<commit_message>
data: sincronizar ultimos cambios de QFieldCloud e inyectar automaticamente Monteserin Bajo
</commit_message>
<xml_diff>
--- a/public/informe_reunion_tecnica.docx
+++ b/public/informe_reunion_tecnica.docx
@@ -4,7 +4,7 @@
   <w:body>
     <w:p>
       <w:pPr>
-        <w:divId w:val="304437129"/>
+        <w:divId w:val="1253051956"/>
         <w:rPr>
           <w:rFonts w:ascii="Plus Jakarta Sans" w:eastAsia="Times New Roman" w:hAnsi="Plus Jakarta Sans"/>
           <w:lang w:val="es-ES"/>
@@ -28,7 +28,7 @@
     <w:p>
       <w:pPr>
         <w:pStyle w:val="Ttulo1"/>
-        <w:divId w:val="1464694250"/>
+        <w:divId w:val="951983701"/>
         <w:rPr>
           <w:rFonts w:eastAsia="Times New Roman"/>
           <w:lang w:val="es-ES"/>
@@ -45,7 +45,7 @@
     <w:p>
       <w:pPr>
         <w:pStyle w:val="NormalWeb"/>
-        <w:divId w:val="1464694250"/>
+        <w:divId w:val="951983701"/>
         <w:rPr>
           <w:rFonts w:ascii="Plus Jakarta Sans" w:hAnsi="Plus Jakarta Sans"/>
           <w:lang w:val="es-ES"/>
@@ -63,7 +63,7 @@
     <w:p>
       <w:pPr>
         <w:pStyle w:val="NormalWeb"/>
-        <w:divId w:val="1464694250"/>
+        <w:divId w:val="951983701"/>
         <w:rPr>
           <w:rFonts w:ascii="Plus Jakarta Sans" w:hAnsi="Plus Jakarta Sans"/>
           <w:lang w:val="es-ES"/>
@@ -102,18 +102,18 @@
     <w:p>
       <w:pPr>
         <w:spacing w:before="450" w:after="450"/>
-        <w:divId w:val="1464694250"/>
-        <w:rPr>
-          <w:rFonts w:ascii="Plus Jakarta Sans" w:eastAsia="Times New Roman" w:hAnsi="Plus Jakarta Sans"/>
-          <w:lang w:val="es-ES"/>
-        </w:rPr>
-      </w:pPr>
-      <w:r>
-        <w:rPr>
-          <w:rFonts w:ascii="Plus Jakarta Sans" w:eastAsia="Times New Roman" w:hAnsi="Plus Jakarta Sans"/>
-          <w:lang w:val="es-ES"/>
-        </w:rPr>
-        <w:pict w14:anchorId="5C0E8E3E">
+        <w:divId w:val="951983701"/>
+        <w:rPr>
+          <w:rFonts w:ascii="Plus Jakarta Sans" w:eastAsia="Times New Roman" w:hAnsi="Plus Jakarta Sans"/>
+          <w:lang w:val="es-ES"/>
+        </w:rPr>
+      </w:pPr>
+      <w:r>
+        <w:rPr>
+          <w:rFonts w:ascii="Plus Jakarta Sans" w:eastAsia="Times New Roman" w:hAnsi="Plus Jakarta Sans"/>
+          <w:lang w:val="es-ES"/>
+        </w:rPr>
+        <w:pict>
           <v:rect id="_x0000_i1025" style="width:0;height:.75pt" o:hralign="center" o:hrstd="t" o:hr="t" fillcolor="#a0a0a0" stroked="f"/>
         </w:pict>
       </w:r>
@@ -121,7 +121,7 @@
     <w:p>
       <w:pPr>
         <w:pStyle w:val="Ttulo2"/>
-        <w:divId w:val="1464694250"/>
+        <w:divId w:val="951983701"/>
         <w:rPr>
           <w:rFonts w:eastAsia="Times New Roman"/>
           <w:lang w:val="es-ES"/>
@@ -145,7 +145,7 @@
     <w:p>
       <w:pPr>
         <w:pStyle w:val="NormalWeb"/>
-        <w:divId w:val="1464694250"/>
+        <w:divId w:val="951983701"/>
         <w:rPr>
           <w:rFonts w:ascii="Plus Jakarta Sans" w:hAnsi="Plus Jakarta Sans"/>
           <w:lang w:val="es-ES"/>
@@ -167,7 +167,7 @@
         </w:numPr>
         <w:spacing w:before="100" w:beforeAutospacing="1" w:after="90"/>
         <w:ind w:left="1020"/>
-        <w:divId w:val="1464694250"/>
+        <w:divId w:val="951983701"/>
         <w:rPr>
           <w:rFonts w:ascii="Plus Jakarta Sans" w:eastAsia="Times New Roman" w:hAnsi="Plus Jakarta Sans"/>
           <w:sz w:val="21"/>
@@ -213,7 +213,7 @@
         </w:numPr>
         <w:spacing w:before="100" w:beforeAutospacing="1" w:after="90"/>
         <w:ind w:left="1020"/>
-        <w:divId w:val="1464694250"/>
+        <w:divId w:val="951983701"/>
         <w:rPr>
           <w:rFonts w:ascii="Plus Jakarta Sans" w:eastAsia="Times New Roman" w:hAnsi="Plus Jakarta Sans"/>
           <w:sz w:val="21"/>
@@ -269,7 +269,7 @@
         </w:numPr>
         <w:spacing w:before="100" w:beforeAutospacing="1" w:after="90"/>
         <w:ind w:left="1020"/>
-        <w:divId w:val="1464694250"/>
+        <w:divId w:val="951983701"/>
         <w:rPr>
           <w:rFonts w:ascii="Plus Jakarta Sans" w:eastAsia="Times New Roman" w:hAnsi="Plus Jakarta Sans"/>
           <w:sz w:val="21"/>
@@ -315,7 +315,7 @@
         </w:numPr>
         <w:spacing w:before="100" w:beforeAutospacing="1" w:after="90"/>
         <w:ind w:left="1020"/>
-        <w:divId w:val="1464694250"/>
+        <w:divId w:val="951983701"/>
         <w:rPr>
           <w:rFonts w:ascii="Plus Jakarta Sans" w:eastAsia="Times New Roman" w:hAnsi="Plus Jakarta Sans"/>
           <w:sz w:val="21"/>
@@ -356,18 +356,18 @@
     <w:p>
       <w:pPr>
         <w:spacing w:before="450" w:after="450"/>
-        <w:divId w:val="1464694250"/>
-        <w:rPr>
-          <w:rFonts w:ascii="Plus Jakarta Sans" w:eastAsia="Times New Roman" w:hAnsi="Plus Jakarta Sans"/>
-          <w:lang w:val="es-ES"/>
-        </w:rPr>
-      </w:pPr>
-      <w:r>
-        <w:rPr>
-          <w:rFonts w:ascii="Plus Jakarta Sans" w:eastAsia="Times New Roman" w:hAnsi="Plus Jakarta Sans"/>
-          <w:lang w:val="es-ES"/>
-        </w:rPr>
-        <w:pict w14:anchorId="3573D15E">
+        <w:divId w:val="951983701"/>
+        <w:rPr>
+          <w:rFonts w:ascii="Plus Jakarta Sans" w:eastAsia="Times New Roman" w:hAnsi="Plus Jakarta Sans"/>
+          <w:lang w:val="es-ES"/>
+        </w:rPr>
+      </w:pPr>
+      <w:r>
+        <w:rPr>
+          <w:rFonts w:ascii="Plus Jakarta Sans" w:eastAsia="Times New Roman" w:hAnsi="Plus Jakarta Sans"/>
+          <w:lang w:val="es-ES"/>
+        </w:rPr>
+        <w:pict>
           <v:rect id="_x0000_i1026" style="width:0;height:.75pt" o:hralign="center" o:hrstd="t" o:hr="t" fillcolor="#a0a0a0" stroked="f"/>
         </w:pict>
       </w:r>
@@ -375,7 +375,7 @@
     <w:p>
       <w:pPr>
         <w:pStyle w:val="Ttulo2"/>
-        <w:divId w:val="1464694250"/>
+        <w:divId w:val="951983701"/>
         <w:rPr>
           <w:rFonts w:eastAsia="Times New Roman"/>
           <w:lang w:val="es-ES"/>
@@ -392,7 +392,7 @@
     <w:p>
       <w:pPr>
         <w:pStyle w:val="NormalWeb"/>
-        <w:divId w:val="1464694250"/>
+        <w:divId w:val="951983701"/>
         <w:rPr>
           <w:rFonts w:ascii="Plus Jakarta Sans" w:hAnsi="Plus Jakarta Sans"/>
           <w:lang w:val="es-ES"/>
@@ -445,7 +445,7 @@
       </w:tblGrid>
       <w:tr>
         <w:trPr>
-          <w:divId w:val="232661712"/>
+          <w:divId w:val="1987857452"/>
           <w:tblHeader/>
         </w:trPr>
         <w:tc>
@@ -525,7 +525,7 @@
       </w:tr>
       <w:tr>
         <w:trPr>
-          <w:divId w:val="232661712"/>
+          <w:divId w:val="1987857452"/>
         </w:trPr>
         <w:tc>
           <w:tcPr>
@@ -591,7 +591,7 @@
       </w:tr>
       <w:tr>
         <w:trPr>
-          <w:divId w:val="232661712"/>
+          <w:divId w:val="1987857452"/>
         </w:trPr>
         <w:tc>
           <w:tcPr>
@@ -657,7 +657,7 @@
       </w:tr>
       <w:tr>
         <w:trPr>
-          <w:divId w:val="232661712"/>
+          <w:divId w:val="1987857452"/>
         </w:trPr>
         <w:tc>
           <w:tcPr>
@@ -723,7 +723,7 @@
       </w:tr>
       <w:tr>
         <w:trPr>
-          <w:divId w:val="232661712"/>
+          <w:divId w:val="1987857452"/>
         </w:trPr>
         <w:tc>
           <w:tcPr>
@@ -791,7 +791,7 @@
     <w:p>
       <w:pPr>
         <w:spacing w:before="450" w:after="450"/>
-        <w:divId w:val="1464694250"/>
+        <w:divId w:val="951983701"/>
         <w:rPr>
           <w:rFonts w:ascii="Plus Jakarta Sans" w:eastAsia="Times New Roman" w:hAnsi="Plus Jakarta Sans"/>
           <w:lang w:val="es-ES"/>
@@ -803,7 +803,7 @@
           <w:lang w:val="es-ES"/>
         </w:rPr>
         <w:lastRenderedPageBreak/>
-        <w:pict w14:anchorId="3733CBC1">
+        <w:pict>
           <v:rect id="_x0000_i1027" style="width:0;height:.75pt" o:hralign="center" o:hrstd="t" o:hr="t" fillcolor="#a0a0a0" stroked="f"/>
         </w:pict>
       </w:r>
@@ -811,7 +811,7 @@
     <w:p>
       <w:pPr>
         <w:pStyle w:val="Ttulo2"/>
-        <w:divId w:val="1464694250"/>
+        <w:divId w:val="951983701"/>
         <w:rPr>
           <w:rFonts w:eastAsia="Times New Roman"/>
           <w:lang w:val="es-ES"/>
@@ -828,7 +828,7 @@
     <w:p>
       <w:pPr>
         <w:pStyle w:val="Ttulo3"/>
-        <w:divId w:val="1464694250"/>
+        <w:divId w:val="951983701"/>
         <w:rPr>
           <w:rFonts w:eastAsia="Times New Roman"/>
           <w:lang w:val="es-ES"/>
@@ -845,7 +845,7 @@
     <w:p>
       <w:pPr>
         <w:pStyle w:val="NormalWeb"/>
-        <w:divId w:val="1464694250"/>
+        <w:divId w:val="951983701"/>
         <w:rPr>
           <w:rFonts w:ascii="Plus Jakarta Sans" w:hAnsi="Plus Jakarta Sans"/>
           <w:lang w:val="es-ES"/>
@@ -885,7 +885,7 @@
       </w:tblGrid>
       <w:tr>
         <w:trPr>
-          <w:divId w:val="457644507"/>
+          <w:divId w:val="605506932"/>
           <w:tblHeader/>
         </w:trPr>
         <w:tc>
@@ -1039,7 +1039,7 @@
       </w:tr>
       <w:tr>
         <w:trPr>
-          <w:divId w:val="457644507"/>
+          <w:divId w:val="605506932"/>
         </w:trPr>
         <w:tc>
           <w:tcPr>
@@ -1165,7 +1165,7 @@
       </w:tr>
       <w:tr>
         <w:trPr>
-          <w:divId w:val="457644507"/>
+          <w:divId w:val="605506932"/>
         </w:trPr>
         <w:tc>
           <w:tcPr>
@@ -1291,7 +1291,7 @@
       </w:tr>
       <w:tr>
         <w:trPr>
-          <w:divId w:val="457644507"/>
+          <w:divId w:val="605506932"/>
         </w:trPr>
         <w:tc>
           <w:tcPr>
@@ -1417,7 +1417,7 @@
       </w:tr>
       <w:tr>
         <w:trPr>
-          <w:divId w:val="457644507"/>
+          <w:divId w:val="605506932"/>
         </w:trPr>
         <w:tc>
           <w:tcPr>
@@ -1543,7 +1543,7 @@
       </w:tr>
       <w:tr>
         <w:trPr>
-          <w:divId w:val="457644507"/>
+          <w:divId w:val="605506932"/>
         </w:trPr>
         <w:tc>
           <w:tcPr>
@@ -1677,7 +1677,7 @@
       </w:tr>
       <w:tr>
         <w:trPr>
-          <w:divId w:val="457644507"/>
+          <w:divId w:val="605506932"/>
         </w:trPr>
         <w:tc>
           <w:tcPr>
@@ -1803,7 +1803,7 @@
       </w:tr>
       <w:tr>
         <w:trPr>
-          <w:divId w:val="457644507"/>
+          <w:divId w:val="605506932"/>
         </w:trPr>
         <w:tc>
           <w:tcPr>
@@ -1929,7 +1929,7 @@
       </w:tr>
       <w:tr>
         <w:trPr>
-          <w:divId w:val="457644507"/>
+          <w:divId w:val="605506932"/>
         </w:trPr>
         <w:tc>
           <w:tcPr>
@@ -2057,7 +2057,7 @@
     <w:p>
       <w:pPr>
         <w:pStyle w:val="Ttulo3"/>
-        <w:divId w:val="1464694250"/>
+        <w:divId w:val="951983701"/>
         <w:rPr>
           <w:rFonts w:eastAsia="Times New Roman"/>
           <w:lang w:val="es-ES"/>
@@ -2074,7 +2074,7 @@
     <w:p>
       <w:pPr>
         <w:pStyle w:val="NormalWeb"/>
-        <w:divId w:val="1464694250"/>
+        <w:divId w:val="951983701"/>
         <w:rPr>
           <w:rFonts w:ascii="Plus Jakarta Sans" w:hAnsi="Plus Jakarta Sans"/>
           <w:lang w:val="es-ES"/>
@@ -2103,7 +2103,7 @@
         </w:numPr>
         <w:spacing w:before="100" w:beforeAutospacing="1" w:after="90"/>
         <w:ind w:left="1020"/>
-        <w:divId w:val="1464694250"/>
+        <w:divId w:val="951983701"/>
         <w:rPr>
           <w:rFonts w:ascii="Plus Jakarta Sans" w:eastAsia="Times New Roman" w:hAnsi="Plus Jakarta Sans"/>
           <w:sz w:val="21"/>
@@ -2205,7 +2205,7 @@
         </w:numPr>
         <w:spacing w:before="100" w:beforeAutospacing="1" w:after="90"/>
         <w:ind w:left="1020"/>
-        <w:divId w:val="1464694250"/>
+        <w:divId w:val="951983701"/>
         <w:rPr>
           <w:rFonts w:ascii="Plus Jakarta Sans" w:eastAsia="Times New Roman" w:hAnsi="Plus Jakarta Sans"/>
           <w:sz w:val="21"/>
@@ -2317,7 +2317,7 @@
         </w:numPr>
         <w:spacing w:before="100" w:beforeAutospacing="1" w:after="90"/>
         <w:ind w:left="1020"/>
-        <w:divId w:val="1464694250"/>
+        <w:divId w:val="951983701"/>
         <w:rPr>
           <w:rFonts w:ascii="Plus Jakarta Sans" w:eastAsia="Times New Roman" w:hAnsi="Plus Jakarta Sans"/>
           <w:sz w:val="21"/>
@@ -2423,7 +2423,7 @@
     <w:p>
       <w:pPr>
         <w:pStyle w:val="Ttulo3"/>
-        <w:divId w:val="1464694250"/>
+        <w:divId w:val="951983701"/>
         <w:rPr>
           <w:rFonts w:eastAsia="Times New Roman"/>
           <w:lang w:val="es-ES"/>
@@ -2440,7 +2440,7 @@
     <w:p>
       <w:pPr>
         <w:jc w:val="center"/>
-        <w:divId w:val="1156847393"/>
+        <w:divId w:val="1107308817"/>
         <w:rPr>
           <w:rFonts w:ascii="Outfit" w:eastAsia="Times New Roman" w:hAnsi="Outfit"/>
           <w:b/>
@@ -2469,7 +2469,7 @@
     <w:p>
       <w:pPr>
         <w:jc w:val="center"/>
-        <w:divId w:val="1244608585"/>
+        <w:divId w:val="1715764319"/>
         <w:rPr>
           <w:rFonts w:ascii="Plus Jakarta Sans" w:eastAsia="Times New Roman" w:hAnsi="Plus Jakarta Sans"/>
           <w:lang w:val="es-ES"/>
@@ -2864,18 +2864,18 @@
     <w:p>
       <w:pPr>
         <w:spacing w:before="450" w:after="450"/>
-        <w:divId w:val="1464694250"/>
-        <w:rPr>
-          <w:rFonts w:ascii="Plus Jakarta Sans" w:eastAsia="Times New Roman" w:hAnsi="Plus Jakarta Sans"/>
-          <w:lang w:val="es-ES"/>
-        </w:rPr>
-      </w:pPr>
-      <w:r>
-        <w:rPr>
-          <w:rFonts w:ascii="Plus Jakarta Sans" w:eastAsia="Times New Roman" w:hAnsi="Plus Jakarta Sans"/>
-          <w:lang w:val="es-ES"/>
-        </w:rPr>
-        <w:pict w14:anchorId="591C8553">
+        <w:divId w:val="951983701"/>
+        <w:rPr>
+          <w:rFonts w:ascii="Plus Jakarta Sans" w:eastAsia="Times New Roman" w:hAnsi="Plus Jakarta Sans"/>
+          <w:lang w:val="es-ES"/>
+        </w:rPr>
+      </w:pPr>
+      <w:r>
+        <w:rPr>
+          <w:rFonts w:ascii="Plus Jakarta Sans" w:eastAsia="Times New Roman" w:hAnsi="Plus Jakarta Sans"/>
+          <w:lang w:val="es-ES"/>
+        </w:rPr>
+        <w:pict>
           <v:rect id="_x0000_i1028" style="width:0;height:.75pt" o:hralign="center" o:hrstd="t" o:hr="t" fillcolor="#a0a0a0" stroked="f"/>
         </w:pict>
       </w:r>
@@ -2883,7 +2883,7 @@
     <w:p>
       <w:pPr>
         <w:pStyle w:val="Ttulo3"/>
-        <w:divId w:val="1464694250"/>
+        <w:divId w:val="951983701"/>
         <w:rPr>
           <w:rFonts w:eastAsia="Times New Roman"/>
           <w:lang w:val="es-ES"/>
@@ -2900,7 +2900,7 @@
     <w:p>
       <w:pPr>
         <w:pStyle w:val="NormalWeb"/>
-        <w:divId w:val="1464694250"/>
+        <w:divId w:val="951983701"/>
         <w:rPr>
           <w:rFonts w:ascii="Plus Jakarta Sans" w:hAnsi="Plus Jakarta Sans"/>
           <w:lang w:val="es-ES"/>
@@ -2933,7 +2933,7 @@
       </w:tblGrid>
       <w:tr>
         <w:trPr>
-          <w:divId w:val="6489395"/>
+          <w:divId w:val="1315405389"/>
           <w:tblHeader/>
         </w:trPr>
         <w:tc>
@@ -3087,7 +3087,7 @@
       </w:tr>
       <w:tr>
         <w:trPr>
-          <w:divId w:val="6489395"/>
+          <w:divId w:val="1315405389"/>
         </w:trPr>
         <w:tc>
           <w:tcPr>
@@ -3221,7 +3221,7 @@
       </w:tr>
       <w:tr>
         <w:trPr>
-          <w:divId w:val="6489395"/>
+          <w:divId w:val="1315405389"/>
         </w:trPr>
         <w:tc>
           <w:tcPr>
@@ -3355,7 +3355,7 @@
       </w:tr>
       <w:tr>
         <w:trPr>
-          <w:divId w:val="6489395"/>
+          <w:divId w:val="1315405389"/>
         </w:trPr>
         <w:tc>
           <w:tcPr>
@@ -3489,7 +3489,7 @@
       </w:tr>
       <w:tr>
         <w:trPr>
-          <w:divId w:val="6489395"/>
+          <w:divId w:val="1315405389"/>
         </w:trPr>
         <w:tc>
           <w:tcPr>
@@ -3623,7 +3623,7 @@
       </w:tr>
       <w:tr>
         <w:trPr>
-          <w:divId w:val="6489395"/>
+          <w:divId w:val="1315405389"/>
         </w:trPr>
         <w:tc>
           <w:tcPr>
@@ -3757,7 +3757,7 @@
       </w:tr>
       <w:tr>
         <w:trPr>
-          <w:divId w:val="6489395"/>
+          <w:divId w:val="1315405389"/>
         </w:trPr>
         <w:tc>
           <w:tcPr>
@@ -3893,7 +3893,7 @@
     <w:p>
       <w:pPr>
         <w:pStyle w:val="Ttulo3"/>
-        <w:divId w:val="1464694250"/>
+        <w:divId w:val="951983701"/>
         <w:rPr>
           <w:rFonts w:eastAsia="Times New Roman"/>
           <w:lang w:val="es-ES"/>
@@ -3910,7 +3910,7 @@
     <w:p>
       <w:pPr>
         <w:jc w:val="center"/>
-        <w:divId w:val="83041421"/>
+        <w:divId w:val="36247426"/>
         <w:rPr>
           <w:rFonts w:ascii="Outfit" w:eastAsia="Times New Roman" w:hAnsi="Outfit"/>
           <w:b/>
@@ -3939,7 +3939,7 @@
     <w:p>
       <w:pPr>
         <w:jc w:val="center"/>
-        <w:divId w:val="1747652432"/>
+        <w:divId w:val="1876504589"/>
         <w:rPr>
           <w:rFonts w:ascii="Plus Jakarta Sans" w:eastAsia="Times New Roman" w:hAnsi="Plus Jakarta Sans"/>
           <w:lang w:val="es-ES"/>
@@ -4313,7 +4313,7 @@
     <w:p>
       <w:pPr>
         <w:spacing w:before="450" w:after="450"/>
-        <w:divId w:val="1464694250"/>
+        <w:divId w:val="951983701"/>
         <w:rPr>
           <w:rFonts w:ascii="Plus Jakarta Sans" w:eastAsia="Times New Roman" w:hAnsi="Plus Jakarta Sans"/>
           <w:lang w:val="es-ES"/>
@@ -4325,7 +4325,7 @@
           <w:lang w:val="es-ES"/>
         </w:rPr>
         <w:lastRenderedPageBreak/>
-        <w:pict w14:anchorId="3633B5AB">
+        <w:pict>
           <v:rect id="_x0000_i1029" style="width:0;height:.75pt" o:hralign="center" o:hrstd="t" o:hr="t" fillcolor="#a0a0a0" stroked="f"/>
         </w:pict>
       </w:r>
@@ -4333,7 +4333,7 @@
     <w:p>
       <w:pPr>
         <w:pStyle w:val="Ttulo3"/>
-        <w:divId w:val="1464694250"/>
+        <w:divId w:val="951983701"/>
         <w:rPr>
           <w:rFonts w:eastAsia="Times New Roman"/>
           <w:lang w:val="es-ES"/>
@@ -4350,7 +4350,7 @@
     <w:p>
       <w:pPr>
         <w:pStyle w:val="NormalWeb"/>
-        <w:divId w:val="1464694250"/>
+        <w:divId w:val="951983701"/>
         <w:rPr>
           <w:rFonts w:ascii="Plus Jakarta Sans" w:hAnsi="Plus Jakarta Sans"/>
           <w:lang w:val="es-ES"/>
@@ -4372,7 +4372,7 @@
         </w:numPr>
         <w:spacing w:before="100" w:beforeAutospacing="1" w:after="90"/>
         <w:ind w:left="1020"/>
-        <w:divId w:val="1464694250"/>
+        <w:divId w:val="951983701"/>
         <w:rPr>
           <w:rFonts w:ascii="Plus Jakarta Sans" w:eastAsia="Times New Roman" w:hAnsi="Plus Jakarta Sans"/>
           <w:sz w:val="21"/>
@@ -4408,7 +4408,7 @@
         </w:numPr>
         <w:spacing w:before="100" w:beforeAutospacing="1" w:after="90"/>
         <w:ind w:left="1020"/>
-        <w:divId w:val="1464694250"/>
+        <w:divId w:val="951983701"/>
         <w:rPr>
           <w:rFonts w:ascii="Plus Jakarta Sans" w:eastAsia="Times New Roman" w:hAnsi="Plus Jakarta Sans"/>
           <w:sz w:val="21"/>
@@ -4453,7 +4453,7 @@
         </w:numPr>
         <w:spacing w:before="100" w:beforeAutospacing="1" w:after="90"/>
         <w:ind w:left="1020"/>
-        <w:divId w:val="1464694250"/>
+        <w:divId w:val="951983701"/>
         <w:rPr>
           <w:rFonts w:ascii="Plus Jakarta Sans" w:eastAsia="Times New Roman" w:hAnsi="Plus Jakarta Sans"/>
           <w:sz w:val="21"/>
@@ -4498,7 +4498,7 @@
         </w:numPr>
         <w:spacing w:before="100" w:beforeAutospacing="1" w:after="90"/>
         <w:ind w:left="1020"/>
-        <w:divId w:val="1464694250"/>
+        <w:divId w:val="951983701"/>
         <w:rPr>
           <w:rFonts w:ascii="Plus Jakarta Sans" w:eastAsia="Times New Roman" w:hAnsi="Plus Jakarta Sans"/>
           <w:sz w:val="21"/>
@@ -4554,7 +4554,7 @@
       </w:tblGrid>
       <w:tr>
         <w:trPr>
-          <w:divId w:val="435254968"/>
+          <w:divId w:val="1114524151"/>
           <w:tblHeader/>
         </w:trPr>
         <w:tc>
@@ -4708,7 +4708,7 @@
       </w:tr>
       <w:tr>
         <w:trPr>
-          <w:divId w:val="435254968"/>
+          <w:divId w:val="1114524151"/>
         </w:trPr>
         <w:tc>
           <w:tcPr>
@@ -4834,7 +4834,7 @@
       </w:tr>
       <w:tr>
         <w:trPr>
-          <w:divId w:val="435254968"/>
+          <w:divId w:val="1114524151"/>
         </w:trPr>
         <w:tc>
           <w:tcPr>
@@ -4960,7 +4960,7 @@
       </w:tr>
       <w:tr>
         <w:trPr>
-          <w:divId w:val="435254968"/>
+          <w:divId w:val="1114524151"/>
         </w:trPr>
         <w:tc>
           <w:tcPr>
@@ -5086,7 +5086,7 @@
       </w:tr>
       <w:tr>
         <w:trPr>
-          <w:divId w:val="435254968"/>
+          <w:divId w:val="1114524151"/>
         </w:trPr>
         <w:tc>
           <w:tcPr>
@@ -5214,18 +5214,18 @@
     <w:p>
       <w:pPr>
         <w:spacing w:before="450" w:after="450"/>
-        <w:divId w:val="1464694250"/>
-        <w:rPr>
-          <w:rFonts w:ascii="Plus Jakarta Sans" w:eastAsia="Times New Roman" w:hAnsi="Plus Jakarta Sans"/>
-          <w:lang w:val="es-ES"/>
-        </w:rPr>
-      </w:pPr>
-      <w:r>
-        <w:rPr>
-          <w:rFonts w:ascii="Plus Jakarta Sans" w:eastAsia="Times New Roman" w:hAnsi="Plus Jakarta Sans"/>
-          <w:lang w:val="es-ES"/>
-        </w:rPr>
-        <w:pict w14:anchorId="78CD25E7">
+        <w:divId w:val="951983701"/>
+        <w:rPr>
+          <w:rFonts w:ascii="Plus Jakarta Sans" w:eastAsia="Times New Roman" w:hAnsi="Plus Jakarta Sans"/>
+          <w:lang w:val="es-ES"/>
+        </w:rPr>
+      </w:pPr>
+      <w:r>
+        <w:rPr>
+          <w:rFonts w:ascii="Plus Jakarta Sans" w:eastAsia="Times New Roman" w:hAnsi="Plus Jakarta Sans"/>
+          <w:lang w:val="es-ES"/>
+        </w:rPr>
+        <w:pict>
           <v:rect id="_x0000_i1030" style="width:0;height:.75pt" o:hralign="center" o:hrstd="t" o:hr="t" fillcolor="#a0a0a0" stroked="f"/>
         </w:pict>
       </w:r>
@@ -5233,7 +5233,7 @@
     <w:p>
       <w:pPr>
         <w:pStyle w:val="Ttulo3"/>
-        <w:divId w:val="1464694250"/>
+        <w:divId w:val="951983701"/>
         <w:rPr>
           <w:rFonts w:eastAsia="Times New Roman"/>
           <w:lang w:val="es-ES"/>
@@ -5250,7 +5250,7 @@
     <w:p>
       <w:pPr>
         <w:pStyle w:val="NormalWeb"/>
-        <w:divId w:val="1464694250"/>
+        <w:divId w:val="951983701"/>
         <w:rPr>
           <w:rFonts w:ascii="Plus Jakarta Sans" w:hAnsi="Plus Jakarta Sans"/>
           <w:lang w:val="es-ES"/>
@@ -5274,7 +5274,7 @@
     <w:p>
       <w:pPr>
         <w:pStyle w:val="Ttulo4"/>
-        <w:divId w:val="1464694250"/>
+        <w:divId w:val="951983701"/>
         <w:rPr>
           <w:rFonts w:eastAsia="Times New Roman"/>
           <w:lang w:val="es-ES"/>
@@ -5291,7 +5291,7 @@
     <w:p>
       <w:pPr>
         <w:jc w:val="center"/>
-        <w:divId w:val="173422477"/>
+        <w:divId w:val="493187689"/>
         <w:rPr>
           <w:rFonts w:ascii="Outfit" w:eastAsia="Times New Roman" w:hAnsi="Outfit"/>
           <w:b/>
@@ -5320,7 +5320,7 @@
     <w:p>
       <w:pPr>
         <w:jc w:val="center"/>
-        <w:divId w:val="678628608"/>
+        <w:divId w:val="1431967642"/>
         <w:rPr>
           <w:rFonts w:ascii="Plus Jakarta Sans" w:eastAsia="Times New Roman" w:hAnsi="Plus Jakarta Sans"/>
           <w:lang w:val="es-ES"/>
@@ -5603,7 +5603,7 @@
     <w:p>
       <w:pPr>
         <w:pStyle w:val="Ttulo4"/>
-        <w:divId w:val="1464694250"/>
+        <w:divId w:val="951983701"/>
         <w:rPr>
           <w:rFonts w:eastAsia="Times New Roman"/>
           <w:lang w:val="es-ES"/>
@@ -5627,7 +5627,7 @@
     <w:p>
       <w:pPr>
         <w:jc w:val="center"/>
-        <w:divId w:val="1289625355"/>
+        <w:divId w:val="2131321560"/>
         <w:rPr>
           <w:rFonts w:ascii="Outfit" w:eastAsia="Times New Roman" w:hAnsi="Outfit"/>
           <w:b/>
@@ -5656,7 +5656,7 @@
     <w:p>
       <w:pPr>
         <w:jc w:val="center"/>
-        <w:divId w:val="69892370"/>
+        <w:divId w:val="638189850"/>
         <w:rPr>
           <w:rFonts w:ascii="Plus Jakarta Sans" w:eastAsia="Times New Roman" w:hAnsi="Plus Jakarta Sans"/>
           <w:lang w:val="es-ES"/>
@@ -5974,7 +5974,7 @@
     <w:p>
       <w:pPr>
         <w:pStyle w:val="Ttulo4"/>
-        <w:divId w:val="1464694250"/>
+        <w:divId w:val="951983701"/>
         <w:rPr>
           <w:rFonts w:eastAsia="Times New Roman"/>
           <w:lang w:val="es-ES"/>
@@ -5992,7 +5992,7 @@
     <w:p>
       <w:pPr>
         <w:jc w:val="center"/>
-        <w:divId w:val="1164781787"/>
+        <w:divId w:val="1131287292"/>
         <w:rPr>
           <w:rFonts w:ascii="Outfit" w:eastAsia="Times New Roman" w:hAnsi="Outfit"/>
           <w:b/>
@@ -6021,7 +6021,7 @@
     <w:p>
       <w:pPr>
         <w:jc w:val="center"/>
-        <w:divId w:val="2053722360"/>
+        <w:divId w:val="1765223530"/>
         <w:rPr>
           <w:rFonts w:ascii="Plus Jakarta Sans" w:eastAsia="Times New Roman" w:hAnsi="Plus Jakarta Sans"/>
           <w:lang w:val="es-ES"/>
@@ -6325,18 +6325,18 @@
     <w:p>
       <w:pPr>
         <w:spacing w:before="450" w:after="450"/>
-        <w:divId w:val="1464694250"/>
-        <w:rPr>
-          <w:rFonts w:ascii="Plus Jakarta Sans" w:eastAsia="Times New Roman" w:hAnsi="Plus Jakarta Sans"/>
-          <w:lang w:val="es-ES"/>
-        </w:rPr>
-      </w:pPr>
-      <w:r>
-        <w:rPr>
-          <w:rFonts w:ascii="Plus Jakarta Sans" w:eastAsia="Times New Roman" w:hAnsi="Plus Jakarta Sans"/>
-          <w:lang w:val="es-ES"/>
-        </w:rPr>
-        <w:pict w14:anchorId="71340560">
+        <w:divId w:val="951983701"/>
+        <w:rPr>
+          <w:rFonts w:ascii="Plus Jakarta Sans" w:eastAsia="Times New Roman" w:hAnsi="Plus Jakarta Sans"/>
+          <w:lang w:val="es-ES"/>
+        </w:rPr>
+      </w:pPr>
+      <w:r>
+        <w:rPr>
+          <w:rFonts w:ascii="Plus Jakarta Sans" w:eastAsia="Times New Roman" w:hAnsi="Plus Jakarta Sans"/>
+          <w:lang w:val="es-ES"/>
+        </w:rPr>
+        <w:pict>
           <v:rect id="_x0000_i1031" style="width:0;height:.75pt" o:hralign="center" o:hrstd="t" o:hr="t" fillcolor="#a0a0a0" stroked="f"/>
         </w:pict>
       </w:r>
@@ -6344,7 +6344,7 @@
     <w:p>
       <w:pPr>
         <w:pStyle w:val="Ttulo3"/>
-        <w:divId w:val="1464694250"/>
+        <w:divId w:val="951983701"/>
         <w:rPr>
           <w:rFonts w:eastAsia="Times New Roman"/>
           <w:lang w:val="es-ES"/>
@@ -6361,7 +6361,7 @@
     <w:p>
       <w:pPr>
         <w:pStyle w:val="NormalWeb"/>
-        <w:divId w:val="1464694250"/>
+        <w:divId w:val="951983701"/>
         <w:rPr>
           <w:rFonts w:ascii="Plus Jakarta Sans" w:hAnsi="Plus Jakarta Sans"/>
           <w:lang w:val="es-ES"/>
@@ -6385,7 +6385,7 @@
     <w:p>
       <w:pPr>
         <w:pStyle w:val="Ttulo4"/>
-        <w:divId w:val="1464694250"/>
+        <w:divId w:val="951983701"/>
         <w:rPr>
           <w:rFonts w:eastAsia="Times New Roman"/>
           <w:lang w:val="es-ES"/>
@@ -6402,7 +6402,7 @@
     <w:p>
       <w:pPr>
         <w:pStyle w:val="NormalWeb"/>
-        <w:divId w:val="1464694250"/>
+        <w:divId w:val="951983701"/>
         <w:rPr>
           <w:rFonts w:ascii="Plus Jakarta Sans" w:hAnsi="Plus Jakarta Sans"/>
           <w:lang w:val="es-ES"/>
@@ -6433,7 +6433,7 @@
       </w:tblGrid>
       <w:tr>
         <w:trPr>
-          <w:divId w:val="1508905786"/>
+          <w:divId w:val="1807967311"/>
           <w:tblHeader/>
         </w:trPr>
         <w:tc>
@@ -6513,7 +6513,7 @@
       </w:tr>
       <w:tr>
         <w:trPr>
-          <w:divId w:val="1508905786"/>
+          <w:divId w:val="1807967311"/>
         </w:trPr>
         <w:tc>
           <w:tcPr>
@@ -6602,7 +6602,7 @@
     <w:p>
       <w:pPr>
         <w:pStyle w:val="Ttulo4"/>
-        <w:divId w:val="1464694250"/>
+        <w:divId w:val="951983701"/>
         <w:rPr>
           <w:rFonts w:eastAsia="Times New Roman"/>
           <w:lang w:val="es-ES"/>
@@ -6619,7 +6619,7 @@
     <w:p>
       <w:pPr>
         <w:pStyle w:val="NormalWeb"/>
-        <w:divId w:val="1464694250"/>
+        <w:divId w:val="951983701"/>
         <w:rPr>
           <w:rFonts w:ascii="Plus Jakarta Sans" w:hAnsi="Plus Jakarta Sans"/>
           <w:lang w:val="es-ES"/>
@@ -6650,7 +6650,7 @@
       </w:tblGrid>
       <w:tr>
         <w:trPr>
-          <w:divId w:val="1473785605"/>
+          <w:divId w:val="90785897"/>
           <w:tblHeader/>
         </w:trPr>
         <w:tc>
@@ -6730,7 +6730,7 @@
       </w:tr>
       <w:tr>
         <w:trPr>
-          <w:divId w:val="1473785605"/>
+          <w:divId w:val="90785897"/>
         </w:trPr>
         <w:tc>
           <w:tcPr>
@@ -6828,7 +6828,7 @@
     <w:p>
       <w:pPr>
         <w:pStyle w:val="Ttulo4"/>
-        <w:divId w:val="1464694250"/>
+        <w:divId w:val="951983701"/>
         <w:rPr>
           <w:rFonts w:eastAsia="Times New Roman"/>
           <w:lang w:val="es-ES"/>
@@ -6845,7 +6845,7 @@
     <w:p>
       <w:pPr>
         <w:pStyle w:val="NormalWeb"/>
-        <w:divId w:val="1464694250"/>
+        <w:divId w:val="951983701"/>
         <w:rPr>
           <w:rFonts w:ascii="Plus Jakarta Sans" w:hAnsi="Plus Jakarta Sans"/>
           <w:lang w:val="es-ES"/>
@@ -6876,7 +6876,7 @@
       </w:tblGrid>
       <w:tr>
         <w:trPr>
-          <w:divId w:val="455608037"/>
+          <w:divId w:val="494612608"/>
           <w:tblHeader/>
         </w:trPr>
         <w:tc>
@@ -6957,7 +6957,7 @@
       </w:tr>
       <w:tr>
         <w:trPr>
-          <w:divId w:val="455608037"/>
+          <w:divId w:val="494612608"/>
         </w:trPr>
         <w:tc>
           <w:tcPr>
@@ -7046,18 +7046,18 @@
     <w:p>
       <w:pPr>
         <w:spacing w:before="450" w:after="450"/>
-        <w:divId w:val="1464694250"/>
-        <w:rPr>
-          <w:rFonts w:ascii="Plus Jakarta Sans" w:eastAsia="Times New Roman" w:hAnsi="Plus Jakarta Sans"/>
-          <w:lang w:val="es-ES"/>
-        </w:rPr>
-      </w:pPr>
-      <w:r>
-        <w:rPr>
-          <w:rFonts w:ascii="Plus Jakarta Sans" w:eastAsia="Times New Roman" w:hAnsi="Plus Jakarta Sans"/>
-          <w:lang w:val="es-ES"/>
-        </w:rPr>
-        <w:pict w14:anchorId="73BF3AD1">
+        <w:divId w:val="951983701"/>
+        <w:rPr>
+          <w:rFonts w:ascii="Plus Jakarta Sans" w:eastAsia="Times New Roman" w:hAnsi="Plus Jakarta Sans"/>
+          <w:lang w:val="es-ES"/>
+        </w:rPr>
+      </w:pPr>
+      <w:r>
+        <w:rPr>
+          <w:rFonts w:ascii="Plus Jakarta Sans" w:eastAsia="Times New Roman" w:hAnsi="Plus Jakarta Sans"/>
+          <w:lang w:val="es-ES"/>
+        </w:rPr>
+        <w:pict>
           <v:rect id="_x0000_i1032" style="width:0;height:.75pt" o:hralign="center" o:hrstd="t" o:hr="t" fillcolor="#a0a0a0" stroked="f"/>
         </w:pict>
       </w:r>
@@ -7065,7 +7065,7 @@
     <w:p>
       <w:pPr>
         <w:pStyle w:val="Ttulo2"/>
-        <w:divId w:val="1464694250"/>
+        <w:divId w:val="951983701"/>
         <w:rPr>
           <w:rFonts w:eastAsia="Times New Roman"/>
           <w:lang w:val="es-ES"/>
@@ -7082,7 +7082,7 @@
     <w:p>
       <w:pPr>
         <w:pStyle w:val="NormalWeb"/>
-        <w:divId w:val="1464694250"/>
+        <w:divId w:val="951983701"/>
         <w:rPr>
           <w:rFonts w:ascii="Plus Jakarta Sans" w:hAnsi="Plus Jakarta Sans"/>
           <w:lang w:val="es-ES"/>
@@ -7099,7 +7099,7 @@
     <w:p>
       <w:pPr>
         <w:pStyle w:val="Ttulo3"/>
-        <w:divId w:val="1464694250"/>
+        <w:divId w:val="951983701"/>
         <w:rPr>
           <w:rFonts w:eastAsia="Times New Roman"/>
           <w:lang w:val="es-ES"/>
@@ -7116,7 +7116,7 @@
     <w:p>
       <w:pPr>
         <w:pStyle w:val="NormalWeb"/>
-        <w:divId w:val="1464694250"/>
+        <w:divId w:val="951983701"/>
         <w:rPr>
           <w:rFonts w:ascii="Plus Jakarta Sans" w:hAnsi="Plus Jakarta Sans"/>
           <w:lang w:val="es-ES"/>
@@ -7149,7 +7149,7 @@
       </w:tblGrid>
       <w:tr>
         <w:trPr>
-          <w:divId w:val="1848790241"/>
+          <w:divId w:val="1994217924"/>
           <w:tblHeader/>
         </w:trPr>
         <w:tc>
@@ -7314,7 +7314,7 @@
       </w:tr>
       <w:tr>
         <w:trPr>
-          <w:divId w:val="1848790241"/>
+          <w:divId w:val="1994217924"/>
         </w:trPr>
         <w:tc>
           <w:tcPr>
@@ -7440,7 +7440,7 @@
       </w:tr>
       <w:tr>
         <w:trPr>
-          <w:divId w:val="1848790241"/>
+          <w:divId w:val="1994217924"/>
         </w:trPr>
         <w:tc>
           <w:tcPr>
@@ -7566,7 +7566,7 @@
       </w:tr>
       <w:tr>
         <w:trPr>
-          <w:divId w:val="1848790241"/>
+          <w:divId w:val="1994217924"/>
         </w:trPr>
         <w:tc>
           <w:tcPr>
@@ -7692,7 +7692,7 @@
       </w:tr>
       <w:tr>
         <w:trPr>
-          <w:divId w:val="1848790241"/>
+          <w:divId w:val="1994217924"/>
         </w:trPr>
         <w:tc>
           <w:tcPr>
@@ -7820,7 +7820,7 @@
     <w:p>
       <w:pPr>
         <w:pStyle w:val="Ttulo3"/>
-        <w:divId w:val="1464694250"/>
+        <w:divId w:val="951983701"/>
         <w:rPr>
           <w:rFonts w:eastAsia="Times New Roman"/>
           <w:lang w:val="es-ES"/>
@@ -7838,7 +7838,7 @@
       <w:pPr>
         <w:spacing w:before="375" w:after="225"/>
         <w:jc w:val="center"/>
-        <w:divId w:val="1975017070"/>
+        <w:divId w:val="1358047466"/>
         <w:rPr>
           <w:rFonts w:ascii="Outfit" w:eastAsia="Times New Roman" w:hAnsi="Outfit"/>
           <w:b/>
@@ -7868,7 +7868,7 @@
       <w:pPr>
         <w:spacing w:after="375"/>
         <w:jc w:val="center"/>
-        <w:divId w:val="1382948822"/>
+        <w:divId w:val="487094487"/>
         <w:rPr>
           <w:rFonts w:ascii="Plus Jakarta Sans" w:eastAsia="Times New Roman" w:hAnsi="Plus Jakarta Sans"/>
           <w:lang w:val="es-ES"/>
@@ -8235,7 +8235,7 @@
     <w:p>
       <w:pPr>
         <w:pStyle w:val="Ttulo3"/>
-        <w:divId w:val="1464694250"/>
+        <w:divId w:val="951983701"/>
         <w:rPr>
           <w:rFonts w:eastAsia="Times New Roman"/>
           <w:lang w:val="es-ES"/>
@@ -8259,7 +8259,7 @@
     <w:p>
       <w:pPr>
         <w:pStyle w:val="NormalWeb"/>
-        <w:divId w:val="1464694250"/>
+        <w:divId w:val="951983701"/>
         <w:rPr>
           <w:rFonts w:ascii="Plus Jakarta Sans" w:hAnsi="Plus Jakarta Sans"/>
           <w:lang w:val="es-ES"/>
@@ -8281,7 +8281,7 @@
         </w:numPr>
         <w:spacing w:before="100" w:beforeAutospacing="1" w:after="90"/>
         <w:ind w:left="1020"/>
-        <w:divId w:val="1464694250"/>
+        <w:divId w:val="951983701"/>
         <w:rPr>
           <w:rFonts w:ascii="Plus Jakarta Sans" w:eastAsia="Times New Roman" w:hAnsi="Plus Jakarta Sans"/>
           <w:sz w:val="21"/>
@@ -8317,7 +8317,7 @@
         </w:numPr>
         <w:spacing w:before="100" w:beforeAutospacing="1" w:after="90"/>
         <w:ind w:left="1020"/>
-        <w:divId w:val="1464694250"/>
+        <w:divId w:val="951983701"/>
         <w:rPr>
           <w:rFonts w:ascii="Plus Jakarta Sans" w:eastAsia="Times New Roman" w:hAnsi="Plus Jakarta Sans"/>
           <w:sz w:val="21"/>
@@ -8362,7 +8362,7 @@
         </w:numPr>
         <w:spacing w:before="100" w:beforeAutospacing="1" w:after="90"/>
         <w:ind w:left="1020"/>
-        <w:divId w:val="1464694250"/>
+        <w:divId w:val="951983701"/>
         <w:rPr>
           <w:rFonts w:ascii="Plus Jakarta Sans" w:eastAsia="Times New Roman" w:hAnsi="Plus Jakarta Sans"/>
           <w:sz w:val="21"/>
@@ -8416,7 +8416,7 @@
         </w:numPr>
         <w:spacing w:before="100" w:beforeAutospacing="1" w:after="90"/>
         <w:ind w:left="1020"/>
-        <w:divId w:val="1464694250"/>
+        <w:divId w:val="951983701"/>
         <w:rPr>
           <w:rFonts w:ascii="Plus Jakarta Sans" w:eastAsia="Times New Roman" w:hAnsi="Plus Jakarta Sans"/>
           <w:sz w:val="21"/>
@@ -8461,7 +8461,7 @@
         </w:numPr>
         <w:spacing w:before="100" w:beforeAutospacing="1" w:after="90"/>
         <w:ind w:left="1020"/>
-        <w:divId w:val="1464694250"/>
+        <w:divId w:val="951983701"/>
         <w:rPr>
           <w:rFonts w:ascii="Plus Jakarta Sans" w:eastAsia="Times New Roman" w:hAnsi="Plus Jakarta Sans"/>
           <w:sz w:val="21"/>
@@ -8497,7 +8497,7 @@
         </w:numPr>
         <w:spacing w:before="100" w:beforeAutospacing="1" w:after="90"/>
         <w:ind w:left="1020"/>
-        <w:divId w:val="1464694250"/>
+        <w:divId w:val="951983701"/>
         <w:rPr>
           <w:rFonts w:ascii="Plus Jakarta Sans" w:eastAsia="Times New Roman" w:hAnsi="Plus Jakarta Sans"/>
           <w:sz w:val="21"/>
@@ -8542,7 +8542,7 @@
         </w:numPr>
         <w:spacing w:before="100" w:beforeAutospacing="1" w:after="90"/>
         <w:ind w:left="1020"/>
-        <w:divId w:val="1464694250"/>
+        <w:divId w:val="951983701"/>
         <w:rPr>
           <w:rFonts w:ascii="Plus Jakarta Sans" w:eastAsia="Times New Roman" w:hAnsi="Plus Jakarta Sans"/>
           <w:sz w:val="21"/>
@@ -8587,7 +8587,7 @@
         </w:numPr>
         <w:spacing w:before="100" w:beforeAutospacing="1" w:after="90"/>
         <w:ind w:left="1020"/>
-        <w:divId w:val="1464694250"/>
+        <w:divId w:val="951983701"/>
         <w:rPr>
           <w:rFonts w:ascii="Plus Jakarta Sans" w:eastAsia="Times New Roman" w:hAnsi="Plus Jakarta Sans"/>
           <w:sz w:val="21"/>
@@ -8632,7 +8632,7 @@
         </w:numPr>
         <w:spacing w:before="100" w:beforeAutospacing="1" w:after="90"/>
         <w:ind w:left="1020"/>
-        <w:divId w:val="1464694250"/>
+        <w:divId w:val="951983701"/>
         <w:rPr>
           <w:rFonts w:ascii="Plus Jakarta Sans" w:eastAsia="Times New Roman" w:hAnsi="Plus Jakarta Sans"/>
           <w:sz w:val="21"/>
@@ -8668,7 +8668,7 @@
         </w:numPr>
         <w:spacing w:before="100" w:beforeAutospacing="1" w:after="90"/>
         <w:ind w:left="1020"/>
-        <w:divId w:val="1464694250"/>
+        <w:divId w:val="951983701"/>
         <w:rPr>
           <w:rFonts w:ascii="Plus Jakarta Sans" w:eastAsia="Times New Roman" w:hAnsi="Plus Jakarta Sans"/>
           <w:sz w:val="21"/>
@@ -8722,7 +8722,7 @@
         </w:numPr>
         <w:spacing w:before="100" w:beforeAutospacing="1" w:after="90"/>
         <w:ind w:left="1020"/>
-        <w:divId w:val="1464694250"/>
+        <w:divId w:val="951983701"/>
         <w:rPr>
           <w:rFonts w:ascii="Plus Jakarta Sans" w:eastAsia="Times New Roman" w:hAnsi="Plus Jakarta Sans"/>
           <w:sz w:val="21"/>
@@ -8767,7 +8767,7 @@
         </w:numPr>
         <w:spacing w:before="100" w:beforeAutospacing="1" w:after="90"/>
         <w:ind w:left="1020"/>
-        <w:divId w:val="1464694250"/>
+        <w:divId w:val="951983701"/>
         <w:rPr>
           <w:rFonts w:ascii="Plus Jakarta Sans" w:eastAsia="Times New Roman" w:hAnsi="Plus Jakarta Sans"/>
           <w:sz w:val="21"/>
@@ -8807,7 +8807,7 @@
     <w:p>
       <w:pPr>
         <w:pStyle w:val="Ttulo3"/>
-        <w:divId w:val="1464694250"/>
+        <w:divId w:val="951983701"/>
         <w:rPr>
           <w:rFonts w:eastAsia="Times New Roman"/>
           <w:lang w:val="es-ES"/>
@@ -8825,7 +8825,7 @@
       <w:pPr>
         <w:spacing w:before="375" w:after="225"/>
         <w:jc w:val="center"/>
-        <w:divId w:val="1895966641"/>
+        <w:divId w:val="2011987123"/>
         <w:rPr>
           <w:rFonts w:ascii="Outfit" w:eastAsia="Times New Roman" w:hAnsi="Outfit"/>
           <w:b/>
@@ -8855,7 +8855,7 @@
       <w:pPr>
         <w:spacing w:after="375"/>
         <w:jc w:val="center"/>
-        <w:divId w:val="842160126"/>
+        <w:divId w:val="520095055"/>
         <w:rPr>
           <w:rFonts w:ascii="Plus Jakarta Sans" w:eastAsia="Times New Roman" w:hAnsi="Plus Jakarta Sans"/>
           <w:lang w:val="es-ES"/>
@@ -9145,18 +9145,18 @@
     <w:p>
       <w:pPr>
         <w:spacing w:before="450" w:after="450"/>
-        <w:divId w:val="1464694250"/>
-        <w:rPr>
-          <w:rFonts w:ascii="Plus Jakarta Sans" w:eastAsia="Times New Roman" w:hAnsi="Plus Jakarta Sans"/>
-          <w:lang w:val="es-ES"/>
-        </w:rPr>
-      </w:pPr>
-      <w:r>
-        <w:rPr>
-          <w:rFonts w:ascii="Plus Jakarta Sans" w:eastAsia="Times New Roman" w:hAnsi="Plus Jakarta Sans"/>
-          <w:lang w:val="es-ES"/>
-        </w:rPr>
-        <w:pict w14:anchorId="0A406960">
+        <w:divId w:val="951983701"/>
+        <w:rPr>
+          <w:rFonts w:ascii="Plus Jakarta Sans" w:eastAsia="Times New Roman" w:hAnsi="Plus Jakarta Sans"/>
+          <w:lang w:val="es-ES"/>
+        </w:rPr>
+      </w:pPr>
+      <w:r>
+        <w:rPr>
+          <w:rFonts w:ascii="Plus Jakarta Sans" w:eastAsia="Times New Roman" w:hAnsi="Plus Jakarta Sans"/>
+          <w:lang w:val="es-ES"/>
+        </w:rPr>
+        <w:pict>
           <v:rect id="_x0000_i1033" style="width:0;height:.75pt" o:hralign="center" o:hrstd="t" o:hr="t" fillcolor="#a0a0a0" stroked="f"/>
         </w:pict>
       </w:r>
@@ -9164,7 +9164,7 @@
     <w:p>
       <w:pPr>
         <w:pStyle w:val="Ttulo2"/>
-        <w:divId w:val="1464694250"/>
+        <w:divId w:val="951983701"/>
         <w:rPr>
           <w:rFonts w:eastAsia="Times New Roman"/>
           <w:lang w:val="es-ES"/>
@@ -9181,7 +9181,7 @@
     <w:p>
       <w:pPr>
         <w:pStyle w:val="NormalWeb"/>
-        <w:divId w:val="1464694250"/>
+        <w:divId w:val="951983701"/>
         <w:rPr>
           <w:rFonts w:ascii="Plus Jakarta Sans" w:hAnsi="Plus Jakarta Sans"/>
           <w:lang w:val="es-ES"/>
@@ -9198,7 +9198,7 @@
     <w:p>
       <w:pPr>
         <w:pStyle w:val="NormalWeb"/>
-        <w:divId w:val="1464694250"/>
+        <w:divId w:val="951983701"/>
         <w:rPr>
           <w:rFonts w:ascii="Plus Jakarta Sans" w:hAnsi="Plus Jakarta Sans"/>
           <w:lang w:val="es-ES"/>
@@ -9260,7 +9260,7 @@
     <w:p>
       <w:pPr>
         <w:pStyle w:val="NormalWeb"/>
-        <w:divId w:val="1464694250"/>
+        <w:divId w:val="951983701"/>
         <w:rPr>
           <w:rFonts w:ascii="Plus Jakarta Sans" w:hAnsi="Plus Jakarta Sans"/>
           <w:lang w:val="es-ES"/>
@@ -9322,7 +9322,7 @@
     <w:p>
       <w:pPr>
         <w:pStyle w:val="NormalWeb"/>
-        <w:divId w:val="1464694250"/>
+        <w:divId w:val="951983701"/>
         <w:rPr>
           <w:rFonts w:ascii="Plus Jakarta Sans" w:hAnsi="Plus Jakarta Sans"/>
           <w:lang w:val="es-ES"/>
@@ -9383,7 +9383,7 @@
     <w:p>
       <w:pPr>
         <w:pStyle w:val="NormalWeb"/>
-        <w:divId w:val="1464694250"/>
+        <w:divId w:val="951983701"/>
         <w:rPr>
           <w:rFonts w:ascii="Plus Jakarta Sans" w:hAnsi="Plus Jakarta Sans"/>
           <w:lang w:val="es-ES"/>
@@ -9437,18 +9437,18 @@
     <w:p>
       <w:pPr>
         <w:spacing w:before="450" w:after="450"/>
-        <w:divId w:val="1464694250"/>
-        <w:rPr>
-          <w:rFonts w:ascii="Plus Jakarta Sans" w:eastAsia="Times New Roman" w:hAnsi="Plus Jakarta Sans"/>
-          <w:lang w:val="es-ES"/>
-        </w:rPr>
-      </w:pPr>
-      <w:r>
-        <w:rPr>
-          <w:rFonts w:ascii="Plus Jakarta Sans" w:eastAsia="Times New Roman" w:hAnsi="Plus Jakarta Sans"/>
-          <w:lang w:val="es-ES"/>
-        </w:rPr>
-        <w:pict w14:anchorId="64174EAE">
+        <w:divId w:val="951983701"/>
+        <w:rPr>
+          <w:rFonts w:ascii="Plus Jakarta Sans" w:eastAsia="Times New Roman" w:hAnsi="Plus Jakarta Sans"/>
+          <w:lang w:val="es-ES"/>
+        </w:rPr>
+      </w:pPr>
+      <w:r>
+        <w:rPr>
+          <w:rFonts w:ascii="Plus Jakarta Sans" w:eastAsia="Times New Roman" w:hAnsi="Plus Jakarta Sans"/>
+          <w:lang w:val="es-ES"/>
+        </w:rPr>
+        <w:pict>
           <v:rect id="_x0000_i1034" style="width:0;height:.75pt" o:hralign="center" o:hrstd="t" o:hr="t" fillcolor="#a0a0a0" stroked="f"/>
         </w:pict>
       </w:r>
@@ -9456,18 +9456,18 @@
     <w:p>
       <w:pPr>
         <w:spacing w:before="450" w:after="450"/>
-        <w:divId w:val="1464694250"/>
-        <w:rPr>
-          <w:rFonts w:ascii="Plus Jakarta Sans" w:eastAsia="Times New Roman" w:hAnsi="Plus Jakarta Sans"/>
-          <w:lang w:val="es-ES"/>
-        </w:rPr>
-      </w:pPr>
-      <w:r>
-        <w:rPr>
-          <w:rFonts w:ascii="Plus Jakarta Sans" w:eastAsia="Times New Roman" w:hAnsi="Plus Jakarta Sans"/>
-          <w:lang w:val="es-ES"/>
-        </w:rPr>
-        <w:pict w14:anchorId="6D325C00">
+        <w:divId w:val="951983701"/>
+        <w:rPr>
+          <w:rFonts w:ascii="Plus Jakarta Sans" w:eastAsia="Times New Roman" w:hAnsi="Plus Jakarta Sans"/>
+          <w:lang w:val="es-ES"/>
+        </w:rPr>
+      </w:pPr>
+      <w:r>
+        <w:rPr>
+          <w:rFonts w:ascii="Plus Jakarta Sans" w:eastAsia="Times New Roman" w:hAnsi="Plus Jakarta Sans"/>
+          <w:lang w:val="es-ES"/>
+        </w:rPr>
+        <w:pict>
           <v:rect id="_x0000_i1035" style="width:0;height:.75pt" o:hralign="center" o:hrstd="t" o:hr="t" fillcolor="#a0a0a0" stroked="f"/>
         </w:pict>
       </w:r>
@@ -9475,7 +9475,7 @@
     <w:p>
       <w:pPr>
         <w:pStyle w:val="NormalWeb"/>
-        <w:divId w:val="1464694250"/>
+        <w:divId w:val="951983701"/>
         <w:rPr>
           <w:rFonts w:ascii="Plus Jakarta Sans" w:hAnsi="Plus Jakarta Sans"/>
           <w:lang w:val="es-ES"/>
@@ -9508,7 +9508,7 @@
           <w:rFonts w:ascii="Plus Jakarta Sans" w:hAnsi="Plus Jakarta Sans"/>
           <w:lang w:val="es-ES"/>
         </w:rPr>
-        <w:pict w14:anchorId="40005054"/>
+        <w:pict/>
       </w:r>
     </w:p>
     <w:sectPr>
@@ -9524,9 +9524,9 @@
 <file path=word/numbering.xml><?xml version="1.0" encoding="utf-8"?>
 <w:numbering xmlns:wpc="http://schemas.microsoft.com/office/word/2010/wordprocessingCanvas" xmlns:cx="http://schemas.microsoft.com/office/drawing/2014/chartex" xmlns:cx1="http://schemas.microsoft.com/office/drawing/2015/9/8/chartex" xmlns:cx2="http://schemas.microsoft.com/office/drawing/2015/10/21/chartex" xmlns:cx3="http://schemas.microsoft.com/office/drawing/2016/5/9/chartex" xmlns:cx4="http://schemas.microsoft.com/office/drawing/2016/5/10/chartex" xmlns:cx5="http://schemas.microsoft.com/office/drawing/2016/5/11/chartex" xmlns:cx6="http://schemas.microsoft.com/office/drawing/2016/5/12/chartex" xmlns:cx7="http://schemas.microsoft.com/office/drawing/2016/5/13/chartex" xmlns:cx8="http://schemas.microsoft.com/office/drawing/2016/5/14/chartex" xmlns:mc="http://schemas.openxmlformats.org/markup-compatibility/2006" xmlns:aink="http://schemas.microsoft.com/office/drawing/2016/ink" xmlns:am3d="http://schemas.microsoft.com/office/drawing/2017/model3d" xmlns:o="urn:schemas-microsoft-com:office:office" xmlns:r="http://schemas.openxmlformats.org/officeDocument/2006/relationships" xmlns:m="http://schemas.openxmlformats.org/officeDocument/2006/math" xmlns:v="urn:schemas-microsoft-com:vml" xmlns:wp14="http://schemas.microsoft.com/office/word/2010/wordprocessingDrawing" xmlns:wp="http://schemas.openxmlformats.org/drawingml/2006/wordprocessingDrawing" xmlns:w10="urn:schemas-microsoft-com:office:word" xmlns:w="http://schemas.openxmlformats.org/wordprocessingml/2006/main" xmlns:w14="http://schemas.microsoft.com/office/word/2010/wordml" xmlns:w15="http://schemas.microsoft.com/office/word/2012/wordml" xmlns:w16cex="http://schemas.microsoft.com/office/word/2018/wordml/cex" xmlns:w16cid="http://schemas.microsoft.com/office/word/2016/wordml/cid" xmlns:w16="http://schemas.microsoft.com/office/word/2018/wordml" xmlns:w16sdtdh="http://schemas.microsoft.com/office/word/2020/wordml/sdtdatahash" xmlns:w16se="http://schemas.microsoft.com/office/word/2015/wordml/symex" xmlns:wpg="http://schemas.microsoft.com/office/word/2010/wordprocessingGroup" xmlns:wpi="http://schemas.microsoft.com/office/word/2010/wordprocessingInk" xmlns:wne="http://schemas.microsoft.com/office/word/2006/wordml" xmlns:wps="http://schemas.microsoft.com/office/word/2010/wordprocessingShape" mc:Ignorable="w14 w15 w16se w16cid w16 w16cex w16sdtdh wp14">
   <w:abstractNum w:abstractNumId="0" w15:restartNumberingAfterBreak="0">
-    <w:nsid w:val="03D951CA"/>
+    <w:nsid w:val="5C06215A"/>
     <w:multiLevelType w:val="multilevel"/>
-    <w:tmpl w:val="F39E90F4"/>
+    <w:tmpl w:val="597C42E0"/>
     <w:lvl w:ilvl="0">
       <w:start w:val="1"/>
       <w:numFmt w:val="bullet"/>
@@ -9673,9 +9673,9 @@
     </w:lvl>
   </w:abstractNum>
   <w:abstractNum w:abstractNumId="1" w15:restartNumberingAfterBreak="0">
-    <w:nsid w:val="042832D8"/>
+    <w:nsid w:val="6C2062CC"/>
     <w:multiLevelType w:val="multilevel"/>
-    <w:tmpl w:val="98487304"/>
+    <w:tmpl w:val="F01CFDF4"/>
     <w:lvl w:ilvl="0">
       <w:start w:val="1"/>
       <w:numFmt w:val="bullet"/>
@@ -9822,9 +9822,9 @@
     </w:lvl>
   </w:abstractNum>
   <w:abstractNum w:abstractNumId="2" w15:restartNumberingAfterBreak="0">
-    <w:nsid w:val="51D100E9"/>
+    <w:nsid w:val="71F47B0F"/>
     <w:multiLevelType w:val="multilevel"/>
-    <w:tmpl w:val="1DE41624"/>
+    <w:tmpl w:val="6F94F99C"/>
     <w:lvl w:ilvl="0">
       <w:start w:val="1"/>
       <w:numFmt w:val="bullet"/>
@@ -9971,9 +9971,9 @@
     </w:lvl>
   </w:abstractNum>
   <w:abstractNum w:abstractNumId="3" w15:restartNumberingAfterBreak="0">
-    <w:nsid w:val="62854F91"/>
+    <w:nsid w:val="77D75669"/>
     <w:multiLevelType w:val="multilevel"/>
-    <w:tmpl w:val="4F500966"/>
+    <w:tmpl w:val="8E8AE3B4"/>
     <w:lvl w:ilvl="0">
       <w:start w:val="1"/>
       <w:numFmt w:val="bullet"/>
@@ -10120,10 +10120,10 @@
     </w:lvl>
   </w:abstractNum>
   <w:num w:numId="1">
-    <w:abstractNumId w:val="2"/>
+    <w:abstractNumId w:val="0"/>
   </w:num>
   <w:num w:numId="2">
-    <w:abstractNumId w:val="0"/>
+    <w:abstractNumId w:val="2"/>
   </w:num>
   <w:num w:numId="3">
     <w:abstractNumId w:val="1"/>

</xml_diff>

<commit_message>
data: sincronizar ultimos registros de campo de QFieldCloud de los tecnicos
</commit_message>
<xml_diff>
--- a/public/informe_reunion_tecnica.docx
+++ b/public/informe_reunion_tecnica.docx
@@ -4,7 +4,7 @@
   <w:body>
     <w:p>
       <w:pPr>
-        <w:divId w:val="1253051956"/>
+        <w:divId w:val="94596251"/>
         <w:rPr>
           <w:rFonts w:ascii="Plus Jakarta Sans" w:eastAsia="Times New Roman" w:hAnsi="Plus Jakarta Sans"/>
           <w:lang w:val="es-ES"/>
@@ -28,7 +28,7 @@
     <w:p>
       <w:pPr>
         <w:pStyle w:val="Ttulo1"/>
-        <w:divId w:val="951983701"/>
+        <w:divId w:val="1889216436"/>
         <w:rPr>
           <w:rFonts w:eastAsia="Times New Roman"/>
           <w:lang w:val="es-ES"/>
@@ -45,7 +45,7 @@
     <w:p>
       <w:pPr>
         <w:pStyle w:val="NormalWeb"/>
-        <w:divId w:val="951983701"/>
+        <w:divId w:val="1889216436"/>
         <w:rPr>
           <w:rFonts w:ascii="Plus Jakarta Sans" w:hAnsi="Plus Jakarta Sans"/>
           <w:lang w:val="es-ES"/>
@@ -63,7 +63,7 @@
     <w:p>
       <w:pPr>
         <w:pStyle w:val="NormalWeb"/>
-        <w:divId w:val="951983701"/>
+        <w:divId w:val="1889216436"/>
         <w:rPr>
           <w:rFonts w:ascii="Plus Jakarta Sans" w:hAnsi="Plus Jakarta Sans"/>
           <w:lang w:val="es-ES"/>
@@ -102,18 +102,18 @@
     <w:p>
       <w:pPr>
         <w:spacing w:before="450" w:after="450"/>
-        <w:divId w:val="951983701"/>
-        <w:rPr>
-          <w:rFonts w:ascii="Plus Jakarta Sans" w:eastAsia="Times New Roman" w:hAnsi="Plus Jakarta Sans"/>
-          <w:lang w:val="es-ES"/>
-        </w:rPr>
-      </w:pPr>
-      <w:r>
-        <w:rPr>
-          <w:rFonts w:ascii="Plus Jakarta Sans" w:eastAsia="Times New Roman" w:hAnsi="Plus Jakarta Sans"/>
-          <w:lang w:val="es-ES"/>
-        </w:rPr>
-        <w:pict>
+        <w:divId w:val="1889216436"/>
+        <w:rPr>
+          <w:rFonts w:ascii="Plus Jakarta Sans" w:eastAsia="Times New Roman" w:hAnsi="Plus Jakarta Sans"/>
+          <w:lang w:val="es-ES"/>
+        </w:rPr>
+      </w:pPr>
+      <w:r>
+        <w:rPr>
+          <w:rFonts w:ascii="Plus Jakarta Sans" w:eastAsia="Times New Roman" w:hAnsi="Plus Jakarta Sans"/>
+          <w:lang w:val="es-ES"/>
+        </w:rPr>
+        <w:pict w14:anchorId="7B550A6F">
           <v:rect id="_x0000_i1025" style="width:0;height:.75pt" o:hralign="center" o:hrstd="t" o:hr="t" fillcolor="#a0a0a0" stroked="f"/>
         </w:pict>
       </w:r>
@@ -121,7 +121,7 @@
     <w:p>
       <w:pPr>
         <w:pStyle w:val="Ttulo2"/>
-        <w:divId w:val="951983701"/>
+        <w:divId w:val="1889216436"/>
         <w:rPr>
           <w:rFonts w:eastAsia="Times New Roman"/>
           <w:lang w:val="es-ES"/>
@@ -145,7 +145,7 @@
     <w:p>
       <w:pPr>
         <w:pStyle w:val="NormalWeb"/>
-        <w:divId w:val="951983701"/>
+        <w:divId w:val="1889216436"/>
         <w:rPr>
           <w:rFonts w:ascii="Plus Jakarta Sans" w:hAnsi="Plus Jakarta Sans"/>
           <w:lang w:val="es-ES"/>
@@ -167,7 +167,7 @@
         </w:numPr>
         <w:spacing w:before="100" w:beforeAutospacing="1" w:after="90"/>
         <w:ind w:left="1020"/>
-        <w:divId w:val="951983701"/>
+        <w:divId w:val="1889216436"/>
         <w:rPr>
           <w:rFonts w:ascii="Plus Jakarta Sans" w:eastAsia="Times New Roman" w:hAnsi="Plus Jakarta Sans"/>
           <w:sz w:val="21"/>
@@ -202,7 +202,7 @@
           <w:szCs w:val="21"/>
           <w:lang w:val="es-ES"/>
         </w:rPr>
-        <w:t>4,090 fichas</w:t>
+        <w:t>4,095 fichas</w:t>
       </w:r>
     </w:p>
     <w:p>
@@ -213,7 +213,7 @@
         </w:numPr>
         <w:spacing w:before="100" w:beforeAutospacing="1" w:after="90"/>
         <w:ind w:left="1020"/>
-        <w:divId w:val="951983701"/>
+        <w:divId w:val="1889216436"/>
         <w:rPr>
           <w:rFonts w:ascii="Plus Jakarta Sans" w:eastAsia="Times New Roman" w:hAnsi="Plus Jakarta Sans"/>
           <w:sz w:val="21"/>
@@ -258,7 +258,7 @@
           <w:szCs w:val="21"/>
           <w:lang w:val="es-ES"/>
         </w:rPr>
-        <w:t>3,442 polígonos unificados</w:t>
+        <w:t>2,961 polígonos unificados</w:t>
       </w:r>
     </w:p>
     <w:p>
@@ -269,7 +269,7 @@
         </w:numPr>
         <w:spacing w:before="100" w:beforeAutospacing="1" w:after="90"/>
         <w:ind w:left="1020"/>
-        <w:divId w:val="951983701"/>
+        <w:divId w:val="1889216436"/>
         <w:rPr>
           <w:rFonts w:ascii="Plus Jakarta Sans" w:eastAsia="Times New Roman" w:hAnsi="Plus Jakarta Sans"/>
           <w:sz w:val="21"/>
@@ -304,7 +304,7 @@
           <w:szCs w:val="21"/>
           <w:lang w:val="es-ES"/>
         </w:rPr>
-        <w:t>8,036 parcelas agrícolas</w:t>
+        <w:t>8,045 parcelas agrícolas</w:t>
       </w:r>
     </w:p>
     <w:p>
@@ -315,7 +315,7 @@
         </w:numPr>
         <w:spacing w:before="100" w:beforeAutospacing="1" w:after="90"/>
         <w:ind w:left="1020"/>
-        <w:divId w:val="951983701"/>
+        <w:divId w:val="1889216436"/>
         <w:rPr>
           <w:rFonts w:ascii="Plus Jakarta Sans" w:eastAsia="Times New Roman" w:hAnsi="Plus Jakarta Sans"/>
           <w:sz w:val="21"/>
@@ -350,24 +350,24 @@
           <w:szCs w:val="21"/>
           <w:lang w:val="es-ES"/>
         </w:rPr>
-        <w:t>161,774 especies pecuarias</w:t>
+        <w:t>161,920 especies pecuarias</w:t>
       </w:r>
     </w:p>
     <w:p>
       <w:pPr>
         <w:spacing w:before="450" w:after="450"/>
-        <w:divId w:val="951983701"/>
-        <w:rPr>
-          <w:rFonts w:ascii="Plus Jakarta Sans" w:eastAsia="Times New Roman" w:hAnsi="Plus Jakarta Sans"/>
-          <w:lang w:val="es-ES"/>
-        </w:rPr>
-      </w:pPr>
-      <w:r>
-        <w:rPr>
-          <w:rFonts w:ascii="Plus Jakarta Sans" w:eastAsia="Times New Roman" w:hAnsi="Plus Jakarta Sans"/>
-          <w:lang w:val="es-ES"/>
-        </w:rPr>
-        <w:pict>
+        <w:divId w:val="1889216436"/>
+        <w:rPr>
+          <w:rFonts w:ascii="Plus Jakarta Sans" w:eastAsia="Times New Roman" w:hAnsi="Plus Jakarta Sans"/>
+          <w:lang w:val="es-ES"/>
+        </w:rPr>
+      </w:pPr>
+      <w:r>
+        <w:rPr>
+          <w:rFonts w:ascii="Plus Jakarta Sans" w:eastAsia="Times New Roman" w:hAnsi="Plus Jakarta Sans"/>
+          <w:lang w:val="es-ES"/>
+        </w:rPr>
+        <w:pict w14:anchorId="087E444E">
           <v:rect id="_x0000_i1026" style="width:0;height:.75pt" o:hralign="center" o:hrstd="t" o:hr="t" fillcolor="#a0a0a0" stroked="f"/>
         </w:pict>
       </w:r>
@@ -375,7 +375,7 @@
     <w:p>
       <w:pPr>
         <w:pStyle w:val="Ttulo2"/>
-        <w:divId w:val="951983701"/>
+        <w:divId w:val="1889216436"/>
         <w:rPr>
           <w:rFonts w:eastAsia="Times New Roman"/>
           <w:lang w:val="es-ES"/>
@@ -392,7 +392,7 @@
     <w:p>
       <w:pPr>
         <w:pStyle w:val="NormalWeb"/>
-        <w:divId w:val="951983701"/>
+        <w:divId w:val="1889216436"/>
         <w:rPr>
           <w:rFonts w:ascii="Plus Jakarta Sans" w:hAnsi="Plus Jakarta Sans"/>
           <w:lang w:val="es-ES"/>
@@ -445,7 +445,7 @@
       </w:tblGrid>
       <w:tr>
         <w:trPr>
-          <w:divId w:val="1987857452"/>
+          <w:divId w:val="1987051979"/>
           <w:tblHeader/>
         </w:trPr>
         <w:tc>
@@ -525,7 +525,7 @@
       </w:tr>
       <w:tr>
         <w:trPr>
-          <w:divId w:val="1987857452"/>
+          <w:divId w:val="1987051979"/>
         </w:trPr>
         <w:tc>
           <w:tcPr>
@@ -584,14 +584,14 @@
                 <w:sz w:val="20"/>
                 <w:szCs w:val="20"/>
               </w:rPr>
-              <w:t>3,288</w:t>
+              <w:t>3,293</w:t>
             </w:r>
           </w:p>
         </w:tc>
       </w:tr>
       <w:tr>
         <w:trPr>
-          <w:divId w:val="1987857452"/>
+          <w:divId w:val="1987051979"/>
         </w:trPr>
         <w:tc>
           <w:tcPr>
@@ -657,7 +657,7 @@
       </w:tr>
       <w:tr>
         <w:trPr>
-          <w:divId w:val="1987857452"/>
+          <w:divId w:val="1987051979"/>
         </w:trPr>
         <w:tc>
           <w:tcPr>
@@ -723,7 +723,7 @@
       </w:tr>
       <w:tr>
         <w:trPr>
-          <w:divId w:val="1987857452"/>
+          <w:divId w:val="1987051979"/>
         </w:trPr>
         <w:tc>
           <w:tcPr>
@@ -791,19 +791,18 @@
     <w:p>
       <w:pPr>
         <w:spacing w:before="450" w:after="450"/>
-        <w:divId w:val="951983701"/>
-        <w:rPr>
-          <w:rFonts w:ascii="Plus Jakarta Sans" w:eastAsia="Times New Roman" w:hAnsi="Plus Jakarta Sans"/>
-          <w:lang w:val="es-ES"/>
-        </w:rPr>
-      </w:pPr>
-      <w:r>
-        <w:rPr>
-          <w:rFonts w:ascii="Plus Jakarta Sans" w:eastAsia="Times New Roman" w:hAnsi="Plus Jakarta Sans"/>
-          <w:lang w:val="es-ES"/>
-        </w:rPr>
-        <w:lastRenderedPageBreak/>
-        <w:pict>
+        <w:divId w:val="1889216436"/>
+        <w:rPr>
+          <w:rFonts w:ascii="Plus Jakarta Sans" w:eastAsia="Times New Roman" w:hAnsi="Plus Jakarta Sans"/>
+          <w:lang w:val="es-ES"/>
+        </w:rPr>
+      </w:pPr>
+      <w:r>
+        <w:rPr>
+          <w:rFonts w:ascii="Plus Jakarta Sans" w:eastAsia="Times New Roman" w:hAnsi="Plus Jakarta Sans"/>
+          <w:lang w:val="es-ES"/>
+        </w:rPr>
+        <w:pict w14:anchorId="6F0F211A">
           <v:rect id="_x0000_i1027" style="width:0;height:.75pt" o:hralign="center" o:hrstd="t" o:hr="t" fillcolor="#a0a0a0" stroked="f"/>
         </w:pict>
       </w:r>
@@ -811,7 +810,7 @@
     <w:p>
       <w:pPr>
         <w:pStyle w:val="Ttulo2"/>
-        <w:divId w:val="951983701"/>
+        <w:divId w:val="1889216436"/>
         <w:rPr>
           <w:rFonts w:eastAsia="Times New Roman"/>
           <w:lang w:val="es-ES"/>
@@ -828,7 +827,7 @@
     <w:p>
       <w:pPr>
         <w:pStyle w:val="Ttulo3"/>
-        <w:divId w:val="951983701"/>
+        <w:divId w:val="1889216436"/>
         <w:rPr>
           <w:rFonts w:eastAsia="Times New Roman"/>
           <w:lang w:val="es-ES"/>
@@ -845,7 +844,7 @@
     <w:p>
       <w:pPr>
         <w:pStyle w:val="NormalWeb"/>
-        <w:divId w:val="951983701"/>
+        <w:divId w:val="1889216436"/>
         <w:rPr>
           <w:rFonts w:ascii="Plus Jakarta Sans" w:hAnsi="Plus Jakarta Sans"/>
           <w:lang w:val="es-ES"/>
@@ -885,7 +884,7 @@
       </w:tblGrid>
       <w:tr>
         <w:trPr>
-          <w:divId w:val="605506932"/>
+          <w:divId w:val="2041397413"/>
           <w:tblHeader/>
         </w:trPr>
         <w:tc>
@@ -1039,7 +1038,7 @@
       </w:tr>
       <w:tr>
         <w:trPr>
-          <w:divId w:val="605506932"/>
+          <w:divId w:val="2041397413"/>
         </w:trPr>
         <w:tc>
           <w:tcPr>
@@ -1098,37 +1097,37 @@
                 <w:sz w:val="20"/>
                 <w:szCs w:val="20"/>
               </w:rPr>
-              <w:t>1,658</w:t>
-            </w:r>
-          </w:p>
-        </w:tc>
-        <w:tc>
-          <w:tcPr>
-            <w:tcW w:w="0" w:type="auto"/>
-            <w:tcMar>
-              <w:top w:w="150" w:type="dxa"/>
-              <w:left w:w="210" w:type="dxa"/>
-              <w:bottom w:w="150" w:type="dxa"/>
-              <w:right w:w="210" w:type="dxa"/>
-            </w:tcMar>
-            <w:vAlign w:val="center"/>
-            <w:hideMark/>
-          </w:tcPr>
-          <w:p>
-            <w:pPr>
-              <w:rPr>
-                <w:rFonts w:ascii="Plus Jakarta Sans" w:eastAsia="Times New Roman" w:hAnsi="Plus Jakarta Sans"/>
-                <w:sz w:val="20"/>
-                <w:szCs w:val="20"/>
-              </w:rPr>
-            </w:pPr>
-            <w:r>
-              <w:rPr>
-                <w:rFonts w:ascii="Plus Jakarta Sans" w:eastAsia="Times New Roman" w:hAnsi="Plus Jakarta Sans"/>
-                <w:sz w:val="20"/>
-                <w:szCs w:val="20"/>
-              </w:rPr>
-              <w:t>1,631</w:t>
+              <w:t>1,662</w:t>
+            </w:r>
+          </w:p>
+        </w:tc>
+        <w:tc>
+          <w:tcPr>
+            <w:tcW w:w="0" w:type="auto"/>
+            <w:tcMar>
+              <w:top w:w="150" w:type="dxa"/>
+              <w:left w:w="210" w:type="dxa"/>
+              <w:bottom w:w="150" w:type="dxa"/>
+              <w:right w:w="210" w:type="dxa"/>
+            </w:tcMar>
+            <w:vAlign w:val="center"/>
+            <w:hideMark/>
+          </w:tcPr>
+          <w:p>
+            <w:pPr>
+              <w:rPr>
+                <w:rFonts w:ascii="Plus Jakarta Sans" w:eastAsia="Times New Roman" w:hAnsi="Plus Jakarta Sans"/>
+                <w:sz w:val="20"/>
+                <w:szCs w:val="20"/>
+              </w:rPr>
+            </w:pPr>
+            <w:r>
+              <w:rPr>
+                <w:rFonts w:ascii="Plus Jakarta Sans" w:eastAsia="Times New Roman" w:hAnsi="Plus Jakarta Sans"/>
+                <w:sz w:val="20"/>
+                <w:szCs w:val="20"/>
+              </w:rPr>
+              <w:t>1,632</w:t>
             </w:r>
           </w:p>
         </w:tc>
@@ -1165,7 +1164,7 @@
       </w:tr>
       <w:tr>
         <w:trPr>
-          <w:divId w:val="605506932"/>
+          <w:divId w:val="2041397413"/>
         </w:trPr>
         <w:tc>
           <w:tcPr>
@@ -1224,37 +1223,37 @@
                 <w:sz w:val="20"/>
                 <w:szCs w:val="20"/>
               </w:rPr>
-              <w:t>33,338,843.39 m²</w:t>
-            </w:r>
-          </w:p>
-        </w:tc>
-        <w:tc>
-          <w:tcPr>
-            <w:tcW w:w="0" w:type="auto"/>
-            <w:tcMar>
-              <w:top w:w="150" w:type="dxa"/>
-              <w:left w:w="210" w:type="dxa"/>
-              <w:bottom w:w="150" w:type="dxa"/>
-              <w:right w:w="210" w:type="dxa"/>
-            </w:tcMar>
-            <w:vAlign w:val="center"/>
-            <w:hideMark/>
-          </w:tcPr>
-          <w:p>
-            <w:pPr>
-              <w:rPr>
-                <w:rFonts w:ascii="Plus Jakarta Sans" w:eastAsia="Times New Roman" w:hAnsi="Plus Jakarta Sans"/>
-                <w:sz w:val="20"/>
-                <w:szCs w:val="20"/>
-              </w:rPr>
-            </w:pPr>
-            <w:r>
-              <w:rPr>
-                <w:rFonts w:ascii="Plus Jakarta Sans" w:eastAsia="Times New Roman" w:hAnsi="Plus Jakarta Sans"/>
-                <w:sz w:val="20"/>
-                <w:szCs w:val="20"/>
-              </w:rPr>
-              <w:t>38,539,114.37 m²</w:t>
+              <w:t>33,392,759.56 m²</w:t>
+            </w:r>
+          </w:p>
+        </w:tc>
+        <w:tc>
+          <w:tcPr>
+            <w:tcW w:w="0" w:type="auto"/>
+            <w:tcMar>
+              <w:top w:w="150" w:type="dxa"/>
+              <w:left w:w="210" w:type="dxa"/>
+              <w:bottom w:w="150" w:type="dxa"/>
+              <w:right w:w="210" w:type="dxa"/>
+            </w:tcMar>
+            <w:vAlign w:val="center"/>
+            <w:hideMark/>
+          </w:tcPr>
+          <w:p>
+            <w:pPr>
+              <w:rPr>
+                <w:rFonts w:ascii="Plus Jakarta Sans" w:eastAsia="Times New Roman" w:hAnsi="Plus Jakarta Sans"/>
+                <w:sz w:val="20"/>
+                <w:szCs w:val="20"/>
+              </w:rPr>
+            </w:pPr>
+            <w:r>
+              <w:rPr>
+                <w:rFonts w:ascii="Plus Jakarta Sans" w:eastAsia="Times New Roman" w:hAnsi="Plus Jakarta Sans"/>
+                <w:sz w:val="20"/>
+                <w:szCs w:val="20"/>
+              </w:rPr>
+              <w:t>38,540,367.36 m²</w:t>
             </w:r>
           </w:p>
         </w:tc>
@@ -1291,7 +1290,7 @@
       </w:tr>
       <w:tr>
         <w:trPr>
-          <w:divId w:val="605506932"/>
+          <w:divId w:val="2041397413"/>
         </w:trPr>
         <w:tc>
           <w:tcPr>
@@ -1350,37 +1349,37 @@
                 <w:sz w:val="20"/>
                 <w:szCs w:val="20"/>
               </w:rPr>
-              <w:t>20,107.87 m² (2.011 ha)</w:t>
-            </w:r>
-          </w:p>
-        </w:tc>
-        <w:tc>
-          <w:tcPr>
-            <w:tcW w:w="0" w:type="auto"/>
-            <w:tcMar>
-              <w:top w:w="150" w:type="dxa"/>
-              <w:left w:w="210" w:type="dxa"/>
-              <w:bottom w:w="150" w:type="dxa"/>
-              <w:right w:w="210" w:type="dxa"/>
-            </w:tcMar>
-            <w:vAlign w:val="center"/>
-            <w:hideMark/>
-          </w:tcPr>
-          <w:p>
-            <w:pPr>
-              <w:rPr>
-                <w:rFonts w:ascii="Plus Jakarta Sans" w:eastAsia="Times New Roman" w:hAnsi="Plus Jakarta Sans"/>
-                <w:sz w:val="20"/>
-                <w:szCs w:val="20"/>
-              </w:rPr>
-            </w:pPr>
-            <w:r>
-              <w:rPr>
-                <w:rFonts w:ascii="Plus Jakarta Sans" w:eastAsia="Times New Roman" w:hAnsi="Plus Jakarta Sans"/>
-                <w:sz w:val="20"/>
-                <w:szCs w:val="20"/>
-              </w:rPr>
-              <w:t>23,629.13 m² (2.363 ha)</w:t>
+              <w:t>20,091.91 m² (2.009 ha)</w:t>
+            </w:r>
+          </w:p>
+        </w:tc>
+        <w:tc>
+          <w:tcPr>
+            <w:tcW w:w="0" w:type="auto"/>
+            <w:tcMar>
+              <w:top w:w="150" w:type="dxa"/>
+              <w:left w:w="210" w:type="dxa"/>
+              <w:bottom w:w="150" w:type="dxa"/>
+              <w:right w:w="210" w:type="dxa"/>
+            </w:tcMar>
+            <w:vAlign w:val="center"/>
+            <w:hideMark/>
+          </w:tcPr>
+          <w:p>
+            <w:pPr>
+              <w:rPr>
+                <w:rFonts w:ascii="Plus Jakarta Sans" w:eastAsia="Times New Roman" w:hAnsi="Plus Jakarta Sans"/>
+                <w:sz w:val="20"/>
+                <w:szCs w:val="20"/>
+              </w:rPr>
+            </w:pPr>
+            <w:r>
+              <w:rPr>
+                <w:rFonts w:ascii="Plus Jakarta Sans" w:eastAsia="Times New Roman" w:hAnsi="Plus Jakarta Sans"/>
+                <w:sz w:val="20"/>
+                <w:szCs w:val="20"/>
+              </w:rPr>
+              <w:t>23,615.42 m² (2.362 ha)</w:t>
             </w:r>
           </w:p>
         </w:tc>
@@ -1417,7 +1416,7 @@
       </w:tr>
       <w:tr>
         <w:trPr>
-          <w:divId w:val="605506932"/>
+          <w:divId w:val="2041397413"/>
         </w:trPr>
         <w:tc>
           <w:tcPr>
@@ -1476,37 +1475,37 @@
                 <w:sz w:val="20"/>
                 <w:szCs w:val="20"/>
               </w:rPr>
-              <w:t>29,294,675.61 m²</w:t>
-            </w:r>
-          </w:p>
-        </w:tc>
-        <w:tc>
-          <w:tcPr>
-            <w:tcW w:w="0" w:type="auto"/>
-            <w:tcMar>
-              <w:top w:w="150" w:type="dxa"/>
-              <w:left w:w="210" w:type="dxa"/>
-              <w:bottom w:w="150" w:type="dxa"/>
-              <w:right w:w="210" w:type="dxa"/>
-            </w:tcMar>
-            <w:vAlign w:val="center"/>
-            <w:hideMark/>
-          </w:tcPr>
-          <w:p>
-            <w:pPr>
-              <w:rPr>
-                <w:rFonts w:ascii="Plus Jakarta Sans" w:eastAsia="Times New Roman" w:hAnsi="Plus Jakarta Sans"/>
-                <w:sz w:val="20"/>
-                <w:szCs w:val="20"/>
-              </w:rPr>
-            </w:pPr>
-            <w:r>
-              <w:rPr>
-                <w:rFonts w:ascii="Plus Jakarta Sans" w:eastAsia="Times New Roman" w:hAnsi="Plus Jakarta Sans"/>
-                <w:sz w:val="20"/>
-                <w:szCs w:val="20"/>
-              </w:rPr>
-              <w:t>24,670,329.70 m²</w:t>
+              <w:t>29,336,220.32 m²</w:t>
+            </w:r>
+          </w:p>
+        </w:tc>
+        <w:tc>
+          <w:tcPr>
+            <w:tcW w:w="0" w:type="auto"/>
+            <w:tcMar>
+              <w:top w:w="150" w:type="dxa"/>
+              <w:left w:w="210" w:type="dxa"/>
+              <w:bottom w:w="150" w:type="dxa"/>
+              <w:right w:w="210" w:type="dxa"/>
+            </w:tcMar>
+            <w:vAlign w:val="center"/>
+            <w:hideMark/>
+          </w:tcPr>
+          <w:p>
+            <w:pPr>
+              <w:rPr>
+                <w:rFonts w:ascii="Plus Jakarta Sans" w:eastAsia="Times New Roman" w:hAnsi="Plus Jakarta Sans"/>
+                <w:sz w:val="20"/>
+                <w:szCs w:val="20"/>
+              </w:rPr>
+            </w:pPr>
+            <w:r>
+              <w:rPr>
+                <w:rFonts w:ascii="Plus Jakarta Sans" w:eastAsia="Times New Roman" w:hAnsi="Plus Jakarta Sans"/>
+                <w:sz w:val="20"/>
+                <w:szCs w:val="20"/>
+              </w:rPr>
+              <w:t>24,671,582.68 m²</w:t>
             </w:r>
           </w:p>
         </w:tc>
@@ -1543,7 +1542,7 @@
       </w:tr>
       <w:tr>
         <w:trPr>
-          <w:divId w:val="605506932"/>
+          <w:divId w:val="2041397413"/>
         </w:trPr>
         <w:tc>
           <w:tcPr>
@@ -1602,45 +1601,45 @@
                 <w:sz w:val="20"/>
                 <w:szCs w:val="20"/>
               </w:rPr>
-              <w:t>17,668.68 m² (1.767 ha)</w:t>
-            </w:r>
-          </w:p>
-        </w:tc>
-        <w:tc>
-          <w:tcPr>
-            <w:tcW w:w="0" w:type="auto"/>
-            <w:tcMar>
-              <w:top w:w="150" w:type="dxa"/>
-              <w:left w:w="210" w:type="dxa"/>
-              <w:bottom w:w="150" w:type="dxa"/>
-              <w:right w:w="210" w:type="dxa"/>
-            </w:tcMar>
-            <w:vAlign w:val="center"/>
-            <w:hideMark/>
-          </w:tcPr>
-          <w:p>
-            <w:pPr>
-              <w:rPr>
-                <w:rFonts w:ascii="Plus Jakarta Sans" w:eastAsia="Times New Roman" w:hAnsi="Plus Jakarta Sans"/>
-                <w:sz w:val="20"/>
-                <w:szCs w:val="20"/>
-              </w:rPr>
-            </w:pPr>
-            <w:r>
-              <w:rPr>
-                <w:rFonts w:ascii="Plus Jakarta Sans" w:eastAsia="Times New Roman" w:hAnsi="Plus Jakarta Sans"/>
-                <w:sz w:val="20"/>
-                <w:szCs w:val="20"/>
-              </w:rPr>
-              <w:t>15,125.89 m² (1.</w:t>
-            </w:r>
-            <w:r>
-              <w:rPr>
-                <w:rFonts w:ascii="Plus Jakarta Sans" w:eastAsia="Times New Roman" w:hAnsi="Plus Jakarta Sans"/>
-                <w:sz w:val="20"/>
-                <w:szCs w:val="20"/>
-              </w:rPr>
-              <w:t>513 ha)</w:t>
+              <w:t>17,651.16 m² (1.765 ha)</w:t>
+            </w:r>
+          </w:p>
+        </w:tc>
+        <w:tc>
+          <w:tcPr>
+            <w:tcW w:w="0" w:type="auto"/>
+            <w:tcMar>
+              <w:top w:w="150" w:type="dxa"/>
+              <w:left w:w="210" w:type="dxa"/>
+              <w:bottom w:w="150" w:type="dxa"/>
+              <w:right w:w="210" w:type="dxa"/>
+            </w:tcMar>
+            <w:vAlign w:val="center"/>
+            <w:hideMark/>
+          </w:tcPr>
+          <w:p>
+            <w:pPr>
+              <w:rPr>
+                <w:rFonts w:ascii="Plus Jakarta Sans" w:eastAsia="Times New Roman" w:hAnsi="Plus Jakarta Sans"/>
+                <w:sz w:val="20"/>
+                <w:szCs w:val="20"/>
+              </w:rPr>
+            </w:pPr>
+            <w:r>
+              <w:rPr>
+                <w:rFonts w:ascii="Plus Jakarta Sans" w:eastAsia="Times New Roman" w:hAnsi="Plus Jakarta Sans"/>
+                <w:sz w:val="20"/>
+                <w:szCs w:val="20"/>
+              </w:rPr>
+              <w:t>15,117.39 m² (1.</w:t>
+            </w:r>
+            <w:r>
+              <w:rPr>
+                <w:rFonts w:ascii="Plus Jakarta Sans" w:eastAsia="Times New Roman" w:hAnsi="Plus Jakarta Sans"/>
+                <w:sz w:val="20"/>
+                <w:szCs w:val="20"/>
+              </w:rPr>
+              <w:t>512 ha)</w:t>
             </w:r>
           </w:p>
         </w:tc>
@@ -1677,7 +1676,7 @@
       </w:tr>
       <w:tr>
         <w:trPr>
-          <w:divId w:val="605506932"/>
+          <w:divId w:val="2041397413"/>
         </w:trPr>
         <w:tc>
           <w:tcPr>
@@ -1736,7 +1735,7 @@
                 <w:sz w:val="20"/>
                 <w:szCs w:val="20"/>
               </w:rPr>
-              <w:t>4,044,167.78 m² (404.42 ha)</w:t>
+              <w:t>4,056,539.24 m² (405.65 ha)</w:t>
             </w:r>
           </w:p>
         </w:tc>
@@ -1803,7 +1802,7 @@
       </w:tr>
       <w:tr>
         <w:trPr>
-          <w:divId w:val="605506932"/>
+          <w:divId w:val="2041397413"/>
         </w:trPr>
         <w:tc>
           <w:tcPr>
@@ -1862,74 +1861,74 @@
                 <w:sz w:val="20"/>
                 <w:szCs w:val="20"/>
               </w:rPr>
-              <w:t>3,974 (49.5%)</w:t>
-            </w:r>
-          </w:p>
-        </w:tc>
-        <w:tc>
-          <w:tcPr>
-            <w:tcW w:w="0" w:type="auto"/>
-            <w:tcMar>
-              <w:top w:w="150" w:type="dxa"/>
-              <w:left w:w="210" w:type="dxa"/>
-              <w:bottom w:w="150" w:type="dxa"/>
-              <w:right w:w="210" w:type="dxa"/>
-            </w:tcMar>
-            <w:vAlign w:val="center"/>
-            <w:hideMark/>
-          </w:tcPr>
-          <w:p>
-            <w:pPr>
-              <w:rPr>
-                <w:rFonts w:ascii="Plus Jakarta Sans" w:eastAsia="Times New Roman" w:hAnsi="Plus Jakarta Sans"/>
-                <w:sz w:val="20"/>
-                <w:szCs w:val="20"/>
-              </w:rPr>
-            </w:pPr>
-            <w:r>
-              <w:rPr>
-                <w:rFonts w:ascii="Plus Jakarta Sans" w:eastAsia="Times New Roman" w:hAnsi="Plus Jakarta Sans"/>
-                <w:sz w:val="20"/>
-                <w:szCs w:val="20"/>
-              </w:rPr>
-              <w:t>2,389 (29.7%)</w:t>
-            </w:r>
-          </w:p>
-        </w:tc>
-        <w:tc>
-          <w:tcPr>
-            <w:tcW w:w="0" w:type="auto"/>
-            <w:tcMar>
-              <w:top w:w="150" w:type="dxa"/>
-              <w:left w:w="210" w:type="dxa"/>
-              <w:bottom w:w="150" w:type="dxa"/>
-              <w:right w:w="210" w:type="dxa"/>
-            </w:tcMar>
-            <w:vAlign w:val="center"/>
-            <w:hideMark/>
-          </w:tcPr>
-          <w:p>
-            <w:pPr>
-              <w:rPr>
-                <w:rFonts w:ascii="Plus Jakarta Sans" w:eastAsia="Times New Roman" w:hAnsi="Plus Jakarta Sans"/>
-                <w:sz w:val="20"/>
-                <w:szCs w:val="20"/>
-              </w:rPr>
-            </w:pPr>
-            <w:r>
-              <w:rPr>
-                <w:rFonts w:ascii="Plus Jakarta Sans" w:eastAsia="Times New Roman" w:hAnsi="Plus Jakarta Sans"/>
-                <w:sz w:val="20"/>
-                <w:szCs w:val="20"/>
-              </w:rPr>
-              <w:t>1,459 (18.2%)</w:t>
+              <w:t>3,981 (49.5%)</w:t>
+            </w:r>
+          </w:p>
+        </w:tc>
+        <w:tc>
+          <w:tcPr>
+            <w:tcW w:w="0" w:type="auto"/>
+            <w:tcMar>
+              <w:top w:w="150" w:type="dxa"/>
+              <w:left w:w="210" w:type="dxa"/>
+              <w:bottom w:w="150" w:type="dxa"/>
+              <w:right w:w="210" w:type="dxa"/>
+            </w:tcMar>
+            <w:vAlign w:val="center"/>
+            <w:hideMark/>
+          </w:tcPr>
+          <w:p>
+            <w:pPr>
+              <w:rPr>
+                <w:rFonts w:ascii="Plus Jakarta Sans" w:eastAsia="Times New Roman" w:hAnsi="Plus Jakarta Sans"/>
+                <w:sz w:val="20"/>
+                <w:szCs w:val="20"/>
+              </w:rPr>
+            </w:pPr>
+            <w:r>
+              <w:rPr>
+                <w:rFonts w:ascii="Plus Jakarta Sans" w:eastAsia="Times New Roman" w:hAnsi="Plus Jakarta Sans"/>
+                <w:sz w:val="20"/>
+                <w:szCs w:val="20"/>
+              </w:rPr>
+              <w:t>2,391 (29.7%)</w:t>
+            </w:r>
+          </w:p>
+        </w:tc>
+        <w:tc>
+          <w:tcPr>
+            <w:tcW w:w="0" w:type="auto"/>
+            <w:tcMar>
+              <w:top w:w="150" w:type="dxa"/>
+              <w:left w:w="210" w:type="dxa"/>
+              <w:bottom w:w="150" w:type="dxa"/>
+              <w:right w:w="210" w:type="dxa"/>
+            </w:tcMar>
+            <w:vAlign w:val="center"/>
+            <w:hideMark/>
+          </w:tcPr>
+          <w:p>
+            <w:pPr>
+              <w:rPr>
+                <w:rFonts w:ascii="Plus Jakarta Sans" w:eastAsia="Times New Roman" w:hAnsi="Plus Jakarta Sans"/>
+                <w:sz w:val="20"/>
+                <w:szCs w:val="20"/>
+              </w:rPr>
+            </w:pPr>
+            <w:r>
+              <w:rPr>
+                <w:rFonts w:ascii="Plus Jakarta Sans" w:eastAsia="Times New Roman" w:hAnsi="Plus Jakarta Sans"/>
+                <w:sz w:val="20"/>
+                <w:szCs w:val="20"/>
+              </w:rPr>
+              <w:t>1,459 (18.1%)</w:t>
             </w:r>
           </w:p>
         </w:tc>
       </w:tr>
       <w:tr>
         <w:trPr>
-          <w:divId w:val="605506932"/>
+          <w:divId w:val="2041397413"/>
         </w:trPr>
         <w:tc>
           <w:tcPr>
@@ -1988,37 +1987,37 @@
                 <w:sz w:val="20"/>
                 <w:szCs w:val="20"/>
               </w:rPr>
-              <w:t>45,874 (28.4%)</w:t>
-            </w:r>
-          </w:p>
-        </w:tc>
-        <w:tc>
-          <w:tcPr>
-            <w:tcW w:w="0" w:type="auto"/>
-            <w:tcMar>
-              <w:top w:w="150" w:type="dxa"/>
-              <w:left w:w="210" w:type="dxa"/>
-              <w:bottom w:w="150" w:type="dxa"/>
-              <w:right w:w="210" w:type="dxa"/>
-            </w:tcMar>
-            <w:vAlign w:val="center"/>
-            <w:hideMark/>
-          </w:tcPr>
-          <w:p>
-            <w:pPr>
-              <w:rPr>
-                <w:rFonts w:ascii="Plus Jakarta Sans" w:eastAsia="Times New Roman" w:hAnsi="Plus Jakarta Sans"/>
-                <w:sz w:val="20"/>
-                <w:szCs w:val="20"/>
-              </w:rPr>
-            </w:pPr>
-            <w:r>
-              <w:rPr>
-                <w:rFonts w:ascii="Plus Jakarta Sans" w:eastAsia="Times New Roman" w:hAnsi="Plus Jakarta Sans"/>
-                <w:sz w:val="20"/>
-                <w:szCs w:val="20"/>
-              </w:rPr>
-              <w:t>35,036 (21.7%)</w:t>
+              <w:t>45,980 (28.4%)</w:t>
+            </w:r>
+          </w:p>
+        </w:tc>
+        <w:tc>
+          <w:tcPr>
+            <w:tcW w:w="0" w:type="auto"/>
+            <w:tcMar>
+              <w:top w:w="150" w:type="dxa"/>
+              <w:left w:w="210" w:type="dxa"/>
+              <w:bottom w:w="150" w:type="dxa"/>
+              <w:right w:w="210" w:type="dxa"/>
+            </w:tcMar>
+            <w:vAlign w:val="center"/>
+            <w:hideMark/>
+          </w:tcPr>
+          <w:p>
+            <w:pPr>
+              <w:rPr>
+                <w:rFonts w:ascii="Plus Jakarta Sans" w:eastAsia="Times New Roman" w:hAnsi="Plus Jakarta Sans"/>
+                <w:sz w:val="20"/>
+                <w:szCs w:val="20"/>
+              </w:rPr>
+            </w:pPr>
+            <w:r>
+              <w:rPr>
+                <w:rFonts w:ascii="Plus Jakarta Sans" w:eastAsia="Times New Roman" w:hAnsi="Plus Jakarta Sans"/>
+                <w:sz w:val="20"/>
+                <w:szCs w:val="20"/>
+              </w:rPr>
+              <w:t>35,076 (21.7%)</w:t>
             </w:r>
           </w:p>
         </w:tc>
@@ -2057,7 +2056,7 @@
     <w:p>
       <w:pPr>
         <w:pStyle w:val="Ttulo3"/>
-        <w:divId w:val="951983701"/>
+        <w:divId w:val="1889216436"/>
         <w:rPr>
           <w:rFonts w:eastAsia="Times New Roman"/>
           <w:lang w:val="es-ES"/>
@@ -2074,7 +2073,7 @@
     <w:p>
       <w:pPr>
         <w:pStyle w:val="NormalWeb"/>
-        <w:divId w:val="951983701"/>
+        <w:divId w:val="1889216436"/>
         <w:rPr>
           <w:rFonts w:ascii="Plus Jakarta Sans" w:hAnsi="Plus Jakarta Sans"/>
           <w:lang w:val="es-ES"/>
@@ -2103,7 +2102,7 @@
         </w:numPr>
         <w:spacing w:before="100" w:beforeAutospacing="1" w:after="90"/>
         <w:ind w:left="1020"/>
-        <w:divId w:val="951983701"/>
+        <w:divId w:val="1889216436"/>
         <w:rPr>
           <w:rFonts w:ascii="Plus Jakarta Sans" w:eastAsia="Times New Roman" w:hAnsi="Plus Jakarta Sans"/>
           <w:sz w:val="21"/>
@@ -2185,7 +2184,7 @@
           <w:szCs w:val="21"/>
           <w:lang w:val="es-ES"/>
         </w:rPr>
-        <w:t>404.42 ha</w:t>
+        <w:t>405.65 ha</w:t>
       </w:r>
       <w:r>
         <w:rPr>
@@ -2205,7 +2204,7 @@
         </w:numPr>
         <w:spacing w:before="100" w:beforeAutospacing="1" w:after="90"/>
         <w:ind w:left="1020"/>
-        <w:divId w:val="951983701"/>
+        <w:divId w:val="1889216436"/>
         <w:rPr>
           <w:rFonts w:ascii="Plus Jakarta Sans" w:eastAsia="Times New Roman" w:hAnsi="Plus Jakarta Sans"/>
           <w:sz w:val="21"/>
@@ -2277,17 +2276,7 @@
           <w:szCs w:val="21"/>
           <w:lang w:val="es-ES"/>
         </w:rPr>
-        <w:t xml:space="preserve"> del ganado. Este sector mantiene una superficie de </w:t>
-      </w:r>
-      <w:r>
-        <w:rPr>
-          <w:rFonts w:ascii="Plus Jakarta Sans" w:eastAsia="Times New Roman" w:hAnsi="Plus Jakarta Sans"/>
-          <w:sz w:val="21"/>
-          <w:szCs w:val="21"/>
-          <w:lang w:val="es-ES"/>
-        </w:rPr>
-        <w:lastRenderedPageBreak/>
-        <w:t xml:space="preserve">secano de </w:t>
+        <w:t xml:space="preserve"> del ganado. Este sector mantiene una superficie de secano de </w:t>
       </w:r>
       <w:r>
         <w:rPr>
@@ -2317,7 +2306,7 @@
         </w:numPr>
         <w:spacing w:before="100" w:beforeAutospacing="1" w:after="90"/>
         <w:ind w:left="1020"/>
-        <w:divId w:val="951983701"/>
+        <w:divId w:val="1889216436"/>
         <w:rPr>
           <w:rFonts w:ascii="Plus Jakarta Sans" w:eastAsia="Times New Roman" w:hAnsi="Plus Jakarta Sans"/>
           <w:sz w:val="21"/>
@@ -2399,7 +2388,7 @@
           <w:szCs w:val="21"/>
           <w:lang w:val="es-ES"/>
         </w:rPr>
-        <w:t>18.2%</w:t>
+        <w:t>18.1%</w:t>
       </w:r>
       <w:r>
         <w:rPr>
@@ -2423,7 +2412,7 @@
     <w:p>
       <w:pPr>
         <w:pStyle w:val="Ttulo3"/>
-        <w:divId w:val="951983701"/>
+        <w:divId w:val="1889216436"/>
         <w:rPr>
           <w:rFonts w:eastAsia="Times New Roman"/>
           <w:lang w:val="es-ES"/>
@@ -2439,8 +2428,9 @@
     </w:p>
     <w:p>
       <w:pPr>
+        <w:spacing w:before="375" w:after="225"/>
         <w:jc w:val="center"/>
-        <w:divId w:val="1107308817"/>
+        <w:divId w:val="1085107930"/>
         <w:rPr>
           <w:rFonts w:ascii="Outfit" w:eastAsia="Times New Roman" w:hAnsi="Outfit"/>
           <w:b/>
@@ -2469,7 +2459,7 @@
     <w:p>
       <w:pPr>
         <w:jc w:val="center"/>
-        <w:divId w:val="1715764319"/>
+        <w:divId w:val="951011909"/>
         <w:rPr>
           <w:rFonts w:ascii="Plus Jakarta Sans" w:eastAsia="Times New Roman" w:hAnsi="Plus Jakarta Sans"/>
           <w:lang w:val="es-ES"/>
@@ -2864,18 +2854,18 @@
     <w:p>
       <w:pPr>
         <w:spacing w:before="450" w:after="450"/>
-        <w:divId w:val="951983701"/>
-        <w:rPr>
-          <w:rFonts w:ascii="Plus Jakarta Sans" w:eastAsia="Times New Roman" w:hAnsi="Plus Jakarta Sans"/>
-          <w:lang w:val="es-ES"/>
-        </w:rPr>
-      </w:pPr>
-      <w:r>
-        <w:rPr>
-          <w:rFonts w:ascii="Plus Jakarta Sans" w:eastAsia="Times New Roman" w:hAnsi="Plus Jakarta Sans"/>
-          <w:lang w:val="es-ES"/>
-        </w:rPr>
-        <w:pict>
+        <w:divId w:val="1889216436"/>
+        <w:rPr>
+          <w:rFonts w:ascii="Plus Jakarta Sans" w:eastAsia="Times New Roman" w:hAnsi="Plus Jakarta Sans"/>
+          <w:lang w:val="es-ES"/>
+        </w:rPr>
+      </w:pPr>
+      <w:r>
+        <w:rPr>
+          <w:rFonts w:ascii="Plus Jakarta Sans" w:eastAsia="Times New Roman" w:hAnsi="Plus Jakarta Sans"/>
+          <w:lang w:val="es-ES"/>
+        </w:rPr>
+        <w:pict w14:anchorId="3275C833">
           <v:rect id="_x0000_i1028" style="width:0;height:.75pt" o:hralign="center" o:hrstd="t" o:hr="t" fillcolor="#a0a0a0" stroked="f"/>
         </w:pict>
       </w:r>
@@ -2883,7 +2873,7 @@
     <w:p>
       <w:pPr>
         <w:pStyle w:val="Ttulo3"/>
-        <w:divId w:val="951983701"/>
+        <w:divId w:val="1889216436"/>
         <w:rPr>
           <w:rFonts w:eastAsia="Times New Roman"/>
           <w:lang w:val="es-ES"/>
@@ -2900,7 +2890,7 @@
     <w:p>
       <w:pPr>
         <w:pStyle w:val="NormalWeb"/>
-        <w:divId w:val="951983701"/>
+        <w:divId w:val="1889216436"/>
         <w:rPr>
           <w:rFonts w:ascii="Plus Jakarta Sans" w:hAnsi="Plus Jakarta Sans"/>
           <w:lang w:val="es-ES"/>
@@ -2933,7 +2923,7 @@
       </w:tblGrid>
       <w:tr>
         <w:trPr>
-          <w:divId w:val="1315405389"/>
+          <w:divId w:val="195390231"/>
           <w:tblHeader/>
         </w:trPr>
         <w:tc>
@@ -3087,7 +3077,7 @@
       </w:tr>
       <w:tr>
         <w:trPr>
-          <w:divId w:val="1315405389"/>
+          <w:divId w:val="195390231"/>
         </w:trPr>
         <w:tc>
           <w:tcPr>
@@ -3221,7 +3211,7 @@
       </w:tr>
       <w:tr>
         <w:trPr>
-          <w:divId w:val="1315405389"/>
+          <w:divId w:val="195390231"/>
         </w:trPr>
         <w:tc>
           <w:tcPr>
@@ -3288,37 +3278,37 @@
                 <w:sz w:val="20"/>
                 <w:szCs w:val="20"/>
               </w:rPr>
-              <w:t>523 (31.5%)</w:t>
-            </w:r>
-          </w:p>
-        </w:tc>
-        <w:tc>
-          <w:tcPr>
-            <w:tcW w:w="0" w:type="auto"/>
-            <w:tcMar>
-              <w:top w:w="150" w:type="dxa"/>
-              <w:left w:w="210" w:type="dxa"/>
-              <w:bottom w:w="150" w:type="dxa"/>
-              <w:right w:w="210" w:type="dxa"/>
-            </w:tcMar>
-            <w:vAlign w:val="center"/>
-            <w:hideMark/>
-          </w:tcPr>
-          <w:p>
-            <w:pPr>
-              <w:rPr>
-                <w:rFonts w:ascii="Plus Jakarta Sans" w:eastAsia="Times New Roman" w:hAnsi="Plus Jakarta Sans"/>
-                <w:sz w:val="20"/>
-                <w:szCs w:val="20"/>
-              </w:rPr>
-            </w:pPr>
-            <w:r>
-              <w:rPr>
-                <w:rFonts w:ascii="Plus Jakarta Sans" w:eastAsia="Times New Roman" w:hAnsi="Plus Jakarta Sans"/>
-                <w:sz w:val="20"/>
-                <w:szCs w:val="20"/>
-              </w:rPr>
-              <w:t>463 (28.4%)</w:t>
+              <w:t>525 (31.6%)</w:t>
+            </w:r>
+          </w:p>
+        </w:tc>
+        <w:tc>
+          <w:tcPr>
+            <w:tcW w:w="0" w:type="auto"/>
+            <w:tcMar>
+              <w:top w:w="150" w:type="dxa"/>
+              <w:left w:w="210" w:type="dxa"/>
+              <w:bottom w:w="150" w:type="dxa"/>
+              <w:right w:w="210" w:type="dxa"/>
+            </w:tcMar>
+            <w:vAlign w:val="center"/>
+            <w:hideMark/>
+          </w:tcPr>
+          <w:p>
+            <w:pPr>
+              <w:rPr>
+                <w:rFonts w:ascii="Plus Jakarta Sans" w:eastAsia="Times New Roman" w:hAnsi="Plus Jakarta Sans"/>
+                <w:sz w:val="20"/>
+                <w:szCs w:val="20"/>
+              </w:rPr>
+            </w:pPr>
+            <w:r>
+              <w:rPr>
+                <w:rFonts w:ascii="Plus Jakarta Sans" w:eastAsia="Times New Roman" w:hAnsi="Plus Jakarta Sans"/>
+                <w:sz w:val="20"/>
+                <w:szCs w:val="20"/>
+              </w:rPr>
+              <w:t>464 (28.4%)</w:t>
             </w:r>
           </w:p>
         </w:tc>
@@ -3355,7 +3345,7 @@
       </w:tr>
       <w:tr>
         <w:trPr>
-          <w:divId w:val="1315405389"/>
+          <w:divId w:val="195390231"/>
         </w:trPr>
         <w:tc>
           <w:tcPr>
@@ -3422,7 +3412,7 @@
                 <w:sz w:val="20"/>
                 <w:szCs w:val="20"/>
               </w:rPr>
-              <w:t>457 (27.6%)</w:t>
+              <w:t>457 (27.5%)</w:t>
             </w:r>
           </w:p>
         </w:tc>
@@ -3489,7 +3479,7 @@
       </w:tr>
       <w:tr>
         <w:trPr>
-          <w:divId w:val="1315405389"/>
+          <w:divId w:val="195390231"/>
         </w:trPr>
         <w:tc>
           <w:tcPr>
@@ -3556,37 +3546,37 @@
                 <w:sz w:val="20"/>
                 <w:szCs w:val="20"/>
               </w:rPr>
-              <w:t>564 (34.0%)</w:t>
-            </w:r>
-          </w:p>
-        </w:tc>
-        <w:tc>
-          <w:tcPr>
-            <w:tcW w:w="0" w:type="auto"/>
-            <w:tcMar>
-              <w:top w:w="150" w:type="dxa"/>
-              <w:left w:w="210" w:type="dxa"/>
-              <w:bottom w:w="150" w:type="dxa"/>
-              <w:right w:w="210" w:type="dxa"/>
-            </w:tcMar>
-            <w:vAlign w:val="center"/>
-            <w:hideMark/>
-          </w:tcPr>
-          <w:p>
-            <w:pPr>
-              <w:rPr>
-                <w:rFonts w:ascii="Plus Jakarta Sans" w:eastAsia="Times New Roman" w:hAnsi="Plus Jakarta Sans"/>
-                <w:sz w:val="20"/>
-                <w:szCs w:val="20"/>
-              </w:rPr>
-            </w:pPr>
-            <w:r>
-              <w:rPr>
-                <w:rFonts w:ascii="Plus Jakarta Sans" w:eastAsia="Times New Roman" w:hAnsi="Plus Jakarta Sans"/>
-                <w:sz w:val="20"/>
-                <w:szCs w:val="20"/>
-              </w:rPr>
-              <w:t>709 (43.5%)</w:t>
+              <w:t>566 (34.1%)</w:t>
+            </w:r>
+          </w:p>
+        </w:tc>
+        <w:tc>
+          <w:tcPr>
+            <w:tcW w:w="0" w:type="auto"/>
+            <w:tcMar>
+              <w:top w:w="150" w:type="dxa"/>
+              <w:left w:w="210" w:type="dxa"/>
+              <w:bottom w:w="150" w:type="dxa"/>
+              <w:right w:w="210" w:type="dxa"/>
+            </w:tcMar>
+            <w:vAlign w:val="center"/>
+            <w:hideMark/>
+          </w:tcPr>
+          <w:p>
+            <w:pPr>
+              <w:rPr>
+                <w:rFonts w:ascii="Plus Jakarta Sans" w:eastAsia="Times New Roman" w:hAnsi="Plus Jakarta Sans"/>
+                <w:sz w:val="20"/>
+                <w:szCs w:val="20"/>
+              </w:rPr>
+            </w:pPr>
+            <w:r>
+              <w:rPr>
+                <w:rFonts w:ascii="Plus Jakarta Sans" w:eastAsia="Times New Roman" w:hAnsi="Plus Jakarta Sans"/>
+                <w:sz w:val="20"/>
+                <w:szCs w:val="20"/>
+              </w:rPr>
+              <w:t>709 (43.4%)</w:t>
             </w:r>
           </w:p>
         </w:tc>
@@ -3623,7 +3613,7 @@
       </w:tr>
       <w:tr>
         <w:trPr>
-          <w:divId w:val="1315405389"/>
+          <w:divId w:val="195390231"/>
         </w:trPr>
         <w:tc>
           <w:tcPr>
@@ -3757,7 +3747,7 @@
       </w:tr>
       <w:tr>
         <w:trPr>
-          <w:divId w:val="1315405389"/>
+          <w:divId w:val="195390231"/>
         </w:trPr>
         <w:tc>
           <w:tcPr>
@@ -3893,7 +3883,7 @@
     <w:p>
       <w:pPr>
         <w:pStyle w:val="Ttulo3"/>
-        <w:divId w:val="951983701"/>
+        <w:divId w:val="1889216436"/>
         <w:rPr>
           <w:rFonts w:eastAsia="Times New Roman"/>
           <w:lang w:val="es-ES"/>
@@ -3909,8 +3899,9 @@
     </w:p>
     <w:p>
       <w:pPr>
+        <w:spacing w:before="375" w:after="225"/>
         <w:jc w:val="center"/>
-        <w:divId w:val="36247426"/>
+        <w:divId w:val="1741948142"/>
         <w:rPr>
           <w:rFonts w:ascii="Outfit" w:eastAsia="Times New Roman" w:hAnsi="Outfit"/>
           <w:b/>
@@ -3938,8 +3929,9 @@
     </w:p>
     <w:p>
       <w:pPr>
+        <w:spacing w:after="375"/>
         <w:jc w:val="center"/>
-        <w:divId w:val="1876504589"/>
+        <w:divId w:val="965896291"/>
         <w:rPr>
           <w:rFonts w:ascii="Plus Jakarta Sans" w:eastAsia="Times New Roman" w:hAnsi="Plus Jakarta Sans"/>
           <w:lang w:val="es-ES"/>
@@ -4313,19 +4305,18 @@
     <w:p>
       <w:pPr>
         <w:spacing w:before="450" w:after="450"/>
-        <w:divId w:val="951983701"/>
-        <w:rPr>
-          <w:rFonts w:ascii="Plus Jakarta Sans" w:eastAsia="Times New Roman" w:hAnsi="Plus Jakarta Sans"/>
-          <w:lang w:val="es-ES"/>
-        </w:rPr>
-      </w:pPr>
-      <w:r>
-        <w:rPr>
-          <w:rFonts w:ascii="Plus Jakarta Sans" w:eastAsia="Times New Roman" w:hAnsi="Plus Jakarta Sans"/>
-          <w:lang w:val="es-ES"/>
-        </w:rPr>
-        <w:lastRenderedPageBreak/>
-        <w:pict>
+        <w:divId w:val="1889216436"/>
+        <w:rPr>
+          <w:rFonts w:ascii="Plus Jakarta Sans" w:eastAsia="Times New Roman" w:hAnsi="Plus Jakarta Sans"/>
+          <w:lang w:val="es-ES"/>
+        </w:rPr>
+      </w:pPr>
+      <w:r>
+        <w:rPr>
+          <w:rFonts w:ascii="Plus Jakarta Sans" w:eastAsia="Times New Roman" w:hAnsi="Plus Jakarta Sans"/>
+          <w:lang w:val="es-ES"/>
+        </w:rPr>
+        <w:pict w14:anchorId="6B8E19C7">
           <v:rect id="_x0000_i1029" style="width:0;height:.75pt" o:hralign="center" o:hrstd="t" o:hr="t" fillcolor="#a0a0a0" stroked="f"/>
         </w:pict>
       </w:r>
@@ -4333,7 +4324,7 @@
     <w:p>
       <w:pPr>
         <w:pStyle w:val="Ttulo3"/>
-        <w:divId w:val="951983701"/>
+        <w:divId w:val="1889216436"/>
         <w:rPr>
           <w:rFonts w:eastAsia="Times New Roman"/>
           <w:lang w:val="es-ES"/>
@@ -4350,7 +4341,7 @@
     <w:p>
       <w:pPr>
         <w:pStyle w:val="NormalWeb"/>
-        <w:divId w:val="951983701"/>
+        <w:divId w:val="1889216436"/>
         <w:rPr>
           <w:rFonts w:ascii="Plus Jakarta Sans" w:hAnsi="Plus Jakarta Sans"/>
           <w:lang w:val="es-ES"/>
@@ -4372,7 +4363,7 @@
         </w:numPr>
         <w:spacing w:before="100" w:beforeAutospacing="1" w:after="90"/>
         <w:ind w:left="1020"/>
-        <w:divId w:val="951983701"/>
+        <w:divId w:val="1889216436"/>
         <w:rPr>
           <w:rFonts w:ascii="Plus Jakarta Sans" w:eastAsia="Times New Roman" w:hAnsi="Plus Jakarta Sans"/>
           <w:sz w:val="21"/>
@@ -4408,7 +4399,7 @@
         </w:numPr>
         <w:spacing w:before="100" w:beforeAutospacing="1" w:after="90"/>
         <w:ind w:left="1020"/>
-        <w:divId w:val="951983701"/>
+        <w:divId w:val="1889216436"/>
         <w:rPr>
           <w:rFonts w:ascii="Plus Jakarta Sans" w:eastAsia="Times New Roman" w:hAnsi="Plus Jakarta Sans"/>
           <w:sz w:val="21"/>
@@ -4453,7 +4444,7 @@
         </w:numPr>
         <w:spacing w:before="100" w:beforeAutospacing="1" w:after="90"/>
         <w:ind w:left="1020"/>
-        <w:divId w:val="951983701"/>
+        <w:divId w:val="1889216436"/>
         <w:rPr>
           <w:rFonts w:ascii="Plus Jakarta Sans" w:eastAsia="Times New Roman" w:hAnsi="Plus Jakarta Sans"/>
           <w:sz w:val="21"/>
@@ -4498,7 +4489,7 @@
         </w:numPr>
         <w:spacing w:before="100" w:beforeAutospacing="1" w:after="90"/>
         <w:ind w:left="1020"/>
-        <w:divId w:val="951983701"/>
+        <w:divId w:val="1889216436"/>
         <w:rPr>
           <w:rFonts w:ascii="Plus Jakarta Sans" w:eastAsia="Times New Roman" w:hAnsi="Plus Jakarta Sans"/>
           <w:sz w:val="21"/>
@@ -4554,7 +4545,7 @@
       </w:tblGrid>
       <w:tr>
         <w:trPr>
-          <w:divId w:val="1114524151"/>
+          <w:divId w:val="332033459"/>
           <w:tblHeader/>
         </w:trPr>
         <w:tc>
@@ -4708,7 +4699,7 @@
       </w:tr>
       <w:tr>
         <w:trPr>
-          <w:divId w:val="1114524151"/>
+          <w:divId w:val="332033459"/>
         </w:trPr>
         <w:tc>
           <w:tcPr>
@@ -4834,7 +4825,7 @@
       </w:tr>
       <w:tr>
         <w:trPr>
-          <w:divId w:val="1114524151"/>
+          <w:divId w:val="332033459"/>
         </w:trPr>
         <w:tc>
           <w:tcPr>
@@ -4893,7 +4884,7 @@
                 <w:sz w:val="20"/>
                 <w:szCs w:val="20"/>
               </w:rPr>
-              <w:t>566 (34.1%)</w:t>
+              <w:t>568 (34.2%)</w:t>
             </w:r>
           </w:p>
         </w:tc>
@@ -4960,7 +4951,7 @@
       </w:tr>
       <w:tr>
         <w:trPr>
-          <w:divId w:val="1114524151"/>
+          <w:divId w:val="332033459"/>
         </w:trPr>
         <w:tc>
           <w:tcPr>
@@ -5019,7 +5010,7 @@
                 <w:sz w:val="20"/>
                 <w:szCs w:val="20"/>
               </w:rPr>
-              <w:t>571 (34.4%)</w:t>
+              <w:t>573 (34.5%)</w:t>
             </w:r>
           </w:p>
         </w:tc>
@@ -5086,7 +5077,7 @@
       </w:tr>
       <w:tr>
         <w:trPr>
-          <w:divId w:val="1114524151"/>
+          <w:divId w:val="332033459"/>
         </w:trPr>
         <w:tc>
           <w:tcPr>
@@ -5175,7 +5166,7 @@
                 <w:sz w:val="20"/>
                 <w:szCs w:val="20"/>
               </w:rPr>
-              <w:t>236 (14.5%)</w:t>
+              <w:t>237 (14.5%)</w:t>
             </w:r>
           </w:p>
         </w:tc>
@@ -5214,18 +5205,18 @@
     <w:p>
       <w:pPr>
         <w:spacing w:before="450" w:after="450"/>
-        <w:divId w:val="951983701"/>
-        <w:rPr>
-          <w:rFonts w:ascii="Plus Jakarta Sans" w:eastAsia="Times New Roman" w:hAnsi="Plus Jakarta Sans"/>
-          <w:lang w:val="es-ES"/>
-        </w:rPr>
-      </w:pPr>
-      <w:r>
-        <w:rPr>
-          <w:rFonts w:ascii="Plus Jakarta Sans" w:eastAsia="Times New Roman" w:hAnsi="Plus Jakarta Sans"/>
-          <w:lang w:val="es-ES"/>
-        </w:rPr>
-        <w:pict>
+        <w:divId w:val="1889216436"/>
+        <w:rPr>
+          <w:rFonts w:ascii="Plus Jakarta Sans" w:eastAsia="Times New Roman" w:hAnsi="Plus Jakarta Sans"/>
+          <w:lang w:val="es-ES"/>
+        </w:rPr>
+      </w:pPr>
+      <w:r>
+        <w:rPr>
+          <w:rFonts w:ascii="Plus Jakarta Sans" w:eastAsia="Times New Roman" w:hAnsi="Plus Jakarta Sans"/>
+          <w:lang w:val="es-ES"/>
+        </w:rPr>
+        <w:pict w14:anchorId="457FCB8C">
           <v:rect id="_x0000_i1030" style="width:0;height:.75pt" o:hralign="center" o:hrstd="t" o:hr="t" fillcolor="#a0a0a0" stroked="f"/>
         </w:pict>
       </w:r>
@@ -5233,7 +5224,7 @@
     <w:p>
       <w:pPr>
         <w:pStyle w:val="Ttulo3"/>
-        <w:divId w:val="951983701"/>
+        <w:divId w:val="1889216436"/>
         <w:rPr>
           <w:rFonts w:eastAsia="Times New Roman"/>
           <w:lang w:val="es-ES"/>
@@ -5250,7 +5241,7 @@
     <w:p>
       <w:pPr>
         <w:pStyle w:val="NormalWeb"/>
-        <w:divId w:val="951983701"/>
+        <w:divId w:val="1889216436"/>
         <w:rPr>
           <w:rFonts w:ascii="Plus Jakarta Sans" w:hAnsi="Plus Jakarta Sans"/>
           <w:lang w:val="es-ES"/>
@@ -5274,7 +5265,7 @@
     <w:p>
       <w:pPr>
         <w:pStyle w:val="Ttulo4"/>
-        <w:divId w:val="951983701"/>
+        <w:divId w:val="1889216436"/>
         <w:rPr>
           <w:rFonts w:eastAsia="Times New Roman"/>
           <w:lang w:val="es-ES"/>
@@ -5290,8 +5281,9 @@
     </w:p>
     <w:p>
       <w:pPr>
+        <w:spacing w:before="375" w:after="225"/>
         <w:jc w:val="center"/>
-        <w:divId w:val="493187689"/>
+        <w:divId w:val="82847537"/>
         <w:rPr>
           <w:rFonts w:ascii="Outfit" w:eastAsia="Times New Roman" w:hAnsi="Outfit"/>
           <w:b/>
@@ -5319,8 +5311,9 @@
     </w:p>
     <w:p>
       <w:pPr>
+        <w:spacing w:after="375"/>
         <w:jc w:val="center"/>
-        <w:divId w:val="1431967642"/>
+        <w:divId w:val="244263598"/>
         <w:rPr>
           <w:rFonts w:ascii="Plus Jakarta Sans" w:eastAsia="Times New Roman" w:hAnsi="Plus Jakarta Sans"/>
           <w:lang w:val="es-ES"/>
@@ -5499,7 +5492,7 @@
           <w:rFonts w:ascii="Plus Jakarta Sans" w:eastAsia="Times New Roman" w:hAnsi="Plus Jakarta Sans"/>
           <w:lang w:val="es-ES"/>
         </w:rPr>
-        <w:t>50.8% (3,974 cultivos</w:t>
+        <w:t>50.8% (3,981 cultivos</w:t>
       </w:r>
       <w:r>
         <w:rPr>
@@ -5541,7 +5534,7 @@
           <w:rFonts w:ascii="Plus Jakarta Sans" w:eastAsia="Times New Roman" w:hAnsi="Plus Jakarta Sans"/>
           <w:lang w:val="es-ES"/>
         </w:rPr>
-        <w:t>30.5% (2,389 cultivos</w:t>
+        <w:t>30.5% (2,391 cultivos</w:t>
       </w:r>
       <w:r>
         <w:rPr>
@@ -5583,7 +5576,7 @@
           <w:rFonts w:ascii="Plus Jakarta Sans" w:eastAsia="Times New Roman" w:hAnsi="Plus Jakarta Sans"/>
           <w:lang w:val="es-ES"/>
         </w:rPr>
-        <w:t>18.7% (1,459 cultivos</w:t>
+        <w:t>18.6% (1,459 cultivos</w:t>
       </w:r>
       <w:r>
         <w:rPr>
@@ -5603,7 +5596,7 @@
     <w:p>
       <w:pPr>
         <w:pStyle w:val="Ttulo4"/>
-        <w:divId w:val="951983701"/>
+        <w:divId w:val="1889216436"/>
         <w:rPr>
           <w:rFonts w:eastAsia="Times New Roman"/>
           <w:lang w:val="es-ES"/>
@@ -5626,8 +5619,9 @@
     </w:p>
     <w:p>
       <w:pPr>
+        <w:spacing w:before="375" w:after="225"/>
         <w:jc w:val="center"/>
-        <w:divId w:val="2131321560"/>
+        <w:divId w:val="1551378958"/>
         <w:rPr>
           <w:rFonts w:ascii="Outfit" w:eastAsia="Times New Roman" w:hAnsi="Outfit"/>
           <w:b/>
@@ -5655,8 +5649,9 @@
     </w:p>
     <w:p>
       <w:pPr>
+        <w:spacing w:after="375"/>
         <w:jc w:val="center"/>
-        <w:divId w:val="638189850"/>
+        <w:divId w:val="1552766514"/>
         <w:rPr>
           <w:rFonts w:ascii="Plus Jakarta Sans" w:eastAsia="Times New Roman" w:hAnsi="Plus Jakarta Sans"/>
           <w:lang w:val="es-ES"/>
@@ -5974,7 +5969,7 @@
     <w:p>
       <w:pPr>
         <w:pStyle w:val="Ttulo4"/>
-        <w:divId w:val="951983701"/>
+        <w:divId w:val="1889216436"/>
         <w:rPr>
           <w:rFonts w:eastAsia="Times New Roman"/>
           <w:lang w:val="es-ES"/>
@@ -5985,14 +5980,14 @@
           <w:rFonts w:eastAsia="Times New Roman"/>
           <w:lang w:val="es-ES"/>
         </w:rPr>
-        <w:lastRenderedPageBreak/>
         <w:t>Destino de la Producción Agrícola por Sector:</w:t>
       </w:r>
     </w:p>
     <w:p>
       <w:pPr>
+        <w:spacing w:before="375" w:after="225"/>
         <w:jc w:val="center"/>
-        <w:divId w:val="1131287292"/>
+        <w:divId w:val="1746999839"/>
         <w:rPr>
           <w:rFonts w:ascii="Outfit" w:eastAsia="Times New Roman" w:hAnsi="Outfit"/>
           <w:b/>
@@ -6020,8 +6015,9 @@
     </w:p>
     <w:p>
       <w:pPr>
+        <w:spacing w:after="375"/>
         <w:jc w:val="center"/>
-        <w:divId w:val="1765223530"/>
+        <w:divId w:val="406541084"/>
         <w:rPr>
           <w:rFonts w:ascii="Plus Jakarta Sans" w:eastAsia="Times New Roman" w:hAnsi="Plus Jakarta Sans"/>
           <w:lang w:val="es-ES"/>
@@ -6325,18 +6321,18 @@
     <w:p>
       <w:pPr>
         <w:spacing w:before="450" w:after="450"/>
-        <w:divId w:val="951983701"/>
-        <w:rPr>
-          <w:rFonts w:ascii="Plus Jakarta Sans" w:eastAsia="Times New Roman" w:hAnsi="Plus Jakarta Sans"/>
-          <w:lang w:val="es-ES"/>
-        </w:rPr>
-      </w:pPr>
-      <w:r>
-        <w:rPr>
-          <w:rFonts w:ascii="Plus Jakarta Sans" w:eastAsia="Times New Roman" w:hAnsi="Plus Jakarta Sans"/>
-          <w:lang w:val="es-ES"/>
-        </w:rPr>
-        <w:pict>
+        <w:divId w:val="1889216436"/>
+        <w:rPr>
+          <w:rFonts w:ascii="Plus Jakarta Sans" w:eastAsia="Times New Roman" w:hAnsi="Plus Jakarta Sans"/>
+          <w:lang w:val="es-ES"/>
+        </w:rPr>
+      </w:pPr>
+      <w:r>
+        <w:rPr>
+          <w:rFonts w:ascii="Plus Jakarta Sans" w:eastAsia="Times New Roman" w:hAnsi="Plus Jakarta Sans"/>
+          <w:lang w:val="es-ES"/>
+        </w:rPr>
+        <w:pict w14:anchorId="52B09532">
           <v:rect id="_x0000_i1031" style="width:0;height:.75pt" o:hralign="center" o:hrstd="t" o:hr="t" fillcolor="#a0a0a0" stroked="f"/>
         </w:pict>
       </w:r>
@@ -6344,7 +6340,7 @@
     <w:p>
       <w:pPr>
         <w:pStyle w:val="Ttulo3"/>
-        <w:divId w:val="951983701"/>
+        <w:divId w:val="1889216436"/>
         <w:rPr>
           <w:rFonts w:eastAsia="Times New Roman"/>
           <w:lang w:val="es-ES"/>
@@ -6361,7 +6357,7 @@
     <w:p>
       <w:pPr>
         <w:pStyle w:val="NormalWeb"/>
-        <w:divId w:val="951983701"/>
+        <w:divId w:val="1889216436"/>
         <w:rPr>
           <w:rFonts w:ascii="Plus Jakarta Sans" w:hAnsi="Plus Jakarta Sans"/>
           <w:lang w:val="es-ES"/>
@@ -6385,7 +6381,7 @@
     <w:p>
       <w:pPr>
         <w:pStyle w:val="Ttulo4"/>
-        <w:divId w:val="951983701"/>
+        <w:divId w:val="1889216436"/>
         <w:rPr>
           <w:rFonts w:eastAsia="Times New Roman"/>
           <w:lang w:val="es-ES"/>
@@ -6402,7 +6398,7 @@
     <w:p>
       <w:pPr>
         <w:pStyle w:val="NormalWeb"/>
-        <w:divId w:val="951983701"/>
+        <w:divId w:val="1889216436"/>
         <w:rPr>
           <w:rFonts w:ascii="Plus Jakarta Sans" w:hAnsi="Plus Jakarta Sans"/>
           <w:lang w:val="es-ES"/>
@@ -6433,7 +6429,7 @@
       </w:tblGrid>
       <w:tr>
         <w:trPr>
-          <w:divId w:val="1807967311"/>
+          <w:divId w:val="2029676551"/>
           <w:tblHeader/>
         </w:trPr>
         <w:tc>
@@ -6513,7 +6509,7 @@
       </w:tr>
       <w:tr>
         <w:trPr>
-          <w:divId w:val="1807967311"/>
+          <w:divId w:val="2029676551"/>
         </w:trPr>
         <w:tc>
           <w:tcPr>
@@ -6602,7 +6598,7 @@
     <w:p>
       <w:pPr>
         <w:pStyle w:val="Ttulo4"/>
-        <w:divId w:val="951983701"/>
+        <w:divId w:val="1889216436"/>
         <w:rPr>
           <w:rFonts w:eastAsia="Times New Roman"/>
           <w:lang w:val="es-ES"/>
@@ -6619,7 +6615,7 @@
     <w:p>
       <w:pPr>
         <w:pStyle w:val="NormalWeb"/>
-        <w:divId w:val="951983701"/>
+        <w:divId w:val="1889216436"/>
         <w:rPr>
           <w:rFonts w:ascii="Plus Jakarta Sans" w:hAnsi="Plus Jakarta Sans"/>
           <w:lang w:val="es-ES"/>
@@ -6650,7 +6646,7 @@
       </w:tblGrid>
       <w:tr>
         <w:trPr>
-          <w:divId w:val="90785897"/>
+          <w:divId w:val="1633367829"/>
           <w:tblHeader/>
         </w:trPr>
         <w:tc>
@@ -6730,7 +6726,7 @@
       </w:tr>
       <w:tr>
         <w:trPr>
-          <w:divId w:val="90785897"/>
+          <w:divId w:val="1633367829"/>
         </w:trPr>
         <w:tc>
           <w:tcPr>
@@ -6828,7 +6824,7 @@
     <w:p>
       <w:pPr>
         <w:pStyle w:val="Ttulo4"/>
-        <w:divId w:val="951983701"/>
+        <w:divId w:val="1889216436"/>
         <w:rPr>
           <w:rFonts w:eastAsia="Times New Roman"/>
           <w:lang w:val="es-ES"/>
@@ -6845,7 +6841,7 @@
     <w:p>
       <w:pPr>
         <w:pStyle w:val="NormalWeb"/>
-        <w:divId w:val="951983701"/>
+        <w:divId w:val="1889216436"/>
         <w:rPr>
           <w:rFonts w:ascii="Plus Jakarta Sans" w:hAnsi="Plus Jakarta Sans"/>
           <w:lang w:val="es-ES"/>
@@ -6876,7 +6872,7 @@
       </w:tblGrid>
       <w:tr>
         <w:trPr>
-          <w:divId w:val="494612608"/>
+          <w:divId w:val="1895189609"/>
           <w:tblHeader/>
         </w:trPr>
         <w:tc>
@@ -6912,7 +6908,6 @@
                 <w:sz w:val="20"/>
                 <w:szCs w:val="20"/>
               </w:rPr>
-              <w:lastRenderedPageBreak/>
               <w:t>Cultivos Frecuentes</w:t>
             </w:r>
           </w:p>
@@ -6957,7 +6952,7 @@
       </w:tr>
       <w:tr>
         <w:trPr>
-          <w:divId w:val="494612608"/>
+          <w:divId w:val="1895189609"/>
         </w:trPr>
         <w:tc>
           <w:tcPr>
@@ -7046,18 +7041,18 @@
     <w:p>
       <w:pPr>
         <w:spacing w:before="450" w:after="450"/>
-        <w:divId w:val="951983701"/>
-        <w:rPr>
-          <w:rFonts w:ascii="Plus Jakarta Sans" w:eastAsia="Times New Roman" w:hAnsi="Plus Jakarta Sans"/>
-          <w:lang w:val="es-ES"/>
-        </w:rPr>
-      </w:pPr>
-      <w:r>
-        <w:rPr>
-          <w:rFonts w:ascii="Plus Jakarta Sans" w:eastAsia="Times New Roman" w:hAnsi="Plus Jakarta Sans"/>
-          <w:lang w:val="es-ES"/>
-        </w:rPr>
-        <w:pict>
+        <w:divId w:val="1889216436"/>
+        <w:rPr>
+          <w:rFonts w:ascii="Plus Jakarta Sans" w:eastAsia="Times New Roman" w:hAnsi="Plus Jakarta Sans"/>
+          <w:lang w:val="es-ES"/>
+        </w:rPr>
+      </w:pPr>
+      <w:r>
+        <w:rPr>
+          <w:rFonts w:ascii="Plus Jakarta Sans" w:eastAsia="Times New Roman" w:hAnsi="Plus Jakarta Sans"/>
+          <w:lang w:val="es-ES"/>
+        </w:rPr>
+        <w:pict w14:anchorId="5B58891C">
           <v:rect id="_x0000_i1032" style="width:0;height:.75pt" o:hralign="center" o:hrstd="t" o:hr="t" fillcolor="#a0a0a0" stroked="f"/>
         </w:pict>
       </w:r>
@@ -7065,7 +7060,7 @@
     <w:p>
       <w:pPr>
         <w:pStyle w:val="Ttulo2"/>
-        <w:divId w:val="951983701"/>
+        <w:divId w:val="1889216436"/>
         <w:rPr>
           <w:rFonts w:eastAsia="Times New Roman"/>
           <w:lang w:val="es-ES"/>
@@ -7082,7 +7077,7 @@
     <w:p>
       <w:pPr>
         <w:pStyle w:val="NormalWeb"/>
-        <w:divId w:val="951983701"/>
+        <w:divId w:val="1889216436"/>
         <w:rPr>
           <w:rFonts w:ascii="Plus Jakarta Sans" w:hAnsi="Plus Jakarta Sans"/>
           <w:lang w:val="es-ES"/>
@@ -7099,7 +7094,7 @@
     <w:p>
       <w:pPr>
         <w:pStyle w:val="Ttulo3"/>
-        <w:divId w:val="951983701"/>
+        <w:divId w:val="1889216436"/>
         <w:rPr>
           <w:rFonts w:eastAsia="Times New Roman"/>
           <w:lang w:val="es-ES"/>
@@ -7116,7 +7111,7 @@
     <w:p>
       <w:pPr>
         <w:pStyle w:val="NormalWeb"/>
-        <w:divId w:val="951983701"/>
+        <w:divId w:val="1889216436"/>
         <w:rPr>
           <w:rFonts w:ascii="Plus Jakarta Sans" w:hAnsi="Plus Jakarta Sans"/>
           <w:lang w:val="es-ES"/>
@@ -7149,7 +7144,7 @@
       </w:tblGrid>
       <w:tr>
         <w:trPr>
-          <w:divId w:val="1994217924"/>
+          <w:divId w:val="1641033483"/>
           <w:tblHeader/>
         </w:trPr>
         <w:tc>
@@ -7314,7 +7309,7 @@
       </w:tr>
       <w:tr>
         <w:trPr>
-          <w:divId w:val="1994217924"/>
+          <w:divId w:val="1641033483"/>
         </w:trPr>
         <w:tc>
           <w:tcPr>
@@ -7373,37 +7368,37 @@
                 <w:sz w:val="20"/>
                 <w:szCs w:val="20"/>
               </w:rPr>
-              <w:t>1525 (92.0%)</w:t>
-            </w:r>
-          </w:p>
-        </w:tc>
-        <w:tc>
-          <w:tcPr>
-            <w:tcW w:w="0" w:type="auto"/>
-            <w:tcMar>
-              <w:top w:w="150" w:type="dxa"/>
-              <w:left w:w="210" w:type="dxa"/>
-              <w:bottom w:w="150" w:type="dxa"/>
-              <w:right w:w="210" w:type="dxa"/>
-            </w:tcMar>
-            <w:vAlign w:val="center"/>
-            <w:hideMark/>
-          </w:tcPr>
-          <w:p>
-            <w:pPr>
-              <w:rPr>
-                <w:rFonts w:ascii="Plus Jakarta Sans" w:eastAsia="Times New Roman" w:hAnsi="Plus Jakarta Sans"/>
-                <w:sz w:val="20"/>
-                <w:szCs w:val="20"/>
-              </w:rPr>
-            </w:pPr>
-            <w:r>
-              <w:rPr>
-                <w:rFonts w:ascii="Plus Jakarta Sans" w:eastAsia="Times New Roman" w:hAnsi="Plus Jakarta Sans"/>
-                <w:sz w:val="20"/>
-                <w:szCs w:val="20"/>
-              </w:rPr>
-              <w:t>1508 (92.5%)</w:t>
+              <w:t>1529 (92.0%)</w:t>
+            </w:r>
+          </w:p>
+        </w:tc>
+        <w:tc>
+          <w:tcPr>
+            <w:tcW w:w="0" w:type="auto"/>
+            <w:tcMar>
+              <w:top w:w="150" w:type="dxa"/>
+              <w:left w:w="210" w:type="dxa"/>
+              <w:bottom w:w="150" w:type="dxa"/>
+              <w:right w:w="210" w:type="dxa"/>
+            </w:tcMar>
+            <w:vAlign w:val="center"/>
+            <w:hideMark/>
+          </w:tcPr>
+          <w:p>
+            <w:pPr>
+              <w:rPr>
+                <w:rFonts w:ascii="Plus Jakarta Sans" w:eastAsia="Times New Roman" w:hAnsi="Plus Jakarta Sans"/>
+                <w:sz w:val="20"/>
+                <w:szCs w:val="20"/>
+              </w:rPr>
+            </w:pPr>
+            <w:r>
+              <w:rPr>
+                <w:rFonts w:ascii="Plus Jakarta Sans" w:eastAsia="Times New Roman" w:hAnsi="Plus Jakarta Sans"/>
+                <w:sz w:val="20"/>
+                <w:szCs w:val="20"/>
+              </w:rPr>
+              <w:t>1509 (92.5%)</w:t>
             </w:r>
           </w:p>
         </w:tc>
@@ -7440,7 +7435,7 @@
       </w:tr>
       <w:tr>
         <w:trPr>
-          <w:divId w:val="1994217924"/>
+          <w:divId w:val="1641033483"/>
         </w:trPr>
         <w:tc>
           <w:tcPr>
@@ -7566,7 +7561,7 @@
       </w:tr>
       <w:tr>
         <w:trPr>
-          <w:divId w:val="1994217924"/>
+          <w:divId w:val="1641033483"/>
         </w:trPr>
         <w:tc>
           <w:tcPr>
@@ -7655,7 +7650,7 @@
                 <w:sz w:val="20"/>
                 <w:szCs w:val="20"/>
               </w:rPr>
-              <w:t>84 (5.2%)</w:t>
+              <w:t>84 (5.1%)</w:t>
             </w:r>
           </w:p>
         </w:tc>
@@ -7692,7 +7687,7 @@
       </w:tr>
       <w:tr>
         <w:trPr>
-          <w:divId w:val="1994217924"/>
+          <w:divId w:val="1641033483"/>
         </w:trPr>
         <w:tc>
           <w:tcPr>
@@ -7820,7 +7815,7 @@
     <w:p>
       <w:pPr>
         <w:pStyle w:val="Ttulo3"/>
-        <w:divId w:val="951983701"/>
+        <w:divId w:val="1889216436"/>
         <w:rPr>
           <w:rFonts w:eastAsia="Times New Roman"/>
           <w:lang w:val="es-ES"/>
@@ -7836,9 +7831,8 @@
     </w:p>
     <w:p>
       <w:pPr>
-        <w:spacing w:before="375" w:after="225"/>
         <w:jc w:val="center"/>
-        <w:divId w:val="1358047466"/>
+        <w:divId w:val="1298875651"/>
         <w:rPr>
           <w:rFonts w:ascii="Outfit" w:eastAsia="Times New Roman" w:hAnsi="Outfit"/>
           <w:b/>
@@ -7868,7 +7862,7 @@
       <w:pPr>
         <w:spacing w:after="375"/>
         <w:jc w:val="center"/>
-        <w:divId w:val="487094487"/>
+        <w:divId w:val="649987038"/>
         <w:rPr>
           <w:rFonts w:ascii="Plus Jakarta Sans" w:eastAsia="Times New Roman" w:hAnsi="Plus Jakarta Sans"/>
           <w:lang w:val="es-ES"/>
@@ -8235,7 +8229,7 @@
     <w:p>
       <w:pPr>
         <w:pStyle w:val="Ttulo3"/>
-        <w:divId w:val="951983701"/>
+        <w:divId w:val="1889216436"/>
         <w:rPr>
           <w:rFonts w:eastAsia="Times New Roman"/>
           <w:lang w:val="es-ES"/>
@@ -8259,7 +8253,7 @@
     <w:p>
       <w:pPr>
         <w:pStyle w:val="NormalWeb"/>
-        <w:divId w:val="951983701"/>
+        <w:divId w:val="1889216436"/>
         <w:rPr>
           <w:rFonts w:ascii="Plus Jakarta Sans" w:hAnsi="Plus Jakarta Sans"/>
           <w:lang w:val="es-ES"/>
@@ -8281,7 +8275,7 @@
         </w:numPr>
         <w:spacing w:before="100" w:beforeAutospacing="1" w:after="90"/>
         <w:ind w:left="1020"/>
-        <w:divId w:val="951983701"/>
+        <w:divId w:val="1889216436"/>
         <w:rPr>
           <w:rFonts w:ascii="Plus Jakarta Sans" w:eastAsia="Times New Roman" w:hAnsi="Plus Jakarta Sans"/>
           <w:sz w:val="21"/>
@@ -8317,7 +8311,7 @@
         </w:numPr>
         <w:spacing w:before="100" w:beforeAutospacing="1" w:after="90"/>
         <w:ind w:left="1020"/>
-        <w:divId w:val="951983701"/>
+        <w:divId w:val="1889216436"/>
         <w:rPr>
           <w:rFonts w:ascii="Plus Jakarta Sans" w:eastAsia="Times New Roman" w:hAnsi="Plus Jakarta Sans"/>
           <w:sz w:val="21"/>
@@ -8342,7 +8336,7 @@
           <w:szCs w:val="21"/>
           <w:lang w:val="es-ES"/>
         </w:rPr>
-        <w:t>94.7%</w:t>
+        <w:t>94.4%</w:t>
       </w:r>
       <w:r>
         <w:rPr>
@@ -8351,7 +8345,7 @@
           <w:szCs w:val="21"/>
           <w:lang w:val="es-ES"/>
         </w:rPr>
-        <w:t xml:space="preserve"> promedio (en 229 predios).</w:t>
+        <w:t xml:space="preserve"> promedio (en 231 predios).</w:t>
       </w:r>
     </w:p>
     <w:p>
@@ -8362,7 +8356,7 @@
         </w:numPr>
         <w:spacing w:before="100" w:beforeAutospacing="1" w:after="90"/>
         <w:ind w:left="1020"/>
-        <w:divId w:val="951983701"/>
+        <w:divId w:val="1889216436"/>
         <w:rPr>
           <w:rFonts w:ascii="Plus Jakarta Sans" w:eastAsia="Times New Roman" w:hAnsi="Plus Jakarta Sans"/>
           <w:sz w:val="21"/>
@@ -8416,7 +8410,7 @@
         </w:numPr>
         <w:spacing w:before="100" w:beforeAutospacing="1" w:after="90"/>
         <w:ind w:left="1020"/>
-        <w:divId w:val="951983701"/>
+        <w:divId w:val="1889216436"/>
         <w:rPr>
           <w:rFonts w:ascii="Plus Jakarta Sans" w:eastAsia="Times New Roman" w:hAnsi="Plus Jakarta Sans"/>
           <w:sz w:val="21"/>
@@ -8461,7 +8455,7 @@
         </w:numPr>
         <w:spacing w:before="100" w:beforeAutospacing="1" w:after="90"/>
         <w:ind w:left="1020"/>
-        <w:divId w:val="951983701"/>
+        <w:divId w:val="1889216436"/>
         <w:rPr>
           <w:rFonts w:ascii="Plus Jakarta Sans" w:eastAsia="Times New Roman" w:hAnsi="Plus Jakarta Sans"/>
           <w:sz w:val="21"/>
@@ -8497,7 +8491,7 @@
         </w:numPr>
         <w:spacing w:before="100" w:beforeAutospacing="1" w:after="90"/>
         <w:ind w:left="1020"/>
-        <w:divId w:val="951983701"/>
+        <w:divId w:val="1889216436"/>
         <w:rPr>
           <w:rFonts w:ascii="Plus Jakarta Sans" w:eastAsia="Times New Roman" w:hAnsi="Plus Jakarta Sans"/>
           <w:sz w:val="21"/>
@@ -8531,7 +8525,7 @@
           <w:szCs w:val="21"/>
           <w:lang w:val="es-ES"/>
         </w:rPr>
-        <w:t xml:space="preserve"> promedio (en 1426 predios).</w:t>
+        <w:t xml:space="preserve"> promedio (en 1429 predios).</w:t>
       </w:r>
     </w:p>
     <w:p>
@@ -8542,7 +8536,7 @@
         </w:numPr>
         <w:spacing w:before="100" w:beforeAutospacing="1" w:after="90"/>
         <w:ind w:left="1020"/>
-        <w:divId w:val="951983701"/>
+        <w:divId w:val="1889216436"/>
         <w:rPr>
           <w:rFonts w:ascii="Plus Jakarta Sans" w:eastAsia="Times New Roman" w:hAnsi="Plus Jakarta Sans"/>
           <w:sz w:val="21"/>
@@ -8576,7 +8570,7 @@
           <w:szCs w:val="21"/>
           <w:lang w:val="es-ES"/>
         </w:rPr>
-        <w:t xml:space="preserve"> promedio (en 1367 predios).</w:t>
+        <w:t xml:space="preserve"> promedio (en 1368 predios).</w:t>
       </w:r>
     </w:p>
     <w:p>
@@ -8587,7 +8581,7 @@
         </w:numPr>
         <w:spacing w:before="100" w:beforeAutospacing="1" w:after="90"/>
         <w:ind w:left="1020"/>
-        <w:divId w:val="951983701"/>
+        <w:divId w:val="1889216436"/>
         <w:rPr>
           <w:rFonts w:ascii="Plus Jakarta Sans" w:eastAsia="Times New Roman" w:hAnsi="Plus Jakarta Sans"/>
           <w:sz w:val="21"/>
@@ -8632,7 +8626,7 @@
         </w:numPr>
         <w:spacing w:before="100" w:beforeAutospacing="1" w:after="90"/>
         <w:ind w:left="1020"/>
-        <w:divId w:val="951983701"/>
+        <w:divId w:val="1889216436"/>
         <w:rPr>
           <w:rFonts w:ascii="Plus Jakarta Sans" w:eastAsia="Times New Roman" w:hAnsi="Plus Jakarta Sans"/>
           <w:sz w:val="21"/>
@@ -8668,7 +8662,7 @@
         </w:numPr>
         <w:spacing w:before="100" w:beforeAutospacing="1" w:after="90"/>
         <w:ind w:left="1020"/>
-        <w:divId w:val="951983701"/>
+        <w:divId w:val="1889216436"/>
         <w:rPr>
           <w:rFonts w:ascii="Plus Jakarta Sans" w:eastAsia="Times New Roman" w:hAnsi="Plus Jakarta Sans"/>
           <w:sz w:val="21"/>
@@ -8722,7 +8716,7 @@
         </w:numPr>
         <w:spacing w:before="100" w:beforeAutospacing="1" w:after="90"/>
         <w:ind w:left="1020"/>
-        <w:divId w:val="951983701"/>
+        <w:divId w:val="1889216436"/>
         <w:rPr>
           <w:rFonts w:ascii="Plus Jakarta Sans" w:eastAsia="Times New Roman" w:hAnsi="Plus Jakarta Sans"/>
           <w:sz w:val="21"/>
@@ -8767,7 +8761,7 @@
         </w:numPr>
         <w:spacing w:before="100" w:beforeAutospacing="1" w:after="90"/>
         <w:ind w:left="1020"/>
-        <w:divId w:val="951983701"/>
+        <w:divId w:val="1889216436"/>
         <w:rPr>
           <w:rFonts w:ascii="Plus Jakarta Sans" w:eastAsia="Times New Roman" w:hAnsi="Plus Jakarta Sans"/>
           <w:sz w:val="21"/>
@@ -8807,7 +8801,7 @@
     <w:p>
       <w:pPr>
         <w:pStyle w:val="Ttulo3"/>
-        <w:divId w:val="951983701"/>
+        <w:divId w:val="1889216436"/>
         <w:rPr>
           <w:rFonts w:eastAsia="Times New Roman"/>
           <w:lang w:val="es-ES"/>
@@ -8825,7 +8819,7 @@
       <w:pPr>
         <w:spacing w:before="375" w:after="225"/>
         <w:jc w:val="center"/>
-        <w:divId w:val="2011987123"/>
+        <w:divId w:val="1720862564"/>
         <w:rPr>
           <w:rFonts w:ascii="Outfit" w:eastAsia="Times New Roman" w:hAnsi="Outfit"/>
           <w:b/>
@@ -8855,7 +8849,7 @@
       <w:pPr>
         <w:spacing w:after="375"/>
         <w:jc w:val="center"/>
-        <w:divId w:val="520095055"/>
+        <w:divId w:val="1967196270"/>
         <w:rPr>
           <w:rFonts w:ascii="Plus Jakarta Sans" w:eastAsia="Times New Roman" w:hAnsi="Plus Jakarta Sans"/>
           <w:lang w:val="es-ES"/>
@@ -9145,18 +9139,18 @@
     <w:p>
       <w:pPr>
         <w:spacing w:before="450" w:after="450"/>
-        <w:divId w:val="951983701"/>
-        <w:rPr>
-          <w:rFonts w:ascii="Plus Jakarta Sans" w:eastAsia="Times New Roman" w:hAnsi="Plus Jakarta Sans"/>
-          <w:lang w:val="es-ES"/>
-        </w:rPr>
-      </w:pPr>
-      <w:r>
-        <w:rPr>
-          <w:rFonts w:ascii="Plus Jakarta Sans" w:eastAsia="Times New Roman" w:hAnsi="Plus Jakarta Sans"/>
-          <w:lang w:val="es-ES"/>
-        </w:rPr>
-        <w:pict>
+        <w:divId w:val="1889216436"/>
+        <w:rPr>
+          <w:rFonts w:ascii="Plus Jakarta Sans" w:eastAsia="Times New Roman" w:hAnsi="Plus Jakarta Sans"/>
+          <w:lang w:val="es-ES"/>
+        </w:rPr>
+      </w:pPr>
+      <w:r>
+        <w:rPr>
+          <w:rFonts w:ascii="Plus Jakarta Sans" w:eastAsia="Times New Roman" w:hAnsi="Plus Jakarta Sans"/>
+          <w:lang w:val="es-ES"/>
+        </w:rPr>
+        <w:pict w14:anchorId="6E90F13A">
           <v:rect id="_x0000_i1033" style="width:0;height:.75pt" o:hralign="center" o:hrstd="t" o:hr="t" fillcolor="#a0a0a0" stroked="f"/>
         </w:pict>
       </w:r>
@@ -9164,7 +9158,7 @@
     <w:p>
       <w:pPr>
         <w:pStyle w:val="Ttulo2"/>
-        <w:divId w:val="951983701"/>
+        <w:divId w:val="1889216436"/>
         <w:rPr>
           <w:rFonts w:eastAsia="Times New Roman"/>
           <w:lang w:val="es-ES"/>
@@ -9181,7 +9175,7 @@
     <w:p>
       <w:pPr>
         <w:pStyle w:val="NormalWeb"/>
-        <w:divId w:val="951983701"/>
+        <w:divId w:val="1889216436"/>
         <w:rPr>
           <w:rFonts w:ascii="Plus Jakarta Sans" w:hAnsi="Plus Jakarta Sans"/>
           <w:lang w:val="es-ES"/>
@@ -9198,7 +9192,7 @@
     <w:p>
       <w:pPr>
         <w:pStyle w:val="NormalWeb"/>
-        <w:divId w:val="951983701"/>
+        <w:divId w:val="1889216436"/>
         <w:rPr>
           <w:rFonts w:ascii="Plus Jakarta Sans" w:hAnsi="Plus Jakarta Sans"/>
           <w:lang w:val="es-ES"/>
@@ -9260,7 +9254,7 @@
     <w:p>
       <w:pPr>
         <w:pStyle w:val="NormalWeb"/>
-        <w:divId w:val="951983701"/>
+        <w:divId w:val="1889216436"/>
         <w:rPr>
           <w:rFonts w:ascii="Plus Jakarta Sans" w:hAnsi="Plus Jakarta Sans"/>
           <w:lang w:val="es-ES"/>
@@ -9322,7 +9316,7 @@
     <w:p>
       <w:pPr>
         <w:pStyle w:val="NormalWeb"/>
-        <w:divId w:val="951983701"/>
+        <w:divId w:val="1889216436"/>
         <w:rPr>
           <w:rFonts w:ascii="Plus Jakarta Sans" w:hAnsi="Plus Jakarta Sans"/>
           <w:lang w:val="es-ES"/>
@@ -9383,7 +9377,7 @@
     <w:p>
       <w:pPr>
         <w:pStyle w:val="NormalWeb"/>
-        <w:divId w:val="951983701"/>
+        <w:divId w:val="1889216436"/>
         <w:rPr>
           <w:rFonts w:ascii="Plus Jakarta Sans" w:hAnsi="Plus Jakarta Sans"/>
           <w:lang w:val="es-ES"/>
@@ -9437,18 +9431,18 @@
     <w:p>
       <w:pPr>
         <w:spacing w:before="450" w:after="450"/>
-        <w:divId w:val="951983701"/>
-        <w:rPr>
-          <w:rFonts w:ascii="Plus Jakarta Sans" w:eastAsia="Times New Roman" w:hAnsi="Plus Jakarta Sans"/>
-          <w:lang w:val="es-ES"/>
-        </w:rPr>
-      </w:pPr>
-      <w:r>
-        <w:rPr>
-          <w:rFonts w:ascii="Plus Jakarta Sans" w:eastAsia="Times New Roman" w:hAnsi="Plus Jakarta Sans"/>
-          <w:lang w:val="es-ES"/>
-        </w:rPr>
-        <w:pict>
+        <w:divId w:val="1889216436"/>
+        <w:rPr>
+          <w:rFonts w:ascii="Plus Jakarta Sans" w:eastAsia="Times New Roman" w:hAnsi="Plus Jakarta Sans"/>
+          <w:lang w:val="es-ES"/>
+        </w:rPr>
+      </w:pPr>
+      <w:r>
+        <w:rPr>
+          <w:rFonts w:ascii="Plus Jakarta Sans" w:eastAsia="Times New Roman" w:hAnsi="Plus Jakarta Sans"/>
+          <w:lang w:val="es-ES"/>
+        </w:rPr>
+        <w:pict w14:anchorId="49833A27">
           <v:rect id="_x0000_i1034" style="width:0;height:.75pt" o:hralign="center" o:hrstd="t" o:hr="t" fillcolor="#a0a0a0" stroked="f"/>
         </w:pict>
       </w:r>
@@ -9456,18 +9450,18 @@
     <w:p>
       <w:pPr>
         <w:spacing w:before="450" w:after="450"/>
-        <w:divId w:val="951983701"/>
-        <w:rPr>
-          <w:rFonts w:ascii="Plus Jakarta Sans" w:eastAsia="Times New Roman" w:hAnsi="Plus Jakarta Sans"/>
-          <w:lang w:val="es-ES"/>
-        </w:rPr>
-      </w:pPr>
-      <w:r>
-        <w:rPr>
-          <w:rFonts w:ascii="Plus Jakarta Sans" w:eastAsia="Times New Roman" w:hAnsi="Plus Jakarta Sans"/>
-          <w:lang w:val="es-ES"/>
-        </w:rPr>
-        <w:pict>
+        <w:divId w:val="1889216436"/>
+        <w:rPr>
+          <w:rFonts w:ascii="Plus Jakarta Sans" w:eastAsia="Times New Roman" w:hAnsi="Plus Jakarta Sans"/>
+          <w:lang w:val="es-ES"/>
+        </w:rPr>
+      </w:pPr>
+      <w:r>
+        <w:rPr>
+          <w:rFonts w:ascii="Plus Jakarta Sans" w:eastAsia="Times New Roman" w:hAnsi="Plus Jakarta Sans"/>
+          <w:lang w:val="es-ES"/>
+        </w:rPr>
+        <w:pict w14:anchorId="4A5ABC37">
           <v:rect id="_x0000_i1035" style="width:0;height:.75pt" o:hralign="center" o:hrstd="t" o:hr="t" fillcolor="#a0a0a0" stroked="f"/>
         </w:pict>
       </w:r>
@@ -9475,7 +9469,7 @@
     <w:p>
       <w:pPr>
         <w:pStyle w:val="NormalWeb"/>
-        <w:divId w:val="951983701"/>
+        <w:divId w:val="1889216436"/>
         <w:rPr>
           <w:rFonts w:ascii="Plus Jakarta Sans" w:hAnsi="Plus Jakarta Sans"/>
           <w:lang w:val="es-ES"/>
@@ -9508,7 +9502,7 @@
           <w:rFonts w:ascii="Plus Jakarta Sans" w:hAnsi="Plus Jakarta Sans"/>
           <w:lang w:val="es-ES"/>
         </w:rPr>
-        <w:pict/>
+        <w:pict w14:anchorId="15F35FDA"/>
       </w:r>
     </w:p>
     <w:sectPr>
@@ -9524,9 +9518,9 @@
 <file path=word/numbering.xml><?xml version="1.0" encoding="utf-8"?>
 <w:numbering xmlns:wpc="http://schemas.microsoft.com/office/word/2010/wordprocessingCanvas" xmlns:cx="http://schemas.microsoft.com/office/drawing/2014/chartex" xmlns:cx1="http://schemas.microsoft.com/office/drawing/2015/9/8/chartex" xmlns:cx2="http://schemas.microsoft.com/office/drawing/2015/10/21/chartex" xmlns:cx3="http://schemas.microsoft.com/office/drawing/2016/5/9/chartex" xmlns:cx4="http://schemas.microsoft.com/office/drawing/2016/5/10/chartex" xmlns:cx5="http://schemas.microsoft.com/office/drawing/2016/5/11/chartex" xmlns:cx6="http://schemas.microsoft.com/office/drawing/2016/5/12/chartex" xmlns:cx7="http://schemas.microsoft.com/office/drawing/2016/5/13/chartex" xmlns:cx8="http://schemas.microsoft.com/office/drawing/2016/5/14/chartex" xmlns:mc="http://schemas.openxmlformats.org/markup-compatibility/2006" xmlns:aink="http://schemas.microsoft.com/office/drawing/2016/ink" xmlns:am3d="http://schemas.microsoft.com/office/drawing/2017/model3d" xmlns:o="urn:schemas-microsoft-com:office:office" xmlns:r="http://schemas.openxmlformats.org/officeDocument/2006/relationships" xmlns:m="http://schemas.openxmlformats.org/officeDocument/2006/math" xmlns:v="urn:schemas-microsoft-com:vml" xmlns:wp14="http://schemas.microsoft.com/office/word/2010/wordprocessingDrawing" xmlns:wp="http://schemas.openxmlformats.org/drawingml/2006/wordprocessingDrawing" xmlns:w10="urn:schemas-microsoft-com:office:word" xmlns:w="http://schemas.openxmlformats.org/wordprocessingml/2006/main" xmlns:w14="http://schemas.microsoft.com/office/word/2010/wordml" xmlns:w15="http://schemas.microsoft.com/office/word/2012/wordml" xmlns:w16cex="http://schemas.microsoft.com/office/word/2018/wordml/cex" xmlns:w16cid="http://schemas.microsoft.com/office/word/2016/wordml/cid" xmlns:w16="http://schemas.microsoft.com/office/word/2018/wordml" xmlns:w16sdtdh="http://schemas.microsoft.com/office/word/2020/wordml/sdtdatahash" xmlns:w16se="http://schemas.microsoft.com/office/word/2015/wordml/symex" xmlns:wpg="http://schemas.microsoft.com/office/word/2010/wordprocessingGroup" xmlns:wpi="http://schemas.microsoft.com/office/word/2010/wordprocessingInk" xmlns:wne="http://schemas.microsoft.com/office/word/2006/wordml" xmlns:wps="http://schemas.microsoft.com/office/word/2010/wordprocessingShape" mc:Ignorable="w14 w15 w16se w16cid w16 w16cex w16sdtdh wp14">
   <w:abstractNum w:abstractNumId="0" w15:restartNumberingAfterBreak="0">
-    <w:nsid w:val="5C06215A"/>
+    <w:nsid w:val="1E991D02"/>
     <w:multiLevelType w:val="multilevel"/>
-    <w:tmpl w:val="597C42E0"/>
+    <w:tmpl w:val="1F3A43CE"/>
     <w:lvl w:ilvl="0">
       <w:start w:val="1"/>
       <w:numFmt w:val="bullet"/>
@@ -9673,9 +9667,9 @@
     </w:lvl>
   </w:abstractNum>
   <w:abstractNum w:abstractNumId="1" w15:restartNumberingAfterBreak="0">
-    <w:nsid w:val="6C2062CC"/>
+    <w:nsid w:val="2A7A5396"/>
     <w:multiLevelType w:val="multilevel"/>
-    <w:tmpl w:val="F01CFDF4"/>
+    <w:tmpl w:val="F66E7338"/>
     <w:lvl w:ilvl="0">
       <w:start w:val="1"/>
       <w:numFmt w:val="bullet"/>
@@ -9822,9 +9816,9 @@
     </w:lvl>
   </w:abstractNum>
   <w:abstractNum w:abstractNumId="2" w15:restartNumberingAfterBreak="0">
-    <w:nsid w:val="71F47B0F"/>
+    <w:nsid w:val="33A61242"/>
     <w:multiLevelType w:val="multilevel"/>
-    <w:tmpl w:val="6F94F99C"/>
+    <w:tmpl w:val="4EA6CA36"/>
     <w:lvl w:ilvl="0">
       <w:start w:val="1"/>
       <w:numFmt w:val="bullet"/>
@@ -9971,9 +9965,9 @@
     </w:lvl>
   </w:abstractNum>
   <w:abstractNum w:abstractNumId="3" w15:restartNumberingAfterBreak="0">
-    <w:nsid w:val="77D75669"/>
+    <w:nsid w:val="60DB7CF1"/>
     <w:multiLevelType w:val="multilevel"/>
-    <w:tmpl w:val="8E8AE3B4"/>
+    <w:tmpl w:val="DBFCD62C"/>
     <w:lvl w:ilvl="0">
       <w:start w:val="1"/>
       <w:numFmt w:val="bullet"/>
@@ -10120,13 +10114,13 @@
     </w:lvl>
   </w:abstractNum>
   <w:num w:numId="1">
+    <w:abstractNumId w:val="1"/>
+  </w:num>
+  <w:num w:numId="2">
     <w:abstractNumId w:val="0"/>
   </w:num>
-  <w:num w:numId="2">
+  <w:num w:numId="3">
     <w:abstractNumId w:val="2"/>
-  </w:num>
-  <w:num w:numId="3">
-    <w:abstractNumId w:val="1"/>
   </w:num>
   <w:num w:numId="4">
     <w:abstractNumId w:val="3"/>

</xml_diff>

<commit_message>
data: sincronizar nuevos registros QFieldCloud (4171 fichas)
</commit_message>
<xml_diff>
--- a/public/informe_reunion_tecnica.docx
+++ b/public/informe_reunion_tecnica.docx
@@ -4,7 +4,7 @@
   <w:body>
     <w:p>
       <w:pPr>
-        <w:divId w:val="94596251"/>
+        <w:divId w:val="1519349449"/>
         <w:rPr>
           <w:rFonts w:ascii="Plus Jakarta Sans" w:eastAsia="Times New Roman" w:hAnsi="Plus Jakarta Sans"/>
           <w:lang w:val="es-ES"/>
@@ -28,7 +28,7 @@
     <w:p>
       <w:pPr>
         <w:pStyle w:val="Ttulo1"/>
-        <w:divId w:val="1889216436"/>
+        <w:divId w:val="1629779195"/>
         <w:rPr>
           <w:rFonts w:eastAsia="Times New Roman"/>
           <w:lang w:val="es-ES"/>
@@ -45,7 +45,7 @@
     <w:p>
       <w:pPr>
         <w:pStyle w:val="NormalWeb"/>
-        <w:divId w:val="1889216436"/>
+        <w:divId w:val="1629779195"/>
         <w:rPr>
           <w:rFonts w:ascii="Plus Jakarta Sans" w:hAnsi="Plus Jakarta Sans"/>
           <w:lang w:val="es-ES"/>
@@ -63,7 +63,7 @@
     <w:p>
       <w:pPr>
         <w:pStyle w:val="NormalWeb"/>
-        <w:divId w:val="1889216436"/>
+        <w:divId w:val="1629779195"/>
         <w:rPr>
           <w:rFonts w:ascii="Plus Jakarta Sans" w:hAnsi="Plus Jakarta Sans"/>
           <w:lang w:val="es-ES"/>
@@ -102,18 +102,18 @@
     <w:p>
       <w:pPr>
         <w:spacing w:before="450" w:after="450"/>
-        <w:divId w:val="1889216436"/>
-        <w:rPr>
-          <w:rFonts w:ascii="Plus Jakarta Sans" w:eastAsia="Times New Roman" w:hAnsi="Plus Jakarta Sans"/>
-          <w:lang w:val="es-ES"/>
-        </w:rPr>
-      </w:pPr>
-      <w:r>
-        <w:rPr>
-          <w:rFonts w:ascii="Plus Jakarta Sans" w:eastAsia="Times New Roman" w:hAnsi="Plus Jakarta Sans"/>
-          <w:lang w:val="es-ES"/>
-        </w:rPr>
-        <w:pict w14:anchorId="7B550A6F">
+        <w:divId w:val="1629779195"/>
+        <w:rPr>
+          <w:rFonts w:ascii="Plus Jakarta Sans" w:eastAsia="Times New Roman" w:hAnsi="Plus Jakarta Sans"/>
+          <w:lang w:val="es-ES"/>
+        </w:rPr>
+      </w:pPr>
+      <w:r>
+        <w:rPr>
+          <w:rFonts w:ascii="Plus Jakarta Sans" w:eastAsia="Times New Roman" w:hAnsi="Plus Jakarta Sans"/>
+          <w:lang w:val="es-ES"/>
+        </w:rPr>
+        <w:pict>
           <v:rect id="_x0000_i1025" style="width:0;height:.75pt" o:hralign="center" o:hrstd="t" o:hr="t" fillcolor="#a0a0a0" stroked="f"/>
         </w:pict>
       </w:r>
@@ -121,7 +121,7 @@
     <w:p>
       <w:pPr>
         <w:pStyle w:val="Ttulo2"/>
-        <w:divId w:val="1889216436"/>
+        <w:divId w:val="1629779195"/>
         <w:rPr>
           <w:rFonts w:eastAsia="Times New Roman"/>
           <w:lang w:val="es-ES"/>
@@ -145,7 +145,7 @@
     <w:p>
       <w:pPr>
         <w:pStyle w:val="NormalWeb"/>
-        <w:divId w:val="1889216436"/>
+        <w:divId w:val="1629779195"/>
         <w:rPr>
           <w:rFonts w:ascii="Plus Jakarta Sans" w:hAnsi="Plus Jakarta Sans"/>
           <w:lang w:val="es-ES"/>
@@ -167,7 +167,7 @@
         </w:numPr>
         <w:spacing w:before="100" w:beforeAutospacing="1" w:after="90"/>
         <w:ind w:left="1020"/>
-        <w:divId w:val="1889216436"/>
+        <w:divId w:val="1629779195"/>
         <w:rPr>
           <w:rFonts w:ascii="Plus Jakarta Sans" w:eastAsia="Times New Roman" w:hAnsi="Plus Jakarta Sans"/>
           <w:sz w:val="21"/>
@@ -202,7 +202,7 @@
           <w:szCs w:val="21"/>
           <w:lang w:val="es-ES"/>
         </w:rPr>
-        <w:t>4,095 fichas</w:t>
+        <w:t>4,155 fichas</w:t>
       </w:r>
     </w:p>
     <w:p>
@@ -213,7 +213,7 @@
         </w:numPr>
         <w:spacing w:before="100" w:beforeAutospacing="1" w:after="90"/>
         <w:ind w:left="1020"/>
-        <w:divId w:val="1889216436"/>
+        <w:divId w:val="1629779195"/>
         <w:rPr>
           <w:rFonts w:ascii="Plus Jakarta Sans" w:eastAsia="Times New Roman" w:hAnsi="Plus Jakarta Sans"/>
           <w:sz w:val="21"/>
@@ -258,7 +258,7 @@
           <w:szCs w:val="21"/>
           <w:lang w:val="es-ES"/>
         </w:rPr>
-        <w:t>2,961 polígonos unificados</w:t>
+        <w:t>3,005 polígonos unificados</w:t>
       </w:r>
     </w:p>
     <w:p>
@@ -269,7 +269,7 @@
         </w:numPr>
         <w:spacing w:before="100" w:beforeAutospacing="1" w:after="90"/>
         <w:ind w:left="1020"/>
-        <w:divId w:val="1889216436"/>
+        <w:divId w:val="1629779195"/>
         <w:rPr>
           <w:rFonts w:ascii="Plus Jakarta Sans" w:eastAsia="Times New Roman" w:hAnsi="Plus Jakarta Sans"/>
           <w:sz w:val="21"/>
@@ -304,7 +304,7 @@
           <w:szCs w:val="21"/>
           <w:lang w:val="es-ES"/>
         </w:rPr>
-        <w:t>8,045 parcelas agrícolas</w:t>
+        <w:t>8,142 parcelas agrícolas</w:t>
       </w:r>
     </w:p>
     <w:p>
@@ -315,7 +315,7 @@
         </w:numPr>
         <w:spacing w:before="100" w:beforeAutospacing="1" w:after="90"/>
         <w:ind w:left="1020"/>
-        <w:divId w:val="1889216436"/>
+        <w:divId w:val="1629779195"/>
         <w:rPr>
           <w:rFonts w:ascii="Plus Jakarta Sans" w:eastAsia="Times New Roman" w:hAnsi="Plus Jakarta Sans"/>
           <w:sz w:val="21"/>
@@ -350,24 +350,24 @@
           <w:szCs w:val="21"/>
           <w:lang w:val="es-ES"/>
         </w:rPr>
-        <w:t>161,920 especies pecuarias</w:t>
+        <w:t>163,058 especies pecuarias</w:t>
       </w:r>
     </w:p>
     <w:p>
       <w:pPr>
         <w:spacing w:before="450" w:after="450"/>
-        <w:divId w:val="1889216436"/>
-        <w:rPr>
-          <w:rFonts w:ascii="Plus Jakarta Sans" w:eastAsia="Times New Roman" w:hAnsi="Plus Jakarta Sans"/>
-          <w:lang w:val="es-ES"/>
-        </w:rPr>
-      </w:pPr>
-      <w:r>
-        <w:rPr>
-          <w:rFonts w:ascii="Plus Jakarta Sans" w:eastAsia="Times New Roman" w:hAnsi="Plus Jakarta Sans"/>
-          <w:lang w:val="es-ES"/>
-        </w:rPr>
-        <w:pict w14:anchorId="087E444E">
+        <w:divId w:val="1629779195"/>
+        <w:rPr>
+          <w:rFonts w:ascii="Plus Jakarta Sans" w:eastAsia="Times New Roman" w:hAnsi="Plus Jakarta Sans"/>
+          <w:lang w:val="es-ES"/>
+        </w:rPr>
+      </w:pPr>
+      <w:r>
+        <w:rPr>
+          <w:rFonts w:ascii="Plus Jakarta Sans" w:eastAsia="Times New Roman" w:hAnsi="Plus Jakarta Sans"/>
+          <w:lang w:val="es-ES"/>
+        </w:rPr>
+        <w:pict>
           <v:rect id="_x0000_i1026" style="width:0;height:.75pt" o:hralign="center" o:hrstd="t" o:hr="t" fillcolor="#a0a0a0" stroked="f"/>
         </w:pict>
       </w:r>
@@ -375,7 +375,7 @@
     <w:p>
       <w:pPr>
         <w:pStyle w:val="Ttulo2"/>
-        <w:divId w:val="1889216436"/>
+        <w:divId w:val="1629779195"/>
         <w:rPr>
           <w:rFonts w:eastAsia="Times New Roman"/>
           <w:lang w:val="es-ES"/>
@@ -392,7 +392,7 @@
     <w:p>
       <w:pPr>
         <w:pStyle w:val="NormalWeb"/>
-        <w:divId w:val="1889216436"/>
+        <w:divId w:val="1629779195"/>
         <w:rPr>
           <w:rFonts w:ascii="Plus Jakarta Sans" w:hAnsi="Plus Jakarta Sans"/>
           <w:lang w:val="es-ES"/>
@@ -445,7 +445,7 @@
       </w:tblGrid>
       <w:tr>
         <w:trPr>
-          <w:divId w:val="1987051979"/>
+          <w:divId w:val="1472598590"/>
           <w:tblHeader/>
         </w:trPr>
         <w:tc>
@@ -525,7 +525,7 @@
       </w:tr>
       <w:tr>
         <w:trPr>
-          <w:divId w:val="1987051979"/>
+          <w:divId w:val="1472598590"/>
         </w:trPr>
         <w:tc>
           <w:tcPr>
@@ -584,14 +584,14 @@
                 <w:sz w:val="20"/>
                 <w:szCs w:val="20"/>
               </w:rPr>
-              <w:t>3,293</w:t>
+              <w:t>3,351</w:t>
             </w:r>
           </w:p>
         </w:tc>
       </w:tr>
       <w:tr>
         <w:trPr>
-          <w:divId w:val="1987051979"/>
+          <w:divId w:val="1472598590"/>
         </w:trPr>
         <w:tc>
           <w:tcPr>
@@ -650,14 +650,14 @@
                 <w:sz w:val="20"/>
                 <w:szCs w:val="20"/>
               </w:rPr>
-              <w:t>375</w:t>
+              <w:t>377</w:t>
             </w:r>
           </w:p>
         </w:tc>
       </w:tr>
       <w:tr>
         <w:trPr>
-          <w:divId w:val="1987051979"/>
+          <w:divId w:val="1472598590"/>
         </w:trPr>
         <w:tc>
           <w:tcPr>
@@ -723,7 +723,7 @@
       </w:tr>
       <w:tr>
         <w:trPr>
-          <w:divId w:val="1987051979"/>
+          <w:divId w:val="1472598590"/>
         </w:trPr>
         <w:tc>
           <w:tcPr>
@@ -791,18 +791,19 @@
     <w:p>
       <w:pPr>
         <w:spacing w:before="450" w:after="450"/>
-        <w:divId w:val="1889216436"/>
-        <w:rPr>
-          <w:rFonts w:ascii="Plus Jakarta Sans" w:eastAsia="Times New Roman" w:hAnsi="Plus Jakarta Sans"/>
-          <w:lang w:val="es-ES"/>
-        </w:rPr>
-      </w:pPr>
-      <w:r>
-        <w:rPr>
-          <w:rFonts w:ascii="Plus Jakarta Sans" w:eastAsia="Times New Roman" w:hAnsi="Plus Jakarta Sans"/>
-          <w:lang w:val="es-ES"/>
-        </w:rPr>
-        <w:pict w14:anchorId="6F0F211A">
+        <w:divId w:val="1629779195"/>
+        <w:rPr>
+          <w:rFonts w:ascii="Plus Jakarta Sans" w:eastAsia="Times New Roman" w:hAnsi="Plus Jakarta Sans"/>
+          <w:lang w:val="es-ES"/>
+        </w:rPr>
+      </w:pPr>
+      <w:r>
+        <w:rPr>
+          <w:rFonts w:ascii="Plus Jakarta Sans" w:eastAsia="Times New Roman" w:hAnsi="Plus Jakarta Sans"/>
+          <w:lang w:val="es-ES"/>
+        </w:rPr>
+        <w:lastRenderedPageBreak/>
+        <w:pict>
           <v:rect id="_x0000_i1027" style="width:0;height:.75pt" o:hralign="center" o:hrstd="t" o:hr="t" fillcolor="#a0a0a0" stroked="f"/>
         </w:pict>
       </w:r>
@@ -810,7 +811,7 @@
     <w:p>
       <w:pPr>
         <w:pStyle w:val="Ttulo2"/>
-        <w:divId w:val="1889216436"/>
+        <w:divId w:val="1629779195"/>
         <w:rPr>
           <w:rFonts w:eastAsia="Times New Roman"/>
           <w:lang w:val="es-ES"/>
@@ -827,7 +828,7 @@
     <w:p>
       <w:pPr>
         <w:pStyle w:val="Ttulo3"/>
-        <w:divId w:val="1889216436"/>
+        <w:divId w:val="1629779195"/>
         <w:rPr>
           <w:rFonts w:eastAsia="Times New Roman"/>
           <w:lang w:val="es-ES"/>
@@ -844,7 +845,7 @@
     <w:p>
       <w:pPr>
         <w:pStyle w:val="NormalWeb"/>
-        <w:divId w:val="1889216436"/>
+        <w:divId w:val="1629779195"/>
         <w:rPr>
           <w:rFonts w:ascii="Plus Jakarta Sans" w:hAnsi="Plus Jakarta Sans"/>
           <w:lang w:val="es-ES"/>
@@ -884,7 +885,7 @@
       </w:tblGrid>
       <w:tr>
         <w:trPr>
-          <w:divId w:val="2041397413"/>
+          <w:divId w:val="2109958329"/>
           <w:tblHeader/>
         </w:trPr>
         <w:tc>
@@ -1038,7 +1039,7 @@
       </w:tr>
       <w:tr>
         <w:trPr>
-          <w:divId w:val="2041397413"/>
+          <w:divId w:val="2109958329"/>
         </w:trPr>
         <w:tc>
           <w:tcPr>
@@ -1097,74 +1098,74 @@
                 <w:sz w:val="20"/>
                 <w:szCs w:val="20"/>
               </w:rPr>
-              <w:t>1,662</w:t>
-            </w:r>
-          </w:p>
-        </w:tc>
-        <w:tc>
-          <w:tcPr>
-            <w:tcW w:w="0" w:type="auto"/>
-            <w:tcMar>
-              <w:top w:w="150" w:type="dxa"/>
-              <w:left w:w="210" w:type="dxa"/>
-              <w:bottom w:w="150" w:type="dxa"/>
-              <w:right w:w="210" w:type="dxa"/>
-            </w:tcMar>
-            <w:vAlign w:val="center"/>
-            <w:hideMark/>
-          </w:tcPr>
-          <w:p>
-            <w:pPr>
-              <w:rPr>
-                <w:rFonts w:ascii="Plus Jakarta Sans" w:eastAsia="Times New Roman" w:hAnsi="Plus Jakarta Sans"/>
-                <w:sz w:val="20"/>
-                <w:szCs w:val="20"/>
-              </w:rPr>
-            </w:pPr>
-            <w:r>
-              <w:rPr>
-                <w:rFonts w:ascii="Plus Jakarta Sans" w:eastAsia="Times New Roman" w:hAnsi="Plus Jakarta Sans"/>
-                <w:sz w:val="20"/>
-                <w:szCs w:val="20"/>
-              </w:rPr>
-              <w:t>1,632</w:t>
-            </w:r>
-          </w:p>
-        </w:tc>
-        <w:tc>
-          <w:tcPr>
-            <w:tcW w:w="0" w:type="auto"/>
-            <w:tcMar>
-              <w:top w:w="150" w:type="dxa"/>
-              <w:left w:w="210" w:type="dxa"/>
-              <w:bottom w:w="150" w:type="dxa"/>
-              <w:right w:w="210" w:type="dxa"/>
-            </w:tcMar>
-            <w:vAlign w:val="center"/>
-            <w:hideMark/>
-          </w:tcPr>
-          <w:p>
-            <w:pPr>
-              <w:rPr>
-                <w:rFonts w:ascii="Plus Jakarta Sans" w:eastAsia="Times New Roman" w:hAnsi="Plus Jakarta Sans"/>
-                <w:sz w:val="20"/>
-                <w:szCs w:val="20"/>
-              </w:rPr>
-            </w:pPr>
-            <w:r>
-              <w:rPr>
-                <w:rFonts w:ascii="Plus Jakarta Sans" w:eastAsia="Times New Roman" w:hAnsi="Plus Jakarta Sans"/>
-                <w:sz w:val="20"/>
-                <w:szCs w:val="20"/>
-              </w:rPr>
-              <w:t>801</w:t>
+              <w:t>1,720</w:t>
+            </w:r>
+          </w:p>
+        </w:tc>
+        <w:tc>
+          <w:tcPr>
+            <w:tcW w:w="0" w:type="auto"/>
+            <w:tcMar>
+              <w:top w:w="150" w:type="dxa"/>
+              <w:left w:w="210" w:type="dxa"/>
+              <w:bottom w:w="150" w:type="dxa"/>
+              <w:right w:w="210" w:type="dxa"/>
+            </w:tcMar>
+            <w:vAlign w:val="center"/>
+            <w:hideMark/>
+          </w:tcPr>
+          <w:p>
+            <w:pPr>
+              <w:rPr>
+                <w:rFonts w:ascii="Plus Jakarta Sans" w:eastAsia="Times New Roman" w:hAnsi="Plus Jakarta Sans"/>
+                <w:sz w:val="20"/>
+                <w:szCs w:val="20"/>
+              </w:rPr>
+            </w:pPr>
+            <w:r>
+              <w:rPr>
+                <w:rFonts w:ascii="Plus Jakarta Sans" w:eastAsia="Times New Roman" w:hAnsi="Plus Jakarta Sans"/>
+                <w:sz w:val="20"/>
+                <w:szCs w:val="20"/>
+              </w:rPr>
+              <w:t>1,633</w:t>
+            </w:r>
+          </w:p>
+        </w:tc>
+        <w:tc>
+          <w:tcPr>
+            <w:tcW w:w="0" w:type="auto"/>
+            <w:tcMar>
+              <w:top w:w="150" w:type="dxa"/>
+              <w:left w:w="210" w:type="dxa"/>
+              <w:bottom w:w="150" w:type="dxa"/>
+              <w:right w:w="210" w:type="dxa"/>
+            </w:tcMar>
+            <w:vAlign w:val="center"/>
+            <w:hideMark/>
+          </w:tcPr>
+          <w:p>
+            <w:pPr>
+              <w:rPr>
+                <w:rFonts w:ascii="Plus Jakarta Sans" w:eastAsia="Times New Roman" w:hAnsi="Plus Jakarta Sans"/>
+                <w:sz w:val="20"/>
+                <w:szCs w:val="20"/>
+              </w:rPr>
+            </w:pPr>
+            <w:r>
+              <w:rPr>
+                <w:rFonts w:ascii="Plus Jakarta Sans" w:eastAsia="Times New Roman" w:hAnsi="Plus Jakarta Sans"/>
+                <w:sz w:val="20"/>
+                <w:szCs w:val="20"/>
+              </w:rPr>
+              <w:t>802</w:t>
             </w:r>
           </w:p>
         </w:tc>
       </w:tr>
       <w:tr>
         <w:trPr>
-          <w:divId w:val="2041397413"/>
+          <w:divId w:val="2109958329"/>
         </w:trPr>
         <w:tc>
           <w:tcPr>
@@ -1223,74 +1224,74 @@
                 <w:sz w:val="20"/>
                 <w:szCs w:val="20"/>
               </w:rPr>
-              <w:t>33,392,759.56 m²</w:t>
-            </w:r>
-          </w:p>
-        </w:tc>
-        <w:tc>
-          <w:tcPr>
-            <w:tcW w:w="0" w:type="auto"/>
-            <w:tcMar>
-              <w:top w:w="150" w:type="dxa"/>
-              <w:left w:w="210" w:type="dxa"/>
-              <w:bottom w:w="150" w:type="dxa"/>
-              <w:right w:w="210" w:type="dxa"/>
-            </w:tcMar>
-            <w:vAlign w:val="center"/>
-            <w:hideMark/>
-          </w:tcPr>
-          <w:p>
-            <w:pPr>
-              <w:rPr>
-                <w:rFonts w:ascii="Plus Jakarta Sans" w:eastAsia="Times New Roman" w:hAnsi="Plus Jakarta Sans"/>
-                <w:sz w:val="20"/>
-                <w:szCs w:val="20"/>
-              </w:rPr>
-            </w:pPr>
-            <w:r>
-              <w:rPr>
-                <w:rFonts w:ascii="Plus Jakarta Sans" w:eastAsia="Times New Roman" w:hAnsi="Plus Jakarta Sans"/>
-                <w:sz w:val="20"/>
-                <w:szCs w:val="20"/>
-              </w:rPr>
-              <w:t>38,540,367.36 m²</w:t>
-            </w:r>
-          </w:p>
-        </w:tc>
-        <w:tc>
-          <w:tcPr>
-            <w:tcW w:w="0" w:type="auto"/>
-            <w:tcMar>
-              <w:top w:w="150" w:type="dxa"/>
-              <w:left w:w="210" w:type="dxa"/>
-              <w:bottom w:w="150" w:type="dxa"/>
-              <w:right w:w="210" w:type="dxa"/>
-            </w:tcMar>
-            <w:vAlign w:val="center"/>
-            <w:hideMark/>
-          </w:tcPr>
-          <w:p>
-            <w:pPr>
-              <w:rPr>
-                <w:rFonts w:ascii="Plus Jakarta Sans" w:eastAsia="Times New Roman" w:hAnsi="Plus Jakarta Sans"/>
-                <w:sz w:val="20"/>
-                <w:szCs w:val="20"/>
-              </w:rPr>
-            </w:pPr>
-            <w:r>
-              <w:rPr>
-                <w:rFonts w:ascii="Plus Jakarta Sans" w:eastAsia="Times New Roman" w:hAnsi="Plus Jakarta Sans"/>
-                <w:sz w:val="20"/>
-                <w:szCs w:val="20"/>
-              </w:rPr>
-              <w:t>31,658,180.62 m²</w:t>
+              <w:t>33,890,391.78 m²</w:t>
+            </w:r>
+          </w:p>
+        </w:tc>
+        <w:tc>
+          <w:tcPr>
+            <w:tcW w:w="0" w:type="auto"/>
+            <w:tcMar>
+              <w:top w:w="150" w:type="dxa"/>
+              <w:left w:w="210" w:type="dxa"/>
+              <w:bottom w:w="150" w:type="dxa"/>
+              <w:right w:w="210" w:type="dxa"/>
+            </w:tcMar>
+            <w:vAlign w:val="center"/>
+            <w:hideMark/>
+          </w:tcPr>
+          <w:p>
+            <w:pPr>
+              <w:rPr>
+                <w:rFonts w:ascii="Plus Jakarta Sans" w:eastAsia="Times New Roman" w:hAnsi="Plus Jakarta Sans"/>
+                <w:sz w:val="20"/>
+                <w:szCs w:val="20"/>
+              </w:rPr>
+            </w:pPr>
+            <w:r>
+              <w:rPr>
+                <w:rFonts w:ascii="Plus Jakarta Sans" w:eastAsia="Times New Roman" w:hAnsi="Plus Jakarta Sans"/>
+                <w:sz w:val="20"/>
+                <w:szCs w:val="20"/>
+              </w:rPr>
+              <w:t>38,555,361.77 m²</w:t>
+            </w:r>
+          </w:p>
+        </w:tc>
+        <w:tc>
+          <w:tcPr>
+            <w:tcW w:w="0" w:type="auto"/>
+            <w:tcMar>
+              <w:top w:w="150" w:type="dxa"/>
+              <w:left w:w="210" w:type="dxa"/>
+              <w:bottom w:w="150" w:type="dxa"/>
+              <w:right w:w="210" w:type="dxa"/>
+            </w:tcMar>
+            <w:vAlign w:val="center"/>
+            <w:hideMark/>
+          </w:tcPr>
+          <w:p>
+            <w:pPr>
+              <w:rPr>
+                <w:rFonts w:ascii="Plus Jakarta Sans" w:eastAsia="Times New Roman" w:hAnsi="Plus Jakarta Sans"/>
+                <w:sz w:val="20"/>
+                <w:szCs w:val="20"/>
+              </w:rPr>
+            </w:pPr>
+            <w:r>
+              <w:rPr>
+                <w:rFonts w:ascii="Plus Jakarta Sans" w:eastAsia="Times New Roman" w:hAnsi="Plus Jakarta Sans"/>
+                <w:sz w:val="20"/>
+                <w:szCs w:val="20"/>
+              </w:rPr>
+              <w:t>31,658,756.58 m²</w:t>
             </w:r>
           </w:p>
         </w:tc>
       </w:tr>
       <w:tr>
         <w:trPr>
-          <w:divId w:val="2041397413"/>
+          <w:divId w:val="2109958329"/>
         </w:trPr>
         <w:tc>
           <w:tcPr>
@@ -1349,74 +1350,74 @@
                 <w:sz w:val="20"/>
                 <w:szCs w:val="20"/>
               </w:rPr>
-              <w:t>20,091.91 m² (2.009 ha)</w:t>
-            </w:r>
-          </w:p>
-        </w:tc>
-        <w:tc>
-          <w:tcPr>
-            <w:tcW w:w="0" w:type="auto"/>
-            <w:tcMar>
-              <w:top w:w="150" w:type="dxa"/>
-              <w:left w:w="210" w:type="dxa"/>
-              <w:bottom w:w="150" w:type="dxa"/>
-              <w:right w:w="210" w:type="dxa"/>
-            </w:tcMar>
-            <w:vAlign w:val="center"/>
-            <w:hideMark/>
-          </w:tcPr>
-          <w:p>
-            <w:pPr>
-              <w:rPr>
-                <w:rFonts w:ascii="Plus Jakarta Sans" w:eastAsia="Times New Roman" w:hAnsi="Plus Jakarta Sans"/>
-                <w:sz w:val="20"/>
-                <w:szCs w:val="20"/>
-              </w:rPr>
-            </w:pPr>
-            <w:r>
-              <w:rPr>
-                <w:rFonts w:ascii="Plus Jakarta Sans" w:eastAsia="Times New Roman" w:hAnsi="Plus Jakarta Sans"/>
-                <w:sz w:val="20"/>
-                <w:szCs w:val="20"/>
-              </w:rPr>
-              <w:t>23,615.42 m² (2.362 ha)</w:t>
-            </w:r>
-          </w:p>
-        </w:tc>
-        <w:tc>
-          <w:tcPr>
-            <w:tcW w:w="0" w:type="auto"/>
-            <w:tcMar>
-              <w:top w:w="150" w:type="dxa"/>
-              <w:left w:w="210" w:type="dxa"/>
-              <w:bottom w:w="150" w:type="dxa"/>
-              <w:right w:w="210" w:type="dxa"/>
-            </w:tcMar>
-            <w:vAlign w:val="center"/>
-            <w:hideMark/>
-          </w:tcPr>
-          <w:p>
-            <w:pPr>
-              <w:rPr>
-                <w:rFonts w:ascii="Plus Jakarta Sans" w:eastAsia="Times New Roman" w:hAnsi="Plus Jakarta Sans"/>
-                <w:sz w:val="20"/>
-                <w:szCs w:val="20"/>
-              </w:rPr>
-            </w:pPr>
-            <w:r>
-              <w:rPr>
-                <w:rFonts w:ascii="Plus Jakarta Sans" w:eastAsia="Times New Roman" w:hAnsi="Plus Jakarta Sans"/>
-                <w:sz w:val="20"/>
-                <w:szCs w:val="20"/>
-              </w:rPr>
-              <w:t>39,523.32 m² (3.952 ha)</w:t>
+              <w:t>19,703.72 m² (1.970 ha)</w:t>
+            </w:r>
+          </w:p>
+        </w:tc>
+        <w:tc>
+          <w:tcPr>
+            <w:tcW w:w="0" w:type="auto"/>
+            <w:tcMar>
+              <w:top w:w="150" w:type="dxa"/>
+              <w:left w:w="210" w:type="dxa"/>
+              <w:bottom w:w="150" w:type="dxa"/>
+              <w:right w:w="210" w:type="dxa"/>
+            </w:tcMar>
+            <w:vAlign w:val="center"/>
+            <w:hideMark/>
+          </w:tcPr>
+          <w:p>
+            <w:pPr>
+              <w:rPr>
+                <w:rFonts w:ascii="Plus Jakarta Sans" w:eastAsia="Times New Roman" w:hAnsi="Plus Jakarta Sans"/>
+                <w:sz w:val="20"/>
+                <w:szCs w:val="20"/>
+              </w:rPr>
+            </w:pPr>
+            <w:r>
+              <w:rPr>
+                <w:rFonts w:ascii="Plus Jakarta Sans" w:eastAsia="Times New Roman" w:hAnsi="Plus Jakarta Sans"/>
+                <w:sz w:val="20"/>
+                <w:szCs w:val="20"/>
+              </w:rPr>
+              <w:t>23,610.14 m² (2.361 ha)</w:t>
+            </w:r>
+          </w:p>
+        </w:tc>
+        <w:tc>
+          <w:tcPr>
+            <w:tcW w:w="0" w:type="auto"/>
+            <w:tcMar>
+              <w:top w:w="150" w:type="dxa"/>
+              <w:left w:w="210" w:type="dxa"/>
+              <w:bottom w:w="150" w:type="dxa"/>
+              <w:right w:w="210" w:type="dxa"/>
+            </w:tcMar>
+            <w:vAlign w:val="center"/>
+            <w:hideMark/>
+          </w:tcPr>
+          <w:p>
+            <w:pPr>
+              <w:rPr>
+                <w:rFonts w:ascii="Plus Jakarta Sans" w:eastAsia="Times New Roman" w:hAnsi="Plus Jakarta Sans"/>
+                <w:sz w:val="20"/>
+                <w:szCs w:val="20"/>
+              </w:rPr>
+            </w:pPr>
+            <w:r>
+              <w:rPr>
+                <w:rFonts w:ascii="Plus Jakarta Sans" w:eastAsia="Times New Roman" w:hAnsi="Plus Jakarta Sans"/>
+                <w:sz w:val="20"/>
+                <w:szCs w:val="20"/>
+              </w:rPr>
+              <w:t>39,474.76 m² (3.947 ha)</w:t>
             </w:r>
           </w:p>
         </w:tc>
       </w:tr>
       <w:tr>
         <w:trPr>
-          <w:divId w:val="2041397413"/>
+          <w:divId w:val="2109958329"/>
         </w:trPr>
         <w:tc>
           <w:tcPr>
@@ -1475,74 +1476,74 @@
                 <w:sz w:val="20"/>
                 <w:szCs w:val="20"/>
               </w:rPr>
-              <w:t>29,336,220.32 m²</w:t>
-            </w:r>
-          </w:p>
-        </w:tc>
-        <w:tc>
-          <w:tcPr>
-            <w:tcW w:w="0" w:type="auto"/>
-            <w:tcMar>
-              <w:top w:w="150" w:type="dxa"/>
-              <w:left w:w="210" w:type="dxa"/>
-              <w:bottom w:w="150" w:type="dxa"/>
-              <w:right w:w="210" w:type="dxa"/>
-            </w:tcMar>
-            <w:vAlign w:val="center"/>
-            <w:hideMark/>
-          </w:tcPr>
-          <w:p>
-            <w:pPr>
-              <w:rPr>
-                <w:rFonts w:ascii="Plus Jakarta Sans" w:eastAsia="Times New Roman" w:hAnsi="Plus Jakarta Sans"/>
-                <w:sz w:val="20"/>
-                <w:szCs w:val="20"/>
-              </w:rPr>
-            </w:pPr>
-            <w:r>
-              <w:rPr>
-                <w:rFonts w:ascii="Plus Jakarta Sans" w:eastAsia="Times New Roman" w:hAnsi="Plus Jakarta Sans"/>
-                <w:sz w:val="20"/>
-                <w:szCs w:val="20"/>
-              </w:rPr>
-              <w:t>24,671,582.68 m²</w:t>
-            </w:r>
-          </w:p>
-        </w:tc>
-        <w:tc>
-          <w:tcPr>
-            <w:tcW w:w="0" w:type="auto"/>
-            <w:tcMar>
-              <w:top w:w="150" w:type="dxa"/>
-              <w:left w:w="210" w:type="dxa"/>
-              <w:bottom w:w="150" w:type="dxa"/>
-              <w:right w:w="210" w:type="dxa"/>
-            </w:tcMar>
-            <w:vAlign w:val="center"/>
-            <w:hideMark/>
-          </w:tcPr>
-          <w:p>
-            <w:pPr>
-              <w:rPr>
-                <w:rFonts w:ascii="Plus Jakarta Sans" w:eastAsia="Times New Roman" w:hAnsi="Plus Jakarta Sans"/>
-                <w:sz w:val="20"/>
-                <w:szCs w:val="20"/>
-              </w:rPr>
-            </w:pPr>
-            <w:r>
-              <w:rPr>
-                <w:rFonts w:ascii="Plus Jakarta Sans" w:eastAsia="Times New Roman" w:hAnsi="Plus Jakarta Sans"/>
-                <w:sz w:val="20"/>
-                <w:szCs w:val="20"/>
-              </w:rPr>
-              <w:t>15,443,759.00 m²</w:t>
+              <w:t>29,812,506.22 m²</w:t>
+            </w:r>
+          </w:p>
+        </w:tc>
+        <w:tc>
+          <w:tcPr>
+            <w:tcW w:w="0" w:type="auto"/>
+            <w:tcMar>
+              <w:top w:w="150" w:type="dxa"/>
+              <w:left w:w="210" w:type="dxa"/>
+              <w:bottom w:w="150" w:type="dxa"/>
+              <w:right w:w="210" w:type="dxa"/>
+            </w:tcMar>
+            <w:vAlign w:val="center"/>
+            <w:hideMark/>
+          </w:tcPr>
+          <w:p>
+            <w:pPr>
+              <w:rPr>
+                <w:rFonts w:ascii="Plus Jakarta Sans" w:eastAsia="Times New Roman" w:hAnsi="Plus Jakarta Sans"/>
+                <w:sz w:val="20"/>
+                <w:szCs w:val="20"/>
+              </w:rPr>
+            </w:pPr>
+            <w:r>
+              <w:rPr>
+                <w:rFonts w:ascii="Plus Jakarta Sans" w:eastAsia="Times New Roman" w:hAnsi="Plus Jakarta Sans"/>
+                <w:sz w:val="20"/>
+                <w:szCs w:val="20"/>
+              </w:rPr>
+              <w:t>24,686,577.09 m²</w:t>
+            </w:r>
+          </w:p>
+        </w:tc>
+        <w:tc>
+          <w:tcPr>
+            <w:tcW w:w="0" w:type="auto"/>
+            <w:tcMar>
+              <w:top w:w="150" w:type="dxa"/>
+              <w:left w:w="210" w:type="dxa"/>
+              <w:bottom w:w="150" w:type="dxa"/>
+              <w:right w:w="210" w:type="dxa"/>
+            </w:tcMar>
+            <w:vAlign w:val="center"/>
+            <w:hideMark/>
+          </w:tcPr>
+          <w:p>
+            <w:pPr>
+              <w:rPr>
+                <w:rFonts w:ascii="Plus Jakarta Sans" w:eastAsia="Times New Roman" w:hAnsi="Plus Jakarta Sans"/>
+                <w:sz w:val="20"/>
+                <w:szCs w:val="20"/>
+              </w:rPr>
+            </w:pPr>
+            <w:r>
+              <w:rPr>
+                <w:rFonts w:ascii="Plus Jakarta Sans" w:eastAsia="Times New Roman" w:hAnsi="Plus Jakarta Sans"/>
+                <w:sz w:val="20"/>
+                <w:szCs w:val="20"/>
+              </w:rPr>
+              <w:t>15,444,334.96 m²</w:t>
             </w:r>
           </w:p>
         </w:tc>
       </w:tr>
       <w:tr>
         <w:trPr>
-          <w:divId w:val="2041397413"/>
+          <w:divId w:val="2109958329"/>
         </w:trPr>
         <w:tc>
           <w:tcPr>
@@ -1601,37 +1602,37 @@
                 <w:sz w:val="20"/>
                 <w:szCs w:val="20"/>
               </w:rPr>
-              <w:t>17,651.16 m² (1.765 ha)</w:t>
-            </w:r>
-          </w:p>
-        </w:tc>
-        <w:tc>
-          <w:tcPr>
-            <w:tcW w:w="0" w:type="auto"/>
-            <w:tcMar>
-              <w:top w:w="150" w:type="dxa"/>
-              <w:left w:w="210" w:type="dxa"/>
-              <w:bottom w:w="150" w:type="dxa"/>
-              <w:right w:w="210" w:type="dxa"/>
-            </w:tcMar>
-            <w:vAlign w:val="center"/>
-            <w:hideMark/>
-          </w:tcPr>
-          <w:p>
-            <w:pPr>
-              <w:rPr>
-                <w:rFonts w:ascii="Plus Jakarta Sans" w:eastAsia="Times New Roman" w:hAnsi="Plus Jakarta Sans"/>
-                <w:sz w:val="20"/>
-                <w:szCs w:val="20"/>
-              </w:rPr>
-            </w:pPr>
-            <w:r>
-              <w:rPr>
-                <w:rFonts w:ascii="Plus Jakarta Sans" w:eastAsia="Times New Roman" w:hAnsi="Plus Jakarta Sans"/>
-                <w:sz w:val="20"/>
-                <w:szCs w:val="20"/>
-              </w:rPr>
-              <w:t>15,117.39 m² (1.</w:t>
+              <w:t>17,332.85 m² (1.733 ha)</w:t>
+            </w:r>
+          </w:p>
+        </w:tc>
+        <w:tc>
+          <w:tcPr>
+            <w:tcW w:w="0" w:type="auto"/>
+            <w:tcMar>
+              <w:top w:w="150" w:type="dxa"/>
+              <w:left w:w="210" w:type="dxa"/>
+              <w:bottom w:w="150" w:type="dxa"/>
+              <w:right w:w="210" w:type="dxa"/>
+            </w:tcMar>
+            <w:vAlign w:val="center"/>
+            <w:hideMark/>
+          </w:tcPr>
+          <w:p>
+            <w:pPr>
+              <w:rPr>
+                <w:rFonts w:ascii="Plus Jakarta Sans" w:eastAsia="Times New Roman" w:hAnsi="Plus Jakarta Sans"/>
+                <w:sz w:val="20"/>
+                <w:szCs w:val="20"/>
+              </w:rPr>
+            </w:pPr>
+            <w:r>
+              <w:rPr>
+                <w:rFonts w:ascii="Plus Jakarta Sans" w:eastAsia="Times New Roman" w:hAnsi="Plus Jakarta Sans"/>
+                <w:sz w:val="20"/>
+                <w:szCs w:val="20"/>
+              </w:rPr>
+              <w:t>15,117.32 m² (1.</w:t>
             </w:r>
             <w:r>
               <w:rPr>
@@ -1669,14 +1670,14 @@
                 <w:sz w:val="20"/>
                 <w:szCs w:val="20"/>
               </w:rPr>
-              <w:t>19,280.60 m² (1.928 ha)</w:t>
+              <w:t>19,257.28 m² (1.926 ha)</w:t>
             </w:r>
           </w:p>
         </w:tc>
       </w:tr>
       <w:tr>
         <w:trPr>
-          <w:divId w:val="2041397413"/>
+          <w:divId w:val="2109958329"/>
         </w:trPr>
         <w:tc>
           <w:tcPr>
@@ -1735,7 +1736,7 @@
                 <w:sz w:val="20"/>
                 <w:szCs w:val="20"/>
               </w:rPr>
-              <w:t>4,056,539.24 m² (405.65 ha)</w:t>
+              <w:t>4,077,885.57 m² (407.79 ha)</w:t>
             </w:r>
           </w:p>
         </w:tc>
@@ -1802,7 +1803,7 @@
       </w:tr>
       <w:tr>
         <w:trPr>
-          <w:divId w:val="2041397413"/>
+          <w:divId w:val="2109958329"/>
         </w:trPr>
         <w:tc>
           <w:tcPr>
@@ -1861,74 +1862,74 @@
                 <w:sz w:val="20"/>
                 <w:szCs w:val="20"/>
               </w:rPr>
-              <w:t>3,981 (49.5%)</w:t>
-            </w:r>
-          </w:p>
-        </w:tc>
-        <w:tc>
-          <w:tcPr>
-            <w:tcW w:w="0" w:type="auto"/>
-            <w:tcMar>
-              <w:top w:w="150" w:type="dxa"/>
-              <w:left w:w="210" w:type="dxa"/>
-              <w:bottom w:w="150" w:type="dxa"/>
-              <w:right w:w="210" w:type="dxa"/>
-            </w:tcMar>
-            <w:vAlign w:val="center"/>
-            <w:hideMark/>
-          </w:tcPr>
-          <w:p>
-            <w:pPr>
-              <w:rPr>
-                <w:rFonts w:ascii="Plus Jakarta Sans" w:eastAsia="Times New Roman" w:hAnsi="Plus Jakarta Sans"/>
-                <w:sz w:val="20"/>
-                <w:szCs w:val="20"/>
-              </w:rPr>
-            </w:pPr>
-            <w:r>
-              <w:rPr>
-                <w:rFonts w:ascii="Plus Jakarta Sans" w:eastAsia="Times New Roman" w:hAnsi="Plus Jakarta Sans"/>
-                <w:sz w:val="20"/>
-                <w:szCs w:val="20"/>
-              </w:rPr>
-              <w:t>2,391 (29.7%)</w:t>
-            </w:r>
-          </w:p>
-        </w:tc>
-        <w:tc>
-          <w:tcPr>
-            <w:tcW w:w="0" w:type="auto"/>
-            <w:tcMar>
-              <w:top w:w="150" w:type="dxa"/>
-              <w:left w:w="210" w:type="dxa"/>
-              <w:bottom w:w="150" w:type="dxa"/>
-              <w:right w:w="210" w:type="dxa"/>
-            </w:tcMar>
-            <w:vAlign w:val="center"/>
-            <w:hideMark/>
-          </w:tcPr>
-          <w:p>
-            <w:pPr>
-              <w:rPr>
-                <w:rFonts w:ascii="Plus Jakarta Sans" w:eastAsia="Times New Roman" w:hAnsi="Plus Jakarta Sans"/>
-                <w:sz w:val="20"/>
-                <w:szCs w:val="20"/>
-              </w:rPr>
-            </w:pPr>
-            <w:r>
-              <w:rPr>
-                <w:rFonts w:ascii="Plus Jakarta Sans" w:eastAsia="Times New Roman" w:hAnsi="Plus Jakarta Sans"/>
-                <w:sz w:val="20"/>
-                <w:szCs w:val="20"/>
-              </w:rPr>
-              <w:t>1,459 (18.1%)</w:t>
+              <w:t>4,071 (50.0%)</w:t>
+            </w:r>
+          </w:p>
+        </w:tc>
+        <w:tc>
+          <w:tcPr>
+            <w:tcW w:w="0" w:type="auto"/>
+            <w:tcMar>
+              <w:top w:w="150" w:type="dxa"/>
+              <w:left w:w="210" w:type="dxa"/>
+              <w:bottom w:w="150" w:type="dxa"/>
+              <w:right w:w="210" w:type="dxa"/>
+            </w:tcMar>
+            <w:vAlign w:val="center"/>
+            <w:hideMark/>
+          </w:tcPr>
+          <w:p>
+            <w:pPr>
+              <w:rPr>
+                <w:rFonts w:ascii="Plus Jakarta Sans" w:eastAsia="Times New Roman" w:hAnsi="Plus Jakarta Sans"/>
+                <w:sz w:val="20"/>
+                <w:szCs w:val="20"/>
+              </w:rPr>
+            </w:pPr>
+            <w:r>
+              <w:rPr>
+                <w:rFonts w:ascii="Plus Jakarta Sans" w:eastAsia="Times New Roman" w:hAnsi="Plus Jakarta Sans"/>
+                <w:sz w:val="20"/>
+                <w:szCs w:val="20"/>
+              </w:rPr>
+              <w:t>2,391 (29.4%)</w:t>
+            </w:r>
+          </w:p>
+        </w:tc>
+        <w:tc>
+          <w:tcPr>
+            <w:tcW w:w="0" w:type="auto"/>
+            <w:tcMar>
+              <w:top w:w="150" w:type="dxa"/>
+              <w:left w:w="210" w:type="dxa"/>
+              <w:bottom w:w="150" w:type="dxa"/>
+              <w:right w:w="210" w:type="dxa"/>
+            </w:tcMar>
+            <w:vAlign w:val="center"/>
+            <w:hideMark/>
+          </w:tcPr>
+          <w:p>
+            <w:pPr>
+              <w:rPr>
+                <w:rFonts w:ascii="Plus Jakarta Sans" w:eastAsia="Times New Roman" w:hAnsi="Plus Jakarta Sans"/>
+                <w:sz w:val="20"/>
+                <w:szCs w:val="20"/>
+              </w:rPr>
+            </w:pPr>
+            <w:r>
+              <w:rPr>
+                <w:rFonts w:ascii="Plus Jakarta Sans" w:eastAsia="Times New Roman" w:hAnsi="Plus Jakarta Sans"/>
+                <w:sz w:val="20"/>
+                <w:szCs w:val="20"/>
+              </w:rPr>
+              <w:t>1,462 (18.0%)</w:t>
             </w:r>
           </w:p>
         </w:tc>
       </w:tr>
       <w:tr>
         <w:trPr>
-          <w:divId w:val="2041397413"/>
+          <w:divId w:val="2109958329"/>
         </w:trPr>
         <w:tc>
           <w:tcPr>
@@ -1987,67 +1988,67 @@
                 <w:sz w:val="20"/>
                 <w:szCs w:val="20"/>
               </w:rPr>
-              <w:t>45,980 (28.4%)</w:t>
-            </w:r>
-          </w:p>
-        </w:tc>
-        <w:tc>
-          <w:tcPr>
-            <w:tcW w:w="0" w:type="auto"/>
-            <w:tcMar>
-              <w:top w:w="150" w:type="dxa"/>
-              <w:left w:w="210" w:type="dxa"/>
-              <w:bottom w:w="150" w:type="dxa"/>
-              <w:right w:w="210" w:type="dxa"/>
-            </w:tcMar>
-            <w:vAlign w:val="center"/>
-            <w:hideMark/>
-          </w:tcPr>
-          <w:p>
-            <w:pPr>
-              <w:rPr>
-                <w:rFonts w:ascii="Plus Jakarta Sans" w:eastAsia="Times New Roman" w:hAnsi="Plus Jakarta Sans"/>
-                <w:sz w:val="20"/>
-                <w:szCs w:val="20"/>
-              </w:rPr>
-            </w:pPr>
-            <w:r>
-              <w:rPr>
-                <w:rFonts w:ascii="Plus Jakarta Sans" w:eastAsia="Times New Roman" w:hAnsi="Plus Jakarta Sans"/>
-                <w:sz w:val="20"/>
-                <w:szCs w:val="20"/>
-              </w:rPr>
-              <w:t>35,076 (21.7%)</w:t>
-            </w:r>
-          </w:p>
-        </w:tc>
-        <w:tc>
-          <w:tcPr>
-            <w:tcW w:w="0" w:type="auto"/>
-            <w:tcMar>
-              <w:top w:w="150" w:type="dxa"/>
-              <w:left w:w="210" w:type="dxa"/>
-              <w:bottom w:w="150" w:type="dxa"/>
-              <w:right w:w="210" w:type="dxa"/>
-            </w:tcMar>
-            <w:vAlign w:val="center"/>
-            <w:hideMark/>
-          </w:tcPr>
-          <w:p>
-            <w:pPr>
-              <w:rPr>
-                <w:rFonts w:ascii="Plus Jakarta Sans" w:eastAsia="Times New Roman" w:hAnsi="Plus Jakarta Sans"/>
-                <w:sz w:val="20"/>
-                <w:szCs w:val="20"/>
-              </w:rPr>
-            </w:pPr>
-            <w:r>
-              <w:rPr>
-                <w:rFonts w:ascii="Plus Jakarta Sans" w:eastAsia="Times New Roman" w:hAnsi="Plus Jakarta Sans"/>
-                <w:sz w:val="20"/>
-                <w:szCs w:val="20"/>
-              </w:rPr>
-              <w:t>78,463 (48.5%)</w:t>
+              <w:t>46,760 (28.7%)</w:t>
+            </w:r>
+          </w:p>
+        </w:tc>
+        <w:tc>
+          <w:tcPr>
+            <w:tcW w:w="0" w:type="auto"/>
+            <w:tcMar>
+              <w:top w:w="150" w:type="dxa"/>
+              <w:left w:w="210" w:type="dxa"/>
+              <w:bottom w:w="150" w:type="dxa"/>
+              <w:right w:w="210" w:type="dxa"/>
+            </w:tcMar>
+            <w:vAlign w:val="center"/>
+            <w:hideMark/>
+          </w:tcPr>
+          <w:p>
+            <w:pPr>
+              <w:rPr>
+                <w:rFonts w:ascii="Plus Jakarta Sans" w:eastAsia="Times New Roman" w:hAnsi="Plus Jakarta Sans"/>
+                <w:sz w:val="20"/>
+                <w:szCs w:val="20"/>
+              </w:rPr>
+            </w:pPr>
+            <w:r>
+              <w:rPr>
+                <w:rFonts w:ascii="Plus Jakarta Sans" w:eastAsia="Times New Roman" w:hAnsi="Plus Jakarta Sans"/>
+                <w:sz w:val="20"/>
+                <w:szCs w:val="20"/>
+              </w:rPr>
+              <w:t>35,076 (21.5%)</w:t>
+            </w:r>
+          </w:p>
+        </w:tc>
+        <w:tc>
+          <w:tcPr>
+            <w:tcW w:w="0" w:type="auto"/>
+            <w:tcMar>
+              <w:top w:w="150" w:type="dxa"/>
+              <w:left w:w="210" w:type="dxa"/>
+              <w:bottom w:w="150" w:type="dxa"/>
+              <w:right w:w="210" w:type="dxa"/>
+            </w:tcMar>
+            <w:vAlign w:val="center"/>
+            <w:hideMark/>
+          </w:tcPr>
+          <w:p>
+            <w:pPr>
+              <w:rPr>
+                <w:rFonts w:ascii="Plus Jakarta Sans" w:eastAsia="Times New Roman" w:hAnsi="Plus Jakarta Sans"/>
+                <w:sz w:val="20"/>
+                <w:szCs w:val="20"/>
+              </w:rPr>
+            </w:pPr>
+            <w:r>
+              <w:rPr>
+                <w:rFonts w:ascii="Plus Jakarta Sans" w:eastAsia="Times New Roman" w:hAnsi="Plus Jakarta Sans"/>
+                <w:sz w:val="20"/>
+                <w:szCs w:val="20"/>
+              </w:rPr>
+              <w:t>78,689 (48.3%)</w:t>
             </w:r>
           </w:p>
         </w:tc>
@@ -2056,7 +2057,7 @@
     <w:p>
       <w:pPr>
         <w:pStyle w:val="Ttulo3"/>
-        <w:divId w:val="1889216436"/>
+        <w:divId w:val="1629779195"/>
         <w:rPr>
           <w:rFonts w:eastAsia="Times New Roman"/>
           <w:lang w:val="es-ES"/>
@@ -2073,7 +2074,7 @@
     <w:p>
       <w:pPr>
         <w:pStyle w:val="NormalWeb"/>
-        <w:divId w:val="1889216436"/>
+        <w:divId w:val="1629779195"/>
         <w:rPr>
           <w:rFonts w:ascii="Plus Jakarta Sans" w:hAnsi="Plus Jakarta Sans"/>
           <w:lang w:val="es-ES"/>
@@ -2102,7 +2103,7 @@
         </w:numPr>
         <w:spacing w:before="100" w:beforeAutospacing="1" w:after="90"/>
         <w:ind w:left="1020"/>
-        <w:divId w:val="1889216436"/>
+        <w:divId w:val="1629779195"/>
         <w:rPr>
           <w:rFonts w:ascii="Plus Jakarta Sans" w:eastAsia="Times New Roman" w:hAnsi="Plus Jakarta Sans"/>
           <w:sz w:val="21"/>
@@ -2137,7 +2138,7 @@
           <w:szCs w:val="21"/>
           <w:lang w:val="es-ES"/>
         </w:rPr>
-        <w:t>49.5%</w:t>
+        <w:t>50.0%</w:t>
       </w:r>
       <w:r>
         <w:rPr>
@@ -2156,7 +2157,7 @@
           <w:szCs w:val="21"/>
           <w:lang w:val="es-ES"/>
         </w:rPr>
-        <w:t>28.4%</w:t>
+        <w:t>28.7%</w:t>
       </w:r>
       <w:r>
         <w:rPr>
@@ -2184,7 +2185,7 @@
           <w:szCs w:val="21"/>
           <w:lang w:val="es-ES"/>
         </w:rPr>
-        <w:t>405.65 ha</w:t>
+        <w:t>407.79 ha</w:t>
       </w:r>
       <w:r>
         <w:rPr>
@@ -2204,7 +2205,7 @@
         </w:numPr>
         <w:spacing w:before="100" w:beforeAutospacing="1" w:after="90"/>
         <w:ind w:left="1020"/>
-        <w:divId w:val="1889216436"/>
+        <w:divId w:val="1629779195"/>
         <w:rPr>
           <w:rFonts w:ascii="Plus Jakarta Sans" w:eastAsia="Times New Roman" w:hAnsi="Plus Jakarta Sans"/>
           <w:sz w:val="21"/>
@@ -2248,7 +2249,7 @@
           <w:szCs w:val="21"/>
           <w:lang w:val="es-ES"/>
         </w:rPr>
-        <w:t>29.7%</w:t>
+        <w:t>29.4%</w:t>
       </w:r>
       <w:r>
         <w:rPr>
@@ -2267,7 +2268,7 @@
           <w:szCs w:val="21"/>
           <w:lang w:val="es-ES"/>
         </w:rPr>
-        <w:t>21.7%</w:t>
+        <w:t>21.5%</w:t>
       </w:r>
       <w:r>
         <w:rPr>
@@ -2276,7 +2277,17 @@
           <w:szCs w:val="21"/>
           <w:lang w:val="es-ES"/>
         </w:rPr>
-        <w:t xml:space="preserve"> del ganado. Este sector mantiene una superficie de secano de </w:t>
+        <w:t xml:space="preserve"> del ganado. Este sector mantiene una superficie de </w:t>
+      </w:r>
+      <w:r>
+        <w:rPr>
+          <w:rFonts w:ascii="Plus Jakarta Sans" w:eastAsia="Times New Roman" w:hAnsi="Plus Jakarta Sans"/>
+          <w:sz w:val="21"/>
+          <w:szCs w:val="21"/>
+          <w:lang w:val="es-ES"/>
+        </w:rPr>
+        <w:lastRenderedPageBreak/>
+        <w:t xml:space="preserve">secano de </w:t>
       </w:r>
       <w:r>
         <w:rPr>
@@ -2306,7 +2317,7 @@
         </w:numPr>
         <w:spacing w:before="100" w:beforeAutospacing="1" w:after="90"/>
         <w:ind w:left="1020"/>
-        <w:divId w:val="1889216436"/>
+        <w:divId w:val="1629779195"/>
         <w:rPr>
           <w:rFonts w:ascii="Plus Jakarta Sans" w:eastAsia="Times New Roman" w:hAnsi="Plus Jakarta Sans"/>
           <w:sz w:val="21"/>
@@ -2388,7 +2399,7 @@
           <w:szCs w:val="21"/>
           <w:lang w:val="es-ES"/>
         </w:rPr>
-        <w:t>18.1%</w:t>
+        <w:t>18.0%</w:t>
       </w:r>
       <w:r>
         <w:rPr>
@@ -2412,7 +2423,7 @@
     <w:p>
       <w:pPr>
         <w:pStyle w:val="Ttulo3"/>
-        <w:divId w:val="1889216436"/>
+        <w:divId w:val="1629779195"/>
         <w:rPr>
           <w:rFonts w:eastAsia="Times New Roman"/>
           <w:lang w:val="es-ES"/>
@@ -2430,7 +2441,7 @@
       <w:pPr>
         <w:spacing w:before="375" w:after="225"/>
         <w:jc w:val="center"/>
-        <w:divId w:val="1085107930"/>
+        <w:divId w:val="585110177"/>
         <w:rPr>
           <w:rFonts w:ascii="Outfit" w:eastAsia="Times New Roman" w:hAnsi="Outfit"/>
           <w:b/>
@@ -2458,8 +2469,9 @@
     </w:p>
     <w:p>
       <w:pPr>
+        <w:spacing w:after="375"/>
         <w:jc w:val="center"/>
-        <w:divId w:val="951011909"/>
+        <w:divId w:val="1121262656"/>
         <w:rPr>
           <w:rFonts w:ascii="Plus Jakarta Sans" w:eastAsia="Times New Roman" w:hAnsi="Plus Jakarta Sans"/>
           <w:lang w:val="es-ES"/>
@@ -2645,7 +2657,7 @@
           <w:rFonts w:ascii="Plus Jakarta Sans" w:eastAsia="Times New Roman" w:hAnsi="Plus Jakarta Sans"/>
           <w:lang w:val="es-ES"/>
         </w:rPr>
-        <w:t>87.9</w:t>
+        <w:t>88.0</w:t>
       </w:r>
       <w:r>
         <w:rPr>
@@ -2666,7 +2678,7 @@
           <w:rFonts w:ascii="Plus Jakarta Sans" w:eastAsia="Times New Roman" w:hAnsi="Plus Jakarta Sans"/>
           <w:lang w:val="es-ES"/>
         </w:rPr>
-        <w:t>12.1</w:t>
+        <w:t>12.0</w:t>
       </w:r>
       <w:r>
         <w:rPr>
@@ -2854,18 +2866,18 @@
     <w:p>
       <w:pPr>
         <w:spacing w:before="450" w:after="450"/>
-        <w:divId w:val="1889216436"/>
-        <w:rPr>
-          <w:rFonts w:ascii="Plus Jakarta Sans" w:eastAsia="Times New Roman" w:hAnsi="Plus Jakarta Sans"/>
-          <w:lang w:val="es-ES"/>
-        </w:rPr>
-      </w:pPr>
-      <w:r>
-        <w:rPr>
-          <w:rFonts w:ascii="Plus Jakarta Sans" w:eastAsia="Times New Roman" w:hAnsi="Plus Jakarta Sans"/>
-          <w:lang w:val="es-ES"/>
-        </w:rPr>
-        <w:pict w14:anchorId="3275C833">
+        <w:divId w:val="1629779195"/>
+        <w:rPr>
+          <w:rFonts w:ascii="Plus Jakarta Sans" w:eastAsia="Times New Roman" w:hAnsi="Plus Jakarta Sans"/>
+          <w:lang w:val="es-ES"/>
+        </w:rPr>
+      </w:pPr>
+      <w:r>
+        <w:rPr>
+          <w:rFonts w:ascii="Plus Jakarta Sans" w:eastAsia="Times New Roman" w:hAnsi="Plus Jakarta Sans"/>
+          <w:lang w:val="es-ES"/>
+        </w:rPr>
+        <w:pict>
           <v:rect id="_x0000_i1028" style="width:0;height:.75pt" o:hralign="center" o:hrstd="t" o:hr="t" fillcolor="#a0a0a0" stroked="f"/>
         </w:pict>
       </w:r>
@@ -2873,7 +2885,7 @@
     <w:p>
       <w:pPr>
         <w:pStyle w:val="Ttulo3"/>
-        <w:divId w:val="1889216436"/>
+        <w:divId w:val="1629779195"/>
         <w:rPr>
           <w:rFonts w:eastAsia="Times New Roman"/>
           <w:lang w:val="es-ES"/>
@@ -2890,7 +2902,7 @@
     <w:p>
       <w:pPr>
         <w:pStyle w:val="NormalWeb"/>
-        <w:divId w:val="1889216436"/>
+        <w:divId w:val="1629779195"/>
         <w:rPr>
           <w:rFonts w:ascii="Plus Jakarta Sans" w:hAnsi="Plus Jakarta Sans"/>
           <w:lang w:val="es-ES"/>
@@ -2923,7 +2935,7 @@
       </w:tblGrid>
       <w:tr>
         <w:trPr>
-          <w:divId w:val="195390231"/>
+          <w:divId w:val="29107729"/>
           <w:tblHeader/>
         </w:trPr>
         <w:tc>
@@ -3077,7 +3089,7 @@
       </w:tr>
       <w:tr>
         <w:trPr>
-          <w:divId w:val="195390231"/>
+          <w:divId w:val="29107729"/>
         </w:trPr>
         <w:tc>
           <w:tcPr>
@@ -3144,7 +3156,7 @@
                 <w:sz w:val="20"/>
                 <w:szCs w:val="20"/>
               </w:rPr>
-              <w:t>43 (2.6%)</w:t>
+              <w:t>48 (2.8%)</w:t>
             </w:r>
           </w:p>
         </w:tc>
@@ -3204,14 +3216,14 @@
                 <w:sz w:val="20"/>
                 <w:szCs w:val="20"/>
               </w:rPr>
-              <w:t>102 (12.7%)</w:t>
+              <w:t>103 (12.8%)</w:t>
             </w:r>
           </w:p>
         </w:tc>
       </w:tr>
       <w:tr>
         <w:trPr>
-          <w:divId w:val="195390231"/>
+          <w:divId w:val="29107729"/>
         </w:trPr>
         <w:tc>
           <w:tcPr>
@@ -3278,7 +3290,7 @@
                 <w:sz w:val="20"/>
                 <w:szCs w:val="20"/>
               </w:rPr>
-              <w:t>525 (31.6%)</w:t>
+              <w:t>544 (31.6%)</w:t>
             </w:r>
           </w:p>
         </w:tc>
@@ -3338,14 +3350,14 @@
                 <w:sz w:val="20"/>
                 <w:szCs w:val="20"/>
               </w:rPr>
-              <w:t>342 (42.7%)</w:t>
+              <w:t>342 (42.6%)</w:t>
             </w:r>
           </w:p>
         </w:tc>
       </w:tr>
       <w:tr>
         <w:trPr>
-          <w:divId w:val="195390231"/>
+          <w:divId w:val="29107729"/>
         </w:trPr>
         <w:tc>
           <w:tcPr>
@@ -3412,7 +3424,7 @@
                 <w:sz w:val="20"/>
                 <w:szCs w:val="20"/>
               </w:rPr>
-              <w:t>457 (27.5%)</w:t>
+              <w:t>475 (27.6%)</w:t>
             </w:r>
           </w:p>
         </w:tc>
@@ -3479,7 +3491,7 @@
       </w:tr>
       <w:tr>
         <w:trPr>
-          <w:divId w:val="195390231"/>
+          <w:divId w:val="29107729"/>
         </w:trPr>
         <w:tc>
           <w:tcPr>
@@ -3546,37 +3558,37 @@
                 <w:sz w:val="20"/>
                 <w:szCs w:val="20"/>
               </w:rPr>
-              <w:t>566 (34.1%)</w:t>
-            </w:r>
-          </w:p>
-        </w:tc>
-        <w:tc>
-          <w:tcPr>
-            <w:tcW w:w="0" w:type="auto"/>
-            <w:tcMar>
-              <w:top w:w="150" w:type="dxa"/>
-              <w:left w:w="210" w:type="dxa"/>
-              <w:bottom w:w="150" w:type="dxa"/>
-              <w:right w:w="210" w:type="dxa"/>
-            </w:tcMar>
-            <w:vAlign w:val="center"/>
-            <w:hideMark/>
-          </w:tcPr>
-          <w:p>
-            <w:pPr>
-              <w:rPr>
-                <w:rFonts w:ascii="Plus Jakarta Sans" w:eastAsia="Times New Roman" w:hAnsi="Plus Jakarta Sans"/>
-                <w:sz w:val="20"/>
-                <w:szCs w:val="20"/>
-              </w:rPr>
-            </w:pPr>
-            <w:r>
-              <w:rPr>
-                <w:rFonts w:ascii="Plus Jakarta Sans" w:eastAsia="Times New Roman" w:hAnsi="Plus Jakarta Sans"/>
-                <w:sz w:val="20"/>
-                <w:szCs w:val="20"/>
-              </w:rPr>
-              <w:t>709 (43.4%)</w:t>
+              <w:t>582 (33.8%)</w:t>
+            </w:r>
+          </w:p>
+        </w:tc>
+        <w:tc>
+          <w:tcPr>
+            <w:tcW w:w="0" w:type="auto"/>
+            <w:tcMar>
+              <w:top w:w="150" w:type="dxa"/>
+              <w:left w:w="210" w:type="dxa"/>
+              <w:bottom w:w="150" w:type="dxa"/>
+              <w:right w:w="210" w:type="dxa"/>
+            </w:tcMar>
+            <w:vAlign w:val="center"/>
+            <w:hideMark/>
+          </w:tcPr>
+          <w:p>
+            <w:pPr>
+              <w:rPr>
+                <w:rFonts w:ascii="Plus Jakarta Sans" w:eastAsia="Times New Roman" w:hAnsi="Plus Jakarta Sans"/>
+                <w:sz w:val="20"/>
+                <w:szCs w:val="20"/>
+              </w:rPr>
+            </w:pPr>
+            <w:r>
+              <w:rPr>
+                <w:rFonts w:ascii="Plus Jakarta Sans" w:eastAsia="Times New Roman" w:hAnsi="Plus Jakarta Sans"/>
+                <w:sz w:val="20"/>
+                <w:szCs w:val="20"/>
+              </w:rPr>
+              <w:t>710 (43.5%)</w:t>
             </w:r>
           </w:p>
         </w:tc>
@@ -3613,7 +3625,7 @@
       </w:tr>
       <w:tr>
         <w:trPr>
-          <w:divId w:val="195390231"/>
+          <w:divId w:val="29107729"/>
         </w:trPr>
         <w:tc>
           <w:tcPr>
@@ -3680,7 +3692,7 @@
                 <w:sz w:val="20"/>
                 <w:szCs w:val="20"/>
               </w:rPr>
-              <w:t>48 (2.9%)</w:t>
+              <w:t>48 (2.8%)</w:t>
             </w:r>
           </w:p>
         </w:tc>
@@ -3747,7 +3759,7 @@
       </w:tr>
       <w:tr>
         <w:trPr>
-          <w:divId w:val="195390231"/>
+          <w:divId w:val="29107729"/>
         </w:trPr>
         <w:tc>
           <w:tcPr>
@@ -3814,7 +3826,7 @@
                 <w:sz w:val="20"/>
                 <w:szCs w:val="20"/>
               </w:rPr>
-              <w:t>23 (1.4%)</w:t>
+              <w:t>23 (1.3%)</w:t>
             </w:r>
           </w:p>
         </w:tc>
@@ -3883,7 +3895,7 @@
     <w:p>
       <w:pPr>
         <w:pStyle w:val="Ttulo3"/>
-        <w:divId w:val="1889216436"/>
+        <w:divId w:val="1629779195"/>
         <w:rPr>
           <w:rFonts w:eastAsia="Times New Roman"/>
           <w:lang w:val="es-ES"/>
@@ -3901,7 +3913,7 @@
       <w:pPr>
         <w:spacing w:before="375" w:after="225"/>
         <w:jc w:val="center"/>
-        <w:divId w:val="1741948142"/>
+        <w:divId w:val="1546067862"/>
         <w:rPr>
           <w:rFonts w:ascii="Outfit" w:eastAsia="Times New Roman" w:hAnsi="Outfit"/>
           <w:b/>
@@ -3931,7 +3943,7 @@
       <w:pPr>
         <w:spacing w:after="375"/>
         <w:jc w:val="center"/>
-        <w:divId w:val="965896291"/>
+        <w:divId w:val="1144858127"/>
         <w:rPr>
           <w:rFonts w:ascii="Plus Jakarta Sans" w:eastAsia="Times New Roman" w:hAnsi="Plus Jakarta Sans"/>
           <w:lang w:val="es-ES"/>
@@ -4305,18 +4317,18 @@
     <w:p>
       <w:pPr>
         <w:spacing w:before="450" w:after="450"/>
-        <w:divId w:val="1889216436"/>
-        <w:rPr>
-          <w:rFonts w:ascii="Plus Jakarta Sans" w:eastAsia="Times New Roman" w:hAnsi="Plus Jakarta Sans"/>
-          <w:lang w:val="es-ES"/>
-        </w:rPr>
-      </w:pPr>
-      <w:r>
-        <w:rPr>
-          <w:rFonts w:ascii="Plus Jakarta Sans" w:eastAsia="Times New Roman" w:hAnsi="Plus Jakarta Sans"/>
-          <w:lang w:val="es-ES"/>
-        </w:rPr>
-        <w:pict w14:anchorId="6B8E19C7">
+        <w:divId w:val="1629779195"/>
+        <w:rPr>
+          <w:rFonts w:ascii="Plus Jakarta Sans" w:eastAsia="Times New Roman" w:hAnsi="Plus Jakarta Sans"/>
+          <w:lang w:val="es-ES"/>
+        </w:rPr>
+      </w:pPr>
+      <w:r>
+        <w:rPr>
+          <w:rFonts w:ascii="Plus Jakarta Sans" w:eastAsia="Times New Roman" w:hAnsi="Plus Jakarta Sans"/>
+          <w:lang w:val="es-ES"/>
+        </w:rPr>
+        <w:pict>
           <v:rect id="_x0000_i1029" style="width:0;height:.75pt" o:hralign="center" o:hrstd="t" o:hr="t" fillcolor="#a0a0a0" stroked="f"/>
         </w:pict>
       </w:r>
@@ -4324,7 +4336,7 @@
     <w:p>
       <w:pPr>
         <w:pStyle w:val="Ttulo3"/>
-        <w:divId w:val="1889216436"/>
+        <w:divId w:val="1629779195"/>
         <w:rPr>
           <w:rFonts w:eastAsia="Times New Roman"/>
           <w:lang w:val="es-ES"/>
@@ -4341,7 +4353,7 @@
     <w:p>
       <w:pPr>
         <w:pStyle w:val="NormalWeb"/>
-        <w:divId w:val="1889216436"/>
+        <w:divId w:val="1629779195"/>
         <w:rPr>
           <w:rFonts w:ascii="Plus Jakarta Sans" w:hAnsi="Plus Jakarta Sans"/>
           <w:lang w:val="es-ES"/>
@@ -4363,7 +4375,7 @@
         </w:numPr>
         <w:spacing w:before="100" w:beforeAutospacing="1" w:after="90"/>
         <w:ind w:left="1020"/>
-        <w:divId w:val="1889216436"/>
+        <w:divId w:val="1629779195"/>
         <w:rPr>
           <w:rFonts w:ascii="Plus Jakarta Sans" w:eastAsia="Times New Roman" w:hAnsi="Plus Jakarta Sans"/>
           <w:sz w:val="21"/>
@@ -4399,7 +4411,7 @@
         </w:numPr>
         <w:spacing w:before="100" w:beforeAutospacing="1" w:after="90"/>
         <w:ind w:left="1020"/>
-        <w:divId w:val="1889216436"/>
+        <w:divId w:val="1629779195"/>
         <w:rPr>
           <w:rFonts w:ascii="Plus Jakarta Sans" w:eastAsia="Times New Roman" w:hAnsi="Plus Jakarta Sans"/>
           <w:sz w:val="21"/>
@@ -4444,7 +4456,7 @@
         </w:numPr>
         <w:spacing w:before="100" w:beforeAutospacing="1" w:after="90"/>
         <w:ind w:left="1020"/>
-        <w:divId w:val="1889216436"/>
+        <w:divId w:val="1629779195"/>
         <w:rPr>
           <w:rFonts w:ascii="Plus Jakarta Sans" w:eastAsia="Times New Roman" w:hAnsi="Plus Jakarta Sans"/>
           <w:sz w:val="21"/>
@@ -4489,7 +4501,7 @@
         </w:numPr>
         <w:spacing w:before="100" w:beforeAutospacing="1" w:after="90"/>
         <w:ind w:left="1020"/>
-        <w:divId w:val="1889216436"/>
+        <w:divId w:val="1629779195"/>
         <w:rPr>
           <w:rFonts w:ascii="Plus Jakarta Sans" w:eastAsia="Times New Roman" w:hAnsi="Plus Jakarta Sans"/>
           <w:sz w:val="21"/>
@@ -4545,7 +4557,7 @@
       </w:tblGrid>
       <w:tr>
         <w:trPr>
-          <w:divId w:val="332033459"/>
+          <w:divId w:val="81068588"/>
           <w:tblHeader/>
         </w:trPr>
         <w:tc>
@@ -4699,7 +4711,7 @@
       </w:tr>
       <w:tr>
         <w:trPr>
-          <w:divId w:val="332033459"/>
+          <w:divId w:val="81068588"/>
         </w:trPr>
         <w:tc>
           <w:tcPr>
@@ -4758,37 +4770,37 @@
                 <w:sz w:val="20"/>
                 <w:szCs w:val="20"/>
               </w:rPr>
-              <w:t>111 (6.7%)</w:t>
-            </w:r>
-          </w:p>
-        </w:tc>
-        <w:tc>
-          <w:tcPr>
-            <w:tcW w:w="0" w:type="auto"/>
-            <w:tcMar>
-              <w:top w:w="150" w:type="dxa"/>
-              <w:left w:w="210" w:type="dxa"/>
-              <w:bottom w:w="150" w:type="dxa"/>
-              <w:right w:w="210" w:type="dxa"/>
-            </w:tcMar>
-            <w:vAlign w:val="center"/>
-            <w:hideMark/>
-          </w:tcPr>
-          <w:p>
-            <w:pPr>
-              <w:rPr>
-                <w:rFonts w:ascii="Plus Jakarta Sans" w:eastAsia="Times New Roman" w:hAnsi="Plus Jakarta Sans"/>
-                <w:sz w:val="20"/>
-                <w:szCs w:val="20"/>
-              </w:rPr>
-            </w:pPr>
-            <w:r>
-              <w:rPr>
-                <w:rFonts w:ascii="Plus Jakarta Sans" w:eastAsia="Times New Roman" w:hAnsi="Plus Jakarta Sans"/>
-                <w:sz w:val="20"/>
-                <w:szCs w:val="20"/>
-              </w:rPr>
-              <w:t>566 (34.7%)</w:t>
+              <w:t>124 (7.2%)</w:t>
+            </w:r>
+          </w:p>
+        </w:tc>
+        <w:tc>
+          <w:tcPr>
+            <w:tcW w:w="0" w:type="auto"/>
+            <w:tcMar>
+              <w:top w:w="150" w:type="dxa"/>
+              <w:left w:w="210" w:type="dxa"/>
+              <w:bottom w:w="150" w:type="dxa"/>
+              <w:right w:w="210" w:type="dxa"/>
+            </w:tcMar>
+            <w:vAlign w:val="center"/>
+            <w:hideMark/>
+          </w:tcPr>
+          <w:p>
+            <w:pPr>
+              <w:rPr>
+                <w:rFonts w:ascii="Plus Jakarta Sans" w:eastAsia="Times New Roman" w:hAnsi="Plus Jakarta Sans"/>
+                <w:sz w:val="20"/>
+                <w:szCs w:val="20"/>
+              </w:rPr>
+            </w:pPr>
+            <w:r>
+              <w:rPr>
+                <w:rFonts w:ascii="Plus Jakarta Sans" w:eastAsia="Times New Roman" w:hAnsi="Plus Jakarta Sans"/>
+                <w:sz w:val="20"/>
+                <w:szCs w:val="20"/>
+              </w:rPr>
+              <w:t>567 (34.7%)</w:t>
             </w:r>
           </w:p>
         </w:tc>
@@ -4825,7 +4837,7 @@
       </w:tr>
       <w:tr>
         <w:trPr>
-          <w:divId w:val="332033459"/>
+          <w:divId w:val="81068588"/>
         </w:trPr>
         <w:tc>
           <w:tcPr>
@@ -4884,7 +4896,7 @@
                 <w:sz w:val="20"/>
                 <w:szCs w:val="20"/>
               </w:rPr>
-              <w:t>568 (34.2%)</w:t>
+              <w:t>595 (34.6%)</w:t>
             </w:r>
           </w:p>
         </w:tc>
@@ -4944,14 +4956,14 @@
                 <w:sz w:val="20"/>
                 <w:szCs w:val="20"/>
               </w:rPr>
-              <w:t>219 (27.3%)</w:t>
+              <w:t>220 (27.4%)</w:t>
             </w:r>
           </w:p>
         </w:tc>
       </w:tr>
       <w:tr>
         <w:trPr>
-          <w:divId w:val="332033459"/>
+          <w:divId w:val="81068588"/>
         </w:trPr>
         <w:tc>
           <w:tcPr>
@@ -5010,7 +5022,7 @@
                 <w:sz w:val="20"/>
                 <w:szCs w:val="20"/>
               </w:rPr>
-              <w:t>573 (34.5%)</w:t>
+              <w:t>583 (33.9%)</w:t>
             </w:r>
           </w:p>
         </w:tc>
@@ -5077,7 +5089,7 @@
       </w:tr>
       <w:tr>
         <w:trPr>
-          <w:divId w:val="332033459"/>
+          <w:divId w:val="81068588"/>
         </w:trPr>
         <w:tc>
           <w:tcPr>
@@ -5136,7 +5148,7 @@
                 <w:sz w:val="20"/>
                 <w:szCs w:val="20"/>
               </w:rPr>
-              <w:t>410 (24.7%)</w:t>
+              <w:t>418 (24.3%)</w:t>
             </w:r>
           </w:p>
         </w:tc>
@@ -5205,18 +5217,18 @@
     <w:p>
       <w:pPr>
         <w:spacing w:before="450" w:after="450"/>
-        <w:divId w:val="1889216436"/>
-        <w:rPr>
-          <w:rFonts w:ascii="Plus Jakarta Sans" w:eastAsia="Times New Roman" w:hAnsi="Plus Jakarta Sans"/>
-          <w:lang w:val="es-ES"/>
-        </w:rPr>
-      </w:pPr>
-      <w:r>
-        <w:rPr>
-          <w:rFonts w:ascii="Plus Jakarta Sans" w:eastAsia="Times New Roman" w:hAnsi="Plus Jakarta Sans"/>
-          <w:lang w:val="es-ES"/>
-        </w:rPr>
-        <w:pict w14:anchorId="457FCB8C">
+        <w:divId w:val="1629779195"/>
+        <w:rPr>
+          <w:rFonts w:ascii="Plus Jakarta Sans" w:eastAsia="Times New Roman" w:hAnsi="Plus Jakarta Sans"/>
+          <w:lang w:val="es-ES"/>
+        </w:rPr>
+      </w:pPr>
+      <w:r>
+        <w:rPr>
+          <w:rFonts w:ascii="Plus Jakarta Sans" w:eastAsia="Times New Roman" w:hAnsi="Plus Jakarta Sans"/>
+          <w:lang w:val="es-ES"/>
+        </w:rPr>
+        <w:pict>
           <v:rect id="_x0000_i1030" style="width:0;height:.75pt" o:hralign="center" o:hrstd="t" o:hr="t" fillcolor="#a0a0a0" stroked="f"/>
         </w:pict>
       </w:r>
@@ -5224,7 +5236,7 @@
     <w:p>
       <w:pPr>
         <w:pStyle w:val="Ttulo3"/>
-        <w:divId w:val="1889216436"/>
+        <w:divId w:val="1629779195"/>
         <w:rPr>
           <w:rFonts w:eastAsia="Times New Roman"/>
           <w:lang w:val="es-ES"/>
@@ -5241,7 +5253,7 @@
     <w:p>
       <w:pPr>
         <w:pStyle w:val="NormalWeb"/>
-        <w:divId w:val="1889216436"/>
+        <w:divId w:val="1629779195"/>
         <w:rPr>
           <w:rFonts w:ascii="Plus Jakarta Sans" w:hAnsi="Plus Jakarta Sans"/>
           <w:lang w:val="es-ES"/>
@@ -5265,7 +5277,7 @@
     <w:p>
       <w:pPr>
         <w:pStyle w:val="Ttulo4"/>
-        <w:divId w:val="1889216436"/>
+        <w:divId w:val="1629779195"/>
         <w:rPr>
           <w:rFonts w:eastAsia="Times New Roman"/>
           <w:lang w:val="es-ES"/>
@@ -5283,7 +5295,7 @@
       <w:pPr>
         <w:spacing w:before="375" w:after="225"/>
         <w:jc w:val="center"/>
-        <w:divId w:val="82847537"/>
+        <w:divId w:val="1827284046"/>
         <w:rPr>
           <w:rFonts w:ascii="Outfit" w:eastAsia="Times New Roman" w:hAnsi="Outfit"/>
           <w:b/>
@@ -5313,7 +5325,7 @@
       <w:pPr>
         <w:spacing w:after="375"/>
         <w:jc w:val="center"/>
-        <w:divId w:val="244263598"/>
+        <w:divId w:val="1219440486"/>
         <w:rPr>
           <w:rFonts w:ascii="Plus Jakarta Sans" w:eastAsia="Times New Roman" w:hAnsi="Plus Jakarta Sans"/>
           <w:lang w:val="es-ES"/>
@@ -5492,7 +5504,7 @@
           <w:rFonts w:ascii="Plus Jakarta Sans" w:eastAsia="Times New Roman" w:hAnsi="Plus Jakarta Sans"/>
           <w:lang w:val="es-ES"/>
         </w:rPr>
-        <w:t>50.8% (3,981 cultivos</w:t>
+        <w:t>51.4% (4,071 cultivos</w:t>
       </w:r>
       <w:r>
         <w:rPr>
@@ -5534,7 +5546,7 @@
           <w:rFonts w:ascii="Plus Jakarta Sans" w:eastAsia="Times New Roman" w:hAnsi="Plus Jakarta Sans"/>
           <w:lang w:val="es-ES"/>
         </w:rPr>
-        <w:t>30.5% (2,391 cultivos</w:t>
+        <w:t>30.2% (2,391 cultivos</w:t>
       </w:r>
       <w:r>
         <w:rPr>
@@ -5576,7 +5588,7 @@
           <w:rFonts w:ascii="Plus Jakarta Sans" w:eastAsia="Times New Roman" w:hAnsi="Plus Jakarta Sans"/>
           <w:lang w:val="es-ES"/>
         </w:rPr>
-        <w:t>18.6% (1,459 cultivos</w:t>
+        <w:t>18.5% (1,462 cultivos</w:t>
       </w:r>
       <w:r>
         <w:rPr>
@@ -5596,7 +5608,7 @@
     <w:p>
       <w:pPr>
         <w:pStyle w:val="Ttulo4"/>
-        <w:divId w:val="1889216436"/>
+        <w:divId w:val="1629779195"/>
         <w:rPr>
           <w:rFonts w:eastAsia="Times New Roman"/>
           <w:lang w:val="es-ES"/>
@@ -5621,7 +5633,7 @@
       <w:pPr>
         <w:spacing w:before="375" w:after="225"/>
         <w:jc w:val="center"/>
-        <w:divId w:val="1551378958"/>
+        <w:divId w:val="2038895529"/>
         <w:rPr>
           <w:rFonts w:ascii="Outfit" w:eastAsia="Times New Roman" w:hAnsi="Outfit"/>
           <w:b/>
@@ -5651,7 +5663,7 @@
       <w:pPr>
         <w:spacing w:after="375"/>
         <w:jc w:val="center"/>
-        <w:divId w:val="1552766514"/>
+        <w:divId w:val="938636994"/>
         <w:rPr>
           <w:rFonts w:ascii="Plus Jakarta Sans" w:eastAsia="Times New Roman" w:hAnsi="Plus Jakarta Sans"/>
           <w:lang w:val="es-ES"/>
@@ -5969,7 +5981,7 @@
     <w:p>
       <w:pPr>
         <w:pStyle w:val="Ttulo4"/>
-        <w:divId w:val="1889216436"/>
+        <w:divId w:val="1629779195"/>
         <w:rPr>
           <w:rFonts w:eastAsia="Times New Roman"/>
           <w:lang w:val="es-ES"/>
@@ -5987,7 +5999,7 @@
       <w:pPr>
         <w:spacing w:before="375" w:after="225"/>
         <w:jc w:val="center"/>
-        <w:divId w:val="1746999839"/>
+        <w:divId w:val="537084289"/>
         <w:rPr>
           <w:rFonts w:ascii="Outfit" w:eastAsia="Times New Roman" w:hAnsi="Outfit"/>
           <w:b/>
@@ -6017,7 +6029,7 @@
       <w:pPr>
         <w:spacing w:after="375"/>
         <w:jc w:val="center"/>
-        <w:divId w:val="406541084"/>
+        <w:divId w:val="134613208"/>
         <w:rPr>
           <w:rFonts w:ascii="Plus Jakarta Sans" w:eastAsia="Times New Roman" w:hAnsi="Plus Jakarta Sans"/>
           <w:lang w:val="es-ES"/>
@@ -6321,18 +6333,18 @@
     <w:p>
       <w:pPr>
         <w:spacing w:before="450" w:after="450"/>
-        <w:divId w:val="1889216436"/>
-        <w:rPr>
-          <w:rFonts w:ascii="Plus Jakarta Sans" w:eastAsia="Times New Roman" w:hAnsi="Plus Jakarta Sans"/>
-          <w:lang w:val="es-ES"/>
-        </w:rPr>
-      </w:pPr>
-      <w:r>
-        <w:rPr>
-          <w:rFonts w:ascii="Plus Jakarta Sans" w:eastAsia="Times New Roman" w:hAnsi="Plus Jakarta Sans"/>
-          <w:lang w:val="es-ES"/>
-        </w:rPr>
-        <w:pict w14:anchorId="52B09532">
+        <w:divId w:val="1629779195"/>
+        <w:rPr>
+          <w:rFonts w:ascii="Plus Jakarta Sans" w:eastAsia="Times New Roman" w:hAnsi="Plus Jakarta Sans"/>
+          <w:lang w:val="es-ES"/>
+        </w:rPr>
+      </w:pPr>
+      <w:r>
+        <w:rPr>
+          <w:rFonts w:ascii="Plus Jakarta Sans" w:eastAsia="Times New Roman" w:hAnsi="Plus Jakarta Sans"/>
+          <w:lang w:val="es-ES"/>
+        </w:rPr>
+        <w:pict>
           <v:rect id="_x0000_i1031" style="width:0;height:.75pt" o:hralign="center" o:hrstd="t" o:hr="t" fillcolor="#a0a0a0" stroked="f"/>
         </w:pict>
       </w:r>
@@ -6340,7 +6352,7 @@
     <w:p>
       <w:pPr>
         <w:pStyle w:val="Ttulo3"/>
-        <w:divId w:val="1889216436"/>
+        <w:divId w:val="1629779195"/>
         <w:rPr>
           <w:rFonts w:eastAsia="Times New Roman"/>
           <w:lang w:val="es-ES"/>
@@ -6357,7 +6369,7 @@
     <w:p>
       <w:pPr>
         <w:pStyle w:val="NormalWeb"/>
-        <w:divId w:val="1889216436"/>
+        <w:divId w:val="1629779195"/>
         <w:rPr>
           <w:rFonts w:ascii="Plus Jakarta Sans" w:hAnsi="Plus Jakarta Sans"/>
           <w:lang w:val="es-ES"/>
@@ -6381,7 +6393,7 @@
     <w:p>
       <w:pPr>
         <w:pStyle w:val="Ttulo4"/>
-        <w:divId w:val="1889216436"/>
+        <w:divId w:val="1629779195"/>
         <w:rPr>
           <w:rFonts w:eastAsia="Times New Roman"/>
           <w:lang w:val="es-ES"/>
@@ -6398,7 +6410,7 @@
     <w:p>
       <w:pPr>
         <w:pStyle w:val="NormalWeb"/>
-        <w:divId w:val="1889216436"/>
+        <w:divId w:val="1629779195"/>
         <w:rPr>
           <w:rFonts w:ascii="Plus Jakarta Sans" w:hAnsi="Plus Jakarta Sans"/>
           <w:lang w:val="es-ES"/>
@@ -6429,7 +6441,7 @@
       </w:tblGrid>
       <w:tr>
         <w:trPr>
-          <w:divId w:val="2029676551"/>
+          <w:divId w:val="201678913"/>
           <w:tblHeader/>
         </w:trPr>
         <w:tc>
@@ -6509,7 +6521,7 @@
       </w:tr>
       <w:tr>
         <w:trPr>
-          <w:divId w:val="2029676551"/>
+          <w:divId w:val="201678913"/>
         </w:trPr>
         <w:tc>
           <w:tcPr>
@@ -6598,7 +6610,7 @@
     <w:p>
       <w:pPr>
         <w:pStyle w:val="Ttulo4"/>
-        <w:divId w:val="1889216436"/>
+        <w:divId w:val="1629779195"/>
         <w:rPr>
           <w:rFonts w:eastAsia="Times New Roman"/>
           <w:lang w:val="es-ES"/>
@@ -6615,7 +6627,7 @@
     <w:p>
       <w:pPr>
         <w:pStyle w:val="NormalWeb"/>
-        <w:divId w:val="1889216436"/>
+        <w:divId w:val="1629779195"/>
         <w:rPr>
           <w:rFonts w:ascii="Plus Jakarta Sans" w:hAnsi="Plus Jakarta Sans"/>
           <w:lang w:val="es-ES"/>
@@ -6646,7 +6658,7 @@
       </w:tblGrid>
       <w:tr>
         <w:trPr>
-          <w:divId w:val="1633367829"/>
+          <w:divId w:val="275337789"/>
           <w:tblHeader/>
         </w:trPr>
         <w:tc>
@@ -6726,7 +6738,7 @@
       </w:tr>
       <w:tr>
         <w:trPr>
-          <w:divId w:val="1633367829"/>
+          <w:divId w:val="275337789"/>
         </w:trPr>
         <w:tc>
           <w:tcPr>
@@ -6824,7 +6836,7 @@
     <w:p>
       <w:pPr>
         <w:pStyle w:val="Ttulo4"/>
-        <w:divId w:val="1889216436"/>
+        <w:divId w:val="1629779195"/>
         <w:rPr>
           <w:rFonts w:eastAsia="Times New Roman"/>
           <w:lang w:val="es-ES"/>
@@ -6841,7 +6853,7 @@
     <w:p>
       <w:pPr>
         <w:pStyle w:val="NormalWeb"/>
-        <w:divId w:val="1889216436"/>
+        <w:divId w:val="1629779195"/>
         <w:rPr>
           <w:rFonts w:ascii="Plus Jakarta Sans" w:hAnsi="Plus Jakarta Sans"/>
           <w:lang w:val="es-ES"/>
@@ -6872,7 +6884,7 @@
       </w:tblGrid>
       <w:tr>
         <w:trPr>
-          <w:divId w:val="1895189609"/>
+          <w:divId w:val="1645164018"/>
           <w:tblHeader/>
         </w:trPr>
         <w:tc>
@@ -6952,7 +6964,7 @@
       </w:tr>
       <w:tr>
         <w:trPr>
-          <w:divId w:val="1895189609"/>
+          <w:divId w:val="1645164018"/>
         </w:trPr>
         <w:tc>
           <w:tcPr>
@@ -7041,18 +7053,18 @@
     <w:p>
       <w:pPr>
         <w:spacing w:before="450" w:after="450"/>
-        <w:divId w:val="1889216436"/>
-        <w:rPr>
-          <w:rFonts w:ascii="Plus Jakarta Sans" w:eastAsia="Times New Roman" w:hAnsi="Plus Jakarta Sans"/>
-          <w:lang w:val="es-ES"/>
-        </w:rPr>
-      </w:pPr>
-      <w:r>
-        <w:rPr>
-          <w:rFonts w:ascii="Plus Jakarta Sans" w:eastAsia="Times New Roman" w:hAnsi="Plus Jakarta Sans"/>
-          <w:lang w:val="es-ES"/>
-        </w:rPr>
-        <w:pict w14:anchorId="5B58891C">
+        <w:divId w:val="1629779195"/>
+        <w:rPr>
+          <w:rFonts w:ascii="Plus Jakarta Sans" w:eastAsia="Times New Roman" w:hAnsi="Plus Jakarta Sans"/>
+          <w:lang w:val="es-ES"/>
+        </w:rPr>
+      </w:pPr>
+      <w:r>
+        <w:rPr>
+          <w:rFonts w:ascii="Plus Jakarta Sans" w:eastAsia="Times New Roman" w:hAnsi="Plus Jakarta Sans"/>
+          <w:lang w:val="es-ES"/>
+        </w:rPr>
+        <w:pict>
           <v:rect id="_x0000_i1032" style="width:0;height:.75pt" o:hralign="center" o:hrstd="t" o:hr="t" fillcolor="#a0a0a0" stroked="f"/>
         </w:pict>
       </w:r>
@@ -7060,7 +7072,7 @@
     <w:p>
       <w:pPr>
         <w:pStyle w:val="Ttulo2"/>
-        <w:divId w:val="1889216436"/>
+        <w:divId w:val="1629779195"/>
         <w:rPr>
           <w:rFonts w:eastAsia="Times New Roman"/>
           <w:lang w:val="es-ES"/>
@@ -7077,7 +7089,7 @@
     <w:p>
       <w:pPr>
         <w:pStyle w:val="NormalWeb"/>
-        <w:divId w:val="1889216436"/>
+        <w:divId w:val="1629779195"/>
         <w:rPr>
           <w:rFonts w:ascii="Plus Jakarta Sans" w:hAnsi="Plus Jakarta Sans"/>
           <w:lang w:val="es-ES"/>
@@ -7094,7 +7106,7 @@
     <w:p>
       <w:pPr>
         <w:pStyle w:val="Ttulo3"/>
-        <w:divId w:val="1889216436"/>
+        <w:divId w:val="1629779195"/>
         <w:rPr>
           <w:rFonts w:eastAsia="Times New Roman"/>
           <w:lang w:val="es-ES"/>
@@ -7111,7 +7123,7 @@
     <w:p>
       <w:pPr>
         <w:pStyle w:val="NormalWeb"/>
-        <w:divId w:val="1889216436"/>
+        <w:divId w:val="1629779195"/>
         <w:rPr>
           <w:rFonts w:ascii="Plus Jakarta Sans" w:hAnsi="Plus Jakarta Sans"/>
           <w:lang w:val="es-ES"/>
@@ -7144,7 +7156,7 @@
       </w:tblGrid>
       <w:tr>
         <w:trPr>
-          <w:divId w:val="1641033483"/>
+          <w:divId w:val="838077992"/>
           <w:tblHeader/>
         </w:trPr>
         <w:tc>
@@ -7309,7 +7321,7 @@
       </w:tr>
       <w:tr>
         <w:trPr>
-          <w:divId w:val="1641033483"/>
+          <w:divId w:val="838077992"/>
         </w:trPr>
         <w:tc>
           <w:tcPr>
@@ -7368,74 +7380,74 @@
                 <w:sz w:val="20"/>
                 <w:szCs w:val="20"/>
               </w:rPr>
-              <w:t>1529 (92.0%)</w:t>
-            </w:r>
-          </w:p>
-        </w:tc>
-        <w:tc>
-          <w:tcPr>
-            <w:tcW w:w="0" w:type="auto"/>
-            <w:tcMar>
-              <w:top w:w="150" w:type="dxa"/>
-              <w:left w:w="210" w:type="dxa"/>
-              <w:bottom w:w="150" w:type="dxa"/>
-              <w:right w:w="210" w:type="dxa"/>
-            </w:tcMar>
-            <w:vAlign w:val="center"/>
-            <w:hideMark/>
-          </w:tcPr>
-          <w:p>
-            <w:pPr>
-              <w:rPr>
-                <w:rFonts w:ascii="Plus Jakarta Sans" w:eastAsia="Times New Roman" w:hAnsi="Plus Jakarta Sans"/>
-                <w:sz w:val="20"/>
-                <w:szCs w:val="20"/>
-              </w:rPr>
-            </w:pPr>
-            <w:r>
-              <w:rPr>
-                <w:rFonts w:ascii="Plus Jakarta Sans" w:eastAsia="Times New Roman" w:hAnsi="Plus Jakarta Sans"/>
-                <w:sz w:val="20"/>
-                <w:szCs w:val="20"/>
-              </w:rPr>
-              <w:t>1509 (92.5%)</w:t>
-            </w:r>
-          </w:p>
-        </w:tc>
-        <w:tc>
-          <w:tcPr>
-            <w:tcW w:w="0" w:type="auto"/>
-            <w:tcMar>
-              <w:top w:w="150" w:type="dxa"/>
-              <w:left w:w="210" w:type="dxa"/>
-              <w:bottom w:w="150" w:type="dxa"/>
-              <w:right w:w="210" w:type="dxa"/>
-            </w:tcMar>
-            <w:vAlign w:val="center"/>
-            <w:hideMark/>
-          </w:tcPr>
-          <w:p>
-            <w:pPr>
-              <w:rPr>
-                <w:rFonts w:ascii="Plus Jakarta Sans" w:eastAsia="Times New Roman" w:hAnsi="Plus Jakarta Sans"/>
-                <w:sz w:val="20"/>
-                <w:szCs w:val="20"/>
-              </w:rPr>
-            </w:pPr>
-            <w:r>
-              <w:rPr>
-                <w:rFonts w:ascii="Plus Jakarta Sans" w:eastAsia="Times New Roman" w:hAnsi="Plus Jakarta Sans"/>
-                <w:sz w:val="20"/>
-                <w:szCs w:val="20"/>
-              </w:rPr>
-              <w:t>568 (70.9%)</w:t>
+              <w:t>1580 (91.9%)</w:t>
+            </w:r>
+          </w:p>
+        </w:tc>
+        <w:tc>
+          <w:tcPr>
+            <w:tcW w:w="0" w:type="auto"/>
+            <w:tcMar>
+              <w:top w:w="150" w:type="dxa"/>
+              <w:left w:w="210" w:type="dxa"/>
+              <w:bottom w:w="150" w:type="dxa"/>
+              <w:right w:w="210" w:type="dxa"/>
+            </w:tcMar>
+            <w:vAlign w:val="center"/>
+            <w:hideMark/>
+          </w:tcPr>
+          <w:p>
+            <w:pPr>
+              <w:rPr>
+                <w:rFonts w:ascii="Plus Jakarta Sans" w:eastAsia="Times New Roman" w:hAnsi="Plus Jakarta Sans"/>
+                <w:sz w:val="20"/>
+                <w:szCs w:val="20"/>
+              </w:rPr>
+            </w:pPr>
+            <w:r>
+              <w:rPr>
+                <w:rFonts w:ascii="Plus Jakarta Sans" w:eastAsia="Times New Roman" w:hAnsi="Plus Jakarta Sans"/>
+                <w:sz w:val="20"/>
+                <w:szCs w:val="20"/>
+              </w:rPr>
+              <w:t>1509 (92.4%)</w:t>
+            </w:r>
+          </w:p>
+        </w:tc>
+        <w:tc>
+          <w:tcPr>
+            <w:tcW w:w="0" w:type="auto"/>
+            <w:tcMar>
+              <w:top w:w="150" w:type="dxa"/>
+              <w:left w:w="210" w:type="dxa"/>
+              <w:bottom w:w="150" w:type="dxa"/>
+              <w:right w:w="210" w:type="dxa"/>
+            </w:tcMar>
+            <w:vAlign w:val="center"/>
+            <w:hideMark/>
+          </w:tcPr>
+          <w:p>
+            <w:pPr>
+              <w:rPr>
+                <w:rFonts w:ascii="Plus Jakarta Sans" w:eastAsia="Times New Roman" w:hAnsi="Plus Jakarta Sans"/>
+                <w:sz w:val="20"/>
+                <w:szCs w:val="20"/>
+              </w:rPr>
+            </w:pPr>
+            <w:r>
+              <w:rPr>
+                <w:rFonts w:ascii="Plus Jakarta Sans" w:eastAsia="Times New Roman" w:hAnsi="Plus Jakarta Sans"/>
+                <w:sz w:val="20"/>
+                <w:szCs w:val="20"/>
+              </w:rPr>
+              <w:t>569 (70.9%)</w:t>
             </w:r>
           </w:p>
         </w:tc>
       </w:tr>
       <w:tr>
         <w:trPr>
-          <w:divId w:val="1641033483"/>
+          <w:divId w:val="838077992"/>
         </w:trPr>
         <w:tc>
           <w:tcPr>
@@ -7494,7 +7506,7 @@
                 <w:sz w:val="20"/>
                 <w:szCs w:val="20"/>
               </w:rPr>
-              <w:t>41 (2.5%)</w:t>
+              <w:t>41 (2.4%)</w:t>
             </w:r>
           </w:p>
         </w:tc>
@@ -7561,7 +7573,7 @@
       </w:tr>
       <w:tr>
         <w:trPr>
-          <w:divId w:val="1641033483"/>
+          <w:divId w:val="838077992"/>
         </w:trPr>
         <w:tc>
           <w:tcPr>
@@ -7620,37 +7632,37 @@
                 <w:sz w:val="20"/>
                 <w:szCs w:val="20"/>
               </w:rPr>
-              <w:t>92 (5.5%)</w:t>
-            </w:r>
-          </w:p>
-        </w:tc>
-        <w:tc>
-          <w:tcPr>
-            <w:tcW w:w="0" w:type="auto"/>
-            <w:tcMar>
-              <w:top w:w="150" w:type="dxa"/>
-              <w:left w:w="210" w:type="dxa"/>
-              <w:bottom w:w="150" w:type="dxa"/>
-              <w:right w:w="210" w:type="dxa"/>
-            </w:tcMar>
-            <w:vAlign w:val="center"/>
-            <w:hideMark/>
-          </w:tcPr>
-          <w:p>
-            <w:pPr>
-              <w:rPr>
-                <w:rFonts w:ascii="Plus Jakarta Sans" w:eastAsia="Times New Roman" w:hAnsi="Plus Jakarta Sans"/>
-                <w:sz w:val="20"/>
-                <w:szCs w:val="20"/>
-              </w:rPr>
-            </w:pPr>
-            <w:r>
-              <w:rPr>
-                <w:rFonts w:ascii="Plus Jakarta Sans" w:eastAsia="Times New Roman" w:hAnsi="Plus Jakarta Sans"/>
-                <w:sz w:val="20"/>
-                <w:szCs w:val="20"/>
-              </w:rPr>
-              <w:t>84 (5.1%)</w:t>
+              <w:t>99 (5.8%)</w:t>
+            </w:r>
+          </w:p>
+        </w:tc>
+        <w:tc>
+          <w:tcPr>
+            <w:tcW w:w="0" w:type="auto"/>
+            <w:tcMar>
+              <w:top w:w="150" w:type="dxa"/>
+              <w:left w:w="210" w:type="dxa"/>
+              <w:bottom w:w="150" w:type="dxa"/>
+              <w:right w:w="210" w:type="dxa"/>
+            </w:tcMar>
+            <w:vAlign w:val="center"/>
+            <w:hideMark/>
+          </w:tcPr>
+          <w:p>
+            <w:pPr>
+              <w:rPr>
+                <w:rFonts w:ascii="Plus Jakarta Sans" w:eastAsia="Times New Roman" w:hAnsi="Plus Jakarta Sans"/>
+                <w:sz w:val="20"/>
+                <w:szCs w:val="20"/>
+              </w:rPr>
+            </w:pPr>
+            <w:r>
+              <w:rPr>
+                <w:rFonts w:ascii="Plus Jakarta Sans" w:eastAsia="Times New Roman" w:hAnsi="Plus Jakarta Sans"/>
+                <w:sz w:val="20"/>
+                <w:szCs w:val="20"/>
+              </w:rPr>
+              <w:t>85 (5.2%)</w:t>
             </w:r>
           </w:p>
         </w:tc>
@@ -7687,7 +7699,7 @@
       </w:tr>
       <w:tr>
         <w:trPr>
-          <w:divId w:val="1641033483"/>
+          <w:divId w:val="838077992"/>
         </w:trPr>
         <w:tc>
           <w:tcPr>
@@ -7815,7 +7827,7 @@
     <w:p>
       <w:pPr>
         <w:pStyle w:val="Ttulo3"/>
-        <w:divId w:val="1889216436"/>
+        <w:divId w:val="1629779195"/>
         <w:rPr>
           <w:rFonts w:eastAsia="Times New Roman"/>
           <w:lang w:val="es-ES"/>
@@ -7831,8 +7843,9 @@
     </w:p>
     <w:p>
       <w:pPr>
+        <w:spacing w:before="375" w:after="225"/>
         <w:jc w:val="center"/>
-        <w:divId w:val="1298875651"/>
+        <w:divId w:val="640698415"/>
         <w:rPr>
           <w:rFonts w:ascii="Outfit" w:eastAsia="Times New Roman" w:hAnsi="Outfit"/>
           <w:b/>
@@ -7862,7 +7875,7 @@
       <w:pPr>
         <w:spacing w:after="375"/>
         <w:jc w:val="center"/>
-        <w:divId w:val="649987038"/>
+        <w:divId w:val="1118136656"/>
         <w:rPr>
           <w:rFonts w:ascii="Plus Jakarta Sans" w:eastAsia="Times New Roman" w:hAnsi="Plus Jakarta Sans"/>
           <w:lang w:val="es-ES"/>
@@ -8229,7 +8242,7 @@
     <w:p>
       <w:pPr>
         <w:pStyle w:val="Ttulo3"/>
-        <w:divId w:val="1889216436"/>
+        <w:divId w:val="1629779195"/>
         <w:rPr>
           <w:rFonts w:eastAsia="Times New Roman"/>
           <w:lang w:val="es-ES"/>
@@ -8253,7 +8266,7 @@
     <w:p>
       <w:pPr>
         <w:pStyle w:val="NormalWeb"/>
-        <w:divId w:val="1889216436"/>
+        <w:divId w:val="1629779195"/>
         <w:rPr>
           <w:rFonts w:ascii="Plus Jakarta Sans" w:hAnsi="Plus Jakarta Sans"/>
           <w:lang w:val="es-ES"/>
@@ -8275,7 +8288,7 @@
         </w:numPr>
         <w:spacing w:before="100" w:beforeAutospacing="1" w:after="90"/>
         <w:ind w:left="1020"/>
-        <w:divId w:val="1889216436"/>
+        <w:divId w:val="1629779195"/>
         <w:rPr>
           <w:rFonts w:ascii="Plus Jakarta Sans" w:eastAsia="Times New Roman" w:hAnsi="Plus Jakarta Sans"/>
           <w:sz w:val="21"/>
@@ -8311,7 +8324,7 @@
         </w:numPr>
         <w:spacing w:before="100" w:beforeAutospacing="1" w:after="90"/>
         <w:ind w:left="1020"/>
-        <w:divId w:val="1889216436"/>
+        <w:divId w:val="1629779195"/>
         <w:rPr>
           <w:rFonts w:ascii="Plus Jakarta Sans" w:eastAsia="Times New Roman" w:hAnsi="Plus Jakarta Sans"/>
           <w:sz w:val="21"/>
@@ -8356,7 +8369,7 @@
         </w:numPr>
         <w:spacing w:before="100" w:beforeAutospacing="1" w:after="90"/>
         <w:ind w:left="1020"/>
-        <w:divId w:val="1889216436"/>
+        <w:divId w:val="1629779195"/>
         <w:rPr>
           <w:rFonts w:ascii="Plus Jakarta Sans" w:eastAsia="Times New Roman" w:hAnsi="Plus Jakarta Sans"/>
           <w:sz w:val="21"/>
@@ -8410,7 +8423,7 @@
         </w:numPr>
         <w:spacing w:before="100" w:beforeAutospacing="1" w:after="90"/>
         <w:ind w:left="1020"/>
-        <w:divId w:val="1889216436"/>
+        <w:divId w:val="1629779195"/>
         <w:rPr>
           <w:rFonts w:ascii="Plus Jakarta Sans" w:eastAsia="Times New Roman" w:hAnsi="Plus Jakarta Sans"/>
           <w:sz w:val="21"/>
@@ -8455,7 +8468,7 @@
         </w:numPr>
         <w:spacing w:before="100" w:beforeAutospacing="1" w:after="90"/>
         <w:ind w:left="1020"/>
-        <w:divId w:val="1889216436"/>
+        <w:divId w:val="1629779195"/>
         <w:rPr>
           <w:rFonts w:ascii="Plus Jakarta Sans" w:eastAsia="Times New Roman" w:hAnsi="Plus Jakarta Sans"/>
           <w:sz w:val="21"/>
@@ -8491,7 +8504,7 @@
         </w:numPr>
         <w:spacing w:before="100" w:beforeAutospacing="1" w:after="90"/>
         <w:ind w:left="1020"/>
-        <w:divId w:val="1889216436"/>
+        <w:divId w:val="1629779195"/>
         <w:rPr>
           <w:rFonts w:ascii="Plus Jakarta Sans" w:eastAsia="Times New Roman" w:hAnsi="Plus Jakarta Sans"/>
           <w:sz w:val="21"/>
@@ -8525,7 +8538,7 @@
           <w:szCs w:val="21"/>
           <w:lang w:val="es-ES"/>
         </w:rPr>
-        <w:t xml:space="preserve"> promedio (en 1429 predios).</w:t>
+        <w:t xml:space="preserve"> promedio (en 1485 predios).</w:t>
       </w:r>
     </w:p>
     <w:p>
@@ -8536,7 +8549,7 @@
         </w:numPr>
         <w:spacing w:before="100" w:beforeAutospacing="1" w:after="90"/>
         <w:ind w:left="1020"/>
-        <w:divId w:val="1889216436"/>
+        <w:divId w:val="1629779195"/>
         <w:rPr>
           <w:rFonts w:ascii="Plus Jakarta Sans" w:eastAsia="Times New Roman" w:hAnsi="Plus Jakarta Sans"/>
           <w:sz w:val="21"/>
@@ -8581,7 +8594,7 @@
         </w:numPr>
         <w:spacing w:before="100" w:beforeAutospacing="1" w:after="90"/>
         <w:ind w:left="1020"/>
-        <w:divId w:val="1889216436"/>
+        <w:divId w:val="1629779195"/>
         <w:rPr>
           <w:rFonts w:ascii="Plus Jakarta Sans" w:eastAsia="Times New Roman" w:hAnsi="Plus Jakarta Sans"/>
           <w:sz w:val="21"/>
@@ -8615,7 +8628,7 @@
           <w:szCs w:val="21"/>
           <w:lang w:val="es-ES"/>
         </w:rPr>
-        <w:t xml:space="preserve"> promedio (en 577 predios).</w:t>
+        <w:t xml:space="preserve"> promedio (en 578 predios).</w:t>
       </w:r>
     </w:p>
     <w:p>
@@ -8626,7 +8639,7 @@
         </w:numPr>
         <w:spacing w:before="100" w:beforeAutospacing="1" w:after="90"/>
         <w:ind w:left="1020"/>
-        <w:divId w:val="1889216436"/>
+        <w:divId w:val="1629779195"/>
         <w:rPr>
           <w:rFonts w:ascii="Plus Jakarta Sans" w:eastAsia="Times New Roman" w:hAnsi="Plus Jakarta Sans"/>
           <w:sz w:val="21"/>
@@ -8662,7 +8675,7 @@
         </w:numPr>
         <w:spacing w:before="100" w:beforeAutospacing="1" w:after="90"/>
         <w:ind w:left="1020"/>
-        <w:divId w:val="1889216436"/>
+        <w:divId w:val="1629779195"/>
         <w:rPr>
           <w:rFonts w:ascii="Plus Jakarta Sans" w:eastAsia="Times New Roman" w:hAnsi="Plus Jakarta Sans"/>
           <w:sz w:val="21"/>
@@ -8716,7 +8729,7 @@
         </w:numPr>
         <w:spacing w:before="100" w:beforeAutospacing="1" w:after="90"/>
         <w:ind w:left="1020"/>
-        <w:divId w:val="1889216436"/>
+        <w:divId w:val="1629779195"/>
         <w:rPr>
           <w:rFonts w:ascii="Plus Jakarta Sans" w:eastAsia="Times New Roman" w:hAnsi="Plus Jakarta Sans"/>
           <w:sz w:val="21"/>
@@ -8761,7 +8774,7 @@
         </w:numPr>
         <w:spacing w:before="100" w:beforeAutospacing="1" w:after="90"/>
         <w:ind w:left="1020"/>
-        <w:divId w:val="1889216436"/>
+        <w:divId w:val="1629779195"/>
         <w:rPr>
           <w:rFonts w:ascii="Plus Jakarta Sans" w:eastAsia="Times New Roman" w:hAnsi="Plus Jakarta Sans"/>
           <w:sz w:val="21"/>
@@ -8801,7 +8814,7 @@
     <w:p>
       <w:pPr>
         <w:pStyle w:val="Ttulo3"/>
-        <w:divId w:val="1889216436"/>
+        <w:divId w:val="1629779195"/>
         <w:rPr>
           <w:rFonts w:eastAsia="Times New Roman"/>
           <w:lang w:val="es-ES"/>
@@ -8819,7 +8832,7 @@
       <w:pPr>
         <w:spacing w:before="375" w:after="225"/>
         <w:jc w:val="center"/>
-        <w:divId w:val="1720862564"/>
+        <w:divId w:val="1403406647"/>
         <w:rPr>
           <w:rFonts w:ascii="Outfit" w:eastAsia="Times New Roman" w:hAnsi="Outfit"/>
           <w:b/>
@@ -8849,7 +8862,7 @@
       <w:pPr>
         <w:spacing w:after="375"/>
         <w:jc w:val="center"/>
-        <w:divId w:val="1967196270"/>
+        <w:divId w:val="1587349200"/>
         <w:rPr>
           <w:rFonts w:ascii="Plus Jakarta Sans" w:eastAsia="Times New Roman" w:hAnsi="Plus Jakarta Sans"/>
           <w:lang w:val="es-ES"/>
@@ -9139,18 +9152,18 @@
     <w:p>
       <w:pPr>
         <w:spacing w:before="450" w:after="450"/>
-        <w:divId w:val="1889216436"/>
-        <w:rPr>
-          <w:rFonts w:ascii="Plus Jakarta Sans" w:eastAsia="Times New Roman" w:hAnsi="Plus Jakarta Sans"/>
-          <w:lang w:val="es-ES"/>
-        </w:rPr>
-      </w:pPr>
-      <w:r>
-        <w:rPr>
-          <w:rFonts w:ascii="Plus Jakarta Sans" w:eastAsia="Times New Roman" w:hAnsi="Plus Jakarta Sans"/>
-          <w:lang w:val="es-ES"/>
-        </w:rPr>
-        <w:pict w14:anchorId="6E90F13A">
+        <w:divId w:val="1629779195"/>
+        <w:rPr>
+          <w:rFonts w:ascii="Plus Jakarta Sans" w:eastAsia="Times New Roman" w:hAnsi="Plus Jakarta Sans"/>
+          <w:lang w:val="es-ES"/>
+        </w:rPr>
+      </w:pPr>
+      <w:r>
+        <w:rPr>
+          <w:rFonts w:ascii="Plus Jakarta Sans" w:eastAsia="Times New Roman" w:hAnsi="Plus Jakarta Sans"/>
+          <w:lang w:val="es-ES"/>
+        </w:rPr>
+        <w:pict>
           <v:rect id="_x0000_i1033" style="width:0;height:.75pt" o:hralign="center" o:hrstd="t" o:hr="t" fillcolor="#a0a0a0" stroked="f"/>
         </w:pict>
       </w:r>
@@ -9158,7 +9171,7 @@
     <w:p>
       <w:pPr>
         <w:pStyle w:val="Ttulo2"/>
-        <w:divId w:val="1889216436"/>
+        <w:divId w:val="1629779195"/>
         <w:rPr>
           <w:rFonts w:eastAsia="Times New Roman"/>
           <w:lang w:val="es-ES"/>
@@ -9175,7 +9188,7 @@
     <w:p>
       <w:pPr>
         <w:pStyle w:val="NormalWeb"/>
-        <w:divId w:val="1889216436"/>
+        <w:divId w:val="1629779195"/>
         <w:rPr>
           <w:rFonts w:ascii="Plus Jakarta Sans" w:hAnsi="Plus Jakarta Sans"/>
           <w:lang w:val="es-ES"/>
@@ -9192,7 +9205,7 @@
     <w:p>
       <w:pPr>
         <w:pStyle w:val="NormalWeb"/>
-        <w:divId w:val="1889216436"/>
+        <w:divId w:val="1629779195"/>
         <w:rPr>
           <w:rFonts w:ascii="Plus Jakarta Sans" w:hAnsi="Plus Jakarta Sans"/>
           <w:lang w:val="es-ES"/>
@@ -9254,7 +9267,7 @@
     <w:p>
       <w:pPr>
         <w:pStyle w:val="NormalWeb"/>
-        <w:divId w:val="1889216436"/>
+        <w:divId w:val="1629779195"/>
         <w:rPr>
           <w:rFonts w:ascii="Plus Jakarta Sans" w:hAnsi="Plus Jakarta Sans"/>
           <w:lang w:val="es-ES"/>
@@ -9316,7 +9329,7 @@
     <w:p>
       <w:pPr>
         <w:pStyle w:val="NormalWeb"/>
-        <w:divId w:val="1889216436"/>
+        <w:divId w:val="1629779195"/>
         <w:rPr>
           <w:rFonts w:ascii="Plus Jakarta Sans" w:hAnsi="Plus Jakarta Sans"/>
           <w:lang w:val="es-ES"/>
@@ -9377,7 +9390,7 @@
     <w:p>
       <w:pPr>
         <w:pStyle w:val="NormalWeb"/>
-        <w:divId w:val="1889216436"/>
+        <w:divId w:val="1629779195"/>
         <w:rPr>
           <w:rFonts w:ascii="Plus Jakarta Sans" w:hAnsi="Plus Jakarta Sans"/>
           <w:lang w:val="es-ES"/>
@@ -9431,18 +9444,18 @@
     <w:p>
       <w:pPr>
         <w:spacing w:before="450" w:after="450"/>
-        <w:divId w:val="1889216436"/>
-        <w:rPr>
-          <w:rFonts w:ascii="Plus Jakarta Sans" w:eastAsia="Times New Roman" w:hAnsi="Plus Jakarta Sans"/>
-          <w:lang w:val="es-ES"/>
-        </w:rPr>
-      </w:pPr>
-      <w:r>
-        <w:rPr>
-          <w:rFonts w:ascii="Plus Jakarta Sans" w:eastAsia="Times New Roman" w:hAnsi="Plus Jakarta Sans"/>
-          <w:lang w:val="es-ES"/>
-        </w:rPr>
-        <w:pict w14:anchorId="49833A27">
+        <w:divId w:val="1629779195"/>
+        <w:rPr>
+          <w:rFonts w:ascii="Plus Jakarta Sans" w:eastAsia="Times New Roman" w:hAnsi="Plus Jakarta Sans"/>
+          <w:lang w:val="es-ES"/>
+        </w:rPr>
+      </w:pPr>
+      <w:r>
+        <w:rPr>
+          <w:rFonts w:ascii="Plus Jakarta Sans" w:eastAsia="Times New Roman" w:hAnsi="Plus Jakarta Sans"/>
+          <w:lang w:val="es-ES"/>
+        </w:rPr>
+        <w:pict>
           <v:rect id="_x0000_i1034" style="width:0;height:.75pt" o:hralign="center" o:hrstd="t" o:hr="t" fillcolor="#a0a0a0" stroked="f"/>
         </w:pict>
       </w:r>
@@ -9450,18 +9463,18 @@
     <w:p>
       <w:pPr>
         <w:spacing w:before="450" w:after="450"/>
-        <w:divId w:val="1889216436"/>
-        <w:rPr>
-          <w:rFonts w:ascii="Plus Jakarta Sans" w:eastAsia="Times New Roman" w:hAnsi="Plus Jakarta Sans"/>
-          <w:lang w:val="es-ES"/>
-        </w:rPr>
-      </w:pPr>
-      <w:r>
-        <w:rPr>
-          <w:rFonts w:ascii="Plus Jakarta Sans" w:eastAsia="Times New Roman" w:hAnsi="Plus Jakarta Sans"/>
-          <w:lang w:val="es-ES"/>
-        </w:rPr>
-        <w:pict w14:anchorId="4A5ABC37">
+        <w:divId w:val="1629779195"/>
+        <w:rPr>
+          <w:rFonts w:ascii="Plus Jakarta Sans" w:eastAsia="Times New Roman" w:hAnsi="Plus Jakarta Sans"/>
+          <w:lang w:val="es-ES"/>
+        </w:rPr>
+      </w:pPr>
+      <w:r>
+        <w:rPr>
+          <w:rFonts w:ascii="Plus Jakarta Sans" w:eastAsia="Times New Roman" w:hAnsi="Plus Jakarta Sans"/>
+          <w:lang w:val="es-ES"/>
+        </w:rPr>
+        <w:pict>
           <v:rect id="_x0000_i1035" style="width:0;height:.75pt" o:hralign="center" o:hrstd="t" o:hr="t" fillcolor="#a0a0a0" stroked="f"/>
         </w:pict>
       </w:r>
@@ -9469,7 +9482,7 @@
     <w:p>
       <w:pPr>
         <w:pStyle w:val="NormalWeb"/>
-        <w:divId w:val="1889216436"/>
+        <w:divId w:val="1629779195"/>
         <w:rPr>
           <w:rFonts w:ascii="Plus Jakarta Sans" w:hAnsi="Plus Jakarta Sans"/>
           <w:lang w:val="es-ES"/>
@@ -9502,7 +9515,7 @@
           <w:rFonts w:ascii="Plus Jakarta Sans" w:hAnsi="Plus Jakarta Sans"/>
           <w:lang w:val="es-ES"/>
         </w:rPr>
-        <w:pict w14:anchorId="15F35FDA"/>
+        <w:pict/>
       </w:r>
     </w:p>
     <w:sectPr>
@@ -9518,9 +9531,9 @@
 <file path=word/numbering.xml><?xml version="1.0" encoding="utf-8"?>
 <w:numbering xmlns:wpc="http://schemas.microsoft.com/office/word/2010/wordprocessingCanvas" xmlns:cx="http://schemas.microsoft.com/office/drawing/2014/chartex" xmlns:cx1="http://schemas.microsoft.com/office/drawing/2015/9/8/chartex" xmlns:cx2="http://schemas.microsoft.com/office/drawing/2015/10/21/chartex" xmlns:cx3="http://schemas.microsoft.com/office/drawing/2016/5/9/chartex" xmlns:cx4="http://schemas.microsoft.com/office/drawing/2016/5/10/chartex" xmlns:cx5="http://schemas.microsoft.com/office/drawing/2016/5/11/chartex" xmlns:cx6="http://schemas.microsoft.com/office/drawing/2016/5/12/chartex" xmlns:cx7="http://schemas.microsoft.com/office/drawing/2016/5/13/chartex" xmlns:cx8="http://schemas.microsoft.com/office/drawing/2016/5/14/chartex" xmlns:mc="http://schemas.openxmlformats.org/markup-compatibility/2006" xmlns:aink="http://schemas.microsoft.com/office/drawing/2016/ink" xmlns:am3d="http://schemas.microsoft.com/office/drawing/2017/model3d" xmlns:o="urn:schemas-microsoft-com:office:office" xmlns:r="http://schemas.openxmlformats.org/officeDocument/2006/relationships" xmlns:m="http://schemas.openxmlformats.org/officeDocument/2006/math" xmlns:v="urn:schemas-microsoft-com:vml" xmlns:wp14="http://schemas.microsoft.com/office/word/2010/wordprocessingDrawing" xmlns:wp="http://schemas.openxmlformats.org/drawingml/2006/wordprocessingDrawing" xmlns:w10="urn:schemas-microsoft-com:office:word" xmlns:w="http://schemas.openxmlformats.org/wordprocessingml/2006/main" xmlns:w14="http://schemas.microsoft.com/office/word/2010/wordml" xmlns:w15="http://schemas.microsoft.com/office/word/2012/wordml" xmlns:w16cex="http://schemas.microsoft.com/office/word/2018/wordml/cex" xmlns:w16cid="http://schemas.microsoft.com/office/word/2016/wordml/cid" xmlns:w16="http://schemas.microsoft.com/office/word/2018/wordml" xmlns:w16sdtdh="http://schemas.microsoft.com/office/word/2020/wordml/sdtdatahash" xmlns:w16se="http://schemas.microsoft.com/office/word/2015/wordml/symex" xmlns:wpg="http://schemas.microsoft.com/office/word/2010/wordprocessingGroup" xmlns:wpi="http://schemas.microsoft.com/office/word/2010/wordprocessingInk" xmlns:wne="http://schemas.microsoft.com/office/word/2006/wordml" xmlns:wps="http://schemas.microsoft.com/office/word/2010/wordprocessingShape" mc:Ignorable="w14 w15 w16se w16cid w16 w16cex w16sdtdh wp14">
   <w:abstractNum w:abstractNumId="0" w15:restartNumberingAfterBreak="0">
-    <w:nsid w:val="1E991D02"/>
+    <w:nsid w:val="12660DCB"/>
     <w:multiLevelType w:val="multilevel"/>
-    <w:tmpl w:val="1F3A43CE"/>
+    <w:tmpl w:val="CBD2B070"/>
     <w:lvl w:ilvl="0">
       <w:start w:val="1"/>
       <w:numFmt w:val="bullet"/>
@@ -9667,9 +9680,9 @@
     </w:lvl>
   </w:abstractNum>
   <w:abstractNum w:abstractNumId="1" w15:restartNumberingAfterBreak="0">
-    <w:nsid w:val="2A7A5396"/>
+    <w:nsid w:val="25777695"/>
     <w:multiLevelType w:val="multilevel"/>
-    <w:tmpl w:val="F66E7338"/>
+    <w:tmpl w:val="1F58DA74"/>
     <w:lvl w:ilvl="0">
       <w:start w:val="1"/>
       <w:numFmt w:val="bullet"/>
@@ -9816,9 +9829,9 @@
     </w:lvl>
   </w:abstractNum>
   <w:abstractNum w:abstractNumId="2" w15:restartNumberingAfterBreak="0">
-    <w:nsid w:val="33A61242"/>
+    <w:nsid w:val="36466786"/>
     <w:multiLevelType w:val="multilevel"/>
-    <w:tmpl w:val="4EA6CA36"/>
+    <w:tmpl w:val="B424439A"/>
     <w:lvl w:ilvl="0">
       <w:start w:val="1"/>
       <w:numFmt w:val="bullet"/>
@@ -9965,9 +9978,9 @@
     </w:lvl>
   </w:abstractNum>
   <w:abstractNum w:abstractNumId="3" w15:restartNumberingAfterBreak="0">
-    <w:nsid w:val="60DB7CF1"/>
+    <w:nsid w:val="3D436EFB"/>
     <w:multiLevelType w:val="multilevel"/>
-    <w:tmpl w:val="DBFCD62C"/>
+    <w:tmpl w:val="B746956A"/>
     <w:lvl w:ilvl="0">
       <w:start w:val="1"/>
       <w:numFmt w:val="bullet"/>
@@ -10114,13 +10127,13 @@
     </w:lvl>
   </w:abstractNum>
   <w:num w:numId="1">
+    <w:abstractNumId w:val="2"/>
+  </w:num>
+  <w:num w:numId="2">
     <w:abstractNumId w:val="1"/>
   </w:num>
-  <w:num w:numId="2">
+  <w:num w:numId="3">
     <w:abstractNumId w:val="0"/>
-  </w:num>
-  <w:num w:numId="3">
-    <w:abstractNumId w:val="2"/>
   </w:num>
   <w:num w:numId="4">
     <w:abstractNumId w:val="3"/>

</xml_diff>

<commit_message>
feat: integrar sección 6 con indicadores clave de planificación y sincronizar últimos cambios de QFieldCloud (4171 fichas)
</commit_message>
<xml_diff>
--- a/public/informe_reunion_tecnica.docx
+++ b/public/informe_reunion_tecnica.docx
@@ -4,7 +4,7 @@
   <w:body>
     <w:p>
       <w:pPr>
-        <w:divId w:val="1519349449"/>
+        <w:divId w:val="971129429"/>
         <w:rPr>
           <w:rFonts w:ascii="Plus Jakarta Sans" w:eastAsia="Times New Roman" w:hAnsi="Plus Jakarta Sans"/>
           <w:lang w:val="es-ES"/>
@@ -28,7 +28,7 @@
     <w:p>
       <w:pPr>
         <w:pStyle w:val="Ttulo1"/>
-        <w:divId w:val="1629779195"/>
+        <w:divId w:val="326174437"/>
         <w:rPr>
           <w:rFonts w:eastAsia="Times New Roman"/>
           <w:lang w:val="es-ES"/>
@@ -45,7 +45,7 @@
     <w:p>
       <w:pPr>
         <w:pStyle w:val="NormalWeb"/>
-        <w:divId w:val="1629779195"/>
+        <w:divId w:val="326174437"/>
         <w:rPr>
           <w:rFonts w:ascii="Plus Jakarta Sans" w:hAnsi="Plus Jakarta Sans"/>
           <w:lang w:val="es-ES"/>
@@ -63,7 +63,7 @@
     <w:p>
       <w:pPr>
         <w:pStyle w:val="NormalWeb"/>
-        <w:divId w:val="1629779195"/>
+        <w:divId w:val="326174437"/>
         <w:rPr>
           <w:rFonts w:ascii="Plus Jakarta Sans" w:hAnsi="Plus Jakarta Sans"/>
           <w:lang w:val="es-ES"/>
@@ -102,18 +102,18 @@
     <w:p>
       <w:pPr>
         <w:spacing w:before="450" w:after="450"/>
-        <w:divId w:val="1629779195"/>
-        <w:rPr>
-          <w:rFonts w:ascii="Plus Jakarta Sans" w:eastAsia="Times New Roman" w:hAnsi="Plus Jakarta Sans"/>
-          <w:lang w:val="es-ES"/>
-        </w:rPr>
-      </w:pPr>
-      <w:r>
-        <w:rPr>
-          <w:rFonts w:ascii="Plus Jakarta Sans" w:eastAsia="Times New Roman" w:hAnsi="Plus Jakarta Sans"/>
-          <w:lang w:val="es-ES"/>
-        </w:rPr>
-        <w:pict>
+        <w:divId w:val="326174437"/>
+        <w:rPr>
+          <w:rFonts w:ascii="Plus Jakarta Sans" w:eastAsia="Times New Roman" w:hAnsi="Plus Jakarta Sans"/>
+          <w:lang w:val="es-ES"/>
+        </w:rPr>
+      </w:pPr>
+      <w:r>
+        <w:rPr>
+          <w:rFonts w:ascii="Plus Jakarta Sans" w:eastAsia="Times New Roman" w:hAnsi="Plus Jakarta Sans"/>
+          <w:lang w:val="es-ES"/>
+        </w:rPr>
+        <w:pict w14:anchorId="679FEB1F">
           <v:rect id="_x0000_i1025" style="width:0;height:.75pt" o:hralign="center" o:hrstd="t" o:hr="t" fillcolor="#a0a0a0" stroked="f"/>
         </w:pict>
       </w:r>
@@ -121,7 +121,7 @@
     <w:p>
       <w:pPr>
         <w:pStyle w:val="Ttulo2"/>
-        <w:divId w:val="1629779195"/>
+        <w:divId w:val="326174437"/>
         <w:rPr>
           <w:rFonts w:eastAsia="Times New Roman"/>
           <w:lang w:val="es-ES"/>
@@ -145,7 +145,7 @@
     <w:p>
       <w:pPr>
         <w:pStyle w:val="NormalWeb"/>
-        <w:divId w:val="1629779195"/>
+        <w:divId w:val="326174437"/>
         <w:rPr>
           <w:rFonts w:ascii="Plus Jakarta Sans" w:hAnsi="Plus Jakarta Sans"/>
           <w:lang w:val="es-ES"/>
@@ -167,7 +167,7 @@
         </w:numPr>
         <w:spacing w:before="100" w:beforeAutospacing="1" w:after="90"/>
         <w:ind w:left="1020"/>
-        <w:divId w:val="1629779195"/>
+        <w:divId w:val="326174437"/>
         <w:rPr>
           <w:rFonts w:ascii="Plus Jakarta Sans" w:eastAsia="Times New Roman" w:hAnsi="Plus Jakarta Sans"/>
           <w:sz w:val="21"/>
@@ -202,7 +202,7 @@
           <w:szCs w:val="21"/>
           <w:lang w:val="es-ES"/>
         </w:rPr>
-        <w:t>4,155 fichas</w:t>
+        <w:t>4,171 fichas</w:t>
       </w:r>
     </w:p>
     <w:p>
@@ -213,7 +213,7 @@
         </w:numPr>
         <w:spacing w:before="100" w:beforeAutospacing="1" w:after="90"/>
         <w:ind w:left="1020"/>
-        <w:divId w:val="1629779195"/>
+        <w:divId w:val="326174437"/>
         <w:rPr>
           <w:rFonts w:ascii="Plus Jakarta Sans" w:eastAsia="Times New Roman" w:hAnsi="Plus Jakarta Sans"/>
           <w:sz w:val="21"/>
@@ -258,7 +258,7 @@
           <w:szCs w:val="21"/>
           <w:lang w:val="es-ES"/>
         </w:rPr>
-        <w:t>3,005 polígonos unificados</w:t>
+        <w:t>3,021 polígonos unificados</w:t>
       </w:r>
     </w:p>
     <w:p>
@@ -269,7 +269,7 @@
         </w:numPr>
         <w:spacing w:before="100" w:beforeAutospacing="1" w:after="90"/>
         <w:ind w:left="1020"/>
-        <w:divId w:val="1629779195"/>
+        <w:divId w:val="326174437"/>
         <w:rPr>
           <w:rFonts w:ascii="Plus Jakarta Sans" w:eastAsia="Times New Roman" w:hAnsi="Plus Jakarta Sans"/>
           <w:sz w:val="21"/>
@@ -304,7 +304,7 @@
           <w:szCs w:val="21"/>
           <w:lang w:val="es-ES"/>
         </w:rPr>
-        <w:t>8,142 parcelas agrícolas</w:t>
+        <w:t>8,144 parcelas agrícolas</w:t>
       </w:r>
     </w:p>
     <w:p>
@@ -315,7 +315,7 @@
         </w:numPr>
         <w:spacing w:before="100" w:beforeAutospacing="1" w:after="90"/>
         <w:ind w:left="1020"/>
-        <w:divId w:val="1629779195"/>
+        <w:divId w:val="326174437"/>
         <w:rPr>
           <w:rFonts w:ascii="Plus Jakarta Sans" w:eastAsia="Times New Roman" w:hAnsi="Plus Jakarta Sans"/>
           <w:sz w:val="21"/>
@@ -350,24 +350,24 @@
           <w:szCs w:val="21"/>
           <w:lang w:val="es-ES"/>
         </w:rPr>
-        <w:t>163,058 especies pecuarias</w:t>
+        <w:t>163,062 especies pecuarias</w:t>
       </w:r>
     </w:p>
     <w:p>
       <w:pPr>
         <w:spacing w:before="450" w:after="450"/>
-        <w:divId w:val="1629779195"/>
-        <w:rPr>
-          <w:rFonts w:ascii="Plus Jakarta Sans" w:eastAsia="Times New Roman" w:hAnsi="Plus Jakarta Sans"/>
-          <w:lang w:val="es-ES"/>
-        </w:rPr>
-      </w:pPr>
-      <w:r>
-        <w:rPr>
-          <w:rFonts w:ascii="Plus Jakarta Sans" w:eastAsia="Times New Roman" w:hAnsi="Plus Jakarta Sans"/>
-          <w:lang w:val="es-ES"/>
-        </w:rPr>
-        <w:pict>
+        <w:divId w:val="326174437"/>
+        <w:rPr>
+          <w:rFonts w:ascii="Plus Jakarta Sans" w:eastAsia="Times New Roman" w:hAnsi="Plus Jakarta Sans"/>
+          <w:lang w:val="es-ES"/>
+        </w:rPr>
+      </w:pPr>
+      <w:r>
+        <w:rPr>
+          <w:rFonts w:ascii="Plus Jakarta Sans" w:eastAsia="Times New Roman" w:hAnsi="Plus Jakarta Sans"/>
+          <w:lang w:val="es-ES"/>
+        </w:rPr>
+        <w:pict w14:anchorId="7D0BE13F">
           <v:rect id="_x0000_i1026" style="width:0;height:.75pt" o:hralign="center" o:hrstd="t" o:hr="t" fillcolor="#a0a0a0" stroked="f"/>
         </w:pict>
       </w:r>
@@ -375,7 +375,7 @@
     <w:p>
       <w:pPr>
         <w:pStyle w:val="Ttulo2"/>
-        <w:divId w:val="1629779195"/>
+        <w:divId w:val="326174437"/>
         <w:rPr>
           <w:rFonts w:eastAsia="Times New Roman"/>
           <w:lang w:val="es-ES"/>
@@ -392,7 +392,7 @@
     <w:p>
       <w:pPr>
         <w:pStyle w:val="NormalWeb"/>
-        <w:divId w:val="1629779195"/>
+        <w:divId w:val="326174437"/>
         <w:rPr>
           <w:rFonts w:ascii="Plus Jakarta Sans" w:hAnsi="Plus Jakarta Sans"/>
           <w:lang w:val="es-ES"/>
@@ -445,7 +445,7 @@
       </w:tblGrid>
       <w:tr>
         <w:trPr>
-          <w:divId w:val="1472598590"/>
+          <w:divId w:val="1857768249"/>
           <w:tblHeader/>
         </w:trPr>
         <w:tc>
@@ -525,7 +525,7 @@
       </w:tr>
       <w:tr>
         <w:trPr>
-          <w:divId w:val="1472598590"/>
+          <w:divId w:val="1857768249"/>
         </w:trPr>
         <w:tc>
           <w:tcPr>
@@ -584,14 +584,14 @@
                 <w:sz w:val="20"/>
                 <w:szCs w:val="20"/>
               </w:rPr>
-              <w:t>3,351</w:t>
+              <w:t>3,352</w:t>
             </w:r>
           </w:p>
         </w:tc>
       </w:tr>
       <w:tr>
         <w:trPr>
-          <w:divId w:val="1472598590"/>
+          <w:divId w:val="1857768249"/>
         </w:trPr>
         <w:tc>
           <w:tcPr>
@@ -650,14 +650,14 @@
                 <w:sz w:val="20"/>
                 <w:szCs w:val="20"/>
               </w:rPr>
-              <w:t>377</w:t>
+              <w:t>391</w:t>
             </w:r>
           </w:p>
         </w:tc>
       </w:tr>
       <w:tr>
         <w:trPr>
-          <w:divId w:val="1472598590"/>
+          <w:divId w:val="1857768249"/>
         </w:trPr>
         <w:tc>
           <w:tcPr>
@@ -723,7 +723,7 @@
       </w:tr>
       <w:tr>
         <w:trPr>
-          <w:divId w:val="1472598590"/>
+          <w:divId w:val="1857768249"/>
         </w:trPr>
         <w:tc>
           <w:tcPr>
@@ -782,7 +782,7 @@
                 <w:sz w:val="20"/>
                 <w:szCs w:val="20"/>
               </w:rPr>
-              <w:t>248</w:t>
+              <w:t>249</w:t>
             </w:r>
           </w:p>
         </w:tc>
@@ -791,7 +791,7 @@
     <w:p>
       <w:pPr>
         <w:spacing w:before="450" w:after="450"/>
-        <w:divId w:val="1629779195"/>
+        <w:divId w:val="326174437"/>
         <w:rPr>
           <w:rFonts w:ascii="Plus Jakarta Sans" w:eastAsia="Times New Roman" w:hAnsi="Plus Jakarta Sans"/>
           <w:lang w:val="es-ES"/>
@@ -803,7 +803,7 @@
           <w:lang w:val="es-ES"/>
         </w:rPr>
         <w:lastRenderedPageBreak/>
-        <w:pict>
+        <w:pict w14:anchorId="4BCD17AF">
           <v:rect id="_x0000_i1027" style="width:0;height:.75pt" o:hralign="center" o:hrstd="t" o:hr="t" fillcolor="#a0a0a0" stroked="f"/>
         </w:pict>
       </w:r>
@@ -811,7 +811,7 @@
     <w:p>
       <w:pPr>
         <w:pStyle w:val="Ttulo2"/>
-        <w:divId w:val="1629779195"/>
+        <w:divId w:val="326174437"/>
         <w:rPr>
           <w:rFonts w:eastAsia="Times New Roman"/>
           <w:lang w:val="es-ES"/>
@@ -828,7 +828,7 @@
     <w:p>
       <w:pPr>
         <w:pStyle w:val="Ttulo3"/>
-        <w:divId w:val="1629779195"/>
+        <w:divId w:val="326174437"/>
         <w:rPr>
           <w:rFonts w:eastAsia="Times New Roman"/>
           <w:lang w:val="es-ES"/>
@@ -845,7 +845,7 @@
     <w:p>
       <w:pPr>
         <w:pStyle w:val="NormalWeb"/>
-        <w:divId w:val="1629779195"/>
+        <w:divId w:val="326174437"/>
         <w:rPr>
           <w:rFonts w:ascii="Plus Jakarta Sans" w:hAnsi="Plus Jakarta Sans"/>
           <w:lang w:val="es-ES"/>
@@ -885,7 +885,7 @@
       </w:tblGrid>
       <w:tr>
         <w:trPr>
-          <w:divId w:val="2109958329"/>
+          <w:divId w:val="395516960"/>
           <w:tblHeader/>
         </w:trPr>
         <w:tc>
@@ -1039,7 +1039,7 @@
       </w:tr>
       <w:tr>
         <w:trPr>
-          <w:divId w:val="2109958329"/>
+          <w:divId w:val="395516960"/>
         </w:trPr>
         <w:tc>
           <w:tcPr>
@@ -1098,7 +1098,7 @@
                 <w:sz w:val="20"/>
                 <w:szCs w:val="20"/>
               </w:rPr>
-              <w:t>1,720</w:t>
+              <w:t>1,721</w:t>
             </w:r>
           </w:p>
         </w:tc>
@@ -1158,14 +1158,14 @@
                 <w:sz w:val="20"/>
                 <w:szCs w:val="20"/>
               </w:rPr>
-              <w:t>802</w:t>
+              <w:t>817</w:t>
             </w:r>
           </w:p>
         </w:tc>
       </w:tr>
       <w:tr>
         <w:trPr>
-          <w:divId w:val="2109958329"/>
+          <w:divId w:val="395516960"/>
         </w:trPr>
         <w:tc>
           <w:tcPr>
@@ -1224,7 +1224,7 @@
                 <w:sz w:val="20"/>
                 <w:szCs w:val="20"/>
               </w:rPr>
-              <w:t>33,890,391.78 m²</w:t>
+              <w:t>33,901,727.35 m²</w:t>
             </w:r>
           </w:p>
         </w:tc>
@@ -1284,14 +1284,14 @@
                 <w:sz w:val="20"/>
                 <w:szCs w:val="20"/>
               </w:rPr>
-              <w:t>31,658,756.58 m²</w:t>
+              <w:t>31,705,920.82 m²</w:t>
             </w:r>
           </w:p>
         </w:tc>
       </w:tr>
       <w:tr>
         <w:trPr>
-          <w:divId w:val="2109958329"/>
+          <w:divId w:val="395516960"/>
         </w:trPr>
         <w:tc>
           <w:tcPr>
@@ -1350,7 +1350,7 @@
                 <w:sz w:val="20"/>
                 <w:szCs w:val="20"/>
               </w:rPr>
-              <w:t>19,703.72 m² (1.970 ha)</w:t>
+              <w:t>19,698.85 m² (1.970 ha)</w:t>
             </w:r>
           </w:p>
         </w:tc>
@@ -1410,14 +1410,14 @@
                 <w:sz w:val="20"/>
                 <w:szCs w:val="20"/>
               </w:rPr>
-              <w:t>39,474.76 m² (3.947 ha)</w:t>
+              <w:t>38,807.74 m² (3.881 ha)</w:t>
             </w:r>
           </w:p>
         </w:tc>
       </w:tr>
       <w:tr>
         <w:trPr>
-          <w:divId w:val="2109958329"/>
+          <w:divId w:val="395516960"/>
         </w:trPr>
         <w:tc>
           <w:tcPr>
@@ -1476,7 +1476,7 @@
                 <w:sz w:val="20"/>
                 <w:szCs w:val="20"/>
               </w:rPr>
-              <w:t>29,812,506.22 m²</w:t>
+              <w:t>29,823,841.79 m²</w:t>
             </w:r>
           </w:p>
         </w:tc>
@@ -1536,14 +1536,14 @@
                 <w:sz w:val="20"/>
                 <w:szCs w:val="20"/>
               </w:rPr>
-              <w:t>15,444,334.96 m²</w:t>
+              <w:t>15,491,499.20 m²</w:t>
             </w:r>
           </w:p>
         </w:tc>
       </w:tr>
       <w:tr>
         <w:trPr>
-          <w:divId w:val="2109958329"/>
+          <w:divId w:val="395516960"/>
         </w:trPr>
         <w:tc>
           <w:tcPr>
@@ -1602,7 +1602,7 @@
                 <w:sz w:val="20"/>
                 <w:szCs w:val="20"/>
               </w:rPr>
-              <w:t>17,332.85 m² (1.733 ha)</w:t>
+              <w:t>17,329.37 m² (1.733 ha)</w:t>
             </w:r>
           </w:p>
         </w:tc>
@@ -1670,14 +1670,14 @@
                 <w:sz w:val="20"/>
                 <w:szCs w:val="20"/>
               </w:rPr>
-              <w:t>19,257.28 m² (1.926 ha)</w:t>
+              <w:t>18,961.44 m² (1.896 ha)</w:t>
             </w:r>
           </w:p>
         </w:tc>
       </w:tr>
       <w:tr>
         <w:trPr>
-          <w:divId w:val="2109958329"/>
+          <w:divId w:val="395516960"/>
         </w:trPr>
         <w:tc>
           <w:tcPr>
@@ -1803,7 +1803,7 @@
       </w:tr>
       <w:tr>
         <w:trPr>
-          <w:divId w:val="2109958329"/>
+          <w:divId w:val="395516960"/>
         </w:trPr>
         <w:tc>
           <w:tcPr>
@@ -1862,7 +1862,7 @@
                 <w:sz w:val="20"/>
                 <w:szCs w:val="20"/>
               </w:rPr>
-              <w:t>4,071 (50.0%)</w:t>
+              <w:t>4,073 (50.0%)</w:t>
             </w:r>
           </w:p>
         </w:tc>
@@ -1929,7 +1929,7 @@
       </w:tr>
       <w:tr>
         <w:trPr>
-          <w:divId w:val="2109958329"/>
+          <w:divId w:val="395516960"/>
         </w:trPr>
         <w:tc>
           <w:tcPr>
@@ -1988,7 +1988,7 @@
                 <w:sz w:val="20"/>
                 <w:szCs w:val="20"/>
               </w:rPr>
-              <w:t>46,760 (28.7%)</w:t>
+              <w:t>46,764 (28.7%)</w:t>
             </w:r>
           </w:p>
         </w:tc>
@@ -2057,7 +2057,7 @@
     <w:p>
       <w:pPr>
         <w:pStyle w:val="Ttulo3"/>
-        <w:divId w:val="1629779195"/>
+        <w:divId w:val="326174437"/>
         <w:rPr>
           <w:rFonts w:eastAsia="Times New Roman"/>
           <w:lang w:val="es-ES"/>
@@ -2074,7 +2074,7 @@
     <w:p>
       <w:pPr>
         <w:pStyle w:val="NormalWeb"/>
-        <w:divId w:val="1629779195"/>
+        <w:divId w:val="326174437"/>
         <w:rPr>
           <w:rFonts w:ascii="Plus Jakarta Sans" w:hAnsi="Plus Jakarta Sans"/>
           <w:lang w:val="es-ES"/>
@@ -2103,7 +2103,7 @@
         </w:numPr>
         <w:spacing w:before="100" w:beforeAutospacing="1" w:after="90"/>
         <w:ind w:left="1020"/>
-        <w:divId w:val="1629779195"/>
+        <w:divId w:val="326174437"/>
         <w:rPr>
           <w:rFonts w:ascii="Plus Jakarta Sans" w:eastAsia="Times New Roman" w:hAnsi="Plus Jakarta Sans"/>
           <w:sz w:val="21"/>
@@ -2205,7 +2205,7 @@
         </w:numPr>
         <w:spacing w:before="100" w:beforeAutospacing="1" w:after="90"/>
         <w:ind w:left="1020"/>
-        <w:divId w:val="1629779195"/>
+        <w:divId w:val="326174437"/>
         <w:rPr>
           <w:rFonts w:ascii="Plus Jakarta Sans" w:eastAsia="Times New Roman" w:hAnsi="Plus Jakarta Sans"/>
           <w:sz w:val="21"/>
@@ -2317,7 +2317,7 @@
         </w:numPr>
         <w:spacing w:before="100" w:beforeAutospacing="1" w:after="90"/>
         <w:ind w:left="1020"/>
-        <w:divId w:val="1629779195"/>
+        <w:divId w:val="326174437"/>
         <w:rPr>
           <w:rFonts w:ascii="Plus Jakarta Sans" w:eastAsia="Times New Roman" w:hAnsi="Plus Jakarta Sans"/>
           <w:sz w:val="21"/>
@@ -2423,7 +2423,7 @@
     <w:p>
       <w:pPr>
         <w:pStyle w:val="Ttulo3"/>
-        <w:divId w:val="1629779195"/>
+        <w:divId w:val="326174437"/>
         <w:rPr>
           <w:rFonts w:eastAsia="Times New Roman"/>
           <w:lang w:val="es-ES"/>
@@ -2441,7 +2441,7 @@
       <w:pPr>
         <w:spacing w:before="375" w:after="225"/>
         <w:jc w:val="center"/>
-        <w:divId w:val="585110177"/>
+        <w:divId w:val="385952298"/>
         <w:rPr>
           <w:rFonts w:ascii="Outfit" w:eastAsia="Times New Roman" w:hAnsi="Outfit"/>
           <w:b/>
@@ -2471,7 +2471,7 @@
       <w:pPr>
         <w:spacing w:after="375"/>
         <w:jc w:val="center"/>
-        <w:divId w:val="1121262656"/>
+        <w:divId w:val="730033532"/>
         <w:rPr>
           <w:rFonts w:ascii="Plus Jakarta Sans" w:eastAsia="Times New Roman" w:hAnsi="Plus Jakarta Sans"/>
           <w:lang w:val="es-ES"/>
@@ -2783,7 +2783,7 @@
           <w:rFonts w:ascii="Plus Jakarta Sans" w:eastAsia="Times New Roman" w:hAnsi="Plus Jakarta Sans"/>
           <w:lang w:val="es-ES"/>
         </w:rPr>
-        <w:t>48.8</w:t>
+        <w:t>48.9</w:t>
       </w:r>
       <w:r>
         <w:rPr>
@@ -2804,7 +2804,7 @@
           <w:rFonts w:ascii="Plus Jakarta Sans" w:eastAsia="Times New Roman" w:hAnsi="Plus Jakarta Sans"/>
           <w:lang w:val="es-ES"/>
         </w:rPr>
-        <w:t>51.2</w:t>
+        <w:t>51.1</w:t>
       </w:r>
       <w:r>
         <w:rPr>
@@ -2866,18 +2866,18 @@
     <w:p>
       <w:pPr>
         <w:spacing w:before="450" w:after="450"/>
-        <w:divId w:val="1629779195"/>
-        <w:rPr>
-          <w:rFonts w:ascii="Plus Jakarta Sans" w:eastAsia="Times New Roman" w:hAnsi="Plus Jakarta Sans"/>
-          <w:lang w:val="es-ES"/>
-        </w:rPr>
-      </w:pPr>
-      <w:r>
-        <w:rPr>
-          <w:rFonts w:ascii="Plus Jakarta Sans" w:eastAsia="Times New Roman" w:hAnsi="Plus Jakarta Sans"/>
-          <w:lang w:val="es-ES"/>
-        </w:rPr>
-        <w:pict>
+        <w:divId w:val="326174437"/>
+        <w:rPr>
+          <w:rFonts w:ascii="Plus Jakarta Sans" w:eastAsia="Times New Roman" w:hAnsi="Plus Jakarta Sans"/>
+          <w:lang w:val="es-ES"/>
+        </w:rPr>
+      </w:pPr>
+      <w:r>
+        <w:rPr>
+          <w:rFonts w:ascii="Plus Jakarta Sans" w:eastAsia="Times New Roman" w:hAnsi="Plus Jakarta Sans"/>
+          <w:lang w:val="es-ES"/>
+        </w:rPr>
+        <w:pict w14:anchorId="161280B3">
           <v:rect id="_x0000_i1028" style="width:0;height:.75pt" o:hralign="center" o:hrstd="t" o:hr="t" fillcolor="#a0a0a0" stroked="f"/>
         </w:pict>
       </w:r>
@@ -2885,7 +2885,7 @@
     <w:p>
       <w:pPr>
         <w:pStyle w:val="Ttulo3"/>
-        <w:divId w:val="1629779195"/>
+        <w:divId w:val="326174437"/>
         <w:rPr>
           <w:rFonts w:eastAsia="Times New Roman"/>
           <w:lang w:val="es-ES"/>
@@ -2902,7 +2902,7 @@
     <w:p>
       <w:pPr>
         <w:pStyle w:val="NormalWeb"/>
-        <w:divId w:val="1629779195"/>
+        <w:divId w:val="326174437"/>
         <w:rPr>
           <w:rFonts w:ascii="Plus Jakarta Sans" w:hAnsi="Plus Jakarta Sans"/>
           <w:lang w:val="es-ES"/>
@@ -2935,7 +2935,7 @@
       </w:tblGrid>
       <w:tr>
         <w:trPr>
-          <w:divId w:val="29107729"/>
+          <w:divId w:val="1783645512"/>
           <w:tblHeader/>
         </w:trPr>
         <w:tc>
@@ -3089,7 +3089,7 @@
       </w:tr>
       <w:tr>
         <w:trPr>
-          <w:divId w:val="29107729"/>
+          <w:divId w:val="1783645512"/>
         </w:trPr>
         <w:tc>
           <w:tcPr>
@@ -3216,14 +3216,14 @@
                 <w:sz w:val="20"/>
                 <w:szCs w:val="20"/>
               </w:rPr>
-              <w:t>103 (12.8%)</w:t>
+              <w:t>105 (12.9%)</w:t>
             </w:r>
           </w:p>
         </w:tc>
       </w:tr>
       <w:tr>
         <w:trPr>
-          <w:divId w:val="29107729"/>
+          <w:divId w:val="1783645512"/>
         </w:trPr>
         <w:tc>
           <w:tcPr>
@@ -3350,14 +3350,14 @@
                 <w:sz w:val="20"/>
                 <w:szCs w:val="20"/>
               </w:rPr>
-              <w:t>342 (42.6%)</w:t>
+              <w:t>351 (43.0%)</w:t>
             </w:r>
           </w:p>
         </w:tc>
       </w:tr>
       <w:tr>
         <w:trPr>
-          <w:divId w:val="29107729"/>
+          <w:divId w:val="1783645512"/>
         </w:trPr>
         <w:tc>
           <w:tcPr>
@@ -3484,14 +3484,14 @@
                 <w:sz w:val="20"/>
                 <w:szCs w:val="20"/>
               </w:rPr>
-              <w:t>223 (27.8%)</w:t>
+              <w:t>227 (27.8%)</w:t>
             </w:r>
           </w:p>
         </w:tc>
       </w:tr>
       <w:tr>
         <w:trPr>
-          <w:divId w:val="29107729"/>
+          <w:divId w:val="1783645512"/>
         </w:trPr>
         <w:tc>
           <w:tcPr>
@@ -3558,7 +3558,7 @@
                 <w:sz w:val="20"/>
                 <w:szCs w:val="20"/>
               </w:rPr>
-              <w:t>582 (33.8%)</w:t>
+              <w:t>583 (33.9%)</w:t>
             </w:r>
           </w:p>
         </w:tc>
@@ -3618,14 +3618,14 @@
                 <w:sz w:val="20"/>
                 <w:szCs w:val="20"/>
               </w:rPr>
-              <w:t>110 (13.7%)</w:t>
+              <w:t>110 (13.5%)</w:t>
             </w:r>
           </w:p>
         </w:tc>
       </w:tr>
       <w:tr>
         <w:trPr>
-          <w:divId w:val="29107729"/>
+          <w:divId w:val="1783645512"/>
         </w:trPr>
         <w:tc>
           <w:tcPr>
@@ -3759,7 +3759,7 @@
       </w:tr>
       <w:tr>
         <w:trPr>
-          <w:divId w:val="29107729"/>
+          <w:divId w:val="1783645512"/>
         </w:trPr>
         <w:tc>
           <w:tcPr>
@@ -3886,7 +3886,7 @@
                 <w:sz w:val="20"/>
                 <w:szCs w:val="20"/>
               </w:rPr>
-              <w:t>15 (1.9%)</w:t>
+              <w:t>15 (1.8%)</w:t>
             </w:r>
           </w:p>
         </w:tc>
@@ -3895,7 +3895,7 @@
     <w:p>
       <w:pPr>
         <w:pStyle w:val="Ttulo3"/>
-        <w:divId w:val="1629779195"/>
+        <w:divId w:val="326174437"/>
         <w:rPr>
           <w:rFonts w:eastAsia="Times New Roman"/>
           <w:lang w:val="es-ES"/>
@@ -3913,7 +3913,7 @@
       <w:pPr>
         <w:spacing w:before="375" w:after="225"/>
         <w:jc w:val="center"/>
-        <w:divId w:val="1546067862"/>
+        <w:divId w:val="2016686019"/>
         <w:rPr>
           <w:rFonts w:ascii="Outfit" w:eastAsia="Times New Roman" w:hAnsi="Outfit"/>
           <w:b/>
@@ -3943,7 +3943,7 @@
       <w:pPr>
         <w:spacing w:after="375"/>
         <w:jc w:val="center"/>
-        <w:divId w:val="1144858127"/>
+        <w:divId w:val="1573541538"/>
         <w:rPr>
           <w:rFonts w:ascii="Plus Jakarta Sans" w:eastAsia="Times New Roman" w:hAnsi="Plus Jakarta Sans"/>
           <w:lang w:val="es-ES"/>
@@ -4317,18 +4317,18 @@
     <w:p>
       <w:pPr>
         <w:spacing w:before="450" w:after="450"/>
-        <w:divId w:val="1629779195"/>
-        <w:rPr>
-          <w:rFonts w:ascii="Plus Jakarta Sans" w:eastAsia="Times New Roman" w:hAnsi="Plus Jakarta Sans"/>
-          <w:lang w:val="es-ES"/>
-        </w:rPr>
-      </w:pPr>
-      <w:r>
-        <w:rPr>
-          <w:rFonts w:ascii="Plus Jakarta Sans" w:eastAsia="Times New Roman" w:hAnsi="Plus Jakarta Sans"/>
-          <w:lang w:val="es-ES"/>
-        </w:rPr>
-        <w:pict>
+        <w:divId w:val="326174437"/>
+        <w:rPr>
+          <w:rFonts w:ascii="Plus Jakarta Sans" w:eastAsia="Times New Roman" w:hAnsi="Plus Jakarta Sans"/>
+          <w:lang w:val="es-ES"/>
+        </w:rPr>
+      </w:pPr>
+      <w:r>
+        <w:rPr>
+          <w:rFonts w:ascii="Plus Jakarta Sans" w:eastAsia="Times New Roman" w:hAnsi="Plus Jakarta Sans"/>
+          <w:lang w:val="es-ES"/>
+        </w:rPr>
+        <w:pict w14:anchorId="5EE00A9F">
           <v:rect id="_x0000_i1029" style="width:0;height:.75pt" o:hralign="center" o:hrstd="t" o:hr="t" fillcolor="#a0a0a0" stroked="f"/>
         </w:pict>
       </w:r>
@@ -4336,7 +4336,7 @@
     <w:p>
       <w:pPr>
         <w:pStyle w:val="Ttulo3"/>
-        <w:divId w:val="1629779195"/>
+        <w:divId w:val="326174437"/>
         <w:rPr>
           <w:rFonts w:eastAsia="Times New Roman"/>
           <w:lang w:val="es-ES"/>
@@ -4353,7 +4353,7 @@
     <w:p>
       <w:pPr>
         <w:pStyle w:val="NormalWeb"/>
-        <w:divId w:val="1629779195"/>
+        <w:divId w:val="326174437"/>
         <w:rPr>
           <w:rFonts w:ascii="Plus Jakarta Sans" w:hAnsi="Plus Jakarta Sans"/>
           <w:lang w:val="es-ES"/>
@@ -4375,7 +4375,7 @@
         </w:numPr>
         <w:spacing w:before="100" w:beforeAutospacing="1" w:after="90"/>
         <w:ind w:left="1020"/>
-        <w:divId w:val="1629779195"/>
+        <w:divId w:val="326174437"/>
         <w:rPr>
           <w:rFonts w:ascii="Plus Jakarta Sans" w:eastAsia="Times New Roman" w:hAnsi="Plus Jakarta Sans"/>
           <w:sz w:val="21"/>
@@ -4411,7 +4411,7 @@
         </w:numPr>
         <w:spacing w:before="100" w:beforeAutospacing="1" w:after="90"/>
         <w:ind w:left="1020"/>
-        <w:divId w:val="1629779195"/>
+        <w:divId w:val="326174437"/>
         <w:rPr>
           <w:rFonts w:ascii="Plus Jakarta Sans" w:eastAsia="Times New Roman" w:hAnsi="Plus Jakarta Sans"/>
           <w:sz w:val="21"/>
@@ -4456,7 +4456,7 @@
         </w:numPr>
         <w:spacing w:before="100" w:beforeAutospacing="1" w:after="90"/>
         <w:ind w:left="1020"/>
-        <w:divId w:val="1629779195"/>
+        <w:divId w:val="326174437"/>
         <w:rPr>
           <w:rFonts w:ascii="Plus Jakarta Sans" w:eastAsia="Times New Roman" w:hAnsi="Plus Jakarta Sans"/>
           <w:sz w:val="21"/>
@@ -4501,7 +4501,7 @@
         </w:numPr>
         <w:spacing w:before="100" w:beforeAutospacing="1" w:after="90"/>
         <w:ind w:left="1020"/>
-        <w:divId w:val="1629779195"/>
+        <w:divId w:val="326174437"/>
         <w:rPr>
           <w:rFonts w:ascii="Plus Jakarta Sans" w:eastAsia="Times New Roman" w:hAnsi="Plus Jakarta Sans"/>
           <w:sz w:val="21"/>
@@ -4557,7 +4557,7 @@
       </w:tblGrid>
       <w:tr>
         <w:trPr>
-          <w:divId w:val="81068588"/>
+          <w:divId w:val="1651909913"/>
           <w:tblHeader/>
         </w:trPr>
         <w:tc>
@@ -4711,7 +4711,7 @@
       </w:tr>
       <w:tr>
         <w:trPr>
-          <w:divId w:val="81068588"/>
+          <w:divId w:val="1651909913"/>
         </w:trPr>
         <w:tc>
           <w:tcPr>
@@ -4830,14 +4830,14 @@
                 <w:sz w:val="20"/>
                 <w:szCs w:val="20"/>
               </w:rPr>
-              <w:t>39 (4.9%)</w:t>
+              <w:t>54 (6.6%)</w:t>
             </w:r>
           </w:p>
         </w:tc>
       </w:tr>
       <w:tr>
         <w:trPr>
-          <w:divId w:val="81068588"/>
+          <w:divId w:val="1651909913"/>
         </w:trPr>
         <w:tc>
           <w:tcPr>
@@ -4956,14 +4956,14 @@
                 <w:sz w:val="20"/>
                 <w:szCs w:val="20"/>
               </w:rPr>
-              <w:t>220 (27.4%)</w:t>
+              <w:t>220 (26.9%)</w:t>
             </w:r>
           </w:p>
         </w:tc>
       </w:tr>
       <w:tr>
         <w:trPr>
-          <w:divId w:val="81068588"/>
+          <w:divId w:val="1651909913"/>
         </w:trPr>
         <w:tc>
           <w:tcPr>
@@ -5022,7 +5022,7 @@
                 <w:sz w:val="20"/>
                 <w:szCs w:val="20"/>
               </w:rPr>
-              <w:t>583 (33.9%)</w:t>
+              <w:t>584 (33.9%)</w:t>
             </w:r>
           </w:p>
         </w:tc>
@@ -5082,14 +5082,14 @@
                 <w:sz w:val="20"/>
                 <w:szCs w:val="20"/>
               </w:rPr>
-              <w:t>376 (46.9%)</w:t>
+              <w:t>376 (46.0%)</w:t>
             </w:r>
           </w:p>
         </w:tc>
       </w:tr>
       <w:tr>
         <w:trPr>
-          <w:divId w:val="81068588"/>
+          <w:divId w:val="1651909913"/>
         </w:trPr>
         <w:tc>
           <w:tcPr>
@@ -5208,7 +5208,7 @@
                 <w:sz w:val="20"/>
                 <w:szCs w:val="20"/>
               </w:rPr>
-              <w:t>167 (20.8%)</w:t>
+              <w:t>167 (20.4%)</w:t>
             </w:r>
           </w:p>
         </w:tc>
@@ -5217,18 +5217,18 @@
     <w:p>
       <w:pPr>
         <w:spacing w:before="450" w:after="450"/>
-        <w:divId w:val="1629779195"/>
-        <w:rPr>
-          <w:rFonts w:ascii="Plus Jakarta Sans" w:eastAsia="Times New Roman" w:hAnsi="Plus Jakarta Sans"/>
-          <w:lang w:val="es-ES"/>
-        </w:rPr>
-      </w:pPr>
-      <w:r>
-        <w:rPr>
-          <w:rFonts w:ascii="Plus Jakarta Sans" w:eastAsia="Times New Roman" w:hAnsi="Plus Jakarta Sans"/>
-          <w:lang w:val="es-ES"/>
-        </w:rPr>
-        <w:pict>
+        <w:divId w:val="326174437"/>
+        <w:rPr>
+          <w:rFonts w:ascii="Plus Jakarta Sans" w:eastAsia="Times New Roman" w:hAnsi="Plus Jakarta Sans"/>
+          <w:lang w:val="es-ES"/>
+        </w:rPr>
+      </w:pPr>
+      <w:r>
+        <w:rPr>
+          <w:rFonts w:ascii="Plus Jakarta Sans" w:eastAsia="Times New Roman" w:hAnsi="Plus Jakarta Sans"/>
+          <w:lang w:val="es-ES"/>
+        </w:rPr>
+        <w:pict w14:anchorId="54046D6C">
           <v:rect id="_x0000_i1030" style="width:0;height:.75pt" o:hralign="center" o:hrstd="t" o:hr="t" fillcolor="#a0a0a0" stroked="f"/>
         </w:pict>
       </w:r>
@@ -5236,7 +5236,7 @@
     <w:p>
       <w:pPr>
         <w:pStyle w:val="Ttulo3"/>
-        <w:divId w:val="1629779195"/>
+        <w:divId w:val="326174437"/>
         <w:rPr>
           <w:rFonts w:eastAsia="Times New Roman"/>
           <w:lang w:val="es-ES"/>
@@ -5253,7 +5253,7 @@
     <w:p>
       <w:pPr>
         <w:pStyle w:val="NormalWeb"/>
-        <w:divId w:val="1629779195"/>
+        <w:divId w:val="326174437"/>
         <w:rPr>
           <w:rFonts w:ascii="Plus Jakarta Sans" w:hAnsi="Plus Jakarta Sans"/>
           <w:lang w:val="es-ES"/>
@@ -5277,7 +5277,7 @@
     <w:p>
       <w:pPr>
         <w:pStyle w:val="Ttulo4"/>
-        <w:divId w:val="1629779195"/>
+        <w:divId w:val="326174437"/>
         <w:rPr>
           <w:rFonts w:eastAsia="Times New Roman"/>
           <w:lang w:val="es-ES"/>
@@ -5295,7 +5295,7 @@
       <w:pPr>
         <w:spacing w:before="375" w:after="225"/>
         <w:jc w:val="center"/>
-        <w:divId w:val="1827284046"/>
+        <w:divId w:val="1060444216"/>
         <w:rPr>
           <w:rFonts w:ascii="Outfit" w:eastAsia="Times New Roman" w:hAnsi="Outfit"/>
           <w:b/>
@@ -5325,7 +5325,7 @@
       <w:pPr>
         <w:spacing w:after="375"/>
         <w:jc w:val="center"/>
-        <w:divId w:val="1219440486"/>
+        <w:divId w:val="437601576"/>
         <w:rPr>
           <w:rFonts w:ascii="Plus Jakarta Sans" w:eastAsia="Times New Roman" w:hAnsi="Plus Jakarta Sans"/>
           <w:lang w:val="es-ES"/>
@@ -5504,7 +5504,7 @@
           <w:rFonts w:ascii="Plus Jakarta Sans" w:eastAsia="Times New Roman" w:hAnsi="Plus Jakarta Sans"/>
           <w:lang w:val="es-ES"/>
         </w:rPr>
-        <w:t>51.4% (4,071 cultivos</w:t>
+        <w:t>51.4% (4,073 cultivos</w:t>
       </w:r>
       <w:r>
         <w:rPr>
@@ -5588,7 +5588,7 @@
           <w:rFonts w:ascii="Plus Jakarta Sans" w:eastAsia="Times New Roman" w:hAnsi="Plus Jakarta Sans"/>
           <w:lang w:val="es-ES"/>
         </w:rPr>
-        <w:t>18.5% (1,462 cultivos</w:t>
+        <w:t>18.4% (1,462 cultivos</w:t>
       </w:r>
       <w:r>
         <w:rPr>
@@ -5608,7 +5608,7 @@
     <w:p>
       <w:pPr>
         <w:pStyle w:val="Ttulo4"/>
-        <w:divId w:val="1629779195"/>
+        <w:divId w:val="326174437"/>
         <w:rPr>
           <w:rFonts w:eastAsia="Times New Roman"/>
           <w:lang w:val="es-ES"/>
@@ -5633,7 +5633,7 @@
       <w:pPr>
         <w:spacing w:before="375" w:after="225"/>
         <w:jc w:val="center"/>
-        <w:divId w:val="2038895529"/>
+        <w:divId w:val="972061338"/>
         <w:rPr>
           <w:rFonts w:ascii="Outfit" w:eastAsia="Times New Roman" w:hAnsi="Outfit"/>
           <w:b/>
@@ -5663,7 +5663,7 @@
       <w:pPr>
         <w:spacing w:after="375"/>
         <w:jc w:val="center"/>
-        <w:divId w:val="938636994"/>
+        <w:divId w:val="605119337"/>
         <w:rPr>
           <w:rFonts w:ascii="Plus Jakarta Sans" w:eastAsia="Times New Roman" w:hAnsi="Plus Jakarta Sans"/>
           <w:lang w:val="es-ES"/>
@@ -5981,7 +5981,7 @@
     <w:p>
       <w:pPr>
         <w:pStyle w:val="Ttulo4"/>
-        <w:divId w:val="1629779195"/>
+        <w:divId w:val="326174437"/>
         <w:rPr>
           <w:rFonts w:eastAsia="Times New Roman"/>
           <w:lang w:val="es-ES"/>
@@ -5999,7 +5999,7 @@
       <w:pPr>
         <w:spacing w:before="375" w:after="225"/>
         <w:jc w:val="center"/>
-        <w:divId w:val="537084289"/>
+        <w:divId w:val="1356495334"/>
         <w:rPr>
           <w:rFonts w:ascii="Outfit" w:eastAsia="Times New Roman" w:hAnsi="Outfit"/>
           <w:b/>
@@ -6029,7 +6029,7 @@
       <w:pPr>
         <w:spacing w:after="375"/>
         <w:jc w:val="center"/>
-        <w:divId w:val="134613208"/>
+        <w:divId w:val="582568550"/>
         <w:rPr>
           <w:rFonts w:ascii="Plus Jakarta Sans" w:eastAsia="Times New Roman" w:hAnsi="Plus Jakarta Sans"/>
           <w:lang w:val="es-ES"/>
@@ -6333,18 +6333,18 @@
     <w:p>
       <w:pPr>
         <w:spacing w:before="450" w:after="450"/>
-        <w:divId w:val="1629779195"/>
-        <w:rPr>
-          <w:rFonts w:ascii="Plus Jakarta Sans" w:eastAsia="Times New Roman" w:hAnsi="Plus Jakarta Sans"/>
-          <w:lang w:val="es-ES"/>
-        </w:rPr>
-      </w:pPr>
-      <w:r>
-        <w:rPr>
-          <w:rFonts w:ascii="Plus Jakarta Sans" w:eastAsia="Times New Roman" w:hAnsi="Plus Jakarta Sans"/>
-          <w:lang w:val="es-ES"/>
-        </w:rPr>
-        <w:pict>
+        <w:divId w:val="326174437"/>
+        <w:rPr>
+          <w:rFonts w:ascii="Plus Jakarta Sans" w:eastAsia="Times New Roman" w:hAnsi="Plus Jakarta Sans"/>
+          <w:lang w:val="es-ES"/>
+        </w:rPr>
+      </w:pPr>
+      <w:r>
+        <w:rPr>
+          <w:rFonts w:ascii="Plus Jakarta Sans" w:eastAsia="Times New Roman" w:hAnsi="Plus Jakarta Sans"/>
+          <w:lang w:val="es-ES"/>
+        </w:rPr>
+        <w:pict w14:anchorId="48E6A525">
           <v:rect id="_x0000_i1031" style="width:0;height:.75pt" o:hralign="center" o:hrstd="t" o:hr="t" fillcolor="#a0a0a0" stroked="f"/>
         </w:pict>
       </w:r>
@@ -6352,7 +6352,7 @@
     <w:p>
       <w:pPr>
         <w:pStyle w:val="Ttulo3"/>
-        <w:divId w:val="1629779195"/>
+        <w:divId w:val="326174437"/>
         <w:rPr>
           <w:rFonts w:eastAsia="Times New Roman"/>
           <w:lang w:val="es-ES"/>
@@ -6369,7 +6369,7 @@
     <w:p>
       <w:pPr>
         <w:pStyle w:val="NormalWeb"/>
-        <w:divId w:val="1629779195"/>
+        <w:divId w:val="326174437"/>
         <w:rPr>
           <w:rFonts w:ascii="Plus Jakarta Sans" w:hAnsi="Plus Jakarta Sans"/>
           <w:lang w:val="es-ES"/>
@@ -6393,7 +6393,7 @@
     <w:p>
       <w:pPr>
         <w:pStyle w:val="Ttulo4"/>
-        <w:divId w:val="1629779195"/>
+        <w:divId w:val="326174437"/>
         <w:rPr>
           <w:rFonts w:eastAsia="Times New Roman"/>
           <w:lang w:val="es-ES"/>
@@ -6410,7 +6410,7 @@
     <w:p>
       <w:pPr>
         <w:pStyle w:val="NormalWeb"/>
-        <w:divId w:val="1629779195"/>
+        <w:divId w:val="326174437"/>
         <w:rPr>
           <w:rFonts w:ascii="Plus Jakarta Sans" w:hAnsi="Plus Jakarta Sans"/>
           <w:lang w:val="es-ES"/>
@@ -6441,7 +6441,7 @@
       </w:tblGrid>
       <w:tr>
         <w:trPr>
-          <w:divId w:val="201678913"/>
+          <w:divId w:val="1871184647"/>
           <w:tblHeader/>
         </w:trPr>
         <w:tc>
@@ -6521,7 +6521,7 @@
       </w:tr>
       <w:tr>
         <w:trPr>
-          <w:divId w:val="201678913"/>
+          <w:divId w:val="1871184647"/>
         </w:trPr>
         <w:tc>
           <w:tcPr>
@@ -6610,7 +6610,7 @@
     <w:p>
       <w:pPr>
         <w:pStyle w:val="Ttulo4"/>
-        <w:divId w:val="1629779195"/>
+        <w:divId w:val="326174437"/>
         <w:rPr>
           <w:rFonts w:eastAsia="Times New Roman"/>
           <w:lang w:val="es-ES"/>
@@ -6627,7 +6627,7 @@
     <w:p>
       <w:pPr>
         <w:pStyle w:val="NormalWeb"/>
-        <w:divId w:val="1629779195"/>
+        <w:divId w:val="326174437"/>
         <w:rPr>
           <w:rFonts w:ascii="Plus Jakarta Sans" w:hAnsi="Plus Jakarta Sans"/>
           <w:lang w:val="es-ES"/>
@@ -6658,7 +6658,7 @@
       </w:tblGrid>
       <w:tr>
         <w:trPr>
-          <w:divId w:val="275337789"/>
+          <w:divId w:val="437141588"/>
           <w:tblHeader/>
         </w:trPr>
         <w:tc>
@@ -6738,7 +6738,7 @@
       </w:tr>
       <w:tr>
         <w:trPr>
-          <w:divId w:val="275337789"/>
+          <w:divId w:val="437141588"/>
         </w:trPr>
         <w:tc>
           <w:tcPr>
@@ -6836,7 +6836,7 @@
     <w:p>
       <w:pPr>
         <w:pStyle w:val="Ttulo4"/>
-        <w:divId w:val="1629779195"/>
+        <w:divId w:val="326174437"/>
         <w:rPr>
           <w:rFonts w:eastAsia="Times New Roman"/>
           <w:lang w:val="es-ES"/>
@@ -6853,7 +6853,7 @@
     <w:p>
       <w:pPr>
         <w:pStyle w:val="NormalWeb"/>
-        <w:divId w:val="1629779195"/>
+        <w:divId w:val="326174437"/>
         <w:rPr>
           <w:rFonts w:ascii="Plus Jakarta Sans" w:hAnsi="Plus Jakarta Sans"/>
           <w:lang w:val="es-ES"/>
@@ -6884,7 +6884,7 @@
       </w:tblGrid>
       <w:tr>
         <w:trPr>
-          <w:divId w:val="1645164018"/>
+          <w:divId w:val="472453506"/>
           <w:tblHeader/>
         </w:trPr>
         <w:tc>
@@ -6964,7 +6964,7 @@
       </w:tr>
       <w:tr>
         <w:trPr>
-          <w:divId w:val="1645164018"/>
+          <w:divId w:val="472453506"/>
         </w:trPr>
         <w:tc>
           <w:tcPr>
@@ -7053,18 +7053,18 @@
     <w:p>
       <w:pPr>
         <w:spacing w:before="450" w:after="450"/>
-        <w:divId w:val="1629779195"/>
-        <w:rPr>
-          <w:rFonts w:ascii="Plus Jakarta Sans" w:eastAsia="Times New Roman" w:hAnsi="Plus Jakarta Sans"/>
-          <w:lang w:val="es-ES"/>
-        </w:rPr>
-      </w:pPr>
-      <w:r>
-        <w:rPr>
-          <w:rFonts w:ascii="Plus Jakarta Sans" w:eastAsia="Times New Roman" w:hAnsi="Plus Jakarta Sans"/>
-          <w:lang w:val="es-ES"/>
-        </w:rPr>
-        <w:pict>
+        <w:divId w:val="326174437"/>
+        <w:rPr>
+          <w:rFonts w:ascii="Plus Jakarta Sans" w:eastAsia="Times New Roman" w:hAnsi="Plus Jakarta Sans"/>
+          <w:lang w:val="es-ES"/>
+        </w:rPr>
+      </w:pPr>
+      <w:r>
+        <w:rPr>
+          <w:rFonts w:ascii="Plus Jakarta Sans" w:eastAsia="Times New Roman" w:hAnsi="Plus Jakarta Sans"/>
+          <w:lang w:val="es-ES"/>
+        </w:rPr>
+        <w:pict w14:anchorId="535A5F45">
           <v:rect id="_x0000_i1032" style="width:0;height:.75pt" o:hralign="center" o:hrstd="t" o:hr="t" fillcolor="#a0a0a0" stroked="f"/>
         </w:pict>
       </w:r>
@@ -7072,7 +7072,7 @@
     <w:p>
       <w:pPr>
         <w:pStyle w:val="Ttulo2"/>
-        <w:divId w:val="1629779195"/>
+        <w:divId w:val="326174437"/>
         <w:rPr>
           <w:rFonts w:eastAsia="Times New Roman"/>
           <w:lang w:val="es-ES"/>
@@ -7089,7 +7089,7 @@
     <w:p>
       <w:pPr>
         <w:pStyle w:val="NormalWeb"/>
-        <w:divId w:val="1629779195"/>
+        <w:divId w:val="326174437"/>
         <w:rPr>
           <w:rFonts w:ascii="Plus Jakarta Sans" w:hAnsi="Plus Jakarta Sans"/>
           <w:lang w:val="es-ES"/>
@@ -7106,7 +7106,7 @@
     <w:p>
       <w:pPr>
         <w:pStyle w:val="Ttulo3"/>
-        <w:divId w:val="1629779195"/>
+        <w:divId w:val="326174437"/>
         <w:rPr>
           <w:rFonts w:eastAsia="Times New Roman"/>
           <w:lang w:val="es-ES"/>
@@ -7123,7 +7123,7 @@
     <w:p>
       <w:pPr>
         <w:pStyle w:val="NormalWeb"/>
-        <w:divId w:val="1629779195"/>
+        <w:divId w:val="326174437"/>
         <w:rPr>
           <w:rFonts w:ascii="Plus Jakarta Sans" w:hAnsi="Plus Jakarta Sans"/>
           <w:lang w:val="es-ES"/>
@@ -7156,7 +7156,7 @@
       </w:tblGrid>
       <w:tr>
         <w:trPr>
-          <w:divId w:val="838077992"/>
+          <w:divId w:val="667557327"/>
           <w:tblHeader/>
         </w:trPr>
         <w:tc>
@@ -7321,7 +7321,7 @@
       </w:tr>
       <w:tr>
         <w:trPr>
-          <w:divId w:val="838077992"/>
+          <w:divId w:val="667557327"/>
         </w:trPr>
         <w:tc>
           <w:tcPr>
@@ -7380,7 +7380,7 @@
                 <w:sz w:val="20"/>
                 <w:szCs w:val="20"/>
               </w:rPr>
-              <w:t>1580 (91.9%)</w:t>
+              <w:t>1581 (91.9%)</w:t>
             </w:r>
           </w:p>
         </w:tc>
@@ -7440,14 +7440,14 @@
                 <w:sz w:val="20"/>
                 <w:szCs w:val="20"/>
               </w:rPr>
-              <w:t>569 (70.9%)</w:t>
+              <w:t>584 (71.5%)</w:t>
             </w:r>
           </w:p>
         </w:tc>
       </w:tr>
       <w:tr>
         <w:trPr>
-          <w:divId w:val="838077992"/>
+          <w:divId w:val="667557327"/>
         </w:trPr>
         <w:tc>
           <w:tcPr>
@@ -7566,14 +7566,14 @@
                 <w:sz w:val="20"/>
                 <w:szCs w:val="20"/>
               </w:rPr>
-              <w:t>173 (21.6%)</w:t>
+              <w:t>173 (21.2%)</w:t>
             </w:r>
           </w:p>
         </w:tc>
       </w:tr>
       <w:tr>
         <w:trPr>
-          <w:divId w:val="838077992"/>
+          <w:divId w:val="667557327"/>
         </w:trPr>
         <w:tc>
           <w:tcPr>
@@ -7692,14 +7692,14 @@
                 <w:sz w:val="20"/>
                 <w:szCs w:val="20"/>
               </w:rPr>
-              <w:t>60 (7.5%)</w:t>
+              <w:t>60 (7.3%)</w:t>
             </w:r>
           </w:p>
         </w:tc>
       </w:tr>
       <w:tr>
         <w:trPr>
-          <w:divId w:val="838077992"/>
+          <w:divId w:val="667557327"/>
         </w:trPr>
         <w:tc>
           <w:tcPr>
@@ -7827,7 +7827,7 @@
     <w:p>
       <w:pPr>
         <w:pStyle w:val="Ttulo3"/>
-        <w:divId w:val="1629779195"/>
+        <w:divId w:val="326174437"/>
         <w:rPr>
           <w:rFonts w:eastAsia="Times New Roman"/>
           <w:lang w:val="es-ES"/>
@@ -7845,7 +7845,7 @@
       <w:pPr>
         <w:spacing w:before="375" w:after="225"/>
         <w:jc w:val="center"/>
-        <w:divId w:val="640698415"/>
+        <w:divId w:val="675157724"/>
         <w:rPr>
           <w:rFonts w:ascii="Outfit" w:eastAsia="Times New Roman" w:hAnsi="Outfit"/>
           <w:b/>
@@ -7875,7 +7875,7 @@
       <w:pPr>
         <w:spacing w:after="375"/>
         <w:jc w:val="center"/>
-        <w:divId w:val="1118136656"/>
+        <w:divId w:val="1909146275"/>
         <w:rPr>
           <w:rFonts w:ascii="Plus Jakarta Sans" w:eastAsia="Times New Roman" w:hAnsi="Plus Jakarta Sans"/>
           <w:lang w:val="es-ES"/>
@@ -8138,7 +8138,7 @@
           <w:rFonts w:ascii="Plus Jakarta Sans" w:eastAsia="Times New Roman" w:hAnsi="Plus Jakarta Sans"/>
           <w:lang w:val="es-ES"/>
         </w:rPr>
-        <w:t>22</w:t>
+        <w:t>21</w:t>
       </w:r>
       <w:r>
         <w:rPr>
@@ -8242,7 +8242,7 @@
     <w:p>
       <w:pPr>
         <w:pStyle w:val="Ttulo3"/>
-        <w:divId w:val="1629779195"/>
+        <w:divId w:val="326174437"/>
         <w:rPr>
           <w:rFonts w:eastAsia="Times New Roman"/>
           <w:lang w:val="es-ES"/>
@@ -8266,7 +8266,7 @@
     <w:p>
       <w:pPr>
         <w:pStyle w:val="NormalWeb"/>
-        <w:divId w:val="1629779195"/>
+        <w:divId w:val="326174437"/>
         <w:rPr>
           <w:rFonts w:ascii="Plus Jakarta Sans" w:hAnsi="Plus Jakarta Sans"/>
           <w:lang w:val="es-ES"/>
@@ -8288,7 +8288,7 @@
         </w:numPr>
         <w:spacing w:before="100" w:beforeAutospacing="1" w:after="90"/>
         <w:ind w:left="1020"/>
-        <w:divId w:val="1629779195"/>
+        <w:divId w:val="326174437"/>
         <w:rPr>
           <w:rFonts w:ascii="Plus Jakarta Sans" w:eastAsia="Times New Roman" w:hAnsi="Plus Jakarta Sans"/>
           <w:sz w:val="21"/>
@@ -8324,7 +8324,7 @@
         </w:numPr>
         <w:spacing w:before="100" w:beforeAutospacing="1" w:after="90"/>
         <w:ind w:left="1020"/>
-        <w:divId w:val="1629779195"/>
+        <w:divId w:val="326174437"/>
         <w:rPr>
           <w:rFonts w:ascii="Plus Jakarta Sans" w:eastAsia="Times New Roman" w:hAnsi="Plus Jakarta Sans"/>
           <w:sz w:val="21"/>
@@ -8369,7 +8369,7 @@
         </w:numPr>
         <w:spacing w:before="100" w:beforeAutospacing="1" w:after="90"/>
         <w:ind w:left="1020"/>
-        <w:divId w:val="1629779195"/>
+        <w:divId w:val="326174437"/>
         <w:rPr>
           <w:rFonts w:ascii="Plus Jakarta Sans" w:eastAsia="Times New Roman" w:hAnsi="Plus Jakarta Sans"/>
           <w:sz w:val="21"/>
@@ -8423,7 +8423,7 @@
         </w:numPr>
         <w:spacing w:before="100" w:beforeAutospacing="1" w:after="90"/>
         <w:ind w:left="1020"/>
-        <w:divId w:val="1629779195"/>
+        <w:divId w:val="326174437"/>
         <w:rPr>
           <w:rFonts w:ascii="Plus Jakarta Sans" w:eastAsia="Times New Roman" w:hAnsi="Plus Jakarta Sans"/>
           <w:sz w:val="21"/>
@@ -8468,7 +8468,7 @@
         </w:numPr>
         <w:spacing w:before="100" w:beforeAutospacing="1" w:after="90"/>
         <w:ind w:left="1020"/>
-        <w:divId w:val="1629779195"/>
+        <w:divId w:val="326174437"/>
         <w:rPr>
           <w:rFonts w:ascii="Plus Jakarta Sans" w:eastAsia="Times New Roman" w:hAnsi="Plus Jakarta Sans"/>
           <w:sz w:val="21"/>
@@ -8504,7 +8504,7 @@
         </w:numPr>
         <w:spacing w:before="100" w:beforeAutospacing="1" w:after="90"/>
         <w:ind w:left="1020"/>
-        <w:divId w:val="1629779195"/>
+        <w:divId w:val="326174437"/>
         <w:rPr>
           <w:rFonts w:ascii="Plus Jakarta Sans" w:eastAsia="Times New Roman" w:hAnsi="Plus Jakarta Sans"/>
           <w:sz w:val="21"/>
@@ -8538,7 +8538,7 @@
           <w:szCs w:val="21"/>
           <w:lang w:val="es-ES"/>
         </w:rPr>
-        <w:t xml:space="preserve"> promedio (en 1485 predios).</w:t>
+        <w:t xml:space="preserve"> promedio (en 1486 predios).</w:t>
       </w:r>
     </w:p>
     <w:p>
@@ -8549,7 +8549,7 @@
         </w:numPr>
         <w:spacing w:before="100" w:beforeAutospacing="1" w:after="90"/>
         <w:ind w:left="1020"/>
-        <w:divId w:val="1629779195"/>
+        <w:divId w:val="326174437"/>
         <w:rPr>
           <w:rFonts w:ascii="Plus Jakarta Sans" w:eastAsia="Times New Roman" w:hAnsi="Plus Jakarta Sans"/>
           <w:sz w:val="21"/>
@@ -8594,7 +8594,7 @@
         </w:numPr>
         <w:spacing w:before="100" w:beforeAutospacing="1" w:after="90"/>
         <w:ind w:left="1020"/>
-        <w:divId w:val="1629779195"/>
+        <w:divId w:val="326174437"/>
         <w:rPr>
           <w:rFonts w:ascii="Plus Jakarta Sans" w:eastAsia="Times New Roman" w:hAnsi="Plus Jakarta Sans"/>
           <w:sz w:val="21"/>
@@ -8619,7 +8619,7 @@
           <w:szCs w:val="21"/>
           <w:lang w:val="es-ES"/>
         </w:rPr>
-        <w:t>83.6%</w:t>
+        <w:t>84.0%</w:t>
       </w:r>
       <w:r>
         <w:rPr>
@@ -8628,7 +8628,7 @@
           <w:szCs w:val="21"/>
           <w:lang w:val="es-ES"/>
         </w:rPr>
-        <w:t xml:space="preserve"> promedio (en 578 predios).</w:t>
+        <w:t xml:space="preserve"> promedio (en 593 predios).</w:t>
       </w:r>
     </w:p>
     <w:p>
@@ -8639,7 +8639,7 @@
         </w:numPr>
         <w:spacing w:before="100" w:beforeAutospacing="1" w:after="90"/>
         <w:ind w:left="1020"/>
-        <w:divId w:val="1629779195"/>
+        <w:divId w:val="326174437"/>
         <w:rPr>
           <w:rFonts w:ascii="Plus Jakarta Sans" w:eastAsia="Times New Roman" w:hAnsi="Plus Jakarta Sans"/>
           <w:sz w:val="21"/>
@@ -8675,7 +8675,7 @@
         </w:numPr>
         <w:spacing w:before="100" w:beforeAutospacing="1" w:after="90"/>
         <w:ind w:left="1020"/>
-        <w:divId w:val="1629779195"/>
+        <w:divId w:val="326174437"/>
         <w:rPr>
           <w:rFonts w:ascii="Plus Jakarta Sans" w:eastAsia="Times New Roman" w:hAnsi="Plus Jakarta Sans"/>
           <w:sz w:val="21"/>
@@ -8729,7 +8729,7 @@
         </w:numPr>
         <w:spacing w:before="100" w:beforeAutospacing="1" w:after="90"/>
         <w:ind w:left="1020"/>
-        <w:divId w:val="1629779195"/>
+        <w:divId w:val="326174437"/>
         <w:rPr>
           <w:rFonts w:ascii="Plus Jakarta Sans" w:eastAsia="Times New Roman" w:hAnsi="Plus Jakarta Sans"/>
           <w:sz w:val="21"/>
@@ -8774,7 +8774,7 @@
         </w:numPr>
         <w:spacing w:before="100" w:beforeAutospacing="1" w:after="90"/>
         <w:ind w:left="1020"/>
-        <w:divId w:val="1629779195"/>
+        <w:divId w:val="326174437"/>
         <w:rPr>
           <w:rFonts w:ascii="Plus Jakarta Sans" w:eastAsia="Times New Roman" w:hAnsi="Plus Jakarta Sans"/>
           <w:sz w:val="21"/>
@@ -8814,7 +8814,7 @@
     <w:p>
       <w:pPr>
         <w:pStyle w:val="Ttulo3"/>
-        <w:divId w:val="1629779195"/>
+        <w:divId w:val="326174437"/>
         <w:rPr>
           <w:rFonts w:eastAsia="Times New Roman"/>
           <w:lang w:val="es-ES"/>
@@ -8832,7 +8832,7 @@
       <w:pPr>
         <w:spacing w:before="375" w:after="225"/>
         <w:jc w:val="center"/>
-        <w:divId w:val="1403406647"/>
+        <w:divId w:val="1603491878"/>
         <w:rPr>
           <w:rFonts w:ascii="Outfit" w:eastAsia="Times New Roman" w:hAnsi="Outfit"/>
           <w:b/>
@@ -8862,7 +8862,7 @@
       <w:pPr>
         <w:spacing w:after="375"/>
         <w:jc w:val="center"/>
-        <w:divId w:val="1587349200"/>
+        <w:divId w:val="1389888122"/>
         <w:rPr>
           <w:rFonts w:ascii="Plus Jakarta Sans" w:eastAsia="Times New Roman" w:hAnsi="Plus Jakarta Sans"/>
           <w:lang w:val="es-ES"/>
@@ -9152,18 +9152,18 @@
     <w:p>
       <w:pPr>
         <w:spacing w:before="450" w:after="450"/>
-        <w:divId w:val="1629779195"/>
-        <w:rPr>
-          <w:rFonts w:ascii="Plus Jakarta Sans" w:eastAsia="Times New Roman" w:hAnsi="Plus Jakarta Sans"/>
-          <w:lang w:val="es-ES"/>
-        </w:rPr>
-      </w:pPr>
-      <w:r>
-        <w:rPr>
-          <w:rFonts w:ascii="Plus Jakarta Sans" w:eastAsia="Times New Roman" w:hAnsi="Plus Jakarta Sans"/>
-          <w:lang w:val="es-ES"/>
-        </w:rPr>
-        <w:pict>
+        <w:divId w:val="326174437"/>
+        <w:rPr>
+          <w:rFonts w:ascii="Plus Jakarta Sans" w:eastAsia="Times New Roman" w:hAnsi="Plus Jakarta Sans"/>
+          <w:lang w:val="es-ES"/>
+        </w:rPr>
+      </w:pPr>
+      <w:r>
+        <w:rPr>
+          <w:rFonts w:ascii="Plus Jakarta Sans" w:eastAsia="Times New Roman" w:hAnsi="Plus Jakarta Sans"/>
+          <w:lang w:val="es-ES"/>
+        </w:rPr>
+        <w:pict w14:anchorId="4D05CA4F">
           <v:rect id="_x0000_i1033" style="width:0;height:.75pt" o:hralign="center" o:hrstd="t" o:hr="t" fillcolor="#a0a0a0" stroked="f"/>
         </w:pict>
       </w:r>
@@ -9171,7 +9171,7 @@
     <w:p>
       <w:pPr>
         <w:pStyle w:val="Ttulo2"/>
-        <w:divId w:val="1629779195"/>
+        <w:divId w:val="326174437"/>
         <w:rPr>
           <w:rFonts w:eastAsia="Times New Roman"/>
           <w:lang w:val="es-ES"/>
@@ -9188,7 +9188,7 @@
     <w:p>
       <w:pPr>
         <w:pStyle w:val="NormalWeb"/>
-        <w:divId w:val="1629779195"/>
+        <w:divId w:val="326174437"/>
         <w:rPr>
           <w:rFonts w:ascii="Plus Jakarta Sans" w:hAnsi="Plus Jakarta Sans"/>
           <w:lang w:val="es-ES"/>
@@ -9205,7 +9205,7 @@
     <w:p>
       <w:pPr>
         <w:pStyle w:val="NormalWeb"/>
-        <w:divId w:val="1629779195"/>
+        <w:divId w:val="326174437"/>
         <w:rPr>
           <w:rFonts w:ascii="Plus Jakarta Sans" w:hAnsi="Plus Jakarta Sans"/>
           <w:lang w:val="es-ES"/>
@@ -9267,7 +9267,7 @@
     <w:p>
       <w:pPr>
         <w:pStyle w:val="NormalWeb"/>
-        <w:divId w:val="1629779195"/>
+        <w:divId w:val="326174437"/>
         <w:rPr>
           <w:rFonts w:ascii="Plus Jakarta Sans" w:hAnsi="Plus Jakarta Sans"/>
           <w:lang w:val="es-ES"/>
@@ -9329,7 +9329,7 @@
     <w:p>
       <w:pPr>
         <w:pStyle w:val="NormalWeb"/>
-        <w:divId w:val="1629779195"/>
+        <w:divId w:val="326174437"/>
         <w:rPr>
           <w:rFonts w:ascii="Plus Jakarta Sans" w:hAnsi="Plus Jakarta Sans"/>
           <w:lang w:val="es-ES"/>
@@ -9390,7 +9390,7 @@
     <w:p>
       <w:pPr>
         <w:pStyle w:val="NormalWeb"/>
-        <w:divId w:val="1629779195"/>
+        <w:divId w:val="326174437"/>
         <w:rPr>
           <w:rFonts w:ascii="Plus Jakarta Sans" w:hAnsi="Plus Jakarta Sans"/>
           <w:lang w:val="es-ES"/>
@@ -9444,18 +9444,18 @@
     <w:p>
       <w:pPr>
         <w:spacing w:before="450" w:after="450"/>
-        <w:divId w:val="1629779195"/>
-        <w:rPr>
-          <w:rFonts w:ascii="Plus Jakarta Sans" w:eastAsia="Times New Roman" w:hAnsi="Plus Jakarta Sans"/>
-          <w:lang w:val="es-ES"/>
-        </w:rPr>
-      </w:pPr>
-      <w:r>
-        <w:rPr>
-          <w:rFonts w:ascii="Plus Jakarta Sans" w:eastAsia="Times New Roman" w:hAnsi="Plus Jakarta Sans"/>
-          <w:lang w:val="es-ES"/>
-        </w:rPr>
-        <w:pict>
+        <w:divId w:val="326174437"/>
+        <w:rPr>
+          <w:rFonts w:ascii="Plus Jakarta Sans" w:eastAsia="Times New Roman" w:hAnsi="Plus Jakarta Sans"/>
+          <w:lang w:val="es-ES"/>
+        </w:rPr>
+      </w:pPr>
+      <w:r>
+        <w:rPr>
+          <w:rFonts w:ascii="Plus Jakarta Sans" w:eastAsia="Times New Roman" w:hAnsi="Plus Jakarta Sans"/>
+          <w:lang w:val="es-ES"/>
+        </w:rPr>
+        <w:pict w14:anchorId="722F1648">
           <v:rect id="_x0000_i1034" style="width:0;height:.75pt" o:hralign="center" o:hrstd="t" o:hr="t" fillcolor="#a0a0a0" stroked="f"/>
         </w:pict>
       </w:r>
@@ -9463,18 +9463,18 @@
     <w:p>
       <w:pPr>
         <w:spacing w:before="450" w:after="450"/>
-        <w:divId w:val="1629779195"/>
-        <w:rPr>
-          <w:rFonts w:ascii="Plus Jakarta Sans" w:eastAsia="Times New Roman" w:hAnsi="Plus Jakarta Sans"/>
-          <w:lang w:val="es-ES"/>
-        </w:rPr>
-      </w:pPr>
-      <w:r>
-        <w:rPr>
-          <w:rFonts w:ascii="Plus Jakarta Sans" w:eastAsia="Times New Roman" w:hAnsi="Plus Jakarta Sans"/>
-          <w:lang w:val="es-ES"/>
-        </w:rPr>
-        <w:pict>
+        <w:divId w:val="326174437"/>
+        <w:rPr>
+          <w:rFonts w:ascii="Plus Jakarta Sans" w:eastAsia="Times New Roman" w:hAnsi="Plus Jakarta Sans"/>
+          <w:lang w:val="es-ES"/>
+        </w:rPr>
+      </w:pPr>
+      <w:r>
+        <w:rPr>
+          <w:rFonts w:ascii="Plus Jakarta Sans" w:eastAsia="Times New Roman" w:hAnsi="Plus Jakarta Sans"/>
+          <w:lang w:val="es-ES"/>
+        </w:rPr>
+        <w:pict w14:anchorId="1376C357">
           <v:rect id="_x0000_i1035" style="width:0;height:.75pt" o:hralign="center" o:hrstd="t" o:hr="t" fillcolor="#a0a0a0" stroked="f"/>
         </w:pict>
       </w:r>
@@ -9482,7 +9482,7 @@
     <w:p>
       <w:pPr>
         <w:pStyle w:val="NormalWeb"/>
-        <w:divId w:val="1629779195"/>
+        <w:divId w:val="326174437"/>
         <w:rPr>
           <w:rFonts w:ascii="Plus Jakarta Sans" w:hAnsi="Plus Jakarta Sans"/>
           <w:lang w:val="es-ES"/>
@@ -9515,7 +9515,7 @@
           <w:rFonts w:ascii="Plus Jakarta Sans" w:hAnsi="Plus Jakarta Sans"/>
           <w:lang w:val="es-ES"/>
         </w:rPr>
-        <w:pict/>
+        <w:pict w14:anchorId="4E30ABC2"/>
       </w:r>
     </w:p>
     <w:sectPr>
@@ -9531,9 +9531,9 @@
 <file path=word/numbering.xml><?xml version="1.0" encoding="utf-8"?>
 <w:numbering xmlns:wpc="http://schemas.microsoft.com/office/word/2010/wordprocessingCanvas" xmlns:cx="http://schemas.microsoft.com/office/drawing/2014/chartex" xmlns:cx1="http://schemas.microsoft.com/office/drawing/2015/9/8/chartex" xmlns:cx2="http://schemas.microsoft.com/office/drawing/2015/10/21/chartex" xmlns:cx3="http://schemas.microsoft.com/office/drawing/2016/5/9/chartex" xmlns:cx4="http://schemas.microsoft.com/office/drawing/2016/5/10/chartex" xmlns:cx5="http://schemas.microsoft.com/office/drawing/2016/5/11/chartex" xmlns:cx6="http://schemas.microsoft.com/office/drawing/2016/5/12/chartex" xmlns:cx7="http://schemas.microsoft.com/office/drawing/2016/5/13/chartex" xmlns:cx8="http://schemas.microsoft.com/office/drawing/2016/5/14/chartex" xmlns:mc="http://schemas.openxmlformats.org/markup-compatibility/2006" xmlns:aink="http://schemas.microsoft.com/office/drawing/2016/ink" xmlns:am3d="http://schemas.microsoft.com/office/drawing/2017/model3d" xmlns:o="urn:schemas-microsoft-com:office:office" xmlns:r="http://schemas.openxmlformats.org/officeDocument/2006/relationships" xmlns:m="http://schemas.openxmlformats.org/officeDocument/2006/math" xmlns:v="urn:schemas-microsoft-com:vml" xmlns:wp14="http://schemas.microsoft.com/office/word/2010/wordprocessingDrawing" xmlns:wp="http://schemas.openxmlformats.org/drawingml/2006/wordprocessingDrawing" xmlns:w10="urn:schemas-microsoft-com:office:word" xmlns:w="http://schemas.openxmlformats.org/wordprocessingml/2006/main" xmlns:w14="http://schemas.microsoft.com/office/word/2010/wordml" xmlns:w15="http://schemas.microsoft.com/office/word/2012/wordml" xmlns:w16cex="http://schemas.microsoft.com/office/word/2018/wordml/cex" xmlns:w16cid="http://schemas.microsoft.com/office/word/2016/wordml/cid" xmlns:w16="http://schemas.microsoft.com/office/word/2018/wordml" xmlns:w16sdtdh="http://schemas.microsoft.com/office/word/2020/wordml/sdtdatahash" xmlns:w16se="http://schemas.microsoft.com/office/word/2015/wordml/symex" xmlns:wpg="http://schemas.microsoft.com/office/word/2010/wordprocessingGroup" xmlns:wpi="http://schemas.microsoft.com/office/word/2010/wordprocessingInk" xmlns:wne="http://schemas.microsoft.com/office/word/2006/wordml" xmlns:wps="http://schemas.microsoft.com/office/word/2010/wordprocessingShape" mc:Ignorable="w14 w15 w16se w16cid w16 w16cex w16sdtdh wp14">
   <w:abstractNum w:abstractNumId="0" w15:restartNumberingAfterBreak="0">
-    <w:nsid w:val="12660DCB"/>
+    <w:nsid w:val="0CD164EC"/>
     <w:multiLevelType w:val="multilevel"/>
-    <w:tmpl w:val="CBD2B070"/>
+    <w:tmpl w:val="E1D8B87A"/>
     <w:lvl w:ilvl="0">
       <w:start w:val="1"/>
       <w:numFmt w:val="bullet"/>
@@ -9680,9 +9680,9 @@
     </w:lvl>
   </w:abstractNum>
   <w:abstractNum w:abstractNumId="1" w15:restartNumberingAfterBreak="0">
-    <w:nsid w:val="25777695"/>
+    <w:nsid w:val="15FC0739"/>
     <w:multiLevelType w:val="multilevel"/>
-    <w:tmpl w:val="1F58DA74"/>
+    <w:tmpl w:val="72E8B722"/>
     <w:lvl w:ilvl="0">
       <w:start w:val="1"/>
       <w:numFmt w:val="bullet"/>
@@ -9829,9 +9829,9 @@
     </w:lvl>
   </w:abstractNum>
   <w:abstractNum w:abstractNumId="2" w15:restartNumberingAfterBreak="0">
-    <w:nsid w:val="36466786"/>
+    <w:nsid w:val="2598660F"/>
     <w:multiLevelType w:val="multilevel"/>
-    <w:tmpl w:val="B424439A"/>
+    <w:tmpl w:val="56A8E986"/>
     <w:lvl w:ilvl="0">
       <w:start w:val="1"/>
       <w:numFmt w:val="bullet"/>
@@ -9978,9 +9978,9 @@
     </w:lvl>
   </w:abstractNum>
   <w:abstractNum w:abstractNumId="3" w15:restartNumberingAfterBreak="0">
-    <w:nsid w:val="3D436EFB"/>
+    <w:nsid w:val="5D8F1415"/>
     <w:multiLevelType w:val="multilevel"/>
-    <w:tmpl w:val="B746956A"/>
+    <w:tmpl w:val="37843568"/>
     <w:lvl w:ilvl="0">
       <w:start w:val="1"/>
       <w:numFmt w:val="bullet"/>
@@ -10127,16 +10127,16 @@
     </w:lvl>
   </w:abstractNum>
   <w:num w:numId="1">
-    <w:abstractNumId w:val="2"/>
+    <w:abstractNumId w:val="3"/>
   </w:num>
   <w:num w:numId="2">
     <w:abstractNumId w:val="1"/>
   </w:num>
   <w:num w:numId="3">
-    <w:abstractNumId w:val="0"/>
+    <w:abstractNumId w:val="2"/>
   </w:num>
   <w:num w:numId="4">
-    <w:abstractNumId w:val="3"/>
+    <w:abstractNumId w:val="0"/>
   </w:num>
 </w:numbering>
 </file>

</xml_diff>

<commit_message>
data: sincronización desde QFieldCloud (4175 fichas)
</commit_message>
<xml_diff>
--- a/public/informe_reunion_tecnica.docx
+++ b/public/informe_reunion_tecnica.docx
@@ -4,7 +4,7 @@
   <w:body>
     <w:p>
       <w:pPr>
-        <w:divId w:val="398360032"/>
+        <w:divId w:val="265626128"/>
         <w:rPr>
           <w:rFonts w:ascii="Plus Jakarta Sans" w:eastAsia="Times New Roman" w:hAnsi="Plus Jakarta Sans"/>
           <w:lang w:val="es-ES"/>
@@ -28,7 +28,7 @@
     <w:p>
       <w:pPr>
         <w:pStyle w:val="Ttulo1"/>
-        <w:divId w:val="583682400"/>
+        <w:divId w:val="1014452338"/>
         <w:rPr>
           <w:rFonts w:eastAsia="Times New Roman"/>
           <w:lang w:val="es-ES"/>
@@ -45,7 +45,7 @@
     <w:p>
       <w:pPr>
         <w:pStyle w:val="NormalWeb"/>
-        <w:divId w:val="583682400"/>
+        <w:divId w:val="1014452338"/>
         <w:rPr>
           <w:rFonts w:ascii="Plus Jakarta Sans" w:hAnsi="Plus Jakarta Sans"/>
           <w:lang w:val="es-ES"/>
@@ -63,7 +63,7 @@
     <w:p>
       <w:pPr>
         <w:pStyle w:val="NormalWeb"/>
-        <w:divId w:val="583682400"/>
+        <w:divId w:val="1014452338"/>
         <w:rPr>
           <w:rFonts w:ascii="Plus Jakarta Sans" w:hAnsi="Plus Jakarta Sans"/>
           <w:lang w:val="es-ES"/>
@@ -102,7 +102,7 @@
     <w:p>
       <w:pPr>
         <w:spacing w:before="450" w:after="450"/>
-        <w:divId w:val="583682400"/>
+        <w:divId w:val="1014452338"/>
         <w:rPr>
           <w:rFonts w:ascii="Plus Jakarta Sans" w:eastAsia="Times New Roman" w:hAnsi="Plus Jakarta Sans"/>
           <w:lang w:val="es-ES"/>
@@ -113,7 +113,7 @@
           <w:rFonts w:ascii="Plus Jakarta Sans" w:eastAsia="Times New Roman" w:hAnsi="Plus Jakarta Sans"/>
           <w:lang w:val="es-ES"/>
         </w:rPr>
-        <w:pict w14:anchorId="56D7F6FE">
+        <w:pict w14:anchorId="6524F9C9">
           <v:rect id="_x0000_i1025" style="width:0;height:.75pt" o:hralign="center" o:hrstd="t" o:hr="t" fillcolor="#a0a0a0" stroked="f"/>
         </w:pict>
       </w:r>
@@ -121,7 +121,7 @@
     <w:p>
       <w:pPr>
         <w:pStyle w:val="Ttulo2"/>
-        <w:divId w:val="583682400"/>
+        <w:divId w:val="1014452338"/>
         <w:rPr>
           <w:rFonts w:eastAsia="Times New Roman"/>
           <w:lang w:val="es-ES"/>
@@ -145,7 +145,7 @@
     <w:p>
       <w:pPr>
         <w:pStyle w:val="NormalWeb"/>
-        <w:divId w:val="583682400"/>
+        <w:divId w:val="1014452338"/>
         <w:rPr>
           <w:rFonts w:ascii="Plus Jakarta Sans" w:hAnsi="Plus Jakarta Sans"/>
           <w:lang w:val="es-ES"/>
@@ -167,7 +167,7 @@
         </w:numPr>
         <w:spacing w:before="100" w:beforeAutospacing="1" w:after="90"/>
         <w:ind w:left="1020"/>
-        <w:divId w:val="583682400"/>
+        <w:divId w:val="1014452338"/>
         <w:rPr>
           <w:rFonts w:ascii="Plus Jakarta Sans" w:eastAsia="Times New Roman" w:hAnsi="Plus Jakarta Sans"/>
           <w:sz w:val="21"/>
@@ -213,7 +213,7 @@
         </w:numPr>
         <w:spacing w:before="100" w:beforeAutospacing="1" w:after="90"/>
         <w:ind w:left="1020"/>
-        <w:divId w:val="583682400"/>
+        <w:divId w:val="1014452338"/>
         <w:rPr>
           <w:rFonts w:ascii="Plus Jakarta Sans" w:eastAsia="Times New Roman" w:hAnsi="Plus Jakarta Sans"/>
           <w:sz w:val="21"/>
@@ -269,7 +269,7 @@
         </w:numPr>
         <w:spacing w:before="100" w:beforeAutospacing="1" w:after="90"/>
         <w:ind w:left="1020"/>
-        <w:divId w:val="583682400"/>
+        <w:divId w:val="1014452338"/>
         <w:rPr>
           <w:rFonts w:ascii="Plus Jakarta Sans" w:eastAsia="Times New Roman" w:hAnsi="Plus Jakarta Sans"/>
           <w:sz w:val="21"/>
@@ -315,7 +315,7 @@
         </w:numPr>
         <w:spacing w:before="100" w:beforeAutospacing="1" w:after="90"/>
         <w:ind w:left="1020"/>
-        <w:divId w:val="583682400"/>
+        <w:divId w:val="1014452338"/>
         <w:rPr>
           <w:rFonts w:ascii="Plus Jakarta Sans" w:eastAsia="Times New Roman" w:hAnsi="Plus Jakarta Sans"/>
           <w:sz w:val="21"/>
@@ -356,7 +356,7 @@
     <w:p>
       <w:pPr>
         <w:spacing w:before="450" w:after="450"/>
-        <w:divId w:val="583682400"/>
+        <w:divId w:val="1014452338"/>
         <w:rPr>
           <w:rFonts w:ascii="Plus Jakarta Sans" w:eastAsia="Times New Roman" w:hAnsi="Plus Jakarta Sans"/>
           <w:lang w:val="es-ES"/>
@@ -367,7 +367,7 @@
           <w:rFonts w:ascii="Plus Jakarta Sans" w:eastAsia="Times New Roman" w:hAnsi="Plus Jakarta Sans"/>
           <w:lang w:val="es-ES"/>
         </w:rPr>
-        <w:pict w14:anchorId="362B626A">
+        <w:pict w14:anchorId="568F90C6">
           <v:rect id="_x0000_i1026" style="width:0;height:.75pt" o:hralign="center" o:hrstd="t" o:hr="t" fillcolor="#a0a0a0" stroked="f"/>
         </w:pict>
       </w:r>
@@ -375,7 +375,7 @@
     <w:p>
       <w:pPr>
         <w:pStyle w:val="Ttulo2"/>
-        <w:divId w:val="583682400"/>
+        <w:divId w:val="1014452338"/>
         <w:rPr>
           <w:rFonts w:eastAsia="Times New Roman"/>
           <w:lang w:val="es-ES"/>
@@ -392,7 +392,7 @@
     <w:p>
       <w:pPr>
         <w:pStyle w:val="NormalWeb"/>
-        <w:divId w:val="583682400"/>
+        <w:divId w:val="1014452338"/>
         <w:rPr>
           <w:rFonts w:ascii="Plus Jakarta Sans" w:hAnsi="Plus Jakarta Sans"/>
           <w:lang w:val="es-ES"/>
@@ -445,7 +445,7 @@
       </w:tblGrid>
       <w:tr>
         <w:trPr>
-          <w:divId w:val="2130123858"/>
+          <w:divId w:val="1471554610"/>
           <w:tblHeader/>
         </w:trPr>
         <w:tc>
@@ -525,7 +525,7 @@
       </w:tr>
       <w:tr>
         <w:trPr>
-          <w:divId w:val="2130123858"/>
+          <w:divId w:val="1471554610"/>
         </w:trPr>
         <w:tc>
           <w:tcPr>
@@ -591,7 +591,7 @@
       </w:tr>
       <w:tr>
         <w:trPr>
-          <w:divId w:val="2130123858"/>
+          <w:divId w:val="1471554610"/>
         </w:trPr>
         <w:tc>
           <w:tcPr>
@@ -657,7 +657,7 @@
       </w:tr>
       <w:tr>
         <w:trPr>
-          <w:divId w:val="2130123858"/>
+          <w:divId w:val="1471554610"/>
         </w:trPr>
         <w:tc>
           <w:tcPr>
@@ -723,7 +723,7 @@
       </w:tr>
       <w:tr>
         <w:trPr>
-          <w:divId w:val="2130123858"/>
+          <w:divId w:val="1471554610"/>
         </w:trPr>
         <w:tc>
           <w:tcPr>
@@ -791,7 +791,7 @@
     <w:p>
       <w:pPr>
         <w:spacing w:before="450" w:after="450"/>
-        <w:divId w:val="583682400"/>
+        <w:divId w:val="1014452338"/>
         <w:rPr>
           <w:rFonts w:ascii="Plus Jakarta Sans" w:eastAsia="Times New Roman" w:hAnsi="Plus Jakarta Sans"/>
           <w:lang w:val="es-ES"/>
@@ -803,7 +803,7 @@
           <w:lang w:val="es-ES"/>
         </w:rPr>
         <w:lastRenderedPageBreak/>
-        <w:pict w14:anchorId="396B44D0">
+        <w:pict w14:anchorId="5CB1E654">
           <v:rect id="_x0000_i1027" style="width:0;height:.75pt" o:hralign="center" o:hrstd="t" o:hr="t" fillcolor="#a0a0a0" stroked="f"/>
         </w:pict>
       </w:r>
@@ -811,7 +811,7 @@
     <w:p>
       <w:pPr>
         <w:pStyle w:val="Ttulo2"/>
-        <w:divId w:val="583682400"/>
+        <w:divId w:val="1014452338"/>
         <w:rPr>
           <w:rFonts w:eastAsia="Times New Roman"/>
           <w:lang w:val="es-ES"/>
@@ -828,7 +828,7 @@
     <w:p>
       <w:pPr>
         <w:pStyle w:val="Ttulo3"/>
-        <w:divId w:val="583682400"/>
+        <w:divId w:val="1014452338"/>
         <w:rPr>
           <w:rFonts w:eastAsia="Times New Roman"/>
           <w:lang w:val="es-ES"/>
@@ -845,7 +845,7 @@
     <w:p>
       <w:pPr>
         <w:pStyle w:val="NormalWeb"/>
-        <w:divId w:val="583682400"/>
+        <w:divId w:val="1014452338"/>
         <w:rPr>
           <w:rFonts w:ascii="Plus Jakarta Sans" w:hAnsi="Plus Jakarta Sans"/>
           <w:lang w:val="es-ES"/>
@@ -885,7 +885,7 @@
       </w:tblGrid>
       <w:tr>
         <w:trPr>
-          <w:divId w:val="781607005"/>
+          <w:divId w:val="512571602"/>
           <w:tblHeader/>
         </w:trPr>
         <w:tc>
@@ -1039,7 +1039,7 @@
       </w:tr>
       <w:tr>
         <w:trPr>
-          <w:divId w:val="781607005"/>
+          <w:divId w:val="512571602"/>
         </w:trPr>
         <w:tc>
           <w:tcPr>
@@ -1165,7 +1165,7 @@
       </w:tr>
       <w:tr>
         <w:trPr>
-          <w:divId w:val="781607005"/>
+          <w:divId w:val="512571602"/>
         </w:trPr>
         <w:tc>
           <w:tcPr>
@@ -1291,7 +1291,7 @@
       </w:tr>
       <w:tr>
         <w:trPr>
-          <w:divId w:val="781607005"/>
+          <w:divId w:val="512571602"/>
         </w:trPr>
         <w:tc>
           <w:tcPr>
@@ -1417,7 +1417,7 @@
       </w:tr>
       <w:tr>
         <w:trPr>
-          <w:divId w:val="781607005"/>
+          <w:divId w:val="512571602"/>
         </w:trPr>
         <w:tc>
           <w:tcPr>
@@ -1543,7 +1543,7 @@
       </w:tr>
       <w:tr>
         <w:trPr>
-          <w:divId w:val="781607005"/>
+          <w:divId w:val="512571602"/>
         </w:trPr>
         <w:tc>
           <w:tcPr>
@@ -1677,7 +1677,7 @@
       </w:tr>
       <w:tr>
         <w:trPr>
-          <w:divId w:val="781607005"/>
+          <w:divId w:val="512571602"/>
         </w:trPr>
         <w:tc>
           <w:tcPr>
@@ -1803,7 +1803,7 @@
       </w:tr>
       <w:tr>
         <w:trPr>
-          <w:divId w:val="781607005"/>
+          <w:divId w:val="512571602"/>
         </w:trPr>
         <w:tc>
           <w:tcPr>
@@ -1929,7 +1929,7 @@
       </w:tr>
       <w:tr>
         <w:trPr>
-          <w:divId w:val="781607005"/>
+          <w:divId w:val="512571602"/>
         </w:trPr>
         <w:tc>
           <w:tcPr>
@@ -2057,7 +2057,7 @@
     <w:p>
       <w:pPr>
         <w:pStyle w:val="Ttulo3"/>
-        <w:divId w:val="583682400"/>
+        <w:divId w:val="1014452338"/>
         <w:rPr>
           <w:rFonts w:eastAsia="Times New Roman"/>
           <w:lang w:val="es-ES"/>
@@ -2074,7 +2074,7 @@
     <w:p>
       <w:pPr>
         <w:pStyle w:val="NormalWeb"/>
-        <w:divId w:val="583682400"/>
+        <w:divId w:val="1014452338"/>
         <w:rPr>
           <w:rFonts w:ascii="Plus Jakarta Sans" w:hAnsi="Plus Jakarta Sans"/>
           <w:lang w:val="es-ES"/>
@@ -2103,7 +2103,7 @@
         </w:numPr>
         <w:spacing w:before="100" w:beforeAutospacing="1" w:after="90"/>
         <w:ind w:left="1020"/>
-        <w:divId w:val="583682400"/>
+        <w:divId w:val="1014452338"/>
         <w:rPr>
           <w:rFonts w:ascii="Plus Jakarta Sans" w:eastAsia="Times New Roman" w:hAnsi="Plus Jakarta Sans"/>
           <w:sz w:val="21"/>
@@ -2205,7 +2205,7 @@
         </w:numPr>
         <w:spacing w:before="100" w:beforeAutospacing="1" w:after="90"/>
         <w:ind w:left="1020"/>
-        <w:divId w:val="583682400"/>
+        <w:divId w:val="1014452338"/>
         <w:rPr>
           <w:rFonts w:ascii="Plus Jakarta Sans" w:eastAsia="Times New Roman" w:hAnsi="Plus Jakarta Sans"/>
           <w:sz w:val="21"/>
@@ -2317,7 +2317,7 @@
         </w:numPr>
         <w:spacing w:before="100" w:beforeAutospacing="1" w:after="90"/>
         <w:ind w:left="1020"/>
-        <w:divId w:val="583682400"/>
+        <w:divId w:val="1014452338"/>
         <w:rPr>
           <w:rFonts w:ascii="Plus Jakarta Sans" w:eastAsia="Times New Roman" w:hAnsi="Plus Jakarta Sans"/>
           <w:sz w:val="21"/>
@@ -2423,7 +2423,7 @@
     <w:p>
       <w:pPr>
         <w:pStyle w:val="Ttulo3"/>
-        <w:divId w:val="583682400"/>
+        <w:divId w:val="1014452338"/>
         <w:rPr>
           <w:rFonts w:eastAsia="Times New Roman"/>
           <w:lang w:val="es-ES"/>
@@ -2439,9 +2439,8 @@
     </w:p>
     <w:p>
       <w:pPr>
-        <w:spacing w:before="375" w:after="225"/>
         <w:jc w:val="center"/>
-        <w:divId w:val="1608198665"/>
+        <w:divId w:val="550968710"/>
         <w:rPr>
           <w:rFonts w:ascii="Outfit" w:eastAsia="Times New Roman" w:hAnsi="Outfit"/>
           <w:b/>
@@ -2469,9 +2468,8 @@
     </w:p>
     <w:p>
       <w:pPr>
-        <w:spacing w:after="375"/>
         <w:jc w:val="center"/>
-        <w:divId w:val="625233100"/>
+        <w:divId w:val="1084381938"/>
         <w:rPr>
           <w:rFonts w:ascii="Plus Jakarta Sans" w:eastAsia="Times New Roman" w:hAnsi="Plus Jakarta Sans"/>
           <w:lang w:val="es-ES"/>
@@ -2866,7 +2864,7 @@
     <w:p>
       <w:pPr>
         <w:spacing w:before="450" w:after="450"/>
-        <w:divId w:val="583682400"/>
+        <w:divId w:val="1014452338"/>
         <w:rPr>
           <w:rFonts w:ascii="Plus Jakarta Sans" w:eastAsia="Times New Roman" w:hAnsi="Plus Jakarta Sans"/>
           <w:lang w:val="es-ES"/>
@@ -2877,7 +2875,7 @@
           <w:rFonts w:ascii="Plus Jakarta Sans" w:eastAsia="Times New Roman" w:hAnsi="Plus Jakarta Sans"/>
           <w:lang w:val="es-ES"/>
         </w:rPr>
-        <w:pict w14:anchorId="633BC444">
+        <w:pict w14:anchorId="2FDDFBA9">
           <v:rect id="_x0000_i1028" style="width:0;height:.75pt" o:hralign="center" o:hrstd="t" o:hr="t" fillcolor="#a0a0a0" stroked="f"/>
         </w:pict>
       </w:r>
@@ -2885,7 +2883,7 @@
     <w:p>
       <w:pPr>
         <w:pStyle w:val="Ttulo3"/>
-        <w:divId w:val="583682400"/>
+        <w:divId w:val="1014452338"/>
         <w:rPr>
           <w:rFonts w:eastAsia="Times New Roman"/>
           <w:lang w:val="es-ES"/>
@@ -2902,7 +2900,7 @@
     <w:p>
       <w:pPr>
         <w:pStyle w:val="NormalWeb"/>
-        <w:divId w:val="583682400"/>
+        <w:divId w:val="1014452338"/>
         <w:rPr>
           <w:rFonts w:ascii="Plus Jakarta Sans" w:hAnsi="Plus Jakarta Sans"/>
           <w:lang w:val="es-ES"/>
@@ -2935,7 +2933,7 @@
       </w:tblGrid>
       <w:tr>
         <w:trPr>
-          <w:divId w:val="1957445735"/>
+          <w:divId w:val="1407876089"/>
           <w:tblHeader/>
         </w:trPr>
         <w:tc>
@@ -3089,7 +3087,7 @@
       </w:tr>
       <w:tr>
         <w:trPr>
-          <w:divId w:val="1957445735"/>
+          <w:divId w:val="1407876089"/>
         </w:trPr>
         <w:tc>
           <w:tcPr>
@@ -3223,7 +3221,7 @@
       </w:tr>
       <w:tr>
         <w:trPr>
-          <w:divId w:val="1957445735"/>
+          <w:divId w:val="1407876089"/>
         </w:trPr>
         <w:tc>
           <w:tcPr>
@@ -3357,7 +3355,7 @@
       </w:tr>
       <w:tr>
         <w:trPr>
-          <w:divId w:val="1957445735"/>
+          <w:divId w:val="1407876089"/>
         </w:trPr>
         <w:tc>
           <w:tcPr>
@@ -3491,7 +3489,7 @@
       </w:tr>
       <w:tr>
         <w:trPr>
-          <w:divId w:val="1957445735"/>
+          <w:divId w:val="1407876089"/>
         </w:trPr>
         <w:tc>
           <w:tcPr>
@@ -3625,7 +3623,7 @@
       </w:tr>
       <w:tr>
         <w:trPr>
-          <w:divId w:val="1957445735"/>
+          <w:divId w:val="1407876089"/>
         </w:trPr>
         <w:tc>
           <w:tcPr>
@@ -3759,7 +3757,7 @@
       </w:tr>
       <w:tr>
         <w:trPr>
-          <w:divId w:val="1957445735"/>
+          <w:divId w:val="1407876089"/>
         </w:trPr>
         <w:tc>
           <w:tcPr>
@@ -3895,7 +3893,7 @@
     <w:p>
       <w:pPr>
         <w:pStyle w:val="Ttulo3"/>
-        <w:divId w:val="583682400"/>
+        <w:divId w:val="1014452338"/>
         <w:rPr>
           <w:rFonts w:eastAsia="Times New Roman"/>
           <w:lang w:val="es-ES"/>
@@ -3911,9 +3909,8 @@
     </w:p>
     <w:p>
       <w:pPr>
-        <w:spacing w:before="375" w:after="225"/>
         <w:jc w:val="center"/>
-        <w:divId w:val="1236430638"/>
+        <w:divId w:val="796878062"/>
         <w:rPr>
           <w:rFonts w:ascii="Outfit" w:eastAsia="Times New Roman" w:hAnsi="Outfit"/>
           <w:b/>
@@ -3941,9 +3938,8 @@
     </w:p>
     <w:p>
       <w:pPr>
-        <w:spacing w:after="375"/>
         <w:jc w:val="center"/>
-        <w:divId w:val="1587566553"/>
+        <w:divId w:val="741637931"/>
         <w:rPr>
           <w:rFonts w:ascii="Plus Jakarta Sans" w:eastAsia="Times New Roman" w:hAnsi="Plus Jakarta Sans"/>
           <w:lang w:val="es-ES"/>
@@ -4317,7 +4313,7 @@
     <w:p>
       <w:pPr>
         <w:spacing w:before="450" w:after="450"/>
-        <w:divId w:val="583682400"/>
+        <w:divId w:val="1014452338"/>
         <w:rPr>
           <w:rFonts w:ascii="Plus Jakarta Sans" w:eastAsia="Times New Roman" w:hAnsi="Plus Jakarta Sans"/>
           <w:lang w:val="es-ES"/>
@@ -4328,7 +4324,8 @@
           <w:rFonts w:ascii="Plus Jakarta Sans" w:eastAsia="Times New Roman" w:hAnsi="Plus Jakarta Sans"/>
           <w:lang w:val="es-ES"/>
         </w:rPr>
-        <w:pict w14:anchorId="06E54357">
+        <w:lastRenderedPageBreak/>
+        <w:pict w14:anchorId="720C3F62">
           <v:rect id="_x0000_i1029" style="width:0;height:.75pt" o:hralign="center" o:hrstd="t" o:hr="t" fillcolor="#a0a0a0" stroked="f"/>
         </w:pict>
       </w:r>
@@ -4336,7 +4333,7 @@
     <w:p>
       <w:pPr>
         <w:pStyle w:val="Ttulo3"/>
-        <w:divId w:val="583682400"/>
+        <w:divId w:val="1014452338"/>
         <w:rPr>
           <w:rFonts w:eastAsia="Times New Roman"/>
           <w:lang w:val="es-ES"/>
@@ -4353,7 +4350,7 @@
     <w:p>
       <w:pPr>
         <w:pStyle w:val="NormalWeb"/>
-        <w:divId w:val="583682400"/>
+        <w:divId w:val="1014452338"/>
         <w:rPr>
           <w:rFonts w:ascii="Plus Jakarta Sans" w:hAnsi="Plus Jakarta Sans"/>
           <w:lang w:val="es-ES"/>
@@ -4375,7 +4372,7 @@
         </w:numPr>
         <w:spacing w:before="100" w:beforeAutospacing="1" w:after="90"/>
         <w:ind w:left="1020"/>
-        <w:divId w:val="583682400"/>
+        <w:divId w:val="1014452338"/>
         <w:rPr>
           <w:rFonts w:ascii="Plus Jakarta Sans" w:eastAsia="Times New Roman" w:hAnsi="Plus Jakarta Sans"/>
           <w:sz w:val="21"/>
@@ -4411,7 +4408,7 @@
         </w:numPr>
         <w:spacing w:before="100" w:beforeAutospacing="1" w:after="90"/>
         <w:ind w:left="1020"/>
-        <w:divId w:val="583682400"/>
+        <w:divId w:val="1014452338"/>
         <w:rPr>
           <w:rFonts w:ascii="Plus Jakarta Sans" w:eastAsia="Times New Roman" w:hAnsi="Plus Jakarta Sans"/>
           <w:sz w:val="21"/>
@@ -4456,7 +4453,7 @@
         </w:numPr>
         <w:spacing w:before="100" w:beforeAutospacing="1" w:after="90"/>
         <w:ind w:left="1020"/>
-        <w:divId w:val="583682400"/>
+        <w:divId w:val="1014452338"/>
         <w:rPr>
           <w:rFonts w:ascii="Plus Jakarta Sans" w:eastAsia="Times New Roman" w:hAnsi="Plus Jakarta Sans"/>
           <w:sz w:val="21"/>
@@ -4501,7 +4498,7 @@
         </w:numPr>
         <w:spacing w:before="100" w:beforeAutospacing="1" w:after="90"/>
         <w:ind w:left="1020"/>
-        <w:divId w:val="583682400"/>
+        <w:divId w:val="1014452338"/>
         <w:rPr>
           <w:rFonts w:ascii="Plus Jakarta Sans" w:eastAsia="Times New Roman" w:hAnsi="Plus Jakarta Sans"/>
           <w:sz w:val="21"/>
@@ -4557,7 +4554,7 @@
       </w:tblGrid>
       <w:tr>
         <w:trPr>
-          <w:divId w:val="1528832002"/>
+          <w:divId w:val="901480012"/>
           <w:tblHeader/>
         </w:trPr>
         <w:tc>
@@ -4711,7 +4708,7 @@
       </w:tr>
       <w:tr>
         <w:trPr>
-          <w:divId w:val="1528832002"/>
+          <w:divId w:val="901480012"/>
         </w:trPr>
         <w:tc>
           <w:tcPr>
@@ -4837,7 +4834,7 @@
       </w:tr>
       <w:tr>
         <w:trPr>
-          <w:divId w:val="1528832002"/>
+          <w:divId w:val="901480012"/>
         </w:trPr>
         <w:tc>
           <w:tcPr>
@@ -4963,7 +4960,7 @@
       </w:tr>
       <w:tr>
         <w:trPr>
-          <w:divId w:val="1528832002"/>
+          <w:divId w:val="901480012"/>
         </w:trPr>
         <w:tc>
           <w:tcPr>
@@ -5089,7 +5086,7 @@
       </w:tr>
       <w:tr>
         <w:trPr>
-          <w:divId w:val="1528832002"/>
+          <w:divId w:val="901480012"/>
         </w:trPr>
         <w:tc>
           <w:tcPr>
@@ -5217,7 +5214,7 @@
     <w:p>
       <w:pPr>
         <w:spacing w:before="450" w:after="450"/>
-        <w:divId w:val="583682400"/>
+        <w:divId w:val="1014452338"/>
         <w:rPr>
           <w:rFonts w:ascii="Plus Jakarta Sans" w:eastAsia="Times New Roman" w:hAnsi="Plus Jakarta Sans"/>
           <w:lang w:val="es-ES"/>
@@ -5228,7 +5225,7 @@
           <w:rFonts w:ascii="Plus Jakarta Sans" w:eastAsia="Times New Roman" w:hAnsi="Plus Jakarta Sans"/>
           <w:lang w:val="es-ES"/>
         </w:rPr>
-        <w:pict w14:anchorId="245523E5">
+        <w:pict w14:anchorId="5AE88D42">
           <v:rect id="_x0000_i1030" style="width:0;height:.75pt" o:hralign="center" o:hrstd="t" o:hr="t" fillcolor="#a0a0a0" stroked="f"/>
         </w:pict>
       </w:r>
@@ -5236,7 +5233,7 @@
     <w:p>
       <w:pPr>
         <w:pStyle w:val="Ttulo3"/>
-        <w:divId w:val="583682400"/>
+        <w:divId w:val="1014452338"/>
         <w:rPr>
           <w:rFonts w:eastAsia="Times New Roman"/>
           <w:lang w:val="es-ES"/>
@@ -5253,7 +5250,7 @@
     <w:p>
       <w:pPr>
         <w:pStyle w:val="NormalWeb"/>
-        <w:divId w:val="583682400"/>
+        <w:divId w:val="1014452338"/>
         <w:rPr>
           <w:rFonts w:ascii="Plus Jakarta Sans" w:hAnsi="Plus Jakarta Sans"/>
           <w:lang w:val="es-ES"/>
@@ -5277,7 +5274,7 @@
     <w:p>
       <w:pPr>
         <w:pStyle w:val="Ttulo4"/>
-        <w:divId w:val="583682400"/>
+        <w:divId w:val="1014452338"/>
         <w:rPr>
           <w:rFonts w:eastAsia="Times New Roman"/>
           <w:lang w:val="es-ES"/>
@@ -5293,9 +5290,8 @@
     </w:p>
     <w:p>
       <w:pPr>
-        <w:spacing w:before="375" w:after="225"/>
         <w:jc w:val="center"/>
-        <w:divId w:val="162627553"/>
+        <w:divId w:val="1440368360"/>
         <w:rPr>
           <w:rFonts w:ascii="Outfit" w:eastAsia="Times New Roman" w:hAnsi="Outfit"/>
           <w:b/>
@@ -5323,9 +5319,8 @@
     </w:p>
     <w:p>
       <w:pPr>
-        <w:spacing w:after="375"/>
         <w:jc w:val="center"/>
-        <w:divId w:val="2041513318"/>
+        <w:divId w:val="1109861333"/>
         <w:rPr>
           <w:rFonts w:ascii="Plus Jakarta Sans" w:eastAsia="Times New Roman" w:hAnsi="Plus Jakarta Sans"/>
           <w:lang w:val="es-ES"/>
@@ -5608,7 +5603,7 @@
     <w:p>
       <w:pPr>
         <w:pStyle w:val="Ttulo4"/>
-        <w:divId w:val="583682400"/>
+        <w:divId w:val="1014452338"/>
         <w:rPr>
           <w:rFonts w:eastAsia="Times New Roman"/>
           <w:lang w:val="es-ES"/>
@@ -5631,9 +5626,8 @@
     </w:p>
     <w:p>
       <w:pPr>
-        <w:spacing w:before="375" w:after="225"/>
         <w:jc w:val="center"/>
-        <w:divId w:val="396633785"/>
+        <w:divId w:val="1081676663"/>
         <w:rPr>
           <w:rFonts w:ascii="Outfit" w:eastAsia="Times New Roman" w:hAnsi="Outfit"/>
           <w:b/>
@@ -5661,9 +5655,8 @@
     </w:p>
     <w:p>
       <w:pPr>
-        <w:spacing w:after="375"/>
         <w:jc w:val="center"/>
-        <w:divId w:val="566109720"/>
+        <w:divId w:val="1417435682"/>
         <w:rPr>
           <w:rFonts w:ascii="Plus Jakarta Sans" w:eastAsia="Times New Roman" w:hAnsi="Plus Jakarta Sans"/>
           <w:lang w:val="es-ES"/>
@@ -5981,7 +5974,7 @@
     <w:p>
       <w:pPr>
         <w:pStyle w:val="Ttulo4"/>
-        <w:divId w:val="583682400"/>
+        <w:divId w:val="1014452338"/>
         <w:rPr>
           <w:rFonts w:eastAsia="Times New Roman"/>
           <w:lang w:val="es-ES"/>
@@ -5992,14 +5985,14 @@
           <w:rFonts w:eastAsia="Times New Roman"/>
           <w:lang w:val="es-ES"/>
         </w:rPr>
+        <w:lastRenderedPageBreak/>
         <w:t>Destino de la Producción Agrícola por Sector:</w:t>
       </w:r>
     </w:p>
     <w:p>
       <w:pPr>
-        <w:spacing w:before="375" w:after="225"/>
         <w:jc w:val="center"/>
-        <w:divId w:val="2015300546"/>
+        <w:divId w:val="1919485121"/>
         <w:rPr>
           <w:rFonts w:ascii="Outfit" w:eastAsia="Times New Roman" w:hAnsi="Outfit"/>
           <w:b/>
@@ -6027,9 +6020,8 @@
     </w:p>
     <w:p>
       <w:pPr>
-        <w:spacing w:after="375"/>
         <w:jc w:val="center"/>
-        <w:divId w:val="429590123"/>
+        <w:divId w:val="1669864747"/>
         <w:rPr>
           <w:rFonts w:ascii="Plus Jakarta Sans" w:eastAsia="Times New Roman" w:hAnsi="Plus Jakarta Sans"/>
           <w:lang w:val="es-ES"/>
@@ -6333,7 +6325,7 @@
     <w:p>
       <w:pPr>
         <w:spacing w:before="450" w:after="450"/>
-        <w:divId w:val="583682400"/>
+        <w:divId w:val="1014452338"/>
         <w:rPr>
           <w:rFonts w:ascii="Plus Jakarta Sans" w:eastAsia="Times New Roman" w:hAnsi="Plus Jakarta Sans"/>
           <w:lang w:val="es-ES"/>
@@ -6344,7 +6336,7 @@
           <w:rFonts w:ascii="Plus Jakarta Sans" w:eastAsia="Times New Roman" w:hAnsi="Plus Jakarta Sans"/>
           <w:lang w:val="es-ES"/>
         </w:rPr>
-        <w:pict w14:anchorId="714EC003">
+        <w:pict w14:anchorId="26800428">
           <v:rect id="_x0000_i1031" style="width:0;height:.75pt" o:hralign="center" o:hrstd="t" o:hr="t" fillcolor="#a0a0a0" stroked="f"/>
         </w:pict>
       </w:r>
@@ -6352,7 +6344,7 @@
     <w:p>
       <w:pPr>
         <w:pStyle w:val="Ttulo3"/>
-        <w:divId w:val="583682400"/>
+        <w:divId w:val="1014452338"/>
         <w:rPr>
           <w:rFonts w:eastAsia="Times New Roman"/>
           <w:lang w:val="es-ES"/>
@@ -6369,7 +6361,7 @@
     <w:p>
       <w:pPr>
         <w:pStyle w:val="NormalWeb"/>
-        <w:divId w:val="583682400"/>
+        <w:divId w:val="1014452338"/>
         <w:rPr>
           <w:rFonts w:ascii="Plus Jakarta Sans" w:hAnsi="Plus Jakarta Sans"/>
           <w:lang w:val="es-ES"/>
@@ -6393,7 +6385,7 @@
     <w:p>
       <w:pPr>
         <w:pStyle w:val="Ttulo4"/>
-        <w:divId w:val="583682400"/>
+        <w:divId w:val="1014452338"/>
         <w:rPr>
           <w:rFonts w:eastAsia="Times New Roman"/>
           <w:lang w:val="es-ES"/>
@@ -6410,7 +6402,7 @@
     <w:p>
       <w:pPr>
         <w:pStyle w:val="NormalWeb"/>
-        <w:divId w:val="583682400"/>
+        <w:divId w:val="1014452338"/>
         <w:rPr>
           <w:rFonts w:ascii="Plus Jakarta Sans" w:hAnsi="Plus Jakarta Sans"/>
           <w:lang w:val="es-ES"/>
@@ -6441,7 +6433,7 @@
       </w:tblGrid>
       <w:tr>
         <w:trPr>
-          <w:divId w:val="1124349282"/>
+          <w:divId w:val="734399386"/>
           <w:tblHeader/>
         </w:trPr>
         <w:tc>
@@ -6521,7 +6513,7 @@
       </w:tr>
       <w:tr>
         <w:trPr>
-          <w:divId w:val="1124349282"/>
+          <w:divId w:val="734399386"/>
         </w:trPr>
         <w:tc>
           <w:tcPr>
@@ -6610,7 +6602,7 @@
     <w:p>
       <w:pPr>
         <w:pStyle w:val="Ttulo4"/>
-        <w:divId w:val="583682400"/>
+        <w:divId w:val="1014452338"/>
         <w:rPr>
           <w:rFonts w:eastAsia="Times New Roman"/>
           <w:lang w:val="es-ES"/>
@@ -6627,7 +6619,7 @@
     <w:p>
       <w:pPr>
         <w:pStyle w:val="NormalWeb"/>
-        <w:divId w:val="583682400"/>
+        <w:divId w:val="1014452338"/>
         <w:rPr>
           <w:rFonts w:ascii="Plus Jakarta Sans" w:hAnsi="Plus Jakarta Sans"/>
           <w:lang w:val="es-ES"/>
@@ -6658,7 +6650,7 @@
       </w:tblGrid>
       <w:tr>
         <w:trPr>
-          <w:divId w:val="1657800073"/>
+          <w:divId w:val="11077816"/>
           <w:tblHeader/>
         </w:trPr>
         <w:tc>
@@ -6738,7 +6730,7 @@
       </w:tr>
       <w:tr>
         <w:trPr>
-          <w:divId w:val="1657800073"/>
+          <w:divId w:val="11077816"/>
         </w:trPr>
         <w:tc>
           <w:tcPr>
@@ -6836,7 +6828,7 @@
     <w:p>
       <w:pPr>
         <w:pStyle w:val="Ttulo4"/>
-        <w:divId w:val="583682400"/>
+        <w:divId w:val="1014452338"/>
         <w:rPr>
           <w:rFonts w:eastAsia="Times New Roman"/>
           <w:lang w:val="es-ES"/>
@@ -6853,7 +6845,7 @@
     <w:p>
       <w:pPr>
         <w:pStyle w:val="NormalWeb"/>
-        <w:divId w:val="583682400"/>
+        <w:divId w:val="1014452338"/>
         <w:rPr>
           <w:rFonts w:ascii="Plus Jakarta Sans" w:hAnsi="Plus Jakarta Sans"/>
           <w:lang w:val="es-ES"/>
@@ -6884,7 +6876,7 @@
       </w:tblGrid>
       <w:tr>
         <w:trPr>
-          <w:divId w:val="1699886176"/>
+          <w:divId w:val="907542674"/>
           <w:tblHeader/>
         </w:trPr>
         <w:tc>
@@ -6920,6 +6912,7 @@
                 <w:sz w:val="20"/>
                 <w:szCs w:val="20"/>
               </w:rPr>
+              <w:lastRenderedPageBreak/>
               <w:t>Cultivos Frecuentes</w:t>
             </w:r>
           </w:p>
@@ -6964,7 +6957,7 @@
       </w:tr>
       <w:tr>
         <w:trPr>
-          <w:divId w:val="1699886176"/>
+          <w:divId w:val="907542674"/>
         </w:trPr>
         <w:tc>
           <w:tcPr>
@@ -7053,7 +7046,7 @@
     <w:p>
       <w:pPr>
         <w:spacing w:before="450" w:after="450"/>
-        <w:divId w:val="583682400"/>
+        <w:divId w:val="1014452338"/>
         <w:rPr>
           <w:rFonts w:ascii="Plus Jakarta Sans" w:eastAsia="Times New Roman" w:hAnsi="Plus Jakarta Sans"/>
           <w:lang w:val="es-ES"/>
@@ -7064,7 +7057,7 @@
           <w:rFonts w:ascii="Plus Jakarta Sans" w:eastAsia="Times New Roman" w:hAnsi="Plus Jakarta Sans"/>
           <w:lang w:val="es-ES"/>
         </w:rPr>
-        <w:pict w14:anchorId="7529194A">
+        <w:pict w14:anchorId="182C2A95">
           <v:rect id="_x0000_i1032" style="width:0;height:.75pt" o:hralign="center" o:hrstd="t" o:hr="t" fillcolor="#a0a0a0" stroked="f"/>
         </w:pict>
       </w:r>
@@ -7072,7 +7065,7 @@
     <w:p>
       <w:pPr>
         <w:pStyle w:val="Ttulo2"/>
-        <w:divId w:val="583682400"/>
+        <w:divId w:val="1014452338"/>
         <w:rPr>
           <w:rFonts w:eastAsia="Times New Roman"/>
           <w:lang w:val="es-ES"/>
@@ -7089,7 +7082,7 @@
     <w:p>
       <w:pPr>
         <w:pStyle w:val="NormalWeb"/>
-        <w:divId w:val="583682400"/>
+        <w:divId w:val="1014452338"/>
         <w:rPr>
           <w:rFonts w:ascii="Plus Jakarta Sans" w:hAnsi="Plus Jakarta Sans"/>
           <w:lang w:val="es-ES"/>
@@ -7106,7 +7099,7 @@
     <w:p>
       <w:pPr>
         <w:pStyle w:val="Ttulo3"/>
-        <w:divId w:val="583682400"/>
+        <w:divId w:val="1014452338"/>
         <w:rPr>
           <w:rFonts w:eastAsia="Times New Roman"/>
           <w:lang w:val="es-ES"/>
@@ -7123,7 +7116,7 @@
     <w:p>
       <w:pPr>
         <w:pStyle w:val="NormalWeb"/>
-        <w:divId w:val="583682400"/>
+        <w:divId w:val="1014452338"/>
         <w:rPr>
           <w:rFonts w:ascii="Plus Jakarta Sans" w:hAnsi="Plus Jakarta Sans"/>
           <w:lang w:val="es-ES"/>
@@ -7156,7 +7149,7 @@
       </w:tblGrid>
       <w:tr>
         <w:trPr>
-          <w:divId w:val="1175996872"/>
+          <w:divId w:val="1317539598"/>
           <w:tblHeader/>
         </w:trPr>
         <w:tc>
@@ -7321,7 +7314,7 @@
       </w:tr>
       <w:tr>
         <w:trPr>
-          <w:divId w:val="1175996872"/>
+          <w:divId w:val="1317539598"/>
         </w:trPr>
         <w:tc>
           <w:tcPr>
@@ -7447,7 +7440,7 @@
       </w:tr>
       <w:tr>
         <w:trPr>
-          <w:divId w:val="1175996872"/>
+          <w:divId w:val="1317539598"/>
         </w:trPr>
         <w:tc>
           <w:tcPr>
@@ -7573,7 +7566,7 @@
       </w:tr>
       <w:tr>
         <w:trPr>
-          <w:divId w:val="1175996872"/>
+          <w:divId w:val="1317539598"/>
         </w:trPr>
         <w:tc>
           <w:tcPr>
@@ -7699,7 +7692,7 @@
       </w:tr>
       <w:tr>
         <w:trPr>
-          <w:divId w:val="1175996872"/>
+          <w:divId w:val="1317539598"/>
         </w:trPr>
         <w:tc>
           <w:tcPr>
@@ -7827,7 +7820,7 @@
     <w:p>
       <w:pPr>
         <w:pStyle w:val="Ttulo3"/>
-        <w:divId w:val="583682400"/>
+        <w:divId w:val="1014452338"/>
         <w:rPr>
           <w:rFonts w:eastAsia="Times New Roman"/>
           <w:lang w:val="es-ES"/>
@@ -7845,7 +7838,7 @@
       <w:pPr>
         <w:spacing w:before="375" w:after="225"/>
         <w:jc w:val="center"/>
-        <w:divId w:val="429080390"/>
+        <w:divId w:val="422848018"/>
         <w:rPr>
           <w:rFonts w:ascii="Outfit" w:eastAsia="Times New Roman" w:hAnsi="Outfit"/>
           <w:b/>
@@ -7875,7 +7868,7 @@
       <w:pPr>
         <w:spacing w:after="375"/>
         <w:jc w:val="center"/>
-        <w:divId w:val="1888254995"/>
+        <w:divId w:val="574048785"/>
         <w:rPr>
           <w:rFonts w:ascii="Plus Jakarta Sans" w:eastAsia="Times New Roman" w:hAnsi="Plus Jakarta Sans"/>
           <w:lang w:val="es-ES"/>
@@ -8242,7 +8235,7 @@
     <w:p>
       <w:pPr>
         <w:pStyle w:val="Ttulo3"/>
-        <w:divId w:val="583682400"/>
+        <w:divId w:val="1014452338"/>
         <w:rPr>
           <w:rFonts w:eastAsia="Times New Roman"/>
           <w:lang w:val="es-ES"/>
@@ -8266,7 +8259,7 @@
     <w:p>
       <w:pPr>
         <w:pStyle w:val="NormalWeb"/>
-        <w:divId w:val="583682400"/>
+        <w:divId w:val="1014452338"/>
         <w:rPr>
           <w:rFonts w:ascii="Plus Jakarta Sans" w:hAnsi="Plus Jakarta Sans"/>
           <w:lang w:val="es-ES"/>
@@ -8288,7 +8281,7 @@
         </w:numPr>
         <w:spacing w:before="100" w:beforeAutospacing="1" w:after="90"/>
         <w:ind w:left="1020"/>
-        <w:divId w:val="583682400"/>
+        <w:divId w:val="1014452338"/>
         <w:rPr>
           <w:rFonts w:ascii="Plus Jakarta Sans" w:eastAsia="Times New Roman" w:hAnsi="Plus Jakarta Sans"/>
           <w:sz w:val="21"/>
@@ -8324,7 +8317,7 @@
         </w:numPr>
         <w:spacing w:before="100" w:beforeAutospacing="1" w:after="90"/>
         <w:ind w:left="1020"/>
-        <w:divId w:val="583682400"/>
+        <w:divId w:val="1014452338"/>
         <w:rPr>
           <w:rFonts w:ascii="Plus Jakarta Sans" w:eastAsia="Times New Roman" w:hAnsi="Plus Jakarta Sans"/>
           <w:sz w:val="21"/>
@@ -8369,7 +8362,7 @@
         </w:numPr>
         <w:spacing w:before="100" w:beforeAutospacing="1" w:after="90"/>
         <w:ind w:left="1020"/>
-        <w:divId w:val="583682400"/>
+        <w:divId w:val="1014452338"/>
         <w:rPr>
           <w:rFonts w:ascii="Plus Jakarta Sans" w:eastAsia="Times New Roman" w:hAnsi="Plus Jakarta Sans"/>
           <w:sz w:val="21"/>
@@ -8423,7 +8416,7 @@
         </w:numPr>
         <w:spacing w:before="100" w:beforeAutospacing="1" w:after="90"/>
         <w:ind w:left="1020"/>
-        <w:divId w:val="583682400"/>
+        <w:divId w:val="1014452338"/>
         <w:rPr>
           <w:rFonts w:ascii="Plus Jakarta Sans" w:eastAsia="Times New Roman" w:hAnsi="Plus Jakarta Sans"/>
           <w:sz w:val="21"/>
@@ -8468,7 +8461,7 @@
         </w:numPr>
         <w:spacing w:before="100" w:beforeAutospacing="1" w:after="90"/>
         <w:ind w:left="1020"/>
-        <w:divId w:val="583682400"/>
+        <w:divId w:val="1014452338"/>
         <w:rPr>
           <w:rFonts w:ascii="Plus Jakarta Sans" w:eastAsia="Times New Roman" w:hAnsi="Plus Jakarta Sans"/>
           <w:sz w:val="21"/>
@@ -8504,7 +8497,7 @@
         </w:numPr>
         <w:spacing w:before="100" w:beforeAutospacing="1" w:after="90"/>
         <w:ind w:left="1020"/>
-        <w:divId w:val="583682400"/>
+        <w:divId w:val="1014452338"/>
         <w:rPr>
           <w:rFonts w:ascii="Plus Jakarta Sans" w:eastAsia="Times New Roman" w:hAnsi="Plus Jakarta Sans"/>
           <w:sz w:val="21"/>
@@ -8549,7 +8542,7 @@
         </w:numPr>
         <w:spacing w:before="100" w:beforeAutospacing="1" w:after="90"/>
         <w:ind w:left="1020"/>
-        <w:divId w:val="583682400"/>
+        <w:divId w:val="1014452338"/>
         <w:rPr>
           <w:rFonts w:ascii="Plus Jakarta Sans" w:eastAsia="Times New Roman" w:hAnsi="Plus Jakarta Sans"/>
           <w:sz w:val="21"/>
@@ -8594,7 +8587,7 @@
         </w:numPr>
         <w:spacing w:before="100" w:beforeAutospacing="1" w:after="90"/>
         <w:ind w:left="1020"/>
-        <w:divId w:val="583682400"/>
+        <w:divId w:val="1014452338"/>
         <w:rPr>
           <w:rFonts w:ascii="Plus Jakarta Sans" w:eastAsia="Times New Roman" w:hAnsi="Plus Jakarta Sans"/>
           <w:sz w:val="21"/>
@@ -8639,7 +8632,7 @@
         </w:numPr>
         <w:spacing w:before="100" w:beforeAutospacing="1" w:after="90"/>
         <w:ind w:left="1020"/>
-        <w:divId w:val="583682400"/>
+        <w:divId w:val="1014452338"/>
         <w:rPr>
           <w:rFonts w:ascii="Plus Jakarta Sans" w:eastAsia="Times New Roman" w:hAnsi="Plus Jakarta Sans"/>
           <w:sz w:val="21"/>
@@ -8675,7 +8668,7 @@
         </w:numPr>
         <w:spacing w:before="100" w:beforeAutospacing="1" w:after="90"/>
         <w:ind w:left="1020"/>
-        <w:divId w:val="583682400"/>
+        <w:divId w:val="1014452338"/>
         <w:rPr>
           <w:rFonts w:ascii="Plus Jakarta Sans" w:eastAsia="Times New Roman" w:hAnsi="Plus Jakarta Sans"/>
           <w:sz w:val="21"/>
@@ -8729,7 +8722,7 @@
         </w:numPr>
         <w:spacing w:before="100" w:beforeAutospacing="1" w:after="90"/>
         <w:ind w:left="1020"/>
-        <w:divId w:val="583682400"/>
+        <w:divId w:val="1014452338"/>
         <w:rPr>
           <w:rFonts w:ascii="Plus Jakarta Sans" w:eastAsia="Times New Roman" w:hAnsi="Plus Jakarta Sans"/>
           <w:sz w:val="21"/>
@@ -8774,7 +8767,7 @@
         </w:numPr>
         <w:spacing w:before="100" w:beforeAutospacing="1" w:after="90"/>
         <w:ind w:left="1020"/>
-        <w:divId w:val="583682400"/>
+        <w:divId w:val="1014452338"/>
         <w:rPr>
           <w:rFonts w:ascii="Plus Jakarta Sans" w:eastAsia="Times New Roman" w:hAnsi="Plus Jakarta Sans"/>
           <w:sz w:val="21"/>
@@ -8814,7 +8807,7 @@
     <w:p>
       <w:pPr>
         <w:pStyle w:val="Ttulo3"/>
-        <w:divId w:val="583682400"/>
+        <w:divId w:val="1014452338"/>
         <w:rPr>
           <w:rFonts w:eastAsia="Times New Roman"/>
           <w:lang w:val="es-ES"/>
@@ -8832,7 +8825,7 @@
       <w:pPr>
         <w:spacing w:before="375" w:after="225"/>
         <w:jc w:val="center"/>
-        <w:divId w:val="1141076599"/>
+        <w:divId w:val="289483007"/>
         <w:rPr>
           <w:rFonts w:ascii="Outfit" w:eastAsia="Times New Roman" w:hAnsi="Outfit"/>
           <w:b/>
@@ -8862,7 +8855,7 @@
       <w:pPr>
         <w:spacing w:after="375"/>
         <w:jc w:val="center"/>
-        <w:divId w:val="1529639760"/>
+        <w:divId w:val="1306550170"/>
         <w:rPr>
           <w:rFonts w:ascii="Plus Jakarta Sans" w:eastAsia="Times New Roman" w:hAnsi="Plus Jakarta Sans"/>
           <w:lang w:val="es-ES"/>
@@ -9152,7 +9145,7 @@
     <w:p>
       <w:pPr>
         <w:spacing w:before="450" w:after="450"/>
-        <w:divId w:val="583682400"/>
+        <w:divId w:val="1014452338"/>
         <w:rPr>
           <w:rFonts w:ascii="Plus Jakarta Sans" w:eastAsia="Times New Roman" w:hAnsi="Plus Jakarta Sans"/>
           <w:lang w:val="es-ES"/>
@@ -9163,7 +9156,7 @@
           <w:rFonts w:ascii="Plus Jakarta Sans" w:eastAsia="Times New Roman" w:hAnsi="Plus Jakarta Sans"/>
           <w:lang w:val="es-ES"/>
         </w:rPr>
-        <w:pict w14:anchorId="44BC22CB">
+        <w:pict w14:anchorId="716A4482">
           <v:rect id="_x0000_i1033" style="width:0;height:.75pt" o:hralign="center" o:hrstd="t" o:hr="t" fillcolor="#a0a0a0" stroked="f"/>
         </w:pict>
       </w:r>
@@ -9171,7 +9164,7 @@
     <w:p>
       <w:pPr>
         <w:pStyle w:val="Ttulo2"/>
-        <w:divId w:val="583682400"/>
+        <w:divId w:val="1014452338"/>
         <w:rPr>
           <w:rFonts w:eastAsia="Times New Roman"/>
           <w:lang w:val="es-ES"/>
@@ -9188,7 +9181,7 @@
     <w:p>
       <w:pPr>
         <w:pStyle w:val="NormalWeb"/>
-        <w:divId w:val="583682400"/>
+        <w:divId w:val="1014452338"/>
         <w:rPr>
           <w:rFonts w:ascii="Plus Jakarta Sans" w:hAnsi="Plus Jakarta Sans"/>
           <w:lang w:val="es-ES"/>
@@ -9205,7 +9198,7 @@
     <w:p>
       <w:pPr>
         <w:pStyle w:val="NormalWeb"/>
-        <w:divId w:val="583682400"/>
+        <w:divId w:val="1014452338"/>
         <w:rPr>
           <w:rFonts w:ascii="Plus Jakarta Sans" w:hAnsi="Plus Jakarta Sans"/>
           <w:lang w:val="es-ES"/>
@@ -9267,7 +9260,7 @@
     <w:p>
       <w:pPr>
         <w:pStyle w:val="NormalWeb"/>
-        <w:divId w:val="583682400"/>
+        <w:divId w:val="1014452338"/>
         <w:rPr>
           <w:rFonts w:ascii="Plus Jakarta Sans" w:hAnsi="Plus Jakarta Sans"/>
           <w:lang w:val="es-ES"/>
@@ -9329,7 +9322,7 @@
     <w:p>
       <w:pPr>
         <w:pStyle w:val="NormalWeb"/>
-        <w:divId w:val="583682400"/>
+        <w:divId w:val="1014452338"/>
         <w:rPr>
           <w:rFonts w:ascii="Plus Jakarta Sans" w:hAnsi="Plus Jakarta Sans"/>
           <w:lang w:val="es-ES"/>
@@ -9390,7 +9383,7 @@
     <w:p>
       <w:pPr>
         <w:pStyle w:val="NormalWeb"/>
-        <w:divId w:val="583682400"/>
+        <w:divId w:val="1014452338"/>
         <w:rPr>
           <w:rFonts w:ascii="Plus Jakarta Sans" w:hAnsi="Plus Jakarta Sans"/>
           <w:lang w:val="es-ES"/>
@@ -9444,7 +9437,7 @@
     <w:p>
       <w:pPr>
         <w:spacing w:before="450" w:after="450"/>
-        <w:divId w:val="583682400"/>
+        <w:divId w:val="1014452338"/>
         <w:rPr>
           <w:rFonts w:ascii="Plus Jakarta Sans" w:eastAsia="Times New Roman" w:hAnsi="Plus Jakarta Sans"/>
           <w:lang w:val="es-ES"/>
@@ -9455,7 +9448,7 @@
           <w:rFonts w:ascii="Plus Jakarta Sans" w:eastAsia="Times New Roman" w:hAnsi="Plus Jakarta Sans"/>
           <w:lang w:val="es-ES"/>
         </w:rPr>
-        <w:pict w14:anchorId="008FA9C8">
+        <w:pict w14:anchorId="14D319C7">
           <v:rect id="_x0000_i1034" style="width:0;height:.75pt" o:hralign="center" o:hrstd="t" o:hr="t" fillcolor="#a0a0a0" stroked="f"/>
         </w:pict>
       </w:r>
@@ -9463,7 +9456,7 @@
     <w:p>
       <w:pPr>
         <w:pStyle w:val="Ttulo2"/>
-        <w:divId w:val="583682400"/>
+        <w:divId w:val="1014452338"/>
         <w:rPr>
           <w:rFonts w:eastAsia="Times New Roman"/>
           <w:lang w:val="es-ES"/>
@@ -9480,7 +9473,7 @@
     <w:p>
       <w:pPr>
         <w:pStyle w:val="NormalWeb"/>
-        <w:divId w:val="583682400"/>
+        <w:divId w:val="1014452338"/>
         <w:rPr>
           <w:rFonts w:ascii="Plus Jakarta Sans" w:hAnsi="Plus Jakarta Sans"/>
           <w:lang w:val="es-ES"/>
@@ -9519,7 +9512,7 @@
     <w:p>
       <w:pPr>
         <w:pStyle w:val="Ttulo3"/>
-        <w:divId w:val="583682400"/>
+        <w:divId w:val="1014452338"/>
         <w:rPr>
           <w:rFonts w:eastAsia="Times New Roman"/>
           <w:lang w:val="es-ES"/>
@@ -9553,7 +9546,7 @@
       </w:tblGrid>
       <w:tr>
         <w:trPr>
-          <w:divId w:val="121927658"/>
+          <w:divId w:val="825515825"/>
           <w:tblHeader/>
         </w:trPr>
         <w:tc>
@@ -9744,7 +9737,7 @@
       </w:tr>
       <w:tr>
         <w:trPr>
-          <w:divId w:val="121927658"/>
+          <w:divId w:val="825515825"/>
         </w:trPr>
         <w:tc>
           <w:tcPr>
@@ -9900,7 +9893,7 @@
       </w:tr>
       <w:tr>
         <w:trPr>
-          <w:divId w:val="121927658"/>
+          <w:divId w:val="825515825"/>
         </w:trPr>
         <w:tc>
           <w:tcPr>
@@ -10056,7 +10049,7 @@
       </w:tr>
       <w:tr>
         <w:trPr>
-          <w:divId w:val="121927658"/>
+          <w:divId w:val="825515825"/>
         </w:trPr>
         <w:tc>
           <w:tcPr>
@@ -10212,7 +10205,7 @@
       </w:tr>
       <w:tr>
         <w:trPr>
-          <w:divId w:val="121927658"/>
+          <w:divId w:val="825515825"/>
         </w:trPr>
         <w:tc>
           <w:tcPr>
@@ -10374,7 +10367,7 @@
     <w:p>
       <w:pPr>
         <w:pStyle w:val="Ttulo3"/>
-        <w:divId w:val="583682400"/>
+        <w:divId w:val="1014452338"/>
         <w:rPr>
           <w:rFonts w:eastAsia="Times New Roman"/>
           <w:lang w:val="es-ES"/>
@@ -10408,7 +10401,7 @@
       </w:tblGrid>
       <w:tr>
         <w:trPr>
-          <w:divId w:val="1450278469"/>
+          <w:divId w:val="1732264554"/>
           <w:tblHeader/>
         </w:trPr>
         <w:tc>
@@ -10599,7 +10592,7 @@
       </w:tr>
       <w:tr>
         <w:trPr>
-          <w:divId w:val="1450278469"/>
+          <w:divId w:val="1732264554"/>
         </w:trPr>
         <w:tc>
           <w:tcPr>
@@ -10756,7 +10749,7 @@
       </w:tr>
       <w:tr>
         <w:trPr>
-          <w:divId w:val="1450278469"/>
+          <w:divId w:val="1732264554"/>
         </w:trPr>
         <w:tc>
           <w:tcPr>
@@ -10915,7 +10908,7 @@
     <w:p>
       <w:pPr>
         <w:pStyle w:val="Ttulo3"/>
-        <w:divId w:val="583682400"/>
+        <w:divId w:val="1014452338"/>
         <w:rPr>
           <w:rFonts w:eastAsia="Times New Roman"/>
           <w:lang w:val="es-ES"/>
@@ -10950,7 +10943,7 @@
       </w:tblGrid>
       <w:tr>
         <w:trPr>
-          <w:divId w:val="1038699402"/>
+          <w:divId w:val="1105659230"/>
           <w:tblHeader/>
         </w:trPr>
         <w:tc>
@@ -11178,7 +11171,7 @@
       </w:tr>
       <w:tr>
         <w:trPr>
-          <w:divId w:val="1038699402"/>
+          <w:divId w:val="1105659230"/>
         </w:trPr>
         <w:tc>
           <w:tcPr>
@@ -11374,7 +11367,7 @@
       </w:tr>
       <w:tr>
         <w:trPr>
-          <w:divId w:val="1038699402"/>
+          <w:divId w:val="1105659230"/>
         </w:trPr>
         <w:tc>
           <w:tcPr>
@@ -11559,7 +11552,7 @@
       </w:tr>
       <w:tr>
         <w:trPr>
-          <w:divId w:val="1038699402"/>
+          <w:divId w:val="1105659230"/>
         </w:trPr>
         <w:tc>
           <w:tcPr>
@@ -11756,8 +11749,451 @@
     </w:tbl>
     <w:p>
       <w:pPr>
+        <w:pStyle w:val="Ttulo4"/>
+        <w:divId w:val="1014452338"/>
+        <w:rPr>
+          <w:rFonts w:eastAsia="Times New Roman"/>
+          <w:lang w:val="es-ES"/>
+        </w:rPr>
+      </w:pPr>
+      <w:r>
+        <w:rPr>
+          <w:rFonts w:eastAsia="Times New Roman"/>
+          <w:lang w:val="es-ES"/>
+        </w:rPr>
+        <w:t>Gráfico de Conocimiento del Proyecto y Directiva:</w:t>
+      </w:r>
+    </w:p>
+    <w:p>
+      <w:pPr>
+        <w:spacing w:before="375" w:after="225"/>
+        <w:jc w:val="center"/>
+        <w:divId w:val="1621034963"/>
+        <w:rPr>
+          <w:rFonts w:ascii="Outfit" w:eastAsia="Times New Roman" w:hAnsi="Outfit"/>
+          <w:b/>
+          <w:bCs/>
+          <w:caps/>
+          <w:spacing w:val="12"/>
+          <w:sz w:val="20"/>
+          <w:szCs w:val="20"/>
+          <w:lang w:val="es-ES"/>
+        </w:rPr>
+      </w:pPr>
+      <w:r>
+        <w:rPr>
+          <w:rFonts w:ascii="Outfit" w:eastAsia="Times New Roman" w:hAnsi="Outfit"/>
+          <w:b/>
+          <w:bCs/>
+          <w:caps/>
+          <w:spacing w:val="12"/>
+          <w:sz w:val="20"/>
+          <w:szCs w:val="20"/>
+          <w:lang w:val="es-ES"/>
+        </w:rPr>
+        <w:t>Conocimiento del Proyecto</w:t>
+      </w:r>
+    </w:p>
+    <w:p>
+      <w:pPr>
+        <w:spacing w:after="375"/>
+        <w:jc w:val="center"/>
+        <w:divId w:val="801001102"/>
+        <w:rPr>
+          <w:rFonts w:ascii="Plus Jakarta Sans" w:eastAsia="Times New Roman" w:hAnsi="Plus Jakarta Sans"/>
+          <w:lang w:val="es-ES"/>
+        </w:rPr>
+      </w:pPr>
+      <w:r>
+        <w:rPr>
+          <w:rFonts w:ascii="Plus Jakarta Sans" w:eastAsia="Times New Roman" w:hAnsi="Plus Jakarta Sans"/>
+          <w:lang w:val="es-ES"/>
+        </w:rPr>
+        <w:t>Conocimiento del Proyecto y Directiva por Secto</w:t>
+      </w:r>
+      <w:r>
+        <w:rPr>
+          <w:rFonts w:ascii="Plus Jakarta Sans" w:eastAsia="Times New Roman" w:hAnsi="Plus Jakarta Sans"/>
+          <w:lang w:val="es-ES"/>
+        </w:rPr>
+        <w:t>r</w:t>
+      </w:r>
+      <w:r>
+        <w:rPr>
+          <w:rFonts w:ascii="Plus Jakarta Sans" w:eastAsia="Times New Roman" w:hAnsi="Plus Jakarta Sans"/>
+          <w:lang w:val="es-ES"/>
+        </w:rPr>
+        <w:t xml:space="preserve"> </w:t>
+      </w:r>
+      <w:r>
+        <w:rPr>
+          <w:rFonts w:ascii="Plus Jakarta Sans" w:eastAsia="Times New Roman" w:hAnsi="Plus Jakarta Sans"/>
+          <w:lang w:val="es-ES"/>
+        </w:rPr>
+        <w:t>Porcentaje de regantes que conocen la i</w:t>
+      </w:r>
+      <w:r>
+        <w:rPr>
+          <w:rFonts w:ascii="Plus Jakarta Sans" w:eastAsia="Times New Roman" w:hAnsi="Plus Jakarta Sans"/>
+          <w:lang w:val="es-ES"/>
+        </w:rPr>
+        <w:t>niciativa y a la directiv</w:t>
+      </w:r>
+      <w:r>
+        <w:rPr>
+          <w:rFonts w:ascii="Plus Jakarta Sans" w:eastAsia="Times New Roman" w:hAnsi="Plus Jakarta Sans"/>
+          <w:lang w:val="es-ES"/>
+        </w:rPr>
+        <w:t>a</w:t>
+      </w:r>
+      <w:r>
+        <w:rPr>
+          <w:rFonts w:ascii="Plus Jakarta Sans" w:eastAsia="Times New Roman" w:hAnsi="Plus Jakarta Sans"/>
+          <w:lang w:val="es-ES"/>
+        </w:rPr>
+        <w:t xml:space="preserve"> </w:t>
+      </w:r>
+      <w:r>
+        <w:rPr>
+          <w:rFonts w:ascii="Plus Jakarta Sans" w:eastAsia="Times New Roman" w:hAnsi="Plus Jakarta Sans"/>
+          <w:lang w:val="es-ES"/>
+        </w:rPr>
+        <w:t>0</w:t>
+      </w:r>
+      <w:r>
+        <w:rPr>
+          <w:rFonts w:ascii="Plus Jakarta Sans" w:eastAsia="Times New Roman" w:hAnsi="Plus Jakarta Sans"/>
+          <w:lang w:val="es-ES"/>
+        </w:rPr>
+        <w:t>%</w:t>
+      </w:r>
+      <w:r>
+        <w:rPr>
+          <w:rFonts w:ascii="Plus Jakarta Sans" w:eastAsia="Times New Roman" w:hAnsi="Plus Jakarta Sans"/>
+          <w:lang w:val="es-ES"/>
+        </w:rPr>
+        <w:t xml:space="preserve"> </w:t>
+      </w:r>
+      <w:r>
+        <w:rPr>
+          <w:rFonts w:ascii="Plus Jakarta Sans" w:eastAsia="Times New Roman" w:hAnsi="Plus Jakarta Sans"/>
+          <w:lang w:val="es-ES"/>
+        </w:rPr>
+        <w:t>25</w:t>
+      </w:r>
+      <w:r>
+        <w:rPr>
+          <w:rFonts w:ascii="Plus Jakarta Sans" w:eastAsia="Times New Roman" w:hAnsi="Plus Jakarta Sans"/>
+          <w:lang w:val="es-ES"/>
+        </w:rPr>
+        <w:t>%</w:t>
+      </w:r>
+      <w:r>
+        <w:rPr>
+          <w:rFonts w:ascii="Plus Jakarta Sans" w:eastAsia="Times New Roman" w:hAnsi="Plus Jakarta Sans"/>
+          <w:lang w:val="es-ES"/>
+        </w:rPr>
+        <w:t xml:space="preserve"> </w:t>
+      </w:r>
+      <w:r>
+        <w:rPr>
+          <w:rFonts w:ascii="Plus Jakarta Sans" w:eastAsia="Times New Roman" w:hAnsi="Plus Jakarta Sans"/>
+          <w:lang w:val="es-ES"/>
+        </w:rPr>
+        <w:t>50</w:t>
+      </w:r>
+      <w:r>
+        <w:rPr>
+          <w:rFonts w:ascii="Plus Jakarta Sans" w:eastAsia="Times New Roman" w:hAnsi="Plus Jakarta Sans"/>
+          <w:lang w:val="es-ES"/>
+        </w:rPr>
+        <w:t>%</w:t>
+      </w:r>
+      <w:r>
+        <w:rPr>
+          <w:rFonts w:ascii="Plus Jakarta Sans" w:eastAsia="Times New Roman" w:hAnsi="Plus Jakarta Sans"/>
+          <w:lang w:val="es-ES"/>
+        </w:rPr>
+        <w:t xml:space="preserve"> </w:t>
+      </w:r>
+      <w:r>
+        <w:rPr>
+          <w:rFonts w:ascii="Plus Jakarta Sans" w:eastAsia="Times New Roman" w:hAnsi="Plus Jakarta Sans"/>
+          <w:lang w:val="es-ES"/>
+        </w:rPr>
+        <w:t>75</w:t>
+      </w:r>
+      <w:r>
+        <w:rPr>
+          <w:rFonts w:ascii="Plus Jakarta Sans" w:eastAsia="Times New Roman" w:hAnsi="Plus Jakarta Sans"/>
+          <w:lang w:val="es-ES"/>
+        </w:rPr>
+        <w:t>%</w:t>
+      </w:r>
+      <w:r>
+        <w:rPr>
+          <w:rFonts w:ascii="Plus Jakarta Sans" w:eastAsia="Times New Roman" w:hAnsi="Plus Jakarta Sans"/>
+          <w:lang w:val="es-ES"/>
+        </w:rPr>
+        <w:t xml:space="preserve"> </w:t>
+      </w:r>
+      <w:r>
+        <w:rPr>
+          <w:rFonts w:ascii="Plus Jakarta Sans" w:eastAsia="Times New Roman" w:hAnsi="Plus Jakarta Sans"/>
+          <w:lang w:val="es-ES"/>
+        </w:rPr>
+        <w:t>100</w:t>
+      </w:r>
+      <w:r>
+        <w:rPr>
+          <w:rFonts w:ascii="Plus Jakarta Sans" w:eastAsia="Times New Roman" w:hAnsi="Plus Jakarta Sans"/>
+          <w:lang w:val="es-ES"/>
+        </w:rPr>
+        <w:t>%</w:t>
+      </w:r>
+      <w:r>
+        <w:rPr>
+          <w:rFonts w:ascii="Plus Jakarta Sans" w:eastAsia="Times New Roman" w:hAnsi="Plus Jakarta Sans"/>
+          <w:lang w:val="es-ES"/>
+        </w:rPr>
+        <w:t xml:space="preserve"> </w:t>
+      </w:r>
+      <w:r>
+        <w:rPr>
+          <w:rFonts w:ascii="Plus Jakarta Sans" w:eastAsia="Times New Roman" w:hAnsi="Plus Jakarta Sans"/>
+          <w:lang w:val="es-ES"/>
+        </w:rPr>
+        <w:t xml:space="preserve">Sector </w:t>
+      </w:r>
+      <w:r>
+        <w:rPr>
+          <w:rFonts w:ascii="Plus Jakarta Sans" w:eastAsia="Times New Roman" w:hAnsi="Plus Jakarta Sans"/>
+          <w:lang w:val="es-ES"/>
+        </w:rPr>
+        <w:t>1</w:t>
+      </w:r>
+      <w:r>
+        <w:rPr>
+          <w:rFonts w:ascii="Plus Jakarta Sans" w:eastAsia="Times New Roman" w:hAnsi="Plus Jakarta Sans"/>
+          <w:lang w:val="es-ES"/>
+        </w:rPr>
+        <w:t xml:space="preserve"> </w:t>
+      </w:r>
+      <w:r>
+        <w:rPr>
+          <w:rFonts w:ascii="Plus Jakarta Sans" w:eastAsia="Times New Roman" w:hAnsi="Plus Jakarta Sans"/>
+          <w:lang w:val="es-ES"/>
+        </w:rPr>
+        <w:t>86</w:t>
+      </w:r>
+      <w:r>
+        <w:rPr>
+          <w:rFonts w:ascii="Plus Jakarta Sans" w:eastAsia="Times New Roman" w:hAnsi="Plus Jakarta Sans"/>
+          <w:lang w:val="es-ES"/>
+        </w:rPr>
+        <w:t>%</w:t>
+      </w:r>
+      <w:r>
+        <w:rPr>
+          <w:rFonts w:ascii="Plus Jakarta Sans" w:eastAsia="Times New Roman" w:hAnsi="Plus Jakarta Sans"/>
+          <w:lang w:val="es-ES"/>
+        </w:rPr>
+        <w:t xml:space="preserve"> </w:t>
+      </w:r>
+      <w:r>
+        <w:rPr>
+          <w:rFonts w:ascii="Plus Jakarta Sans" w:eastAsia="Times New Roman" w:hAnsi="Plus Jakarta Sans"/>
+          <w:lang w:val="es-ES"/>
+        </w:rPr>
+        <w:t>99</w:t>
+      </w:r>
+      <w:r>
+        <w:rPr>
+          <w:rFonts w:ascii="Plus Jakarta Sans" w:eastAsia="Times New Roman" w:hAnsi="Plus Jakarta Sans"/>
+          <w:lang w:val="es-ES"/>
+        </w:rPr>
+        <w:t>%</w:t>
+      </w:r>
+      <w:r>
+        <w:rPr>
+          <w:rFonts w:ascii="Plus Jakarta Sans" w:eastAsia="Times New Roman" w:hAnsi="Plus Jakarta Sans"/>
+          <w:lang w:val="es-ES"/>
+        </w:rPr>
+        <w:t xml:space="preserve"> </w:t>
+      </w:r>
+      <w:r>
+        <w:rPr>
+          <w:rFonts w:ascii="Plus Jakarta Sans" w:eastAsia="Times New Roman" w:hAnsi="Plus Jakarta Sans"/>
+          <w:lang w:val="es-ES"/>
+        </w:rPr>
+        <w:t xml:space="preserve">Sector </w:t>
+      </w:r>
+      <w:r>
+        <w:rPr>
+          <w:rFonts w:ascii="Plus Jakarta Sans" w:eastAsia="Times New Roman" w:hAnsi="Plus Jakarta Sans"/>
+          <w:lang w:val="es-ES"/>
+        </w:rPr>
+        <w:t>2</w:t>
+      </w:r>
+      <w:r>
+        <w:rPr>
+          <w:rFonts w:ascii="Plus Jakarta Sans" w:eastAsia="Times New Roman" w:hAnsi="Plus Jakarta Sans"/>
+          <w:lang w:val="es-ES"/>
+        </w:rPr>
+        <w:t xml:space="preserve"> </w:t>
+      </w:r>
+      <w:r>
+        <w:rPr>
+          <w:rFonts w:ascii="Plus Jakarta Sans" w:eastAsia="Times New Roman" w:hAnsi="Plus Jakarta Sans"/>
+          <w:lang w:val="es-ES"/>
+        </w:rPr>
+        <w:t>88</w:t>
+      </w:r>
+      <w:r>
+        <w:rPr>
+          <w:rFonts w:ascii="Plus Jakarta Sans" w:eastAsia="Times New Roman" w:hAnsi="Plus Jakarta Sans"/>
+          <w:lang w:val="es-ES"/>
+        </w:rPr>
+        <w:t>%</w:t>
+      </w:r>
+      <w:r>
+        <w:rPr>
+          <w:rFonts w:ascii="Plus Jakarta Sans" w:eastAsia="Times New Roman" w:hAnsi="Plus Jakarta Sans"/>
+          <w:lang w:val="es-ES"/>
+        </w:rPr>
+        <w:t xml:space="preserve"> </w:t>
+      </w:r>
+      <w:r>
+        <w:rPr>
+          <w:rFonts w:ascii="Plus Jakarta Sans" w:eastAsia="Times New Roman" w:hAnsi="Plus Jakarta Sans"/>
+          <w:lang w:val="es-ES"/>
+        </w:rPr>
+        <w:t>99</w:t>
+      </w:r>
+      <w:r>
+        <w:rPr>
+          <w:rFonts w:ascii="Plus Jakarta Sans" w:eastAsia="Times New Roman" w:hAnsi="Plus Jakarta Sans"/>
+          <w:lang w:val="es-ES"/>
+        </w:rPr>
+        <w:t>%</w:t>
+      </w:r>
+      <w:r>
+        <w:rPr>
+          <w:rFonts w:ascii="Plus Jakarta Sans" w:eastAsia="Times New Roman" w:hAnsi="Plus Jakarta Sans"/>
+          <w:lang w:val="es-ES"/>
+        </w:rPr>
+        <w:t xml:space="preserve"> </w:t>
+      </w:r>
+      <w:r>
+        <w:rPr>
+          <w:rFonts w:ascii="Plus Jakarta Sans" w:eastAsia="Times New Roman" w:hAnsi="Plus Jakarta Sans"/>
+          <w:lang w:val="es-ES"/>
+        </w:rPr>
+        <w:t xml:space="preserve">Sector </w:t>
+      </w:r>
+      <w:r>
+        <w:rPr>
+          <w:rFonts w:ascii="Plus Jakarta Sans" w:eastAsia="Times New Roman" w:hAnsi="Plus Jakarta Sans"/>
+          <w:lang w:val="es-ES"/>
+        </w:rPr>
+        <w:t>3</w:t>
+      </w:r>
+      <w:r>
+        <w:rPr>
+          <w:rFonts w:ascii="Plus Jakarta Sans" w:eastAsia="Times New Roman" w:hAnsi="Plus Jakarta Sans"/>
+          <w:lang w:val="es-ES"/>
+        </w:rPr>
+        <w:t xml:space="preserve"> </w:t>
+      </w:r>
+      <w:r>
+        <w:rPr>
+          <w:rFonts w:ascii="Plus Jakarta Sans" w:eastAsia="Times New Roman" w:hAnsi="Plus Jakarta Sans"/>
+          <w:lang w:val="es-ES"/>
+        </w:rPr>
+        <w:t>84</w:t>
+      </w:r>
+      <w:r>
+        <w:rPr>
+          <w:rFonts w:ascii="Plus Jakarta Sans" w:eastAsia="Times New Roman" w:hAnsi="Plus Jakarta Sans"/>
+          <w:lang w:val="es-ES"/>
+        </w:rPr>
+        <w:t>%</w:t>
+      </w:r>
+      <w:r>
+        <w:rPr>
+          <w:rFonts w:ascii="Plus Jakarta Sans" w:eastAsia="Times New Roman" w:hAnsi="Plus Jakarta Sans"/>
+          <w:lang w:val="es-ES"/>
+        </w:rPr>
+        <w:t xml:space="preserve"> </w:t>
+      </w:r>
+      <w:r>
+        <w:rPr>
+          <w:rFonts w:ascii="Plus Jakarta Sans" w:eastAsia="Times New Roman" w:hAnsi="Plus Jakarta Sans"/>
+          <w:lang w:val="es-ES"/>
+        </w:rPr>
+        <w:t>100</w:t>
+      </w:r>
+      <w:r>
+        <w:rPr>
+          <w:rFonts w:ascii="Plus Jakarta Sans" w:eastAsia="Times New Roman" w:hAnsi="Plus Jakarta Sans"/>
+          <w:lang w:val="es-ES"/>
+        </w:rPr>
+        <w:t>%</w:t>
+      </w:r>
+      <w:r>
+        <w:rPr>
+          <w:rFonts w:ascii="Plus Jakarta Sans" w:eastAsia="Times New Roman" w:hAnsi="Plus Jakarta Sans"/>
+          <w:lang w:val="es-ES"/>
+        </w:rPr>
+        <w:t xml:space="preserve"> </w:t>
+      </w:r>
+      <w:r>
+        <w:rPr>
+          <w:rFonts w:ascii="Plus Jakarta Sans" w:eastAsia="Times New Roman" w:hAnsi="Plus Jakarta Sans"/>
+          <w:lang w:val="es-ES"/>
+        </w:rPr>
+        <w:t>Conoce Proyect</w:t>
+      </w:r>
+      <w:r>
+        <w:rPr>
+          <w:rFonts w:ascii="Plus Jakarta Sans" w:eastAsia="Times New Roman" w:hAnsi="Plus Jakarta Sans"/>
+          <w:lang w:val="es-ES"/>
+        </w:rPr>
+        <w:t>o</w:t>
+      </w:r>
+      <w:r>
+        <w:rPr>
+          <w:rFonts w:ascii="Plus Jakarta Sans" w:eastAsia="Times New Roman" w:hAnsi="Plus Jakarta Sans"/>
+          <w:lang w:val="es-ES"/>
+        </w:rPr>
+        <w:t xml:space="preserve"> </w:t>
+      </w:r>
+      <w:r>
+        <w:rPr>
+          <w:rFonts w:ascii="Plus Jakarta Sans" w:eastAsia="Times New Roman" w:hAnsi="Plus Jakarta Sans"/>
+          <w:lang w:val="es-ES"/>
+        </w:rPr>
+        <w:t>Conoce President</w:t>
+      </w:r>
+      <w:r>
+        <w:rPr>
+          <w:rFonts w:ascii="Plus Jakarta Sans" w:eastAsia="Times New Roman" w:hAnsi="Plus Jakarta Sans"/>
+          <w:lang w:val="es-ES"/>
+        </w:rPr>
+        <w:t>a</w:t>
+      </w:r>
+      <w:r>
+        <w:rPr>
+          <w:rFonts w:ascii="Plus Jakarta Sans" w:eastAsia="Times New Roman" w:hAnsi="Plus Jakarta Sans"/>
+          <w:lang w:val="es-ES"/>
+        </w:rPr>
+        <w:t xml:space="preserve"> </w:t>
+      </w:r>
+    </w:p>
+    <w:p>
+      <w:pPr>
         <w:pStyle w:val="Ttulo3"/>
-        <w:divId w:val="583682400"/>
+        <w:divId w:val="1014452338"/>
         <w:rPr>
           <w:rFonts w:eastAsia="Times New Roman"/>
           <w:lang w:val="es-ES"/>
@@ -11789,7 +12225,7 @@
       </w:tblGrid>
       <w:tr>
         <w:trPr>
-          <w:divId w:val="1221477746"/>
+          <w:divId w:val="2078212114"/>
           <w:tblHeader/>
         </w:trPr>
         <w:tc>
@@ -11906,7 +12342,7 @@
       </w:tr>
       <w:tr>
         <w:trPr>
-          <w:divId w:val="1221477746"/>
+          <w:divId w:val="2078212114"/>
         </w:trPr>
         <w:tc>
           <w:tcPr>
@@ -12002,7 +12438,7 @@
       </w:tr>
       <w:tr>
         <w:trPr>
-          <w:divId w:val="1221477746"/>
+          <w:divId w:val="2078212114"/>
         </w:trPr>
         <w:tc>
           <w:tcPr>
@@ -12098,7 +12534,7 @@
       </w:tr>
       <w:tr>
         <w:trPr>
-          <w:divId w:val="1221477746"/>
+          <w:divId w:val="2078212114"/>
         </w:trPr>
         <w:tc>
           <w:tcPr>
@@ -12196,7 +12632,7 @@
     <w:p>
       <w:pPr>
         <w:pStyle w:val="NormalWeb"/>
-        <w:divId w:val="583682400"/>
+        <w:divId w:val="1014452338"/>
         <w:rPr>
           <w:rFonts w:ascii="Plus Jakarta Sans" w:hAnsi="Plus Jakarta Sans"/>
           <w:lang w:val="es-ES"/>
@@ -12221,7 +12657,7 @@
     <w:p>
       <w:pPr>
         <w:pStyle w:val="Ttulo3"/>
-        <w:divId w:val="583682400"/>
+        <w:divId w:val="1014452338"/>
         <w:rPr>
           <w:rFonts w:eastAsia="Times New Roman"/>
           <w:lang w:val="es-ES"/>
@@ -12232,7 +12668,14 @@
           <w:rFonts w:eastAsia="Times New Roman"/>
           <w:lang w:val="es-ES"/>
         </w:rPr>
-        <w:t>E. Población y Familias Beneficiarias</w:t>
+        <w:t>E. Población y Familia</w:t>
+      </w:r>
+      <w:r>
+        <w:rPr>
+          <w:rFonts w:eastAsia="Times New Roman"/>
+          <w:lang w:val="es-ES"/>
+        </w:rPr>
+        <w:t>s Beneficiarias</w:t>
       </w:r>
     </w:p>
     <w:tbl>
@@ -12256,7 +12699,7 @@
       </w:tblGrid>
       <w:tr>
         <w:trPr>
-          <w:divId w:val="1533112560"/>
+          <w:divId w:val="1396706266"/>
           <w:tblHeader/>
         </w:trPr>
         <w:tc>
@@ -12484,7 +12927,7 @@
       </w:tr>
       <w:tr>
         <w:trPr>
-          <w:divId w:val="1533112560"/>
+          <w:divId w:val="1396706266"/>
         </w:trPr>
         <w:tc>
           <w:tcPr>
@@ -12670,7 +13113,7 @@
       </w:tr>
       <w:tr>
         <w:trPr>
-          <w:divId w:val="1533112560"/>
+          <w:divId w:val="1396706266"/>
         </w:trPr>
         <w:tc>
           <w:tcPr>
@@ -12856,7 +13299,7 @@
       </w:tr>
       <w:tr>
         <w:trPr>
-          <w:divId w:val="1533112560"/>
+          <w:divId w:val="1396706266"/>
         </w:trPr>
         <w:tc>
           <w:tcPr>
@@ -13042,7 +13485,7 @@
       </w:tr>
       <w:tr>
         <w:trPr>
-          <w:divId w:val="1533112560"/>
+          <w:divId w:val="1396706266"/>
         </w:trPr>
         <w:tc>
           <w:tcPr>
@@ -13235,7 +13678,7 @@
     <w:p>
       <w:pPr>
         <w:pStyle w:val="NormalWeb"/>
-        <w:divId w:val="583682400"/>
+        <w:divId w:val="1014452338"/>
         <w:rPr>
           <w:rFonts w:ascii="Plus Jakarta Sans" w:hAnsi="Plus Jakarta Sans"/>
           <w:lang w:val="es-ES"/>
@@ -13261,14 +13704,7 @@
           <w:rFonts w:ascii="Plus Jakarta Sans" w:hAnsi="Plus Jakarta Sans"/>
           <w:lang w:val="es-ES"/>
         </w:rPr>
-        <w:t xml:space="preserve"> </w:t>
-      </w:r>
-      <w:r>
-        <w:rPr>
-          <w:rFonts w:ascii="Plus Jakarta Sans" w:hAnsi="Plus Jakarta Sans"/>
-          <w:lang w:val="es-ES"/>
-        </w:rPr>
-        <w:t xml:space="preserve">4,171 titulares + 11,897 hijos = </w:t>
+        <w:t xml:space="preserve"> 4,171 titulares + 11,897 hijos = </w:t>
       </w:r>
       <w:r>
         <w:rPr>
@@ -13289,7 +13725,7 @@
     <w:p>
       <w:pPr>
         <w:pStyle w:val="Ttulo3"/>
-        <w:divId w:val="583682400"/>
+        <w:divId w:val="1014452338"/>
         <w:rPr>
           <w:rFonts w:eastAsia="Times New Roman"/>
           <w:lang w:val="es-ES"/>
@@ -13324,7 +13760,7 @@
       </w:tblGrid>
       <w:tr>
         <w:trPr>
-          <w:divId w:val="2132939494"/>
+          <w:divId w:val="1145973427"/>
           <w:tblHeader/>
         </w:trPr>
         <w:tc>
@@ -13552,7 +13988,7 @@
       </w:tr>
       <w:tr>
         <w:trPr>
-          <w:divId w:val="2132939494"/>
+          <w:divId w:val="1145973427"/>
         </w:trPr>
         <w:tc>
           <w:tcPr>
@@ -13746,7 +14182,7 @@
       </w:tr>
       <w:tr>
         <w:trPr>
-          <w:divId w:val="2132939494"/>
+          <w:divId w:val="1145973427"/>
         </w:trPr>
         <w:tc>
           <w:tcPr>
@@ -13941,8 +14377,444 @@
     </w:tbl>
     <w:p>
       <w:pPr>
+        <w:pStyle w:val="Ttulo4"/>
+        <w:divId w:val="1014452338"/>
+        <w:rPr>
+          <w:rFonts w:eastAsia="Times New Roman"/>
+          <w:lang w:val="es-ES"/>
+        </w:rPr>
+      </w:pPr>
+      <w:r>
+        <w:rPr>
+          <w:rFonts w:eastAsia="Times New Roman"/>
+          <w:lang w:val="es-ES"/>
+        </w:rPr>
+        <w:t>Gráfico de Cobertura de Servicios Básicos:</w:t>
+      </w:r>
+    </w:p>
+    <w:p>
+      <w:pPr>
+        <w:spacing w:before="375" w:after="225"/>
+        <w:jc w:val="center"/>
+        <w:divId w:val="620650974"/>
+        <w:rPr>
+          <w:rFonts w:ascii="Outfit" w:eastAsia="Times New Roman" w:hAnsi="Outfit"/>
+          <w:b/>
+          <w:bCs/>
+          <w:caps/>
+          <w:spacing w:val="12"/>
+          <w:sz w:val="20"/>
+          <w:szCs w:val="20"/>
+          <w:lang w:val="es-ES"/>
+        </w:rPr>
+      </w:pPr>
+      <w:r>
+        <w:rPr>
+          <w:rFonts w:ascii="Outfit" w:eastAsia="Times New Roman" w:hAnsi="Outfit"/>
+          <w:b/>
+          <w:bCs/>
+          <w:caps/>
+          <w:spacing w:val="12"/>
+          <w:sz w:val="20"/>
+          <w:szCs w:val="20"/>
+          <w:lang w:val="es-ES"/>
+        </w:rPr>
+        <w:t>Cobertura de Servicios Básicos</w:t>
+      </w:r>
+    </w:p>
+    <w:p>
+      <w:pPr>
+        <w:spacing w:after="375"/>
+        <w:jc w:val="center"/>
+        <w:divId w:val="599529728"/>
+        <w:rPr>
+          <w:rFonts w:ascii="Plus Jakarta Sans" w:eastAsia="Times New Roman" w:hAnsi="Plus Jakarta Sans"/>
+          <w:lang w:val="es-ES"/>
+        </w:rPr>
+      </w:pPr>
+      <w:r>
+        <w:rPr>
+          <w:rFonts w:ascii="Plus Jakarta Sans" w:eastAsia="Times New Roman" w:hAnsi="Plus Jakarta Sans"/>
+          <w:lang w:val="es-ES"/>
+        </w:rPr>
+        <w:t>Cobertura de Servicios Básicos por Secto</w:t>
+      </w:r>
+      <w:r>
+        <w:rPr>
+          <w:rFonts w:ascii="Plus Jakarta Sans" w:eastAsia="Times New Roman" w:hAnsi="Plus Jakarta Sans"/>
+          <w:lang w:val="es-ES"/>
+        </w:rPr>
+        <w:t>r</w:t>
+      </w:r>
+      <w:r>
+        <w:rPr>
+          <w:rFonts w:ascii="Plus Jakarta Sans" w:eastAsia="Times New Roman" w:hAnsi="Plus Jakarta Sans"/>
+          <w:lang w:val="es-ES"/>
+        </w:rPr>
+        <w:t xml:space="preserve"> </w:t>
+      </w:r>
+      <w:r>
+        <w:rPr>
+          <w:rFonts w:ascii="Plus Jakarta Sans" w:eastAsia="Times New Roman" w:hAnsi="Plus Jakarta Sans"/>
+          <w:lang w:val="es-ES"/>
+        </w:rPr>
+        <w:t>Porcentaje de acceso a agua de consumo y red de energía eléctric</w:t>
+      </w:r>
+      <w:r>
+        <w:rPr>
+          <w:rFonts w:ascii="Plus Jakarta Sans" w:eastAsia="Times New Roman" w:hAnsi="Plus Jakarta Sans"/>
+          <w:lang w:val="es-ES"/>
+        </w:rPr>
+        <w:t>a</w:t>
+      </w:r>
+      <w:r>
+        <w:rPr>
+          <w:rFonts w:ascii="Plus Jakarta Sans" w:eastAsia="Times New Roman" w:hAnsi="Plus Jakarta Sans"/>
+          <w:lang w:val="es-ES"/>
+        </w:rPr>
+        <w:t xml:space="preserve"> </w:t>
+      </w:r>
+      <w:r>
+        <w:rPr>
+          <w:rFonts w:ascii="Plus Jakarta Sans" w:eastAsia="Times New Roman" w:hAnsi="Plus Jakarta Sans"/>
+          <w:lang w:val="es-ES"/>
+        </w:rPr>
+        <w:t>0</w:t>
+      </w:r>
+      <w:r>
+        <w:rPr>
+          <w:rFonts w:ascii="Plus Jakarta Sans" w:eastAsia="Times New Roman" w:hAnsi="Plus Jakarta Sans"/>
+          <w:lang w:val="es-ES"/>
+        </w:rPr>
+        <w:t>%</w:t>
+      </w:r>
+      <w:r>
+        <w:rPr>
+          <w:rFonts w:ascii="Plus Jakarta Sans" w:eastAsia="Times New Roman" w:hAnsi="Plus Jakarta Sans"/>
+          <w:lang w:val="es-ES"/>
+        </w:rPr>
+        <w:t xml:space="preserve"> </w:t>
+      </w:r>
+      <w:r>
+        <w:rPr>
+          <w:rFonts w:ascii="Plus Jakarta Sans" w:eastAsia="Times New Roman" w:hAnsi="Plus Jakarta Sans"/>
+          <w:lang w:val="es-ES"/>
+        </w:rPr>
+        <w:t>25</w:t>
+      </w:r>
+      <w:r>
+        <w:rPr>
+          <w:rFonts w:ascii="Plus Jakarta Sans" w:eastAsia="Times New Roman" w:hAnsi="Plus Jakarta Sans"/>
+          <w:lang w:val="es-ES"/>
+        </w:rPr>
+        <w:t>%</w:t>
+      </w:r>
+      <w:r>
+        <w:rPr>
+          <w:rFonts w:ascii="Plus Jakarta Sans" w:eastAsia="Times New Roman" w:hAnsi="Plus Jakarta Sans"/>
+          <w:lang w:val="es-ES"/>
+        </w:rPr>
+        <w:t xml:space="preserve"> </w:t>
+      </w:r>
+      <w:r>
+        <w:rPr>
+          <w:rFonts w:ascii="Plus Jakarta Sans" w:eastAsia="Times New Roman" w:hAnsi="Plus Jakarta Sans"/>
+          <w:lang w:val="es-ES"/>
+        </w:rPr>
+        <w:t>50</w:t>
+      </w:r>
+      <w:r>
+        <w:rPr>
+          <w:rFonts w:ascii="Plus Jakarta Sans" w:eastAsia="Times New Roman" w:hAnsi="Plus Jakarta Sans"/>
+          <w:lang w:val="es-ES"/>
+        </w:rPr>
+        <w:t>%</w:t>
+      </w:r>
+      <w:r>
+        <w:rPr>
+          <w:rFonts w:ascii="Plus Jakarta Sans" w:eastAsia="Times New Roman" w:hAnsi="Plus Jakarta Sans"/>
+          <w:lang w:val="es-ES"/>
+        </w:rPr>
+        <w:t xml:space="preserve"> </w:t>
+      </w:r>
+      <w:r>
+        <w:rPr>
+          <w:rFonts w:ascii="Plus Jakarta Sans" w:eastAsia="Times New Roman" w:hAnsi="Plus Jakarta Sans"/>
+          <w:lang w:val="es-ES"/>
+        </w:rPr>
+        <w:t>75</w:t>
+      </w:r>
+      <w:r>
+        <w:rPr>
+          <w:rFonts w:ascii="Plus Jakarta Sans" w:eastAsia="Times New Roman" w:hAnsi="Plus Jakarta Sans"/>
+          <w:lang w:val="es-ES"/>
+        </w:rPr>
+        <w:t>%</w:t>
+      </w:r>
+      <w:r>
+        <w:rPr>
+          <w:rFonts w:ascii="Plus Jakarta Sans" w:eastAsia="Times New Roman" w:hAnsi="Plus Jakarta Sans"/>
+          <w:lang w:val="es-ES"/>
+        </w:rPr>
+        <w:t xml:space="preserve"> </w:t>
+      </w:r>
+      <w:r>
+        <w:rPr>
+          <w:rFonts w:ascii="Plus Jakarta Sans" w:eastAsia="Times New Roman" w:hAnsi="Plus Jakarta Sans"/>
+          <w:lang w:val="es-ES"/>
+        </w:rPr>
+        <w:t>100</w:t>
+      </w:r>
+      <w:r>
+        <w:rPr>
+          <w:rFonts w:ascii="Plus Jakarta Sans" w:eastAsia="Times New Roman" w:hAnsi="Plus Jakarta Sans"/>
+          <w:lang w:val="es-ES"/>
+        </w:rPr>
+        <w:t>%</w:t>
+      </w:r>
+      <w:r>
+        <w:rPr>
+          <w:rFonts w:ascii="Plus Jakarta Sans" w:eastAsia="Times New Roman" w:hAnsi="Plus Jakarta Sans"/>
+          <w:lang w:val="es-ES"/>
+        </w:rPr>
+        <w:t xml:space="preserve"> </w:t>
+      </w:r>
+      <w:r>
+        <w:rPr>
+          <w:rFonts w:ascii="Plus Jakarta Sans" w:eastAsia="Times New Roman" w:hAnsi="Plus Jakarta Sans"/>
+          <w:lang w:val="es-ES"/>
+        </w:rPr>
+        <w:t xml:space="preserve">Sector </w:t>
+      </w:r>
+      <w:r>
+        <w:rPr>
+          <w:rFonts w:ascii="Plus Jakarta Sans" w:eastAsia="Times New Roman" w:hAnsi="Plus Jakarta Sans"/>
+          <w:lang w:val="es-ES"/>
+        </w:rPr>
+        <w:t>1</w:t>
+      </w:r>
+      <w:r>
+        <w:rPr>
+          <w:rFonts w:ascii="Plus Jakarta Sans" w:eastAsia="Times New Roman" w:hAnsi="Plus Jakarta Sans"/>
+          <w:lang w:val="es-ES"/>
+        </w:rPr>
+        <w:t xml:space="preserve"> </w:t>
+      </w:r>
+      <w:r>
+        <w:rPr>
+          <w:rFonts w:ascii="Plus Jakarta Sans" w:eastAsia="Times New Roman" w:hAnsi="Plus Jakarta Sans"/>
+          <w:lang w:val="es-ES"/>
+        </w:rPr>
+        <w:t>96</w:t>
+      </w:r>
+      <w:r>
+        <w:rPr>
+          <w:rFonts w:ascii="Plus Jakarta Sans" w:eastAsia="Times New Roman" w:hAnsi="Plus Jakarta Sans"/>
+          <w:lang w:val="es-ES"/>
+        </w:rPr>
+        <w:t>%</w:t>
+      </w:r>
+      <w:r>
+        <w:rPr>
+          <w:rFonts w:ascii="Plus Jakarta Sans" w:eastAsia="Times New Roman" w:hAnsi="Plus Jakarta Sans"/>
+          <w:lang w:val="es-ES"/>
+        </w:rPr>
+        <w:t xml:space="preserve"> </w:t>
+      </w:r>
+      <w:r>
+        <w:rPr>
+          <w:rFonts w:ascii="Plus Jakarta Sans" w:eastAsia="Times New Roman" w:hAnsi="Plus Jakarta Sans"/>
+          <w:lang w:val="es-ES"/>
+        </w:rPr>
+        <w:t>94</w:t>
+      </w:r>
+      <w:r>
+        <w:rPr>
+          <w:rFonts w:ascii="Plus Jakarta Sans" w:eastAsia="Times New Roman" w:hAnsi="Plus Jakarta Sans"/>
+          <w:lang w:val="es-ES"/>
+        </w:rPr>
+        <w:t>%</w:t>
+      </w:r>
+      <w:r>
+        <w:rPr>
+          <w:rFonts w:ascii="Plus Jakarta Sans" w:eastAsia="Times New Roman" w:hAnsi="Plus Jakarta Sans"/>
+          <w:lang w:val="es-ES"/>
+        </w:rPr>
+        <w:t xml:space="preserve"> </w:t>
+      </w:r>
+      <w:r>
+        <w:rPr>
+          <w:rFonts w:ascii="Plus Jakarta Sans" w:eastAsia="Times New Roman" w:hAnsi="Plus Jakarta Sans"/>
+          <w:lang w:val="es-ES"/>
+        </w:rPr>
+        <w:t xml:space="preserve">Sector </w:t>
+      </w:r>
+      <w:r>
+        <w:rPr>
+          <w:rFonts w:ascii="Plus Jakarta Sans" w:eastAsia="Times New Roman" w:hAnsi="Plus Jakarta Sans"/>
+          <w:lang w:val="es-ES"/>
+        </w:rPr>
+        <w:t>2</w:t>
+      </w:r>
+      <w:r>
+        <w:rPr>
+          <w:rFonts w:ascii="Plus Jakarta Sans" w:eastAsia="Times New Roman" w:hAnsi="Plus Jakarta Sans"/>
+          <w:lang w:val="es-ES"/>
+        </w:rPr>
+        <w:t xml:space="preserve"> </w:t>
+      </w:r>
+      <w:r>
+        <w:rPr>
+          <w:rFonts w:ascii="Plus Jakarta Sans" w:eastAsia="Times New Roman" w:hAnsi="Plus Jakarta Sans"/>
+          <w:lang w:val="es-ES"/>
+        </w:rPr>
+        <w:t>96</w:t>
+      </w:r>
+      <w:r>
+        <w:rPr>
+          <w:rFonts w:ascii="Plus Jakarta Sans" w:eastAsia="Times New Roman" w:hAnsi="Plus Jakarta Sans"/>
+          <w:lang w:val="es-ES"/>
+        </w:rPr>
+        <w:t>%</w:t>
+      </w:r>
+      <w:r>
+        <w:rPr>
+          <w:rFonts w:ascii="Plus Jakarta Sans" w:eastAsia="Times New Roman" w:hAnsi="Plus Jakarta Sans"/>
+          <w:lang w:val="es-ES"/>
+        </w:rPr>
+        <w:t xml:space="preserve"> </w:t>
+      </w:r>
+      <w:r>
+        <w:rPr>
+          <w:rFonts w:ascii="Plus Jakarta Sans" w:eastAsia="Times New Roman" w:hAnsi="Plus Jakarta Sans"/>
+          <w:lang w:val="es-ES"/>
+        </w:rPr>
+        <w:t>95</w:t>
+      </w:r>
+      <w:r>
+        <w:rPr>
+          <w:rFonts w:ascii="Plus Jakarta Sans" w:eastAsia="Times New Roman" w:hAnsi="Plus Jakarta Sans"/>
+          <w:lang w:val="es-ES"/>
+        </w:rPr>
+        <w:t>%</w:t>
+      </w:r>
+      <w:r>
+        <w:rPr>
+          <w:rFonts w:ascii="Plus Jakarta Sans" w:eastAsia="Times New Roman" w:hAnsi="Plus Jakarta Sans"/>
+          <w:lang w:val="es-ES"/>
+        </w:rPr>
+        <w:t xml:space="preserve"> </w:t>
+      </w:r>
+      <w:r>
+        <w:rPr>
+          <w:rFonts w:ascii="Plus Jakarta Sans" w:eastAsia="Times New Roman" w:hAnsi="Plus Jakarta Sans"/>
+          <w:lang w:val="es-ES"/>
+        </w:rPr>
+        <w:t xml:space="preserve">Sector </w:t>
+      </w:r>
+      <w:r>
+        <w:rPr>
+          <w:rFonts w:ascii="Plus Jakarta Sans" w:eastAsia="Times New Roman" w:hAnsi="Plus Jakarta Sans"/>
+          <w:lang w:val="es-ES"/>
+        </w:rPr>
+        <w:t>3</w:t>
+      </w:r>
+      <w:r>
+        <w:rPr>
+          <w:rFonts w:ascii="Plus Jakarta Sans" w:eastAsia="Times New Roman" w:hAnsi="Plus Jakarta Sans"/>
+          <w:lang w:val="es-ES"/>
+        </w:rPr>
+        <w:t xml:space="preserve"> </w:t>
+      </w:r>
+      <w:r>
+        <w:rPr>
+          <w:rFonts w:ascii="Plus Jakarta Sans" w:eastAsia="Times New Roman" w:hAnsi="Plus Jakarta Sans"/>
+          <w:lang w:val="es-ES"/>
+        </w:rPr>
+        <w:t>96</w:t>
+      </w:r>
+      <w:r>
+        <w:rPr>
+          <w:rFonts w:ascii="Plus Jakarta Sans" w:eastAsia="Times New Roman" w:hAnsi="Plus Jakarta Sans"/>
+          <w:lang w:val="es-ES"/>
+        </w:rPr>
+        <w:t>%</w:t>
+      </w:r>
+      <w:r>
+        <w:rPr>
+          <w:rFonts w:ascii="Plus Jakarta Sans" w:eastAsia="Times New Roman" w:hAnsi="Plus Jakarta Sans"/>
+          <w:lang w:val="es-ES"/>
+        </w:rPr>
+        <w:t xml:space="preserve"> </w:t>
+      </w:r>
+      <w:r>
+        <w:rPr>
+          <w:rFonts w:ascii="Plus Jakarta Sans" w:eastAsia="Times New Roman" w:hAnsi="Plus Jakarta Sans"/>
+          <w:lang w:val="es-ES"/>
+        </w:rPr>
+        <w:t>96</w:t>
+      </w:r>
+      <w:r>
+        <w:rPr>
+          <w:rFonts w:ascii="Plus Jakarta Sans" w:eastAsia="Times New Roman" w:hAnsi="Plus Jakarta Sans"/>
+          <w:lang w:val="es-ES"/>
+        </w:rPr>
+        <w:t>%</w:t>
+      </w:r>
+      <w:r>
+        <w:rPr>
+          <w:rFonts w:ascii="Plus Jakarta Sans" w:eastAsia="Times New Roman" w:hAnsi="Plus Jakarta Sans"/>
+          <w:lang w:val="es-ES"/>
+        </w:rPr>
+        <w:t xml:space="preserve"> </w:t>
+      </w:r>
+      <w:r>
+        <w:rPr>
+          <w:rFonts w:ascii="Plus Jakarta Sans" w:eastAsia="Times New Roman" w:hAnsi="Plus Jakarta Sans"/>
+          <w:lang w:val="es-ES"/>
+        </w:rPr>
+        <w:t>Agua de Consum</w:t>
+      </w:r>
+      <w:r>
+        <w:rPr>
+          <w:rFonts w:ascii="Plus Jakarta Sans" w:eastAsia="Times New Roman" w:hAnsi="Plus Jakarta Sans"/>
+          <w:lang w:val="es-ES"/>
+        </w:rPr>
+        <w:t>o</w:t>
+      </w:r>
+      <w:r>
+        <w:rPr>
+          <w:rFonts w:ascii="Plus Jakarta Sans" w:eastAsia="Times New Roman" w:hAnsi="Plus Jakarta Sans"/>
+          <w:lang w:val="es-ES"/>
+        </w:rPr>
+        <w:t xml:space="preserve"> </w:t>
+      </w:r>
+      <w:r>
+        <w:rPr>
+          <w:rFonts w:ascii="Plus Jakarta Sans" w:eastAsia="Times New Roman" w:hAnsi="Plus Jakarta Sans"/>
+          <w:lang w:val="es-ES"/>
+        </w:rPr>
+        <w:t>Energía Eléctric</w:t>
+      </w:r>
+      <w:r>
+        <w:rPr>
+          <w:rFonts w:ascii="Plus Jakarta Sans" w:eastAsia="Times New Roman" w:hAnsi="Plus Jakarta Sans"/>
+          <w:lang w:val="es-ES"/>
+        </w:rPr>
+        <w:t>a</w:t>
+      </w:r>
+      <w:r>
+        <w:rPr>
+          <w:rFonts w:ascii="Plus Jakarta Sans" w:eastAsia="Times New Roman" w:hAnsi="Plus Jakarta Sans"/>
+          <w:lang w:val="es-ES"/>
+        </w:rPr>
+        <w:t xml:space="preserve"> </w:t>
+      </w:r>
+    </w:p>
+    <w:p>
+      <w:pPr>
         <w:pStyle w:val="Ttulo3"/>
-        <w:divId w:val="583682400"/>
+        <w:divId w:val="1014452338"/>
         <w:rPr>
           <w:rFonts w:eastAsia="Times New Roman"/>
           <w:lang w:val="es-ES"/>
@@ -13976,7 +14848,7 @@
       </w:tblGrid>
       <w:tr>
         <w:trPr>
-          <w:divId w:val="224532987"/>
+          <w:divId w:val="913661640"/>
           <w:tblHeader/>
         </w:trPr>
         <w:tc>
@@ -14167,7 +15039,7 @@
       </w:tr>
       <w:tr>
         <w:trPr>
-          <w:divId w:val="224532987"/>
+          <w:divId w:val="913661640"/>
         </w:trPr>
         <w:tc>
           <w:tcPr>
@@ -14323,7 +15195,7 @@
       </w:tr>
       <w:tr>
         <w:trPr>
-          <w:divId w:val="224532987"/>
+          <w:divId w:val="913661640"/>
         </w:trPr>
         <w:tc>
           <w:tcPr>
@@ -14479,7 +15351,7 @@
       </w:tr>
       <w:tr>
         <w:trPr>
-          <w:divId w:val="224532987"/>
+          <w:divId w:val="913661640"/>
         </w:trPr>
         <w:tc>
           <w:tcPr>
@@ -14635,7 +15507,7 @@
       </w:tr>
       <w:tr>
         <w:trPr>
-          <w:divId w:val="224532987"/>
+          <w:divId w:val="913661640"/>
         </w:trPr>
         <w:tc>
           <w:tcPr>
@@ -14791,7 +15663,7 @@
       </w:tr>
       <w:tr>
         <w:trPr>
-          <w:divId w:val="224532987"/>
+          <w:divId w:val="913661640"/>
         </w:trPr>
         <w:tc>
           <w:tcPr>
@@ -14947,7 +15819,7 @@
       </w:tr>
       <w:tr>
         <w:trPr>
-          <w:divId w:val="224532987"/>
+          <w:divId w:val="913661640"/>
         </w:trPr>
         <w:tc>
           <w:tcPr>
@@ -15105,7 +15977,7 @@
     <w:p>
       <w:pPr>
         <w:pStyle w:val="Ttulo3"/>
-        <w:divId w:val="583682400"/>
+        <w:divId w:val="1014452338"/>
         <w:rPr>
           <w:rFonts w:eastAsia="Times New Roman"/>
           <w:lang w:val="es-ES"/>
@@ -15139,7 +16011,7 @@
       </w:tblGrid>
       <w:tr>
         <w:trPr>
-          <w:divId w:val="1892496767"/>
+          <w:divId w:val="699672113"/>
           <w:tblHeader/>
         </w:trPr>
         <w:tc>
@@ -15330,7 +16202,7 @@
       </w:tr>
       <w:tr>
         <w:trPr>
-          <w:divId w:val="1892496767"/>
+          <w:divId w:val="699672113"/>
         </w:trPr>
         <w:tc>
           <w:tcPr>
@@ -15486,7 +16358,7 @@
       </w:tr>
       <w:tr>
         <w:trPr>
-          <w:divId w:val="1892496767"/>
+          <w:divId w:val="699672113"/>
         </w:trPr>
         <w:tc>
           <w:tcPr>
@@ -15642,7 +16514,7 @@
       </w:tr>
       <w:tr>
         <w:trPr>
-          <w:divId w:val="1892496767"/>
+          <w:divId w:val="699672113"/>
         </w:trPr>
         <w:tc>
           <w:tcPr>
@@ -15798,7 +16670,7 @@
       </w:tr>
       <w:tr>
         <w:trPr>
-          <w:divId w:val="1892496767"/>
+          <w:divId w:val="699672113"/>
         </w:trPr>
         <w:tc>
           <w:tcPr>
@@ -15954,7 +16826,7 @@
       </w:tr>
       <w:tr>
         <w:trPr>
-          <w:divId w:val="1892496767"/>
+          <w:divId w:val="699672113"/>
         </w:trPr>
         <w:tc>
           <w:tcPr>
@@ -16112,7 +16984,7 @@
     <w:p>
       <w:pPr>
         <w:pStyle w:val="Ttulo3"/>
-        <w:divId w:val="583682400"/>
+        <w:divId w:val="1014452338"/>
         <w:rPr>
           <w:rFonts w:eastAsia="Times New Roman"/>
           <w:lang w:val="es-ES"/>
@@ -16146,7 +17018,7 @@
       </w:tblGrid>
       <w:tr>
         <w:trPr>
-          <w:divId w:val="1528984398"/>
+          <w:divId w:val="978152155"/>
           <w:tblHeader/>
         </w:trPr>
         <w:tc>
@@ -16337,7 +17209,7 @@
       </w:tr>
       <w:tr>
         <w:trPr>
-          <w:divId w:val="1528984398"/>
+          <w:divId w:val="978152155"/>
         </w:trPr>
         <w:tc>
           <w:tcPr>
@@ -16493,7 +17365,7 @@
       </w:tr>
       <w:tr>
         <w:trPr>
-          <w:divId w:val="1528984398"/>
+          <w:divId w:val="978152155"/>
         </w:trPr>
         <w:tc>
           <w:tcPr>
@@ -16650,27 +17522,444 @@
     </w:tbl>
     <w:p>
       <w:pPr>
-        <w:spacing w:before="450" w:after="450"/>
-        <w:divId w:val="583682400"/>
-        <w:rPr>
-          <w:rFonts w:ascii="Plus Jakarta Sans" w:eastAsia="Times New Roman" w:hAnsi="Plus Jakarta Sans"/>
+        <w:pStyle w:val="Ttulo4"/>
+        <w:divId w:val="1014452338"/>
+        <w:rPr>
+          <w:rFonts w:eastAsia="Times New Roman"/>
           <w:lang w:val="es-ES"/>
         </w:rPr>
       </w:pPr>
       <w:r>
         <w:rPr>
-          <w:rFonts w:ascii="Plus Jakarta Sans" w:eastAsia="Times New Roman" w:hAnsi="Plus Jakarta Sans"/>
-          <w:lang w:val="es-ES"/>
-        </w:rPr>
-        <w:pict w14:anchorId="2270FD94">
-          <v:rect id="_x0000_i1035" style="width:0;height:.75pt" o:hralign="center" o:hrstd="t" o:hr="t" fillcolor="#a0a0a0" stroked="f"/>
-        </w:pict>
+          <w:rFonts w:eastAsia="Times New Roman"/>
+          <w:lang w:val="es-ES"/>
+        </w:rPr>
+        <w:t>Gráfico de Tenencia de Tierras:</w:t>
+      </w:r>
+    </w:p>
+    <w:p>
+      <w:pPr>
+        <w:spacing w:before="375" w:after="225"/>
+        <w:jc w:val="center"/>
+        <w:divId w:val="1780954797"/>
+        <w:rPr>
+          <w:rFonts w:ascii="Outfit" w:eastAsia="Times New Roman" w:hAnsi="Outfit"/>
+          <w:b/>
+          <w:bCs/>
+          <w:caps/>
+          <w:spacing w:val="12"/>
+          <w:sz w:val="20"/>
+          <w:szCs w:val="20"/>
+          <w:lang w:val="es-ES"/>
+        </w:rPr>
+      </w:pPr>
+      <w:r>
+        <w:rPr>
+          <w:rFonts w:ascii="Outfit" w:eastAsia="Times New Roman" w:hAnsi="Outfit"/>
+          <w:b/>
+          <w:bCs/>
+          <w:caps/>
+          <w:spacing w:val="12"/>
+          <w:sz w:val="20"/>
+          <w:szCs w:val="20"/>
+          <w:lang w:val="es-ES"/>
+        </w:rPr>
+        <w:t>Tenencia de Predios</w:t>
+      </w:r>
+    </w:p>
+    <w:p>
+      <w:pPr>
+        <w:spacing w:after="375"/>
+        <w:jc w:val="center"/>
+        <w:divId w:val="815227078"/>
+        <w:rPr>
+          <w:rFonts w:ascii="Plus Jakarta Sans" w:eastAsia="Times New Roman" w:hAnsi="Plus Jakarta Sans"/>
+          <w:lang w:val="es-ES"/>
+        </w:rPr>
+      </w:pPr>
+      <w:r>
+        <w:rPr>
+          <w:rFonts w:ascii="Plus Jakarta Sans" w:eastAsia="Times New Roman" w:hAnsi="Plus Jakarta Sans"/>
+          <w:lang w:val="es-ES"/>
+        </w:rPr>
+        <w:t>Estado Legal de Tenencia del Predio por Secto</w:t>
+      </w:r>
+      <w:r>
+        <w:rPr>
+          <w:rFonts w:ascii="Plus Jakarta Sans" w:eastAsia="Times New Roman" w:hAnsi="Plus Jakarta Sans"/>
+          <w:lang w:val="es-ES"/>
+        </w:rPr>
+        <w:t>r</w:t>
+      </w:r>
+      <w:r>
+        <w:rPr>
+          <w:rFonts w:ascii="Plus Jakarta Sans" w:eastAsia="Times New Roman" w:hAnsi="Plus Jakarta Sans"/>
+          <w:lang w:val="es-ES"/>
+        </w:rPr>
+        <w:t xml:space="preserve"> </w:t>
+      </w:r>
+      <w:r>
+        <w:rPr>
+          <w:rFonts w:ascii="Plus Jakarta Sans" w:eastAsia="Times New Roman" w:hAnsi="Plus Jakarta Sans"/>
+          <w:lang w:val="es-ES"/>
+        </w:rPr>
+        <w:t>Proporción relativa del estado de legalización de tierra</w:t>
+      </w:r>
+      <w:r>
+        <w:rPr>
+          <w:rFonts w:ascii="Plus Jakarta Sans" w:eastAsia="Times New Roman" w:hAnsi="Plus Jakarta Sans"/>
+          <w:lang w:val="es-ES"/>
+        </w:rPr>
+        <w:t>s</w:t>
+      </w:r>
+      <w:r>
+        <w:rPr>
+          <w:rFonts w:ascii="Plus Jakarta Sans" w:eastAsia="Times New Roman" w:hAnsi="Plus Jakarta Sans"/>
+          <w:lang w:val="es-ES"/>
+        </w:rPr>
+        <w:t xml:space="preserve"> </w:t>
+      </w:r>
+      <w:r>
+        <w:rPr>
+          <w:rFonts w:ascii="Plus Jakarta Sans" w:eastAsia="Times New Roman" w:hAnsi="Plus Jakarta Sans"/>
+          <w:lang w:val="es-ES"/>
+        </w:rPr>
+        <w:t>0</w:t>
+      </w:r>
+      <w:r>
+        <w:rPr>
+          <w:rFonts w:ascii="Plus Jakarta Sans" w:eastAsia="Times New Roman" w:hAnsi="Plus Jakarta Sans"/>
+          <w:lang w:val="es-ES"/>
+        </w:rPr>
+        <w:t>%</w:t>
+      </w:r>
+      <w:r>
+        <w:rPr>
+          <w:rFonts w:ascii="Plus Jakarta Sans" w:eastAsia="Times New Roman" w:hAnsi="Plus Jakarta Sans"/>
+          <w:lang w:val="es-ES"/>
+        </w:rPr>
+        <w:t xml:space="preserve"> </w:t>
+      </w:r>
+      <w:r>
+        <w:rPr>
+          <w:rFonts w:ascii="Plus Jakarta Sans" w:eastAsia="Times New Roman" w:hAnsi="Plus Jakarta Sans"/>
+          <w:lang w:val="es-ES"/>
+        </w:rPr>
+        <w:t>25</w:t>
+      </w:r>
+      <w:r>
+        <w:rPr>
+          <w:rFonts w:ascii="Plus Jakarta Sans" w:eastAsia="Times New Roman" w:hAnsi="Plus Jakarta Sans"/>
+          <w:lang w:val="es-ES"/>
+        </w:rPr>
+        <w:t>%</w:t>
+      </w:r>
+      <w:r>
+        <w:rPr>
+          <w:rFonts w:ascii="Plus Jakarta Sans" w:eastAsia="Times New Roman" w:hAnsi="Plus Jakarta Sans"/>
+          <w:lang w:val="es-ES"/>
+        </w:rPr>
+        <w:t xml:space="preserve"> </w:t>
+      </w:r>
+      <w:r>
+        <w:rPr>
+          <w:rFonts w:ascii="Plus Jakarta Sans" w:eastAsia="Times New Roman" w:hAnsi="Plus Jakarta Sans"/>
+          <w:lang w:val="es-ES"/>
+        </w:rPr>
+        <w:t>50</w:t>
+      </w:r>
+      <w:r>
+        <w:rPr>
+          <w:rFonts w:ascii="Plus Jakarta Sans" w:eastAsia="Times New Roman" w:hAnsi="Plus Jakarta Sans"/>
+          <w:lang w:val="es-ES"/>
+        </w:rPr>
+        <w:t>%</w:t>
+      </w:r>
+      <w:r>
+        <w:rPr>
+          <w:rFonts w:ascii="Plus Jakarta Sans" w:eastAsia="Times New Roman" w:hAnsi="Plus Jakarta Sans"/>
+          <w:lang w:val="es-ES"/>
+        </w:rPr>
+        <w:t xml:space="preserve"> </w:t>
+      </w:r>
+      <w:r>
+        <w:rPr>
+          <w:rFonts w:ascii="Plus Jakarta Sans" w:eastAsia="Times New Roman" w:hAnsi="Plus Jakarta Sans"/>
+          <w:lang w:val="es-ES"/>
+        </w:rPr>
+        <w:t>75</w:t>
+      </w:r>
+      <w:r>
+        <w:rPr>
+          <w:rFonts w:ascii="Plus Jakarta Sans" w:eastAsia="Times New Roman" w:hAnsi="Plus Jakarta Sans"/>
+          <w:lang w:val="es-ES"/>
+        </w:rPr>
+        <w:t>%</w:t>
+      </w:r>
+      <w:r>
+        <w:rPr>
+          <w:rFonts w:ascii="Plus Jakarta Sans" w:eastAsia="Times New Roman" w:hAnsi="Plus Jakarta Sans"/>
+          <w:lang w:val="es-ES"/>
+        </w:rPr>
+        <w:t xml:space="preserve"> </w:t>
+      </w:r>
+      <w:r>
+        <w:rPr>
+          <w:rFonts w:ascii="Plus Jakarta Sans" w:eastAsia="Times New Roman" w:hAnsi="Plus Jakarta Sans"/>
+          <w:lang w:val="es-ES"/>
+        </w:rPr>
+        <w:t>100</w:t>
+      </w:r>
+      <w:r>
+        <w:rPr>
+          <w:rFonts w:ascii="Plus Jakarta Sans" w:eastAsia="Times New Roman" w:hAnsi="Plus Jakarta Sans"/>
+          <w:lang w:val="es-ES"/>
+        </w:rPr>
+        <w:t>%</w:t>
+      </w:r>
+      <w:r>
+        <w:rPr>
+          <w:rFonts w:ascii="Plus Jakarta Sans" w:eastAsia="Times New Roman" w:hAnsi="Plus Jakarta Sans"/>
+          <w:lang w:val="es-ES"/>
+        </w:rPr>
+        <w:t xml:space="preserve"> </w:t>
+      </w:r>
+      <w:r>
+        <w:rPr>
+          <w:rFonts w:ascii="Plus Jakarta Sans" w:eastAsia="Times New Roman" w:hAnsi="Plus Jakarta Sans"/>
+          <w:lang w:val="es-ES"/>
+        </w:rPr>
+        <w:t xml:space="preserve">Sector </w:t>
+      </w:r>
+      <w:r>
+        <w:rPr>
+          <w:rFonts w:ascii="Plus Jakarta Sans" w:eastAsia="Times New Roman" w:hAnsi="Plus Jakarta Sans"/>
+          <w:lang w:val="es-ES"/>
+        </w:rPr>
+        <w:t>1</w:t>
+      </w:r>
+      <w:r>
+        <w:rPr>
+          <w:rFonts w:ascii="Plus Jakarta Sans" w:eastAsia="Times New Roman" w:hAnsi="Plus Jakarta Sans"/>
+          <w:lang w:val="es-ES"/>
+        </w:rPr>
+        <w:t xml:space="preserve"> </w:t>
+      </w:r>
+      <w:r>
+        <w:rPr>
+          <w:rFonts w:ascii="Plus Jakarta Sans" w:eastAsia="Times New Roman" w:hAnsi="Plus Jakarta Sans"/>
+          <w:lang w:val="es-ES"/>
+        </w:rPr>
+        <w:t>68</w:t>
+      </w:r>
+      <w:r>
+        <w:rPr>
+          <w:rFonts w:ascii="Plus Jakarta Sans" w:eastAsia="Times New Roman" w:hAnsi="Plus Jakarta Sans"/>
+          <w:lang w:val="es-ES"/>
+        </w:rPr>
+        <w:t>%</w:t>
+      </w:r>
+      <w:r>
+        <w:rPr>
+          <w:rFonts w:ascii="Plus Jakarta Sans" w:eastAsia="Times New Roman" w:hAnsi="Plus Jakarta Sans"/>
+          <w:lang w:val="es-ES"/>
+        </w:rPr>
+        <w:t xml:space="preserve"> </w:t>
+      </w:r>
+      <w:r>
+        <w:rPr>
+          <w:rFonts w:ascii="Plus Jakarta Sans" w:eastAsia="Times New Roman" w:hAnsi="Plus Jakarta Sans"/>
+          <w:lang w:val="es-ES"/>
+        </w:rPr>
+        <w:t>31</w:t>
+      </w:r>
+      <w:r>
+        <w:rPr>
+          <w:rFonts w:ascii="Plus Jakarta Sans" w:eastAsia="Times New Roman" w:hAnsi="Plus Jakarta Sans"/>
+          <w:lang w:val="es-ES"/>
+        </w:rPr>
+        <w:t>%</w:t>
+      </w:r>
+      <w:r>
+        <w:rPr>
+          <w:rFonts w:ascii="Plus Jakarta Sans" w:eastAsia="Times New Roman" w:hAnsi="Plus Jakarta Sans"/>
+          <w:lang w:val="es-ES"/>
+        </w:rPr>
+        <w:t xml:space="preserve"> </w:t>
+      </w:r>
+      <w:r>
+        <w:rPr>
+          <w:rFonts w:ascii="Plus Jakarta Sans" w:eastAsia="Times New Roman" w:hAnsi="Plus Jakarta Sans"/>
+          <w:lang w:val="es-ES"/>
+        </w:rPr>
+        <w:t xml:space="preserve">Sector </w:t>
+      </w:r>
+      <w:r>
+        <w:rPr>
+          <w:rFonts w:ascii="Plus Jakarta Sans" w:eastAsia="Times New Roman" w:hAnsi="Plus Jakarta Sans"/>
+          <w:lang w:val="es-ES"/>
+        </w:rPr>
+        <w:t>2</w:t>
+      </w:r>
+      <w:r>
+        <w:rPr>
+          <w:rFonts w:ascii="Plus Jakarta Sans" w:eastAsia="Times New Roman" w:hAnsi="Plus Jakarta Sans"/>
+          <w:lang w:val="es-ES"/>
+        </w:rPr>
+        <w:t xml:space="preserve"> </w:t>
+      </w:r>
+      <w:r>
+        <w:rPr>
+          <w:rFonts w:ascii="Plus Jakarta Sans" w:eastAsia="Times New Roman" w:hAnsi="Plus Jakarta Sans"/>
+          <w:lang w:val="es-ES"/>
+        </w:rPr>
+        <w:t>67</w:t>
+      </w:r>
+      <w:r>
+        <w:rPr>
+          <w:rFonts w:ascii="Plus Jakarta Sans" w:eastAsia="Times New Roman" w:hAnsi="Plus Jakarta Sans"/>
+          <w:lang w:val="es-ES"/>
+        </w:rPr>
+        <w:t>%</w:t>
+      </w:r>
+      <w:r>
+        <w:rPr>
+          <w:rFonts w:ascii="Plus Jakarta Sans" w:eastAsia="Times New Roman" w:hAnsi="Plus Jakarta Sans"/>
+          <w:lang w:val="es-ES"/>
+        </w:rPr>
+        <w:t xml:space="preserve"> </w:t>
+      </w:r>
+      <w:r>
+        <w:rPr>
+          <w:rFonts w:ascii="Plus Jakarta Sans" w:eastAsia="Times New Roman" w:hAnsi="Plus Jakarta Sans"/>
+          <w:lang w:val="es-ES"/>
+        </w:rPr>
+        <w:t>32</w:t>
+      </w:r>
+      <w:r>
+        <w:rPr>
+          <w:rFonts w:ascii="Plus Jakarta Sans" w:eastAsia="Times New Roman" w:hAnsi="Plus Jakarta Sans"/>
+          <w:lang w:val="es-ES"/>
+        </w:rPr>
+        <w:t>%</w:t>
+      </w:r>
+      <w:r>
+        <w:rPr>
+          <w:rFonts w:ascii="Plus Jakarta Sans" w:eastAsia="Times New Roman" w:hAnsi="Plus Jakarta Sans"/>
+          <w:lang w:val="es-ES"/>
+        </w:rPr>
+        <w:t xml:space="preserve"> </w:t>
+      </w:r>
+      <w:r>
+        <w:rPr>
+          <w:rFonts w:ascii="Plus Jakarta Sans" w:eastAsia="Times New Roman" w:hAnsi="Plus Jakarta Sans"/>
+          <w:lang w:val="es-ES"/>
+        </w:rPr>
+        <w:t xml:space="preserve">Sector </w:t>
+      </w:r>
+      <w:r>
+        <w:rPr>
+          <w:rFonts w:ascii="Plus Jakarta Sans" w:eastAsia="Times New Roman" w:hAnsi="Plus Jakarta Sans"/>
+          <w:lang w:val="es-ES"/>
+        </w:rPr>
+        <w:t>3</w:t>
+      </w:r>
+      <w:r>
+        <w:rPr>
+          <w:rFonts w:ascii="Plus Jakarta Sans" w:eastAsia="Times New Roman" w:hAnsi="Plus Jakarta Sans"/>
+          <w:lang w:val="es-ES"/>
+        </w:rPr>
+        <w:t xml:space="preserve"> </w:t>
+      </w:r>
+      <w:r>
+        <w:rPr>
+          <w:rFonts w:ascii="Plus Jakarta Sans" w:eastAsia="Times New Roman" w:hAnsi="Plus Jakarta Sans"/>
+          <w:lang w:val="es-ES"/>
+        </w:rPr>
+        <w:t>75</w:t>
+      </w:r>
+      <w:r>
+        <w:rPr>
+          <w:rFonts w:ascii="Plus Jakarta Sans" w:eastAsia="Times New Roman" w:hAnsi="Plus Jakarta Sans"/>
+          <w:lang w:val="es-ES"/>
+        </w:rPr>
+        <w:t>%</w:t>
+      </w:r>
+      <w:r>
+        <w:rPr>
+          <w:rFonts w:ascii="Plus Jakarta Sans" w:eastAsia="Times New Roman" w:hAnsi="Plus Jakarta Sans"/>
+          <w:lang w:val="es-ES"/>
+        </w:rPr>
+        <w:t xml:space="preserve"> </w:t>
+      </w:r>
+      <w:r>
+        <w:rPr>
+          <w:rFonts w:ascii="Plus Jakarta Sans" w:eastAsia="Times New Roman" w:hAnsi="Plus Jakarta Sans"/>
+          <w:lang w:val="es-ES"/>
+        </w:rPr>
+        <w:t>24</w:t>
+      </w:r>
+      <w:r>
+        <w:rPr>
+          <w:rFonts w:ascii="Plus Jakarta Sans" w:eastAsia="Times New Roman" w:hAnsi="Plus Jakarta Sans"/>
+          <w:lang w:val="es-ES"/>
+        </w:rPr>
+        <w:t>%</w:t>
+      </w:r>
+      <w:r>
+        <w:rPr>
+          <w:rFonts w:ascii="Plus Jakarta Sans" w:eastAsia="Times New Roman" w:hAnsi="Plus Jakarta Sans"/>
+          <w:lang w:val="es-ES"/>
+        </w:rPr>
+        <w:t xml:space="preserve"> </w:t>
+      </w:r>
+      <w:r>
+        <w:rPr>
+          <w:rFonts w:ascii="Plus Jakarta Sans" w:eastAsia="Times New Roman" w:hAnsi="Plus Jakarta Sans"/>
+          <w:lang w:val="es-ES"/>
+        </w:rPr>
+        <w:t>Escritur</w:t>
+      </w:r>
+      <w:r>
+        <w:rPr>
+          <w:rFonts w:ascii="Plus Jakarta Sans" w:eastAsia="Times New Roman" w:hAnsi="Plus Jakarta Sans"/>
+          <w:lang w:val="es-ES"/>
+        </w:rPr>
+        <w:t>a</w:t>
+      </w:r>
+      <w:r>
+        <w:rPr>
+          <w:rFonts w:ascii="Plus Jakarta Sans" w:eastAsia="Times New Roman" w:hAnsi="Plus Jakarta Sans"/>
+          <w:lang w:val="es-ES"/>
+        </w:rPr>
+        <w:t xml:space="preserve"> </w:t>
+      </w:r>
+      <w:r>
+        <w:rPr>
+          <w:rFonts w:ascii="Plus Jakarta Sans" w:eastAsia="Times New Roman" w:hAnsi="Plus Jakarta Sans"/>
+          <w:lang w:val="es-ES"/>
+        </w:rPr>
+        <w:t>Sin Escritur</w:t>
+      </w:r>
+      <w:r>
+        <w:rPr>
+          <w:rFonts w:ascii="Plus Jakarta Sans" w:eastAsia="Times New Roman" w:hAnsi="Plus Jakarta Sans"/>
+          <w:lang w:val="es-ES"/>
+        </w:rPr>
+        <w:t>a</w:t>
+      </w:r>
+      <w:r>
+        <w:rPr>
+          <w:rFonts w:ascii="Plus Jakarta Sans" w:eastAsia="Times New Roman" w:hAnsi="Plus Jakarta Sans"/>
+          <w:lang w:val="es-ES"/>
+        </w:rPr>
+        <w:t xml:space="preserve"> </w:t>
       </w:r>
     </w:p>
     <w:p>
       <w:pPr>
         <w:spacing w:before="450" w:after="450"/>
-        <w:divId w:val="583682400"/>
+        <w:divId w:val="1014452338"/>
         <w:rPr>
           <w:rFonts w:ascii="Plus Jakarta Sans" w:eastAsia="Times New Roman" w:hAnsi="Plus Jakarta Sans"/>
           <w:lang w:val="es-ES"/>
@@ -16681,7 +17970,26 @@
           <w:rFonts w:ascii="Plus Jakarta Sans" w:eastAsia="Times New Roman" w:hAnsi="Plus Jakarta Sans"/>
           <w:lang w:val="es-ES"/>
         </w:rPr>
-        <w:pict w14:anchorId="63BCD8C7">
+        <w:pict w14:anchorId="0190A629">
+          <v:rect id="_x0000_i1035" style="width:0;height:.75pt" o:hralign="center" o:hrstd="t" o:hr="t" fillcolor="#a0a0a0" stroked="f"/>
+        </w:pict>
+      </w:r>
+    </w:p>
+    <w:p>
+      <w:pPr>
+        <w:spacing w:before="450" w:after="450"/>
+        <w:divId w:val="1014452338"/>
+        <w:rPr>
+          <w:rFonts w:ascii="Plus Jakarta Sans" w:eastAsia="Times New Roman" w:hAnsi="Plus Jakarta Sans"/>
+          <w:lang w:val="es-ES"/>
+        </w:rPr>
+      </w:pPr>
+      <w:r>
+        <w:rPr>
+          <w:rFonts w:ascii="Plus Jakarta Sans" w:eastAsia="Times New Roman" w:hAnsi="Plus Jakarta Sans"/>
+          <w:lang w:val="es-ES"/>
+        </w:rPr>
+        <w:pict w14:anchorId="25433595">
           <v:rect id="_x0000_i1036" style="width:0;height:.75pt" o:hralign="center" o:hrstd="t" o:hr="t" fillcolor="#a0a0a0" stroked="f"/>
         </w:pict>
       </w:r>
@@ -16689,7 +17997,7 @@
     <w:p>
       <w:pPr>
         <w:pStyle w:val="NormalWeb"/>
-        <w:divId w:val="583682400"/>
+        <w:divId w:val="1014452338"/>
         <w:rPr>
           <w:rFonts w:ascii="Plus Jakarta Sans" w:hAnsi="Plus Jakarta Sans"/>
           <w:lang w:val="es-ES"/>
@@ -16722,7 +18030,7 @@
           <w:rFonts w:ascii="Plus Jakarta Sans" w:hAnsi="Plus Jakarta Sans"/>
           <w:lang w:val="es-ES"/>
         </w:rPr>
-        <w:pict w14:anchorId="5ED5309B"/>
+        <w:pict w14:anchorId="1E6B61EF"/>
       </w:r>
     </w:p>
     <w:sectPr>
@@ -16738,9 +18046,9 @@
 <file path=word/numbering.xml><?xml version="1.0" encoding="utf-8"?>
 <w:numbering xmlns:wpc="http://schemas.microsoft.com/office/word/2010/wordprocessingCanvas" xmlns:cx="http://schemas.microsoft.com/office/drawing/2014/chartex" xmlns:cx1="http://schemas.microsoft.com/office/drawing/2015/9/8/chartex" xmlns:cx2="http://schemas.microsoft.com/office/drawing/2015/10/21/chartex" xmlns:cx3="http://schemas.microsoft.com/office/drawing/2016/5/9/chartex" xmlns:cx4="http://schemas.microsoft.com/office/drawing/2016/5/10/chartex" xmlns:cx5="http://schemas.microsoft.com/office/drawing/2016/5/11/chartex" xmlns:cx6="http://schemas.microsoft.com/office/drawing/2016/5/12/chartex" xmlns:cx7="http://schemas.microsoft.com/office/drawing/2016/5/13/chartex" xmlns:cx8="http://schemas.microsoft.com/office/drawing/2016/5/14/chartex" xmlns:mc="http://schemas.openxmlformats.org/markup-compatibility/2006" xmlns:aink="http://schemas.microsoft.com/office/drawing/2016/ink" xmlns:am3d="http://schemas.microsoft.com/office/drawing/2017/model3d" xmlns:o="urn:schemas-microsoft-com:office:office" xmlns:r="http://schemas.openxmlformats.org/officeDocument/2006/relationships" xmlns:m="http://schemas.openxmlformats.org/officeDocument/2006/math" xmlns:v="urn:schemas-microsoft-com:vml" xmlns:wp14="http://schemas.microsoft.com/office/word/2010/wordprocessingDrawing" xmlns:wp="http://schemas.openxmlformats.org/drawingml/2006/wordprocessingDrawing" xmlns:w10="urn:schemas-microsoft-com:office:word" xmlns:w="http://schemas.openxmlformats.org/wordprocessingml/2006/main" xmlns:w14="http://schemas.microsoft.com/office/word/2010/wordml" xmlns:w15="http://schemas.microsoft.com/office/word/2012/wordml" xmlns:w16cex="http://schemas.microsoft.com/office/word/2018/wordml/cex" xmlns:w16cid="http://schemas.microsoft.com/office/word/2016/wordml/cid" xmlns:w16="http://schemas.microsoft.com/office/word/2018/wordml" xmlns:w16sdtdh="http://schemas.microsoft.com/office/word/2020/wordml/sdtdatahash" xmlns:w16se="http://schemas.microsoft.com/office/word/2015/wordml/symex" xmlns:wpg="http://schemas.microsoft.com/office/word/2010/wordprocessingGroup" xmlns:wpi="http://schemas.microsoft.com/office/word/2010/wordprocessingInk" xmlns:wne="http://schemas.microsoft.com/office/word/2006/wordml" xmlns:wps="http://schemas.microsoft.com/office/word/2010/wordprocessingShape" mc:Ignorable="w14 w15 w16se w16cid w16 w16cex w16sdtdh wp14">
   <w:abstractNum w:abstractNumId="0" w15:restartNumberingAfterBreak="0">
-    <w:nsid w:val="02524072"/>
+    <w:nsid w:val="05E83C86"/>
     <w:multiLevelType w:val="multilevel"/>
-    <w:tmpl w:val="4DA2C6DE"/>
+    <w:tmpl w:val="208852F0"/>
     <w:lvl w:ilvl="0">
       <w:start w:val="1"/>
       <w:numFmt w:val="bullet"/>
@@ -16887,9 +18195,9 @@
     </w:lvl>
   </w:abstractNum>
   <w:abstractNum w:abstractNumId="1" w15:restartNumberingAfterBreak="0">
-    <w:nsid w:val="176C34DD"/>
+    <w:nsid w:val="3A9D6304"/>
     <w:multiLevelType w:val="multilevel"/>
-    <w:tmpl w:val="918AD576"/>
+    <w:tmpl w:val="D2D4A2AE"/>
     <w:lvl w:ilvl="0">
       <w:start w:val="1"/>
       <w:numFmt w:val="bullet"/>
@@ -17036,9 +18344,9 @@
     </w:lvl>
   </w:abstractNum>
   <w:abstractNum w:abstractNumId="2" w15:restartNumberingAfterBreak="0">
-    <w:nsid w:val="1C825A2B"/>
+    <w:nsid w:val="43F975E1"/>
     <w:multiLevelType w:val="multilevel"/>
-    <w:tmpl w:val="F4EA5D14"/>
+    <w:tmpl w:val="2E8861A6"/>
     <w:lvl w:ilvl="0">
       <w:start w:val="1"/>
       <w:numFmt w:val="bullet"/>
@@ -17185,9 +18493,9 @@
     </w:lvl>
   </w:abstractNum>
   <w:abstractNum w:abstractNumId="3" w15:restartNumberingAfterBreak="0">
-    <w:nsid w:val="305908F0"/>
+    <w:nsid w:val="784F3CEE"/>
     <w:multiLevelType w:val="multilevel"/>
-    <w:tmpl w:val="052CB6C4"/>
+    <w:tmpl w:val="8CF28EC2"/>
     <w:lvl w:ilvl="0">
       <w:start w:val="1"/>
       <w:numFmt w:val="bullet"/>
@@ -17337,13 +18645,13 @@
     <w:abstractNumId w:val="2"/>
   </w:num>
   <w:num w:numId="2">
-    <w:abstractNumId w:val="0"/>
+    <w:abstractNumId w:val="3"/>
   </w:num>
   <w:num w:numId="3">
-    <w:abstractNumId w:val="3"/>
+    <w:abstractNumId w:val="1"/>
   </w:num>
   <w:num w:numId="4">
-    <w:abstractNumId w:val="1"/>
+    <w:abstractNumId w:val="0"/>
   </w:num>
 </w:numbering>
 </file>
@@ -18103,6 +19411,8 @@
       <w:rFonts w:ascii="Arial" w:hAnsi="Arial" w:cs="Arial"/>
       <w:b/>
       <w:bCs/>
+      <w:sz w:val="23"/>
+      <w:szCs w:val="23"/>
     </w:rPr>
   </w:style>
   <w:style w:type="paragraph" w:customStyle="1" w:styleId="axis-label">
@@ -18171,6 +19481,20 @@
       <w:bCs/>
       <w:sz w:val="17"/>
       <w:szCs w:val="17"/>
+    </w:rPr>
+  </w:style>
+  <w:style w:type="paragraph" w:customStyle="1" w:styleId="bar-val">
+    <w:name w:val="bar-val"/>
+    <w:basedOn w:val="Normal"/>
+    <w:pPr>
+      <w:spacing w:before="100" w:beforeAutospacing="1" w:after="90"/>
+    </w:pPr>
+    <w:rPr>
+      <w:rFonts w:ascii="Arial" w:hAnsi="Arial" w:cs="Arial"/>
+      <w:b/>
+      <w:bCs/>
+      <w:sz w:val="14"/>
+      <w:szCs w:val="14"/>
     </w:rPr>
   </w:style>
 </w:styles>

</xml_diff>

<commit_message>
data: sync QFieldCloud (4175 fichas)
</commit_message>
<xml_diff>
--- a/public/informe_reunion_tecnica.docx
+++ b/public/informe_reunion_tecnica.docx
@@ -4,7 +4,7 @@
   <w:body>
     <w:p>
       <w:pPr>
-        <w:divId w:val="265626128"/>
+        <w:divId w:val="245845440"/>
         <w:rPr>
           <w:rFonts w:ascii="Plus Jakarta Sans" w:eastAsia="Times New Roman" w:hAnsi="Plus Jakarta Sans"/>
           <w:lang w:val="es-ES"/>
@@ -28,7 +28,7 @@
     <w:p>
       <w:pPr>
         <w:pStyle w:val="Ttulo1"/>
-        <w:divId w:val="1014452338"/>
+        <w:divId w:val="1312251671"/>
         <w:rPr>
           <w:rFonts w:eastAsia="Times New Roman"/>
           <w:lang w:val="es-ES"/>
@@ -45,7 +45,7 @@
     <w:p>
       <w:pPr>
         <w:pStyle w:val="NormalWeb"/>
-        <w:divId w:val="1014452338"/>
+        <w:divId w:val="1312251671"/>
         <w:rPr>
           <w:rFonts w:ascii="Plus Jakarta Sans" w:hAnsi="Plus Jakarta Sans"/>
           <w:lang w:val="es-ES"/>
@@ -63,7 +63,7 @@
     <w:p>
       <w:pPr>
         <w:pStyle w:val="NormalWeb"/>
-        <w:divId w:val="1014452338"/>
+        <w:divId w:val="1312251671"/>
         <w:rPr>
           <w:rFonts w:ascii="Plus Jakarta Sans" w:hAnsi="Plus Jakarta Sans"/>
           <w:lang w:val="es-ES"/>
@@ -102,7 +102,7 @@
     <w:p>
       <w:pPr>
         <w:spacing w:before="450" w:after="450"/>
-        <w:divId w:val="1014452338"/>
+        <w:divId w:val="1312251671"/>
         <w:rPr>
           <w:rFonts w:ascii="Plus Jakarta Sans" w:eastAsia="Times New Roman" w:hAnsi="Plus Jakarta Sans"/>
           <w:lang w:val="es-ES"/>
@@ -113,7 +113,7 @@
           <w:rFonts w:ascii="Plus Jakarta Sans" w:eastAsia="Times New Roman" w:hAnsi="Plus Jakarta Sans"/>
           <w:lang w:val="es-ES"/>
         </w:rPr>
-        <w:pict w14:anchorId="6524F9C9">
+        <w:pict w14:anchorId="2C294813">
           <v:rect id="_x0000_i1025" style="width:0;height:.75pt" o:hralign="center" o:hrstd="t" o:hr="t" fillcolor="#a0a0a0" stroked="f"/>
         </w:pict>
       </w:r>
@@ -121,7 +121,7 @@
     <w:p>
       <w:pPr>
         <w:pStyle w:val="Ttulo2"/>
-        <w:divId w:val="1014452338"/>
+        <w:divId w:val="1312251671"/>
         <w:rPr>
           <w:rFonts w:eastAsia="Times New Roman"/>
           <w:lang w:val="es-ES"/>
@@ -145,7 +145,7 @@
     <w:p>
       <w:pPr>
         <w:pStyle w:val="NormalWeb"/>
-        <w:divId w:val="1014452338"/>
+        <w:divId w:val="1312251671"/>
         <w:rPr>
           <w:rFonts w:ascii="Plus Jakarta Sans" w:hAnsi="Plus Jakarta Sans"/>
           <w:lang w:val="es-ES"/>
@@ -167,7 +167,7 @@
         </w:numPr>
         <w:spacing w:before="100" w:beforeAutospacing="1" w:after="90"/>
         <w:ind w:left="1020"/>
-        <w:divId w:val="1014452338"/>
+        <w:divId w:val="1312251671"/>
         <w:rPr>
           <w:rFonts w:ascii="Plus Jakarta Sans" w:eastAsia="Times New Roman" w:hAnsi="Plus Jakarta Sans"/>
           <w:sz w:val="21"/>
@@ -202,7 +202,7 @@
           <w:szCs w:val="21"/>
           <w:lang w:val="es-ES"/>
         </w:rPr>
-        <w:t>4,171 fichas</w:t>
+        <w:t>4,175 fichas</w:t>
       </w:r>
     </w:p>
     <w:p>
@@ -213,7 +213,7 @@
         </w:numPr>
         <w:spacing w:before="100" w:beforeAutospacing="1" w:after="90"/>
         <w:ind w:left="1020"/>
-        <w:divId w:val="1014452338"/>
+        <w:divId w:val="1312251671"/>
         <w:rPr>
           <w:rFonts w:ascii="Plus Jakarta Sans" w:eastAsia="Times New Roman" w:hAnsi="Plus Jakarta Sans"/>
           <w:sz w:val="21"/>
@@ -258,7 +258,7 @@
           <w:szCs w:val="21"/>
           <w:lang w:val="es-ES"/>
         </w:rPr>
-        <w:t>3,021 polígonos unificados</w:t>
+        <w:t>3,026 polígonos unificados</w:t>
       </w:r>
     </w:p>
     <w:p>
@@ -269,7 +269,7 @@
         </w:numPr>
         <w:spacing w:before="100" w:beforeAutospacing="1" w:after="90"/>
         <w:ind w:left="1020"/>
-        <w:divId w:val="1014452338"/>
+        <w:divId w:val="1312251671"/>
         <w:rPr>
           <w:rFonts w:ascii="Plus Jakarta Sans" w:eastAsia="Times New Roman" w:hAnsi="Plus Jakarta Sans"/>
           <w:sz w:val="21"/>
@@ -304,7 +304,7 @@
           <w:szCs w:val="21"/>
           <w:lang w:val="es-ES"/>
         </w:rPr>
-        <w:t>8,144 parcelas agrícolas</w:t>
+        <w:t>8,188 parcelas agrícolas</w:t>
       </w:r>
     </w:p>
     <w:p>
@@ -315,7 +315,7 @@
         </w:numPr>
         <w:spacing w:before="100" w:beforeAutospacing="1" w:after="90"/>
         <w:ind w:left="1020"/>
-        <w:divId w:val="1014452338"/>
+        <w:divId w:val="1312251671"/>
         <w:rPr>
           <w:rFonts w:ascii="Plus Jakarta Sans" w:eastAsia="Times New Roman" w:hAnsi="Plus Jakarta Sans"/>
           <w:sz w:val="21"/>
@@ -350,13 +350,13 @@
           <w:szCs w:val="21"/>
           <w:lang w:val="es-ES"/>
         </w:rPr>
-        <w:t>163,062 especies pecuarias</w:t>
+        <w:t>163,831 especies pecuarias</w:t>
       </w:r>
     </w:p>
     <w:p>
       <w:pPr>
         <w:spacing w:before="450" w:after="450"/>
-        <w:divId w:val="1014452338"/>
+        <w:divId w:val="1312251671"/>
         <w:rPr>
           <w:rFonts w:ascii="Plus Jakarta Sans" w:eastAsia="Times New Roman" w:hAnsi="Plus Jakarta Sans"/>
           <w:lang w:val="es-ES"/>
@@ -367,7 +367,7 @@
           <w:rFonts w:ascii="Plus Jakarta Sans" w:eastAsia="Times New Roman" w:hAnsi="Plus Jakarta Sans"/>
           <w:lang w:val="es-ES"/>
         </w:rPr>
-        <w:pict w14:anchorId="568F90C6">
+        <w:pict w14:anchorId="46BECF94">
           <v:rect id="_x0000_i1026" style="width:0;height:.75pt" o:hralign="center" o:hrstd="t" o:hr="t" fillcolor="#a0a0a0" stroked="f"/>
         </w:pict>
       </w:r>
@@ -375,7 +375,7 @@
     <w:p>
       <w:pPr>
         <w:pStyle w:val="Ttulo2"/>
-        <w:divId w:val="1014452338"/>
+        <w:divId w:val="1312251671"/>
         <w:rPr>
           <w:rFonts w:eastAsia="Times New Roman"/>
           <w:lang w:val="es-ES"/>
@@ -392,7 +392,7 @@
     <w:p>
       <w:pPr>
         <w:pStyle w:val="NormalWeb"/>
-        <w:divId w:val="1014452338"/>
+        <w:divId w:val="1312251671"/>
         <w:rPr>
           <w:rFonts w:ascii="Plus Jakarta Sans" w:hAnsi="Plus Jakarta Sans"/>
           <w:lang w:val="es-ES"/>
@@ -445,7 +445,7 @@
       </w:tblGrid>
       <w:tr>
         <w:trPr>
-          <w:divId w:val="1471554610"/>
+          <w:divId w:val="515659461"/>
           <w:tblHeader/>
         </w:trPr>
         <w:tc>
@@ -525,7 +525,7 @@
       </w:tr>
       <w:tr>
         <w:trPr>
-          <w:divId w:val="1471554610"/>
+          <w:divId w:val="515659461"/>
         </w:trPr>
         <w:tc>
           <w:tcPr>
@@ -591,7 +591,7 @@
       </w:tr>
       <w:tr>
         <w:trPr>
-          <w:divId w:val="1471554610"/>
+          <w:divId w:val="515659461"/>
         </w:trPr>
         <w:tc>
           <w:tcPr>
@@ -650,14 +650,14 @@
                 <w:sz w:val="20"/>
                 <w:szCs w:val="20"/>
               </w:rPr>
-              <w:t>391</w:t>
+              <w:t>396</w:t>
             </w:r>
           </w:p>
         </w:tc>
       </w:tr>
       <w:tr>
         <w:trPr>
-          <w:divId w:val="1471554610"/>
+          <w:divId w:val="515659461"/>
         </w:trPr>
         <w:tc>
           <w:tcPr>
@@ -723,7 +723,7 @@
       </w:tr>
       <w:tr>
         <w:trPr>
-          <w:divId w:val="1471554610"/>
+          <w:divId w:val="515659461"/>
         </w:trPr>
         <w:tc>
           <w:tcPr>
@@ -782,7 +782,7 @@
                 <w:sz w:val="20"/>
                 <w:szCs w:val="20"/>
               </w:rPr>
-              <w:t>249</w:t>
+              <w:t>248</w:t>
             </w:r>
           </w:p>
         </w:tc>
@@ -791,7 +791,7 @@
     <w:p>
       <w:pPr>
         <w:spacing w:before="450" w:after="450"/>
-        <w:divId w:val="1014452338"/>
+        <w:divId w:val="1312251671"/>
         <w:rPr>
           <w:rFonts w:ascii="Plus Jakarta Sans" w:eastAsia="Times New Roman" w:hAnsi="Plus Jakarta Sans"/>
           <w:lang w:val="es-ES"/>
@@ -803,7 +803,7 @@
           <w:lang w:val="es-ES"/>
         </w:rPr>
         <w:lastRenderedPageBreak/>
-        <w:pict w14:anchorId="5CB1E654">
+        <w:pict w14:anchorId="212E2FF8">
           <v:rect id="_x0000_i1027" style="width:0;height:.75pt" o:hralign="center" o:hrstd="t" o:hr="t" fillcolor="#a0a0a0" stroked="f"/>
         </w:pict>
       </w:r>
@@ -811,7 +811,7 @@
     <w:p>
       <w:pPr>
         <w:pStyle w:val="Ttulo2"/>
-        <w:divId w:val="1014452338"/>
+        <w:divId w:val="1312251671"/>
         <w:rPr>
           <w:rFonts w:eastAsia="Times New Roman"/>
           <w:lang w:val="es-ES"/>
@@ -828,7 +828,7 @@
     <w:p>
       <w:pPr>
         <w:pStyle w:val="Ttulo3"/>
-        <w:divId w:val="1014452338"/>
+        <w:divId w:val="1312251671"/>
         <w:rPr>
           <w:rFonts w:eastAsia="Times New Roman"/>
           <w:lang w:val="es-ES"/>
@@ -845,7 +845,7 @@
     <w:p>
       <w:pPr>
         <w:pStyle w:val="NormalWeb"/>
-        <w:divId w:val="1014452338"/>
+        <w:divId w:val="1312251671"/>
         <w:rPr>
           <w:rFonts w:ascii="Plus Jakarta Sans" w:hAnsi="Plus Jakarta Sans"/>
           <w:lang w:val="es-ES"/>
@@ -885,7 +885,7 @@
       </w:tblGrid>
       <w:tr>
         <w:trPr>
-          <w:divId w:val="512571602"/>
+          <w:divId w:val="2097090985"/>
           <w:tblHeader/>
         </w:trPr>
         <w:tc>
@@ -1039,7 +1039,7 @@
       </w:tr>
       <w:tr>
         <w:trPr>
-          <w:divId w:val="512571602"/>
+          <w:divId w:val="2097090985"/>
         </w:trPr>
         <w:tc>
           <w:tcPr>
@@ -1128,44 +1128,44 @@
                 <w:sz w:val="20"/>
                 <w:szCs w:val="20"/>
               </w:rPr>
-              <w:t>1,633</w:t>
-            </w:r>
-          </w:p>
-        </w:tc>
-        <w:tc>
-          <w:tcPr>
-            <w:tcW w:w="0" w:type="auto"/>
-            <w:tcMar>
-              <w:top w:w="150" w:type="dxa"/>
-              <w:left w:w="210" w:type="dxa"/>
-              <w:bottom w:w="150" w:type="dxa"/>
-              <w:right w:w="210" w:type="dxa"/>
-            </w:tcMar>
-            <w:vAlign w:val="center"/>
-            <w:hideMark/>
-          </w:tcPr>
-          <w:p>
-            <w:pPr>
-              <w:rPr>
-                <w:rFonts w:ascii="Plus Jakarta Sans" w:eastAsia="Times New Roman" w:hAnsi="Plus Jakarta Sans"/>
-                <w:sz w:val="20"/>
-                <w:szCs w:val="20"/>
-              </w:rPr>
-            </w:pPr>
-            <w:r>
-              <w:rPr>
-                <w:rFonts w:ascii="Plus Jakarta Sans" w:eastAsia="Times New Roman" w:hAnsi="Plus Jakarta Sans"/>
-                <w:sz w:val="20"/>
-                <w:szCs w:val="20"/>
-              </w:rPr>
-              <w:t>817</w:t>
+              <w:t>1,632</w:t>
+            </w:r>
+          </w:p>
+        </w:tc>
+        <w:tc>
+          <w:tcPr>
+            <w:tcW w:w="0" w:type="auto"/>
+            <w:tcMar>
+              <w:top w:w="150" w:type="dxa"/>
+              <w:left w:w="210" w:type="dxa"/>
+              <w:bottom w:w="150" w:type="dxa"/>
+              <w:right w:w="210" w:type="dxa"/>
+            </w:tcMar>
+            <w:vAlign w:val="center"/>
+            <w:hideMark/>
+          </w:tcPr>
+          <w:p>
+            <w:pPr>
+              <w:rPr>
+                <w:rFonts w:ascii="Plus Jakarta Sans" w:eastAsia="Times New Roman" w:hAnsi="Plus Jakarta Sans"/>
+                <w:sz w:val="20"/>
+                <w:szCs w:val="20"/>
+              </w:rPr>
+            </w:pPr>
+            <w:r>
+              <w:rPr>
+                <w:rFonts w:ascii="Plus Jakarta Sans" w:eastAsia="Times New Roman" w:hAnsi="Plus Jakarta Sans"/>
+                <w:sz w:val="20"/>
+                <w:szCs w:val="20"/>
+              </w:rPr>
+              <w:t>822</w:t>
             </w:r>
           </w:p>
         </w:tc>
       </w:tr>
       <w:tr>
         <w:trPr>
-          <w:divId w:val="512571602"/>
+          <w:divId w:val="2097090985"/>
         </w:trPr>
         <w:tc>
           <w:tcPr>
@@ -1254,44 +1254,44 @@
                 <w:sz w:val="20"/>
                 <w:szCs w:val="20"/>
               </w:rPr>
-              <w:t>38,555,361.77 m²</w:t>
-            </w:r>
-          </w:p>
-        </w:tc>
-        <w:tc>
-          <w:tcPr>
-            <w:tcW w:w="0" w:type="auto"/>
-            <w:tcMar>
-              <w:top w:w="150" w:type="dxa"/>
-              <w:left w:w="210" w:type="dxa"/>
-              <w:bottom w:w="150" w:type="dxa"/>
-              <w:right w:w="210" w:type="dxa"/>
-            </w:tcMar>
-            <w:vAlign w:val="center"/>
-            <w:hideMark/>
-          </w:tcPr>
-          <w:p>
-            <w:pPr>
-              <w:rPr>
-                <w:rFonts w:ascii="Plus Jakarta Sans" w:eastAsia="Times New Roman" w:hAnsi="Plus Jakarta Sans"/>
-                <w:sz w:val="20"/>
-                <w:szCs w:val="20"/>
-              </w:rPr>
-            </w:pPr>
-            <w:r>
-              <w:rPr>
-                <w:rFonts w:ascii="Plus Jakarta Sans" w:eastAsia="Times New Roman" w:hAnsi="Plus Jakarta Sans"/>
-                <w:sz w:val="20"/>
-                <w:szCs w:val="20"/>
-              </w:rPr>
-              <w:t>31,705,920.82 m²</w:t>
+              <w:t>38,540,367.36 m²</w:t>
+            </w:r>
+          </w:p>
+        </w:tc>
+        <w:tc>
+          <w:tcPr>
+            <w:tcW w:w="0" w:type="auto"/>
+            <w:tcMar>
+              <w:top w:w="150" w:type="dxa"/>
+              <w:left w:w="210" w:type="dxa"/>
+              <w:bottom w:w="150" w:type="dxa"/>
+              <w:right w:w="210" w:type="dxa"/>
+            </w:tcMar>
+            <w:vAlign w:val="center"/>
+            <w:hideMark/>
+          </w:tcPr>
+          <w:p>
+            <w:pPr>
+              <w:rPr>
+                <w:rFonts w:ascii="Plus Jakarta Sans" w:eastAsia="Times New Roman" w:hAnsi="Plus Jakarta Sans"/>
+                <w:sz w:val="20"/>
+                <w:szCs w:val="20"/>
+              </w:rPr>
+            </w:pPr>
+            <w:r>
+              <w:rPr>
+                <w:rFonts w:ascii="Plus Jakarta Sans" w:eastAsia="Times New Roman" w:hAnsi="Plus Jakarta Sans"/>
+                <w:sz w:val="20"/>
+                <w:szCs w:val="20"/>
+              </w:rPr>
+              <w:t>31,755,316.64 m²</w:t>
             </w:r>
           </w:p>
         </w:tc>
       </w:tr>
       <w:tr>
         <w:trPr>
-          <w:divId w:val="512571602"/>
+          <w:divId w:val="2097090985"/>
         </w:trPr>
         <w:tc>
           <w:tcPr>
@@ -1380,44 +1380,44 @@
                 <w:sz w:val="20"/>
                 <w:szCs w:val="20"/>
               </w:rPr>
-              <w:t>23,610.14 m² (2.361 ha)</w:t>
-            </w:r>
-          </w:p>
-        </w:tc>
-        <w:tc>
-          <w:tcPr>
-            <w:tcW w:w="0" w:type="auto"/>
-            <w:tcMar>
-              <w:top w:w="150" w:type="dxa"/>
-              <w:left w:w="210" w:type="dxa"/>
-              <w:bottom w:w="150" w:type="dxa"/>
-              <w:right w:w="210" w:type="dxa"/>
-            </w:tcMar>
-            <w:vAlign w:val="center"/>
-            <w:hideMark/>
-          </w:tcPr>
-          <w:p>
-            <w:pPr>
-              <w:rPr>
-                <w:rFonts w:ascii="Plus Jakarta Sans" w:eastAsia="Times New Roman" w:hAnsi="Plus Jakarta Sans"/>
-                <w:sz w:val="20"/>
-                <w:szCs w:val="20"/>
-              </w:rPr>
-            </w:pPr>
-            <w:r>
-              <w:rPr>
-                <w:rFonts w:ascii="Plus Jakarta Sans" w:eastAsia="Times New Roman" w:hAnsi="Plus Jakarta Sans"/>
-                <w:sz w:val="20"/>
-                <w:szCs w:val="20"/>
-              </w:rPr>
-              <w:t>38,807.74 m² (3.881 ha)</w:t>
+              <w:t>23,615.42 m² (2.362 ha)</w:t>
+            </w:r>
+          </w:p>
+        </w:tc>
+        <w:tc>
+          <w:tcPr>
+            <w:tcW w:w="0" w:type="auto"/>
+            <w:tcMar>
+              <w:top w:w="150" w:type="dxa"/>
+              <w:left w:w="210" w:type="dxa"/>
+              <w:bottom w:w="150" w:type="dxa"/>
+              <w:right w:w="210" w:type="dxa"/>
+            </w:tcMar>
+            <w:vAlign w:val="center"/>
+            <w:hideMark/>
+          </w:tcPr>
+          <w:p>
+            <w:pPr>
+              <w:rPr>
+                <w:rFonts w:ascii="Plus Jakarta Sans" w:eastAsia="Times New Roman" w:hAnsi="Plus Jakarta Sans"/>
+                <w:sz w:val="20"/>
+                <w:szCs w:val="20"/>
+              </w:rPr>
+            </w:pPr>
+            <w:r>
+              <w:rPr>
+                <w:rFonts w:ascii="Plus Jakarta Sans" w:eastAsia="Times New Roman" w:hAnsi="Plus Jakarta Sans"/>
+                <w:sz w:val="20"/>
+                <w:szCs w:val="20"/>
+              </w:rPr>
+              <w:t>38,631.77 m² (3.863 ha)</w:t>
             </w:r>
           </w:p>
         </w:tc>
       </w:tr>
       <w:tr>
         <w:trPr>
-          <w:divId w:val="512571602"/>
+          <w:divId w:val="2097090985"/>
         </w:trPr>
         <w:tc>
           <w:tcPr>
@@ -1506,44 +1506,44 @@
                 <w:sz w:val="20"/>
                 <w:szCs w:val="20"/>
               </w:rPr>
-              <w:t>24,686,577.09 m²</w:t>
-            </w:r>
-          </w:p>
-        </w:tc>
-        <w:tc>
-          <w:tcPr>
-            <w:tcW w:w="0" w:type="auto"/>
-            <w:tcMar>
-              <w:top w:w="150" w:type="dxa"/>
-              <w:left w:w="210" w:type="dxa"/>
-              <w:bottom w:w="150" w:type="dxa"/>
-              <w:right w:w="210" w:type="dxa"/>
-            </w:tcMar>
-            <w:vAlign w:val="center"/>
-            <w:hideMark/>
-          </w:tcPr>
-          <w:p>
-            <w:pPr>
-              <w:rPr>
-                <w:rFonts w:ascii="Plus Jakarta Sans" w:eastAsia="Times New Roman" w:hAnsi="Plus Jakarta Sans"/>
-                <w:sz w:val="20"/>
-                <w:szCs w:val="20"/>
-              </w:rPr>
-            </w:pPr>
-            <w:r>
-              <w:rPr>
-                <w:rFonts w:ascii="Plus Jakarta Sans" w:eastAsia="Times New Roman" w:hAnsi="Plus Jakarta Sans"/>
-                <w:sz w:val="20"/>
-                <w:szCs w:val="20"/>
-              </w:rPr>
-              <w:t>15,491,499.20 m²</w:t>
+              <w:t>24,671,582.68 m²</w:t>
+            </w:r>
+          </w:p>
+        </w:tc>
+        <w:tc>
+          <w:tcPr>
+            <w:tcW w:w="0" w:type="auto"/>
+            <w:tcMar>
+              <w:top w:w="150" w:type="dxa"/>
+              <w:left w:w="210" w:type="dxa"/>
+              <w:bottom w:w="150" w:type="dxa"/>
+              <w:right w:w="210" w:type="dxa"/>
+            </w:tcMar>
+            <w:vAlign w:val="center"/>
+            <w:hideMark/>
+          </w:tcPr>
+          <w:p>
+            <w:pPr>
+              <w:rPr>
+                <w:rFonts w:ascii="Plus Jakarta Sans" w:eastAsia="Times New Roman" w:hAnsi="Plus Jakarta Sans"/>
+                <w:sz w:val="20"/>
+                <w:szCs w:val="20"/>
+              </w:rPr>
+            </w:pPr>
+            <w:r>
+              <w:rPr>
+                <w:rFonts w:ascii="Plus Jakarta Sans" w:eastAsia="Times New Roman" w:hAnsi="Plus Jakarta Sans"/>
+                <w:sz w:val="20"/>
+                <w:szCs w:val="20"/>
+              </w:rPr>
+              <w:t>15,533,612.34 m²</w:t>
             </w:r>
           </w:p>
         </w:tc>
       </w:tr>
       <w:tr>
         <w:trPr>
-          <w:divId w:val="512571602"/>
+          <w:divId w:val="2097090985"/>
         </w:trPr>
         <w:tc>
           <w:tcPr>
@@ -1632,7 +1632,7 @@
                 <w:sz w:val="20"/>
                 <w:szCs w:val="20"/>
               </w:rPr>
-              <w:t>15,117.32 m² (1.</w:t>
+              <w:t>15,117.39 m² (1.</w:t>
             </w:r>
             <w:r>
               <w:rPr>
@@ -1670,14 +1670,14 @@
                 <w:sz w:val="20"/>
                 <w:szCs w:val="20"/>
               </w:rPr>
-              <w:t>18,961.44 m² (1.896 ha)</w:t>
+              <w:t>18,897.34 m² (1.890 ha)</w:t>
             </w:r>
           </w:p>
         </w:tc>
       </w:tr>
       <w:tr>
         <w:trPr>
-          <w:divId w:val="512571602"/>
+          <w:divId w:val="2097090985"/>
         </w:trPr>
         <w:tc>
           <w:tcPr>
@@ -1796,14 +1796,14 @@
                 <w:sz w:val="20"/>
                 <w:szCs w:val="20"/>
               </w:rPr>
-              <w:t>16,214,421.62 m² (1621.44 ha)</w:t>
+              <w:t>16,221,704.30 m² (1622.17 ha)</w:t>
             </w:r>
           </w:p>
         </w:tc>
       </w:tr>
       <w:tr>
         <w:trPr>
-          <w:divId w:val="512571602"/>
+          <w:divId w:val="2097090985"/>
         </w:trPr>
         <w:tc>
           <w:tcPr>
@@ -1862,74 +1862,74 @@
                 <w:sz w:val="20"/>
                 <w:szCs w:val="20"/>
               </w:rPr>
-              <w:t>4,073 (50.0%)</w:t>
-            </w:r>
-          </w:p>
-        </w:tc>
-        <w:tc>
-          <w:tcPr>
-            <w:tcW w:w="0" w:type="auto"/>
-            <w:tcMar>
-              <w:top w:w="150" w:type="dxa"/>
-              <w:left w:w="210" w:type="dxa"/>
-              <w:bottom w:w="150" w:type="dxa"/>
-              <w:right w:w="210" w:type="dxa"/>
-            </w:tcMar>
-            <w:vAlign w:val="center"/>
-            <w:hideMark/>
-          </w:tcPr>
-          <w:p>
-            <w:pPr>
-              <w:rPr>
-                <w:rFonts w:ascii="Plus Jakarta Sans" w:eastAsia="Times New Roman" w:hAnsi="Plus Jakarta Sans"/>
-                <w:sz w:val="20"/>
-                <w:szCs w:val="20"/>
-              </w:rPr>
-            </w:pPr>
-            <w:r>
-              <w:rPr>
-                <w:rFonts w:ascii="Plus Jakarta Sans" w:eastAsia="Times New Roman" w:hAnsi="Plus Jakarta Sans"/>
-                <w:sz w:val="20"/>
-                <w:szCs w:val="20"/>
-              </w:rPr>
-              <w:t>2,391 (29.4%)</w:t>
-            </w:r>
-          </w:p>
-        </w:tc>
-        <w:tc>
-          <w:tcPr>
-            <w:tcW w:w="0" w:type="auto"/>
-            <w:tcMar>
-              <w:top w:w="150" w:type="dxa"/>
-              <w:left w:w="210" w:type="dxa"/>
-              <w:bottom w:w="150" w:type="dxa"/>
-              <w:right w:w="210" w:type="dxa"/>
-            </w:tcMar>
-            <w:vAlign w:val="center"/>
-            <w:hideMark/>
-          </w:tcPr>
-          <w:p>
-            <w:pPr>
-              <w:rPr>
-                <w:rFonts w:ascii="Plus Jakarta Sans" w:eastAsia="Times New Roman" w:hAnsi="Plus Jakarta Sans"/>
-                <w:sz w:val="20"/>
-                <w:szCs w:val="20"/>
-              </w:rPr>
-            </w:pPr>
-            <w:r>
-              <w:rPr>
-                <w:rFonts w:ascii="Plus Jakarta Sans" w:eastAsia="Times New Roman" w:hAnsi="Plus Jakarta Sans"/>
-                <w:sz w:val="20"/>
-                <w:szCs w:val="20"/>
-              </w:rPr>
-              <w:t>1,462 (18.0%)</w:t>
+              <w:t>4,073 (49.7%)</w:t>
+            </w:r>
+          </w:p>
+        </w:tc>
+        <w:tc>
+          <w:tcPr>
+            <w:tcW w:w="0" w:type="auto"/>
+            <w:tcMar>
+              <w:top w:w="150" w:type="dxa"/>
+              <w:left w:w="210" w:type="dxa"/>
+              <w:bottom w:w="150" w:type="dxa"/>
+              <w:right w:w="210" w:type="dxa"/>
+            </w:tcMar>
+            <w:vAlign w:val="center"/>
+            <w:hideMark/>
+          </w:tcPr>
+          <w:p>
+            <w:pPr>
+              <w:rPr>
+                <w:rFonts w:ascii="Plus Jakarta Sans" w:eastAsia="Times New Roman" w:hAnsi="Plus Jakarta Sans"/>
+                <w:sz w:val="20"/>
+                <w:szCs w:val="20"/>
+              </w:rPr>
+            </w:pPr>
+            <w:r>
+              <w:rPr>
+                <w:rFonts w:ascii="Plus Jakarta Sans" w:eastAsia="Times New Roman" w:hAnsi="Plus Jakarta Sans"/>
+                <w:sz w:val="20"/>
+                <w:szCs w:val="20"/>
+              </w:rPr>
+              <w:t>2,391 (29.2%)</w:t>
+            </w:r>
+          </w:p>
+        </w:tc>
+        <w:tc>
+          <w:tcPr>
+            <w:tcW w:w="0" w:type="auto"/>
+            <w:tcMar>
+              <w:top w:w="150" w:type="dxa"/>
+              <w:left w:w="210" w:type="dxa"/>
+              <w:bottom w:w="150" w:type="dxa"/>
+              <w:right w:w="210" w:type="dxa"/>
+            </w:tcMar>
+            <w:vAlign w:val="center"/>
+            <w:hideMark/>
+          </w:tcPr>
+          <w:p>
+            <w:pPr>
+              <w:rPr>
+                <w:rFonts w:ascii="Plus Jakarta Sans" w:eastAsia="Times New Roman" w:hAnsi="Plus Jakarta Sans"/>
+                <w:sz w:val="20"/>
+                <w:szCs w:val="20"/>
+              </w:rPr>
+            </w:pPr>
+            <w:r>
+              <w:rPr>
+                <w:rFonts w:ascii="Plus Jakarta Sans" w:eastAsia="Times New Roman" w:hAnsi="Plus Jakarta Sans"/>
+                <w:sz w:val="20"/>
+                <w:szCs w:val="20"/>
+              </w:rPr>
+              <w:t>1,505 (18.4%)</w:t>
             </w:r>
           </w:p>
         </w:tc>
       </w:tr>
       <w:tr>
         <w:trPr>
-          <w:divId w:val="512571602"/>
+          <w:divId w:val="2097090985"/>
         </w:trPr>
         <w:tc>
           <w:tcPr>
@@ -1988,67 +1988,67 @@
                 <w:sz w:val="20"/>
                 <w:szCs w:val="20"/>
               </w:rPr>
-              <w:t>46,764 (28.7%)</w:t>
-            </w:r>
-          </w:p>
-        </w:tc>
-        <w:tc>
-          <w:tcPr>
-            <w:tcW w:w="0" w:type="auto"/>
-            <w:tcMar>
-              <w:top w:w="150" w:type="dxa"/>
-              <w:left w:w="210" w:type="dxa"/>
-              <w:bottom w:w="150" w:type="dxa"/>
-              <w:right w:w="210" w:type="dxa"/>
-            </w:tcMar>
-            <w:vAlign w:val="center"/>
-            <w:hideMark/>
-          </w:tcPr>
-          <w:p>
-            <w:pPr>
-              <w:rPr>
-                <w:rFonts w:ascii="Plus Jakarta Sans" w:eastAsia="Times New Roman" w:hAnsi="Plus Jakarta Sans"/>
-                <w:sz w:val="20"/>
-                <w:szCs w:val="20"/>
-              </w:rPr>
-            </w:pPr>
-            <w:r>
-              <w:rPr>
-                <w:rFonts w:ascii="Plus Jakarta Sans" w:eastAsia="Times New Roman" w:hAnsi="Plus Jakarta Sans"/>
-                <w:sz w:val="20"/>
-                <w:szCs w:val="20"/>
-              </w:rPr>
-              <w:t>35,076 (21.5%)</w:t>
-            </w:r>
-          </w:p>
-        </w:tc>
-        <w:tc>
-          <w:tcPr>
-            <w:tcW w:w="0" w:type="auto"/>
-            <w:tcMar>
-              <w:top w:w="150" w:type="dxa"/>
-              <w:left w:w="210" w:type="dxa"/>
-              <w:bottom w:w="150" w:type="dxa"/>
-              <w:right w:w="210" w:type="dxa"/>
-            </w:tcMar>
-            <w:vAlign w:val="center"/>
-            <w:hideMark/>
-          </w:tcPr>
-          <w:p>
-            <w:pPr>
-              <w:rPr>
-                <w:rFonts w:ascii="Plus Jakarta Sans" w:eastAsia="Times New Roman" w:hAnsi="Plus Jakarta Sans"/>
-                <w:sz w:val="20"/>
-                <w:szCs w:val="20"/>
-              </w:rPr>
-            </w:pPr>
-            <w:r>
-              <w:rPr>
-                <w:rFonts w:ascii="Plus Jakarta Sans" w:eastAsia="Times New Roman" w:hAnsi="Plus Jakarta Sans"/>
-                <w:sz w:val="20"/>
-                <w:szCs w:val="20"/>
-              </w:rPr>
-              <w:t>78,689 (48.3%)</w:t>
+              <w:t>46,764 (28.5%)</w:t>
+            </w:r>
+          </w:p>
+        </w:tc>
+        <w:tc>
+          <w:tcPr>
+            <w:tcW w:w="0" w:type="auto"/>
+            <w:tcMar>
+              <w:top w:w="150" w:type="dxa"/>
+              <w:left w:w="210" w:type="dxa"/>
+              <w:bottom w:w="150" w:type="dxa"/>
+              <w:right w:w="210" w:type="dxa"/>
+            </w:tcMar>
+            <w:vAlign w:val="center"/>
+            <w:hideMark/>
+          </w:tcPr>
+          <w:p>
+            <w:pPr>
+              <w:rPr>
+                <w:rFonts w:ascii="Plus Jakarta Sans" w:eastAsia="Times New Roman" w:hAnsi="Plus Jakarta Sans"/>
+                <w:sz w:val="20"/>
+                <w:szCs w:val="20"/>
+              </w:rPr>
+            </w:pPr>
+            <w:r>
+              <w:rPr>
+                <w:rFonts w:ascii="Plus Jakarta Sans" w:eastAsia="Times New Roman" w:hAnsi="Plus Jakarta Sans"/>
+                <w:sz w:val="20"/>
+                <w:szCs w:val="20"/>
+              </w:rPr>
+              <w:t>35,076 (21.4%)</w:t>
+            </w:r>
+          </w:p>
+        </w:tc>
+        <w:tc>
+          <w:tcPr>
+            <w:tcW w:w="0" w:type="auto"/>
+            <w:tcMar>
+              <w:top w:w="150" w:type="dxa"/>
+              <w:left w:w="210" w:type="dxa"/>
+              <w:bottom w:w="150" w:type="dxa"/>
+              <w:right w:w="210" w:type="dxa"/>
+            </w:tcMar>
+            <w:vAlign w:val="center"/>
+            <w:hideMark/>
+          </w:tcPr>
+          <w:p>
+            <w:pPr>
+              <w:rPr>
+                <w:rFonts w:ascii="Plus Jakarta Sans" w:eastAsia="Times New Roman" w:hAnsi="Plus Jakarta Sans"/>
+                <w:sz w:val="20"/>
+                <w:szCs w:val="20"/>
+              </w:rPr>
+            </w:pPr>
+            <w:r>
+              <w:rPr>
+                <w:rFonts w:ascii="Plus Jakarta Sans" w:eastAsia="Times New Roman" w:hAnsi="Plus Jakarta Sans"/>
+                <w:sz w:val="20"/>
+                <w:szCs w:val="20"/>
+              </w:rPr>
+              <w:t>79,458 (48.5%)</w:t>
             </w:r>
           </w:p>
         </w:tc>
@@ -2057,7 +2057,7 @@
     <w:p>
       <w:pPr>
         <w:pStyle w:val="Ttulo3"/>
-        <w:divId w:val="1014452338"/>
+        <w:divId w:val="1312251671"/>
         <w:rPr>
           <w:rFonts w:eastAsia="Times New Roman"/>
           <w:lang w:val="es-ES"/>
@@ -2074,7 +2074,7 @@
     <w:p>
       <w:pPr>
         <w:pStyle w:val="NormalWeb"/>
-        <w:divId w:val="1014452338"/>
+        <w:divId w:val="1312251671"/>
         <w:rPr>
           <w:rFonts w:ascii="Plus Jakarta Sans" w:hAnsi="Plus Jakarta Sans"/>
           <w:lang w:val="es-ES"/>
@@ -2103,7 +2103,7 @@
         </w:numPr>
         <w:spacing w:before="100" w:beforeAutospacing="1" w:after="90"/>
         <w:ind w:left="1020"/>
-        <w:divId w:val="1014452338"/>
+        <w:divId w:val="1312251671"/>
         <w:rPr>
           <w:rFonts w:ascii="Plus Jakarta Sans" w:eastAsia="Times New Roman" w:hAnsi="Plus Jakarta Sans"/>
           <w:sz w:val="21"/>
@@ -2138,7 +2138,7 @@
           <w:szCs w:val="21"/>
           <w:lang w:val="es-ES"/>
         </w:rPr>
-        <w:t>50.0%</w:t>
+        <w:t>49.7%</w:t>
       </w:r>
       <w:r>
         <w:rPr>
@@ -2157,7 +2157,7 @@
           <w:szCs w:val="21"/>
           <w:lang w:val="es-ES"/>
         </w:rPr>
-        <w:t>28.7%</w:t>
+        <w:t>28.5%</w:t>
       </w:r>
       <w:r>
         <w:rPr>
@@ -2205,7 +2205,7 @@
         </w:numPr>
         <w:spacing w:before="100" w:beforeAutospacing="1" w:after="90"/>
         <w:ind w:left="1020"/>
-        <w:divId w:val="1014452338"/>
+        <w:divId w:val="1312251671"/>
         <w:rPr>
           <w:rFonts w:ascii="Plus Jakarta Sans" w:eastAsia="Times New Roman" w:hAnsi="Plus Jakarta Sans"/>
           <w:sz w:val="21"/>
@@ -2249,7 +2249,7 @@
           <w:szCs w:val="21"/>
           <w:lang w:val="es-ES"/>
         </w:rPr>
-        <w:t>29.4%</w:t>
+        <w:t>29.2%</w:t>
       </w:r>
       <w:r>
         <w:rPr>
@@ -2268,7 +2268,7 @@
           <w:szCs w:val="21"/>
           <w:lang w:val="es-ES"/>
         </w:rPr>
-        <w:t>21.5%</w:t>
+        <w:t>21.4%</w:t>
       </w:r>
       <w:r>
         <w:rPr>
@@ -2317,7 +2317,7 @@
         </w:numPr>
         <w:spacing w:before="100" w:beforeAutospacing="1" w:after="90"/>
         <w:ind w:left="1020"/>
-        <w:divId w:val="1014452338"/>
+        <w:divId w:val="1312251671"/>
         <w:rPr>
           <w:rFonts w:ascii="Plus Jakarta Sans" w:eastAsia="Times New Roman" w:hAnsi="Plus Jakarta Sans"/>
           <w:sz w:val="21"/>
@@ -2361,7 +2361,7 @@
           <w:szCs w:val="21"/>
           <w:lang w:val="es-ES"/>
         </w:rPr>
-        <w:t>1621.44 ha</w:t>
+        <w:t>1622.17 ha</w:t>
       </w:r>
       <w:r>
         <w:rPr>
@@ -2399,7 +2399,7 @@
           <w:szCs w:val="21"/>
           <w:lang w:val="es-ES"/>
         </w:rPr>
-        <w:t>18.0%</w:t>
+        <w:t>18.4%</w:t>
       </w:r>
       <w:r>
         <w:rPr>
@@ -2423,7 +2423,7 @@
     <w:p>
       <w:pPr>
         <w:pStyle w:val="Ttulo3"/>
-        <w:divId w:val="1014452338"/>
+        <w:divId w:val="1312251671"/>
         <w:rPr>
           <w:rFonts w:eastAsia="Times New Roman"/>
           <w:lang w:val="es-ES"/>
@@ -2440,7 +2440,7 @@
     <w:p>
       <w:pPr>
         <w:jc w:val="center"/>
-        <w:divId w:val="550968710"/>
+        <w:divId w:val="784621173"/>
         <w:rPr>
           <w:rFonts w:ascii="Outfit" w:eastAsia="Times New Roman" w:hAnsi="Outfit"/>
           <w:b/>
@@ -2469,7 +2469,7 @@
     <w:p>
       <w:pPr>
         <w:jc w:val="center"/>
-        <w:divId w:val="1084381938"/>
+        <w:divId w:val="1375807880"/>
         <w:rPr>
           <w:rFonts w:ascii="Plus Jakarta Sans" w:eastAsia="Times New Roman" w:hAnsi="Plus Jakarta Sans"/>
           <w:lang w:val="es-ES"/>
@@ -2864,7 +2864,7 @@
     <w:p>
       <w:pPr>
         <w:spacing w:before="450" w:after="450"/>
-        <w:divId w:val="1014452338"/>
+        <w:divId w:val="1312251671"/>
         <w:rPr>
           <w:rFonts w:ascii="Plus Jakarta Sans" w:eastAsia="Times New Roman" w:hAnsi="Plus Jakarta Sans"/>
           <w:lang w:val="es-ES"/>
@@ -2875,7 +2875,7 @@
           <w:rFonts w:ascii="Plus Jakarta Sans" w:eastAsia="Times New Roman" w:hAnsi="Plus Jakarta Sans"/>
           <w:lang w:val="es-ES"/>
         </w:rPr>
-        <w:pict w14:anchorId="2FDDFBA9">
+        <w:pict w14:anchorId="03F2F059">
           <v:rect id="_x0000_i1028" style="width:0;height:.75pt" o:hralign="center" o:hrstd="t" o:hr="t" fillcolor="#a0a0a0" stroked="f"/>
         </w:pict>
       </w:r>
@@ -2883,7 +2883,7 @@
     <w:p>
       <w:pPr>
         <w:pStyle w:val="Ttulo3"/>
-        <w:divId w:val="1014452338"/>
+        <w:divId w:val="1312251671"/>
         <w:rPr>
           <w:rFonts w:eastAsia="Times New Roman"/>
           <w:lang w:val="es-ES"/>
@@ -2900,7 +2900,7 @@
     <w:p>
       <w:pPr>
         <w:pStyle w:val="NormalWeb"/>
-        <w:divId w:val="1014452338"/>
+        <w:divId w:val="1312251671"/>
         <w:rPr>
           <w:rFonts w:ascii="Plus Jakarta Sans" w:hAnsi="Plus Jakarta Sans"/>
           <w:lang w:val="es-ES"/>
@@ -2933,7 +2933,7 @@
       </w:tblGrid>
       <w:tr>
         <w:trPr>
-          <w:divId w:val="1407876089"/>
+          <w:divId w:val="2131435743"/>
           <w:tblHeader/>
         </w:trPr>
         <w:tc>
@@ -3087,7 +3087,7 @@
       </w:tr>
       <w:tr>
         <w:trPr>
-          <w:divId w:val="1407876089"/>
+          <w:divId w:val="2131435743"/>
         </w:trPr>
         <w:tc>
           <w:tcPr>
@@ -3214,14 +3214,14 @@
                 <w:sz w:val="20"/>
                 <w:szCs w:val="20"/>
               </w:rPr>
-              <w:t>105 (12.9%)</w:t>
+              <w:t>106 (12.9%)</w:t>
             </w:r>
           </w:p>
         </w:tc>
       </w:tr>
       <w:tr>
         <w:trPr>
-          <w:divId w:val="1407876089"/>
+          <w:divId w:val="2131435743"/>
         </w:trPr>
         <w:tc>
           <w:tcPr>
@@ -3348,14 +3348,14 @@
                 <w:sz w:val="20"/>
                 <w:szCs w:val="20"/>
               </w:rPr>
-              <w:t>351 (43.0%)</w:t>
+              <w:t>352 (42.8%)</w:t>
             </w:r>
           </w:p>
         </w:tc>
       </w:tr>
       <w:tr>
         <w:trPr>
-          <w:divId w:val="1407876089"/>
+          <w:divId w:val="2131435743"/>
         </w:trPr>
         <w:tc>
           <w:tcPr>
@@ -3482,14 +3482,14 @@
                 <w:sz w:val="20"/>
                 <w:szCs w:val="20"/>
               </w:rPr>
-              <w:t>227 (27.8%)</w:t>
+              <w:t>228 (27.7%)</w:t>
             </w:r>
           </w:p>
         </w:tc>
       </w:tr>
       <w:tr>
         <w:trPr>
-          <w:divId w:val="1407876089"/>
+          <w:divId w:val="2131435743"/>
         </w:trPr>
         <w:tc>
           <w:tcPr>
@@ -3586,44 +3586,44 @@
                 <w:sz w:val="20"/>
                 <w:szCs w:val="20"/>
               </w:rPr>
-              <w:t>710 (43.5%)</w:t>
-            </w:r>
-          </w:p>
-        </w:tc>
-        <w:tc>
-          <w:tcPr>
-            <w:tcW w:w="0" w:type="auto"/>
-            <w:tcMar>
-              <w:top w:w="150" w:type="dxa"/>
-              <w:left w:w="210" w:type="dxa"/>
-              <w:bottom w:w="150" w:type="dxa"/>
-              <w:right w:w="210" w:type="dxa"/>
-            </w:tcMar>
-            <w:vAlign w:val="center"/>
-            <w:hideMark/>
-          </w:tcPr>
-          <w:p>
-            <w:pPr>
-              <w:rPr>
-                <w:rFonts w:ascii="Plus Jakarta Sans" w:eastAsia="Times New Roman" w:hAnsi="Plus Jakarta Sans"/>
-                <w:sz w:val="20"/>
-                <w:szCs w:val="20"/>
-              </w:rPr>
-            </w:pPr>
-            <w:r>
-              <w:rPr>
-                <w:rFonts w:ascii="Plus Jakarta Sans" w:eastAsia="Times New Roman" w:hAnsi="Plus Jakarta Sans"/>
-                <w:sz w:val="20"/>
-                <w:szCs w:val="20"/>
-              </w:rPr>
-              <w:t>110 (13.5%)</w:t>
+              <w:t>709 (43.4%)</w:t>
+            </w:r>
+          </w:p>
+        </w:tc>
+        <w:tc>
+          <w:tcPr>
+            <w:tcW w:w="0" w:type="auto"/>
+            <w:tcMar>
+              <w:top w:w="150" w:type="dxa"/>
+              <w:left w:w="210" w:type="dxa"/>
+              <w:bottom w:w="150" w:type="dxa"/>
+              <w:right w:w="210" w:type="dxa"/>
+            </w:tcMar>
+            <w:vAlign w:val="center"/>
+            <w:hideMark/>
+          </w:tcPr>
+          <w:p>
+            <w:pPr>
+              <w:rPr>
+                <w:rFonts w:ascii="Plus Jakarta Sans" w:eastAsia="Times New Roman" w:hAnsi="Plus Jakarta Sans"/>
+                <w:sz w:val="20"/>
+                <w:szCs w:val="20"/>
+              </w:rPr>
+            </w:pPr>
+            <w:r>
+              <w:rPr>
+                <w:rFonts w:ascii="Plus Jakarta Sans" w:eastAsia="Times New Roman" w:hAnsi="Plus Jakarta Sans"/>
+                <w:sz w:val="20"/>
+                <w:szCs w:val="20"/>
+              </w:rPr>
+              <w:t>112 (13.6%)</w:t>
             </w:r>
           </w:p>
         </w:tc>
       </w:tr>
       <w:tr>
         <w:trPr>
-          <w:divId w:val="1407876089"/>
+          <w:divId w:val="2131435743"/>
         </w:trPr>
         <w:tc>
           <w:tcPr>
@@ -3757,7 +3757,7 @@
       </w:tr>
       <w:tr>
         <w:trPr>
-          <w:divId w:val="1407876089"/>
+          <w:divId w:val="2131435743"/>
         </w:trPr>
         <w:tc>
           <w:tcPr>
@@ -3893,7 +3893,7 @@
     <w:p>
       <w:pPr>
         <w:pStyle w:val="Ttulo3"/>
-        <w:divId w:val="1014452338"/>
+        <w:divId w:val="1312251671"/>
         <w:rPr>
           <w:rFonts w:eastAsia="Times New Roman"/>
           <w:lang w:val="es-ES"/>
@@ -3910,7 +3910,7 @@
     <w:p>
       <w:pPr>
         <w:jc w:val="center"/>
-        <w:divId w:val="796878062"/>
+        <w:divId w:val="221602405"/>
         <w:rPr>
           <w:rFonts w:ascii="Outfit" w:eastAsia="Times New Roman" w:hAnsi="Outfit"/>
           <w:b/>
@@ -3939,7 +3939,7 @@
     <w:p>
       <w:pPr>
         <w:jc w:val="center"/>
-        <w:divId w:val="741637931"/>
+        <w:divId w:val="1351221866"/>
         <w:rPr>
           <w:rFonts w:ascii="Plus Jakarta Sans" w:eastAsia="Times New Roman" w:hAnsi="Plus Jakarta Sans"/>
           <w:lang w:val="es-ES"/>
@@ -4313,7 +4313,7 @@
     <w:p>
       <w:pPr>
         <w:spacing w:before="450" w:after="450"/>
-        <w:divId w:val="1014452338"/>
+        <w:divId w:val="1312251671"/>
         <w:rPr>
           <w:rFonts w:ascii="Plus Jakarta Sans" w:eastAsia="Times New Roman" w:hAnsi="Plus Jakarta Sans"/>
           <w:lang w:val="es-ES"/>
@@ -4325,7 +4325,7 @@
           <w:lang w:val="es-ES"/>
         </w:rPr>
         <w:lastRenderedPageBreak/>
-        <w:pict w14:anchorId="720C3F62">
+        <w:pict w14:anchorId="19FB431A">
           <v:rect id="_x0000_i1029" style="width:0;height:.75pt" o:hralign="center" o:hrstd="t" o:hr="t" fillcolor="#a0a0a0" stroked="f"/>
         </w:pict>
       </w:r>
@@ -4333,7 +4333,7 @@
     <w:p>
       <w:pPr>
         <w:pStyle w:val="Ttulo3"/>
-        <w:divId w:val="1014452338"/>
+        <w:divId w:val="1312251671"/>
         <w:rPr>
           <w:rFonts w:eastAsia="Times New Roman"/>
           <w:lang w:val="es-ES"/>
@@ -4350,7 +4350,7 @@
     <w:p>
       <w:pPr>
         <w:pStyle w:val="NormalWeb"/>
-        <w:divId w:val="1014452338"/>
+        <w:divId w:val="1312251671"/>
         <w:rPr>
           <w:rFonts w:ascii="Plus Jakarta Sans" w:hAnsi="Plus Jakarta Sans"/>
           <w:lang w:val="es-ES"/>
@@ -4372,7 +4372,7 @@
         </w:numPr>
         <w:spacing w:before="100" w:beforeAutospacing="1" w:after="90"/>
         <w:ind w:left="1020"/>
-        <w:divId w:val="1014452338"/>
+        <w:divId w:val="1312251671"/>
         <w:rPr>
           <w:rFonts w:ascii="Plus Jakarta Sans" w:eastAsia="Times New Roman" w:hAnsi="Plus Jakarta Sans"/>
           <w:sz w:val="21"/>
@@ -4408,7 +4408,7 @@
         </w:numPr>
         <w:spacing w:before="100" w:beforeAutospacing="1" w:after="90"/>
         <w:ind w:left="1020"/>
-        <w:divId w:val="1014452338"/>
+        <w:divId w:val="1312251671"/>
         <w:rPr>
           <w:rFonts w:ascii="Plus Jakarta Sans" w:eastAsia="Times New Roman" w:hAnsi="Plus Jakarta Sans"/>
           <w:sz w:val="21"/>
@@ -4453,7 +4453,7 @@
         </w:numPr>
         <w:spacing w:before="100" w:beforeAutospacing="1" w:after="90"/>
         <w:ind w:left="1020"/>
-        <w:divId w:val="1014452338"/>
+        <w:divId w:val="1312251671"/>
         <w:rPr>
           <w:rFonts w:ascii="Plus Jakarta Sans" w:eastAsia="Times New Roman" w:hAnsi="Plus Jakarta Sans"/>
           <w:sz w:val="21"/>
@@ -4498,7 +4498,7 @@
         </w:numPr>
         <w:spacing w:before="100" w:beforeAutospacing="1" w:after="90"/>
         <w:ind w:left="1020"/>
-        <w:divId w:val="1014452338"/>
+        <w:divId w:val="1312251671"/>
         <w:rPr>
           <w:rFonts w:ascii="Plus Jakarta Sans" w:eastAsia="Times New Roman" w:hAnsi="Plus Jakarta Sans"/>
           <w:sz w:val="21"/>
@@ -4554,7 +4554,7 @@
       </w:tblGrid>
       <w:tr>
         <w:trPr>
-          <w:divId w:val="901480012"/>
+          <w:divId w:val="1333921488"/>
           <w:tblHeader/>
         </w:trPr>
         <w:tc>
@@ -4708,7 +4708,7 @@
       </w:tr>
       <w:tr>
         <w:trPr>
-          <w:divId w:val="901480012"/>
+          <w:divId w:val="1333921488"/>
         </w:trPr>
         <w:tc>
           <w:tcPr>
@@ -4797,44 +4797,44 @@
                 <w:sz w:val="20"/>
                 <w:szCs w:val="20"/>
               </w:rPr>
-              <w:t>567 (34.7%)</w:t>
-            </w:r>
-          </w:p>
-        </w:tc>
-        <w:tc>
-          <w:tcPr>
-            <w:tcW w:w="0" w:type="auto"/>
-            <w:tcMar>
-              <w:top w:w="150" w:type="dxa"/>
-              <w:left w:w="210" w:type="dxa"/>
-              <w:bottom w:w="150" w:type="dxa"/>
-              <w:right w:w="210" w:type="dxa"/>
-            </w:tcMar>
-            <w:vAlign w:val="center"/>
-            <w:hideMark/>
-          </w:tcPr>
-          <w:p>
-            <w:pPr>
-              <w:rPr>
-                <w:rFonts w:ascii="Plus Jakarta Sans" w:eastAsia="Times New Roman" w:hAnsi="Plus Jakarta Sans"/>
-                <w:sz w:val="20"/>
-                <w:szCs w:val="20"/>
-              </w:rPr>
-            </w:pPr>
-            <w:r>
-              <w:rPr>
-                <w:rFonts w:ascii="Plus Jakarta Sans" w:eastAsia="Times New Roman" w:hAnsi="Plus Jakarta Sans"/>
-                <w:sz w:val="20"/>
-                <w:szCs w:val="20"/>
-              </w:rPr>
-              <w:t>54 (6.6%)</w:t>
+              <w:t>566 (34.7%)</w:t>
+            </w:r>
+          </w:p>
+        </w:tc>
+        <w:tc>
+          <w:tcPr>
+            <w:tcW w:w="0" w:type="auto"/>
+            <w:tcMar>
+              <w:top w:w="150" w:type="dxa"/>
+              <w:left w:w="210" w:type="dxa"/>
+              <w:bottom w:w="150" w:type="dxa"/>
+              <w:right w:w="210" w:type="dxa"/>
+            </w:tcMar>
+            <w:vAlign w:val="center"/>
+            <w:hideMark/>
+          </w:tcPr>
+          <w:p>
+            <w:pPr>
+              <w:rPr>
+                <w:rFonts w:ascii="Plus Jakarta Sans" w:eastAsia="Times New Roman" w:hAnsi="Plus Jakarta Sans"/>
+                <w:sz w:val="20"/>
+                <w:szCs w:val="20"/>
+              </w:rPr>
+            </w:pPr>
+            <w:r>
+              <w:rPr>
+                <w:rFonts w:ascii="Plus Jakarta Sans" w:eastAsia="Times New Roman" w:hAnsi="Plus Jakarta Sans"/>
+                <w:sz w:val="20"/>
+                <w:szCs w:val="20"/>
+              </w:rPr>
+              <w:t>44 (5.4%)</w:t>
             </w:r>
           </w:p>
         </w:tc>
       </w:tr>
       <w:tr>
         <w:trPr>
-          <w:divId w:val="901480012"/>
+          <w:divId w:val="1333921488"/>
         </w:trPr>
         <w:tc>
           <w:tcPr>
@@ -4953,14 +4953,14 @@
                 <w:sz w:val="20"/>
                 <w:szCs w:val="20"/>
               </w:rPr>
-              <w:t>220 (26.9%)</w:t>
+              <w:t>226 (27.5%)</w:t>
             </w:r>
           </w:p>
         </w:tc>
       </w:tr>
       <w:tr>
         <w:trPr>
-          <w:divId w:val="901480012"/>
+          <w:divId w:val="1333921488"/>
         </w:trPr>
         <w:tc>
           <w:tcPr>
@@ -5079,14 +5079,14 @@
                 <w:sz w:val="20"/>
                 <w:szCs w:val="20"/>
               </w:rPr>
-              <w:t>376 (46.0%)</w:t>
+              <w:t>385 (46.8%)</w:t>
             </w:r>
           </w:p>
         </w:tc>
       </w:tr>
       <w:tr>
         <w:trPr>
-          <w:divId w:val="901480012"/>
+          <w:divId w:val="1333921488"/>
         </w:trPr>
         <w:tc>
           <w:tcPr>
@@ -5205,7 +5205,7 @@
                 <w:sz w:val="20"/>
                 <w:szCs w:val="20"/>
               </w:rPr>
-              <w:t>167 (20.4%)</w:t>
+              <w:t>167 (20.3%)</w:t>
             </w:r>
           </w:p>
         </w:tc>
@@ -5214,7 +5214,7 @@
     <w:p>
       <w:pPr>
         <w:spacing w:before="450" w:after="450"/>
-        <w:divId w:val="1014452338"/>
+        <w:divId w:val="1312251671"/>
         <w:rPr>
           <w:rFonts w:ascii="Plus Jakarta Sans" w:eastAsia="Times New Roman" w:hAnsi="Plus Jakarta Sans"/>
           <w:lang w:val="es-ES"/>
@@ -5225,7 +5225,7 @@
           <w:rFonts w:ascii="Plus Jakarta Sans" w:eastAsia="Times New Roman" w:hAnsi="Plus Jakarta Sans"/>
           <w:lang w:val="es-ES"/>
         </w:rPr>
-        <w:pict w14:anchorId="5AE88D42">
+        <w:pict w14:anchorId="5749FBD5">
           <v:rect id="_x0000_i1030" style="width:0;height:.75pt" o:hralign="center" o:hrstd="t" o:hr="t" fillcolor="#a0a0a0" stroked="f"/>
         </w:pict>
       </w:r>
@@ -5233,7 +5233,7 @@
     <w:p>
       <w:pPr>
         <w:pStyle w:val="Ttulo3"/>
-        <w:divId w:val="1014452338"/>
+        <w:divId w:val="1312251671"/>
         <w:rPr>
           <w:rFonts w:eastAsia="Times New Roman"/>
           <w:lang w:val="es-ES"/>
@@ -5250,7 +5250,7 @@
     <w:p>
       <w:pPr>
         <w:pStyle w:val="NormalWeb"/>
-        <w:divId w:val="1014452338"/>
+        <w:divId w:val="1312251671"/>
         <w:rPr>
           <w:rFonts w:ascii="Plus Jakarta Sans" w:hAnsi="Plus Jakarta Sans"/>
           <w:lang w:val="es-ES"/>
@@ -5274,7 +5274,7 @@
     <w:p>
       <w:pPr>
         <w:pStyle w:val="Ttulo4"/>
-        <w:divId w:val="1014452338"/>
+        <w:divId w:val="1312251671"/>
         <w:rPr>
           <w:rFonts w:eastAsia="Times New Roman"/>
           <w:lang w:val="es-ES"/>
@@ -5291,7 +5291,7 @@
     <w:p>
       <w:pPr>
         <w:jc w:val="center"/>
-        <w:divId w:val="1440368360"/>
+        <w:divId w:val="1985431534"/>
         <w:rPr>
           <w:rFonts w:ascii="Outfit" w:eastAsia="Times New Roman" w:hAnsi="Outfit"/>
           <w:b/>
@@ -5320,7 +5320,7 @@
     <w:p>
       <w:pPr>
         <w:jc w:val="center"/>
-        <w:divId w:val="1109861333"/>
+        <w:divId w:val="23673007"/>
         <w:rPr>
           <w:rFonts w:ascii="Plus Jakarta Sans" w:eastAsia="Times New Roman" w:hAnsi="Plus Jakarta Sans"/>
           <w:lang w:val="es-ES"/>
@@ -5499,7 +5499,7 @@
           <w:rFonts w:ascii="Plus Jakarta Sans" w:eastAsia="Times New Roman" w:hAnsi="Plus Jakarta Sans"/>
           <w:lang w:val="es-ES"/>
         </w:rPr>
-        <w:t>51.4% (4,073 cultivos</w:t>
+        <w:t>51.1% (4,073 cultivos</w:t>
       </w:r>
       <w:r>
         <w:rPr>
@@ -5541,7 +5541,7 @@
           <w:rFonts w:ascii="Plus Jakarta Sans" w:eastAsia="Times New Roman" w:hAnsi="Plus Jakarta Sans"/>
           <w:lang w:val="es-ES"/>
         </w:rPr>
-        <w:t>30.2% (2,391 cultivos</w:t>
+        <w:t>30.0% (2,391 cultivos</w:t>
       </w:r>
       <w:r>
         <w:rPr>
@@ -5583,7 +5583,7 @@
           <w:rFonts w:ascii="Plus Jakarta Sans" w:eastAsia="Times New Roman" w:hAnsi="Plus Jakarta Sans"/>
           <w:lang w:val="es-ES"/>
         </w:rPr>
-        <w:t>18.4% (1,462 cultivos</w:t>
+        <w:t>18.9% (1,505 cultivos</w:t>
       </w:r>
       <w:r>
         <w:rPr>
@@ -5603,7 +5603,7 @@
     <w:p>
       <w:pPr>
         <w:pStyle w:val="Ttulo4"/>
-        <w:divId w:val="1014452338"/>
+        <w:divId w:val="1312251671"/>
         <w:rPr>
           <w:rFonts w:eastAsia="Times New Roman"/>
           <w:lang w:val="es-ES"/>
@@ -5627,7 +5627,7 @@
     <w:p>
       <w:pPr>
         <w:jc w:val="center"/>
-        <w:divId w:val="1081676663"/>
+        <w:divId w:val="496959792"/>
         <w:rPr>
           <w:rFonts w:ascii="Outfit" w:eastAsia="Times New Roman" w:hAnsi="Outfit"/>
           <w:b/>
@@ -5656,7 +5656,7 @@
     <w:p>
       <w:pPr>
         <w:jc w:val="center"/>
-        <w:divId w:val="1417435682"/>
+        <w:divId w:val="74326942"/>
         <w:rPr>
           <w:rFonts w:ascii="Plus Jakarta Sans" w:eastAsia="Times New Roman" w:hAnsi="Plus Jakarta Sans"/>
           <w:lang w:val="es-ES"/>
@@ -5974,7 +5974,7 @@
     <w:p>
       <w:pPr>
         <w:pStyle w:val="Ttulo4"/>
-        <w:divId w:val="1014452338"/>
+        <w:divId w:val="1312251671"/>
         <w:rPr>
           <w:rFonts w:eastAsia="Times New Roman"/>
           <w:lang w:val="es-ES"/>
@@ -5992,7 +5992,7 @@
     <w:p>
       <w:pPr>
         <w:jc w:val="center"/>
-        <w:divId w:val="1919485121"/>
+        <w:divId w:val="1751075772"/>
         <w:rPr>
           <w:rFonts w:ascii="Outfit" w:eastAsia="Times New Roman" w:hAnsi="Outfit"/>
           <w:b/>
@@ -6021,7 +6021,7 @@
     <w:p>
       <w:pPr>
         <w:jc w:val="center"/>
-        <w:divId w:val="1669864747"/>
+        <w:divId w:val="147409112"/>
         <w:rPr>
           <w:rFonts w:ascii="Plus Jakarta Sans" w:eastAsia="Times New Roman" w:hAnsi="Plus Jakarta Sans"/>
           <w:lang w:val="es-ES"/>
@@ -6325,7 +6325,7 @@
     <w:p>
       <w:pPr>
         <w:spacing w:before="450" w:after="450"/>
-        <w:divId w:val="1014452338"/>
+        <w:divId w:val="1312251671"/>
         <w:rPr>
           <w:rFonts w:ascii="Plus Jakarta Sans" w:eastAsia="Times New Roman" w:hAnsi="Plus Jakarta Sans"/>
           <w:lang w:val="es-ES"/>
@@ -6336,7 +6336,7 @@
           <w:rFonts w:ascii="Plus Jakarta Sans" w:eastAsia="Times New Roman" w:hAnsi="Plus Jakarta Sans"/>
           <w:lang w:val="es-ES"/>
         </w:rPr>
-        <w:pict w14:anchorId="26800428">
+        <w:pict w14:anchorId="4C4F0DD8">
           <v:rect id="_x0000_i1031" style="width:0;height:.75pt" o:hralign="center" o:hrstd="t" o:hr="t" fillcolor="#a0a0a0" stroked="f"/>
         </w:pict>
       </w:r>
@@ -6344,7 +6344,7 @@
     <w:p>
       <w:pPr>
         <w:pStyle w:val="Ttulo3"/>
-        <w:divId w:val="1014452338"/>
+        <w:divId w:val="1312251671"/>
         <w:rPr>
           <w:rFonts w:eastAsia="Times New Roman"/>
           <w:lang w:val="es-ES"/>
@@ -6361,7 +6361,7 @@
     <w:p>
       <w:pPr>
         <w:pStyle w:val="NormalWeb"/>
-        <w:divId w:val="1014452338"/>
+        <w:divId w:val="1312251671"/>
         <w:rPr>
           <w:rFonts w:ascii="Plus Jakarta Sans" w:hAnsi="Plus Jakarta Sans"/>
           <w:lang w:val="es-ES"/>
@@ -6385,7 +6385,7 @@
     <w:p>
       <w:pPr>
         <w:pStyle w:val="Ttulo4"/>
-        <w:divId w:val="1014452338"/>
+        <w:divId w:val="1312251671"/>
         <w:rPr>
           <w:rFonts w:eastAsia="Times New Roman"/>
           <w:lang w:val="es-ES"/>
@@ -6402,7 +6402,7 @@
     <w:p>
       <w:pPr>
         <w:pStyle w:val="NormalWeb"/>
-        <w:divId w:val="1014452338"/>
+        <w:divId w:val="1312251671"/>
         <w:rPr>
           <w:rFonts w:ascii="Plus Jakarta Sans" w:hAnsi="Plus Jakarta Sans"/>
           <w:lang w:val="es-ES"/>
@@ -6433,7 +6433,7 @@
       </w:tblGrid>
       <w:tr>
         <w:trPr>
-          <w:divId w:val="734399386"/>
+          <w:divId w:val="347752533"/>
           <w:tblHeader/>
         </w:trPr>
         <w:tc>
@@ -6513,7 +6513,7 @@
       </w:tr>
       <w:tr>
         <w:trPr>
-          <w:divId w:val="734399386"/>
+          <w:divId w:val="347752533"/>
         </w:trPr>
         <w:tc>
           <w:tcPr>
@@ -6602,7 +6602,7 @@
     <w:p>
       <w:pPr>
         <w:pStyle w:val="Ttulo4"/>
-        <w:divId w:val="1014452338"/>
+        <w:divId w:val="1312251671"/>
         <w:rPr>
           <w:rFonts w:eastAsia="Times New Roman"/>
           <w:lang w:val="es-ES"/>
@@ -6619,7 +6619,7 @@
     <w:p>
       <w:pPr>
         <w:pStyle w:val="NormalWeb"/>
-        <w:divId w:val="1014452338"/>
+        <w:divId w:val="1312251671"/>
         <w:rPr>
           <w:rFonts w:ascii="Plus Jakarta Sans" w:hAnsi="Plus Jakarta Sans"/>
           <w:lang w:val="es-ES"/>
@@ -6650,7 +6650,7 @@
       </w:tblGrid>
       <w:tr>
         <w:trPr>
-          <w:divId w:val="11077816"/>
+          <w:divId w:val="1854680621"/>
           <w:tblHeader/>
         </w:trPr>
         <w:tc>
@@ -6730,7 +6730,7 @@
       </w:tr>
       <w:tr>
         <w:trPr>
-          <w:divId w:val="11077816"/>
+          <w:divId w:val="1854680621"/>
         </w:trPr>
         <w:tc>
           <w:tcPr>
@@ -6828,7 +6828,7 @@
     <w:p>
       <w:pPr>
         <w:pStyle w:val="Ttulo4"/>
-        <w:divId w:val="1014452338"/>
+        <w:divId w:val="1312251671"/>
         <w:rPr>
           <w:rFonts w:eastAsia="Times New Roman"/>
           <w:lang w:val="es-ES"/>
@@ -6845,7 +6845,7 @@
     <w:p>
       <w:pPr>
         <w:pStyle w:val="NormalWeb"/>
-        <w:divId w:val="1014452338"/>
+        <w:divId w:val="1312251671"/>
         <w:rPr>
           <w:rFonts w:ascii="Plus Jakarta Sans" w:hAnsi="Plus Jakarta Sans"/>
           <w:lang w:val="es-ES"/>
@@ -6876,7 +6876,7 @@
       </w:tblGrid>
       <w:tr>
         <w:trPr>
-          <w:divId w:val="907542674"/>
+          <w:divId w:val="862939102"/>
           <w:tblHeader/>
         </w:trPr>
         <w:tc>
@@ -6957,7 +6957,7 @@
       </w:tr>
       <w:tr>
         <w:trPr>
-          <w:divId w:val="907542674"/>
+          <w:divId w:val="862939102"/>
         </w:trPr>
         <w:tc>
           <w:tcPr>
@@ -7046,7 +7046,7 @@
     <w:p>
       <w:pPr>
         <w:spacing w:before="450" w:after="450"/>
-        <w:divId w:val="1014452338"/>
+        <w:divId w:val="1312251671"/>
         <w:rPr>
           <w:rFonts w:ascii="Plus Jakarta Sans" w:eastAsia="Times New Roman" w:hAnsi="Plus Jakarta Sans"/>
           <w:lang w:val="es-ES"/>
@@ -7057,7 +7057,7 @@
           <w:rFonts w:ascii="Plus Jakarta Sans" w:eastAsia="Times New Roman" w:hAnsi="Plus Jakarta Sans"/>
           <w:lang w:val="es-ES"/>
         </w:rPr>
-        <w:pict w14:anchorId="182C2A95">
+        <w:pict w14:anchorId="0FD2EDCA">
           <v:rect id="_x0000_i1032" style="width:0;height:.75pt" o:hralign="center" o:hrstd="t" o:hr="t" fillcolor="#a0a0a0" stroked="f"/>
         </w:pict>
       </w:r>
@@ -7065,7 +7065,7 @@
     <w:p>
       <w:pPr>
         <w:pStyle w:val="Ttulo2"/>
-        <w:divId w:val="1014452338"/>
+        <w:divId w:val="1312251671"/>
         <w:rPr>
           <w:rFonts w:eastAsia="Times New Roman"/>
           <w:lang w:val="es-ES"/>
@@ -7082,7 +7082,7 @@
     <w:p>
       <w:pPr>
         <w:pStyle w:val="NormalWeb"/>
-        <w:divId w:val="1014452338"/>
+        <w:divId w:val="1312251671"/>
         <w:rPr>
           <w:rFonts w:ascii="Plus Jakarta Sans" w:hAnsi="Plus Jakarta Sans"/>
           <w:lang w:val="es-ES"/>
@@ -7099,7 +7099,7 @@
     <w:p>
       <w:pPr>
         <w:pStyle w:val="Ttulo3"/>
-        <w:divId w:val="1014452338"/>
+        <w:divId w:val="1312251671"/>
         <w:rPr>
           <w:rFonts w:eastAsia="Times New Roman"/>
           <w:lang w:val="es-ES"/>
@@ -7116,7 +7116,7 @@
     <w:p>
       <w:pPr>
         <w:pStyle w:val="NormalWeb"/>
-        <w:divId w:val="1014452338"/>
+        <w:divId w:val="1312251671"/>
         <w:rPr>
           <w:rFonts w:ascii="Plus Jakarta Sans" w:hAnsi="Plus Jakarta Sans"/>
           <w:lang w:val="es-ES"/>
@@ -7149,7 +7149,7 @@
       </w:tblGrid>
       <w:tr>
         <w:trPr>
-          <w:divId w:val="1317539598"/>
+          <w:divId w:val="2102871404"/>
           <w:tblHeader/>
         </w:trPr>
         <w:tc>
@@ -7314,7 +7314,7 @@
       </w:tr>
       <w:tr>
         <w:trPr>
-          <w:divId w:val="1317539598"/>
+          <w:divId w:val="2102871404"/>
         </w:trPr>
         <w:tc>
           <w:tcPr>
@@ -7403,44 +7403,44 @@
                 <w:sz w:val="20"/>
                 <w:szCs w:val="20"/>
               </w:rPr>
-              <w:t>1509 (92.4%)</w:t>
-            </w:r>
-          </w:p>
-        </w:tc>
-        <w:tc>
-          <w:tcPr>
-            <w:tcW w:w="0" w:type="auto"/>
-            <w:tcMar>
-              <w:top w:w="150" w:type="dxa"/>
-              <w:left w:w="210" w:type="dxa"/>
-              <w:bottom w:w="150" w:type="dxa"/>
-              <w:right w:w="210" w:type="dxa"/>
-            </w:tcMar>
-            <w:vAlign w:val="center"/>
-            <w:hideMark/>
-          </w:tcPr>
-          <w:p>
-            <w:pPr>
-              <w:rPr>
-                <w:rFonts w:ascii="Plus Jakarta Sans" w:eastAsia="Times New Roman" w:hAnsi="Plus Jakarta Sans"/>
-                <w:sz w:val="20"/>
-                <w:szCs w:val="20"/>
-              </w:rPr>
-            </w:pPr>
-            <w:r>
-              <w:rPr>
-                <w:rFonts w:ascii="Plus Jakarta Sans" w:eastAsia="Times New Roman" w:hAnsi="Plus Jakarta Sans"/>
-                <w:sz w:val="20"/>
-                <w:szCs w:val="20"/>
-              </w:rPr>
-              <w:t>584 (71.5%)</w:t>
+              <w:t>1509 (92.5%)</w:t>
+            </w:r>
+          </w:p>
+        </w:tc>
+        <w:tc>
+          <w:tcPr>
+            <w:tcW w:w="0" w:type="auto"/>
+            <w:tcMar>
+              <w:top w:w="150" w:type="dxa"/>
+              <w:left w:w="210" w:type="dxa"/>
+              <w:bottom w:w="150" w:type="dxa"/>
+              <w:right w:w="210" w:type="dxa"/>
+            </w:tcMar>
+            <w:vAlign w:val="center"/>
+            <w:hideMark/>
+          </w:tcPr>
+          <w:p>
+            <w:pPr>
+              <w:rPr>
+                <w:rFonts w:ascii="Plus Jakarta Sans" w:eastAsia="Times New Roman" w:hAnsi="Plus Jakarta Sans"/>
+                <w:sz w:val="20"/>
+                <w:szCs w:val="20"/>
+              </w:rPr>
+            </w:pPr>
+            <w:r>
+              <w:rPr>
+                <w:rFonts w:ascii="Plus Jakarta Sans" w:eastAsia="Times New Roman" w:hAnsi="Plus Jakarta Sans"/>
+                <w:sz w:val="20"/>
+                <w:szCs w:val="20"/>
+              </w:rPr>
+              <w:t>588 (71.5%)</w:t>
             </w:r>
           </w:p>
         </w:tc>
       </w:tr>
       <w:tr>
         <w:trPr>
-          <w:divId w:val="1317539598"/>
+          <w:divId w:val="2102871404"/>
         </w:trPr>
         <w:tc>
           <w:tcPr>
@@ -7559,14 +7559,14 @@
                 <w:sz w:val="20"/>
                 <w:szCs w:val="20"/>
               </w:rPr>
-              <w:t>173 (21.2%)</w:t>
+              <w:t>174 (21.2%)</w:t>
             </w:r>
           </w:p>
         </w:tc>
       </w:tr>
       <w:tr>
         <w:trPr>
-          <w:divId w:val="1317539598"/>
+          <w:divId w:val="2102871404"/>
         </w:trPr>
         <w:tc>
           <w:tcPr>
@@ -7655,7 +7655,7 @@
                 <w:sz w:val="20"/>
                 <w:szCs w:val="20"/>
               </w:rPr>
-              <w:t>85 (5.2%)</w:t>
+              <w:t>84 (5.1%)</w:t>
             </w:r>
           </w:p>
         </w:tc>
@@ -7692,7 +7692,7 @@
       </w:tr>
       <w:tr>
         <w:trPr>
-          <w:divId w:val="1317539598"/>
+          <w:divId w:val="2102871404"/>
         </w:trPr>
         <w:tc>
           <w:tcPr>
@@ -7820,7 +7820,7 @@
     <w:p>
       <w:pPr>
         <w:pStyle w:val="Ttulo3"/>
-        <w:divId w:val="1014452338"/>
+        <w:divId w:val="1312251671"/>
         <w:rPr>
           <w:rFonts w:eastAsia="Times New Roman"/>
           <w:lang w:val="es-ES"/>
@@ -7838,7 +7838,7 @@
       <w:pPr>
         <w:spacing w:before="375" w:after="225"/>
         <w:jc w:val="center"/>
-        <w:divId w:val="422848018"/>
+        <w:divId w:val="1819878746"/>
         <w:rPr>
           <w:rFonts w:ascii="Outfit" w:eastAsia="Times New Roman" w:hAnsi="Outfit"/>
           <w:b/>
@@ -7868,7 +7868,7 @@
       <w:pPr>
         <w:spacing w:after="375"/>
         <w:jc w:val="center"/>
-        <w:divId w:val="574048785"/>
+        <w:divId w:val="2125808045"/>
         <w:rPr>
           <w:rFonts w:ascii="Plus Jakarta Sans" w:eastAsia="Times New Roman" w:hAnsi="Plus Jakarta Sans"/>
           <w:lang w:val="es-ES"/>
@@ -8110,7 +8110,7 @@
           <w:rFonts w:ascii="Plus Jakarta Sans" w:eastAsia="Times New Roman" w:hAnsi="Plus Jakarta Sans"/>
           <w:lang w:val="es-ES"/>
         </w:rPr>
-        <w:t>71</w:t>
+        <w:t>72</w:t>
       </w:r>
       <w:r>
         <w:rPr>
@@ -8235,7 +8235,7 @@
     <w:p>
       <w:pPr>
         <w:pStyle w:val="Ttulo3"/>
-        <w:divId w:val="1014452338"/>
+        <w:divId w:val="1312251671"/>
         <w:rPr>
           <w:rFonts w:eastAsia="Times New Roman"/>
           <w:lang w:val="es-ES"/>
@@ -8259,7 +8259,7 @@
     <w:p>
       <w:pPr>
         <w:pStyle w:val="NormalWeb"/>
-        <w:divId w:val="1014452338"/>
+        <w:divId w:val="1312251671"/>
         <w:rPr>
           <w:rFonts w:ascii="Plus Jakarta Sans" w:hAnsi="Plus Jakarta Sans"/>
           <w:lang w:val="es-ES"/>
@@ -8281,7 +8281,7 @@
         </w:numPr>
         <w:spacing w:before="100" w:beforeAutospacing="1" w:after="90"/>
         <w:ind w:left="1020"/>
-        <w:divId w:val="1014452338"/>
+        <w:divId w:val="1312251671"/>
         <w:rPr>
           <w:rFonts w:ascii="Plus Jakarta Sans" w:eastAsia="Times New Roman" w:hAnsi="Plus Jakarta Sans"/>
           <w:sz w:val="21"/>
@@ -8317,7 +8317,7 @@
         </w:numPr>
         <w:spacing w:before="100" w:beforeAutospacing="1" w:after="90"/>
         <w:ind w:left="1020"/>
-        <w:divId w:val="1014452338"/>
+        <w:divId w:val="1312251671"/>
         <w:rPr>
           <w:rFonts w:ascii="Plus Jakarta Sans" w:eastAsia="Times New Roman" w:hAnsi="Plus Jakarta Sans"/>
           <w:sz w:val="21"/>
@@ -8362,7 +8362,7 @@
         </w:numPr>
         <w:spacing w:before="100" w:beforeAutospacing="1" w:after="90"/>
         <w:ind w:left="1020"/>
-        <w:divId w:val="1014452338"/>
+        <w:divId w:val="1312251671"/>
         <w:rPr>
           <w:rFonts w:ascii="Plus Jakarta Sans" w:eastAsia="Times New Roman" w:hAnsi="Plus Jakarta Sans"/>
           <w:sz w:val="21"/>
@@ -8416,7 +8416,7 @@
         </w:numPr>
         <w:spacing w:before="100" w:beforeAutospacing="1" w:after="90"/>
         <w:ind w:left="1020"/>
-        <w:divId w:val="1014452338"/>
+        <w:divId w:val="1312251671"/>
         <w:rPr>
           <w:rFonts w:ascii="Plus Jakarta Sans" w:eastAsia="Times New Roman" w:hAnsi="Plus Jakarta Sans"/>
           <w:sz w:val="21"/>
@@ -8461,7 +8461,7 @@
         </w:numPr>
         <w:spacing w:before="100" w:beforeAutospacing="1" w:after="90"/>
         <w:ind w:left="1020"/>
-        <w:divId w:val="1014452338"/>
+        <w:divId w:val="1312251671"/>
         <w:rPr>
           <w:rFonts w:ascii="Plus Jakarta Sans" w:eastAsia="Times New Roman" w:hAnsi="Plus Jakarta Sans"/>
           <w:sz w:val="21"/>
@@ -8497,7 +8497,7 @@
         </w:numPr>
         <w:spacing w:before="100" w:beforeAutospacing="1" w:after="90"/>
         <w:ind w:left="1020"/>
-        <w:divId w:val="1014452338"/>
+        <w:divId w:val="1312251671"/>
         <w:rPr>
           <w:rFonts w:ascii="Plus Jakarta Sans" w:eastAsia="Times New Roman" w:hAnsi="Plus Jakarta Sans"/>
           <w:sz w:val="21"/>
@@ -8542,7 +8542,7 @@
         </w:numPr>
         <w:spacing w:before="100" w:beforeAutospacing="1" w:after="90"/>
         <w:ind w:left="1020"/>
-        <w:divId w:val="1014452338"/>
+        <w:divId w:val="1312251671"/>
         <w:rPr>
           <w:rFonts w:ascii="Plus Jakarta Sans" w:eastAsia="Times New Roman" w:hAnsi="Plus Jakarta Sans"/>
           <w:sz w:val="21"/>
@@ -8587,7 +8587,7 @@
         </w:numPr>
         <w:spacing w:before="100" w:beforeAutospacing="1" w:after="90"/>
         <w:ind w:left="1020"/>
-        <w:divId w:val="1014452338"/>
+        <w:divId w:val="1312251671"/>
         <w:rPr>
           <w:rFonts w:ascii="Plus Jakarta Sans" w:eastAsia="Times New Roman" w:hAnsi="Plus Jakarta Sans"/>
           <w:sz w:val="21"/>
@@ -8612,7 +8612,7 @@
           <w:szCs w:val="21"/>
           <w:lang w:val="es-ES"/>
         </w:rPr>
-        <w:t>84.0%</w:t>
+        <w:t>84.1%</w:t>
       </w:r>
       <w:r>
         <w:rPr>
@@ -8621,7 +8621,7 @@
           <w:szCs w:val="21"/>
           <w:lang w:val="es-ES"/>
         </w:rPr>
-        <w:t xml:space="preserve"> promedio (en 593 predios).</w:t>
+        <w:t xml:space="preserve"> promedio (en 598 predios).</w:t>
       </w:r>
     </w:p>
     <w:p>
@@ -8632,7 +8632,7 @@
         </w:numPr>
         <w:spacing w:before="100" w:beforeAutospacing="1" w:after="90"/>
         <w:ind w:left="1020"/>
-        <w:divId w:val="1014452338"/>
+        <w:divId w:val="1312251671"/>
         <w:rPr>
           <w:rFonts w:ascii="Plus Jakarta Sans" w:eastAsia="Times New Roman" w:hAnsi="Plus Jakarta Sans"/>
           <w:sz w:val="21"/>
@@ -8668,7 +8668,7 @@
         </w:numPr>
         <w:spacing w:before="100" w:beforeAutospacing="1" w:after="90"/>
         <w:ind w:left="1020"/>
-        <w:divId w:val="1014452338"/>
+        <w:divId w:val="1312251671"/>
         <w:rPr>
           <w:rFonts w:ascii="Plus Jakarta Sans" w:eastAsia="Times New Roman" w:hAnsi="Plus Jakarta Sans"/>
           <w:sz w:val="21"/>
@@ -8722,7 +8722,7 @@
         </w:numPr>
         <w:spacing w:before="100" w:beforeAutospacing="1" w:after="90"/>
         <w:ind w:left="1020"/>
-        <w:divId w:val="1014452338"/>
+        <w:divId w:val="1312251671"/>
         <w:rPr>
           <w:rFonts w:ascii="Plus Jakarta Sans" w:eastAsia="Times New Roman" w:hAnsi="Plus Jakarta Sans"/>
           <w:sz w:val="21"/>
@@ -8767,7 +8767,7 @@
         </w:numPr>
         <w:spacing w:before="100" w:beforeAutospacing="1" w:after="90"/>
         <w:ind w:left="1020"/>
-        <w:divId w:val="1014452338"/>
+        <w:divId w:val="1312251671"/>
         <w:rPr>
           <w:rFonts w:ascii="Plus Jakarta Sans" w:eastAsia="Times New Roman" w:hAnsi="Plus Jakarta Sans"/>
           <w:sz w:val="21"/>
@@ -8807,7 +8807,7 @@
     <w:p>
       <w:pPr>
         <w:pStyle w:val="Ttulo3"/>
-        <w:divId w:val="1014452338"/>
+        <w:divId w:val="1312251671"/>
         <w:rPr>
           <w:rFonts w:eastAsia="Times New Roman"/>
           <w:lang w:val="es-ES"/>
@@ -8825,7 +8825,7 @@
       <w:pPr>
         <w:spacing w:before="375" w:after="225"/>
         <w:jc w:val="center"/>
-        <w:divId w:val="289483007"/>
+        <w:divId w:val="1953246843"/>
         <w:rPr>
           <w:rFonts w:ascii="Outfit" w:eastAsia="Times New Roman" w:hAnsi="Outfit"/>
           <w:b/>
@@ -8855,7 +8855,7 @@
       <w:pPr>
         <w:spacing w:after="375"/>
         <w:jc w:val="center"/>
-        <w:divId w:val="1306550170"/>
+        <w:divId w:val="916206169"/>
         <w:rPr>
           <w:rFonts w:ascii="Plus Jakarta Sans" w:eastAsia="Times New Roman" w:hAnsi="Plus Jakarta Sans"/>
           <w:lang w:val="es-ES"/>
@@ -9145,7 +9145,7 @@
     <w:p>
       <w:pPr>
         <w:spacing w:before="450" w:after="450"/>
-        <w:divId w:val="1014452338"/>
+        <w:divId w:val="1312251671"/>
         <w:rPr>
           <w:rFonts w:ascii="Plus Jakarta Sans" w:eastAsia="Times New Roman" w:hAnsi="Plus Jakarta Sans"/>
           <w:lang w:val="es-ES"/>
@@ -9156,7 +9156,7 @@
           <w:rFonts w:ascii="Plus Jakarta Sans" w:eastAsia="Times New Roman" w:hAnsi="Plus Jakarta Sans"/>
           <w:lang w:val="es-ES"/>
         </w:rPr>
-        <w:pict w14:anchorId="716A4482">
+        <w:pict w14:anchorId="29F91B73">
           <v:rect id="_x0000_i1033" style="width:0;height:.75pt" o:hralign="center" o:hrstd="t" o:hr="t" fillcolor="#a0a0a0" stroked="f"/>
         </w:pict>
       </w:r>
@@ -9164,7 +9164,7 @@
     <w:p>
       <w:pPr>
         <w:pStyle w:val="Ttulo2"/>
-        <w:divId w:val="1014452338"/>
+        <w:divId w:val="1312251671"/>
         <w:rPr>
           <w:rFonts w:eastAsia="Times New Roman"/>
           <w:lang w:val="es-ES"/>
@@ -9181,7 +9181,7 @@
     <w:p>
       <w:pPr>
         <w:pStyle w:val="NormalWeb"/>
-        <w:divId w:val="1014452338"/>
+        <w:divId w:val="1312251671"/>
         <w:rPr>
           <w:rFonts w:ascii="Plus Jakarta Sans" w:hAnsi="Plus Jakarta Sans"/>
           <w:lang w:val="es-ES"/>
@@ -9198,7 +9198,7 @@
     <w:p>
       <w:pPr>
         <w:pStyle w:val="NormalWeb"/>
-        <w:divId w:val="1014452338"/>
+        <w:divId w:val="1312251671"/>
         <w:rPr>
           <w:rFonts w:ascii="Plus Jakarta Sans" w:hAnsi="Plus Jakarta Sans"/>
           <w:lang w:val="es-ES"/>
@@ -9260,7 +9260,7 @@
     <w:p>
       <w:pPr>
         <w:pStyle w:val="NormalWeb"/>
-        <w:divId w:val="1014452338"/>
+        <w:divId w:val="1312251671"/>
         <w:rPr>
           <w:rFonts w:ascii="Plus Jakarta Sans" w:hAnsi="Plus Jakarta Sans"/>
           <w:lang w:val="es-ES"/>
@@ -9322,7 +9322,7 @@
     <w:p>
       <w:pPr>
         <w:pStyle w:val="NormalWeb"/>
-        <w:divId w:val="1014452338"/>
+        <w:divId w:val="1312251671"/>
         <w:rPr>
           <w:rFonts w:ascii="Plus Jakarta Sans" w:hAnsi="Plus Jakarta Sans"/>
           <w:lang w:val="es-ES"/>
@@ -9383,7 +9383,7 @@
     <w:p>
       <w:pPr>
         <w:pStyle w:val="NormalWeb"/>
-        <w:divId w:val="1014452338"/>
+        <w:divId w:val="1312251671"/>
         <w:rPr>
           <w:rFonts w:ascii="Plus Jakarta Sans" w:hAnsi="Plus Jakarta Sans"/>
           <w:lang w:val="es-ES"/>
@@ -9437,7 +9437,7 @@
     <w:p>
       <w:pPr>
         <w:spacing w:before="450" w:after="450"/>
-        <w:divId w:val="1014452338"/>
+        <w:divId w:val="1312251671"/>
         <w:rPr>
           <w:rFonts w:ascii="Plus Jakarta Sans" w:eastAsia="Times New Roman" w:hAnsi="Plus Jakarta Sans"/>
           <w:lang w:val="es-ES"/>
@@ -9448,7 +9448,7 @@
           <w:rFonts w:ascii="Plus Jakarta Sans" w:eastAsia="Times New Roman" w:hAnsi="Plus Jakarta Sans"/>
           <w:lang w:val="es-ES"/>
         </w:rPr>
-        <w:pict w14:anchorId="14D319C7">
+        <w:pict w14:anchorId="549EE60A">
           <v:rect id="_x0000_i1034" style="width:0;height:.75pt" o:hralign="center" o:hrstd="t" o:hr="t" fillcolor="#a0a0a0" stroked="f"/>
         </w:pict>
       </w:r>
@@ -9456,7 +9456,7 @@
     <w:p>
       <w:pPr>
         <w:pStyle w:val="Ttulo2"/>
-        <w:divId w:val="1014452338"/>
+        <w:divId w:val="1312251671"/>
         <w:rPr>
           <w:rFonts w:eastAsia="Times New Roman"/>
           <w:lang w:val="es-ES"/>
@@ -9473,7 +9473,7 @@
     <w:p>
       <w:pPr>
         <w:pStyle w:val="NormalWeb"/>
-        <w:divId w:val="1014452338"/>
+        <w:divId w:val="1312251671"/>
         <w:rPr>
           <w:rFonts w:ascii="Plus Jakarta Sans" w:hAnsi="Plus Jakarta Sans"/>
           <w:lang w:val="es-ES"/>
@@ -9499,7 +9499,7 @@
           <w:rFonts w:ascii="Plus Jakarta Sans" w:hAnsi="Plus Jakarta Sans"/>
           <w:lang w:val="es-ES"/>
         </w:rPr>
-        <w:t>4,171 familias</w:t>
+        <w:t>4,175 familias</w:t>
       </w:r>
       <w:r>
         <w:rPr>
@@ -9512,7 +9512,7 @@
     <w:p>
       <w:pPr>
         <w:pStyle w:val="Ttulo3"/>
-        <w:divId w:val="1014452338"/>
+        <w:divId w:val="1312251671"/>
         <w:rPr>
           <w:rFonts w:eastAsia="Times New Roman"/>
           <w:lang w:val="es-ES"/>
@@ -9546,7 +9546,7 @@
       </w:tblGrid>
       <w:tr>
         <w:trPr>
-          <w:divId w:val="825515825"/>
+          <w:divId w:val="1715543782"/>
           <w:tblHeader/>
         </w:trPr>
         <w:tc>
@@ -9737,7 +9737,7 @@
       </w:tr>
       <w:tr>
         <w:trPr>
-          <w:divId w:val="825515825"/>
+          <w:divId w:val="1715543782"/>
         </w:trPr>
         <w:tc>
           <w:tcPr>
@@ -9893,7 +9893,7 @@
       </w:tr>
       <w:tr>
         <w:trPr>
-          <w:divId w:val="825515825"/>
+          <w:divId w:val="1715543782"/>
         </w:trPr>
         <w:tc>
           <w:tcPr>
@@ -9952,67 +9952,67 @@
                 <w:sz w:val="20"/>
                 <w:szCs w:val="20"/>
               </w:rPr>
-              <w:t>1,633</w:t>
-            </w:r>
-          </w:p>
-        </w:tc>
-        <w:tc>
-          <w:tcPr>
-            <w:tcW w:w="0" w:type="auto"/>
-            <w:tcMar>
-              <w:top w:w="150" w:type="dxa"/>
-              <w:left w:w="210" w:type="dxa"/>
-              <w:bottom w:w="150" w:type="dxa"/>
-              <w:right w:w="210" w:type="dxa"/>
-            </w:tcMar>
-            <w:vAlign w:val="center"/>
-            <w:hideMark/>
-          </w:tcPr>
-          <w:p>
-            <w:pPr>
-              <w:rPr>
-                <w:rFonts w:ascii="Plus Jakarta Sans" w:eastAsia="Times New Roman" w:hAnsi="Plus Jakarta Sans"/>
-                <w:sz w:val="20"/>
-                <w:szCs w:val="20"/>
-              </w:rPr>
-            </w:pPr>
-            <w:r>
-              <w:rPr>
-                <w:rFonts w:ascii="Plus Jakarta Sans" w:eastAsia="Times New Roman" w:hAnsi="Plus Jakarta Sans"/>
-                <w:sz w:val="20"/>
-                <w:szCs w:val="20"/>
-              </w:rPr>
-              <w:t>3,855.54 ha</w:t>
-            </w:r>
-          </w:p>
-        </w:tc>
-        <w:tc>
-          <w:tcPr>
-            <w:tcW w:w="0" w:type="auto"/>
-            <w:tcMar>
-              <w:top w:w="150" w:type="dxa"/>
-              <w:left w:w="210" w:type="dxa"/>
-              <w:bottom w:w="150" w:type="dxa"/>
-              <w:right w:w="210" w:type="dxa"/>
-            </w:tcMar>
-            <w:vAlign w:val="center"/>
-            <w:hideMark/>
-          </w:tcPr>
-          <w:p>
-            <w:pPr>
-              <w:rPr>
-                <w:rFonts w:ascii="Plus Jakarta Sans" w:eastAsia="Times New Roman" w:hAnsi="Plus Jakarta Sans"/>
-                <w:sz w:val="20"/>
-                <w:szCs w:val="20"/>
-              </w:rPr>
-            </w:pPr>
-            <w:r>
-              <w:rPr>
-                <w:rFonts w:ascii="Plus Jakarta Sans" w:eastAsia="Times New Roman" w:hAnsi="Plus Jakarta Sans"/>
-                <w:sz w:val="20"/>
-                <w:szCs w:val="20"/>
-              </w:rPr>
-              <w:t>2,468.66 ha</w:t>
+              <w:t>1,632</w:t>
+            </w:r>
+          </w:p>
+        </w:tc>
+        <w:tc>
+          <w:tcPr>
+            <w:tcW w:w="0" w:type="auto"/>
+            <w:tcMar>
+              <w:top w:w="150" w:type="dxa"/>
+              <w:left w:w="210" w:type="dxa"/>
+              <w:bottom w:w="150" w:type="dxa"/>
+              <w:right w:w="210" w:type="dxa"/>
+            </w:tcMar>
+            <w:vAlign w:val="center"/>
+            <w:hideMark/>
+          </w:tcPr>
+          <w:p>
+            <w:pPr>
+              <w:rPr>
+                <w:rFonts w:ascii="Plus Jakarta Sans" w:eastAsia="Times New Roman" w:hAnsi="Plus Jakarta Sans"/>
+                <w:sz w:val="20"/>
+                <w:szCs w:val="20"/>
+              </w:rPr>
+            </w:pPr>
+            <w:r>
+              <w:rPr>
+                <w:rFonts w:ascii="Plus Jakarta Sans" w:eastAsia="Times New Roman" w:hAnsi="Plus Jakarta Sans"/>
+                <w:sz w:val="20"/>
+                <w:szCs w:val="20"/>
+              </w:rPr>
+              <w:t>3,854.04 ha</w:t>
+            </w:r>
+          </w:p>
+        </w:tc>
+        <w:tc>
+          <w:tcPr>
+            <w:tcW w:w="0" w:type="auto"/>
+            <w:tcMar>
+              <w:top w:w="150" w:type="dxa"/>
+              <w:left w:w="210" w:type="dxa"/>
+              <w:bottom w:w="150" w:type="dxa"/>
+              <w:right w:w="210" w:type="dxa"/>
+            </w:tcMar>
+            <w:vAlign w:val="center"/>
+            <w:hideMark/>
+          </w:tcPr>
+          <w:p>
+            <w:pPr>
+              <w:rPr>
+                <w:rFonts w:ascii="Plus Jakarta Sans" w:eastAsia="Times New Roman" w:hAnsi="Plus Jakarta Sans"/>
+                <w:sz w:val="20"/>
+                <w:szCs w:val="20"/>
+              </w:rPr>
+            </w:pPr>
+            <w:r>
+              <w:rPr>
+                <w:rFonts w:ascii="Plus Jakarta Sans" w:eastAsia="Times New Roman" w:hAnsi="Plus Jakarta Sans"/>
+                <w:sz w:val="20"/>
+                <w:szCs w:val="20"/>
+              </w:rPr>
+              <w:t>2,467.16 ha</w:t>
             </w:r>
           </w:p>
         </w:tc>
@@ -10049,7 +10049,7 @@
       </w:tr>
       <w:tr>
         <w:trPr>
-          <w:divId w:val="825515825"/>
+          <w:divId w:val="1715543782"/>
         </w:trPr>
         <w:tc>
           <w:tcPr>
@@ -10108,104 +10108,104 @@
                 <w:sz w:val="20"/>
                 <w:szCs w:val="20"/>
               </w:rPr>
-              <w:t>817</w:t>
-            </w:r>
-          </w:p>
-        </w:tc>
-        <w:tc>
-          <w:tcPr>
-            <w:tcW w:w="0" w:type="auto"/>
-            <w:tcMar>
-              <w:top w:w="150" w:type="dxa"/>
-              <w:left w:w="210" w:type="dxa"/>
-              <w:bottom w:w="150" w:type="dxa"/>
-              <w:right w:w="210" w:type="dxa"/>
-            </w:tcMar>
-            <w:vAlign w:val="center"/>
-            <w:hideMark/>
-          </w:tcPr>
-          <w:p>
-            <w:pPr>
-              <w:rPr>
-                <w:rFonts w:ascii="Plus Jakarta Sans" w:eastAsia="Times New Roman" w:hAnsi="Plus Jakarta Sans"/>
-                <w:sz w:val="20"/>
-                <w:szCs w:val="20"/>
-              </w:rPr>
-            </w:pPr>
-            <w:r>
-              <w:rPr>
-                <w:rFonts w:ascii="Plus Jakarta Sans" w:eastAsia="Times New Roman" w:hAnsi="Plus Jakarta Sans"/>
-                <w:sz w:val="20"/>
-                <w:szCs w:val="20"/>
-              </w:rPr>
-              <w:t>3,170.59 ha</w:t>
-            </w:r>
-          </w:p>
-        </w:tc>
-        <w:tc>
-          <w:tcPr>
-            <w:tcW w:w="0" w:type="auto"/>
-            <w:tcMar>
-              <w:top w:w="150" w:type="dxa"/>
-              <w:left w:w="210" w:type="dxa"/>
-              <w:bottom w:w="150" w:type="dxa"/>
-              <w:right w:w="210" w:type="dxa"/>
-            </w:tcMar>
-            <w:vAlign w:val="center"/>
-            <w:hideMark/>
-          </w:tcPr>
-          <w:p>
-            <w:pPr>
-              <w:rPr>
-                <w:rFonts w:ascii="Plus Jakarta Sans" w:eastAsia="Times New Roman" w:hAnsi="Plus Jakarta Sans"/>
-                <w:sz w:val="20"/>
-                <w:szCs w:val="20"/>
-              </w:rPr>
-            </w:pPr>
-            <w:r>
-              <w:rPr>
-                <w:rFonts w:ascii="Plus Jakarta Sans" w:eastAsia="Times New Roman" w:hAnsi="Plus Jakarta Sans"/>
-                <w:sz w:val="20"/>
-                <w:szCs w:val="20"/>
-              </w:rPr>
-              <w:t>1,549.15 ha</w:t>
-            </w:r>
-          </w:p>
-        </w:tc>
-        <w:tc>
-          <w:tcPr>
-            <w:tcW w:w="0" w:type="auto"/>
-            <w:tcMar>
-              <w:top w:w="150" w:type="dxa"/>
-              <w:left w:w="210" w:type="dxa"/>
-              <w:bottom w:w="150" w:type="dxa"/>
-              <w:right w:w="210" w:type="dxa"/>
-            </w:tcMar>
-            <w:vAlign w:val="center"/>
-            <w:hideMark/>
-          </w:tcPr>
-          <w:p>
-            <w:pPr>
-              <w:rPr>
-                <w:rFonts w:ascii="Plus Jakarta Sans" w:eastAsia="Times New Roman" w:hAnsi="Plus Jakarta Sans"/>
-                <w:sz w:val="20"/>
-                <w:szCs w:val="20"/>
-              </w:rPr>
-            </w:pPr>
-            <w:r>
-              <w:rPr>
-                <w:rFonts w:ascii="Plus Jakarta Sans" w:eastAsia="Times New Roman" w:hAnsi="Plus Jakarta Sans"/>
-                <w:sz w:val="20"/>
-                <w:szCs w:val="20"/>
-              </w:rPr>
-              <w:t>1,621.44 ha</w:t>
+              <w:t>822</w:t>
+            </w:r>
+          </w:p>
+        </w:tc>
+        <w:tc>
+          <w:tcPr>
+            <w:tcW w:w="0" w:type="auto"/>
+            <w:tcMar>
+              <w:top w:w="150" w:type="dxa"/>
+              <w:left w:w="210" w:type="dxa"/>
+              <w:bottom w:w="150" w:type="dxa"/>
+              <w:right w:w="210" w:type="dxa"/>
+            </w:tcMar>
+            <w:vAlign w:val="center"/>
+            <w:hideMark/>
+          </w:tcPr>
+          <w:p>
+            <w:pPr>
+              <w:rPr>
+                <w:rFonts w:ascii="Plus Jakarta Sans" w:eastAsia="Times New Roman" w:hAnsi="Plus Jakarta Sans"/>
+                <w:sz w:val="20"/>
+                <w:szCs w:val="20"/>
+              </w:rPr>
+            </w:pPr>
+            <w:r>
+              <w:rPr>
+                <w:rFonts w:ascii="Plus Jakarta Sans" w:eastAsia="Times New Roman" w:hAnsi="Plus Jakarta Sans"/>
+                <w:sz w:val="20"/>
+                <w:szCs w:val="20"/>
+              </w:rPr>
+              <w:t>3,175.53 ha</w:t>
+            </w:r>
+          </w:p>
+        </w:tc>
+        <w:tc>
+          <w:tcPr>
+            <w:tcW w:w="0" w:type="auto"/>
+            <w:tcMar>
+              <w:top w:w="150" w:type="dxa"/>
+              <w:left w:w="210" w:type="dxa"/>
+              <w:bottom w:w="150" w:type="dxa"/>
+              <w:right w:w="210" w:type="dxa"/>
+            </w:tcMar>
+            <w:vAlign w:val="center"/>
+            <w:hideMark/>
+          </w:tcPr>
+          <w:p>
+            <w:pPr>
+              <w:rPr>
+                <w:rFonts w:ascii="Plus Jakarta Sans" w:eastAsia="Times New Roman" w:hAnsi="Plus Jakarta Sans"/>
+                <w:sz w:val="20"/>
+                <w:szCs w:val="20"/>
+              </w:rPr>
+            </w:pPr>
+            <w:r>
+              <w:rPr>
+                <w:rFonts w:ascii="Plus Jakarta Sans" w:eastAsia="Times New Roman" w:hAnsi="Plus Jakarta Sans"/>
+                <w:sz w:val="20"/>
+                <w:szCs w:val="20"/>
+              </w:rPr>
+              <w:t>1,553.36 ha</w:t>
+            </w:r>
+          </w:p>
+        </w:tc>
+        <w:tc>
+          <w:tcPr>
+            <w:tcW w:w="0" w:type="auto"/>
+            <w:tcMar>
+              <w:top w:w="150" w:type="dxa"/>
+              <w:left w:w="210" w:type="dxa"/>
+              <w:bottom w:w="150" w:type="dxa"/>
+              <w:right w:w="210" w:type="dxa"/>
+            </w:tcMar>
+            <w:vAlign w:val="center"/>
+            <w:hideMark/>
+          </w:tcPr>
+          <w:p>
+            <w:pPr>
+              <w:rPr>
+                <w:rFonts w:ascii="Plus Jakarta Sans" w:eastAsia="Times New Roman" w:hAnsi="Plus Jakarta Sans"/>
+                <w:sz w:val="20"/>
+                <w:szCs w:val="20"/>
+              </w:rPr>
+            </w:pPr>
+            <w:r>
+              <w:rPr>
+                <w:rFonts w:ascii="Plus Jakarta Sans" w:eastAsia="Times New Roman" w:hAnsi="Plus Jakarta Sans"/>
+                <w:sz w:val="20"/>
+                <w:szCs w:val="20"/>
+              </w:rPr>
+              <w:t>1,622.17 ha</w:t>
             </w:r>
           </w:p>
         </w:tc>
       </w:tr>
       <w:tr>
         <w:trPr>
-          <w:divId w:val="825515825"/>
+          <w:divId w:val="1715543782"/>
         </w:trPr>
         <w:tc>
           <w:tcPr>
@@ -10265,7 +10265,7 @@
                 <w:sz w:val="20"/>
                 <w:szCs w:val="20"/>
               </w:rPr>
-              <w:t>4,171</w:t>
+              <w:t>4,175</w:t>
             </w:r>
           </w:p>
         </w:tc>
@@ -10296,7 +10296,7 @@
                 <w:sz w:val="20"/>
                 <w:szCs w:val="20"/>
               </w:rPr>
-              <w:t>10,416.30 ha</w:t>
+              <w:t>10,419.74 ha</w:t>
             </w:r>
           </w:p>
         </w:tc>
@@ -10327,7 +10327,7 @@
                 <w:sz w:val="20"/>
                 <w:szCs w:val="20"/>
               </w:rPr>
-              <w:t>7,000.19 ha</w:t>
+              <w:t>7,002.90 ha</w:t>
             </w:r>
           </w:p>
         </w:tc>
@@ -10358,7 +10358,7 @@
                 <w:sz w:val="20"/>
                 <w:szCs w:val="20"/>
               </w:rPr>
-              <w:t>3,416.11 ha</w:t>
+              <w:t>3,416.84 ha</w:t>
             </w:r>
           </w:p>
         </w:tc>
@@ -10367,7 +10367,7 @@
     <w:p>
       <w:pPr>
         <w:pStyle w:val="Ttulo3"/>
-        <w:divId w:val="1014452338"/>
+        <w:divId w:val="1312251671"/>
         <w:rPr>
           <w:rFonts w:eastAsia="Times New Roman"/>
           <w:lang w:val="es-ES"/>
@@ -10401,7 +10401,7 @@
       </w:tblGrid>
       <w:tr>
         <w:trPr>
-          <w:divId w:val="1732264554"/>
+          <w:divId w:val="1570798865"/>
           <w:tblHeader/>
         </w:trPr>
         <w:tc>
@@ -10592,7 +10592,7 @@
       </w:tr>
       <w:tr>
         <w:trPr>
-          <w:divId w:val="1732264554"/>
+          <w:divId w:val="1570798865"/>
         </w:trPr>
         <w:tc>
           <w:tcPr>
@@ -10681,37 +10681,37 @@
                 <w:sz w:val="20"/>
                 <w:szCs w:val="20"/>
               </w:rPr>
-              <w:t>881</w:t>
-            </w:r>
-          </w:p>
-        </w:tc>
-        <w:tc>
-          <w:tcPr>
-            <w:tcW w:w="0" w:type="auto"/>
-            <w:tcMar>
-              <w:top w:w="150" w:type="dxa"/>
-              <w:left w:w="210" w:type="dxa"/>
-              <w:bottom w:w="150" w:type="dxa"/>
-              <w:right w:w="210" w:type="dxa"/>
-            </w:tcMar>
-            <w:vAlign w:val="center"/>
-            <w:hideMark/>
-          </w:tcPr>
-          <w:p>
-            <w:pPr>
-              <w:rPr>
-                <w:rFonts w:ascii="Plus Jakarta Sans" w:eastAsia="Times New Roman" w:hAnsi="Plus Jakarta Sans"/>
-                <w:sz w:val="20"/>
-                <w:szCs w:val="20"/>
-              </w:rPr>
-            </w:pPr>
-            <w:r>
-              <w:rPr>
-                <w:rFonts w:ascii="Plus Jakarta Sans" w:eastAsia="Times New Roman" w:hAnsi="Plus Jakarta Sans"/>
-                <w:sz w:val="20"/>
-                <w:szCs w:val="20"/>
-              </w:rPr>
-              <w:t>614</w:t>
+              <w:t>880</w:t>
+            </w:r>
+          </w:p>
+        </w:tc>
+        <w:tc>
+          <w:tcPr>
+            <w:tcW w:w="0" w:type="auto"/>
+            <w:tcMar>
+              <w:top w:w="150" w:type="dxa"/>
+              <w:left w:w="210" w:type="dxa"/>
+              <w:bottom w:w="150" w:type="dxa"/>
+              <w:right w:w="210" w:type="dxa"/>
+            </w:tcMar>
+            <w:vAlign w:val="center"/>
+            <w:hideMark/>
+          </w:tcPr>
+          <w:p>
+            <w:pPr>
+              <w:rPr>
+                <w:rFonts w:ascii="Plus Jakarta Sans" w:eastAsia="Times New Roman" w:hAnsi="Plus Jakarta Sans"/>
+                <w:sz w:val="20"/>
+                <w:szCs w:val="20"/>
+              </w:rPr>
+            </w:pPr>
+            <w:r>
+              <w:rPr>
+                <w:rFonts w:ascii="Plus Jakarta Sans" w:eastAsia="Times New Roman" w:hAnsi="Plus Jakarta Sans"/>
+                <w:sz w:val="20"/>
+                <w:szCs w:val="20"/>
+              </w:rPr>
+              <w:t>619</w:t>
             </w:r>
           </w:p>
         </w:tc>
@@ -10742,14 +10742,14 @@
                 <w:sz w:val="20"/>
                 <w:szCs w:val="20"/>
               </w:rPr>
-              <w:t>3,043</w:t>
+              <w:t>3,047</w:t>
             </w:r>
           </w:p>
         </w:tc>
       </w:tr>
       <w:tr>
         <w:trPr>
-          <w:divId w:val="1732264554"/>
+          <w:divId w:val="1570798865"/>
         </w:trPr>
         <w:tc>
           <w:tcPr>
@@ -10899,7 +10899,7 @@
                 <w:sz w:val="20"/>
                 <w:szCs w:val="20"/>
               </w:rPr>
-              <w:t>2,877</w:t>
+              <w:t>2,878</w:t>
             </w:r>
           </w:p>
         </w:tc>
@@ -10908,7 +10908,7 @@
     <w:p>
       <w:pPr>
         <w:pStyle w:val="Ttulo3"/>
-        <w:divId w:val="1014452338"/>
+        <w:divId w:val="1312251671"/>
         <w:rPr>
           <w:rFonts w:eastAsia="Times New Roman"/>
           <w:lang w:val="es-ES"/>
@@ -10943,7 +10943,7 @@
       </w:tblGrid>
       <w:tr>
         <w:trPr>
-          <w:divId w:val="1105659230"/>
+          <w:divId w:val="1599632691"/>
           <w:tblHeader/>
         </w:trPr>
         <w:tc>
@@ -11171,7 +11171,7 @@
       </w:tr>
       <w:tr>
         <w:trPr>
-          <w:divId w:val="1105659230"/>
+          <w:divId w:val="1599632691"/>
         </w:trPr>
         <w:tc>
           <w:tcPr>
@@ -11298,7 +11298,7 @@
                 <w:sz w:val="20"/>
                 <w:szCs w:val="20"/>
               </w:rPr>
-              <w:t>688</w:t>
+              <w:t>697</w:t>
             </w:r>
           </w:p>
         </w:tc>
@@ -11329,7 +11329,7 @@
                 <w:sz w:val="20"/>
                 <w:szCs w:val="20"/>
               </w:rPr>
-              <w:t>3,626</w:t>
+              <w:t>3,635</w:t>
             </w:r>
           </w:p>
         </w:tc>
@@ -11360,14 +11360,14 @@
                 <w:sz w:val="20"/>
                 <w:szCs w:val="20"/>
               </w:rPr>
-              <w:t>86.9%</w:t>
+              <w:t>87.1%</w:t>
             </w:r>
           </w:p>
         </w:tc>
       </w:tr>
       <w:tr>
         <w:trPr>
-          <w:divId w:val="1105659230"/>
+          <w:divId w:val="1599632691"/>
         </w:trPr>
         <w:tc>
           <w:tcPr>
@@ -11485,74 +11485,74 @@
                 <w:sz w:val="20"/>
                 <w:szCs w:val="20"/>
               </w:rPr>
-              <w:t>120</w:t>
-            </w:r>
-          </w:p>
-        </w:tc>
-        <w:tc>
-          <w:tcPr>
-            <w:tcW w:w="0" w:type="auto"/>
-            <w:tcMar>
-              <w:top w:w="150" w:type="dxa"/>
-              <w:left w:w="210" w:type="dxa"/>
-              <w:bottom w:w="150" w:type="dxa"/>
-              <w:right w:w="210" w:type="dxa"/>
-            </w:tcMar>
-            <w:vAlign w:val="center"/>
-            <w:hideMark/>
-          </w:tcPr>
-          <w:p>
-            <w:pPr>
-              <w:rPr>
-                <w:rFonts w:ascii="Plus Jakarta Sans" w:eastAsia="Times New Roman" w:hAnsi="Plus Jakarta Sans"/>
-                <w:sz w:val="20"/>
-                <w:szCs w:val="20"/>
-              </w:rPr>
-            </w:pPr>
-            <w:r>
-              <w:rPr>
-                <w:rFonts w:ascii="Plus Jakarta Sans" w:eastAsia="Times New Roman" w:hAnsi="Plus Jakarta Sans"/>
-                <w:sz w:val="20"/>
-                <w:szCs w:val="20"/>
-              </w:rPr>
-              <w:t>515</w:t>
-            </w:r>
-          </w:p>
-        </w:tc>
-        <w:tc>
-          <w:tcPr>
-            <w:tcW w:w="0" w:type="auto"/>
-            <w:tcMar>
-              <w:top w:w="150" w:type="dxa"/>
-              <w:left w:w="210" w:type="dxa"/>
-              <w:bottom w:w="150" w:type="dxa"/>
-              <w:right w:w="210" w:type="dxa"/>
-            </w:tcMar>
-            <w:vAlign w:val="center"/>
-            <w:hideMark/>
-          </w:tcPr>
-          <w:p>
-            <w:pPr>
-              <w:rPr>
-                <w:rFonts w:ascii="Plus Jakarta Sans" w:eastAsia="Times New Roman" w:hAnsi="Plus Jakarta Sans"/>
-                <w:sz w:val="20"/>
-                <w:szCs w:val="20"/>
-              </w:rPr>
-            </w:pPr>
-            <w:r>
-              <w:rPr>
-                <w:rFonts w:ascii="Plus Jakarta Sans" w:eastAsia="Times New Roman" w:hAnsi="Plus Jakarta Sans"/>
-                <w:sz w:val="20"/>
-                <w:szCs w:val="20"/>
-              </w:rPr>
-              <w:t>12.3%</w:t>
+              <w:t>123</w:t>
+            </w:r>
+          </w:p>
+        </w:tc>
+        <w:tc>
+          <w:tcPr>
+            <w:tcW w:w="0" w:type="auto"/>
+            <w:tcMar>
+              <w:top w:w="150" w:type="dxa"/>
+              <w:left w:w="210" w:type="dxa"/>
+              <w:bottom w:w="150" w:type="dxa"/>
+              <w:right w:w="210" w:type="dxa"/>
+            </w:tcMar>
+            <w:vAlign w:val="center"/>
+            <w:hideMark/>
+          </w:tcPr>
+          <w:p>
+            <w:pPr>
+              <w:rPr>
+                <w:rFonts w:ascii="Plus Jakarta Sans" w:eastAsia="Times New Roman" w:hAnsi="Plus Jakarta Sans"/>
+                <w:sz w:val="20"/>
+                <w:szCs w:val="20"/>
+              </w:rPr>
+            </w:pPr>
+            <w:r>
+              <w:rPr>
+                <w:rFonts w:ascii="Plus Jakarta Sans" w:eastAsia="Times New Roman" w:hAnsi="Plus Jakarta Sans"/>
+                <w:sz w:val="20"/>
+                <w:szCs w:val="20"/>
+              </w:rPr>
+              <w:t>518</w:t>
+            </w:r>
+          </w:p>
+        </w:tc>
+        <w:tc>
+          <w:tcPr>
+            <w:tcW w:w="0" w:type="auto"/>
+            <w:tcMar>
+              <w:top w:w="150" w:type="dxa"/>
+              <w:left w:w="210" w:type="dxa"/>
+              <w:bottom w:w="150" w:type="dxa"/>
+              <w:right w:w="210" w:type="dxa"/>
+            </w:tcMar>
+            <w:vAlign w:val="center"/>
+            <w:hideMark/>
+          </w:tcPr>
+          <w:p>
+            <w:pPr>
+              <w:rPr>
+                <w:rFonts w:ascii="Plus Jakarta Sans" w:eastAsia="Times New Roman" w:hAnsi="Plus Jakarta Sans"/>
+                <w:sz w:val="20"/>
+                <w:szCs w:val="20"/>
+              </w:rPr>
+            </w:pPr>
+            <w:r>
+              <w:rPr>
+                <w:rFonts w:ascii="Plus Jakarta Sans" w:eastAsia="Times New Roman" w:hAnsi="Plus Jakarta Sans"/>
+                <w:sz w:val="20"/>
+                <w:szCs w:val="20"/>
+              </w:rPr>
+              <w:t>12.4%</w:t>
             </w:r>
           </w:p>
         </w:tc>
       </w:tr>
       <w:tr>
         <w:trPr>
-          <w:divId w:val="1105659230"/>
+          <w:divId w:val="1599632691"/>
         </w:trPr>
         <w:tc>
           <w:tcPr>
@@ -11679,7 +11679,7 @@
                 <w:sz w:val="20"/>
                 <w:szCs w:val="20"/>
               </w:rPr>
-              <w:t>817</w:t>
+              <w:t>822</w:t>
             </w:r>
           </w:p>
         </w:tc>
@@ -11710,7 +11710,7 @@
                 <w:sz w:val="20"/>
                 <w:szCs w:val="20"/>
               </w:rPr>
-              <w:t>4,151</w:t>
+              <w:t>4,156</w:t>
             </w:r>
           </w:p>
         </w:tc>
@@ -11750,7 +11750,7 @@
     <w:p>
       <w:pPr>
         <w:pStyle w:val="Ttulo4"/>
-        <w:divId w:val="1014452338"/>
+        <w:divId w:val="1312251671"/>
         <w:rPr>
           <w:rFonts w:eastAsia="Times New Roman"/>
           <w:lang w:val="es-ES"/>
@@ -11768,7 +11768,7 @@
       <w:pPr>
         <w:spacing w:before="375" w:after="225"/>
         <w:jc w:val="center"/>
-        <w:divId w:val="1621034963"/>
+        <w:divId w:val="1109204957"/>
         <w:rPr>
           <w:rFonts w:ascii="Outfit" w:eastAsia="Times New Roman" w:hAnsi="Outfit"/>
           <w:b/>
@@ -11798,7 +11798,7 @@
       <w:pPr>
         <w:spacing w:after="375"/>
         <w:jc w:val="center"/>
-        <w:divId w:val="801001102"/>
+        <w:divId w:val="41708553"/>
         <w:rPr>
           <w:rFonts w:ascii="Plus Jakarta Sans" w:eastAsia="Times New Roman" w:hAnsi="Plus Jakarta Sans"/>
           <w:lang w:val="es-ES"/>
@@ -12193,7 +12193,7 @@
     <w:p>
       <w:pPr>
         <w:pStyle w:val="Ttulo3"/>
-        <w:divId w:val="1014452338"/>
+        <w:divId w:val="1312251671"/>
         <w:rPr>
           <w:rFonts w:eastAsia="Times New Roman"/>
           <w:lang w:val="es-ES"/>
@@ -12225,7 +12225,7 @@
       </w:tblGrid>
       <w:tr>
         <w:trPr>
-          <w:divId w:val="2078212114"/>
+          <w:divId w:val="1758407925"/>
           <w:tblHeader/>
         </w:trPr>
         <w:tc>
@@ -12342,7 +12342,7 @@
       </w:tr>
       <w:tr>
         <w:trPr>
-          <w:divId w:val="2078212114"/>
+          <w:divId w:val="1758407925"/>
         </w:trPr>
         <w:tc>
           <w:tcPr>
@@ -12438,7 +12438,7 @@
       </w:tr>
       <w:tr>
         <w:trPr>
-          <w:divId w:val="2078212114"/>
+          <w:divId w:val="1758407925"/>
         </w:trPr>
         <w:tc>
           <w:tcPr>
@@ -12534,7 +12534,7 @@
       </w:tr>
       <w:tr>
         <w:trPr>
-          <w:divId w:val="2078212114"/>
+          <w:divId w:val="1758407925"/>
         </w:trPr>
         <w:tc>
           <w:tcPr>
@@ -12593,37 +12593,37 @@
                 <w:sz w:val="20"/>
                 <w:szCs w:val="20"/>
               </w:rPr>
-              <w:t>58.8 km</w:t>
-            </w:r>
-          </w:p>
-        </w:tc>
-        <w:tc>
-          <w:tcPr>
-            <w:tcW w:w="0" w:type="auto"/>
-            <w:tcMar>
-              <w:top w:w="150" w:type="dxa"/>
-              <w:left w:w="210" w:type="dxa"/>
-              <w:bottom w:w="150" w:type="dxa"/>
-              <w:right w:w="210" w:type="dxa"/>
-            </w:tcMar>
-            <w:vAlign w:val="center"/>
-            <w:hideMark/>
-          </w:tcPr>
-          <w:p>
-            <w:pPr>
-              <w:rPr>
-                <w:rFonts w:ascii="Plus Jakarta Sans" w:eastAsia="Times New Roman" w:hAnsi="Plus Jakarta Sans"/>
-                <w:sz w:val="20"/>
-                <w:szCs w:val="20"/>
-              </w:rPr>
-            </w:pPr>
-            <w:r>
-              <w:rPr>
-                <w:rFonts w:ascii="Plus Jakarta Sans" w:eastAsia="Times New Roman" w:hAnsi="Plus Jakarta Sans"/>
-                <w:sz w:val="20"/>
-                <w:szCs w:val="20"/>
-              </w:rPr>
-              <w:t>814</w:t>
+              <w:t>58.9 km</w:t>
+            </w:r>
+          </w:p>
+        </w:tc>
+        <w:tc>
+          <w:tcPr>
+            <w:tcW w:w="0" w:type="auto"/>
+            <w:tcMar>
+              <w:top w:w="150" w:type="dxa"/>
+              <w:left w:w="210" w:type="dxa"/>
+              <w:bottom w:w="150" w:type="dxa"/>
+              <w:right w:w="210" w:type="dxa"/>
+            </w:tcMar>
+            <w:vAlign w:val="center"/>
+            <w:hideMark/>
+          </w:tcPr>
+          <w:p>
+            <w:pPr>
+              <w:rPr>
+                <w:rFonts w:ascii="Plus Jakarta Sans" w:eastAsia="Times New Roman" w:hAnsi="Plus Jakarta Sans"/>
+                <w:sz w:val="20"/>
+                <w:szCs w:val="20"/>
+              </w:rPr>
+            </w:pPr>
+            <w:r>
+              <w:rPr>
+                <w:rFonts w:ascii="Plus Jakarta Sans" w:eastAsia="Times New Roman" w:hAnsi="Plus Jakarta Sans"/>
+                <w:sz w:val="20"/>
+                <w:szCs w:val="20"/>
+              </w:rPr>
+              <w:t>819</w:t>
             </w:r>
           </w:p>
         </w:tc>
@@ -12632,7 +12632,7 @@
     <w:p>
       <w:pPr>
         <w:pStyle w:val="NormalWeb"/>
-        <w:divId w:val="1014452338"/>
+        <w:divId w:val="1312251671"/>
         <w:rPr>
           <w:rFonts w:ascii="Plus Jakarta Sans" w:hAnsi="Plus Jakarta Sans"/>
           <w:lang w:val="es-ES"/>
@@ -12657,7 +12657,7 @@
     <w:p>
       <w:pPr>
         <w:pStyle w:val="Ttulo3"/>
-        <w:divId w:val="1014452338"/>
+        <w:divId w:val="1312251671"/>
         <w:rPr>
           <w:rFonts w:eastAsia="Times New Roman"/>
           <w:lang w:val="es-ES"/>
@@ -12699,7 +12699,7 @@
       </w:tblGrid>
       <w:tr>
         <w:trPr>
-          <w:divId w:val="1396706266"/>
+          <w:divId w:val="670261669"/>
           <w:tblHeader/>
         </w:trPr>
         <w:tc>
@@ -12927,7 +12927,7 @@
       </w:tr>
       <w:tr>
         <w:trPr>
-          <w:divId w:val="1396706266"/>
+          <w:divId w:val="670261669"/>
         </w:trPr>
         <w:tc>
           <w:tcPr>
@@ -13113,7 +13113,7 @@
       </w:tr>
       <w:tr>
         <w:trPr>
-          <w:divId w:val="1396706266"/>
+          <w:divId w:val="670261669"/>
         </w:trPr>
         <w:tc>
           <w:tcPr>
@@ -13172,7 +13172,7 @@
                 <w:sz w:val="20"/>
                 <w:szCs w:val="20"/>
               </w:rPr>
-              <w:t>1,633</w:t>
+              <w:t>1,632</w:t>
             </w:r>
           </w:p>
         </w:tc>
@@ -13299,7 +13299,7 @@
       </w:tr>
       <w:tr>
         <w:trPr>
-          <w:divId w:val="1396706266"/>
+          <w:divId w:val="670261669"/>
         </w:trPr>
         <w:tc>
           <w:tcPr>
@@ -13358,97 +13358,97 @@
                 <w:sz w:val="20"/>
                 <w:szCs w:val="20"/>
               </w:rPr>
-              <w:t>817</w:t>
-            </w:r>
-          </w:p>
-        </w:tc>
-        <w:tc>
-          <w:tcPr>
-            <w:tcW w:w="0" w:type="auto"/>
-            <w:tcMar>
-              <w:top w:w="150" w:type="dxa"/>
-              <w:left w:w="210" w:type="dxa"/>
-              <w:bottom w:w="150" w:type="dxa"/>
-              <w:right w:w="210" w:type="dxa"/>
-            </w:tcMar>
-            <w:vAlign w:val="center"/>
-            <w:hideMark/>
-          </w:tcPr>
-          <w:p>
-            <w:pPr>
-              <w:rPr>
-                <w:rFonts w:ascii="Plus Jakarta Sans" w:eastAsia="Times New Roman" w:hAnsi="Plus Jakarta Sans"/>
-                <w:sz w:val="20"/>
-                <w:szCs w:val="20"/>
-              </w:rPr>
-            </w:pPr>
-            <w:r>
-              <w:rPr>
-                <w:rFonts w:ascii="Plus Jakarta Sans" w:eastAsia="Times New Roman" w:hAnsi="Plus Jakarta Sans"/>
-                <w:sz w:val="20"/>
-                <w:szCs w:val="20"/>
-              </w:rPr>
-              <w:t>1,416</w:t>
-            </w:r>
-          </w:p>
-        </w:tc>
-        <w:tc>
-          <w:tcPr>
-            <w:tcW w:w="0" w:type="auto"/>
-            <w:tcMar>
-              <w:top w:w="150" w:type="dxa"/>
-              <w:left w:w="210" w:type="dxa"/>
-              <w:bottom w:w="150" w:type="dxa"/>
-              <w:right w:w="210" w:type="dxa"/>
-            </w:tcMar>
-            <w:vAlign w:val="center"/>
-            <w:hideMark/>
-          </w:tcPr>
-          <w:p>
-            <w:pPr>
-              <w:rPr>
-                <w:rFonts w:ascii="Plus Jakarta Sans" w:eastAsia="Times New Roman" w:hAnsi="Plus Jakarta Sans"/>
-                <w:sz w:val="20"/>
-                <w:szCs w:val="20"/>
-              </w:rPr>
-            </w:pPr>
-            <w:r>
-              <w:rPr>
-                <w:rFonts w:ascii="Plus Jakarta Sans" w:eastAsia="Times New Roman" w:hAnsi="Plus Jakarta Sans"/>
-                <w:sz w:val="20"/>
-                <w:szCs w:val="20"/>
-              </w:rPr>
-              <w:t>1,264</w:t>
-            </w:r>
-          </w:p>
-        </w:tc>
-        <w:tc>
-          <w:tcPr>
-            <w:tcW w:w="0" w:type="auto"/>
-            <w:tcMar>
-              <w:top w:w="150" w:type="dxa"/>
-              <w:left w:w="210" w:type="dxa"/>
-              <w:bottom w:w="150" w:type="dxa"/>
-              <w:right w:w="210" w:type="dxa"/>
-            </w:tcMar>
-            <w:vAlign w:val="center"/>
-            <w:hideMark/>
-          </w:tcPr>
-          <w:p>
-            <w:pPr>
-              <w:rPr>
-                <w:rFonts w:ascii="Plus Jakarta Sans" w:eastAsia="Times New Roman" w:hAnsi="Plus Jakarta Sans"/>
-                <w:sz w:val="20"/>
-                <w:szCs w:val="20"/>
-              </w:rPr>
-            </w:pPr>
-            <w:r>
-              <w:rPr>
-                <w:rFonts w:ascii="Plus Jakarta Sans" w:eastAsia="Times New Roman" w:hAnsi="Plus Jakarta Sans"/>
-                <w:sz w:val="20"/>
-                <w:szCs w:val="20"/>
-              </w:rPr>
-              <w:t>2,680</w:t>
+              <w:t>822</w:t>
+            </w:r>
+          </w:p>
+        </w:tc>
+        <w:tc>
+          <w:tcPr>
+            <w:tcW w:w="0" w:type="auto"/>
+            <w:tcMar>
+              <w:top w:w="150" w:type="dxa"/>
+              <w:left w:w="210" w:type="dxa"/>
+              <w:bottom w:w="150" w:type="dxa"/>
+              <w:right w:w="210" w:type="dxa"/>
+            </w:tcMar>
+            <w:vAlign w:val="center"/>
+            <w:hideMark/>
+          </w:tcPr>
+          <w:p>
+            <w:pPr>
+              <w:rPr>
+                <w:rFonts w:ascii="Plus Jakarta Sans" w:eastAsia="Times New Roman" w:hAnsi="Plus Jakarta Sans"/>
+                <w:sz w:val="20"/>
+                <w:szCs w:val="20"/>
+              </w:rPr>
+            </w:pPr>
+            <w:r>
+              <w:rPr>
+                <w:rFonts w:ascii="Plus Jakarta Sans" w:eastAsia="Times New Roman" w:hAnsi="Plus Jakarta Sans"/>
+                <w:sz w:val="20"/>
+                <w:szCs w:val="20"/>
+              </w:rPr>
+              <w:t>1,437</w:t>
+            </w:r>
+          </w:p>
+        </w:tc>
+        <w:tc>
+          <w:tcPr>
+            <w:tcW w:w="0" w:type="auto"/>
+            <w:tcMar>
+              <w:top w:w="150" w:type="dxa"/>
+              <w:left w:w="210" w:type="dxa"/>
+              <w:bottom w:w="150" w:type="dxa"/>
+              <w:right w:w="210" w:type="dxa"/>
+            </w:tcMar>
+            <w:vAlign w:val="center"/>
+            <w:hideMark/>
+          </w:tcPr>
+          <w:p>
+            <w:pPr>
+              <w:rPr>
+                <w:rFonts w:ascii="Plus Jakarta Sans" w:eastAsia="Times New Roman" w:hAnsi="Plus Jakarta Sans"/>
+                <w:sz w:val="20"/>
+                <w:szCs w:val="20"/>
+              </w:rPr>
+            </w:pPr>
+            <w:r>
+              <w:rPr>
+                <w:rFonts w:ascii="Plus Jakarta Sans" w:eastAsia="Times New Roman" w:hAnsi="Plus Jakarta Sans"/>
+                <w:sz w:val="20"/>
+                <w:szCs w:val="20"/>
+              </w:rPr>
+              <w:t>1,282</w:t>
+            </w:r>
+          </w:p>
+        </w:tc>
+        <w:tc>
+          <w:tcPr>
+            <w:tcW w:w="0" w:type="auto"/>
+            <w:tcMar>
+              <w:top w:w="150" w:type="dxa"/>
+              <w:left w:w="210" w:type="dxa"/>
+              <w:bottom w:w="150" w:type="dxa"/>
+              <w:right w:w="210" w:type="dxa"/>
+            </w:tcMar>
+            <w:vAlign w:val="center"/>
+            <w:hideMark/>
+          </w:tcPr>
+          <w:p>
+            <w:pPr>
+              <w:rPr>
+                <w:rFonts w:ascii="Plus Jakarta Sans" w:eastAsia="Times New Roman" w:hAnsi="Plus Jakarta Sans"/>
+                <w:sz w:val="20"/>
+                <w:szCs w:val="20"/>
+              </w:rPr>
+            </w:pPr>
+            <w:r>
+              <w:rPr>
+                <w:rFonts w:ascii="Plus Jakarta Sans" w:eastAsia="Times New Roman" w:hAnsi="Plus Jakarta Sans"/>
+                <w:sz w:val="20"/>
+                <w:szCs w:val="20"/>
+              </w:rPr>
+              <w:t>2,719</w:t>
             </w:r>
           </w:p>
         </w:tc>
@@ -13485,7 +13485,7 @@
       </w:tr>
       <w:tr>
         <w:trPr>
-          <w:divId w:val="1396706266"/>
+          <w:divId w:val="670261669"/>
         </w:trPr>
         <w:tc>
           <w:tcPr>
@@ -13545,7 +13545,7 @@
                 <w:sz w:val="20"/>
                 <w:szCs w:val="20"/>
               </w:rPr>
-              <w:t>4,171</w:t>
+              <w:t>4,175</w:t>
             </w:r>
           </w:p>
         </w:tc>
@@ -13576,7 +13576,7 @@
                 <w:sz w:val="20"/>
                 <w:szCs w:val="20"/>
               </w:rPr>
-              <w:t>6,077</w:t>
+              <w:t>6,098</w:t>
             </w:r>
           </w:p>
         </w:tc>
@@ -13607,7 +13607,7 @@
                 <w:sz w:val="20"/>
                 <w:szCs w:val="20"/>
               </w:rPr>
-              <w:t>5,820</w:t>
+              <w:t>5,838</w:t>
             </w:r>
           </w:p>
         </w:tc>
@@ -13638,7 +13638,7 @@
                 <w:sz w:val="20"/>
                 <w:szCs w:val="20"/>
               </w:rPr>
-              <w:t>11,897</w:t>
+              <w:t>11,936</w:t>
             </w:r>
           </w:p>
         </w:tc>
@@ -13678,7 +13678,7 @@
     <w:p>
       <w:pPr>
         <w:pStyle w:val="NormalWeb"/>
-        <w:divId w:val="1014452338"/>
+        <w:divId w:val="1312251671"/>
         <w:rPr>
           <w:rFonts w:ascii="Plus Jakarta Sans" w:hAnsi="Plus Jakarta Sans"/>
           <w:lang w:val="es-ES"/>
@@ -13704,7 +13704,7 @@
           <w:rFonts w:ascii="Plus Jakarta Sans" w:hAnsi="Plus Jakarta Sans"/>
           <w:lang w:val="es-ES"/>
         </w:rPr>
-        <w:t xml:space="preserve"> 4,171 titulares + 11,897 hijos = </w:t>
+        <w:t xml:space="preserve"> 4,175 titulares + 11,936 hijos = </w:t>
       </w:r>
       <w:r>
         <w:rPr>
@@ -13712,7 +13712,7 @@
           <w:rFonts w:ascii="Plus Jakarta Sans" w:hAnsi="Plus Jakarta Sans"/>
           <w:lang w:val="es-ES"/>
         </w:rPr>
-        <w:t>~16,068 personas</w:t>
+        <w:t>~16,111 personas</w:t>
       </w:r>
       <w:r>
         <w:rPr>
@@ -13725,7 +13725,7 @@
     <w:p>
       <w:pPr>
         <w:pStyle w:val="Ttulo3"/>
-        <w:divId w:val="1014452338"/>
+        <w:divId w:val="1312251671"/>
         <w:rPr>
           <w:rFonts w:eastAsia="Times New Roman"/>
           <w:lang w:val="es-ES"/>
@@ -13760,7 +13760,7 @@
       </w:tblGrid>
       <w:tr>
         <w:trPr>
-          <w:divId w:val="1145973427"/>
+          <w:divId w:val="1703239134"/>
           <w:tblHeader/>
         </w:trPr>
         <w:tc>
@@ -13988,7 +13988,7 @@
       </w:tr>
       <w:tr>
         <w:trPr>
-          <w:divId w:val="1145973427"/>
+          <w:divId w:val="1703239134"/>
         </w:trPr>
         <w:tc>
           <w:tcPr>
@@ -14115,37 +14115,37 @@
                 <w:sz w:val="20"/>
                 <w:szCs w:val="20"/>
               </w:rPr>
-              <w:t>588</w:t>
-            </w:r>
-          </w:p>
-        </w:tc>
-        <w:tc>
-          <w:tcPr>
-            <w:tcW w:w="0" w:type="auto"/>
-            <w:tcMar>
-              <w:top w:w="150" w:type="dxa"/>
-              <w:left w:w="210" w:type="dxa"/>
-              <w:bottom w:w="150" w:type="dxa"/>
-              <w:right w:w="210" w:type="dxa"/>
-            </w:tcMar>
-            <w:vAlign w:val="center"/>
-            <w:hideMark/>
-          </w:tcPr>
-          <w:p>
-            <w:pPr>
-              <w:rPr>
-                <w:rFonts w:ascii="Plus Jakarta Sans" w:eastAsia="Times New Roman" w:hAnsi="Plus Jakarta Sans"/>
-                <w:sz w:val="20"/>
-                <w:szCs w:val="20"/>
-              </w:rPr>
-            </w:pPr>
-            <w:r>
-              <w:rPr>
-                <w:rFonts w:ascii="Plus Jakarta Sans" w:eastAsia="Times New Roman" w:hAnsi="Plus Jakarta Sans"/>
-                <w:sz w:val="20"/>
-                <w:szCs w:val="20"/>
-              </w:rPr>
-              <w:t>2,661</w:t>
+              <w:t>601</w:t>
+            </w:r>
+          </w:p>
+        </w:tc>
+        <w:tc>
+          <w:tcPr>
+            <w:tcW w:w="0" w:type="auto"/>
+            <w:tcMar>
+              <w:top w:w="150" w:type="dxa"/>
+              <w:left w:w="210" w:type="dxa"/>
+              <w:bottom w:w="150" w:type="dxa"/>
+              <w:right w:w="210" w:type="dxa"/>
+            </w:tcMar>
+            <w:vAlign w:val="center"/>
+            <w:hideMark/>
+          </w:tcPr>
+          <w:p>
+            <w:pPr>
+              <w:rPr>
+                <w:rFonts w:ascii="Plus Jakarta Sans" w:eastAsia="Times New Roman" w:hAnsi="Plus Jakarta Sans"/>
+                <w:sz w:val="20"/>
+                <w:szCs w:val="20"/>
+              </w:rPr>
+            </w:pPr>
+            <w:r>
+              <w:rPr>
+                <w:rFonts w:ascii="Plus Jakarta Sans" w:eastAsia="Times New Roman" w:hAnsi="Plus Jakarta Sans"/>
+                <w:sz w:val="20"/>
+                <w:szCs w:val="20"/>
+              </w:rPr>
+              <w:t>2,674</w:t>
             </w:r>
           </w:p>
         </w:tc>
@@ -14182,7 +14182,7 @@
       </w:tr>
       <w:tr>
         <w:trPr>
-          <w:divId w:val="1145973427"/>
+          <w:divId w:val="1703239134"/>
         </w:trPr>
         <w:tc>
           <w:tcPr>
@@ -14309,37 +14309,37 @@
                 <w:sz w:val="20"/>
                 <w:szCs w:val="20"/>
               </w:rPr>
-              <w:t>585</w:t>
-            </w:r>
-          </w:p>
-        </w:tc>
-        <w:tc>
-          <w:tcPr>
-            <w:tcW w:w="0" w:type="auto"/>
-            <w:tcMar>
-              <w:top w:w="150" w:type="dxa"/>
-              <w:left w:w="210" w:type="dxa"/>
-              <w:bottom w:w="150" w:type="dxa"/>
-              <w:right w:w="210" w:type="dxa"/>
-            </w:tcMar>
-            <w:vAlign w:val="center"/>
-            <w:hideMark/>
-          </w:tcPr>
-          <w:p>
-            <w:pPr>
-              <w:rPr>
-                <w:rFonts w:ascii="Plus Jakarta Sans" w:eastAsia="Times New Roman" w:hAnsi="Plus Jakarta Sans"/>
-                <w:sz w:val="20"/>
-                <w:szCs w:val="20"/>
-              </w:rPr>
-            </w:pPr>
-            <w:r>
-              <w:rPr>
-                <w:rFonts w:ascii="Plus Jakarta Sans" w:eastAsia="Times New Roman" w:hAnsi="Plus Jakarta Sans"/>
-                <w:sz w:val="20"/>
-                <w:szCs w:val="20"/>
-              </w:rPr>
-              <w:t>2,487</w:t>
+              <w:t>595</w:t>
+            </w:r>
+          </w:p>
+        </w:tc>
+        <w:tc>
+          <w:tcPr>
+            <w:tcW w:w="0" w:type="auto"/>
+            <w:tcMar>
+              <w:top w:w="150" w:type="dxa"/>
+              <w:left w:w="210" w:type="dxa"/>
+              <w:bottom w:w="150" w:type="dxa"/>
+              <w:right w:w="210" w:type="dxa"/>
+            </w:tcMar>
+            <w:vAlign w:val="center"/>
+            <w:hideMark/>
+          </w:tcPr>
+          <w:p>
+            <w:pPr>
+              <w:rPr>
+                <w:rFonts w:ascii="Plus Jakarta Sans" w:eastAsia="Times New Roman" w:hAnsi="Plus Jakarta Sans"/>
+                <w:sz w:val="20"/>
+                <w:szCs w:val="20"/>
+              </w:rPr>
+            </w:pPr>
+            <w:r>
+              <w:rPr>
+                <w:rFonts w:ascii="Plus Jakarta Sans" w:eastAsia="Times New Roman" w:hAnsi="Plus Jakarta Sans"/>
+                <w:sz w:val="20"/>
+                <w:szCs w:val="20"/>
+              </w:rPr>
+              <w:t>2,497</w:t>
             </w:r>
           </w:p>
         </w:tc>
@@ -14378,7 +14378,7 @@
     <w:p>
       <w:pPr>
         <w:pStyle w:val="Ttulo4"/>
-        <w:divId w:val="1014452338"/>
+        <w:divId w:val="1312251671"/>
         <w:rPr>
           <w:rFonts w:eastAsia="Times New Roman"/>
           <w:lang w:val="es-ES"/>
@@ -14396,7 +14396,7 @@
       <w:pPr>
         <w:spacing w:before="375" w:after="225"/>
         <w:jc w:val="center"/>
-        <w:divId w:val="620650974"/>
+        <w:divId w:val="524901041"/>
         <w:rPr>
           <w:rFonts w:ascii="Outfit" w:eastAsia="Times New Roman" w:hAnsi="Outfit"/>
           <w:b/>
@@ -14426,7 +14426,7 @@
       <w:pPr>
         <w:spacing w:after="375"/>
         <w:jc w:val="center"/>
-        <w:divId w:val="599529728"/>
+        <w:divId w:val="1376656426"/>
         <w:rPr>
           <w:rFonts w:ascii="Plus Jakarta Sans" w:eastAsia="Times New Roman" w:hAnsi="Plus Jakarta Sans"/>
           <w:lang w:val="es-ES"/>
@@ -14814,7 +14814,7 @@
     <w:p>
       <w:pPr>
         <w:pStyle w:val="Ttulo3"/>
-        <w:divId w:val="1014452338"/>
+        <w:divId w:val="1312251671"/>
         <w:rPr>
           <w:rFonts w:eastAsia="Times New Roman"/>
           <w:lang w:val="es-ES"/>
@@ -14848,7 +14848,7 @@
       </w:tblGrid>
       <w:tr>
         <w:trPr>
-          <w:divId w:val="913661640"/>
+          <w:divId w:val="927226906"/>
           <w:tblHeader/>
         </w:trPr>
         <w:tc>
@@ -15039,7 +15039,7 @@
       </w:tr>
       <w:tr>
         <w:trPr>
-          <w:divId w:val="913661640"/>
+          <w:divId w:val="927226906"/>
         </w:trPr>
         <w:tc>
           <w:tcPr>
@@ -15158,44 +15158,44 @@
                 <w:sz w:val="20"/>
                 <w:szCs w:val="20"/>
               </w:rPr>
-              <w:t>310</w:t>
-            </w:r>
-          </w:p>
-        </w:tc>
-        <w:tc>
-          <w:tcPr>
-            <w:tcW w:w="0" w:type="auto"/>
-            <w:tcMar>
-              <w:top w:w="150" w:type="dxa"/>
-              <w:left w:w="210" w:type="dxa"/>
-              <w:bottom w:w="150" w:type="dxa"/>
-              <w:right w:w="210" w:type="dxa"/>
-            </w:tcMar>
-            <w:vAlign w:val="center"/>
-            <w:hideMark/>
-          </w:tcPr>
-          <w:p>
-            <w:pPr>
-              <w:rPr>
-                <w:rFonts w:ascii="Plus Jakarta Sans" w:eastAsia="Times New Roman" w:hAnsi="Plus Jakarta Sans"/>
-                <w:sz w:val="20"/>
-                <w:szCs w:val="20"/>
-              </w:rPr>
-            </w:pPr>
-            <w:r>
-              <w:rPr>
-                <w:rFonts w:ascii="Plus Jakarta Sans" w:eastAsia="Times New Roman" w:hAnsi="Plus Jakarta Sans"/>
-                <w:sz w:val="20"/>
-                <w:szCs w:val="20"/>
-              </w:rPr>
-              <w:t>1,834</w:t>
+              <w:t>321</w:t>
+            </w:r>
+          </w:p>
+        </w:tc>
+        <w:tc>
+          <w:tcPr>
+            <w:tcW w:w="0" w:type="auto"/>
+            <w:tcMar>
+              <w:top w:w="150" w:type="dxa"/>
+              <w:left w:w="210" w:type="dxa"/>
+              <w:bottom w:w="150" w:type="dxa"/>
+              <w:right w:w="210" w:type="dxa"/>
+            </w:tcMar>
+            <w:vAlign w:val="center"/>
+            <w:hideMark/>
+          </w:tcPr>
+          <w:p>
+            <w:pPr>
+              <w:rPr>
+                <w:rFonts w:ascii="Plus Jakarta Sans" w:eastAsia="Times New Roman" w:hAnsi="Plus Jakarta Sans"/>
+                <w:sz w:val="20"/>
+                <w:szCs w:val="20"/>
+              </w:rPr>
+            </w:pPr>
+            <w:r>
+              <w:rPr>
+                <w:rFonts w:ascii="Plus Jakarta Sans" w:eastAsia="Times New Roman" w:hAnsi="Plus Jakarta Sans"/>
+                <w:sz w:val="20"/>
+                <w:szCs w:val="20"/>
+              </w:rPr>
+              <w:t>1,845</w:t>
             </w:r>
           </w:p>
         </w:tc>
       </w:tr>
       <w:tr>
         <w:trPr>
-          <w:divId w:val="913661640"/>
+          <w:divId w:val="927226906"/>
         </w:trPr>
         <w:tc>
           <w:tcPr>
@@ -15351,7 +15351,7 @@
       </w:tr>
       <w:tr>
         <w:trPr>
-          <w:divId w:val="913661640"/>
+          <w:divId w:val="927226906"/>
         </w:trPr>
         <w:tc>
           <w:tcPr>
@@ -15507,7 +15507,7 @@
       </w:tr>
       <w:tr>
         <w:trPr>
-          <w:divId w:val="913661640"/>
+          <w:divId w:val="927226906"/>
         </w:trPr>
         <w:tc>
           <w:tcPr>
@@ -15626,44 +15626,44 @@
                 <w:sz w:val="20"/>
                 <w:szCs w:val="20"/>
               </w:rPr>
-              <w:t>35</w:t>
-            </w:r>
-          </w:p>
-        </w:tc>
-        <w:tc>
-          <w:tcPr>
-            <w:tcW w:w="0" w:type="auto"/>
-            <w:tcMar>
-              <w:top w:w="150" w:type="dxa"/>
-              <w:left w:w="210" w:type="dxa"/>
-              <w:bottom w:w="150" w:type="dxa"/>
-              <w:right w:w="210" w:type="dxa"/>
-            </w:tcMar>
-            <w:vAlign w:val="center"/>
-            <w:hideMark/>
-          </w:tcPr>
-          <w:p>
-            <w:pPr>
-              <w:rPr>
-                <w:rFonts w:ascii="Plus Jakarta Sans" w:eastAsia="Times New Roman" w:hAnsi="Plus Jakarta Sans"/>
-                <w:sz w:val="20"/>
-                <w:szCs w:val="20"/>
-              </w:rPr>
-            </w:pPr>
-            <w:r>
-              <w:rPr>
-                <w:rFonts w:ascii="Plus Jakarta Sans" w:eastAsia="Times New Roman" w:hAnsi="Plus Jakarta Sans"/>
-                <w:sz w:val="20"/>
-                <w:szCs w:val="20"/>
-              </w:rPr>
-              <w:t>116</w:t>
+              <w:t>36</w:t>
+            </w:r>
+          </w:p>
+        </w:tc>
+        <w:tc>
+          <w:tcPr>
+            <w:tcW w:w="0" w:type="auto"/>
+            <w:tcMar>
+              <w:top w:w="150" w:type="dxa"/>
+              <w:left w:w="210" w:type="dxa"/>
+              <w:bottom w:w="150" w:type="dxa"/>
+              <w:right w:w="210" w:type="dxa"/>
+            </w:tcMar>
+            <w:vAlign w:val="center"/>
+            <w:hideMark/>
+          </w:tcPr>
+          <w:p>
+            <w:pPr>
+              <w:rPr>
+                <w:rFonts w:ascii="Plus Jakarta Sans" w:eastAsia="Times New Roman" w:hAnsi="Plus Jakarta Sans"/>
+                <w:sz w:val="20"/>
+                <w:szCs w:val="20"/>
+              </w:rPr>
+            </w:pPr>
+            <w:r>
+              <w:rPr>
+                <w:rFonts w:ascii="Plus Jakarta Sans" w:eastAsia="Times New Roman" w:hAnsi="Plus Jakarta Sans"/>
+                <w:sz w:val="20"/>
+                <w:szCs w:val="20"/>
+              </w:rPr>
+              <w:t>117</w:t>
             </w:r>
           </w:p>
         </w:tc>
       </w:tr>
       <w:tr>
         <w:trPr>
-          <w:divId w:val="913661640"/>
+          <w:divId w:val="927226906"/>
         </w:trPr>
         <w:tc>
           <w:tcPr>
@@ -15782,44 +15782,44 @@
                 <w:sz w:val="20"/>
                 <w:szCs w:val="20"/>
               </w:rPr>
-              <w:t>23</w:t>
-            </w:r>
-          </w:p>
-        </w:tc>
-        <w:tc>
-          <w:tcPr>
-            <w:tcW w:w="0" w:type="auto"/>
-            <w:tcMar>
-              <w:top w:w="150" w:type="dxa"/>
-              <w:left w:w="210" w:type="dxa"/>
-              <w:bottom w:w="150" w:type="dxa"/>
-              <w:right w:w="210" w:type="dxa"/>
-            </w:tcMar>
-            <w:vAlign w:val="center"/>
-            <w:hideMark/>
-          </w:tcPr>
-          <w:p>
-            <w:pPr>
-              <w:rPr>
-                <w:rFonts w:ascii="Plus Jakarta Sans" w:eastAsia="Times New Roman" w:hAnsi="Plus Jakarta Sans"/>
-                <w:sz w:val="20"/>
-                <w:szCs w:val="20"/>
-              </w:rPr>
-            </w:pPr>
-            <w:r>
-              <w:rPr>
-                <w:rFonts w:ascii="Plus Jakarta Sans" w:eastAsia="Times New Roman" w:hAnsi="Plus Jakarta Sans"/>
-                <w:sz w:val="20"/>
-                <w:szCs w:val="20"/>
-              </w:rPr>
-              <w:t>77</w:t>
+              <w:t>24</w:t>
+            </w:r>
+          </w:p>
+        </w:tc>
+        <w:tc>
+          <w:tcPr>
+            <w:tcW w:w="0" w:type="auto"/>
+            <w:tcMar>
+              <w:top w:w="150" w:type="dxa"/>
+              <w:left w:w="210" w:type="dxa"/>
+              <w:bottom w:w="150" w:type="dxa"/>
+              <w:right w:w="210" w:type="dxa"/>
+            </w:tcMar>
+            <w:vAlign w:val="center"/>
+            <w:hideMark/>
+          </w:tcPr>
+          <w:p>
+            <w:pPr>
+              <w:rPr>
+                <w:rFonts w:ascii="Plus Jakarta Sans" w:eastAsia="Times New Roman" w:hAnsi="Plus Jakarta Sans"/>
+                <w:sz w:val="20"/>
+                <w:szCs w:val="20"/>
+              </w:rPr>
+            </w:pPr>
+            <w:r>
+              <w:rPr>
+                <w:rFonts w:ascii="Plus Jakarta Sans" w:eastAsia="Times New Roman" w:hAnsi="Plus Jakarta Sans"/>
+                <w:sz w:val="20"/>
+                <w:szCs w:val="20"/>
+              </w:rPr>
+              <w:t>78</w:t>
             </w:r>
           </w:p>
         </w:tc>
       </w:tr>
       <w:tr>
         <w:trPr>
-          <w:divId w:val="913661640"/>
+          <w:divId w:val="927226906"/>
         </w:trPr>
         <w:tc>
           <w:tcPr>
@@ -15977,7 +15977,7 @@
     <w:p>
       <w:pPr>
         <w:pStyle w:val="Ttulo3"/>
-        <w:divId w:val="1014452338"/>
+        <w:divId w:val="1312251671"/>
         <w:rPr>
           <w:rFonts w:eastAsia="Times New Roman"/>
           <w:lang w:val="es-ES"/>
@@ -16011,7 +16011,7 @@
       </w:tblGrid>
       <w:tr>
         <w:trPr>
-          <w:divId w:val="699672113"/>
+          <w:divId w:val="41097089"/>
           <w:tblHeader/>
         </w:trPr>
         <w:tc>
@@ -16202,7 +16202,7 @@
       </w:tr>
       <w:tr>
         <w:trPr>
-          <w:divId w:val="699672113"/>
+          <w:divId w:val="41097089"/>
         </w:trPr>
         <w:tc>
           <w:tcPr>
@@ -16321,44 +16321,44 @@
                 <w:sz w:val="20"/>
                 <w:szCs w:val="20"/>
               </w:rPr>
-              <w:t>420</w:t>
-            </w:r>
-          </w:p>
-        </w:tc>
-        <w:tc>
-          <w:tcPr>
-            <w:tcW w:w="0" w:type="auto"/>
-            <w:tcMar>
-              <w:top w:w="150" w:type="dxa"/>
-              <w:left w:w="210" w:type="dxa"/>
-              <w:bottom w:w="150" w:type="dxa"/>
-              <w:right w:w="210" w:type="dxa"/>
-            </w:tcMar>
-            <w:vAlign w:val="center"/>
-            <w:hideMark/>
-          </w:tcPr>
-          <w:p>
-            <w:pPr>
-              <w:rPr>
-                <w:rFonts w:ascii="Plus Jakarta Sans" w:eastAsia="Times New Roman" w:hAnsi="Plus Jakarta Sans"/>
-                <w:sz w:val="20"/>
-                <w:szCs w:val="20"/>
-              </w:rPr>
-            </w:pPr>
-            <w:r>
-              <w:rPr>
-                <w:rFonts w:ascii="Plus Jakarta Sans" w:eastAsia="Times New Roman" w:hAnsi="Plus Jakarta Sans"/>
-                <w:sz w:val="20"/>
-                <w:szCs w:val="20"/>
-              </w:rPr>
-              <w:t>1,906</w:t>
+              <w:t>437</w:t>
+            </w:r>
+          </w:p>
+        </w:tc>
+        <w:tc>
+          <w:tcPr>
+            <w:tcW w:w="0" w:type="auto"/>
+            <w:tcMar>
+              <w:top w:w="150" w:type="dxa"/>
+              <w:left w:w="210" w:type="dxa"/>
+              <w:bottom w:w="150" w:type="dxa"/>
+              <w:right w:w="210" w:type="dxa"/>
+            </w:tcMar>
+            <w:vAlign w:val="center"/>
+            <w:hideMark/>
+          </w:tcPr>
+          <w:p>
+            <w:pPr>
+              <w:rPr>
+                <w:rFonts w:ascii="Plus Jakarta Sans" w:eastAsia="Times New Roman" w:hAnsi="Plus Jakarta Sans"/>
+                <w:sz w:val="20"/>
+                <w:szCs w:val="20"/>
+              </w:rPr>
+            </w:pPr>
+            <w:r>
+              <w:rPr>
+                <w:rFonts w:ascii="Plus Jakarta Sans" w:eastAsia="Times New Roman" w:hAnsi="Plus Jakarta Sans"/>
+                <w:sz w:val="20"/>
+                <w:szCs w:val="20"/>
+              </w:rPr>
+              <w:t>1,923</w:t>
             </w:r>
           </w:p>
         </w:tc>
       </w:tr>
       <w:tr>
         <w:trPr>
-          <w:divId w:val="699672113"/>
+          <w:divId w:val="41097089"/>
         </w:trPr>
         <w:tc>
           <w:tcPr>
@@ -16477,44 +16477,44 @@
                 <w:sz w:val="20"/>
                 <w:szCs w:val="20"/>
               </w:rPr>
-              <w:t>239</w:t>
-            </w:r>
-          </w:p>
-        </w:tc>
-        <w:tc>
-          <w:tcPr>
-            <w:tcW w:w="0" w:type="auto"/>
-            <w:tcMar>
-              <w:top w:w="150" w:type="dxa"/>
-              <w:left w:w="210" w:type="dxa"/>
-              <w:bottom w:w="150" w:type="dxa"/>
-              <w:right w:w="210" w:type="dxa"/>
-            </w:tcMar>
-            <w:vAlign w:val="center"/>
-            <w:hideMark/>
-          </w:tcPr>
-          <w:p>
-            <w:pPr>
-              <w:rPr>
-                <w:rFonts w:ascii="Plus Jakarta Sans" w:eastAsia="Times New Roman" w:hAnsi="Plus Jakarta Sans"/>
-                <w:sz w:val="20"/>
-                <w:szCs w:val="20"/>
-              </w:rPr>
-            </w:pPr>
-            <w:r>
-              <w:rPr>
-                <w:rFonts w:ascii="Plus Jakarta Sans" w:eastAsia="Times New Roman" w:hAnsi="Plus Jakarta Sans"/>
-                <w:sz w:val="20"/>
-                <w:szCs w:val="20"/>
-              </w:rPr>
-              <w:t>868</w:t>
+              <w:t>240</w:t>
+            </w:r>
+          </w:p>
+        </w:tc>
+        <w:tc>
+          <w:tcPr>
+            <w:tcW w:w="0" w:type="auto"/>
+            <w:tcMar>
+              <w:top w:w="150" w:type="dxa"/>
+              <w:left w:w="210" w:type="dxa"/>
+              <w:bottom w:w="150" w:type="dxa"/>
+              <w:right w:w="210" w:type="dxa"/>
+            </w:tcMar>
+            <w:vAlign w:val="center"/>
+            <w:hideMark/>
+          </w:tcPr>
+          <w:p>
+            <w:pPr>
+              <w:rPr>
+                <w:rFonts w:ascii="Plus Jakarta Sans" w:eastAsia="Times New Roman" w:hAnsi="Plus Jakarta Sans"/>
+                <w:sz w:val="20"/>
+                <w:szCs w:val="20"/>
+              </w:rPr>
+            </w:pPr>
+            <w:r>
+              <w:rPr>
+                <w:rFonts w:ascii="Plus Jakarta Sans" w:eastAsia="Times New Roman" w:hAnsi="Plus Jakarta Sans"/>
+                <w:sz w:val="20"/>
+                <w:szCs w:val="20"/>
+              </w:rPr>
+              <w:t>869</w:t>
             </w:r>
           </w:p>
         </w:tc>
       </w:tr>
       <w:tr>
         <w:trPr>
-          <w:divId w:val="699672113"/>
+          <w:divId w:val="41097089"/>
         </w:trPr>
         <w:tc>
           <w:tcPr>
@@ -16633,44 +16633,44 @@
                 <w:sz w:val="20"/>
                 <w:szCs w:val="20"/>
               </w:rPr>
-              <w:t>48</w:t>
-            </w:r>
-          </w:p>
-        </w:tc>
-        <w:tc>
-          <w:tcPr>
-            <w:tcW w:w="0" w:type="auto"/>
-            <w:tcMar>
-              <w:top w:w="150" w:type="dxa"/>
-              <w:left w:w="210" w:type="dxa"/>
-              <w:bottom w:w="150" w:type="dxa"/>
-              <w:right w:w="210" w:type="dxa"/>
-            </w:tcMar>
-            <w:vAlign w:val="center"/>
-            <w:hideMark/>
-          </w:tcPr>
-          <w:p>
-            <w:pPr>
-              <w:rPr>
-                <w:rFonts w:ascii="Plus Jakarta Sans" w:eastAsia="Times New Roman" w:hAnsi="Plus Jakarta Sans"/>
-                <w:sz w:val="20"/>
-                <w:szCs w:val="20"/>
-              </w:rPr>
-            </w:pPr>
-            <w:r>
-              <w:rPr>
-                <w:rFonts w:ascii="Plus Jakarta Sans" w:eastAsia="Times New Roman" w:hAnsi="Plus Jakarta Sans"/>
-                <w:sz w:val="20"/>
-                <w:szCs w:val="20"/>
-              </w:rPr>
-              <w:t>696</w:t>
+              <w:t>49</w:t>
+            </w:r>
+          </w:p>
+        </w:tc>
+        <w:tc>
+          <w:tcPr>
+            <w:tcW w:w="0" w:type="auto"/>
+            <w:tcMar>
+              <w:top w:w="150" w:type="dxa"/>
+              <w:left w:w="210" w:type="dxa"/>
+              <w:bottom w:w="150" w:type="dxa"/>
+              <w:right w:w="210" w:type="dxa"/>
+            </w:tcMar>
+            <w:vAlign w:val="center"/>
+            <w:hideMark/>
+          </w:tcPr>
+          <w:p>
+            <w:pPr>
+              <w:rPr>
+                <w:rFonts w:ascii="Plus Jakarta Sans" w:eastAsia="Times New Roman" w:hAnsi="Plus Jakarta Sans"/>
+                <w:sz w:val="20"/>
+                <w:szCs w:val="20"/>
+              </w:rPr>
+            </w:pPr>
+            <w:r>
+              <w:rPr>
+                <w:rFonts w:ascii="Plus Jakarta Sans" w:eastAsia="Times New Roman" w:hAnsi="Plus Jakarta Sans"/>
+                <w:sz w:val="20"/>
+                <w:szCs w:val="20"/>
+              </w:rPr>
+              <w:t>697</w:t>
             </w:r>
           </w:p>
         </w:tc>
       </w:tr>
       <w:tr>
         <w:trPr>
-          <w:divId w:val="699672113"/>
+          <w:divId w:val="41097089"/>
         </w:trPr>
         <w:tc>
           <w:tcPr>
@@ -16826,7 +16826,7 @@
       </w:tr>
       <w:tr>
         <w:trPr>
-          <w:divId w:val="699672113"/>
+          <w:divId w:val="41097089"/>
         </w:trPr>
         <w:tc>
           <w:tcPr>
@@ -16945,37 +16945,37 @@
                 <w:sz w:val="20"/>
                 <w:szCs w:val="20"/>
               </w:rPr>
-              <w:t>43</w:t>
-            </w:r>
-          </w:p>
-        </w:tc>
-        <w:tc>
-          <w:tcPr>
-            <w:tcW w:w="0" w:type="auto"/>
-            <w:tcMar>
-              <w:top w:w="150" w:type="dxa"/>
-              <w:left w:w="210" w:type="dxa"/>
-              <w:bottom w:w="150" w:type="dxa"/>
-              <w:right w:w="210" w:type="dxa"/>
-            </w:tcMar>
-            <w:vAlign w:val="center"/>
-            <w:hideMark/>
-          </w:tcPr>
-          <w:p>
-            <w:pPr>
-              <w:rPr>
-                <w:rFonts w:ascii="Plus Jakarta Sans" w:eastAsia="Times New Roman" w:hAnsi="Plus Jakarta Sans"/>
-                <w:sz w:val="20"/>
-                <w:szCs w:val="20"/>
-              </w:rPr>
-            </w:pPr>
-            <w:r>
-              <w:rPr>
-                <w:rFonts w:ascii="Plus Jakarta Sans" w:eastAsia="Times New Roman" w:hAnsi="Plus Jakarta Sans"/>
-                <w:sz w:val="20"/>
-                <w:szCs w:val="20"/>
-              </w:rPr>
-              <w:t>221</w:t>
+              <w:t>44</w:t>
+            </w:r>
+          </w:p>
+        </w:tc>
+        <w:tc>
+          <w:tcPr>
+            <w:tcW w:w="0" w:type="auto"/>
+            <w:tcMar>
+              <w:top w:w="150" w:type="dxa"/>
+              <w:left w:w="210" w:type="dxa"/>
+              <w:bottom w:w="150" w:type="dxa"/>
+              <w:right w:w="210" w:type="dxa"/>
+            </w:tcMar>
+            <w:vAlign w:val="center"/>
+            <w:hideMark/>
+          </w:tcPr>
+          <w:p>
+            <w:pPr>
+              <w:rPr>
+                <w:rFonts w:ascii="Plus Jakarta Sans" w:eastAsia="Times New Roman" w:hAnsi="Plus Jakarta Sans"/>
+                <w:sz w:val="20"/>
+                <w:szCs w:val="20"/>
+              </w:rPr>
+            </w:pPr>
+            <w:r>
+              <w:rPr>
+                <w:rFonts w:ascii="Plus Jakarta Sans" w:eastAsia="Times New Roman" w:hAnsi="Plus Jakarta Sans"/>
+                <w:sz w:val="20"/>
+                <w:szCs w:val="20"/>
+              </w:rPr>
+              <w:t>222</w:t>
             </w:r>
           </w:p>
         </w:tc>
@@ -16984,7 +16984,7 @@
     <w:p>
       <w:pPr>
         <w:pStyle w:val="Ttulo3"/>
-        <w:divId w:val="1014452338"/>
+        <w:divId w:val="1312251671"/>
         <w:rPr>
           <w:rFonts w:eastAsia="Times New Roman"/>
           <w:lang w:val="es-ES"/>
@@ -17018,7 +17018,7 @@
       </w:tblGrid>
       <w:tr>
         <w:trPr>
-          <w:divId w:val="978152155"/>
+          <w:divId w:val="1521625576"/>
           <w:tblHeader/>
         </w:trPr>
         <w:tc>
@@ -17209,7 +17209,7 @@
       </w:tr>
       <w:tr>
         <w:trPr>
-          <w:divId w:val="978152155"/>
+          <w:divId w:val="1521625576"/>
         </w:trPr>
         <w:tc>
           <w:tcPr>
@@ -17328,44 +17328,44 @@
                 <w:sz w:val="20"/>
                 <w:szCs w:val="20"/>
               </w:rPr>
-              <w:t>609</w:t>
-            </w:r>
-          </w:p>
-        </w:tc>
-        <w:tc>
-          <w:tcPr>
-            <w:tcW w:w="0" w:type="auto"/>
-            <w:tcMar>
-              <w:top w:w="150" w:type="dxa"/>
-              <w:left w:w="210" w:type="dxa"/>
-              <w:bottom w:w="150" w:type="dxa"/>
-              <w:right w:w="210" w:type="dxa"/>
-            </w:tcMar>
-            <w:vAlign w:val="center"/>
-            <w:hideMark/>
-          </w:tcPr>
-          <w:p>
-            <w:pPr>
-              <w:rPr>
-                <w:rFonts w:ascii="Plus Jakarta Sans" w:eastAsia="Times New Roman" w:hAnsi="Plus Jakarta Sans"/>
-                <w:sz w:val="20"/>
-                <w:szCs w:val="20"/>
-              </w:rPr>
-            </w:pPr>
-            <w:r>
-              <w:rPr>
-                <w:rFonts w:ascii="Plus Jakarta Sans" w:eastAsia="Times New Roman" w:hAnsi="Plus Jakarta Sans"/>
-                <w:sz w:val="20"/>
-                <w:szCs w:val="20"/>
-              </w:rPr>
-              <w:t>2,880</w:t>
+              <w:t>617</w:t>
+            </w:r>
+          </w:p>
+        </w:tc>
+        <w:tc>
+          <w:tcPr>
+            <w:tcW w:w="0" w:type="auto"/>
+            <w:tcMar>
+              <w:top w:w="150" w:type="dxa"/>
+              <w:left w:w="210" w:type="dxa"/>
+              <w:bottom w:w="150" w:type="dxa"/>
+              <w:right w:w="210" w:type="dxa"/>
+            </w:tcMar>
+            <w:vAlign w:val="center"/>
+            <w:hideMark/>
+          </w:tcPr>
+          <w:p>
+            <w:pPr>
+              <w:rPr>
+                <w:rFonts w:ascii="Plus Jakarta Sans" w:eastAsia="Times New Roman" w:hAnsi="Plus Jakarta Sans"/>
+                <w:sz w:val="20"/>
+                <w:szCs w:val="20"/>
+              </w:rPr>
+            </w:pPr>
+            <w:r>
+              <w:rPr>
+                <w:rFonts w:ascii="Plus Jakarta Sans" w:eastAsia="Times New Roman" w:hAnsi="Plus Jakarta Sans"/>
+                <w:sz w:val="20"/>
+                <w:szCs w:val="20"/>
+              </w:rPr>
+              <w:t>2,888</w:t>
             </w:r>
           </w:p>
         </w:tc>
       </w:tr>
       <w:tr>
         <w:trPr>
-          <w:divId w:val="978152155"/>
+          <w:divId w:val="1521625576"/>
         </w:trPr>
         <w:tc>
           <w:tcPr>
@@ -17484,37 +17484,37 @@
                 <w:sz w:val="20"/>
                 <w:szCs w:val="20"/>
               </w:rPr>
-              <w:t>202</w:t>
-            </w:r>
-          </w:p>
-        </w:tc>
-        <w:tc>
-          <w:tcPr>
-            <w:tcW w:w="0" w:type="auto"/>
-            <w:tcMar>
-              <w:top w:w="150" w:type="dxa"/>
-              <w:left w:w="210" w:type="dxa"/>
-              <w:bottom w:w="150" w:type="dxa"/>
-              <w:right w:w="210" w:type="dxa"/>
-            </w:tcMar>
-            <w:vAlign w:val="center"/>
-            <w:hideMark/>
-          </w:tcPr>
-          <w:p>
-            <w:pPr>
-              <w:rPr>
-                <w:rFonts w:ascii="Plus Jakarta Sans" w:eastAsia="Times New Roman" w:hAnsi="Plus Jakarta Sans"/>
-                <w:sz w:val="20"/>
-                <w:szCs w:val="20"/>
-              </w:rPr>
-            </w:pPr>
-            <w:r>
-              <w:rPr>
-                <w:rFonts w:ascii="Plus Jakarta Sans" w:eastAsia="Times New Roman" w:hAnsi="Plus Jakarta Sans"/>
-                <w:sz w:val="20"/>
-                <w:szCs w:val="20"/>
-              </w:rPr>
-              <w:t>1,263</w:t>
+              <w:t>205</w:t>
+            </w:r>
+          </w:p>
+        </w:tc>
+        <w:tc>
+          <w:tcPr>
+            <w:tcW w:w="0" w:type="auto"/>
+            <w:tcMar>
+              <w:top w:w="150" w:type="dxa"/>
+              <w:left w:w="210" w:type="dxa"/>
+              <w:bottom w:w="150" w:type="dxa"/>
+              <w:right w:w="210" w:type="dxa"/>
+            </w:tcMar>
+            <w:vAlign w:val="center"/>
+            <w:hideMark/>
+          </w:tcPr>
+          <w:p>
+            <w:pPr>
+              <w:rPr>
+                <w:rFonts w:ascii="Plus Jakarta Sans" w:eastAsia="Times New Roman" w:hAnsi="Plus Jakarta Sans"/>
+                <w:sz w:val="20"/>
+                <w:szCs w:val="20"/>
+              </w:rPr>
+            </w:pPr>
+            <w:r>
+              <w:rPr>
+                <w:rFonts w:ascii="Plus Jakarta Sans" w:eastAsia="Times New Roman" w:hAnsi="Plus Jakarta Sans"/>
+                <w:sz w:val="20"/>
+                <w:szCs w:val="20"/>
+              </w:rPr>
+              <w:t>1,266</w:t>
             </w:r>
           </w:p>
         </w:tc>
@@ -17523,7 +17523,7 @@
     <w:p>
       <w:pPr>
         <w:pStyle w:val="Ttulo4"/>
-        <w:divId w:val="1014452338"/>
+        <w:divId w:val="1312251671"/>
         <w:rPr>
           <w:rFonts w:eastAsia="Times New Roman"/>
           <w:lang w:val="es-ES"/>
@@ -17541,7 +17541,7 @@
       <w:pPr>
         <w:spacing w:before="375" w:after="225"/>
         <w:jc w:val="center"/>
-        <w:divId w:val="1780954797"/>
+        <w:divId w:val="1133597885"/>
         <w:rPr>
           <w:rFonts w:ascii="Outfit" w:eastAsia="Times New Roman" w:hAnsi="Outfit"/>
           <w:b/>
@@ -17571,7 +17571,7 @@
       <w:pPr>
         <w:spacing w:after="375"/>
         <w:jc w:val="center"/>
-        <w:divId w:val="815227078"/>
+        <w:divId w:val="1735738965"/>
         <w:rPr>
           <w:rFonts w:ascii="Plus Jakarta Sans" w:eastAsia="Times New Roman" w:hAnsi="Plus Jakarta Sans"/>
           <w:lang w:val="es-ES"/>
@@ -17959,7 +17959,7 @@
     <w:p>
       <w:pPr>
         <w:spacing w:before="450" w:after="450"/>
-        <w:divId w:val="1014452338"/>
+        <w:divId w:val="1312251671"/>
         <w:rPr>
           <w:rFonts w:ascii="Plus Jakarta Sans" w:eastAsia="Times New Roman" w:hAnsi="Plus Jakarta Sans"/>
           <w:lang w:val="es-ES"/>
@@ -17970,7 +17970,7 @@
           <w:rFonts w:ascii="Plus Jakarta Sans" w:eastAsia="Times New Roman" w:hAnsi="Plus Jakarta Sans"/>
           <w:lang w:val="es-ES"/>
         </w:rPr>
-        <w:pict w14:anchorId="0190A629">
+        <w:pict w14:anchorId="6EEBF09C">
           <v:rect id="_x0000_i1035" style="width:0;height:.75pt" o:hralign="center" o:hrstd="t" o:hr="t" fillcolor="#a0a0a0" stroked="f"/>
         </w:pict>
       </w:r>
@@ -17978,7 +17978,7 @@
     <w:p>
       <w:pPr>
         <w:spacing w:before="450" w:after="450"/>
-        <w:divId w:val="1014452338"/>
+        <w:divId w:val="1312251671"/>
         <w:rPr>
           <w:rFonts w:ascii="Plus Jakarta Sans" w:eastAsia="Times New Roman" w:hAnsi="Plus Jakarta Sans"/>
           <w:lang w:val="es-ES"/>
@@ -17989,7 +17989,7 @@
           <w:rFonts w:ascii="Plus Jakarta Sans" w:eastAsia="Times New Roman" w:hAnsi="Plus Jakarta Sans"/>
           <w:lang w:val="es-ES"/>
         </w:rPr>
-        <w:pict w14:anchorId="25433595">
+        <w:pict w14:anchorId="6C7A8ED9">
           <v:rect id="_x0000_i1036" style="width:0;height:.75pt" o:hralign="center" o:hrstd="t" o:hr="t" fillcolor="#a0a0a0" stroked="f"/>
         </w:pict>
       </w:r>
@@ -17997,7 +17997,7 @@
     <w:p>
       <w:pPr>
         <w:pStyle w:val="NormalWeb"/>
-        <w:divId w:val="1014452338"/>
+        <w:divId w:val="1312251671"/>
         <w:rPr>
           <w:rFonts w:ascii="Plus Jakarta Sans" w:hAnsi="Plus Jakarta Sans"/>
           <w:lang w:val="es-ES"/>
@@ -18030,7 +18030,7 @@
           <w:rFonts w:ascii="Plus Jakarta Sans" w:hAnsi="Plus Jakarta Sans"/>
           <w:lang w:val="es-ES"/>
         </w:rPr>
-        <w:pict w14:anchorId="1E6B61EF"/>
+        <w:pict w14:anchorId="34C7168A"/>
       </w:r>
     </w:p>
     <w:sectPr>
@@ -18046,9 +18046,9 @@
 <file path=word/numbering.xml><?xml version="1.0" encoding="utf-8"?>
 <w:numbering xmlns:wpc="http://schemas.microsoft.com/office/word/2010/wordprocessingCanvas" xmlns:cx="http://schemas.microsoft.com/office/drawing/2014/chartex" xmlns:cx1="http://schemas.microsoft.com/office/drawing/2015/9/8/chartex" xmlns:cx2="http://schemas.microsoft.com/office/drawing/2015/10/21/chartex" xmlns:cx3="http://schemas.microsoft.com/office/drawing/2016/5/9/chartex" xmlns:cx4="http://schemas.microsoft.com/office/drawing/2016/5/10/chartex" xmlns:cx5="http://schemas.microsoft.com/office/drawing/2016/5/11/chartex" xmlns:cx6="http://schemas.microsoft.com/office/drawing/2016/5/12/chartex" xmlns:cx7="http://schemas.microsoft.com/office/drawing/2016/5/13/chartex" xmlns:cx8="http://schemas.microsoft.com/office/drawing/2016/5/14/chartex" xmlns:mc="http://schemas.openxmlformats.org/markup-compatibility/2006" xmlns:aink="http://schemas.microsoft.com/office/drawing/2016/ink" xmlns:am3d="http://schemas.microsoft.com/office/drawing/2017/model3d" xmlns:o="urn:schemas-microsoft-com:office:office" xmlns:r="http://schemas.openxmlformats.org/officeDocument/2006/relationships" xmlns:m="http://schemas.openxmlformats.org/officeDocument/2006/math" xmlns:v="urn:schemas-microsoft-com:vml" xmlns:wp14="http://schemas.microsoft.com/office/word/2010/wordprocessingDrawing" xmlns:wp="http://schemas.openxmlformats.org/drawingml/2006/wordprocessingDrawing" xmlns:w10="urn:schemas-microsoft-com:office:word" xmlns:w="http://schemas.openxmlformats.org/wordprocessingml/2006/main" xmlns:w14="http://schemas.microsoft.com/office/word/2010/wordml" xmlns:w15="http://schemas.microsoft.com/office/word/2012/wordml" xmlns:w16cex="http://schemas.microsoft.com/office/word/2018/wordml/cex" xmlns:w16cid="http://schemas.microsoft.com/office/word/2016/wordml/cid" xmlns:w16="http://schemas.microsoft.com/office/word/2018/wordml" xmlns:w16sdtdh="http://schemas.microsoft.com/office/word/2020/wordml/sdtdatahash" xmlns:w16se="http://schemas.microsoft.com/office/word/2015/wordml/symex" xmlns:wpg="http://schemas.microsoft.com/office/word/2010/wordprocessingGroup" xmlns:wpi="http://schemas.microsoft.com/office/word/2010/wordprocessingInk" xmlns:wne="http://schemas.microsoft.com/office/word/2006/wordml" xmlns:wps="http://schemas.microsoft.com/office/word/2010/wordprocessingShape" mc:Ignorable="w14 w15 w16se w16cid w16 w16cex w16sdtdh wp14">
   <w:abstractNum w:abstractNumId="0" w15:restartNumberingAfterBreak="0">
-    <w:nsid w:val="05E83C86"/>
+    <w:nsid w:val="1A887E4E"/>
     <w:multiLevelType w:val="multilevel"/>
-    <w:tmpl w:val="208852F0"/>
+    <w:tmpl w:val="84460910"/>
     <w:lvl w:ilvl="0">
       <w:start w:val="1"/>
       <w:numFmt w:val="bullet"/>
@@ -18195,9 +18195,9 @@
     </w:lvl>
   </w:abstractNum>
   <w:abstractNum w:abstractNumId="1" w15:restartNumberingAfterBreak="0">
-    <w:nsid w:val="3A9D6304"/>
+    <w:nsid w:val="1FC74A44"/>
     <w:multiLevelType w:val="multilevel"/>
-    <w:tmpl w:val="D2D4A2AE"/>
+    <w:tmpl w:val="9A3EA250"/>
     <w:lvl w:ilvl="0">
       <w:start w:val="1"/>
       <w:numFmt w:val="bullet"/>
@@ -18344,9 +18344,9 @@
     </w:lvl>
   </w:abstractNum>
   <w:abstractNum w:abstractNumId="2" w15:restartNumberingAfterBreak="0">
-    <w:nsid w:val="43F975E1"/>
+    <w:nsid w:val="38293563"/>
     <w:multiLevelType w:val="multilevel"/>
-    <w:tmpl w:val="2E8861A6"/>
+    <w:tmpl w:val="A97A4AE6"/>
     <w:lvl w:ilvl="0">
       <w:start w:val="1"/>
       <w:numFmt w:val="bullet"/>
@@ -18493,9 +18493,9 @@
     </w:lvl>
   </w:abstractNum>
   <w:abstractNum w:abstractNumId="3" w15:restartNumberingAfterBreak="0">
-    <w:nsid w:val="784F3CEE"/>
+    <w:nsid w:val="65A37B1C"/>
     <w:multiLevelType w:val="multilevel"/>
-    <w:tmpl w:val="8CF28EC2"/>
+    <w:tmpl w:val="7F6E3110"/>
     <w:lvl w:ilvl="0">
       <w:start w:val="1"/>
       <w:numFmt w:val="bullet"/>
@@ -18642,16 +18642,16 @@
     </w:lvl>
   </w:abstractNum>
   <w:num w:numId="1">
-    <w:abstractNumId w:val="2"/>
+    <w:abstractNumId w:val="3"/>
   </w:num>
   <w:num w:numId="2">
-    <w:abstractNumId w:val="3"/>
+    <w:abstractNumId w:val="1"/>
   </w:num>
   <w:num w:numId="3">
-    <w:abstractNumId w:val="1"/>
+    <w:abstractNumId w:val="0"/>
   </w:num>
   <w:num w:numId="4">
-    <w:abstractNumId w:val="0"/>
+    <w:abstractNumId w:val="2"/>
   </w:num>
 </w:numbering>
 </file>

</xml_diff>

<commit_message>
data: sync QFieldCloud completa tras descarga local (4173 fichas)
</commit_message>
<xml_diff>
--- a/public/informe_reunion_tecnica.docx
+++ b/public/informe_reunion_tecnica.docx
@@ -4,7 +4,7 @@
   <w:body>
     <w:p>
       <w:pPr>
-        <w:divId w:val="245845440"/>
+        <w:divId w:val="2082830466"/>
         <w:rPr>
           <w:rFonts w:ascii="Plus Jakarta Sans" w:eastAsia="Times New Roman" w:hAnsi="Plus Jakarta Sans"/>
           <w:lang w:val="es-ES"/>
@@ -28,7 +28,7 @@
     <w:p>
       <w:pPr>
         <w:pStyle w:val="Ttulo1"/>
-        <w:divId w:val="1312251671"/>
+        <w:divId w:val="691807660"/>
         <w:rPr>
           <w:rFonts w:eastAsia="Times New Roman"/>
           <w:lang w:val="es-ES"/>
@@ -45,7 +45,7 @@
     <w:p>
       <w:pPr>
         <w:pStyle w:val="NormalWeb"/>
-        <w:divId w:val="1312251671"/>
+        <w:divId w:val="691807660"/>
         <w:rPr>
           <w:rFonts w:ascii="Plus Jakarta Sans" w:hAnsi="Plus Jakarta Sans"/>
           <w:lang w:val="es-ES"/>
@@ -63,7 +63,7 @@
     <w:p>
       <w:pPr>
         <w:pStyle w:val="NormalWeb"/>
-        <w:divId w:val="1312251671"/>
+        <w:divId w:val="691807660"/>
         <w:rPr>
           <w:rFonts w:ascii="Plus Jakarta Sans" w:hAnsi="Plus Jakarta Sans"/>
           <w:lang w:val="es-ES"/>
@@ -102,7 +102,7 @@
     <w:p>
       <w:pPr>
         <w:spacing w:before="450" w:after="450"/>
-        <w:divId w:val="1312251671"/>
+        <w:divId w:val="691807660"/>
         <w:rPr>
           <w:rFonts w:ascii="Plus Jakarta Sans" w:eastAsia="Times New Roman" w:hAnsi="Plus Jakarta Sans"/>
           <w:lang w:val="es-ES"/>
@@ -113,7 +113,7 @@
           <w:rFonts w:ascii="Plus Jakarta Sans" w:eastAsia="Times New Roman" w:hAnsi="Plus Jakarta Sans"/>
           <w:lang w:val="es-ES"/>
         </w:rPr>
-        <w:pict w14:anchorId="2C294813">
+        <w:pict>
           <v:rect id="_x0000_i1025" style="width:0;height:.75pt" o:hralign="center" o:hrstd="t" o:hr="t" fillcolor="#a0a0a0" stroked="f"/>
         </w:pict>
       </w:r>
@@ -121,7 +121,7 @@
     <w:p>
       <w:pPr>
         <w:pStyle w:val="Ttulo2"/>
-        <w:divId w:val="1312251671"/>
+        <w:divId w:val="691807660"/>
         <w:rPr>
           <w:rFonts w:eastAsia="Times New Roman"/>
           <w:lang w:val="es-ES"/>
@@ -145,7 +145,7 @@
     <w:p>
       <w:pPr>
         <w:pStyle w:val="NormalWeb"/>
-        <w:divId w:val="1312251671"/>
+        <w:divId w:val="691807660"/>
         <w:rPr>
           <w:rFonts w:ascii="Plus Jakarta Sans" w:hAnsi="Plus Jakarta Sans"/>
           <w:lang w:val="es-ES"/>
@@ -167,7 +167,7 @@
         </w:numPr>
         <w:spacing w:before="100" w:beforeAutospacing="1" w:after="90"/>
         <w:ind w:left="1020"/>
-        <w:divId w:val="1312251671"/>
+        <w:divId w:val="691807660"/>
         <w:rPr>
           <w:rFonts w:ascii="Plus Jakarta Sans" w:eastAsia="Times New Roman" w:hAnsi="Plus Jakarta Sans"/>
           <w:sz w:val="21"/>
@@ -213,7 +213,7 @@
         </w:numPr>
         <w:spacing w:before="100" w:beforeAutospacing="1" w:after="90"/>
         <w:ind w:left="1020"/>
-        <w:divId w:val="1312251671"/>
+        <w:divId w:val="691807660"/>
         <w:rPr>
           <w:rFonts w:ascii="Plus Jakarta Sans" w:eastAsia="Times New Roman" w:hAnsi="Plus Jakarta Sans"/>
           <w:sz w:val="21"/>
@@ -269,7 +269,7 @@
         </w:numPr>
         <w:spacing w:before="100" w:beforeAutospacing="1" w:after="90"/>
         <w:ind w:left="1020"/>
-        <w:divId w:val="1312251671"/>
+        <w:divId w:val="691807660"/>
         <w:rPr>
           <w:rFonts w:ascii="Plus Jakarta Sans" w:eastAsia="Times New Roman" w:hAnsi="Plus Jakarta Sans"/>
           <w:sz w:val="21"/>
@@ -315,7 +315,7 @@
         </w:numPr>
         <w:spacing w:before="100" w:beforeAutospacing="1" w:after="90"/>
         <w:ind w:left="1020"/>
-        <w:divId w:val="1312251671"/>
+        <w:divId w:val="691807660"/>
         <w:rPr>
           <w:rFonts w:ascii="Plus Jakarta Sans" w:eastAsia="Times New Roman" w:hAnsi="Plus Jakarta Sans"/>
           <w:sz w:val="21"/>
@@ -356,7 +356,7 @@
     <w:p>
       <w:pPr>
         <w:spacing w:before="450" w:after="450"/>
-        <w:divId w:val="1312251671"/>
+        <w:divId w:val="691807660"/>
         <w:rPr>
           <w:rFonts w:ascii="Plus Jakarta Sans" w:eastAsia="Times New Roman" w:hAnsi="Plus Jakarta Sans"/>
           <w:lang w:val="es-ES"/>
@@ -367,7 +367,7 @@
           <w:rFonts w:ascii="Plus Jakarta Sans" w:eastAsia="Times New Roman" w:hAnsi="Plus Jakarta Sans"/>
           <w:lang w:val="es-ES"/>
         </w:rPr>
-        <w:pict w14:anchorId="46BECF94">
+        <w:pict>
           <v:rect id="_x0000_i1026" style="width:0;height:.75pt" o:hralign="center" o:hrstd="t" o:hr="t" fillcolor="#a0a0a0" stroked="f"/>
         </w:pict>
       </w:r>
@@ -375,7 +375,7 @@
     <w:p>
       <w:pPr>
         <w:pStyle w:val="Ttulo2"/>
-        <w:divId w:val="1312251671"/>
+        <w:divId w:val="691807660"/>
         <w:rPr>
           <w:rFonts w:eastAsia="Times New Roman"/>
           <w:lang w:val="es-ES"/>
@@ -392,7 +392,7 @@
     <w:p>
       <w:pPr>
         <w:pStyle w:val="NormalWeb"/>
-        <w:divId w:val="1312251671"/>
+        <w:divId w:val="691807660"/>
         <w:rPr>
           <w:rFonts w:ascii="Plus Jakarta Sans" w:hAnsi="Plus Jakarta Sans"/>
           <w:lang w:val="es-ES"/>
@@ -445,7 +445,7 @@
       </w:tblGrid>
       <w:tr>
         <w:trPr>
-          <w:divId w:val="515659461"/>
+          <w:divId w:val="1290938860"/>
           <w:tblHeader/>
         </w:trPr>
         <w:tc>
@@ -525,7 +525,7 @@
       </w:tr>
       <w:tr>
         <w:trPr>
-          <w:divId w:val="515659461"/>
+          <w:divId w:val="1290938860"/>
         </w:trPr>
         <w:tc>
           <w:tcPr>
@@ -591,7 +591,7 @@
       </w:tr>
       <w:tr>
         <w:trPr>
-          <w:divId w:val="515659461"/>
+          <w:divId w:val="1290938860"/>
         </w:trPr>
         <w:tc>
           <w:tcPr>
@@ -657,7 +657,7 @@
       </w:tr>
       <w:tr>
         <w:trPr>
-          <w:divId w:val="515659461"/>
+          <w:divId w:val="1290938860"/>
         </w:trPr>
         <w:tc>
           <w:tcPr>
@@ -723,7 +723,7 @@
       </w:tr>
       <w:tr>
         <w:trPr>
-          <w:divId w:val="515659461"/>
+          <w:divId w:val="1290938860"/>
         </w:trPr>
         <w:tc>
           <w:tcPr>
@@ -791,7 +791,7 @@
     <w:p>
       <w:pPr>
         <w:spacing w:before="450" w:after="450"/>
-        <w:divId w:val="1312251671"/>
+        <w:divId w:val="691807660"/>
         <w:rPr>
           <w:rFonts w:ascii="Plus Jakarta Sans" w:eastAsia="Times New Roman" w:hAnsi="Plus Jakarta Sans"/>
           <w:lang w:val="es-ES"/>
@@ -803,7 +803,7 @@
           <w:lang w:val="es-ES"/>
         </w:rPr>
         <w:lastRenderedPageBreak/>
-        <w:pict w14:anchorId="212E2FF8">
+        <w:pict>
           <v:rect id="_x0000_i1027" style="width:0;height:.75pt" o:hralign="center" o:hrstd="t" o:hr="t" fillcolor="#a0a0a0" stroked="f"/>
         </w:pict>
       </w:r>
@@ -811,7 +811,7 @@
     <w:p>
       <w:pPr>
         <w:pStyle w:val="Ttulo2"/>
-        <w:divId w:val="1312251671"/>
+        <w:divId w:val="691807660"/>
         <w:rPr>
           <w:rFonts w:eastAsia="Times New Roman"/>
           <w:lang w:val="es-ES"/>
@@ -828,7 +828,7 @@
     <w:p>
       <w:pPr>
         <w:pStyle w:val="Ttulo3"/>
-        <w:divId w:val="1312251671"/>
+        <w:divId w:val="691807660"/>
         <w:rPr>
           <w:rFonts w:eastAsia="Times New Roman"/>
           <w:lang w:val="es-ES"/>
@@ -845,7 +845,7 @@
     <w:p>
       <w:pPr>
         <w:pStyle w:val="NormalWeb"/>
-        <w:divId w:val="1312251671"/>
+        <w:divId w:val="691807660"/>
         <w:rPr>
           <w:rFonts w:ascii="Plus Jakarta Sans" w:hAnsi="Plus Jakarta Sans"/>
           <w:lang w:val="es-ES"/>
@@ -885,7 +885,7 @@
       </w:tblGrid>
       <w:tr>
         <w:trPr>
-          <w:divId w:val="2097090985"/>
+          <w:divId w:val="348411533"/>
           <w:tblHeader/>
         </w:trPr>
         <w:tc>
@@ -1039,7 +1039,7 @@
       </w:tr>
       <w:tr>
         <w:trPr>
-          <w:divId w:val="2097090985"/>
+          <w:divId w:val="348411533"/>
         </w:trPr>
         <w:tc>
           <w:tcPr>
@@ -1165,7 +1165,7 @@
       </w:tr>
       <w:tr>
         <w:trPr>
-          <w:divId w:val="2097090985"/>
+          <w:divId w:val="348411533"/>
         </w:trPr>
         <w:tc>
           <w:tcPr>
@@ -1291,7 +1291,7 @@
       </w:tr>
       <w:tr>
         <w:trPr>
-          <w:divId w:val="2097090985"/>
+          <w:divId w:val="348411533"/>
         </w:trPr>
         <w:tc>
           <w:tcPr>
@@ -1417,7 +1417,7 @@
       </w:tr>
       <w:tr>
         <w:trPr>
-          <w:divId w:val="2097090985"/>
+          <w:divId w:val="348411533"/>
         </w:trPr>
         <w:tc>
           <w:tcPr>
@@ -1543,7 +1543,7 @@
       </w:tr>
       <w:tr>
         <w:trPr>
-          <w:divId w:val="2097090985"/>
+          <w:divId w:val="348411533"/>
         </w:trPr>
         <w:tc>
           <w:tcPr>
@@ -1677,7 +1677,7 @@
       </w:tr>
       <w:tr>
         <w:trPr>
-          <w:divId w:val="2097090985"/>
+          <w:divId w:val="348411533"/>
         </w:trPr>
         <w:tc>
           <w:tcPr>
@@ -1803,7 +1803,7 @@
       </w:tr>
       <w:tr>
         <w:trPr>
-          <w:divId w:val="2097090985"/>
+          <w:divId w:val="348411533"/>
         </w:trPr>
         <w:tc>
           <w:tcPr>
@@ -1929,7 +1929,7 @@
       </w:tr>
       <w:tr>
         <w:trPr>
-          <w:divId w:val="2097090985"/>
+          <w:divId w:val="348411533"/>
         </w:trPr>
         <w:tc>
           <w:tcPr>
@@ -2057,7 +2057,7 @@
     <w:p>
       <w:pPr>
         <w:pStyle w:val="Ttulo3"/>
-        <w:divId w:val="1312251671"/>
+        <w:divId w:val="691807660"/>
         <w:rPr>
           <w:rFonts w:eastAsia="Times New Roman"/>
           <w:lang w:val="es-ES"/>
@@ -2074,7 +2074,7 @@
     <w:p>
       <w:pPr>
         <w:pStyle w:val="NormalWeb"/>
-        <w:divId w:val="1312251671"/>
+        <w:divId w:val="691807660"/>
         <w:rPr>
           <w:rFonts w:ascii="Plus Jakarta Sans" w:hAnsi="Plus Jakarta Sans"/>
           <w:lang w:val="es-ES"/>
@@ -2103,7 +2103,7 @@
         </w:numPr>
         <w:spacing w:before="100" w:beforeAutospacing="1" w:after="90"/>
         <w:ind w:left="1020"/>
-        <w:divId w:val="1312251671"/>
+        <w:divId w:val="691807660"/>
         <w:rPr>
           <w:rFonts w:ascii="Plus Jakarta Sans" w:eastAsia="Times New Roman" w:hAnsi="Plus Jakarta Sans"/>
           <w:sz w:val="21"/>
@@ -2205,7 +2205,7 @@
         </w:numPr>
         <w:spacing w:before="100" w:beforeAutospacing="1" w:after="90"/>
         <w:ind w:left="1020"/>
-        <w:divId w:val="1312251671"/>
+        <w:divId w:val="691807660"/>
         <w:rPr>
           <w:rFonts w:ascii="Plus Jakarta Sans" w:eastAsia="Times New Roman" w:hAnsi="Plus Jakarta Sans"/>
           <w:sz w:val="21"/>
@@ -2317,7 +2317,7 @@
         </w:numPr>
         <w:spacing w:before="100" w:beforeAutospacing="1" w:after="90"/>
         <w:ind w:left="1020"/>
-        <w:divId w:val="1312251671"/>
+        <w:divId w:val="691807660"/>
         <w:rPr>
           <w:rFonts w:ascii="Plus Jakarta Sans" w:eastAsia="Times New Roman" w:hAnsi="Plus Jakarta Sans"/>
           <w:sz w:val="21"/>
@@ -2423,7 +2423,7 @@
     <w:p>
       <w:pPr>
         <w:pStyle w:val="Ttulo3"/>
-        <w:divId w:val="1312251671"/>
+        <w:divId w:val="691807660"/>
         <w:rPr>
           <w:rFonts w:eastAsia="Times New Roman"/>
           <w:lang w:val="es-ES"/>
@@ -2440,7 +2440,7 @@
     <w:p>
       <w:pPr>
         <w:jc w:val="center"/>
-        <w:divId w:val="784621173"/>
+        <w:divId w:val="557472263"/>
         <w:rPr>
           <w:rFonts w:ascii="Outfit" w:eastAsia="Times New Roman" w:hAnsi="Outfit"/>
           <w:b/>
@@ -2469,7 +2469,7 @@
     <w:p>
       <w:pPr>
         <w:jc w:val="center"/>
-        <w:divId w:val="1375807880"/>
+        <w:divId w:val="1431387911"/>
         <w:rPr>
           <w:rFonts w:ascii="Plus Jakarta Sans" w:eastAsia="Times New Roman" w:hAnsi="Plus Jakarta Sans"/>
           <w:lang w:val="es-ES"/>
@@ -2864,7 +2864,7 @@
     <w:p>
       <w:pPr>
         <w:spacing w:before="450" w:after="450"/>
-        <w:divId w:val="1312251671"/>
+        <w:divId w:val="691807660"/>
         <w:rPr>
           <w:rFonts w:ascii="Plus Jakarta Sans" w:eastAsia="Times New Roman" w:hAnsi="Plus Jakarta Sans"/>
           <w:lang w:val="es-ES"/>
@@ -2875,7 +2875,7 @@
           <w:rFonts w:ascii="Plus Jakarta Sans" w:eastAsia="Times New Roman" w:hAnsi="Plus Jakarta Sans"/>
           <w:lang w:val="es-ES"/>
         </w:rPr>
-        <w:pict w14:anchorId="03F2F059">
+        <w:pict>
           <v:rect id="_x0000_i1028" style="width:0;height:.75pt" o:hralign="center" o:hrstd="t" o:hr="t" fillcolor="#a0a0a0" stroked="f"/>
         </w:pict>
       </w:r>
@@ -2883,7 +2883,7 @@
     <w:p>
       <w:pPr>
         <w:pStyle w:val="Ttulo3"/>
-        <w:divId w:val="1312251671"/>
+        <w:divId w:val="691807660"/>
         <w:rPr>
           <w:rFonts w:eastAsia="Times New Roman"/>
           <w:lang w:val="es-ES"/>
@@ -2900,7 +2900,7 @@
     <w:p>
       <w:pPr>
         <w:pStyle w:val="NormalWeb"/>
-        <w:divId w:val="1312251671"/>
+        <w:divId w:val="691807660"/>
         <w:rPr>
           <w:rFonts w:ascii="Plus Jakarta Sans" w:hAnsi="Plus Jakarta Sans"/>
           <w:lang w:val="es-ES"/>
@@ -2933,7 +2933,7 @@
       </w:tblGrid>
       <w:tr>
         <w:trPr>
-          <w:divId w:val="2131435743"/>
+          <w:divId w:val="408772037"/>
           <w:tblHeader/>
         </w:trPr>
         <w:tc>
@@ -3087,7 +3087,7 @@
       </w:tr>
       <w:tr>
         <w:trPr>
-          <w:divId w:val="2131435743"/>
+          <w:divId w:val="408772037"/>
         </w:trPr>
         <w:tc>
           <w:tcPr>
@@ -3221,7 +3221,7 @@
       </w:tr>
       <w:tr>
         <w:trPr>
-          <w:divId w:val="2131435743"/>
+          <w:divId w:val="408772037"/>
         </w:trPr>
         <w:tc>
           <w:tcPr>
@@ -3355,7 +3355,7 @@
       </w:tr>
       <w:tr>
         <w:trPr>
-          <w:divId w:val="2131435743"/>
+          <w:divId w:val="408772037"/>
         </w:trPr>
         <w:tc>
           <w:tcPr>
@@ -3489,7 +3489,7 @@
       </w:tr>
       <w:tr>
         <w:trPr>
-          <w:divId w:val="2131435743"/>
+          <w:divId w:val="408772037"/>
         </w:trPr>
         <w:tc>
           <w:tcPr>
@@ -3623,7 +3623,7 @@
       </w:tr>
       <w:tr>
         <w:trPr>
-          <w:divId w:val="2131435743"/>
+          <w:divId w:val="408772037"/>
         </w:trPr>
         <w:tc>
           <w:tcPr>
@@ -3757,7 +3757,7 @@
       </w:tr>
       <w:tr>
         <w:trPr>
-          <w:divId w:val="2131435743"/>
+          <w:divId w:val="408772037"/>
         </w:trPr>
         <w:tc>
           <w:tcPr>
@@ -3893,7 +3893,7 @@
     <w:p>
       <w:pPr>
         <w:pStyle w:val="Ttulo3"/>
-        <w:divId w:val="1312251671"/>
+        <w:divId w:val="691807660"/>
         <w:rPr>
           <w:rFonts w:eastAsia="Times New Roman"/>
           <w:lang w:val="es-ES"/>
@@ -3910,7 +3910,7 @@
     <w:p>
       <w:pPr>
         <w:jc w:val="center"/>
-        <w:divId w:val="221602405"/>
+        <w:divId w:val="53310526"/>
         <w:rPr>
           <w:rFonts w:ascii="Outfit" w:eastAsia="Times New Roman" w:hAnsi="Outfit"/>
           <w:b/>
@@ -3939,7 +3939,7 @@
     <w:p>
       <w:pPr>
         <w:jc w:val="center"/>
-        <w:divId w:val="1351221866"/>
+        <w:divId w:val="644897381"/>
         <w:rPr>
           <w:rFonts w:ascii="Plus Jakarta Sans" w:eastAsia="Times New Roman" w:hAnsi="Plus Jakarta Sans"/>
           <w:lang w:val="es-ES"/>
@@ -4313,7 +4313,7 @@
     <w:p>
       <w:pPr>
         <w:spacing w:before="450" w:after="450"/>
-        <w:divId w:val="1312251671"/>
+        <w:divId w:val="691807660"/>
         <w:rPr>
           <w:rFonts w:ascii="Plus Jakarta Sans" w:eastAsia="Times New Roman" w:hAnsi="Plus Jakarta Sans"/>
           <w:lang w:val="es-ES"/>
@@ -4325,7 +4325,7 @@
           <w:lang w:val="es-ES"/>
         </w:rPr>
         <w:lastRenderedPageBreak/>
-        <w:pict w14:anchorId="19FB431A">
+        <w:pict>
           <v:rect id="_x0000_i1029" style="width:0;height:.75pt" o:hralign="center" o:hrstd="t" o:hr="t" fillcolor="#a0a0a0" stroked="f"/>
         </w:pict>
       </w:r>
@@ -4333,7 +4333,7 @@
     <w:p>
       <w:pPr>
         <w:pStyle w:val="Ttulo3"/>
-        <w:divId w:val="1312251671"/>
+        <w:divId w:val="691807660"/>
         <w:rPr>
           <w:rFonts w:eastAsia="Times New Roman"/>
           <w:lang w:val="es-ES"/>
@@ -4350,7 +4350,7 @@
     <w:p>
       <w:pPr>
         <w:pStyle w:val="NormalWeb"/>
-        <w:divId w:val="1312251671"/>
+        <w:divId w:val="691807660"/>
         <w:rPr>
           <w:rFonts w:ascii="Plus Jakarta Sans" w:hAnsi="Plus Jakarta Sans"/>
           <w:lang w:val="es-ES"/>
@@ -4372,7 +4372,7 @@
         </w:numPr>
         <w:spacing w:before="100" w:beforeAutospacing="1" w:after="90"/>
         <w:ind w:left="1020"/>
-        <w:divId w:val="1312251671"/>
+        <w:divId w:val="691807660"/>
         <w:rPr>
           <w:rFonts w:ascii="Plus Jakarta Sans" w:eastAsia="Times New Roman" w:hAnsi="Plus Jakarta Sans"/>
           <w:sz w:val="21"/>
@@ -4408,7 +4408,7 @@
         </w:numPr>
         <w:spacing w:before="100" w:beforeAutospacing="1" w:after="90"/>
         <w:ind w:left="1020"/>
-        <w:divId w:val="1312251671"/>
+        <w:divId w:val="691807660"/>
         <w:rPr>
           <w:rFonts w:ascii="Plus Jakarta Sans" w:eastAsia="Times New Roman" w:hAnsi="Plus Jakarta Sans"/>
           <w:sz w:val="21"/>
@@ -4453,7 +4453,7 @@
         </w:numPr>
         <w:spacing w:before="100" w:beforeAutospacing="1" w:after="90"/>
         <w:ind w:left="1020"/>
-        <w:divId w:val="1312251671"/>
+        <w:divId w:val="691807660"/>
         <w:rPr>
           <w:rFonts w:ascii="Plus Jakarta Sans" w:eastAsia="Times New Roman" w:hAnsi="Plus Jakarta Sans"/>
           <w:sz w:val="21"/>
@@ -4498,7 +4498,7 @@
         </w:numPr>
         <w:spacing w:before="100" w:beforeAutospacing="1" w:after="90"/>
         <w:ind w:left="1020"/>
-        <w:divId w:val="1312251671"/>
+        <w:divId w:val="691807660"/>
         <w:rPr>
           <w:rFonts w:ascii="Plus Jakarta Sans" w:eastAsia="Times New Roman" w:hAnsi="Plus Jakarta Sans"/>
           <w:sz w:val="21"/>
@@ -4554,7 +4554,7 @@
       </w:tblGrid>
       <w:tr>
         <w:trPr>
-          <w:divId w:val="1333921488"/>
+          <w:divId w:val="1019085786"/>
           <w:tblHeader/>
         </w:trPr>
         <w:tc>
@@ -4708,7 +4708,7 @@
       </w:tr>
       <w:tr>
         <w:trPr>
-          <w:divId w:val="1333921488"/>
+          <w:divId w:val="1019085786"/>
         </w:trPr>
         <w:tc>
           <w:tcPr>
@@ -4834,7 +4834,7 @@
       </w:tr>
       <w:tr>
         <w:trPr>
-          <w:divId w:val="1333921488"/>
+          <w:divId w:val="1019085786"/>
         </w:trPr>
         <w:tc>
           <w:tcPr>
@@ -4960,7 +4960,7 @@
       </w:tr>
       <w:tr>
         <w:trPr>
-          <w:divId w:val="1333921488"/>
+          <w:divId w:val="1019085786"/>
         </w:trPr>
         <w:tc>
           <w:tcPr>
@@ -5086,7 +5086,7 @@
       </w:tr>
       <w:tr>
         <w:trPr>
-          <w:divId w:val="1333921488"/>
+          <w:divId w:val="1019085786"/>
         </w:trPr>
         <w:tc>
           <w:tcPr>
@@ -5214,7 +5214,7 @@
     <w:p>
       <w:pPr>
         <w:spacing w:before="450" w:after="450"/>
-        <w:divId w:val="1312251671"/>
+        <w:divId w:val="691807660"/>
         <w:rPr>
           <w:rFonts w:ascii="Plus Jakarta Sans" w:eastAsia="Times New Roman" w:hAnsi="Plus Jakarta Sans"/>
           <w:lang w:val="es-ES"/>
@@ -5225,7 +5225,7 @@
           <w:rFonts w:ascii="Plus Jakarta Sans" w:eastAsia="Times New Roman" w:hAnsi="Plus Jakarta Sans"/>
           <w:lang w:val="es-ES"/>
         </w:rPr>
-        <w:pict w14:anchorId="5749FBD5">
+        <w:pict>
           <v:rect id="_x0000_i1030" style="width:0;height:.75pt" o:hralign="center" o:hrstd="t" o:hr="t" fillcolor="#a0a0a0" stroked="f"/>
         </w:pict>
       </w:r>
@@ -5233,7 +5233,7 @@
     <w:p>
       <w:pPr>
         <w:pStyle w:val="Ttulo3"/>
-        <w:divId w:val="1312251671"/>
+        <w:divId w:val="691807660"/>
         <w:rPr>
           <w:rFonts w:eastAsia="Times New Roman"/>
           <w:lang w:val="es-ES"/>
@@ -5250,7 +5250,7 @@
     <w:p>
       <w:pPr>
         <w:pStyle w:val="NormalWeb"/>
-        <w:divId w:val="1312251671"/>
+        <w:divId w:val="691807660"/>
         <w:rPr>
           <w:rFonts w:ascii="Plus Jakarta Sans" w:hAnsi="Plus Jakarta Sans"/>
           <w:lang w:val="es-ES"/>
@@ -5274,7 +5274,7 @@
     <w:p>
       <w:pPr>
         <w:pStyle w:val="Ttulo4"/>
-        <w:divId w:val="1312251671"/>
+        <w:divId w:val="691807660"/>
         <w:rPr>
           <w:rFonts w:eastAsia="Times New Roman"/>
           <w:lang w:val="es-ES"/>
@@ -5291,7 +5291,7 @@
     <w:p>
       <w:pPr>
         <w:jc w:val="center"/>
-        <w:divId w:val="1985431534"/>
+        <w:divId w:val="1316228403"/>
         <w:rPr>
           <w:rFonts w:ascii="Outfit" w:eastAsia="Times New Roman" w:hAnsi="Outfit"/>
           <w:b/>
@@ -5320,7 +5320,7 @@
     <w:p>
       <w:pPr>
         <w:jc w:val="center"/>
-        <w:divId w:val="23673007"/>
+        <w:divId w:val="2085493770"/>
         <w:rPr>
           <w:rFonts w:ascii="Plus Jakarta Sans" w:eastAsia="Times New Roman" w:hAnsi="Plus Jakarta Sans"/>
           <w:lang w:val="es-ES"/>
@@ -5603,7 +5603,7 @@
     <w:p>
       <w:pPr>
         <w:pStyle w:val="Ttulo4"/>
-        <w:divId w:val="1312251671"/>
+        <w:divId w:val="691807660"/>
         <w:rPr>
           <w:rFonts w:eastAsia="Times New Roman"/>
           <w:lang w:val="es-ES"/>
@@ -5627,7 +5627,7 @@
     <w:p>
       <w:pPr>
         <w:jc w:val="center"/>
-        <w:divId w:val="496959792"/>
+        <w:divId w:val="815538186"/>
         <w:rPr>
           <w:rFonts w:ascii="Outfit" w:eastAsia="Times New Roman" w:hAnsi="Outfit"/>
           <w:b/>
@@ -5656,7 +5656,7 @@
     <w:p>
       <w:pPr>
         <w:jc w:val="center"/>
-        <w:divId w:val="74326942"/>
+        <w:divId w:val="893546260"/>
         <w:rPr>
           <w:rFonts w:ascii="Plus Jakarta Sans" w:eastAsia="Times New Roman" w:hAnsi="Plus Jakarta Sans"/>
           <w:lang w:val="es-ES"/>
@@ -5974,7 +5974,7 @@
     <w:p>
       <w:pPr>
         <w:pStyle w:val="Ttulo4"/>
-        <w:divId w:val="1312251671"/>
+        <w:divId w:val="691807660"/>
         <w:rPr>
           <w:rFonts w:eastAsia="Times New Roman"/>
           <w:lang w:val="es-ES"/>
@@ -5992,7 +5992,7 @@
     <w:p>
       <w:pPr>
         <w:jc w:val="center"/>
-        <w:divId w:val="1751075772"/>
+        <w:divId w:val="107086364"/>
         <w:rPr>
           <w:rFonts w:ascii="Outfit" w:eastAsia="Times New Roman" w:hAnsi="Outfit"/>
           <w:b/>
@@ -6021,7 +6021,7 @@
     <w:p>
       <w:pPr>
         <w:jc w:val="center"/>
-        <w:divId w:val="147409112"/>
+        <w:divId w:val="105514769"/>
         <w:rPr>
           <w:rFonts w:ascii="Plus Jakarta Sans" w:eastAsia="Times New Roman" w:hAnsi="Plus Jakarta Sans"/>
           <w:lang w:val="es-ES"/>
@@ -6325,7 +6325,7 @@
     <w:p>
       <w:pPr>
         <w:spacing w:before="450" w:after="450"/>
-        <w:divId w:val="1312251671"/>
+        <w:divId w:val="691807660"/>
         <w:rPr>
           <w:rFonts w:ascii="Plus Jakarta Sans" w:eastAsia="Times New Roman" w:hAnsi="Plus Jakarta Sans"/>
           <w:lang w:val="es-ES"/>
@@ -6336,7 +6336,7 @@
           <w:rFonts w:ascii="Plus Jakarta Sans" w:eastAsia="Times New Roman" w:hAnsi="Plus Jakarta Sans"/>
           <w:lang w:val="es-ES"/>
         </w:rPr>
-        <w:pict w14:anchorId="4C4F0DD8">
+        <w:pict>
           <v:rect id="_x0000_i1031" style="width:0;height:.75pt" o:hralign="center" o:hrstd="t" o:hr="t" fillcolor="#a0a0a0" stroked="f"/>
         </w:pict>
       </w:r>
@@ -6344,7 +6344,7 @@
     <w:p>
       <w:pPr>
         <w:pStyle w:val="Ttulo3"/>
-        <w:divId w:val="1312251671"/>
+        <w:divId w:val="691807660"/>
         <w:rPr>
           <w:rFonts w:eastAsia="Times New Roman"/>
           <w:lang w:val="es-ES"/>
@@ -6361,7 +6361,7 @@
     <w:p>
       <w:pPr>
         <w:pStyle w:val="NormalWeb"/>
-        <w:divId w:val="1312251671"/>
+        <w:divId w:val="691807660"/>
         <w:rPr>
           <w:rFonts w:ascii="Plus Jakarta Sans" w:hAnsi="Plus Jakarta Sans"/>
           <w:lang w:val="es-ES"/>
@@ -6385,7 +6385,7 @@
     <w:p>
       <w:pPr>
         <w:pStyle w:val="Ttulo4"/>
-        <w:divId w:val="1312251671"/>
+        <w:divId w:val="691807660"/>
         <w:rPr>
           <w:rFonts w:eastAsia="Times New Roman"/>
           <w:lang w:val="es-ES"/>
@@ -6402,7 +6402,7 @@
     <w:p>
       <w:pPr>
         <w:pStyle w:val="NormalWeb"/>
-        <w:divId w:val="1312251671"/>
+        <w:divId w:val="691807660"/>
         <w:rPr>
           <w:rFonts w:ascii="Plus Jakarta Sans" w:hAnsi="Plus Jakarta Sans"/>
           <w:lang w:val="es-ES"/>
@@ -6433,7 +6433,7 @@
       </w:tblGrid>
       <w:tr>
         <w:trPr>
-          <w:divId w:val="347752533"/>
+          <w:divId w:val="1978991382"/>
           <w:tblHeader/>
         </w:trPr>
         <w:tc>
@@ -6513,7 +6513,7 @@
       </w:tr>
       <w:tr>
         <w:trPr>
-          <w:divId w:val="347752533"/>
+          <w:divId w:val="1978991382"/>
         </w:trPr>
         <w:tc>
           <w:tcPr>
@@ -6602,7 +6602,7 @@
     <w:p>
       <w:pPr>
         <w:pStyle w:val="Ttulo4"/>
-        <w:divId w:val="1312251671"/>
+        <w:divId w:val="691807660"/>
         <w:rPr>
           <w:rFonts w:eastAsia="Times New Roman"/>
           <w:lang w:val="es-ES"/>
@@ -6619,7 +6619,7 @@
     <w:p>
       <w:pPr>
         <w:pStyle w:val="NormalWeb"/>
-        <w:divId w:val="1312251671"/>
+        <w:divId w:val="691807660"/>
         <w:rPr>
           <w:rFonts w:ascii="Plus Jakarta Sans" w:hAnsi="Plus Jakarta Sans"/>
           <w:lang w:val="es-ES"/>
@@ -6650,7 +6650,7 @@
       </w:tblGrid>
       <w:tr>
         <w:trPr>
-          <w:divId w:val="1854680621"/>
+          <w:divId w:val="1128862683"/>
           <w:tblHeader/>
         </w:trPr>
         <w:tc>
@@ -6730,7 +6730,7 @@
       </w:tr>
       <w:tr>
         <w:trPr>
-          <w:divId w:val="1854680621"/>
+          <w:divId w:val="1128862683"/>
         </w:trPr>
         <w:tc>
           <w:tcPr>
@@ -6828,7 +6828,7 @@
     <w:p>
       <w:pPr>
         <w:pStyle w:val="Ttulo4"/>
-        <w:divId w:val="1312251671"/>
+        <w:divId w:val="691807660"/>
         <w:rPr>
           <w:rFonts w:eastAsia="Times New Roman"/>
           <w:lang w:val="es-ES"/>
@@ -6845,7 +6845,7 @@
     <w:p>
       <w:pPr>
         <w:pStyle w:val="NormalWeb"/>
-        <w:divId w:val="1312251671"/>
+        <w:divId w:val="691807660"/>
         <w:rPr>
           <w:rFonts w:ascii="Plus Jakarta Sans" w:hAnsi="Plus Jakarta Sans"/>
           <w:lang w:val="es-ES"/>
@@ -6876,7 +6876,7 @@
       </w:tblGrid>
       <w:tr>
         <w:trPr>
-          <w:divId w:val="862939102"/>
+          <w:divId w:val="658189039"/>
           <w:tblHeader/>
         </w:trPr>
         <w:tc>
@@ -6957,7 +6957,7 @@
       </w:tr>
       <w:tr>
         <w:trPr>
-          <w:divId w:val="862939102"/>
+          <w:divId w:val="658189039"/>
         </w:trPr>
         <w:tc>
           <w:tcPr>
@@ -7046,7 +7046,7 @@
     <w:p>
       <w:pPr>
         <w:spacing w:before="450" w:after="450"/>
-        <w:divId w:val="1312251671"/>
+        <w:divId w:val="691807660"/>
         <w:rPr>
           <w:rFonts w:ascii="Plus Jakarta Sans" w:eastAsia="Times New Roman" w:hAnsi="Plus Jakarta Sans"/>
           <w:lang w:val="es-ES"/>
@@ -7057,7 +7057,7 @@
           <w:rFonts w:ascii="Plus Jakarta Sans" w:eastAsia="Times New Roman" w:hAnsi="Plus Jakarta Sans"/>
           <w:lang w:val="es-ES"/>
         </w:rPr>
-        <w:pict w14:anchorId="0FD2EDCA">
+        <w:pict>
           <v:rect id="_x0000_i1032" style="width:0;height:.75pt" o:hralign="center" o:hrstd="t" o:hr="t" fillcolor="#a0a0a0" stroked="f"/>
         </w:pict>
       </w:r>
@@ -7065,7 +7065,7 @@
     <w:p>
       <w:pPr>
         <w:pStyle w:val="Ttulo2"/>
-        <w:divId w:val="1312251671"/>
+        <w:divId w:val="691807660"/>
         <w:rPr>
           <w:rFonts w:eastAsia="Times New Roman"/>
           <w:lang w:val="es-ES"/>
@@ -7082,7 +7082,7 @@
     <w:p>
       <w:pPr>
         <w:pStyle w:val="NormalWeb"/>
-        <w:divId w:val="1312251671"/>
+        <w:divId w:val="691807660"/>
         <w:rPr>
           <w:rFonts w:ascii="Plus Jakarta Sans" w:hAnsi="Plus Jakarta Sans"/>
           <w:lang w:val="es-ES"/>
@@ -7099,7 +7099,7 @@
     <w:p>
       <w:pPr>
         <w:pStyle w:val="Ttulo3"/>
-        <w:divId w:val="1312251671"/>
+        <w:divId w:val="691807660"/>
         <w:rPr>
           <w:rFonts w:eastAsia="Times New Roman"/>
           <w:lang w:val="es-ES"/>
@@ -7116,7 +7116,7 @@
     <w:p>
       <w:pPr>
         <w:pStyle w:val="NormalWeb"/>
-        <w:divId w:val="1312251671"/>
+        <w:divId w:val="691807660"/>
         <w:rPr>
           <w:rFonts w:ascii="Plus Jakarta Sans" w:hAnsi="Plus Jakarta Sans"/>
           <w:lang w:val="es-ES"/>
@@ -7149,7 +7149,7 @@
       </w:tblGrid>
       <w:tr>
         <w:trPr>
-          <w:divId w:val="2102871404"/>
+          <w:divId w:val="386951841"/>
           <w:tblHeader/>
         </w:trPr>
         <w:tc>
@@ -7314,7 +7314,7 @@
       </w:tr>
       <w:tr>
         <w:trPr>
-          <w:divId w:val="2102871404"/>
+          <w:divId w:val="386951841"/>
         </w:trPr>
         <w:tc>
           <w:tcPr>
@@ -7440,7 +7440,7 @@
       </w:tr>
       <w:tr>
         <w:trPr>
-          <w:divId w:val="2102871404"/>
+          <w:divId w:val="386951841"/>
         </w:trPr>
         <w:tc>
           <w:tcPr>
@@ -7566,7 +7566,7 @@
       </w:tr>
       <w:tr>
         <w:trPr>
-          <w:divId w:val="2102871404"/>
+          <w:divId w:val="386951841"/>
         </w:trPr>
         <w:tc>
           <w:tcPr>
@@ -7692,7 +7692,7 @@
       </w:tr>
       <w:tr>
         <w:trPr>
-          <w:divId w:val="2102871404"/>
+          <w:divId w:val="386951841"/>
         </w:trPr>
         <w:tc>
           <w:tcPr>
@@ -7820,7 +7820,7 @@
     <w:p>
       <w:pPr>
         <w:pStyle w:val="Ttulo3"/>
-        <w:divId w:val="1312251671"/>
+        <w:divId w:val="691807660"/>
         <w:rPr>
           <w:rFonts w:eastAsia="Times New Roman"/>
           <w:lang w:val="es-ES"/>
@@ -7838,7 +7838,7 @@
       <w:pPr>
         <w:spacing w:before="375" w:after="225"/>
         <w:jc w:val="center"/>
-        <w:divId w:val="1819878746"/>
+        <w:divId w:val="1393037839"/>
         <w:rPr>
           <w:rFonts w:ascii="Outfit" w:eastAsia="Times New Roman" w:hAnsi="Outfit"/>
           <w:b/>
@@ -7868,7 +7868,7 @@
       <w:pPr>
         <w:spacing w:after="375"/>
         <w:jc w:val="center"/>
-        <w:divId w:val="2125808045"/>
+        <w:divId w:val="1285384729"/>
         <w:rPr>
           <w:rFonts w:ascii="Plus Jakarta Sans" w:eastAsia="Times New Roman" w:hAnsi="Plus Jakarta Sans"/>
           <w:lang w:val="es-ES"/>
@@ -8235,7 +8235,7 @@
     <w:p>
       <w:pPr>
         <w:pStyle w:val="Ttulo3"/>
-        <w:divId w:val="1312251671"/>
+        <w:divId w:val="691807660"/>
         <w:rPr>
           <w:rFonts w:eastAsia="Times New Roman"/>
           <w:lang w:val="es-ES"/>
@@ -8259,7 +8259,7 @@
     <w:p>
       <w:pPr>
         <w:pStyle w:val="NormalWeb"/>
-        <w:divId w:val="1312251671"/>
+        <w:divId w:val="691807660"/>
         <w:rPr>
           <w:rFonts w:ascii="Plus Jakarta Sans" w:hAnsi="Plus Jakarta Sans"/>
           <w:lang w:val="es-ES"/>
@@ -8281,7 +8281,7 @@
         </w:numPr>
         <w:spacing w:before="100" w:beforeAutospacing="1" w:after="90"/>
         <w:ind w:left="1020"/>
-        <w:divId w:val="1312251671"/>
+        <w:divId w:val="691807660"/>
         <w:rPr>
           <w:rFonts w:ascii="Plus Jakarta Sans" w:eastAsia="Times New Roman" w:hAnsi="Plus Jakarta Sans"/>
           <w:sz w:val="21"/>
@@ -8317,7 +8317,7 @@
         </w:numPr>
         <w:spacing w:before="100" w:beforeAutospacing="1" w:after="90"/>
         <w:ind w:left="1020"/>
-        <w:divId w:val="1312251671"/>
+        <w:divId w:val="691807660"/>
         <w:rPr>
           <w:rFonts w:ascii="Plus Jakarta Sans" w:eastAsia="Times New Roman" w:hAnsi="Plus Jakarta Sans"/>
           <w:sz w:val="21"/>
@@ -8362,7 +8362,7 @@
         </w:numPr>
         <w:spacing w:before="100" w:beforeAutospacing="1" w:after="90"/>
         <w:ind w:left="1020"/>
-        <w:divId w:val="1312251671"/>
+        <w:divId w:val="691807660"/>
         <w:rPr>
           <w:rFonts w:ascii="Plus Jakarta Sans" w:eastAsia="Times New Roman" w:hAnsi="Plus Jakarta Sans"/>
           <w:sz w:val="21"/>
@@ -8416,7 +8416,7 @@
         </w:numPr>
         <w:spacing w:before="100" w:beforeAutospacing="1" w:after="90"/>
         <w:ind w:left="1020"/>
-        <w:divId w:val="1312251671"/>
+        <w:divId w:val="691807660"/>
         <w:rPr>
           <w:rFonts w:ascii="Plus Jakarta Sans" w:eastAsia="Times New Roman" w:hAnsi="Plus Jakarta Sans"/>
           <w:sz w:val="21"/>
@@ -8461,7 +8461,7 @@
         </w:numPr>
         <w:spacing w:before="100" w:beforeAutospacing="1" w:after="90"/>
         <w:ind w:left="1020"/>
-        <w:divId w:val="1312251671"/>
+        <w:divId w:val="691807660"/>
         <w:rPr>
           <w:rFonts w:ascii="Plus Jakarta Sans" w:eastAsia="Times New Roman" w:hAnsi="Plus Jakarta Sans"/>
           <w:sz w:val="21"/>
@@ -8497,7 +8497,7 @@
         </w:numPr>
         <w:spacing w:before="100" w:beforeAutospacing="1" w:after="90"/>
         <w:ind w:left="1020"/>
-        <w:divId w:val="1312251671"/>
+        <w:divId w:val="691807660"/>
         <w:rPr>
           <w:rFonts w:ascii="Plus Jakarta Sans" w:eastAsia="Times New Roman" w:hAnsi="Plus Jakarta Sans"/>
           <w:sz w:val="21"/>
@@ -8542,7 +8542,7 @@
         </w:numPr>
         <w:spacing w:before="100" w:beforeAutospacing="1" w:after="90"/>
         <w:ind w:left="1020"/>
-        <w:divId w:val="1312251671"/>
+        <w:divId w:val="691807660"/>
         <w:rPr>
           <w:rFonts w:ascii="Plus Jakarta Sans" w:eastAsia="Times New Roman" w:hAnsi="Plus Jakarta Sans"/>
           <w:sz w:val="21"/>
@@ -8587,7 +8587,7 @@
         </w:numPr>
         <w:spacing w:before="100" w:beforeAutospacing="1" w:after="90"/>
         <w:ind w:left="1020"/>
-        <w:divId w:val="1312251671"/>
+        <w:divId w:val="691807660"/>
         <w:rPr>
           <w:rFonts w:ascii="Plus Jakarta Sans" w:eastAsia="Times New Roman" w:hAnsi="Plus Jakarta Sans"/>
           <w:sz w:val="21"/>
@@ -8632,7 +8632,7 @@
         </w:numPr>
         <w:spacing w:before="100" w:beforeAutospacing="1" w:after="90"/>
         <w:ind w:left="1020"/>
-        <w:divId w:val="1312251671"/>
+        <w:divId w:val="691807660"/>
         <w:rPr>
           <w:rFonts w:ascii="Plus Jakarta Sans" w:eastAsia="Times New Roman" w:hAnsi="Plus Jakarta Sans"/>
           <w:sz w:val="21"/>
@@ -8668,7 +8668,7 @@
         </w:numPr>
         <w:spacing w:before="100" w:beforeAutospacing="1" w:after="90"/>
         <w:ind w:left="1020"/>
-        <w:divId w:val="1312251671"/>
+        <w:divId w:val="691807660"/>
         <w:rPr>
           <w:rFonts w:ascii="Plus Jakarta Sans" w:eastAsia="Times New Roman" w:hAnsi="Plus Jakarta Sans"/>
           <w:sz w:val="21"/>
@@ -8722,7 +8722,7 @@
         </w:numPr>
         <w:spacing w:before="100" w:beforeAutospacing="1" w:after="90"/>
         <w:ind w:left="1020"/>
-        <w:divId w:val="1312251671"/>
+        <w:divId w:val="691807660"/>
         <w:rPr>
           <w:rFonts w:ascii="Plus Jakarta Sans" w:eastAsia="Times New Roman" w:hAnsi="Plus Jakarta Sans"/>
           <w:sz w:val="21"/>
@@ -8767,7 +8767,7 @@
         </w:numPr>
         <w:spacing w:before="100" w:beforeAutospacing="1" w:after="90"/>
         <w:ind w:left="1020"/>
-        <w:divId w:val="1312251671"/>
+        <w:divId w:val="691807660"/>
         <w:rPr>
           <w:rFonts w:ascii="Plus Jakarta Sans" w:eastAsia="Times New Roman" w:hAnsi="Plus Jakarta Sans"/>
           <w:sz w:val="21"/>
@@ -8807,7 +8807,7 @@
     <w:p>
       <w:pPr>
         <w:pStyle w:val="Ttulo3"/>
-        <w:divId w:val="1312251671"/>
+        <w:divId w:val="691807660"/>
         <w:rPr>
           <w:rFonts w:eastAsia="Times New Roman"/>
           <w:lang w:val="es-ES"/>
@@ -8825,7 +8825,7 @@
       <w:pPr>
         <w:spacing w:before="375" w:after="225"/>
         <w:jc w:val="center"/>
-        <w:divId w:val="1953246843"/>
+        <w:divId w:val="1909420181"/>
         <w:rPr>
           <w:rFonts w:ascii="Outfit" w:eastAsia="Times New Roman" w:hAnsi="Outfit"/>
           <w:b/>
@@ -8855,7 +8855,7 @@
       <w:pPr>
         <w:spacing w:after="375"/>
         <w:jc w:val="center"/>
-        <w:divId w:val="916206169"/>
+        <w:divId w:val="1023897308"/>
         <w:rPr>
           <w:rFonts w:ascii="Plus Jakarta Sans" w:eastAsia="Times New Roman" w:hAnsi="Plus Jakarta Sans"/>
           <w:lang w:val="es-ES"/>
@@ -9145,7 +9145,7 @@
     <w:p>
       <w:pPr>
         <w:spacing w:before="450" w:after="450"/>
-        <w:divId w:val="1312251671"/>
+        <w:divId w:val="691807660"/>
         <w:rPr>
           <w:rFonts w:ascii="Plus Jakarta Sans" w:eastAsia="Times New Roman" w:hAnsi="Plus Jakarta Sans"/>
           <w:lang w:val="es-ES"/>
@@ -9156,7 +9156,7 @@
           <w:rFonts w:ascii="Plus Jakarta Sans" w:eastAsia="Times New Roman" w:hAnsi="Plus Jakarta Sans"/>
           <w:lang w:val="es-ES"/>
         </w:rPr>
-        <w:pict w14:anchorId="29F91B73">
+        <w:pict>
           <v:rect id="_x0000_i1033" style="width:0;height:.75pt" o:hralign="center" o:hrstd="t" o:hr="t" fillcolor="#a0a0a0" stroked="f"/>
         </w:pict>
       </w:r>
@@ -9164,7 +9164,7 @@
     <w:p>
       <w:pPr>
         <w:pStyle w:val="Ttulo2"/>
-        <w:divId w:val="1312251671"/>
+        <w:divId w:val="691807660"/>
         <w:rPr>
           <w:rFonts w:eastAsia="Times New Roman"/>
           <w:lang w:val="es-ES"/>
@@ -9181,7 +9181,7 @@
     <w:p>
       <w:pPr>
         <w:pStyle w:val="NormalWeb"/>
-        <w:divId w:val="1312251671"/>
+        <w:divId w:val="691807660"/>
         <w:rPr>
           <w:rFonts w:ascii="Plus Jakarta Sans" w:hAnsi="Plus Jakarta Sans"/>
           <w:lang w:val="es-ES"/>
@@ -9198,7 +9198,7 @@
     <w:p>
       <w:pPr>
         <w:pStyle w:val="NormalWeb"/>
-        <w:divId w:val="1312251671"/>
+        <w:divId w:val="691807660"/>
         <w:rPr>
           <w:rFonts w:ascii="Plus Jakarta Sans" w:hAnsi="Plus Jakarta Sans"/>
           <w:lang w:val="es-ES"/>
@@ -9260,7 +9260,7 @@
     <w:p>
       <w:pPr>
         <w:pStyle w:val="NormalWeb"/>
-        <w:divId w:val="1312251671"/>
+        <w:divId w:val="691807660"/>
         <w:rPr>
           <w:rFonts w:ascii="Plus Jakarta Sans" w:hAnsi="Plus Jakarta Sans"/>
           <w:lang w:val="es-ES"/>
@@ -9322,7 +9322,7 @@
     <w:p>
       <w:pPr>
         <w:pStyle w:val="NormalWeb"/>
-        <w:divId w:val="1312251671"/>
+        <w:divId w:val="691807660"/>
         <w:rPr>
           <w:rFonts w:ascii="Plus Jakarta Sans" w:hAnsi="Plus Jakarta Sans"/>
           <w:lang w:val="es-ES"/>
@@ -9383,7 +9383,7 @@
     <w:p>
       <w:pPr>
         <w:pStyle w:val="NormalWeb"/>
-        <w:divId w:val="1312251671"/>
+        <w:divId w:val="691807660"/>
         <w:rPr>
           <w:rFonts w:ascii="Plus Jakarta Sans" w:hAnsi="Plus Jakarta Sans"/>
           <w:lang w:val="es-ES"/>
@@ -9437,7 +9437,7 @@
     <w:p>
       <w:pPr>
         <w:spacing w:before="450" w:after="450"/>
-        <w:divId w:val="1312251671"/>
+        <w:divId w:val="691807660"/>
         <w:rPr>
           <w:rFonts w:ascii="Plus Jakarta Sans" w:eastAsia="Times New Roman" w:hAnsi="Plus Jakarta Sans"/>
           <w:lang w:val="es-ES"/>
@@ -9448,7 +9448,7 @@
           <w:rFonts w:ascii="Plus Jakarta Sans" w:eastAsia="Times New Roman" w:hAnsi="Plus Jakarta Sans"/>
           <w:lang w:val="es-ES"/>
         </w:rPr>
-        <w:pict w14:anchorId="549EE60A">
+        <w:pict>
           <v:rect id="_x0000_i1034" style="width:0;height:.75pt" o:hralign="center" o:hrstd="t" o:hr="t" fillcolor="#a0a0a0" stroked="f"/>
         </w:pict>
       </w:r>
@@ -9456,7 +9456,7 @@
     <w:p>
       <w:pPr>
         <w:pStyle w:val="Ttulo2"/>
-        <w:divId w:val="1312251671"/>
+        <w:divId w:val="691807660"/>
         <w:rPr>
           <w:rFonts w:eastAsia="Times New Roman"/>
           <w:lang w:val="es-ES"/>
@@ -9473,7 +9473,7 @@
     <w:p>
       <w:pPr>
         <w:pStyle w:val="NormalWeb"/>
-        <w:divId w:val="1312251671"/>
+        <w:divId w:val="691807660"/>
         <w:rPr>
           <w:rFonts w:ascii="Plus Jakarta Sans" w:hAnsi="Plus Jakarta Sans"/>
           <w:lang w:val="es-ES"/>
@@ -9512,7 +9512,7 @@
     <w:p>
       <w:pPr>
         <w:pStyle w:val="Ttulo3"/>
-        <w:divId w:val="1312251671"/>
+        <w:divId w:val="691807660"/>
         <w:rPr>
           <w:rFonts w:eastAsia="Times New Roman"/>
           <w:lang w:val="es-ES"/>
@@ -9546,7 +9546,7 @@
       </w:tblGrid>
       <w:tr>
         <w:trPr>
-          <w:divId w:val="1715543782"/>
+          <w:divId w:val="1619874450"/>
           <w:tblHeader/>
         </w:trPr>
         <w:tc>
@@ -9737,7 +9737,7 @@
       </w:tr>
       <w:tr>
         <w:trPr>
-          <w:divId w:val="1715543782"/>
+          <w:divId w:val="1619874450"/>
         </w:trPr>
         <w:tc>
           <w:tcPr>
@@ -9893,7 +9893,7 @@
       </w:tr>
       <w:tr>
         <w:trPr>
-          <w:divId w:val="1715543782"/>
+          <w:divId w:val="1619874450"/>
         </w:trPr>
         <w:tc>
           <w:tcPr>
@@ -10049,7 +10049,7 @@
       </w:tr>
       <w:tr>
         <w:trPr>
-          <w:divId w:val="1715543782"/>
+          <w:divId w:val="1619874450"/>
         </w:trPr>
         <w:tc>
           <w:tcPr>
@@ -10205,7 +10205,7 @@
       </w:tr>
       <w:tr>
         <w:trPr>
-          <w:divId w:val="1715543782"/>
+          <w:divId w:val="1619874450"/>
         </w:trPr>
         <w:tc>
           <w:tcPr>
@@ -10367,7 +10367,7 @@
     <w:p>
       <w:pPr>
         <w:pStyle w:val="Ttulo3"/>
-        <w:divId w:val="1312251671"/>
+        <w:divId w:val="691807660"/>
         <w:rPr>
           <w:rFonts w:eastAsia="Times New Roman"/>
           <w:lang w:val="es-ES"/>
@@ -10401,7 +10401,7 @@
       </w:tblGrid>
       <w:tr>
         <w:trPr>
-          <w:divId w:val="1570798865"/>
+          <w:divId w:val="1425150999"/>
           <w:tblHeader/>
         </w:trPr>
         <w:tc>
@@ -10592,7 +10592,7 @@
       </w:tr>
       <w:tr>
         <w:trPr>
-          <w:divId w:val="1570798865"/>
+          <w:divId w:val="1425150999"/>
         </w:trPr>
         <w:tc>
           <w:tcPr>
@@ -10749,7 +10749,7 @@
       </w:tr>
       <w:tr>
         <w:trPr>
-          <w:divId w:val="1570798865"/>
+          <w:divId w:val="1425150999"/>
         </w:trPr>
         <w:tc>
           <w:tcPr>
@@ -10908,7 +10908,7 @@
     <w:p>
       <w:pPr>
         <w:pStyle w:val="Ttulo3"/>
-        <w:divId w:val="1312251671"/>
+        <w:divId w:val="691807660"/>
         <w:rPr>
           <w:rFonts w:eastAsia="Times New Roman"/>
           <w:lang w:val="es-ES"/>
@@ -10943,7 +10943,7 @@
       </w:tblGrid>
       <w:tr>
         <w:trPr>
-          <w:divId w:val="1599632691"/>
+          <w:divId w:val="1212108729"/>
           <w:tblHeader/>
         </w:trPr>
         <w:tc>
@@ -11171,7 +11171,7 @@
       </w:tr>
       <w:tr>
         <w:trPr>
-          <w:divId w:val="1599632691"/>
+          <w:divId w:val="1212108729"/>
         </w:trPr>
         <w:tc>
           <w:tcPr>
@@ -11367,7 +11367,7 @@
       </w:tr>
       <w:tr>
         <w:trPr>
-          <w:divId w:val="1599632691"/>
+          <w:divId w:val="1212108729"/>
         </w:trPr>
         <w:tc>
           <w:tcPr>
@@ -11552,7 +11552,7 @@
       </w:tr>
       <w:tr>
         <w:trPr>
-          <w:divId w:val="1599632691"/>
+          <w:divId w:val="1212108729"/>
         </w:trPr>
         <w:tc>
           <w:tcPr>
@@ -11750,7 +11750,7 @@
     <w:p>
       <w:pPr>
         <w:pStyle w:val="Ttulo4"/>
-        <w:divId w:val="1312251671"/>
+        <w:divId w:val="691807660"/>
         <w:rPr>
           <w:rFonts w:eastAsia="Times New Roman"/>
           <w:lang w:val="es-ES"/>
@@ -11768,7 +11768,7 @@
       <w:pPr>
         <w:spacing w:before="375" w:after="225"/>
         <w:jc w:val="center"/>
-        <w:divId w:val="1109204957"/>
+        <w:divId w:val="442040353"/>
         <w:rPr>
           <w:rFonts w:ascii="Outfit" w:eastAsia="Times New Roman" w:hAnsi="Outfit"/>
           <w:b/>
@@ -11798,7 +11798,7 @@
       <w:pPr>
         <w:spacing w:after="375"/>
         <w:jc w:val="center"/>
-        <w:divId w:val="41708553"/>
+        <w:divId w:val="1726178887"/>
         <w:rPr>
           <w:rFonts w:ascii="Plus Jakarta Sans" w:eastAsia="Times New Roman" w:hAnsi="Plus Jakarta Sans"/>
           <w:lang w:val="es-ES"/>
@@ -12193,7 +12193,7 @@
     <w:p>
       <w:pPr>
         <w:pStyle w:val="Ttulo3"/>
-        <w:divId w:val="1312251671"/>
+        <w:divId w:val="691807660"/>
         <w:rPr>
           <w:rFonts w:eastAsia="Times New Roman"/>
           <w:lang w:val="es-ES"/>
@@ -12225,7 +12225,7 @@
       </w:tblGrid>
       <w:tr>
         <w:trPr>
-          <w:divId w:val="1758407925"/>
+          <w:divId w:val="701442411"/>
           <w:tblHeader/>
         </w:trPr>
         <w:tc>
@@ -12342,7 +12342,7 @@
       </w:tr>
       <w:tr>
         <w:trPr>
-          <w:divId w:val="1758407925"/>
+          <w:divId w:val="701442411"/>
         </w:trPr>
         <w:tc>
           <w:tcPr>
@@ -12438,7 +12438,7 @@
       </w:tr>
       <w:tr>
         <w:trPr>
-          <w:divId w:val="1758407925"/>
+          <w:divId w:val="701442411"/>
         </w:trPr>
         <w:tc>
           <w:tcPr>
@@ -12534,7 +12534,7 @@
       </w:tr>
       <w:tr>
         <w:trPr>
-          <w:divId w:val="1758407925"/>
+          <w:divId w:val="701442411"/>
         </w:trPr>
         <w:tc>
           <w:tcPr>
@@ -12632,7 +12632,7 @@
     <w:p>
       <w:pPr>
         <w:pStyle w:val="NormalWeb"/>
-        <w:divId w:val="1312251671"/>
+        <w:divId w:val="691807660"/>
         <w:rPr>
           <w:rFonts w:ascii="Plus Jakarta Sans" w:hAnsi="Plus Jakarta Sans"/>
           <w:lang w:val="es-ES"/>
@@ -12657,7 +12657,7 @@
     <w:p>
       <w:pPr>
         <w:pStyle w:val="Ttulo3"/>
-        <w:divId w:val="1312251671"/>
+        <w:divId w:val="691807660"/>
         <w:rPr>
           <w:rFonts w:eastAsia="Times New Roman"/>
           <w:lang w:val="es-ES"/>
@@ -12699,7 +12699,7 @@
       </w:tblGrid>
       <w:tr>
         <w:trPr>
-          <w:divId w:val="670261669"/>
+          <w:divId w:val="656880881"/>
           <w:tblHeader/>
         </w:trPr>
         <w:tc>
@@ -12927,7 +12927,7 @@
       </w:tr>
       <w:tr>
         <w:trPr>
-          <w:divId w:val="670261669"/>
+          <w:divId w:val="656880881"/>
         </w:trPr>
         <w:tc>
           <w:tcPr>
@@ -13113,7 +13113,7 @@
       </w:tr>
       <w:tr>
         <w:trPr>
-          <w:divId w:val="670261669"/>
+          <w:divId w:val="656880881"/>
         </w:trPr>
         <w:tc>
           <w:tcPr>
@@ -13299,7 +13299,7 @@
       </w:tr>
       <w:tr>
         <w:trPr>
-          <w:divId w:val="670261669"/>
+          <w:divId w:val="656880881"/>
         </w:trPr>
         <w:tc>
           <w:tcPr>
@@ -13485,7 +13485,7 @@
       </w:tr>
       <w:tr>
         <w:trPr>
-          <w:divId w:val="670261669"/>
+          <w:divId w:val="656880881"/>
         </w:trPr>
         <w:tc>
           <w:tcPr>
@@ -13678,7 +13678,7 @@
     <w:p>
       <w:pPr>
         <w:pStyle w:val="NormalWeb"/>
-        <w:divId w:val="1312251671"/>
+        <w:divId w:val="691807660"/>
         <w:rPr>
           <w:rFonts w:ascii="Plus Jakarta Sans" w:hAnsi="Plus Jakarta Sans"/>
           <w:lang w:val="es-ES"/>
@@ -13725,7 +13725,7 @@
     <w:p>
       <w:pPr>
         <w:pStyle w:val="Ttulo3"/>
-        <w:divId w:val="1312251671"/>
+        <w:divId w:val="691807660"/>
         <w:rPr>
           <w:rFonts w:eastAsia="Times New Roman"/>
           <w:lang w:val="es-ES"/>
@@ -13760,7 +13760,7 @@
       </w:tblGrid>
       <w:tr>
         <w:trPr>
-          <w:divId w:val="1703239134"/>
+          <w:divId w:val="340546434"/>
           <w:tblHeader/>
         </w:trPr>
         <w:tc>
@@ -13988,7 +13988,7 @@
       </w:tr>
       <w:tr>
         <w:trPr>
-          <w:divId w:val="1703239134"/>
+          <w:divId w:val="340546434"/>
         </w:trPr>
         <w:tc>
           <w:tcPr>
@@ -14182,7 +14182,7 @@
       </w:tr>
       <w:tr>
         <w:trPr>
-          <w:divId w:val="1703239134"/>
+          <w:divId w:val="340546434"/>
         </w:trPr>
         <w:tc>
           <w:tcPr>
@@ -14378,7 +14378,7 @@
     <w:p>
       <w:pPr>
         <w:pStyle w:val="Ttulo4"/>
-        <w:divId w:val="1312251671"/>
+        <w:divId w:val="691807660"/>
         <w:rPr>
           <w:rFonts w:eastAsia="Times New Roman"/>
           <w:lang w:val="es-ES"/>
@@ -14396,7 +14396,7 @@
       <w:pPr>
         <w:spacing w:before="375" w:after="225"/>
         <w:jc w:val="center"/>
-        <w:divId w:val="524901041"/>
+        <w:divId w:val="1396388531"/>
         <w:rPr>
           <w:rFonts w:ascii="Outfit" w:eastAsia="Times New Roman" w:hAnsi="Outfit"/>
           <w:b/>
@@ -14426,7 +14426,7 @@
       <w:pPr>
         <w:spacing w:after="375"/>
         <w:jc w:val="center"/>
-        <w:divId w:val="1376656426"/>
+        <w:divId w:val="571086301"/>
         <w:rPr>
           <w:rFonts w:ascii="Plus Jakarta Sans" w:eastAsia="Times New Roman" w:hAnsi="Plus Jakarta Sans"/>
           <w:lang w:val="es-ES"/>
@@ -14814,7 +14814,7 @@
     <w:p>
       <w:pPr>
         <w:pStyle w:val="Ttulo3"/>
-        <w:divId w:val="1312251671"/>
+        <w:divId w:val="691807660"/>
         <w:rPr>
           <w:rFonts w:eastAsia="Times New Roman"/>
           <w:lang w:val="es-ES"/>
@@ -14848,7 +14848,7 @@
       </w:tblGrid>
       <w:tr>
         <w:trPr>
-          <w:divId w:val="927226906"/>
+          <w:divId w:val="43600748"/>
           <w:tblHeader/>
         </w:trPr>
         <w:tc>
@@ -15039,7 +15039,7 @@
       </w:tr>
       <w:tr>
         <w:trPr>
-          <w:divId w:val="927226906"/>
+          <w:divId w:val="43600748"/>
         </w:trPr>
         <w:tc>
           <w:tcPr>
@@ -15195,7 +15195,7 @@
       </w:tr>
       <w:tr>
         <w:trPr>
-          <w:divId w:val="927226906"/>
+          <w:divId w:val="43600748"/>
         </w:trPr>
         <w:tc>
           <w:tcPr>
@@ -15351,7 +15351,7 @@
       </w:tr>
       <w:tr>
         <w:trPr>
-          <w:divId w:val="927226906"/>
+          <w:divId w:val="43600748"/>
         </w:trPr>
         <w:tc>
           <w:tcPr>
@@ -15507,7 +15507,7 @@
       </w:tr>
       <w:tr>
         <w:trPr>
-          <w:divId w:val="927226906"/>
+          <w:divId w:val="43600748"/>
         </w:trPr>
         <w:tc>
           <w:tcPr>
@@ -15663,7 +15663,7 @@
       </w:tr>
       <w:tr>
         <w:trPr>
-          <w:divId w:val="927226906"/>
+          <w:divId w:val="43600748"/>
         </w:trPr>
         <w:tc>
           <w:tcPr>
@@ -15819,7 +15819,7 @@
       </w:tr>
       <w:tr>
         <w:trPr>
-          <w:divId w:val="927226906"/>
+          <w:divId w:val="43600748"/>
         </w:trPr>
         <w:tc>
           <w:tcPr>
@@ -15977,7 +15977,7 @@
     <w:p>
       <w:pPr>
         <w:pStyle w:val="Ttulo3"/>
-        <w:divId w:val="1312251671"/>
+        <w:divId w:val="691807660"/>
         <w:rPr>
           <w:rFonts w:eastAsia="Times New Roman"/>
           <w:lang w:val="es-ES"/>
@@ -16011,7 +16011,7 @@
       </w:tblGrid>
       <w:tr>
         <w:trPr>
-          <w:divId w:val="41097089"/>
+          <w:divId w:val="2111970162"/>
           <w:tblHeader/>
         </w:trPr>
         <w:tc>
@@ -16202,7 +16202,7 @@
       </w:tr>
       <w:tr>
         <w:trPr>
-          <w:divId w:val="41097089"/>
+          <w:divId w:val="2111970162"/>
         </w:trPr>
         <w:tc>
           <w:tcPr>
@@ -16358,7 +16358,7 @@
       </w:tr>
       <w:tr>
         <w:trPr>
-          <w:divId w:val="41097089"/>
+          <w:divId w:val="2111970162"/>
         </w:trPr>
         <w:tc>
           <w:tcPr>
@@ -16514,7 +16514,7 @@
       </w:tr>
       <w:tr>
         <w:trPr>
-          <w:divId w:val="41097089"/>
+          <w:divId w:val="2111970162"/>
         </w:trPr>
         <w:tc>
           <w:tcPr>
@@ -16670,7 +16670,7 @@
       </w:tr>
       <w:tr>
         <w:trPr>
-          <w:divId w:val="41097089"/>
+          <w:divId w:val="2111970162"/>
         </w:trPr>
         <w:tc>
           <w:tcPr>
@@ -16826,7 +16826,7 @@
       </w:tr>
       <w:tr>
         <w:trPr>
-          <w:divId w:val="41097089"/>
+          <w:divId w:val="2111970162"/>
         </w:trPr>
         <w:tc>
           <w:tcPr>
@@ -16984,7 +16984,7 @@
     <w:p>
       <w:pPr>
         <w:pStyle w:val="Ttulo3"/>
-        <w:divId w:val="1312251671"/>
+        <w:divId w:val="691807660"/>
         <w:rPr>
           <w:rFonts w:eastAsia="Times New Roman"/>
           <w:lang w:val="es-ES"/>
@@ -17018,7 +17018,7 @@
       </w:tblGrid>
       <w:tr>
         <w:trPr>
-          <w:divId w:val="1521625576"/>
+          <w:divId w:val="603612651"/>
           <w:tblHeader/>
         </w:trPr>
         <w:tc>
@@ -17209,7 +17209,7 @@
       </w:tr>
       <w:tr>
         <w:trPr>
-          <w:divId w:val="1521625576"/>
+          <w:divId w:val="603612651"/>
         </w:trPr>
         <w:tc>
           <w:tcPr>
@@ -17365,7 +17365,7 @@
       </w:tr>
       <w:tr>
         <w:trPr>
-          <w:divId w:val="1521625576"/>
+          <w:divId w:val="603612651"/>
         </w:trPr>
         <w:tc>
           <w:tcPr>
@@ -17523,7 +17523,7 @@
     <w:p>
       <w:pPr>
         <w:pStyle w:val="Ttulo4"/>
-        <w:divId w:val="1312251671"/>
+        <w:divId w:val="691807660"/>
         <w:rPr>
           <w:rFonts w:eastAsia="Times New Roman"/>
           <w:lang w:val="es-ES"/>
@@ -17541,7 +17541,7 @@
       <w:pPr>
         <w:spacing w:before="375" w:after="225"/>
         <w:jc w:val="center"/>
-        <w:divId w:val="1133597885"/>
+        <w:divId w:val="526336032"/>
         <w:rPr>
           <w:rFonts w:ascii="Outfit" w:eastAsia="Times New Roman" w:hAnsi="Outfit"/>
           <w:b/>
@@ -17571,7 +17571,7 @@
       <w:pPr>
         <w:spacing w:after="375"/>
         <w:jc w:val="center"/>
-        <w:divId w:val="1735738965"/>
+        <w:divId w:val="440613112"/>
         <w:rPr>
           <w:rFonts w:ascii="Plus Jakarta Sans" w:eastAsia="Times New Roman" w:hAnsi="Plus Jakarta Sans"/>
           <w:lang w:val="es-ES"/>
@@ -17959,7 +17959,7 @@
     <w:p>
       <w:pPr>
         <w:spacing w:before="450" w:after="450"/>
-        <w:divId w:val="1312251671"/>
+        <w:divId w:val="691807660"/>
         <w:rPr>
           <w:rFonts w:ascii="Plus Jakarta Sans" w:eastAsia="Times New Roman" w:hAnsi="Plus Jakarta Sans"/>
           <w:lang w:val="es-ES"/>
@@ -17970,7 +17970,7 @@
           <w:rFonts w:ascii="Plus Jakarta Sans" w:eastAsia="Times New Roman" w:hAnsi="Plus Jakarta Sans"/>
           <w:lang w:val="es-ES"/>
         </w:rPr>
-        <w:pict w14:anchorId="6EEBF09C">
+        <w:pict>
           <v:rect id="_x0000_i1035" style="width:0;height:.75pt" o:hralign="center" o:hrstd="t" o:hr="t" fillcolor="#a0a0a0" stroked="f"/>
         </w:pict>
       </w:r>
@@ -17978,7 +17978,7 @@
     <w:p>
       <w:pPr>
         <w:spacing w:before="450" w:after="450"/>
-        <w:divId w:val="1312251671"/>
+        <w:divId w:val="691807660"/>
         <w:rPr>
           <w:rFonts w:ascii="Plus Jakarta Sans" w:eastAsia="Times New Roman" w:hAnsi="Plus Jakarta Sans"/>
           <w:lang w:val="es-ES"/>
@@ -17989,7 +17989,7 @@
           <w:rFonts w:ascii="Plus Jakarta Sans" w:eastAsia="Times New Roman" w:hAnsi="Plus Jakarta Sans"/>
           <w:lang w:val="es-ES"/>
         </w:rPr>
-        <w:pict w14:anchorId="6C7A8ED9">
+        <w:pict>
           <v:rect id="_x0000_i1036" style="width:0;height:.75pt" o:hralign="center" o:hrstd="t" o:hr="t" fillcolor="#a0a0a0" stroked="f"/>
         </w:pict>
       </w:r>
@@ -17997,7 +17997,7 @@
     <w:p>
       <w:pPr>
         <w:pStyle w:val="NormalWeb"/>
-        <w:divId w:val="1312251671"/>
+        <w:divId w:val="691807660"/>
         <w:rPr>
           <w:rFonts w:ascii="Plus Jakarta Sans" w:hAnsi="Plus Jakarta Sans"/>
           <w:lang w:val="es-ES"/>
@@ -18030,7 +18030,7 @@
           <w:rFonts w:ascii="Plus Jakarta Sans" w:hAnsi="Plus Jakarta Sans"/>
           <w:lang w:val="es-ES"/>
         </w:rPr>
-        <w:pict w14:anchorId="34C7168A"/>
+        <w:pict/>
       </w:r>
     </w:p>
     <w:sectPr>
@@ -18046,9 +18046,9 @@
 <file path=word/numbering.xml><?xml version="1.0" encoding="utf-8"?>
 <w:numbering xmlns:wpc="http://schemas.microsoft.com/office/word/2010/wordprocessingCanvas" xmlns:cx="http://schemas.microsoft.com/office/drawing/2014/chartex" xmlns:cx1="http://schemas.microsoft.com/office/drawing/2015/9/8/chartex" xmlns:cx2="http://schemas.microsoft.com/office/drawing/2015/10/21/chartex" xmlns:cx3="http://schemas.microsoft.com/office/drawing/2016/5/9/chartex" xmlns:cx4="http://schemas.microsoft.com/office/drawing/2016/5/10/chartex" xmlns:cx5="http://schemas.microsoft.com/office/drawing/2016/5/11/chartex" xmlns:cx6="http://schemas.microsoft.com/office/drawing/2016/5/12/chartex" xmlns:cx7="http://schemas.microsoft.com/office/drawing/2016/5/13/chartex" xmlns:cx8="http://schemas.microsoft.com/office/drawing/2016/5/14/chartex" xmlns:mc="http://schemas.openxmlformats.org/markup-compatibility/2006" xmlns:aink="http://schemas.microsoft.com/office/drawing/2016/ink" xmlns:am3d="http://schemas.microsoft.com/office/drawing/2017/model3d" xmlns:o="urn:schemas-microsoft-com:office:office" xmlns:r="http://schemas.openxmlformats.org/officeDocument/2006/relationships" xmlns:m="http://schemas.openxmlformats.org/officeDocument/2006/math" xmlns:v="urn:schemas-microsoft-com:vml" xmlns:wp14="http://schemas.microsoft.com/office/word/2010/wordprocessingDrawing" xmlns:wp="http://schemas.openxmlformats.org/drawingml/2006/wordprocessingDrawing" xmlns:w10="urn:schemas-microsoft-com:office:word" xmlns:w="http://schemas.openxmlformats.org/wordprocessingml/2006/main" xmlns:w14="http://schemas.microsoft.com/office/word/2010/wordml" xmlns:w15="http://schemas.microsoft.com/office/word/2012/wordml" xmlns:w16cex="http://schemas.microsoft.com/office/word/2018/wordml/cex" xmlns:w16cid="http://schemas.microsoft.com/office/word/2016/wordml/cid" xmlns:w16="http://schemas.microsoft.com/office/word/2018/wordml" xmlns:w16sdtdh="http://schemas.microsoft.com/office/word/2020/wordml/sdtdatahash" xmlns:w16se="http://schemas.microsoft.com/office/word/2015/wordml/symex" xmlns:wpg="http://schemas.microsoft.com/office/word/2010/wordprocessingGroup" xmlns:wpi="http://schemas.microsoft.com/office/word/2010/wordprocessingInk" xmlns:wne="http://schemas.microsoft.com/office/word/2006/wordml" xmlns:wps="http://schemas.microsoft.com/office/word/2010/wordprocessingShape" mc:Ignorable="w14 w15 w16se w16cid w16 w16cex w16sdtdh wp14">
   <w:abstractNum w:abstractNumId="0" w15:restartNumberingAfterBreak="0">
-    <w:nsid w:val="1A887E4E"/>
+    <w:nsid w:val="37F15C65"/>
     <w:multiLevelType w:val="multilevel"/>
-    <w:tmpl w:val="84460910"/>
+    <w:tmpl w:val="ACE2DF6C"/>
     <w:lvl w:ilvl="0">
       <w:start w:val="1"/>
       <w:numFmt w:val="bullet"/>
@@ -18195,9 +18195,9 @@
     </w:lvl>
   </w:abstractNum>
   <w:abstractNum w:abstractNumId="1" w15:restartNumberingAfterBreak="0">
-    <w:nsid w:val="1FC74A44"/>
+    <w:nsid w:val="65ED05AA"/>
     <w:multiLevelType w:val="multilevel"/>
-    <w:tmpl w:val="9A3EA250"/>
+    <w:tmpl w:val="05A4BB08"/>
     <w:lvl w:ilvl="0">
       <w:start w:val="1"/>
       <w:numFmt w:val="bullet"/>
@@ -18344,9 +18344,9 @@
     </w:lvl>
   </w:abstractNum>
   <w:abstractNum w:abstractNumId="2" w15:restartNumberingAfterBreak="0">
-    <w:nsid w:val="38293563"/>
+    <w:nsid w:val="695400F3"/>
     <w:multiLevelType w:val="multilevel"/>
-    <w:tmpl w:val="A97A4AE6"/>
+    <w:tmpl w:val="2132E58C"/>
     <w:lvl w:ilvl="0">
       <w:start w:val="1"/>
       <w:numFmt w:val="bullet"/>
@@ -18493,9 +18493,9 @@
     </w:lvl>
   </w:abstractNum>
   <w:abstractNum w:abstractNumId="3" w15:restartNumberingAfterBreak="0">
-    <w:nsid w:val="65A37B1C"/>
+    <w:nsid w:val="6E9922F7"/>
     <w:multiLevelType w:val="multilevel"/>
-    <w:tmpl w:val="7F6E3110"/>
+    <w:tmpl w:val="463246D8"/>
     <w:lvl w:ilvl="0">
       <w:start w:val="1"/>
       <w:numFmt w:val="bullet"/>
@@ -18642,13 +18642,13 @@
     </w:lvl>
   </w:abstractNum>
   <w:num w:numId="1">
+    <w:abstractNumId w:val="0"/>
+  </w:num>
+  <w:num w:numId="2">
     <w:abstractNumId w:val="3"/>
   </w:num>
-  <w:num w:numId="2">
+  <w:num w:numId="3">
     <w:abstractNumId w:val="1"/>
-  </w:num>
-  <w:num w:numId="3">
-    <w:abstractNumId w:val="0"/>
   </w:num>
   <w:num w:numId="4">
     <w:abstractNumId w:val="2"/>

</xml_diff>

<commit_message>
feat: implementar correcciones de nomenclatura, tenencia y responsables en visor, pdf e informes
</commit_message>
<xml_diff>
--- a/public/informe_reunion_tecnica.docx
+++ b/public/informe_reunion_tecnica.docx
@@ -4,7 +4,7 @@
   <w:body>
     <w:p>
       <w:pPr>
-        <w:divId w:val="2082830466"/>
+        <w:divId w:val="381489858"/>
         <w:rPr>
           <w:rFonts w:ascii="Plus Jakarta Sans" w:eastAsia="Times New Roman" w:hAnsi="Plus Jakarta Sans"/>
           <w:lang w:val="es-ES"/>
@@ -28,7 +28,7 @@
     <w:p>
       <w:pPr>
         <w:pStyle w:val="Ttulo1"/>
-        <w:divId w:val="691807660"/>
+        <w:divId w:val="405105006"/>
         <w:rPr>
           <w:rFonts w:eastAsia="Times New Roman"/>
           <w:lang w:val="es-ES"/>
@@ -45,7 +45,7 @@
     <w:p>
       <w:pPr>
         <w:pStyle w:val="NormalWeb"/>
-        <w:divId w:val="691807660"/>
+        <w:divId w:val="405105006"/>
         <w:rPr>
           <w:rFonts w:ascii="Plus Jakarta Sans" w:hAnsi="Plus Jakarta Sans"/>
           <w:lang w:val="es-ES"/>
@@ -63,7 +63,7 @@
     <w:p>
       <w:pPr>
         <w:pStyle w:val="NormalWeb"/>
-        <w:divId w:val="691807660"/>
+        <w:divId w:val="405105006"/>
         <w:rPr>
           <w:rFonts w:ascii="Plus Jakarta Sans" w:hAnsi="Plus Jakarta Sans"/>
           <w:lang w:val="es-ES"/>
@@ -102,7 +102,7 @@
     <w:p>
       <w:pPr>
         <w:spacing w:before="450" w:after="450"/>
-        <w:divId w:val="691807660"/>
+        <w:divId w:val="405105006"/>
         <w:rPr>
           <w:rFonts w:ascii="Plus Jakarta Sans" w:eastAsia="Times New Roman" w:hAnsi="Plus Jakarta Sans"/>
           <w:lang w:val="es-ES"/>
@@ -113,7 +113,7 @@
           <w:rFonts w:ascii="Plus Jakarta Sans" w:eastAsia="Times New Roman" w:hAnsi="Plus Jakarta Sans"/>
           <w:lang w:val="es-ES"/>
         </w:rPr>
-        <w:pict>
+        <w:pict w14:anchorId="7D453425">
           <v:rect id="_x0000_i1025" style="width:0;height:.75pt" o:hralign="center" o:hrstd="t" o:hr="t" fillcolor="#a0a0a0" stroked="f"/>
         </w:pict>
       </w:r>
@@ -121,7 +121,7 @@
     <w:p>
       <w:pPr>
         <w:pStyle w:val="Ttulo2"/>
-        <w:divId w:val="691807660"/>
+        <w:divId w:val="405105006"/>
         <w:rPr>
           <w:rFonts w:eastAsia="Times New Roman"/>
           <w:lang w:val="es-ES"/>
@@ -145,7 +145,7 @@
     <w:p>
       <w:pPr>
         <w:pStyle w:val="NormalWeb"/>
-        <w:divId w:val="691807660"/>
+        <w:divId w:val="405105006"/>
         <w:rPr>
           <w:rFonts w:ascii="Plus Jakarta Sans" w:hAnsi="Plus Jakarta Sans"/>
           <w:lang w:val="es-ES"/>
@@ -167,7 +167,7 @@
         </w:numPr>
         <w:spacing w:before="100" w:beforeAutospacing="1" w:after="90"/>
         <w:ind w:left="1020"/>
-        <w:divId w:val="691807660"/>
+        <w:divId w:val="405105006"/>
         <w:rPr>
           <w:rFonts w:ascii="Plus Jakarta Sans" w:eastAsia="Times New Roman" w:hAnsi="Plus Jakarta Sans"/>
           <w:sz w:val="21"/>
@@ -202,7 +202,7 @@
           <w:szCs w:val="21"/>
           <w:lang w:val="es-ES"/>
         </w:rPr>
-        <w:t>4,175 fichas</w:t>
+        <w:t>4,173 fichas</w:t>
       </w:r>
     </w:p>
     <w:p>
@@ -213,7 +213,7 @@
         </w:numPr>
         <w:spacing w:before="100" w:beforeAutospacing="1" w:after="90"/>
         <w:ind w:left="1020"/>
-        <w:divId w:val="691807660"/>
+        <w:divId w:val="405105006"/>
         <w:rPr>
           <w:rFonts w:ascii="Plus Jakarta Sans" w:eastAsia="Times New Roman" w:hAnsi="Plus Jakarta Sans"/>
           <w:sz w:val="21"/>
@@ -258,7 +258,7 @@
           <w:szCs w:val="21"/>
           <w:lang w:val="es-ES"/>
         </w:rPr>
-        <w:t>3,026 polígonos unificados</w:t>
+        <w:t>3,024 polígonos unificados</w:t>
       </w:r>
     </w:p>
     <w:p>
@@ -269,7 +269,7 @@
         </w:numPr>
         <w:spacing w:before="100" w:beforeAutospacing="1" w:after="90"/>
         <w:ind w:left="1020"/>
-        <w:divId w:val="691807660"/>
+        <w:divId w:val="405105006"/>
         <w:rPr>
           <w:rFonts w:ascii="Plus Jakarta Sans" w:eastAsia="Times New Roman" w:hAnsi="Plus Jakarta Sans"/>
           <w:sz w:val="21"/>
@@ -315,7 +315,7 @@
         </w:numPr>
         <w:spacing w:before="100" w:beforeAutospacing="1" w:after="90"/>
         <w:ind w:left="1020"/>
-        <w:divId w:val="691807660"/>
+        <w:divId w:val="405105006"/>
         <w:rPr>
           <w:rFonts w:ascii="Plus Jakarta Sans" w:eastAsia="Times New Roman" w:hAnsi="Plus Jakarta Sans"/>
           <w:sz w:val="21"/>
@@ -356,7 +356,7 @@
     <w:p>
       <w:pPr>
         <w:spacing w:before="450" w:after="450"/>
-        <w:divId w:val="691807660"/>
+        <w:divId w:val="405105006"/>
         <w:rPr>
           <w:rFonts w:ascii="Plus Jakarta Sans" w:eastAsia="Times New Roman" w:hAnsi="Plus Jakarta Sans"/>
           <w:lang w:val="es-ES"/>
@@ -367,7 +367,7 @@
           <w:rFonts w:ascii="Plus Jakarta Sans" w:eastAsia="Times New Roman" w:hAnsi="Plus Jakarta Sans"/>
           <w:lang w:val="es-ES"/>
         </w:rPr>
-        <w:pict>
+        <w:pict w14:anchorId="62EE58CA">
           <v:rect id="_x0000_i1026" style="width:0;height:.75pt" o:hralign="center" o:hrstd="t" o:hr="t" fillcolor="#a0a0a0" stroked="f"/>
         </w:pict>
       </w:r>
@@ -375,7 +375,7 @@
     <w:p>
       <w:pPr>
         <w:pStyle w:val="Ttulo2"/>
-        <w:divId w:val="691807660"/>
+        <w:divId w:val="405105006"/>
         <w:rPr>
           <w:rFonts w:eastAsia="Times New Roman"/>
           <w:lang w:val="es-ES"/>
@@ -392,7 +392,7 @@
     <w:p>
       <w:pPr>
         <w:pStyle w:val="NormalWeb"/>
-        <w:divId w:val="691807660"/>
+        <w:divId w:val="405105006"/>
         <w:rPr>
           <w:rFonts w:ascii="Plus Jakarta Sans" w:hAnsi="Plus Jakarta Sans"/>
           <w:lang w:val="es-ES"/>
@@ -445,7 +445,7 @@
       </w:tblGrid>
       <w:tr>
         <w:trPr>
-          <w:divId w:val="1290938860"/>
+          <w:divId w:val="1421951576"/>
           <w:tblHeader/>
         </w:trPr>
         <w:tc>
@@ -525,7 +525,7 @@
       </w:tr>
       <w:tr>
         <w:trPr>
-          <w:divId w:val="1290938860"/>
+          <w:divId w:val="1421951576"/>
         </w:trPr>
         <w:tc>
           <w:tcPr>
@@ -591,7 +591,7 @@
       </w:tr>
       <w:tr>
         <w:trPr>
-          <w:divId w:val="1290938860"/>
+          <w:divId w:val="1421951576"/>
         </w:trPr>
         <w:tc>
           <w:tcPr>
@@ -650,14 +650,14 @@
                 <w:sz w:val="20"/>
                 <w:szCs w:val="20"/>
               </w:rPr>
-              <w:t>396</w:t>
+              <w:t>394</w:t>
             </w:r>
           </w:p>
         </w:tc>
       </w:tr>
       <w:tr>
         <w:trPr>
-          <w:divId w:val="1290938860"/>
+          <w:divId w:val="1421951576"/>
         </w:trPr>
         <w:tc>
           <w:tcPr>
@@ -723,7 +723,7 @@
       </w:tr>
       <w:tr>
         <w:trPr>
-          <w:divId w:val="1290938860"/>
+          <w:divId w:val="1421951576"/>
         </w:trPr>
         <w:tc>
           <w:tcPr>
@@ -791,7 +791,7 @@
     <w:p>
       <w:pPr>
         <w:spacing w:before="450" w:after="450"/>
-        <w:divId w:val="691807660"/>
+        <w:divId w:val="405105006"/>
         <w:rPr>
           <w:rFonts w:ascii="Plus Jakarta Sans" w:eastAsia="Times New Roman" w:hAnsi="Plus Jakarta Sans"/>
           <w:lang w:val="es-ES"/>
@@ -803,7 +803,7 @@
           <w:lang w:val="es-ES"/>
         </w:rPr>
         <w:lastRenderedPageBreak/>
-        <w:pict>
+        <w:pict w14:anchorId="6CD12635">
           <v:rect id="_x0000_i1027" style="width:0;height:.75pt" o:hralign="center" o:hrstd="t" o:hr="t" fillcolor="#a0a0a0" stroked="f"/>
         </w:pict>
       </w:r>
@@ -811,7 +811,7 @@
     <w:p>
       <w:pPr>
         <w:pStyle w:val="Ttulo2"/>
-        <w:divId w:val="691807660"/>
+        <w:divId w:val="405105006"/>
         <w:rPr>
           <w:rFonts w:eastAsia="Times New Roman"/>
           <w:lang w:val="es-ES"/>
@@ -828,7 +828,7 @@
     <w:p>
       <w:pPr>
         <w:pStyle w:val="Ttulo3"/>
-        <w:divId w:val="691807660"/>
+        <w:divId w:val="405105006"/>
         <w:rPr>
           <w:rFonts w:eastAsia="Times New Roman"/>
           <w:lang w:val="es-ES"/>
@@ -845,7 +845,7 @@
     <w:p>
       <w:pPr>
         <w:pStyle w:val="NormalWeb"/>
-        <w:divId w:val="691807660"/>
+        <w:divId w:val="405105006"/>
         <w:rPr>
           <w:rFonts w:ascii="Plus Jakarta Sans" w:hAnsi="Plus Jakarta Sans"/>
           <w:lang w:val="es-ES"/>
@@ -885,7 +885,7 @@
       </w:tblGrid>
       <w:tr>
         <w:trPr>
-          <w:divId w:val="348411533"/>
+          <w:divId w:val="1112284402"/>
           <w:tblHeader/>
         </w:trPr>
         <w:tc>
@@ -1039,7 +1039,7 @@
       </w:tr>
       <w:tr>
         <w:trPr>
-          <w:divId w:val="348411533"/>
+          <w:divId w:val="1112284402"/>
         </w:trPr>
         <w:tc>
           <w:tcPr>
@@ -1158,14 +1158,14 @@
                 <w:sz w:val="20"/>
                 <w:szCs w:val="20"/>
               </w:rPr>
-              <w:t>822</w:t>
+              <w:t>820</w:t>
             </w:r>
           </w:p>
         </w:tc>
       </w:tr>
       <w:tr>
         <w:trPr>
-          <w:divId w:val="348411533"/>
+          <w:divId w:val="1112284402"/>
         </w:trPr>
         <w:tc>
           <w:tcPr>
@@ -1284,14 +1284,14 @@
                 <w:sz w:val="20"/>
                 <w:szCs w:val="20"/>
               </w:rPr>
-              <w:t>31,755,316.64 m²</w:t>
+              <w:t>31,733,370.43 m²</w:t>
             </w:r>
           </w:p>
         </w:tc>
       </w:tr>
       <w:tr>
         <w:trPr>
-          <w:divId w:val="348411533"/>
+          <w:divId w:val="1112284402"/>
         </w:trPr>
         <w:tc>
           <w:tcPr>
@@ -1410,14 +1410,14 @@
                 <w:sz w:val="20"/>
                 <w:szCs w:val="20"/>
               </w:rPr>
-              <w:t>38,631.77 m² (3.863 ha)</w:t>
+              <w:t>38,699.23 m² (3.870 ha)</w:t>
             </w:r>
           </w:p>
         </w:tc>
       </w:tr>
       <w:tr>
         <w:trPr>
-          <w:divId w:val="348411533"/>
+          <w:divId w:val="1112284402"/>
         </w:trPr>
         <w:tc>
           <w:tcPr>
@@ -1536,14 +1536,14 @@
                 <w:sz w:val="20"/>
                 <w:szCs w:val="20"/>
               </w:rPr>
-              <w:t>15,533,612.34 m²</w:t>
+              <w:t>15,511,666.13 m²</w:t>
             </w:r>
           </w:p>
         </w:tc>
       </w:tr>
       <w:tr>
         <w:trPr>
-          <w:divId w:val="348411533"/>
+          <w:divId w:val="1112284402"/>
         </w:trPr>
         <w:tc>
           <w:tcPr>
@@ -1670,14 +1670,14 @@
                 <w:sz w:val="20"/>
                 <w:szCs w:val="20"/>
               </w:rPr>
-              <w:t>18,897.34 m² (1.890 ha)</w:t>
+              <w:t>18,916.67 m² (1.892 ha)</w:t>
             </w:r>
           </w:p>
         </w:tc>
       </w:tr>
       <w:tr>
         <w:trPr>
-          <w:divId w:val="348411533"/>
+          <w:divId w:val="1112284402"/>
         </w:trPr>
         <w:tc>
           <w:tcPr>
@@ -1803,7 +1803,7 @@
       </w:tr>
       <w:tr>
         <w:trPr>
-          <w:divId w:val="348411533"/>
+          <w:divId w:val="1112284402"/>
         </w:trPr>
         <w:tc>
           <w:tcPr>
@@ -1922,14 +1922,14 @@
                 <w:sz w:val="20"/>
                 <w:szCs w:val="20"/>
               </w:rPr>
-              <w:t>1,505 (18.4%)</w:t>
+              <w:t>1,498 (18.3%)</w:t>
             </w:r>
           </w:p>
         </w:tc>
       </w:tr>
       <w:tr>
         <w:trPr>
-          <w:divId w:val="348411533"/>
+          <w:divId w:val="1112284402"/>
         </w:trPr>
         <w:tc>
           <w:tcPr>
@@ -2048,7 +2048,7 @@
                 <w:sz w:val="20"/>
                 <w:szCs w:val="20"/>
               </w:rPr>
-              <w:t>79,458 (48.5%)</w:t>
+              <w:t>79,401 (48.5%)</w:t>
             </w:r>
           </w:p>
         </w:tc>
@@ -2057,7 +2057,7 @@
     <w:p>
       <w:pPr>
         <w:pStyle w:val="Ttulo3"/>
-        <w:divId w:val="691807660"/>
+        <w:divId w:val="405105006"/>
         <w:rPr>
           <w:rFonts w:eastAsia="Times New Roman"/>
           <w:lang w:val="es-ES"/>
@@ -2074,7 +2074,7 @@
     <w:p>
       <w:pPr>
         <w:pStyle w:val="NormalWeb"/>
-        <w:divId w:val="691807660"/>
+        <w:divId w:val="405105006"/>
         <w:rPr>
           <w:rFonts w:ascii="Plus Jakarta Sans" w:hAnsi="Plus Jakarta Sans"/>
           <w:lang w:val="es-ES"/>
@@ -2103,7 +2103,7 @@
         </w:numPr>
         <w:spacing w:before="100" w:beforeAutospacing="1" w:after="90"/>
         <w:ind w:left="1020"/>
-        <w:divId w:val="691807660"/>
+        <w:divId w:val="405105006"/>
         <w:rPr>
           <w:rFonts w:ascii="Plus Jakarta Sans" w:eastAsia="Times New Roman" w:hAnsi="Plus Jakarta Sans"/>
           <w:sz w:val="21"/>
@@ -2205,7 +2205,7 @@
         </w:numPr>
         <w:spacing w:before="100" w:beforeAutospacing="1" w:after="90"/>
         <w:ind w:left="1020"/>
-        <w:divId w:val="691807660"/>
+        <w:divId w:val="405105006"/>
         <w:rPr>
           <w:rFonts w:ascii="Plus Jakarta Sans" w:eastAsia="Times New Roman" w:hAnsi="Plus Jakarta Sans"/>
           <w:sz w:val="21"/>
@@ -2317,7 +2317,7 @@
         </w:numPr>
         <w:spacing w:before="100" w:beforeAutospacing="1" w:after="90"/>
         <w:ind w:left="1020"/>
-        <w:divId w:val="691807660"/>
+        <w:divId w:val="405105006"/>
         <w:rPr>
           <w:rFonts w:ascii="Plus Jakarta Sans" w:eastAsia="Times New Roman" w:hAnsi="Plus Jakarta Sans"/>
           <w:sz w:val="21"/>
@@ -2399,7 +2399,7 @@
           <w:szCs w:val="21"/>
           <w:lang w:val="es-ES"/>
         </w:rPr>
-        <w:t>18.4%</w:t>
+        <w:t>18.3%</w:t>
       </w:r>
       <w:r>
         <w:rPr>
@@ -2423,7 +2423,7 @@
     <w:p>
       <w:pPr>
         <w:pStyle w:val="Ttulo3"/>
-        <w:divId w:val="691807660"/>
+        <w:divId w:val="405105006"/>
         <w:rPr>
           <w:rFonts w:eastAsia="Times New Roman"/>
           <w:lang w:val="es-ES"/>
@@ -2440,7 +2440,7 @@
     <w:p>
       <w:pPr>
         <w:jc w:val="center"/>
-        <w:divId w:val="557472263"/>
+        <w:divId w:val="1270432307"/>
         <w:rPr>
           <w:rFonts w:ascii="Outfit" w:eastAsia="Times New Roman" w:hAnsi="Outfit"/>
           <w:b/>
@@ -2469,7 +2469,7 @@
     <w:p>
       <w:pPr>
         <w:jc w:val="center"/>
-        <w:divId w:val="1431387911"/>
+        <w:divId w:val="750666025"/>
         <w:rPr>
           <w:rFonts w:ascii="Plus Jakarta Sans" w:eastAsia="Times New Roman" w:hAnsi="Plus Jakarta Sans"/>
           <w:lang w:val="es-ES"/>
@@ -2864,7 +2864,7 @@
     <w:p>
       <w:pPr>
         <w:spacing w:before="450" w:after="450"/>
-        <w:divId w:val="691807660"/>
+        <w:divId w:val="405105006"/>
         <w:rPr>
           <w:rFonts w:ascii="Plus Jakarta Sans" w:eastAsia="Times New Roman" w:hAnsi="Plus Jakarta Sans"/>
           <w:lang w:val="es-ES"/>
@@ -2875,7 +2875,7 @@
           <w:rFonts w:ascii="Plus Jakarta Sans" w:eastAsia="Times New Roman" w:hAnsi="Plus Jakarta Sans"/>
           <w:lang w:val="es-ES"/>
         </w:rPr>
-        <w:pict>
+        <w:pict w14:anchorId="2EB39D84">
           <v:rect id="_x0000_i1028" style="width:0;height:.75pt" o:hralign="center" o:hrstd="t" o:hr="t" fillcolor="#a0a0a0" stroked="f"/>
         </w:pict>
       </w:r>
@@ -2883,7 +2883,7 @@
     <w:p>
       <w:pPr>
         <w:pStyle w:val="Ttulo3"/>
-        <w:divId w:val="691807660"/>
+        <w:divId w:val="405105006"/>
         <w:rPr>
           <w:rFonts w:eastAsia="Times New Roman"/>
           <w:lang w:val="es-ES"/>
@@ -2900,7 +2900,7 @@
     <w:p>
       <w:pPr>
         <w:pStyle w:val="NormalWeb"/>
-        <w:divId w:val="691807660"/>
+        <w:divId w:val="405105006"/>
         <w:rPr>
           <w:rFonts w:ascii="Plus Jakarta Sans" w:hAnsi="Plus Jakarta Sans"/>
           <w:lang w:val="es-ES"/>
@@ -2933,7 +2933,7 @@
       </w:tblGrid>
       <w:tr>
         <w:trPr>
-          <w:divId w:val="408772037"/>
+          <w:divId w:val="1441148870"/>
           <w:tblHeader/>
         </w:trPr>
         <w:tc>
@@ -3087,7 +3087,7 @@
       </w:tr>
       <w:tr>
         <w:trPr>
-          <w:divId w:val="408772037"/>
+          <w:divId w:val="1441148870"/>
         </w:trPr>
         <w:tc>
           <w:tcPr>
@@ -3221,7 +3221,7 @@
       </w:tr>
       <w:tr>
         <w:trPr>
-          <w:divId w:val="408772037"/>
+          <w:divId w:val="1441148870"/>
         </w:trPr>
         <w:tc>
           <w:tcPr>
@@ -3348,14 +3348,14 @@
                 <w:sz w:val="20"/>
                 <w:szCs w:val="20"/>
               </w:rPr>
-              <w:t>352 (42.8%)</w:t>
+              <w:t>351 (42.8%)</w:t>
             </w:r>
           </w:p>
         </w:tc>
       </w:tr>
       <w:tr>
         <w:trPr>
-          <w:divId w:val="408772037"/>
+          <w:divId w:val="1441148870"/>
         </w:trPr>
         <w:tc>
           <w:tcPr>
@@ -3482,14 +3482,14 @@
                 <w:sz w:val="20"/>
                 <w:szCs w:val="20"/>
               </w:rPr>
-              <w:t>228 (27.7%)</w:t>
+              <w:t>228 (27.8%)</w:t>
             </w:r>
           </w:p>
         </w:tc>
       </w:tr>
       <w:tr>
         <w:trPr>
-          <w:divId w:val="408772037"/>
+          <w:divId w:val="1441148870"/>
         </w:trPr>
         <w:tc>
           <w:tcPr>
@@ -3616,14 +3616,14 @@
                 <w:sz w:val="20"/>
                 <w:szCs w:val="20"/>
               </w:rPr>
-              <w:t>112 (13.6%)</w:t>
+              <w:t>111 (13.5%)</w:t>
             </w:r>
           </w:p>
         </w:tc>
       </w:tr>
       <w:tr>
         <w:trPr>
-          <w:divId w:val="408772037"/>
+          <w:divId w:val="1441148870"/>
         </w:trPr>
         <w:tc>
           <w:tcPr>
@@ -3757,7 +3757,7 @@
       </w:tr>
       <w:tr>
         <w:trPr>
-          <w:divId w:val="408772037"/>
+          <w:divId w:val="1441148870"/>
         </w:trPr>
         <w:tc>
           <w:tcPr>
@@ -3893,7 +3893,7 @@
     <w:p>
       <w:pPr>
         <w:pStyle w:val="Ttulo3"/>
-        <w:divId w:val="691807660"/>
+        <w:divId w:val="405105006"/>
         <w:rPr>
           <w:rFonts w:eastAsia="Times New Roman"/>
           <w:lang w:val="es-ES"/>
@@ -3910,7 +3910,7 @@
     <w:p>
       <w:pPr>
         <w:jc w:val="center"/>
-        <w:divId w:val="53310526"/>
+        <w:divId w:val="1303001689"/>
         <w:rPr>
           <w:rFonts w:ascii="Outfit" w:eastAsia="Times New Roman" w:hAnsi="Outfit"/>
           <w:b/>
@@ -3939,7 +3939,7 @@
     <w:p>
       <w:pPr>
         <w:jc w:val="center"/>
-        <w:divId w:val="644897381"/>
+        <w:divId w:val="2073695296"/>
         <w:rPr>
           <w:rFonts w:ascii="Plus Jakarta Sans" w:eastAsia="Times New Roman" w:hAnsi="Plus Jakarta Sans"/>
           <w:lang w:val="es-ES"/>
@@ -4313,7 +4313,7 @@
     <w:p>
       <w:pPr>
         <w:spacing w:before="450" w:after="450"/>
-        <w:divId w:val="691807660"/>
+        <w:divId w:val="405105006"/>
         <w:rPr>
           <w:rFonts w:ascii="Plus Jakarta Sans" w:eastAsia="Times New Roman" w:hAnsi="Plus Jakarta Sans"/>
           <w:lang w:val="es-ES"/>
@@ -4325,7 +4325,7 @@
           <w:lang w:val="es-ES"/>
         </w:rPr>
         <w:lastRenderedPageBreak/>
-        <w:pict>
+        <w:pict w14:anchorId="3BAE97E9">
           <v:rect id="_x0000_i1029" style="width:0;height:.75pt" o:hralign="center" o:hrstd="t" o:hr="t" fillcolor="#a0a0a0" stroked="f"/>
         </w:pict>
       </w:r>
@@ -4333,7 +4333,7 @@
     <w:p>
       <w:pPr>
         <w:pStyle w:val="Ttulo3"/>
-        <w:divId w:val="691807660"/>
+        <w:divId w:val="405105006"/>
         <w:rPr>
           <w:rFonts w:eastAsia="Times New Roman"/>
           <w:lang w:val="es-ES"/>
@@ -4350,7 +4350,7 @@
     <w:p>
       <w:pPr>
         <w:pStyle w:val="NormalWeb"/>
-        <w:divId w:val="691807660"/>
+        <w:divId w:val="405105006"/>
         <w:rPr>
           <w:rFonts w:ascii="Plus Jakarta Sans" w:hAnsi="Plus Jakarta Sans"/>
           <w:lang w:val="es-ES"/>
@@ -4372,7 +4372,7 @@
         </w:numPr>
         <w:spacing w:before="100" w:beforeAutospacing="1" w:after="90"/>
         <w:ind w:left="1020"/>
-        <w:divId w:val="691807660"/>
+        <w:divId w:val="405105006"/>
         <w:rPr>
           <w:rFonts w:ascii="Plus Jakarta Sans" w:eastAsia="Times New Roman" w:hAnsi="Plus Jakarta Sans"/>
           <w:sz w:val="21"/>
@@ -4408,7 +4408,7 @@
         </w:numPr>
         <w:spacing w:before="100" w:beforeAutospacing="1" w:after="90"/>
         <w:ind w:left="1020"/>
-        <w:divId w:val="691807660"/>
+        <w:divId w:val="405105006"/>
         <w:rPr>
           <w:rFonts w:ascii="Plus Jakarta Sans" w:eastAsia="Times New Roman" w:hAnsi="Plus Jakarta Sans"/>
           <w:sz w:val="21"/>
@@ -4453,7 +4453,7 @@
         </w:numPr>
         <w:spacing w:before="100" w:beforeAutospacing="1" w:after="90"/>
         <w:ind w:left="1020"/>
-        <w:divId w:val="691807660"/>
+        <w:divId w:val="405105006"/>
         <w:rPr>
           <w:rFonts w:ascii="Plus Jakarta Sans" w:eastAsia="Times New Roman" w:hAnsi="Plus Jakarta Sans"/>
           <w:sz w:val="21"/>
@@ -4498,7 +4498,7 @@
         </w:numPr>
         <w:spacing w:before="100" w:beforeAutospacing="1" w:after="90"/>
         <w:ind w:left="1020"/>
-        <w:divId w:val="691807660"/>
+        <w:divId w:val="405105006"/>
         <w:rPr>
           <w:rFonts w:ascii="Plus Jakarta Sans" w:eastAsia="Times New Roman" w:hAnsi="Plus Jakarta Sans"/>
           <w:sz w:val="21"/>
@@ -4554,7 +4554,7 @@
       </w:tblGrid>
       <w:tr>
         <w:trPr>
-          <w:divId w:val="1019085786"/>
+          <w:divId w:val="810363425"/>
           <w:tblHeader/>
         </w:trPr>
         <w:tc>
@@ -4708,7 +4708,7 @@
       </w:tr>
       <w:tr>
         <w:trPr>
-          <w:divId w:val="1019085786"/>
+          <w:divId w:val="810363425"/>
         </w:trPr>
         <w:tc>
           <w:tcPr>
@@ -4834,7 +4834,7 @@
       </w:tr>
       <w:tr>
         <w:trPr>
-          <w:divId w:val="1019085786"/>
+          <w:divId w:val="810363425"/>
         </w:trPr>
         <w:tc>
           <w:tcPr>
@@ -4953,14 +4953,14 @@
                 <w:sz w:val="20"/>
                 <w:szCs w:val="20"/>
               </w:rPr>
-              <w:t>226 (27.5%)</w:t>
+              <w:t>226 (27.6%)</w:t>
             </w:r>
           </w:p>
         </w:tc>
       </w:tr>
       <w:tr>
         <w:trPr>
-          <w:divId w:val="1019085786"/>
+          <w:divId w:val="810363425"/>
         </w:trPr>
         <w:tc>
           <w:tcPr>
@@ -5079,14 +5079,14 @@
                 <w:sz w:val="20"/>
                 <w:szCs w:val="20"/>
               </w:rPr>
-              <w:t>385 (46.8%)</w:t>
+              <w:t>383 (46.7%)</w:t>
             </w:r>
           </w:p>
         </w:tc>
       </w:tr>
       <w:tr>
         <w:trPr>
-          <w:divId w:val="1019085786"/>
+          <w:divId w:val="810363425"/>
         </w:trPr>
         <w:tc>
           <w:tcPr>
@@ -5205,7 +5205,7 @@
                 <w:sz w:val="20"/>
                 <w:szCs w:val="20"/>
               </w:rPr>
-              <w:t>167 (20.3%)</w:t>
+              <w:t>167 (20.4%)</w:t>
             </w:r>
           </w:p>
         </w:tc>
@@ -5214,7 +5214,7 @@
     <w:p>
       <w:pPr>
         <w:spacing w:before="450" w:after="450"/>
-        <w:divId w:val="691807660"/>
+        <w:divId w:val="405105006"/>
         <w:rPr>
           <w:rFonts w:ascii="Plus Jakarta Sans" w:eastAsia="Times New Roman" w:hAnsi="Plus Jakarta Sans"/>
           <w:lang w:val="es-ES"/>
@@ -5225,7 +5225,7 @@
           <w:rFonts w:ascii="Plus Jakarta Sans" w:eastAsia="Times New Roman" w:hAnsi="Plus Jakarta Sans"/>
           <w:lang w:val="es-ES"/>
         </w:rPr>
-        <w:pict>
+        <w:pict w14:anchorId="3406A002">
           <v:rect id="_x0000_i1030" style="width:0;height:.75pt" o:hralign="center" o:hrstd="t" o:hr="t" fillcolor="#a0a0a0" stroked="f"/>
         </w:pict>
       </w:r>
@@ -5233,7 +5233,7 @@
     <w:p>
       <w:pPr>
         <w:pStyle w:val="Ttulo3"/>
-        <w:divId w:val="691807660"/>
+        <w:divId w:val="405105006"/>
         <w:rPr>
           <w:rFonts w:eastAsia="Times New Roman"/>
           <w:lang w:val="es-ES"/>
@@ -5250,7 +5250,7 @@
     <w:p>
       <w:pPr>
         <w:pStyle w:val="NormalWeb"/>
-        <w:divId w:val="691807660"/>
+        <w:divId w:val="405105006"/>
         <w:rPr>
           <w:rFonts w:ascii="Plus Jakarta Sans" w:hAnsi="Plus Jakarta Sans"/>
           <w:lang w:val="es-ES"/>
@@ -5274,7 +5274,7 @@
     <w:p>
       <w:pPr>
         <w:pStyle w:val="Ttulo4"/>
-        <w:divId w:val="691807660"/>
+        <w:divId w:val="405105006"/>
         <w:rPr>
           <w:rFonts w:eastAsia="Times New Roman"/>
           <w:lang w:val="es-ES"/>
@@ -5291,7 +5291,7 @@
     <w:p>
       <w:pPr>
         <w:jc w:val="center"/>
-        <w:divId w:val="1316228403"/>
+        <w:divId w:val="1136681157"/>
         <w:rPr>
           <w:rFonts w:ascii="Outfit" w:eastAsia="Times New Roman" w:hAnsi="Outfit"/>
           <w:b/>
@@ -5320,7 +5320,7 @@
     <w:p>
       <w:pPr>
         <w:jc w:val="center"/>
-        <w:divId w:val="2085493770"/>
+        <w:divId w:val="23946288"/>
         <w:rPr>
           <w:rFonts w:ascii="Plus Jakarta Sans" w:eastAsia="Times New Roman" w:hAnsi="Plus Jakarta Sans"/>
           <w:lang w:val="es-ES"/>
@@ -5499,7 +5499,7 @@
           <w:rFonts w:ascii="Plus Jakarta Sans" w:eastAsia="Times New Roman" w:hAnsi="Plus Jakarta Sans"/>
           <w:lang w:val="es-ES"/>
         </w:rPr>
-        <w:t>51.1% (4,073 cultivos</w:t>
+        <w:t>51.2% (4,073 cultivos</w:t>
       </w:r>
       <w:r>
         <w:rPr>
@@ -5583,7 +5583,7 @@
           <w:rFonts w:ascii="Plus Jakarta Sans" w:eastAsia="Times New Roman" w:hAnsi="Plus Jakarta Sans"/>
           <w:lang w:val="es-ES"/>
         </w:rPr>
-        <w:t>18.9% (1,505 cultivos</w:t>
+        <w:t>18.8% (1,498 cultivos</w:t>
       </w:r>
       <w:r>
         <w:rPr>
@@ -5603,7 +5603,7 @@
     <w:p>
       <w:pPr>
         <w:pStyle w:val="Ttulo4"/>
-        <w:divId w:val="691807660"/>
+        <w:divId w:val="405105006"/>
         <w:rPr>
           <w:rFonts w:eastAsia="Times New Roman"/>
           <w:lang w:val="es-ES"/>
@@ -5627,7 +5627,7 @@
     <w:p>
       <w:pPr>
         <w:jc w:val="center"/>
-        <w:divId w:val="815538186"/>
+        <w:divId w:val="669069100"/>
         <w:rPr>
           <w:rFonts w:ascii="Outfit" w:eastAsia="Times New Roman" w:hAnsi="Outfit"/>
           <w:b/>
@@ -5656,7 +5656,7 @@
     <w:p>
       <w:pPr>
         <w:jc w:val="center"/>
-        <w:divId w:val="893546260"/>
+        <w:divId w:val="838889342"/>
         <w:rPr>
           <w:rFonts w:ascii="Plus Jakarta Sans" w:eastAsia="Times New Roman" w:hAnsi="Plus Jakarta Sans"/>
           <w:lang w:val="es-ES"/>
@@ -5974,7 +5974,7 @@
     <w:p>
       <w:pPr>
         <w:pStyle w:val="Ttulo4"/>
-        <w:divId w:val="691807660"/>
+        <w:divId w:val="405105006"/>
         <w:rPr>
           <w:rFonts w:eastAsia="Times New Roman"/>
           <w:lang w:val="es-ES"/>
@@ -5992,7 +5992,7 @@
     <w:p>
       <w:pPr>
         <w:jc w:val="center"/>
-        <w:divId w:val="107086364"/>
+        <w:divId w:val="1392845973"/>
         <w:rPr>
           <w:rFonts w:ascii="Outfit" w:eastAsia="Times New Roman" w:hAnsi="Outfit"/>
           <w:b/>
@@ -6021,7 +6021,7 @@
     <w:p>
       <w:pPr>
         <w:jc w:val="center"/>
-        <w:divId w:val="105514769"/>
+        <w:divId w:val="1999455149"/>
         <w:rPr>
           <w:rFonts w:ascii="Plus Jakarta Sans" w:eastAsia="Times New Roman" w:hAnsi="Plus Jakarta Sans"/>
           <w:lang w:val="es-ES"/>
@@ -6325,7 +6325,7 @@
     <w:p>
       <w:pPr>
         <w:spacing w:before="450" w:after="450"/>
-        <w:divId w:val="691807660"/>
+        <w:divId w:val="405105006"/>
         <w:rPr>
           <w:rFonts w:ascii="Plus Jakarta Sans" w:eastAsia="Times New Roman" w:hAnsi="Plus Jakarta Sans"/>
           <w:lang w:val="es-ES"/>
@@ -6336,7 +6336,7 @@
           <w:rFonts w:ascii="Plus Jakarta Sans" w:eastAsia="Times New Roman" w:hAnsi="Plus Jakarta Sans"/>
           <w:lang w:val="es-ES"/>
         </w:rPr>
-        <w:pict>
+        <w:pict w14:anchorId="7D3548CF">
           <v:rect id="_x0000_i1031" style="width:0;height:.75pt" o:hralign="center" o:hrstd="t" o:hr="t" fillcolor="#a0a0a0" stroked="f"/>
         </w:pict>
       </w:r>
@@ -6344,7 +6344,7 @@
     <w:p>
       <w:pPr>
         <w:pStyle w:val="Ttulo3"/>
-        <w:divId w:val="691807660"/>
+        <w:divId w:val="405105006"/>
         <w:rPr>
           <w:rFonts w:eastAsia="Times New Roman"/>
           <w:lang w:val="es-ES"/>
@@ -6361,7 +6361,7 @@
     <w:p>
       <w:pPr>
         <w:pStyle w:val="NormalWeb"/>
-        <w:divId w:val="691807660"/>
+        <w:divId w:val="405105006"/>
         <w:rPr>
           <w:rFonts w:ascii="Plus Jakarta Sans" w:hAnsi="Plus Jakarta Sans"/>
           <w:lang w:val="es-ES"/>
@@ -6385,7 +6385,7 @@
     <w:p>
       <w:pPr>
         <w:pStyle w:val="Ttulo4"/>
-        <w:divId w:val="691807660"/>
+        <w:divId w:val="405105006"/>
         <w:rPr>
           <w:rFonts w:eastAsia="Times New Roman"/>
           <w:lang w:val="es-ES"/>
@@ -6402,7 +6402,7 @@
     <w:p>
       <w:pPr>
         <w:pStyle w:val="NormalWeb"/>
-        <w:divId w:val="691807660"/>
+        <w:divId w:val="405105006"/>
         <w:rPr>
           <w:rFonts w:ascii="Plus Jakarta Sans" w:hAnsi="Plus Jakarta Sans"/>
           <w:lang w:val="es-ES"/>
@@ -6433,7 +6433,7 @@
       </w:tblGrid>
       <w:tr>
         <w:trPr>
-          <w:divId w:val="1978991382"/>
+          <w:divId w:val="808520631"/>
           <w:tblHeader/>
         </w:trPr>
         <w:tc>
@@ -6513,7 +6513,7 @@
       </w:tr>
       <w:tr>
         <w:trPr>
-          <w:divId w:val="1978991382"/>
+          <w:divId w:val="808520631"/>
         </w:trPr>
         <w:tc>
           <w:tcPr>
@@ -6602,7 +6602,7 @@
     <w:p>
       <w:pPr>
         <w:pStyle w:val="Ttulo4"/>
-        <w:divId w:val="691807660"/>
+        <w:divId w:val="405105006"/>
         <w:rPr>
           <w:rFonts w:eastAsia="Times New Roman"/>
           <w:lang w:val="es-ES"/>
@@ -6619,7 +6619,7 @@
     <w:p>
       <w:pPr>
         <w:pStyle w:val="NormalWeb"/>
-        <w:divId w:val="691807660"/>
+        <w:divId w:val="405105006"/>
         <w:rPr>
           <w:rFonts w:ascii="Plus Jakarta Sans" w:hAnsi="Plus Jakarta Sans"/>
           <w:lang w:val="es-ES"/>
@@ -6650,7 +6650,7 @@
       </w:tblGrid>
       <w:tr>
         <w:trPr>
-          <w:divId w:val="1128862683"/>
+          <w:divId w:val="617566023"/>
           <w:tblHeader/>
         </w:trPr>
         <w:tc>
@@ -6730,7 +6730,7 @@
       </w:tr>
       <w:tr>
         <w:trPr>
-          <w:divId w:val="1128862683"/>
+          <w:divId w:val="617566023"/>
         </w:trPr>
         <w:tc>
           <w:tcPr>
@@ -6828,7 +6828,7 @@
     <w:p>
       <w:pPr>
         <w:pStyle w:val="Ttulo4"/>
-        <w:divId w:val="691807660"/>
+        <w:divId w:val="405105006"/>
         <w:rPr>
           <w:rFonts w:eastAsia="Times New Roman"/>
           <w:lang w:val="es-ES"/>
@@ -6845,7 +6845,7 @@
     <w:p>
       <w:pPr>
         <w:pStyle w:val="NormalWeb"/>
-        <w:divId w:val="691807660"/>
+        <w:divId w:val="405105006"/>
         <w:rPr>
           <w:rFonts w:ascii="Plus Jakarta Sans" w:hAnsi="Plus Jakarta Sans"/>
           <w:lang w:val="es-ES"/>
@@ -6876,7 +6876,7 @@
       </w:tblGrid>
       <w:tr>
         <w:trPr>
-          <w:divId w:val="658189039"/>
+          <w:divId w:val="1752465391"/>
           <w:tblHeader/>
         </w:trPr>
         <w:tc>
@@ -6957,7 +6957,7 @@
       </w:tr>
       <w:tr>
         <w:trPr>
-          <w:divId w:val="658189039"/>
+          <w:divId w:val="1752465391"/>
         </w:trPr>
         <w:tc>
           <w:tcPr>
@@ -7046,7 +7046,7 @@
     <w:p>
       <w:pPr>
         <w:spacing w:before="450" w:after="450"/>
-        <w:divId w:val="691807660"/>
+        <w:divId w:val="405105006"/>
         <w:rPr>
           <w:rFonts w:ascii="Plus Jakarta Sans" w:eastAsia="Times New Roman" w:hAnsi="Plus Jakarta Sans"/>
           <w:lang w:val="es-ES"/>
@@ -7057,7 +7057,7 @@
           <w:rFonts w:ascii="Plus Jakarta Sans" w:eastAsia="Times New Roman" w:hAnsi="Plus Jakarta Sans"/>
           <w:lang w:val="es-ES"/>
         </w:rPr>
-        <w:pict>
+        <w:pict w14:anchorId="00373679">
           <v:rect id="_x0000_i1032" style="width:0;height:.75pt" o:hralign="center" o:hrstd="t" o:hr="t" fillcolor="#a0a0a0" stroked="f"/>
         </w:pict>
       </w:r>
@@ -7065,7 +7065,7 @@
     <w:p>
       <w:pPr>
         <w:pStyle w:val="Ttulo2"/>
-        <w:divId w:val="691807660"/>
+        <w:divId w:val="405105006"/>
         <w:rPr>
           <w:rFonts w:eastAsia="Times New Roman"/>
           <w:lang w:val="es-ES"/>
@@ -7082,7 +7082,7 @@
     <w:p>
       <w:pPr>
         <w:pStyle w:val="NormalWeb"/>
-        <w:divId w:val="691807660"/>
+        <w:divId w:val="405105006"/>
         <w:rPr>
           <w:rFonts w:ascii="Plus Jakarta Sans" w:hAnsi="Plus Jakarta Sans"/>
           <w:lang w:val="es-ES"/>
@@ -7099,7 +7099,7 @@
     <w:p>
       <w:pPr>
         <w:pStyle w:val="Ttulo3"/>
-        <w:divId w:val="691807660"/>
+        <w:divId w:val="405105006"/>
         <w:rPr>
           <w:rFonts w:eastAsia="Times New Roman"/>
           <w:lang w:val="es-ES"/>
@@ -7116,7 +7116,7 @@
     <w:p>
       <w:pPr>
         <w:pStyle w:val="NormalWeb"/>
-        <w:divId w:val="691807660"/>
+        <w:divId w:val="405105006"/>
         <w:rPr>
           <w:rFonts w:ascii="Plus Jakarta Sans" w:hAnsi="Plus Jakarta Sans"/>
           <w:lang w:val="es-ES"/>
@@ -7149,7 +7149,7 @@
       </w:tblGrid>
       <w:tr>
         <w:trPr>
-          <w:divId w:val="386951841"/>
+          <w:divId w:val="468401452"/>
           <w:tblHeader/>
         </w:trPr>
         <w:tc>
@@ -7314,7 +7314,7 @@
       </w:tr>
       <w:tr>
         <w:trPr>
-          <w:divId w:val="386951841"/>
+          <w:divId w:val="468401452"/>
         </w:trPr>
         <w:tc>
           <w:tcPr>
@@ -7433,14 +7433,14 @@
                 <w:sz w:val="20"/>
                 <w:szCs w:val="20"/>
               </w:rPr>
-              <w:t>588 (71.5%)</w:t>
+              <w:t>587 (71.6%)</w:t>
             </w:r>
           </w:p>
         </w:tc>
       </w:tr>
       <w:tr>
         <w:trPr>
-          <w:divId w:val="386951841"/>
+          <w:divId w:val="468401452"/>
         </w:trPr>
         <w:tc>
           <w:tcPr>
@@ -7566,7 +7566,7 @@
       </w:tr>
       <w:tr>
         <w:trPr>
-          <w:divId w:val="386951841"/>
+          <w:divId w:val="468401452"/>
         </w:trPr>
         <w:tc>
           <w:tcPr>
@@ -7685,14 +7685,14 @@
                 <w:sz w:val="20"/>
                 <w:szCs w:val="20"/>
               </w:rPr>
-              <w:t>60 (7.3%)</w:t>
+              <w:t>59 (7.2%)</w:t>
             </w:r>
           </w:p>
         </w:tc>
       </w:tr>
       <w:tr>
         <w:trPr>
-          <w:divId w:val="386951841"/>
+          <w:divId w:val="468401452"/>
         </w:trPr>
         <w:tc>
           <w:tcPr>
@@ -7820,7 +7820,7 @@
     <w:p>
       <w:pPr>
         <w:pStyle w:val="Ttulo3"/>
-        <w:divId w:val="691807660"/>
+        <w:divId w:val="405105006"/>
         <w:rPr>
           <w:rFonts w:eastAsia="Times New Roman"/>
           <w:lang w:val="es-ES"/>
@@ -7838,7 +7838,7 @@
       <w:pPr>
         <w:spacing w:before="375" w:after="225"/>
         <w:jc w:val="center"/>
-        <w:divId w:val="1393037839"/>
+        <w:divId w:val="1399673425"/>
         <w:rPr>
           <w:rFonts w:ascii="Outfit" w:eastAsia="Times New Roman" w:hAnsi="Outfit"/>
           <w:b/>
@@ -7868,7 +7868,7 @@
       <w:pPr>
         <w:spacing w:after="375"/>
         <w:jc w:val="center"/>
-        <w:divId w:val="1285384729"/>
+        <w:divId w:val="2091460443"/>
         <w:rPr>
           <w:rFonts w:ascii="Plus Jakarta Sans" w:eastAsia="Times New Roman" w:hAnsi="Plus Jakarta Sans"/>
           <w:lang w:val="es-ES"/>
@@ -8235,7 +8235,7 @@
     <w:p>
       <w:pPr>
         <w:pStyle w:val="Ttulo3"/>
-        <w:divId w:val="691807660"/>
+        <w:divId w:val="405105006"/>
         <w:rPr>
           <w:rFonts w:eastAsia="Times New Roman"/>
           <w:lang w:val="es-ES"/>
@@ -8259,7 +8259,7 @@
     <w:p>
       <w:pPr>
         <w:pStyle w:val="NormalWeb"/>
-        <w:divId w:val="691807660"/>
+        <w:divId w:val="405105006"/>
         <w:rPr>
           <w:rFonts w:ascii="Plus Jakarta Sans" w:hAnsi="Plus Jakarta Sans"/>
           <w:lang w:val="es-ES"/>
@@ -8281,7 +8281,7 @@
         </w:numPr>
         <w:spacing w:before="100" w:beforeAutospacing="1" w:after="90"/>
         <w:ind w:left="1020"/>
-        <w:divId w:val="691807660"/>
+        <w:divId w:val="405105006"/>
         <w:rPr>
           <w:rFonts w:ascii="Plus Jakarta Sans" w:eastAsia="Times New Roman" w:hAnsi="Plus Jakarta Sans"/>
           <w:sz w:val="21"/>
@@ -8317,7 +8317,7 @@
         </w:numPr>
         <w:spacing w:before="100" w:beforeAutospacing="1" w:after="90"/>
         <w:ind w:left="1020"/>
-        <w:divId w:val="691807660"/>
+        <w:divId w:val="405105006"/>
         <w:rPr>
           <w:rFonts w:ascii="Plus Jakarta Sans" w:eastAsia="Times New Roman" w:hAnsi="Plus Jakarta Sans"/>
           <w:sz w:val="21"/>
@@ -8362,7 +8362,7 @@
         </w:numPr>
         <w:spacing w:before="100" w:beforeAutospacing="1" w:after="90"/>
         <w:ind w:left="1020"/>
-        <w:divId w:val="691807660"/>
+        <w:divId w:val="405105006"/>
         <w:rPr>
           <w:rFonts w:ascii="Plus Jakarta Sans" w:eastAsia="Times New Roman" w:hAnsi="Plus Jakarta Sans"/>
           <w:sz w:val="21"/>
@@ -8416,7 +8416,7 @@
         </w:numPr>
         <w:spacing w:before="100" w:beforeAutospacing="1" w:after="90"/>
         <w:ind w:left="1020"/>
-        <w:divId w:val="691807660"/>
+        <w:divId w:val="405105006"/>
         <w:rPr>
           <w:rFonts w:ascii="Plus Jakarta Sans" w:eastAsia="Times New Roman" w:hAnsi="Plus Jakarta Sans"/>
           <w:sz w:val="21"/>
@@ -8461,7 +8461,7 @@
         </w:numPr>
         <w:spacing w:before="100" w:beforeAutospacing="1" w:after="90"/>
         <w:ind w:left="1020"/>
-        <w:divId w:val="691807660"/>
+        <w:divId w:val="405105006"/>
         <w:rPr>
           <w:rFonts w:ascii="Plus Jakarta Sans" w:eastAsia="Times New Roman" w:hAnsi="Plus Jakarta Sans"/>
           <w:sz w:val="21"/>
@@ -8497,7 +8497,7 @@
         </w:numPr>
         <w:spacing w:before="100" w:beforeAutospacing="1" w:after="90"/>
         <w:ind w:left="1020"/>
-        <w:divId w:val="691807660"/>
+        <w:divId w:val="405105006"/>
         <w:rPr>
           <w:rFonts w:ascii="Plus Jakarta Sans" w:eastAsia="Times New Roman" w:hAnsi="Plus Jakarta Sans"/>
           <w:sz w:val="21"/>
@@ -8542,7 +8542,7 @@
         </w:numPr>
         <w:spacing w:before="100" w:beforeAutospacing="1" w:after="90"/>
         <w:ind w:left="1020"/>
-        <w:divId w:val="691807660"/>
+        <w:divId w:val="405105006"/>
         <w:rPr>
           <w:rFonts w:ascii="Plus Jakarta Sans" w:eastAsia="Times New Roman" w:hAnsi="Plus Jakarta Sans"/>
           <w:sz w:val="21"/>
@@ -8587,7 +8587,7 @@
         </w:numPr>
         <w:spacing w:before="100" w:beforeAutospacing="1" w:after="90"/>
         <w:ind w:left="1020"/>
-        <w:divId w:val="691807660"/>
+        <w:divId w:val="405105006"/>
         <w:rPr>
           <w:rFonts w:ascii="Plus Jakarta Sans" w:eastAsia="Times New Roman" w:hAnsi="Plus Jakarta Sans"/>
           <w:sz w:val="21"/>
@@ -8621,7 +8621,7 @@
           <w:szCs w:val="21"/>
           <w:lang w:val="es-ES"/>
         </w:rPr>
-        <w:t xml:space="preserve"> promedio (en 598 predios).</w:t>
+        <w:t xml:space="preserve"> promedio (en 596 predios).</w:t>
       </w:r>
     </w:p>
     <w:p>
@@ -8632,7 +8632,7 @@
         </w:numPr>
         <w:spacing w:before="100" w:beforeAutospacing="1" w:after="90"/>
         <w:ind w:left="1020"/>
-        <w:divId w:val="691807660"/>
+        <w:divId w:val="405105006"/>
         <w:rPr>
           <w:rFonts w:ascii="Plus Jakarta Sans" w:eastAsia="Times New Roman" w:hAnsi="Plus Jakarta Sans"/>
           <w:sz w:val="21"/>
@@ -8668,7 +8668,7 @@
         </w:numPr>
         <w:spacing w:before="100" w:beforeAutospacing="1" w:after="90"/>
         <w:ind w:left="1020"/>
-        <w:divId w:val="691807660"/>
+        <w:divId w:val="405105006"/>
         <w:rPr>
           <w:rFonts w:ascii="Plus Jakarta Sans" w:eastAsia="Times New Roman" w:hAnsi="Plus Jakarta Sans"/>
           <w:sz w:val="21"/>
@@ -8722,7 +8722,7 @@
         </w:numPr>
         <w:spacing w:before="100" w:beforeAutospacing="1" w:after="90"/>
         <w:ind w:left="1020"/>
-        <w:divId w:val="691807660"/>
+        <w:divId w:val="405105006"/>
         <w:rPr>
           <w:rFonts w:ascii="Plus Jakarta Sans" w:eastAsia="Times New Roman" w:hAnsi="Plus Jakarta Sans"/>
           <w:sz w:val="21"/>
@@ -8767,7 +8767,7 @@
         </w:numPr>
         <w:spacing w:before="100" w:beforeAutospacing="1" w:after="90"/>
         <w:ind w:left="1020"/>
-        <w:divId w:val="691807660"/>
+        <w:divId w:val="405105006"/>
         <w:rPr>
           <w:rFonts w:ascii="Plus Jakarta Sans" w:eastAsia="Times New Roman" w:hAnsi="Plus Jakarta Sans"/>
           <w:sz w:val="21"/>
@@ -8807,7 +8807,7 @@
     <w:p>
       <w:pPr>
         <w:pStyle w:val="Ttulo3"/>
-        <w:divId w:val="691807660"/>
+        <w:divId w:val="405105006"/>
         <w:rPr>
           <w:rFonts w:eastAsia="Times New Roman"/>
           <w:lang w:val="es-ES"/>
@@ -8825,7 +8825,7 @@
       <w:pPr>
         <w:spacing w:before="375" w:after="225"/>
         <w:jc w:val="center"/>
-        <w:divId w:val="1909420181"/>
+        <w:divId w:val="50659640"/>
         <w:rPr>
           <w:rFonts w:ascii="Outfit" w:eastAsia="Times New Roman" w:hAnsi="Outfit"/>
           <w:b/>
@@ -8855,7 +8855,7 @@
       <w:pPr>
         <w:spacing w:after="375"/>
         <w:jc w:val="center"/>
-        <w:divId w:val="1023897308"/>
+        <w:divId w:val="1103299843"/>
         <w:rPr>
           <w:rFonts w:ascii="Plus Jakarta Sans" w:eastAsia="Times New Roman" w:hAnsi="Plus Jakarta Sans"/>
           <w:lang w:val="es-ES"/>
@@ -9145,7 +9145,7 @@
     <w:p>
       <w:pPr>
         <w:spacing w:before="450" w:after="450"/>
-        <w:divId w:val="691807660"/>
+        <w:divId w:val="405105006"/>
         <w:rPr>
           <w:rFonts w:ascii="Plus Jakarta Sans" w:eastAsia="Times New Roman" w:hAnsi="Plus Jakarta Sans"/>
           <w:lang w:val="es-ES"/>
@@ -9156,7 +9156,7 @@
           <w:rFonts w:ascii="Plus Jakarta Sans" w:eastAsia="Times New Roman" w:hAnsi="Plus Jakarta Sans"/>
           <w:lang w:val="es-ES"/>
         </w:rPr>
-        <w:pict>
+        <w:pict w14:anchorId="61316A71">
           <v:rect id="_x0000_i1033" style="width:0;height:.75pt" o:hralign="center" o:hrstd="t" o:hr="t" fillcolor="#a0a0a0" stroked="f"/>
         </w:pict>
       </w:r>
@@ -9164,7 +9164,7 @@
     <w:p>
       <w:pPr>
         <w:pStyle w:val="Ttulo2"/>
-        <w:divId w:val="691807660"/>
+        <w:divId w:val="405105006"/>
         <w:rPr>
           <w:rFonts w:eastAsia="Times New Roman"/>
           <w:lang w:val="es-ES"/>
@@ -9181,7 +9181,7 @@
     <w:p>
       <w:pPr>
         <w:pStyle w:val="NormalWeb"/>
-        <w:divId w:val="691807660"/>
+        <w:divId w:val="405105006"/>
         <w:rPr>
           <w:rFonts w:ascii="Plus Jakarta Sans" w:hAnsi="Plus Jakarta Sans"/>
           <w:lang w:val="es-ES"/>
@@ -9198,7 +9198,7 @@
     <w:p>
       <w:pPr>
         <w:pStyle w:val="NormalWeb"/>
-        <w:divId w:val="691807660"/>
+        <w:divId w:val="405105006"/>
         <w:rPr>
           <w:rFonts w:ascii="Plus Jakarta Sans" w:hAnsi="Plus Jakarta Sans"/>
           <w:lang w:val="es-ES"/>
@@ -9260,7 +9260,7 @@
     <w:p>
       <w:pPr>
         <w:pStyle w:val="NormalWeb"/>
-        <w:divId w:val="691807660"/>
+        <w:divId w:val="405105006"/>
         <w:rPr>
           <w:rFonts w:ascii="Plus Jakarta Sans" w:hAnsi="Plus Jakarta Sans"/>
           <w:lang w:val="es-ES"/>
@@ -9322,7 +9322,7 @@
     <w:p>
       <w:pPr>
         <w:pStyle w:val="NormalWeb"/>
-        <w:divId w:val="691807660"/>
+        <w:divId w:val="405105006"/>
         <w:rPr>
           <w:rFonts w:ascii="Plus Jakarta Sans" w:hAnsi="Plus Jakarta Sans"/>
           <w:lang w:val="es-ES"/>
@@ -9383,7 +9383,7 @@
     <w:p>
       <w:pPr>
         <w:pStyle w:val="NormalWeb"/>
-        <w:divId w:val="691807660"/>
+        <w:divId w:val="405105006"/>
         <w:rPr>
           <w:rFonts w:ascii="Plus Jakarta Sans" w:hAnsi="Plus Jakarta Sans"/>
           <w:lang w:val="es-ES"/>
@@ -9437,7 +9437,7 @@
     <w:p>
       <w:pPr>
         <w:spacing w:before="450" w:after="450"/>
-        <w:divId w:val="691807660"/>
+        <w:divId w:val="405105006"/>
         <w:rPr>
           <w:rFonts w:ascii="Plus Jakarta Sans" w:eastAsia="Times New Roman" w:hAnsi="Plus Jakarta Sans"/>
           <w:lang w:val="es-ES"/>
@@ -9448,7 +9448,7 @@
           <w:rFonts w:ascii="Plus Jakarta Sans" w:eastAsia="Times New Roman" w:hAnsi="Plus Jakarta Sans"/>
           <w:lang w:val="es-ES"/>
         </w:rPr>
-        <w:pict>
+        <w:pict w14:anchorId="3FCD4A84">
           <v:rect id="_x0000_i1034" style="width:0;height:.75pt" o:hralign="center" o:hrstd="t" o:hr="t" fillcolor="#a0a0a0" stroked="f"/>
         </w:pict>
       </w:r>
@@ -9456,7 +9456,7 @@
     <w:p>
       <w:pPr>
         <w:pStyle w:val="Ttulo2"/>
-        <w:divId w:val="691807660"/>
+        <w:divId w:val="405105006"/>
         <w:rPr>
           <w:rFonts w:eastAsia="Times New Roman"/>
           <w:lang w:val="es-ES"/>
@@ -9473,7 +9473,7 @@
     <w:p>
       <w:pPr>
         <w:pStyle w:val="NormalWeb"/>
-        <w:divId w:val="691807660"/>
+        <w:divId w:val="405105006"/>
         <w:rPr>
           <w:rFonts w:ascii="Plus Jakarta Sans" w:hAnsi="Plus Jakarta Sans"/>
           <w:lang w:val="es-ES"/>
@@ -9499,7 +9499,7 @@
           <w:rFonts w:ascii="Plus Jakarta Sans" w:hAnsi="Plus Jakarta Sans"/>
           <w:lang w:val="es-ES"/>
         </w:rPr>
-        <w:t>4,175 familias</w:t>
+        <w:t>4,173 familias</w:t>
       </w:r>
       <w:r>
         <w:rPr>
@@ -9512,7 +9512,7 @@
     <w:p>
       <w:pPr>
         <w:pStyle w:val="Ttulo3"/>
-        <w:divId w:val="691807660"/>
+        <w:divId w:val="405105006"/>
         <w:rPr>
           <w:rFonts w:eastAsia="Times New Roman"/>
           <w:lang w:val="es-ES"/>
@@ -9546,7 +9546,7 @@
       </w:tblGrid>
       <w:tr>
         <w:trPr>
-          <w:divId w:val="1619874450"/>
+          <w:divId w:val="1387879358"/>
           <w:tblHeader/>
         </w:trPr>
         <w:tc>
@@ -9737,7 +9737,7 @@
       </w:tr>
       <w:tr>
         <w:trPr>
-          <w:divId w:val="1619874450"/>
+          <w:divId w:val="1387879358"/>
         </w:trPr>
         <w:tc>
           <w:tcPr>
@@ -9893,7 +9893,7 @@
       </w:tr>
       <w:tr>
         <w:trPr>
-          <w:divId w:val="1619874450"/>
+          <w:divId w:val="1387879358"/>
         </w:trPr>
         <w:tc>
           <w:tcPr>
@@ -10049,7 +10049,7 @@
       </w:tr>
       <w:tr>
         <w:trPr>
-          <w:divId w:val="1619874450"/>
+          <w:divId w:val="1387879358"/>
         </w:trPr>
         <w:tc>
           <w:tcPr>
@@ -10108,67 +10108,67 @@
                 <w:sz w:val="20"/>
                 <w:szCs w:val="20"/>
               </w:rPr>
-              <w:t>822</w:t>
-            </w:r>
-          </w:p>
-        </w:tc>
-        <w:tc>
-          <w:tcPr>
-            <w:tcW w:w="0" w:type="auto"/>
-            <w:tcMar>
-              <w:top w:w="150" w:type="dxa"/>
-              <w:left w:w="210" w:type="dxa"/>
-              <w:bottom w:w="150" w:type="dxa"/>
-              <w:right w:w="210" w:type="dxa"/>
-            </w:tcMar>
-            <w:vAlign w:val="center"/>
-            <w:hideMark/>
-          </w:tcPr>
-          <w:p>
-            <w:pPr>
-              <w:rPr>
-                <w:rFonts w:ascii="Plus Jakarta Sans" w:eastAsia="Times New Roman" w:hAnsi="Plus Jakarta Sans"/>
-                <w:sz w:val="20"/>
-                <w:szCs w:val="20"/>
-              </w:rPr>
-            </w:pPr>
-            <w:r>
-              <w:rPr>
-                <w:rFonts w:ascii="Plus Jakarta Sans" w:eastAsia="Times New Roman" w:hAnsi="Plus Jakarta Sans"/>
-                <w:sz w:val="20"/>
-                <w:szCs w:val="20"/>
-              </w:rPr>
-              <w:t>3,175.53 ha</w:t>
-            </w:r>
-          </w:p>
-        </w:tc>
-        <w:tc>
-          <w:tcPr>
-            <w:tcW w:w="0" w:type="auto"/>
-            <w:tcMar>
-              <w:top w:w="150" w:type="dxa"/>
-              <w:left w:w="210" w:type="dxa"/>
-              <w:bottom w:w="150" w:type="dxa"/>
-              <w:right w:w="210" w:type="dxa"/>
-            </w:tcMar>
-            <w:vAlign w:val="center"/>
-            <w:hideMark/>
-          </w:tcPr>
-          <w:p>
-            <w:pPr>
-              <w:rPr>
-                <w:rFonts w:ascii="Plus Jakarta Sans" w:eastAsia="Times New Roman" w:hAnsi="Plus Jakarta Sans"/>
-                <w:sz w:val="20"/>
-                <w:szCs w:val="20"/>
-              </w:rPr>
-            </w:pPr>
-            <w:r>
-              <w:rPr>
-                <w:rFonts w:ascii="Plus Jakarta Sans" w:eastAsia="Times New Roman" w:hAnsi="Plus Jakarta Sans"/>
-                <w:sz w:val="20"/>
-                <w:szCs w:val="20"/>
-              </w:rPr>
-              <w:t>1,553.36 ha</w:t>
+              <w:t>820</w:t>
+            </w:r>
+          </w:p>
+        </w:tc>
+        <w:tc>
+          <w:tcPr>
+            <w:tcW w:w="0" w:type="auto"/>
+            <w:tcMar>
+              <w:top w:w="150" w:type="dxa"/>
+              <w:left w:w="210" w:type="dxa"/>
+              <w:bottom w:w="150" w:type="dxa"/>
+              <w:right w:w="210" w:type="dxa"/>
+            </w:tcMar>
+            <w:vAlign w:val="center"/>
+            <w:hideMark/>
+          </w:tcPr>
+          <w:p>
+            <w:pPr>
+              <w:rPr>
+                <w:rFonts w:ascii="Plus Jakarta Sans" w:eastAsia="Times New Roman" w:hAnsi="Plus Jakarta Sans"/>
+                <w:sz w:val="20"/>
+                <w:szCs w:val="20"/>
+              </w:rPr>
+            </w:pPr>
+            <w:r>
+              <w:rPr>
+                <w:rFonts w:ascii="Plus Jakarta Sans" w:eastAsia="Times New Roman" w:hAnsi="Plus Jakarta Sans"/>
+                <w:sz w:val="20"/>
+                <w:szCs w:val="20"/>
+              </w:rPr>
+              <w:t>3,173.34 ha</w:t>
+            </w:r>
+          </w:p>
+        </w:tc>
+        <w:tc>
+          <w:tcPr>
+            <w:tcW w:w="0" w:type="auto"/>
+            <w:tcMar>
+              <w:top w:w="150" w:type="dxa"/>
+              <w:left w:w="210" w:type="dxa"/>
+              <w:bottom w:w="150" w:type="dxa"/>
+              <w:right w:w="210" w:type="dxa"/>
+            </w:tcMar>
+            <w:vAlign w:val="center"/>
+            <w:hideMark/>
+          </w:tcPr>
+          <w:p>
+            <w:pPr>
+              <w:rPr>
+                <w:rFonts w:ascii="Plus Jakarta Sans" w:eastAsia="Times New Roman" w:hAnsi="Plus Jakarta Sans"/>
+                <w:sz w:val="20"/>
+                <w:szCs w:val="20"/>
+              </w:rPr>
+            </w:pPr>
+            <w:r>
+              <w:rPr>
+                <w:rFonts w:ascii="Plus Jakarta Sans" w:eastAsia="Times New Roman" w:hAnsi="Plus Jakarta Sans"/>
+                <w:sz w:val="20"/>
+                <w:szCs w:val="20"/>
+              </w:rPr>
+              <w:t>1,551.17 ha</w:t>
             </w:r>
           </w:p>
         </w:tc>
@@ -10205,7 +10205,7 @@
       </w:tr>
       <w:tr>
         <w:trPr>
-          <w:divId w:val="1619874450"/>
+          <w:divId w:val="1387879358"/>
         </w:trPr>
         <w:tc>
           <w:tcPr>
@@ -10265,7 +10265,7 @@
                 <w:sz w:val="20"/>
                 <w:szCs w:val="20"/>
               </w:rPr>
-              <w:t>4,175</w:t>
+              <w:t>4,173</w:t>
             </w:r>
           </w:p>
         </w:tc>
@@ -10296,7 +10296,7 @@
                 <w:sz w:val="20"/>
                 <w:szCs w:val="20"/>
               </w:rPr>
-              <w:t>10,419.74 ha</w:t>
+              <w:t>10,417.55 ha</w:t>
             </w:r>
           </w:p>
         </w:tc>
@@ -10327,7 +10327,7 @@
                 <w:sz w:val="20"/>
                 <w:szCs w:val="20"/>
               </w:rPr>
-              <w:t>7,002.90 ha</w:t>
+              <w:t>7,000.71 ha</w:t>
             </w:r>
           </w:p>
         </w:tc>
@@ -10367,7 +10367,7 @@
     <w:p>
       <w:pPr>
         <w:pStyle w:val="Ttulo3"/>
-        <w:divId w:val="691807660"/>
+        <w:divId w:val="405105006"/>
         <w:rPr>
           <w:rFonts w:eastAsia="Times New Roman"/>
           <w:lang w:val="es-ES"/>
@@ -10401,7 +10401,7 @@
       </w:tblGrid>
       <w:tr>
         <w:trPr>
-          <w:divId w:val="1425150999"/>
+          <w:divId w:val="1561667667"/>
           <w:tblHeader/>
         </w:trPr>
         <w:tc>
@@ -10592,7 +10592,7 @@
       </w:tr>
       <w:tr>
         <w:trPr>
-          <w:divId w:val="1425150999"/>
+          <w:divId w:val="1561667667"/>
         </w:trPr>
         <w:tc>
           <w:tcPr>
@@ -10711,7 +10711,7 @@
                 <w:sz w:val="20"/>
                 <w:szCs w:val="20"/>
               </w:rPr>
-              <w:t>619</w:t>
+              <w:t>617</w:t>
             </w:r>
           </w:p>
         </w:tc>
@@ -10742,14 +10742,14 @@
                 <w:sz w:val="20"/>
                 <w:szCs w:val="20"/>
               </w:rPr>
-              <w:t>3,047</w:t>
+              <w:t>3,045</w:t>
             </w:r>
           </w:p>
         </w:tc>
       </w:tr>
       <w:tr>
         <w:trPr>
-          <w:divId w:val="1425150999"/>
+          <w:divId w:val="1561667667"/>
         </w:trPr>
         <w:tc>
           <w:tcPr>
@@ -10908,7 +10908,7 @@
     <w:p>
       <w:pPr>
         <w:pStyle w:val="Ttulo3"/>
-        <w:divId w:val="691807660"/>
+        <w:divId w:val="405105006"/>
         <w:rPr>
           <w:rFonts w:eastAsia="Times New Roman"/>
           <w:lang w:val="es-ES"/>
@@ -10943,7 +10943,7 @@
       </w:tblGrid>
       <w:tr>
         <w:trPr>
-          <w:divId w:val="1212108729"/>
+          <w:divId w:val="584874067"/>
           <w:tblHeader/>
         </w:trPr>
         <w:tc>
@@ -11171,7 +11171,7 @@
       </w:tr>
       <w:tr>
         <w:trPr>
-          <w:divId w:val="1212108729"/>
+          <w:divId w:val="584874067"/>
         </w:trPr>
         <w:tc>
           <w:tcPr>
@@ -11298,7 +11298,7 @@
                 <w:sz w:val="20"/>
                 <w:szCs w:val="20"/>
               </w:rPr>
-              <w:t>697</w:t>
+              <w:t>695</w:t>
             </w:r>
           </w:p>
         </w:tc>
@@ -11329,7 +11329,7 @@
                 <w:sz w:val="20"/>
                 <w:szCs w:val="20"/>
               </w:rPr>
-              <w:t>3,635</w:t>
+              <w:t>3,633</w:t>
             </w:r>
           </w:p>
         </w:tc>
@@ -11367,7 +11367,7 @@
       </w:tr>
       <w:tr>
         <w:trPr>
-          <w:divId w:val="1212108729"/>
+          <w:divId w:val="584874067"/>
         </w:trPr>
         <w:tc>
           <w:tcPr>
@@ -11552,7 +11552,7 @@
       </w:tr>
       <w:tr>
         <w:trPr>
-          <w:divId w:val="1212108729"/>
+          <w:divId w:val="584874067"/>
         </w:trPr>
         <w:tc>
           <w:tcPr>
@@ -11679,7 +11679,7 @@
                 <w:sz w:val="20"/>
                 <w:szCs w:val="20"/>
               </w:rPr>
-              <w:t>822</w:t>
+              <w:t>820</w:t>
             </w:r>
           </w:p>
         </w:tc>
@@ -11710,7 +11710,7 @@
                 <w:sz w:val="20"/>
                 <w:szCs w:val="20"/>
               </w:rPr>
-              <w:t>4,156</w:t>
+              <w:t>4,154</w:t>
             </w:r>
           </w:p>
         </w:tc>
@@ -11750,7 +11750,7 @@
     <w:p>
       <w:pPr>
         <w:pStyle w:val="Ttulo4"/>
-        <w:divId w:val="691807660"/>
+        <w:divId w:val="405105006"/>
         <w:rPr>
           <w:rFonts w:eastAsia="Times New Roman"/>
           <w:lang w:val="es-ES"/>
@@ -11768,7 +11768,7 @@
       <w:pPr>
         <w:spacing w:before="375" w:after="225"/>
         <w:jc w:val="center"/>
-        <w:divId w:val="442040353"/>
+        <w:divId w:val="638806010"/>
         <w:rPr>
           <w:rFonts w:ascii="Outfit" w:eastAsia="Times New Roman" w:hAnsi="Outfit"/>
           <w:b/>
@@ -11798,7 +11798,7 @@
       <w:pPr>
         <w:spacing w:after="375"/>
         <w:jc w:val="center"/>
-        <w:divId w:val="1726178887"/>
+        <w:divId w:val="57288442"/>
         <w:rPr>
           <w:rFonts w:ascii="Plus Jakarta Sans" w:eastAsia="Times New Roman" w:hAnsi="Plus Jakarta Sans"/>
           <w:lang w:val="es-ES"/>
@@ -12193,7 +12193,7 @@
     <w:p>
       <w:pPr>
         <w:pStyle w:val="Ttulo3"/>
-        <w:divId w:val="691807660"/>
+        <w:divId w:val="405105006"/>
         <w:rPr>
           <w:rFonts w:eastAsia="Times New Roman"/>
           <w:lang w:val="es-ES"/>
@@ -12225,7 +12225,7 @@
       </w:tblGrid>
       <w:tr>
         <w:trPr>
-          <w:divId w:val="701442411"/>
+          <w:divId w:val="406223200"/>
           <w:tblHeader/>
         </w:trPr>
         <w:tc>
@@ -12342,7 +12342,7 @@
       </w:tr>
       <w:tr>
         <w:trPr>
-          <w:divId w:val="701442411"/>
+          <w:divId w:val="406223200"/>
         </w:trPr>
         <w:tc>
           <w:tcPr>
@@ -12438,7 +12438,7 @@
       </w:tr>
       <w:tr>
         <w:trPr>
-          <w:divId w:val="701442411"/>
+          <w:divId w:val="406223200"/>
         </w:trPr>
         <w:tc>
           <w:tcPr>
@@ -12534,7 +12534,7 @@
       </w:tr>
       <w:tr>
         <w:trPr>
-          <w:divId w:val="701442411"/>
+          <w:divId w:val="406223200"/>
         </w:trPr>
         <w:tc>
           <w:tcPr>
@@ -12623,7 +12623,7 @@
                 <w:sz w:val="20"/>
                 <w:szCs w:val="20"/>
               </w:rPr>
-              <w:t>819</w:t>
+              <w:t>817</w:t>
             </w:r>
           </w:p>
         </w:tc>
@@ -12632,7 +12632,7 @@
     <w:p>
       <w:pPr>
         <w:pStyle w:val="NormalWeb"/>
-        <w:divId w:val="691807660"/>
+        <w:divId w:val="405105006"/>
         <w:rPr>
           <w:rFonts w:ascii="Plus Jakarta Sans" w:hAnsi="Plus Jakarta Sans"/>
           <w:lang w:val="es-ES"/>
@@ -12657,7 +12657,7 @@
     <w:p>
       <w:pPr>
         <w:pStyle w:val="Ttulo3"/>
-        <w:divId w:val="691807660"/>
+        <w:divId w:val="405105006"/>
         <w:rPr>
           <w:rFonts w:eastAsia="Times New Roman"/>
           <w:lang w:val="es-ES"/>
@@ -12699,7 +12699,7 @@
       </w:tblGrid>
       <w:tr>
         <w:trPr>
-          <w:divId w:val="656880881"/>
+          <w:divId w:val="153960148"/>
           <w:tblHeader/>
         </w:trPr>
         <w:tc>
@@ -12927,7 +12927,7 @@
       </w:tr>
       <w:tr>
         <w:trPr>
-          <w:divId w:val="656880881"/>
+          <w:divId w:val="153960148"/>
         </w:trPr>
         <w:tc>
           <w:tcPr>
@@ -13113,7 +13113,7 @@
       </w:tr>
       <w:tr>
         <w:trPr>
-          <w:divId w:val="656880881"/>
+          <w:divId w:val="153960148"/>
         </w:trPr>
         <w:tc>
           <w:tcPr>
@@ -13299,7 +13299,7 @@
       </w:tr>
       <w:tr>
         <w:trPr>
-          <w:divId w:val="656880881"/>
+          <w:divId w:val="153960148"/>
         </w:trPr>
         <w:tc>
           <w:tcPr>
@@ -13358,97 +13358,97 @@
                 <w:sz w:val="20"/>
                 <w:szCs w:val="20"/>
               </w:rPr>
-              <w:t>822</w:t>
-            </w:r>
-          </w:p>
-        </w:tc>
-        <w:tc>
-          <w:tcPr>
-            <w:tcW w:w="0" w:type="auto"/>
-            <w:tcMar>
-              <w:top w:w="150" w:type="dxa"/>
-              <w:left w:w="210" w:type="dxa"/>
-              <w:bottom w:w="150" w:type="dxa"/>
-              <w:right w:w="210" w:type="dxa"/>
-            </w:tcMar>
-            <w:vAlign w:val="center"/>
-            <w:hideMark/>
-          </w:tcPr>
-          <w:p>
-            <w:pPr>
-              <w:rPr>
-                <w:rFonts w:ascii="Plus Jakarta Sans" w:eastAsia="Times New Roman" w:hAnsi="Plus Jakarta Sans"/>
-                <w:sz w:val="20"/>
-                <w:szCs w:val="20"/>
-              </w:rPr>
-            </w:pPr>
-            <w:r>
-              <w:rPr>
-                <w:rFonts w:ascii="Plus Jakarta Sans" w:eastAsia="Times New Roman" w:hAnsi="Plus Jakarta Sans"/>
-                <w:sz w:val="20"/>
-                <w:szCs w:val="20"/>
-              </w:rPr>
-              <w:t>1,437</w:t>
-            </w:r>
-          </w:p>
-        </w:tc>
-        <w:tc>
-          <w:tcPr>
-            <w:tcW w:w="0" w:type="auto"/>
-            <w:tcMar>
-              <w:top w:w="150" w:type="dxa"/>
-              <w:left w:w="210" w:type="dxa"/>
-              <w:bottom w:w="150" w:type="dxa"/>
-              <w:right w:w="210" w:type="dxa"/>
-            </w:tcMar>
-            <w:vAlign w:val="center"/>
-            <w:hideMark/>
-          </w:tcPr>
-          <w:p>
-            <w:pPr>
-              <w:rPr>
-                <w:rFonts w:ascii="Plus Jakarta Sans" w:eastAsia="Times New Roman" w:hAnsi="Plus Jakarta Sans"/>
-                <w:sz w:val="20"/>
-                <w:szCs w:val="20"/>
-              </w:rPr>
-            </w:pPr>
-            <w:r>
-              <w:rPr>
-                <w:rFonts w:ascii="Plus Jakarta Sans" w:eastAsia="Times New Roman" w:hAnsi="Plus Jakarta Sans"/>
-                <w:sz w:val="20"/>
-                <w:szCs w:val="20"/>
-              </w:rPr>
-              <w:t>1,282</w:t>
-            </w:r>
-          </w:p>
-        </w:tc>
-        <w:tc>
-          <w:tcPr>
-            <w:tcW w:w="0" w:type="auto"/>
-            <w:tcMar>
-              <w:top w:w="150" w:type="dxa"/>
-              <w:left w:w="210" w:type="dxa"/>
-              <w:bottom w:w="150" w:type="dxa"/>
-              <w:right w:w="210" w:type="dxa"/>
-            </w:tcMar>
-            <w:vAlign w:val="center"/>
-            <w:hideMark/>
-          </w:tcPr>
-          <w:p>
-            <w:pPr>
-              <w:rPr>
-                <w:rFonts w:ascii="Plus Jakarta Sans" w:eastAsia="Times New Roman" w:hAnsi="Plus Jakarta Sans"/>
-                <w:sz w:val="20"/>
-                <w:szCs w:val="20"/>
-              </w:rPr>
-            </w:pPr>
-            <w:r>
-              <w:rPr>
-                <w:rFonts w:ascii="Plus Jakarta Sans" w:eastAsia="Times New Roman" w:hAnsi="Plus Jakarta Sans"/>
-                <w:sz w:val="20"/>
-                <w:szCs w:val="20"/>
-              </w:rPr>
-              <w:t>2,719</w:t>
+              <w:t>820</w:t>
+            </w:r>
+          </w:p>
+        </w:tc>
+        <w:tc>
+          <w:tcPr>
+            <w:tcW w:w="0" w:type="auto"/>
+            <w:tcMar>
+              <w:top w:w="150" w:type="dxa"/>
+              <w:left w:w="210" w:type="dxa"/>
+              <w:bottom w:w="150" w:type="dxa"/>
+              <w:right w:w="210" w:type="dxa"/>
+            </w:tcMar>
+            <w:vAlign w:val="center"/>
+            <w:hideMark/>
+          </w:tcPr>
+          <w:p>
+            <w:pPr>
+              <w:rPr>
+                <w:rFonts w:ascii="Plus Jakarta Sans" w:eastAsia="Times New Roman" w:hAnsi="Plus Jakarta Sans"/>
+                <w:sz w:val="20"/>
+                <w:szCs w:val="20"/>
+              </w:rPr>
+            </w:pPr>
+            <w:r>
+              <w:rPr>
+                <w:rFonts w:ascii="Plus Jakarta Sans" w:eastAsia="Times New Roman" w:hAnsi="Plus Jakarta Sans"/>
+                <w:sz w:val="20"/>
+                <w:szCs w:val="20"/>
+              </w:rPr>
+              <w:t>1,435</w:t>
+            </w:r>
+          </w:p>
+        </w:tc>
+        <w:tc>
+          <w:tcPr>
+            <w:tcW w:w="0" w:type="auto"/>
+            <w:tcMar>
+              <w:top w:w="150" w:type="dxa"/>
+              <w:left w:w="210" w:type="dxa"/>
+              <w:bottom w:w="150" w:type="dxa"/>
+              <w:right w:w="210" w:type="dxa"/>
+            </w:tcMar>
+            <w:vAlign w:val="center"/>
+            <w:hideMark/>
+          </w:tcPr>
+          <w:p>
+            <w:pPr>
+              <w:rPr>
+                <w:rFonts w:ascii="Plus Jakarta Sans" w:eastAsia="Times New Roman" w:hAnsi="Plus Jakarta Sans"/>
+                <w:sz w:val="20"/>
+                <w:szCs w:val="20"/>
+              </w:rPr>
+            </w:pPr>
+            <w:r>
+              <w:rPr>
+                <w:rFonts w:ascii="Plus Jakarta Sans" w:eastAsia="Times New Roman" w:hAnsi="Plus Jakarta Sans"/>
+                <w:sz w:val="20"/>
+                <w:szCs w:val="20"/>
+              </w:rPr>
+              <w:t>1,277</w:t>
+            </w:r>
+          </w:p>
+        </w:tc>
+        <w:tc>
+          <w:tcPr>
+            <w:tcW w:w="0" w:type="auto"/>
+            <w:tcMar>
+              <w:top w:w="150" w:type="dxa"/>
+              <w:left w:w="210" w:type="dxa"/>
+              <w:bottom w:w="150" w:type="dxa"/>
+              <w:right w:w="210" w:type="dxa"/>
+            </w:tcMar>
+            <w:vAlign w:val="center"/>
+            <w:hideMark/>
+          </w:tcPr>
+          <w:p>
+            <w:pPr>
+              <w:rPr>
+                <w:rFonts w:ascii="Plus Jakarta Sans" w:eastAsia="Times New Roman" w:hAnsi="Plus Jakarta Sans"/>
+                <w:sz w:val="20"/>
+                <w:szCs w:val="20"/>
+              </w:rPr>
+            </w:pPr>
+            <w:r>
+              <w:rPr>
+                <w:rFonts w:ascii="Plus Jakarta Sans" w:eastAsia="Times New Roman" w:hAnsi="Plus Jakarta Sans"/>
+                <w:sz w:val="20"/>
+                <w:szCs w:val="20"/>
+              </w:rPr>
+              <w:t>2,712</w:t>
             </w:r>
           </w:p>
         </w:tc>
@@ -13485,7 +13485,7 @@
       </w:tr>
       <w:tr>
         <w:trPr>
-          <w:divId w:val="656880881"/>
+          <w:divId w:val="153960148"/>
         </w:trPr>
         <w:tc>
           <w:tcPr>
@@ -13545,7 +13545,7 @@
                 <w:sz w:val="20"/>
                 <w:szCs w:val="20"/>
               </w:rPr>
-              <w:t>4,175</w:t>
+              <w:t>4,173</w:t>
             </w:r>
           </w:p>
         </w:tc>
@@ -13576,7 +13576,7 @@
                 <w:sz w:val="20"/>
                 <w:szCs w:val="20"/>
               </w:rPr>
-              <w:t>6,098</w:t>
+              <w:t>6,096</w:t>
             </w:r>
           </w:p>
         </w:tc>
@@ -13607,7 +13607,7 @@
                 <w:sz w:val="20"/>
                 <w:szCs w:val="20"/>
               </w:rPr>
-              <w:t>5,838</w:t>
+              <w:t>5,833</w:t>
             </w:r>
           </w:p>
         </w:tc>
@@ -13638,7 +13638,7 @@
                 <w:sz w:val="20"/>
                 <w:szCs w:val="20"/>
               </w:rPr>
-              <w:t>11,936</w:t>
+              <w:t>11,929</w:t>
             </w:r>
           </w:p>
         </w:tc>
@@ -13678,7 +13678,7 @@
     <w:p>
       <w:pPr>
         <w:pStyle w:val="NormalWeb"/>
-        <w:divId w:val="691807660"/>
+        <w:divId w:val="405105006"/>
         <w:rPr>
           <w:rFonts w:ascii="Plus Jakarta Sans" w:hAnsi="Plus Jakarta Sans"/>
           <w:lang w:val="es-ES"/>
@@ -13704,7 +13704,7 @@
           <w:rFonts w:ascii="Plus Jakarta Sans" w:hAnsi="Plus Jakarta Sans"/>
           <w:lang w:val="es-ES"/>
         </w:rPr>
-        <w:t xml:space="preserve"> 4,175 titulares + 11,936 hijos = </w:t>
+        <w:t xml:space="preserve"> 4,173 titulares + 11,929 hijos = </w:t>
       </w:r>
       <w:r>
         <w:rPr>
@@ -13712,7 +13712,7 @@
           <w:rFonts w:ascii="Plus Jakarta Sans" w:hAnsi="Plus Jakarta Sans"/>
           <w:lang w:val="es-ES"/>
         </w:rPr>
-        <w:t>~16,111 personas</w:t>
+        <w:t>~16,102 personas</w:t>
       </w:r>
       <w:r>
         <w:rPr>
@@ -13725,7 +13725,7 @@
     <w:p>
       <w:pPr>
         <w:pStyle w:val="Ttulo3"/>
-        <w:divId w:val="691807660"/>
+        <w:divId w:val="405105006"/>
         <w:rPr>
           <w:rFonts w:eastAsia="Times New Roman"/>
           <w:lang w:val="es-ES"/>
@@ -13760,7 +13760,7 @@
       </w:tblGrid>
       <w:tr>
         <w:trPr>
-          <w:divId w:val="340546434"/>
+          <w:divId w:val="428503108"/>
           <w:tblHeader/>
         </w:trPr>
         <w:tc>
@@ -13988,7 +13988,7 @@
       </w:tr>
       <w:tr>
         <w:trPr>
-          <w:divId w:val="340546434"/>
+          <w:divId w:val="428503108"/>
         </w:trPr>
         <w:tc>
           <w:tcPr>
@@ -14182,7 +14182,7 @@
       </w:tr>
       <w:tr>
         <w:trPr>
-          <w:divId w:val="340546434"/>
+          <w:divId w:val="428503108"/>
         </w:trPr>
         <w:tc>
           <w:tcPr>
@@ -14378,7 +14378,7 @@
     <w:p>
       <w:pPr>
         <w:pStyle w:val="Ttulo4"/>
-        <w:divId w:val="691807660"/>
+        <w:divId w:val="405105006"/>
         <w:rPr>
           <w:rFonts w:eastAsia="Times New Roman"/>
           <w:lang w:val="es-ES"/>
@@ -14396,7 +14396,7 @@
       <w:pPr>
         <w:spacing w:before="375" w:after="225"/>
         <w:jc w:val="center"/>
-        <w:divId w:val="1396388531"/>
+        <w:divId w:val="2044473563"/>
         <w:rPr>
           <w:rFonts w:ascii="Outfit" w:eastAsia="Times New Roman" w:hAnsi="Outfit"/>
           <w:b/>
@@ -14426,7 +14426,7 @@
       <w:pPr>
         <w:spacing w:after="375"/>
         <w:jc w:val="center"/>
-        <w:divId w:val="571086301"/>
+        <w:divId w:val="1236353305"/>
         <w:rPr>
           <w:rFonts w:ascii="Plus Jakarta Sans" w:eastAsia="Times New Roman" w:hAnsi="Plus Jakarta Sans"/>
           <w:lang w:val="es-ES"/>
@@ -14814,7 +14814,7 @@
     <w:p>
       <w:pPr>
         <w:pStyle w:val="Ttulo3"/>
-        <w:divId w:val="691807660"/>
+        <w:divId w:val="405105006"/>
         <w:rPr>
           <w:rFonts w:eastAsia="Times New Roman"/>
           <w:lang w:val="es-ES"/>
@@ -14848,7 +14848,7 @@
       </w:tblGrid>
       <w:tr>
         <w:trPr>
-          <w:divId w:val="43600748"/>
+          <w:divId w:val="593977300"/>
           <w:tblHeader/>
         </w:trPr>
         <w:tc>
@@ -15039,7 +15039,7 @@
       </w:tr>
       <w:tr>
         <w:trPr>
-          <w:divId w:val="43600748"/>
+          <w:divId w:val="593977300"/>
         </w:trPr>
         <w:tc>
           <w:tcPr>
@@ -15195,7 +15195,7 @@
       </w:tr>
       <w:tr>
         <w:trPr>
-          <w:divId w:val="43600748"/>
+          <w:divId w:val="593977300"/>
         </w:trPr>
         <w:tc>
           <w:tcPr>
@@ -15351,7 +15351,7 @@
       </w:tr>
       <w:tr>
         <w:trPr>
-          <w:divId w:val="43600748"/>
+          <w:divId w:val="593977300"/>
         </w:trPr>
         <w:tc>
           <w:tcPr>
@@ -15470,44 +15470,44 @@
                 <w:sz w:val="20"/>
                 <w:szCs w:val="20"/>
               </w:rPr>
-              <w:t>143</w:t>
-            </w:r>
-          </w:p>
-        </w:tc>
-        <w:tc>
-          <w:tcPr>
-            <w:tcW w:w="0" w:type="auto"/>
-            <w:tcMar>
-              <w:top w:w="150" w:type="dxa"/>
-              <w:left w:w="210" w:type="dxa"/>
-              <w:bottom w:w="150" w:type="dxa"/>
-              <w:right w:w="210" w:type="dxa"/>
-            </w:tcMar>
-            <w:vAlign w:val="center"/>
-            <w:hideMark/>
-          </w:tcPr>
-          <w:p>
-            <w:pPr>
-              <w:rPr>
-                <w:rFonts w:ascii="Plus Jakarta Sans" w:eastAsia="Times New Roman" w:hAnsi="Plus Jakarta Sans"/>
-                <w:sz w:val="20"/>
-                <w:szCs w:val="20"/>
-              </w:rPr>
-            </w:pPr>
-            <w:r>
-              <w:rPr>
-                <w:rFonts w:ascii="Plus Jakarta Sans" w:eastAsia="Times New Roman" w:hAnsi="Plus Jakarta Sans"/>
-                <w:sz w:val="20"/>
-                <w:szCs w:val="20"/>
-              </w:rPr>
-              <w:t>242</w:t>
+              <w:t>142</w:t>
+            </w:r>
+          </w:p>
+        </w:tc>
+        <w:tc>
+          <w:tcPr>
+            <w:tcW w:w="0" w:type="auto"/>
+            <w:tcMar>
+              <w:top w:w="150" w:type="dxa"/>
+              <w:left w:w="210" w:type="dxa"/>
+              <w:bottom w:w="150" w:type="dxa"/>
+              <w:right w:w="210" w:type="dxa"/>
+            </w:tcMar>
+            <w:vAlign w:val="center"/>
+            <w:hideMark/>
+          </w:tcPr>
+          <w:p>
+            <w:pPr>
+              <w:rPr>
+                <w:rFonts w:ascii="Plus Jakarta Sans" w:eastAsia="Times New Roman" w:hAnsi="Plus Jakarta Sans"/>
+                <w:sz w:val="20"/>
+                <w:szCs w:val="20"/>
+              </w:rPr>
+            </w:pPr>
+            <w:r>
+              <w:rPr>
+                <w:rFonts w:ascii="Plus Jakarta Sans" w:eastAsia="Times New Roman" w:hAnsi="Plus Jakarta Sans"/>
+                <w:sz w:val="20"/>
+                <w:szCs w:val="20"/>
+              </w:rPr>
+              <w:t>241</w:t>
             </w:r>
           </w:p>
         </w:tc>
       </w:tr>
       <w:tr>
         <w:trPr>
-          <w:divId w:val="43600748"/>
+          <w:divId w:val="593977300"/>
         </w:trPr>
         <w:tc>
           <w:tcPr>
@@ -15663,7 +15663,7 @@
       </w:tr>
       <w:tr>
         <w:trPr>
-          <w:divId w:val="43600748"/>
+          <w:divId w:val="593977300"/>
         </w:trPr>
         <w:tc>
           <w:tcPr>
@@ -15819,7 +15819,7 @@
       </w:tr>
       <w:tr>
         <w:trPr>
-          <w:divId w:val="43600748"/>
+          <w:divId w:val="593977300"/>
         </w:trPr>
         <w:tc>
           <w:tcPr>
@@ -15977,7 +15977,7 @@
     <w:p>
       <w:pPr>
         <w:pStyle w:val="Ttulo3"/>
-        <w:divId w:val="691807660"/>
+        <w:divId w:val="405105006"/>
         <w:rPr>
           <w:rFonts w:eastAsia="Times New Roman"/>
           <w:lang w:val="es-ES"/>
@@ -16011,7 +16011,7 @@
       </w:tblGrid>
       <w:tr>
         <w:trPr>
-          <w:divId w:val="2111970162"/>
+          <w:divId w:val="254021730"/>
           <w:tblHeader/>
         </w:trPr>
         <w:tc>
@@ -16202,7 +16202,7 @@
       </w:tr>
       <w:tr>
         <w:trPr>
-          <w:divId w:val="2111970162"/>
+          <w:divId w:val="254021730"/>
         </w:trPr>
         <w:tc>
           <w:tcPr>
@@ -16321,44 +16321,44 @@
                 <w:sz w:val="20"/>
                 <w:szCs w:val="20"/>
               </w:rPr>
-              <w:t>437</w:t>
-            </w:r>
-          </w:p>
-        </w:tc>
-        <w:tc>
-          <w:tcPr>
-            <w:tcW w:w="0" w:type="auto"/>
-            <w:tcMar>
-              <w:top w:w="150" w:type="dxa"/>
-              <w:left w:w="210" w:type="dxa"/>
-              <w:bottom w:w="150" w:type="dxa"/>
-              <w:right w:w="210" w:type="dxa"/>
-            </w:tcMar>
-            <w:vAlign w:val="center"/>
-            <w:hideMark/>
-          </w:tcPr>
-          <w:p>
-            <w:pPr>
-              <w:rPr>
-                <w:rFonts w:ascii="Plus Jakarta Sans" w:eastAsia="Times New Roman" w:hAnsi="Plus Jakarta Sans"/>
-                <w:sz w:val="20"/>
-                <w:szCs w:val="20"/>
-              </w:rPr>
-            </w:pPr>
-            <w:r>
-              <w:rPr>
-                <w:rFonts w:ascii="Plus Jakarta Sans" w:eastAsia="Times New Roman" w:hAnsi="Plus Jakarta Sans"/>
-                <w:sz w:val="20"/>
-                <w:szCs w:val="20"/>
-              </w:rPr>
-              <w:t>1,923</w:t>
+              <w:t>435</w:t>
+            </w:r>
+          </w:p>
+        </w:tc>
+        <w:tc>
+          <w:tcPr>
+            <w:tcW w:w="0" w:type="auto"/>
+            <w:tcMar>
+              <w:top w:w="150" w:type="dxa"/>
+              <w:left w:w="210" w:type="dxa"/>
+              <w:bottom w:w="150" w:type="dxa"/>
+              <w:right w:w="210" w:type="dxa"/>
+            </w:tcMar>
+            <w:vAlign w:val="center"/>
+            <w:hideMark/>
+          </w:tcPr>
+          <w:p>
+            <w:pPr>
+              <w:rPr>
+                <w:rFonts w:ascii="Plus Jakarta Sans" w:eastAsia="Times New Roman" w:hAnsi="Plus Jakarta Sans"/>
+                <w:sz w:val="20"/>
+                <w:szCs w:val="20"/>
+              </w:rPr>
+            </w:pPr>
+            <w:r>
+              <w:rPr>
+                <w:rFonts w:ascii="Plus Jakarta Sans" w:eastAsia="Times New Roman" w:hAnsi="Plus Jakarta Sans"/>
+                <w:sz w:val="20"/>
+                <w:szCs w:val="20"/>
+              </w:rPr>
+              <w:t>1,921</w:t>
             </w:r>
           </w:p>
         </w:tc>
       </w:tr>
       <w:tr>
         <w:trPr>
-          <w:divId w:val="2111970162"/>
+          <w:divId w:val="254021730"/>
         </w:trPr>
         <w:tc>
           <w:tcPr>
@@ -16514,7 +16514,7 @@
       </w:tr>
       <w:tr>
         <w:trPr>
-          <w:divId w:val="2111970162"/>
+          <w:divId w:val="254021730"/>
         </w:trPr>
         <w:tc>
           <w:tcPr>
@@ -16670,7 +16670,7 @@
       </w:tr>
       <w:tr>
         <w:trPr>
-          <w:divId w:val="2111970162"/>
+          <w:divId w:val="254021730"/>
         </w:trPr>
         <w:tc>
           <w:tcPr>
@@ -16826,7 +16826,7 @@
       </w:tr>
       <w:tr>
         <w:trPr>
-          <w:divId w:val="2111970162"/>
+          <w:divId w:val="254021730"/>
         </w:trPr>
         <w:tc>
           <w:tcPr>
@@ -16984,7 +16984,7 @@
     <w:p>
       <w:pPr>
         <w:pStyle w:val="Ttulo3"/>
-        <w:divId w:val="691807660"/>
+        <w:divId w:val="405105006"/>
         <w:rPr>
           <w:rFonts w:eastAsia="Times New Roman"/>
           <w:lang w:val="es-ES"/>
@@ -17018,7 +17018,7 @@
       </w:tblGrid>
       <w:tr>
         <w:trPr>
-          <w:divId w:val="603612651"/>
+          <w:divId w:val="1138647899"/>
           <w:tblHeader/>
         </w:trPr>
         <w:tc>
@@ -17209,7 +17209,7 @@
       </w:tr>
       <w:tr>
         <w:trPr>
-          <w:divId w:val="603612651"/>
+          <w:divId w:val="1138647899"/>
         </w:trPr>
         <w:tc>
           <w:tcPr>
@@ -17328,44 +17328,44 @@
                 <w:sz w:val="20"/>
                 <w:szCs w:val="20"/>
               </w:rPr>
-              <w:t>617</w:t>
-            </w:r>
-          </w:p>
-        </w:tc>
-        <w:tc>
-          <w:tcPr>
-            <w:tcW w:w="0" w:type="auto"/>
-            <w:tcMar>
-              <w:top w:w="150" w:type="dxa"/>
-              <w:left w:w="210" w:type="dxa"/>
-              <w:bottom w:w="150" w:type="dxa"/>
-              <w:right w:w="210" w:type="dxa"/>
-            </w:tcMar>
-            <w:vAlign w:val="center"/>
-            <w:hideMark/>
-          </w:tcPr>
-          <w:p>
-            <w:pPr>
-              <w:rPr>
-                <w:rFonts w:ascii="Plus Jakarta Sans" w:eastAsia="Times New Roman" w:hAnsi="Plus Jakarta Sans"/>
-                <w:sz w:val="20"/>
-                <w:szCs w:val="20"/>
-              </w:rPr>
-            </w:pPr>
-            <w:r>
-              <w:rPr>
-                <w:rFonts w:ascii="Plus Jakarta Sans" w:eastAsia="Times New Roman" w:hAnsi="Plus Jakarta Sans"/>
-                <w:sz w:val="20"/>
-                <w:szCs w:val="20"/>
-              </w:rPr>
-              <w:t>2,888</w:t>
+              <w:t>615</w:t>
+            </w:r>
+          </w:p>
+        </w:tc>
+        <w:tc>
+          <w:tcPr>
+            <w:tcW w:w="0" w:type="auto"/>
+            <w:tcMar>
+              <w:top w:w="150" w:type="dxa"/>
+              <w:left w:w="210" w:type="dxa"/>
+              <w:bottom w:w="150" w:type="dxa"/>
+              <w:right w:w="210" w:type="dxa"/>
+            </w:tcMar>
+            <w:vAlign w:val="center"/>
+            <w:hideMark/>
+          </w:tcPr>
+          <w:p>
+            <w:pPr>
+              <w:rPr>
+                <w:rFonts w:ascii="Plus Jakarta Sans" w:eastAsia="Times New Roman" w:hAnsi="Plus Jakarta Sans"/>
+                <w:sz w:val="20"/>
+                <w:szCs w:val="20"/>
+              </w:rPr>
+            </w:pPr>
+            <w:r>
+              <w:rPr>
+                <w:rFonts w:ascii="Plus Jakarta Sans" w:eastAsia="Times New Roman" w:hAnsi="Plus Jakarta Sans"/>
+                <w:sz w:val="20"/>
+                <w:szCs w:val="20"/>
+              </w:rPr>
+              <w:t>2,886</w:t>
             </w:r>
           </w:p>
         </w:tc>
       </w:tr>
       <w:tr>
         <w:trPr>
-          <w:divId w:val="603612651"/>
+          <w:divId w:val="1138647899"/>
         </w:trPr>
         <w:tc>
           <w:tcPr>
@@ -17523,7 +17523,7 @@
     <w:p>
       <w:pPr>
         <w:pStyle w:val="Ttulo4"/>
-        <w:divId w:val="691807660"/>
+        <w:divId w:val="405105006"/>
         <w:rPr>
           <w:rFonts w:eastAsia="Times New Roman"/>
           <w:lang w:val="es-ES"/>
@@ -17541,7 +17541,7 @@
       <w:pPr>
         <w:spacing w:before="375" w:after="225"/>
         <w:jc w:val="center"/>
-        <w:divId w:val="526336032"/>
+        <w:divId w:val="1287203001"/>
         <w:rPr>
           <w:rFonts w:ascii="Outfit" w:eastAsia="Times New Roman" w:hAnsi="Outfit"/>
           <w:b/>
@@ -17571,7 +17571,7 @@
       <w:pPr>
         <w:spacing w:after="375"/>
         <w:jc w:val="center"/>
-        <w:divId w:val="440613112"/>
+        <w:divId w:val="1261915259"/>
         <w:rPr>
           <w:rFonts w:ascii="Plus Jakarta Sans" w:eastAsia="Times New Roman" w:hAnsi="Plus Jakarta Sans"/>
           <w:lang w:val="es-ES"/>
@@ -17897,7 +17897,7 @@
           <w:rFonts w:ascii="Plus Jakarta Sans" w:eastAsia="Times New Roman" w:hAnsi="Plus Jakarta Sans"/>
           <w:lang w:val="es-ES"/>
         </w:rPr>
-        <w:t>24</w:t>
+        <w:t>25</w:t>
       </w:r>
       <w:r>
         <w:rPr>
@@ -17959,7 +17959,7 @@
     <w:p>
       <w:pPr>
         <w:spacing w:before="450" w:after="450"/>
-        <w:divId w:val="691807660"/>
+        <w:divId w:val="405105006"/>
         <w:rPr>
           <w:rFonts w:ascii="Plus Jakarta Sans" w:eastAsia="Times New Roman" w:hAnsi="Plus Jakarta Sans"/>
           <w:lang w:val="es-ES"/>
@@ -17970,7 +17970,7 @@
           <w:rFonts w:ascii="Plus Jakarta Sans" w:eastAsia="Times New Roman" w:hAnsi="Plus Jakarta Sans"/>
           <w:lang w:val="es-ES"/>
         </w:rPr>
-        <w:pict>
+        <w:pict w14:anchorId="41B08D88">
           <v:rect id="_x0000_i1035" style="width:0;height:.75pt" o:hralign="center" o:hrstd="t" o:hr="t" fillcolor="#a0a0a0" stroked="f"/>
         </w:pict>
       </w:r>
@@ -17978,7 +17978,7 @@
     <w:p>
       <w:pPr>
         <w:spacing w:before="450" w:after="450"/>
-        <w:divId w:val="691807660"/>
+        <w:divId w:val="405105006"/>
         <w:rPr>
           <w:rFonts w:ascii="Plus Jakarta Sans" w:eastAsia="Times New Roman" w:hAnsi="Plus Jakarta Sans"/>
           <w:lang w:val="es-ES"/>
@@ -17989,7 +17989,7 @@
           <w:rFonts w:ascii="Plus Jakarta Sans" w:eastAsia="Times New Roman" w:hAnsi="Plus Jakarta Sans"/>
           <w:lang w:val="es-ES"/>
         </w:rPr>
-        <w:pict>
+        <w:pict w14:anchorId="2D32839B">
           <v:rect id="_x0000_i1036" style="width:0;height:.75pt" o:hralign="center" o:hrstd="t" o:hr="t" fillcolor="#a0a0a0" stroked="f"/>
         </w:pict>
       </w:r>
@@ -17997,7 +17997,7 @@
     <w:p>
       <w:pPr>
         <w:pStyle w:val="NormalWeb"/>
-        <w:divId w:val="691807660"/>
+        <w:divId w:val="405105006"/>
         <w:rPr>
           <w:rFonts w:ascii="Plus Jakarta Sans" w:hAnsi="Plus Jakarta Sans"/>
           <w:lang w:val="es-ES"/>
@@ -18030,7 +18030,7 @@
           <w:rFonts w:ascii="Plus Jakarta Sans" w:hAnsi="Plus Jakarta Sans"/>
           <w:lang w:val="es-ES"/>
         </w:rPr>
-        <w:pict/>
+        <w:pict w14:anchorId="05EFAC0D"/>
       </w:r>
     </w:p>
     <w:sectPr>
@@ -18046,9 +18046,9 @@
 <file path=word/numbering.xml><?xml version="1.0" encoding="utf-8"?>
 <w:numbering xmlns:wpc="http://schemas.microsoft.com/office/word/2010/wordprocessingCanvas" xmlns:cx="http://schemas.microsoft.com/office/drawing/2014/chartex" xmlns:cx1="http://schemas.microsoft.com/office/drawing/2015/9/8/chartex" xmlns:cx2="http://schemas.microsoft.com/office/drawing/2015/10/21/chartex" xmlns:cx3="http://schemas.microsoft.com/office/drawing/2016/5/9/chartex" xmlns:cx4="http://schemas.microsoft.com/office/drawing/2016/5/10/chartex" xmlns:cx5="http://schemas.microsoft.com/office/drawing/2016/5/11/chartex" xmlns:cx6="http://schemas.microsoft.com/office/drawing/2016/5/12/chartex" xmlns:cx7="http://schemas.microsoft.com/office/drawing/2016/5/13/chartex" xmlns:cx8="http://schemas.microsoft.com/office/drawing/2016/5/14/chartex" xmlns:mc="http://schemas.openxmlformats.org/markup-compatibility/2006" xmlns:aink="http://schemas.microsoft.com/office/drawing/2016/ink" xmlns:am3d="http://schemas.microsoft.com/office/drawing/2017/model3d" xmlns:o="urn:schemas-microsoft-com:office:office" xmlns:r="http://schemas.openxmlformats.org/officeDocument/2006/relationships" xmlns:m="http://schemas.openxmlformats.org/officeDocument/2006/math" xmlns:v="urn:schemas-microsoft-com:vml" xmlns:wp14="http://schemas.microsoft.com/office/word/2010/wordprocessingDrawing" xmlns:wp="http://schemas.openxmlformats.org/drawingml/2006/wordprocessingDrawing" xmlns:w10="urn:schemas-microsoft-com:office:word" xmlns:w="http://schemas.openxmlformats.org/wordprocessingml/2006/main" xmlns:w14="http://schemas.microsoft.com/office/word/2010/wordml" xmlns:w15="http://schemas.microsoft.com/office/word/2012/wordml" xmlns:w16cex="http://schemas.microsoft.com/office/word/2018/wordml/cex" xmlns:w16cid="http://schemas.microsoft.com/office/word/2016/wordml/cid" xmlns:w16="http://schemas.microsoft.com/office/word/2018/wordml" xmlns:w16sdtdh="http://schemas.microsoft.com/office/word/2020/wordml/sdtdatahash" xmlns:w16se="http://schemas.microsoft.com/office/word/2015/wordml/symex" xmlns:wpg="http://schemas.microsoft.com/office/word/2010/wordprocessingGroup" xmlns:wpi="http://schemas.microsoft.com/office/word/2010/wordprocessingInk" xmlns:wne="http://schemas.microsoft.com/office/word/2006/wordml" xmlns:wps="http://schemas.microsoft.com/office/word/2010/wordprocessingShape" mc:Ignorable="w14 w15 w16se w16cid w16 w16cex w16sdtdh wp14">
   <w:abstractNum w:abstractNumId="0" w15:restartNumberingAfterBreak="0">
-    <w:nsid w:val="37F15C65"/>
+    <w:nsid w:val="048A5EFD"/>
     <w:multiLevelType w:val="multilevel"/>
-    <w:tmpl w:val="ACE2DF6C"/>
+    <w:tmpl w:val="DA92B1E2"/>
     <w:lvl w:ilvl="0">
       <w:start w:val="1"/>
       <w:numFmt w:val="bullet"/>
@@ -18195,9 +18195,9 @@
     </w:lvl>
   </w:abstractNum>
   <w:abstractNum w:abstractNumId="1" w15:restartNumberingAfterBreak="0">
-    <w:nsid w:val="65ED05AA"/>
+    <w:nsid w:val="2AC927AE"/>
     <w:multiLevelType w:val="multilevel"/>
-    <w:tmpl w:val="05A4BB08"/>
+    <w:tmpl w:val="D6C4C91E"/>
     <w:lvl w:ilvl="0">
       <w:start w:val="1"/>
       <w:numFmt w:val="bullet"/>
@@ -18344,9 +18344,9 @@
     </w:lvl>
   </w:abstractNum>
   <w:abstractNum w:abstractNumId="2" w15:restartNumberingAfterBreak="0">
-    <w:nsid w:val="695400F3"/>
+    <w:nsid w:val="58BF6F92"/>
     <w:multiLevelType w:val="multilevel"/>
-    <w:tmpl w:val="2132E58C"/>
+    <w:tmpl w:val="FD86BB48"/>
     <w:lvl w:ilvl="0">
       <w:start w:val="1"/>
       <w:numFmt w:val="bullet"/>
@@ -18493,9 +18493,9 @@
     </w:lvl>
   </w:abstractNum>
   <w:abstractNum w:abstractNumId="3" w15:restartNumberingAfterBreak="0">
-    <w:nsid w:val="6E9922F7"/>
+    <w:nsid w:val="6D1046A1"/>
     <w:multiLevelType w:val="multilevel"/>
-    <w:tmpl w:val="463246D8"/>
+    <w:tmpl w:val="97784994"/>
     <w:lvl w:ilvl="0">
       <w:start w:val="1"/>
       <w:numFmt w:val="bullet"/>
@@ -18642,16 +18642,16 @@
     </w:lvl>
   </w:abstractNum>
   <w:num w:numId="1">
+    <w:abstractNumId w:val="1"/>
+  </w:num>
+  <w:num w:numId="2">
     <w:abstractNumId w:val="0"/>
   </w:num>
-  <w:num w:numId="2">
-    <w:abstractNumId w:val="3"/>
-  </w:num>
   <w:num w:numId="3">
-    <w:abstractNumId w:val="1"/>
+    <w:abstractNumId w:val="2"/>
   </w:num>
   <w:num w:numId="4">
-    <w:abstractNumId w:val="2"/>
+    <w:abstractNumId w:val="3"/>
   </w:num>
 </w:numbering>
 </file>

</xml_diff>

<commit_message>
data: sync desde QFieldCloud y reporte de propietarios
</commit_message>
<xml_diff>
--- a/public/informe_reunion_tecnica.docx
+++ b/public/informe_reunion_tecnica.docx
@@ -4,7 +4,7 @@
   <w:body>
     <w:p>
       <w:pPr>
-        <w:divId w:val="381489858"/>
+        <w:divId w:val="881483099"/>
         <w:rPr>
           <w:rFonts w:ascii="Plus Jakarta Sans" w:eastAsia="Times New Roman" w:hAnsi="Plus Jakarta Sans"/>
           <w:lang w:val="es-ES"/>
@@ -28,7 +28,7 @@
     <w:p>
       <w:pPr>
         <w:pStyle w:val="Ttulo1"/>
-        <w:divId w:val="405105006"/>
+        <w:divId w:val="851917686"/>
         <w:rPr>
           <w:rFonts w:eastAsia="Times New Roman"/>
           <w:lang w:val="es-ES"/>
@@ -45,7 +45,7 @@
     <w:p>
       <w:pPr>
         <w:pStyle w:val="NormalWeb"/>
-        <w:divId w:val="405105006"/>
+        <w:divId w:val="851917686"/>
         <w:rPr>
           <w:rFonts w:ascii="Plus Jakarta Sans" w:hAnsi="Plus Jakarta Sans"/>
           <w:lang w:val="es-ES"/>
@@ -63,7 +63,7 @@
     <w:p>
       <w:pPr>
         <w:pStyle w:val="NormalWeb"/>
-        <w:divId w:val="405105006"/>
+        <w:divId w:val="851917686"/>
         <w:rPr>
           <w:rFonts w:ascii="Plus Jakarta Sans" w:hAnsi="Plus Jakarta Sans"/>
           <w:lang w:val="es-ES"/>
@@ -102,7 +102,7 @@
     <w:p>
       <w:pPr>
         <w:spacing w:before="450" w:after="450"/>
-        <w:divId w:val="405105006"/>
+        <w:divId w:val="851917686"/>
         <w:rPr>
           <w:rFonts w:ascii="Plus Jakarta Sans" w:eastAsia="Times New Roman" w:hAnsi="Plus Jakarta Sans"/>
           <w:lang w:val="es-ES"/>
@@ -113,7 +113,7 @@
           <w:rFonts w:ascii="Plus Jakarta Sans" w:eastAsia="Times New Roman" w:hAnsi="Plus Jakarta Sans"/>
           <w:lang w:val="es-ES"/>
         </w:rPr>
-        <w:pict w14:anchorId="7D453425">
+        <w:pict w14:anchorId="2F5841BF">
           <v:rect id="_x0000_i1025" style="width:0;height:.75pt" o:hralign="center" o:hrstd="t" o:hr="t" fillcolor="#a0a0a0" stroked="f"/>
         </w:pict>
       </w:r>
@@ -121,7 +121,7 @@
     <w:p>
       <w:pPr>
         <w:pStyle w:val="Ttulo2"/>
-        <w:divId w:val="405105006"/>
+        <w:divId w:val="851917686"/>
         <w:rPr>
           <w:rFonts w:eastAsia="Times New Roman"/>
           <w:lang w:val="es-ES"/>
@@ -145,7 +145,7 @@
     <w:p>
       <w:pPr>
         <w:pStyle w:val="NormalWeb"/>
-        <w:divId w:val="405105006"/>
+        <w:divId w:val="851917686"/>
         <w:rPr>
           <w:rFonts w:ascii="Plus Jakarta Sans" w:hAnsi="Plus Jakarta Sans"/>
           <w:lang w:val="es-ES"/>
@@ -167,7 +167,7 @@
         </w:numPr>
         <w:spacing w:before="100" w:beforeAutospacing="1" w:after="90"/>
         <w:ind w:left="1020"/>
-        <w:divId w:val="405105006"/>
+        <w:divId w:val="851917686"/>
         <w:rPr>
           <w:rFonts w:ascii="Plus Jakarta Sans" w:eastAsia="Times New Roman" w:hAnsi="Plus Jakarta Sans"/>
           <w:sz w:val="21"/>
@@ -213,7 +213,7 @@
         </w:numPr>
         <w:spacing w:before="100" w:beforeAutospacing="1" w:after="90"/>
         <w:ind w:left="1020"/>
-        <w:divId w:val="405105006"/>
+        <w:divId w:val="851917686"/>
         <w:rPr>
           <w:rFonts w:ascii="Plus Jakarta Sans" w:eastAsia="Times New Roman" w:hAnsi="Plus Jakarta Sans"/>
           <w:sz w:val="21"/>
@@ -269,7 +269,7 @@
         </w:numPr>
         <w:spacing w:before="100" w:beforeAutospacing="1" w:after="90"/>
         <w:ind w:left="1020"/>
-        <w:divId w:val="405105006"/>
+        <w:divId w:val="851917686"/>
         <w:rPr>
           <w:rFonts w:ascii="Plus Jakarta Sans" w:eastAsia="Times New Roman" w:hAnsi="Plus Jakarta Sans"/>
           <w:sz w:val="21"/>
@@ -315,7 +315,7 @@
         </w:numPr>
         <w:spacing w:before="100" w:beforeAutospacing="1" w:after="90"/>
         <w:ind w:left="1020"/>
-        <w:divId w:val="405105006"/>
+        <w:divId w:val="851917686"/>
         <w:rPr>
           <w:rFonts w:ascii="Plus Jakarta Sans" w:eastAsia="Times New Roman" w:hAnsi="Plus Jakarta Sans"/>
           <w:sz w:val="21"/>
@@ -356,7 +356,7 @@
     <w:p>
       <w:pPr>
         <w:spacing w:before="450" w:after="450"/>
-        <w:divId w:val="405105006"/>
+        <w:divId w:val="851917686"/>
         <w:rPr>
           <w:rFonts w:ascii="Plus Jakarta Sans" w:eastAsia="Times New Roman" w:hAnsi="Plus Jakarta Sans"/>
           <w:lang w:val="es-ES"/>
@@ -367,7 +367,7 @@
           <w:rFonts w:ascii="Plus Jakarta Sans" w:eastAsia="Times New Roman" w:hAnsi="Plus Jakarta Sans"/>
           <w:lang w:val="es-ES"/>
         </w:rPr>
-        <w:pict w14:anchorId="62EE58CA">
+        <w:pict w14:anchorId="67DF0CB5">
           <v:rect id="_x0000_i1026" style="width:0;height:.75pt" o:hralign="center" o:hrstd="t" o:hr="t" fillcolor="#a0a0a0" stroked="f"/>
         </w:pict>
       </w:r>
@@ -375,7 +375,7 @@
     <w:p>
       <w:pPr>
         <w:pStyle w:val="Ttulo2"/>
-        <w:divId w:val="405105006"/>
+        <w:divId w:val="851917686"/>
         <w:rPr>
           <w:rFonts w:eastAsia="Times New Roman"/>
           <w:lang w:val="es-ES"/>
@@ -392,7 +392,7 @@
     <w:p>
       <w:pPr>
         <w:pStyle w:val="NormalWeb"/>
-        <w:divId w:val="405105006"/>
+        <w:divId w:val="851917686"/>
         <w:rPr>
           <w:rFonts w:ascii="Plus Jakarta Sans" w:hAnsi="Plus Jakarta Sans"/>
           <w:lang w:val="es-ES"/>
@@ -445,7 +445,7 @@
       </w:tblGrid>
       <w:tr>
         <w:trPr>
-          <w:divId w:val="1421951576"/>
+          <w:divId w:val="88504598"/>
           <w:tblHeader/>
         </w:trPr>
         <w:tc>
@@ -525,7 +525,7 @@
       </w:tr>
       <w:tr>
         <w:trPr>
-          <w:divId w:val="1421951576"/>
+          <w:divId w:val="88504598"/>
         </w:trPr>
         <w:tc>
           <w:tcPr>
@@ -591,7 +591,7 @@
       </w:tr>
       <w:tr>
         <w:trPr>
-          <w:divId w:val="1421951576"/>
+          <w:divId w:val="88504598"/>
         </w:trPr>
         <w:tc>
           <w:tcPr>
@@ -657,7 +657,7 @@
       </w:tr>
       <w:tr>
         <w:trPr>
-          <w:divId w:val="1421951576"/>
+          <w:divId w:val="88504598"/>
         </w:trPr>
         <w:tc>
           <w:tcPr>
@@ -723,7 +723,7 @@
       </w:tr>
       <w:tr>
         <w:trPr>
-          <w:divId w:val="1421951576"/>
+          <w:divId w:val="88504598"/>
         </w:trPr>
         <w:tc>
           <w:tcPr>
@@ -791,7 +791,7 @@
     <w:p>
       <w:pPr>
         <w:spacing w:before="450" w:after="450"/>
-        <w:divId w:val="405105006"/>
+        <w:divId w:val="851917686"/>
         <w:rPr>
           <w:rFonts w:ascii="Plus Jakarta Sans" w:eastAsia="Times New Roman" w:hAnsi="Plus Jakarta Sans"/>
           <w:lang w:val="es-ES"/>
@@ -803,7 +803,7 @@
           <w:lang w:val="es-ES"/>
         </w:rPr>
         <w:lastRenderedPageBreak/>
-        <w:pict w14:anchorId="6CD12635">
+        <w:pict w14:anchorId="72F7712A">
           <v:rect id="_x0000_i1027" style="width:0;height:.75pt" o:hralign="center" o:hrstd="t" o:hr="t" fillcolor="#a0a0a0" stroked="f"/>
         </w:pict>
       </w:r>
@@ -811,7 +811,7 @@
     <w:p>
       <w:pPr>
         <w:pStyle w:val="Ttulo2"/>
-        <w:divId w:val="405105006"/>
+        <w:divId w:val="851917686"/>
         <w:rPr>
           <w:rFonts w:eastAsia="Times New Roman"/>
           <w:lang w:val="es-ES"/>
@@ -828,7 +828,7 @@
     <w:p>
       <w:pPr>
         <w:pStyle w:val="Ttulo3"/>
-        <w:divId w:val="405105006"/>
+        <w:divId w:val="851917686"/>
         <w:rPr>
           <w:rFonts w:eastAsia="Times New Roman"/>
           <w:lang w:val="es-ES"/>
@@ -845,7 +845,7 @@
     <w:p>
       <w:pPr>
         <w:pStyle w:val="NormalWeb"/>
-        <w:divId w:val="405105006"/>
+        <w:divId w:val="851917686"/>
         <w:rPr>
           <w:rFonts w:ascii="Plus Jakarta Sans" w:hAnsi="Plus Jakarta Sans"/>
           <w:lang w:val="es-ES"/>
@@ -885,7 +885,7 @@
       </w:tblGrid>
       <w:tr>
         <w:trPr>
-          <w:divId w:val="1112284402"/>
+          <w:divId w:val="731659834"/>
           <w:tblHeader/>
         </w:trPr>
         <w:tc>
@@ -1039,7 +1039,7 @@
       </w:tr>
       <w:tr>
         <w:trPr>
-          <w:divId w:val="1112284402"/>
+          <w:divId w:val="731659834"/>
         </w:trPr>
         <w:tc>
           <w:tcPr>
@@ -1165,7 +1165,7 @@
       </w:tr>
       <w:tr>
         <w:trPr>
-          <w:divId w:val="1112284402"/>
+          <w:divId w:val="731659834"/>
         </w:trPr>
         <w:tc>
           <w:tcPr>
@@ -1291,7 +1291,7 @@
       </w:tr>
       <w:tr>
         <w:trPr>
-          <w:divId w:val="1112284402"/>
+          <w:divId w:val="731659834"/>
         </w:trPr>
         <w:tc>
           <w:tcPr>
@@ -1417,7 +1417,7 @@
       </w:tr>
       <w:tr>
         <w:trPr>
-          <w:divId w:val="1112284402"/>
+          <w:divId w:val="731659834"/>
         </w:trPr>
         <w:tc>
           <w:tcPr>
@@ -1543,7 +1543,7 @@
       </w:tr>
       <w:tr>
         <w:trPr>
-          <w:divId w:val="1112284402"/>
+          <w:divId w:val="731659834"/>
         </w:trPr>
         <w:tc>
           <w:tcPr>
@@ -1677,7 +1677,7 @@
       </w:tr>
       <w:tr>
         <w:trPr>
-          <w:divId w:val="1112284402"/>
+          <w:divId w:val="731659834"/>
         </w:trPr>
         <w:tc>
           <w:tcPr>
@@ -1803,7 +1803,7 @@
       </w:tr>
       <w:tr>
         <w:trPr>
-          <w:divId w:val="1112284402"/>
+          <w:divId w:val="731659834"/>
         </w:trPr>
         <w:tc>
           <w:tcPr>
@@ -1929,7 +1929,7 @@
       </w:tr>
       <w:tr>
         <w:trPr>
-          <w:divId w:val="1112284402"/>
+          <w:divId w:val="731659834"/>
         </w:trPr>
         <w:tc>
           <w:tcPr>
@@ -2057,7 +2057,7 @@
     <w:p>
       <w:pPr>
         <w:pStyle w:val="Ttulo3"/>
-        <w:divId w:val="405105006"/>
+        <w:divId w:val="851917686"/>
         <w:rPr>
           <w:rFonts w:eastAsia="Times New Roman"/>
           <w:lang w:val="es-ES"/>
@@ -2074,7 +2074,7 @@
     <w:p>
       <w:pPr>
         <w:pStyle w:val="NormalWeb"/>
-        <w:divId w:val="405105006"/>
+        <w:divId w:val="851917686"/>
         <w:rPr>
           <w:rFonts w:ascii="Plus Jakarta Sans" w:hAnsi="Plus Jakarta Sans"/>
           <w:lang w:val="es-ES"/>
@@ -2103,7 +2103,7 @@
         </w:numPr>
         <w:spacing w:before="100" w:beforeAutospacing="1" w:after="90"/>
         <w:ind w:left="1020"/>
-        <w:divId w:val="405105006"/>
+        <w:divId w:val="851917686"/>
         <w:rPr>
           <w:rFonts w:ascii="Plus Jakarta Sans" w:eastAsia="Times New Roman" w:hAnsi="Plus Jakarta Sans"/>
           <w:sz w:val="21"/>
@@ -2205,7 +2205,7 @@
         </w:numPr>
         <w:spacing w:before="100" w:beforeAutospacing="1" w:after="90"/>
         <w:ind w:left="1020"/>
-        <w:divId w:val="405105006"/>
+        <w:divId w:val="851917686"/>
         <w:rPr>
           <w:rFonts w:ascii="Plus Jakarta Sans" w:eastAsia="Times New Roman" w:hAnsi="Plus Jakarta Sans"/>
           <w:sz w:val="21"/>
@@ -2317,7 +2317,7 @@
         </w:numPr>
         <w:spacing w:before="100" w:beforeAutospacing="1" w:after="90"/>
         <w:ind w:left="1020"/>
-        <w:divId w:val="405105006"/>
+        <w:divId w:val="851917686"/>
         <w:rPr>
           <w:rFonts w:ascii="Plus Jakarta Sans" w:eastAsia="Times New Roman" w:hAnsi="Plus Jakarta Sans"/>
           <w:sz w:val="21"/>
@@ -2423,7 +2423,7 @@
     <w:p>
       <w:pPr>
         <w:pStyle w:val="Ttulo3"/>
-        <w:divId w:val="405105006"/>
+        <w:divId w:val="851917686"/>
         <w:rPr>
           <w:rFonts w:eastAsia="Times New Roman"/>
           <w:lang w:val="es-ES"/>
@@ -2440,7 +2440,7 @@
     <w:p>
       <w:pPr>
         <w:jc w:val="center"/>
-        <w:divId w:val="1270432307"/>
+        <w:divId w:val="1978148399"/>
         <w:rPr>
           <w:rFonts w:ascii="Outfit" w:eastAsia="Times New Roman" w:hAnsi="Outfit"/>
           <w:b/>
@@ -2469,7 +2469,7 @@
     <w:p>
       <w:pPr>
         <w:jc w:val="center"/>
-        <w:divId w:val="750666025"/>
+        <w:divId w:val="1895659601"/>
         <w:rPr>
           <w:rFonts w:ascii="Plus Jakarta Sans" w:eastAsia="Times New Roman" w:hAnsi="Plus Jakarta Sans"/>
           <w:lang w:val="es-ES"/>
@@ -2864,7 +2864,7 @@
     <w:p>
       <w:pPr>
         <w:spacing w:before="450" w:after="450"/>
-        <w:divId w:val="405105006"/>
+        <w:divId w:val="851917686"/>
         <w:rPr>
           <w:rFonts w:ascii="Plus Jakarta Sans" w:eastAsia="Times New Roman" w:hAnsi="Plus Jakarta Sans"/>
           <w:lang w:val="es-ES"/>
@@ -2875,7 +2875,7 @@
           <w:rFonts w:ascii="Plus Jakarta Sans" w:eastAsia="Times New Roman" w:hAnsi="Plus Jakarta Sans"/>
           <w:lang w:val="es-ES"/>
         </w:rPr>
-        <w:pict w14:anchorId="2EB39D84">
+        <w:pict w14:anchorId="19BD4A4D">
           <v:rect id="_x0000_i1028" style="width:0;height:.75pt" o:hralign="center" o:hrstd="t" o:hr="t" fillcolor="#a0a0a0" stroked="f"/>
         </w:pict>
       </w:r>
@@ -2883,7 +2883,7 @@
     <w:p>
       <w:pPr>
         <w:pStyle w:val="Ttulo3"/>
-        <w:divId w:val="405105006"/>
+        <w:divId w:val="851917686"/>
         <w:rPr>
           <w:rFonts w:eastAsia="Times New Roman"/>
           <w:lang w:val="es-ES"/>
@@ -2900,7 +2900,7 @@
     <w:p>
       <w:pPr>
         <w:pStyle w:val="NormalWeb"/>
-        <w:divId w:val="405105006"/>
+        <w:divId w:val="851917686"/>
         <w:rPr>
           <w:rFonts w:ascii="Plus Jakarta Sans" w:hAnsi="Plus Jakarta Sans"/>
           <w:lang w:val="es-ES"/>
@@ -2933,7 +2933,7 @@
       </w:tblGrid>
       <w:tr>
         <w:trPr>
-          <w:divId w:val="1441148870"/>
+          <w:divId w:val="271016928"/>
           <w:tblHeader/>
         </w:trPr>
         <w:tc>
@@ -3087,7 +3087,7 @@
       </w:tr>
       <w:tr>
         <w:trPr>
-          <w:divId w:val="1441148870"/>
+          <w:divId w:val="271016928"/>
         </w:trPr>
         <w:tc>
           <w:tcPr>
@@ -3221,7 +3221,7 @@
       </w:tr>
       <w:tr>
         <w:trPr>
-          <w:divId w:val="1441148870"/>
+          <w:divId w:val="271016928"/>
         </w:trPr>
         <w:tc>
           <w:tcPr>
@@ -3355,7 +3355,7 @@
       </w:tr>
       <w:tr>
         <w:trPr>
-          <w:divId w:val="1441148870"/>
+          <w:divId w:val="271016928"/>
         </w:trPr>
         <w:tc>
           <w:tcPr>
@@ -3489,7 +3489,7 @@
       </w:tr>
       <w:tr>
         <w:trPr>
-          <w:divId w:val="1441148870"/>
+          <w:divId w:val="271016928"/>
         </w:trPr>
         <w:tc>
           <w:tcPr>
@@ -3623,7 +3623,7 @@
       </w:tr>
       <w:tr>
         <w:trPr>
-          <w:divId w:val="1441148870"/>
+          <w:divId w:val="271016928"/>
         </w:trPr>
         <w:tc>
           <w:tcPr>
@@ -3757,7 +3757,7 @@
       </w:tr>
       <w:tr>
         <w:trPr>
-          <w:divId w:val="1441148870"/>
+          <w:divId w:val="271016928"/>
         </w:trPr>
         <w:tc>
           <w:tcPr>
@@ -3893,7 +3893,7 @@
     <w:p>
       <w:pPr>
         <w:pStyle w:val="Ttulo3"/>
-        <w:divId w:val="405105006"/>
+        <w:divId w:val="851917686"/>
         <w:rPr>
           <w:rFonts w:eastAsia="Times New Roman"/>
           <w:lang w:val="es-ES"/>
@@ -3910,7 +3910,7 @@
     <w:p>
       <w:pPr>
         <w:jc w:val="center"/>
-        <w:divId w:val="1303001689"/>
+        <w:divId w:val="578027735"/>
         <w:rPr>
           <w:rFonts w:ascii="Outfit" w:eastAsia="Times New Roman" w:hAnsi="Outfit"/>
           <w:b/>
@@ -3939,7 +3939,7 @@
     <w:p>
       <w:pPr>
         <w:jc w:val="center"/>
-        <w:divId w:val="2073695296"/>
+        <w:divId w:val="1322344344"/>
         <w:rPr>
           <w:rFonts w:ascii="Plus Jakarta Sans" w:eastAsia="Times New Roman" w:hAnsi="Plus Jakarta Sans"/>
           <w:lang w:val="es-ES"/>
@@ -4313,7 +4313,7 @@
     <w:p>
       <w:pPr>
         <w:spacing w:before="450" w:after="450"/>
-        <w:divId w:val="405105006"/>
+        <w:divId w:val="851917686"/>
         <w:rPr>
           <w:rFonts w:ascii="Plus Jakarta Sans" w:eastAsia="Times New Roman" w:hAnsi="Plus Jakarta Sans"/>
           <w:lang w:val="es-ES"/>
@@ -4325,7 +4325,7 @@
           <w:lang w:val="es-ES"/>
         </w:rPr>
         <w:lastRenderedPageBreak/>
-        <w:pict w14:anchorId="3BAE97E9">
+        <w:pict w14:anchorId="0DD83123">
           <v:rect id="_x0000_i1029" style="width:0;height:.75pt" o:hralign="center" o:hrstd="t" o:hr="t" fillcolor="#a0a0a0" stroked="f"/>
         </w:pict>
       </w:r>
@@ -4333,7 +4333,7 @@
     <w:p>
       <w:pPr>
         <w:pStyle w:val="Ttulo3"/>
-        <w:divId w:val="405105006"/>
+        <w:divId w:val="851917686"/>
         <w:rPr>
           <w:rFonts w:eastAsia="Times New Roman"/>
           <w:lang w:val="es-ES"/>
@@ -4350,7 +4350,7 @@
     <w:p>
       <w:pPr>
         <w:pStyle w:val="NormalWeb"/>
-        <w:divId w:val="405105006"/>
+        <w:divId w:val="851917686"/>
         <w:rPr>
           <w:rFonts w:ascii="Plus Jakarta Sans" w:hAnsi="Plus Jakarta Sans"/>
           <w:lang w:val="es-ES"/>
@@ -4372,7 +4372,7 @@
         </w:numPr>
         <w:spacing w:before="100" w:beforeAutospacing="1" w:after="90"/>
         <w:ind w:left="1020"/>
-        <w:divId w:val="405105006"/>
+        <w:divId w:val="851917686"/>
         <w:rPr>
           <w:rFonts w:ascii="Plus Jakarta Sans" w:eastAsia="Times New Roman" w:hAnsi="Plus Jakarta Sans"/>
           <w:sz w:val="21"/>
@@ -4408,7 +4408,7 @@
         </w:numPr>
         <w:spacing w:before="100" w:beforeAutospacing="1" w:after="90"/>
         <w:ind w:left="1020"/>
-        <w:divId w:val="405105006"/>
+        <w:divId w:val="851917686"/>
         <w:rPr>
           <w:rFonts w:ascii="Plus Jakarta Sans" w:eastAsia="Times New Roman" w:hAnsi="Plus Jakarta Sans"/>
           <w:sz w:val="21"/>
@@ -4453,7 +4453,7 @@
         </w:numPr>
         <w:spacing w:before="100" w:beforeAutospacing="1" w:after="90"/>
         <w:ind w:left="1020"/>
-        <w:divId w:val="405105006"/>
+        <w:divId w:val="851917686"/>
         <w:rPr>
           <w:rFonts w:ascii="Plus Jakarta Sans" w:eastAsia="Times New Roman" w:hAnsi="Plus Jakarta Sans"/>
           <w:sz w:val="21"/>
@@ -4498,7 +4498,7 @@
         </w:numPr>
         <w:spacing w:before="100" w:beforeAutospacing="1" w:after="90"/>
         <w:ind w:left="1020"/>
-        <w:divId w:val="405105006"/>
+        <w:divId w:val="851917686"/>
         <w:rPr>
           <w:rFonts w:ascii="Plus Jakarta Sans" w:eastAsia="Times New Roman" w:hAnsi="Plus Jakarta Sans"/>
           <w:sz w:val="21"/>
@@ -4554,7 +4554,7 @@
       </w:tblGrid>
       <w:tr>
         <w:trPr>
-          <w:divId w:val="810363425"/>
+          <w:divId w:val="344863589"/>
           <w:tblHeader/>
         </w:trPr>
         <w:tc>
@@ -4708,7 +4708,7 @@
       </w:tr>
       <w:tr>
         <w:trPr>
-          <w:divId w:val="810363425"/>
+          <w:divId w:val="344863589"/>
         </w:trPr>
         <w:tc>
           <w:tcPr>
@@ -4834,7 +4834,7 @@
       </w:tr>
       <w:tr>
         <w:trPr>
-          <w:divId w:val="810363425"/>
+          <w:divId w:val="344863589"/>
         </w:trPr>
         <w:tc>
           <w:tcPr>
@@ -4960,7 +4960,7 @@
       </w:tr>
       <w:tr>
         <w:trPr>
-          <w:divId w:val="810363425"/>
+          <w:divId w:val="344863589"/>
         </w:trPr>
         <w:tc>
           <w:tcPr>
@@ -5086,7 +5086,7 @@
       </w:tr>
       <w:tr>
         <w:trPr>
-          <w:divId w:val="810363425"/>
+          <w:divId w:val="344863589"/>
         </w:trPr>
         <w:tc>
           <w:tcPr>
@@ -5214,7 +5214,7 @@
     <w:p>
       <w:pPr>
         <w:spacing w:before="450" w:after="450"/>
-        <w:divId w:val="405105006"/>
+        <w:divId w:val="851917686"/>
         <w:rPr>
           <w:rFonts w:ascii="Plus Jakarta Sans" w:eastAsia="Times New Roman" w:hAnsi="Plus Jakarta Sans"/>
           <w:lang w:val="es-ES"/>
@@ -5225,7 +5225,7 @@
           <w:rFonts w:ascii="Plus Jakarta Sans" w:eastAsia="Times New Roman" w:hAnsi="Plus Jakarta Sans"/>
           <w:lang w:val="es-ES"/>
         </w:rPr>
-        <w:pict w14:anchorId="3406A002">
+        <w:pict w14:anchorId="39E1B1EE">
           <v:rect id="_x0000_i1030" style="width:0;height:.75pt" o:hralign="center" o:hrstd="t" o:hr="t" fillcolor="#a0a0a0" stroked="f"/>
         </w:pict>
       </w:r>
@@ -5233,7 +5233,7 @@
     <w:p>
       <w:pPr>
         <w:pStyle w:val="Ttulo3"/>
-        <w:divId w:val="405105006"/>
+        <w:divId w:val="851917686"/>
         <w:rPr>
           <w:rFonts w:eastAsia="Times New Roman"/>
           <w:lang w:val="es-ES"/>
@@ -5250,7 +5250,7 @@
     <w:p>
       <w:pPr>
         <w:pStyle w:val="NormalWeb"/>
-        <w:divId w:val="405105006"/>
+        <w:divId w:val="851917686"/>
         <w:rPr>
           <w:rFonts w:ascii="Plus Jakarta Sans" w:hAnsi="Plus Jakarta Sans"/>
           <w:lang w:val="es-ES"/>
@@ -5274,7 +5274,7 @@
     <w:p>
       <w:pPr>
         <w:pStyle w:val="Ttulo4"/>
-        <w:divId w:val="405105006"/>
+        <w:divId w:val="851917686"/>
         <w:rPr>
           <w:rFonts w:eastAsia="Times New Roman"/>
           <w:lang w:val="es-ES"/>
@@ -5291,7 +5291,7 @@
     <w:p>
       <w:pPr>
         <w:jc w:val="center"/>
-        <w:divId w:val="1136681157"/>
+        <w:divId w:val="1354578684"/>
         <w:rPr>
           <w:rFonts w:ascii="Outfit" w:eastAsia="Times New Roman" w:hAnsi="Outfit"/>
           <w:b/>
@@ -5320,7 +5320,7 @@
     <w:p>
       <w:pPr>
         <w:jc w:val="center"/>
-        <w:divId w:val="23946288"/>
+        <w:divId w:val="1936942744"/>
         <w:rPr>
           <w:rFonts w:ascii="Plus Jakarta Sans" w:eastAsia="Times New Roman" w:hAnsi="Plus Jakarta Sans"/>
           <w:lang w:val="es-ES"/>
@@ -5603,7 +5603,7 @@
     <w:p>
       <w:pPr>
         <w:pStyle w:val="Ttulo4"/>
-        <w:divId w:val="405105006"/>
+        <w:divId w:val="851917686"/>
         <w:rPr>
           <w:rFonts w:eastAsia="Times New Roman"/>
           <w:lang w:val="es-ES"/>
@@ -5627,7 +5627,7 @@
     <w:p>
       <w:pPr>
         <w:jc w:val="center"/>
-        <w:divId w:val="669069100"/>
+        <w:divId w:val="1795053789"/>
         <w:rPr>
           <w:rFonts w:ascii="Outfit" w:eastAsia="Times New Roman" w:hAnsi="Outfit"/>
           <w:b/>
@@ -5656,7 +5656,7 @@
     <w:p>
       <w:pPr>
         <w:jc w:val="center"/>
-        <w:divId w:val="838889342"/>
+        <w:divId w:val="1132484920"/>
         <w:rPr>
           <w:rFonts w:ascii="Plus Jakarta Sans" w:eastAsia="Times New Roman" w:hAnsi="Plus Jakarta Sans"/>
           <w:lang w:val="es-ES"/>
@@ -5974,7 +5974,7 @@
     <w:p>
       <w:pPr>
         <w:pStyle w:val="Ttulo4"/>
-        <w:divId w:val="405105006"/>
+        <w:divId w:val="851917686"/>
         <w:rPr>
           <w:rFonts w:eastAsia="Times New Roman"/>
           <w:lang w:val="es-ES"/>
@@ -5992,7 +5992,7 @@
     <w:p>
       <w:pPr>
         <w:jc w:val="center"/>
-        <w:divId w:val="1392845973"/>
+        <w:divId w:val="1856728143"/>
         <w:rPr>
           <w:rFonts w:ascii="Outfit" w:eastAsia="Times New Roman" w:hAnsi="Outfit"/>
           <w:b/>
@@ -6021,7 +6021,7 @@
     <w:p>
       <w:pPr>
         <w:jc w:val="center"/>
-        <w:divId w:val="1999455149"/>
+        <w:divId w:val="869034192"/>
         <w:rPr>
           <w:rFonts w:ascii="Plus Jakarta Sans" w:eastAsia="Times New Roman" w:hAnsi="Plus Jakarta Sans"/>
           <w:lang w:val="es-ES"/>
@@ -6325,7 +6325,7 @@
     <w:p>
       <w:pPr>
         <w:spacing w:before="450" w:after="450"/>
-        <w:divId w:val="405105006"/>
+        <w:divId w:val="851917686"/>
         <w:rPr>
           <w:rFonts w:ascii="Plus Jakarta Sans" w:eastAsia="Times New Roman" w:hAnsi="Plus Jakarta Sans"/>
           <w:lang w:val="es-ES"/>
@@ -6336,7 +6336,7 @@
           <w:rFonts w:ascii="Plus Jakarta Sans" w:eastAsia="Times New Roman" w:hAnsi="Plus Jakarta Sans"/>
           <w:lang w:val="es-ES"/>
         </w:rPr>
-        <w:pict w14:anchorId="7D3548CF">
+        <w:pict w14:anchorId="2273C35E">
           <v:rect id="_x0000_i1031" style="width:0;height:.75pt" o:hralign="center" o:hrstd="t" o:hr="t" fillcolor="#a0a0a0" stroked="f"/>
         </w:pict>
       </w:r>
@@ -6344,7 +6344,7 @@
     <w:p>
       <w:pPr>
         <w:pStyle w:val="Ttulo3"/>
-        <w:divId w:val="405105006"/>
+        <w:divId w:val="851917686"/>
         <w:rPr>
           <w:rFonts w:eastAsia="Times New Roman"/>
           <w:lang w:val="es-ES"/>
@@ -6361,7 +6361,7 @@
     <w:p>
       <w:pPr>
         <w:pStyle w:val="NormalWeb"/>
-        <w:divId w:val="405105006"/>
+        <w:divId w:val="851917686"/>
         <w:rPr>
           <w:rFonts w:ascii="Plus Jakarta Sans" w:hAnsi="Plus Jakarta Sans"/>
           <w:lang w:val="es-ES"/>
@@ -6385,7 +6385,7 @@
     <w:p>
       <w:pPr>
         <w:pStyle w:val="Ttulo4"/>
-        <w:divId w:val="405105006"/>
+        <w:divId w:val="851917686"/>
         <w:rPr>
           <w:rFonts w:eastAsia="Times New Roman"/>
           <w:lang w:val="es-ES"/>
@@ -6402,7 +6402,7 @@
     <w:p>
       <w:pPr>
         <w:pStyle w:val="NormalWeb"/>
-        <w:divId w:val="405105006"/>
+        <w:divId w:val="851917686"/>
         <w:rPr>
           <w:rFonts w:ascii="Plus Jakarta Sans" w:hAnsi="Plus Jakarta Sans"/>
           <w:lang w:val="es-ES"/>
@@ -6433,7 +6433,7 @@
       </w:tblGrid>
       <w:tr>
         <w:trPr>
-          <w:divId w:val="808520631"/>
+          <w:divId w:val="1545215203"/>
           <w:tblHeader/>
         </w:trPr>
         <w:tc>
@@ -6513,7 +6513,7 @@
       </w:tr>
       <w:tr>
         <w:trPr>
-          <w:divId w:val="808520631"/>
+          <w:divId w:val="1545215203"/>
         </w:trPr>
         <w:tc>
           <w:tcPr>
@@ -6602,7 +6602,7 @@
     <w:p>
       <w:pPr>
         <w:pStyle w:val="Ttulo4"/>
-        <w:divId w:val="405105006"/>
+        <w:divId w:val="851917686"/>
         <w:rPr>
           <w:rFonts w:eastAsia="Times New Roman"/>
           <w:lang w:val="es-ES"/>
@@ -6619,7 +6619,7 @@
     <w:p>
       <w:pPr>
         <w:pStyle w:val="NormalWeb"/>
-        <w:divId w:val="405105006"/>
+        <w:divId w:val="851917686"/>
         <w:rPr>
           <w:rFonts w:ascii="Plus Jakarta Sans" w:hAnsi="Plus Jakarta Sans"/>
           <w:lang w:val="es-ES"/>
@@ -6650,7 +6650,7 @@
       </w:tblGrid>
       <w:tr>
         <w:trPr>
-          <w:divId w:val="617566023"/>
+          <w:divId w:val="209223297"/>
           <w:tblHeader/>
         </w:trPr>
         <w:tc>
@@ -6730,7 +6730,7 @@
       </w:tr>
       <w:tr>
         <w:trPr>
-          <w:divId w:val="617566023"/>
+          <w:divId w:val="209223297"/>
         </w:trPr>
         <w:tc>
           <w:tcPr>
@@ -6828,7 +6828,7 @@
     <w:p>
       <w:pPr>
         <w:pStyle w:val="Ttulo4"/>
-        <w:divId w:val="405105006"/>
+        <w:divId w:val="851917686"/>
         <w:rPr>
           <w:rFonts w:eastAsia="Times New Roman"/>
           <w:lang w:val="es-ES"/>
@@ -6845,7 +6845,7 @@
     <w:p>
       <w:pPr>
         <w:pStyle w:val="NormalWeb"/>
-        <w:divId w:val="405105006"/>
+        <w:divId w:val="851917686"/>
         <w:rPr>
           <w:rFonts w:ascii="Plus Jakarta Sans" w:hAnsi="Plus Jakarta Sans"/>
           <w:lang w:val="es-ES"/>
@@ -6876,7 +6876,7 @@
       </w:tblGrid>
       <w:tr>
         <w:trPr>
-          <w:divId w:val="1752465391"/>
+          <w:divId w:val="1105148497"/>
           <w:tblHeader/>
         </w:trPr>
         <w:tc>
@@ -6957,7 +6957,7 @@
       </w:tr>
       <w:tr>
         <w:trPr>
-          <w:divId w:val="1752465391"/>
+          <w:divId w:val="1105148497"/>
         </w:trPr>
         <w:tc>
           <w:tcPr>
@@ -7046,7 +7046,7 @@
     <w:p>
       <w:pPr>
         <w:spacing w:before="450" w:after="450"/>
-        <w:divId w:val="405105006"/>
+        <w:divId w:val="851917686"/>
         <w:rPr>
           <w:rFonts w:ascii="Plus Jakarta Sans" w:eastAsia="Times New Roman" w:hAnsi="Plus Jakarta Sans"/>
           <w:lang w:val="es-ES"/>
@@ -7057,7 +7057,7 @@
           <w:rFonts w:ascii="Plus Jakarta Sans" w:eastAsia="Times New Roman" w:hAnsi="Plus Jakarta Sans"/>
           <w:lang w:val="es-ES"/>
         </w:rPr>
-        <w:pict w14:anchorId="00373679">
+        <w:pict w14:anchorId="4E1AA0B3">
           <v:rect id="_x0000_i1032" style="width:0;height:.75pt" o:hralign="center" o:hrstd="t" o:hr="t" fillcolor="#a0a0a0" stroked="f"/>
         </w:pict>
       </w:r>
@@ -7065,7 +7065,7 @@
     <w:p>
       <w:pPr>
         <w:pStyle w:val="Ttulo2"/>
-        <w:divId w:val="405105006"/>
+        <w:divId w:val="851917686"/>
         <w:rPr>
           <w:rFonts w:eastAsia="Times New Roman"/>
           <w:lang w:val="es-ES"/>
@@ -7082,7 +7082,7 @@
     <w:p>
       <w:pPr>
         <w:pStyle w:val="NormalWeb"/>
-        <w:divId w:val="405105006"/>
+        <w:divId w:val="851917686"/>
         <w:rPr>
           <w:rFonts w:ascii="Plus Jakarta Sans" w:hAnsi="Plus Jakarta Sans"/>
           <w:lang w:val="es-ES"/>
@@ -7099,7 +7099,7 @@
     <w:p>
       <w:pPr>
         <w:pStyle w:val="Ttulo3"/>
-        <w:divId w:val="405105006"/>
+        <w:divId w:val="851917686"/>
         <w:rPr>
           <w:rFonts w:eastAsia="Times New Roman"/>
           <w:lang w:val="es-ES"/>
@@ -7116,7 +7116,7 @@
     <w:p>
       <w:pPr>
         <w:pStyle w:val="NormalWeb"/>
-        <w:divId w:val="405105006"/>
+        <w:divId w:val="851917686"/>
         <w:rPr>
           <w:rFonts w:ascii="Plus Jakarta Sans" w:hAnsi="Plus Jakarta Sans"/>
           <w:lang w:val="es-ES"/>
@@ -7149,7 +7149,7 @@
       </w:tblGrid>
       <w:tr>
         <w:trPr>
-          <w:divId w:val="468401452"/>
+          <w:divId w:val="713192455"/>
           <w:tblHeader/>
         </w:trPr>
         <w:tc>
@@ -7314,7 +7314,7 @@
       </w:tr>
       <w:tr>
         <w:trPr>
-          <w:divId w:val="468401452"/>
+          <w:divId w:val="713192455"/>
         </w:trPr>
         <w:tc>
           <w:tcPr>
@@ -7440,7 +7440,7 @@
       </w:tr>
       <w:tr>
         <w:trPr>
-          <w:divId w:val="468401452"/>
+          <w:divId w:val="713192455"/>
         </w:trPr>
         <w:tc>
           <w:tcPr>
@@ -7566,7 +7566,7 @@
       </w:tr>
       <w:tr>
         <w:trPr>
-          <w:divId w:val="468401452"/>
+          <w:divId w:val="713192455"/>
         </w:trPr>
         <w:tc>
           <w:tcPr>
@@ -7692,7 +7692,7 @@
       </w:tr>
       <w:tr>
         <w:trPr>
-          <w:divId w:val="468401452"/>
+          <w:divId w:val="713192455"/>
         </w:trPr>
         <w:tc>
           <w:tcPr>
@@ -7820,7 +7820,7 @@
     <w:p>
       <w:pPr>
         <w:pStyle w:val="Ttulo3"/>
-        <w:divId w:val="405105006"/>
+        <w:divId w:val="851917686"/>
         <w:rPr>
           <w:rFonts w:eastAsia="Times New Roman"/>
           <w:lang w:val="es-ES"/>
@@ -7838,7 +7838,7 @@
       <w:pPr>
         <w:spacing w:before="375" w:after="225"/>
         <w:jc w:val="center"/>
-        <w:divId w:val="1399673425"/>
+        <w:divId w:val="1492713938"/>
         <w:rPr>
           <w:rFonts w:ascii="Outfit" w:eastAsia="Times New Roman" w:hAnsi="Outfit"/>
           <w:b/>
@@ -7868,7 +7868,7 @@
       <w:pPr>
         <w:spacing w:after="375"/>
         <w:jc w:val="center"/>
-        <w:divId w:val="2091460443"/>
+        <w:divId w:val="1620918101"/>
         <w:rPr>
           <w:rFonts w:ascii="Plus Jakarta Sans" w:eastAsia="Times New Roman" w:hAnsi="Plus Jakarta Sans"/>
           <w:lang w:val="es-ES"/>
@@ -8235,7 +8235,7 @@
     <w:p>
       <w:pPr>
         <w:pStyle w:val="Ttulo3"/>
-        <w:divId w:val="405105006"/>
+        <w:divId w:val="851917686"/>
         <w:rPr>
           <w:rFonts w:eastAsia="Times New Roman"/>
           <w:lang w:val="es-ES"/>
@@ -8259,7 +8259,7 @@
     <w:p>
       <w:pPr>
         <w:pStyle w:val="NormalWeb"/>
-        <w:divId w:val="405105006"/>
+        <w:divId w:val="851917686"/>
         <w:rPr>
           <w:rFonts w:ascii="Plus Jakarta Sans" w:hAnsi="Plus Jakarta Sans"/>
           <w:lang w:val="es-ES"/>
@@ -8281,7 +8281,7 @@
         </w:numPr>
         <w:spacing w:before="100" w:beforeAutospacing="1" w:after="90"/>
         <w:ind w:left="1020"/>
-        <w:divId w:val="405105006"/>
+        <w:divId w:val="851917686"/>
         <w:rPr>
           <w:rFonts w:ascii="Plus Jakarta Sans" w:eastAsia="Times New Roman" w:hAnsi="Plus Jakarta Sans"/>
           <w:sz w:val="21"/>
@@ -8317,7 +8317,7 @@
         </w:numPr>
         <w:spacing w:before="100" w:beforeAutospacing="1" w:after="90"/>
         <w:ind w:left="1020"/>
-        <w:divId w:val="405105006"/>
+        <w:divId w:val="851917686"/>
         <w:rPr>
           <w:rFonts w:ascii="Plus Jakarta Sans" w:eastAsia="Times New Roman" w:hAnsi="Plus Jakarta Sans"/>
           <w:sz w:val="21"/>
@@ -8362,7 +8362,7 @@
         </w:numPr>
         <w:spacing w:before="100" w:beforeAutospacing="1" w:after="90"/>
         <w:ind w:left="1020"/>
-        <w:divId w:val="405105006"/>
+        <w:divId w:val="851917686"/>
         <w:rPr>
           <w:rFonts w:ascii="Plus Jakarta Sans" w:eastAsia="Times New Roman" w:hAnsi="Plus Jakarta Sans"/>
           <w:sz w:val="21"/>
@@ -8416,7 +8416,7 @@
         </w:numPr>
         <w:spacing w:before="100" w:beforeAutospacing="1" w:after="90"/>
         <w:ind w:left="1020"/>
-        <w:divId w:val="405105006"/>
+        <w:divId w:val="851917686"/>
         <w:rPr>
           <w:rFonts w:ascii="Plus Jakarta Sans" w:eastAsia="Times New Roman" w:hAnsi="Plus Jakarta Sans"/>
           <w:sz w:val="21"/>
@@ -8461,7 +8461,7 @@
         </w:numPr>
         <w:spacing w:before="100" w:beforeAutospacing="1" w:after="90"/>
         <w:ind w:left="1020"/>
-        <w:divId w:val="405105006"/>
+        <w:divId w:val="851917686"/>
         <w:rPr>
           <w:rFonts w:ascii="Plus Jakarta Sans" w:eastAsia="Times New Roman" w:hAnsi="Plus Jakarta Sans"/>
           <w:sz w:val="21"/>
@@ -8497,7 +8497,7 @@
         </w:numPr>
         <w:spacing w:before="100" w:beforeAutospacing="1" w:after="90"/>
         <w:ind w:left="1020"/>
-        <w:divId w:val="405105006"/>
+        <w:divId w:val="851917686"/>
         <w:rPr>
           <w:rFonts w:ascii="Plus Jakarta Sans" w:eastAsia="Times New Roman" w:hAnsi="Plus Jakarta Sans"/>
           <w:sz w:val="21"/>
@@ -8542,7 +8542,7 @@
         </w:numPr>
         <w:spacing w:before="100" w:beforeAutospacing="1" w:after="90"/>
         <w:ind w:left="1020"/>
-        <w:divId w:val="405105006"/>
+        <w:divId w:val="851917686"/>
         <w:rPr>
           <w:rFonts w:ascii="Plus Jakarta Sans" w:eastAsia="Times New Roman" w:hAnsi="Plus Jakarta Sans"/>
           <w:sz w:val="21"/>
@@ -8587,7 +8587,7 @@
         </w:numPr>
         <w:spacing w:before="100" w:beforeAutospacing="1" w:after="90"/>
         <w:ind w:left="1020"/>
-        <w:divId w:val="405105006"/>
+        <w:divId w:val="851917686"/>
         <w:rPr>
           <w:rFonts w:ascii="Plus Jakarta Sans" w:eastAsia="Times New Roman" w:hAnsi="Plus Jakarta Sans"/>
           <w:sz w:val="21"/>
@@ -8632,7 +8632,7 @@
         </w:numPr>
         <w:spacing w:before="100" w:beforeAutospacing="1" w:after="90"/>
         <w:ind w:left="1020"/>
-        <w:divId w:val="405105006"/>
+        <w:divId w:val="851917686"/>
         <w:rPr>
           <w:rFonts w:ascii="Plus Jakarta Sans" w:eastAsia="Times New Roman" w:hAnsi="Plus Jakarta Sans"/>
           <w:sz w:val="21"/>
@@ -8668,7 +8668,7 @@
         </w:numPr>
         <w:spacing w:before="100" w:beforeAutospacing="1" w:after="90"/>
         <w:ind w:left="1020"/>
-        <w:divId w:val="405105006"/>
+        <w:divId w:val="851917686"/>
         <w:rPr>
           <w:rFonts w:ascii="Plus Jakarta Sans" w:eastAsia="Times New Roman" w:hAnsi="Plus Jakarta Sans"/>
           <w:sz w:val="21"/>
@@ -8722,7 +8722,7 @@
         </w:numPr>
         <w:spacing w:before="100" w:beforeAutospacing="1" w:after="90"/>
         <w:ind w:left="1020"/>
-        <w:divId w:val="405105006"/>
+        <w:divId w:val="851917686"/>
         <w:rPr>
           <w:rFonts w:ascii="Plus Jakarta Sans" w:eastAsia="Times New Roman" w:hAnsi="Plus Jakarta Sans"/>
           <w:sz w:val="21"/>
@@ -8767,7 +8767,7 @@
         </w:numPr>
         <w:spacing w:before="100" w:beforeAutospacing="1" w:after="90"/>
         <w:ind w:left="1020"/>
-        <w:divId w:val="405105006"/>
+        <w:divId w:val="851917686"/>
         <w:rPr>
           <w:rFonts w:ascii="Plus Jakarta Sans" w:eastAsia="Times New Roman" w:hAnsi="Plus Jakarta Sans"/>
           <w:sz w:val="21"/>
@@ -8807,7 +8807,7 @@
     <w:p>
       <w:pPr>
         <w:pStyle w:val="Ttulo3"/>
-        <w:divId w:val="405105006"/>
+        <w:divId w:val="851917686"/>
         <w:rPr>
           <w:rFonts w:eastAsia="Times New Roman"/>
           <w:lang w:val="es-ES"/>
@@ -8825,7 +8825,7 @@
       <w:pPr>
         <w:spacing w:before="375" w:after="225"/>
         <w:jc w:val="center"/>
-        <w:divId w:val="50659640"/>
+        <w:divId w:val="650716847"/>
         <w:rPr>
           <w:rFonts w:ascii="Outfit" w:eastAsia="Times New Roman" w:hAnsi="Outfit"/>
           <w:b/>
@@ -8855,7 +8855,7 @@
       <w:pPr>
         <w:spacing w:after="375"/>
         <w:jc w:val="center"/>
-        <w:divId w:val="1103299843"/>
+        <w:divId w:val="468203892"/>
         <w:rPr>
           <w:rFonts w:ascii="Plus Jakarta Sans" w:eastAsia="Times New Roman" w:hAnsi="Plus Jakarta Sans"/>
           <w:lang w:val="es-ES"/>
@@ -9145,7 +9145,7 @@
     <w:p>
       <w:pPr>
         <w:spacing w:before="450" w:after="450"/>
-        <w:divId w:val="405105006"/>
+        <w:divId w:val="851917686"/>
         <w:rPr>
           <w:rFonts w:ascii="Plus Jakarta Sans" w:eastAsia="Times New Roman" w:hAnsi="Plus Jakarta Sans"/>
           <w:lang w:val="es-ES"/>
@@ -9156,7 +9156,7 @@
           <w:rFonts w:ascii="Plus Jakarta Sans" w:eastAsia="Times New Roman" w:hAnsi="Plus Jakarta Sans"/>
           <w:lang w:val="es-ES"/>
         </w:rPr>
-        <w:pict w14:anchorId="61316A71">
+        <w:pict w14:anchorId="6E93CBAA">
           <v:rect id="_x0000_i1033" style="width:0;height:.75pt" o:hralign="center" o:hrstd="t" o:hr="t" fillcolor="#a0a0a0" stroked="f"/>
         </w:pict>
       </w:r>
@@ -9164,7 +9164,7 @@
     <w:p>
       <w:pPr>
         <w:pStyle w:val="Ttulo2"/>
-        <w:divId w:val="405105006"/>
+        <w:divId w:val="851917686"/>
         <w:rPr>
           <w:rFonts w:eastAsia="Times New Roman"/>
           <w:lang w:val="es-ES"/>
@@ -9181,7 +9181,7 @@
     <w:p>
       <w:pPr>
         <w:pStyle w:val="NormalWeb"/>
-        <w:divId w:val="405105006"/>
+        <w:divId w:val="851917686"/>
         <w:rPr>
           <w:rFonts w:ascii="Plus Jakarta Sans" w:hAnsi="Plus Jakarta Sans"/>
           <w:lang w:val="es-ES"/>
@@ -9198,7 +9198,7 @@
     <w:p>
       <w:pPr>
         <w:pStyle w:val="NormalWeb"/>
-        <w:divId w:val="405105006"/>
+        <w:divId w:val="851917686"/>
         <w:rPr>
           <w:rFonts w:ascii="Plus Jakarta Sans" w:hAnsi="Plus Jakarta Sans"/>
           <w:lang w:val="es-ES"/>
@@ -9260,7 +9260,7 @@
     <w:p>
       <w:pPr>
         <w:pStyle w:val="NormalWeb"/>
-        <w:divId w:val="405105006"/>
+        <w:divId w:val="851917686"/>
         <w:rPr>
           <w:rFonts w:ascii="Plus Jakarta Sans" w:hAnsi="Plus Jakarta Sans"/>
           <w:lang w:val="es-ES"/>
@@ -9322,7 +9322,7 @@
     <w:p>
       <w:pPr>
         <w:pStyle w:val="NormalWeb"/>
-        <w:divId w:val="405105006"/>
+        <w:divId w:val="851917686"/>
         <w:rPr>
           <w:rFonts w:ascii="Plus Jakarta Sans" w:hAnsi="Plus Jakarta Sans"/>
           <w:lang w:val="es-ES"/>
@@ -9383,7 +9383,7 @@
     <w:p>
       <w:pPr>
         <w:pStyle w:val="NormalWeb"/>
-        <w:divId w:val="405105006"/>
+        <w:divId w:val="851917686"/>
         <w:rPr>
           <w:rFonts w:ascii="Plus Jakarta Sans" w:hAnsi="Plus Jakarta Sans"/>
           <w:lang w:val="es-ES"/>
@@ -9437,7 +9437,7 @@
     <w:p>
       <w:pPr>
         <w:spacing w:before="450" w:after="450"/>
-        <w:divId w:val="405105006"/>
+        <w:divId w:val="851917686"/>
         <w:rPr>
           <w:rFonts w:ascii="Plus Jakarta Sans" w:eastAsia="Times New Roman" w:hAnsi="Plus Jakarta Sans"/>
           <w:lang w:val="es-ES"/>
@@ -9448,7 +9448,7 @@
           <w:rFonts w:ascii="Plus Jakarta Sans" w:eastAsia="Times New Roman" w:hAnsi="Plus Jakarta Sans"/>
           <w:lang w:val="es-ES"/>
         </w:rPr>
-        <w:pict w14:anchorId="3FCD4A84">
+        <w:pict w14:anchorId="36F93464">
           <v:rect id="_x0000_i1034" style="width:0;height:.75pt" o:hralign="center" o:hrstd="t" o:hr="t" fillcolor="#a0a0a0" stroked="f"/>
         </w:pict>
       </w:r>
@@ -9456,7 +9456,7 @@
     <w:p>
       <w:pPr>
         <w:pStyle w:val="Ttulo2"/>
-        <w:divId w:val="405105006"/>
+        <w:divId w:val="851917686"/>
         <w:rPr>
           <w:rFonts w:eastAsia="Times New Roman"/>
           <w:lang w:val="es-ES"/>
@@ -9473,7 +9473,7 @@
     <w:p>
       <w:pPr>
         <w:pStyle w:val="NormalWeb"/>
-        <w:divId w:val="405105006"/>
+        <w:divId w:val="851917686"/>
         <w:rPr>
           <w:rFonts w:ascii="Plus Jakarta Sans" w:hAnsi="Plus Jakarta Sans"/>
           <w:lang w:val="es-ES"/>
@@ -9512,7 +9512,7 @@
     <w:p>
       <w:pPr>
         <w:pStyle w:val="Ttulo3"/>
-        <w:divId w:val="405105006"/>
+        <w:divId w:val="851917686"/>
         <w:rPr>
           <w:rFonts w:eastAsia="Times New Roman"/>
           <w:lang w:val="es-ES"/>
@@ -9546,7 +9546,7 @@
       </w:tblGrid>
       <w:tr>
         <w:trPr>
-          <w:divId w:val="1387879358"/>
+          <w:divId w:val="830289267"/>
           <w:tblHeader/>
         </w:trPr>
         <w:tc>
@@ -9737,7 +9737,7 @@
       </w:tr>
       <w:tr>
         <w:trPr>
-          <w:divId w:val="1387879358"/>
+          <w:divId w:val="830289267"/>
         </w:trPr>
         <w:tc>
           <w:tcPr>
@@ -9893,7 +9893,7 @@
       </w:tr>
       <w:tr>
         <w:trPr>
-          <w:divId w:val="1387879358"/>
+          <w:divId w:val="830289267"/>
         </w:trPr>
         <w:tc>
           <w:tcPr>
@@ -10049,7 +10049,7 @@
       </w:tr>
       <w:tr>
         <w:trPr>
-          <w:divId w:val="1387879358"/>
+          <w:divId w:val="830289267"/>
         </w:trPr>
         <w:tc>
           <w:tcPr>
@@ -10205,7 +10205,7 @@
       </w:tr>
       <w:tr>
         <w:trPr>
-          <w:divId w:val="1387879358"/>
+          <w:divId w:val="830289267"/>
         </w:trPr>
         <w:tc>
           <w:tcPr>
@@ -10367,7 +10367,7 @@
     <w:p>
       <w:pPr>
         <w:pStyle w:val="Ttulo3"/>
-        <w:divId w:val="405105006"/>
+        <w:divId w:val="851917686"/>
         <w:rPr>
           <w:rFonts w:eastAsia="Times New Roman"/>
           <w:lang w:val="es-ES"/>
@@ -10401,7 +10401,7 @@
       </w:tblGrid>
       <w:tr>
         <w:trPr>
-          <w:divId w:val="1561667667"/>
+          <w:divId w:val="1292126954"/>
           <w:tblHeader/>
         </w:trPr>
         <w:tc>
@@ -10592,7 +10592,7 @@
       </w:tr>
       <w:tr>
         <w:trPr>
-          <w:divId w:val="1561667667"/>
+          <w:divId w:val="1292126954"/>
         </w:trPr>
         <w:tc>
           <w:tcPr>
@@ -10749,7 +10749,7 @@
       </w:tr>
       <w:tr>
         <w:trPr>
-          <w:divId w:val="1561667667"/>
+          <w:divId w:val="1292126954"/>
         </w:trPr>
         <w:tc>
           <w:tcPr>
@@ -10908,7 +10908,7 @@
     <w:p>
       <w:pPr>
         <w:pStyle w:val="Ttulo3"/>
-        <w:divId w:val="405105006"/>
+        <w:divId w:val="851917686"/>
         <w:rPr>
           <w:rFonts w:eastAsia="Times New Roman"/>
           <w:lang w:val="es-ES"/>
@@ -10943,7 +10943,7 @@
       </w:tblGrid>
       <w:tr>
         <w:trPr>
-          <w:divId w:val="584874067"/>
+          <w:divId w:val="1269503263"/>
           <w:tblHeader/>
         </w:trPr>
         <w:tc>
@@ -11171,7 +11171,7 @@
       </w:tr>
       <w:tr>
         <w:trPr>
-          <w:divId w:val="584874067"/>
+          <w:divId w:val="1269503263"/>
         </w:trPr>
         <w:tc>
           <w:tcPr>
@@ -11367,7 +11367,7 @@
       </w:tr>
       <w:tr>
         <w:trPr>
-          <w:divId w:val="584874067"/>
+          <w:divId w:val="1269503263"/>
         </w:trPr>
         <w:tc>
           <w:tcPr>
@@ -11552,7 +11552,7 @@
       </w:tr>
       <w:tr>
         <w:trPr>
-          <w:divId w:val="584874067"/>
+          <w:divId w:val="1269503263"/>
         </w:trPr>
         <w:tc>
           <w:tcPr>
@@ -11750,7 +11750,7 @@
     <w:p>
       <w:pPr>
         <w:pStyle w:val="Ttulo4"/>
-        <w:divId w:val="405105006"/>
+        <w:divId w:val="851917686"/>
         <w:rPr>
           <w:rFonts w:eastAsia="Times New Roman"/>
           <w:lang w:val="es-ES"/>
@@ -11768,7 +11768,7 @@
       <w:pPr>
         <w:spacing w:before="375" w:after="225"/>
         <w:jc w:val="center"/>
-        <w:divId w:val="638806010"/>
+        <w:divId w:val="1397628067"/>
         <w:rPr>
           <w:rFonts w:ascii="Outfit" w:eastAsia="Times New Roman" w:hAnsi="Outfit"/>
           <w:b/>
@@ -11798,7 +11798,7 @@
       <w:pPr>
         <w:spacing w:after="375"/>
         <w:jc w:val="center"/>
-        <w:divId w:val="57288442"/>
+        <w:divId w:val="398213200"/>
         <w:rPr>
           <w:rFonts w:ascii="Plus Jakarta Sans" w:eastAsia="Times New Roman" w:hAnsi="Plus Jakarta Sans"/>
           <w:lang w:val="es-ES"/>
@@ -12193,7 +12193,7 @@
     <w:p>
       <w:pPr>
         <w:pStyle w:val="Ttulo3"/>
-        <w:divId w:val="405105006"/>
+        <w:divId w:val="851917686"/>
         <w:rPr>
           <w:rFonts w:eastAsia="Times New Roman"/>
           <w:lang w:val="es-ES"/>
@@ -12225,7 +12225,7 @@
       </w:tblGrid>
       <w:tr>
         <w:trPr>
-          <w:divId w:val="406223200"/>
+          <w:divId w:val="1315989465"/>
           <w:tblHeader/>
         </w:trPr>
         <w:tc>
@@ -12342,7 +12342,7 @@
       </w:tr>
       <w:tr>
         <w:trPr>
-          <w:divId w:val="406223200"/>
+          <w:divId w:val="1315989465"/>
         </w:trPr>
         <w:tc>
           <w:tcPr>
@@ -12438,7 +12438,7 @@
       </w:tr>
       <w:tr>
         <w:trPr>
-          <w:divId w:val="406223200"/>
+          <w:divId w:val="1315989465"/>
         </w:trPr>
         <w:tc>
           <w:tcPr>
@@ -12534,7 +12534,7 @@
       </w:tr>
       <w:tr>
         <w:trPr>
-          <w:divId w:val="406223200"/>
+          <w:divId w:val="1315989465"/>
         </w:trPr>
         <w:tc>
           <w:tcPr>
@@ -12632,7 +12632,7 @@
     <w:p>
       <w:pPr>
         <w:pStyle w:val="NormalWeb"/>
-        <w:divId w:val="405105006"/>
+        <w:divId w:val="851917686"/>
         <w:rPr>
           <w:rFonts w:ascii="Plus Jakarta Sans" w:hAnsi="Plus Jakarta Sans"/>
           <w:lang w:val="es-ES"/>
@@ -12657,7 +12657,7 @@
     <w:p>
       <w:pPr>
         <w:pStyle w:val="Ttulo3"/>
-        <w:divId w:val="405105006"/>
+        <w:divId w:val="851917686"/>
         <w:rPr>
           <w:rFonts w:eastAsia="Times New Roman"/>
           <w:lang w:val="es-ES"/>
@@ -12699,7 +12699,7 @@
       </w:tblGrid>
       <w:tr>
         <w:trPr>
-          <w:divId w:val="153960148"/>
+          <w:divId w:val="45299059"/>
           <w:tblHeader/>
         </w:trPr>
         <w:tc>
@@ -12927,7 +12927,7 @@
       </w:tr>
       <w:tr>
         <w:trPr>
-          <w:divId w:val="153960148"/>
+          <w:divId w:val="45299059"/>
         </w:trPr>
         <w:tc>
           <w:tcPr>
@@ -13113,7 +13113,7 @@
       </w:tr>
       <w:tr>
         <w:trPr>
-          <w:divId w:val="153960148"/>
+          <w:divId w:val="45299059"/>
         </w:trPr>
         <w:tc>
           <w:tcPr>
@@ -13299,7 +13299,7 @@
       </w:tr>
       <w:tr>
         <w:trPr>
-          <w:divId w:val="153960148"/>
+          <w:divId w:val="45299059"/>
         </w:trPr>
         <w:tc>
           <w:tcPr>
@@ -13485,7 +13485,7 @@
       </w:tr>
       <w:tr>
         <w:trPr>
-          <w:divId w:val="153960148"/>
+          <w:divId w:val="45299059"/>
         </w:trPr>
         <w:tc>
           <w:tcPr>
@@ -13678,7 +13678,7 @@
     <w:p>
       <w:pPr>
         <w:pStyle w:val="NormalWeb"/>
-        <w:divId w:val="405105006"/>
+        <w:divId w:val="851917686"/>
         <w:rPr>
           <w:rFonts w:ascii="Plus Jakarta Sans" w:hAnsi="Plus Jakarta Sans"/>
           <w:lang w:val="es-ES"/>
@@ -13725,7 +13725,7 @@
     <w:p>
       <w:pPr>
         <w:pStyle w:val="Ttulo3"/>
-        <w:divId w:val="405105006"/>
+        <w:divId w:val="851917686"/>
         <w:rPr>
           <w:rFonts w:eastAsia="Times New Roman"/>
           <w:lang w:val="es-ES"/>
@@ -13760,7 +13760,7 @@
       </w:tblGrid>
       <w:tr>
         <w:trPr>
-          <w:divId w:val="428503108"/>
+          <w:divId w:val="962228667"/>
           <w:tblHeader/>
         </w:trPr>
         <w:tc>
@@ -13988,7 +13988,7 @@
       </w:tr>
       <w:tr>
         <w:trPr>
-          <w:divId w:val="428503108"/>
+          <w:divId w:val="962228667"/>
         </w:trPr>
         <w:tc>
           <w:tcPr>
@@ -14182,7 +14182,7 @@
       </w:tr>
       <w:tr>
         <w:trPr>
-          <w:divId w:val="428503108"/>
+          <w:divId w:val="962228667"/>
         </w:trPr>
         <w:tc>
           <w:tcPr>
@@ -14378,7 +14378,7 @@
     <w:p>
       <w:pPr>
         <w:pStyle w:val="Ttulo4"/>
-        <w:divId w:val="405105006"/>
+        <w:divId w:val="851917686"/>
         <w:rPr>
           <w:rFonts w:eastAsia="Times New Roman"/>
           <w:lang w:val="es-ES"/>
@@ -14396,7 +14396,7 @@
       <w:pPr>
         <w:spacing w:before="375" w:after="225"/>
         <w:jc w:val="center"/>
-        <w:divId w:val="2044473563"/>
+        <w:divId w:val="1075782831"/>
         <w:rPr>
           <w:rFonts w:ascii="Outfit" w:eastAsia="Times New Roman" w:hAnsi="Outfit"/>
           <w:b/>
@@ -14426,7 +14426,7 @@
       <w:pPr>
         <w:spacing w:after="375"/>
         <w:jc w:val="center"/>
-        <w:divId w:val="1236353305"/>
+        <w:divId w:val="1871450505"/>
         <w:rPr>
           <w:rFonts w:ascii="Plus Jakarta Sans" w:eastAsia="Times New Roman" w:hAnsi="Plus Jakarta Sans"/>
           <w:lang w:val="es-ES"/>
@@ -14814,7 +14814,7 @@
     <w:p>
       <w:pPr>
         <w:pStyle w:val="Ttulo3"/>
-        <w:divId w:val="405105006"/>
+        <w:divId w:val="851917686"/>
         <w:rPr>
           <w:rFonts w:eastAsia="Times New Roman"/>
           <w:lang w:val="es-ES"/>
@@ -14848,7 +14848,7 @@
       </w:tblGrid>
       <w:tr>
         <w:trPr>
-          <w:divId w:val="593977300"/>
+          <w:divId w:val="58527619"/>
           <w:tblHeader/>
         </w:trPr>
         <w:tc>
@@ -15039,7 +15039,7 @@
       </w:tr>
       <w:tr>
         <w:trPr>
-          <w:divId w:val="593977300"/>
+          <w:divId w:val="58527619"/>
         </w:trPr>
         <w:tc>
           <w:tcPr>
@@ -15195,7 +15195,7 @@
       </w:tr>
       <w:tr>
         <w:trPr>
-          <w:divId w:val="593977300"/>
+          <w:divId w:val="58527619"/>
         </w:trPr>
         <w:tc>
           <w:tcPr>
@@ -15351,7 +15351,7 @@
       </w:tr>
       <w:tr>
         <w:trPr>
-          <w:divId w:val="593977300"/>
+          <w:divId w:val="58527619"/>
         </w:trPr>
         <w:tc>
           <w:tcPr>
@@ -15507,7 +15507,7 @@
       </w:tr>
       <w:tr>
         <w:trPr>
-          <w:divId w:val="593977300"/>
+          <w:divId w:val="58527619"/>
         </w:trPr>
         <w:tc>
           <w:tcPr>
@@ -15663,7 +15663,7 @@
       </w:tr>
       <w:tr>
         <w:trPr>
-          <w:divId w:val="593977300"/>
+          <w:divId w:val="58527619"/>
         </w:trPr>
         <w:tc>
           <w:tcPr>
@@ -15819,7 +15819,7 @@
       </w:tr>
       <w:tr>
         <w:trPr>
-          <w:divId w:val="593977300"/>
+          <w:divId w:val="58527619"/>
         </w:trPr>
         <w:tc>
           <w:tcPr>
@@ -15977,7 +15977,7 @@
     <w:p>
       <w:pPr>
         <w:pStyle w:val="Ttulo3"/>
-        <w:divId w:val="405105006"/>
+        <w:divId w:val="851917686"/>
         <w:rPr>
           <w:rFonts w:eastAsia="Times New Roman"/>
           <w:lang w:val="es-ES"/>
@@ -16011,7 +16011,7 @@
       </w:tblGrid>
       <w:tr>
         <w:trPr>
-          <w:divId w:val="254021730"/>
+          <w:divId w:val="1585526202"/>
           <w:tblHeader/>
         </w:trPr>
         <w:tc>
@@ -16202,7 +16202,7 @@
       </w:tr>
       <w:tr>
         <w:trPr>
-          <w:divId w:val="254021730"/>
+          <w:divId w:val="1585526202"/>
         </w:trPr>
         <w:tc>
           <w:tcPr>
@@ -16358,7 +16358,7 @@
       </w:tr>
       <w:tr>
         <w:trPr>
-          <w:divId w:val="254021730"/>
+          <w:divId w:val="1585526202"/>
         </w:trPr>
         <w:tc>
           <w:tcPr>
@@ -16514,7 +16514,7 @@
       </w:tr>
       <w:tr>
         <w:trPr>
-          <w:divId w:val="254021730"/>
+          <w:divId w:val="1585526202"/>
         </w:trPr>
         <w:tc>
           <w:tcPr>
@@ -16670,7 +16670,7 @@
       </w:tr>
       <w:tr>
         <w:trPr>
-          <w:divId w:val="254021730"/>
+          <w:divId w:val="1585526202"/>
         </w:trPr>
         <w:tc>
           <w:tcPr>
@@ -16826,7 +16826,7 @@
       </w:tr>
       <w:tr>
         <w:trPr>
-          <w:divId w:val="254021730"/>
+          <w:divId w:val="1585526202"/>
         </w:trPr>
         <w:tc>
           <w:tcPr>
@@ -16984,7 +16984,7 @@
     <w:p>
       <w:pPr>
         <w:pStyle w:val="Ttulo3"/>
-        <w:divId w:val="405105006"/>
+        <w:divId w:val="851917686"/>
         <w:rPr>
           <w:rFonts w:eastAsia="Times New Roman"/>
           <w:lang w:val="es-ES"/>
@@ -17018,7 +17018,7 @@
       </w:tblGrid>
       <w:tr>
         <w:trPr>
-          <w:divId w:val="1138647899"/>
+          <w:divId w:val="425274019"/>
           <w:tblHeader/>
         </w:trPr>
         <w:tc>
@@ -17209,7 +17209,7 @@
       </w:tr>
       <w:tr>
         <w:trPr>
-          <w:divId w:val="1138647899"/>
+          <w:divId w:val="425274019"/>
         </w:trPr>
         <w:tc>
           <w:tcPr>
@@ -17365,7 +17365,7 @@
       </w:tr>
       <w:tr>
         <w:trPr>
-          <w:divId w:val="1138647899"/>
+          <w:divId w:val="425274019"/>
         </w:trPr>
         <w:tc>
           <w:tcPr>
@@ -17424,37 +17424,37 @@
                 <w:sz w:val="20"/>
                 <w:szCs w:val="20"/>
               </w:rPr>
-              <w:t>533</w:t>
-            </w:r>
-          </w:p>
-        </w:tc>
-        <w:tc>
-          <w:tcPr>
-            <w:tcW w:w="0" w:type="auto"/>
-            <w:tcMar>
-              <w:top w:w="150" w:type="dxa"/>
-              <w:left w:w="210" w:type="dxa"/>
-              <w:bottom w:w="150" w:type="dxa"/>
-              <w:right w:w="210" w:type="dxa"/>
-            </w:tcMar>
-            <w:vAlign w:val="center"/>
-            <w:hideMark/>
-          </w:tcPr>
-          <w:p>
-            <w:pPr>
-              <w:rPr>
-                <w:rFonts w:ascii="Plus Jakarta Sans" w:eastAsia="Times New Roman" w:hAnsi="Plus Jakarta Sans"/>
-                <w:sz w:val="20"/>
-                <w:szCs w:val="20"/>
-              </w:rPr>
-            </w:pPr>
-            <w:r>
-              <w:rPr>
-                <w:rFonts w:ascii="Plus Jakarta Sans" w:eastAsia="Times New Roman" w:hAnsi="Plus Jakarta Sans"/>
-                <w:sz w:val="20"/>
-                <w:szCs w:val="20"/>
-              </w:rPr>
-              <w:t>528</w:t>
+              <w:t>551</w:t>
+            </w:r>
+          </w:p>
+        </w:tc>
+        <w:tc>
+          <w:tcPr>
+            <w:tcW w:w="0" w:type="auto"/>
+            <w:tcMar>
+              <w:top w:w="150" w:type="dxa"/>
+              <w:left w:w="210" w:type="dxa"/>
+              <w:bottom w:w="150" w:type="dxa"/>
+              <w:right w:w="210" w:type="dxa"/>
+            </w:tcMar>
+            <w:vAlign w:val="center"/>
+            <w:hideMark/>
+          </w:tcPr>
+          <w:p>
+            <w:pPr>
+              <w:rPr>
+                <w:rFonts w:ascii="Plus Jakarta Sans" w:eastAsia="Times New Roman" w:hAnsi="Plus Jakarta Sans"/>
+                <w:sz w:val="20"/>
+                <w:szCs w:val="20"/>
+              </w:rPr>
+            </w:pPr>
+            <w:r>
+              <w:rPr>
+                <w:rFonts w:ascii="Plus Jakarta Sans" w:eastAsia="Times New Roman" w:hAnsi="Plus Jakarta Sans"/>
+                <w:sz w:val="20"/>
+                <w:szCs w:val="20"/>
+              </w:rPr>
+              <w:t>531</w:t>
             </w:r>
           </w:p>
         </w:tc>
@@ -17514,7 +17514,7 @@
                 <w:sz w:val="20"/>
                 <w:szCs w:val="20"/>
               </w:rPr>
-              <w:t>1,266</w:t>
+              <w:t>1,287</w:t>
             </w:r>
           </w:p>
         </w:tc>
@@ -17523,7 +17523,7 @@
     <w:p>
       <w:pPr>
         <w:pStyle w:val="Ttulo4"/>
-        <w:divId w:val="405105006"/>
+        <w:divId w:val="851917686"/>
         <w:rPr>
           <w:rFonts w:eastAsia="Times New Roman"/>
           <w:lang w:val="es-ES"/>
@@ -17541,7 +17541,7 @@
       <w:pPr>
         <w:spacing w:before="375" w:after="225"/>
         <w:jc w:val="center"/>
-        <w:divId w:val="1287203001"/>
+        <w:divId w:val="1283923740"/>
         <w:rPr>
           <w:rFonts w:ascii="Outfit" w:eastAsia="Times New Roman" w:hAnsi="Outfit"/>
           <w:b/>
@@ -17571,7 +17571,7 @@
       <w:pPr>
         <w:spacing w:after="375"/>
         <w:jc w:val="center"/>
-        <w:divId w:val="1261915259"/>
+        <w:divId w:val="263344979"/>
         <w:rPr>
           <w:rFonts w:ascii="Plus Jakarta Sans" w:eastAsia="Times New Roman" w:hAnsi="Plus Jakarta Sans"/>
           <w:lang w:val="es-ES"/>
@@ -17750,7 +17750,7 @@
           <w:rFonts w:ascii="Plus Jakarta Sans" w:eastAsia="Times New Roman" w:hAnsi="Plus Jakarta Sans"/>
           <w:lang w:val="es-ES"/>
         </w:rPr>
-        <w:t>68</w:t>
+        <w:t>67</w:t>
       </w:r>
       <w:r>
         <w:rPr>
@@ -17771,7 +17771,7 @@
           <w:rFonts w:ascii="Plus Jakarta Sans" w:eastAsia="Times New Roman" w:hAnsi="Plus Jakarta Sans"/>
           <w:lang w:val="es-ES"/>
         </w:rPr>
-        <w:t>31</w:t>
+        <w:t>32</w:t>
       </w:r>
       <w:r>
         <w:rPr>
@@ -17959,7 +17959,7 @@
     <w:p>
       <w:pPr>
         <w:spacing w:before="450" w:after="450"/>
-        <w:divId w:val="405105006"/>
+        <w:divId w:val="851917686"/>
         <w:rPr>
           <w:rFonts w:ascii="Plus Jakarta Sans" w:eastAsia="Times New Roman" w:hAnsi="Plus Jakarta Sans"/>
           <w:lang w:val="es-ES"/>
@@ -17970,7 +17970,7 @@
           <w:rFonts w:ascii="Plus Jakarta Sans" w:eastAsia="Times New Roman" w:hAnsi="Plus Jakarta Sans"/>
           <w:lang w:val="es-ES"/>
         </w:rPr>
-        <w:pict w14:anchorId="41B08D88">
+        <w:pict w14:anchorId="115BAF15">
           <v:rect id="_x0000_i1035" style="width:0;height:.75pt" o:hralign="center" o:hrstd="t" o:hr="t" fillcolor="#a0a0a0" stroked="f"/>
         </w:pict>
       </w:r>
@@ -17978,7 +17978,7 @@
     <w:p>
       <w:pPr>
         <w:spacing w:before="450" w:after="450"/>
-        <w:divId w:val="405105006"/>
+        <w:divId w:val="851917686"/>
         <w:rPr>
           <w:rFonts w:ascii="Plus Jakarta Sans" w:eastAsia="Times New Roman" w:hAnsi="Plus Jakarta Sans"/>
           <w:lang w:val="es-ES"/>
@@ -17989,7 +17989,7 @@
           <w:rFonts w:ascii="Plus Jakarta Sans" w:eastAsia="Times New Roman" w:hAnsi="Plus Jakarta Sans"/>
           <w:lang w:val="es-ES"/>
         </w:rPr>
-        <w:pict w14:anchorId="2D32839B">
+        <w:pict w14:anchorId="05586870">
           <v:rect id="_x0000_i1036" style="width:0;height:.75pt" o:hralign="center" o:hrstd="t" o:hr="t" fillcolor="#a0a0a0" stroked="f"/>
         </w:pict>
       </w:r>
@@ -17997,7 +17997,7 @@
     <w:p>
       <w:pPr>
         <w:pStyle w:val="NormalWeb"/>
-        <w:divId w:val="405105006"/>
+        <w:divId w:val="851917686"/>
         <w:rPr>
           <w:rFonts w:ascii="Plus Jakarta Sans" w:hAnsi="Plus Jakarta Sans"/>
           <w:lang w:val="es-ES"/>
@@ -18030,7 +18030,7 @@
           <w:rFonts w:ascii="Plus Jakarta Sans" w:hAnsi="Plus Jakarta Sans"/>
           <w:lang w:val="es-ES"/>
         </w:rPr>
-        <w:pict w14:anchorId="05EFAC0D"/>
+        <w:pict w14:anchorId="2BAB3FD2"/>
       </w:r>
     </w:p>
     <w:sectPr>
@@ -18046,9 +18046,9 @@
 <file path=word/numbering.xml><?xml version="1.0" encoding="utf-8"?>
 <w:numbering xmlns:wpc="http://schemas.microsoft.com/office/word/2010/wordprocessingCanvas" xmlns:cx="http://schemas.microsoft.com/office/drawing/2014/chartex" xmlns:cx1="http://schemas.microsoft.com/office/drawing/2015/9/8/chartex" xmlns:cx2="http://schemas.microsoft.com/office/drawing/2015/10/21/chartex" xmlns:cx3="http://schemas.microsoft.com/office/drawing/2016/5/9/chartex" xmlns:cx4="http://schemas.microsoft.com/office/drawing/2016/5/10/chartex" xmlns:cx5="http://schemas.microsoft.com/office/drawing/2016/5/11/chartex" xmlns:cx6="http://schemas.microsoft.com/office/drawing/2016/5/12/chartex" xmlns:cx7="http://schemas.microsoft.com/office/drawing/2016/5/13/chartex" xmlns:cx8="http://schemas.microsoft.com/office/drawing/2016/5/14/chartex" xmlns:mc="http://schemas.openxmlformats.org/markup-compatibility/2006" xmlns:aink="http://schemas.microsoft.com/office/drawing/2016/ink" xmlns:am3d="http://schemas.microsoft.com/office/drawing/2017/model3d" xmlns:o="urn:schemas-microsoft-com:office:office" xmlns:r="http://schemas.openxmlformats.org/officeDocument/2006/relationships" xmlns:m="http://schemas.openxmlformats.org/officeDocument/2006/math" xmlns:v="urn:schemas-microsoft-com:vml" xmlns:wp14="http://schemas.microsoft.com/office/word/2010/wordprocessingDrawing" xmlns:wp="http://schemas.openxmlformats.org/drawingml/2006/wordprocessingDrawing" xmlns:w10="urn:schemas-microsoft-com:office:word" xmlns:w="http://schemas.openxmlformats.org/wordprocessingml/2006/main" xmlns:w14="http://schemas.microsoft.com/office/word/2010/wordml" xmlns:w15="http://schemas.microsoft.com/office/word/2012/wordml" xmlns:w16cex="http://schemas.microsoft.com/office/word/2018/wordml/cex" xmlns:w16cid="http://schemas.microsoft.com/office/word/2016/wordml/cid" xmlns:w16="http://schemas.microsoft.com/office/word/2018/wordml" xmlns:w16sdtdh="http://schemas.microsoft.com/office/word/2020/wordml/sdtdatahash" xmlns:w16se="http://schemas.microsoft.com/office/word/2015/wordml/symex" xmlns:wpg="http://schemas.microsoft.com/office/word/2010/wordprocessingGroup" xmlns:wpi="http://schemas.microsoft.com/office/word/2010/wordprocessingInk" xmlns:wne="http://schemas.microsoft.com/office/word/2006/wordml" xmlns:wps="http://schemas.microsoft.com/office/word/2010/wordprocessingShape" mc:Ignorable="w14 w15 w16se w16cid w16 w16cex w16sdtdh wp14">
   <w:abstractNum w:abstractNumId="0" w15:restartNumberingAfterBreak="0">
-    <w:nsid w:val="048A5EFD"/>
+    <w:nsid w:val="47F37629"/>
     <w:multiLevelType w:val="multilevel"/>
-    <w:tmpl w:val="DA92B1E2"/>
+    <w:tmpl w:val="95846878"/>
     <w:lvl w:ilvl="0">
       <w:start w:val="1"/>
       <w:numFmt w:val="bullet"/>
@@ -18195,9 +18195,9 @@
     </w:lvl>
   </w:abstractNum>
   <w:abstractNum w:abstractNumId="1" w15:restartNumberingAfterBreak="0">
-    <w:nsid w:val="2AC927AE"/>
+    <w:nsid w:val="62D67D0A"/>
     <w:multiLevelType w:val="multilevel"/>
-    <w:tmpl w:val="D6C4C91E"/>
+    <w:tmpl w:val="983838A8"/>
     <w:lvl w:ilvl="0">
       <w:start w:val="1"/>
       <w:numFmt w:val="bullet"/>
@@ -18344,9 +18344,9 @@
     </w:lvl>
   </w:abstractNum>
   <w:abstractNum w:abstractNumId="2" w15:restartNumberingAfterBreak="0">
-    <w:nsid w:val="58BF6F92"/>
+    <w:nsid w:val="6676066B"/>
     <w:multiLevelType w:val="multilevel"/>
-    <w:tmpl w:val="FD86BB48"/>
+    <w:tmpl w:val="E4728232"/>
     <w:lvl w:ilvl="0">
       <w:start w:val="1"/>
       <w:numFmt w:val="bullet"/>
@@ -18493,9 +18493,9 @@
     </w:lvl>
   </w:abstractNum>
   <w:abstractNum w:abstractNumId="3" w15:restartNumberingAfterBreak="0">
-    <w:nsid w:val="6D1046A1"/>
+    <w:nsid w:val="7E8751C8"/>
     <w:multiLevelType w:val="multilevel"/>
-    <w:tmpl w:val="97784994"/>
+    <w:tmpl w:val="37D07E0A"/>
     <w:lvl w:ilvl="0">
       <w:start w:val="1"/>
       <w:numFmt w:val="bullet"/>
@@ -18642,16 +18642,16 @@
     </w:lvl>
   </w:abstractNum>
   <w:num w:numId="1">
-    <w:abstractNumId w:val="1"/>
+    <w:abstractNumId w:val="3"/>
   </w:num>
   <w:num w:numId="2">
-    <w:abstractNumId w:val="0"/>
+    <w:abstractNumId w:val="1"/>
   </w:num>
   <w:num w:numId="3">
     <w:abstractNumId w:val="2"/>
   </w:num>
   <w:num w:numId="4">
-    <w:abstractNumId w:val="3"/>
+    <w:abstractNumId w:val="0"/>
   </w:num>
 </w:numbering>
 </file>

</xml_diff>

<commit_message>
feat: fichas hijas Fase 2 (dashboard, mapa, modal) + data sync piloto Sector 3
- 267 fichas hijas generadas desde Sección 7 (piloto Sector 3)
- Dashboard: KPI separado principales vs hijas; stats excluyen hijas pendientes
- FichasPage: columna Tipo + filtro por tipo de ficha
- Modal: banner ficha hija + navegación madre <-> hija + auditoría
- Mapa: puntos blancos discontinuos para hijas pendientes + toggle leyenda
- Export: stats.json con desglose + auditoria_fichas_hijas.json

Co-Authored-By: Claude Fable 5 <noreply@anthropic.com>
</commit_message>
<xml_diff>
--- a/public/informe_reunion_tecnica.docx
+++ b/public/informe_reunion_tecnica.docx
@@ -4,7 +4,7 @@
   <w:body>
     <w:p>
       <w:pPr>
-        <w:divId w:val="881483099"/>
+        <w:divId w:val="90901179"/>
         <w:rPr>
           <w:rFonts w:ascii="Plus Jakarta Sans" w:eastAsia="Times New Roman" w:hAnsi="Plus Jakarta Sans"/>
           <w:lang w:val="es-ES"/>
@@ -28,7 +28,7 @@
     <w:p>
       <w:pPr>
         <w:pStyle w:val="Ttulo1"/>
-        <w:divId w:val="851917686"/>
+        <w:divId w:val="774710797"/>
         <w:rPr>
           <w:rFonts w:eastAsia="Times New Roman"/>
           <w:lang w:val="es-ES"/>
@@ -45,7 +45,7 @@
     <w:p>
       <w:pPr>
         <w:pStyle w:val="NormalWeb"/>
-        <w:divId w:val="851917686"/>
+        <w:divId w:val="774710797"/>
         <w:rPr>
           <w:rFonts w:ascii="Plus Jakarta Sans" w:hAnsi="Plus Jakarta Sans"/>
           <w:lang w:val="es-ES"/>
@@ -63,7 +63,7 @@
     <w:p>
       <w:pPr>
         <w:pStyle w:val="NormalWeb"/>
-        <w:divId w:val="851917686"/>
+        <w:divId w:val="774710797"/>
         <w:rPr>
           <w:rFonts w:ascii="Plus Jakarta Sans" w:hAnsi="Plus Jakarta Sans"/>
           <w:lang w:val="es-ES"/>
@@ -102,7 +102,7 @@
     <w:p>
       <w:pPr>
         <w:spacing w:before="450" w:after="450"/>
-        <w:divId w:val="851917686"/>
+        <w:divId w:val="774710797"/>
         <w:rPr>
           <w:rFonts w:ascii="Plus Jakarta Sans" w:eastAsia="Times New Roman" w:hAnsi="Plus Jakarta Sans"/>
           <w:lang w:val="es-ES"/>
@@ -113,7 +113,7 @@
           <w:rFonts w:ascii="Plus Jakarta Sans" w:eastAsia="Times New Roman" w:hAnsi="Plus Jakarta Sans"/>
           <w:lang w:val="es-ES"/>
         </w:rPr>
-        <w:pict w14:anchorId="2F5841BF">
+        <w:pict w14:anchorId="181F3B43">
           <v:rect id="_x0000_i1025" style="width:0;height:.75pt" o:hralign="center" o:hrstd="t" o:hr="t" fillcolor="#a0a0a0" stroked="f"/>
         </w:pict>
       </w:r>
@@ -121,7 +121,7 @@
     <w:p>
       <w:pPr>
         <w:pStyle w:val="Ttulo2"/>
-        <w:divId w:val="851917686"/>
+        <w:divId w:val="774710797"/>
         <w:rPr>
           <w:rFonts w:eastAsia="Times New Roman"/>
           <w:lang w:val="es-ES"/>
@@ -145,7 +145,7 @@
     <w:p>
       <w:pPr>
         <w:pStyle w:val="NormalWeb"/>
-        <w:divId w:val="851917686"/>
+        <w:divId w:val="774710797"/>
         <w:rPr>
           <w:rFonts w:ascii="Plus Jakarta Sans" w:hAnsi="Plus Jakarta Sans"/>
           <w:lang w:val="es-ES"/>
@@ -167,7 +167,7 @@
         </w:numPr>
         <w:spacing w:before="100" w:beforeAutospacing="1" w:after="90"/>
         <w:ind w:left="1020"/>
-        <w:divId w:val="851917686"/>
+        <w:divId w:val="774710797"/>
         <w:rPr>
           <w:rFonts w:ascii="Plus Jakarta Sans" w:eastAsia="Times New Roman" w:hAnsi="Plus Jakarta Sans"/>
           <w:sz w:val="21"/>
@@ -213,7 +213,7 @@
         </w:numPr>
         <w:spacing w:before="100" w:beforeAutospacing="1" w:after="90"/>
         <w:ind w:left="1020"/>
-        <w:divId w:val="851917686"/>
+        <w:divId w:val="774710797"/>
         <w:rPr>
           <w:rFonts w:ascii="Plus Jakarta Sans" w:eastAsia="Times New Roman" w:hAnsi="Plus Jakarta Sans"/>
           <w:sz w:val="21"/>
@@ -269,7 +269,7 @@
         </w:numPr>
         <w:spacing w:before="100" w:beforeAutospacing="1" w:after="90"/>
         <w:ind w:left="1020"/>
-        <w:divId w:val="851917686"/>
+        <w:divId w:val="774710797"/>
         <w:rPr>
           <w:rFonts w:ascii="Plus Jakarta Sans" w:eastAsia="Times New Roman" w:hAnsi="Plus Jakarta Sans"/>
           <w:sz w:val="21"/>
@@ -315,7 +315,7 @@
         </w:numPr>
         <w:spacing w:before="100" w:beforeAutospacing="1" w:after="90"/>
         <w:ind w:left="1020"/>
-        <w:divId w:val="851917686"/>
+        <w:divId w:val="774710797"/>
         <w:rPr>
           <w:rFonts w:ascii="Plus Jakarta Sans" w:eastAsia="Times New Roman" w:hAnsi="Plus Jakarta Sans"/>
           <w:sz w:val="21"/>
@@ -356,7 +356,7 @@
     <w:p>
       <w:pPr>
         <w:spacing w:before="450" w:after="450"/>
-        <w:divId w:val="851917686"/>
+        <w:divId w:val="774710797"/>
         <w:rPr>
           <w:rFonts w:ascii="Plus Jakarta Sans" w:eastAsia="Times New Roman" w:hAnsi="Plus Jakarta Sans"/>
           <w:lang w:val="es-ES"/>
@@ -367,7 +367,7 @@
           <w:rFonts w:ascii="Plus Jakarta Sans" w:eastAsia="Times New Roman" w:hAnsi="Plus Jakarta Sans"/>
           <w:lang w:val="es-ES"/>
         </w:rPr>
-        <w:pict w14:anchorId="67DF0CB5">
+        <w:pict w14:anchorId="013141BA">
           <v:rect id="_x0000_i1026" style="width:0;height:.75pt" o:hralign="center" o:hrstd="t" o:hr="t" fillcolor="#a0a0a0" stroked="f"/>
         </w:pict>
       </w:r>
@@ -375,7 +375,7 @@
     <w:p>
       <w:pPr>
         <w:pStyle w:val="Ttulo2"/>
-        <w:divId w:val="851917686"/>
+        <w:divId w:val="774710797"/>
         <w:rPr>
           <w:rFonts w:eastAsia="Times New Roman"/>
           <w:lang w:val="es-ES"/>
@@ -392,7 +392,7 @@
     <w:p>
       <w:pPr>
         <w:pStyle w:val="NormalWeb"/>
-        <w:divId w:val="851917686"/>
+        <w:divId w:val="774710797"/>
         <w:rPr>
           <w:rFonts w:ascii="Plus Jakarta Sans" w:hAnsi="Plus Jakarta Sans"/>
           <w:lang w:val="es-ES"/>
@@ -445,7 +445,7 @@
       </w:tblGrid>
       <w:tr>
         <w:trPr>
-          <w:divId w:val="88504598"/>
+          <w:divId w:val="1724712861"/>
           <w:tblHeader/>
         </w:trPr>
         <w:tc>
@@ -525,7 +525,7 @@
       </w:tr>
       <w:tr>
         <w:trPr>
-          <w:divId w:val="88504598"/>
+          <w:divId w:val="1724712861"/>
         </w:trPr>
         <w:tc>
           <w:tcPr>
@@ -591,7 +591,7 @@
       </w:tr>
       <w:tr>
         <w:trPr>
-          <w:divId w:val="88504598"/>
+          <w:divId w:val="1724712861"/>
         </w:trPr>
         <w:tc>
           <w:tcPr>
@@ -657,7 +657,7 @@
       </w:tr>
       <w:tr>
         <w:trPr>
-          <w:divId w:val="88504598"/>
+          <w:divId w:val="1724712861"/>
         </w:trPr>
         <w:tc>
           <w:tcPr>
@@ -723,7 +723,7 @@
       </w:tr>
       <w:tr>
         <w:trPr>
-          <w:divId w:val="88504598"/>
+          <w:divId w:val="1724712861"/>
         </w:trPr>
         <w:tc>
           <w:tcPr>
@@ -791,7 +791,7 @@
     <w:p>
       <w:pPr>
         <w:spacing w:before="450" w:after="450"/>
-        <w:divId w:val="851917686"/>
+        <w:divId w:val="774710797"/>
         <w:rPr>
           <w:rFonts w:ascii="Plus Jakarta Sans" w:eastAsia="Times New Roman" w:hAnsi="Plus Jakarta Sans"/>
           <w:lang w:val="es-ES"/>
@@ -803,7 +803,7 @@
           <w:lang w:val="es-ES"/>
         </w:rPr>
         <w:lastRenderedPageBreak/>
-        <w:pict w14:anchorId="72F7712A">
+        <w:pict w14:anchorId="59B31B84">
           <v:rect id="_x0000_i1027" style="width:0;height:.75pt" o:hralign="center" o:hrstd="t" o:hr="t" fillcolor="#a0a0a0" stroked="f"/>
         </w:pict>
       </w:r>
@@ -811,7 +811,7 @@
     <w:p>
       <w:pPr>
         <w:pStyle w:val="Ttulo2"/>
-        <w:divId w:val="851917686"/>
+        <w:divId w:val="774710797"/>
         <w:rPr>
           <w:rFonts w:eastAsia="Times New Roman"/>
           <w:lang w:val="es-ES"/>
@@ -828,7 +828,7 @@
     <w:p>
       <w:pPr>
         <w:pStyle w:val="Ttulo3"/>
-        <w:divId w:val="851917686"/>
+        <w:divId w:val="774710797"/>
         <w:rPr>
           <w:rFonts w:eastAsia="Times New Roman"/>
           <w:lang w:val="es-ES"/>
@@ -845,7 +845,7 @@
     <w:p>
       <w:pPr>
         <w:pStyle w:val="NormalWeb"/>
-        <w:divId w:val="851917686"/>
+        <w:divId w:val="774710797"/>
         <w:rPr>
           <w:rFonts w:ascii="Plus Jakarta Sans" w:hAnsi="Plus Jakarta Sans"/>
           <w:lang w:val="es-ES"/>
@@ -885,7 +885,7 @@
       </w:tblGrid>
       <w:tr>
         <w:trPr>
-          <w:divId w:val="731659834"/>
+          <w:divId w:val="268045967"/>
           <w:tblHeader/>
         </w:trPr>
         <w:tc>
@@ -1039,7 +1039,7 @@
       </w:tr>
       <w:tr>
         <w:trPr>
-          <w:divId w:val="731659834"/>
+          <w:divId w:val="268045967"/>
         </w:trPr>
         <w:tc>
           <w:tcPr>
@@ -1165,7 +1165,7 @@
       </w:tr>
       <w:tr>
         <w:trPr>
-          <w:divId w:val="731659834"/>
+          <w:divId w:val="268045967"/>
         </w:trPr>
         <w:tc>
           <w:tcPr>
@@ -1291,7 +1291,7 @@
       </w:tr>
       <w:tr>
         <w:trPr>
-          <w:divId w:val="731659834"/>
+          <w:divId w:val="268045967"/>
         </w:trPr>
         <w:tc>
           <w:tcPr>
@@ -1417,7 +1417,7 @@
       </w:tr>
       <w:tr>
         <w:trPr>
-          <w:divId w:val="731659834"/>
+          <w:divId w:val="268045967"/>
         </w:trPr>
         <w:tc>
           <w:tcPr>
@@ -1543,7 +1543,7 @@
       </w:tr>
       <w:tr>
         <w:trPr>
-          <w:divId w:val="731659834"/>
+          <w:divId w:val="268045967"/>
         </w:trPr>
         <w:tc>
           <w:tcPr>
@@ -1677,7 +1677,7 @@
       </w:tr>
       <w:tr>
         <w:trPr>
-          <w:divId w:val="731659834"/>
+          <w:divId w:val="268045967"/>
         </w:trPr>
         <w:tc>
           <w:tcPr>
@@ -1803,7 +1803,7 @@
       </w:tr>
       <w:tr>
         <w:trPr>
-          <w:divId w:val="731659834"/>
+          <w:divId w:val="268045967"/>
         </w:trPr>
         <w:tc>
           <w:tcPr>
@@ -1929,7 +1929,7 @@
       </w:tr>
       <w:tr>
         <w:trPr>
-          <w:divId w:val="731659834"/>
+          <w:divId w:val="268045967"/>
         </w:trPr>
         <w:tc>
           <w:tcPr>
@@ -2057,7 +2057,7 @@
     <w:p>
       <w:pPr>
         <w:pStyle w:val="Ttulo3"/>
-        <w:divId w:val="851917686"/>
+        <w:divId w:val="774710797"/>
         <w:rPr>
           <w:rFonts w:eastAsia="Times New Roman"/>
           <w:lang w:val="es-ES"/>
@@ -2074,7 +2074,7 @@
     <w:p>
       <w:pPr>
         <w:pStyle w:val="NormalWeb"/>
-        <w:divId w:val="851917686"/>
+        <w:divId w:val="774710797"/>
         <w:rPr>
           <w:rFonts w:ascii="Plus Jakarta Sans" w:hAnsi="Plus Jakarta Sans"/>
           <w:lang w:val="es-ES"/>
@@ -2103,7 +2103,7 @@
         </w:numPr>
         <w:spacing w:before="100" w:beforeAutospacing="1" w:after="90"/>
         <w:ind w:left="1020"/>
-        <w:divId w:val="851917686"/>
+        <w:divId w:val="774710797"/>
         <w:rPr>
           <w:rFonts w:ascii="Plus Jakarta Sans" w:eastAsia="Times New Roman" w:hAnsi="Plus Jakarta Sans"/>
           <w:sz w:val="21"/>
@@ -2205,7 +2205,7 @@
         </w:numPr>
         <w:spacing w:before="100" w:beforeAutospacing="1" w:after="90"/>
         <w:ind w:left="1020"/>
-        <w:divId w:val="851917686"/>
+        <w:divId w:val="774710797"/>
         <w:rPr>
           <w:rFonts w:ascii="Plus Jakarta Sans" w:eastAsia="Times New Roman" w:hAnsi="Plus Jakarta Sans"/>
           <w:sz w:val="21"/>
@@ -2317,7 +2317,7 @@
         </w:numPr>
         <w:spacing w:before="100" w:beforeAutospacing="1" w:after="90"/>
         <w:ind w:left="1020"/>
-        <w:divId w:val="851917686"/>
+        <w:divId w:val="774710797"/>
         <w:rPr>
           <w:rFonts w:ascii="Plus Jakarta Sans" w:eastAsia="Times New Roman" w:hAnsi="Plus Jakarta Sans"/>
           <w:sz w:val="21"/>
@@ -2423,7 +2423,7 @@
     <w:p>
       <w:pPr>
         <w:pStyle w:val="Ttulo3"/>
-        <w:divId w:val="851917686"/>
+        <w:divId w:val="774710797"/>
         <w:rPr>
           <w:rFonts w:eastAsia="Times New Roman"/>
           <w:lang w:val="es-ES"/>
@@ -2440,7 +2440,7 @@
     <w:p>
       <w:pPr>
         <w:jc w:val="center"/>
-        <w:divId w:val="1978148399"/>
+        <w:divId w:val="194315215"/>
         <w:rPr>
           <w:rFonts w:ascii="Outfit" w:eastAsia="Times New Roman" w:hAnsi="Outfit"/>
           <w:b/>
@@ -2469,7 +2469,7 @@
     <w:p>
       <w:pPr>
         <w:jc w:val="center"/>
-        <w:divId w:val="1895659601"/>
+        <w:divId w:val="473375114"/>
         <w:rPr>
           <w:rFonts w:ascii="Plus Jakarta Sans" w:eastAsia="Times New Roman" w:hAnsi="Plus Jakarta Sans"/>
           <w:lang w:val="es-ES"/>
@@ -2864,7 +2864,7 @@
     <w:p>
       <w:pPr>
         <w:spacing w:before="450" w:after="450"/>
-        <w:divId w:val="851917686"/>
+        <w:divId w:val="774710797"/>
         <w:rPr>
           <w:rFonts w:ascii="Plus Jakarta Sans" w:eastAsia="Times New Roman" w:hAnsi="Plus Jakarta Sans"/>
           <w:lang w:val="es-ES"/>
@@ -2875,7 +2875,7 @@
           <w:rFonts w:ascii="Plus Jakarta Sans" w:eastAsia="Times New Roman" w:hAnsi="Plus Jakarta Sans"/>
           <w:lang w:val="es-ES"/>
         </w:rPr>
-        <w:pict w14:anchorId="19BD4A4D">
+        <w:pict w14:anchorId="47337178">
           <v:rect id="_x0000_i1028" style="width:0;height:.75pt" o:hralign="center" o:hrstd="t" o:hr="t" fillcolor="#a0a0a0" stroked="f"/>
         </w:pict>
       </w:r>
@@ -2883,7 +2883,7 @@
     <w:p>
       <w:pPr>
         <w:pStyle w:val="Ttulo3"/>
-        <w:divId w:val="851917686"/>
+        <w:divId w:val="774710797"/>
         <w:rPr>
           <w:rFonts w:eastAsia="Times New Roman"/>
           <w:lang w:val="es-ES"/>
@@ -2900,7 +2900,7 @@
     <w:p>
       <w:pPr>
         <w:pStyle w:val="NormalWeb"/>
-        <w:divId w:val="851917686"/>
+        <w:divId w:val="774710797"/>
         <w:rPr>
           <w:rFonts w:ascii="Plus Jakarta Sans" w:hAnsi="Plus Jakarta Sans"/>
           <w:lang w:val="es-ES"/>
@@ -2933,7 +2933,7 @@
       </w:tblGrid>
       <w:tr>
         <w:trPr>
-          <w:divId w:val="271016928"/>
+          <w:divId w:val="1624921106"/>
           <w:tblHeader/>
         </w:trPr>
         <w:tc>
@@ -3087,7 +3087,7 @@
       </w:tr>
       <w:tr>
         <w:trPr>
-          <w:divId w:val="271016928"/>
+          <w:divId w:val="1624921106"/>
         </w:trPr>
         <w:tc>
           <w:tcPr>
@@ -3221,7 +3221,7 @@
       </w:tr>
       <w:tr>
         <w:trPr>
-          <w:divId w:val="271016928"/>
+          <w:divId w:val="1624921106"/>
         </w:trPr>
         <w:tc>
           <w:tcPr>
@@ -3355,7 +3355,7 @@
       </w:tr>
       <w:tr>
         <w:trPr>
-          <w:divId w:val="271016928"/>
+          <w:divId w:val="1624921106"/>
         </w:trPr>
         <w:tc>
           <w:tcPr>
@@ -3489,7 +3489,7 @@
       </w:tr>
       <w:tr>
         <w:trPr>
-          <w:divId w:val="271016928"/>
+          <w:divId w:val="1624921106"/>
         </w:trPr>
         <w:tc>
           <w:tcPr>
@@ -3623,7 +3623,7 @@
       </w:tr>
       <w:tr>
         <w:trPr>
-          <w:divId w:val="271016928"/>
+          <w:divId w:val="1624921106"/>
         </w:trPr>
         <w:tc>
           <w:tcPr>
@@ -3757,7 +3757,7 @@
       </w:tr>
       <w:tr>
         <w:trPr>
-          <w:divId w:val="271016928"/>
+          <w:divId w:val="1624921106"/>
         </w:trPr>
         <w:tc>
           <w:tcPr>
@@ -3893,7 +3893,7 @@
     <w:p>
       <w:pPr>
         <w:pStyle w:val="Ttulo3"/>
-        <w:divId w:val="851917686"/>
+        <w:divId w:val="774710797"/>
         <w:rPr>
           <w:rFonts w:eastAsia="Times New Roman"/>
           <w:lang w:val="es-ES"/>
@@ -3910,7 +3910,7 @@
     <w:p>
       <w:pPr>
         <w:jc w:val="center"/>
-        <w:divId w:val="578027735"/>
+        <w:divId w:val="1460755883"/>
         <w:rPr>
           <w:rFonts w:ascii="Outfit" w:eastAsia="Times New Roman" w:hAnsi="Outfit"/>
           <w:b/>
@@ -3939,7 +3939,7 @@
     <w:p>
       <w:pPr>
         <w:jc w:val="center"/>
-        <w:divId w:val="1322344344"/>
+        <w:divId w:val="171535641"/>
         <w:rPr>
           <w:rFonts w:ascii="Plus Jakarta Sans" w:eastAsia="Times New Roman" w:hAnsi="Plus Jakarta Sans"/>
           <w:lang w:val="es-ES"/>
@@ -4313,7 +4313,7 @@
     <w:p>
       <w:pPr>
         <w:spacing w:before="450" w:after="450"/>
-        <w:divId w:val="851917686"/>
+        <w:divId w:val="774710797"/>
         <w:rPr>
           <w:rFonts w:ascii="Plus Jakarta Sans" w:eastAsia="Times New Roman" w:hAnsi="Plus Jakarta Sans"/>
           <w:lang w:val="es-ES"/>
@@ -4325,7 +4325,7 @@
           <w:lang w:val="es-ES"/>
         </w:rPr>
         <w:lastRenderedPageBreak/>
-        <w:pict w14:anchorId="0DD83123">
+        <w:pict w14:anchorId="1B94D7B8">
           <v:rect id="_x0000_i1029" style="width:0;height:.75pt" o:hralign="center" o:hrstd="t" o:hr="t" fillcolor="#a0a0a0" stroked="f"/>
         </w:pict>
       </w:r>
@@ -4333,7 +4333,7 @@
     <w:p>
       <w:pPr>
         <w:pStyle w:val="Ttulo3"/>
-        <w:divId w:val="851917686"/>
+        <w:divId w:val="774710797"/>
         <w:rPr>
           <w:rFonts w:eastAsia="Times New Roman"/>
           <w:lang w:val="es-ES"/>
@@ -4350,7 +4350,7 @@
     <w:p>
       <w:pPr>
         <w:pStyle w:val="NormalWeb"/>
-        <w:divId w:val="851917686"/>
+        <w:divId w:val="774710797"/>
         <w:rPr>
           <w:rFonts w:ascii="Plus Jakarta Sans" w:hAnsi="Plus Jakarta Sans"/>
           <w:lang w:val="es-ES"/>
@@ -4372,7 +4372,7 @@
         </w:numPr>
         <w:spacing w:before="100" w:beforeAutospacing="1" w:after="90"/>
         <w:ind w:left="1020"/>
-        <w:divId w:val="851917686"/>
+        <w:divId w:val="774710797"/>
         <w:rPr>
           <w:rFonts w:ascii="Plus Jakarta Sans" w:eastAsia="Times New Roman" w:hAnsi="Plus Jakarta Sans"/>
           <w:sz w:val="21"/>
@@ -4408,7 +4408,7 @@
         </w:numPr>
         <w:spacing w:before="100" w:beforeAutospacing="1" w:after="90"/>
         <w:ind w:left="1020"/>
-        <w:divId w:val="851917686"/>
+        <w:divId w:val="774710797"/>
         <w:rPr>
           <w:rFonts w:ascii="Plus Jakarta Sans" w:eastAsia="Times New Roman" w:hAnsi="Plus Jakarta Sans"/>
           <w:sz w:val="21"/>
@@ -4453,7 +4453,7 @@
         </w:numPr>
         <w:spacing w:before="100" w:beforeAutospacing="1" w:after="90"/>
         <w:ind w:left="1020"/>
-        <w:divId w:val="851917686"/>
+        <w:divId w:val="774710797"/>
         <w:rPr>
           <w:rFonts w:ascii="Plus Jakarta Sans" w:eastAsia="Times New Roman" w:hAnsi="Plus Jakarta Sans"/>
           <w:sz w:val="21"/>
@@ -4498,7 +4498,7 @@
         </w:numPr>
         <w:spacing w:before="100" w:beforeAutospacing="1" w:after="90"/>
         <w:ind w:left="1020"/>
-        <w:divId w:val="851917686"/>
+        <w:divId w:val="774710797"/>
         <w:rPr>
           <w:rFonts w:ascii="Plus Jakarta Sans" w:eastAsia="Times New Roman" w:hAnsi="Plus Jakarta Sans"/>
           <w:sz w:val="21"/>
@@ -4554,7 +4554,7 @@
       </w:tblGrid>
       <w:tr>
         <w:trPr>
-          <w:divId w:val="344863589"/>
+          <w:divId w:val="1880628252"/>
           <w:tblHeader/>
         </w:trPr>
         <w:tc>
@@ -4708,7 +4708,7 @@
       </w:tr>
       <w:tr>
         <w:trPr>
-          <w:divId w:val="344863589"/>
+          <w:divId w:val="1880628252"/>
         </w:trPr>
         <w:tc>
           <w:tcPr>
@@ -4834,7 +4834,7 @@
       </w:tr>
       <w:tr>
         <w:trPr>
-          <w:divId w:val="344863589"/>
+          <w:divId w:val="1880628252"/>
         </w:trPr>
         <w:tc>
           <w:tcPr>
@@ -4960,7 +4960,7 @@
       </w:tr>
       <w:tr>
         <w:trPr>
-          <w:divId w:val="344863589"/>
+          <w:divId w:val="1880628252"/>
         </w:trPr>
         <w:tc>
           <w:tcPr>
@@ -5086,7 +5086,7 @@
       </w:tr>
       <w:tr>
         <w:trPr>
-          <w:divId w:val="344863589"/>
+          <w:divId w:val="1880628252"/>
         </w:trPr>
         <w:tc>
           <w:tcPr>
@@ -5214,7 +5214,7 @@
     <w:p>
       <w:pPr>
         <w:spacing w:before="450" w:after="450"/>
-        <w:divId w:val="851917686"/>
+        <w:divId w:val="774710797"/>
         <w:rPr>
           <w:rFonts w:ascii="Plus Jakarta Sans" w:eastAsia="Times New Roman" w:hAnsi="Plus Jakarta Sans"/>
           <w:lang w:val="es-ES"/>
@@ -5225,7 +5225,7 @@
           <w:rFonts w:ascii="Plus Jakarta Sans" w:eastAsia="Times New Roman" w:hAnsi="Plus Jakarta Sans"/>
           <w:lang w:val="es-ES"/>
         </w:rPr>
-        <w:pict w14:anchorId="39E1B1EE">
+        <w:pict w14:anchorId="3824807E">
           <v:rect id="_x0000_i1030" style="width:0;height:.75pt" o:hralign="center" o:hrstd="t" o:hr="t" fillcolor="#a0a0a0" stroked="f"/>
         </w:pict>
       </w:r>
@@ -5233,7 +5233,7 @@
     <w:p>
       <w:pPr>
         <w:pStyle w:val="Ttulo3"/>
-        <w:divId w:val="851917686"/>
+        <w:divId w:val="774710797"/>
         <w:rPr>
           <w:rFonts w:eastAsia="Times New Roman"/>
           <w:lang w:val="es-ES"/>
@@ -5250,7 +5250,7 @@
     <w:p>
       <w:pPr>
         <w:pStyle w:val="NormalWeb"/>
-        <w:divId w:val="851917686"/>
+        <w:divId w:val="774710797"/>
         <w:rPr>
           <w:rFonts w:ascii="Plus Jakarta Sans" w:hAnsi="Plus Jakarta Sans"/>
           <w:lang w:val="es-ES"/>
@@ -5274,7 +5274,7 @@
     <w:p>
       <w:pPr>
         <w:pStyle w:val="Ttulo4"/>
-        <w:divId w:val="851917686"/>
+        <w:divId w:val="774710797"/>
         <w:rPr>
           <w:rFonts w:eastAsia="Times New Roman"/>
           <w:lang w:val="es-ES"/>
@@ -5291,7 +5291,7 @@
     <w:p>
       <w:pPr>
         <w:jc w:val="center"/>
-        <w:divId w:val="1354578684"/>
+        <w:divId w:val="1631125754"/>
         <w:rPr>
           <w:rFonts w:ascii="Outfit" w:eastAsia="Times New Roman" w:hAnsi="Outfit"/>
           <w:b/>
@@ -5320,7 +5320,7 @@
     <w:p>
       <w:pPr>
         <w:jc w:val="center"/>
-        <w:divId w:val="1936942744"/>
+        <w:divId w:val="150872134"/>
         <w:rPr>
           <w:rFonts w:ascii="Plus Jakarta Sans" w:eastAsia="Times New Roman" w:hAnsi="Plus Jakarta Sans"/>
           <w:lang w:val="es-ES"/>
@@ -5603,7 +5603,7 @@
     <w:p>
       <w:pPr>
         <w:pStyle w:val="Ttulo4"/>
-        <w:divId w:val="851917686"/>
+        <w:divId w:val="774710797"/>
         <w:rPr>
           <w:rFonts w:eastAsia="Times New Roman"/>
           <w:lang w:val="es-ES"/>
@@ -5627,7 +5627,7 @@
     <w:p>
       <w:pPr>
         <w:jc w:val="center"/>
-        <w:divId w:val="1795053789"/>
+        <w:divId w:val="926698009"/>
         <w:rPr>
           <w:rFonts w:ascii="Outfit" w:eastAsia="Times New Roman" w:hAnsi="Outfit"/>
           <w:b/>
@@ -5656,7 +5656,7 @@
     <w:p>
       <w:pPr>
         <w:jc w:val="center"/>
-        <w:divId w:val="1132484920"/>
+        <w:divId w:val="1380205331"/>
         <w:rPr>
           <w:rFonts w:ascii="Plus Jakarta Sans" w:eastAsia="Times New Roman" w:hAnsi="Plus Jakarta Sans"/>
           <w:lang w:val="es-ES"/>
@@ -5974,7 +5974,7 @@
     <w:p>
       <w:pPr>
         <w:pStyle w:val="Ttulo4"/>
-        <w:divId w:val="851917686"/>
+        <w:divId w:val="774710797"/>
         <w:rPr>
           <w:rFonts w:eastAsia="Times New Roman"/>
           <w:lang w:val="es-ES"/>
@@ -5992,7 +5992,7 @@
     <w:p>
       <w:pPr>
         <w:jc w:val="center"/>
-        <w:divId w:val="1856728143"/>
+        <w:divId w:val="1070497314"/>
         <w:rPr>
           <w:rFonts w:ascii="Outfit" w:eastAsia="Times New Roman" w:hAnsi="Outfit"/>
           <w:b/>
@@ -6021,7 +6021,7 @@
     <w:p>
       <w:pPr>
         <w:jc w:val="center"/>
-        <w:divId w:val="869034192"/>
+        <w:divId w:val="199974457"/>
         <w:rPr>
           <w:rFonts w:ascii="Plus Jakarta Sans" w:eastAsia="Times New Roman" w:hAnsi="Plus Jakarta Sans"/>
           <w:lang w:val="es-ES"/>
@@ -6325,7 +6325,7 @@
     <w:p>
       <w:pPr>
         <w:spacing w:before="450" w:after="450"/>
-        <w:divId w:val="851917686"/>
+        <w:divId w:val="774710797"/>
         <w:rPr>
           <w:rFonts w:ascii="Plus Jakarta Sans" w:eastAsia="Times New Roman" w:hAnsi="Plus Jakarta Sans"/>
           <w:lang w:val="es-ES"/>
@@ -6336,7 +6336,7 @@
           <w:rFonts w:ascii="Plus Jakarta Sans" w:eastAsia="Times New Roman" w:hAnsi="Plus Jakarta Sans"/>
           <w:lang w:val="es-ES"/>
         </w:rPr>
-        <w:pict w14:anchorId="2273C35E">
+        <w:pict w14:anchorId="6B6222A9">
           <v:rect id="_x0000_i1031" style="width:0;height:.75pt" o:hralign="center" o:hrstd="t" o:hr="t" fillcolor="#a0a0a0" stroked="f"/>
         </w:pict>
       </w:r>
@@ -6344,7 +6344,7 @@
     <w:p>
       <w:pPr>
         <w:pStyle w:val="Ttulo3"/>
-        <w:divId w:val="851917686"/>
+        <w:divId w:val="774710797"/>
         <w:rPr>
           <w:rFonts w:eastAsia="Times New Roman"/>
           <w:lang w:val="es-ES"/>
@@ -6361,7 +6361,7 @@
     <w:p>
       <w:pPr>
         <w:pStyle w:val="NormalWeb"/>
-        <w:divId w:val="851917686"/>
+        <w:divId w:val="774710797"/>
         <w:rPr>
           <w:rFonts w:ascii="Plus Jakarta Sans" w:hAnsi="Plus Jakarta Sans"/>
           <w:lang w:val="es-ES"/>
@@ -6385,7 +6385,7 @@
     <w:p>
       <w:pPr>
         <w:pStyle w:val="Ttulo4"/>
-        <w:divId w:val="851917686"/>
+        <w:divId w:val="774710797"/>
         <w:rPr>
           <w:rFonts w:eastAsia="Times New Roman"/>
           <w:lang w:val="es-ES"/>
@@ -6402,7 +6402,7 @@
     <w:p>
       <w:pPr>
         <w:pStyle w:val="NormalWeb"/>
-        <w:divId w:val="851917686"/>
+        <w:divId w:val="774710797"/>
         <w:rPr>
           <w:rFonts w:ascii="Plus Jakarta Sans" w:hAnsi="Plus Jakarta Sans"/>
           <w:lang w:val="es-ES"/>
@@ -6433,7 +6433,7 @@
       </w:tblGrid>
       <w:tr>
         <w:trPr>
-          <w:divId w:val="1545215203"/>
+          <w:divId w:val="1288779825"/>
           <w:tblHeader/>
         </w:trPr>
         <w:tc>
@@ -6513,7 +6513,7 @@
       </w:tr>
       <w:tr>
         <w:trPr>
-          <w:divId w:val="1545215203"/>
+          <w:divId w:val="1288779825"/>
         </w:trPr>
         <w:tc>
           <w:tcPr>
@@ -6602,7 +6602,7 @@
     <w:p>
       <w:pPr>
         <w:pStyle w:val="Ttulo4"/>
-        <w:divId w:val="851917686"/>
+        <w:divId w:val="774710797"/>
         <w:rPr>
           <w:rFonts w:eastAsia="Times New Roman"/>
           <w:lang w:val="es-ES"/>
@@ -6619,7 +6619,7 @@
     <w:p>
       <w:pPr>
         <w:pStyle w:val="NormalWeb"/>
-        <w:divId w:val="851917686"/>
+        <w:divId w:val="774710797"/>
         <w:rPr>
           <w:rFonts w:ascii="Plus Jakarta Sans" w:hAnsi="Plus Jakarta Sans"/>
           <w:lang w:val="es-ES"/>
@@ -6650,7 +6650,7 @@
       </w:tblGrid>
       <w:tr>
         <w:trPr>
-          <w:divId w:val="209223297"/>
+          <w:divId w:val="934627502"/>
           <w:tblHeader/>
         </w:trPr>
         <w:tc>
@@ -6730,7 +6730,7 @@
       </w:tr>
       <w:tr>
         <w:trPr>
-          <w:divId w:val="209223297"/>
+          <w:divId w:val="934627502"/>
         </w:trPr>
         <w:tc>
           <w:tcPr>
@@ -6828,7 +6828,7 @@
     <w:p>
       <w:pPr>
         <w:pStyle w:val="Ttulo4"/>
-        <w:divId w:val="851917686"/>
+        <w:divId w:val="774710797"/>
         <w:rPr>
           <w:rFonts w:eastAsia="Times New Roman"/>
           <w:lang w:val="es-ES"/>
@@ -6845,7 +6845,7 @@
     <w:p>
       <w:pPr>
         <w:pStyle w:val="NormalWeb"/>
-        <w:divId w:val="851917686"/>
+        <w:divId w:val="774710797"/>
         <w:rPr>
           <w:rFonts w:ascii="Plus Jakarta Sans" w:hAnsi="Plus Jakarta Sans"/>
           <w:lang w:val="es-ES"/>
@@ -6876,7 +6876,7 @@
       </w:tblGrid>
       <w:tr>
         <w:trPr>
-          <w:divId w:val="1105148497"/>
+          <w:divId w:val="1437286208"/>
           <w:tblHeader/>
         </w:trPr>
         <w:tc>
@@ -6957,7 +6957,7 @@
       </w:tr>
       <w:tr>
         <w:trPr>
-          <w:divId w:val="1105148497"/>
+          <w:divId w:val="1437286208"/>
         </w:trPr>
         <w:tc>
           <w:tcPr>
@@ -7046,7 +7046,7 @@
     <w:p>
       <w:pPr>
         <w:spacing w:before="450" w:after="450"/>
-        <w:divId w:val="851917686"/>
+        <w:divId w:val="774710797"/>
         <w:rPr>
           <w:rFonts w:ascii="Plus Jakarta Sans" w:eastAsia="Times New Roman" w:hAnsi="Plus Jakarta Sans"/>
           <w:lang w:val="es-ES"/>
@@ -7057,7 +7057,7 @@
           <w:rFonts w:ascii="Plus Jakarta Sans" w:eastAsia="Times New Roman" w:hAnsi="Plus Jakarta Sans"/>
           <w:lang w:val="es-ES"/>
         </w:rPr>
-        <w:pict w14:anchorId="4E1AA0B3">
+        <w:pict w14:anchorId="2ED892C6">
           <v:rect id="_x0000_i1032" style="width:0;height:.75pt" o:hralign="center" o:hrstd="t" o:hr="t" fillcolor="#a0a0a0" stroked="f"/>
         </w:pict>
       </w:r>
@@ -7065,7 +7065,7 @@
     <w:p>
       <w:pPr>
         <w:pStyle w:val="Ttulo2"/>
-        <w:divId w:val="851917686"/>
+        <w:divId w:val="774710797"/>
         <w:rPr>
           <w:rFonts w:eastAsia="Times New Roman"/>
           <w:lang w:val="es-ES"/>
@@ -7082,7 +7082,7 @@
     <w:p>
       <w:pPr>
         <w:pStyle w:val="NormalWeb"/>
-        <w:divId w:val="851917686"/>
+        <w:divId w:val="774710797"/>
         <w:rPr>
           <w:rFonts w:ascii="Plus Jakarta Sans" w:hAnsi="Plus Jakarta Sans"/>
           <w:lang w:val="es-ES"/>
@@ -7099,7 +7099,7 @@
     <w:p>
       <w:pPr>
         <w:pStyle w:val="Ttulo3"/>
-        <w:divId w:val="851917686"/>
+        <w:divId w:val="774710797"/>
         <w:rPr>
           <w:rFonts w:eastAsia="Times New Roman"/>
           <w:lang w:val="es-ES"/>
@@ -7116,7 +7116,7 @@
     <w:p>
       <w:pPr>
         <w:pStyle w:val="NormalWeb"/>
-        <w:divId w:val="851917686"/>
+        <w:divId w:val="774710797"/>
         <w:rPr>
           <w:rFonts w:ascii="Plus Jakarta Sans" w:hAnsi="Plus Jakarta Sans"/>
           <w:lang w:val="es-ES"/>
@@ -7149,7 +7149,7 @@
       </w:tblGrid>
       <w:tr>
         <w:trPr>
-          <w:divId w:val="713192455"/>
+          <w:divId w:val="1791168544"/>
           <w:tblHeader/>
         </w:trPr>
         <w:tc>
@@ -7314,7 +7314,7 @@
       </w:tr>
       <w:tr>
         <w:trPr>
-          <w:divId w:val="713192455"/>
+          <w:divId w:val="1791168544"/>
         </w:trPr>
         <w:tc>
           <w:tcPr>
@@ -7440,7 +7440,7 @@
       </w:tr>
       <w:tr>
         <w:trPr>
-          <w:divId w:val="713192455"/>
+          <w:divId w:val="1791168544"/>
         </w:trPr>
         <w:tc>
           <w:tcPr>
@@ -7566,7 +7566,7 @@
       </w:tr>
       <w:tr>
         <w:trPr>
-          <w:divId w:val="713192455"/>
+          <w:divId w:val="1791168544"/>
         </w:trPr>
         <w:tc>
           <w:tcPr>
@@ -7692,7 +7692,7 @@
       </w:tr>
       <w:tr>
         <w:trPr>
-          <w:divId w:val="713192455"/>
+          <w:divId w:val="1791168544"/>
         </w:trPr>
         <w:tc>
           <w:tcPr>
@@ -7820,7 +7820,7 @@
     <w:p>
       <w:pPr>
         <w:pStyle w:val="Ttulo3"/>
-        <w:divId w:val="851917686"/>
+        <w:divId w:val="774710797"/>
         <w:rPr>
           <w:rFonts w:eastAsia="Times New Roman"/>
           <w:lang w:val="es-ES"/>
@@ -7838,7 +7838,7 @@
       <w:pPr>
         <w:spacing w:before="375" w:after="225"/>
         <w:jc w:val="center"/>
-        <w:divId w:val="1492713938"/>
+        <w:divId w:val="466976253"/>
         <w:rPr>
           <w:rFonts w:ascii="Outfit" w:eastAsia="Times New Roman" w:hAnsi="Outfit"/>
           <w:b/>
@@ -7868,7 +7868,7 @@
       <w:pPr>
         <w:spacing w:after="375"/>
         <w:jc w:val="center"/>
-        <w:divId w:val="1620918101"/>
+        <w:divId w:val="2055807340"/>
         <w:rPr>
           <w:rFonts w:ascii="Plus Jakarta Sans" w:eastAsia="Times New Roman" w:hAnsi="Plus Jakarta Sans"/>
           <w:lang w:val="es-ES"/>
@@ -8235,7 +8235,7 @@
     <w:p>
       <w:pPr>
         <w:pStyle w:val="Ttulo3"/>
-        <w:divId w:val="851917686"/>
+        <w:divId w:val="774710797"/>
         <w:rPr>
           <w:rFonts w:eastAsia="Times New Roman"/>
           <w:lang w:val="es-ES"/>
@@ -8259,7 +8259,7 @@
     <w:p>
       <w:pPr>
         <w:pStyle w:val="NormalWeb"/>
-        <w:divId w:val="851917686"/>
+        <w:divId w:val="774710797"/>
         <w:rPr>
           <w:rFonts w:ascii="Plus Jakarta Sans" w:hAnsi="Plus Jakarta Sans"/>
           <w:lang w:val="es-ES"/>
@@ -8281,7 +8281,7 @@
         </w:numPr>
         <w:spacing w:before="100" w:beforeAutospacing="1" w:after="90"/>
         <w:ind w:left="1020"/>
-        <w:divId w:val="851917686"/>
+        <w:divId w:val="774710797"/>
         <w:rPr>
           <w:rFonts w:ascii="Plus Jakarta Sans" w:eastAsia="Times New Roman" w:hAnsi="Plus Jakarta Sans"/>
           <w:sz w:val="21"/>
@@ -8317,7 +8317,7 @@
         </w:numPr>
         <w:spacing w:before="100" w:beforeAutospacing="1" w:after="90"/>
         <w:ind w:left="1020"/>
-        <w:divId w:val="851917686"/>
+        <w:divId w:val="774710797"/>
         <w:rPr>
           <w:rFonts w:ascii="Plus Jakarta Sans" w:eastAsia="Times New Roman" w:hAnsi="Plus Jakarta Sans"/>
           <w:sz w:val="21"/>
@@ -8362,7 +8362,7 @@
         </w:numPr>
         <w:spacing w:before="100" w:beforeAutospacing="1" w:after="90"/>
         <w:ind w:left="1020"/>
-        <w:divId w:val="851917686"/>
+        <w:divId w:val="774710797"/>
         <w:rPr>
           <w:rFonts w:ascii="Plus Jakarta Sans" w:eastAsia="Times New Roman" w:hAnsi="Plus Jakarta Sans"/>
           <w:sz w:val="21"/>
@@ -8416,7 +8416,7 @@
         </w:numPr>
         <w:spacing w:before="100" w:beforeAutospacing="1" w:after="90"/>
         <w:ind w:left="1020"/>
-        <w:divId w:val="851917686"/>
+        <w:divId w:val="774710797"/>
         <w:rPr>
           <w:rFonts w:ascii="Plus Jakarta Sans" w:eastAsia="Times New Roman" w:hAnsi="Plus Jakarta Sans"/>
           <w:sz w:val="21"/>
@@ -8461,7 +8461,7 @@
         </w:numPr>
         <w:spacing w:before="100" w:beforeAutospacing="1" w:after="90"/>
         <w:ind w:left="1020"/>
-        <w:divId w:val="851917686"/>
+        <w:divId w:val="774710797"/>
         <w:rPr>
           <w:rFonts w:ascii="Plus Jakarta Sans" w:eastAsia="Times New Roman" w:hAnsi="Plus Jakarta Sans"/>
           <w:sz w:val="21"/>
@@ -8497,7 +8497,7 @@
         </w:numPr>
         <w:spacing w:before="100" w:beforeAutospacing="1" w:after="90"/>
         <w:ind w:left="1020"/>
-        <w:divId w:val="851917686"/>
+        <w:divId w:val="774710797"/>
         <w:rPr>
           <w:rFonts w:ascii="Plus Jakarta Sans" w:eastAsia="Times New Roman" w:hAnsi="Plus Jakarta Sans"/>
           <w:sz w:val="21"/>
@@ -8542,7 +8542,7 @@
         </w:numPr>
         <w:spacing w:before="100" w:beforeAutospacing="1" w:after="90"/>
         <w:ind w:left="1020"/>
-        <w:divId w:val="851917686"/>
+        <w:divId w:val="774710797"/>
         <w:rPr>
           <w:rFonts w:ascii="Plus Jakarta Sans" w:eastAsia="Times New Roman" w:hAnsi="Plus Jakarta Sans"/>
           <w:sz w:val="21"/>
@@ -8587,7 +8587,7 @@
         </w:numPr>
         <w:spacing w:before="100" w:beforeAutospacing="1" w:after="90"/>
         <w:ind w:left="1020"/>
-        <w:divId w:val="851917686"/>
+        <w:divId w:val="774710797"/>
         <w:rPr>
           <w:rFonts w:ascii="Plus Jakarta Sans" w:eastAsia="Times New Roman" w:hAnsi="Plus Jakarta Sans"/>
           <w:sz w:val="21"/>
@@ -8632,7 +8632,7 @@
         </w:numPr>
         <w:spacing w:before="100" w:beforeAutospacing="1" w:after="90"/>
         <w:ind w:left="1020"/>
-        <w:divId w:val="851917686"/>
+        <w:divId w:val="774710797"/>
         <w:rPr>
           <w:rFonts w:ascii="Plus Jakarta Sans" w:eastAsia="Times New Roman" w:hAnsi="Plus Jakarta Sans"/>
           <w:sz w:val="21"/>
@@ -8668,7 +8668,7 @@
         </w:numPr>
         <w:spacing w:before="100" w:beforeAutospacing="1" w:after="90"/>
         <w:ind w:left="1020"/>
-        <w:divId w:val="851917686"/>
+        <w:divId w:val="774710797"/>
         <w:rPr>
           <w:rFonts w:ascii="Plus Jakarta Sans" w:eastAsia="Times New Roman" w:hAnsi="Plus Jakarta Sans"/>
           <w:sz w:val="21"/>
@@ -8722,7 +8722,7 @@
         </w:numPr>
         <w:spacing w:before="100" w:beforeAutospacing="1" w:after="90"/>
         <w:ind w:left="1020"/>
-        <w:divId w:val="851917686"/>
+        <w:divId w:val="774710797"/>
         <w:rPr>
           <w:rFonts w:ascii="Plus Jakarta Sans" w:eastAsia="Times New Roman" w:hAnsi="Plus Jakarta Sans"/>
           <w:sz w:val="21"/>
@@ -8767,7 +8767,7 @@
         </w:numPr>
         <w:spacing w:before="100" w:beforeAutospacing="1" w:after="90"/>
         <w:ind w:left="1020"/>
-        <w:divId w:val="851917686"/>
+        <w:divId w:val="774710797"/>
         <w:rPr>
           <w:rFonts w:ascii="Plus Jakarta Sans" w:eastAsia="Times New Roman" w:hAnsi="Plus Jakarta Sans"/>
           <w:sz w:val="21"/>
@@ -8807,7 +8807,7 @@
     <w:p>
       <w:pPr>
         <w:pStyle w:val="Ttulo3"/>
-        <w:divId w:val="851917686"/>
+        <w:divId w:val="774710797"/>
         <w:rPr>
           <w:rFonts w:eastAsia="Times New Roman"/>
           <w:lang w:val="es-ES"/>
@@ -8825,7 +8825,7 @@
       <w:pPr>
         <w:spacing w:before="375" w:after="225"/>
         <w:jc w:val="center"/>
-        <w:divId w:val="650716847"/>
+        <w:divId w:val="1126464341"/>
         <w:rPr>
           <w:rFonts w:ascii="Outfit" w:eastAsia="Times New Roman" w:hAnsi="Outfit"/>
           <w:b/>
@@ -8855,7 +8855,7 @@
       <w:pPr>
         <w:spacing w:after="375"/>
         <w:jc w:val="center"/>
-        <w:divId w:val="468203892"/>
+        <w:divId w:val="510611381"/>
         <w:rPr>
           <w:rFonts w:ascii="Plus Jakarta Sans" w:eastAsia="Times New Roman" w:hAnsi="Plus Jakarta Sans"/>
           <w:lang w:val="es-ES"/>
@@ -9145,7 +9145,7 @@
     <w:p>
       <w:pPr>
         <w:spacing w:before="450" w:after="450"/>
-        <w:divId w:val="851917686"/>
+        <w:divId w:val="774710797"/>
         <w:rPr>
           <w:rFonts w:ascii="Plus Jakarta Sans" w:eastAsia="Times New Roman" w:hAnsi="Plus Jakarta Sans"/>
           <w:lang w:val="es-ES"/>
@@ -9156,7 +9156,7 @@
           <w:rFonts w:ascii="Plus Jakarta Sans" w:eastAsia="Times New Roman" w:hAnsi="Plus Jakarta Sans"/>
           <w:lang w:val="es-ES"/>
         </w:rPr>
-        <w:pict w14:anchorId="6E93CBAA">
+        <w:pict w14:anchorId="458386A1">
           <v:rect id="_x0000_i1033" style="width:0;height:.75pt" o:hralign="center" o:hrstd="t" o:hr="t" fillcolor="#a0a0a0" stroked="f"/>
         </w:pict>
       </w:r>
@@ -9164,7 +9164,7 @@
     <w:p>
       <w:pPr>
         <w:pStyle w:val="Ttulo2"/>
-        <w:divId w:val="851917686"/>
+        <w:divId w:val="774710797"/>
         <w:rPr>
           <w:rFonts w:eastAsia="Times New Roman"/>
           <w:lang w:val="es-ES"/>
@@ -9181,7 +9181,7 @@
     <w:p>
       <w:pPr>
         <w:pStyle w:val="NormalWeb"/>
-        <w:divId w:val="851917686"/>
+        <w:divId w:val="774710797"/>
         <w:rPr>
           <w:rFonts w:ascii="Plus Jakarta Sans" w:hAnsi="Plus Jakarta Sans"/>
           <w:lang w:val="es-ES"/>
@@ -9198,7 +9198,7 @@
     <w:p>
       <w:pPr>
         <w:pStyle w:val="NormalWeb"/>
-        <w:divId w:val="851917686"/>
+        <w:divId w:val="774710797"/>
         <w:rPr>
           <w:rFonts w:ascii="Plus Jakarta Sans" w:hAnsi="Plus Jakarta Sans"/>
           <w:lang w:val="es-ES"/>
@@ -9260,7 +9260,7 @@
     <w:p>
       <w:pPr>
         <w:pStyle w:val="NormalWeb"/>
-        <w:divId w:val="851917686"/>
+        <w:divId w:val="774710797"/>
         <w:rPr>
           <w:rFonts w:ascii="Plus Jakarta Sans" w:hAnsi="Plus Jakarta Sans"/>
           <w:lang w:val="es-ES"/>
@@ -9322,7 +9322,7 @@
     <w:p>
       <w:pPr>
         <w:pStyle w:val="NormalWeb"/>
-        <w:divId w:val="851917686"/>
+        <w:divId w:val="774710797"/>
         <w:rPr>
           <w:rFonts w:ascii="Plus Jakarta Sans" w:hAnsi="Plus Jakarta Sans"/>
           <w:lang w:val="es-ES"/>
@@ -9383,7 +9383,7 @@
     <w:p>
       <w:pPr>
         <w:pStyle w:val="NormalWeb"/>
-        <w:divId w:val="851917686"/>
+        <w:divId w:val="774710797"/>
         <w:rPr>
           <w:rFonts w:ascii="Plus Jakarta Sans" w:hAnsi="Plus Jakarta Sans"/>
           <w:lang w:val="es-ES"/>
@@ -9437,7 +9437,7 @@
     <w:p>
       <w:pPr>
         <w:spacing w:before="450" w:after="450"/>
-        <w:divId w:val="851917686"/>
+        <w:divId w:val="774710797"/>
         <w:rPr>
           <w:rFonts w:ascii="Plus Jakarta Sans" w:eastAsia="Times New Roman" w:hAnsi="Plus Jakarta Sans"/>
           <w:lang w:val="es-ES"/>
@@ -9448,7 +9448,7 @@
           <w:rFonts w:ascii="Plus Jakarta Sans" w:eastAsia="Times New Roman" w:hAnsi="Plus Jakarta Sans"/>
           <w:lang w:val="es-ES"/>
         </w:rPr>
-        <w:pict w14:anchorId="36F93464">
+        <w:pict w14:anchorId="61D09A04">
           <v:rect id="_x0000_i1034" style="width:0;height:.75pt" o:hralign="center" o:hrstd="t" o:hr="t" fillcolor="#a0a0a0" stroked="f"/>
         </w:pict>
       </w:r>
@@ -9456,7 +9456,7 @@
     <w:p>
       <w:pPr>
         <w:pStyle w:val="Ttulo2"/>
-        <w:divId w:val="851917686"/>
+        <w:divId w:val="774710797"/>
         <w:rPr>
           <w:rFonts w:eastAsia="Times New Roman"/>
           <w:lang w:val="es-ES"/>
@@ -9473,7 +9473,7 @@
     <w:p>
       <w:pPr>
         <w:pStyle w:val="NormalWeb"/>
-        <w:divId w:val="851917686"/>
+        <w:divId w:val="774710797"/>
         <w:rPr>
           <w:rFonts w:ascii="Plus Jakarta Sans" w:hAnsi="Plus Jakarta Sans"/>
           <w:lang w:val="es-ES"/>
@@ -9512,7 +9512,7 @@
     <w:p>
       <w:pPr>
         <w:pStyle w:val="Ttulo3"/>
-        <w:divId w:val="851917686"/>
+        <w:divId w:val="774710797"/>
         <w:rPr>
           <w:rFonts w:eastAsia="Times New Roman"/>
           <w:lang w:val="es-ES"/>
@@ -9546,7 +9546,7 @@
       </w:tblGrid>
       <w:tr>
         <w:trPr>
-          <w:divId w:val="830289267"/>
+          <w:divId w:val="592200007"/>
           <w:tblHeader/>
         </w:trPr>
         <w:tc>
@@ -9737,7 +9737,7 @@
       </w:tr>
       <w:tr>
         <w:trPr>
-          <w:divId w:val="830289267"/>
+          <w:divId w:val="592200007"/>
         </w:trPr>
         <w:tc>
           <w:tcPr>
@@ -9893,7 +9893,7 @@
       </w:tr>
       <w:tr>
         <w:trPr>
-          <w:divId w:val="830289267"/>
+          <w:divId w:val="592200007"/>
         </w:trPr>
         <w:tc>
           <w:tcPr>
@@ -10049,7 +10049,7 @@
       </w:tr>
       <w:tr>
         <w:trPr>
-          <w:divId w:val="830289267"/>
+          <w:divId w:val="592200007"/>
         </w:trPr>
         <w:tc>
           <w:tcPr>
@@ -10205,7 +10205,7 @@
       </w:tr>
       <w:tr>
         <w:trPr>
-          <w:divId w:val="830289267"/>
+          <w:divId w:val="592200007"/>
         </w:trPr>
         <w:tc>
           <w:tcPr>
@@ -10367,7 +10367,7 @@
     <w:p>
       <w:pPr>
         <w:pStyle w:val="Ttulo3"/>
-        <w:divId w:val="851917686"/>
+        <w:divId w:val="774710797"/>
         <w:rPr>
           <w:rFonts w:eastAsia="Times New Roman"/>
           <w:lang w:val="es-ES"/>
@@ -10401,7 +10401,7 @@
       </w:tblGrid>
       <w:tr>
         <w:trPr>
-          <w:divId w:val="1292126954"/>
+          <w:divId w:val="608316225"/>
           <w:tblHeader/>
         </w:trPr>
         <w:tc>
@@ -10592,7 +10592,7 @@
       </w:tr>
       <w:tr>
         <w:trPr>
-          <w:divId w:val="1292126954"/>
+          <w:divId w:val="608316225"/>
         </w:trPr>
         <w:tc>
           <w:tcPr>
@@ -10749,7 +10749,7 @@
       </w:tr>
       <w:tr>
         <w:trPr>
-          <w:divId w:val="1292126954"/>
+          <w:divId w:val="608316225"/>
         </w:trPr>
         <w:tc>
           <w:tcPr>
@@ -10908,7 +10908,7 @@
     <w:p>
       <w:pPr>
         <w:pStyle w:val="Ttulo3"/>
-        <w:divId w:val="851917686"/>
+        <w:divId w:val="774710797"/>
         <w:rPr>
           <w:rFonts w:eastAsia="Times New Roman"/>
           <w:lang w:val="es-ES"/>
@@ -10943,7 +10943,7 @@
       </w:tblGrid>
       <w:tr>
         <w:trPr>
-          <w:divId w:val="1269503263"/>
+          <w:divId w:val="1328363218"/>
           <w:tblHeader/>
         </w:trPr>
         <w:tc>
@@ -11171,7 +11171,7 @@
       </w:tr>
       <w:tr>
         <w:trPr>
-          <w:divId w:val="1269503263"/>
+          <w:divId w:val="1328363218"/>
         </w:trPr>
         <w:tc>
           <w:tcPr>
@@ -11367,7 +11367,7 @@
       </w:tr>
       <w:tr>
         <w:trPr>
-          <w:divId w:val="1269503263"/>
+          <w:divId w:val="1328363218"/>
         </w:trPr>
         <w:tc>
           <w:tcPr>
@@ -11552,7 +11552,7 @@
       </w:tr>
       <w:tr>
         <w:trPr>
-          <w:divId w:val="1269503263"/>
+          <w:divId w:val="1328363218"/>
         </w:trPr>
         <w:tc>
           <w:tcPr>
@@ -11750,7 +11750,7 @@
     <w:p>
       <w:pPr>
         <w:pStyle w:val="Ttulo4"/>
-        <w:divId w:val="851917686"/>
+        <w:divId w:val="774710797"/>
         <w:rPr>
           <w:rFonts w:eastAsia="Times New Roman"/>
           <w:lang w:val="es-ES"/>
@@ -11768,7 +11768,7 @@
       <w:pPr>
         <w:spacing w:before="375" w:after="225"/>
         <w:jc w:val="center"/>
-        <w:divId w:val="1397628067"/>
+        <w:divId w:val="469055906"/>
         <w:rPr>
           <w:rFonts w:ascii="Outfit" w:eastAsia="Times New Roman" w:hAnsi="Outfit"/>
           <w:b/>
@@ -11798,7 +11798,7 @@
       <w:pPr>
         <w:spacing w:after="375"/>
         <w:jc w:val="center"/>
-        <w:divId w:val="398213200"/>
+        <w:divId w:val="452093882"/>
         <w:rPr>
           <w:rFonts w:ascii="Plus Jakarta Sans" w:eastAsia="Times New Roman" w:hAnsi="Plus Jakarta Sans"/>
           <w:lang w:val="es-ES"/>
@@ -12193,7 +12193,7 @@
     <w:p>
       <w:pPr>
         <w:pStyle w:val="Ttulo3"/>
-        <w:divId w:val="851917686"/>
+        <w:divId w:val="774710797"/>
         <w:rPr>
           <w:rFonts w:eastAsia="Times New Roman"/>
           <w:lang w:val="es-ES"/>
@@ -12225,7 +12225,7 @@
       </w:tblGrid>
       <w:tr>
         <w:trPr>
-          <w:divId w:val="1315989465"/>
+          <w:divId w:val="916524853"/>
           <w:tblHeader/>
         </w:trPr>
         <w:tc>
@@ -12342,7 +12342,7 @@
       </w:tr>
       <w:tr>
         <w:trPr>
-          <w:divId w:val="1315989465"/>
+          <w:divId w:val="916524853"/>
         </w:trPr>
         <w:tc>
           <w:tcPr>
@@ -12438,7 +12438,7 @@
       </w:tr>
       <w:tr>
         <w:trPr>
-          <w:divId w:val="1315989465"/>
+          <w:divId w:val="916524853"/>
         </w:trPr>
         <w:tc>
           <w:tcPr>
@@ -12534,7 +12534,7 @@
       </w:tr>
       <w:tr>
         <w:trPr>
-          <w:divId w:val="1315989465"/>
+          <w:divId w:val="916524853"/>
         </w:trPr>
         <w:tc>
           <w:tcPr>
@@ -12632,7 +12632,7 @@
     <w:p>
       <w:pPr>
         <w:pStyle w:val="NormalWeb"/>
-        <w:divId w:val="851917686"/>
+        <w:divId w:val="774710797"/>
         <w:rPr>
           <w:rFonts w:ascii="Plus Jakarta Sans" w:hAnsi="Plus Jakarta Sans"/>
           <w:lang w:val="es-ES"/>
@@ -12657,7 +12657,7 @@
     <w:p>
       <w:pPr>
         <w:pStyle w:val="Ttulo3"/>
-        <w:divId w:val="851917686"/>
+        <w:divId w:val="774710797"/>
         <w:rPr>
           <w:rFonts w:eastAsia="Times New Roman"/>
           <w:lang w:val="es-ES"/>
@@ -12699,7 +12699,7 @@
       </w:tblGrid>
       <w:tr>
         <w:trPr>
-          <w:divId w:val="45299059"/>
+          <w:divId w:val="93215313"/>
           <w:tblHeader/>
         </w:trPr>
         <w:tc>
@@ -12927,7 +12927,7 @@
       </w:tr>
       <w:tr>
         <w:trPr>
-          <w:divId w:val="45299059"/>
+          <w:divId w:val="93215313"/>
         </w:trPr>
         <w:tc>
           <w:tcPr>
@@ -13113,7 +13113,7 @@
       </w:tr>
       <w:tr>
         <w:trPr>
-          <w:divId w:val="45299059"/>
+          <w:divId w:val="93215313"/>
         </w:trPr>
         <w:tc>
           <w:tcPr>
@@ -13299,7 +13299,7 @@
       </w:tr>
       <w:tr>
         <w:trPr>
-          <w:divId w:val="45299059"/>
+          <w:divId w:val="93215313"/>
         </w:trPr>
         <w:tc>
           <w:tcPr>
@@ -13485,7 +13485,7 @@
       </w:tr>
       <w:tr>
         <w:trPr>
-          <w:divId w:val="45299059"/>
+          <w:divId w:val="93215313"/>
         </w:trPr>
         <w:tc>
           <w:tcPr>
@@ -13678,7 +13678,7 @@
     <w:p>
       <w:pPr>
         <w:pStyle w:val="NormalWeb"/>
-        <w:divId w:val="851917686"/>
+        <w:divId w:val="774710797"/>
         <w:rPr>
           <w:rFonts w:ascii="Plus Jakarta Sans" w:hAnsi="Plus Jakarta Sans"/>
           <w:lang w:val="es-ES"/>
@@ -13725,7 +13725,7 @@
     <w:p>
       <w:pPr>
         <w:pStyle w:val="Ttulo3"/>
-        <w:divId w:val="851917686"/>
+        <w:divId w:val="774710797"/>
         <w:rPr>
           <w:rFonts w:eastAsia="Times New Roman"/>
           <w:lang w:val="es-ES"/>
@@ -13760,7 +13760,7 @@
       </w:tblGrid>
       <w:tr>
         <w:trPr>
-          <w:divId w:val="962228667"/>
+          <w:divId w:val="961375496"/>
           <w:tblHeader/>
         </w:trPr>
         <w:tc>
@@ -13988,7 +13988,7 @@
       </w:tr>
       <w:tr>
         <w:trPr>
-          <w:divId w:val="962228667"/>
+          <w:divId w:val="961375496"/>
         </w:trPr>
         <w:tc>
           <w:tcPr>
@@ -14182,7 +14182,7 @@
       </w:tr>
       <w:tr>
         <w:trPr>
-          <w:divId w:val="962228667"/>
+          <w:divId w:val="961375496"/>
         </w:trPr>
         <w:tc>
           <w:tcPr>
@@ -14378,7 +14378,7 @@
     <w:p>
       <w:pPr>
         <w:pStyle w:val="Ttulo4"/>
-        <w:divId w:val="851917686"/>
+        <w:divId w:val="774710797"/>
         <w:rPr>
           <w:rFonts w:eastAsia="Times New Roman"/>
           <w:lang w:val="es-ES"/>
@@ -14396,7 +14396,7 @@
       <w:pPr>
         <w:spacing w:before="375" w:after="225"/>
         <w:jc w:val="center"/>
-        <w:divId w:val="1075782831"/>
+        <w:divId w:val="1826622228"/>
         <w:rPr>
           <w:rFonts w:ascii="Outfit" w:eastAsia="Times New Roman" w:hAnsi="Outfit"/>
           <w:b/>
@@ -14426,7 +14426,7 @@
       <w:pPr>
         <w:spacing w:after="375"/>
         <w:jc w:val="center"/>
-        <w:divId w:val="1871450505"/>
+        <w:divId w:val="454324766"/>
         <w:rPr>
           <w:rFonts w:ascii="Plus Jakarta Sans" w:eastAsia="Times New Roman" w:hAnsi="Plus Jakarta Sans"/>
           <w:lang w:val="es-ES"/>
@@ -14814,7 +14814,7 @@
     <w:p>
       <w:pPr>
         <w:pStyle w:val="Ttulo3"/>
-        <w:divId w:val="851917686"/>
+        <w:divId w:val="774710797"/>
         <w:rPr>
           <w:rFonts w:eastAsia="Times New Roman"/>
           <w:lang w:val="es-ES"/>
@@ -14848,7 +14848,7 @@
       </w:tblGrid>
       <w:tr>
         <w:trPr>
-          <w:divId w:val="58527619"/>
+          <w:divId w:val="1375471928"/>
           <w:tblHeader/>
         </w:trPr>
         <w:tc>
@@ -15039,7 +15039,7 @@
       </w:tr>
       <w:tr>
         <w:trPr>
-          <w:divId w:val="58527619"/>
+          <w:divId w:val="1375471928"/>
         </w:trPr>
         <w:tc>
           <w:tcPr>
@@ -15195,7 +15195,7 @@
       </w:tr>
       <w:tr>
         <w:trPr>
-          <w:divId w:val="58527619"/>
+          <w:divId w:val="1375471928"/>
         </w:trPr>
         <w:tc>
           <w:tcPr>
@@ -15351,7 +15351,7 @@
       </w:tr>
       <w:tr>
         <w:trPr>
-          <w:divId w:val="58527619"/>
+          <w:divId w:val="1375471928"/>
         </w:trPr>
         <w:tc>
           <w:tcPr>
@@ -15507,7 +15507,7 @@
       </w:tr>
       <w:tr>
         <w:trPr>
-          <w:divId w:val="58527619"/>
+          <w:divId w:val="1375471928"/>
         </w:trPr>
         <w:tc>
           <w:tcPr>
@@ -15663,7 +15663,7 @@
       </w:tr>
       <w:tr>
         <w:trPr>
-          <w:divId w:val="58527619"/>
+          <w:divId w:val="1375471928"/>
         </w:trPr>
         <w:tc>
           <w:tcPr>
@@ -15819,7 +15819,7 @@
       </w:tr>
       <w:tr>
         <w:trPr>
-          <w:divId w:val="58527619"/>
+          <w:divId w:val="1375471928"/>
         </w:trPr>
         <w:tc>
           <w:tcPr>
@@ -15977,7 +15977,7 @@
     <w:p>
       <w:pPr>
         <w:pStyle w:val="Ttulo3"/>
-        <w:divId w:val="851917686"/>
+        <w:divId w:val="774710797"/>
         <w:rPr>
           <w:rFonts w:eastAsia="Times New Roman"/>
           <w:lang w:val="es-ES"/>
@@ -16011,7 +16011,7 @@
       </w:tblGrid>
       <w:tr>
         <w:trPr>
-          <w:divId w:val="1585526202"/>
+          <w:divId w:val="959653971"/>
           <w:tblHeader/>
         </w:trPr>
         <w:tc>
@@ -16202,7 +16202,7 @@
       </w:tr>
       <w:tr>
         <w:trPr>
-          <w:divId w:val="1585526202"/>
+          <w:divId w:val="959653971"/>
         </w:trPr>
         <w:tc>
           <w:tcPr>
@@ -16358,7 +16358,7 @@
       </w:tr>
       <w:tr>
         <w:trPr>
-          <w:divId w:val="1585526202"/>
+          <w:divId w:val="959653971"/>
         </w:trPr>
         <w:tc>
           <w:tcPr>
@@ -16514,7 +16514,7 @@
       </w:tr>
       <w:tr>
         <w:trPr>
-          <w:divId w:val="1585526202"/>
+          <w:divId w:val="959653971"/>
         </w:trPr>
         <w:tc>
           <w:tcPr>
@@ -16670,7 +16670,7 @@
       </w:tr>
       <w:tr>
         <w:trPr>
-          <w:divId w:val="1585526202"/>
+          <w:divId w:val="959653971"/>
         </w:trPr>
         <w:tc>
           <w:tcPr>
@@ -16826,7 +16826,7 @@
       </w:tr>
       <w:tr>
         <w:trPr>
-          <w:divId w:val="1585526202"/>
+          <w:divId w:val="959653971"/>
         </w:trPr>
         <w:tc>
           <w:tcPr>
@@ -16984,7 +16984,7 @@
     <w:p>
       <w:pPr>
         <w:pStyle w:val="Ttulo3"/>
-        <w:divId w:val="851917686"/>
+        <w:divId w:val="774710797"/>
         <w:rPr>
           <w:rFonts w:eastAsia="Times New Roman"/>
           <w:lang w:val="es-ES"/>
@@ -17018,7 +17018,7 @@
       </w:tblGrid>
       <w:tr>
         <w:trPr>
-          <w:divId w:val="425274019"/>
+          <w:divId w:val="324404115"/>
           <w:tblHeader/>
         </w:trPr>
         <w:tc>
@@ -17209,7 +17209,7 @@
       </w:tr>
       <w:tr>
         <w:trPr>
-          <w:divId w:val="425274019"/>
+          <w:divId w:val="324404115"/>
         </w:trPr>
         <w:tc>
           <w:tcPr>
@@ -17365,7 +17365,7 @@
       </w:tr>
       <w:tr>
         <w:trPr>
-          <w:divId w:val="425274019"/>
+          <w:divId w:val="324404115"/>
         </w:trPr>
         <w:tc>
           <w:tcPr>
@@ -17523,7 +17523,7 @@
     <w:p>
       <w:pPr>
         <w:pStyle w:val="Ttulo4"/>
-        <w:divId w:val="851917686"/>
+        <w:divId w:val="774710797"/>
         <w:rPr>
           <w:rFonts w:eastAsia="Times New Roman"/>
           <w:lang w:val="es-ES"/>
@@ -17541,7 +17541,7 @@
       <w:pPr>
         <w:spacing w:before="375" w:after="225"/>
         <w:jc w:val="center"/>
-        <w:divId w:val="1283923740"/>
+        <w:divId w:val="570501602"/>
         <w:rPr>
           <w:rFonts w:ascii="Outfit" w:eastAsia="Times New Roman" w:hAnsi="Outfit"/>
           <w:b/>
@@ -17571,7 +17571,7 @@
       <w:pPr>
         <w:spacing w:after="375"/>
         <w:jc w:val="center"/>
-        <w:divId w:val="263344979"/>
+        <w:divId w:val="1490633627"/>
         <w:rPr>
           <w:rFonts w:ascii="Plus Jakarta Sans" w:eastAsia="Times New Roman" w:hAnsi="Plus Jakarta Sans"/>
           <w:lang w:val="es-ES"/>
@@ -17959,7 +17959,7 @@
     <w:p>
       <w:pPr>
         <w:spacing w:before="450" w:after="450"/>
-        <w:divId w:val="851917686"/>
+        <w:divId w:val="774710797"/>
         <w:rPr>
           <w:rFonts w:ascii="Plus Jakarta Sans" w:eastAsia="Times New Roman" w:hAnsi="Plus Jakarta Sans"/>
           <w:lang w:val="es-ES"/>
@@ -17970,7 +17970,7 @@
           <w:rFonts w:ascii="Plus Jakarta Sans" w:eastAsia="Times New Roman" w:hAnsi="Plus Jakarta Sans"/>
           <w:lang w:val="es-ES"/>
         </w:rPr>
-        <w:pict w14:anchorId="115BAF15">
+        <w:pict w14:anchorId="1AB168E4">
           <v:rect id="_x0000_i1035" style="width:0;height:.75pt" o:hralign="center" o:hrstd="t" o:hr="t" fillcolor="#a0a0a0" stroked="f"/>
         </w:pict>
       </w:r>
@@ -17978,7 +17978,7 @@
     <w:p>
       <w:pPr>
         <w:spacing w:before="450" w:after="450"/>
-        <w:divId w:val="851917686"/>
+        <w:divId w:val="774710797"/>
         <w:rPr>
           <w:rFonts w:ascii="Plus Jakarta Sans" w:eastAsia="Times New Roman" w:hAnsi="Plus Jakarta Sans"/>
           <w:lang w:val="es-ES"/>
@@ -17989,7 +17989,7 @@
           <w:rFonts w:ascii="Plus Jakarta Sans" w:eastAsia="Times New Roman" w:hAnsi="Plus Jakarta Sans"/>
           <w:lang w:val="es-ES"/>
         </w:rPr>
-        <w:pict w14:anchorId="05586870">
+        <w:pict w14:anchorId="2311B9B6">
           <v:rect id="_x0000_i1036" style="width:0;height:.75pt" o:hralign="center" o:hrstd="t" o:hr="t" fillcolor="#a0a0a0" stroked="f"/>
         </w:pict>
       </w:r>
@@ -17997,7 +17997,7 @@
     <w:p>
       <w:pPr>
         <w:pStyle w:val="NormalWeb"/>
-        <w:divId w:val="851917686"/>
+        <w:divId w:val="774710797"/>
         <w:rPr>
           <w:rFonts w:ascii="Plus Jakarta Sans" w:hAnsi="Plus Jakarta Sans"/>
           <w:lang w:val="es-ES"/>
@@ -18030,7 +18030,7 @@
           <w:rFonts w:ascii="Plus Jakarta Sans" w:hAnsi="Plus Jakarta Sans"/>
           <w:lang w:val="es-ES"/>
         </w:rPr>
-        <w:pict w14:anchorId="2BAB3FD2"/>
+        <w:pict w14:anchorId="7A0E4E82"/>
       </w:r>
     </w:p>
     <w:sectPr>
@@ -18046,9 +18046,9 @@
 <file path=word/numbering.xml><?xml version="1.0" encoding="utf-8"?>
 <w:numbering xmlns:wpc="http://schemas.microsoft.com/office/word/2010/wordprocessingCanvas" xmlns:cx="http://schemas.microsoft.com/office/drawing/2014/chartex" xmlns:cx1="http://schemas.microsoft.com/office/drawing/2015/9/8/chartex" xmlns:cx2="http://schemas.microsoft.com/office/drawing/2015/10/21/chartex" xmlns:cx3="http://schemas.microsoft.com/office/drawing/2016/5/9/chartex" xmlns:cx4="http://schemas.microsoft.com/office/drawing/2016/5/10/chartex" xmlns:cx5="http://schemas.microsoft.com/office/drawing/2016/5/11/chartex" xmlns:cx6="http://schemas.microsoft.com/office/drawing/2016/5/12/chartex" xmlns:cx7="http://schemas.microsoft.com/office/drawing/2016/5/13/chartex" xmlns:cx8="http://schemas.microsoft.com/office/drawing/2016/5/14/chartex" xmlns:mc="http://schemas.openxmlformats.org/markup-compatibility/2006" xmlns:aink="http://schemas.microsoft.com/office/drawing/2016/ink" xmlns:am3d="http://schemas.microsoft.com/office/drawing/2017/model3d" xmlns:o="urn:schemas-microsoft-com:office:office" xmlns:r="http://schemas.openxmlformats.org/officeDocument/2006/relationships" xmlns:m="http://schemas.openxmlformats.org/officeDocument/2006/math" xmlns:v="urn:schemas-microsoft-com:vml" xmlns:wp14="http://schemas.microsoft.com/office/word/2010/wordprocessingDrawing" xmlns:wp="http://schemas.openxmlformats.org/drawingml/2006/wordprocessingDrawing" xmlns:w10="urn:schemas-microsoft-com:office:word" xmlns:w="http://schemas.openxmlformats.org/wordprocessingml/2006/main" xmlns:w14="http://schemas.microsoft.com/office/word/2010/wordml" xmlns:w15="http://schemas.microsoft.com/office/word/2012/wordml" xmlns:w16cex="http://schemas.microsoft.com/office/word/2018/wordml/cex" xmlns:w16cid="http://schemas.microsoft.com/office/word/2016/wordml/cid" xmlns:w16="http://schemas.microsoft.com/office/word/2018/wordml" xmlns:w16sdtdh="http://schemas.microsoft.com/office/word/2020/wordml/sdtdatahash" xmlns:w16se="http://schemas.microsoft.com/office/word/2015/wordml/symex" xmlns:wpg="http://schemas.microsoft.com/office/word/2010/wordprocessingGroup" xmlns:wpi="http://schemas.microsoft.com/office/word/2010/wordprocessingInk" xmlns:wne="http://schemas.microsoft.com/office/word/2006/wordml" xmlns:wps="http://schemas.microsoft.com/office/word/2010/wordprocessingShape" mc:Ignorable="w14 w15 w16se w16cid w16 w16cex w16sdtdh wp14">
   <w:abstractNum w:abstractNumId="0" w15:restartNumberingAfterBreak="0">
-    <w:nsid w:val="47F37629"/>
+    <w:nsid w:val="0D89711D"/>
     <w:multiLevelType w:val="multilevel"/>
-    <w:tmpl w:val="95846878"/>
+    <w:tmpl w:val="673035B0"/>
     <w:lvl w:ilvl="0">
       <w:start w:val="1"/>
       <w:numFmt w:val="bullet"/>
@@ -18195,9 +18195,9 @@
     </w:lvl>
   </w:abstractNum>
   <w:abstractNum w:abstractNumId="1" w15:restartNumberingAfterBreak="0">
-    <w:nsid w:val="62D67D0A"/>
+    <w:nsid w:val="0F8F2412"/>
     <w:multiLevelType w:val="multilevel"/>
-    <w:tmpl w:val="983838A8"/>
+    <w:tmpl w:val="05BEC1C0"/>
     <w:lvl w:ilvl="0">
       <w:start w:val="1"/>
       <w:numFmt w:val="bullet"/>
@@ -18344,9 +18344,9 @@
     </w:lvl>
   </w:abstractNum>
   <w:abstractNum w:abstractNumId="2" w15:restartNumberingAfterBreak="0">
-    <w:nsid w:val="6676066B"/>
+    <w:nsid w:val="352E6732"/>
     <w:multiLevelType w:val="multilevel"/>
-    <w:tmpl w:val="E4728232"/>
+    <w:tmpl w:val="62A6117A"/>
     <w:lvl w:ilvl="0">
       <w:start w:val="1"/>
       <w:numFmt w:val="bullet"/>
@@ -18493,9 +18493,9 @@
     </w:lvl>
   </w:abstractNum>
   <w:abstractNum w:abstractNumId="3" w15:restartNumberingAfterBreak="0">
-    <w:nsid w:val="7E8751C8"/>
+    <w:nsid w:val="42963C09"/>
     <w:multiLevelType w:val="multilevel"/>
-    <w:tmpl w:val="37D07E0A"/>
+    <w:tmpl w:val="DF427EB6"/>
     <w:lvl w:ilvl="0">
       <w:start w:val="1"/>
       <w:numFmt w:val="bullet"/>
@@ -18642,16 +18642,16 @@
     </w:lvl>
   </w:abstractNum>
   <w:num w:numId="1">
-    <w:abstractNumId w:val="3"/>
+    <w:abstractNumId w:val="2"/>
   </w:num>
   <w:num w:numId="2">
+    <w:abstractNumId w:val="0"/>
+  </w:num>
+  <w:num w:numId="3">
     <w:abstractNumId w:val="1"/>
   </w:num>
-  <w:num w:numId="3">
-    <w:abstractNumId w:val="2"/>
-  </w:num>
   <w:num w:numId="4">
-    <w:abstractNumId w:val="0"/>
+    <w:abstractNumId w:val="3"/>
   </w:num>
 </w:numbering>
 </file>

</xml_diff>

<commit_message>
feat: fichas hijas Fase 3 (encuesta validada, panel auditoría) + corrida completa
- Corrida completa: 2411 fichas hijas totales (6584 fichas en total)
- Encuesta: validación de clave contra catastro + producción opcional por predio
- AdminEncuestas: muestra producción declarada por predio adicional
- Nuevo panel /auditoria-hijas (admin+tecnico): avance por sector, tabla madre->hija
- QField: panel referencia producción de la madre con area en cultivos

Co-Authored-By: Claude Fable 5 <noreply@anthropic.com>
</commit_message>
<xml_diff>
--- a/public/informe_reunion_tecnica.docx
+++ b/public/informe_reunion_tecnica.docx
@@ -4,7 +4,7 @@
   <w:body>
     <w:p>
       <w:pPr>
-        <w:divId w:val="90901179"/>
+        <w:divId w:val="1955674484"/>
         <w:rPr>
           <w:rFonts w:ascii="Plus Jakarta Sans" w:eastAsia="Times New Roman" w:hAnsi="Plus Jakarta Sans"/>
           <w:lang w:val="es-ES"/>
@@ -28,7 +28,7 @@
     <w:p>
       <w:pPr>
         <w:pStyle w:val="Ttulo1"/>
-        <w:divId w:val="774710797"/>
+        <w:divId w:val="1751079550"/>
         <w:rPr>
           <w:rFonts w:eastAsia="Times New Roman"/>
           <w:lang w:val="es-ES"/>
@@ -45,7 +45,7 @@
     <w:p>
       <w:pPr>
         <w:pStyle w:val="NormalWeb"/>
-        <w:divId w:val="774710797"/>
+        <w:divId w:val="1751079550"/>
         <w:rPr>
           <w:rFonts w:ascii="Plus Jakarta Sans" w:hAnsi="Plus Jakarta Sans"/>
           <w:lang w:val="es-ES"/>
@@ -63,7 +63,7 @@
     <w:p>
       <w:pPr>
         <w:pStyle w:val="NormalWeb"/>
-        <w:divId w:val="774710797"/>
+        <w:divId w:val="1751079550"/>
         <w:rPr>
           <w:rFonts w:ascii="Plus Jakarta Sans" w:hAnsi="Plus Jakarta Sans"/>
           <w:lang w:val="es-ES"/>
@@ -102,7 +102,7 @@
     <w:p>
       <w:pPr>
         <w:spacing w:before="450" w:after="450"/>
-        <w:divId w:val="774710797"/>
+        <w:divId w:val="1751079550"/>
         <w:rPr>
           <w:rFonts w:ascii="Plus Jakarta Sans" w:eastAsia="Times New Roman" w:hAnsi="Plus Jakarta Sans"/>
           <w:lang w:val="es-ES"/>
@@ -113,7 +113,7 @@
           <w:rFonts w:ascii="Plus Jakarta Sans" w:eastAsia="Times New Roman" w:hAnsi="Plus Jakarta Sans"/>
           <w:lang w:val="es-ES"/>
         </w:rPr>
-        <w:pict w14:anchorId="181F3B43">
+        <w:pict w14:anchorId="395B6DFE">
           <v:rect id="_x0000_i1025" style="width:0;height:.75pt" o:hralign="center" o:hrstd="t" o:hr="t" fillcolor="#a0a0a0" stroked="f"/>
         </w:pict>
       </w:r>
@@ -121,7 +121,7 @@
     <w:p>
       <w:pPr>
         <w:pStyle w:val="Ttulo2"/>
-        <w:divId w:val="774710797"/>
+        <w:divId w:val="1751079550"/>
         <w:rPr>
           <w:rFonts w:eastAsia="Times New Roman"/>
           <w:lang w:val="es-ES"/>
@@ -145,7 +145,7 @@
     <w:p>
       <w:pPr>
         <w:pStyle w:val="NormalWeb"/>
-        <w:divId w:val="774710797"/>
+        <w:divId w:val="1751079550"/>
         <w:rPr>
           <w:rFonts w:ascii="Plus Jakarta Sans" w:hAnsi="Plus Jakarta Sans"/>
           <w:lang w:val="es-ES"/>
@@ -167,7 +167,7 @@
         </w:numPr>
         <w:spacing w:before="100" w:beforeAutospacing="1" w:after="90"/>
         <w:ind w:left="1020"/>
-        <w:divId w:val="774710797"/>
+        <w:divId w:val="1751079550"/>
         <w:rPr>
           <w:rFonts w:ascii="Plus Jakarta Sans" w:eastAsia="Times New Roman" w:hAnsi="Plus Jakarta Sans"/>
           <w:sz w:val="21"/>
@@ -202,7 +202,7 @@
           <w:szCs w:val="21"/>
           <w:lang w:val="es-ES"/>
         </w:rPr>
-        <w:t>4,173 fichas</w:t>
+        <w:t>4,440 fichas</w:t>
       </w:r>
     </w:p>
     <w:p>
@@ -213,7 +213,7 @@
         </w:numPr>
         <w:spacing w:before="100" w:beforeAutospacing="1" w:after="90"/>
         <w:ind w:left="1020"/>
-        <w:divId w:val="774710797"/>
+        <w:divId w:val="1751079550"/>
         <w:rPr>
           <w:rFonts w:ascii="Plus Jakarta Sans" w:eastAsia="Times New Roman" w:hAnsi="Plus Jakarta Sans"/>
           <w:sz w:val="21"/>
@@ -258,7 +258,7 @@
           <w:szCs w:val="21"/>
           <w:lang w:val="es-ES"/>
         </w:rPr>
-        <w:t>3,024 polígonos unificados</w:t>
+        <w:t>3,289 polígonos unificados</w:t>
       </w:r>
     </w:p>
     <w:p>
@@ -269,7 +269,7 @@
         </w:numPr>
         <w:spacing w:before="100" w:beforeAutospacing="1" w:after="90"/>
         <w:ind w:left="1020"/>
-        <w:divId w:val="774710797"/>
+        <w:divId w:val="1751079550"/>
         <w:rPr>
           <w:rFonts w:ascii="Plus Jakarta Sans" w:eastAsia="Times New Roman" w:hAnsi="Plus Jakarta Sans"/>
           <w:sz w:val="21"/>
@@ -315,7 +315,7 @@
         </w:numPr>
         <w:spacing w:before="100" w:beforeAutospacing="1" w:after="90"/>
         <w:ind w:left="1020"/>
-        <w:divId w:val="774710797"/>
+        <w:divId w:val="1751079550"/>
         <w:rPr>
           <w:rFonts w:ascii="Plus Jakarta Sans" w:eastAsia="Times New Roman" w:hAnsi="Plus Jakarta Sans"/>
           <w:sz w:val="21"/>
@@ -356,7 +356,7 @@
     <w:p>
       <w:pPr>
         <w:spacing w:before="450" w:after="450"/>
-        <w:divId w:val="774710797"/>
+        <w:divId w:val="1751079550"/>
         <w:rPr>
           <w:rFonts w:ascii="Plus Jakarta Sans" w:eastAsia="Times New Roman" w:hAnsi="Plus Jakarta Sans"/>
           <w:lang w:val="es-ES"/>
@@ -367,7 +367,7 @@
           <w:rFonts w:ascii="Plus Jakarta Sans" w:eastAsia="Times New Roman" w:hAnsi="Plus Jakarta Sans"/>
           <w:lang w:val="es-ES"/>
         </w:rPr>
-        <w:pict w14:anchorId="013141BA">
+        <w:pict w14:anchorId="03978D28">
           <v:rect id="_x0000_i1026" style="width:0;height:.75pt" o:hralign="center" o:hrstd="t" o:hr="t" fillcolor="#a0a0a0" stroked="f"/>
         </w:pict>
       </w:r>
@@ -375,7 +375,7 @@
     <w:p>
       <w:pPr>
         <w:pStyle w:val="Ttulo2"/>
-        <w:divId w:val="774710797"/>
+        <w:divId w:val="1751079550"/>
         <w:rPr>
           <w:rFonts w:eastAsia="Times New Roman"/>
           <w:lang w:val="es-ES"/>
@@ -392,7 +392,7 @@
     <w:p>
       <w:pPr>
         <w:pStyle w:val="NormalWeb"/>
-        <w:divId w:val="774710797"/>
+        <w:divId w:val="1751079550"/>
         <w:rPr>
           <w:rFonts w:ascii="Plus Jakarta Sans" w:hAnsi="Plus Jakarta Sans"/>
           <w:lang w:val="es-ES"/>
@@ -445,7 +445,7 @@
       </w:tblGrid>
       <w:tr>
         <w:trPr>
-          <w:divId w:val="1724712861"/>
+          <w:divId w:val="352078256"/>
           <w:tblHeader/>
         </w:trPr>
         <w:tc>
@@ -525,7 +525,7 @@
       </w:tr>
       <w:tr>
         <w:trPr>
-          <w:divId w:val="1724712861"/>
+          <w:divId w:val="352078256"/>
         </w:trPr>
         <w:tc>
           <w:tcPr>
@@ -591,7 +591,7 @@
       </w:tr>
       <w:tr>
         <w:trPr>
-          <w:divId w:val="1724712861"/>
+          <w:divId w:val="352078256"/>
         </w:trPr>
         <w:tc>
           <w:tcPr>
@@ -650,14 +650,14 @@
                 <w:sz w:val="20"/>
                 <w:szCs w:val="20"/>
               </w:rPr>
-              <w:t>394</w:t>
+              <w:t>559</w:t>
             </w:r>
           </w:p>
         </w:tc>
       </w:tr>
       <w:tr>
         <w:trPr>
-          <w:divId w:val="1724712861"/>
+          <w:divId w:val="352078256"/>
         </w:trPr>
         <w:tc>
           <w:tcPr>
@@ -716,14 +716,14 @@
                 <w:sz w:val="20"/>
                 <w:szCs w:val="20"/>
               </w:rPr>
-              <w:t>179</w:t>
+              <w:t>194</w:t>
             </w:r>
           </w:p>
         </w:tc>
       </w:tr>
       <w:tr>
         <w:trPr>
-          <w:divId w:val="1724712861"/>
+          <w:divId w:val="352078256"/>
         </w:trPr>
         <w:tc>
           <w:tcPr>
@@ -782,7 +782,7 @@
                 <w:sz w:val="20"/>
                 <w:szCs w:val="20"/>
               </w:rPr>
-              <w:t>248</w:t>
+              <w:t>335</w:t>
             </w:r>
           </w:p>
         </w:tc>
@@ -791,7 +791,7 @@
     <w:p>
       <w:pPr>
         <w:spacing w:before="450" w:after="450"/>
-        <w:divId w:val="774710797"/>
+        <w:divId w:val="1751079550"/>
         <w:rPr>
           <w:rFonts w:ascii="Plus Jakarta Sans" w:eastAsia="Times New Roman" w:hAnsi="Plus Jakarta Sans"/>
           <w:lang w:val="es-ES"/>
@@ -803,7 +803,7 @@
           <w:lang w:val="es-ES"/>
         </w:rPr>
         <w:lastRenderedPageBreak/>
-        <w:pict w14:anchorId="59B31B84">
+        <w:pict w14:anchorId="680EEFE0">
           <v:rect id="_x0000_i1027" style="width:0;height:.75pt" o:hralign="center" o:hrstd="t" o:hr="t" fillcolor="#a0a0a0" stroked="f"/>
         </w:pict>
       </w:r>
@@ -811,7 +811,7 @@
     <w:p>
       <w:pPr>
         <w:pStyle w:val="Ttulo2"/>
-        <w:divId w:val="774710797"/>
+        <w:divId w:val="1751079550"/>
         <w:rPr>
           <w:rFonts w:eastAsia="Times New Roman"/>
           <w:lang w:val="es-ES"/>
@@ -828,7 +828,7 @@
     <w:p>
       <w:pPr>
         <w:pStyle w:val="Ttulo3"/>
-        <w:divId w:val="774710797"/>
+        <w:divId w:val="1751079550"/>
         <w:rPr>
           <w:rFonts w:eastAsia="Times New Roman"/>
           <w:lang w:val="es-ES"/>
@@ -845,7 +845,7 @@
     <w:p>
       <w:pPr>
         <w:pStyle w:val="NormalWeb"/>
-        <w:divId w:val="774710797"/>
+        <w:divId w:val="1751079550"/>
         <w:rPr>
           <w:rFonts w:ascii="Plus Jakarta Sans" w:hAnsi="Plus Jakarta Sans"/>
           <w:lang w:val="es-ES"/>
@@ -885,7 +885,7 @@
       </w:tblGrid>
       <w:tr>
         <w:trPr>
-          <w:divId w:val="268045967"/>
+          <w:divId w:val="851798907"/>
           <w:tblHeader/>
         </w:trPr>
         <w:tc>
@@ -1039,7 +1039,7 @@
       </w:tr>
       <w:tr>
         <w:trPr>
-          <w:divId w:val="268045967"/>
+          <w:divId w:val="851798907"/>
         </w:trPr>
         <w:tc>
           <w:tcPr>
@@ -1158,14 +1158,14 @@
                 <w:sz w:val="20"/>
                 <w:szCs w:val="20"/>
               </w:rPr>
-              <w:t>820</w:t>
+              <w:t>1,087</w:t>
             </w:r>
           </w:p>
         </w:tc>
       </w:tr>
       <w:tr>
         <w:trPr>
-          <w:divId w:val="268045967"/>
+          <w:divId w:val="851798907"/>
         </w:trPr>
         <w:tc>
           <w:tcPr>
@@ -1284,14 +1284,14 @@
                 <w:sz w:val="20"/>
                 <w:szCs w:val="20"/>
               </w:rPr>
-              <w:t>31,733,370.43 m²</w:t>
+              <w:t>34,028,885.15 m²</w:t>
             </w:r>
           </w:p>
         </w:tc>
       </w:tr>
       <w:tr>
         <w:trPr>
-          <w:divId w:val="268045967"/>
+          <w:divId w:val="851798907"/>
         </w:trPr>
         <w:tc>
           <w:tcPr>
@@ -1410,14 +1410,14 @@
                 <w:sz w:val="20"/>
                 <w:szCs w:val="20"/>
               </w:rPr>
-              <w:t>38,699.23 m² (3.870 ha)</w:t>
+              <w:t>31,305.32 m² (3.131 ha)</w:t>
             </w:r>
           </w:p>
         </w:tc>
       </w:tr>
       <w:tr>
         <w:trPr>
-          <w:divId w:val="268045967"/>
+          <w:divId w:val="851798907"/>
         </w:trPr>
         <w:tc>
           <w:tcPr>
@@ -1536,14 +1536,14 @@
                 <w:sz w:val="20"/>
                 <w:szCs w:val="20"/>
               </w:rPr>
-              <w:t>15,511,666.13 m²</w:t>
+              <w:t>17,111,494.61 m²</w:t>
             </w:r>
           </w:p>
         </w:tc>
       </w:tr>
       <w:tr>
         <w:trPr>
-          <w:divId w:val="268045967"/>
+          <w:divId w:val="851798907"/>
         </w:trPr>
         <w:tc>
           <w:tcPr>
@@ -1670,14 +1670,14 @@
                 <w:sz w:val="20"/>
                 <w:szCs w:val="20"/>
               </w:rPr>
-              <w:t>18,916.67 m² (1.892 ha)</w:t>
+              <w:t>15,741.95 m² (1.574 ha)</w:t>
             </w:r>
           </w:p>
         </w:tc>
       </w:tr>
       <w:tr>
         <w:trPr>
-          <w:divId w:val="268045967"/>
+          <w:divId w:val="851798907"/>
         </w:trPr>
         <w:tc>
           <w:tcPr>
@@ -1796,14 +1796,14 @@
                 <w:sz w:val="20"/>
                 <w:szCs w:val="20"/>
               </w:rPr>
-              <w:t>16,221,704.30 m² (1622.17 ha)</w:t>
+              <w:t>16,917,390.54 m² (1691.74 ha)</w:t>
             </w:r>
           </w:p>
         </w:tc>
       </w:tr>
       <w:tr>
         <w:trPr>
-          <w:divId w:val="268045967"/>
+          <w:divId w:val="851798907"/>
         </w:trPr>
         <w:tc>
           <w:tcPr>
@@ -1929,7 +1929,7 @@
       </w:tr>
       <w:tr>
         <w:trPr>
-          <w:divId w:val="268045967"/>
+          <w:divId w:val="851798907"/>
         </w:trPr>
         <w:tc>
           <w:tcPr>
@@ -2057,7 +2057,7 @@
     <w:p>
       <w:pPr>
         <w:pStyle w:val="Ttulo3"/>
-        <w:divId w:val="774710797"/>
+        <w:divId w:val="1751079550"/>
         <w:rPr>
           <w:rFonts w:eastAsia="Times New Roman"/>
           <w:lang w:val="es-ES"/>
@@ -2074,7 +2074,7 @@
     <w:p>
       <w:pPr>
         <w:pStyle w:val="NormalWeb"/>
-        <w:divId w:val="774710797"/>
+        <w:divId w:val="1751079550"/>
         <w:rPr>
           <w:rFonts w:ascii="Plus Jakarta Sans" w:hAnsi="Plus Jakarta Sans"/>
           <w:lang w:val="es-ES"/>
@@ -2103,7 +2103,7 @@
         </w:numPr>
         <w:spacing w:before="100" w:beforeAutospacing="1" w:after="90"/>
         <w:ind w:left="1020"/>
-        <w:divId w:val="774710797"/>
+        <w:divId w:val="1751079550"/>
         <w:rPr>
           <w:rFonts w:ascii="Plus Jakarta Sans" w:eastAsia="Times New Roman" w:hAnsi="Plus Jakarta Sans"/>
           <w:sz w:val="21"/>
@@ -2205,7 +2205,7 @@
         </w:numPr>
         <w:spacing w:before="100" w:beforeAutospacing="1" w:after="90"/>
         <w:ind w:left="1020"/>
-        <w:divId w:val="774710797"/>
+        <w:divId w:val="1751079550"/>
         <w:rPr>
           <w:rFonts w:ascii="Plus Jakarta Sans" w:eastAsia="Times New Roman" w:hAnsi="Plus Jakarta Sans"/>
           <w:sz w:val="21"/>
@@ -2317,7 +2317,7 @@
         </w:numPr>
         <w:spacing w:before="100" w:beforeAutospacing="1" w:after="90"/>
         <w:ind w:left="1020"/>
-        <w:divId w:val="774710797"/>
+        <w:divId w:val="1751079550"/>
         <w:rPr>
           <w:rFonts w:ascii="Plus Jakarta Sans" w:eastAsia="Times New Roman" w:hAnsi="Plus Jakarta Sans"/>
           <w:sz w:val="21"/>
@@ -2361,7 +2361,7 @@
           <w:szCs w:val="21"/>
           <w:lang w:val="es-ES"/>
         </w:rPr>
-        <w:t>1622.17 ha</w:t>
+        <w:t>1691.74 ha</w:t>
       </w:r>
       <w:r>
         <w:rPr>
@@ -2380,7 +2380,7 @@
           <w:szCs w:val="21"/>
           <w:lang w:val="es-ES"/>
         </w:rPr>
-        <w:t>47.5%</w:t>
+        <w:t>48.5%</w:t>
       </w:r>
       <w:r>
         <w:rPr>
@@ -2423,7 +2423,7 @@
     <w:p>
       <w:pPr>
         <w:pStyle w:val="Ttulo3"/>
-        <w:divId w:val="774710797"/>
+        <w:divId w:val="1751079550"/>
         <w:rPr>
           <w:rFonts w:eastAsia="Times New Roman"/>
           <w:lang w:val="es-ES"/>
@@ -2440,7 +2440,7 @@
     <w:p>
       <w:pPr>
         <w:jc w:val="center"/>
-        <w:divId w:val="194315215"/>
+        <w:divId w:val="1839229493"/>
         <w:rPr>
           <w:rFonts w:ascii="Outfit" w:eastAsia="Times New Roman" w:hAnsi="Outfit"/>
           <w:b/>
@@ -2469,7 +2469,7 @@
     <w:p>
       <w:pPr>
         <w:jc w:val="center"/>
-        <w:divId w:val="473375114"/>
+        <w:divId w:val="177894608"/>
         <w:rPr>
           <w:rFonts w:ascii="Plus Jakarta Sans" w:eastAsia="Times New Roman" w:hAnsi="Plus Jakarta Sans"/>
           <w:lang w:val="es-ES"/>
@@ -2781,7 +2781,7 @@
           <w:rFonts w:ascii="Plus Jakarta Sans" w:eastAsia="Times New Roman" w:hAnsi="Plus Jakarta Sans"/>
           <w:lang w:val="es-ES"/>
         </w:rPr>
-        <w:t>48.9</w:t>
+        <w:t>50.3</w:t>
       </w:r>
       <w:r>
         <w:rPr>
@@ -2802,7 +2802,7 @@
           <w:rFonts w:ascii="Plus Jakarta Sans" w:eastAsia="Times New Roman" w:hAnsi="Plus Jakarta Sans"/>
           <w:lang w:val="es-ES"/>
         </w:rPr>
-        <w:t>51.1</w:t>
+        <w:t>49.7</w:t>
       </w:r>
       <w:r>
         <w:rPr>
@@ -2864,7 +2864,7 @@
     <w:p>
       <w:pPr>
         <w:spacing w:before="450" w:after="450"/>
-        <w:divId w:val="774710797"/>
+        <w:divId w:val="1751079550"/>
         <w:rPr>
           <w:rFonts w:ascii="Plus Jakarta Sans" w:eastAsia="Times New Roman" w:hAnsi="Plus Jakarta Sans"/>
           <w:lang w:val="es-ES"/>
@@ -2875,7 +2875,7 @@
           <w:rFonts w:ascii="Plus Jakarta Sans" w:eastAsia="Times New Roman" w:hAnsi="Plus Jakarta Sans"/>
           <w:lang w:val="es-ES"/>
         </w:rPr>
-        <w:pict w14:anchorId="47337178">
+        <w:pict w14:anchorId="201554FF">
           <v:rect id="_x0000_i1028" style="width:0;height:.75pt" o:hralign="center" o:hrstd="t" o:hr="t" fillcolor="#a0a0a0" stroked="f"/>
         </w:pict>
       </w:r>
@@ -2883,7 +2883,7 @@
     <w:p>
       <w:pPr>
         <w:pStyle w:val="Ttulo3"/>
-        <w:divId w:val="774710797"/>
+        <w:divId w:val="1751079550"/>
         <w:rPr>
           <w:rFonts w:eastAsia="Times New Roman"/>
           <w:lang w:val="es-ES"/>
@@ -2900,7 +2900,7 @@
     <w:p>
       <w:pPr>
         <w:pStyle w:val="NormalWeb"/>
-        <w:divId w:val="774710797"/>
+        <w:divId w:val="1751079550"/>
         <w:rPr>
           <w:rFonts w:ascii="Plus Jakarta Sans" w:hAnsi="Plus Jakarta Sans"/>
           <w:lang w:val="es-ES"/>
@@ -2933,7 +2933,7 @@
       </w:tblGrid>
       <w:tr>
         <w:trPr>
-          <w:divId w:val="1624921106"/>
+          <w:divId w:val="797139471"/>
           <w:tblHeader/>
         </w:trPr>
         <w:tc>
@@ -3087,7 +3087,7 @@
       </w:tr>
       <w:tr>
         <w:trPr>
-          <w:divId w:val="1624921106"/>
+          <w:divId w:val="797139471"/>
         </w:trPr>
         <w:tc>
           <w:tcPr>
@@ -3214,14 +3214,14 @@
                 <w:sz w:val="20"/>
                 <w:szCs w:val="20"/>
               </w:rPr>
-              <w:t>106 (12.9%)</w:t>
+              <w:t>166 (15.3%)</w:t>
             </w:r>
           </w:p>
         </w:tc>
       </w:tr>
       <w:tr>
         <w:trPr>
-          <w:divId w:val="1624921106"/>
+          <w:divId w:val="797139471"/>
         </w:trPr>
         <w:tc>
           <w:tcPr>
@@ -3348,14 +3348,14 @@
                 <w:sz w:val="20"/>
                 <w:szCs w:val="20"/>
               </w:rPr>
-              <w:t>351 (42.8%)</w:t>
+              <w:t>485 (44.6%)</w:t>
             </w:r>
           </w:p>
         </w:tc>
       </w:tr>
       <w:tr>
         <w:trPr>
-          <w:divId w:val="1624921106"/>
+          <w:divId w:val="797139471"/>
         </w:trPr>
         <w:tc>
           <w:tcPr>
@@ -3482,14 +3482,14 @@
                 <w:sz w:val="20"/>
                 <w:szCs w:val="20"/>
               </w:rPr>
-              <w:t>228 (27.8%)</w:t>
+              <w:t>262 (24.1%)</w:t>
             </w:r>
           </w:p>
         </w:tc>
       </w:tr>
       <w:tr>
         <w:trPr>
-          <w:divId w:val="1624921106"/>
+          <w:divId w:val="797139471"/>
         </w:trPr>
         <w:tc>
           <w:tcPr>
@@ -3616,14 +3616,14 @@
                 <w:sz w:val="20"/>
                 <w:szCs w:val="20"/>
               </w:rPr>
-              <w:t>111 (13.5%)</w:t>
+              <w:t>144 (13.2%)</w:t>
             </w:r>
           </w:p>
         </w:tc>
       </w:tr>
       <w:tr>
         <w:trPr>
-          <w:divId w:val="1624921106"/>
+          <w:divId w:val="797139471"/>
         </w:trPr>
         <w:tc>
           <w:tcPr>
@@ -3750,14 +3750,14 @@
                 <w:sz w:val="20"/>
                 <w:szCs w:val="20"/>
               </w:rPr>
-              <w:t>9 (1.1%)</w:t>
+              <w:t>13 (1.2%)</w:t>
             </w:r>
           </w:p>
         </w:tc>
       </w:tr>
       <w:tr>
         <w:trPr>
-          <w:divId w:val="1624921106"/>
+          <w:divId w:val="797139471"/>
         </w:trPr>
         <w:tc>
           <w:tcPr>
@@ -3884,7 +3884,7 @@
                 <w:sz w:val="20"/>
                 <w:szCs w:val="20"/>
               </w:rPr>
-              <w:t>15 (1.8%)</w:t>
+              <w:t>17 (1.6%)</w:t>
             </w:r>
           </w:p>
         </w:tc>
@@ -3893,7 +3893,7 @@
     <w:p>
       <w:pPr>
         <w:pStyle w:val="Ttulo3"/>
-        <w:divId w:val="774710797"/>
+        <w:divId w:val="1751079550"/>
         <w:rPr>
           <w:rFonts w:eastAsia="Times New Roman"/>
           <w:lang w:val="es-ES"/>
@@ -3910,7 +3910,7 @@
     <w:p>
       <w:pPr>
         <w:jc w:val="center"/>
-        <w:divId w:val="1460755883"/>
+        <w:divId w:val="2099711320"/>
         <w:rPr>
           <w:rFonts w:ascii="Outfit" w:eastAsia="Times New Roman" w:hAnsi="Outfit"/>
           <w:b/>
@@ -3939,7 +3939,7 @@
     <w:p>
       <w:pPr>
         <w:jc w:val="center"/>
-        <w:divId w:val="171535641"/>
+        <w:divId w:val="1940135966"/>
         <w:rPr>
           <w:rFonts w:ascii="Plus Jakarta Sans" w:eastAsia="Times New Roman" w:hAnsi="Plus Jakarta Sans"/>
           <w:lang w:val="es-ES"/>
@@ -3971,14 +3971,14 @@
           <w:rFonts w:ascii="Plus Jakarta Sans" w:eastAsia="Times New Roman" w:hAnsi="Plus Jakarta Sans"/>
           <w:lang w:val="es-ES"/>
         </w:rPr>
-        <w:t>Porcentaje de p</w:t>
-      </w:r>
-      <w:r>
-        <w:rPr>
-          <w:rFonts w:ascii="Plus Jakarta Sans" w:eastAsia="Times New Roman" w:hAnsi="Plus Jakarta Sans"/>
-          <w:lang w:val="es-ES"/>
-        </w:rPr>
-        <w:t>redios en cada rango de hectáreas (ha</w:t>
+        <w:t xml:space="preserve">Porcentaje de </w:t>
+      </w:r>
+      <w:r>
+        <w:rPr>
+          <w:rFonts w:ascii="Plus Jakarta Sans" w:eastAsia="Times New Roman" w:hAnsi="Plus Jakarta Sans"/>
+          <w:lang w:val="es-ES"/>
+        </w:rPr>
+        <w:t>predios en cada rango de hectáreas (ha</w:t>
       </w:r>
       <w:r>
         <w:rPr>
@@ -4313,7 +4313,7 @@
     <w:p>
       <w:pPr>
         <w:spacing w:before="450" w:after="450"/>
-        <w:divId w:val="774710797"/>
+        <w:divId w:val="1751079550"/>
         <w:rPr>
           <w:rFonts w:ascii="Plus Jakarta Sans" w:eastAsia="Times New Roman" w:hAnsi="Plus Jakarta Sans"/>
           <w:lang w:val="es-ES"/>
@@ -4325,7 +4325,7 @@
           <w:lang w:val="es-ES"/>
         </w:rPr>
         <w:lastRenderedPageBreak/>
-        <w:pict w14:anchorId="1B94D7B8">
+        <w:pict w14:anchorId="6D6A6E56">
           <v:rect id="_x0000_i1029" style="width:0;height:.75pt" o:hralign="center" o:hrstd="t" o:hr="t" fillcolor="#a0a0a0" stroked="f"/>
         </w:pict>
       </w:r>
@@ -4333,7 +4333,7 @@
     <w:p>
       <w:pPr>
         <w:pStyle w:val="Ttulo3"/>
-        <w:divId w:val="774710797"/>
+        <w:divId w:val="1751079550"/>
         <w:rPr>
           <w:rFonts w:eastAsia="Times New Roman"/>
           <w:lang w:val="es-ES"/>
@@ -4350,7 +4350,7 @@
     <w:p>
       <w:pPr>
         <w:pStyle w:val="NormalWeb"/>
-        <w:divId w:val="774710797"/>
+        <w:divId w:val="1751079550"/>
         <w:rPr>
           <w:rFonts w:ascii="Plus Jakarta Sans" w:hAnsi="Plus Jakarta Sans"/>
           <w:lang w:val="es-ES"/>
@@ -4372,7 +4372,7 @@
         </w:numPr>
         <w:spacing w:before="100" w:beforeAutospacing="1" w:after="90"/>
         <w:ind w:left="1020"/>
-        <w:divId w:val="774710797"/>
+        <w:divId w:val="1751079550"/>
         <w:rPr>
           <w:rFonts w:ascii="Plus Jakarta Sans" w:eastAsia="Times New Roman" w:hAnsi="Plus Jakarta Sans"/>
           <w:sz w:val="21"/>
@@ -4408,7 +4408,7 @@
         </w:numPr>
         <w:spacing w:before="100" w:beforeAutospacing="1" w:after="90"/>
         <w:ind w:left="1020"/>
-        <w:divId w:val="774710797"/>
+        <w:divId w:val="1751079550"/>
         <w:rPr>
           <w:rFonts w:ascii="Plus Jakarta Sans" w:eastAsia="Times New Roman" w:hAnsi="Plus Jakarta Sans"/>
           <w:sz w:val="21"/>
@@ -4453,7 +4453,7 @@
         </w:numPr>
         <w:spacing w:before="100" w:beforeAutospacing="1" w:after="90"/>
         <w:ind w:left="1020"/>
-        <w:divId w:val="774710797"/>
+        <w:divId w:val="1751079550"/>
         <w:rPr>
           <w:rFonts w:ascii="Plus Jakarta Sans" w:eastAsia="Times New Roman" w:hAnsi="Plus Jakarta Sans"/>
           <w:sz w:val="21"/>
@@ -4498,7 +4498,7 @@
         </w:numPr>
         <w:spacing w:before="100" w:beforeAutospacing="1" w:after="90"/>
         <w:ind w:left="1020"/>
-        <w:divId w:val="774710797"/>
+        <w:divId w:val="1751079550"/>
         <w:rPr>
           <w:rFonts w:ascii="Plus Jakarta Sans" w:eastAsia="Times New Roman" w:hAnsi="Plus Jakarta Sans"/>
           <w:sz w:val="21"/>
@@ -4523,7 +4523,7 @@
           <w:szCs w:val="21"/>
           <w:lang w:val="es-ES"/>
         </w:rPr>
-        <w:t>3.3 hijos</w:t>
+        <w:t>3.5 hijos</w:t>
       </w:r>
       <w:r>
         <w:rPr>
@@ -4532,7 +4532,7 @@
           <w:szCs w:val="21"/>
           <w:lang w:val="es-ES"/>
         </w:rPr>
-        <w:t xml:space="preserve"> (Hogar promedio de ~5.3 personas).</w:t>
+        <w:t xml:space="preserve"> (Hogar promedio de ~5.5 personas).</w:t>
       </w:r>
     </w:p>
     <w:tbl>
@@ -4554,7 +4554,7 @@
       </w:tblGrid>
       <w:tr>
         <w:trPr>
-          <w:divId w:val="1880628252"/>
+          <w:divId w:val="716927364"/>
           <w:tblHeader/>
         </w:trPr>
         <w:tc>
@@ -4708,7 +4708,7 @@
       </w:tr>
       <w:tr>
         <w:trPr>
-          <w:divId w:val="1880628252"/>
+          <w:divId w:val="716927364"/>
         </w:trPr>
         <w:tc>
           <w:tcPr>
@@ -4827,14 +4827,14 @@
                 <w:sz w:val="20"/>
                 <w:szCs w:val="20"/>
               </w:rPr>
-              <w:t>44 (5.4%)</w:t>
+              <w:t>69 (6.3%)</w:t>
             </w:r>
           </w:p>
         </w:tc>
       </w:tr>
       <w:tr>
         <w:trPr>
-          <w:divId w:val="1880628252"/>
+          <w:divId w:val="716927364"/>
         </w:trPr>
         <w:tc>
           <w:tcPr>
@@ -4953,14 +4953,14 @@
                 <w:sz w:val="20"/>
                 <w:szCs w:val="20"/>
               </w:rPr>
-              <w:t>226 (27.6%)</w:t>
+              <w:t>268 (24.7%)</w:t>
             </w:r>
           </w:p>
         </w:tc>
       </w:tr>
       <w:tr>
         <w:trPr>
-          <w:divId w:val="1880628252"/>
+          <w:divId w:val="716927364"/>
         </w:trPr>
         <w:tc>
           <w:tcPr>
@@ -5079,14 +5079,14 @@
                 <w:sz w:val="20"/>
                 <w:szCs w:val="20"/>
               </w:rPr>
-              <w:t>383 (46.7%)</w:t>
+              <w:t>486 (44.7%)</w:t>
             </w:r>
           </w:p>
         </w:tc>
       </w:tr>
       <w:tr>
         <w:trPr>
-          <w:divId w:val="1880628252"/>
+          <w:divId w:val="716927364"/>
         </w:trPr>
         <w:tc>
           <w:tcPr>
@@ -5205,7 +5205,7 @@
                 <w:sz w:val="20"/>
                 <w:szCs w:val="20"/>
               </w:rPr>
-              <w:t>167 (20.4%)</w:t>
+              <w:t>264 (24.3%)</w:t>
             </w:r>
           </w:p>
         </w:tc>
@@ -5214,7 +5214,7 @@
     <w:p>
       <w:pPr>
         <w:spacing w:before="450" w:after="450"/>
-        <w:divId w:val="774710797"/>
+        <w:divId w:val="1751079550"/>
         <w:rPr>
           <w:rFonts w:ascii="Plus Jakarta Sans" w:eastAsia="Times New Roman" w:hAnsi="Plus Jakarta Sans"/>
           <w:lang w:val="es-ES"/>
@@ -5225,7 +5225,7 @@
           <w:rFonts w:ascii="Plus Jakarta Sans" w:eastAsia="Times New Roman" w:hAnsi="Plus Jakarta Sans"/>
           <w:lang w:val="es-ES"/>
         </w:rPr>
-        <w:pict w14:anchorId="3824807E">
+        <w:pict w14:anchorId="2717BFD2">
           <v:rect id="_x0000_i1030" style="width:0;height:.75pt" o:hralign="center" o:hrstd="t" o:hr="t" fillcolor="#a0a0a0" stroked="f"/>
         </w:pict>
       </w:r>
@@ -5233,7 +5233,7 @@
     <w:p>
       <w:pPr>
         <w:pStyle w:val="Ttulo3"/>
-        <w:divId w:val="774710797"/>
+        <w:divId w:val="1751079550"/>
         <w:rPr>
           <w:rFonts w:eastAsia="Times New Roman"/>
           <w:lang w:val="es-ES"/>
@@ -5250,7 +5250,7 @@
     <w:p>
       <w:pPr>
         <w:pStyle w:val="NormalWeb"/>
-        <w:divId w:val="774710797"/>
+        <w:divId w:val="1751079550"/>
         <w:rPr>
           <w:rFonts w:ascii="Plus Jakarta Sans" w:hAnsi="Plus Jakarta Sans"/>
           <w:lang w:val="es-ES"/>
@@ -5274,7 +5274,7 @@
     <w:p>
       <w:pPr>
         <w:pStyle w:val="Ttulo4"/>
-        <w:divId w:val="774710797"/>
+        <w:divId w:val="1751079550"/>
         <w:rPr>
           <w:rFonts w:eastAsia="Times New Roman"/>
           <w:lang w:val="es-ES"/>
@@ -5291,7 +5291,7 @@
     <w:p>
       <w:pPr>
         <w:jc w:val="center"/>
-        <w:divId w:val="1631125754"/>
+        <w:divId w:val="151920837"/>
         <w:rPr>
           <w:rFonts w:ascii="Outfit" w:eastAsia="Times New Roman" w:hAnsi="Outfit"/>
           <w:b/>
@@ -5320,7 +5320,7 @@
     <w:p>
       <w:pPr>
         <w:jc w:val="center"/>
-        <w:divId w:val="150872134"/>
+        <w:divId w:val="1017656423"/>
         <w:rPr>
           <w:rFonts w:ascii="Plus Jakarta Sans" w:eastAsia="Times New Roman" w:hAnsi="Plus Jakarta Sans"/>
           <w:lang w:val="es-ES"/>
@@ -5603,7 +5603,7 @@
     <w:p>
       <w:pPr>
         <w:pStyle w:val="Ttulo4"/>
-        <w:divId w:val="774710797"/>
+        <w:divId w:val="1751079550"/>
         <w:rPr>
           <w:rFonts w:eastAsia="Times New Roman"/>
           <w:lang w:val="es-ES"/>
@@ -5627,7 +5627,7 @@
     <w:p>
       <w:pPr>
         <w:jc w:val="center"/>
-        <w:divId w:val="926698009"/>
+        <w:divId w:val="1816606542"/>
         <w:rPr>
           <w:rFonts w:ascii="Outfit" w:eastAsia="Times New Roman" w:hAnsi="Outfit"/>
           <w:b/>
@@ -5656,7 +5656,7 @@
     <w:p>
       <w:pPr>
         <w:jc w:val="center"/>
-        <w:divId w:val="1380205331"/>
+        <w:divId w:val="891964180"/>
         <w:rPr>
           <w:rFonts w:ascii="Plus Jakarta Sans" w:eastAsia="Times New Roman" w:hAnsi="Plus Jakarta Sans"/>
           <w:lang w:val="es-ES"/>
@@ -5974,7 +5974,7 @@
     <w:p>
       <w:pPr>
         <w:pStyle w:val="Ttulo4"/>
-        <w:divId w:val="774710797"/>
+        <w:divId w:val="1751079550"/>
         <w:rPr>
           <w:rFonts w:eastAsia="Times New Roman"/>
           <w:lang w:val="es-ES"/>
@@ -5992,7 +5992,7 @@
     <w:p>
       <w:pPr>
         <w:jc w:val="center"/>
-        <w:divId w:val="1070497314"/>
+        <w:divId w:val="1444961280"/>
         <w:rPr>
           <w:rFonts w:ascii="Outfit" w:eastAsia="Times New Roman" w:hAnsi="Outfit"/>
           <w:b/>
@@ -6021,7 +6021,7 @@
     <w:p>
       <w:pPr>
         <w:jc w:val="center"/>
-        <w:divId w:val="199974457"/>
+        <w:divId w:val="125975542"/>
         <w:rPr>
           <w:rFonts w:ascii="Plus Jakarta Sans" w:eastAsia="Times New Roman" w:hAnsi="Plus Jakarta Sans"/>
           <w:lang w:val="es-ES"/>
@@ -6325,7 +6325,7 @@
     <w:p>
       <w:pPr>
         <w:spacing w:before="450" w:after="450"/>
-        <w:divId w:val="774710797"/>
+        <w:divId w:val="1751079550"/>
         <w:rPr>
           <w:rFonts w:ascii="Plus Jakarta Sans" w:eastAsia="Times New Roman" w:hAnsi="Plus Jakarta Sans"/>
           <w:lang w:val="es-ES"/>
@@ -6336,7 +6336,7 @@
           <w:rFonts w:ascii="Plus Jakarta Sans" w:eastAsia="Times New Roman" w:hAnsi="Plus Jakarta Sans"/>
           <w:lang w:val="es-ES"/>
         </w:rPr>
-        <w:pict w14:anchorId="6B6222A9">
+        <w:pict w14:anchorId="5526A864">
           <v:rect id="_x0000_i1031" style="width:0;height:.75pt" o:hralign="center" o:hrstd="t" o:hr="t" fillcolor="#a0a0a0" stroked="f"/>
         </w:pict>
       </w:r>
@@ -6344,7 +6344,7 @@
     <w:p>
       <w:pPr>
         <w:pStyle w:val="Ttulo3"/>
-        <w:divId w:val="774710797"/>
+        <w:divId w:val="1751079550"/>
         <w:rPr>
           <w:rFonts w:eastAsia="Times New Roman"/>
           <w:lang w:val="es-ES"/>
@@ -6361,7 +6361,7 @@
     <w:p>
       <w:pPr>
         <w:pStyle w:val="NormalWeb"/>
-        <w:divId w:val="774710797"/>
+        <w:divId w:val="1751079550"/>
         <w:rPr>
           <w:rFonts w:ascii="Plus Jakarta Sans" w:hAnsi="Plus Jakarta Sans"/>
           <w:lang w:val="es-ES"/>
@@ -6385,7 +6385,7 @@
     <w:p>
       <w:pPr>
         <w:pStyle w:val="Ttulo4"/>
-        <w:divId w:val="774710797"/>
+        <w:divId w:val="1751079550"/>
         <w:rPr>
           <w:rFonts w:eastAsia="Times New Roman"/>
           <w:lang w:val="es-ES"/>
@@ -6402,7 +6402,7 @@
     <w:p>
       <w:pPr>
         <w:pStyle w:val="NormalWeb"/>
-        <w:divId w:val="774710797"/>
+        <w:divId w:val="1751079550"/>
         <w:rPr>
           <w:rFonts w:ascii="Plus Jakarta Sans" w:hAnsi="Plus Jakarta Sans"/>
           <w:lang w:val="es-ES"/>
@@ -6433,7 +6433,7 @@
       </w:tblGrid>
       <w:tr>
         <w:trPr>
-          <w:divId w:val="1288779825"/>
+          <w:divId w:val="427580545"/>
           <w:tblHeader/>
         </w:trPr>
         <w:tc>
@@ -6513,7 +6513,7 @@
       </w:tr>
       <w:tr>
         <w:trPr>
-          <w:divId w:val="1288779825"/>
+          <w:divId w:val="427580545"/>
         </w:trPr>
         <w:tc>
           <w:tcPr>
@@ -6602,7 +6602,7 @@
     <w:p>
       <w:pPr>
         <w:pStyle w:val="Ttulo4"/>
-        <w:divId w:val="774710797"/>
+        <w:divId w:val="1751079550"/>
         <w:rPr>
           <w:rFonts w:eastAsia="Times New Roman"/>
           <w:lang w:val="es-ES"/>
@@ -6619,7 +6619,7 @@
     <w:p>
       <w:pPr>
         <w:pStyle w:val="NormalWeb"/>
-        <w:divId w:val="774710797"/>
+        <w:divId w:val="1751079550"/>
         <w:rPr>
           <w:rFonts w:ascii="Plus Jakarta Sans" w:hAnsi="Plus Jakarta Sans"/>
           <w:lang w:val="es-ES"/>
@@ -6650,7 +6650,7 @@
       </w:tblGrid>
       <w:tr>
         <w:trPr>
-          <w:divId w:val="934627502"/>
+          <w:divId w:val="333841694"/>
           <w:tblHeader/>
         </w:trPr>
         <w:tc>
@@ -6730,7 +6730,7 @@
       </w:tr>
       <w:tr>
         <w:trPr>
-          <w:divId w:val="934627502"/>
+          <w:divId w:val="333841694"/>
         </w:trPr>
         <w:tc>
           <w:tcPr>
@@ -6828,7 +6828,7 @@
     <w:p>
       <w:pPr>
         <w:pStyle w:val="Ttulo4"/>
-        <w:divId w:val="774710797"/>
+        <w:divId w:val="1751079550"/>
         <w:rPr>
           <w:rFonts w:eastAsia="Times New Roman"/>
           <w:lang w:val="es-ES"/>
@@ -6845,7 +6845,7 @@
     <w:p>
       <w:pPr>
         <w:pStyle w:val="NormalWeb"/>
-        <w:divId w:val="774710797"/>
+        <w:divId w:val="1751079550"/>
         <w:rPr>
           <w:rFonts w:ascii="Plus Jakarta Sans" w:hAnsi="Plus Jakarta Sans"/>
           <w:lang w:val="es-ES"/>
@@ -6876,7 +6876,7 @@
       </w:tblGrid>
       <w:tr>
         <w:trPr>
-          <w:divId w:val="1437286208"/>
+          <w:divId w:val="1063793555"/>
           <w:tblHeader/>
         </w:trPr>
         <w:tc>
@@ -6957,7 +6957,7 @@
       </w:tr>
       <w:tr>
         <w:trPr>
-          <w:divId w:val="1437286208"/>
+          <w:divId w:val="1063793555"/>
         </w:trPr>
         <w:tc>
           <w:tcPr>
@@ -7046,7 +7046,7 @@
     <w:p>
       <w:pPr>
         <w:spacing w:before="450" w:after="450"/>
-        <w:divId w:val="774710797"/>
+        <w:divId w:val="1751079550"/>
         <w:rPr>
           <w:rFonts w:ascii="Plus Jakarta Sans" w:eastAsia="Times New Roman" w:hAnsi="Plus Jakarta Sans"/>
           <w:lang w:val="es-ES"/>
@@ -7057,7 +7057,7 @@
           <w:rFonts w:ascii="Plus Jakarta Sans" w:eastAsia="Times New Roman" w:hAnsi="Plus Jakarta Sans"/>
           <w:lang w:val="es-ES"/>
         </w:rPr>
-        <w:pict w14:anchorId="2ED892C6">
+        <w:pict w14:anchorId="4716DAA5">
           <v:rect id="_x0000_i1032" style="width:0;height:.75pt" o:hralign="center" o:hrstd="t" o:hr="t" fillcolor="#a0a0a0" stroked="f"/>
         </w:pict>
       </w:r>
@@ -7065,7 +7065,7 @@
     <w:p>
       <w:pPr>
         <w:pStyle w:val="Ttulo2"/>
-        <w:divId w:val="774710797"/>
+        <w:divId w:val="1751079550"/>
         <w:rPr>
           <w:rFonts w:eastAsia="Times New Roman"/>
           <w:lang w:val="es-ES"/>
@@ -7082,7 +7082,7 @@
     <w:p>
       <w:pPr>
         <w:pStyle w:val="NormalWeb"/>
-        <w:divId w:val="774710797"/>
+        <w:divId w:val="1751079550"/>
         <w:rPr>
           <w:rFonts w:ascii="Plus Jakarta Sans" w:hAnsi="Plus Jakarta Sans"/>
           <w:lang w:val="es-ES"/>
@@ -7099,7 +7099,7 @@
     <w:p>
       <w:pPr>
         <w:pStyle w:val="Ttulo3"/>
-        <w:divId w:val="774710797"/>
+        <w:divId w:val="1751079550"/>
         <w:rPr>
           <w:rFonts w:eastAsia="Times New Roman"/>
           <w:lang w:val="es-ES"/>
@@ -7116,7 +7116,7 @@
     <w:p>
       <w:pPr>
         <w:pStyle w:val="NormalWeb"/>
-        <w:divId w:val="774710797"/>
+        <w:divId w:val="1751079550"/>
         <w:rPr>
           <w:rFonts w:ascii="Plus Jakarta Sans" w:hAnsi="Plus Jakarta Sans"/>
           <w:lang w:val="es-ES"/>
@@ -7149,7 +7149,7 @@
       </w:tblGrid>
       <w:tr>
         <w:trPr>
-          <w:divId w:val="1791168544"/>
+          <w:divId w:val="406075286"/>
           <w:tblHeader/>
         </w:trPr>
         <w:tc>
@@ -7314,7 +7314,7 @@
       </w:tr>
       <w:tr>
         <w:trPr>
-          <w:divId w:val="1791168544"/>
+          <w:divId w:val="406075286"/>
         </w:trPr>
         <w:tc>
           <w:tcPr>
@@ -7433,14 +7433,14 @@
                 <w:sz w:val="20"/>
                 <w:szCs w:val="20"/>
               </w:rPr>
-              <w:t>587 (71.6%)</w:t>
+              <w:t>809 (74.4%)</w:t>
             </w:r>
           </w:p>
         </w:tc>
       </w:tr>
       <w:tr>
         <w:trPr>
-          <w:divId w:val="1791168544"/>
+          <w:divId w:val="406075286"/>
         </w:trPr>
         <w:tc>
           <w:tcPr>
@@ -7559,14 +7559,14 @@
                 <w:sz w:val="20"/>
                 <w:szCs w:val="20"/>
               </w:rPr>
-              <w:t>174 (21.2%)</w:t>
+              <w:t>203 (18.7%)</w:t>
             </w:r>
           </w:p>
         </w:tc>
       </w:tr>
       <w:tr>
         <w:trPr>
-          <w:divId w:val="1791168544"/>
+          <w:divId w:val="406075286"/>
         </w:trPr>
         <w:tc>
           <w:tcPr>
@@ -7685,14 +7685,14 @@
                 <w:sz w:val="20"/>
                 <w:szCs w:val="20"/>
               </w:rPr>
-              <w:t>59 (7.2%)</w:t>
+              <w:t>75 (6.9%)</w:t>
             </w:r>
           </w:p>
         </w:tc>
       </w:tr>
       <w:tr>
         <w:trPr>
-          <w:divId w:val="1791168544"/>
+          <w:divId w:val="406075286"/>
         </w:trPr>
         <w:tc>
           <w:tcPr>
@@ -7820,7 +7820,7 @@
     <w:p>
       <w:pPr>
         <w:pStyle w:val="Ttulo3"/>
-        <w:divId w:val="774710797"/>
+        <w:divId w:val="1751079550"/>
         <w:rPr>
           <w:rFonts w:eastAsia="Times New Roman"/>
           <w:lang w:val="es-ES"/>
@@ -7838,7 +7838,7 @@
       <w:pPr>
         <w:spacing w:before="375" w:after="225"/>
         <w:jc w:val="center"/>
-        <w:divId w:val="466976253"/>
+        <w:divId w:val="79061763"/>
         <w:rPr>
           <w:rFonts w:ascii="Outfit" w:eastAsia="Times New Roman" w:hAnsi="Outfit"/>
           <w:b/>
@@ -7868,7 +7868,7 @@
       <w:pPr>
         <w:spacing w:after="375"/>
         <w:jc w:val="center"/>
-        <w:divId w:val="2055807340"/>
+        <w:divId w:val="427163980"/>
         <w:rPr>
           <w:rFonts w:ascii="Plus Jakarta Sans" w:eastAsia="Times New Roman" w:hAnsi="Plus Jakarta Sans"/>
           <w:lang w:val="es-ES"/>
@@ -8110,7 +8110,7 @@
           <w:rFonts w:ascii="Plus Jakarta Sans" w:eastAsia="Times New Roman" w:hAnsi="Plus Jakarta Sans"/>
           <w:lang w:val="es-ES"/>
         </w:rPr>
-        <w:t>72</w:t>
+        <w:t>74</w:t>
       </w:r>
       <w:r>
         <w:rPr>
@@ -8131,7 +8131,7 @@
           <w:rFonts w:ascii="Plus Jakarta Sans" w:eastAsia="Times New Roman" w:hAnsi="Plus Jakarta Sans"/>
           <w:lang w:val="es-ES"/>
         </w:rPr>
-        <w:t>21</w:t>
+        <w:t>19</w:t>
       </w:r>
       <w:r>
         <w:rPr>
@@ -8235,7 +8235,7 @@
     <w:p>
       <w:pPr>
         <w:pStyle w:val="Ttulo3"/>
-        <w:divId w:val="774710797"/>
+        <w:divId w:val="1751079550"/>
         <w:rPr>
           <w:rFonts w:eastAsia="Times New Roman"/>
           <w:lang w:val="es-ES"/>
@@ -8259,7 +8259,7 @@
     <w:p>
       <w:pPr>
         <w:pStyle w:val="NormalWeb"/>
-        <w:divId w:val="774710797"/>
+        <w:divId w:val="1751079550"/>
         <w:rPr>
           <w:rFonts w:ascii="Plus Jakarta Sans" w:hAnsi="Plus Jakarta Sans"/>
           <w:lang w:val="es-ES"/>
@@ -8281,7 +8281,7 @@
         </w:numPr>
         <w:spacing w:before="100" w:beforeAutospacing="1" w:after="90"/>
         <w:ind w:left="1020"/>
-        <w:divId w:val="774710797"/>
+        <w:divId w:val="1751079550"/>
         <w:rPr>
           <w:rFonts w:ascii="Plus Jakarta Sans" w:eastAsia="Times New Roman" w:hAnsi="Plus Jakarta Sans"/>
           <w:sz w:val="21"/>
@@ -8317,7 +8317,7 @@
         </w:numPr>
         <w:spacing w:before="100" w:beforeAutospacing="1" w:after="90"/>
         <w:ind w:left="1020"/>
-        <w:divId w:val="774710797"/>
+        <w:divId w:val="1751079550"/>
         <w:rPr>
           <w:rFonts w:ascii="Plus Jakarta Sans" w:eastAsia="Times New Roman" w:hAnsi="Plus Jakarta Sans"/>
           <w:sz w:val="21"/>
@@ -8362,7 +8362,7 @@
         </w:numPr>
         <w:spacing w:before="100" w:beforeAutospacing="1" w:after="90"/>
         <w:ind w:left="1020"/>
-        <w:divId w:val="774710797"/>
+        <w:divId w:val="1751079550"/>
         <w:rPr>
           <w:rFonts w:ascii="Plus Jakarta Sans" w:eastAsia="Times New Roman" w:hAnsi="Plus Jakarta Sans"/>
           <w:sz w:val="21"/>
@@ -8416,7 +8416,7 @@
         </w:numPr>
         <w:spacing w:before="100" w:beforeAutospacing="1" w:after="90"/>
         <w:ind w:left="1020"/>
-        <w:divId w:val="774710797"/>
+        <w:divId w:val="1751079550"/>
         <w:rPr>
           <w:rFonts w:ascii="Plus Jakarta Sans" w:eastAsia="Times New Roman" w:hAnsi="Plus Jakarta Sans"/>
           <w:sz w:val="21"/>
@@ -8450,7 +8450,7 @@
           <w:szCs w:val="21"/>
           <w:lang w:val="es-ES"/>
         </w:rPr>
-        <w:t xml:space="preserve"> promedio (en 176 predios).</w:t>
+        <w:t xml:space="preserve"> promedio (en 265 predios).</w:t>
       </w:r>
     </w:p>
     <w:p>
@@ -8461,7 +8461,7 @@
         </w:numPr>
         <w:spacing w:before="100" w:beforeAutospacing="1" w:after="90"/>
         <w:ind w:left="1020"/>
-        <w:divId w:val="774710797"/>
+        <w:divId w:val="1751079550"/>
         <w:rPr>
           <w:rFonts w:ascii="Plus Jakarta Sans" w:eastAsia="Times New Roman" w:hAnsi="Plus Jakarta Sans"/>
           <w:sz w:val="21"/>
@@ -8497,7 +8497,7 @@
         </w:numPr>
         <w:spacing w:before="100" w:beforeAutospacing="1" w:after="90"/>
         <w:ind w:left="1020"/>
-        <w:divId w:val="774710797"/>
+        <w:divId w:val="1751079550"/>
         <w:rPr>
           <w:rFonts w:ascii="Plus Jakarta Sans" w:eastAsia="Times New Roman" w:hAnsi="Plus Jakarta Sans"/>
           <w:sz w:val="21"/>
@@ -8542,7 +8542,7 @@
         </w:numPr>
         <w:spacing w:before="100" w:beforeAutospacing="1" w:after="90"/>
         <w:ind w:left="1020"/>
-        <w:divId w:val="774710797"/>
+        <w:divId w:val="1751079550"/>
         <w:rPr>
           <w:rFonts w:ascii="Plus Jakarta Sans" w:eastAsia="Times New Roman" w:hAnsi="Plus Jakarta Sans"/>
           <w:sz w:val="21"/>
@@ -8587,7 +8587,7 @@
         </w:numPr>
         <w:spacing w:before="100" w:beforeAutospacing="1" w:after="90"/>
         <w:ind w:left="1020"/>
-        <w:divId w:val="774710797"/>
+        <w:divId w:val="1751079550"/>
         <w:rPr>
           <w:rFonts w:ascii="Plus Jakarta Sans" w:eastAsia="Times New Roman" w:hAnsi="Plus Jakarta Sans"/>
           <w:sz w:val="21"/>
@@ -8612,7 +8612,7 @@
           <w:szCs w:val="21"/>
           <w:lang w:val="es-ES"/>
         </w:rPr>
-        <w:t>84.1%</w:t>
+        <w:t>87.0%</w:t>
       </w:r>
       <w:r>
         <w:rPr>
@@ -8621,7 +8621,7 @@
           <w:szCs w:val="21"/>
           <w:lang w:val="es-ES"/>
         </w:rPr>
-        <w:t xml:space="preserve"> promedio (en 596 predios).</w:t>
+        <w:t xml:space="preserve"> promedio (en 768 predios).</w:t>
       </w:r>
     </w:p>
     <w:p>
@@ -8632,7 +8632,7 @@
         </w:numPr>
         <w:spacing w:before="100" w:beforeAutospacing="1" w:after="90"/>
         <w:ind w:left="1020"/>
-        <w:divId w:val="774710797"/>
+        <w:divId w:val="1751079550"/>
         <w:rPr>
           <w:rFonts w:ascii="Plus Jakarta Sans" w:eastAsia="Times New Roman" w:hAnsi="Plus Jakarta Sans"/>
           <w:sz w:val="21"/>
@@ -8668,7 +8668,7 @@
         </w:numPr>
         <w:spacing w:before="100" w:beforeAutospacing="1" w:after="90"/>
         <w:ind w:left="1020"/>
-        <w:divId w:val="774710797"/>
+        <w:divId w:val="1751079550"/>
         <w:rPr>
           <w:rFonts w:ascii="Plus Jakarta Sans" w:eastAsia="Times New Roman" w:hAnsi="Plus Jakarta Sans"/>
           <w:sz w:val="21"/>
@@ -8722,7 +8722,7 @@
         </w:numPr>
         <w:spacing w:before="100" w:beforeAutospacing="1" w:after="90"/>
         <w:ind w:left="1020"/>
-        <w:divId w:val="774710797"/>
+        <w:divId w:val="1751079550"/>
         <w:rPr>
           <w:rFonts w:ascii="Plus Jakarta Sans" w:eastAsia="Times New Roman" w:hAnsi="Plus Jakarta Sans"/>
           <w:sz w:val="21"/>
@@ -8767,7 +8767,7 @@
         </w:numPr>
         <w:spacing w:before="100" w:beforeAutospacing="1" w:after="90"/>
         <w:ind w:left="1020"/>
-        <w:divId w:val="774710797"/>
+        <w:divId w:val="1751079550"/>
         <w:rPr>
           <w:rFonts w:ascii="Plus Jakarta Sans" w:eastAsia="Times New Roman" w:hAnsi="Plus Jakarta Sans"/>
           <w:sz w:val="21"/>
@@ -8792,7 +8792,7 @@
           <w:szCs w:val="21"/>
           <w:lang w:val="es-ES"/>
         </w:rPr>
-        <w:t>67.5%</w:t>
+        <w:t>66.9%</w:t>
       </w:r>
       <w:r>
         <w:rPr>
@@ -8801,13 +8801,13 @@
           <w:szCs w:val="21"/>
           <w:lang w:val="es-ES"/>
         </w:rPr>
-        <w:t xml:space="preserve"> promedio (en 144 predios).</w:t>
+        <w:t xml:space="preserve"> promedio (en 149 predios).</w:t>
       </w:r>
     </w:p>
     <w:p>
       <w:pPr>
         <w:pStyle w:val="Ttulo3"/>
-        <w:divId w:val="774710797"/>
+        <w:divId w:val="1751079550"/>
         <w:rPr>
           <w:rFonts w:eastAsia="Times New Roman"/>
           <w:lang w:val="es-ES"/>
@@ -8825,7 +8825,7 @@
       <w:pPr>
         <w:spacing w:before="375" w:after="225"/>
         <w:jc w:val="center"/>
-        <w:divId w:val="1126464341"/>
+        <w:divId w:val="687364577"/>
         <w:rPr>
           <w:rFonts w:ascii="Outfit" w:eastAsia="Times New Roman" w:hAnsi="Outfit"/>
           <w:b/>
@@ -8855,7 +8855,7 @@
       <w:pPr>
         <w:spacing w:after="375"/>
         <w:jc w:val="center"/>
-        <w:divId w:val="510611381"/>
+        <w:divId w:val="1047024298"/>
         <w:rPr>
           <w:rFonts w:ascii="Plus Jakarta Sans" w:eastAsia="Times New Roman" w:hAnsi="Plus Jakarta Sans"/>
           <w:lang w:val="es-ES"/>
@@ -9145,7 +9145,7 @@
     <w:p>
       <w:pPr>
         <w:spacing w:before="450" w:after="450"/>
-        <w:divId w:val="774710797"/>
+        <w:divId w:val="1751079550"/>
         <w:rPr>
           <w:rFonts w:ascii="Plus Jakarta Sans" w:eastAsia="Times New Roman" w:hAnsi="Plus Jakarta Sans"/>
           <w:lang w:val="es-ES"/>
@@ -9156,7 +9156,7 @@
           <w:rFonts w:ascii="Plus Jakarta Sans" w:eastAsia="Times New Roman" w:hAnsi="Plus Jakarta Sans"/>
           <w:lang w:val="es-ES"/>
         </w:rPr>
-        <w:pict w14:anchorId="458386A1">
+        <w:pict w14:anchorId="52CECF5F">
           <v:rect id="_x0000_i1033" style="width:0;height:.75pt" o:hralign="center" o:hrstd="t" o:hr="t" fillcolor="#a0a0a0" stroked="f"/>
         </w:pict>
       </w:r>
@@ -9164,7 +9164,7 @@
     <w:p>
       <w:pPr>
         <w:pStyle w:val="Ttulo2"/>
-        <w:divId w:val="774710797"/>
+        <w:divId w:val="1751079550"/>
         <w:rPr>
           <w:rFonts w:eastAsia="Times New Roman"/>
           <w:lang w:val="es-ES"/>
@@ -9181,7 +9181,7 @@
     <w:p>
       <w:pPr>
         <w:pStyle w:val="NormalWeb"/>
-        <w:divId w:val="774710797"/>
+        <w:divId w:val="1751079550"/>
         <w:rPr>
           <w:rFonts w:ascii="Plus Jakarta Sans" w:hAnsi="Plus Jakarta Sans"/>
           <w:lang w:val="es-ES"/>
@@ -9198,7 +9198,7 @@
     <w:p>
       <w:pPr>
         <w:pStyle w:val="NormalWeb"/>
-        <w:divId w:val="774710797"/>
+        <w:divId w:val="1751079550"/>
         <w:rPr>
           <w:rFonts w:ascii="Plus Jakarta Sans" w:hAnsi="Plus Jakarta Sans"/>
           <w:lang w:val="es-ES"/>
@@ -9260,7 +9260,7 @@
     <w:p>
       <w:pPr>
         <w:pStyle w:val="NormalWeb"/>
-        <w:divId w:val="774710797"/>
+        <w:divId w:val="1751079550"/>
         <w:rPr>
           <w:rFonts w:ascii="Plus Jakarta Sans" w:hAnsi="Plus Jakarta Sans"/>
           <w:lang w:val="es-ES"/>
@@ -9322,7 +9322,7 @@
     <w:p>
       <w:pPr>
         <w:pStyle w:val="NormalWeb"/>
-        <w:divId w:val="774710797"/>
+        <w:divId w:val="1751079550"/>
         <w:rPr>
           <w:rFonts w:ascii="Plus Jakarta Sans" w:hAnsi="Plus Jakarta Sans"/>
           <w:lang w:val="es-ES"/>
@@ -9383,7 +9383,7 @@
     <w:p>
       <w:pPr>
         <w:pStyle w:val="NormalWeb"/>
-        <w:divId w:val="774710797"/>
+        <w:divId w:val="1751079550"/>
         <w:rPr>
           <w:rFonts w:ascii="Plus Jakarta Sans" w:hAnsi="Plus Jakarta Sans"/>
           <w:lang w:val="es-ES"/>
@@ -9437,7 +9437,7 @@
     <w:p>
       <w:pPr>
         <w:spacing w:before="450" w:after="450"/>
-        <w:divId w:val="774710797"/>
+        <w:divId w:val="1751079550"/>
         <w:rPr>
           <w:rFonts w:ascii="Plus Jakarta Sans" w:eastAsia="Times New Roman" w:hAnsi="Plus Jakarta Sans"/>
           <w:lang w:val="es-ES"/>
@@ -9448,7 +9448,7 @@
           <w:rFonts w:ascii="Plus Jakarta Sans" w:eastAsia="Times New Roman" w:hAnsi="Plus Jakarta Sans"/>
           <w:lang w:val="es-ES"/>
         </w:rPr>
-        <w:pict w14:anchorId="61D09A04">
+        <w:pict w14:anchorId="62F64AC6">
           <v:rect id="_x0000_i1034" style="width:0;height:.75pt" o:hralign="center" o:hrstd="t" o:hr="t" fillcolor="#a0a0a0" stroked="f"/>
         </w:pict>
       </w:r>
@@ -9456,7 +9456,7 @@
     <w:p>
       <w:pPr>
         <w:pStyle w:val="Ttulo2"/>
-        <w:divId w:val="774710797"/>
+        <w:divId w:val="1751079550"/>
         <w:rPr>
           <w:rFonts w:eastAsia="Times New Roman"/>
           <w:lang w:val="es-ES"/>
@@ -9473,7 +9473,7 @@
     <w:p>
       <w:pPr>
         <w:pStyle w:val="NormalWeb"/>
-        <w:divId w:val="774710797"/>
+        <w:divId w:val="1751079550"/>
         <w:rPr>
           <w:rFonts w:ascii="Plus Jakarta Sans" w:hAnsi="Plus Jakarta Sans"/>
           <w:lang w:val="es-ES"/>
@@ -9499,7 +9499,7 @@
           <w:rFonts w:ascii="Plus Jakarta Sans" w:hAnsi="Plus Jakarta Sans"/>
           <w:lang w:val="es-ES"/>
         </w:rPr>
-        <w:t>4,173 familias</w:t>
+        <w:t>4,440 familias</w:t>
       </w:r>
       <w:r>
         <w:rPr>
@@ -9512,7 +9512,7 @@
     <w:p>
       <w:pPr>
         <w:pStyle w:val="Ttulo3"/>
-        <w:divId w:val="774710797"/>
+        <w:divId w:val="1751079550"/>
         <w:rPr>
           <w:rFonts w:eastAsia="Times New Roman"/>
           <w:lang w:val="es-ES"/>
@@ -9546,7 +9546,7 @@
       </w:tblGrid>
       <w:tr>
         <w:trPr>
-          <w:divId w:val="592200007"/>
+          <w:divId w:val="1385718799"/>
           <w:tblHeader/>
         </w:trPr>
         <w:tc>
@@ -9737,7 +9737,7 @@
       </w:tr>
       <w:tr>
         <w:trPr>
-          <w:divId w:val="592200007"/>
+          <w:divId w:val="1385718799"/>
         </w:trPr>
         <w:tc>
           <w:tcPr>
@@ -9893,7 +9893,7 @@
       </w:tr>
       <w:tr>
         <w:trPr>
-          <w:divId w:val="592200007"/>
+          <w:divId w:val="1385718799"/>
         </w:trPr>
         <w:tc>
           <w:tcPr>
@@ -10049,7 +10049,7 @@
       </w:tr>
       <w:tr>
         <w:trPr>
-          <w:divId w:val="592200007"/>
+          <w:divId w:val="1385718799"/>
         </w:trPr>
         <w:tc>
           <w:tcPr>
@@ -10108,104 +10108,104 @@
                 <w:sz w:val="20"/>
                 <w:szCs w:val="20"/>
               </w:rPr>
-              <w:t>820</w:t>
-            </w:r>
-          </w:p>
-        </w:tc>
-        <w:tc>
-          <w:tcPr>
-            <w:tcW w:w="0" w:type="auto"/>
-            <w:tcMar>
-              <w:top w:w="150" w:type="dxa"/>
-              <w:left w:w="210" w:type="dxa"/>
-              <w:bottom w:w="150" w:type="dxa"/>
-              <w:right w:w="210" w:type="dxa"/>
-            </w:tcMar>
-            <w:vAlign w:val="center"/>
-            <w:hideMark/>
-          </w:tcPr>
-          <w:p>
-            <w:pPr>
-              <w:rPr>
-                <w:rFonts w:ascii="Plus Jakarta Sans" w:eastAsia="Times New Roman" w:hAnsi="Plus Jakarta Sans"/>
-                <w:sz w:val="20"/>
-                <w:szCs w:val="20"/>
-              </w:rPr>
-            </w:pPr>
-            <w:r>
-              <w:rPr>
-                <w:rFonts w:ascii="Plus Jakarta Sans" w:eastAsia="Times New Roman" w:hAnsi="Plus Jakarta Sans"/>
-                <w:sz w:val="20"/>
-                <w:szCs w:val="20"/>
-              </w:rPr>
-              <w:t>3,173.34 ha</w:t>
-            </w:r>
-          </w:p>
-        </w:tc>
-        <w:tc>
-          <w:tcPr>
-            <w:tcW w:w="0" w:type="auto"/>
-            <w:tcMar>
-              <w:top w:w="150" w:type="dxa"/>
-              <w:left w:w="210" w:type="dxa"/>
-              <w:bottom w:w="150" w:type="dxa"/>
-              <w:right w:w="210" w:type="dxa"/>
-            </w:tcMar>
-            <w:vAlign w:val="center"/>
-            <w:hideMark/>
-          </w:tcPr>
-          <w:p>
-            <w:pPr>
-              <w:rPr>
-                <w:rFonts w:ascii="Plus Jakarta Sans" w:eastAsia="Times New Roman" w:hAnsi="Plus Jakarta Sans"/>
-                <w:sz w:val="20"/>
-                <w:szCs w:val="20"/>
-              </w:rPr>
-            </w:pPr>
-            <w:r>
-              <w:rPr>
-                <w:rFonts w:ascii="Plus Jakarta Sans" w:eastAsia="Times New Roman" w:hAnsi="Plus Jakarta Sans"/>
-                <w:sz w:val="20"/>
-                <w:szCs w:val="20"/>
-              </w:rPr>
-              <w:t>1,551.17 ha</w:t>
-            </w:r>
-          </w:p>
-        </w:tc>
-        <w:tc>
-          <w:tcPr>
-            <w:tcW w:w="0" w:type="auto"/>
-            <w:tcMar>
-              <w:top w:w="150" w:type="dxa"/>
-              <w:left w:w="210" w:type="dxa"/>
-              <w:bottom w:w="150" w:type="dxa"/>
-              <w:right w:w="210" w:type="dxa"/>
-            </w:tcMar>
-            <w:vAlign w:val="center"/>
-            <w:hideMark/>
-          </w:tcPr>
-          <w:p>
-            <w:pPr>
-              <w:rPr>
-                <w:rFonts w:ascii="Plus Jakarta Sans" w:eastAsia="Times New Roman" w:hAnsi="Plus Jakarta Sans"/>
-                <w:sz w:val="20"/>
-                <w:szCs w:val="20"/>
-              </w:rPr>
-            </w:pPr>
-            <w:r>
-              <w:rPr>
-                <w:rFonts w:ascii="Plus Jakarta Sans" w:eastAsia="Times New Roman" w:hAnsi="Plus Jakarta Sans"/>
-                <w:sz w:val="20"/>
-                <w:szCs w:val="20"/>
-              </w:rPr>
-              <w:t>1,622.17 ha</w:t>
+              <w:t>1,087</w:t>
+            </w:r>
+          </w:p>
+        </w:tc>
+        <w:tc>
+          <w:tcPr>
+            <w:tcW w:w="0" w:type="auto"/>
+            <w:tcMar>
+              <w:top w:w="150" w:type="dxa"/>
+              <w:left w:w="210" w:type="dxa"/>
+              <w:bottom w:w="150" w:type="dxa"/>
+              <w:right w:w="210" w:type="dxa"/>
+            </w:tcMar>
+            <w:vAlign w:val="center"/>
+            <w:hideMark/>
+          </w:tcPr>
+          <w:p>
+            <w:pPr>
+              <w:rPr>
+                <w:rFonts w:ascii="Plus Jakarta Sans" w:eastAsia="Times New Roman" w:hAnsi="Plus Jakarta Sans"/>
+                <w:sz w:val="20"/>
+                <w:szCs w:val="20"/>
+              </w:rPr>
+            </w:pPr>
+            <w:r>
+              <w:rPr>
+                <w:rFonts w:ascii="Plus Jakarta Sans" w:eastAsia="Times New Roman" w:hAnsi="Plus Jakarta Sans"/>
+                <w:sz w:val="20"/>
+                <w:szCs w:val="20"/>
+              </w:rPr>
+              <w:t>3,402.89 ha</w:t>
+            </w:r>
+          </w:p>
+        </w:tc>
+        <w:tc>
+          <w:tcPr>
+            <w:tcW w:w="0" w:type="auto"/>
+            <w:tcMar>
+              <w:top w:w="150" w:type="dxa"/>
+              <w:left w:w="210" w:type="dxa"/>
+              <w:bottom w:w="150" w:type="dxa"/>
+              <w:right w:w="210" w:type="dxa"/>
+            </w:tcMar>
+            <w:vAlign w:val="center"/>
+            <w:hideMark/>
+          </w:tcPr>
+          <w:p>
+            <w:pPr>
+              <w:rPr>
+                <w:rFonts w:ascii="Plus Jakarta Sans" w:eastAsia="Times New Roman" w:hAnsi="Plus Jakarta Sans"/>
+                <w:sz w:val="20"/>
+                <w:szCs w:val="20"/>
+              </w:rPr>
+            </w:pPr>
+            <w:r>
+              <w:rPr>
+                <w:rFonts w:ascii="Plus Jakarta Sans" w:eastAsia="Times New Roman" w:hAnsi="Plus Jakarta Sans"/>
+                <w:sz w:val="20"/>
+                <w:szCs w:val="20"/>
+              </w:rPr>
+              <w:t>1,711.15 ha</w:t>
+            </w:r>
+          </w:p>
+        </w:tc>
+        <w:tc>
+          <w:tcPr>
+            <w:tcW w:w="0" w:type="auto"/>
+            <w:tcMar>
+              <w:top w:w="150" w:type="dxa"/>
+              <w:left w:w="210" w:type="dxa"/>
+              <w:bottom w:w="150" w:type="dxa"/>
+              <w:right w:w="210" w:type="dxa"/>
+            </w:tcMar>
+            <w:vAlign w:val="center"/>
+            <w:hideMark/>
+          </w:tcPr>
+          <w:p>
+            <w:pPr>
+              <w:rPr>
+                <w:rFonts w:ascii="Plus Jakarta Sans" w:eastAsia="Times New Roman" w:hAnsi="Plus Jakarta Sans"/>
+                <w:sz w:val="20"/>
+                <w:szCs w:val="20"/>
+              </w:rPr>
+            </w:pPr>
+            <w:r>
+              <w:rPr>
+                <w:rFonts w:ascii="Plus Jakarta Sans" w:eastAsia="Times New Roman" w:hAnsi="Plus Jakarta Sans"/>
+                <w:sz w:val="20"/>
+                <w:szCs w:val="20"/>
+              </w:rPr>
+              <w:t>1,691.74 ha</w:t>
             </w:r>
           </w:p>
         </w:tc>
       </w:tr>
       <w:tr>
         <w:trPr>
-          <w:divId w:val="592200007"/>
+          <w:divId w:val="1385718799"/>
         </w:trPr>
         <w:tc>
           <w:tcPr>
@@ -10265,7 +10265,7 @@
                 <w:sz w:val="20"/>
                 <w:szCs w:val="20"/>
               </w:rPr>
-              <w:t>4,173</w:t>
+              <w:t>4,440</w:t>
             </w:r>
           </w:p>
         </w:tc>
@@ -10296,7 +10296,7 @@
                 <w:sz w:val="20"/>
                 <w:szCs w:val="20"/>
               </w:rPr>
-              <w:t>10,417.55 ha</w:t>
+              <w:t>10,647.10 ha</w:t>
             </w:r>
           </w:p>
         </w:tc>
@@ -10327,7 +10327,7 @@
                 <w:sz w:val="20"/>
                 <w:szCs w:val="20"/>
               </w:rPr>
-              <w:t>7,000.71 ha</w:t>
+              <w:t>7,160.69 ha</w:t>
             </w:r>
           </w:p>
         </w:tc>
@@ -10358,7 +10358,7 @@
                 <w:sz w:val="20"/>
                 <w:szCs w:val="20"/>
               </w:rPr>
-              <w:t>3,416.84 ha</w:t>
+              <w:t>3,486.41 ha</w:t>
             </w:r>
           </w:p>
         </w:tc>
@@ -10367,7 +10367,7 @@
     <w:p>
       <w:pPr>
         <w:pStyle w:val="Ttulo3"/>
-        <w:divId w:val="774710797"/>
+        <w:divId w:val="1751079550"/>
         <w:rPr>
           <w:rFonts w:eastAsia="Times New Roman"/>
           <w:lang w:val="es-ES"/>
@@ -10401,7 +10401,7 @@
       </w:tblGrid>
       <w:tr>
         <w:trPr>
-          <w:divId w:val="608316225"/>
+          <w:divId w:val="1723557997"/>
           <w:tblHeader/>
         </w:trPr>
         <w:tc>
@@ -10592,7 +10592,7 @@
       </w:tr>
       <w:tr>
         <w:trPr>
-          <w:divId w:val="608316225"/>
+          <w:divId w:val="1723557997"/>
         </w:trPr>
         <w:tc>
           <w:tcPr>
@@ -10711,7 +10711,7 @@
                 <w:sz w:val="20"/>
                 <w:szCs w:val="20"/>
               </w:rPr>
-              <w:t>617</w:t>
+              <w:t>882</w:t>
             </w:r>
           </w:p>
         </w:tc>
@@ -10742,14 +10742,14 @@
                 <w:sz w:val="20"/>
                 <w:szCs w:val="20"/>
               </w:rPr>
-              <w:t>3,045</w:t>
+              <w:t>3,310</w:t>
             </w:r>
           </w:p>
         </w:tc>
       </w:tr>
       <w:tr>
         <w:trPr>
-          <w:divId w:val="608316225"/>
+          <w:divId w:val="1723557997"/>
         </w:trPr>
         <w:tc>
           <w:tcPr>
@@ -10908,7 +10908,7 @@
     <w:p>
       <w:pPr>
         <w:pStyle w:val="Ttulo3"/>
-        <w:divId w:val="774710797"/>
+        <w:divId w:val="1751079550"/>
         <w:rPr>
           <w:rFonts w:eastAsia="Times New Roman"/>
           <w:lang w:val="es-ES"/>
@@ -10943,7 +10943,7 @@
       </w:tblGrid>
       <w:tr>
         <w:trPr>
-          <w:divId w:val="1328363218"/>
+          <w:divId w:val="1033771953"/>
           <w:tblHeader/>
         </w:trPr>
         <w:tc>
@@ -11171,7 +11171,7 @@
       </w:tr>
       <w:tr>
         <w:trPr>
-          <w:divId w:val="1328363218"/>
+          <w:divId w:val="1033771953"/>
         </w:trPr>
         <w:tc>
           <w:tcPr>
@@ -11298,7 +11298,7 @@
                 <w:sz w:val="20"/>
                 <w:szCs w:val="20"/>
               </w:rPr>
-              <w:t>695</w:t>
+              <w:t>911</w:t>
             </w:r>
           </w:p>
         </w:tc>
@@ -11329,7 +11329,7 @@
                 <w:sz w:val="20"/>
                 <w:szCs w:val="20"/>
               </w:rPr>
-              <w:t>3,633</w:t>
+              <w:t>3,849</w:t>
             </w:r>
           </w:p>
         </w:tc>
@@ -11360,14 +11360,14 @@
                 <w:sz w:val="20"/>
                 <w:szCs w:val="20"/>
               </w:rPr>
-              <w:t>87.1%</w:t>
+              <w:t>86.7%</w:t>
             </w:r>
           </w:p>
         </w:tc>
       </w:tr>
       <w:tr>
         <w:trPr>
-          <w:divId w:val="1328363218"/>
+          <w:divId w:val="1033771953"/>
         </w:trPr>
         <w:tc>
           <w:tcPr>
@@ -11485,74 +11485,74 @@
                 <w:sz w:val="20"/>
                 <w:szCs w:val="20"/>
               </w:rPr>
-              <w:t>123</w:t>
-            </w:r>
-          </w:p>
-        </w:tc>
-        <w:tc>
-          <w:tcPr>
-            <w:tcW w:w="0" w:type="auto"/>
-            <w:tcMar>
-              <w:top w:w="150" w:type="dxa"/>
-              <w:left w:w="210" w:type="dxa"/>
-              <w:bottom w:w="150" w:type="dxa"/>
-              <w:right w:w="210" w:type="dxa"/>
-            </w:tcMar>
-            <w:vAlign w:val="center"/>
-            <w:hideMark/>
-          </w:tcPr>
-          <w:p>
-            <w:pPr>
-              <w:rPr>
-                <w:rFonts w:ascii="Plus Jakarta Sans" w:eastAsia="Times New Roman" w:hAnsi="Plus Jakarta Sans"/>
-                <w:sz w:val="20"/>
-                <w:szCs w:val="20"/>
-              </w:rPr>
-            </w:pPr>
-            <w:r>
-              <w:rPr>
-                <w:rFonts w:ascii="Plus Jakarta Sans" w:eastAsia="Times New Roman" w:hAnsi="Plus Jakarta Sans"/>
-                <w:sz w:val="20"/>
-                <w:szCs w:val="20"/>
-              </w:rPr>
-              <w:t>518</w:t>
-            </w:r>
-          </w:p>
-        </w:tc>
-        <w:tc>
-          <w:tcPr>
-            <w:tcW w:w="0" w:type="auto"/>
-            <w:tcMar>
-              <w:top w:w="150" w:type="dxa"/>
-              <w:left w:w="210" w:type="dxa"/>
-              <w:bottom w:w="150" w:type="dxa"/>
-              <w:right w:w="210" w:type="dxa"/>
-            </w:tcMar>
-            <w:vAlign w:val="center"/>
-            <w:hideMark/>
-          </w:tcPr>
-          <w:p>
-            <w:pPr>
-              <w:rPr>
-                <w:rFonts w:ascii="Plus Jakarta Sans" w:eastAsia="Times New Roman" w:hAnsi="Plus Jakarta Sans"/>
-                <w:sz w:val="20"/>
-                <w:szCs w:val="20"/>
-              </w:rPr>
-            </w:pPr>
-            <w:r>
-              <w:rPr>
-                <w:rFonts w:ascii="Plus Jakarta Sans" w:eastAsia="Times New Roman" w:hAnsi="Plus Jakarta Sans"/>
-                <w:sz w:val="20"/>
-                <w:szCs w:val="20"/>
-              </w:rPr>
-              <w:t>12.4%</w:t>
+              <w:t>174</w:t>
+            </w:r>
+          </w:p>
+        </w:tc>
+        <w:tc>
+          <w:tcPr>
+            <w:tcW w:w="0" w:type="auto"/>
+            <w:tcMar>
+              <w:top w:w="150" w:type="dxa"/>
+              <w:left w:w="210" w:type="dxa"/>
+              <w:bottom w:w="150" w:type="dxa"/>
+              <w:right w:w="210" w:type="dxa"/>
+            </w:tcMar>
+            <w:vAlign w:val="center"/>
+            <w:hideMark/>
+          </w:tcPr>
+          <w:p>
+            <w:pPr>
+              <w:rPr>
+                <w:rFonts w:ascii="Plus Jakarta Sans" w:eastAsia="Times New Roman" w:hAnsi="Plus Jakarta Sans"/>
+                <w:sz w:val="20"/>
+                <w:szCs w:val="20"/>
+              </w:rPr>
+            </w:pPr>
+            <w:r>
+              <w:rPr>
+                <w:rFonts w:ascii="Plus Jakarta Sans" w:eastAsia="Times New Roman" w:hAnsi="Plus Jakarta Sans"/>
+                <w:sz w:val="20"/>
+                <w:szCs w:val="20"/>
+              </w:rPr>
+              <w:t>569</w:t>
+            </w:r>
+          </w:p>
+        </w:tc>
+        <w:tc>
+          <w:tcPr>
+            <w:tcW w:w="0" w:type="auto"/>
+            <w:tcMar>
+              <w:top w:w="150" w:type="dxa"/>
+              <w:left w:w="210" w:type="dxa"/>
+              <w:bottom w:w="150" w:type="dxa"/>
+              <w:right w:w="210" w:type="dxa"/>
+            </w:tcMar>
+            <w:vAlign w:val="center"/>
+            <w:hideMark/>
+          </w:tcPr>
+          <w:p>
+            <w:pPr>
+              <w:rPr>
+                <w:rFonts w:ascii="Plus Jakarta Sans" w:eastAsia="Times New Roman" w:hAnsi="Plus Jakarta Sans"/>
+                <w:sz w:val="20"/>
+                <w:szCs w:val="20"/>
+              </w:rPr>
+            </w:pPr>
+            <w:r>
+              <w:rPr>
+                <w:rFonts w:ascii="Plus Jakarta Sans" w:eastAsia="Times New Roman" w:hAnsi="Plus Jakarta Sans"/>
+                <w:sz w:val="20"/>
+                <w:szCs w:val="20"/>
+              </w:rPr>
+              <w:t>12.8%</w:t>
             </w:r>
           </w:p>
         </w:tc>
       </w:tr>
       <w:tr>
         <w:trPr>
-          <w:divId w:val="1328363218"/>
+          <w:divId w:val="1033771953"/>
         </w:trPr>
         <w:tc>
           <w:tcPr>
@@ -11679,7 +11679,7 @@
                 <w:sz w:val="20"/>
                 <w:szCs w:val="20"/>
               </w:rPr>
-              <w:t>820</w:t>
+              <w:t>1,087</w:t>
             </w:r>
           </w:p>
         </w:tc>
@@ -11710,7 +11710,7 @@
                 <w:sz w:val="20"/>
                 <w:szCs w:val="20"/>
               </w:rPr>
-              <w:t>4,154</w:t>
+              <w:t>4,421</w:t>
             </w:r>
           </w:p>
         </w:tc>
@@ -11741,7 +11741,7 @@
                 <w:sz w:val="20"/>
                 <w:szCs w:val="20"/>
               </w:rPr>
-              <w:t>99.5%</w:t>
+              <w:t>99.6%</w:t>
             </w:r>
           </w:p>
         </w:tc>
@@ -11750,7 +11750,7 @@
     <w:p>
       <w:pPr>
         <w:pStyle w:val="Ttulo4"/>
-        <w:divId w:val="774710797"/>
+        <w:divId w:val="1751079550"/>
         <w:rPr>
           <w:rFonts w:eastAsia="Times New Roman"/>
           <w:lang w:val="es-ES"/>
@@ -11768,7 +11768,7 @@
       <w:pPr>
         <w:spacing w:before="375" w:after="225"/>
         <w:jc w:val="center"/>
-        <w:divId w:val="469055906"/>
+        <w:divId w:val="1397820431"/>
         <w:rPr>
           <w:rFonts w:ascii="Outfit" w:eastAsia="Times New Roman" w:hAnsi="Outfit"/>
           <w:b/>
@@ -11798,7 +11798,7 @@
       <w:pPr>
         <w:spacing w:after="375"/>
         <w:jc w:val="center"/>
-        <w:divId w:val="452093882"/>
+        <w:divId w:val="801849471"/>
         <w:rPr>
           <w:rFonts w:ascii="Plus Jakarta Sans" w:eastAsia="Times New Roman" w:hAnsi="Plus Jakarta Sans"/>
           <w:lang w:val="es-ES"/>
@@ -11830,14 +11830,14 @@
           <w:rFonts w:ascii="Plus Jakarta Sans" w:eastAsia="Times New Roman" w:hAnsi="Plus Jakarta Sans"/>
           <w:lang w:val="es-ES"/>
         </w:rPr>
-        <w:t>Porcentaje de regantes que conocen la i</w:t>
-      </w:r>
-      <w:r>
-        <w:rPr>
-          <w:rFonts w:ascii="Plus Jakarta Sans" w:eastAsia="Times New Roman" w:hAnsi="Plus Jakarta Sans"/>
-          <w:lang w:val="es-ES"/>
-        </w:rPr>
-        <w:t>niciativa y a la directiv</w:t>
+        <w:t>Porcentaje de regantes que conocen la</w:t>
+      </w:r>
+      <w:r>
+        <w:rPr>
+          <w:rFonts w:ascii="Plus Jakarta Sans" w:eastAsia="Times New Roman" w:hAnsi="Plus Jakarta Sans"/>
+          <w:lang w:val="es-ES"/>
+        </w:rPr>
+        <w:t xml:space="preserve"> iniciativa y a la directiv</w:t>
       </w:r>
       <w:r>
         <w:rPr>
@@ -12110,7 +12110,7 @@
           <w:rFonts w:ascii="Plus Jakarta Sans" w:eastAsia="Times New Roman" w:hAnsi="Plus Jakarta Sans"/>
           <w:lang w:val="es-ES"/>
         </w:rPr>
-        <w:t>84</w:t>
+        <w:t>83</w:t>
       </w:r>
       <w:r>
         <w:rPr>
@@ -12193,7 +12193,7 @@
     <w:p>
       <w:pPr>
         <w:pStyle w:val="Ttulo3"/>
-        <w:divId w:val="774710797"/>
+        <w:divId w:val="1751079550"/>
         <w:rPr>
           <w:rFonts w:eastAsia="Times New Roman"/>
           <w:lang w:val="es-ES"/>
@@ -12225,7 +12225,7 @@
       </w:tblGrid>
       <w:tr>
         <w:trPr>
-          <w:divId w:val="916524853"/>
+          <w:divId w:val="645624549"/>
           <w:tblHeader/>
         </w:trPr>
         <w:tc>
@@ -12342,7 +12342,7 @@
       </w:tr>
       <w:tr>
         <w:trPr>
-          <w:divId w:val="916524853"/>
+          <w:divId w:val="645624549"/>
         </w:trPr>
         <w:tc>
           <w:tcPr>
@@ -12438,7 +12438,7 @@
       </w:tr>
       <w:tr>
         <w:trPr>
-          <w:divId w:val="916524853"/>
+          <w:divId w:val="645624549"/>
         </w:trPr>
         <w:tc>
           <w:tcPr>
@@ -12534,7 +12534,7 @@
       </w:tr>
       <w:tr>
         <w:trPr>
-          <w:divId w:val="916524853"/>
+          <w:divId w:val="645624549"/>
         </w:trPr>
         <w:tc>
           <w:tcPr>
@@ -12593,37 +12593,37 @@
                 <w:sz w:val="20"/>
                 <w:szCs w:val="20"/>
               </w:rPr>
-              <w:t>58.9 km</w:t>
-            </w:r>
-          </w:p>
-        </w:tc>
-        <w:tc>
-          <w:tcPr>
-            <w:tcW w:w="0" w:type="auto"/>
-            <w:tcMar>
-              <w:top w:w="150" w:type="dxa"/>
-              <w:left w:w="210" w:type="dxa"/>
-              <w:bottom w:w="150" w:type="dxa"/>
-              <w:right w:w="210" w:type="dxa"/>
-            </w:tcMar>
-            <w:vAlign w:val="center"/>
-            <w:hideMark/>
-          </w:tcPr>
-          <w:p>
-            <w:pPr>
-              <w:rPr>
-                <w:rFonts w:ascii="Plus Jakarta Sans" w:eastAsia="Times New Roman" w:hAnsi="Plus Jakarta Sans"/>
-                <w:sz w:val="20"/>
-                <w:szCs w:val="20"/>
-              </w:rPr>
-            </w:pPr>
-            <w:r>
-              <w:rPr>
-                <w:rFonts w:ascii="Plus Jakarta Sans" w:eastAsia="Times New Roman" w:hAnsi="Plus Jakarta Sans"/>
-                <w:sz w:val="20"/>
-                <w:szCs w:val="20"/>
-              </w:rPr>
-              <w:t>817</w:t>
+              <w:t>57.6 km</w:t>
+            </w:r>
+          </w:p>
+        </w:tc>
+        <w:tc>
+          <w:tcPr>
+            <w:tcW w:w="0" w:type="auto"/>
+            <w:tcMar>
+              <w:top w:w="150" w:type="dxa"/>
+              <w:left w:w="210" w:type="dxa"/>
+              <w:bottom w:w="150" w:type="dxa"/>
+              <w:right w:w="210" w:type="dxa"/>
+            </w:tcMar>
+            <w:vAlign w:val="center"/>
+            <w:hideMark/>
+          </w:tcPr>
+          <w:p>
+            <w:pPr>
+              <w:rPr>
+                <w:rFonts w:ascii="Plus Jakarta Sans" w:eastAsia="Times New Roman" w:hAnsi="Plus Jakarta Sans"/>
+                <w:sz w:val="20"/>
+                <w:szCs w:val="20"/>
+              </w:rPr>
+            </w:pPr>
+            <w:r>
+              <w:rPr>
+                <w:rFonts w:ascii="Plus Jakarta Sans" w:eastAsia="Times New Roman" w:hAnsi="Plus Jakarta Sans"/>
+                <w:sz w:val="20"/>
+                <w:szCs w:val="20"/>
+              </w:rPr>
+              <w:t>1,084</w:t>
             </w:r>
           </w:p>
         </w:tc>
@@ -12632,7 +12632,7 @@
     <w:p>
       <w:pPr>
         <w:pStyle w:val="NormalWeb"/>
-        <w:divId w:val="774710797"/>
+        <w:divId w:val="1751079550"/>
         <w:rPr>
           <w:rFonts w:ascii="Plus Jakarta Sans" w:hAnsi="Plus Jakarta Sans"/>
           <w:lang w:val="es-ES"/>
@@ -12657,7 +12657,7 @@
     <w:p>
       <w:pPr>
         <w:pStyle w:val="Ttulo3"/>
-        <w:divId w:val="774710797"/>
+        <w:divId w:val="1751079550"/>
         <w:rPr>
           <w:rFonts w:eastAsia="Times New Roman"/>
           <w:lang w:val="es-ES"/>
@@ -12668,14 +12668,14 @@
           <w:rFonts w:eastAsia="Times New Roman"/>
           <w:lang w:val="es-ES"/>
         </w:rPr>
-        <w:t>E. Población y Familia</w:t>
+        <w:t>E. Población y Famil</w:t>
       </w:r>
       <w:r>
         <w:rPr>
           <w:rFonts w:eastAsia="Times New Roman"/>
           <w:lang w:val="es-ES"/>
         </w:rPr>
-        <w:t>s Beneficiarias</w:t>
+        <w:t>ias Beneficiarias</w:t>
       </w:r>
     </w:p>
     <w:tbl>
@@ -12699,7 +12699,7 @@
       </w:tblGrid>
       <w:tr>
         <w:trPr>
-          <w:divId w:val="93215313"/>
+          <w:divId w:val="490365150"/>
           <w:tblHeader/>
         </w:trPr>
         <w:tc>
@@ -12927,7 +12927,7 @@
       </w:tr>
       <w:tr>
         <w:trPr>
-          <w:divId w:val="93215313"/>
+          <w:divId w:val="490365150"/>
         </w:trPr>
         <w:tc>
           <w:tcPr>
@@ -13113,7 +13113,7 @@
       </w:tr>
       <w:tr>
         <w:trPr>
-          <w:divId w:val="93215313"/>
+          <w:divId w:val="490365150"/>
         </w:trPr>
         <w:tc>
           <w:tcPr>
@@ -13299,7 +13299,7 @@
       </w:tr>
       <w:tr>
         <w:trPr>
-          <w:divId w:val="93215313"/>
+          <w:divId w:val="490365150"/>
         </w:trPr>
         <w:tc>
           <w:tcPr>
@@ -13358,134 +13358,134 @@
                 <w:sz w:val="20"/>
                 <w:szCs w:val="20"/>
               </w:rPr>
-              <w:t>820</w:t>
-            </w:r>
-          </w:p>
-        </w:tc>
-        <w:tc>
-          <w:tcPr>
-            <w:tcW w:w="0" w:type="auto"/>
-            <w:tcMar>
-              <w:top w:w="150" w:type="dxa"/>
-              <w:left w:w="210" w:type="dxa"/>
-              <w:bottom w:w="150" w:type="dxa"/>
-              <w:right w:w="210" w:type="dxa"/>
-            </w:tcMar>
-            <w:vAlign w:val="center"/>
-            <w:hideMark/>
-          </w:tcPr>
-          <w:p>
-            <w:pPr>
-              <w:rPr>
-                <w:rFonts w:ascii="Plus Jakarta Sans" w:eastAsia="Times New Roman" w:hAnsi="Plus Jakarta Sans"/>
-                <w:sz w:val="20"/>
-                <w:szCs w:val="20"/>
-              </w:rPr>
-            </w:pPr>
-            <w:r>
-              <w:rPr>
-                <w:rFonts w:ascii="Plus Jakarta Sans" w:eastAsia="Times New Roman" w:hAnsi="Plus Jakarta Sans"/>
-                <w:sz w:val="20"/>
-                <w:szCs w:val="20"/>
-              </w:rPr>
-              <w:t>1,435</w:t>
-            </w:r>
-          </w:p>
-        </w:tc>
-        <w:tc>
-          <w:tcPr>
-            <w:tcW w:w="0" w:type="auto"/>
-            <w:tcMar>
-              <w:top w:w="150" w:type="dxa"/>
-              <w:left w:w="210" w:type="dxa"/>
-              <w:bottom w:w="150" w:type="dxa"/>
-              <w:right w:w="210" w:type="dxa"/>
-            </w:tcMar>
-            <w:vAlign w:val="center"/>
-            <w:hideMark/>
-          </w:tcPr>
-          <w:p>
-            <w:pPr>
-              <w:rPr>
-                <w:rFonts w:ascii="Plus Jakarta Sans" w:eastAsia="Times New Roman" w:hAnsi="Plus Jakarta Sans"/>
-                <w:sz w:val="20"/>
-                <w:szCs w:val="20"/>
-              </w:rPr>
-            </w:pPr>
-            <w:r>
-              <w:rPr>
-                <w:rFonts w:ascii="Plus Jakarta Sans" w:eastAsia="Times New Roman" w:hAnsi="Plus Jakarta Sans"/>
-                <w:sz w:val="20"/>
-                <w:szCs w:val="20"/>
-              </w:rPr>
-              <w:t>1,277</w:t>
-            </w:r>
-          </w:p>
-        </w:tc>
-        <w:tc>
-          <w:tcPr>
-            <w:tcW w:w="0" w:type="auto"/>
-            <w:tcMar>
-              <w:top w:w="150" w:type="dxa"/>
-              <w:left w:w="210" w:type="dxa"/>
-              <w:bottom w:w="150" w:type="dxa"/>
-              <w:right w:w="210" w:type="dxa"/>
-            </w:tcMar>
-            <w:vAlign w:val="center"/>
-            <w:hideMark/>
-          </w:tcPr>
-          <w:p>
-            <w:pPr>
-              <w:rPr>
-                <w:rFonts w:ascii="Plus Jakarta Sans" w:eastAsia="Times New Roman" w:hAnsi="Plus Jakarta Sans"/>
-                <w:sz w:val="20"/>
-                <w:szCs w:val="20"/>
-              </w:rPr>
-            </w:pPr>
-            <w:r>
-              <w:rPr>
-                <w:rFonts w:ascii="Plus Jakarta Sans" w:eastAsia="Times New Roman" w:hAnsi="Plus Jakarta Sans"/>
-                <w:sz w:val="20"/>
-                <w:szCs w:val="20"/>
-              </w:rPr>
-              <w:t>2,712</w:t>
-            </w:r>
-          </w:p>
-        </w:tc>
-        <w:tc>
-          <w:tcPr>
-            <w:tcW w:w="0" w:type="auto"/>
-            <w:tcMar>
-              <w:top w:w="150" w:type="dxa"/>
-              <w:left w:w="210" w:type="dxa"/>
-              <w:bottom w:w="150" w:type="dxa"/>
-              <w:right w:w="210" w:type="dxa"/>
-            </w:tcMar>
-            <w:vAlign w:val="center"/>
-            <w:hideMark/>
-          </w:tcPr>
-          <w:p>
-            <w:pPr>
-              <w:rPr>
-                <w:rFonts w:ascii="Plus Jakarta Sans" w:eastAsia="Times New Roman" w:hAnsi="Plus Jakarta Sans"/>
-                <w:sz w:val="20"/>
-                <w:szCs w:val="20"/>
-              </w:rPr>
-            </w:pPr>
-            <w:r>
-              <w:rPr>
-                <w:rFonts w:ascii="Plus Jakarta Sans" w:eastAsia="Times New Roman" w:hAnsi="Plus Jakarta Sans"/>
-                <w:sz w:val="20"/>
-                <w:szCs w:val="20"/>
-              </w:rPr>
-              <w:t>3.3</w:t>
+              <w:t>1,087</w:t>
+            </w:r>
+          </w:p>
+        </w:tc>
+        <w:tc>
+          <w:tcPr>
+            <w:tcW w:w="0" w:type="auto"/>
+            <w:tcMar>
+              <w:top w:w="150" w:type="dxa"/>
+              <w:left w:w="210" w:type="dxa"/>
+              <w:bottom w:w="150" w:type="dxa"/>
+              <w:right w:w="210" w:type="dxa"/>
+            </w:tcMar>
+            <w:vAlign w:val="center"/>
+            <w:hideMark/>
+          </w:tcPr>
+          <w:p>
+            <w:pPr>
+              <w:rPr>
+                <w:rFonts w:ascii="Plus Jakarta Sans" w:eastAsia="Times New Roman" w:hAnsi="Plus Jakarta Sans"/>
+                <w:sz w:val="20"/>
+                <w:szCs w:val="20"/>
+              </w:rPr>
+            </w:pPr>
+            <w:r>
+              <w:rPr>
+                <w:rFonts w:ascii="Plus Jakarta Sans" w:eastAsia="Times New Roman" w:hAnsi="Plus Jakarta Sans"/>
+                <w:sz w:val="20"/>
+                <w:szCs w:val="20"/>
+              </w:rPr>
+              <w:t>1,979</w:t>
+            </w:r>
+          </w:p>
+        </w:tc>
+        <w:tc>
+          <w:tcPr>
+            <w:tcW w:w="0" w:type="auto"/>
+            <w:tcMar>
+              <w:top w:w="150" w:type="dxa"/>
+              <w:left w:w="210" w:type="dxa"/>
+              <w:bottom w:w="150" w:type="dxa"/>
+              <w:right w:w="210" w:type="dxa"/>
+            </w:tcMar>
+            <w:vAlign w:val="center"/>
+            <w:hideMark/>
+          </w:tcPr>
+          <w:p>
+            <w:pPr>
+              <w:rPr>
+                <w:rFonts w:ascii="Plus Jakarta Sans" w:eastAsia="Times New Roman" w:hAnsi="Plus Jakarta Sans"/>
+                <w:sz w:val="20"/>
+                <w:szCs w:val="20"/>
+              </w:rPr>
+            </w:pPr>
+            <w:r>
+              <w:rPr>
+                <w:rFonts w:ascii="Plus Jakarta Sans" w:eastAsia="Times New Roman" w:hAnsi="Plus Jakarta Sans"/>
+                <w:sz w:val="20"/>
+                <w:szCs w:val="20"/>
+              </w:rPr>
+              <w:t>1,793</w:t>
+            </w:r>
+          </w:p>
+        </w:tc>
+        <w:tc>
+          <w:tcPr>
+            <w:tcW w:w="0" w:type="auto"/>
+            <w:tcMar>
+              <w:top w:w="150" w:type="dxa"/>
+              <w:left w:w="210" w:type="dxa"/>
+              <w:bottom w:w="150" w:type="dxa"/>
+              <w:right w:w="210" w:type="dxa"/>
+            </w:tcMar>
+            <w:vAlign w:val="center"/>
+            <w:hideMark/>
+          </w:tcPr>
+          <w:p>
+            <w:pPr>
+              <w:rPr>
+                <w:rFonts w:ascii="Plus Jakarta Sans" w:eastAsia="Times New Roman" w:hAnsi="Plus Jakarta Sans"/>
+                <w:sz w:val="20"/>
+                <w:szCs w:val="20"/>
+              </w:rPr>
+            </w:pPr>
+            <w:r>
+              <w:rPr>
+                <w:rFonts w:ascii="Plus Jakarta Sans" w:eastAsia="Times New Roman" w:hAnsi="Plus Jakarta Sans"/>
+                <w:sz w:val="20"/>
+                <w:szCs w:val="20"/>
+              </w:rPr>
+              <w:t>3,772</w:t>
+            </w:r>
+          </w:p>
+        </w:tc>
+        <w:tc>
+          <w:tcPr>
+            <w:tcW w:w="0" w:type="auto"/>
+            <w:tcMar>
+              <w:top w:w="150" w:type="dxa"/>
+              <w:left w:w="210" w:type="dxa"/>
+              <w:bottom w:w="150" w:type="dxa"/>
+              <w:right w:w="210" w:type="dxa"/>
+            </w:tcMar>
+            <w:vAlign w:val="center"/>
+            <w:hideMark/>
+          </w:tcPr>
+          <w:p>
+            <w:pPr>
+              <w:rPr>
+                <w:rFonts w:ascii="Plus Jakarta Sans" w:eastAsia="Times New Roman" w:hAnsi="Plus Jakarta Sans"/>
+                <w:sz w:val="20"/>
+                <w:szCs w:val="20"/>
+              </w:rPr>
+            </w:pPr>
+            <w:r>
+              <w:rPr>
+                <w:rFonts w:ascii="Plus Jakarta Sans" w:eastAsia="Times New Roman" w:hAnsi="Plus Jakarta Sans"/>
+                <w:sz w:val="20"/>
+                <w:szCs w:val="20"/>
+              </w:rPr>
+              <w:t>3.5</w:t>
             </w:r>
           </w:p>
         </w:tc>
       </w:tr>
       <w:tr>
         <w:trPr>
-          <w:divId w:val="93215313"/>
+          <w:divId w:val="490365150"/>
         </w:trPr>
         <w:tc>
           <w:tcPr>
@@ -13545,7 +13545,7 @@
                 <w:sz w:val="20"/>
                 <w:szCs w:val="20"/>
               </w:rPr>
-              <w:t>4,173</w:t>
+              <w:t>4,440</w:t>
             </w:r>
           </w:p>
         </w:tc>
@@ -13576,7 +13576,7 @@
                 <w:sz w:val="20"/>
                 <w:szCs w:val="20"/>
               </w:rPr>
-              <w:t>6,096</w:t>
+              <w:t>6,640</w:t>
             </w:r>
           </w:p>
         </w:tc>
@@ -13607,7 +13607,7 @@
                 <w:sz w:val="20"/>
                 <w:szCs w:val="20"/>
               </w:rPr>
-              <w:t>5,833</w:t>
+              <w:t>6,349</w:t>
             </w:r>
           </w:p>
         </w:tc>
@@ -13638,7 +13638,7 @@
                 <w:sz w:val="20"/>
                 <w:szCs w:val="20"/>
               </w:rPr>
-              <w:t>11,929</w:t>
+              <w:t>12,989</w:t>
             </w:r>
           </w:p>
         </w:tc>
@@ -13678,7 +13678,7 @@
     <w:p>
       <w:pPr>
         <w:pStyle w:val="NormalWeb"/>
-        <w:divId w:val="774710797"/>
+        <w:divId w:val="1751079550"/>
         <w:rPr>
           <w:rFonts w:ascii="Plus Jakarta Sans" w:hAnsi="Plus Jakarta Sans"/>
           <w:lang w:val="es-ES"/>
@@ -13704,7 +13704,7 @@
           <w:rFonts w:ascii="Plus Jakarta Sans" w:hAnsi="Plus Jakarta Sans"/>
           <w:lang w:val="es-ES"/>
         </w:rPr>
-        <w:t xml:space="preserve"> 4,173 titulares + 11,929 hijos = </w:t>
+        <w:t xml:space="preserve"> 4,440 titulares + 12,989 hijos = </w:t>
       </w:r>
       <w:r>
         <w:rPr>
@@ -13712,7 +13712,7 @@
           <w:rFonts w:ascii="Plus Jakarta Sans" w:hAnsi="Plus Jakarta Sans"/>
           <w:lang w:val="es-ES"/>
         </w:rPr>
-        <w:t>~16,102 personas</w:t>
+        <w:t>~17,429 personas</w:t>
       </w:r>
       <w:r>
         <w:rPr>
@@ -13725,7 +13725,7 @@
     <w:p>
       <w:pPr>
         <w:pStyle w:val="Ttulo3"/>
-        <w:divId w:val="774710797"/>
+        <w:divId w:val="1751079550"/>
         <w:rPr>
           <w:rFonts w:eastAsia="Times New Roman"/>
           <w:lang w:val="es-ES"/>
@@ -13760,7 +13760,7 @@
       </w:tblGrid>
       <w:tr>
         <w:trPr>
-          <w:divId w:val="961375496"/>
+          <w:divId w:val="392771969"/>
           <w:tblHeader/>
         </w:trPr>
         <w:tc>
@@ -13988,7 +13988,7 @@
       </w:tr>
       <w:tr>
         <w:trPr>
-          <w:divId w:val="961375496"/>
+          <w:divId w:val="392771969"/>
         </w:trPr>
         <w:tc>
           <w:tcPr>
@@ -14115,37 +14115,37 @@
                 <w:sz w:val="20"/>
                 <w:szCs w:val="20"/>
               </w:rPr>
-              <w:t>601</w:t>
-            </w:r>
-          </w:p>
-        </w:tc>
-        <w:tc>
-          <w:tcPr>
-            <w:tcW w:w="0" w:type="auto"/>
-            <w:tcMar>
-              <w:top w:w="150" w:type="dxa"/>
-              <w:left w:w="210" w:type="dxa"/>
-              <w:bottom w:w="150" w:type="dxa"/>
-              <w:right w:w="210" w:type="dxa"/>
-            </w:tcMar>
-            <w:vAlign w:val="center"/>
-            <w:hideMark/>
-          </w:tcPr>
-          <w:p>
-            <w:pPr>
-              <w:rPr>
-                <w:rFonts w:ascii="Plus Jakarta Sans" w:eastAsia="Times New Roman" w:hAnsi="Plus Jakarta Sans"/>
-                <w:sz w:val="20"/>
-                <w:szCs w:val="20"/>
-              </w:rPr>
-            </w:pPr>
-            <w:r>
-              <w:rPr>
-                <w:rFonts w:ascii="Plus Jakarta Sans" w:eastAsia="Times New Roman" w:hAnsi="Plus Jakarta Sans"/>
-                <w:sz w:val="20"/>
-                <w:szCs w:val="20"/>
-              </w:rPr>
-              <w:t>2,674</w:t>
+              <w:t>792</w:t>
+            </w:r>
+          </w:p>
+        </w:tc>
+        <w:tc>
+          <w:tcPr>
+            <w:tcW w:w="0" w:type="auto"/>
+            <w:tcMar>
+              <w:top w:w="150" w:type="dxa"/>
+              <w:left w:w="210" w:type="dxa"/>
+              <w:bottom w:w="150" w:type="dxa"/>
+              <w:right w:w="210" w:type="dxa"/>
+            </w:tcMar>
+            <w:vAlign w:val="center"/>
+            <w:hideMark/>
+          </w:tcPr>
+          <w:p>
+            <w:pPr>
+              <w:rPr>
+                <w:rFonts w:ascii="Plus Jakarta Sans" w:eastAsia="Times New Roman" w:hAnsi="Plus Jakarta Sans"/>
+                <w:sz w:val="20"/>
+                <w:szCs w:val="20"/>
+              </w:rPr>
+            </w:pPr>
+            <w:r>
+              <w:rPr>
+                <w:rFonts w:ascii="Plus Jakarta Sans" w:eastAsia="Times New Roman" w:hAnsi="Plus Jakarta Sans"/>
+                <w:sz w:val="20"/>
+                <w:szCs w:val="20"/>
+              </w:rPr>
+              <w:t>2,865</w:t>
             </w:r>
           </w:p>
         </w:tc>
@@ -14182,7 +14182,7 @@
       </w:tr>
       <w:tr>
         <w:trPr>
-          <w:divId w:val="961375496"/>
+          <w:divId w:val="392771969"/>
         </w:trPr>
         <w:tc>
           <w:tcPr>
@@ -14309,67 +14309,67 @@
                 <w:sz w:val="20"/>
                 <w:szCs w:val="20"/>
               </w:rPr>
-              <w:t>595</w:t>
-            </w:r>
-          </w:p>
-        </w:tc>
-        <w:tc>
-          <w:tcPr>
-            <w:tcW w:w="0" w:type="auto"/>
-            <w:tcMar>
-              <w:top w:w="150" w:type="dxa"/>
-              <w:left w:w="210" w:type="dxa"/>
-              <w:bottom w:w="150" w:type="dxa"/>
-              <w:right w:w="210" w:type="dxa"/>
-            </w:tcMar>
-            <w:vAlign w:val="center"/>
-            <w:hideMark/>
-          </w:tcPr>
-          <w:p>
-            <w:pPr>
-              <w:rPr>
-                <w:rFonts w:ascii="Plus Jakarta Sans" w:eastAsia="Times New Roman" w:hAnsi="Plus Jakarta Sans"/>
-                <w:sz w:val="20"/>
-                <w:szCs w:val="20"/>
-              </w:rPr>
-            </w:pPr>
-            <w:r>
-              <w:rPr>
-                <w:rFonts w:ascii="Plus Jakarta Sans" w:eastAsia="Times New Roman" w:hAnsi="Plus Jakarta Sans"/>
-                <w:sz w:val="20"/>
-                <w:szCs w:val="20"/>
-              </w:rPr>
-              <w:t>2,497</w:t>
-            </w:r>
-          </w:p>
-        </w:tc>
-        <w:tc>
-          <w:tcPr>
-            <w:tcW w:w="0" w:type="auto"/>
-            <w:tcMar>
-              <w:top w:w="150" w:type="dxa"/>
-              <w:left w:w="210" w:type="dxa"/>
-              <w:bottom w:w="150" w:type="dxa"/>
-              <w:right w:w="210" w:type="dxa"/>
-            </w:tcMar>
-            <w:vAlign w:val="center"/>
-            <w:hideMark/>
-          </w:tcPr>
-          <w:p>
-            <w:pPr>
-              <w:rPr>
-                <w:rFonts w:ascii="Plus Jakarta Sans" w:eastAsia="Times New Roman" w:hAnsi="Plus Jakarta Sans"/>
-                <w:sz w:val="20"/>
-                <w:szCs w:val="20"/>
-              </w:rPr>
-            </w:pPr>
-            <w:r>
-              <w:rPr>
-                <w:rFonts w:ascii="Plus Jakarta Sans" w:eastAsia="Times New Roman" w:hAnsi="Plus Jakarta Sans"/>
-                <w:sz w:val="20"/>
-                <w:szCs w:val="20"/>
-              </w:rPr>
-              <w:t>95.5%</w:t>
+              <w:t>776</w:t>
+            </w:r>
+          </w:p>
+        </w:tc>
+        <w:tc>
+          <w:tcPr>
+            <w:tcW w:w="0" w:type="auto"/>
+            <w:tcMar>
+              <w:top w:w="150" w:type="dxa"/>
+              <w:left w:w="210" w:type="dxa"/>
+              <w:bottom w:w="150" w:type="dxa"/>
+              <w:right w:w="210" w:type="dxa"/>
+            </w:tcMar>
+            <w:vAlign w:val="center"/>
+            <w:hideMark/>
+          </w:tcPr>
+          <w:p>
+            <w:pPr>
+              <w:rPr>
+                <w:rFonts w:ascii="Plus Jakarta Sans" w:eastAsia="Times New Roman" w:hAnsi="Plus Jakarta Sans"/>
+                <w:sz w:val="20"/>
+                <w:szCs w:val="20"/>
+              </w:rPr>
+            </w:pPr>
+            <w:r>
+              <w:rPr>
+                <w:rFonts w:ascii="Plus Jakarta Sans" w:eastAsia="Times New Roman" w:hAnsi="Plus Jakarta Sans"/>
+                <w:sz w:val="20"/>
+                <w:szCs w:val="20"/>
+              </w:rPr>
+              <w:t>2,678</w:t>
+            </w:r>
+          </w:p>
+        </w:tc>
+        <w:tc>
+          <w:tcPr>
+            <w:tcW w:w="0" w:type="auto"/>
+            <w:tcMar>
+              <w:top w:w="150" w:type="dxa"/>
+              <w:left w:w="210" w:type="dxa"/>
+              <w:bottom w:w="150" w:type="dxa"/>
+              <w:right w:w="210" w:type="dxa"/>
+            </w:tcMar>
+            <w:vAlign w:val="center"/>
+            <w:hideMark/>
+          </w:tcPr>
+          <w:p>
+            <w:pPr>
+              <w:rPr>
+                <w:rFonts w:ascii="Plus Jakarta Sans" w:eastAsia="Times New Roman" w:hAnsi="Plus Jakarta Sans"/>
+                <w:sz w:val="20"/>
+                <w:szCs w:val="20"/>
+              </w:rPr>
+            </w:pPr>
+            <w:r>
+              <w:rPr>
+                <w:rFonts w:ascii="Plus Jakarta Sans" w:eastAsia="Times New Roman" w:hAnsi="Plus Jakarta Sans"/>
+                <w:sz w:val="20"/>
+                <w:szCs w:val="20"/>
+              </w:rPr>
+              <w:t>95.4%</w:t>
             </w:r>
           </w:p>
         </w:tc>
@@ -14378,7 +14378,7 @@
     <w:p>
       <w:pPr>
         <w:pStyle w:val="Ttulo4"/>
-        <w:divId w:val="774710797"/>
+        <w:divId w:val="1751079550"/>
         <w:rPr>
           <w:rFonts w:eastAsia="Times New Roman"/>
           <w:lang w:val="es-ES"/>
@@ -14396,7 +14396,7 @@
       <w:pPr>
         <w:spacing w:before="375" w:after="225"/>
         <w:jc w:val="center"/>
-        <w:divId w:val="1826622228"/>
+        <w:divId w:val="753475592"/>
         <w:rPr>
           <w:rFonts w:ascii="Outfit" w:eastAsia="Times New Roman" w:hAnsi="Outfit"/>
           <w:b/>
@@ -14426,7 +14426,7 @@
       <w:pPr>
         <w:spacing w:after="375"/>
         <w:jc w:val="center"/>
-        <w:divId w:val="454324766"/>
+        <w:divId w:val="1932002314"/>
         <w:rPr>
           <w:rFonts w:ascii="Plus Jakarta Sans" w:eastAsia="Times New Roman" w:hAnsi="Plus Jakarta Sans"/>
           <w:lang w:val="es-ES"/>
@@ -14814,7 +14814,7 @@
     <w:p>
       <w:pPr>
         <w:pStyle w:val="Ttulo3"/>
-        <w:divId w:val="774710797"/>
+        <w:divId w:val="1751079550"/>
         <w:rPr>
           <w:rFonts w:eastAsia="Times New Roman"/>
           <w:lang w:val="es-ES"/>
@@ -14848,7 +14848,7 @@
       </w:tblGrid>
       <w:tr>
         <w:trPr>
-          <w:divId w:val="1375471928"/>
+          <w:divId w:val="483085498"/>
           <w:tblHeader/>
         </w:trPr>
         <w:tc>
@@ -15039,7 +15039,7 @@
       </w:tr>
       <w:tr>
         <w:trPr>
-          <w:divId w:val="1375471928"/>
+          <w:divId w:val="483085498"/>
         </w:trPr>
         <w:tc>
           <w:tcPr>
@@ -15158,44 +15158,44 @@
                 <w:sz w:val="20"/>
                 <w:szCs w:val="20"/>
               </w:rPr>
-              <w:t>321</w:t>
-            </w:r>
-          </w:p>
-        </w:tc>
-        <w:tc>
-          <w:tcPr>
-            <w:tcW w:w="0" w:type="auto"/>
-            <w:tcMar>
-              <w:top w:w="150" w:type="dxa"/>
-              <w:left w:w="210" w:type="dxa"/>
-              <w:bottom w:w="150" w:type="dxa"/>
-              <w:right w:w="210" w:type="dxa"/>
-            </w:tcMar>
-            <w:vAlign w:val="center"/>
-            <w:hideMark/>
-          </w:tcPr>
-          <w:p>
-            <w:pPr>
-              <w:rPr>
-                <w:rFonts w:ascii="Plus Jakarta Sans" w:eastAsia="Times New Roman" w:hAnsi="Plus Jakarta Sans"/>
-                <w:sz w:val="20"/>
-                <w:szCs w:val="20"/>
-              </w:rPr>
-            </w:pPr>
-            <w:r>
-              <w:rPr>
-                <w:rFonts w:ascii="Plus Jakarta Sans" w:eastAsia="Times New Roman" w:hAnsi="Plus Jakarta Sans"/>
-                <w:sz w:val="20"/>
-                <w:szCs w:val="20"/>
-              </w:rPr>
-              <w:t>1,845</w:t>
+              <w:t>432</w:t>
+            </w:r>
+          </w:p>
+        </w:tc>
+        <w:tc>
+          <w:tcPr>
+            <w:tcW w:w="0" w:type="auto"/>
+            <w:tcMar>
+              <w:top w:w="150" w:type="dxa"/>
+              <w:left w:w="210" w:type="dxa"/>
+              <w:bottom w:w="150" w:type="dxa"/>
+              <w:right w:w="210" w:type="dxa"/>
+            </w:tcMar>
+            <w:vAlign w:val="center"/>
+            <w:hideMark/>
+          </w:tcPr>
+          <w:p>
+            <w:pPr>
+              <w:rPr>
+                <w:rFonts w:ascii="Plus Jakarta Sans" w:eastAsia="Times New Roman" w:hAnsi="Plus Jakarta Sans"/>
+                <w:sz w:val="20"/>
+                <w:szCs w:val="20"/>
+              </w:rPr>
+            </w:pPr>
+            <w:r>
+              <w:rPr>
+                <w:rFonts w:ascii="Plus Jakarta Sans" w:eastAsia="Times New Roman" w:hAnsi="Plus Jakarta Sans"/>
+                <w:sz w:val="20"/>
+                <w:szCs w:val="20"/>
+              </w:rPr>
+              <w:t>1,956</w:t>
             </w:r>
           </w:p>
         </w:tc>
       </w:tr>
       <w:tr>
         <w:trPr>
-          <w:divId w:val="1375471928"/>
+          <w:divId w:val="483085498"/>
         </w:trPr>
         <w:tc>
           <w:tcPr>
@@ -15314,44 +15314,44 @@
                 <w:sz w:val="20"/>
                 <w:szCs w:val="20"/>
               </w:rPr>
-              <w:t>72</w:t>
-            </w:r>
-          </w:p>
-        </w:tc>
-        <w:tc>
-          <w:tcPr>
-            <w:tcW w:w="0" w:type="auto"/>
-            <w:tcMar>
-              <w:top w:w="150" w:type="dxa"/>
-              <w:left w:w="210" w:type="dxa"/>
-              <w:bottom w:w="150" w:type="dxa"/>
-              <w:right w:w="210" w:type="dxa"/>
-            </w:tcMar>
-            <w:vAlign w:val="center"/>
-            <w:hideMark/>
-          </w:tcPr>
-          <w:p>
-            <w:pPr>
-              <w:rPr>
-                <w:rFonts w:ascii="Plus Jakarta Sans" w:eastAsia="Times New Roman" w:hAnsi="Plus Jakarta Sans"/>
-                <w:sz w:val="20"/>
-                <w:szCs w:val="20"/>
-              </w:rPr>
-            </w:pPr>
-            <w:r>
-              <w:rPr>
-                <w:rFonts w:ascii="Plus Jakarta Sans" w:eastAsia="Times New Roman" w:hAnsi="Plus Jakarta Sans"/>
-                <w:sz w:val="20"/>
-                <w:szCs w:val="20"/>
-              </w:rPr>
-              <w:t>321</w:t>
+              <w:t>109</w:t>
+            </w:r>
+          </w:p>
+        </w:tc>
+        <w:tc>
+          <w:tcPr>
+            <w:tcW w:w="0" w:type="auto"/>
+            <w:tcMar>
+              <w:top w:w="150" w:type="dxa"/>
+              <w:left w:w="210" w:type="dxa"/>
+              <w:bottom w:w="150" w:type="dxa"/>
+              <w:right w:w="210" w:type="dxa"/>
+            </w:tcMar>
+            <w:vAlign w:val="center"/>
+            <w:hideMark/>
+          </w:tcPr>
+          <w:p>
+            <w:pPr>
+              <w:rPr>
+                <w:rFonts w:ascii="Plus Jakarta Sans" w:eastAsia="Times New Roman" w:hAnsi="Plus Jakarta Sans"/>
+                <w:sz w:val="20"/>
+                <w:szCs w:val="20"/>
+              </w:rPr>
+            </w:pPr>
+            <w:r>
+              <w:rPr>
+                <w:rFonts w:ascii="Plus Jakarta Sans" w:eastAsia="Times New Roman" w:hAnsi="Plus Jakarta Sans"/>
+                <w:sz w:val="20"/>
+                <w:szCs w:val="20"/>
+              </w:rPr>
+              <w:t>358</w:t>
             </w:r>
           </w:p>
         </w:tc>
       </w:tr>
       <w:tr>
         <w:trPr>
-          <w:divId w:val="1375471928"/>
+          <w:divId w:val="483085498"/>
         </w:trPr>
         <w:tc>
           <w:tcPr>
@@ -15470,44 +15470,44 @@
                 <w:sz w:val="20"/>
                 <w:szCs w:val="20"/>
               </w:rPr>
-              <w:t>142</w:t>
-            </w:r>
-          </w:p>
-        </w:tc>
-        <w:tc>
-          <w:tcPr>
-            <w:tcW w:w="0" w:type="auto"/>
-            <w:tcMar>
-              <w:top w:w="150" w:type="dxa"/>
-              <w:left w:w="210" w:type="dxa"/>
-              <w:bottom w:w="150" w:type="dxa"/>
-              <w:right w:w="210" w:type="dxa"/>
-            </w:tcMar>
-            <w:vAlign w:val="center"/>
-            <w:hideMark/>
-          </w:tcPr>
-          <w:p>
-            <w:pPr>
-              <w:rPr>
-                <w:rFonts w:ascii="Plus Jakarta Sans" w:eastAsia="Times New Roman" w:hAnsi="Plus Jakarta Sans"/>
-                <w:sz w:val="20"/>
-                <w:szCs w:val="20"/>
-              </w:rPr>
-            </w:pPr>
-            <w:r>
-              <w:rPr>
-                <w:rFonts w:ascii="Plus Jakarta Sans" w:eastAsia="Times New Roman" w:hAnsi="Plus Jakarta Sans"/>
-                <w:sz w:val="20"/>
-                <w:szCs w:val="20"/>
-              </w:rPr>
-              <w:t>241</w:t>
+              <w:t>156</w:t>
+            </w:r>
+          </w:p>
+        </w:tc>
+        <w:tc>
+          <w:tcPr>
+            <w:tcW w:w="0" w:type="auto"/>
+            <w:tcMar>
+              <w:top w:w="150" w:type="dxa"/>
+              <w:left w:w="210" w:type="dxa"/>
+              <w:bottom w:w="150" w:type="dxa"/>
+              <w:right w:w="210" w:type="dxa"/>
+            </w:tcMar>
+            <w:vAlign w:val="center"/>
+            <w:hideMark/>
+          </w:tcPr>
+          <w:p>
+            <w:pPr>
+              <w:rPr>
+                <w:rFonts w:ascii="Plus Jakarta Sans" w:eastAsia="Times New Roman" w:hAnsi="Plus Jakarta Sans"/>
+                <w:sz w:val="20"/>
+                <w:szCs w:val="20"/>
+              </w:rPr>
+            </w:pPr>
+            <w:r>
+              <w:rPr>
+                <w:rFonts w:ascii="Plus Jakarta Sans" w:eastAsia="Times New Roman" w:hAnsi="Plus Jakarta Sans"/>
+                <w:sz w:val="20"/>
+                <w:szCs w:val="20"/>
+              </w:rPr>
+              <w:t>255</w:t>
             </w:r>
           </w:p>
         </w:tc>
       </w:tr>
       <w:tr>
         <w:trPr>
-          <w:divId w:val="1375471928"/>
+          <w:divId w:val="483085498"/>
         </w:trPr>
         <w:tc>
           <w:tcPr>
@@ -15626,44 +15626,44 @@
                 <w:sz w:val="20"/>
                 <w:szCs w:val="20"/>
               </w:rPr>
-              <w:t>36</w:t>
-            </w:r>
-          </w:p>
-        </w:tc>
-        <w:tc>
-          <w:tcPr>
-            <w:tcW w:w="0" w:type="auto"/>
-            <w:tcMar>
-              <w:top w:w="150" w:type="dxa"/>
-              <w:left w:w="210" w:type="dxa"/>
-              <w:bottom w:w="150" w:type="dxa"/>
-              <w:right w:w="210" w:type="dxa"/>
-            </w:tcMar>
-            <w:vAlign w:val="center"/>
-            <w:hideMark/>
-          </w:tcPr>
-          <w:p>
-            <w:pPr>
-              <w:rPr>
-                <w:rFonts w:ascii="Plus Jakarta Sans" w:eastAsia="Times New Roman" w:hAnsi="Plus Jakarta Sans"/>
-                <w:sz w:val="20"/>
-                <w:szCs w:val="20"/>
-              </w:rPr>
-            </w:pPr>
-            <w:r>
-              <w:rPr>
-                <w:rFonts w:ascii="Plus Jakarta Sans" w:eastAsia="Times New Roman" w:hAnsi="Plus Jakarta Sans"/>
-                <w:sz w:val="20"/>
-                <w:szCs w:val="20"/>
-              </w:rPr>
-              <w:t>117</w:t>
+              <w:t>42</w:t>
+            </w:r>
+          </w:p>
+        </w:tc>
+        <w:tc>
+          <w:tcPr>
+            <w:tcW w:w="0" w:type="auto"/>
+            <w:tcMar>
+              <w:top w:w="150" w:type="dxa"/>
+              <w:left w:w="210" w:type="dxa"/>
+              <w:bottom w:w="150" w:type="dxa"/>
+              <w:right w:w="210" w:type="dxa"/>
+            </w:tcMar>
+            <w:vAlign w:val="center"/>
+            <w:hideMark/>
+          </w:tcPr>
+          <w:p>
+            <w:pPr>
+              <w:rPr>
+                <w:rFonts w:ascii="Plus Jakarta Sans" w:eastAsia="Times New Roman" w:hAnsi="Plus Jakarta Sans"/>
+                <w:sz w:val="20"/>
+                <w:szCs w:val="20"/>
+              </w:rPr>
+            </w:pPr>
+            <w:r>
+              <w:rPr>
+                <w:rFonts w:ascii="Plus Jakarta Sans" w:eastAsia="Times New Roman" w:hAnsi="Plus Jakarta Sans"/>
+                <w:sz w:val="20"/>
+                <w:szCs w:val="20"/>
+              </w:rPr>
+              <w:t>123</w:t>
             </w:r>
           </w:p>
         </w:tc>
       </w:tr>
       <w:tr>
         <w:trPr>
-          <w:divId w:val="1375471928"/>
+          <w:divId w:val="483085498"/>
         </w:trPr>
         <w:tc>
           <w:tcPr>
@@ -15782,44 +15782,44 @@
                 <w:sz w:val="20"/>
                 <w:szCs w:val="20"/>
               </w:rPr>
-              <w:t>24</w:t>
-            </w:r>
-          </w:p>
-        </w:tc>
-        <w:tc>
-          <w:tcPr>
-            <w:tcW w:w="0" w:type="auto"/>
-            <w:tcMar>
-              <w:top w:w="150" w:type="dxa"/>
-              <w:left w:w="210" w:type="dxa"/>
-              <w:bottom w:w="150" w:type="dxa"/>
-              <w:right w:w="210" w:type="dxa"/>
-            </w:tcMar>
-            <w:vAlign w:val="center"/>
-            <w:hideMark/>
-          </w:tcPr>
-          <w:p>
-            <w:pPr>
-              <w:rPr>
-                <w:rFonts w:ascii="Plus Jakarta Sans" w:eastAsia="Times New Roman" w:hAnsi="Plus Jakarta Sans"/>
-                <w:sz w:val="20"/>
-                <w:szCs w:val="20"/>
-              </w:rPr>
-            </w:pPr>
-            <w:r>
-              <w:rPr>
-                <w:rFonts w:ascii="Plus Jakarta Sans" w:eastAsia="Times New Roman" w:hAnsi="Plus Jakarta Sans"/>
-                <w:sz w:val="20"/>
-                <w:szCs w:val="20"/>
-              </w:rPr>
-              <w:t>78</w:t>
+              <w:t>39</w:t>
+            </w:r>
+          </w:p>
+        </w:tc>
+        <w:tc>
+          <w:tcPr>
+            <w:tcW w:w="0" w:type="auto"/>
+            <w:tcMar>
+              <w:top w:w="150" w:type="dxa"/>
+              <w:left w:w="210" w:type="dxa"/>
+              <w:bottom w:w="150" w:type="dxa"/>
+              <w:right w:w="210" w:type="dxa"/>
+            </w:tcMar>
+            <w:vAlign w:val="center"/>
+            <w:hideMark/>
+          </w:tcPr>
+          <w:p>
+            <w:pPr>
+              <w:rPr>
+                <w:rFonts w:ascii="Plus Jakarta Sans" w:eastAsia="Times New Roman" w:hAnsi="Plus Jakarta Sans"/>
+                <w:sz w:val="20"/>
+                <w:szCs w:val="20"/>
+              </w:rPr>
+            </w:pPr>
+            <w:r>
+              <w:rPr>
+                <w:rFonts w:ascii="Plus Jakarta Sans" w:eastAsia="Times New Roman" w:hAnsi="Plus Jakarta Sans"/>
+                <w:sz w:val="20"/>
+                <w:szCs w:val="20"/>
+              </w:rPr>
+              <w:t>93</w:t>
             </w:r>
           </w:p>
         </w:tc>
       </w:tr>
       <w:tr>
         <w:trPr>
-          <w:divId w:val="1375471928"/>
+          <w:divId w:val="483085498"/>
         </w:trPr>
         <w:tc>
           <w:tcPr>
@@ -15938,37 +15938,37 @@
                 <w:sz w:val="20"/>
                 <w:szCs w:val="20"/>
               </w:rPr>
-              <w:t>9</w:t>
-            </w:r>
-          </w:p>
-        </w:tc>
-        <w:tc>
-          <w:tcPr>
-            <w:tcW w:w="0" w:type="auto"/>
-            <w:tcMar>
-              <w:top w:w="150" w:type="dxa"/>
-              <w:left w:w="210" w:type="dxa"/>
-              <w:bottom w:w="150" w:type="dxa"/>
-              <w:right w:w="210" w:type="dxa"/>
-            </w:tcMar>
-            <w:vAlign w:val="center"/>
-            <w:hideMark/>
-          </w:tcPr>
-          <w:p>
-            <w:pPr>
-              <w:rPr>
-                <w:rFonts w:ascii="Plus Jakarta Sans" w:eastAsia="Times New Roman" w:hAnsi="Plus Jakarta Sans"/>
-                <w:sz w:val="20"/>
-                <w:szCs w:val="20"/>
-              </w:rPr>
-            </w:pPr>
-            <w:r>
-              <w:rPr>
-                <w:rFonts w:ascii="Plus Jakarta Sans" w:eastAsia="Times New Roman" w:hAnsi="Plus Jakarta Sans"/>
-                <w:sz w:val="20"/>
-                <w:szCs w:val="20"/>
-              </w:rPr>
-              <w:t>67</w:t>
+              <w:t>14</w:t>
+            </w:r>
+          </w:p>
+        </w:tc>
+        <w:tc>
+          <w:tcPr>
+            <w:tcW w:w="0" w:type="auto"/>
+            <w:tcMar>
+              <w:top w:w="150" w:type="dxa"/>
+              <w:left w:w="210" w:type="dxa"/>
+              <w:bottom w:w="150" w:type="dxa"/>
+              <w:right w:w="210" w:type="dxa"/>
+            </w:tcMar>
+            <w:vAlign w:val="center"/>
+            <w:hideMark/>
+          </w:tcPr>
+          <w:p>
+            <w:pPr>
+              <w:rPr>
+                <w:rFonts w:ascii="Plus Jakarta Sans" w:eastAsia="Times New Roman" w:hAnsi="Plus Jakarta Sans"/>
+                <w:sz w:val="20"/>
+                <w:szCs w:val="20"/>
+              </w:rPr>
+            </w:pPr>
+            <w:r>
+              <w:rPr>
+                <w:rFonts w:ascii="Plus Jakarta Sans" w:eastAsia="Times New Roman" w:hAnsi="Plus Jakarta Sans"/>
+                <w:sz w:val="20"/>
+                <w:szCs w:val="20"/>
+              </w:rPr>
+              <w:t>72</w:t>
             </w:r>
           </w:p>
         </w:tc>
@@ -15977,7 +15977,7 @@
     <w:p>
       <w:pPr>
         <w:pStyle w:val="Ttulo3"/>
-        <w:divId w:val="774710797"/>
+        <w:divId w:val="1751079550"/>
         <w:rPr>
           <w:rFonts w:eastAsia="Times New Roman"/>
           <w:lang w:val="es-ES"/>
@@ -16011,7 +16011,7 @@
       </w:tblGrid>
       <w:tr>
         <w:trPr>
-          <w:divId w:val="959653971"/>
+          <w:divId w:val="1758593845"/>
           <w:tblHeader/>
         </w:trPr>
         <w:tc>
@@ -16202,7 +16202,7 @@
       </w:tr>
       <w:tr>
         <w:trPr>
-          <w:divId w:val="959653971"/>
+          <w:divId w:val="1758593845"/>
         </w:trPr>
         <w:tc>
           <w:tcPr>
@@ -16321,44 +16321,44 @@
                 <w:sz w:val="20"/>
                 <w:szCs w:val="20"/>
               </w:rPr>
-              <w:t>435</w:t>
-            </w:r>
-          </w:p>
-        </w:tc>
-        <w:tc>
-          <w:tcPr>
-            <w:tcW w:w="0" w:type="auto"/>
-            <w:tcMar>
-              <w:top w:w="150" w:type="dxa"/>
-              <w:left w:w="210" w:type="dxa"/>
-              <w:bottom w:w="150" w:type="dxa"/>
-              <w:right w:w="210" w:type="dxa"/>
-            </w:tcMar>
-            <w:vAlign w:val="center"/>
-            <w:hideMark/>
-          </w:tcPr>
-          <w:p>
-            <w:pPr>
-              <w:rPr>
-                <w:rFonts w:ascii="Plus Jakarta Sans" w:eastAsia="Times New Roman" w:hAnsi="Plus Jakarta Sans"/>
-                <w:sz w:val="20"/>
-                <w:szCs w:val="20"/>
-              </w:rPr>
-            </w:pPr>
-            <w:r>
-              <w:rPr>
-                <w:rFonts w:ascii="Plus Jakarta Sans" w:eastAsia="Times New Roman" w:hAnsi="Plus Jakarta Sans"/>
-                <w:sz w:val="20"/>
-                <w:szCs w:val="20"/>
-              </w:rPr>
-              <w:t>1,921</w:t>
+              <w:t>606</w:t>
+            </w:r>
+          </w:p>
+        </w:tc>
+        <w:tc>
+          <w:tcPr>
+            <w:tcW w:w="0" w:type="auto"/>
+            <w:tcMar>
+              <w:top w:w="150" w:type="dxa"/>
+              <w:left w:w="210" w:type="dxa"/>
+              <w:bottom w:w="150" w:type="dxa"/>
+              <w:right w:w="210" w:type="dxa"/>
+            </w:tcMar>
+            <w:vAlign w:val="center"/>
+            <w:hideMark/>
+          </w:tcPr>
+          <w:p>
+            <w:pPr>
+              <w:rPr>
+                <w:rFonts w:ascii="Plus Jakarta Sans" w:eastAsia="Times New Roman" w:hAnsi="Plus Jakarta Sans"/>
+                <w:sz w:val="20"/>
+                <w:szCs w:val="20"/>
+              </w:rPr>
+            </w:pPr>
+            <w:r>
+              <w:rPr>
+                <w:rFonts w:ascii="Plus Jakarta Sans" w:eastAsia="Times New Roman" w:hAnsi="Plus Jakarta Sans"/>
+                <w:sz w:val="20"/>
+                <w:szCs w:val="20"/>
+              </w:rPr>
+              <w:t>2,092</w:t>
             </w:r>
           </w:p>
         </w:tc>
       </w:tr>
       <w:tr>
         <w:trPr>
-          <w:divId w:val="959653971"/>
+          <w:divId w:val="1758593845"/>
         </w:trPr>
         <w:tc>
           <w:tcPr>
@@ -16477,44 +16477,44 @@
                 <w:sz w:val="20"/>
                 <w:szCs w:val="20"/>
               </w:rPr>
-              <w:t>240</w:t>
-            </w:r>
-          </w:p>
-        </w:tc>
-        <w:tc>
-          <w:tcPr>
-            <w:tcW w:w="0" w:type="auto"/>
-            <w:tcMar>
-              <w:top w:w="150" w:type="dxa"/>
-              <w:left w:w="210" w:type="dxa"/>
-              <w:bottom w:w="150" w:type="dxa"/>
-              <w:right w:w="210" w:type="dxa"/>
-            </w:tcMar>
-            <w:vAlign w:val="center"/>
-            <w:hideMark/>
-          </w:tcPr>
-          <w:p>
-            <w:pPr>
-              <w:rPr>
-                <w:rFonts w:ascii="Plus Jakarta Sans" w:eastAsia="Times New Roman" w:hAnsi="Plus Jakarta Sans"/>
-                <w:sz w:val="20"/>
-                <w:szCs w:val="20"/>
-              </w:rPr>
-            </w:pPr>
-            <w:r>
-              <w:rPr>
-                <w:rFonts w:ascii="Plus Jakarta Sans" w:eastAsia="Times New Roman" w:hAnsi="Plus Jakarta Sans"/>
-                <w:sz w:val="20"/>
-                <w:szCs w:val="20"/>
-              </w:rPr>
-              <w:t>869</w:t>
+              <w:t>272</w:t>
+            </w:r>
+          </w:p>
+        </w:tc>
+        <w:tc>
+          <w:tcPr>
+            <w:tcW w:w="0" w:type="auto"/>
+            <w:tcMar>
+              <w:top w:w="150" w:type="dxa"/>
+              <w:left w:w="210" w:type="dxa"/>
+              <w:bottom w:w="150" w:type="dxa"/>
+              <w:right w:w="210" w:type="dxa"/>
+            </w:tcMar>
+            <w:vAlign w:val="center"/>
+            <w:hideMark/>
+          </w:tcPr>
+          <w:p>
+            <w:pPr>
+              <w:rPr>
+                <w:rFonts w:ascii="Plus Jakarta Sans" w:eastAsia="Times New Roman" w:hAnsi="Plus Jakarta Sans"/>
+                <w:sz w:val="20"/>
+                <w:szCs w:val="20"/>
+              </w:rPr>
+            </w:pPr>
+            <w:r>
+              <w:rPr>
+                <w:rFonts w:ascii="Plus Jakarta Sans" w:eastAsia="Times New Roman" w:hAnsi="Plus Jakarta Sans"/>
+                <w:sz w:val="20"/>
+                <w:szCs w:val="20"/>
+              </w:rPr>
+              <w:t>901</w:t>
             </w:r>
           </w:p>
         </w:tc>
       </w:tr>
       <w:tr>
         <w:trPr>
-          <w:divId w:val="959653971"/>
+          <w:divId w:val="1758593845"/>
         </w:trPr>
         <w:tc>
           <w:tcPr>
@@ -16633,44 +16633,44 @@
                 <w:sz w:val="20"/>
                 <w:szCs w:val="20"/>
               </w:rPr>
-              <w:t>49</w:t>
-            </w:r>
-          </w:p>
-        </w:tc>
-        <w:tc>
-          <w:tcPr>
-            <w:tcW w:w="0" w:type="auto"/>
-            <w:tcMar>
-              <w:top w:w="150" w:type="dxa"/>
-              <w:left w:w="210" w:type="dxa"/>
-              <w:bottom w:w="150" w:type="dxa"/>
-              <w:right w:w="210" w:type="dxa"/>
-            </w:tcMar>
-            <w:vAlign w:val="center"/>
-            <w:hideMark/>
-          </w:tcPr>
-          <w:p>
-            <w:pPr>
-              <w:rPr>
-                <w:rFonts w:ascii="Plus Jakarta Sans" w:eastAsia="Times New Roman" w:hAnsi="Plus Jakarta Sans"/>
-                <w:sz w:val="20"/>
-                <w:szCs w:val="20"/>
-              </w:rPr>
-            </w:pPr>
-            <w:r>
-              <w:rPr>
-                <w:rFonts w:ascii="Plus Jakarta Sans" w:eastAsia="Times New Roman" w:hAnsi="Plus Jakarta Sans"/>
-                <w:sz w:val="20"/>
-                <w:szCs w:val="20"/>
-              </w:rPr>
-              <w:t>697</w:t>
+              <w:t>76</w:t>
+            </w:r>
+          </w:p>
+        </w:tc>
+        <w:tc>
+          <w:tcPr>
+            <w:tcW w:w="0" w:type="auto"/>
+            <w:tcMar>
+              <w:top w:w="150" w:type="dxa"/>
+              <w:left w:w="210" w:type="dxa"/>
+              <w:bottom w:w="150" w:type="dxa"/>
+              <w:right w:w="210" w:type="dxa"/>
+            </w:tcMar>
+            <w:vAlign w:val="center"/>
+            <w:hideMark/>
+          </w:tcPr>
+          <w:p>
+            <w:pPr>
+              <w:rPr>
+                <w:rFonts w:ascii="Plus Jakarta Sans" w:eastAsia="Times New Roman" w:hAnsi="Plus Jakarta Sans"/>
+                <w:sz w:val="20"/>
+                <w:szCs w:val="20"/>
+              </w:rPr>
+            </w:pPr>
+            <w:r>
+              <w:rPr>
+                <w:rFonts w:ascii="Plus Jakarta Sans" w:eastAsia="Times New Roman" w:hAnsi="Plus Jakarta Sans"/>
+                <w:sz w:val="20"/>
+                <w:szCs w:val="20"/>
+              </w:rPr>
+              <w:t>724</w:t>
             </w:r>
           </w:p>
         </w:tc>
       </w:tr>
       <w:tr>
         <w:trPr>
-          <w:divId w:val="959653971"/>
+          <w:divId w:val="1758593845"/>
         </w:trPr>
         <w:tc>
           <w:tcPr>
@@ -16789,44 +16789,44 @@
                 <w:sz w:val="20"/>
                 <w:szCs w:val="20"/>
               </w:rPr>
-              <w:t>45</w:t>
-            </w:r>
-          </w:p>
-        </w:tc>
-        <w:tc>
-          <w:tcPr>
-            <w:tcW w:w="0" w:type="auto"/>
-            <w:tcMar>
-              <w:top w:w="150" w:type="dxa"/>
-              <w:left w:w="210" w:type="dxa"/>
-              <w:bottom w:w="150" w:type="dxa"/>
-              <w:right w:w="210" w:type="dxa"/>
-            </w:tcMar>
-            <w:vAlign w:val="center"/>
-            <w:hideMark/>
-          </w:tcPr>
-          <w:p>
-            <w:pPr>
-              <w:rPr>
-                <w:rFonts w:ascii="Plus Jakarta Sans" w:eastAsia="Times New Roman" w:hAnsi="Plus Jakarta Sans"/>
-                <w:sz w:val="20"/>
-                <w:szCs w:val="20"/>
-              </w:rPr>
-            </w:pPr>
-            <w:r>
-              <w:rPr>
-                <w:rFonts w:ascii="Plus Jakarta Sans" w:eastAsia="Times New Roman" w:hAnsi="Plus Jakarta Sans"/>
-                <w:sz w:val="20"/>
-                <w:szCs w:val="20"/>
-              </w:rPr>
-              <w:t>274</w:t>
+              <w:t>72</w:t>
+            </w:r>
+          </w:p>
+        </w:tc>
+        <w:tc>
+          <w:tcPr>
+            <w:tcW w:w="0" w:type="auto"/>
+            <w:tcMar>
+              <w:top w:w="150" w:type="dxa"/>
+              <w:left w:w="210" w:type="dxa"/>
+              <w:bottom w:w="150" w:type="dxa"/>
+              <w:right w:w="210" w:type="dxa"/>
+            </w:tcMar>
+            <w:vAlign w:val="center"/>
+            <w:hideMark/>
+          </w:tcPr>
+          <w:p>
+            <w:pPr>
+              <w:rPr>
+                <w:rFonts w:ascii="Plus Jakarta Sans" w:eastAsia="Times New Roman" w:hAnsi="Plus Jakarta Sans"/>
+                <w:sz w:val="20"/>
+                <w:szCs w:val="20"/>
+              </w:rPr>
+            </w:pPr>
+            <w:r>
+              <w:rPr>
+                <w:rFonts w:ascii="Plus Jakarta Sans" w:eastAsia="Times New Roman" w:hAnsi="Plus Jakarta Sans"/>
+                <w:sz w:val="20"/>
+                <w:szCs w:val="20"/>
+              </w:rPr>
+              <w:t>301</w:t>
             </w:r>
           </w:p>
         </w:tc>
       </w:tr>
       <w:tr>
         <w:trPr>
-          <w:divId w:val="959653971"/>
+          <w:divId w:val="1758593845"/>
         </w:trPr>
         <w:tc>
           <w:tcPr>
@@ -16945,37 +16945,37 @@
                 <w:sz w:val="20"/>
                 <w:szCs w:val="20"/>
               </w:rPr>
-              <w:t>44</w:t>
-            </w:r>
-          </w:p>
-        </w:tc>
-        <w:tc>
-          <w:tcPr>
-            <w:tcW w:w="0" w:type="auto"/>
-            <w:tcMar>
-              <w:top w:w="150" w:type="dxa"/>
-              <w:left w:w="210" w:type="dxa"/>
-              <w:bottom w:w="150" w:type="dxa"/>
-              <w:right w:w="210" w:type="dxa"/>
-            </w:tcMar>
-            <w:vAlign w:val="center"/>
-            <w:hideMark/>
-          </w:tcPr>
-          <w:p>
-            <w:pPr>
-              <w:rPr>
-                <w:rFonts w:ascii="Plus Jakarta Sans" w:eastAsia="Times New Roman" w:hAnsi="Plus Jakarta Sans"/>
-                <w:sz w:val="20"/>
-                <w:szCs w:val="20"/>
-              </w:rPr>
-            </w:pPr>
-            <w:r>
-              <w:rPr>
-                <w:rFonts w:ascii="Plus Jakarta Sans" w:eastAsia="Times New Roman" w:hAnsi="Plus Jakarta Sans"/>
-                <w:sz w:val="20"/>
-                <w:szCs w:val="20"/>
-              </w:rPr>
-              <w:t>222</w:t>
+              <w:t>49</w:t>
+            </w:r>
+          </w:p>
+        </w:tc>
+        <w:tc>
+          <w:tcPr>
+            <w:tcW w:w="0" w:type="auto"/>
+            <w:tcMar>
+              <w:top w:w="150" w:type="dxa"/>
+              <w:left w:w="210" w:type="dxa"/>
+              <w:bottom w:w="150" w:type="dxa"/>
+              <w:right w:w="210" w:type="dxa"/>
+            </w:tcMar>
+            <w:vAlign w:val="center"/>
+            <w:hideMark/>
+          </w:tcPr>
+          <w:p>
+            <w:pPr>
+              <w:rPr>
+                <w:rFonts w:ascii="Plus Jakarta Sans" w:eastAsia="Times New Roman" w:hAnsi="Plus Jakarta Sans"/>
+                <w:sz w:val="20"/>
+                <w:szCs w:val="20"/>
+              </w:rPr>
+            </w:pPr>
+            <w:r>
+              <w:rPr>
+                <w:rFonts w:ascii="Plus Jakarta Sans" w:eastAsia="Times New Roman" w:hAnsi="Plus Jakarta Sans"/>
+                <w:sz w:val="20"/>
+                <w:szCs w:val="20"/>
+              </w:rPr>
+              <w:t>227</w:t>
             </w:r>
           </w:p>
         </w:tc>
@@ -16984,7 +16984,7 @@
     <w:p>
       <w:pPr>
         <w:pStyle w:val="Ttulo3"/>
-        <w:divId w:val="774710797"/>
+        <w:divId w:val="1751079550"/>
         <w:rPr>
           <w:rFonts w:eastAsia="Times New Roman"/>
           <w:lang w:val="es-ES"/>
@@ -17018,7 +17018,7 @@
       </w:tblGrid>
       <w:tr>
         <w:trPr>
-          <w:divId w:val="324404115"/>
+          <w:divId w:val="618224215"/>
           <w:tblHeader/>
         </w:trPr>
         <w:tc>
@@ -17209,7 +17209,7 @@
       </w:tr>
       <w:tr>
         <w:trPr>
-          <w:divId w:val="324404115"/>
+          <w:divId w:val="618224215"/>
         </w:trPr>
         <w:tc>
           <w:tcPr>
@@ -17328,44 +17328,44 @@
                 <w:sz w:val="20"/>
                 <w:szCs w:val="20"/>
               </w:rPr>
-              <w:t>615</w:t>
-            </w:r>
-          </w:p>
-        </w:tc>
-        <w:tc>
-          <w:tcPr>
-            <w:tcW w:w="0" w:type="auto"/>
-            <w:tcMar>
-              <w:top w:w="150" w:type="dxa"/>
-              <w:left w:w="210" w:type="dxa"/>
-              <w:bottom w:w="150" w:type="dxa"/>
-              <w:right w:w="210" w:type="dxa"/>
-            </w:tcMar>
-            <w:vAlign w:val="center"/>
-            <w:hideMark/>
-          </w:tcPr>
-          <w:p>
-            <w:pPr>
-              <w:rPr>
-                <w:rFonts w:ascii="Plus Jakarta Sans" w:eastAsia="Times New Roman" w:hAnsi="Plus Jakarta Sans"/>
-                <w:sz w:val="20"/>
-                <w:szCs w:val="20"/>
-              </w:rPr>
-            </w:pPr>
-            <w:r>
-              <w:rPr>
-                <w:rFonts w:ascii="Plus Jakarta Sans" w:eastAsia="Times New Roman" w:hAnsi="Plus Jakarta Sans"/>
-                <w:sz w:val="20"/>
-                <w:szCs w:val="20"/>
-              </w:rPr>
-              <w:t>2,886</w:t>
+              <w:t>841</w:t>
+            </w:r>
+          </w:p>
+        </w:tc>
+        <w:tc>
+          <w:tcPr>
+            <w:tcW w:w="0" w:type="auto"/>
+            <w:tcMar>
+              <w:top w:w="150" w:type="dxa"/>
+              <w:left w:w="210" w:type="dxa"/>
+              <w:bottom w:w="150" w:type="dxa"/>
+              <w:right w:w="210" w:type="dxa"/>
+            </w:tcMar>
+            <w:vAlign w:val="center"/>
+            <w:hideMark/>
+          </w:tcPr>
+          <w:p>
+            <w:pPr>
+              <w:rPr>
+                <w:rFonts w:ascii="Plus Jakarta Sans" w:eastAsia="Times New Roman" w:hAnsi="Plus Jakarta Sans"/>
+                <w:sz w:val="20"/>
+                <w:szCs w:val="20"/>
+              </w:rPr>
+            </w:pPr>
+            <w:r>
+              <w:rPr>
+                <w:rFonts w:ascii="Plus Jakarta Sans" w:eastAsia="Times New Roman" w:hAnsi="Plus Jakarta Sans"/>
+                <w:sz w:val="20"/>
+                <w:szCs w:val="20"/>
+              </w:rPr>
+              <w:t>3,112</w:t>
             </w:r>
           </w:p>
         </w:tc>
       </w:tr>
       <w:tr>
         <w:trPr>
-          <w:divId w:val="324404115"/>
+          <w:divId w:val="618224215"/>
         </w:trPr>
         <w:tc>
           <w:tcPr>
@@ -17484,37 +17484,37 @@
                 <w:sz w:val="20"/>
                 <w:szCs w:val="20"/>
               </w:rPr>
-              <w:t>205</w:t>
-            </w:r>
-          </w:p>
-        </w:tc>
-        <w:tc>
-          <w:tcPr>
-            <w:tcW w:w="0" w:type="auto"/>
-            <w:tcMar>
-              <w:top w:w="150" w:type="dxa"/>
-              <w:left w:w="210" w:type="dxa"/>
-              <w:bottom w:w="150" w:type="dxa"/>
-              <w:right w:w="210" w:type="dxa"/>
-            </w:tcMar>
-            <w:vAlign w:val="center"/>
-            <w:hideMark/>
-          </w:tcPr>
-          <w:p>
-            <w:pPr>
-              <w:rPr>
-                <w:rFonts w:ascii="Plus Jakarta Sans" w:eastAsia="Times New Roman" w:hAnsi="Plus Jakarta Sans"/>
-                <w:sz w:val="20"/>
-                <w:szCs w:val="20"/>
-              </w:rPr>
-            </w:pPr>
-            <w:r>
-              <w:rPr>
-                <w:rFonts w:ascii="Plus Jakarta Sans" w:eastAsia="Times New Roman" w:hAnsi="Plus Jakarta Sans"/>
-                <w:sz w:val="20"/>
-                <w:szCs w:val="20"/>
-              </w:rPr>
-              <w:t>1,287</w:t>
+              <w:t>246</w:t>
+            </w:r>
+          </w:p>
+        </w:tc>
+        <w:tc>
+          <w:tcPr>
+            <w:tcW w:w="0" w:type="auto"/>
+            <w:tcMar>
+              <w:top w:w="150" w:type="dxa"/>
+              <w:left w:w="210" w:type="dxa"/>
+              <w:bottom w:w="150" w:type="dxa"/>
+              <w:right w:w="210" w:type="dxa"/>
+            </w:tcMar>
+            <w:vAlign w:val="center"/>
+            <w:hideMark/>
+          </w:tcPr>
+          <w:p>
+            <w:pPr>
+              <w:rPr>
+                <w:rFonts w:ascii="Plus Jakarta Sans" w:eastAsia="Times New Roman" w:hAnsi="Plus Jakarta Sans"/>
+                <w:sz w:val="20"/>
+                <w:szCs w:val="20"/>
+              </w:rPr>
+            </w:pPr>
+            <w:r>
+              <w:rPr>
+                <w:rFonts w:ascii="Plus Jakarta Sans" w:eastAsia="Times New Roman" w:hAnsi="Plus Jakarta Sans"/>
+                <w:sz w:val="20"/>
+                <w:szCs w:val="20"/>
+              </w:rPr>
+              <w:t>1,328</w:t>
             </w:r>
           </w:p>
         </w:tc>
@@ -17523,7 +17523,7 @@
     <w:p>
       <w:pPr>
         <w:pStyle w:val="Ttulo4"/>
-        <w:divId w:val="774710797"/>
+        <w:divId w:val="1751079550"/>
         <w:rPr>
           <w:rFonts w:eastAsia="Times New Roman"/>
           <w:lang w:val="es-ES"/>
@@ -17541,7 +17541,7 @@
       <w:pPr>
         <w:spacing w:before="375" w:after="225"/>
         <w:jc w:val="center"/>
-        <w:divId w:val="570501602"/>
+        <w:divId w:val="1824930397"/>
         <w:rPr>
           <w:rFonts w:ascii="Outfit" w:eastAsia="Times New Roman" w:hAnsi="Outfit"/>
           <w:b/>
@@ -17571,7 +17571,7 @@
       <w:pPr>
         <w:spacing w:after="375"/>
         <w:jc w:val="center"/>
-        <w:divId w:val="1490633627"/>
+        <w:divId w:val="748039691"/>
         <w:rPr>
           <w:rFonts w:ascii="Plus Jakarta Sans" w:eastAsia="Times New Roman" w:hAnsi="Plus Jakarta Sans"/>
           <w:lang w:val="es-ES"/>
@@ -17876,7 +17876,7 @@
           <w:rFonts w:ascii="Plus Jakarta Sans" w:eastAsia="Times New Roman" w:hAnsi="Plus Jakarta Sans"/>
           <w:lang w:val="es-ES"/>
         </w:rPr>
-        <w:t>75</w:t>
+        <w:t>77</w:t>
       </w:r>
       <w:r>
         <w:rPr>
@@ -17897,7 +17897,7 @@
           <w:rFonts w:ascii="Plus Jakarta Sans" w:eastAsia="Times New Roman" w:hAnsi="Plus Jakarta Sans"/>
           <w:lang w:val="es-ES"/>
         </w:rPr>
-        <w:t>25</w:t>
+        <w:t>22</w:t>
       </w:r>
       <w:r>
         <w:rPr>
@@ -17959,7 +17959,7 @@
     <w:p>
       <w:pPr>
         <w:spacing w:before="450" w:after="450"/>
-        <w:divId w:val="774710797"/>
+        <w:divId w:val="1751079550"/>
         <w:rPr>
           <w:rFonts w:ascii="Plus Jakarta Sans" w:eastAsia="Times New Roman" w:hAnsi="Plus Jakarta Sans"/>
           <w:lang w:val="es-ES"/>
@@ -17970,7 +17970,7 @@
           <w:rFonts w:ascii="Plus Jakarta Sans" w:eastAsia="Times New Roman" w:hAnsi="Plus Jakarta Sans"/>
           <w:lang w:val="es-ES"/>
         </w:rPr>
-        <w:pict w14:anchorId="1AB168E4">
+        <w:pict w14:anchorId="1D9F70EA">
           <v:rect id="_x0000_i1035" style="width:0;height:.75pt" o:hralign="center" o:hrstd="t" o:hr="t" fillcolor="#a0a0a0" stroked="f"/>
         </w:pict>
       </w:r>
@@ -17978,7 +17978,7 @@
     <w:p>
       <w:pPr>
         <w:spacing w:before="450" w:after="450"/>
-        <w:divId w:val="774710797"/>
+        <w:divId w:val="1751079550"/>
         <w:rPr>
           <w:rFonts w:ascii="Plus Jakarta Sans" w:eastAsia="Times New Roman" w:hAnsi="Plus Jakarta Sans"/>
           <w:lang w:val="es-ES"/>
@@ -17989,7 +17989,7 @@
           <w:rFonts w:ascii="Plus Jakarta Sans" w:eastAsia="Times New Roman" w:hAnsi="Plus Jakarta Sans"/>
           <w:lang w:val="es-ES"/>
         </w:rPr>
-        <w:pict w14:anchorId="2311B9B6">
+        <w:pict w14:anchorId="08BB7277">
           <v:rect id="_x0000_i1036" style="width:0;height:.75pt" o:hralign="center" o:hrstd="t" o:hr="t" fillcolor="#a0a0a0" stroked="f"/>
         </w:pict>
       </w:r>
@@ -17997,7 +17997,7 @@
     <w:p>
       <w:pPr>
         <w:pStyle w:val="NormalWeb"/>
-        <w:divId w:val="774710797"/>
+        <w:divId w:val="1751079550"/>
         <w:rPr>
           <w:rFonts w:ascii="Plus Jakarta Sans" w:hAnsi="Plus Jakarta Sans"/>
           <w:lang w:val="es-ES"/>
@@ -18030,7 +18030,7 @@
           <w:rFonts w:ascii="Plus Jakarta Sans" w:hAnsi="Plus Jakarta Sans"/>
           <w:lang w:val="es-ES"/>
         </w:rPr>
-        <w:pict w14:anchorId="7A0E4E82"/>
+        <w:pict w14:anchorId="1A22EE37"/>
       </w:r>
     </w:p>
     <w:sectPr>
@@ -18046,9 +18046,9 @@
 <file path=word/numbering.xml><?xml version="1.0" encoding="utf-8"?>
 <w:numbering xmlns:wpc="http://schemas.microsoft.com/office/word/2010/wordprocessingCanvas" xmlns:cx="http://schemas.microsoft.com/office/drawing/2014/chartex" xmlns:cx1="http://schemas.microsoft.com/office/drawing/2015/9/8/chartex" xmlns:cx2="http://schemas.microsoft.com/office/drawing/2015/10/21/chartex" xmlns:cx3="http://schemas.microsoft.com/office/drawing/2016/5/9/chartex" xmlns:cx4="http://schemas.microsoft.com/office/drawing/2016/5/10/chartex" xmlns:cx5="http://schemas.microsoft.com/office/drawing/2016/5/11/chartex" xmlns:cx6="http://schemas.microsoft.com/office/drawing/2016/5/12/chartex" xmlns:cx7="http://schemas.microsoft.com/office/drawing/2016/5/13/chartex" xmlns:cx8="http://schemas.microsoft.com/office/drawing/2016/5/14/chartex" xmlns:mc="http://schemas.openxmlformats.org/markup-compatibility/2006" xmlns:aink="http://schemas.microsoft.com/office/drawing/2016/ink" xmlns:am3d="http://schemas.microsoft.com/office/drawing/2017/model3d" xmlns:o="urn:schemas-microsoft-com:office:office" xmlns:r="http://schemas.openxmlformats.org/officeDocument/2006/relationships" xmlns:m="http://schemas.openxmlformats.org/officeDocument/2006/math" xmlns:v="urn:schemas-microsoft-com:vml" xmlns:wp14="http://schemas.microsoft.com/office/word/2010/wordprocessingDrawing" xmlns:wp="http://schemas.openxmlformats.org/drawingml/2006/wordprocessingDrawing" xmlns:w10="urn:schemas-microsoft-com:office:word" xmlns:w="http://schemas.openxmlformats.org/wordprocessingml/2006/main" xmlns:w14="http://schemas.microsoft.com/office/word/2010/wordml" xmlns:w15="http://schemas.microsoft.com/office/word/2012/wordml" xmlns:w16cex="http://schemas.microsoft.com/office/word/2018/wordml/cex" xmlns:w16cid="http://schemas.microsoft.com/office/word/2016/wordml/cid" xmlns:w16="http://schemas.microsoft.com/office/word/2018/wordml" xmlns:w16sdtdh="http://schemas.microsoft.com/office/word/2020/wordml/sdtdatahash" xmlns:w16se="http://schemas.microsoft.com/office/word/2015/wordml/symex" xmlns:wpg="http://schemas.microsoft.com/office/word/2010/wordprocessingGroup" xmlns:wpi="http://schemas.microsoft.com/office/word/2010/wordprocessingInk" xmlns:wne="http://schemas.microsoft.com/office/word/2006/wordml" xmlns:wps="http://schemas.microsoft.com/office/word/2010/wordprocessingShape" mc:Ignorable="w14 w15 w16se w16cid w16 w16cex w16sdtdh wp14">
   <w:abstractNum w:abstractNumId="0" w15:restartNumberingAfterBreak="0">
-    <w:nsid w:val="0D89711D"/>
+    <w:nsid w:val="07267757"/>
     <w:multiLevelType w:val="multilevel"/>
-    <w:tmpl w:val="673035B0"/>
+    <w:tmpl w:val="137A748E"/>
     <w:lvl w:ilvl="0">
       <w:start w:val="1"/>
       <w:numFmt w:val="bullet"/>
@@ -18195,9 +18195,9 @@
     </w:lvl>
   </w:abstractNum>
   <w:abstractNum w:abstractNumId="1" w15:restartNumberingAfterBreak="0">
-    <w:nsid w:val="0F8F2412"/>
+    <w:nsid w:val="3243732F"/>
     <w:multiLevelType w:val="multilevel"/>
-    <w:tmpl w:val="05BEC1C0"/>
+    <w:tmpl w:val="3B02063E"/>
     <w:lvl w:ilvl="0">
       <w:start w:val="1"/>
       <w:numFmt w:val="bullet"/>
@@ -18344,9 +18344,9 @@
     </w:lvl>
   </w:abstractNum>
   <w:abstractNum w:abstractNumId="2" w15:restartNumberingAfterBreak="0">
-    <w:nsid w:val="352E6732"/>
+    <w:nsid w:val="3AE059A4"/>
     <w:multiLevelType w:val="multilevel"/>
-    <w:tmpl w:val="62A6117A"/>
+    <w:tmpl w:val="540839D4"/>
     <w:lvl w:ilvl="0">
       <w:start w:val="1"/>
       <w:numFmt w:val="bullet"/>
@@ -18493,9 +18493,9 @@
     </w:lvl>
   </w:abstractNum>
   <w:abstractNum w:abstractNumId="3" w15:restartNumberingAfterBreak="0">
-    <w:nsid w:val="42963C09"/>
+    <w:nsid w:val="4FB528E8"/>
     <w:multiLevelType w:val="multilevel"/>
-    <w:tmpl w:val="DF427EB6"/>
+    <w:tmpl w:val="F4FAA632"/>
     <w:lvl w:ilvl="0">
       <w:start w:val="1"/>
       <w:numFmt w:val="bullet"/>

</xml_diff>

<commit_message>
fix(reportes): eliminar duplicacion de fichas adicionales + celular en Excel
- PDF y Excel: las fichas adicionales salen del padron numerado (ya
  aparecen como sub-filas 'Predio Adicional' bajo su regante)
- Sub-filas y pestana Lotes Adicionales muestran estado de investigacion
- Nueva columna CELULAR en ambos Excel
- Limpieza de formato: sin 'nan' ni sufijo '.0' en claves catastrales
- Renombrado de etiquetas visibles: fichas hijas -> fichas adicionales

Co-Authored-By: Claude Opus 4.8 <noreply@anthropic.com>
</commit_message>
<xml_diff>
--- a/public/informe_reunion_tecnica.docx
+++ b/public/informe_reunion_tecnica.docx
@@ -4,7 +4,7 @@
   <w:body>
     <w:p>
       <w:pPr>
-        <w:divId w:val="1944414825"/>
+        <w:divId w:val="325284317"/>
         <w:rPr>
           <w:rFonts w:ascii="Plus Jakarta Sans" w:eastAsia="Times New Roman" w:hAnsi="Plus Jakarta Sans"/>
           <w:lang w:val="es-ES"/>
@@ -28,7 +28,7 @@
     <w:p>
       <w:pPr>
         <w:pStyle w:val="Ttulo1"/>
-        <w:divId w:val="1098213800"/>
+        <w:divId w:val="352536562"/>
         <w:rPr>
           <w:rFonts w:eastAsia="Times New Roman"/>
           <w:lang w:val="es-ES"/>
@@ -45,7 +45,7 @@
     <w:p>
       <w:pPr>
         <w:pStyle w:val="NormalWeb"/>
-        <w:divId w:val="1098213800"/>
+        <w:divId w:val="352536562"/>
         <w:rPr>
           <w:rFonts w:ascii="Plus Jakarta Sans" w:hAnsi="Plus Jakarta Sans"/>
           <w:lang w:val="es-ES"/>
@@ -63,7 +63,7 @@
     <w:p>
       <w:pPr>
         <w:pStyle w:val="NormalWeb"/>
-        <w:divId w:val="1098213800"/>
+        <w:divId w:val="352536562"/>
         <w:rPr>
           <w:rFonts w:ascii="Plus Jakarta Sans" w:hAnsi="Plus Jakarta Sans"/>
           <w:lang w:val="es-ES"/>
@@ -102,7 +102,7 @@
     <w:p>
       <w:pPr>
         <w:spacing w:before="450" w:after="450"/>
-        <w:divId w:val="1098213800"/>
+        <w:divId w:val="352536562"/>
         <w:rPr>
           <w:rFonts w:ascii="Plus Jakarta Sans" w:eastAsia="Times New Roman" w:hAnsi="Plus Jakarta Sans"/>
           <w:lang w:val="es-ES"/>
@@ -121,7 +121,7 @@
     <w:p>
       <w:pPr>
         <w:pStyle w:val="Ttulo2"/>
-        <w:divId w:val="1098213800"/>
+        <w:divId w:val="352536562"/>
         <w:rPr>
           <w:rFonts w:eastAsia="Times New Roman"/>
           <w:lang w:val="es-ES"/>
@@ -145,7 +145,7 @@
     <w:p>
       <w:pPr>
         <w:pStyle w:val="NormalWeb"/>
-        <w:divId w:val="1098213800"/>
+        <w:divId w:val="352536562"/>
         <w:rPr>
           <w:rFonts w:ascii="Plus Jakarta Sans" w:hAnsi="Plus Jakarta Sans"/>
           <w:lang w:val="es-ES"/>
@@ -167,7 +167,7 @@
         </w:numPr>
         <w:spacing w:before="100" w:beforeAutospacing="1" w:after="90"/>
         <w:ind w:left="1020"/>
-        <w:divId w:val="1098213800"/>
+        <w:divId w:val="352536562"/>
         <w:rPr>
           <w:rFonts w:ascii="Plus Jakarta Sans" w:eastAsia="Times New Roman" w:hAnsi="Plus Jakarta Sans"/>
           <w:sz w:val="21"/>
@@ -213,7 +213,7 @@
         </w:numPr>
         <w:spacing w:before="100" w:beforeAutospacing="1" w:after="90"/>
         <w:ind w:left="1020"/>
-        <w:divId w:val="1098213800"/>
+        <w:divId w:val="352536562"/>
         <w:rPr>
           <w:rFonts w:ascii="Plus Jakarta Sans" w:eastAsia="Times New Roman" w:hAnsi="Plus Jakarta Sans"/>
           <w:sz w:val="21"/>
@@ -269,7 +269,7 @@
         </w:numPr>
         <w:spacing w:before="100" w:beforeAutospacing="1" w:after="90"/>
         <w:ind w:left="1020"/>
-        <w:divId w:val="1098213800"/>
+        <w:divId w:val="352536562"/>
         <w:rPr>
           <w:rFonts w:ascii="Plus Jakarta Sans" w:eastAsia="Times New Roman" w:hAnsi="Plus Jakarta Sans"/>
           <w:sz w:val="21"/>
@@ -315,7 +315,7 @@
         </w:numPr>
         <w:spacing w:before="100" w:beforeAutospacing="1" w:after="90"/>
         <w:ind w:left="1020"/>
-        <w:divId w:val="1098213800"/>
+        <w:divId w:val="352536562"/>
         <w:rPr>
           <w:rFonts w:ascii="Plus Jakarta Sans" w:eastAsia="Times New Roman" w:hAnsi="Plus Jakarta Sans"/>
           <w:sz w:val="21"/>
@@ -356,7 +356,7 @@
     <w:p>
       <w:pPr>
         <w:spacing w:before="450" w:after="450"/>
-        <w:divId w:val="1098213800"/>
+        <w:divId w:val="352536562"/>
         <w:rPr>
           <w:rFonts w:ascii="Plus Jakarta Sans" w:eastAsia="Times New Roman" w:hAnsi="Plus Jakarta Sans"/>
           <w:lang w:val="es-ES"/>
@@ -375,7 +375,7 @@
     <w:p>
       <w:pPr>
         <w:pStyle w:val="Ttulo2"/>
-        <w:divId w:val="1098213800"/>
+        <w:divId w:val="352536562"/>
         <w:rPr>
           <w:rFonts w:eastAsia="Times New Roman"/>
           <w:lang w:val="es-ES"/>
@@ -392,7 +392,7 @@
     <w:p>
       <w:pPr>
         <w:pStyle w:val="NormalWeb"/>
-        <w:divId w:val="1098213800"/>
+        <w:divId w:val="352536562"/>
         <w:rPr>
           <w:rFonts w:ascii="Plus Jakarta Sans" w:hAnsi="Plus Jakarta Sans"/>
           <w:lang w:val="es-ES"/>
@@ -445,7 +445,7 @@
       </w:tblGrid>
       <w:tr>
         <w:trPr>
-          <w:divId w:val="917440750"/>
+          <w:divId w:val="8988403"/>
           <w:tblHeader/>
         </w:trPr>
         <w:tc>
@@ -525,7 +525,7 @@
       </w:tr>
       <w:tr>
         <w:trPr>
-          <w:divId w:val="917440750"/>
+          <w:divId w:val="8988403"/>
         </w:trPr>
         <w:tc>
           <w:tcPr>
@@ -591,7 +591,7 @@
       </w:tr>
       <w:tr>
         <w:trPr>
-          <w:divId w:val="917440750"/>
+          <w:divId w:val="8988403"/>
         </w:trPr>
         <w:tc>
           <w:tcPr>
@@ -657,7 +657,7 @@
       </w:tr>
       <w:tr>
         <w:trPr>
-          <w:divId w:val="917440750"/>
+          <w:divId w:val="8988403"/>
         </w:trPr>
         <w:tc>
           <w:tcPr>
@@ -723,7 +723,7 @@
       </w:tr>
       <w:tr>
         <w:trPr>
-          <w:divId w:val="917440750"/>
+          <w:divId w:val="8988403"/>
         </w:trPr>
         <w:tc>
           <w:tcPr>
@@ -791,7 +791,7 @@
     <w:p>
       <w:pPr>
         <w:spacing w:before="450" w:after="450"/>
-        <w:divId w:val="1098213800"/>
+        <w:divId w:val="352536562"/>
         <w:rPr>
           <w:rFonts w:ascii="Plus Jakarta Sans" w:eastAsia="Times New Roman" w:hAnsi="Plus Jakarta Sans"/>
           <w:lang w:val="es-ES"/>
@@ -811,7 +811,7 @@
     <w:p>
       <w:pPr>
         <w:pStyle w:val="Ttulo2"/>
-        <w:divId w:val="1098213800"/>
+        <w:divId w:val="352536562"/>
         <w:rPr>
           <w:rFonts w:eastAsia="Times New Roman"/>
           <w:lang w:val="es-ES"/>
@@ -828,7 +828,7 @@
     <w:p>
       <w:pPr>
         <w:pStyle w:val="Ttulo3"/>
-        <w:divId w:val="1098213800"/>
+        <w:divId w:val="352536562"/>
         <w:rPr>
           <w:rFonts w:eastAsia="Times New Roman"/>
           <w:lang w:val="es-ES"/>
@@ -845,7 +845,7 @@
     <w:p>
       <w:pPr>
         <w:pStyle w:val="NormalWeb"/>
-        <w:divId w:val="1098213800"/>
+        <w:divId w:val="352536562"/>
         <w:rPr>
           <w:rFonts w:ascii="Plus Jakarta Sans" w:hAnsi="Plus Jakarta Sans"/>
           <w:lang w:val="es-ES"/>
@@ -885,7 +885,7 @@
       </w:tblGrid>
       <w:tr>
         <w:trPr>
-          <w:divId w:val="1477189363"/>
+          <w:divId w:val="1881624982"/>
           <w:tblHeader/>
         </w:trPr>
         <w:tc>
@@ -1039,7 +1039,7 @@
       </w:tr>
       <w:tr>
         <w:trPr>
-          <w:divId w:val="1477189363"/>
+          <w:divId w:val="1881624982"/>
         </w:trPr>
         <w:tc>
           <w:tcPr>
@@ -1165,7 +1165,7 @@
       </w:tr>
       <w:tr>
         <w:trPr>
-          <w:divId w:val="1477189363"/>
+          <w:divId w:val="1881624982"/>
         </w:trPr>
         <w:tc>
           <w:tcPr>
@@ -1291,7 +1291,7 @@
       </w:tr>
       <w:tr>
         <w:trPr>
-          <w:divId w:val="1477189363"/>
+          <w:divId w:val="1881624982"/>
         </w:trPr>
         <w:tc>
           <w:tcPr>
@@ -1417,7 +1417,7 @@
       </w:tr>
       <w:tr>
         <w:trPr>
-          <w:divId w:val="1477189363"/>
+          <w:divId w:val="1881624982"/>
         </w:trPr>
         <w:tc>
           <w:tcPr>
@@ -1543,7 +1543,7 @@
       </w:tr>
       <w:tr>
         <w:trPr>
-          <w:divId w:val="1477189363"/>
+          <w:divId w:val="1881624982"/>
         </w:trPr>
         <w:tc>
           <w:tcPr>
@@ -1677,7 +1677,7 @@
       </w:tr>
       <w:tr>
         <w:trPr>
-          <w:divId w:val="1477189363"/>
+          <w:divId w:val="1881624982"/>
         </w:trPr>
         <w:tc>
           <w:tcPr>
@@ -1803,7 +1803,7 @@
       </w:tr>
       <w:tr>
         <w:trPr>
-          <w:divId w:val="1477189363"/>
+          <w:divId w:val="1881624982"/>
         </w:trPr>
         <w:tc>
           <w:tcPr>
@@ -1929,7 +1929,7 @@
       </w:tr>
       <w:tr>
         <w:trPr>
-          <w:divId w:val="1477189363"/>
+          <w:divId w:val="1881624982"/>
         </w:trPr>
         <w:tc>
           <w:tcPr>
@@ -2057,7 +2057,7 @@
     <w:p>
       <w:pPr>
         <w:pStyle w:val="Ttulo3"/>
-        <w:divId w:val="1098213800"/>
+        <w:divId w:val="352536562"/>
         <w:rPr>
           <w:rFonts w:eastAsia="Times New Roman"/>
           <w:lang w:val="es-ES"/>
@@ -2074,7 +2074,7 @@
     <w:p>
       <w:pPr>
         <w:pStyle w:val="NormalWeb"/>
-        <w:divId w:val="1098213800"/>
+        <w:divId w:val="352536562"/>
         <w:rPr>
           <w:rFonts w:ascii="Plus Jakarta Sans" w:hAnsi="Plus Jakarta Sans"/>
           <w:lang w:val="es-ES"/>
@@ -2103,7 +2103,7 @@
         </w:numPr>
         <w:spacing w:before="100" w:beforeAutospacing="1" w:after="90"/>
         <w:ind w:left="1020"/>
-        <w:divId w:val="1098213800"/>
+        <w:divId w:val="352536562"/>
         <w:rPr>
           <w:rFonts w:ascii="Plus Jakarta Sans" w:eastAsia="Times New Roman" w:hAnsi="Plus Jakarta Sans"/>
           <w:sz w:val="21"/>
@@ -2205,7 +2205,7 @@
         </w:numPr>
         <w:spacing w:before="100" w:beforeAutospacing="1" w:after="90"/>
         <w:ind w:left="1020"/>
-        <w:divId w:val="1098213800"/>
+        <w:divId w:val="352536562"/>
         <w:rPr>
           <w:rFonts w:ascii="Plus Jakarta Sans" w:eastAsia="Times New Roman" w:hAnsi="Plus Jakarta Sans"/>
           <w:sz w:val="21"/>
@@ -2317,7 +2317,7 @@
         </w:numPr>
         <w:spacing w:before="100" w:beforeAutospacing="1" w:after="90"/>
         <w:ind w:left="1020"/>
-        <w:divId w:val="1098213800"/>
+        <w:divId w:val="352536562"/>
         <w:rPr>
           <w:rFonts w:ascii="Plus Jakarta Sans" w:eastAsia="Times New Roman" w:hAnsi="Plus Jakarta Sans"/>
           <w:sz w:val="21"/>
@@ -2423,7 +2423,7 @@
     <w:p>
       <w:pPr>
         <w:pStyle w:val="Ttulo3"/>
-        <w:divId w:val="1098213800"/>
+        <w:divId w:val="352536562"/>
         <w:rPr>
           <w:rFonts w:eastAsia="Times New Roman"/>
           <w:lang w:val="es-ES"/>
@@ -2440,7 +2440,7 @@
     <w:p>
       <w:pPr>
         <w:jc w:val="center"/>
-        <w:divId w:val="1417828057"/>
+        <w:divId w:val="458959302"/>
         <w:rPr>
           <w:rFonts w:ascii="Outfit" w:eastAsia="Times New Roman" w:hAnsi="Outfit"/>
           <w:b/>
@@ -2469,7 +2469,7 @@
     <w:p>
       <w:pPr>
         <w:jc w:val="center"/>
-        <w:divId w:val="1711148982"/>
+        <w:divId w:val="420680183"/>
         <w:rPr>
           <w:rFonts w:ascii="Plus Jakarta Sans" w:eastAsia="Times New Roman" w:hAnsi="Plus Jakarta Sans"/>
           <w:lang w:val="es-ES"/>
@@ -2864,7 +2864,7 @@
     <w:p>
       <w:pPr>
         <w:spacing w:before="450" w:after="450"/>
-        <w:divId w:val="1098213800"/>
+        <w:divId w:val="352536562"/>
         <w:rPr>
           <w:rFonts w:ascii="Plus Jakarta Sans" w:eastAsia="Times New Roman" w:hAnsi="Plus Jakarta Sans"/>
           <w:lang w:val="es-ES"/>
@@ -2883,7 +2883,7 @@
     <w:p>
       <w:pPr>
         <w:pStyle w:val="Ttulo3"/>
-        <w:divId w:val="1098213800"/>
+        <w:divId w:val="352536562"/>
         <w:rPr>
           <w:rFonts w:eastAsia="Times New Roman"/>
           <w:lang w:val="es-ES"/>
@@ -2900,7 +2900,7 @@
     <w:p>
       <w:pPr>
         <w:pStyle w:val="NormalWeb"/>
-        <w:divId w:val="1098213800"/>
+        <w:divId w:val="352536562"/>
         <w:rPr>
           <w:rFonts w:ascii="Plus Jakarta Sans" w:hAnsi="Plus Jakarta Sans"/>
           <w:lang w:val="es-ES"/>
@@ -2933,7 +2933,7 @@
       </w:tblGrid>
       <w:tr>
         <w:trPr>
-          <w:divId w:val="1507594481"/>
+          <w:divId w:val="1283077250"/>
           <w:tblHeader/>
         </w:trPr>
         <w:tc>
@@ -3087,7 +3087,7 @@
       </w:tr>
       <w:tr>
         <w:trPr>
-          <w:divId w:val="1507594481"/>
+          <w:divId w:val="1283077250"/>
         </w:trPr>
         <w:tc>
           <w:tcPr>
@@ -3221,7 +3221,7 @@
       </w:tr>
       <w:tr>
         <w:trPr>
-          <w:divId w:val="1507594481"/>
+          <w:divId w:val="1283077250"/>
         </w:trPr>
         <w:tc>
           <w:tcPr>
@@ -3355,7 +3355,7 @@
       </w:tr>
       <w:tr>
         <w:trPr>
-          <w:divId w:val="1507594481"/>
+          <w:divId w:val="1283077250"/>
         </w:trPr>
         <w:tc>
           <w:tcPr>
@@ -3489,7 +3489,7 @@
       </w:tr>
       <w:tr>
         <w:trPr>
-          <w:divId w:val="1507594481"/>
+          <w:divId w:val="1283077250"/>
         </w:trPr>
         <w:tc>
           <w:tcPr>
@@ -3623,7 +3623,7 @@
       </w:tr>
       <w:tr>
         <w:trPr>
-          <w:divId w:val="1507594481"/>
+          <w:divId w:val="1283077250"/>
         </w:trPr>
         <w:tc>
           <w:tcPr>
@@ -3757,7 +3757,7 @@
       </w:tr>
       <w:tr>
         <w:trPr>
-          <w:divId w:val="1507594481"/>
+          <w:divId w:val="1283077250"/>
         </w:trPr>
         <w:tc>
           <w:tcPr>
@@ -3893,7 +3893,7 @@
     <w:p>
       <w:pPr>
         <w:pStyle w:val="Ttulo3"/>
-        <w:divId w:val="1098213800"/>
+        <w:divId w:val="352536562"/>
         <w:rPr>
           <w:rFonts w:eastAsia="Times New Roman"/>
           <w:lang w:val="es-ES"/>
@@ -3910,7 +3910,7 @@
     <w:p>
       <w:pPr>
         <w:jc w:val="center"/>
-        <w:divId w:val="139810900"/>
+        <w:divId w:val="2047096783"/>
         <w:rPr>
           <w:rFonts w:ascii="Outfit" w:eastAsia="Times New Roman" w:hAnsi="Outfit"/>
           <w:b/>
@@ -3939,7 +3939,7 @@
     <w:p>
       <w:pPr>
         <w:jc w:val="center"/>
-        <w:divId w:val="1008679623"/>
+        <w:divId w:val="158742085"/>
         <w:rPr>
           <w:rFonts w:ascii="Plus Jakarta Sans" w:eastAsia="Times New Roman" w:hAnsi="Plus Jakarta Sans"/>
           <w:lang w:val="es-ES"/>
@@ -4313,7 +4313,7 @@
     <w:p>
       <w:pPr>
         <w:spacing w:before="450" w:after="450"/>
-        <w:divId w:val="1098213800"/>
+        <w:divId w:val="352536562"/>
         <w:rPr>
           <w:rFonts w:ascii="Plus Jakarta Sans" w:eastAsia="Times New Roman" w:hAnsi="Plus Jakarta Sans"/>
           <w:lang w:val="es-ES"/>
@@ -4333,7 +4333,7 @@
     <w:p>
       <w:pPr>
         <w:pStyle w:val="Ttulo3"/>
-        <w:divId w:val="1098213800"/>
+        <w:divId w:val="352536562"/>
         <w:rPr>
           <w:rFonts w:eastAsia="Times New Roman"/>
           <w:lang w:val="es-ES"/>
@@ -4350,7 +4350,7 @@
     <w:p>
       <w:pPr>
         <w:pStyle w:val="NormalWeb"/>
-        <w:divId w:val="1098213800"/>
+        <w:divId w:val="352536562"/>
         <w:rPr>
           <w:rFonts w:ascii="Plus Jakarta Sans" w:hAnsi="Plus Jakarta Sans"/>
           <w:lang w:val="es-ES"/>
@@ -4372,7 +4372,7 @@
         </w:numPr>
         <w:spacing w:before="100" w:beforeAutospacing="1" w:after="90"/>
         <w:ind w:left="1020"/>
-        <w:divId w:val="1098213800"/>
+        <w:divId w:val="352536562"/>
         <w:rPr>
           <w:rFonts w:ascii="Plus Jakarta Sans" w:eastAsia="Times New Roman" w:hAnsi="Plus Jakarta Sans"/>
           <w:sz w:val="21"/>
@@ -4408,7 +4408,7 @@
         </w:numPr>
         <w:spacing w:before="100" w:beforeAutospacing="1" w:after="90"/>
         <w:ind w:left="1020"/>
-        <w:divId w:val="1098213800"/>
+        <w:divId w:val="352536562"/>
         <w:rPr>
           <w:rFonts w:ascii="Plus Jakarta Sans" w:eastAsia="Times New Roman" w:hAnsi="Plus Jakarta Sans"/>
           <w:sz w:val="21"/>
@@ -4453,7 +4453,7 @@
         </w:numPr>
         <w:spacing w:before="100" w:beforeAutospacing="1" w:after="90"/>
         <w:ind w:left="1020"/>
-        <w:divId w:val="1098213800"/>
+        <w:divId w:val="352536562"/>
         <w:rPr>
           <w:rFonts w:ascii="Plus Jakarta Sans" w:eastAsia="Times New Roman" w:hAnsi="Plus Jakarta Sans"/>
           <w:sz w:val="21"/>
@@ -4498,7 +4498,7 @@
         </w:numPr>
         <w:spacing w:before="100" w:beforeAutospacing="1" w:after="90"/>
         <w:ind w:left="1020"/>
-        <w:divId w:val="1098213800"/>
+        <w:divId w:val="352536562"/>
         <w:rPr>
           <w:rFonts w:ascii="Plus Jakarta Sans" w:eastAsia="Times New Roman" w:hAnsi="Plus Jakarta Sans"/>
           <w:sz w:val="21"/>
@@ -4554,7 +4554,7 @@
       </w:tblGrid>
       <w:tr>
         <w:trPr>
-          <w:divId w:val="1913540566"/>
+          <w:divId w:val="1116220387"/>
           <w:tblHeader/>
         </w:trPr>
         <w:tc>
@@ -4708,7 +4708,7 @@
       </w:tr>
       <w:tr>
         <w:trPr>
-          <w:divId w:val="1913540566"/>
+          <w:divId w:val="1116220387"/>
         </w:trPr>
         <w:tc>
           <w:tcPr>
@@ -4834,7 +4834,7 @@
       </w:tr>
       <w:tr>
         <w:trPr>
-          <w:divId w:val="1913540566"/>
+          <w:divId w:val="1116220387"/>
         </w:trPr>
         <w:tc>
           <w:tcPr>
@@ -4960,7 +4960,7 @@
       </w:tr>
       <w:tr>
         <w:trPr>
-          <w:divId w:val="1913540566"/>
+          <w:divId w:val="1116220387"/>
         </w:trPr>
         <w:tc>
           <w:tcPr>
@@ -5086,7 +5086,7 @@
       </w:tr>
       <w:tr>
         <w:trPr>
-          <w:divId w:val="1913540566"/>
+          <w:divId w:val="1116220387"/>
         </w:trPr>
         <w:tc>
           <w:tcPr>
@@ -5214,7 +5214,7 @@
     <w:p>
       <w:pPr>
         <w:spacing w:before="450" w:after="450"/>
-        <w:divId w:val="1098213800"/>
+        <w:divId w:val="352536562"/>
         <w:rPr>
           <w:rFonts w:ascii="Plus Jakarta Sans" w:eastAsia="Times New Roman" w:hAnsi="Plus Jakarta Sans"/>
           <w:lang w:val="es-ES"/>
@@ -5233,7 +5233,7 @@
     <w:p>
       <w:pPr>
         <w:pStyle w:val="Ttulo3"/>
-        <w:divId w:val="1098213800"/>
+        <w:divId w:val="352536562"/>
         <w:rPr>
           <w:rFonts w:eastAsia="Times New Roman"/>
           <w:lang w:val="es-ES"/>
@@ -5250,7 +5250,7 @@
     <w:p>
       <w:pPr>
         <w:pStyle w:val="NormalWeb"/>
-        <w:divId w:val="1098213800"/>
+        <w:divId w:val="352536562"/>
         <w:rPr>
           <w:rFonts w:ascii="Plus Jakarta Sans" w:hAnsi="Plus Jakarta Sans"/>
           <w:lang w:val="es-ES"/>
@@ -5274,7 +5274,7 @@
     <w:p>
       <w:pPr>
         <w:pStyle w:val="Ttulo4"/>
-        <w:divId w:val="1098213800"/>
+        <w:divId w:val="352536562"/>
         <w:rPr>
           <w:rFonts w:eastAsia="Times New Roman"/>
           <w:lang w:val="es-ES"/>
@@ -5291,7 +5291,7 @@
     <w:p>
       <w:pPr>
         <w:jc w:val="center"/>
-        <w:divId w:val="1866940417"/>
+        <w:divId w:val="674114649"/>
         <w:rPr>
           <w:rFonts w:ascii="Outfit" w:eastAsia="Times New Roman" w:hAnsi="Outfit"/>
           <w:b/>
@@ -5320,7 +5320,7 @@
     <w:p>
       <w:pPr>
         <w:jc w:val="center"/>
-        <w:divId w:val="1972056375"/>
+        <w:divId w:val="2049377079"/>
         <w:rPr>
           <w:rFonts w:ascii="Plus Jakarta Sans" w:eastAsia="Times New Roman" w:hAnsi="Plus Jakarta Sans"/>
           <w:lang w:val="es-ES"/>
@@ -5603,7 +5603,7 @@
     <w:p>
       <w:pPr>
         <w:pStyle w:val="Ttulo4"/>
-        <w:divId w:val="1098213800"/>
+        <w:divId w:val="352536562"/>
         <w:rPr>
           <w:rFonts w:eastAsia="Times New Roman"/>
           <w:lang w:val="es-ES"/>
@@ -5627,7 +5627,7 @@
     <w:p>
       <w:pPr>
         <w:jc w:val="center"/>
-        <w:divId w:val="318312967"/>
+        <w:divId w:val="1506244056"/>
         <w:rPr>
           <w:rFonts w:ascii="Outfit" w:eastAsia="Times New Roman" w:hAnsi="Outfit"/>
           <w:b/>
@@ -5656,7 +5656,7 @@
     <w:p>
       <w:pPr>
         <w:jc w:val="center"/>
-        <w:divId w:val="485126657"/>
+        <w:divId w:val="417142120"/>
         <w:rPr>
           <w:rFonts w:ascii="Plus Jakarta Sans" w:eastAsia="Times New Roman" w:hAnsi="Plus Jakarta Sans"/>
           <w:lang w:val="es-ES"/>
@@ -5974,7 +5974,7 @@
     <w:p>
       <w:pPr>
         <w:pStyle w:val="Ttulo4"/>
-        <w:divId w:val="1098213800"/>
+        <w:divId w:val="352536562"/>
         <w:rPr>
           <w:rFonts w:eastAsia="Times New Roman"/>
           <w:lang w:val="es-ES"/>
@@ -5992,7 +5992,7 @@
     <w:p>
       <w:pPr>
         <w:jc w:val="center"/>
-        <w:divId w:val="1123960460"/>
+        <w:divId w:val="943923399"/>
         <w:rPr>
           <w:rFonts w:ascii="Outfit" w:eastAsia="Times New Roman" w:hAnsi="Outfit"/>
           <w:b/>
@@ -6021,7 +6021,7 @@
     <w:p>
       <w:pPr>
         <w:jc w:val="center"/>
-        <w:divId w:val="394209785"/>
+        <w:divId w:val="231042764"/>
         <w:rPr>
           <w:rFonts w:ascii="Plus Jakarta Sans" w:eastAsia="Times New Roman" w:hAnsi="Plus Jakarta Sans"/>
           <w:lang w:val="es-ES"/>
@@ -6325,7 +6325,7 @@
     <w:p>
       <w:pPr>
         <w:spacing w:before="450" w:after="450"/>
-        <w:divId w:val="1098213800"/>
+        <w:divId w:val="352536562"/>
         <w:rPr>
           <w:rFonts w:ascii="Plus Jakarta Sans" w:eastAsia="Times New Roman" w:hAnsi="Plus Jakarta Sans"/>
           <w:lang w:val="es-ES"/>
@@ -6344,7 +6344,7 @@
     <w:p>
       <w:pPr>
         <w:pStyle w:val="Ttulo3"/>
-        <w:divId w:val="1098213800"/>
+        <w:divId w:val="352536562"/>
         <w:rPr>
           <w:rFonts w:eastAsia="Times New Roman"/>
           <w:lang w:val="es-ES"/>
@@ -6361,7 +6361,7 @@
     <w:p>
       <w:pPr>
         <w:pStyle w:val="NormalWeb"/>
-        <w:divId w:val="1098213800"/>
+        <w:divId w:val="352536562"/>
         <w:rPr>
           <w:rFonts w:ascii="Plus Jakarta Sans" w:hAnsi="Plus Jakarta Sans"/>
           <w:lang w:val="es-ES"/>
@@ -6385,7 +6385,7 @@
     <w:p>
       <w:pPr>
         <w:pStyle w:val="Ttulo4"/>
-        <w:divId w:val="1098213800"/>
+        <w:divId w:val="352536562"/>
         <w:rPr>
           <w:rFonts w:eastAsia="Times New Roman"/>
           <w:lang w:val="es-ES"/>
@@ -6402,7 +6402,7 @@
     <w:p>
       <w:pPr>
         <w:pStyle w:val="NormalWeb"/>
-        <w:divId w:val="1098213800"/>
+        <w:divId w:val="352536562"/>
         <w:rPr>
           <w:rFonts w:ascii="Plus Jakarta Sans" w:hAnsi="Plus Jakarta Sans"/>
           <w:lang w:val="es-ES"/>
@@ -6433,7 +6433,7 @@
       </w:tblGrid>
       <w:tr>
         <w:trPr>
-          <w:divId w:val="526142459"/>
+          <w:divId w:val="116293211"/>
           <w:tblHeader/>
         </w:trPr>
         <w:tc>
@@ -6513,7 +6513,7 @@
       </w:tr>
       <w:tr>
         <w:trPr>
-          <w:divId w:val="526142459"/>
+          <w:divId w:val="116293211"/>
         </w:trPr>
         <w:tc>
           <w:tcPr>
@@ -6602,7 +6602,7 @@
     <w:p>
       <w:pPr>
         <w:pStyle w:val="Ttulo4"/>
-        <w:divId w:val="1098213800"/>
+        <w:divId w:val="352536562"/>
         <w:rPr>
           <w:rFonts w:eastAsia="Times New Roman"/>
           <w:lang w:val="es-ES"/>
@@ -6619,7 +6619,7 @@
     <w:p>
       <w:pPr>
         <w:pStyle w:val="NormalWeb"/>
-        <w:divId w:val="1098213800"/>
+        <w:divId w:val="352536562"/>
         <w:rPr>
           <w:rFonts w:ascii="Plus Jakarta Sans" w:hAnsi="Plus Jakarta Sans"/>
           <w:lang w:val="es-ES"/>
@@ -6650,7 +6650,7 @@
       </w:tblGrid>
       <w:tr>
         <w:trPr>
-          <w:divId w:val="1973368147"/>
+          <w:divId w:val="157964385"/>
           <w:tblHeader/>
         </w:trPr>
         <w:tc>
@@ -6730,7 +6730,7 @@
       </w:tr>
       <w:tr>
         <w:trPr>
-          <w:divId w:val="1973368147"/>
+          <w:divId w:val="157964385"/>
         </w:trPr>
         <w:tc>
           <w:tcPr>
@@ -6828,7 +6828,7 @@
     <w:p>
       <w:pPr>
         <w:pStyle w:val="Ttulo4"/>
-        <w:divId w:val="1098213800"/>
+        <w:divId w:val="352536562"/>
         <w:rPr>
           <w:rFonts w:eastAsia="Times New Roman"/>
           <w:lang w:val="es-ES"/>
@@ -6845,7 +6845,7 @@
     <w:p>
       <w:pPr>
         <w:pStyle w:val="NormalWeb"/>
-        <w:divId w:val="1098213800"/>
+        <w:divId w:val="352536562"/>
         <w:rPr>
           <w:rFonts w:ascii="Plus Jakarta Sans" w:hAnsi="Plus Jakarta Sans"/>
           <w:lang w:val="es-ES"/>
@@ -6876,7 +6876,7 @@
       </w:tblGrid>
       <w:tr>
         <w:trPr>
-          <w:divId w:val="2064718757"/>
+          <w:divId w:val="647587675"/>
           <w:tblHeader/>
         </w:trPr>
         <w:tc>
@@ -6957,7 +6957,7 @@
       </w:tr>
       <w:tr>
         <w:trPr>
-          <w:divId w:val="2064718757"/>
+          <w:divId w:val="647587675"/>
         </w:trPr>
         <w:tc>
           <w:tcPr>
@@ -7046,7 +7046,7 @@
     <w:p>
       <w:pPr>
         <w:spacing w:before="450" w:after="450"/>
-        <w:divId w:val="1098213800"/>
+        <w:divId w:val="352536562"/>
         <w:rPr>
           <w:rFonts w:ascii="Plus Jakarta Sans" w:eastAsia="Times New Roman" w:hAnsi="Plus Jakarta Sans"/>
           <w:lang w:val="es-ES"/>
@@ -7065,7 +7065,7 @@
     <w:p>
       <w:pPr>
         <w:pStyle w:val="Ttulo2"/>
-        <w:divId w:val="1098213800"/>
+        <w:divId w:val="352536562"/>
         <w:rPr>
           <w:rFonts w:eastAsia="Times New Roman"/>
           <w:lang w:val="es-ES"/>
@@ -7082,7 +7082,7 @@
     <w:p>
       <w:pPr>
         <w:pStyle w:val="NormalWeb"/>
-        <w:divId w:val="1098213800"/>
+        <w:divId w:val="352536562"/>
         <w:rPr>
           <w:rFonts w:ascii="Plus Jakarta Sans" w:hAnsi="Plus Jakarta Sans"/>
           <w:lang w:val="es-ES"/>
@@ -7099,7 +7099,7 @@
     <w:p>
       <w:pPr>
         <w:pStyle w:val="Ttulo3"/>
-        <w:divId w:val="1098213800"/>
+        <w:divId w:val="352536562"/>
         <w:rPr>
           <w:rFonts w:eastAsia="Times New Roman"/>
           <w:lang w:val="es-ES"/>
@@ -7116,7 +7116,7 @@
     <w:p>
       <w:pPr>
         <w:pStyle w:val="NormalWeb"/>
-        <w:divId w:val="1098213800"/>
+        <w:divId w:val="352536562"/>
         <w:rPr>
           <w:rFonts w:ascii="Plus Jakarta Sans" w:hAnsi="Plus Jakarta Sans"/>
           <w:lang w:val="es-ES"/>
@@ -7149,7 +7149,7 @@
       </w:tblGrid>
       <w:tr>
         <w:trPr>
-          <w:divId w:val="174926851"/>
+          <w:divId w:val="471601693"/>
           <w:tblHeader/>
         </w:trPr>
         <w:tc>
@@ -7314,7 +7314,7 @@
       </w:tr>
       <w:tr>
         <w:trPr>
-          <w:divId w:val="174926851"/>
+          <w:divId w:val="471601693"/>
         </w:trPr>
         <w:tc>
           <w:tcPr>
@@ -7440,7 +7440,7 @@
       </w:tr>
       <w:tr>
         <w:trPr>
-          <w:divId w:val="174926851"/>
+          <w:divId w:val="471601693"/>
         </w:trPr>
         <w:tc>
           <w:tcPr>
@@ -7566,7 +7566,7 @@
       </w:tr>
       <w:tr>
         <w:trPr>
-          <w:divId w:val="174926851"/>
+          <w:divId w:val="471601693"/>
         </w:trPr>
         <w:tc>
           <w:tcPr>
@@ -7692,7 +7692,7 @@
       </w:tr>
       <w:tr>
         <w:trPr>
-          <w:divId w:val="174926851"/>
+          <w:divId w:val="471601693"/>
         </w:trPr>
         <w:tc>
           <w:tcPr>
@@ -7820,7 +7820,7 @@
     <w:p>
       <w:pPr>
         <w:pStyle w:val="Ttulo3"/>
-        <w:divId w:val="1098213800"/>
+        <w:divId w:val="352536562"/>
         <w:rPr>
           <w:rFonts w:eastAsia="Times New Roman"/>
           <w:lang w:val="es-ES"/>
@@ -7838,7 +7838,7 @@
       <w:pPr>
         <w:spacing w:before="375" w:after="225"/>
         <w:jc w:val="center"/>
-        <w:divId w:val="290020157"/>
+        <w:divId w:val="2013140033"/>
         <w:rPr>
           <w:rFonts w:ascii="Outfit" w:eastAsia="Times New Roman" w:hAnsi="Outfit"/>
           <w:b/>
@@ -7868,7 +7868,7 @@
       <w:pPr>
         <w:spacing w:after="375"/>
         <w:jc w:val="center"/>
-        <w:divId w:val="1526210711"/>
+        <w:divId w:val="269633010"/>
         <w:rPr>
           <w:rFonts w:ascii="Plus Jakarta Sans" w:eastAsia="Times New Roman" w:hAnsi="Plus Jakarta Sans"/>
           <w:lang w:val="es-ES"/>
@@ -8235,7 +8235,7 @@
     <w:p>
       <w:pPr>
         <w:pStyle w:val="Ttulo3"/>
-        <w:divId w:val="1098213800"/>
+        <w:divId w:val="352536562"/>
         <w:rPr>
           <w:rFonts w:eastAsia="Times New Roman"/>
           <w:lang w:val="es-ES"/>
@@ -8259,7 +8259,7 @@
     <w:p>
       <w:pPr>
         <w:pStyle w:val="NormalWeb"/>
-        <w:divId w:val="1098213800"/>
+        <w:divId w:val="352536562"/>
         <w:rPr>
           <w:rFonts w:ascii="Plus Jakarta Sans" w:hAnsi="Plus Jakarta Sans"/>
           <w:lang w:val="es-ES"/>
@@ -8281,7 +8281,7 @@
         </w:numPr>
         <w:spacing w:before="100" w:beforeAutospacing="1" w:after="90"/>
         <w:ind w:left="1020"/>
-        <w:divId w:val="1098213800"/>
+        <w:divId w:val="352536562"/>
         <w:rPr>
           <w:rFonts w:ascii="Plus Jakarta Sans" w:eastAsia="Times New Roman" w:hAnsi="Plus Jakarta Sans"/>
           <w:sz w:val="21"/>
@@ -8317,7 +8317,7 @@
         </w:numPr>
         <w:spacing w:before="100" w:beforeAutospacing="1" w:after="90"/>
         <w:ind w:left="1020"/>
-        <w:divId w:val="1098213800"/>
+        <w:divId w:val="352536562"/>
         <w:rPr>
           <w:rFonts w:ascii="Plus Jakarta Sans" w:eastAsia="Times New Roman" w:hAnsi="Plus Jakarta Sans"/>
           <w:sz w:val="21"/>
@@ -8362,7 +8362,7 @@
         </w:numPr>
         <w:spacing w:before="100" w:beforeAutospacing="1" w:after="90"/>
         <w:ind w:left="1020"/>
-        <w:divId w:val="1098213800"/>
+        <w:divId w:val="352536562"/>
         <w:rPr>
           <w:rFonts w:ascii="Plus Jakarta Sans" w:eastAsia="Times New Roman" w:hAnsi="Plus Jakarta Sans"/>
           <w:sz w:val="21"/>
@@ -8416,7 +8416,7 @@
         </w:numPr>
         <w:spacing w:before="100" w:beforeAutospacing="1" w:after="90"/>
         <w:ind w:left="1020"/>
-        <w:divId w:val="1098213800"/>
+        <w:divId w:val="352536562"/>
         <w:rPr>
           <w:rFonts w:ascii="Plus Jakarta Sans" w:eastAsia="Times New Roman" w:hAnsi="Plus Jakarta Sans"/>
           <w:sz w:val="21"/>
@@ -8461,7 +8461,7 @@
         </w:numPr>
         <w:spacing w:before="100" w:beforeAutospacing="1" w:after="90"/>
         <w:ind w:left="1020"/>
-        <w:divId w:val="1098213800"/>
+        <w:divId w:val="352536562"/>
         <w:rPr>
           <w:rFonts w:ascii="Plus Jakarta Sans" w:eastAsia="Times New Roman" w:hAnsi="Plus Jakarta Sans"/>
           <w:sz w:val="21"/>
@@ -8497,7 +8497,7 @@
         </w:numPr>
         <w:spacing w:before="100" w:beforeAutospacing="1" w:after="90"/>
         <w:ind w:left="1020"/>
-        <w:divId w:val="1098213800"/>
+        <w:divId w:val="352536562"/>
         <w:rPr>
           <w:rFonts w:ascii="Plus Jakarta Sans" w:eastAsia="Times New Roman" w:hAnsi="Plus Jakarta Sans"/>
           <w:sz w:val="21"/>
@@ -8542,7 +8542,7 @@
         </w:numPr>
         <w:spacing w:before="100" w:beforeAutospacing="1" w:after="90"/>
         <w:ind w:left="1020"/>
-        <w:divId w:val="1098213800"/>
+        <w:divId w:val="352536562"/>
         <w:rPr>
           <w:rFonts w:ascii="Plus Jakarta Sans" w:eastAsia="Times New Roman" w:hAnsi="Plus Jakarta Sans"/>
           <w:sz w:val="21"/>
@@ -8587,7 +8587,7 @@
         </w:numPr>
         <w:spacing w:before="100" w:beforeAutospacing="1" w:after="90"/>
         <w:ind w:left="1020"/>
-        <w:divId w:val="1098213800"/>
+        <w:divId w:val="352536562"/>
         <w:rPr>
           <w:rFonts w:ascii="Plus Jakarta Sans" w:eastAsia="Times New Roman" w:hAnsi="Plus Jakarta Sans"/>
           <w:sz w:val="21"/>
@@ -8632,7 +8632,7 @@
         </w:numPr>
         <w:spacing w:before="100" w:beforeAutospacing="1" w:after="90"/>
         <w:ind w:left="1020"/>
-        <w:divId w:val="1098213800"/>
+        <w:divId w:val="352536562"/>
         <w:rPr>
           <w:rFonts w:ascii="Plus Jakarta Sans" w:eastAsia="Times New Roman" w:hAnsi="Plus Jakarta Sans"/>
           <w:sz w:val="21"/>
@@ -8668,7 +8668,7 @@
         </w:numPr>
         <w:spacing w:before="100" w:beforeAutospacing="1" w:after="90"/>
         <w:ind w:left="1020"/>
-        <w:divId w:val="1098213800"/>
+        <w:divId w:val="352536562"/>
         <w:rPr>
           <w:rFonts w:ascii="Plus Jakarta Sans" w:eastAsia="Times New Roman" w:hAnsi="Plus Jakarta Sans"/>
           <w:sz w:val="21"/>
@@ -8722,7 +8722,7 @@
         </w:numPr>
         <w:spacing w:before="100" w:beforeAutospacing="1" w:after="90"/>
         <w:ind w:left="1020"/>
-        <w:divId w:val="1098213800"/>
+        <w:divId w:val="352536562"/>
         <w:rPr>
           <w:rFonts w:ascii="Plus Jakarta Sans" w:eastAsia="Times New Roman" w:hAnsi="Plus Jakarta Sans"/>
           <w:sz w:val="21"/>
@@ -8767,7 +8767,7 @@
         </w:numPr>
         <w:spacing w:before="100" w:beforeAutospacing="1" w:after="90"/>
         <w:ind w:left="1020"/>
-        <w:divId w:val="1098213800"/>
+        <w:divId w:val="352536562"/>
         <w:rPr>
           <w:rFonts w:ascii="Plus Jakarta Sans" w:eastAsia="Times New Roman" w:hAnsi="Plus Jakarta Sans"/>
           <w:sz w:val="21"/>
@@ -8807,7 +8807,7 @@
     <w:p>
       <w:pPr>
         <w:pStyle w:val="Ttulo3"/>
-        <w:divId w:val="1098213800"/>
+        <w:divId w:val="352536562"/>
         <w:rPr>
           <w:rFonts w:eastAsia="Times New Roman"/>
           <w:lang w:val="es-ES"/>
@@ -8825,7 +8825,7 @@
       <w:pPr>
         <w:spacing w:before="375" w:after="225"/>
         <w:jc w:val="center"/>
-        <w:divId w:val="1153060241"/>
+        <w:divId w:val="2041588286"/>
         <w:rPr>
           <w:rFonts w:ascii="Outfit" w:eastAsia="Times New Roman" w:hAnsi="Outfit"/>
           <w:b/>
@@ -8855,7 +8855,7 @@
       <w:pPr>
         <w:spacing w:after="375"/>
         <w:jc w:val="center"/>
-        <w:divId w:val="1166435549"/>
+        <w:divId w:val="471555047"/>
         <w:rPr>
           <w:rFonts w:ascii="Plus Jakarta Sans" w:eastAsia="Times New Roman" w:hAnsi="Plus Jakarta Sans"/>
           <w:lang w:val="es-ES"/>
@@ -9145,7 +9145,7 @@
     <w:p>
       <w:pPr>
         <w:spacing w:before="450" w:after="450"/>
-        <w:divId w:val="1098213800"/>
+        <w:divId w:val="352536562"/>
         <w:rPr>
           <w:rFonts w:ascii="Plus Jakarta Sans" w:eastAsia="Times New Roman" w:hAnsi="Plus Jakarta Sans"/>
           <w:lang w:val="es-ES"/>
@@ -9164,7 +9164,7 @@
     <w:p>
       <w:pPr>
         <w:pStyle w:val="Ttulo2"/>
-        <w:divId w:val="1098213800"/>
+        <w:divId w:val="352536562"/>
         <w:rPr>
           <w:rFonts w:eastAsia="Times New Roman"/>
           <w:lang w:val="es-ES"/>
@@ -9181,7 +9181,7 @@
     <w:p>
       <w:pPr>
         <w:pStyle w:val="NormalWeb"/>
-        <w:divId w:val="1098213800"/>
+        <w:divId w:val="352536562"/>
         <w:rPr>
           <w:rFonts w:ascii="Plus Jakarta Sans" w:hAnsi="Plus Jakarta Sans"/>
           <w:lang w:val="es-ES"/>
@@ -9198,7 +9198,7 @@
     <w:p>
       <w:pPr>
         <w:pStyle w:val="NormalWeb"/>
-        <w:divId w:val="1098213800"/>
+        <w:divId w:val="352536562"/>
         <w:rPr>
           <w:rFonts w:ascii="Plus Jakarta Sans" w:hAnsi="Plus Jakarta Sans"/>
           <w:lang w:val="es-ES"/>
@@ -9260,7 +9260,7 @@
     <w:p>
       <w:pPr>
         <w:pStyle w:val="NormalWeb"/>
-        <w:divId w:val="1098213800"/>
+        <w:divId w:val="352536562"/>
         <w:rPr>
           <w:rFonts w:ascii="Plus Jakarta Sans" w:hAnsi="Plus Jakarta Sans"/>
           <w:lang w:val="es-ES"/>
@@ -9314,7 +9314,7 @@
     <w:p>
       <w:pPr>
         <w:pStyle w:val="NormalWeb"/>
-        <w:divId w:val="1098213800"/>
+        <w:divId w:val="352536562"/>
         <w:rPr>
           <w:rFonts w:ascii="Plus Jakarta Sans" w:hAnsi="Plus Jakarta Sans"/>
           <w:lang w:val="es-ES"/>
@@ -9375,7 +9375,7 @@
     <w:p>
       <w:pPr>
         <w:pStyle w:val="NormalWeb"/>
-        <w:divId w:val="1098213800"/>
+        <w:divId w:val="352536562"/>
         <w:rPr>
           <w:rFonts w:ascii="Plus Jakarta Sans" w:hAnsi="Plus Jakarta Sans"/>
           <w:lang w:val="es-ES"/>
@@ -9429,7 +9429,7 @@
     <w:p>
       <w:pPr>
         <w:spacing w:before="450" w:after="450"/>
-        <w:divId w:val="1098213800"/>
+        <w:divId w:val="352536562"/>
         <w:rPr>
           <w:rFonts w:ascii="Plus Jakarta Sans" w:eastAsia="Times New Roman" w:hAnsi="Plus Jakarta Sans"/>
           <w:lang w:val="es-ES"/>
@@ -9448,7 +9448,7 @@
     <w:p>
       <w:pPr>
         <w:pStyle w:val="Ttulo2"/>
-        <w:divId w:val="1098213800"/>
+        <w:divId w:val="352536562"/>
         <w:rPr>
           <w:rFonts w:eastAsia="Times New Roman"/>
           <w:lang w:val="es-ES"/>
@@ -9465,7 +9465,7 @@
     <w:p>
       <w:pPr>
         <w:pStyle w:val="NormalWeb"/>
-        <w:divId w:val="1098213800"/>
+        <w:divId w:val="352536562"/>
         <w:rPr>
           <w:rFonts w:ascii="Plus Jakarta Sans" w:hAnsi="Plus Jakarta Sans"/>
           <w:lang w:val="es-ES"/>
@@ -9504,7 +9504,7 @@
     <w:p>
       <w:pPr>
         <w:pStyle w:val="Ttulo3"/>
-        <w:divId w:val="1098213800"/>
+        <w:divId w:val="352536562"/>
         <w:rPr>
           <w:rFonts w:eastAsia="Times New Roman"/>
           <w:lang w:val="es-ES"/>
@@ -9538,7 +9538,7 @@
       </w:tblGrid>
       <w:tr>
         <w:trPr>
-          <w:divId w:val="280652846"/>
+          <w:divId w:val="1057630465"/>
           <w:tblHeader/>
         </w:trPr>
         <w:tc>
@@ -9729,7 +9729,7 @@
       </w:tr>
       <w:tr>
         <w:trPr>
-          <w:divId w:val="280652846"/>
+          <w:divId w:val="1057630465"/>
         </w:trPr>
         <w:tc>
           <w:tcPr>
@@ -9885,7 +9885,7 @@
       </w:tr>
       <w:tr>
         <w:trPr>
-          <w:divId w:val="280652846"/>
+          <w:divId w:val="1057630465"/>
         </w:trPr>
         <w:tc>
           <w:tcPr>
@@ -10041,7 +10041,7 @@
       </w:tr>
       <w:tr>
         <w:trPr>
-          <w:divId w:val="280652846"/>
+          <w:divId w:val="1057630465"/>
         </w:trPr>
         <w:tc>
           <w:tcPr>
@@ -10197,7 +10197,7 @@
       </w:tr>
       <w:tr>
         <w:trPr>
-          <w:divId w:val="280652846"/>
+          <w:divId w:val="1057630465"/>
         </w:trPr>
         <w:tc>
           <w:tcPr>
@@ -10359,7 +10359,7 @@
     <w:p>
       <w:pPr>
         <w:pStyle w:val="Ttulo3"/>
-        <w:divId w:val="1098213800"/>
+        <w:divId w:val="352536562"/>
         <w:rPr>
           <w:rFonts w:eastAsia="Times New Roman"/>
           <w:lang w:val="es-ES"/>
@@ -10393,7 +10393,7 @@
       </w:tblGrid>
       <w:tr>
         <w:trPr>
-          <w:divId w:val="2138792196"/>
+          <w:divId w:val="945696290"/>
           <w:tblHeader/>
         </w:trPr>
         <w:tc>
@@ -10584,7 +10584,7 @@
       </w:tr>
       <w:tr>
         <w:trPr>
-          <w:divId w:val="2138792196"/>
+          <w:divId w:val="945696290"/>
         </w:trPr>
         <w:tc>
           <w:tcPr>
@@ -10741,7 +10741,7 @@
       </w:tr>
       <w:tr>
         <w:trPr>
-          <w:divId w:val="2138792196"/>
+          <w:divId w:val="945696290"/>
         </w:trPr>
         <w:tc>
           <w:tcPr>
@@ -10900,7 +10900,7 @@
     <w:p>
       <w:pPr>
         <w:pStyle w:val="Ttulo3"/>
-        <w:divId w:val="1098213800"/>
+        <w:divId w:val="352536562"/>
         <w:rPr>
           <w:rFonts w:eastAsia="Times New Roman"/>
           <w:lang w:val="es-ES"/>
@@ -10935,7 +10935,7 @@
       </w:tblGrid>
       <w:tr>
         <w:trPr>
-          <w:divId w:val="871921341"/>
+          <w:divId w:val="1829591070"/>
           <w:tblHeader/>
         </w:trPr>
         <w:tc>
@@ -11163,7 +11163,7 @@
       </w:tr>
       <w:tr>
         <w:trPr>
-          <w:divId w:val="871921341"/>
+          <w:divId w:val="1829591070"/>
         </w:trPr>
         <w:tc>
           <w:tcPr>
@@ -11359,7 +11359,7 @@
       </w:tr>
       <w:tr>
         <w:trPr>
-          <w:divId w:val="871921341"/>
+          <w:divId w:val="1829591070"/>
         </w:trPr>
         <w:tc>
           <w:tcPr>
@@ -11544,7 +11544,7 @@
       </w:tr>
       <w:tr>
         <w:trPr>
-          <w:divId w:val="871921341"/>
+          <w:divId w:val="1829591070"/>
         </w:trPr>
         <w:tc>
           <w:tcPr>
@@ -11742,7 +11742,7 @@
     <w:p>
       <w:pPr>
         <w:pStyle w:val="Ttulo4"/>
-        <w:divId w:val="1098213800"/>
+        <w:divId w:val="352536562"/>
         <w:rPr>
           <w:rFonts w:eastAsia="Times New Roman"/>
           <w:lang w:val="es-ES"/>
@@ -11760,7 +11760,7 @@
       <w:pPr>
         <w:spacing w:before="375" w:after="225"/>
         <w:jc w:val="center"/>
-        <w:divId w:val="1403988895"/>
+        <w:divId w:val="462386693"/>
         <w:rPr>
           <w:rFonts w:ascii="Outfit" w:eastAsia="Times New Roman" w:hAnsi="Outfit"/>
           <w:b/>
@@ -11790,7 +11790,7 @@
       <w:pPr>
         <w:spacing w:after="375"/>
         <w:jc w:val="center"/>
-        <w:divId w:val="2103791336"/>
+        <w:divId w:val="1477720822"/>
         <w:rPr>
           <w:rFonts w:ascii="Plus Jakarta Sans" w:eastAsia="Times New Roman" w:hAnsi="Plus Jakarta Sans"/>
           <w:lang w:val="es-ES"/>
@@ -12185,7 +12185,7 @@
     <w:p>
       <w:pPr>
         <w:pStyle w:val="Ttulo3"/>
-        <w:divId w:val="1098213800"/>
+        <w:divId w:val="352536562"/>
         <w:rPr>
           <w:rFonts w:eastAsia="Times New Roman"/>
           <w:lang w:val="es-ES"/>
@@ -12217,7 +12217,7 @@
       </w:tblGrid>
       <w:tr>
         <w:trPr>
-          <w:divId w:val="1356156820"/>
+          <w:divId w:val="1997999716"/>
           <w:tblHeader/>
         </w:trPr>
         <w:tc>
@@ -12334,7 +12334,7 @@
       </w:tr>
       <w:tr>
         <w:trPr>
-          <w:divId w:val="1356156820"/>
+          <w:divId w:val="1997999716"/>
         </w:trPr>
         <w:tc>
           <w:tcPr>
@@ -12430,7 +12430,7 @@
       </w:tr>
       <w:tr>
         <w:trPr>
-          <w:divId w:val="1356156820"/>
+          <w:divId w:val="1997999716"/>
         </w:trPr>
         <w:tc>
           <w:tcPr>
@@ -12526,7 +12526,7 @@
       </w:tr>
       <w:tr>
         <w:trPr>
-          <w:divId w:val="1356156820"/>
+          <w:divId w:val="1997999716"/>
         </w:trPr>
         <w:tc>
           <w:tcPr>
@@ -12624,7 +12624,7 @@
     <w:p>
       <w:pPr>
         <w:pStyle w:val="NormalWeb"/>
-        <w:divId w:val="1098213800"/>
+        <w:divId w:val="352536562"/>
         <w:rPr>
           <w:rFonts w:ascii="Plus Jakarta Sans" w:hAnsi="Plus Jakarta Sans"/>
           <w:lang w:val="es-ES"/>
@@ -12649,7 +12649,7 @@
     <w:p>
       <w:pPr>
         <w:pStyle w:val="Ttulo3"/>
-        <w:divId w:val="1098213800"/>
+        <w:divId w:val="352536562"/>
         <w:rPr>
           <w:rFonts w:eastAsia="Times New Roman"/>
           <w:lang w:val="es-ES"/>
@@ -12691,7 +12691,7 @@
       </w:tblGrid>
       <w:tr>
         <w:trPr>
-          <w:divId w:val="166210748"/>
+          <w:divId w:val="328480932"/>
           <w:tblHeader/>
         </w:trPr>
         <w:tc>
@@ -12919,7 +12919,7 @@
       </w:tr>
       <w:tr>
         <w:trPr>
-          <w:divId w:val="166210748"/>
+          <w:divId w:val="328480932"/>
         </w:trPr>
         <w:tc>
           <w:tcPr>
@@ -13105,7 +13105,7 @@
       </w:tr>
       <w:tr>
         <w:trPr>
-          <w:divId w:val="166210748"/>
+          <w:divId w:val="328480932"/>
         </w:trPr>
         <w:tc>
           <w:tcPr>
@@ -13291,7 +13291,7 @@
       </w:tr>
       <w:tr>
         <w:trPr>
-          <w:divId w:val="166210748"/>
+          <w:divId w:val="328480932"/>
         </w:trPr>
         <w:tc>
           <w:tcPr>
@@ -13477,7 +13477,7 @@
       </w:tr>
       <w:tr>
         <w:trPr>
-          <w:divId w:val="166210748"/>
+          <w:divId w:val="328480932"/>
         </w:trPr>
         <w:tc>
           <w:tcPr>
@@ -13670,7 +13670,7 @@
     <w:p>
       <w:pPr>
         <w:pStyle w:val="NormalWeb"/>
-        <w:divId w:val="1098213800"/>
+        <w:divId w:val="352536562"/>
         <w:rPr>
           <w:rFonts w:ascii="Plus Jakarta Sans" w:hAnsi="Plus Jakarta Sans"/>
           <w:lang w:val="es-ES"/>
@@ -13717,7 +13717,7 @@
     <w:p>
       <w:pPr>
         <w:pStyle w:val="Ttulo3"/>
-        <w:divId w:val="1098213800"/>
+        <w:divId w:val="352536562"/>
         <w:rPr>
           <w:rFonts w:eastAsia="Times New Roman"/>
           <w:lang w:val="es-ES"/>
@@ -13752,7 +13752,7 @@
       </w:tblGrid>
       <w:tr>
         <w:trPr>
-          <w:divId w:val="646279088"/>
+          <w:divId w:val="1733188543"/>
           <w:tblHeader/>
         </w:trPr>
         <w:tc>
@@ -13980,7 +13980,7 @@
       </w:tr>
       <w:tr>
         <w:trPr>
-          <w:divId w:val="646279088"/>
+          <w:divId w:val="1733188543"/>
         </w:trPr>
         <w:tc>
           <w:tcPr>
@@ -14174,7 +14174,7 @@
       </w:tr>
       <w:tr>
         <w:trPr>
-          <w:divId w:val="646279088"/>
+          <w:divId w:val="1733188543"/>
         </w:trPr>
         <w:tc>
           <w:tcPr>
@@ -14370,7 +14370,7 @@
     <w:p>
       <w:pPr>
         <w:pStyle w:val="Ttulo4"/>
-        <w:divId w:val="1098213800"/>
+        <w:divId w:val="352536562"/>
         <w:rPr>
           <w:rFonts w:eastAsia="Times New Roman"/>
           <w:lang w:val="es-ES"/>
@@ -14388,7 +14388,7 @@
       <w:pPr>
         <w:spacing w:before="375" w:after="225"/>
         <w:jc w:val="center"/>
-        <w:divId w:val="1616138124"/>
+        <w:divId w:val="1086927358"/>
         <w:rPr>
           <w:rFonts w:ascii="Outfit" w:eastAsia="Times New Roman" w:hAnsi="Outfit"/>
           <w:b/>
@@ -14418,7 +14418,7 @@
       <w:pPr>
         <w:spacing w:after="375"/>
         <w:jc w:val="center"/>
-        <w:divId w:val="1401174693"/>
+        <w:divId w:val="2132241711"/>
         <w:rPr>
           <w:rFonts w:ascii="Plus Jakarta Sans" w:eastAsia="Times New Roman" w:hAnsi="Plus Jakarta Sans"/>
           <w:lang w:val="es-ES"/>
@@ -14806,7 +14806,7 @@
     <w:p>
       <w:pPr>
         <w:pStyle w:val="Ttulo3"/>
-        <w:divId w:val="1098213800"/>
+        <w:divId w:val="352536562"/>
         <w:rPr>
           <w:rFonts w:eastAsia="Times New Roman"/>
           <w:lang w:val="es-ES"/>
@@ -14840,7 +14840,7 @@
       </w:tblGrid>
       <w:tr>
         <w:trPr>
-          <w:divId w:val="417021110"/>
+          <w:divId w:val="837380940"/>
           <w:tblHeader/>
         </w:trPr>
         <w:tc>
@@ -15031,7 +15031,7 @@
       </w:tr>
       <w:tr>
         <w:trPr>
-          <w:divId w:val="417021110"/>
+          <w:divId w:val="837380940"/>
         </w:trPr>
         <w:tc>
           <w:tcPr>
@@ -15187,7 +15187,7 @@
       </w:tr>
       <w:tr>
         <w:trPr>
-          <w:divId w:val="417021110"/>
+          <w:divId w:val="837380940"/>
         </w:trPr>
         <w:tc>
           <w:tcPr>
@@ -15343,7 +15343,7 @@
       </w:tr>
       <w:tr>
         <w:trPr>
-          <w:divId w:val="417021110"/>
+          <w:divId w:val="837380940"/>
         </w:trPr>
         <w:tc>
           <w:tcPr>
@@ -15499,7 +15499,7 @@
       </w:tr>
       <w:tr>
         <w:trPr>
-          <w:divId w:val="417021110"/>
+          <w:divId w:val="837380940"/>
         </w:trPr>
         <w:tc>
           <w:tcPr>
@@ -15655,7 +15655,7 @@
       </w:tr>
       <w:tr>
         <w:trPr>
-          <w:divId w:val="417021110"/>
+          <w:divId w:val="837380940"/>
         </w:trPr>
         <w:tc>
           <w:tcPr>
@@ -15811,7 +15811,7 @@
       </w:tr>
       <w:tr>
         <w:trPr>
-          <w:divId w:val="417021110"/>
+          <w:divId w:val="837380940"/>
         </w:trPr>
         <w:tc>
           <w:tcPr>
@@ -15969,7 +15969,7 @@
     <w:p>
       <w:pPr>
         <w:pStyle w:val="Ttulo3"/>
-        <w:divId w:val="1098213800"/>
+        <w:divId w:val="352536562"/>
         <w:rPr>
           <w:rFonts w:eastAsia="Times New Roman"/>
           <w:lang w:val="es-ES"/>
@@ -16003,7 +16003,7 @@
       </w:tblGrid>
       <w:tr>
         <w:trPr>
-          <w:divId w:val="927620462"/>
+          <w:divId w:val="984436155"/>
           <w:tblHeader/>
         </w:trPr>
         <w:tc>
@@ -16194,7 +16194,7 @@
       </w:tr>
       <w:tr>
         <w:trPr>
-          <w:divId w:val="927620462"/>
+          <w:divId w:val="984436155"/>
         </w:trPr>
         <w:tc>
           <w:tcPr>
@@ -16350,7 +16350,7 @@
       </w:tr>
       <w:tr>
         <w:trPr>
-          <w:divId w:val="927620462"/>
+          <w:divId w:val="984436155"/>
         </w:trPr>
         <w:tc>
           <w:tcPr>
@@ -16506,7 +16506,7 @@
       </w:tr>
       <w:tr>
         <w:trPr>
-          <w:divId w:val="927620462"/>
+          <w:divId w:val="984436155"/>
         </w:trPr>
         <w:tc>
           <w:tcPr>
@@ -16662,7 +16662,7 @@
       </w:tr>
       <w:tr>
         <w:trPr>
-          <w:divId w:val="927620462"/>
+          <w:divId w:val="984436155"/>
         </w:trPr>
         <w:tc>
           <w:tcPr>
@@ -16818,7 +16818,7 @@
       </w:tr>
       <w:tr>
         <w:trPr>
-          <w:divId w:val="927620462"/>
+          <w:divId w:val="984436155"/>
         </w:trPr>
         <w:tc>
           <w:tcPr>
@@ -16976,7 +16976,7 @@
     <w:p>
       <w:pPr>
         <w:pStyle w:val="Ttulo3"/>
-        <w:divId w:val="1098213800"/>
+        <w:divId w:val="352536562"/>
         <w:rPr>
           <w:rFonts w:eastAsia="Times New Roman"/>
           <w:lang w:val="es-ES"/>
@@ -17010,7 +17010,7 @@
       </w:tblGrid>
       <w:tr>
         <w:trPr>
-          <w:divId w:val="822047532"/>
+          <w:divId w:val="206644266"/>
           <w:tblHeader/>
         </w:trPr>
         <w:tc>
@@ -17201,7 +17201,7 @@
       </w:tr>
       <w:tr>
         <w:trPr>
-          <w:divId w:val="822047532"/>
+          <w:divId w:val="206644266"/>
         </w:trPr>
         <w:tc>
           <w:tcPr>
@@ -17357,7 +17357,7 @@
       </w:tr>
       <w:tr>
         <w:trPr>
-          <w:divId w:val="822047532"/>
+          <w:divId w:val="206644266"/>
         </w:trPr>
         <w:tc>
           <w:tcPr>
@@ -17515,7 +17515,7 @@
     <w:p>
       <w:pPr>
         <w:pStyle w:val="Ttulo4"/>
-        <w:divId w:val="1098213800"/>
+        <w:divId w:val="352536562"/>
         <w:rPr>
           <w:rFonts w:eastAsia="Times New Roman"/>
           <w:lang w:val="es-ES"/>
@@ -17533,7 +17533,7 @@
       <w:pPr>
         <w:spacing w:before="375" w:after="225"/>
         <w:jc w:val="center"/>
-        <w:divId w:val="2060015036"/>
+        <w:divId w:val="1708483866"/>
         <w:rPr>
           <w:rFonts w:ascii="Outfit" w:eastAsia="Times New Roman" w:hAnsi="Outfit"/>
           <w:b/>
@@ -17563,7 +17563,7 @@
       <w:pPr>
         <w:spacing w:after="375"/>
         <w:jc w:val="center"/>
-        <w:divId w:val="536940096"/>
+        <w:divId w:val="1136339715"/>
         <w:rPr>
           <w:rFonts w:ascii="Plus Jakarta Sans" w:eastAsia="Times New Roman" w:hAnsi="Plus Jakarta Sans"/>
           <w:lang w:val="es-ES"/>
@@ -17951,7 +17951,7 @@
     <w:p>
       <w:pPr>
         <w:spacing w:before="450" w:after="450"/>
-        <w:divId w:val="1098213800"/>
+        <w:divId w:val="352536562"/>
         <w:rPr>
           <w:rFonts w:ascii="Plus Jakarta Sans" w:eastAsia="Times New Roman" w:hAnsi="Plus Jakarta Sans"/>
           <w:lang w:val="es-ES"/>
@@ -17970,7 +17970,7 @@
     <w:p>
       <w:pPr>
         <w:spacing w:before="450" w:after="450"/>
-        <w:divId w:val="1098213800"/>
+        <w:divId w:val="352536562"/>
         <w:rPr>
           <w:rFonts w:ascii="Plus Jakarta Sans" w:eastAsia="Times New Roman" w:hAnsi="Plus Jakarta Sans"/>
           <w:lang w:val="es-ES"/>
@@ -17989,7 +17989,7 @@
     <w:p>
       <w:pPr>
         <w:pStyle w:val="NormalWeb"/>
-        <w:divId w:val="1098213800"/>
+        <w:divId w:val="352536562"/>
         <w:rPr>
           <w:rFonts w:ascii="Plus Jakarta Sans" w:hAnsi="Plus Jakarta Sans"/>
           <w:lang w:val="es-ES"/>
@@ -18038,9 +18038,9 @@
 <file path=word/numbering.xml><?xml version="1.0" encoding="utf-8"?>
 <w:numbering xmlns:wpc="http://schemas.microsoft.com/office/word/2010/wordprocessingCanvas" xmlns:cx="http://schemas.microsoft.com/office/drawing/2014/chartex" xmlns:cx1="http://schemas.microsoft.com/office/drawing/2015/9/8/chartex" xmlns:cx2="http://schemas.microsoft.com/office/drawing/2015/10/21/chartex" xmlns:cx3="http://schemas.microsoft.com/office/drawing/2016/5/9/chartex" xmlns:cx4="http://schemas.microsoft.com/office/drawing/2016/5/10/chartex" xmlns:cx5="http://schemas.microsoft.com/office/drawing/2016/5/11/chartex" xmlns:cx6="http://schemas.microsoft.com/office/drawing/2016/5/12/chartex" xmlns:cx7="http://schemas.microsoft.com/office/drawing/2016/5/13/chartex" xmlns:cx8="http://schemas.microsoft.com/office/drawing/2016/5/14/chartex" xmlns:mc="http://schemas.openxmlformats.org/markup-compatibility/2006" xmlns:aink="http://schemas.microsoft.com/office/drawing/2016/ink" xmlns:am3d="http://schemas.microsoft.com/office/drawing/2017/model3d" xmlns:o="urn:schemas-microsoft-com:office:office" xmlns:r="http://schemas.openxmlformats.org/officeDocument/2006/relationships" xmlns:m="http://schemas.openxmlformats.org/officeDocument/2006/math" xmlns:v="urn:schemas-microsoft-com:vml" xmlns:wp14="http://schemas.microsoft.com/office/word/2010/wordprocessingDrawing" xmlns:wp="http://schemas.openxmlformats.org/drawingml/2006/wordprocessingDrawing" xmlns:w10="urn:schemas-microsoft-com:office:word" xmlns:w="http://schemas.openxmlformats.org/wordprocessingml/2006/main" xmlns:w14="http://schemas.microsoft.com/office/word/2010/wordml" xmlns:w15="http://schemas.microsoft.com/office/word/2012/wordml" xmlns:w16cex="http://schemas.microsoft.com/office/word/2018/wordml/cex" xmlns:w16cid="http://schemas.microsoft.com/office/word/2016/wordml/cid" xmlns:w16="http://schemas.microsoft.com/office/word/2018/wordml" xmlns:w16sdtdh="http://schemas.microsoft.com/office/word/2020/wordml/sdtdatahash" xmlns:w16se="http://schemas.microsoft.com/office/word/2015/wordml/symex" xmlns:wpg="http://schemas.microsoft.com/office/word/2010/wordprocessingGroup" xmlns:wpi="http://schemas.microsoft.com/office/word/2010/wordprocessingInk" xmlns:wne="http://schemas.microsoft.com/office/word/2006/wordml" xmlns:wps="http://schemas.microsoft.com/office/word/2010/wordprocessingShape" mc:Ignorable="w14 w15 w16se w16cid w16 w16cex w16sdtdh wp14">
   <w:abstractNum w:abstractNumId="0" w15:restartNumberingAfterBreak="0">
-    <w:nsid w:val="499758F0"/>
+    <w:nsid w:val="0EA4532B"/>
     <w:multiLevelType w:val="multilevel"/>
-    <w:tmpl w:val="7BF012EE"/>
+    <w:tmpl w:val="DE562B3E"/>
     <w:lvl w:ilvl="0">
       <w:start w:val="1"/>
       <w:numFmt w:val="bullet"/>
@@ -18187,9 +18187,9 @@
     </w:lvl>
   </w:abstractNum>
   <w:abstractNum w:abstractNumId="1" w15:restartNumberingAfterBreak="0">
-    <w:nsid w:val="61A546C3"/>
+    <w:nsid w:val="11145B2D"/>
     <w:multiLevelType w:val="multilevel"/>
-    <w:tmpl w:val="F000F2B0"/>
+    <w:tmpl w:val="13E222FA"/>
     <w:lvl w:ilvl="0">
       <w:start w:val="1"/>
       <w:numFmt w:val="bullet"/>
@@ -18336,9 +18336,9 @@
     </w:lvl>
   </w:abstractNum>
   <w:abstractNum w:abstractNumId="2" w15:restartNumberingAfterBreak="0">
-    <w:nsid w:val="726A0E14"/>
+    <w:nsid w:val="5DD80196"/>
     <w:multiLevelType w:val="multilevel"/>
-    <w:tmpl w:val="77986308"/>
+    <w:tmpl w:val="00CCDED8"/>
     <w:lvl w:ilvl="0">
       <w:start w:val="1"/>
       <w:numFmt w:val="bullet"/>
@@ -18485,9 +18485,9 @@
     </w:lvl>
   </w:abstractNum>
   <w:abstractNum w:abstractNumId="3" w15:restartNumberingAfterBreak="0">
-    <w:nsid w:val="72AB53EC"/>
+    <w:nsid w:val="7F8A1D43"/>
     <w:multiLevelType w:val="multilevel"/>
-    <w:tmpl w:val="7848EE96"/>
+    <w:tmpl w:val="8BAE3D82"/>
     <w:lvl w:ilvl="0">
       <w:start w:val="1"/>
       <w:numFmt w:val="bullet"/>
@@ -18634,16 +18634,16 @@
     </w:lvl>
   </w:abstractNum>
   <w:num w:numId="1">
+    <w:abstractNumId w:val="2"/>
+  </w:num>
+  <w:num w:numId="2">
+    <w:abstractNumId w:val="0"/>
+  </w:num>
+  <w:num w:numId="3">
     <w:abstractNumId w:val="1"/>
   </w:num>
-  <w:num w:numId="2">
-    <w:abstractNumId w:val="2"/>
-  </w:num>
-  <w:num w:numId="3">
+  <w:num w:numId="4">
     <w:abstractNumId w:val="3"/>
-  </w:num>
-  <w:num w:numId="4">
-    <w:abstractNumId w:val="0"/>
   </w:num>
 </w:numbering>
 </file>

</xml_diff>

<commit_message>
feat: recuperacion produccion historica + herencia uso del agua + predios sin investigar en mapa
- 108 fichas adicionales recuperadas de investigacion de mayo (En Revision)
- 2398 fichas adicionales heredan Uso del Agua de su ficha madre
- Mapa: capa de 24K poligonos ahora clicable -> tarjeta de predio sin
  investigar (dueno, cedula, comunidad, area) para planificar alcance
- Trigger de auto-completado ajustado: solo cultivos/animales reales

Co-Authored-By: Claude Opus 4.8 <noreply@anthropic.com>
</commit_message>
<xml_diff>
--- a/public/informe_reunion_tecnica.docx
+++ b/public/informe_reunion_tecnica.docx
@@ -4,7 +4,7 @@
   <w:body>
     <w:p>
       <w:pPr>
-        <w:divId w:val="325284317"/>
+        <w:divId w:val="820079123"/>
         <w:rPr>
           <w:rFonts w:ascii="Plus Jakarta Sans" w:eastAsia="Times New Roman" w:hAnsi="Plus Jakarta Sans"/>
           <w:lang w:val="es-ES"/>
@@ -28,7 +28,7 @@
     <w:p>
       <w:pPr>
         <w:pStyle w:val="Ttulo1"/>
-        <w:divId w:val="352536562"/>
+        <w:divId w:val="826241979"/>
         <w:rPr>
           <w:rFonts w:eastAsia="Times New Roman"/>
           <w:lang w:val="es-ES"/>
@@ -45,7 +45,7 @@
     <w:p>
       <w:pPr>
         <w:pStyle w:val="NormalWeb"/>
-        <w:divId w:val="352536562"/>
+        <w:divId w:val="826241979"/>
         <w:rPr>
           <w:rFonts w:ascii="Plus Jakarta Sans" w:hAnsi="Plus Jakarta Sans"/>
           <w:lang w:val="es-ES"/>
@@ -63,7 +63,7 @@
     <w:p>
       <w:pPr>
         <w:pStyle w:val="NormalWeb"/>
-        <w:divId w:val="352536562"/>
+        <w:divId w:val="826241979"/>
         <w:rPr>
           <w:rFonts w:ascii="Plus Jakarta Sans" w:hAnsi="Plus Jakarta Sans"/>
           <w:lang w:val="es-ES"/>
@@ -102,7 +102,7 @@
     <w:p>
       <w:pPr>
         <w:spacing w:before="450" w:after="450"/>
-        <w:divId w:val="352536562"/>
+        <w:divId w:val="826241979"/>
         <w:rPr>
           <w:rFonts w:ascii="Plus Jakarta Sans" w:eastAsia="Times New Roman" w:hAnsi="Plus Jakarta Sans"/>
           <w:lang w:val="es-ES"/>
@@ -121,7 +121,7 @@
     <w:p>
       <w:pPr>
         <w:pStyle w:val="Ttulo2"/>
-        <w:divId w:val="352536562"/>
+        <w:divId w:val="826241979"/>
         <w:rPr>
           <w:rFonts w:eastAsia="Times New Roman"/>
           <w:lang w:val="es-ES"/>
@@ -145,7 +145,7 @@
     <w:p>
       <w:pPr>
         <w:pStyle w:val="NormalWeb"/>
-        <w:divId w:val="352536562"/>
+        <w:divId w:val="826241979"/>
         <w:rPr>
           <w:rFonts w:ascii="Plus Jakarta Sans" w:hAnsi="Plus Jakarta Sans"/>
           <w:lang w:val="es-ES"/>
@@ -167,7 +167,7 @@
         </w:numPr>
         <w:spacing w:before="100" w:beforeAutospacing="1" w:after="90"/>
         <w:ind w:left="1020"/>
-        <w:divId w:val="352536562"/>
+        <w:divId w:val="826241979"/>
         <w:rPr>
           <w:rFonts w:ascii="Plus Jakarta Sans" w:eastAsia="Times New Roman" w:hAnsi="Plus Jakarta Sans"/>
           <w:sz w:val="21"/>
@@ -213,7 +213,7 @@
         </w:numPr>
         <w:spacing w:before="100" w:beforeAutospacing="1" w:after="90"/>
         <w:ind w:left="1020"/>
-        <w:divId w:val="352536562"/>
+        <w:divId w:val="826241979"/>
         <w:rPr>
           <w:rFonts w:ascii="Plus Jakarta Sans" w:eastAsia="Times New Roman" w:hAnsi="Plus Jakarta Sans"/>
           <w:sz w:val="21"/>
@@ -269,7 +269,7 @@
         </w:numPr>
         <w:spacing w:before="100" w:beforeAutospacing="1" w:after="90"/>
         <w:ind w:left="1020"/>
-        <w:divId w:val="352536562"/>
+        <w:divId w:val="826241979"/>
         <w:rPr>
           <w:rFonts w:ascii="Plus Jakarta Sans" w:eastAsia="Times New Roman" w:hAnsi="Plus Jakarta Sans"/>
           <w:sz w:val="21"/>
@@ -315,7 +315,7 @@
         </w:numPr>
         <w:spacing w:before="100" w:beforeAutospacing="1" w:after="90"/>
         <w:ind w:left="1020"/>
-        <w:divId w:val="352536562"/>
+        <w:divId w:val="826241979"/>
         <w:rPr>
           <w:rFonts w:ascii="Plus Jakarta Sans" w:eastAsia="Times New Roman" w:hAnsi="Plus Jakarta Sans"/>
           <w:sz w:val="21"/>
@@ -356,7 +356,7 @@
     <w:p>
       <w:pPr>
         <w:spacing w:before="450" w:after="450"/>
-        <w:divId w:val="352536562"/>
+        <w:divId w:val="826241979"/>
         <w:rPr>
           <w:rFonts w:ascii="Plus Jakarta Sans" w:eastAsia="Times New Roman" w:hAnsi="Plus Jakarta Sans"/>
           <w:lang w:val="es-ES"/>
@@ -375,7 +375,7 @@
     <w:p>
       <w:pPr>
         <w:pStyle w:val="Ttulo2"/>
-        <w:divId w:val="352536562"/>
+        <w:divId w:val="826241979"/>
         <w:rPr>
           <w:rFonts w:eastAsia="Times New Roman"/>
           <w:lang w:val="es-ES"/>
@@ -392,7 +392,7 @@
     <w:p>
       <w:pPr>
         <w:pStyle w:val="NormalWeb"/>
-        <w:divId w:val="352536562"/>
+        <w:divId w:val="826241979"/>
         <w:rPr>
           <w:rFonts w:ascii="Plus Jakarta Sans" w:hAnsi="Plus Jakarta Sans"/>
           <w:lang w:val="es-ES"/>
@@ -445,7 +445,7 @@
       </w:tblGrid>
       <w:tr>
         <w:trPr>
-          <w:divId w:val="8988403"/>
+          <w:divId w:val="1750276212"/>
           <w:tblHeader/>
         </w:trPr>
         <w:tc>
@@ -525,7 +525,7 @@
       </w:tr>
       <w:tr>
         <w:trPr>
-          <w:divId w:val="8988403"/>
+          <w:divId w:val="1750276212"/>
         </w:trPr>
         <w:tc>
           <w:tcPr>
@@ -591,7 +591,7 @@
       </w:tr>
       <w:tr>
         <w:trPr>
-          <w:divId w:val="8988403"/>
+          <w:divId w:val="1750276212"/>
         </w:trPr>
         <w:tc>
           <w:tcPr>
@@ -657,7 +657,7 @@
       </w:tr>
       <w:tr>
         <w:trPr>
-          <w:divId w:val="8988403"/>
+          <w:divId w:val="1750276212"/>
         </w:trPr>
         <w:tc>
           <w:tcPr>
@@ -723,7 +723,7 @@
       </w:tr>
       <w:tr>
         <w:trPr>
-          <w:divId w:val="8988403"/>
+          <w:divId w:val="1750276212"/>
         </w:trPr>
         <w:tc>
           <w:tcPr>
@@ -791,7 +791,7 @@
     <w:p>
       <w:pPr>
         <w:spacing w:before="450" w:after="450"/>
-        <w:divId w:val="352536562"/>
+        <w:divId w:val="826241979"/>
         <w:rPr>
           <w:rFonts w:ascii="Plus Jakarta Sans" w:eastAsia="Times New Roman" w:hAnsi="Plus Jakarta Sans"/>
           <w:lang w:val="es-ES"/>
@@ -811,7 +811,7 @@
     <w:p>
       <w:pPr>
         <w:pStyle w:val="Ttulo2"/>
-        <w:divId w:val="352536562"/>
+        <w:divId w:val="826241979"/>
         <w:rPr>
           <w:rFonts w:eastAsia="Times New Roman"/>
           <w:lang w:val="es-ES"/>
@@ -828,7 +828,7 @@
     <w:p>
       <w:pPr>
         <w:pStyle w:val="Ttulo3"/>
-        <w:divId w:val="352536562"/>
+        <w:divId w:val="826241979"/>
         <w:rPr>
           <w:rFonts w:eastAsia="Times New Roman"/>
           <w:lang w:val="es-ES"/>
@@ -845,7 +845,7 @@
     <w:p>
       <w:pPr>
         <w:pStyle w:val="NormalWeb"/>
-        <w:divId w:val="352536562"/>
+        <w:divId w:val="826241979"/>
         <w:rPr>
           <w:rFonts w:ascii="Plus Jakarta Sans" w:hAnsi="Plus Jakarta Sans"/>
           <w:lang w:val="es-ES"/>
@@ -885,7 +885,7 @@
       </w:tblGrid>
       <w:tr>
         <w:trPr>
-          <w:divId w:val="1881624982"/>
+          <w:divId w:val="1176117570"/>
           <w:tblHeader/>
         </w:trPr>
         <w:tc>
@@ -1039,7 +1039,7 @@
       </w:tr>
       <w:tr>
         <w:trPr>
-          <w:divId w:val="1881624982"/>
+          <w:divId w:val="1176117570"/>
         </w:trPr>
         <w:tc>
           <w:tcPr>
@@ -1165,7 +1165,7 @@
       </w:tr>
       <w:tr>
         <w:trPr>
-          <w:divId w:val="1881624982"/>
+          <w:divId w:val="1176117570"/>
         </w:trPr>
         <w:tc>
           <w:tcPr>
@@ -1291,7 +1291,7 @@
       </w:tr>
       <w:tr>
         <w:trPr>
-          <w:divId w:val="1881624982"/>
+          <w:divId w:val="1176117570"/>
         </w:trPr>
         <w:tc>
           <w:tcPr>
@@ -1417,7 +1417,7 @@
       </w:tr>
       <w:tr>
         <w:trPr>
-          <w:divId w:val="1881624982"/>
+          <w:divId w:val="1176117570"/>
         </w:trPr>
         <w:tc>
           <w:tcPr>
@@ -1543,7 +1543,7 @@
       </w:tr>
       <w:tr>
         <w:trPr>
-          <w:divId w:val="1881624982"/>
+          <w:divId w:val="1176117570"/>
         </w:trPr>
         <w:tc>
           <w:tcPr>
@@ -1677,7 +1677,7 @@
       </w:tr>
       <w:tr>
         <w:trPr>
-          <w:divId w:val="1881624982"/>
+          <w:divId w:val="1176117570"/>
         </w:trPr>
         <w:tc>
           <w:tcPr>
@@ -1803,7 +1803,7 @@
       </w:tr>
       <w:tr>
         <w:trPr>
-          <w:divId w:val="1881624982"/>
+          <w:divId w:val="1176117570"/>
         </w:trPr>
         <w:tc>
           <w:tcPr>
@@ -1929,7 +1929,7 @@
       </w:tr>
       <w:tr>
         <w:trPr>
-          <w:divId w:val="1881624982"/>
+          <w:divId w:val="1176117570"/>
         </w:trPr>
         <w:tc>
           <w:tcPr>
@@ -2057,7 +2057,7 @@
     <w:p>
       <w:pPr>
         <w:pStyle w:val="Ttulo3"/>
-        <w:divId w:val="352536562"/>
+        <w:divId w:val="826241979"/>
         <w:rPr>
           <w:rFonts w:eastAsia="Times New Roman"/>
           <w:lang w:val="es-ES"/>
@@ -2074,7 +2074,7 @@
     <w:p>
       <w:pPr>
         <w:pStyle w:val="NormalWeb"/>
-        <w:divId w:val="352536562"/>
+        <w:divId w:val="826241979"/>
         <w:rPr>
           <w:rFonts w:ascii="Plus Jakarta Sans" w:hAnsi="Plus Jakarta Sans"/>
           <w:lang w:val="es-ES"/>
@@ -2103,7 +2103,7 @@
         </w:numPr>
         <w:spacing w:before="100" w:beforeAutospacing="1" w:after="90"/>
         <w:ind w:left="1020"/>
-        <w:divId w:val="352536562"/>
+        <w:divId w:val="826241979"/>
         <w:rPr>
           <w:rFonts w:ascii="Plus Jakarta Sans" w:eastAsia="Times New Roman" w:hAnsi="Plus Jakarta Sans"/>
           <w:sz w:val="21"/>
@@ -2205,7 +2205,7 @@
         </w:numPr>
         <w:spacing w:before="100" w:beforeAutospacing="1" w:after="90"/>
         <w:ind w:left="1020"/>
-        <w:divId w:val="352536562"/>
+        <w:divId w:val="826241979"/>
         <w:rPr>
           <w:rFonts w:ascii="Plus Jakarta Sans" w:eastAsia="Times New Roman" w:hAnsi="Plus Jakarta Sans"/>
           <w:sz w:val="21"/>
@@ -2317,7 +2317,7 @@
         </w:numPr>
         <w:spacing w:before="100" w:beforeAutospacing="1" w:after="90"/>
         <w:ind w:left="1020"/>
-        <w:divId w:val="352536562"/>
+        <w:divId w:val="826241979"/>
         <w:rPr>
           <w:rFonts w:ascii="Plus Jakarta Sans" w:eastAsia="Times New Roman" w:hAnsi="Plus Jakarta Sans"/>
           <w:sz w:val="21"/>
@@ -2423,7 +2423,7 @@
     <w:p>
       <w:pPr>
         <w:pStyle w:val="Ttulo3"/>
-        <w:divId w:val="352536562"/>
+        <w:divId w:val="826241979"/>
         <w:rPr>
           <w:rFonts w:eastAsia="Times New Roman"/>
           <w:lang w:val="es-ES"/>
@@ -2439,8 +2439,9 @@
     </w:p>
     <w:p>
       <w:pPr>
+        <w:spacing w:before="375" w:after="225"/>
         <w:jc w:val="center"/>
-        <w:divId w:val="458959302"/>
+        <w:divId w:val="1211723689"/>
         <w:rPr>
           <w:rFonts w:ascii="Outfit" w:eastAsia="Times New Roman" w:hAnsi="Outfit"/>
           <w:b/>
@@ -2468,8 +2469,9 @@
     </w:p>
     <w:p>
       <w:pPr>
+        <w:spacing w:after="375"/>
         <w:jc w:val="center"/>
-        <w:divId w:val="420680183"/>
+        <w:divId w:val="1532186699"/>
         <w:rPr>
           <w:rFonts w:ascii="Plus Jakarta Sans" w:eastAsia="Times New Roman" w:hAnsi="Plus Jakarta Sans"/>
           <w:lang w:val="es-ES"/>
@@ -2864,7 +2866,7 @@
     <w:p>
       <w:pPr>
         <w:spacing w:before="450" w:after="450"/>
-        <w:divId w:val="352536562"/>
+        <w:divId w:val="826241979"/>
         <w:rPr>
           <w:rFonts w:ascii="Plus Jakarta Sans" w:eastAsia="Times New Roman" w:hAnsi="Plus Jakarta Sans"/>
           <w:lang w:val="es-ES"/>
@@ -2883,7 +2885,7 @@
     <w:p>
       <w:pPr>
         <w:pStyle w:val="Ttulo3"/>
-        <w:divId w:val="352536562"/>
+        <w:divId w:val="826241979"/>
         <w:rPr>
           <w:rFonts w:eastAsia="Times New Roman"/>
           <w:lang w:val="es-ES"/>
@@ -2900,7 +2902,7 @@
     <w:p>
       <w:pPr>
         <w:pStyle w:val="NormalWeb"/>
-        <w:divId w:val="352536562"/>
+        <w:divId w:val="826241979"/>
         <w:rPr>
           <w:rFonts w:ascii="Plus Jakarta Sans" w:hAnsi="Plus Jakarta Sans"/>
           <w:lang w:val="es-ES"/>
@@ -2933,7 +2935,7 @@
       </w:tblGrid>
       <w:tr>
         <w:trPr>
-          <w:divId w:val="1283077250"/>
+          <w:divId w:val="1085496244"/>
           <w:tblHeader/>
         </w:trPr>
         <w:tc>
@@ -3087,7 +3089,7 @@
       </w:tr>
       <w:tr>
         <w:trPr>
-          <w:divId w:val="1283077250"/>
+          <w:divId w:val="1085496244"/>
         </w:trPr>
         <w:tc>
           <w:tcPr>
@@ -3221,7 +3223,7 @@
       </w:tr>
       <w:tr>
         <w:trPr>
-          <w:divId w:val="1283077250"/>
+          <w:divId w:val="1085496244"/>
         </w:trPr>
         <w:tc>
           <w:tcPr>
@@ -3355,7 +3357,7 @@
       </w:tr>
       <w:tr>
         <w:trPr>
-          <w:divId w:val="1283077250"/>
+          <w:divId w:val="1085496244"/>
         </w:trPr>
         <w:tc>
           <w:tcPr>
@@ -3489,7 +3491,7 @@
       </w:tr>
       <w:tr>
         <w:trPr>
-          <w:divId w:val="1283077250"/>
+          <w:divId w:val="1085496244"/>
         </w:trPr>
         <w:tc>
           <w:tcPr>
@@ -3623,7 +3625,7 @@
       </w:tr>
       <w:tr>
         <w:trPr>
-          <w:divId w:val="1283077250"/>
+          <w:divId w:val="1085496244"/>
         </w:trPr>
         <w:tc>
           <w:tcPr>
@@ -3757,7 +3759,7 @@
       </w:tr>
       <w:tr>
         <w:trPr>
-          <w:divId w:val="1283077250"/>
+          <w:divId w:val="1085496244"/>
         </w:trPr>
         <w:tc>
           <w:tcPr>
@@ -3893,7 +3895,7 @@
     <w:p>
       <w:pPr>
         <w:pStyle w:val="Ttulo3"/>
-        <w:divId w:val="352536562"/>
+        <w:divId w:val="826241979"/>
         <w:rPr>
           <w:rFonts w:eastAsia="Times New Roman"/>
           <w:lang w:val="es-ES"/>
@@ -3909,8 +3911,9 @@
     </w:p>
     <w:p>
       <w:pPr>
+        <w:spacing w:before="375" w:after="225"/>
         <w:jc w:val="center"/>
-        <w:divId w:val="2047096783"/>
+        <w:divId w:val="882906261"/>
         <w:rPr>
           <w:rFonts w:ascii="Outfit" w:eastAsia="Times New Roman" w:hAnsi="Outfit"/>
           <w:b/>
@@ -3938,8 +3941,9 @@
     </w:p>
     <w:p>
       <w:pPr>
+        <w:spacing w:after="375"/>
         <w:jc w:val="center"/>
-        <w:divId w:val="158742085"/>
+        <w:divId w:val="763066188"/>
         <w:rPr>
           <w:rFonts w:ascii="Plus Jakarta Sans" w:eastAsia="Times New Roman" w:hAnsi="Plus Jakarta Sans"/>
           <w:lang w:val="es-ES"/>
@@ -4313,7 +4317,7 @@
     <w:p>
       <w:pPr>
         <w:spacing w:before="450" w:after="450"/>
-        <w:divId w:val="352536562"/>
+        <w:divId w:val="826241979"/>
         <w:rPr>
           <w:rFonts w:ascii="Plus Jakarta Sans" w:eastAsia="Times New Roman" w:hAnsi="Plus Jakarta Sans"/>
           <w:lang w:val="es-ES"/>
@@ -4324,7 +4328,6 @@
           <w:rFonts w:ascii="Plus Jakarta Sans" w:eastAsia="Times New Roman" w:hAnsi="Plus Jakarta Sans"/>
           <w:lang w:val="es-ES"/>
         </w:rPr>
-        <w:lastRenderedPageBreak/>
         <w:pict>
           <v:rect id="_x0000_i1029" style="width:0;height:.75pt" o:hralign="center" o:hrstd="t" o:hr="t" fillcolor="#a0a0a0" stroked="f"/>
         </w:pict>
@@ -4333,7 +4336,7 @@
     <w:p>
       <w:pPr>
         <w:pStyle w:val="Ttulo3"/>
-        <w:divId w:val="352536562"/>
+        <w:divId w:val="826241979"/>
         <w:rPr>
           <w:rFonts w:eastAsia="Times New Roman"/>
           <w:lang w:val="es-ES"/>
@@ -4350,7 +4353,7 @@
     <w:p>
       <w:pPr>
         <w:pStyle w:val="NormalWeb"/>
-        <w:divId w:val="352536562"/>
+        <w:divId w:val="826241979"/>
         <w:rPr>
           <w:rFonts w:ascii="Plus Jakarta Sans" w:hAnsi="Plus Jakarta Sans"/>
           <w:lang w:val="es-ES"/>
@@ -4372,7 +4375,7 @@
         </w:numPr>
         <w:spacing w:before="100" w:beforeAutospacing="1" w:after="90"/>
         <w:ind w:left="1020"/>
-        <w:divId w:val="352536562"/>
+        <w:divId w:val="826241979"/>
         <w:rPr>
           <w:rFonts w:ascii="Plus Jakarta Sans" w:eastAsia="Times New Roman" w:hAnsi="Plus Jakarta Sans"/>
           <w:sz w:val="21"/>
@@ -4408,7 +4411,7 @@
         </w:numPr>
         <w:spacing w:before="100" w:beforeAutospacing="1" w:after="90"/>
         <w:ind w:left="1020"/>
-        <w:divId w:val="352536562"/>
+        <w:divId w:val="826241979"/>
         <w:rPr>
           <w:rFonts w:ascii="Plus Jakarta Sans" w:eastAsia="Times New Roman" w:hAnsi="Plus Jakarta Sans"/>
           <w:sz w:val="21"/>
@@ -4453,7 +4456,7 @@
         </w:numPr>
         <w:spacing w:before="100" w:beforeAutospacing="1" w:after="90"/>
         <w:ind w:left="1020"/>
-        <w:divId w:val="352536562"/>
+        <w:divId w:val="826241979"/>
         <w:rPr>
           <w:rFonts w:ascii="Plus Jakarta Sans" w:eastAsia="Times New Roman" w:hAnsi="Plus Jakarta Sans"/>
           <w:sz w:val="21"/>
@@ -4498,7 +4501,7 @@
         </w:numPr>
         <w:spacing w:before="100" w:beforeAutospacing="1" w:after="90"/>
         <w:ind w:left="1020"/>
-        <w:divId w:val="352536562"/>
+        <w:divId w:val="826241979"/>
         <w:rPr>
           <w:rFonts w:ascii="Plus Jakarta Sans" w:eastAsia="Times New Roman" w:hAnsi="Plus Jakarta Sans"/>
           <w:sz w:val="21"/>
@@ -4554,7 +4557,7 @@
       </w:tblGrid>
       <w:tr>
         <w:trPr>
-          <w:divId w:val="1116220387"/>
+          <w:divId w:val="1412584618"/>
           <w:tblHeader/>
         </w:trPr>
         <w:tc>
@@ -4708,7 +4711,7 @@
       </w:tr>
       <w:tr>
         <w:trPr>
-          <w:divId w:val="1116220387"/>
+          <w:divId w:val="1412584618"/>
         </w:trPr>
         <w:tc>
           <w:tcPr>
@@ -4834,7 +4837,7 @@
       </w:tr>
       <w:tr>
         <w:trPr>
-          <w:divId w:val="1116220387"/>
+          <w:divId w:val="1412584618"/>
         </w:trPr>
         <w:tc>
           <w:tcPr>
@@ -4960,7 +4963,7 @@
       </w:tr>
       <w:tr>
         <w:trPr>
-          <w:divId w:val="1116220387"/>
+          <w:divId w:val="1412584618"/>
         </w:trPr>
         <w:tc>
           <w:tcPr>
@@ -5086,7 +5089,7 @@
       </w:tr>
       <w:tr>
         <w:trPr>
-          <w:divId w:val="1116220387"/>
+          <w:divId w:val="1412584618"/>
         </w:trPr>
         <w:tc>
           <w:tcPr>
@@ -5214,7 +5217,7 @@
     <w:p>
       <w:pPr>
         <w:spacing w:before="450" w:after="450"/>
-        <w:divId w:val="352536562"/>
+        <w:divId w:val="826241979"/>
         <w:rPr>
           <w:rFonts w:ascii="Plus Jakarta Sans" w:eastAsia="Times New Roman" w:hAnsi="Plus Jakarta Sans"/>
           <w:lang w:val="es-ES"/>
@@ -5233,7 +5236,7 @@
     <w:p>
       <w:pPr>
         <w:pStyle w:val="Ttulo3"/>
-        <w:divId w:val="352536562"/>
+        <w:divId w:val="826241979"/>
         <w:rPr>
           <w:rFonts w:eastAsia="Times New Roman"/>
           <w:lang w:val="es-ES"/>
@@ -5250,7 +5253,7 @@
     <w:p>
       <w:pPr>
         <w:pStyle w:val="NormalWeb"/>
-        <w:divId w:val="352536562"/>
+        <w:divId w:val="826241979"/>
         <w:rPr>
           <w:rFonts w:ascii="Plus Jakarta Sans" w:hAnsi="Plus Jakarta Sans"/>
           <w:lang w:val="es-ES"/>
@@ -5274,7 +5277,7 @@
     <w:p>
       <w:pPr>
         <w:pStyle w:val="Ttulo4"/>
-        <w:divId w:val="352536562"/>
+        <w:divId w:val="826241979"/>
         <w:rPr>
           <w:rFonts w:eastAsia="Times New Roman"/>
           <w:lang w:val="es-ES"/>
@@ -5290,8 +5293,9 @@
     </w:p>
     <w:p>
       <w:pPr>
+        <w:spacing w:before="375" w:after="225"/>
         <w:jc w:val="center"/>
-        <w:divId w:val="674114649"/>
+        <w:divId w:val="480930176"/>
         <w:rPr>
           <w:rFonts w:ascii="Outfit" w:eastAsia="Times New Roman" w:hAnsi="Outfit"/>
           <w:b/>
@@ -5319,8 +5323,9 @@
     </w:p>
     <w:p>
       <w:pPr>
+        <w:spacing w:after="375"/>
         <w:jc w:val="center"/>
-        <w:divId w:val="2049377079"/>
+        <w:divId w:val="12735218"/>
         <w:rPr>
           <w:rFonts w:ascii="Plus Jakarta Sans" w:eastAsia="Times New Roman" w:hAnsi="Plus Jakarta Sans"/>
           <w:lang w:val="es-ES"/>
@@ -5603,7 +5608,7 @@
     <w:p>
       <w:pPr>
         <w:pStyle w:val="Ttulo4"/>
-        <w:divId w:val="352536562"/>
+        <w:divId w:val="826241979"/>
         <w:rPr>
           <w:rFonts w:eastAsia="Times New Roman"/>
           <w:lang w:val="es-ES"/>
@@ -5626,8 +5631,9 @@
     </w:p>
     <w:p>
       <w:pPr>
+        <w:spacing w:before="375" w:after="225"/>
         <w:jc w:val="center"/>
-        <w:divId w:val="1506244056"/>
+        <w:divId w:val="729230999"/>
         <w:rPr>
           <w:rFonts w:ascii="Outfit" w:eastAsia="Times New Roman" w:hAnsi="Outfit"/>
           <w:b/>
@@ -5655,8 +5661,9 @@
     </w:p>
     <w:p>
       <w:pPr>
+        <w:spacing w:after="375"/>
         <w:jc w:val="center"/>
-        <w:divId w:val="417142120"/>
+        <w:divId w:val="2143959191"/>
         <w:rPr>
           <w:rFonts w:ascii="Plus Jakarta Sans" w:eastAsia="Times New Roman" w:hAnsi="Plus Jakarta Sans"/>
           <w:lang w:val="es-ES"/>
@@ -5974,7 +5981,7 @@
     <w:p>
       <w:pPr>
         <w:pStyle w:val="Ttulo4"/>
-        <w:divId w:val="352536562"/>
+        <w:divId w:val="826241979"/>
         <w:rPr>
           <w:rFonts w:eastAsia="Times New Roman"/>
           <w:lang w:val="es-ES"/>
@@ -5985,14 +5992,14 @@
           <w:rFonts w:eastAsia="Times New Roman"/>
           <w:lang w:val="es-ES"/>
         </w:rPr>
-        <w:lastRenderedPageBreak/>
         <w:t>Destino de la Producción Agrícola por Sector:</w:t>
       </w:r>
     </w:p>
     <w:p>
       <w:pPr>
+        <w:spacing w:before="375" w:after="225"/>
         <w:jc w:val="center"/>
-        <w:divId w:val="943923399"/>
+        <w:divId w:val="275406310"/>
         <w:rPr>
           <w:rFonts w:ascii="Outfit" w:eastAsia="Times New Roman" w:hAnsi="Outfit"/>
           <w:b/>
@@ -6020,8 +6027,9 @@
     </w:p>
     <w:p>
       <w:pPr>
+        <w:spacing w:after="375"/>
         <w:jc w:val="center"/>
-        <w:divId w:val="231042764"/>
+        <w:divId w:val="1805538477"/>
         <w:rPr>
           <w:rFonts w:ascii="Plus Jakarta Sans" w:eastAsia="Times New Roman" w:hAnsi="Plus Jakarta Sans"/>
           <w:lang w:val="es-ES"/>
@@ -6325,7 +6333,7 @@
     <w:p>
       <w:pPr>
         <w:spacing w:before="450" w:after="450"/>
-        <w:divId w:val="352536562"/>
+        <w:divId w:val="826241979"/>
         <w:rPr>
           <w:rFonts w:ascii="Plus Jakarta Sans" w:eastAsia="Times New Roman" w:hAnsi="Plus Jakarta Sans"/>
           <w:lang w:val="es-ES"/>
@@ -6344,7 +6352,7 @@
     <w:p>
       <w:pPr>
         <w:pStyle w:val="Ttulo3"/>
-        <w:divId w:val="352536562"/>
+        <w:divId w:val="826241979"/>
         <w:rPr>
           <w:rFonts w:eastAsia="Times New Roman"/>
           <w:lang w:val="es-ES"/>
@@ -6361,7 +6369,7 @@
     <w:p>
       <w:pPr>
         <w:pStyle w:val="NormalWeb"/>
-        <w:divId w:val="352536562"/>
+        <w:divId w:val="826241979"/>
         <w:rPr>
           <w:rFonts w:ascii="Plus Jakarta Sans" w:hAnsi="Plus Jakarta Sans"/>
           <w:lang w:val="es-ES"/>
@@ -6385,7 +6393,7 @@
     <w:p>
       <w:pPr>
         <w:pStyle w:val="Ttulo4"/>
-        <w:divId w:val="352536562"/>
+        <w:divId w:val="826241979"/>
         <w:rPr>
           <w:rFonts w:eastAsia="Times New Roman"/>
           <w:lang w:val="es-ES"/>
@@ -6402,7 +6410,7 @@
     <w:p>
       <w:pPr>
         <w:pStyle w:val="NormalWeb"/>
-        <w:divId w:val="352536562"/>
+        <w:divId w:val="826241979"/>
         <w:rPr>
           <w:rFonts w:ascii="Plus Jakarta Sans" w:hAnsi="Plus Jakarta Sans"/>
           <w:lang w:val="es-ES"/>
@@ -6433,7 +6441,7 @@
       </w:tblGrid>
       <w:tr>
         <w:trPr>
-          <w:divId w:val="116293211"/>
+          <w:divId w:val="712585321"/>
           <w:tblHeader/>
         </w:trPr>
         <w:tc>
@@ -6513,7 +6521,7 @@
       </w:tr>
       <w:tr>
         <w:trPr>
-          <w:divId w:val="116293211"/>
+          <w:divId w:val="712585321"/>
         </w:trPr>
         <w:tc>
           <w:tcPr>
@@ -6602,7 +6610,7 @@
     <w:p>
       <w:pPr>
         <w:pStyle w:val="Ttulo4"/>
-        <w:divId w:val="352536562"/>
+        <w:divId w:val="826241979"/>
         <w:rPr>
           <w:rFonts w:eastAsia="Times New Roman"/>
           <w:lang w:val="es-ES"/>
@@ -6619,7 +6627,7 @@
     <w:p>
       <w:pPr>
         <w:pStyle w:val="NormalWeb"/>
-        <w:divId w:val="352536562"/>
+        <w:divId w:val="826241979"/>
         <w:rPr>
           <w:rFonts w:ascii="Plus Jakarta Sans" w:hAnsi="Plus Jakarta Sans"/>
           <w:lang w:val="es-ES"/>
@@ -6650,7 +6658,7 @@
       </w:tblGrid>
       <w:tr>
         <w:trPr>
-          <w:divId w:val="157964385"/>
+          <w:divId w:val="1594896200"/>
           <w:tblHeader/>
         </w:trPr>
         <w:tc>
@@ -6730,7 +6738,7 @@
       </w:tr>
       <w:tr>
         <w:trPr>
-          <w:divId w:val="157964385"/>
+          <w:divId w:val="1594896200"/>
         </w:trPr>
         <w:tc>
           <w:tcPr>
@@ -6828,7 +6836,7 @@
     <w:p>
       <w:pPr>
         <w:pStyle w:val="Ttulo4"/>
-        <w:divId w:val="352536562"/>
+        <w:divId w:val="826241979"/>
         <w:rPr>
           <w:rFonts w:eastAsia="Times New Roman"/>
           <w:lang w:val="es-ES"/>
@@ -6845,7 +6853,7 @@
     <w:p>
       <w:pPr>
         <w:pStyle w:val="NormalWeb"/>
-        <w:divId w:val="352536562"/>
+        <w:divId w:val="826241979"/>
         <w:rPr>
           <w:rFonts w:ascii="Plus Jakarta Sans" w:hAnsi="Plus Jakarta Sans"/>
           <w:lang w:val="es-ES"/>
@@ -6876,7 +6884,7 @@
       </w:tblGrid>
       <w:tr>
         <w:trPr>
-          <w:divId w:val="647587675"/>
+          <w:divId w:val="1559777115"/>
           <w:tblHeader/>
         </w:trPr>
         <w:tc>
@@ -6912,7 +6920,6 @@
                 <w:sz w:val="20"/>
                 <w:szCs w:val="20"/>
               </w:rPr>
-              <w:lastRenderedPageBreak/>
               <w:t>Cultivos Frecuentes</w:t>
             </w:r>
           </w:p>
@@ -6957,7 +6964,7 @@
       </w:tr>
       <w:tr>
         <w:trPr>
-          <w:divId w:val="647587675"/>
+          <w:divId w:val="1559777115"/>
         </w:trPr>
         <w:tc>
           <w:tcPr>
@@ -7046,7 +7053,7 @@
     <w:p>
       <w:pPr>
         <w:spacing w:before="450" w:after="450"/>
-        <w:divId w:val="352536562"/>
+        <w:divId w:val="826241979"/>
         <w:rPr>
           <w:rFonts w:ascii="Plus Jakarta Sans" w:eastAsia="Times New Roman" w:hAnsi="Plus Jakarta Sans"/>
           <w:lang w:val="es-ES"/>
@@ -7065,7 +7072,7 @@
     <w:p>
       <w:pPr>
         <w:pStyle w:val="Ttulo2"/>
-        <w:divId w:val="352536562"/>
+        <w:divId w:val="826241979"/>
         <w:rPr>
           <w:rFonts w:eastAsia="Times New Roman"/>
           <w:lang w:val="es-ES"/>
@@ -7082,7 +7089,7 @@
     <w:p>
       <w:pPr>
         <w:pStyle w:val="NormalWeb"/>
-        <w:divId w:val="352536562"/>
+        <w:divId w:val="826241979"/>
         <w:rPr>
           <w:rFonts w:ascii="Plus Jakarta Sans" w:hAnsi="Plus Jakarta Sans"/>
           <w:lang w:val="es-ES"/>
@@ -7099,7 +7106,7 @@
     <w:p>
       <w:pPr>
         <w:pStyle w:val="Ttulo3"/>
-        <w:divId w:val="352536562"/>
+        <w:divId w:val="826241979"/>
         <w:rPr>
           <w:rFonts w:eastAsia="Times New Roman"/>
           <w:lang w:val="es-ES"/>
@@ -7116,7 +7123,7 @@
     <w:p>
       <w:pPr>
         <w:pStyle w:val="NormalWeb"/>
-        <w:divId w:val="352536562"/>
+        <w:divId w:val="826241979"/>
         <w:rPr>
           <w:rFonts w:ascii="Plus Jakarta Sans" w:hAnsi="Plus Jakarta Sans"/>
           <w:lang w:val="es-ES"/>
@@ -7149,7 +7156,7 @@
       </w:tblGrid>
       <w:tr>
         <w:trPr>
-          <w:divId w:val="471601693"/>
+          <w:divId w:val="1167593749"/>
           <w:tblHeader/>
         </w:trPr>
         <w:tc>
@@ -7314,7 +7321,7 @@
       </w:tr>
       <w:tr>
         <w:trPr>
-          <w:divId w:val="471601693"/>
+          <w:divId w:val="1167593749"/>
         </w:trPr>
         <w:tc>
           <w:tcPr>
@@ -7440,7 +7447,7 @@
       </w:tr>
       <w:tr>
         <w:trPr>
-          <w:divId w:val="471601693"/>
+          <w:divId w:val="1167593749"/>
         </w:trPr>
         <w:tc>
           <w:tcPr>
@@ -7566,7 +7573,7 @@
       </w:tr>
       <w:tr>
         <w:trPr>
-          <w:divId w:val="471601693"/>
+          <w:divId w:val="1167593749"/>
         </w:trPr>
         <w:tc>
           <w:tcPr>
@@ -7692,7 +7699,7 @@
       </w:tr>
       <w:tr>
         <w:trPr>
-          <w:divId w:val="471601693"/>
+          <w:divId w:val="1167593749"/>
         </w:trPr>
         <w:tc>
           <w:tcPr>
@@ -7820,7 +7827,7 @@
     <w:p>
       <w:pPr>
         <w:pStyle w:val="Ttulo3"/>
-        <w:divId w:val="352536562"/>
+        <w:divId w:val="826241979"/>
         <w:rPr>
           <w:rFonts w:eastAsia="Times New Roman"/>
           <w:lang w:val="es-ES"/>
@@ -7838,7 +7845,7 @@
       <w:pPr>
         <w:spacing w:before="375" w:after="225"/>
         <w:jc w:val="center"/>
-        <w:divId w:val="2013140033"/>
+        <w:divId w:val="1531452239"/>
         <w:rPr>
           <w:rFonts w:ascii="Outfit" w:eastAsia="Times New Roman" w:hAnsi="Outfit"/>
           <w:b/>
@@ -7868,7 +7875,7 @@
       <w:pPr>
         <w:spacing w:after="375"/>
         <w:jc w:val="center"/>
-        <w:divId w:val="269633010"/>
+        <w:divId w:val="952172824"/>
         <w:rPr>
           <w:rFonts w:ascii="Plus Jakarta Sans" w:eastAsia="Times New Roman" w:hAnsi="Plus Jakarta Sans"/>
           <w:lang w:val="es-ES"/>
@@ -8235,7 +8242,7 @@
     <w:p>
       <w:pPr>
         <w:pStyle w:val="Ttulo3"/>
-        <w:divId w:val="352536562"/>
+        <w:divId w:val="826241979"/>
         <w:rPr>
           <w:rFonts w:eastAsia="Times New Roman"/>
           <w:lang w:val="es-ES"/>
@@ -8259,7 +8266,7 @@
     <w:p>
       <w:pPr>
         <w:pStyle w:val="NormalWeb"/>
-        <w:divId w:val="352536562"/>
+        <w:divId w:val="826241979"/>
         <w:rPr>
           <w:rFonts w:ascii="Plus Jakarta Sans" w:hAnsi="Plus Jakarta Sans"/>
           <w:lang w:val="es-ES"/>
@@ -8281,7 +8288,7 @@
         </w:numPr>
         <w:spacing w:before="100" w:beforeAutospacing="1" w:after="90"/>
         <w:ind w:left="1020"/>
-        <w:divId w:val="352536562"/>
+        <w:divId w:val="826241979"/>
         <w:rPr>
           <w:rFonts w:ascii="Plus Jakarta Sans" w:eastAsia="Times New Roman" w:hAnsi="Plus Jakarta Sans"/>
           <w:sz w:val="21"/>
@@ -8317,7 +8324,7 @@
         </w:numPr>
         <w:spacing w:before="100" w:beforeAutospacing="1" w:after="90"/>
         <w:ind w:left="1020"/>
-        <w:divId w:val="352536562"/>
+        <w:divId w:val="826241979"/>
         <w:rPr>
           <w:rFonts w:ascii="Plus Jakarta Sans" w:eastAsia="Times New Roman" w:hAnsi="Plus Jakarta Sans"/>
           <w:sz w:val="21"/>
@@ -8362,7 +8369,7 @@
         </w:numPr>
         <w:spacing w:before="100" w:beforeAutospacing="1" w:after="90"/>
         <w:ind w:left="1020"/>
-        <w:divId w:val="352536562"/>
+        <w:divId w:val="826241979"/>
         <w:rPr>
           <w:rFonts w:ascii="Plus Jakarta Sans" w:eastAsia="Times New Roman" w:hAnsi="Plus Jakarta Sans"/>
           <w:sz w:val="21"/>
@@ -8416,7 +8423,7 @@
         </w:numPr>
         <w:spacing w:before="100" w:beforeAutospacing="1" w:after="90"/>
         <w:ind w:left="1020"/>
-        <w:divId w:val="352536562"/>
+        <w:divId w:val="826241979"/>
         <w:rPr>
           <w:rFonts w:ascii="Plus Jakarta Sans" w:eastAsia="Times New Roman" w:hAnsi="Plus Jakarta Sans"/>
           <w:sz w:val="21"/>
@@ -8461,7 +8468,7 @@
         </w:numPr>
         <w:spacing w:before="100" w:beforeAutospacing="1" w:after="90"/>
         <w:ind w:left="1020"/>
-        <w:divId w:val="352536562"/>
+        <w:divId w:val="826241979"/>
         <w:rPr>
           <w:rFonts w:ascii="Plus Jakarta Sans" w:eastAsia="Times New Roman" w:hAnsi="Plus Jakarta Sans"/>
           <w:sz w:val="21"/>
@@ -8497,7 +8504,7 @@
         </w:numPr>
         <w:spacing w:before="100" w:beforeAutospacing="1" w:after="90"/>
         <w:ind w:left="1020"/>
-        <w:divId w:val="352536562"/>
+        <w:divId w:val="826241979"/>
         <w:rPr>
           <w:rFonts w:ascii="Plus Jakarta Sans" w:eastAsia="Times New Roman" w:hAnsi="Plus Jakarta Sans"/>
           <w:sz w:val="21"/>
@@ -8542,7 +8549,7 @@
         </w:numPr>
         <w:spacing w:before="100" w:beforeAutospacing="1" w:after="90"/>
         <w:ind w:left="1020"/>
-        <w:divId w:val="352536562"/>
+        <w:divId w:val="826241979"/>
         <w:rPr>
           <w:rFonts w:ascii="Plus Jakarta Sans" w:eastAsia="Times New Roman" w:hAnsi="Plus Jakarta Sans"/>
           <w:sz w:val="21"/>
@@ -8587,7 +8594,7 @@
         </w:numPr>
         <w:spacing w:before="100" w:beforeAutospacing="1" w:after="90"/>
         <w:ind w:left="1020"/>
-        <w:divId w:val="352536562"/>
+        <w:divId w:val="826241979"/>
         <w:rPr>
           <w:rFonts w:ascii="Plus Jakarta Sans" w:eastAsia="Times New Roman" w:hAnsi="Plus Jakarta Sans"/>
           <w:sz w:val="21"/>
@@ -8632,7 +8639,7 @@
         </w:numPr>
         <w:spacing w:before="100" w:beforeAutospacing="1" w:after="90"/>
         <w:ind w:left="1020"/>
-        <w:divId w:val="352536562"/>
+        <w:divId w:val="826241979"/>
         <w:rPr>
           <w:rFonts w:ascii="Plus Jakarta Sans" w:eastAsia="Times New Roman" w:hAnsi="Plus Jakarta Sans"/>
           <w:sz w:val="21"/>
@@ -8668,7 +8675,7 @@
         </w:numPr>
         <w:spacing w:before="100" w:beforeAutospacing="1" w:after="90"/>
         <w:ind w:left="1020"/>
-        <w:divId w:val="352536562"/>
+        <w:divId w:val="826241979"/>
         <w:rPr>
           <w:rFonts w:ascii="Plus Jakarta Sans" w:eastAsia="Times New Roman" w:hAnsi="Plus Jakarta Sans"/>
           <w:sz w:val="21"/>
@@ -8722,7 +8729,7 @@
         </w:numPr>
         <w:spacing w:before="100" w:beforeAutospacing="1" w:after="90"/>
         <w:ind w:left="1020"/>
-        <w:divId w:val="352536562"/>
+        <w:divId w:val="826241979"/>
         <w:rPr>
           <w:rFonts w:ascii="Plus Jakarta Sans" w:eastAsia="Times New Roman" w:hAnsi="Plus Jakarta Sans"/>
           <w:sz w:val="21"/>
@@ -8767,7 +8774,7 @@
         </w:numPr>
         <w:spacing w:before="100" w:beforeAutospacing="1" w:after="90"/>
         <w:ind w:left="1020"/>
-        <w:divId w:val="352536562"/>
+        <w:divId w:val="826241979"/>
         <w:rPr>
           <w:rFonts w:ascii="Plus Jakarta Sans" w:eastAsia="Times New Roman" w:hAnsi="Plus Jakarta Sans"/>
           <w:sz w:val="21"/>
@@ -8807,7 +8814,7 @@
     <w:p>
       <w:pPr>
         <w:pStyle w:val="Ttulo3"/>
-        <w:divId w:val="352536562"/>
+        <w:divId w:val="826241979"/>
         <w:rPr>
           <w:rFonts w:eastAsia="Times New Roman"/>
           <w:lang w:val="es-ES"/>
@@ -8825,7 +8832,7 @@
       <w:pPr>
         <w:spacing w:before="375" w:after="225"/>
         <w:jc w:val="center"/>
-        <w:divId w:val="2041588286"/>
+        <w:divId w:val="932931812"/>
         <w:rPr>
           <w:rFonts w:ascii="Outfit" w:eastAsia="Times New Roman" w:hAnsi="Outfit"/>
           <w:b/>
@@ -8855,7 +8862,7 @@
       <w:pPr>
         <w:spacing w:after="375"/>
         <w:jc w:val="center"/>
-        <w:divId w:val="471555047"/>
+        <w:divId w:val="537545422"/>
         <w:rPr>
           <w:rFonts w:ascii="Plus Jakarta Sans" w:eastAsia="Times New Roman" w:hAnsi="Plus Jakarta Sans"/>
           <w:lang w:val="es-ES"/>
@@ -9145,7 +9152,7 @@
     <w:p>
       <w:pPr>
         <w:spacing w:before="450" w:after="450"/>
-        <w:divId w:val="352536562"/>
+        <w:divId w:val="826241979"/>
         <w:rPr>
           <w:rFonts w:ascii="Plus Jakarta Sans" w:eastAsia="Times New Roman" w:hAnsi="Plus Jakarta Sans"/>
           <w:lang w:val="es-ES"/>
@@ -9164,7 +9171,7 @@
     <w:p>
       <w:pPr>
         <w:pStyle w:val="Ttulo2"/>
-        <w:divId w:val="352536562"/>
+        <w:divId w:val="826241979"/>
         <w:rPr>
           <w:rFonts w:eastAsia="Times New Roman"/>
           <w:lang w:val="es-ES"/>
@@ -9181,7 +9188,7 @@
     <w:p>
       <w:pPr>
         <w:pStyle w:val="NormalWeb"/>
-        <w:divId w:val="352536562"/>
+        <w:divId w:val="826241979"/>
         <w:rPr>
           <w:rFonts w:ascii="Plus Jakarta Sans" w:hAnsi="Plus Jakarta Sans"/>
           <w:lang w:val="es-ES"/>
@@ -9198,7 +9205,7 @@
     <w:p>
       <w:pPr>
         <w:pStyle w:val="NormalWeb"/>
-        <w:divId w:val="352536562"/>
+        <w:divId w:val="826241979"/>
         <w:rPr>
           <w:rFonts w:ascii="Plus Jakarta Sans" w:hAnsi="Plus Jakarta Sans"/>
           <w:lang w:val="es-ES"/>
@@ -9260,7 +9267,7 @@
     <w:p>
       <w:pPr>
         <w:pStyle w:val="NormalWeb"/>
-        <w:divId w:val="352536562"/>
+        <w:divId w:val="826241979"/>
         <w:rPr>
           <w:rFonts w:ascii="Plus Jakarta Sans" w:hAnsi="Plus Jakarta Sans"/>
           <w:lang w:val="es-ES"/>
@@ -9314,7 +9321,7 @@
     <w:p>
       <w:pPr>
         <w:pStyle w:val="NormalWeb"/>
-        <w:divId w:val="352536562"/>
+        <w:divId w:val="826241979"/>
         <w:rPr>
           <w:rFonts w:ascii="Plus Jakarta Sans" w:hAnsi="Plus Jakarta Sans"/>
           <w:lang w:val="es-ES"/>
@@ -9375,7 +9382,7 @@
     <w:p>
       <w:pPr>
         <w:pStyle w:val="NormalWeb"/>
-        <w:divId w:val="352536562"/>
+        <w:divId w:val="826241979"/>
         <w:rPr>
           <w:rFonts w:ascii="Plus Jakarta Sans" w:hAnsi="Plus Jakarta Sans"/>
           <w:lang w:val="es-ES"/>
@@ -9429,7 +9436,7 @@
     <w:p>
       <w:pPr>
         <w:spacing w:before="450" w:after="450"/>
-        <w:divId w:val="352536562"/>
+        <w:divId w:val="826241979"/>
         <w:rPr>
           <w:rFonts w:ascii="Plus Jakarta Sans" w:eastAsia="Times New Roman" w:hAnsi="Plus Jakarta Sans"/>
           <w:lang w:val="es-ES"/>
@@ -9448,7 +9455,7 @@
     <w:p>
       <w:pPr>
         <w:pStyle w:val="Ttulo2"/>
-        <w:divId w:val="352536562"/>
+        <w:divId w:val="826241979"/>
         <w:rPr>
           <w:rFonts w:eastAsia="Times New Roman"/>
           <w:lang w:val="es-ES"/>
@@ -9465,7 +9472,7 @@
     <w:p>
       <w:pPr>
         <w:pStyle w:val="NormalWeb"/>
-        <w:divId w:val="352536562"/>
+        <w:divId w:val="826241979"/>
         <w:rPr>
           <w:rFonts w:ascii="Plus Jakarta Sans" w:hAnsi="Plus Jakarta Sans"/>
           <w:lang w:val="es-ES"/>
@@ -9504,7 +9511,7 @@
     <w:p>
       <w:pPr>
         <w:pStyle w:val="Ttulo3"/>
-        <w:divId w:val="352536562"/>
+        <w:divId w:val="826241979"/>
         <w:rPr>
           <w:rFonts w:eastAsia="Times New Roman"/>
           <w:lang w:val="es-ES"/>
@@ -9538,7 +9545,7 @@
       </w:tblGrid>
       <w:tr>
         <w:trPr>
-          <w:divId w:val="1057630465"/>
+          <w:divId w:val="1929805285"/>
           <w:tblHeader/>
         </w:trPr>
         <w:tc>
@@ -9729,7 +9736,7 @@
       </w:tr>
       <w:tr>
         <w:trPr>
-          <w:divId w:val="1057630465"/>
+          <w:divId w:val="1929805285"/>
         </w:trPr>
         <w:tc>
           <w:tcPr>
@@ -9885,7 +9892,7 @@
       </w:tr>
       <w:tr>
         <w:trPr>
-          <w:divId w:val="1057630465"/>
+          <w:divId w:val="1929805285"/>
         </w:trPr>
         <w:tc>
           <w:tcPr>
@@ -10041,7 +10048,7 @@
       </w:tr>
       <w:tr>
         <w:trPr>
-          <w:divId w:val="1057630465"/>
+          <w:divId w:val="1929805285"/>
         </w:trPr>
         <w:tc>
           <w:tcPr>
@@ -10197,7 +10204,7 @@
       </w:tr>
       <w:tr>
         <w:trPr>
-          <w:divId w:val="1057630465"/>
+          <w:divId w:val="1929805285"/>
         </w:trPr>
         <w:tc>
           <w:tcPr>
@@ -10359,7 +10366,7 @@
     <w:p>
       <w:pPr>
         <w:pStyle w:val="Ttulo3"/>
-        <w:divId w:val="352536562"/>
+        <w:divId w:val="826241979"/>
         <w:rPr>
           <w:rFonts w:eastAsia="Times New Roman"/>
           <w:lang w:val="es-ES"/>
@@ -10393,7 +10400,7 @@
       </w:tblGrid>
       <w:tr>
         <w:trPr>
-          <w:divId w:val="945696290"/>
+          <w:divId w:val="1330059110"/>
           <w:tblHeader/>
         </w:trPr>
         <w:tc>
@@ -10584,7 +10591,7 @@
       </w:tr>
       <w:tr>
         <w:trPr>
-          <w:divId w:val="945696290"/>
+          <w:divId w:val="1330059110"/>
         </w:trPr>
         <w:tc>
           <w:tcPr>
@@ -10741,7 +10748,7 @@
       </w:tr>
       <w:tr>
         <w:trPr>
-          <w:divId w:val="945696290"/>
+          <w:divId w:val="1330059110"/>
         </w:trPr>
         <w:tc>
           <w:tcPr>
@@ -10900,7 +10907,7 @@
     <w:p>
       <w:pPr>
         <w:pStyle w:val="Ttulo3"/>
-        <w:divId w:val="352536562"/>
+        <w:divId w:val="826241979"/>
         <w:rPr>
           <w:rFonts w:eastAsia="Times New Roman"/>
           <w:lang w:val="es-ES"/>
@@ -10935,7 +10942,7 @@
       </w:tblGrid>
       <w:tr>
         <w:trPr>
-          <w:divId w:val="1829591070"/>
+          <w:divId w:val="1681850948"/>
           <w:tblHeader/>
         </w:trPr>
         <w:tc>
@@ -11163,7 +11170,7 @@
       </w:tr>
       <w:tr>
         <w:trPr>
-          <w:divId w:val="1829591070"/>
+          <w:divId w:val="1681850948"/>
         </w:trPr>
         <w:tc>
           <w:tcPr>
@@ -11359,7 +11366,7 @@
       </w:tr>
       <w:tr>
         <w:trPr>
-          <w:divId w:val="1829591070"/>
+          <w:divId w:val="1681850948"/>
         </w:trPr>
         <w:tc>
           <w:tcPr>
@@ -11544,7 +11551,7 @@
       </w:tr>
       <w:tr>
         <w:trPr>
-          <w:divId w:val="1829591070"/>
+          <w:divId w:val="1681850948"/>
         </w:trPr>
         <w:tc>
           <w:tcPr>
@@ -11742,7 +11749,7 @@
     <w:p>
       <w:pPr>
         <w:pStyle w:val="Ttulo4"/>
-        <w:divId w:val="352536562"/>
+        <w:divId w:val="826241979"/>
         <w:rPr>
           <w:rFonts w:eastAsia="Times New Roman"/>
           <w:lang w:val="es-ES"/>
@@ -11760,7 +11767,7 @@
       <w:pPr>
         <w:spacing w:before="375" w:after="225"/>
         <w:jc w:val="center"/>
-        <w:divId w:val="462386693"/>
+        <w:divId w:val="29035586"/>
         <w:rPr>
           <w:rFonts w:ascii="Outfit" w:eastAsia="Times New Roman" w:hAnsi="Outfit"/>
           <w:b/>
@@ -11790,7 +11797,7 @@
       <w:pPr>
         <w:spacing w:after="375"/>
         <w:jc w:val="center"/>
-        <w:divId w:val="1477720822"/>
+        <w:divId w:val="1202745989"/>
         <w:rPr>
           <w:rFonts w:ascii="Plus Jakarta Sans" w:eastAsia="Times New Roman" w:hAnsi="Plus Jakarta Sans"/>
           <w:lang w:val="es-ES"/>
@@ -12185,7 +12192,7 @@
     <w:p>
       <w:pPr>
         <w:pStyle w:val="Ttulo3"/>
-        <w:divId w:val="352536562"/>
+        <w:divId w:val="826241979"/>
         <w:rPr>
           <w:rFonts w:eastAsia="Times New Roman"/>
           <w:lang w:val="es-ES"/>
@@ -12217,7 +12224,7 @@
       </w:tblGrid>
       <w:tr>
         <w:trPr>
-          <w:divId w:val="1997999716"/>
+          <w:divId w:val="505168946"/>
           <w:tblHeader/>
         </w:trPr>
         <w:tc>
@@ -12334,7 +12341,7 @@
       </w:tr>
       <w:tr>
         <w:trPr>
-          <w:divId w:val="1997999716"/>
+          <w:divId w:val="505168946"/>
         </w:trPr>
         <w:tc>
           <w:tcPr>
@@ -12430,7 +12437,7 @@
       </w:tr>
       <w:tr>
         <w:trPr>
-          <w:divId w:val="1997999716"/>
+          <w:divId w:val="505168946"/>
         </w:trPr>
         <w:tc>
           <w:tcPr>
@@ -12526,7 +12533,7 @@
       </w:tr>
       <w:tr>
         <w:trPr>
-          <w:divId w:val="1997999716"/>
+          <w:divId w:val="505168946"/>
         </w:trPr>
         <w:tc>
           <w:tcPr>
@@ -12624,7 +12631,7 @@
     <w:p>
       <w:pPr>
         <w:pStyle w:val="NormalWeb"/>
-        <w:divId w:val="352536562"/>
+        <w:divId w:val="826241979"/>
         <w:rPr>
           <w:rFonts w:ascii="Plus Jakarta Sans" w:hAnsi="Plus Jakarta Sans"/>
           <w:lang w:val="es-ES"/>
@@ -12649,7 +12656,7 @@
     <w:p>
       <w:pPr>
         <w:pStyle w:val="Ttulo3"/>
-        <w:divId w:val="352536562"/>
+        <w:divId w:val="826241979"/>
         <w:rPr>
           <w:rFonts w:eastAsia="Times New Roman"/>
           <w:lang w:val="es-ES"/>
@@ -12691,7 +12698,7 @@
       </w:tblGrid>
       <w:tr>
         <w:trPr>
-          <w:divId w:val="328480932"/>
+          <w:divId w:val="728505099"/>
           <w:tblHeader/>
         </w:trPr>
         <w:tc>
@@ -12919,7 +12926,7 @@
       </w:tr>
       <w:tr>
         <w:trPr>
-          <w:divId w:val="328480932"/>
+          <w:divId w:val="728505099"/>
         </w:trPr>
         <w:tc>
           <w:tcPr>
@@ -13105,7 +13112,7 @@
       </w:tr>
       <w:tr>
         <w:trPr>
-          <w:divId w:val="328480932"/>
+          <w:divId w:val="728505099"/>
         </w:trPr>
         <w:tc>
           <w:tcPr>
@@ -13291,7 +13298,7 @@
       </w:tr>
       <w:tr>
         <w:trPr>
-          <w:divId w:val="328480932"/>
+          <w:divId w:val="728505099"/>
         </w:trPr>
         <w:tc>
           <w:tcPr>
@@ -13477,7 +13484,7 @@
       </w:tr>
       <w:tr>
         <w:trPr>
-          <w:divId w:val="328480932"/>
+          <w:divId w:val="728505099"/>
         </w:trPr>
         <w:tc>
           <w:tcPr>
@@ -13670,7 +13677,7 @@
     <w:p>
       <w:pPr>
         <w:pStyle w:val="NormalWeb"/>
-        <w:divId w:val="352536562"/>
+        <w:divId w:val="826241979"/>
         <w:rPr>
           <w:rFonts w:ascii="Plus Jakarta Sans" w:hAnsi="Plus Jakarta Sans"/>
           <w:lang w:val="es-ES"/>
@@ -13717,7 +13724,7 @@
     <w:p>
       <w:pPr>
         <w:pStyle w:val="Ttulo3"/>
-        <w:divId w:val="352536562"/>
+        <w:divId w:val="826241979"/>
         <w:rPr>
           <w:rFonts w:eastAsia="Times New Roman"/>
           <w:lang w:val="es-ES"/>
@@ -13752,7 +13759,7 @@
       </w:tblGrid>
       <w:tr>
         <w:trPr>
-          <w:divId w:val="1733188543"/>
+          <w:divId w:val="2045204512"/>
           <w:tblHeader/>
         </w:trPr>
         <w:tc>
@@ -13980,7 +13987,7 @@
       </w:tr>
       <w:tr>
         <w:trPr>
-          <w:divId w:val="1733188543"/>
+          <w:divId w:val="2045204512"/>
         </w:trPr>
         <w:tc>
           <w:tcPr>
@@ -14174,7 +14181,7 @@
       </w:tr>
       <w:tr>
         <w:trPr>
-          <w:divId w:val="1733188543"/>
+          <w:divId w:val="2045204512"/>
         </w:trPr>
         <w:tc>
           <w:tcPr>
@@ -14370,7 +14377,7 @@
     <w:p>
       <w:pPr>
         <w:pStyle w:val="Ttulo4"/>
-        <w:divId w:val="352536562"/>
+        <w:divId w:val="826241979"/>
         <w:rPr>
           <w:rFonts w:eastAsia="Times New Roman"/>
           <w:lang w:val="es-ES"/>
@@ -14388,7 +14395,7 @@
       <w:pPr>
         <w:spacing w:before="375" w:after="225"/>
         <w:jc w:val="center"/>
-        <w:divId w:val="1086927358"/>
+        <w:divId w:val="1473717990"/>
         <w:rPr>
           <w:rFonts w:ascii="Outfit" w:eastAsia="Times New Roman" w:hAnsi="Outfit"/>
           <w:b/>
@@ -14418,7 +14425,7 @@
       <w:pPr>
         <w:spacing w:after="375"/>
         <w:jc w:val="center"/>
-        <w:divId w:val="2132241711"/>
+        <w:divId w:val="1332295772"/>
         <w:rPr>
           <w:rFonts w:ascii="Plus Jakarta Sans" w:eastAsia="Times New Roman" w:hAnsi="Plus Jakarta Sans"/>
           <w:lang w:val="es-ES"/>
@@ -14806,7 +14813,7 @@
     <w:p>
       <w:pPr>
         <w:pStyle w:val="Ttulo3"/>
-        <w:divId w:val="352536562"/>
+        <w:divId w:val="826241979"/>
         <w:rPr>
           <w:rFonts w:eastAsia="Times New Roman"/>
           <w:lang w:val="es-ES"/>
@@ -14840,7 +14847,7 @@
       </w:tblGrid>
       <w:tr>
         <w:trPr>
-          <w:divId w:val="837380940"/>
+          <w:divId w:val="417946447"/>
           <w:tblHeader/>
         </w:trPr>
         <w:tc>
@@ -15031,7 +15038,7 @@
       </w:tr>
       <w:tr>
         <w:trPr>
-          <w:divId w:val="837380940"/>
+          <w:divId w:val="417946447"/>
         </w:trPr>
         <w:tc>
           <w:tcPr>
@@ -15187,7 +15194,7 @@
       </w:tr>
       <w:tr>
         <w:trPr>
-          <w:divId w:val="837380940"/>
+          <w:divId w:val="417946447"/>
         </w:trPr>
         <w:tc>
           <w:tcPr>
@@ -15343,7 +15350,7 @@
       </w:tr>
       <w:tr>
         <w:trPr>
-          <w:divId w:val="837380940"/>
+          <w:divId w:val="417946447"/>
         </w:trPr>
         <w:tc>
           <w:tcPr>
@@ -15499,7 +15506,7 @@
       </w:tr>
       <w:tr>
         <w:trPr>
-          <w:divId w:val="837380940"/>
+          <w:divId w:val="417946447"/>
         </w:trPr>
         <w:tc>
           <w:tcPr>
@@ -15655,7 +15662,7 @@
       </w:tr>
       <w:tr>
         <w:trPr>
-          <w:divId w:val="837380940"/>
+          <w:divId w:val="417946447"/>
         </w:trPr>
         <w:tc>
           <w:tcPr>
@@ -15811,7 +15818,7 @@
       </w:tr>
       <w:tr>
         <w:trPr>
-          <w:divId w:val="837380940"/>
+          <w:divId w:val="417946447"/>
         </w:trPr>
         <w:tc>
           <w:tcPr>
@@ -15969,7 +15976,7 @@
     <w:p>
       <w:pPr>
         <w:pStyle w:val="Ttulo3"/>
-        <w:divId w:val="352536562"/>
+        <w:divId w:val="826241979"/>
         <w:rPr>
           <w:rFonts w:eastAsia="Times New Roman"/>
           <w:lang w:val="es-ES"/>
@@ -16003,7 +16010,7 @@
       </w:tblGrid>
       <w:tr>
         <w:trPr>
-          <w:divId w:val="984436155"/>
+          <w:divId w:val="987201251"/>
           <w:tblHeader/>
         </w:trPr>
         <w:tc>
@@ -16194,7 +16201,7 @@
       </w:tr>
       <w:tr>
         <w:trPr>
-          <w:divId w:val="984436155"/>
+          <w:divId w:val="987201251"/>
         </w:trPr>
         <w:tc>
           <w:tcPr>
@@ -16350,7 +16357,7 @@
       </w:tr>
       <w:tr>
         <w:trPr>
-          <w:divId w:val="984436155"/>
+          <w:divId w:val="987201251"/>
         </w:trPr>
         <w:tc>
           <w:tcPr>
@@ -16506,7 +16513,7 @@
       </w:tr>
       <w:tr>
         <w:trPr>
-          <w:divId w:val="984436155"/>
+          <w:divId w:val="987201251"/>
         </w:trPr>
         <w:tc>
           <w:tcPr>
@@ -16662,7 +16669,7 @@
       </w:tr>
       <w:tr>
         <w:trPr>
-          <w:divId w:val="984436155"/>
+          <w:divId w:val="987201251"/>
         </w:trPr>
         <w:tc>
           <w:tcPr>
@@ -16818,7 +16825,7 @@
       </w:tr>
       <w:tr>
         <w:trPr>
-          <w:divId w:val="984436155"/>
+          <w:divId w:val="987201251"/>
         </w:trPr>
         <w:tc>
           <w:tcPr>
@@ -16976,7 +16983,7 @@
     <w:p>
       <w:pPr>
         <w:pStyle w:val="Ttulo3"/>
-        <w:divId w:val="352536562"/>
+        <w:divId w:val="826241979"/>
         <w:rPr>
           <w:rFonts w:eastAsia="Times New Roman"/>
           <w:lang w:val="es-ES"/>
@@ -17010,7 +17017,7 @@
       </w:tblGrid>
       <w:tr>
         <w:trPr>
-          <w:divId w:val="206644266"/>
+          <w:divId w:val="1419205223"/>
           <w:tblHeader/>
         </w:trPr>
         <w:tc>
@@ -17201,7 +17208,7 @@
       </w:tr>
       <w:tr>
         <w:trPr>
-          <w:divId w:val="206644266"/>
+          <w:divId w:val="1419205223"/>
         </w:trPr>
         <w:tc>
           <w:tcPr>
@@ -17357,7 +17364,7 @@
       </w:tr>
       <w:tr>
         <w:trPr>
-          <w:divId w:val="206644266"/>
+          <w:divId w:val="1419205223"/>
         </w:trPr>
         <w:tc>
           <w:tcPr>
@@ -17515,7 +17522,7 @@
     <w:p>
       <w:pPr>
         <w:pStyle w:val="Ttulo4"/>
-        <w:divId w:val="352536562"/>
+        <w:divId w:val="826241979"/>
         <w:rPr>
           <w:rFonts w:eastAsia="Times New Roman"/>
           <w:lang w:val="es-ES"/>
@@ -17533,7 +17540,7 @@
       <w:pPr>
         <w:spacing w:before="375" w:after="225"/>
         <w:jc w:val="center"/>
-        <w:divId w:val="1708483866"/>
+        <w:divId w:val="936526817"/>
         <w:rPr>
           <w:rFonts w:ascii="Outfit" w:eastAsia="Times New Roman" w:hAnsi="Outfit"/>
           <w:b/>
@@ -17563,7 +17570,7 @@
       <w:pPr>
         <w:spacing w:after="375"/>
         <w:jc w:val="center"/>
-        <w:divId w:val="1136339715"/>
+        <w:divId w:val="548952218"/>
         <w:rPr>
           <w:rFonts w:ascii="Plus Jakarta Sans" w:eastAsia="Times New Roman" w:hAnsi="Plus Jakarta Sans"/>
           <w:lang w:val="es-ES"/>
@@ -17951,7 +17958,7 @@
     <w:p>
       <w:pPr>
         <w:spacing w:before="450" w:after="450"/>
-        <w:divId w:val="352536562"/>
+        <w:divId w:val="826241979"/>
         <w:rPr>
           <w:rFonts w:ascii="Plus Jakarta Sans" w:eastAsia="Times New Roman" w:hAnsi="Plus Jakarta Sans"/>
           <w:lang w:val="es-ES"/>
@@ -17970,7 +17977,7 @@
     <w:p>
       <w:pPr>
         <w:spacing w:before="450" w:after="450"/>
-        <w:divId w:val="352536562"/>
+        <w:divId w:val="826241979"/>
         <w:rPr>
           <w:rFonts w:ascii="Plus Jakarta Sans" w:eastAsia="Times New Roman" w:hAnsi="Plus Jakarta Sans"/>
           <w:lang w:val="es-ES"/>
@@ -17989,7 +17996,7 @@
     <w:p>
       <w:pPr>
         <w:pStyle w:val="NormalWeb"/>
-        <w:divId w:val="352536562"/>
+        <w:divId w:val="826241979"/>
         <w:rPr>
           <w:rFonts w:ascii="Plus Jakarta Sans" w:hAnsi="Plus Jakarta Sans"/>
           <w:lang w:val="es-ES"/>
@@ -18038,9 +18045,9 @@
 <file path=word/numbering.xml><?xml version="1.0" encoding="utf-8"?>
 <w:numbering xmlns:wpc="http://schemas.microsoft.com/office/word/2010/wordprocessingCanvas" xmlns:cx="http://schemas.microsoft.com/office/drawing/2014/chartex" xmlns:cx1="http://schemas.microsoft.com/office/drawing/2015/9/8/chartex" xmlns:cx2="http://schemas.microsoft.com/office/drawing/2015/10/21/chartex" xmlns:cx3="http://schemas.microsoft.com/office/drawing/2016/5/9/chartex" xmlns:cx4="http://schemas.microsoft.com/office/drawing/2016/5/10/chartex" xmlns:cx5="http://schemas.microsoft.com/office/drawing/2016/5/11/chartex" xmlns:cx6="http://schemas.microsoft.com/office/drawing/2016/5/12/chartex" xmlns:cx7="http://schemas.microsoft.com/office/drawing/2016/5/13/chartex" xmlns:cx8="http://schemas.microsoft.com/office/drawing/2016/5/14/chartex" xmlns:mc="http://schemas.openxmlformats.org/markup-compatibility/2006" xmlns:aink="http://schemas.microsoft.com/office/drawing/2016/ink" xmlns:am3d="http://schemas.microsoft.com/office/drawing/2017/model3d" xmlns:o="urn:schemas-microsoft-com:office:office" xmlns:r="http://schemas.openxmlformats.org/officeDocument/2006/relationships" xmlns:m="http://schemas.openxmlformats.org/officeDocument/2006/math" xmlns:v="urn:schemas-microsoft-com:vml" xmlns:wp14="http://schemas.microsoft.com/office/word/2010/wordprocessingDrawing" xmlns:wp="http://schemas.openxmlformats.org/drawingml/2006/wordprocessingDrawing" xmlns:w10="urn:schemas-microsoft-com:office:word" xmlns:w="http://schemas.openxmlformats.org/wordprocessingml/2006/main" xmlns:w14="http://schemas.microsoft.com/office/word/2010/wordml" xmlns:w15="http://schemas.microsoft.com/office/word/2012/wordml" xmlns:w16cex="http://schemas.microsoft.com/office/word/2018/wordml/cex" xmlns:w16cid="http://schemas.microsoft.com/office/word/2016/wordml/cid" xmlns:w16="http://schemas.microsoft.com/office/word/2018/wordml" xmlns:w16sdtdh="http://schemas.microsoft.com/office/word/2020/wordml/sdtdatahash" xmlns:w16se="http://schemas.microsoft.com/office/word/2015/wordml/symex" xmlns:wpg="http://schemas.microsoft.com/office/word/2010/wordprocessingGroup" xmlns:wpi="http://schemas.microsoft.com/office/word/2010/wordprocessingInk" xmlns:wne="http://schemas.microsoft.com/office/word/2006/wordml" xmlns:wps="http://schemas.microsoft.com/office/word/2010/wordprocessingShape" mc:Ignorable="w14 w15 w16se w16cid w16 w16cex w16sdtdh wp14">
   <w:abstractNum w:abstractNumId="0" w15:restartNumberingAfterBreak="0">
-    <w:nsid w:val="0EA4532B"/>
+    <w:nsid w:val="12DD5F3A"/>
     <w:multiLevelType w:val="multilevel"/>
-    <w:tmpl w:val="DE562B3E"/>
+    <w:tmpl w:val="1C2E7A76"/>
     <w:lvl w:ilvl="0">
       <w:start w:val="1"/>
       <w:numFmt w:val="bullet"/>
@@ -18187,9 +18194,9 @@
     </w:lvl>
   </w:abstractNum>
   <w:abstractNum w:abstractNumId="1" w15:restartNumberingAfterBreak="0">
-    <w:nsid w:val="11145B2D"/>
+    <w:nsid w:val="57F40478"/>
     <w:multiLevelType w:val="multilevel"/>
-    <w:tmpl w:val="13E222FA"/>
+    <w:tmpl w:val="315042A2"/>
     <w:lvl w:ilvl="0">
       <w:start w:val="1"/>
       <w:numFmt w:val="bullet"/>
@@ -18336,9 +18343,9 @@
     </w:lvl>
   </w:abstractNum>
   <w:abstractNum w:abstractNumId="2" w15:restartNumberingAfterBreak="0">
-    <w:nsid w:val="5DD80196"/>
+    <w:nsid w:val="7B9F5532"/>
     <w:multiLevelType w:val="multilevel"/>
-    <w:tmpl w:val="00CCDED8"/>
+    <w:tmpl w:val="73C0234C"/>
     <w:lvl w:ilvl="0">
       <w:start w:val="1"/>
       <w:numFmt w:val="bullet"/>
@@ -18485,9 +18492,9 @@
     </w:lvl>
   </w:abstractNum>
   <w:abstractNum w:abstractNumId="3" w15:restartNumberingAfterBreak="0">
-    <w:nsid w:val="7F8A1D43"/>
+    <w:nsid w:val="7E345565"/>
     <w:multiLevelType w:val="multilevel"/>
-    <w:tmpl w:val="8BAE3D82"/>
+    <w:tmpl w:val="A674621E"/>
     <w:lvl w:ilvl="0">
       <w:start w:val="1"/>
       <w:numFmt w:val="bullet"/>
@@ -18634,16 +18641,16 @@
     </w:lvl>
   </w:abstractNum>
   <w:num w:numId="1">
-    <w:abstractNumId w:val="2"/>
+    <w:abstractNumId w:val="0"/>
   </w:num>
   <w:num w:numId="2">
-    <w:abstractNumId w:val="0"/>
+    <w:abstractNumId w:val="3"/>
   </w:num>
   <w:num w:numId="3">
     <w:abstractNumId w:val="1"/>
   </w:num>
   <w:num w:numId="4">
-    <w:abstractNumId w:val="3"/>
+    <w:abstractNumId w:val="2"/>
   </w:num>
 </w:numbering>
 </file>

</xml_diff>

<commit_message>
data: sincronizacion desde QFieldCloud (4347 fichas principales + 2409 adicionales)
</commit_message>
<xml_diff>
--- a/public/informe_reunion_tecnica.docx
+++ b/public/informe_reunion_tecnica.docx
@@ -4,7 +4,7 @@
   <w:body>
     <w:p>
       <w:pPr>
-        <w:divId w:val="2115511730"/>
+        <w:divId w:val="1109354478"/>
         <w:rPr>
           <w:rFonts w:ascii="Plus Jakarta Sans" w:eastAsia="Times New Roman" w:hAnsi="Plus Jakarta Sans"/>
           <w:lang w:val="es-ES"/>
@@ -28,7 +28,7 @@
     <w:p>
       <w:pPr>
         <w:pStyle w:val="Ttulo1"/>
-        <w:divId w:val="777528882"/>
+        <w:divId w:val="1873178777"/>
         <w:rPr>
           <w:rFonts w:eastAsia="Times New Roman"/>
           <w:lang w:val="es-ES"/>
@@ -45,7 +45,7 @@
     <w:p>
       <w:pPr>
         <w:pStyle w:val="NormalWeb"/>
-        <w:divId w:val="777528882"/>
+        <w:divId w:val="1873178777"/>
         <w:rPr>
           <w:rFonts w:ascii="Plus Jakarta Sans" w:hAnsi="Plus Jakarta Sans"/>
           <w:lang w:val="es-ES"/>
@@ -63,7 +63,7 @@
     <w:p>
       <w:pPr>
         <w:pStyle w:val="NormalWeb"/>
-        <w:divId w:val="777528882"/>
+        <w:divId w:val="1873178777"/>
         <w:rPr>
           <w:rFonts w:ascii="Plus Jakarta Sans" w:hAnsi="Plus Jakarta Sans"/>
           <w:lang w:val="es-ES"/>
@@ -102,7 +102,7 @@
     <w:p>
       <w:pPr>
         <w:spacing w:before="450" w:after="450"/>
-        <w:divId w:val="777528882"/>
+        <w:divId w:val="1873178777"/>
         <w:rPr>
           <w:rFonts w:ascii="Plus Jakarta Sans" w:eastAsia="Times New Roman" w:hAnsi="Plus Jakarta Sans"/>
           <w:lang w:val="es-ES"/>
@@ -113,7 +113,7 @@
           <w:rFonts w:ascii="Plus Jakarta Sans" w:eastAsia="Times New Roman" w:hAnsi="Plus Jakarta Sans"/>
           <w:lang w:val="es-ES"/>
         </w:rPr>
-        <w:pict>
+        <w:pict w14:anchorId="4710B897">
           <v:rect id="_x0000_i1025" style="width:0;height:.75pt" o:hralign="center" o:hrstd="t" o:hr="t" fillcolor="#a0a0a0" stroked="f"/>
         </w:pict>
       </w:r>
@@ -121,7 +121,7 @@
     <w:p>
       <w:pPr>
         <w:pStyle w:val="Ttulo2"/>
-        <w:divId w:val="777528882"/>
+        <w:divId w:val="1873178777"/>
         <w:rPr>
           <w:rFonts w:eastAsia="Times New Roman"/>
           <w:lang w:val="es-ES"/>
@@ -145,7 +145,7 @@
     <w:p>
       <w:pPr>
         <w:pStyle w:val="NormalWeb"/>
-        <w:divId w:val="777528882"/>
+        <w:divId w:val="1873178777"/>
         <w:rPr>
           <w:rFonts w:ascii="Plus Jakarta Sans" w:hAnsi="Plus Jakarta Sans"/>
           <w:lang w:val="es-ES"/>
@@ -167,7 +167,7 @@
         </w:numPr>
         <w:spacing w:before="100" w:beforeAutospacing="1" w:after="90"/>
         <w:ind w:left="1020"/>
-        <w:divId w:val="777528882"/>
+        <w:divId w:val="1873178777"/>
         <w:rPr>
           <w:rFonts w:ascii="Plus Jakarta Sans" w:eastAsia="Times New Roman" w:hAnsi="Plus Jakarta Sans"/>
           <w:sz w:val="21"/>
@@ -213,7 +213,7 @@
         </w:numPr>
         <w:spacing w:before="100" w:beforeAutospacing="1" w:after="90"/>
         <w:ind w:left="1020"/>
-        <w:divId w:val="777528882"/>
+        <w:divId w:val="1873178777"/>
         <w:rPr>
           <w:rFonts w:ascii="Plus Jakarta Sans" w:eastAsia="Times New Roman" w:hAnsi="Plus Jakarta Sans"/>
           <w:sz w:val="21"/>
@@ -269,7 +269,7 @@
         </w:numPr>
         <w:spacing w:before="100" w:beforeAutospacing="1" w:after="90"/>
         <w:ind w:left="1020"/>
-        <w:divId w:val="777528882"/>
+        <w:divId w:val="1873178777"/>
         <w:rPr>
           <w:rFonts w:ascii="Plus Jakarta Sans" w:eastAsia="Times New Roman" w:hAnsi="Plus Jakarta Sans"/>
           <w:sz w:val="21"/>
@@ -315,7 +315,7 @@
         </w:numPr>
         <w:spacing w:before="100" w:beforeAutospacing="1" w:after="90"/>
         <w:ind w:left="1020"/>
-        <w:divId w:val="777528882"/>
+        <w:divId w:val="1873178777"/>
         <w:rPr>
           <w:rFonts w:ascii="Plus Jakarta Sans" w:eastAsia="Times New Roman" w:hAnsi="Plus Jakarta Sans"/>
           <w:sz w:val="21"/>
@@ -356,7 +356,7 @@
     <w:p>
       <w:pPr>
         <w:spacing w:before="450" w:after="450"/>
-        <w:divId w:val="777528882"/>
+        <w:divId w:val="1873178777"/>
         <w:rPr>
           <w:rFonts w:ascii="Plus Jakarta Sans" w:eastAsia="Times New Roman" w:hAnsi="Plus Jakarta Sans"/>
           <w:lang w:val="es-ES"/>
@@ -367,7 +367,7 @@
           <w:rFonts w:ascii="Plus Jakarta Sans" w:eastAsia="Times New Roman" w:hAnsi="Plus Jakarta Sans"/>
           <w:lang w:val="es-ES"/>
         </w:rPr>
-        <w:pict>
+        <w:pict w14:anchorId="67865CCF">
           <v:rect id="_x0000_i1026" style="width:0;height:.75pt" o:hralign="center" o:hrstd="t" o:hr="t" fillcolor="#a0a0a0" stroked="f"/>
         </w:pict>
       </w:r>
@@ -375,7 +375,7 @@
     <w:p>
       <w:pPr>
         <w:pStyle w:val="Ttulo2"/>
-        <w:divId w:val="777528882"/>
+        <w:divId w:val="1873178777"/>
         <w:rPr>
           <w:rFonts w:eastAsia="Times New Roman"/>
           <w:lang w:val="es-ES"/>
@@ -392,7 +392,7 @@
     <w:p>
       <w:pPr>
         <w:pStyle w:val="NormalWeb"/>
-        <w:divId w:val="777528882"/>
+        <w:divId w:val="1873178777"/>
         <w:rPr>
           <w:rFonts w:ascii="Plus Jakarta Sans" w:hAnsi="Plus Jakarta Sans"/>
           <w:lang w:val="es-ES"/>
@@ -445,7 +445,7 @@
       </w:tblGrid>
       <w:tr>
         <w:trPr>
-          <w:divId w:val="942228928"/>
+          <w:divId w:val="2118134554"/>
           <w:tblHeader/>
         </w:trPr>
         <w:tc>
@@ -525,7 +525,7 @@
       </w:tr>
       <w:tr>
         <w:trPr>
-          <w:divId w:val="942228928"/>
+          <w:divId w:val="2118134554"/>
         </w:trPr>
         <w:tc>
           <w:tcPr>
@@ -591,7 +591,7 @@
       </w:tr>
       <w:tr>
         <w:trPr>
-          <w:divId w:val="942228928"/>
+          <w:divId w:val="2118134554"/>
         </w:trPr>
         <w:tc>
           <w:tcPr>
@@ -657,7 +657,7 @@
       </w:tr>
       <w:tr>
         <w:trPr>
-          <w:divId w:val="942228928"/>
+          <w:divId w:val="2118134554"/>
         </w:trPr>
         <w:tc>
           <w:tcPr>
@@ -723,7 +723,7 @@
       </w:tr>
       <w:tr>
         <w:trPr>
-          <w:divId w:val="942228928"/>
+          <w:divId w:val="2118134554"/>
         </w:trPr>
         <w:tc>
           <w:tcPr>
@@ -791,7 +791,7 @@
     <w:p>
       <w:pPr>
         <w:spacing w:before="450" w:after="450"/>
-        <w:divId w:val="777528882"/>
+        <w:divId w:val="1873178777"/>
         <w:rPr>
           <w:rFonts w:ascii="Plus Jakarta Sans" w:eastAsia="Times New Roman" w:hAnsi="Plus Jakarta Sans"/>
           <w:lang w:val="es-ES"/>
@@ -803,7 +803,7 @@
           <w:lang w:val="es-ES"/>
         </w:rPr>
         <w:lastRenderedPageBreak/>
-        <w:pict>
+        <w:pict w14:anchorId="28A36DE2">
           <v:rect id="_x0000_i1027" style="width:0;height:.75pt" o:hralign="center" o:hrstd="t" o:hr="t" fillcolor="#a0a0a0" stroked="f"/>
         </w:pict>
       </w:r>
@@ -811,7 +811,7 @@
     <w:p>
       <w:pPr>
         <w:pStyle w:val="Ttulo2"/>
-        <w:divId w:val="777528882"/>
+        <w:divId w:val="1873178777"/>
         <w:rPr>
           <w:rFonts w:eastAsia="Times New Roman"/>
           <w:lang w:val="es-ES"/>
@@ -828,7 +828,7 @@
     <w:p>
       <w:pPr>
         <w:pStyle w:val="Ttulo3"/>
-        <w:divId w:val="777528882"/>
+        <w:divId w:val="1873178777"/>
         <w:rPr>
           <w:rFonts w:eastAsia="Times New Roman"/>
           <w:lang w:val="es-ES"/>
@@ -845,7 +845,7 @@
     <w:p>
       <w:pPr>
         <w:pStyle w:val="NormalWeb"/>
-        <w:divId w:val="777528882"/>
+        <w:divId w:val="1873178777"/>
         <w:rPr>
           <w:rFonts w:ascii="Plus Jakarta Sans" w:hAnsi="Plus Jakarta Sans"/>
           <w:lang w:val="es-ES"/>
@@ -885,7 +885,7 @@
       </w:tblGrid>
       <w:tr>
         <w:trPr>
-          <w:divId w:val="2036080711"/>
+          <w:divId w:val="1462730294"/>
           <w:tblHeader/>
         </w:trPr>
         <w:tc>
@@ -1039,7 +1039,7 @@
       </w:tr>
       <w:tr>
         <w:trPr>
-          <w:divId w:val="2036080711"/>
+          <w:divId w:val="1462730294"/>
         </w:trPr>
         <w:tc>
           <w:tcPr>
@@ -1165,7 +1165,7 @@
       </w:tr>
       <w:tr>
         <w:trPr>
-          <w:divId w:val="2036080711"/>
+          <w:divId w:val="1462730294"/>
         </w:trPr>
         <w:tc>
           <w:tcPr>
@@ -1291,7 +1291,7 @@
       </w:tr>
       <w:tr>
         <w:trPr>
-          <w:divId w:val="2036080711"/>
+          <w:divId w:val="1462730294"/>
         </w:trPr>
         <w:tc>
           <w:tcPr>
@@ -1417,7 +1417,7 @@
       </w:tr>
       <w:tr>
         <w:trPr>
-          <w:divId w:val="2036080711"/>
+          <w:divId w:val="1462730294"/>
         </w:trPr>
         <w:tc>
           <w:tcPr>
@@ -1543,7 +1543,7 @@
       </w:tr>
       <w:tr>
         <w:trPr>
-          <w:divId w:val="2036080711"/>
+          <w:divId w:val="1462730294"/>
         </w:trPr>
         <w:tc>
           <w:tcPr>
@@ -1677,7 +1677,7 @@
       </w:tr>
       <w:tr>
         <w:trPr>
-          <w:divId w:val="2036080711"/>
+          <w:divId w:val="1462730294"/>
         </w:trPr>
         <w:tc>
           <w:tcPr>
@@ -1803,7 +1803,7 @@
       </w:tr>
       <w:tr>
         <w:trPr>
-          <w:divId w:val="2036080711"/>
+          <w:divId w:val="1462730294"/>
         </w:trPr>
         <w:tc>
           <w:tcPr>
@@ -1929,7 +1929,7 @@
       </w:tr>
       <w:tr>
         <w:trPr>
-          <w:divId w:val="2036080711"/>
+          <w:divId w:val="1462730294"/>
         </w:trPr>
         <w:tc>
           <w:tcPr>
@@ -2057,7 +2057,7 @@
     <w:p>
       <w:pPr>
         <w:pStyle w:val="Ttulo3"/>
-        <w:divId w:val="777528882"/>
+        <w:divId w:val="1873178777"/>
         <w:rPr>
           <w:rFonts w:eastAsia="Times New Roman"/>
           <w:lang w:val="es-ES"/>
@@ -2074,7 +2074,7 @@
     <w:p>
       <w:pPr>
         <w:pStyle w:val="NormalWeb"/>
-        <w:divId w:val="777528882"/>
+        <w:divId w:val="1873178777"/>
         <w:rPr>
           <w:rFonts w:ascii="Plus Jakarta Sans" w:hAnsi="Plus Jakarta Sans"/>
           <w:lang w:val="es-ES"/>
@@ -2103,7 +2103,7 @@
         </w:numPr>
         <w:spacing w:before="100" w:beforeAutospacing="1" w:after="90"/>
         <w:ind w:left="1020"/>
-        <w:divId w:val="777528882"/>
+        <w:divId w:val="1873178777"/>
         <w:rPr>
           <w:rFonts w:ascii="Plus Jakarta Sans" w:eastAsia="Times New Roman" w:hAnsi="Plus Jakarta Sans"/>
           <w:sz w:val="21"/>
@@ -2205,7 +2205,7 @@
         </w:numPr>
         <w:spacing w:before="100" w:beforeAutospacing="1" w:after="90"/>
         <w:ind w:left="1020"/>
-        <w:divId w:val="777528882"/>
+        <w:divId w:val="1873178777"/>
         <w:rPr>
           <w:rFonts w:ascii="Plus Jakarta Sans" w:eastAsia="Times New Roman" w:hAnsi="Plus Jakarta Sans"/>
           <w:sz w:val="21"/>
@@ -2317,7 +2317,7 @@
         </w:numPr>
         <w:spacing w:before="100" w:beforeAutospacing="1" w:after="90"/>
         <w:ind w:left="1020"/>
-        <w:divId w:val="777528882"/>
+        <w:divId w:val="1873178777"/>
         <w:rPr>
           <w:rFonts w:ascii="Plus Jakarta Sans" w:eastAsia="Times New Roman" w:hAnsi="Plus Jakarta Sans"/>
           <w:sz w:val="21"/>
@@ -2423,7 +2423,7 @@
     <w:p>
       <w:pPr>
         <w:pStyle w:val="Ttulo3"/>
-        <w:divId w:val="777528882"/>
+        <w:divId w:val="1873178777"/>
         <w:rPr>
           <w:rFonts w:eastAsia="Times New Roman"/>
           <w:lang w:val="es-ES"/>
@@ -2439,9 +2439,8 @@
     </w:p>
     <w:p>
       <w:pPr>
-        <w:spacing w:before="375" w:after="225"/>
         <w:jc w:val="center"/>
-        <w:divId w:val="1333871747"/>
+        <w:divId w:val="1132670062"/>
         <w:rPr>
           <w:rFonts w:ascii="Outfit" w:eastAsia="Times New Roman" w:hAnsi="Outfit"/>
           <w:b/>
@@ -2469,9 +2468,8 @@
     </w:p>
     <w:p>
       <w:pPr>
-        <w:spacing w:after="375"/>
         <w:jc w:val="center"/>
-        <w:divId w:val="1995059748"/>
+        <w:divId w:val="2108453403"/>
         <w:rPr>
           <w:rFonts w:ascii="Plus Jakarta Sans" w:eastAsia="Times New Roman" w:hAnsi="Plus Jakarta Sans"/>
           <w:lang w:val="es-ES"/>
@@ -2866,7 +2864,7 @@
     <w:p>
       <w:pPr>
         <w:spacing w:before="450" w:after="450"/>
-        <w:divId w:val="777528882"/>
+        <w:divId w:val="1873178777"/>
         <w:rPr>
           <w:rFonts w:ascii="Plus Jakarta Sans" w:eastAsia="Times New Roman" w:hAnsi="Plus Jakarta Sans"/>
           <w:lang w:val="es-ES"/>
@@ -2877,7 +2875,7 @@
           <w:rFonts w:ascii="Plus Jakarta Sans" w:eastAsia="Times New Roman" w:hAnsi="Plus Jakarta Sans"/>
           <w:lang w:val="es-ES"/>
         </w:rPr>
-        <w:pict>
+        <w:pict w14:anchorId="20BB342C">
           <v:rect id="_x0000_i1028" style="width:0;height:.75pt" o:hralign="center" o:hrstd="t" o:hr="t" fillcolor="#a0a0a0" stroked="f"/>
         </w:pict>
       </w:r>
@@ -2885,7 +2883,7 @@
     <w:p>
       <w:pPr>
         <w:pStyle w:val="Ttulo3"/>
-        <w:divId w:val="777528882"/>
+        <w:divId w:val="1873178777"/>
         <w:rPr>
           <w:rFonts w:eastAsia="Times New Roman"/>
           <w:lang w:val="es-ES"/>
@@ -2902,7 +2900,7 @@
     <w:p>
       <w:pPr>
         <w:pStyle w:val="NormalWeb"/>
-        <w:divId w:val="777528882"/>
+        <w:divId w:val="1873178777"/>
         <w:rPr>
           <w:rFonts w:ascii="Plus Jakarta Sans" w:hAnsi="Plus Jakarta Sans"/>
           <w:lang w:val="es-ES"/>
@@ -2935,7 +2933,7 @@
       </w:tblGrid>
       <w:tr>
         <w:trPr>
-          <w:divId w:val="242303269"/>
+          <w:divId w:val="758865793"/>
           <w:tblHeader/>
         </w:trPr>
         <w:tc>
@@ -3089,7 +3087,7 @@
       </w:tr>
       <w:tr>
         <w:trPr>
-          <w:divId w:val="242303269"/>
+          <w:divId w:val="758865793"/>
         </w:trPr>
         <w:tc>
           <w:tcPr>
@@ -3223,7 +3221,7 @@
       </w:tr>
       <w:tr>
         <w:trPr>
-          <w:divId w:val="242303269"/>
+          <w:divId w:val="758865793"/>
         </w:trPr>
         <w:tc>
           <w:tcPr>
@@ -3357,7 +3355,7 @@
       </w:tr>
       <w:tr>
         <w:trPr>
-          <w:divId w:val="242303269"/>
+          <w:divId w:val="758865793"/>
         </w:trPr>
         <w:tc>
           <w:tcPr>
@@ -3491,7 +3489,7 @@
       </w:tr>
       <w:tr>
         <w:trPr>
-          <w:divId w:val="242303269"/>
+          <w:divId w:val="758865793"/>
         </w:trPr>
         <w:tc>
           <w:tcPr>
@@ -3625,7 +3623,7 @@
       </w:tr>
       <w:tr>
         <w:trPr>
-          <w:divId w:val="242303269"/>
+          <w:divId w:val="758865793"/>
         </w:trPr>
         <w:tc>
           <w:tcPr>
@@ -3759,7 +3757,7 @@
       </w:tr>
       <w:tr>
         <w:trPr>
-          <w:divId w:val="242303269"/>
+          <w:divId w:val="758865793"/>
         </w:trPr>
         <w:tc>
           <w:tcPr>
@@ -3895,7 +3893,7 @@
     <w:p>
       <w:pPr>
         <w:pStyle w:val="Ttulo3"/>
-        <w:divId w:val="777528882"/>
+        <w:divId w:val="1873178777"/>
         <w:rPr>
           <w:rFonts w:eastAsia="Times New Roman"/>
           <w:lang w:val="es-ES"/>
@@ -3911,9 +3909,8 @@
     </w:p>
     <w:p>
       <w:pPr>
-        <w:spacing w:before="375" w:after="225"/>
         <w:jc w:val="center"/>
-        <w:divId w:val="1229152367"/>
+        <w:divId w:val="2046711728"/>
         <w:rPr>
           <w:rFonts w:ascii="Outfit" w:eastAsia="Times New Roman" w:hAnsi="Outfit"/>
           <w:b/>
@@ -3941,9 +3938,8 @@
     </w:p>
     <w:p>
       <w:pPr>
-        <w:spacing w:after="375"/>
         <w:jc w:val="center"/>
-        <w:divId w:val="339240226"/>
+        <w:divId w:val="766923443"/>
         <w:rPr>
           <w:rFonts w:ascii="Plus Jakarta Sans" w:eastAsia="Times New Roman" w:hAnsi="Plus Jakarta Sans"/>
           <w:lang w:val="es-ES"/>
@@ -4317,7 +4313,7 @@
     <w:p>
       <w:pPr>
         <w:spacing w:before="450" w:after="450"/>
-        <w:divId w:val="777528882"/>
+        <w:divId w:val="1873178777"/>
         <w:rPr>
           <w:rFonts w:ascii="Plus Jakarta Sans" w:eastAsia="Times New Roman" w:hAnsi="Plus Jakarta Sans"/>
           <w:lang w:val="es-ES"/>
@@ -4328,7 +4324,8 @@
           <w:rFonts w:ascii="Plus Jakarta Sans" w:eastAsia="Times New Roman" w:hAnsi="Plus Jakarta Sans"/>
           <w:lang w:val="es-ES"/>
         </w:rPr>
-        <w:pict>
+        <w:lastRenderedPageBreak/>
+        <w:pict w14:anchorId="48CD30E2">
           <v:rect id="_x0000_i1029" style="width:0;height:.75pt" o:hralign="center" o:hrstd="t" o:hr="t" fillcolor="#a0a0a0" stroked="f"/>
         </w:pict>
       </w:r>
@@ -4336,7 +4333,7 @@
     <w:p>
       <w:pPr>
         <w:pStyle w:val="Ttulo3"/>
-        <w:divId w:val="777528882"/>
+        <w:divId w:val="1873178777"/>
         <w:rPr>
           <w:rFonts w:eastAsia="Times New Roman"/>
           <w:lang w:val="es-ES"/>
@@ -4353,7 +4350,7 @@
     <w:p>
       <w:pPr>
         <w:pStyle w:val="NormalWeb"/>
-        <w:divId w:val="777528882"/>
+        <w:divId w:val="1873178777"/>
         <w:rPr>
           <w:rFonts w:ascii="Plus Jakarta Sans" w:hAnsi="Plus Jakarta Sans"/>
           <w:lang w:val="es-ES"/>
@@ -4375,7 +4372,7 @@
         </w:numPr>
         <w:spacing w:before="100" w:beforeAutospacing="1" w:after="90"/>
         <w:ind w:left="1020"/>
-        <w:divId w:val="777528882"/>
+        <w:divId w:val="1873178777"/>
         <w:rPr>
           <w:rFonts w:ascii="Plus Jakarta Sans" w:eastAsia="Times New Roman" w:hAnsi="Plus Jakarta Sans"/>
           <w:sz w:val="21"/>
@@ -4411,7 +4408,7 @@
         </w:numPr>
         <w:spacing w:before="100" w:beforeAutospacing="1" w:after="90"/>
         <w:ind w:left="1020"/>
-        <w:divId w:val="777528882"/>
+        <w:divId w:val="1873178777"/>
         <w:rPr>
           <w:rFonts w:ascii="Plus Jakarta Sans" w:eastAsia="Times New Roman" w:hAnsi="Plus Jakarta Sans"/>
           <w:sz w:val="21"/>
@@ -4456,7 +4453,7 @@
         </w:numPr>
         <w:spacing w:before="100" w:beforeAutospacing="1" w:after="90"/>
         <w:ind w:left="1020"/>
-        <w:divId w:val="777528882"/>
+        <w:divId w:val="1873178777"/>
         <w:rPr>
           <w:rFonts w:ascii="Plus Jakarta Sans" w:eastAsia="Times New Roman" w:hAnsi="Plus Jakarta Sans"/>
           <w:sz w:val="21"/>
@@ -4501,7 +4498,7 @@
         </w:numPr>
         <w:spacing w:before="100" w:beforeAutospacing="1" w:after="90"/>
         <w:ind w:left="1020"/>
-        <w:divId w:val="777528882"/>
+        <w:divId w:val="1873178777"/>
         <w:rPr>
           <w:rFonts w:ascii="Plus Jakarta Sans" w:eastAsia="Times New Roman" w:hAnsi="Plus Jakarta Sans"/>
           <w:sz w:val="21"/>
@@ -4557,7 +4554,7 @@
       </w:tblGrid>
       <w:tr>
         <w:trPr>
-          <w:divId w:val="1068843768"/>
+          <w:divId w:val="1182671173"/>
           <w:tblHeader/>
         </w:trPr>
         <w:tc>
@@ -4711,7 +4708,7 @@
       </w:tr>
       <w:tr>
         <w:trPr>
-          <w:divId w:val="1068843768"/>
+          <w:divId w:val="1182671173"/>
         </w:trPr>
         <w:tc>
           <w:tcPr>
@@ -4837,7 +4834,7 @@
       </w:tr>
       <w:tr>
         <w:trPr>
-          <w:divId w:val="1068843768"/>
+          <w:divId w:val="1182671173"/>
         </w:trPr>
         <w:tc>
           <w:tcPr>
@@ -4963,7 +4960,7 @@
       </w:tr>
       <w:tr>
         <w:trPr>
-          <w:divId w:val="1068843768"/>
+          <w:divId w:val="1182671173"/>
         </w:trPr>
         <w:tc>
           <w:tcPr>
@@ -5089,7 +5086,7 @@
       </w:tr>
       <w:tr>
         <w:trPr>
-          <w:divId w:val="1068843768"/>
+          <w:divId w:val="1182671173"/>
         </w:trPr>
         <w:tc>
           <w:tcPr>
@@ -5217,7 +5214,7 @@
     <w:p>
       <w:pPr>
         <w:spacing w:before="450" w:after="450"/>
-        <w:divId w:val="777528882"/>
+        <w:divId w:val="1873178777"/>
         <w:rPr>
           <w:rFonts w:ascii="Plus Jakarta Sans" w:eastAsia="Times New Roman" w:hAnsi="Plus Jakarta Sans"/>
           <w:lang w:val="es-ES"/>
@@ -5228,7 +5225,7 @@
           <w:rFonts w:ascii="Plus Jakarta Sans" w:eastAsia="Times New Roman" w:hAnsi="Plus Jakarta Sans"/>
           <w:lang w:val="es-ES"/>
         </w:rPr>
-        <w:pict>
+        <w:pict w14:anchorId="02D93116">
           <v:rect id="_x0000_i1030" style="width:0;height:.75pt" o:hralign="center" o:hrstd="t" o:hr="t" fillcolor="#a0a0a0" stroked="f"/>
         </w:pict>
       </w:r>
@@ -5236,7 +5233,7 @@
     <w:p>
       <w:pPr>
         <w:pStyle w:val="Ttulo3"/>
-        <w:divId w:val="777528882"/>
+        <w:divId w:val="1873178777"/>
         <w:rPr>
           <w:rFonts w:eastAsia="Times New Roman"/>
           <w:lang w:val="es-ES"/>
@@ -5253,7 +5250,7 @@
     <w:p>
       <w:pPr>
         <w:pStyle w:val="NormalWeb"/>
-        <w:divId w:val="777528882"/>
+        <w:divId w:val="1873178777"/>
         <w:rPr>
           <w:rFonts w:ascii="Plus Jakarta Sans" w:hAnsi="Plus Jakarta Sans"/>
           <w:lang w:val="es-ES"/>
@@ -5277,7 +5274,7 @@
     <w:p>
       <w:pPr>
         <w:pStyle w:val="Ttulo4"/>
-        <w:divId w:val="777528882"/>
+        <w:divId w:val="1873178777"/>
         <w:rPr>
           <w:rFonts w:eastAsia="Times New Roman"/>
           <w:lang w:val="es-ES"/>
@@ -5293,9 +5290,8 @@
     </w:p>
     <w:p>
       <w:pPr>
-        <w:spacing w:before="375" w:after="225"/>
         <w:jc w:val="center"/>
-        <w:divId w:val="1339044583"/>
+        <w:divId w:val="1647738217"/>
         <w:rPr>
           <w:rFonts w:ascii="Outfit" w:eastAsia="Times New Roman" w:hAnsi="Outfit"/>
           <w:b/>
@@ -5323,9 +5319,8 @@
     </w:p>
     <w:p>
       <w:pPr>
-        <w:spacing w:after="375"/>
         <w:jc w:val="center"/>
-        <w:divId w:val="1395471663"/>
+        <w:divId w:val="1548952182"/>
         <w:rPr>
           <w:rFonts w:ascii="Plus Jakarta Sans" w:eastAsia="Times New Roman" w:hAnsi="Plus Jakarta Sans"/>
           <w:lang w:val="es-ES"/>
@@ -5608,7 +5603,7 @@
     <w:p>
       <w:pPr>
         <w:pStyle w:val="Ttulo4"/>
-        <w:divId w:val="777528882"/>
+        <w:divId w:val="1873178777"/>
         <w:rPr>
           <w:rFonts w:eastAsia="Times New Roman"/>
           <w:lang w:val="es-ES"/>
@@ -5631,9 +5626,8 @@
     </w:p>
     <w:p>
       <w:pPr>
-        <w:spacing w:before="375" w:after="225"/>
         <w:jc w:val="center"/>
-        <w:divId w:val="1448311019"/>
+        <w:divId w:val="698705759"/>
         <w:rPr>
           <w:rFonts w:ascii="Outfit" w:eastAsia="Times New Roman" w:hAnsi="Outfit"/>
           <w:b/>
@@ -5661,9 +5655,8 @@
     </w:p>
     <w:p>
       <w:pPr>
-        <w:spacing w:after="375"/>
         <w:jc w:val="center"/>
-        <w:divId w:val="183053373"/>
+        <w:divId w:val="1365790715"/>
         <w:rPr>
           <w:rFonts w:ascii="Plus Jakarta Sans" w:eastAsia="Times New Roman" w:hAnsi="Plus Jakarta Sans"/>
           <w:lang w:val="es-ES"/>
@@ -5981,7 +5974,7 @@
     <w:p>
       <w:pPr>
         <w:pStyle w:val="Ttulo4"/>
-        <w:divId w:val="777528882"/>
+        <w:divId w:val="1873178777"/>
         <w:rPr>
           <w:rFonts w:eastAsia="Times New Roman"/>
           <w:lang w:val="es-ES"/>
@@ -5992,14 +5985,14 @@
           <w:rFonts w:eastAsia="Times New Roman"/>
           <w:lang w:val="es-ES"/>
         </w:rPr>
+        <w:lastRenderedPageBreak/>
         <w:t>Destino de la Producción Agrícola por Sector:</w:t>
       </w:r>
     </w:p>
     <w:p>
       <w:pPr>
-        <w:spacing w:before="375" w:after="225"/>
         <w:jc w:val="center"/>
-        <w:divId w:val="948971998"/>
+        <w:divId w:val="2088262796"/>
         <w:rPr>
           <w:rFonts w:ascii="Outfit" w:eastAsia="Times New Roman" w:hAnsi="Outfit"/>
           <w:b/>
@@ -6027,9 +6020,8 @@
     </w:p>
     <w:p>
       <w:pPr>
-        <w:spacing w:after="375"/>
         <w:jc w:val="center"/>
-        <w:divId w:val="773094646"/>
+        <w:divId w:val="380447813"/>
         <w:rPr>
           <w:rFonts w:ascii="Plus Jakarta Sans" w:eastAsia="Times New Roman" w:hAnsi="Plus Jakarta Sans"/>
           <w:lang w:val="es-ES"/>
@@ -6333,7 +6325,7 @@
     <w:p>
       <w:pPr>
         <w:spacing w:before="450" w:after="450"/>
-        <w:divId w:val="777528882"/>
+        <w:divId w:val="1873178777"/>
         <w:rPr>
           <w:rFonts w:ascii="Plus Jakarta Sans" w:eastAsia="Times New Roman" w:hAnsi="Plus Jakarta Sans"/>
           <w:lang w:val="es-ES"/>
@@ -6344,7 +6336,7 @@
           <w:rFonts w:ascii="Plus Jakarta Sans" w:eastAsia="Times New Roman" w:hAnsi="Plus Jakarta Sans"/>
           <w:lang w:val="es-ES"/>
         </w:rPr>
-        <w:pict>
+        <w:pict w14:anchorId="613CCA71">
           <v:rect id="_x0000_i1031" style="width:0;height:.75pt" o:hralign="center" o:hrstd="t" o:hr="t" fillcolor="#a0a0a0" stroked="f"/>
         </w:pict>
       </w:r>
@@ -6352,7 +6344,7 @@
     <w:p>
       <w:pPr>
         <w:pStyle w:val="Ttulo3"/>
-        <w:divId w:val="777528882"/>
+        <w:divId w:val="1873178777"/>
         <w:rPr>
           <w:rFonts w:eastAsia="Times New Roman"/>
           <w:lang w:val="es-ES"/>
@@ -6369,7 +6361,7 @@
     <w:p>
       <w:pPr>
         <w:pStyle w:val="NormalWeb"/>
-        <w:divId w:val="777528882"/>
+        <w:divId w:val="1873178777"/>
         <w:rPr>
           <w:rFonts w:ascii="Plus Jakarta Sans" w:hAnsi="Plus Jakarta Sans"/>
           <w:lang w:val="es-ES"/>
@@ -6393,7 +6385,7 @@
     <w:p>
       <w:pPr>
         <w:pStyle w:val="Ttulo4"/>
-        <w:divId w:val="777528882"/>
+        <w:divId w:val="1873178777"/>
         <w:rPr>
           <w:rFonts w:eastAsia="Times New Roman"/>
           <w:lang w:val="es-ES"/>
@@ -6410,7 +6402,7 @@
     <w:p>
       <w:pPr>
         <w:pStyle w:val="NormalWeb"/>
-        <w:divId w:val="777528882"/>
+        <w:divId w:val="1873178777"/>
         <w:rPr>
           <w:rFonts w:ascii="Plus Jakarta Sans" w:hAnsi="Plus Jakarta Sans"/>
           <w:lang w:val="es-ES"/>
@@ -6441,7 +6433,7 @@
       </w:tblGrid>
       <w:tr>
         <w:trPr>
-          <w:divId w:val="807817469"/>
+          <w:divId w:val="1920405460"/>
           <w:tblHeader/>
         </w:trPr>
         <w:tc>
@@ -6521,7 +6513,7 @@
       </w:tr>
       <w:tr>
         <w:trPr>
-          <w:divId w:val="807817469"/>
+          <w:divId w:val="1920405460"/>
         </w:trPr>
         <w:tc>
           <w:tcPr>
@@ -6610,7 +6602,7 @@
     <w:p>
       <w:pPr>
         <w:pStyle w:val="Ttulo4"/>
-        <w:divId w:val="777528882"/>
+        <w:divId w:val="1873178777"/>
         <w:rPr>
           <w:rFonts w:eastAsia="Times New Roman"/>
           <w:lang w:val="es-ES"/>
@@ -6627,7 +6619,7 @@
     <w:p>
       <w:pPr>
         <w:pStyle w:val="NormalWeb"/>
-        <w:divId w:val="777528882"/>
+        <w:divId w:val="1873178777"/>
         <w:rPr>
           <w:rFonts w:ascii="Plus Jakarta Sans" w:hAnsi="Plus Jakarta Sans"/>
           <w:lang w:val="es-ES"/>
@@ -6658,7 +6650,7 @@
       </w:tblGrid>
       <w:tr>
         <w:trPr>
-          <w:divId w:val="2031947544"/>
+          <w:divId w:val="1477607293"/>
           <w:tblHeader/>
         </w:trPr>
         <w:tc>
@@ -6738,7 +6730,7 @@
       </w:tr>
       <w:tr>
         <w:trPr>
-          <w:divId w:val="2031947544"/>
+          <w:divId w:val="1477607293"/>
         </w:trPr>
         <w:tc>
           <w:tcPr>
@@ -6836,7 +6828,7 @@
     <w:p>
       <w:pPr>
         <w:pStyle w:val="Ttulo4"/>
-        <w:divId w:val="777528882"/>
+        <w:divId w:val="1873178777"/>
         <w:rPr>
           <w:rFonts w:eastAsia="Times New Roman"/>
           <w:lang w:val="es-ES"/>
@@ -6853,7 +6845,7 @@
     <w:p>
       <w:pPr>
         <w:pStyle w:val="NormalWeb"/>
-        <w:divId w:val="777528882"/>
+        <w:divId w:val="1873178777"/>
         <w:rPr>
           <w:rFonts w:ascii="Plus Jakarta Sans" w:hAnsi="Plus Jakarta Sans"/>
           <w:lang w:val="es-ES"/>
@@ -6884,7 +6876,7 @@
       </w:tblGrid>
       <w:tr>
         <w:trPr>
-          <w:divId w:val="954600255"/>
+          <w:divId w:val="867597147"/>
           <w:tblHeader/>
         </w:trPr>
         <w:tc>
@@ -6920,6 +6912,7 @@
                 <w:sz w:val="20"/>
                 <w:szCs w:val="20"/>
               </w:rPr>
+              <w:lastRenderedPageBreak/>
               <w:t>Cultivos Frecuentes</w:t>
             </w:r>
           </w:p>
@@ -6964,7 +6957,7 @@
       </w:tr>
       <w:tr>
         <w:trPr>
-          <w:divId w:val="954600255"/>
+          <w:divId w:val="867597147"/>
         </w:trPr>
         <w:tc>
           <w:tcPr>
@@ -7053,7 +7046,7 @@
     <w:p>
       <w:pPr>
         <w:spacing w:before="450" w:after="450"/>
-        <w:divId w:val="777528882"/>
+        <w:divId w:val="1873178777"/>
         <w:rPr>
           <w:rFonts w:ascii="Plus Jakarta Sans" w:eastAsia="Times New Roman" w:hAnsi="Plus Jakarta Sans"/>
           <w:lang w:val="es-ES"/>
@@ -7064,7 +7057,7 @@
           <w:rFonts w:ascii="Plus Jakarta Sans" w:eastAsia="Times New Roman" w:hAnsi="Plus Jakarta Sans"/>
           <w:lang w:val="es-ES"/>
         </w:rPr>
-        <w:pict>
+        <w:pict w14:anchorId="742F4CC2">
           <v:rect id="_x0000_i1032" style="width:0;height:.75pt" o:hralign="center" o:hrstd="t" o:hr="t" fillcolor="#a0a0a0" stroked="f"/>
         </w:pict>
       </w:r>
@@ -7072,7 +7065,7 @@
     <w:p>
       <w:pPr>
         <w:pStyle w:val="Ttulo2"/>
-        <w:divId w:val="777528882"/>
+        <w:divId w:val="1873178777"/>
         <w:rPr>
           <w:rFonts w:eastAsia="Times New Roman"/>
           <w:lang w:val="es-ES"/>
@@ -7089,7 +7082,7 @@
     <w:p>
       <w:pPr>
         <w:pStyle w:val="NormalWeb"/>
-        <w:divId w:val="777528882"/>
+        <w:divId w:val="1873178777"/>
         <w:rPr>
           <w:rFonts w:ascii="Plus Jakarta Sans" w:hAnsi="Plus Jakarta Sans"/>
           <w:lang w:val="es-ES"/>
@@ -7106,7 +7099,7 @@
     <w:p>
       <w:pPr>
         <w:pStyle w:val="Ttulo3"/>
-        <w:divId w:val="777528882"/>
+        <w:divId w:val="1873178777"/>
         <w:rPr>
           <w:rFonts w:eastAsia="Times New Roman"/>
           <w:lang w:val="es-ES"/>
@@ -7123,7 +7116,7 @@
     <w:p>
       <w:pPr>
         <w:pStyle w:val="NormalWeb"/>
-        <w:divId w:val="777528882"/>
+        <w:divId w:val="1873178777"/>
         <w:rPr>
           <w:rFonts w:ascii="Plus Jakarta Sans" w:hAnsi="Plus Jakarta Sans"/>
           <w:lang w:val="es-ES"/>
@@ -7156,7 +7149,7 @@
       </w:tblGrid>
       <w:tr>
         <w:trPr>
-          <w:divId w:val="952440247"/>
+          <w:divId w:val="785581222"/>
           <w:tblHeader/>
         </w:trPr>
         <w:tc>
@@ -7321,7 +7314,7 @@
       </w:tr>
       <w:tr>
         <w:trPr>
-          <w:divId w:val="952440247"/>
+          <w:divId w:val="785581222"/>
         </w:trPr>
         <w:tc>
           <w:tcPr>
@@ -7447,7 +7440,7 @@
       </w:tr>
       <w:tr>
         <w:trPr>
-          <w:divId w:val="952440247"/>
+          <w:divId w:val="785581222"/>
         </w:trPr>
         <w:tc>
           <w:tcPr>
@@ -7573,7 +7566,7 @@
       </w:tr>
       <w:tr>
         <w:trPr>
-          <w:divId w:val="952440247"/>
+          <w:divId w:val="785581222"/>
         </w:trPr>
         <w:tc>
           <w:tcPr>
@@ -7699,7 +7692,7 @@
       </w:tr>
       <w:tr>
         <w:trPr>
-          <w:divId w:val="952440247"/>
+          <w:divId w:val="785581222"/>
         </w:trPr>
         <w:tc>
           <w:tcPr>
@@ -7827,7 +7820,7 @@
     <w:p>
       <w:pPr>
         <w:pStyle w:val="Ttulo3"/>
-        <w:divId w:val="777528882"/>
+        <w:divId w:val="1873178777"/>
         <w:rPr>
           <w:rFonts w:eastAsia="Times New Roman"/>
           <w:lang w:val="es-ES"/>
@@ -7845,7 +7838,7 @@
       <w:pPr>
         <w:spacing w:before="375" w:after="225"/>
         <w:jc w:val="center"/>
-        <w:divId w:val="268122805"/>
+        <w:divId w:val="1348173038"/>
         <w:rPr>
           <w:rFonts w:ascii="Outfit" w:eastAsia="Times New Roman" w:hAnsi="Outfit"/>
           <w:b/>
@@ -7875,7 +7868,7 @@
       <w:pPr>
         <w:spacing w:after="375"/>
         <w:jc w:val="center"/>
-        <w:divId w:val="997227776"/>
+        <w:divId w:val="1773014178"/>
         <w:rPr>
           <w:rFonts w:ascii="Plus Jakarta Sans" w:eastAsia="Times New Roman" w:hAnsi="Plus Jakarta Sans"/>
           <w:lang w:val="es-ES"/>
@@ -8242,7 +8235,7 @@
     <w:p>
       <w:pPr>
         <w:pStyle w:val="Ttulo3"/>
-        <w:divId w:val="777528882"/>
+        <w:divId w:val="1873178777"/>
         <w:rPr>
           <w:rFonts w:eastAsia="Times New Roman"/>
           <w:lang w:val="es-ES"/>
@@ -8266,7 +8259,7 @@
     <w:p>
       <w:pPr>
         <w:pStyle w:val="NormalWeb"/>
-        <w:divId w:val="777528882"/>
+        <w:divId w:val="1873178777"/>
         <w:rPr>
           <w:rFonts w:ascii="Plus Jakarta Sans" w:hAnsi="Plus Jakarta Sans"/>
           <w:lang w:val="es-ES"/>
@@ -8288,7 +8281,7 @@
         </w:numPr>
         <w:spacing w:before="100" w:beforeAutospacing="1" w:after="90"/>
         <w:ind w:left="1020"/>
-        <w:divId w:val="777528882"/>
+        <w:divId w:val="1873178777"/>
         <w:rPr>
           <w:rFonts w:ascii="Plus Jakarta Sans" w:eastAsia="Times New Roman" w:hAnsi="Plus Jakarta Sans"/>
           <w:sz w:val="21"/>
@@ -8324,7 +8317,7 @@
         </w:numPr>
         <w:spacing w:before="100" w:beforeAutospacing="1" w:after="90"/>
         <w:ind w:left="1020"/>
-        <w:divId w:val="777528882"/>
+        <w:divId w:val="1873178777"/>
         <w:rPr>
           <w:rFonts w:ascii="Plus Jakarta Sans" w:eastAsia="Times New Roman" w:hAnsi="Plus Jakarta Sans"/>
           <w:sz w:val="21"/>
@@ -8369,7 +8362,7 @@
         </w:numPr>
         <w:spacing w:before="100" w:beforeAutospacing="1" w:after="90"/>
         <w:ind w:left="1020"/>
-        <w:divId w:val="777528882"/>
+        <w:divId w:val="1873178777"/>
         <w:rPr>
           <w:rFonts w:ascii="Plus Jakarta Sans" w:eastAsia="Times New Roman" w:hAnsi="Plus Jakarta Sans"/>
           <w:sz w:val="21"/>
@@ -8423,7 +8416,7 @@
         </w:numPr>
         <w:spacing w:before="100" w:beforeAutospacing="1" w:after="90"/>
         <w:ind w:left="1020"/>
-        <w:divId w:val="777528882"/>
+        <w:divId w:val="1873178777"/>
         <w:rPr>
           <w:rFonts w:ascii="Plus Jakarta Sans" w:eastAsia="Times New Roman" w:hAnsi="Plus Jakarta Sans"/>
           <w:sz w:val="21"/>
@@ -8468,7 +8461,7 @@
         </w:numPr>
         <w:spacing w:before="100" w:beforeAutospacing="1" w:after="90"/>
         <w:ind w:left="1020"/>
-        <w:divId w:val="777528882"/>
+        <w:divId w:val="1873178777"/>
         <w:rPr>
           <w:rFonts w:ascii="Plus Jakarta Sans" w:eastAsia="Times New Roman" w:hAnsi="Plus Jakarta Sans"/>
           <w:sz w:val="21"/>
@@ -8504,7 +8497,7 @@
         </w:numPr>
         <w:spacing w:before="100" w:beforeAutospacing="1" w:after="90"/>
         <w:ind w:left="1020"/>
-        <w:divId w:val="777528882"/>
+        <w:divId w:val="1873178777"/>
         <w:rPr>
           <w:rFonts w:ascii="Plus Jakarta Sans" w:eastAsia="Times New Roman" w:hAnsi="Plus Jakarta Sans"/>
           <w:sz w:val="21"/>
@@ -8549,7 +8542,7 @@
         </w:numPr>
         <w:spacing w:before="100" w:beforeAutospacing="1" w:after="90"/>
         <w:ind w:left="1020"/>
-        <w:divId w:val="777528882"/>
+        <w:divId w:val="1873178777"/>
         <w:rPr>
           <w:rFonts w:ascii="Plus Jakarta Sans" w:eastAsia="Times New Roman" w:hAnsi="Plus Jakarta Sans"/>
           <w:sz w:val="21"/>
@@ -8594,7 +8587,7 @@
         </w:numPr>
         <w:spacing w:before="100" w:beforeAutospacing="1" w:after="90"/>
         <w:ind w:left="1020"/>
-        <w:divId w:val="777528882"/>
+        <w:divId w:val="1873178777"/>
         <w:rPr>
           <w:rFonts w:ascii="Plus Jakarta Sans" w:eastAsia="Times New Roman" w:hAnsi="Plus Jakarta Sans"/>
           <w:sz w:val="21"/>
@@ -8639,7 +8632,7 @@
         </w:numPr>
         <w:spacing w:before="100" w:beforeAutospacing="1" w:after="90"/>
         <w:ind w:left="1020"/>
-        <w:divId w:val="777528882"/>
+        <w:divId w:val="1873178777"/>
         <w:rPr>
           <w:rFonts w:ascii="Plus Jakarta Sans" w:eastAsia="Times New Roman" w:hAnsi="Plus Jakarta Sans"/>
           <w:sz w:val="21"/>
@@ -8675,7 +8668,7 @@
         </w:numPr>
         <w:spacing w:before="100" w:beforeAutospacing="1" w:after="90"/>
         <w:ind w:left="1020"/>
-        <w:divId w:val="777528882"/>
+        <w:divId w:val="1873178777"/>
         <w:rPr>
           <w:rFonts w:ascii="Plus Jakarta Sans" w:eastAsia="Times New Roman" w:hAnsi="Plus Jakarta Sans"/>
           <w:sz w:val="21"/>
@@ -8729,7 +8722,7 @@
         </w:numPr>
         <w:spacing w:before="100" w:beforeAutospacing="1" w:after="90"/>
         <w:ind w:left="1020"/>
-        <w:divId w:val="777528882"/>
+        <w:divId w:val="1873178777"/>
         <w:rPr>
           <w:rFonts w:ascii="Plus Jakarta Sans" w:eastAsia="Times New Roman" w:hAnsi="Plus Jakarta Sans"/>
           <w:sz w:val="21"/>
@@ -8774,7 +8767,7 @@
         </w:numPr>
         <w:spacing w:before="100" w:beforeAutospacing="1" w:after="90"/>
         <w:ind w:left="1020"/>
-        <w:divId w:val="777528882"/>
+        <w:divId w:val="1873178777"/>
         <w:rPr>
           <w:rFonts w:ascii="Plus Jakarta Sans" w:eastAsia="Times New Roman" w:hAnsi="Plus Jakarta Sans"/>
           <w:sz w:val="21"/>
@@ -8814,7 +8807,7 @@
     <w:p>
       <w:pPr>
         <w:pStyle w:val="Ttulo3"/>
-        <w:divId w:val="777528882"/>
+        <w:divId w:val="1873178777"/>
         <w:rPr>
           <w:rFonts w:eastAsia="Times New Roman"/>
           <w:lang w:val="es-ES"/>
@@ -8832,7 +8825,7 @@
       <w:pPr>
         <w:spacing w:before="375" w:after="225"/>
         <w:jc w:val="center"/>
-        <w:divId w:val="1579629547"/>
+        <w:divId w:val="445781197"/>
         <w:rPr>
           <w:rFonts w:ascii="Outfit" w:eastAsia="Times New Roman" w:hAnsi="Outfit"/>
           <w:b/>
@@ -8862,7 +8855,7 @@
       <w:pPr>
         <w:spacing w:after="375"/>
         <w:jc w:val="center"/>
-        <w:divId w:val="866529537"/>
+        <w:divId w:val="5643441"/>
         <w:rPr>
           <w:rFonts w:ascii="Plus Jakarta Sans" w:eastAsia="Times New Roman" w:hAnsi="Plus Jakarta Sans"/>
           <w:lang w:val="es-ES"/>
@@ -9152,7 +9145,7 @@
     <w:p>
       <w:pPr>
         <w:spacing w:before="450" w:after="450"/>
-        <w:divId w:val="777528882"/>
+        <w:divId w:val="1873178777"/>
         <w:rPr>
           <w:rFonts w:ascii="Plus Jakarta Sans" w:eastAsia="Times New Roman" w:hAnsi="Plus Jakarta Sans"/>
           <w:lang w:val="es-ES"/>
@@ -9163,7 +9156,7 @@
           <w:rFonts w:ascii="Plus Jakarta Sans" w:eastAsia="Times New Roman" w:hAnsi="Plus Jakarta Sans"/>
           <w:lang w:val="es-ES"/>
         </w:rPr>
-        <w:pict>
+        <w:pict w14:anchorId="55A09B0C">
           <v:rect id="_x0000_i1033" style="width:0;height:.75pt" o:hralign="center" o:hrstd="t" o:hr="t" fillcolor="#a0a0a0" stroked="f"/>
         </w:pict>
       </w:r>
@@ -9171,7 +9164,7 @@
     <w:p>
       <w:pPr>
         <w:pStyle w:val="Ttulo2"/>
-        <w:divId w:val="777528882"/>
+        <w:divId w:val="1873178777"/>
         <w:rPr>
           <w:rFonts w:eastAsia="Times New Roman"/>
           <w:lang w:val="es-ES"/>
@@ -9188,7 +9181,7 @@
     <w:p>
       <w:pPr>
         <w:pStyle w:val="NormalWeb"/>
-        <w:divId w:val="777528882"/>
+        <w:divId w:val="1873178777"/>
         <w:rPr>
           <w:rFonts w:ascii="Plus Jakarta Sans" w:hAnsi="Plus Jakarta Sans"/>
           <w:lang w:val="es-ES"/>
@@ -9205,7 +9198,7 @@
     <w:p>
       <w:pPr>
         <w:pStyle w:val="NormalWeb"/>
-        <w:divId w:val="777528882"/>
+        <w:divId w:val="1873178777"/>
         <w:rPr>
           <w:rFonts w:ascii="Plus Jakarta Sans" w:hAnsi="Plus Jakarta Sans"/>
           <w:lang w:val="es-ES"/>
@@ -9267,7 +9260,7 @@
     <w:p>
       <w:pPr>
         <w:pStyle w:val="NormalWeb"/>
-        <w:divId w:val="777528882"/>
+        <w:divId w:val="1873178777"/>
         <w:rPr>
           <w:rFonts w:ascii="Plus Jakarta Sans" w:hAnsi="Plus Jakarta Sans"/>
           <w:lang w:val="es-ES"/>
@@ -9321,7 +9314,7 @@
     <w:p>
       <w:pPr>
         <w:pStyle w:val="NormalWeb"/>
-        <w:divId w:val="777528882"/>
+        <w:divId w:val="1873178777"/>
         <w:rPr>
           <w:rFonts w:ascii="Plus Jakarta Sans" w:hAnsi="Plus Jakarta Sans"/>
           <w:lang w:val="es-ES"/>
@@ -9382,7 +9375,7 @@
     <w:p>
       <w:pPr>
         <w:pStyle w:val="NormalWeb"/>
-        <w:divId w:val="777528882"/>
+        <w:divId w:val="1873178777"/>
         <w:rPr>
           <w:rFonts w:ascii="Plus Jakarta Sans" w:hAnsi="Plus Jakarta Sans"/>
           <w:lang w:val="es-ES"/>
@@ -9436,7 +9429,7 @@
     <w:p>
       <w:pPr>
         <w:spacing w:before="450" w:after="450"/>
-        <w:divId w:val="777528882"/>
+        <w:divId w:val="1873178777"/>
         <w:rPr>
           <w:rFonts w:ascii="Plus Jakarta Sans" w:eastAsia="Times New Roman" w:hAnsi="Plus Jakarta Sans"/>
           <w:lang w:val="es-ES"/>
@@ -9447,7 +9440,7 @@
           <w:rFonts w:ascii="Plus Jakarta Sans" w:eastAsia="Times New Roman" w:hAnsi="Plus Jakarta Sans"/>
           <w:lang w:val="es-ES"/>
         </w:rPr>
-        <w:pict>
+        <w:pict w14:anchorId="0D68FCD8">
           <v:rect id="_x0000_i1034" style="width:0;height:.75pt" o:hralign="center" o:hrstd="t" o:hr="t" fillcolor="#a0a0a0" stroked="f"/>
         </w:pict>
       </w:r>
@@ -9455,7 +9448,7 @@
     <w:p>
       <w:pPr>
         <w:pStyle w:val="Ttulo2"/>
-        <w:divId w:val="777528882"/>
+        <w:divId w:val="1873178777"/>
         <w:rPr>
           <w:rFonts w:eastAsia="Times New Roman"/>
           <w:lang w:val="es-ES"/>
@@ -9472,7 +9465,7 @@
     <w:p>
       <w:pPr>
         <w:pStyle w:val="NormalWeb"/>
-        <w:divId w:val="777528882"/>
+        <w:divId w:val="1873178777"/>
         <w:rPr>
           <w:rFonts w:ascii="Plus Jakarta Sans" w:hAnsi="Plus Jakarta Sans"/>
           <w:lang w:val="es-ES"/>
@@ -9511,7 +9504,7 @@
     <w:p>
       <w:pPr>
         <w:pStyle w:val="Ttulo3"/>
-        <w:divId w:val="777528882"/>
+        <w:divId w:val="1873178777"/>
         <w:rPr>
           <w:rFonts w:eastAsia="Times New Roman"/>
           <w:lang w:val="es-ES"/>
@@ -9545,7 +9538,7 @@
       </w:tblGrid>
       <w:tr>
         <w:trPr>
-          <w:divId w:val="2065441676"/>
+          <w:divId w:val="196241718"/>
           <w:tblHeader/>
         </w:trPr>
         <w:tc>
@@ -9736,7 +9729,7 @@
       </w:tr>
       <w:tr>
         <w:trPr>
-          <w:divId w:val="2065441676"/>
+          <w:divId w:val="196241718"/>
         </w:trPr>
         <w:tc>
           <w:tcPr>
@@ -9892,7 +9885,7 @@
       </w:tr>
       <w:tr>
         <w:trPr>
-          <w:divId w:val="2065441676"/>
+          <w:divId w:val="196241718"/>
         </w:trPr>
         <w:tc>
           <w:tcPr>
@@ -10048,7 +10041,7 @@
       </w:tr>
       <w:tr>
         <w:trPr>
-          <w:divId w:val="2065441676"/>
+          <w:divId w:val="196241718"/>
         </w:trPr>
         <w:tc>
           <w:tcPr>
@@ -10204,7 +10197,7 @@
       </w:tr>
       <w:tr>
         <w:trPr>
-          <w:divId w:val="2065441676"/>
+          <w:divId w:val="196241718"/>
         </w:trPr>
         <w:tc>
           <w:tcPr>
@@ -10366,7 +10359,7 @@
     <w:p>
       <w:pPr>
         <w:pStyle w:val="Ttulo3"/>
-        <w:divId w:val="777528882"/>
+        <w:divId w:val="1873178777"/>
         <w:rPr>
           <w:rFonts w:eastAsia="Times New Roman"/>
           <w:lang w:val="es-ES"/>
@@ -10400,7 +10393,7 @@
       </w:tblGrid>
       <w:tr>
         <w:trPr>
-          <w:divId w:val="953363433"/>
+          <w:divId w:val="1772704128"/>
           <w:tblHeader/>
         </w:trPr>
         <w:tc>
@@ -10591,7 +10584,7 @@
       </w:tr>
       <w:tr>
         <w:trPr>
-          <w:divId w:val="953363433"/>
+          <w:divId w:val="1772704128"/>
         </w:trPr>
         <w:tc>
           <w:tcPr>
@@ -10748,7 +10741,7 @@
       </w:tr>
       <w:tr>
         <w:trPr>
-          <w:divId w:val="953363433"/>
+          <w:divId w:val="1772704128"/>
         </w:trPr>
         <w:tc>
           <w:tcPr>
@@ -10907,7 +10900,7 @@
     <w:p>
       <w:pPr>
         <w:pStyle w:val="Ttulo3"/>
-        <w:divId w:val="777528882"/>
+        <w:divId w:val="1873178777"/>
         <w:rPr>
           <w:rFonts w:eastAsia="Times New Roman"/>
           <w:lang w:val="es-ES"/>
@@ -10942,7 +10935,7 @@
       </w:tblGrid>
       <w:tr>
         <w:trPr>
-          <w:divId w:val="1187520238"/>
+          <w:divId w:val="1708287966"/>
           <w:tblHeader/>
         </w:trPr>
         <w:tc>
@@ -11170,7 +11163,7 @@
       </w:tr>
       <w:tr>
         <w:trPr>
-          <w:divId w:val="1187520238"/>
+          <w:divId w:val="1708287966"/>
         </w:trPr>
         <w:tc>
           <w:tcPr>
@@ -11366,7 +11359,7 @@
       </w:tr>
       <w:tr>
         <w:trPr>
-          <w:divId w:val="1187520238"/>
+          <w:divId w:val="1708287966"/>
         </w:trPr>
         <w:tc>
           <w:tcPr>
@@ -11551,7 +11544,7 @@
       </w:tr>
       <w:tr>
         <w:trPr>
-          <w:divId w:val="1187520238"/>
+          <w:divId w:val="1708287966"/>
         </w:trPr>
         <w:tc>
           <w:tcPr>
@@ -11749,7 +11742,7 @@
     <w:p>
       <w:pPr>
         <w:pStyle w:val="Ttulo4"/>
-        <w:divId w:val="777528882"/>
+        <w:divId w:val="1873178777"/>
         <w:rPr>
           <w:rFonts w:eastAsia="Times New Roman"/>
           <w:lang w:val="es-ES"/>
@@ -11767,7 +11760,7 @@
       <w:pPr>
         <w:spacing w:before="375" w:after="225"/>
         <w:jc w:val="center"/>
-        <w:divId w:val="396438793"/>
+        <w:divId w:val="1462573753"/>
         <w:rPr>
           <w:rFonts w:ascii="Outfit" w:eastAsia="Times New Roman" w:hAnsi="Outfit"/>
           <w:b/>
@@ -11797,7 +11790,7 @@
       <w:pPr>
         <w:spacing w:after="375"/>
         <w:jc w:val="center"/>
-        <w:divId w:val="1163277392"/>
+        <w:divId w:val="1217013427"/>
         <w:rPr>
           <w:rFonts w:ascii="Plus Jakarta Sans" w:eastAsia="Times New Roman" w:hAnsi="Plus Jakarta Sans"/>
           <w:lang w:val="es-ES"/>
@@ -12192,7 +12185,7 @@
     <w:p>
       <w:pPr>
         <w:pStyle w:val="Ttulo3"/>
-        <w:divId w:val="777528882"/>
+        <w:divId w:val="1873178777"/>
         <w:rPr>
           <w:rFonts w:eastAsia="Times New Roman"/>
           <w:lang w:val="es-ES"/>
@@ -12224,7 +12217,7 @@
       </w:tblGrid>
       <w:tr>
         <w:trPr>
-          <w:divId w:val="2141259375"/>
+          <w:divId w:val="1480346537"/>
           <w:tblHeader/>
         </w:trPr>
         <w:tc>
@@ -12341,7 +12334,7 @@
       </w:tr>
       <w:tr>
         <w:trPr>
-          <w:divId w:val="2141259375"/>
+          <w:divId w:val="1480346537"/>
         </w:trPr>
         <w:tc>
           <w:tcPr>
@@ -12437,7 +12430,7 @@
       </w:tr>
       <w:tr>
         <w:trPr>
-          <w:divId w:val="2141259375"/>
+          <w:divId w:val="1480346537"/>
         </w:trPr>
         <w:tc>
           <w:tcPr>
@@ -12533,7 +12526,7 @@
       </w:tr>
       <w:tr>
         <w:trPr>
-          <w:divId w:val="2141259375"/>
+          <w:divId w:val="1480346537"/>
         </w:trPr>
         <w:tc>
           <w:tcPr>
@@ -12631,7 +12624,7 @@
     <w:p>
       <w:pPr>
         <w:pStyle w:val="NormalWeb"/>
-        <w:divId w:val="777528882"/>
+        <w:divId w:val="1873178777"/>
         <w:rPr>
           <w:rFonts w:ascii="Plus Jakarta Sans" w:hAnsi="Plus Jakarta Sans"/>
           <w:lang w:val="es-ES"/>
@@ -12656,7 +12649,7 @@
     <w:p>
       <w:pPr>
         <w:pStyle w:val="Ttulo3"/>
-        <w:divId w:val="777528882"/>
+        <w:divId w:val="1873178777"/>
         <w:rPr>
           <w:rFonts w:eastAsia="Times New Roman"/>
           <w:lang w:val="es-ES"/>
@@ -12698,7 +12691,7 @@
       </w:tblGrid>
       <w:tr>
         <w:trPr>
-          <w:divId w:val="345718072"/>
+          <w:divId w:val="1942373310"/>
           <w:tblHeader/>
         </w:trPr>
         <w:tc>
@@ -12926,7 +12919,7 @@
       </w:tr>
       <w:tr>
         <w:trPr>
-          <w:divId w:val="345718072"/>
+          <w:divId w:val="1942373310"/>
         </w:trPr>
         <w:tc>
           <w:tcPr>
@@ -13112,7 +13105,7 @@
       </w:tr>
       <w:tr>
         <w:trPr>
-          <w:divId w:val="345718072"/>
+          <w:divId w:val="1942373310"/>
         </w:trPr>
         <w:tc>
           <w:tcPr>
@@ -13298,7 +13291,7 @@
       </w:tr>
       <w:tr>
         <w:trPr>
-          <w:divId w:val="345718072"/>
+          <w:divId w:val="1942373310"/>
         </w:trPr>
         <w:tc>
           <w:tcPr>
@@ -13484,7 +13477,7 @@
       </w:tr>
       <w:tr>
         <w:trPr>
-          <w:divId w:val="345718072"/>
+          <w:divId w:val="1942373310"/>
         </w:trPr>
         <w:tc>
           <w:tcPr>
@@ -13677,7 +13670,7 @@
     <w:p>
       <w:pPr>
         <w:pStyle w:val="NormalWeb"/>
-        <w:divId w:val="777528882"/>
+        <w:divId w:val="1873178777"/>
         <w:rPr>
           <w:rFonts w:ascii="Plus Jakarta Sans" w:hAnsi="Plus Jakarta Sans"/>
           <w:lang w:val="es-ES"/>
@@ -13724,7 +13717,7 @@
     <w:p>
       <w:pPr>
         <w:pStyle w:val="Ttulo3"/>
-        <w:divId w:val="777528882"/>
+        <w:divId w:val="1873178777"/>
         <w:rPr>
           <w:rFonts w:eastAsia="Times New Roman"/>
           <w:lang w:val="es-ES"/>
@@ -13759,7 +13752,7 @@
       </w:tblGrid>
       <w:tr>
         <w:trPr>
-          <w:divId w:val="1710060004"/>
+          <w:divId w:val="1000893280"/>
           <w:tblHeader/>
         </w:trPr>
         <w:tc>
@@ -13987,7 +13980,7 @@
       </w:tr>
       <w:tr>
         <w:trPr>
-          <w:divId w:val="1710060004"/>
+          <w:divId w:val="1000893280"/>
         </w:trPr>
         <w:tc>
           <w:tcPr>
@@ -14181,7 +14174,7 @@
       </w:tr>
       <w:tr>
         <w:trPr>
-          <w:divId w:val="1710060004"/>
+          <w:divId w:val="1000893280"/>
         </w:trPr>
         <w:tc>
           <w:tcPr>
@@ -14377,7 +14370,7 @@
     <w:p>
       <w:pPr>
         <w:pStyle w:val="Ttulo4"/>
-        <w:divId w:val="777528882"/>
+        <w:divId w:val="1873178777"/>
         <w:rPr>
           <w:rFonts w:eastAsia="Times New Roman"/>
           <w:lang w:val="es-ES"/>
@@ -14395,7 +14388,7 @@
       <w:pPr>
         <w:spacing w:before="375" w:after="225"/>
         <w:jc w:val="center"/>
-        <w:divId w:val="1727409958"/>
+        <w:divId w:val="1600530781"/>
         <w:rPr>
           <w:rFonts w:ascii="Outfit" w:eastAsia="Times New Roman" w:hAnsi="Outfit"/>
           <w:b/>
@@ -14425,7 +14418,7 @@
       <w:pPr>
         <w:spacing w:after="375"/>
         <w:jc w:val="center"/>
-        <w:divId w:val="1327593013"/>
+        <w:divId w:val="1443261680"/>
         <w:rPr>
           <w:rFonts w:ascii="Plus Jakarta Sans" w:eastAsia="Times New Roman" w:hAnsi="Plus Jakarta Sans"/>
           <w:lang w:val="es-ES"/>
@@ -14813,7 +14806,7 @@
     <w:p>
       <w:pPr>
         <w:pStyle w:val="Ttulo3"/>
-        <w:divId w:val="777528882"/>
+        <w:divId w:val="1873178777"/>
         <w:rPr>
           <w:rFonts w:eastAsia="Times New Roman"/>
           <w:lang w:val="es-ES"/>
@@ -14847,7 +14840,7 @@
       </w:tblGrid>
       <w:tr>
         <w:trPr>
-          <w:divId w:val="155609232"/>
+          <w:divId w:val="868105857"/>
           <w:tblHeader/>
         </w:trPr>
         <w:tc>
@@ -15038,7 +15031,7 @@
       </w:tr>
       <w:tr>
         <w:trPr>
-          <w:divId w:val="155609232"/>
+          <w:divId w:val="868105857"/>
         </w:trPr>
         <w:tc>
           <w:tcPr>
@@ -15194,7 +15187,7 @@
       </w:tr>
       <w:tr>
         <w:trPr>
-          <w:divId w:val="155609232"/>
+          <w:divId w:val="868105857"/>
         </w:trPr>
         <w:tc>
           <w:tcPr>
@@ -15350,7 +15343,7 @@
       </w:tr>
       <w:tr>
         <w:trPr>
-          <w:divId w:val="155609232"/>
+          <w:divId w:val="868105857"/>
         </w:trPr>
         <w:tc>
           <w:tcPr>
@@ -15506,7 +15499,7 @@
       </w:tr>
       <w:tr>
         <w:trPr>
-          <w:divId w:val="155609232"/>
+          <w:divId w:val="868105857"/>
         </w:trPr>
         <w:tc>
           <w:tcPr>
@@ -15662,7 +15655,7 @@
       </w:tr>
       <w:tr>
         <w:trPr>
-          <w:divId w:val="155609232"/>
+          <w:divId w:val="868105857"/>
         </w:trPr>
         <w:tc>
           <w:tcPr>
@@ -15818,7 +15811,7 @@
       </w:tr>
       <w:tr>
         <w:trPr>
-          <w:divId w:val="155609232"/>
+          <w:divId w:val="868105857"/>
         </w:trPr>
         <w:tc>
           <w:tcPr>
@@ -15976,7 +15969,7 @@
     <w:p>
       <w:pPr>
         <w:pStyle w:val="Ttulo3"/>
-        <w:divId w:val="777528882"/>
+        <w:divId w:val="1873178777"/>
         <w:rPr>
           <w:rFonts w:eastAsia="Times New Roman"/>
           <w:lang w:val="es-ES"/>
@@ -16010,7 +16003,7 @@
       </w:tblGrid>
       <w:tr>
         <w:trPr>
-          <w:divId w:val="779686075"/>
+          <w:divId w:val="368455532"/>
           <w:tblHeader/>
         </w:trPr>
         <w:tc>
@@ -16201,7 +16194,7 @@
       </w:tr>
       <w:tr>
         <w:trPr>
-          <w:divId w:val="779686075"/>
+          <w:divId w:val="368455532"/>
         </w:trPr>
         <w:tc>
           <w:tcPr>
@@ -16357,7 +16350,7 @@
       </w:tr>
       <w:tr>
         <w:trPr>
-          <w:divId w:val="779686075"/>
+          <w:divId w:val="368455532"/>
         </w:trPr>
         <w:tc>
           <w:tcPr>
@@ -16513,7 +16506,7 @@
       </w:tr>
       <w:tr>
         <w:trPr>
-          <w:divId w:val="779686075"/>
+          <w:divId w:val="368455532"/>
         </w:trPr>
         <w:tc>
           <w:tcPr>
@@ -16669,7 +16662,7 @@
       </w:tr>
       <w:tr>
         <w:trPr>
-          <w:divId w:val="779686075"/>
+          <w:divId w:val="368455532"/>
         </w:trPr>
         <w:tc>
           <w:tcPr>
@@ -16825,7 +16818,7 @@
       </w:tr>
       <w:tr>
         <w:trPr>
-          <w:divId w:val="779686075"/>
+          <w:divId w:val="368455532"/>
         </w:trPr>
         <w:tc>
           <w:tcPr>
@@ -16983,7 +16976,7 @@
     <w:p>
       <w:pPr>
         <w:pStyle w:val="Ttulo3"/>
-        <w:divId w:val="777528882"/>
+        <w:divId w:val="1873178777"/>
         <w:rPr>
           <w:rFonts w:eastAsia="Times New Roman"/>
           <w:lang w:val="es-ES"/>
@@ -17017,7 +17010,7 @@
       </w:tblGrid>
       <w:tr>
         <w:trPr>
-          <w:divId w:val="1894075171"/>
+          <w:divId w:val="751245308"/>
           <w:tblHeader/>
         </w:trPr>
         <w:tc>
@@ -17208,7 +17201,7 @@
       </w:tr>
       <w:tr>
         <w:trPr>
-          <w:divId w:val="1894075171"/>
+          <w:divId w:val="751245308"/>
         </w:trPr>
         <w:tc>
           <w:tcPr>
@@ -17364,7 +17357,7 @@
       </w:tr>
       <w:tr>
         <w:trPr>
-          <w:divId w:val="1894075171"/>
+          <w:divId w:val="751245308"/>
         </w:trPr>
         <w:tc>
           <w:tcPr>
@@ -17522,7 +17515,7 @@
     <w:p>
       <w:pPr>
         <w:pStyle w:val="Ttulo4"/>
-        <w:divId w:val="777528882"/>
+        <w:divId w:val="1873178777"/>
         <w:rPr>
           <w:rFonts w:eastAsia="Times New Roman"/>
           <w:lang w:val="es-ES"/>
@@ -17540,7 +17533,7 @@
       <w:pPr>
         <w:spacing w:before="375" w:after="225"/>
         <w:jc w:val="center"/>
-        <w:divId w:val="277297825"/>
+        <w:divId w:val="822819012"/>
         <w:rPr>
           <w:rFonts w:ascii="Outfit" w:eastAsia="Times New Roman" w:hAnsi="Outfit"/>
           <w:b/>
@@ -17570,7 +17563,7 @@
       <w:pPr>
         <w:spacing w:after="375"/>
         <w:jc w:val="center"/>
-        <w:divId w:val="1180583342"/>
+        <w:divId w:val="1216309895"/>
         <w:rPr>
           <w:rFonts w:ascii="Plus Jakarta Sans" w:eastAsia="Times New Roman" w:hAnsi="Plus Jakarta Sans"/>
           <w:lang w:val="es-ES"/>
@@ -17958,7 +17951,7 @@
     <w:p>
       <w:pPr>
         <w:spacing w:before="450" w:after="450"/>
-        <w:divId w:val="777528882"/>
+        <w:divId w:val="1873178777"/>
         <w:rPr>
           <w:rFonts w:ascii="Plus Jakarta Sans" w:eastAsia="Times New Roman" w:hAnsi="Plus Jakarta Sans"/>
           <w:lang w:val="es-ES"/>
@@ -17969,7 +17962,7 @@
           <w:rFonts w:ascii="Plus Jakarta Sans" w:eastAsia="Times New Roman" w:hAnsi="Plus Jakarta Sans"/>
           <w:lang w:val="es-ES"/>
         </w:rPr>
-        <w:pict>
+        <w:pict w14:anchorId="0FB8AA03">
           <v:rect id="_x0000_i1035" style="width:0;height:.75pt" o:hralign="center" o:hrstd="t" o:hr="t" fillcolor="#a0a0a0" stroked="f"/>
         </w:pict>
       </w:r>
@@ -17977,7 +17970,7 @@
     <w:p>
       <w:pPr>
         <w:spacing w:before="450" w:after="450"/>
-        <w:divId w:val="777528882"/>
+        <w:divId w:val="1873178777"/>
         <w:rPr>
           <w:rFonts w:ascii="Plus Jakarta Sans" w:eastAsia="Times New Roman" w:hAnsi="Plus Jakarta Sans"/>
           <w:lang w:val="es-ES"/>
@@ -17988,7 +17981,7 @@
           <w:rFonts w:ascii="Plus Jakarta Sans" w:eastAsia="Times New Roman" w:hAnsi="Plus Jakarta Sans"/>
           <w:lang w:val="es-ES"/>
         </w:rPr>
-        <w:pict>
+        <w:pict w14:anchorId="3A5EE9C4">
           <v:rect id="_x0000_i1036" style="width:0;height:.75pt" o:hralign="center" o:hrstd="t" o:hr="t" fillcolor="#a0a0a0" stroked="f"/>
         </w:pict>
       </w:r>
@@ -17996,7 +17989,7 @@
     <w:p>
       <w:pPr>
         <w:pStyle w:val="NormalWeb"/>
-        <w:divId w:val="777528882"/>
+        <w:divId w:val="1873178777"/>
         <w:rPr>
           <w:rFonts w:ascii="Plus Jakarta Sans" w:hAnsi="Plus Jakarta Sans"/>
           <w:lang w:val="es-ES"/>
@@ -18029,7 +18022,7 @@
           <w:rFonts w:ascii="Plus Jakarta Sans" w:hAnsi="Plus Jakarta Sans"/>
           <w:lang w:val="es-ES"/>
         </w:rPr>
-        <w:pict/>
+        <w:pict w14:anchorId="663AD247"/>
       </w:r>
     </w:p>
     <w:sectPr>
@@ -18045,9 +18038,9 @@
 <file path=word/numbering.xml><?xml version="1.0" encoding="utf-8"?>
 <w:numbering xmlns:wpc="http://schemas.microsoft.com/office/word/2010/wordprocessingCanvas" xmlns:cx="http://schemas.microsoft.com/office/drawing/2014/chartex" xmlns:cx1="http://schemas.microsoft.com/office/drawing/2015/9/8/chartex" xmlns:cx2="http://schemas.microsoft.com/office/drawing/2015/10/21/chartex" xmlns:cx3="http://schemas.microsoft.com/office/drawing/2016/5/9/chartex" xmlns:cx4="http://schemas.microsoft.com/office/drawing/2016/5/10/chartex" xmlns:cx5="http://schemas.microsoft.com/office/drawing/2016/5/11/chartex" xmlns:cx6="http://schemas.microsoft.com/office/drawing/2016/5/12/chartex" xmlns:cx7="http://schemas.microsoft.com/office/drawing/2016/5/13/chartex" xmlns:cx8="http://schemas.microsoft.com/office/drawing/2016/5/14/chartex" xmlns:mc="http://schemas.openxmlformats.org/markup-compatibility/2006" xmlns:aink="http://schemas.microsoft.com/office/drawing/2016/ink" xmlns:am3d="http://schemas.microsoft.com/office/drawing/2017/model3d" xmlns:o="urn:schemas-microsoft-com:office:office" xmlns:r="http://schemas.openxmlformats.org/officeDocument/2006/relationships" xmlns:m="http://schemas.openxmlformats.org/officeDocument/2006/math" xmlns:v="urn:schemas-microsoft-com:vml" xmlns:wp14="http://schemas.microsoft.com/office/word/2010/wordprocessingDrawing" xmlns:wp="http://schemas.openxmlformats.org/drawingml/2006/wordprocessingDrawing" xmlns:w10="urn:schemas-microsoft-com:office:word" xmlns:w="http://schemas.openxmlformats.org/wordprocessingml/2006/main" xmlns:w14="http://schemas.microsoft.com/office/word/2010/wordml" xmlns:w15="http://schemas.microsoft.com/office/word/2012/wordml" xmlns:w16cex="http://schemas.microsoft.com/office/word/2018/wordml/cex" xmlns:w16cid="http://schemas.microsoft.com/office/word/2016/wordml/cid" xmlns:w16="http://schemas.microsoft.com/office/word/2018/wordml" xmlns:w16sdtdh="http://schemas.microsoft.com/office/word/2020/wordml/sdtdatahash" xmlns:w16se="http://schemas.microsoft.com/office/word/2015/wordml/symex" xmlns:wpg="http://schemas.microsoft.com/office/word/2010/wordprocessingGroup" xmlns:wpi="http://schemas.microsoft.com/office/word/2010/wordprocessingInk" xmlns:wne="http://schemas.microsoft.com/office/word/2006/wordml" xmlns:wps="http://schemas.microsoft.com/office/word/2010/wordprocessingShape" mc:Ignorable="w14 w15 w16se w16cid w16 w16cex w16sdtdh wp14">
   <w:abstractNum w:abstractNumId="0" w15:restartNumberingAfterBreak="0">
-    <w:nsid w:val="038A6886"/>
+    <w:nsid w:val="09DD0227"/>
     <w:multiLevelType w:val="multilevel"/>
-    <w:tmpl w:val="69B0EA14"/>
+    <w:tmpl w:val="62E0B7D2"/>
     <w:lvl w:ilvl="0">
       <w:start w:val="1"/>
       <w:numFmt w:val="bullet"/>
@@ -18194,9 +18187,9 @@
     </w:lvl>
   </w:abstractNum>
   <w:abstractNum w:abstractNumId="1" w15:restartNumberingAfterBreak="0">
-    <w:nsid w:val="24713E0F"/>
+    <w:nsid w:val="295D2035"/>
     <w:multiLevelType w:val="multilevel"/>
-    <w:tmpl w:val="14AC8C5E"/>
+    <w:tmpl w:val="AF86236A"/>
     <w:lvl w:ilvl="0">
       <w:start w:val="1"/>
       <w:numFmt w:val="bullet"/>
@@ -18343,9 +18336,9 @@
     </w:lvl>
   </w:abstractNum>
   <w:abstractNum w:abstractNumId="2" w15:restartNumberingAfterBreak="0">
-    <w:nsid w:val="5D9D1439"/>
+    <w:nsid w:val="31623D5A"/>
     <w:multiLevelType w:val="multilevel"/>
-    <w:tmpl w:val="F614E05A"/>
+    <w:tmpl w:val="C336625E"/>
     <w:lvl w:ilvl="0">
       <w:start w:val="1"/>
       <w:numFmt w:val="bullet"/>
@@ -18492,9 +18485,9 @@
     </w:lvl>
   </w:abstractNum>
   <w:abstractNum w:abstractNumId="3" w15:restartNumberingAfterBreak="0">
-    <w:nsid w:val="75C67476"/>
+    <w:nsid w:val="39984DB3"/>
     <w:multiLevelType w:val="multilevel"/>
-    <w:tmpl w:val="4DCAA5A8"/>
+    <w:tmpl w:val="05FE27B8"/>
     <w:lvl w:ilvl="0">
       <w:start w:val="1"/>
       <w:numFmt w:val="bullet"/>
@@ -18644,13 +18637,13 @@
     <w:abstractNumId w:val="1"/>
   </w:num>
   <w:num w:numId="2">
-    <w:abstractNumId w:val="2"/>
+    <w:abstractNumId w:val="0"/>
   </w:num>
   <w:num w:numId="3">
     <w:abstractNumId w:val="3"/>
   </w:num>
   <w:num w:numId="4">
-    <w:abstractNumId w:val="0"/>
+    <w:abstractNumId w:val="2"/>
   </w:num>
 </w:numbering>
 </file>

</xml_diff>

<commit_message>
data: regenerar tras las correcciones de fichas y el fix de export (19-ago)
export_geojson.py + generar_superficie_por_comunidad.py despues de las
3 correcciones de fichas y el fix de prioridad clave_catastral/
cod_poligono. Sin bajada nueva de QFieldCloud: mismas 6.830 fichas.

Predios investigados 5.995 -> 5.987 en catastro_geo.geojson y
stats.json (los 8 poligonos fantasma de cod_poligono desaparecen).
Superficie catastral 8.093,34 ha sin cambio. Umaquinga ya no fuerza
recorte de riego (su declarada coincide exacta con su predio real):
predios con varias fichas 435 -> 436, fichas sin poligono 10 -> 9.

Cuadre de caudal por sectores verificado: sigue en -11,38 l/s.

Co-Authored-By: Claude Sonnet 5 <noreply@anthropic.com>
</commit_message>
<xml_diff>
--- a/public/informe_reunion_tecnica.docx
+++ b/public/informe_reunion_tecnica.docx
@@ -4,7 +4,7 @@
   <w:body>
     <w:p>
       <w:pPr>
-        <w:divId w:val="1700928443"/>
+        <w:divId w:val="620692996"/>
         <w:rPr>
           <w:rFonts w:ascii="Plus Jakarta Sans" w:eastAsia="Times New Roman" w:hAnsi="Plus Jakarta Sans"/>
           <w:lang w:val="es-ES"/>
@@ -28,7 +28,7 @@
     <w:p>
       <w:pPr>
         <w:pStyle w:val="Ttulo1"/>
-        <w:divId w:val="319427985"/>
+        <w:divId w:val="1591885174"/>
         <w:rPr>
           <w:rFonts w:eastAsia="Times New Roman"/>
           <w:lang w:val="es-ES"/>
@@ -45,7 +45,7 @@
     <w:p>
       <w:pPr>
         <w:pStyle w:val="NormalWeb"/>
-        <w:divId w:val="319427985"/>
+        <w:divId w:val="1591885174"/>
         <w:rPr>
           <w:rFonts w:ascii="Plus Jakarta Sans" w:hAnsi="Plus Jakarta Sans"/>
           <w:lang w:val="es-ES"/>
@@ -63,7 +63,7 @@
     <w:p>
       <w:pPr>
         <w:pStyle w:val="NormalWeb"/>
-        <w:divId w:val="319427985"/>
+        <w:divId w:val="1591885174"/>
         <w:rPr>
           <w:rFonts w:ascii="Plus Jakarta Sans" w:hAnsi="Plus Jakarta Sans"/>
           <w:lang w:val="es-ES"/>
@@ -102,7 +102,7 @@
     <w:p>
       <w:pPr>
         <w:pStyle w:val="NormalWeb"/>
-        <w:divId w:val="319427985"/>
+        <w:divId w:val="1591885174"/>
         <w:rPr>
           <w:rFonts w:ascii="Plus Jakarta Sans" w:hAnsi="Plus Jakarta Sans"/>
           <w:lang w:val="es-ES"/>
@@ -134,7 +134,7 @@
     <w:p>
       <w:pPr>
         <w:pStyle w:val="NormalWeb"/>
-        <w:divId w:val="319427985"/>
+        <w:divId w:val="1591885174"/>
         <w:rPr>
           <w:rFonts w:ascii="Plus Jakarta Sans" w:hAnsi="Plus Jakarta Sans"/>
           <w:lang w:val="es-ES"/>
@@ -166,7 +166,7 @@
     <w:p>
       <w:pPr>
         <w:pStyle w:val="NormalWeb"/>
-        <w:divId w:val="319427985"/>
+        <w:divId w:val="1591885174"/>
         <w:rPr>
           <w:rFonts w:ascii="Plus Jakarta Sans" w:hAnsi="Plus Jakarta Sans"/>
           <w:lang w:val="es-ES"/>
@@ -206,7 +206,7 @@
     <w:p>
       <w:pPr>
         <w:pStyle w:val="NormalWeb"/>
-        <w:divId w:val="319427985"/>
+        <w:divId w:val="1591885174"/>
         <w:rPr>
           <w:rFonts w:ascii="Plus Jakarta Sans" w:hAnsi="Plus Jakarta Sans"/>
           <w:lang w:val="es-ES"/>
@@ -223,7 +223,7 @@
     <w:p>
       <w:pPr>
         <w:pStyle w:val="NormalWeb"/>
-        <w:divId w:val="319427985"/>
+        <w:divId w:val="1591885174"/>
         <w:rPr>
           <w:rFonts w:ascii="Plus Jakarta Sans" w:hAnsi="Plus Jakarta Sans"/>
           <w:lang w:val="es-ES"/>
@@ -240,7 +240,7 @@
     <w:p>
       <w:pPr>
         <w:pStyle w:val="NormalWeb"/>
-        <w:divId w:val="319427985"/>
+        <w:divId w:val="1591885174"/>
         <w:rPr>
           <w:rFonts w:ascii="Plus Jakarta Sans" w:hAnsi="Plus Jakarta Sans"/>
           <w:lang w:val="es-ES"/>
@@ -272,7 +272,7 @@
     <w:p>
       <w:pPr>
         <w:pStyle w:val="NormalWeb"/>
-        <w:divId w:val="319427985"/>
+        <w:divId w:val="1591885174"/>
         <w:rPr>
           <w:rFonts w:ascii="Plus Jakarta Sans" w:hAnsi="Plus Jakarta Sans"/>
           <w:lang w:val="es-ES"/>
@@ -289,7 +289,7 @@
     <w:p>
       <w:pPr>
         <w:pStyle w:val="NormalWeb"/>
-        <w:divId w:val="319427985"/>
+        <w:divId w:val="1591885174"/>
         <w:rPr>
           <w:rFonts w:ascii="Plus Jakarta Sans" w:hAnsi="Plus Jakarta Sans"/>
           <w:lang w:val="es-ES"/>
@@ -306,7 +306,7 @@
     <w:p>
       <w:pPr>
         <w:pStyle w:val="NormalWeb"/>
-        <w:divId w:val="319427985"/>
+        <w:divId w:val="1591885174"/>
         <w:rPr>
           <w:rFonts w:ascii="Plus Jakarta Sans" w:hAnsi="Plus Jakarta Sans"/>
           <w:lang w:val="es-ES"/>
@@ -323,7 +323,7 @@
     <w:p>
       <w:pPr>
         <w:pStyle w:val="NormalWeb"/>
-        <w:divId w:val="319427985"/>
+        <w:divId w:val="1591885174"/>
         <w:rPr>
           <w:rFonts w:ascii="Plus Jakarta Sans" w:hAnsi="Plus Jakarta Sans"/>
           <w:lang w:val="es-ES"/>
@@ -340,7 +340,7 @@
     <w:p>
       <w:pPr>
         <w:pStyle w:val="NormalWeb"/>
-        <w:divId w:val="319427985"/>
+        <w:divId w:val="1591885174"/>
         <w:rPr>
           <w:rFonts w:ascii="Plus Jakarta Sans" w:hAnsi="Plus Jakarta Sans"/>
           <w:lang w:val="es-ES"/>
@@ -364,7 +364,7 @@
     <w:p>
       <w:pPr>
         <w:spacing w:before="450" w:after="450"/>
-        <w:divId w:val="319427985"/>
+        <w:divId w:val="1591885174"/>
         <w:rPr>
           <w:rFonts w:ascii="Plus Jakarta Sans" w:eastAsia="Times New Roman" w:hAnsi="Plus Jakarta Sans"/>
           <w:lang w:val="es-ES"/>
@@ -383,7 +383,7 @@
     <w:p>
       <w:pPr>
         <w:pStyle w:val="Ttulo2"/>
-        <w:divId w:val="319427985"/>
+        <w:divId w:val="1591885174"/>
         <w:rPr>
           <w:rFonts w:eastAsia="Times New Roman"/>
           <w:lang w:val="es-ES"/>
@@ -407,7 +407,7 @@
     <w:p>
       <w:pPr>
         <w:pStyle w:val="NormalWeb"/>
-        <w:divId w:val="319427985"/>
+        <w:divId w:val="1591885174"/>
         <w:rPr>
           <w:rFonts w:ascii="Plus Jakarta Sans" w:hAnsi="Plus Jakarta Sans"/>
           <w:lang w:val="es-ES"/>
@@ -429,7 +429,7 @@
         </w:numPr>
         <w:spacing w:before="100" w:beforeAutospacing="1" w:after="90"/>
         <w:ind w:left="1020"/>
-        <w:divId w:val="319427985"/>
+        <w:divId w:val="1591885174"/>
         <w:rPr>
           <w:rFonts w:ascii="Plus Jakarta Sans" w:eastAsia="Times New Roman" w:hAnsi="Plus Jakarta Sans"/>
           <w:sz w:val="21"/>
@@ -475,7 +475,7 @@
         </w:numPr>
         <w:spacing w:before="100" w:beforeAutospacing="1" w:after="90"/>
         <w:ind w:left="1020"/>
-        <w:divId w:val="319427985"/>
+        <w:divId w:val="1591885174"/>
         <w:rPr>
           <w:rFonts w:ascii="Plus Jakarta Sans" w:eastAsia="Times New Roman" w:hAnsi="Plus Jakarta Sans"/>
           <w:sz w:val="21"/>
@@ -520,7 +520,7 @@
           <w:szCs w:val="21"/>
           <w:lang w:val="es-ES"/>
         </w:rPr>
-        <w:t>5,995 polígonos unificados</w:t>
+        <w:t>5,987 polígonos unificados</w:t>
       </w:r>
     </w:p>
     <w:p>
@@ -531,7 +531,7 @@
         </w:numPr>
         <w:spacing w:before="100" w:beforeAutospacing="1" w:after="90"/>
         <w:ind w:left="1020"/>
-        <w:divId w:val="319427985"/>
+        <w:divId w:val="1591885174"/>
         <w:rPr>
           <w:rFonts w:ascii="Plus Jakarta Sans" w:eastAsia="Times New Roman" w:hAnsi="Plus Jakarta Sans"/>
           <w:sz w:val="21"/>
@@ -577,7 +577,7 @@
         </w:numPr>
         <w:spacing w:before="100" w:beforeAutospacing="1" w:after="90"/>
         <w:ind w:left="1020"/>
-        <w:divId w:val="319427985"/>
+        <w:divId w:val="1591885174"/>
         <w:rPr>
           <w:rFonts w:ascii="Plus Jakarta Sans" w:eastAsia="Times New Roman" w:hAnsi="Plus Jakarta Sans"/>
           <w:sz w:val="21"/>
@@ -618,7 +618,7 @@
     <w:p>
       <w:pPr>
         <w:spacing w:before="450" w:after="450"/>
-        <w:divId w:val="319427985"/>
+        <w:divId w:val="1591885174"/>
         <w:rPr>
           <w:rFonts w:ascii="Plus Jakarta Sans" w:eastAsia="Times New Roman" w:hAnsi="Plus Jakarta Sans"/>
           <w:lang w:val="es-ES"/>
@@ -638,7 +638,7 @@
     <w:p>
       <w:pPr>
         <w:pStyle w:val="Ttulo2"/>
-        <w:divId w:val="319427985"/>
+        <w:divId w:val="1591885174"/>
         <w:rPr>
           <w:rFonts w:eastAsia="Times New Roman"/>
           <w:lang w:val="es-ES"/>
@@ -655,7 +655,7 @@
     <w:p>
       <w:pPr>
         <w:pStyle w:val="NormalWeb"/>
-        <w:divId w:val="319427985"/>
+        <w:divId w:val="1591885174"/>
         <w:rPr>
           <w:rFonts w:ascii="Plus Jakarta Sans" w:hAnsi="Plus Jakarta Sans"/>
           <w:lang w:val="es-ES"/>
@@ -709,7 +709,7 @@
       </w:tblGrid>
       <w:tr>
         <w:trPr>
-          <w:divId w:val="742794388"/>
+          <w:divId w:val="358287268"/>
           <w:tblHeader/>
         </w:trPr>
         <w:tc>
@@ -789,7 +789,7 @@
       </w:tr>
       <w:tr>
         <w:trPr>
-          <w:divId w:val="742794388"/>
+          <w:divId w:val="358287268"/>
         </w:trPr>
         <w:tc>
           <w:tcPr>
@@ -855,7 +855,7 @@
       </w:tr>
       <w:tr>
         <w:trPr>
-          <w:divId w:val="742794388"/>
+          <w:divId w:val="358287268"/>
         </w:trPr>
         <w:tc>
           <w:tcPr>
@@ -921,7 +921,7 @@
       </w:tr>
       <w:tr>
         <w:trPr>
-          <w:divId w:val="742794388"/>
+          <w:divId w:val="358287268"/>
         </w:trPr>
         <w:tc>
           <w:tcPr>
@@ -987,7 +987,7 @@
       </w:tr>
       <w:tr>
         <w:trPr>
-          <w:divId w:val="742794388"/>
+          <w:divId w:val="358287268"/>
         </w:trPr>
         <w:tc>
           <w:tcPr>
@@ -1055,7 +1055,7 @@
     <w:p>
       <w:pPr>
         <w:spacing w:before="450" w:after="450"/>
-        <w:divId w:val="319427985"/>
+        <w:divId w:val="1591885174"/>
         <w:rPr>
           <w:rFonts w:ascii="Plus Jakarta Sans" w:eastAsia="Times New Roman" w:hAnsi="Plus Jakarta Sans"/>
           <w:lang w:val="es-ES"/>
@@ -1074,7 +1074,7 @@
     <w:p>
       <w:pPr>
         <w:pStyle w:val="Ttulo2"/>
-        <w:divId w:val="319427985"/>
+        <w:divId w:val="1591885174"/>
         <w:rPr>
           <w:rFonts w:eastAsia="Times New Roman"/>
           <w:lang w:val="es-ES"/>
@@ -1091,7 +1091,7 @@
     <w:p>
       <w:pPr>
         <w:pStyle w:val="Ttulo3"/>
-        <w:divId w:val="319427985"/>
+        <w:divId w:val="1591885174"/>
         <w:rPr>
           <w:rFonts w:eastAsia="Times New Roman"/>
           <w:lang w:val="es-ES"/>
@@ -1115,7 +1115,7 @@
     <w:p>
       <w:pPr>
         <w:pStyle w:val="NormalWeb"/>
-        <w:divId w:val="319427985"/>
+        <w:divId w:val="1591885174"/>
         <w:rPr>
           <w:rFonts w:ascii="Plus Jakarta Sans" w:hAnsi="Plus Jakarta Sans"/>
           <w:lang w:val="es-ES"/>
@@ -1148,7 +1148,7 @@
       </w:tblGrid>
       <w:tr>
         <w:trPr>
-          <w:divId w:val="1087773612"/>
+          <w:divId w:val="1017461724"/>
           <w:tblHeader/>
         </w:trPr>
         <w:tc>
@@ -1302,7 +1302,7 @@
       </w:tr>
       <w:tr>
         <w:trPr>
-          <w:divId w:val="1087773612"/>
+          <w:divId w:val="1017461724"/>
         </w:trPr>
         <w:tc>
           <w:tcPr>
@@ -1428,7 +1428,7 @@
       </w:tr>
       <w:tr>
         <w:trPr>
-          <w:divId w:val="1087773612"/>
+          <w:divId w:val="1017461724"/>
         </w:trPr>
         <w:tc>
           <w:tcPr>
@@ -1554,7 +1554,7 @@
       </w:tr>
       <w:tr>
         <w:trPr>
-          <w:divId w:val="1087773612"/>
+          <w:divId w:val="1017461724"/>
         </w:trPr>
         <w:tc>
           <w:tcPr>
@@ -1680,7 +1680,7 @@
       </w:tr>
       <w:tr>
         <w:trPr>
-          <w:divId w:val="1087773612"/>
+          <w:divId w:val="1017461724"/>
         </w:trPr>
         <w:tc>
           <w:tcPr>
@@ -1806,7 +1806,7 @@
       </w:tr>
       <w:tr>
         <w:trPr>
-          <w:divId w:val="1087773612"/>
+          <w:divId w:val="1017461724"/>
         </w:trPr>
         <w:tc>
           <w:tcPr>
@@ -1932,7 +1932,7 @@
       </w:tr>
       <w:tr>
         <w:trPr>
-          <w:divId w:val="1087773612"/>
+          <w:divId w:val="1017461724"/>
         </w:trPr>
         <w:tc>
           <w:tcPr>
@@ -2059,7 +2059,7 @@
       </w:tr>
       <w:tr>
         <w:trPr>
-          <w:divId w:val="1087773612"/>
+          <w:divId w:val="1017461724"/>
         </w:trPr>
         <w:tc>
           <w:tcPr>
@@ -2194,7 +2194,7 @@
       </w:tr>
       <w:tr>
         <w:trPr>
-          <w:divId w:val="1087773612"/>
+          <w:divId w:val="1017461724"/>
         </w:trPr>
         <w:tc>
           <w:tcPr>
@@ -2322,7 +2322,7 @@
     <w:p>
       <w:pPr>
         <w:pStyle w:val="Ttulo3"/>
-        <w:divId w:val="319427985"/>
+        <w:divId w:val="1591885174"/>
         <w:rPr>
           <w:rFonts w:eastAsia="Times New Roman"/>
           <w:lang w:val="es-ES"/>
@@ -2339,7 +2339,7 @@
     <w:p>
       <w:pPr>
         <w:pStyle w:val="NormalWeb"/>
-        <w:divId w:val="319427985"/>
+        <w:divId w:val="1591885174"/>
         <w:rPr>
           <w:rFonts w:ascii="Plus Jakarta Sans" w:hAnsi="Plus Jakarta Sans"/>
           <w:lang w:val="es-ES"/>
@@ -2361,7 +2361,7 @@
         </w:numPr>
         <w:spacing w:before="100" w:beforeAutospacing="1" w:after="90"/>
         <w:ind w:left="1020"/>
-        <w:divId w:val="319427985"/>
+        <w:divId w:val="1591885174"/>
         <w:rPr>
           <w:rFonts w:ascii="Plus Jakarta Sans" w:eastAsia="Times New Roman" w:hAnsi="Plus Jakarta Sans"/>
           <w:sz w:val="21"/>
@@ -2463,7 +2463,7 @@
         </w:numPr>
         <w:spacing w:before="100" w:beforeAutospacing="1" w:after="90"/>
         <w:ind w:left="1020"/>
-        <w:divId w:val="319427985"/>
+        <w:divId w:val="1591885174"/>
         <w:rPr>
           <w:rFonts w:ascii="Plus Jakarta Sans" w:eastAsia="Times New Roman" w:hAnsi="Plus Jakarta Sans"/>
           <w:sz w:val="21"/>
@@ -2565,7 +2565,7 @@
         </w:numPr>
         <w:spacing w:before="100" w:beforeAutospacing="1" w:after="90"/>
         <w:ind w:left="1020"/>
-        <w:divId w:val="319427985"/>
+        <w:divId w:val="1591885174"/>
         <w:rPr>
           <w:rFonts w:ascii="Plus Jakarta Sans" w:eastAsia="Times New Roman" w:hAnsi="Plus Jakarta Sans"/>
           <w:sz w:val="21"/>
@@ -2671,7 +2671,7 @@
     <w:p>
       <w:pPr>
         <w:pStyle w:val="Ttulo3"/>
-        <w:divId w:val="319427985"/>
+        <w:divId w:val="1591885174"/>
         <w:rPr>
           <w:rFonts w:eastAsia="Times New Roman"/>
           <w:lang w:val="es-ES"/>
@@ -2688,7 +2688,7 @@
     <w:p>
       <w:pPr>
         <w:jc w:val="center"/>
-        <w:divId w:val="1655798318"/>
+        <w:divId w:val="1900744319"/>
         <w:rPr>
           <w:rFonts w:ascii="Outfit" w:eastAsia="Times New Roman" w:hAnsi="Outfit"/>
           <w:b/>
@@ -2717,7 +2717,7 @@
     <w:p>
       <w:pPr>
         <w:jc w:val="center"/>
-        <w:divId w:val="1525166014"/>
+        <w:divId w:val="606350242"/>
         <w:rPr>
           <w:rFonts w:ascii="Plus Jakarta Sans" w:eastAsia="Times New Roman" w:hAnsi="Plus Jakarta Sans"/>
           <w:lang w:val="es-ES"/>
@@ -3112,7 +3112,7 @@
     <w:p>
       <w:pPr>
         <w:spacing w:before="450" w:after="450"/>
-        <w:divId w:val="319427985"/>
+        <w:divId w:val="1591885174"/>
         <w:rPr>
           <w:rFonts w:ascii="Plus Jakarta Sans" w:eastAsia="Times New Roman" w:hAnsi="Plus Jakarta Sans"/>
           <w:lang w:val="es-ES"/>
@@ -3131,7 +3131,7 @@
     <w:p>
       <w:pPr>
         <w:pStyle w:val="Ttulo3"/>
-        <w:divId w:val="319427985"/>
+        <w:divId w:val="1591885174"/>
         <w:rPr>
           <w:rFonts w:eastAsia="Times New Roman"/>
           <w:lang w:val="es-ES"/>
@@ -3148,7 +3148,7 @@
     <w:p>
       <w:pPr>
         <w:pStyle w:val="NormalWeb"/>
-        <w:divId w:val="319427985"/>
+        <w:divId w:val="1591885174"/>
         <w:rPr>
           <w:rFonts w:ascii="Plus Jakarta Sans" w:hAnsi="Plus Jakarta Sans"/>
           <w:lang w:val="es-ES"/>
@@ -3188,7 +3188,7 @@
       </w:tblGrid>
       <w:tr>
         <w:trPr>
-          <w:divId w:val="705375071"/>
+          <w:divId w:val="76639154"/>
           <w:tblHeader/>
         </w:trPr>
         <w:tc>
@@ -3343,7 +3343,7 @@
       </w:tr>
       <w:tr>
         <w:trPr>
-          <w:divId w:val="705375071"/>
+          <w:divId w:val="76639154"/>
         </w:trPr>
         <w:tc>
           <w:tcPr>
@@ -3477,7 +3477,7 @@
       </w:tr>
       <w:tr>
         <w:trPr>
-          <w:divId w:val="705375071"/>
+          <w:divId w:val="76639154"/>
         </w:trPr>
         <w:tc>
           <w:tcPr>
@@ -3611,7 +3611,7 @@
       </w:tr>
       <w:tr>
         <w:trPr>
-          <w:divId w:val="705375071"/>
+          <w:divId w:val="76639154"/>
         </w:trPr>
         <w:tc>
           <w:tcPr>
@@ -3753,7 +3753,7 @@
       </w:tr>
       <w:tr>
         <w:trPr>
-          <w:divId w:val="705375071"/>
+          <w:divId w:val="76639154"/>
         </w:trPr>
         <w:tc>
           <w:tcPr>
@@ -3887,7 +3887,7 @@
       </w:tr>
       <w:tr>
         <w:trPr>
-          <w:divId w:val="705375071"/>
+          <w:divId w:val="76639154"/>
         </w:trPr>
         <w:tc>
           <w:tcPr>
@@ -4021,7 +4021,7 @@
       </w:tr>
       <w:tr>
         <w:trPr>
-          <w:divId w:val="705375071"/>
+          <w:divId w:val="76639154"/>
         </w:trPr>
         <w:tc>
           <w:tcPr>
@@ -4157,7 +4157,7 @@
     <w:p>
       <w:pPr>
         <w:pStyle w:val="Ttulo3"/>
-        <w:divId w:val="319427985"/>
+        <w:divId w:val="1591885174"/>
         <w:rPr>
           <w:rFonts w:eastAsia="Times New Roman"/>
           <w:lang w:val="es-ES"/>
@@ -4181,7 +4181,7 @@
     <w:p>
       <w:pPr>
         <w:jc w:val="center"/>
-        <w:divId w:val="1645508070"/>
+        <w:divId w:val="843933059"/>
         <w:rPr>
           <w:rFonts w:ascii="Outfit" w:eastAsia="Times New Roman" w:hAnsi="Outfit"/>
           <w:b/>
@@ -4210,7 +4210,7 @@
     <w:p>
       <w:pPr>
         <w:jc w:val="center"/>
-        <w:divId w:val="671100902"/>
+        <w:divId w:val="125703928"/>
         <w:rPr>
           <w:rFonts w:ascii="Plus Jakarta Sans" w:eastAsia="Times New Roman" w:hAnsi="Plus Jakarta Sans"/>
           <w:lang w:val="es-ES"/>
@@ -4577,7 +4577,7 @@
     <w:p>
       <w:pPr>
         <w:spacing w:before="450" w:after="450"/>
-        <w:divId w:val="319427985"/>
+        <w:divId w:val="1591885174"/>
         <w:rPr>
           <w:rFonts w:ascii="Plus Jakarta Sans" w:eastAsia="Times New Roman" w:hAnsi="Plus Jakarta Sans"/>
           <w:lang w:val="es-ES"/>
@@ -4596,7 +4596,7 @@
     <w:p>
       <w:pPr>
         <w:pStyle w:val="Ttulo3"/>
-        <w:divId w:val="319427985"/>
+        <w:divId w:val="1591885174"/>
         <w:rPr>
           <w:rFonts w:eastAsia="Times New Roman"/>
           <w:lang w:val="es-ES"/>
@@ -4613,7 +4613,7 @@
     <w:p>
       <w:pPr>
         <w:pStyle w:val="NormalWeb"/>
-        <w:divId w:val="319427985"/>
+        <w:divId w:val="1591885174"/>
         <w:rPr>
           <w:rFonts w:ascii="Plus Jakarta Sans" w:hAnsi="Plus Jakarta Sans"/>
           <w:lang w:val="es-ES"/>
@@ -4642,7 +4642,7 @@
         </w:numPr>
         <w:spacing w:before="100" w:beforeAutospacing="1" w:after="90"/>
         <w:ind w:left="1020"/>
-        <w:divId w:val="319427985"/>
+        <w:divId w:val="1591885174"/>
         <w:rPr>
           <w:rFonts w:ascii="Plus Jakarta Sans" w:eastAsia="Times New Roman" w:hAnsi="Plus Jakarta Sans"/>
           <w:sz w:val="21"/>
@@ -4678,7 +4678,7 @@
         </w:numPr>
         <w:spacing w:before="100" w:beforeAutospacing="1" w:after="90"/>
         <w:ind w:left="1020"/>
-        <w:divId w:val="319427985"/>
+        <w:divId w:val="1591885174"/>
         <w:rPr>
           <w:rFonts w:ascii="Plus Jakarta Sans" w:eastAsia="Times New Roman" w:hAnsi="Plus Jakarta Sans"/>
           <w:sz w:val="21"/>
@@ -4723,7 +4723,7 @@
         </w:numPr>
         <w:spacing w:before="100" w:beforeAutospacing="1" w:after="90"/>
         <w:ind w:left="1020"/>
-        <w:divId w:val="319427985"/>
+        <w:divId w:val="1591885174"/>
         <w:rPr>
           <w:rFonts w:ascii="Plus Jakarta Sans" w:eastAsia="Times New Roman" w:hAnsi="Plus Jakarta Sans"/>
           <w:sz w:val="21"/>
@@ -4777,7 +4777,7 @@
         </w:numPr>
         <w:spacing w:before="100" w:beforeAutospacing="1" w:after="90"/>
         <w:ind w:left="1020"/>
-        <w:divId w:val="319427985"/>
+        <w:divId w:val="1591885174"/>
         <w:rPr>
           <w:rFonts w:ascii="Plus Jakarta Sans" w:eastAsia="Times New Roman" w:hAnsi="Plus Jakarta Sans"/>
           <w:sz w:val="21"/>
@@ -4833,7 +4833,7 @@
       </w:tblGrid>
       <w:tr>
         <w:trPr>
-          <w:divId w:val="1049065563"/>
+          <w:divId w:val="592251564"/>
           <w:tblHeader/>
         </w:trPr>
         <w:tc>
@@ -4987,7 +4987,7 @@
       </w:tr>
       <w:tr>
         <w:trPr>
-          <w:divId w:val="1049065563"/>
+          <w:divId w:val="592251564"/>
         </w:trPr>
         <w:tc>
           <w:tcPr>
@@ -5113,7 +5113,7 @@
       </w:tr>
       <w:tr>
         <w:trPr>
-          <w:divId w:val="1049065563"/>
+          <w:divId w:val="592251564"/>
         </w:trPr>
         <w:tc>
           <w:tcPr>
@@ -5239,7 +5239,7 @@
       </w:tr>
       <w:tr>
         <w:trPr>
-          <w:divId w:val="1049065563"/>
+          <w:divId w:val="592251564"/>
         </w:trPr>
         <w:tc>
           <w:tcPr>
@@ -5365,7 +5365,7 @@
       </w:tr>
       <w:tr>
         <w:trPr>
-          <w:divId w:val="1049065563"/>
+          <w:divId w:val="592251564"/>
         </w:trPr>
         <w:tc>
           <w:tcPr>
@@ -5494,7 +5494,7 @@
     <w:p>
       <w:pPr>
         <w:spacing w:before="450" w:after="450"/>
-        <w:divId w:val="319427985"/>
+        <w:divId w:val="1591885174"/>
         <w:rPr>
           <w:rFonts w:ascii="Plus Jakarta Sans" w:eastAsia="Times New Roman" w:hAnsi="Plus Jakarta Sans"/>
           <w:lang w:val="es-ES"/>
@@ -5513,7 +5513,7 @@
     <w:p>
       <w:pPr>
         <w:pStyle w:val="Ttulo3"/>
-        <w:divId w:val="319427985"/>
+        <w:divId w:val="1591885174"/>
         <w:rPr>
           <w:rFonts w:eastAsia="Times New Roman"/>
           <w:lang w:val="es-ES"/>
@@ -5530,7 +5530,7 @@
     <w:p>
       <w:pPr>
         <w:pStyle w:val="NormalWeb"/>
-        <w:divId w:val="319427985"/>
+        <w:divId w:val="1591885174"/>
         <w:rPr>
           <w:rFonts w:ascii="Plus Jakarta Sans" w:hAnsi="Plus Jakarta Sans"/>
           <w:lang w:val="es-ES"/>
@@ -5554,7 +5554,7 @@
     <w:p>
       <w:pPr>
         <w:pStyle w:val="Ttulo4"/>
-        <w:divId w:val="319427985"/>
+        <w:divId w:val="1591885174"/>
         <w:rPr>
           <w:rFonts w:eastAsia="Times New Roman"/>
           <w:lang w:val="es-ES"/>
@@ -5571,7 +5571,7 @@
     <w:p>
       <w:pPr>
         <w:jc w:val="center"/>
-        <w:divId w:val="1970429544"/>
+        <w:divId w:val="2016304213"/>
         <w:rPr>
           <w:rFonts w:ascii="Outfit" w:eastAsia="Times New Roman" w:hAnsi="Outfit"/>
           <w:b/>
@@ -5600,7 +5600,7 @@
     <w:p>
       <w:pPr>
         <w:jc w:val="center"/>
-        <w:divId w:val="1879392439"/>
+        <w:divId w:val="1217594684"/>
         <w:rPr>
           <w:rFonts w:ascii="Plus Jakarta Sans" w:eastAsia="Times New Roman" w:hAnsi="Plus Jakarta Sans"/>
           <w:lang w:val="es-ES"/>
@@ -5883,7 +5883,7 @@
     <w:p>
       <w:pPr>
         <w:pStyle w:val="Ttulo4"/>
-        <w:divId w:val="319427985"/>
+        <w:divId w:val="1591885174"/>
         <w:rPr>
           <w:rFonts w:eastAsia="Times New Roman"/>
           <w:lang w:val="es-ES"/>
@@ -5900,7 +5900,7 @@
     <w:p>
       <w:pPr>
         <w:jc w:val="center"/>
-        <w:divId w:val="1182284777"/>
+        <w:divId w:val="1460339858"/>
         <w:rPr>
           <w:rFonts w:ascii="Outfit" w:eastAsia="Times New Roman" w:hAnsi="Outfit"/>
           <w:b/>
@@ -5942,7 +5942,7 @@
     <w:p>
       <w:pPr>
         <w:jc w:val="center"/>
-        <w:divId w:val="2020305284"/>
+        <w:divId w:val="1385720125"/>
         <w:rPr>
           <w:rFonts w:ascii="Plus Jakarta Sans" w:eastAsia="Times New Roman" w:hAnsi="Plus Jakarta Sans"/>
           <w:lang w:val="es-ES"/>
@@ -6260,7 +6260,7 @@
     <w:p>
       <w:pPr>
         <w:pStyle w:val="Ttulo4"/>
-        <w:divId w:val="319427985"/>
+        <w:divId w:val="1591885174"/>
         <w:rPr>
           <w:rFonts w:eastAsia="Times New Roman"/>
           <w:lang w:val="es-ES"/>
@@ -6277,7 +6277,7 @@
     <w:p>
       <w:pPr>
         <w:jc w:val="center"/>
-        <w:divId w:val="94372865"/>
+        <w:divId w:val="1752309090"/>
         <w:rPr>
           <w:rFonts w:ascii="Outfit" w:eastAsia="Times New Roman" w:hAnsi="Outfit"/>
           <w:b/>
@@ -6306,7 +6306,7 @@
     <w:p>
       <w:pPr>
         <w:jc w:val="center"/>
-        <w:divId w:val="511336248"/>
+        <w:divId w:val="1386024632"/>
         <w:rPr>
           <w:rFonts w:ascii="Plus Jakarta Sans" w:eastAsia="Times New Roman" w:hAnsi="Plus Jakarta Sans"/>
           <w:lang w:val="es-ES"/>
@@ -6610,7 +6610,7 @@
     <w:p>
       <w:pPr>
         <w:spacing w:before="450" w:after="450"/>
-        <w:divId w:val="319427985"/>
+        <w:divId w:val="1591885174"/>
         <w:rPr>
           <w:rFonts w:ascii="Plus Jakarta Sans" w:eastAsia="Times New Roman" w:hAnsi="Plus Jakarta Sans"/>
           <w:lang w:val="es-ES"/>
@@ -6629,7 +6629,7 @@
     <w:p>
       <w:pPr>
         <w:pStyle w:val="Ttulo3"/>
-        <w:divId w:val="319427985"/>
+        <w:divId w:val="1591885174"/>
         <w:rPr>
           <w:rFonts w:eastAsia="Times New Roman"/>
           <w:lang w:val="es-ES"/>
@@ -6653,7 +6653,7 @@
     <w:p>
       <w:pPr>
         <w:pStyle w:val="NormalWeb"/>
-        <w:divId w:val="319427985"/>
+        <w:divId w:val="1591885174"/>
         <w:rPr>
           <w:rFonts w:ascii="Plus Jakarta Sans" w:hAnsi="Plus Jakarta Sans"/>
           <w:lang w:val="es-ES"/>
@@ -6670,7 +6670,7 @@
     <w:p>
       <w:pPr>
         <w:pStyle w:val="Ttulo4"/>
-        <w:divId w:val="319427985"/>
+        <w:divId w:val="1591885174"/>
         <w:rPr>
           <w:rFonts w:eastAsia="Times New Roman"/>
           <w:lang w:val="es-ES"/>
@@ -6688,7 +6688,7 @@
     <w:p>
       <w:pPr>
         <w:pStyle w:val="NormalWeb"/>
-        <w:divId w:val="319427985"/>
+        <w:divId w:val="1591885174"/>
         <w:rPr>
           <w:rFonts w:ascii="Plus Jakarta Sans" w:hAnsi="Plus Jakarta Sans"/>
           <w:lang w:val="es-ES"/>
@@ -6726,7 +6726,7 @@
       </w:tblGrid>
       <w:tr>
         <w:trPr>
-          <w:divId w:val="1577401046"/>
+          <w:divId w:val="352538469"/>
           <w:tblHeader/>
         </w:trPr>
         <w:tc>
@@ -6806,7 +6806,7 @@
       </w:tr>
       <w:tr>
         <w:trPr>
-          <w:divId w:val="1577401046"/>
+          <w:divId w:val="352538469"/>
         </w:trPr>
         <w:tc>
           <w:tcPr>
@@ -6895,7 +6895,7 @@
     <w:p>
       <w:pPr>
         <w:pStyle w:val="Ttulo4"/>
-        <w:divId w:val="319427985"/>
+        <w:divId w:val="1591885174"/>
         <w:rPr>
           <w:rFonts w:eastAsia="Times New Roman"/>
           <w:lang w:val="es-ES"/>
@@ -6912,7 +6912,7 @@
     <w:p>
       <w:pPr>
         <w:pStyle w:val="NormalWeb"/>
-        <w:divId w:val="319427985"/>
+        <w:divId w:val="1591885174"/>
         <w:rPr>
           <w:rFonts w:ascii="Plus Jakarta Sans" w:hAnsi="Plus Jakarta Sans"/>
           <w:lang w:val="es-ES"/>
@@ -6943,7 +6943,7 @@
       </w:tblGrid>
       <w:tr>
         <w:trPr>
-          <w:divId w:val="1629555762"/>
+          <w:divId w:val="1581409523"/>
           <w:tblHeader/>
         </w:trPr>
         <w:tc>
@@ -7034,7 +7034,7 @@
       </w:tr>
       <w:tr>
         <w:trPr>
-          <w:divId w:val="1629555762"/>
+          <w:divId w:val="1581409523"/>
         </w:trPr>
         <w:tc>
           <w:tcPr>
@@ -7123,7 +7123,7 @@
     <w:p>
       <w:pPr>
         <w:pStyle w:val="Ttulo4"/>
-        <w:divId w:val="319427985"/>
+        <w:divId w:val="1591885174"/>
         <w:rPr>
           <w:rFonts w:eastAsia="Times New Roman"/>
           <w:lang w:val="es-ES"/>
@@ -7140,7 +7140,7 @@
     <w:p>
       <w:pPr>
         <w:pStyle w:val="NormalWeb"/>
-        <w:divId w:val="319427985"/>
+        <w:divId w:val="1591885174"/>
         <w:rPr>
           <w:rFonts w:ascii="Plus Jakarta Sans" w:hAnsi="Plus Jakarta Sans"/>
           <w:lang w:val="es-ES"/>
@@ -7171,7 +7171,7 @@
       </w:tblGrid>
       <w:tr>
         <w:trPr>
-          <w:divId w:val="1218012163"/>
+          <w:divId w:val="2145658211"/>
           <w:tblHeader/>
         </w:trPr>
         <w:tc>
@@ -7251,7 +7251,7 @@
       </w:tr>
       <w:tr>
         <w:trPr>
-          <w:divId w:val="1218012163"/>
+          <w:divId w:val="2145658211"/>
         </w:trPr>
         <w:tc>
           <w:tcPr>
@@ -7340,7 +7340,7 @@
     <w:p>
       <w:pPr>
         <w:spacing w:before="450" w:after="450"/>
-        <w:divId w:val="319427985"/>
+        <w:divId w:val="1591885174"/>
         <w:rPr>
           <w:rFonts w:ascii="Plus Jakarta Sans" w:eastAsia="Times New Roman" w:hAnsi="Plus Jakarta Sans"/>
           <w:lang w:val="es-ES"/>
@@ -7359,7 +7359,7 @@
     <w:p>
       <w:pPr>
         <w:pStyle w:val="Ttulo2"/>
-        <w:divId w:val="319427985"/>
+        <w:divId w:val="1591885174"/>
         <w:rPr>
           <w:rFonts w:eastAsia="Times New Roman"/>
           <w:lang w:val="es-ES"/>
@@ -7376,7 +7376,7 @@
     <w:p>
       <w:pPr>
         <w:pStyle w:val="NormalWeb"/>
-        <w:divId w:val="319427985"/>
+        <w:divId w:val="1591885174"/>
         <w:rPr>
           <w:rFonts w:ascii="Plus Jakarta Sans" w:hAnsi="Plus Jakarta Sans"/>
           <w:lang w:val="es-ES"/>
@@ -7393,7 +7393,7 @@
     <w:p>
       <w:pPr>
         <w:pStyle w:val="Ttulo3"/>
-        <w:divId w:val="319427985"/>
+        <w:divId w:val="1591885174"/>
         <w:rPr>
           <w:rFonts w:eastAsia="Times New Roman"/>
           <w:lang w:val="es-ES"/>
@@ -7410,7 +7410,7 @@
     <w:p>
       <w:pPr>
         <w:pStyle w:val="NormalWeb"/>
-        <w:divId w:val="319427985"/>
+        <w:divId w:val="1591885174"/>
         <w:rPr>
           <w:rFonts w:ascii="Plus Jakarta Sans" w:hAnsi="Plus Jakarta Sans"/>
           <w:lang w:val="es-ES"/>
@@ -7443,7 +7443,7 @@
       </w:tblGrid>
       <w:tr>
         <w:trPr>
-          <w:divId w:val="279148780"/>
+          <w:divId w:val="1375732000"/>
           <w:tblHeader/>
         </w:trPr>
         <w:tc>
@@ -7608,7 +7608,7 @@
       </w:tr>
       <w:tr>
         <w:trPr>
-          <w:divId w:val="279148780"/>
+          <w:divId w:val="1375732000"/>
         </w:trPr>
         <w:tc>
           <w:tcPr>
@@ -7734,7 +7734,7 @@
       </w:tr>
       <w:tr>
         <w:trPr>
-          <w:divId w:val="279148780"/>
+          <w:divId w:val="1375732000"/>
         </w:trPr>
         <w:tc>
           <w:tcPr>
@@ -7860,7 +7860,7 @@
       </w:tr>
       <w:tr>
         <w:trPr>
-          <w:divId w:val="279148780"/>
+          <w:divId w:val="1375732000"/>
         </w:trPr>
         <w:tc>
           <w:tcPr>
@@ -7986,7 +7986,7 @@
       </w:tr>
       <w:tr>
         <w:trPr>
-          <w:divId w:val="279148780"/>
+          <w:divId w:val="1375732000"/>
         </w:trPr>
         <w:tc>
           <w:tcPr>
@@ -8114,7 +8114,7 @@
     <w:p>
       <w:pPr>
         <w:pStyle w:val="Ttulo3"/>
-        <w:divId w:val="319427985"/>
+        <w:divId w:val="1591885174"/>
         <w:rPr>
           <w:rFonts w:eastAsia="Times New Roman"/>
           <w:lang w:val="es-ES"/>
@@ -8132,7 +8132,7 @@
       <w:pPr>
         <w:spacing w:before="375" w:after="225"/>
         <w:jc w:val="center"/>
-        <w:divId w:val="278146551"/>
+        <w:divId w:val="743530076"/>
         <w:rPr>
           <w:rFonts w:ascii="Outfit" w:eastAsia="Times New Roman" w:hAnsi="Outfit"/>
           <w:b/>
@@ -8162,7 +8162,7 @@
       <w:pPr>
         <w:spacing w:after="375"/>
         <w:jc w:val="center"/>
-        <w:divId w:val="2018649373"/>
+        <w:divId w:val="224294173"/>
         <w:rPr>
           <w:rFonts w:ascii="Plus Jakarta Sans" w:eastAsia="Times New Roman" w:hAnsi="Plus Jakarta Sans"/>
           <w:lang w:val="es-ES"/>
@@ -8550,7 +8550,7 @@
     <w:p>
       <w:pPr>
         <w:pStyle w:val="Ttulo3"/>
-        <w:divId w:val="319427985"/>
+        <w:divId w:val="1591885174"/>
         <w:rPr>
           <w:rFonts w:eastAsia="Times New Roman"/>
           <w:lang w:val="es-ES"/>
@@ -8574,7 +8574,7 @@
     <w:p>
       <w:pPr>
         <w:pStyle w:val="NormalWeb"/>
-        <w:divId w:val="319427985"/>
+        <w:divId w:val="1591885174"/>
         <w:rPr>
           <w:rFonts w:ascii="Plus Jakarta Sans" w:hAnsi="Plus Jakarta Sans"/>
           <w:lang w:val="es-ES"/>
@@ -8596,7 +8596,7 @@
         </w:numPr>
         <w:spacing w:before="100" w:beforeAutospacing="1" w:after="90"/>
         <w:ind w:left="1020"/>
-        <w:divId w:val="319427985"/>
+        <w:divId w:val="1591885174"/>
         <w:rPr>
           <w:rFonts w:ascii="Plus Jakarta Sans" w:eastAsia="Times New Roman" w:hAnsi="Plus Jakarta Sans"/>
           <w:sz w:val="21"/>
@@ -8632,7 +8632,7 @@
         </w:numPr>
         <w:spacing w:before="100" w:beforeAutospacing="1" w:after="90"/>
         <w:ind w:left="1020"/>
-        <w:divId w:val="319427985"/>
+        <w:divId w:val="1591885174"/>
         <w:rPr>
           <w:rFonts w:ascii="Plus Jakarta Sans" w:eastAsia="Times New Roman" w:hAnsi="Plus Jakarta Sans"/>
           <w:sz w:val="21"/>
@@ -8677,7 +8677,7 @@
         </w:numPr>
         <w:spacing w:before="100" w:beforeAutospacing="1" w:after="90"/>
         <w:ind w:left="1020"/>
-        <w:divId w:val="319427985"/>
+        <w:divId w:val="1591885174"/>
         <w:rPr>
           <w:rFonts w:ascii="Plus Jakarta Sans" w:eastAsia="Times New Roman" w:hAnsi="Plus Jakarta Sans"/>
           <w:sz w:val="21"/>
@@ -8722,7 +8722,7 @@
         </w:numPr>
         <w:spacing w:before="100" w:beforeAutospacing="1" w:after="90"/>
         <w:ind w:left="1020"/>
-        <w:divId w:val="319427985"/>
+        <w:divId w:val="1591885174"/>
         <w:rPr>
           <w:rFonts w:ascii="Plus Jakarta Sans" w:eastAsia="Times New Roman" w:hAnsi="Plus Jakarta Sans"/>
           <w:sz w:val="21"/>
@@ -8776,7 +8776,7 @@
         </w:numPr>
         <w:spacing w:before="100" w:beforeAutospacing="1" w:after="90"/>
         <w:ind w:left="1020"/>
-        <w:divId w:val="319427985"/>
+        <w:divId w:val="1591885174"/>
         <w:rPr>
           <w:rFonts w:ascii="Plus Jakarta Sans" w:eastAsia="Times New Roman" w:hAnsi="Plus Jakarta Sans"/>
           <w:sz w:val="21"/>
@@ -8812,7 +8812,7 @@
         </w:numPr>
         <w:spacing w:before="100" w:beforeAutospacing="1" w:after="90"/>
         <w:ind w:left="1020"/>
-        <w:divId w:val="319427985"/>
+        <w:divId w:val="1591885174"/>
         <w:rPr>
           <w:rFonts w:ascii="Plus Jakarta Sans" w:eastAsia="Times New Roman" w:hAnsi="Plus Jakarta Sans"/>
           <w:sz w:val="21"/>
@@ -8857,7 +8857,7 @@
         </w:numPr>
         <w:spacing w:before="100" w:beforeAutospacing="1" w:after="90"/>
         <w:ind w:left="1020"/>
-        <w:divId w:val="319427985"/>
+        <w:divId w:val="1591885174"/>
         <w:rPr>
           <w:rFonts w:ascii="Plus Jakarta Sans" w:eastAsia="Times New Roman" w:hAnsi="Plus Jakarta Sans"/>
           <w:sz w:val="21"/>
@@ -8902,7 +8902,7 @@
         </w:numPr>
         <w:spacing w:before="100" w:beforeAutospacing="1" w:after="90"/>
         <w:ind w:left="1020"/>
-        <w:divId w:val="319427985"/>
+        <w:divId w:val="1591885174"/>
         <w:rPr>
           <w:rFonts w:ascii="Plus Jakarta Sans" w:eastAsia="Times New Roman" w:hAnsi="Plus Jakarta Sans"/>
           <w:sz w:val="21"/>
@@ -8947,7 +8947,7 @@
         </w:numPr>
         <w:spacing w:before="100" w:beforeAutospacing="1" w:after="90"/>
         <w:ind w:left="1020"/>
-        <w:divId w:val="319427985"/>
+        <w:divId w:val="1591885174"/>
         <w:rPr>
           <w:rFonts w:ascii="Plus Jakarta Sans" w:eastAsia="Times New Roman" w:hAnsi="Plus Jakarta Sans"/>
           <w:sz w:val="21"/>
@@ -8983,7 +8983,7 @@
         </w:numPr>
         <w:spacing w:before="100" w:beforeAutospacing="1" w:after="90"/>
         <w:ind w:left="1020"/>
-        <w:divId w:val="319427985"/>
+        <w:divId w:val="1591885174"/>
         <w:rPr>
           <w:rFonts w:ascii="Plus Jakarta Sans" w:eastAsia="Times New Roman" w:hAnsi="Plus Jakarta Sans"/>
           <w:sz w:val="21"/>
@@ -9028,7 +9028,7 @@
         </w:numPr>
         <w:spacing w:before="100" w:beforeAutospacing="1" w:after="90"/>
         <w:ind w:left="1020"/>
-        <w:divId w:val="319427985"/>
+        <w:divId w:val="1591885174"/>
         <w:rPr>
           <w:rFonts w:ascii="Plus Jakarta Sans" w:eastAsia="Times New Roman" w:hAnsi="Plus Jakarta Sans"/>
           <w:sz w:val="21"/>
@@ -9082,7 +9082,7 @@
         </w:numPr>
         <w:spacing w:before="100" w:beforeAutospacing="1" w:after="90"/>
         <w:ind w:left="1020"/>
-        <w:divId w:val="319427985"/>
+        <w:divId w:val="1591885174"/>
         <w:rPr>
           <w:rFonts w:ascii="Plus Jakarta Sans" w:eastAsia="Times New Roman" w:hAnsi="Plus Jakarta Sans"/>
           <w:sz w:val="21"/>
@@ -9122,7 +9122,7 @@
     <w:p>
       <w:pPr>
         <w:pStyle w:val="Ttulo3"/>
-        <w:divId w:val="319427985"/>
+        <w:divId w:val="1591885174"/>
         <w:rPr>
           <w:rFonts w:eastAsia="Times New Roman"/>
           <w:lang w:val="es-ES"/>
@@ -9140,7 +9140,7 @@
       <w:pPr>
         <w:spacing w:before="375" w:after="225"/>
         <w:jc w:val="center"/>
-        <w:divId w:val="223764163"/>
+        <w:divId w:val="1580408032"/>
         <w:rPr>
           <w:rFonts w:ascii="Outfit" w:eastAsia="Times New Roman" w:hAnsi="Outfit"/>
           <w:b/>
@@ -9170,7 +9170,7 @@
       <w:pPr>
         <w:spacing w:after="375"/>
         <w:jc w:val="center"/>
-        <w:divId w:val="269316675"/>
+        <w:divId w:val="1281185145"/>
         <w:rPr>
           <w:rFonts w:ascii="Plus Jakarta Sans" w:eastAsia="Times New Roman" w:hAnsi="Plus Jakarta Sans"/>
           <w:lang w:val="es-ES"/>
@@ -9453,7 +9453,7 @@
     <w:p>
       <w:pPr>
         <w:spacing w:before="450" w:after="450"/>
-        <w:divId w:val="319427985"/>
+        <w:divId w:val="1591885174"/>
         <w:rPr>
           <w:rFonts w:ascii="Plus Jakarta Sans" w:eastAsia="Times New Roman" w:hAnsi="Plus Jakarta Sans"/>
           <w:lang w:val="es-ES"/>
@@ -9472,7 +9472,7 @@
     <w:p>
       <w:pPr>
         <w:pStyle w:val="Ttulo2"/>
-        <w:divId w:val="319427985"/>
+        <w:divId w:val="1591885174"/>
         <w:rPr>
           <w:rFonts w:eastAsia="Times New Roman"/>
           <w:lang w:val="es-ES"/>
@@ -9489,7 +9489,7 @@
     <w:p>
       <w:pPr>
         <w:pStyle w:val="NormalWeb"/>
-        <w:divId w:val="319427985"/>
+        <w:divId w:val="1591885174"/>
         <w:rPr>
           <w:rFonts w:ascii="Plus Jakarta Sans" w:hAnsi="Plus Jakarta Sans"/>
           <w:lang w:val="es-ES"/>
@@ -9513,7 +9513,7 @@
     <w:p>
       <w:pPr>
         <w:pStyle w:val="NormalWeb"/>
-        <w:divId w:val="319427985"/>
+        <w:divId w:val="1591885174"/>
         <w:rPr>
           <w:rFonts w:ascii="Plus Jakarta Sans" w:hAnsi="Plus Jakarta Sans"/>
           <w:lang w:val="es-ES"/>
@@ -9575,7 +9575,7 @@
     <w:p>
       <w:pPr>
         <w:pStyle w:val="NormalWeb"/>
-        <w:divId w:val="319427985"/>
+        <w:divId w:val="1591885174"/>
         <w:rPr>
           <w:rFonts w:ascii="Plus Jakarta Sans" w:hAnsi="Plus Jakarta Sans"/>
           <w:lang w:val="es-ES"/>
@@ -9636,7 +9636,7 @@
     <w:p>
       <w:pPr>
         <w:pStyle w:val="NormalWeb"/>
-        <w:divId w:val="319427985"/>
+        <w:divId w:val="1591885174"/>
         <w:rPr>
           <w:rFonts w:ascii="Plus Jakarta Sans" w:hAnsi="Plus Jakarta Sans"/>
           <w:lang w:val="es-ES"/>
@@ -9690,7 +9690,7 @@
     <w:p>
       <w:pPr>
         <w:pStyle w:val="NormalWeb"/>
-        <w:divId w:val="319427985"/>
+        <w:divId w:val="1591885174"/>
         <w:rPr>
           <w:rFonts w:ascii="Plus Jakarta Sans" w:hAnsi="Plus Jakarta Sans"/>
           <w:lang w:val="es-ES"/>
@@ -9751,7 +9751,7 @@
     <w:p>
       <w:pPr>
         <w:spacing w:before="450" w:after="450"/>
-        <w:divId w:val="319427985"/>
+        <w:divId w:val="1591885174"/>
         <w:rPr>
           <w:rFonts w:ascii="Plus Jakarta Sans" w:eastAsia="Times New Roman" w:hAnsi="Plus Jakarta Sans"/>
           <w:lang w:val="es-ES"/>
@@ -9770,7 +9770,7 @@
     <w:p>
       <w:pPr>
         <w:pStyle w:val="Ttulo2"/>
-        <w:divId w:val="319427985"/>
+        <w:divId w:val="1591885174"/>
         <w:rPr>
           <w:rFonts w:eastAsia="Times New Roman"/>
           <w:lang w:val="es-ES"/>
@@ -9787,7 +9787,7 @@
     <w:p>
       <w:pPr>
         <w:pStyle w:val="NormalWeb"/>
-        <w:divId w:val="319427985"/>
+        <w:divId w:val="1591885174"/>
         <w:rPr>
           <w:rFonts w:ascii="Plus Jakarta Sans" w:hAnsi="Plus Jakarta Sans"/>
           <w:lang w:val="es-ES"/>
@@ -9826,7 +9826,7 @@
     <w:p>
       <w:pPr>
         <w:pStyle w:val="Ttulo3"/>
-        <w:divId w:val="319427985"/>
+        <w:divId w:val="1591885174"/>
         <w:rPr>
           <w:rFonts w:eastAsia="Times New Roman"/>
           <w:lang w:val="es-ES"/>
@@ -9860,7 +9860,7 @@
       </w:tblGrid>
       <w:tr>
         <w:trPr>
-          <w:divId w:val="1378235425"/>
+          <w:divId w:val="261112923"/>
           <w:tblHeader/>
         </w:trPr>
         <w:tc>
@@ -10051,7 +10051,7 @@
       </w:tr>
       <w:tr>
         <w:trPr>
-          <w:divId w:val="1378235425"/>
+          <w:divId w:val="261112923"/>
         </w:trPr>
         <w:tc>
           <w:tcPr>
@@ -10207,7 +10207,7 @@
       </w:tr>
       <w:tr>
         <w:trPr>
-          <w:divId w:val="1378235425"/>
+          <w:divId w:val="261112923"/>
         </w:trPr>
         <w:tc>
           <w:tcPr>
@@ -10363,7 +10363,7 @@
       </w:tr>
       <w:tr>
         <w:trPr>
-          <w:divId w:val="1378235425"/>
+          <w:divId w:val="261112923"/>
         </w:trPr>
         <w:tc>
           <w:tcPr>
@@ -10519,7 +10519,7 @@
       </w:tr>
       <w:tr>
         <w:trPr>
-          <w:divId w:val="1378235425"/>
+          <w:divId w:val="261112923"/>
         </w:trPr>
         <w:tc>
           <w:tcPr>
@@ -10681,7 +10681,7 @@
     <w:p>
       <w:pPr>
         <w:pStyle w:val="Ttulo3"/>
-        <w:divId w:val="319427985"/>
+        <w:divId w:val="1591885174"/>
         <w:rPr>
           <w:rFonts w:eastAsia="Times New Roman"/>
           <w:lang w:val="es-ES"/>
@@ -10715,7 +10715,7 @@
       </w:tblGrid>
       <w:tr>
         <w:trPr>
-          <w:divId w:val="2020036228"/>
+          <w:divId w:val="403990771"/>
           <w:tblHeader/>
         </w:trPr>
         <w:tc>
@@ -10906,7 +10906,7 @@
       </w:tr>
       <w:tr>
         <w:trPr>
-          <w:divId w:val="2020036228"/>
+          <w:divId w:val="403990771"/>
         </w:trPr>
         <w:tc>
           <w:tcPr>
@@ -10965,7 +10965,7 @@
                 <w:sz w:val="20"/>
                 <w:szCs w:val="20"/>
               </w:rPr>
-              <w:t>3,130</w:t>
+              <w:t>3,129</w:t>
             </w:r>
           </w:p>
         </w:tc>
@@ -11056,14 +11056,14 @@
                 <w:sz w:val="20"/>
                 <w:szCs w:val="20"/>
               </w:rPr>
-              <w:t>6,043</w:t>
+              <w:t>6,042</w:t>
             </w:r>
           </w:p>
         </w:tc>
       </w:tr>
       <w:tr>
         <w:trPr>
-          <w:divId w:val="2020036228"/>
+          <w:divId w:val="403990771"/>
         </w:trPr>
         <w:tc>
           <w:tcPr>
@@ -11222,7 +11222,7 @@
     <w:p>
       <w:pPr>
         <w:pStyle w:val="Ttulo3"/>
-        <w:divId w:val="319427985"/>
+        <w:divId w:val="1591885174"/>
         <w:rPr>
           <w:rFonts w:eastAsia="Times New Roman"/>
           <w:lang w:val="es-ES"/>
@@ -11257,7 +11257,7 @@
       </w:tblGrid>
       <w:tr>
         <w:trPr>
-          <w:divId w:val="1490290923"/>
+          <w:divId w:val="279919591"/>
           <w:tblHeader/>
         </w:trPr>
         <w:tc>
@@ -11485,7 +11485,7 @@
       </w:tr>
       <w:tr>
         <w:trPr>
-          <w:divId w:val="1490290923"/>
+          <w:divId w:val="279919591"/>
         </w:trPr>
         <w:tc>
           <w:tcPr>
@@ -11681,7 +11681,7 @@
       </w:tr>
       <w:tr>
         <w:trPr>
-          <w:divId w:val="1490290923"/>
+          <w:divId w:val="279919591"/>
         </w:trPr>
         <w:tc>
           <w:tcPr>
@@ -11866,7 +11866,7 @@
       </w:tr>
       <w:tr>
         <w:trPr>
-          <w:divId w:val="1490290923"/>
+          <w:divId w:val="279919591"/>
         </w:trPr>
         <w:tc>
           <w:tcPr>
@@ -12064,7 +12064,7 @@
     <w:p>
       <w:pPr>
         <w:pStyle w:val="Ttulo4"/>
-        <w:divId w:val="319427985"/>
+        <w:divId w:val="1591885174"/>
         <w:rPr>
           <w:rFonts w:eastAsia="Times New Roman"/>
           <w:lang w:val="es-ES"/>
@@ -12082,7 +12082,7 @@
       <w:pPr>
         <w:spacing w:before="375" w:after="225"/>
         <w:jc w:val="center"/>
-        <w:divId w:val="821847600"/>
+        <w:divId w:val="367071087"/>
         <w:rPr>
           <w:rFonts w:ascii="Outfit" w:eastAsia="Times New Roman" w:hAnsi="Outfit"/>
           <w:b/>
@@ -12112,7 +12112,7 @@
       <w:pPr>
         <w:spacing w:after="375"/>
         <w:jc w:val="center"/>
-        <w:divId w:val="1876036712"/>
+        <w:divId w:val="540287391"/>
         <w:rPr>
           <w:rFonts w:ascii="Plus Jakarta Sans" w:eastAsia="Times New Roman" w:hAnsi="Plus Jakarta Sans"/>
           <w:lang w:val="es-ES"/>
@@ -12500,7 +12500,7 @@
     <w:p>
       <w:pPr>
         <w:pStyle w:val="Ttulo3"/>
-        <w:divId w:val="319427985"/>
+        <w:divId w:val="1591885174"/>
         <w:rPr>
           <w:rFonts w:eastAsia="Times New Roman"/>
           <w:lang w:val="es-ES"/>
@@ -12539,7 +12539,7 @@
       </w:tblGrid>
       <w:tr>
         <w:trPr>
-          <w:divId w:val="344794989"/>
+          <w:divId w:val="693573355"/>
           <w:tblHeader/>
         </w:trPr>
         <w:tc>
@@ -12656,7 +12656,7 @@
       </w:tr>
       <w:tr>
         <w:trPr>
-          <w:divId w:val="344794989"/>
+          <w:divId w:val="693573355"/>
         </w:trPr>
         <w:tc>
           <w:tcPr>
@@ -12752,7 +12752,7 @@
       </w:tr>
       <w:tr>
         <w:trPr>
-          <w:divId w:val="344794989"/>
+          <w:divId w:val="693573355"/>
         </w:trPr>
         <w:tc>
           <w:tcPr>
@@ -12848,7 +12848,7 @@
       </w:tr>
       <w:tr>
         <w:trPr>
-          <w:divId w:val="344794989"/>
+          <w:divId w:val="693573355"/>
         </w:trPr>
         <w:tc>
           <w:tcPr>
@@ -12946,7 +12946,7 @@
     <w:p>
       <w:pPr>
         <w:pStyle w:val="NormalWeb"/>
-        <w:divId w:val="319427985"/>
+        <w:divId w:val="1591885174"/>
         <w:rPr>
           <w:rFonts w:ascii="Plus Jakarta Sans" w:hAnsi="Plus Jakarta Sans"/>
           <w:lang w:val="es-ES"/>
@@ -12971,7 +12971,7 @@
     <w:p>
       <w:pPr>
         <w:pStyle w:val="Ttulo3"/>
-        <w:divId w:val="319427985"/>
+        <w:divId w:val="1591885174"/>
         <w:rPr>
           <w:rFonts w:eastAsia="Times New Roman"/>
           <w:lang w:val="es-ES"/>
@@ -13006,7 +13006,7 @@
       </w:tblGrid>
       <w:tr>
         <w:trPr>
-          <w:divId w:val="414009656"/>
+          <w:divId w:val="1700741069"/>
           <w:tblHeader/>
         </w:trPr>
         <w:tc>
@@ -13234,7 +13234,7 @@
       </w:tr>
       <w:tr>
         <w:trPr>
-          <w:divId w:val="414009656"/>
+          <w:divId w:val="1700741069"/>
         </w:trPr>
         <w:tc>
           <w:tcPr>
@@ -13420,7 +13420,7 @@
       </w:tr>
       <w:tr>
         <w:trPr>
-          <w:divId w:val="414009656"/>
+          <w:divId w:val="1700741069"/>
         </w:trPr>
         <w:tc>
           <w:tcPr>
@@ -13606,7 +13606,7 @@
       </w:tr>
       <w:tr>
         <w:trPr>
-          <w:divId w:val="414009656"/>
+          <w:divId w:val="1700741069"/>
         </w:trPr>
         <w:tc>
           <w:tcPr>
@@ -13792,7 +13792,7 @@
       </w:tr>
       <w:tr>
         <w:trPr>
-          <w:divId w:val="414009656"/>
+          <w:divId w:val="1700741069"/>
         </w:trPr>
         <w:tc>
           <w:tcPr>
@@ -13985,7 +13985,7 @@
     <w:p>
       <w:pPr>
         <w:pStyle w:val="NormalWeb"/>
-        <w:divId w:val="319427985"/>
+        <w:divId w:val="1591885174"/>
         <w:rPr>
           <w:rFonts w:ascii="Plus Jakarta Sans" w:hAnsi="Plus Jakarta Sans"/>
           <w:lang w:val="es-ES"/>
@@ -14032,7 +14032,7 @@
     <w:p>
       <w:pPr>
         <w:pStyle w:val="Ttulo3"/>
-        <w:divId w:val="319427985"/>
+        <w:divId w:val="1591885174"/>
         <w:rPr>
           <w:rFonts w:eastAsia="Times New Roman"/>
           <w:lang w:val="es-ES"/>
@@ -14067,7 +14067,7 @@
       </w:tblGrid>
       <w:tr>
         <w:trPr>
-          <w:divId w:val="1653828853"/>
+          <w:divId w:val="1799251390"/>
           <w:tblHeader/>
         </w:trPr>
         <w:tc>
@@ -14295,7 +14295,7 @@
       </w:tr>
       <w:tr>
         <w:trPr>
-          <w:divId w:val="1653828853"/>
+          <w:divId w:val="1799251390"/>
         </w:trPr>
         <w:tc>
           <w:tcPr>
@@ -14489,7 +14489,7 @@
       </w:tr>
       <w:tr>
         <w:trPr>
-          <w:divId w:val="1653828853"/>
+          <w:divId w:val="1799251390"/>
         </w:trPr>
         <w:tc>
           <w:tcPr>
@@ -14685,7 +14685,7 @@
     <w:p>
       <w:pPr>
         <w:pStyle w:val="Ttulo4"/>
-        <w:divId w:val="319427985"/>
+        <w:divId w:val="1591885174"/>
         <w:rPr>
           <w:rFonts w:eastAsia="Times New Roman"/>
           <w:lang w:val="es-ES"/>
@@ -14703,7 +14703,7 @@
       <w:pPr>
         <w:spacing w:before="375" w:after="225"/>
         <w:jc w:val="center"/>
-        <w:divId w:val="679431256"/>
+        <w:divId w:val="1595895565"/>
         <w:rPr>
           <w:rFonts w:ascii="Outfit" w:eastAsia="Times New Roman" w:hAnsi="Outfit"/>
           <w:b/>
@@ -14733,7 +14733,7 @@
       <w:pPr>
         <w:spacing w:after="375"/>
         <w:jc w:val="center"/>
-        <w:divId w:val="1798596730"/>
+        <w:divId w:val="2079353182"/>
         <w:rPr>
           <w:rFonts w:ascii="Plus Jakarta Sans" w:eastAsia="Times New Roman" w:hAnsi="Plus Jakarta Sans"/>
           <w:lang w:val="es-ES"/>
@@ -15121,7 +15121,7 @@
     <w:p>
       <w:pPr>
         <w:pStyle w:val="Ttulo3"/>
-        <w:divId w:val="319427985"/>
+        <w:divId w:val="1591885174"/>
         <w:rPr>
           <w:rFonts w:eastAsia="Times New Roman"/>
           <w:lang w:val="es-ES"/>
@@ -15155,7 +15155,7 @@
       </w:tblGrid>
       <w:tr>
         <w:trPr>
-          <w:divId w:val="669874185"/>
+          <w:divId w:val="2085567290"/>
           <w:tblHeader/>
         </w:trPr>
         <w:tc>
@@ -15346,7 +15346,7 @@
       </w:tr>
       <w:tr>
         <w:trPr>
-          <w:divId w:val="669874185"/>
+          <w:divId w:val="2085567290"/>
         </w:trPr>
         <w:tc>
           <w:tcPr>
@@ -15502,7 +15502,7 @@
       </w:tr>
       <w:tr>
         <w:trPr>
-          <w:divId w:val="669874185"/>
+          <w:divId w:val="2085567290"/>
         </w:trPr>
         <w:tc>
           <w:tcPr>
@@ -15658,7 +15658,7 @@
       </w:tr>
       <w:tr>
         <w:trPr>
-          <w:divId w:val="669874185"/>
+          <w:divId w:val="2085567290"/>
         </w:trPr>
         <w:tc>
           <w:tcPr>
@@ -15717,7 +15717,7 @@
                 <w:sz w:val="20"/>
                 <w:szCs w:val="20"/>
               </w:rPr>
-              <w:t>154</w:t>
+              <w:t>153</w:t>
             </w:r>
           </w:p>
         </w:tc>
@@ -15807,14 +15807,14 @@
                 <w:sz w:val="20"/>
                 <w:szCs w:val="20"/>
               </w:rPr>
-              <w:t>362</w:t>
+              <w:t>361</w:t>
             </w:r>
           </w:p>
         </w:tc>
       </w:tr>
       <w:tr>
         <w:trPr>
-          <w:divId w:val="669874185"/>
+          <w:divId w:val="2085567290"/>
         </w:trPr>
         <w:tc>
           <w:tcPr>
@@ -15970,7 +15970,7 @@
       </w:tr>
       <w:tr>
         <w:trPr>
-          <w:divId w:val="669874185"/>
+          <w:divId w:val="2085567290"/>
         </w:trPr>
         <w:tc>
           <w:tcPr>
@@ -16126,7 +16126,7 @@
       </w:tr>
       <w:tr>
         <w:trPr>
-          <w:divId w:val="669874185"/>
+          <w:divId w:val="2085567290"/>
         </w:trPr>
         <w:tc>
           <w:tcPr>
@@ -16284,7 +16284,7 @@
     <w:p>
       <w:pPr>
         <w:pStyle w:val="Ttulo3"/>
-        <w:divId w:val="319427985"/>
+        <w:divId w:val="1591885174"/>
         <w:rPr>
           <w:rFonts w:eastAsia="Times New Roman"/>
           <w:lang w:val="es-ES"/>
@@ -16318,7 +16318,7 @@
       </w:tblGrid>
       <w:tr>
         <w:trPr>
-          <w:divId w:val="590435869"/>
+          <w:divId w:val="196159083"/>
           <w:tblHeader/>
         </w:trPr>
         <w:tc>
@@ -16509,7 +16509,7 @@
       </w:tr>
       <w:tr>
         <w:trPr>
-          <w:divId w:val="590435869"/>
+          <w:divId w:val="196159083"/>
         </w:trPr>
         <w:tc>
           <w:tcPr>
@@ -16665,7 +16665,7 @@
       </w:tr>
       <w:tr>
         <w:trPr>
-          <w:divId w:val="590435869"/>
+          <w:divId w:val="196159083"/>
         </w:trPr>
         <w:tc>
           <w:tcPr>
@@ -16821,7 +16821,7 @@
       </w:tr>
       <w:tr>
         <w:trPr>
-          <w:divId w:val="590435869"/>
+          <w:divId w:val="196159083"/>
         </w:trPr>
         <w:tc>
           <w:tcPr>
@@ -16977,7 +16977,7 @@
       </w:tr>
       <w:tr>
         <w:trPr>
-          <w:divId w:val="590435869"/>
+          <w:divId w:val="196159083"/>
         </w:trPr>
         <w:tc>
           <w:tcPr>
@@ -17133,7 +17133,7 @@
       </w:tr>
       <w:tr>
         <w:trPr>
-          <w:divId w:val="590435869"/>
+          <w:divId w:val="196159083"/>
         </w:trPr>
         <w:tc>
           <w:tcPr>
@@ -17291,7 +17291,7 @@
     <w:p>
       <w:pPr>
         <w:pStyle w:val="Ttulo3"/>
-        <w:divId w:val="319427985"/>
+        <w:divId w:val="1591885174"/>
         <w:rPr>
           <w:rFonts w:eastAsia="Times New Roman"/>
           <w:lang w:val="es-ES"/>
@@ -17325,7 +17325,7 @@
       </w:tblGrid>
       <w:tr>
         <w:trPr>
-          <w:divId w:val="826440630"/>
+          <w:divId w:val="373040277"/>
           <w:tblHeader/>
         </w:trPr>
         <w:tc>
@@ -17516,7 +17516,7 @@
       </w:tr>
       <w:tr>
         <w:trPr>
-          <w:divId w:val="826440630"/>
+          <w:divId w:val="373040277"/>
         </w:trPr>
         <w:tc>
           <w:tcPr>
@@ -17575,7 +17575,7 @@
                 <w:sz w:val="20"/>
                 <w:szCs w:val="20"/>
               </w:rPr>
-              <w:t>2,507</w:t>
+              <w:t>2,508</w:t>
             </w:r>
           </w:p>
         </w:tc>
@@ -17665,14 +17665,14 @@
                 <w:sz w:val="20"/>
                 <w:szCs w:val="20"/>
               </w:rPr>
-              <w:t>4,961</w:t>
+              <w:t>4,962</w:t>
             </w:r>
           </w:p>
         </w:tc>
       </w:tr>
       <w:tr>
         <w:trPr>
-          <w:divId w:val="826440630"/>
+          <w:divId w:val="373040277"/>
         </w:trPr>
         <w:tc>
           <w:tcPr>
@@ -17731,7 +17731,7 @@
                 <w:sz w:val="20"/>
                 <w:szCs w:val="20"/>
               </w:rPr>
-              <w:t>892</w:t>
+              <w:t>891</w:t>
             </w:r>
           </w:p>
         </w:tc>
@@ -17821,7 +17821,7 @@
                 <w:sz w:val="20"/>
                 <w:szCs w:val="20"/>
               </w:rPr>
-              <w:t>1,869</w:t>
+              <w:t>1,868</w:t>
             </w:r>
           </w:p>
         </w:tc>
@@ -17830,7 +17830,7 @@
     <w:p>
       <w:pPr>
         <w:pStyle w:val="Ttulo4"/>
-        <w:divId w:val="319427985"/>
+        <w:divId w:val="1591885174"/>
         <w:rPr>
           <w:rFonts w:eastAsia="Times New Roman"/>
           <w:lang w:val="es-ES"/>
@@ -17848,7 +17848,7 @@
       <w:pPr>
         <w:spacing w:before="375" w:after="225"/>
         <w:jc w:val="center"/>
-        <w:divId w:val="637684256"/>
+        <w:divId w:val="28771415"/>
         <w:rPr>
           <w:rFonts w:ascii="Outfit" w:eastAsia="Times New Roman" w:hAnsi="Outfit"/>
           <w:b/>
@@ -17878,7 +17878,7 @@
       <w:pPr>
         <w:spacing w:after="375"/>
         <w:jc w:val="center"/>
-        <w:divId w:val="1159999562"/>
+        <w:divId w:val="288170005"/>
         <w:rPr>
           <w:rFonts w:ascii="Plus Jakarta Sans" w:eastAsia="Times New Roman" w:hAnsi="Plus Jakarta Sans"/>
           <w:lang w:val="es-ES"/>
@@ -18266,7 +18266,7 @@
     <w:p>
       <w:pPr>
         <w:spacing w:before="450" w:after="450"/>
-        <w:divId w:val="319427985"/>
+        <w:divId w:val="1591885174"/>
         <w:rPr>
           <w:rFonts w:ascii="Plus Jakarta Sans" w:eastAsia="Times New Roman" w:hAnsi="Plus Jakarta Sans"/>
           <w:lang w:val="es-ES"/>
@@ -18285,7 +18285,7 @@
     <w:p>
       <w:pPr>
         <w:spacing w:before="450" w:after="450"/>
-        <w:divId w:val="319427985"/>
+        <w:divId w:val="1591885174"/>
         <w:rPr>
           <w:rFonts w:ascii="Plus Jakarta Sans" w:eastAsia="Times New Roman" w:hAnsi="Plus Jakarta Sans"/>
           <w:lang w:val="es-ES"/>
@@ -18304,7 +18304,7 @@
     <w:p>
       <w:pPr>
         <w:pStyle w:val="NormalWeb"/>
-        <w:divId w:val="319427985"/>
+        <w:divId w:val="1591885174"/>
         <w:rPr>
           <w:rFonts w:ascii="Plus Jakarta Sans" w:hAnsi="Plus Jakarta Sans"/>
           <w:lang w:val="es-ES"/>
@@ -18353,9 +18353,9 @@
 <file path=word/numbering.xml><?xml version="1.0" encoding="utf-8"?>
 <w:numbering xmlns:wpc="http://schemas.microsoft.com/office/word/2010/wordprocessingCanvas" xmlns:cx="http://schemas.microsoft.com/office/drawing/2014/chartex" xmlns:cx1="http://schemas.microsoft.com/office/drawing/2015/9/8/chartex" xmlns:cx2="http://schemas.microsoft.com/office/drawing/2015/10/21/chartex" xmlns:cx3="http://schemas.microsoft.com/office/drawing/2016/5/9/chartex" xmlns:cx4="http://schemas.microsoft.com/office/drawing/2016/5/10/chartex" xmlns:cx5="http://schemas.microsoft.com/office/drawing/2016/5/11/chartex" xmlns:cx6="http://schemas.microsoft.com/office/drawing/2016/5/12/chartex" xmlns:cx7="http://schemas.microsoft.com/office/drawing/2016/5/13/chartex" xmlns:cx8="http://schemas.microsoft.com/office/drawing/2016/5/14/chartex" xmlns:mc="http://schemas.openxmlformats.org/markup-compatibility/2006" xmlns:aink="http://schemas.microsoft.com/office/drawing/2016/ink" xmlns:am3d="http://schemas.microsoft.com/office/drawing/2017/model3d" xmlns:o="urn:schemas-microsoft-com:office:office" xmlns:r="http://schemas.openxmlformats.org/officeDocument/2006/relationships" xmlns:m="http://schemas.openxmlformats.org/officeDocument/2006/math" xmlns:v="urn:schemas-microsoft-com:vml" xmlns:wp14="http://schemas.microsoft.com/office/word/2010/wordprocessingDrawing" xmlns:wp="http://schemas.openxmlformats.org/drawingml/2006/wordprocessingDrawing" xmlns:w10="urn:schemas-microsoft-com:office:word" xmlns:w="http://schemas.openxmlformats.org/wordprocessingml/2006/main" xmlns:w14="http://schemas.microsoft.com/office/word/2010/wordml" xmlns:w15="http://schemas.microsoft.com/office/word/2012/wordml" xmlns:w16cex="http://schemas.microsoft.com/office/word/2018/wordml/cex" xmlns:w16cid="http://schemas.microsoft.com/office/word/2016/wordml/cid" xmlns:w16="http://schemas.microsoft.com/office/word/2018/wordml" xmlns:w16sdtdh="http://schemas.microsoft.com/office/word/2020/wordml/sdtdatahash" xmlns:w16se="http://schemas.microsoft.com/office/word/2015/wordml/symex" xmlns:wpg="http://schemas.microsoft.com/office/word/2010/wordprocessingGroup" xmlns:wpi="http://schemas.microsoft.com/office/word/2010/wordprocessingInk" xmlns:wne="http://schemas.microsoft.com/office/word/2006/wordml" xmlns:wps="http://schemas.microsoft.com/office/word/2010/wordprocessingShape" mc:Ignorable="w14 w15 w16se w16cid w16 w16cex w16sdtdh wp14">
   <w:abstractNum w:abstractNumId="0" w15:restartNumberingAfterBreak="0">
-    <w:nsid w:val="16420B6C"/>
+    <w:nsid w:val="150F1BF2"/>
     <w:multiLevelType w:val="multilevel"/>
-    <w:tmpl w:val="C16A96C0"/>
+    <w:tmpl w:val="B85064BA"/>
     <w:lvl w:ilvl="0">
       <w:start w:val="1"/>
       <w:numFmt w:val="bullet"/>
@@ -18502,9 +18502,9 @@
     </w:lvl>
   </w:abstractNum>
   <w:abstractNum w:abstractNumId="1" w15:restartNumberingAfterBreak="0">
-    <w:nsid w:val="29F67521"/>
+    <w:nsid w:val="2CE055B8"/>
     <w:multiLevelType w:val="multilevel"/>
-    <w:tmpl w:val="9D703A84"/>
+    <w:tmpl w:val="854C53B4"/>
     <w:lvl w:ilvl="0">
       <w:start w:val="1"/>
       <w:numFmt w:val="bullet"/>
@@ -18651,9 +18651,9 @@
     </w:lvl>
   </w:abstractNum>
   <w:abstractNum w:abstractNumId="2" w15:restartNumberingAfterBreak="0">
-    <w:nsid w:val="58797059"/>
+    <w:nsid w:val="53DC6767"/>
     <w:multiLevelType w:val="multilevel"/>
-    <w:tmpl w:val="95EA99C8"/>
+    <w:tmpl w:val="4704F7D4"/>
     <w:lvl w:ilvl="0">
       <w:start w:val="1"/>
       <w:numFmt w:val="bullet"/>
@@ -18800,9 +18800,9 @@
     </w:lvl>
   </w:abstractNum>
   <w:abstractNum w:abstractNumId="3" w15:restartNumberingAfterBreak="0">
-    <w:nsid w:val="6DBC0465"/>
+    <w:nsid w:val="79515DEA"/>
     <w:multiLevelType w:val="multilevel"/>
-    <w:tmpl w:val="AD204204"/>
+    <w:tmpl w:val="677A2918"/>
     <w:lvl w:ilvl="0">
       <w:start w:val="1"/>
       <w:numFmt w:val="bullet"/>
@@ -18952,13 +18952,13 @@
     <w:abstractNumId w:val="2"/>
   </w:num>
   <w:num w:numId="2">
-    <w:abstractNumId w:val="0"/>
+    <w:abstractNumId w:val="3"/>
   </w:num>
   <w:num w:numId="3">
     <w:abstractNumId w:val="1"/>
   </w:num>
   <w:num w:numId="4">
-    <w:abstractNumId w:val="3"/>
+    <w:abstractNumId w:val="0"/>
   </w:num>
 </w:numbering>
 </file>

</xml_diff>

<commit_message>
Mapas del sociólogo: etiquetas sin traslape y bordes de comunidad
Observaciones de Armando (WhatsApp 30-ago-2026): el número 16 quedaba
montado sobre el 1 y los polígonos de comunidad no se distinguían.
Las etiquetas ahora se separan por repulsión de pares (mínimo 650 m
Mercator, sin mover el centro real) y el borde de comunidad va marcado:
blanco sobre el relleno de sector en el mapa general, azul oscuro en el
del sector. Los mosaicos de la base se reintentan 3 veces: uno perdido
dejaba un rectángulo gris en pleno mapa.

Co-Authored-By: Claude Fable 5 <noreply@anthropic.com>
</commit_message>
<xml_diff>
--- a/public/informe_reunion_tecnica.docx
+++ b/public/informe_reunion_tecnica.docx
@@ -4,7 +4,7 @@
   <w:body>
     <w:p>
       <w:pPr>
-        <w:divId w:val="620692996"/>
+        <w:divId w:val="81340911"/>
         <w:rPr>
           <w:rFonts w:ascii="Plus Jakarta Sans" w:eastAsia="Times New Roman" w:hAnsi="Plus Jakarta Sans"/>
           <w:lang w:val="es-ES"/>
@@ -28,7 +28,7 @@
     <w:p>
       <w:pPr>
         <w:pStyle w:val="Ttulo1"/>
-        <w:divId w:val="1591885174"/>
+        <w:divId w:val="1164006827"/>
         <w:rPr>
           <w:rFonts w:eastAsia="Times New Roman"/>
           <w:lang w:val="es-ES"/>
@@ -45,7 +45,7 @@
     <w:p>
       <w:pPr>
         <w:pStyle w:val="NormalWeb"/>
-        <w:divId w:val="1591885174"/>
+        <w:divId w:val="1164006827"/>
         <w:rPr>
           <w:rFonts w:ascii="Plus Jakarta Sans" w:hAnsi="Plus Jakarta Sans"/>
           <w:lang w:val="es-ES"/>
@@ -63,7 +63,7 @@
     <w:p>
       <w:pPr>
         <w:pStyle w:val="NormalWeb"/>
-        <w:divId w:val="1591885174"/>
+        <w:divId w:val="1164006827"/>
         <w:rPr>
           <w:rFonts w:ascii="Plus Jakarta Sans" w:hAnsi="Plus Jakarta Sans"/>
           <w:lang w:val="es-ES"/>
@@ -102,7 +102,7 @@
     <w:p>
       <w:pPr>
         <w:pStyle w:val="NormalWeb"/>
-        <w:divId w:val="1591885174"/>
+        <w:divId w:val="1164006827"/>
         <w:rPr>
           <w:rFonts w:ascii="Plus Jakarta Sans" w:hAnsi="Plus Jakarta Sans"/>
           <w:lang w:val="es-ES"/>
@@ -134,7 +134,7 @@
     <w:p>
       <w:pPr>
         <w:pStyle w:val="NormalWeb"/>
-        <w:divId w:val="1591885174"/>
+        <w:divId w:val="1164006827"/>
         <w:rPr>
           <w:rFonts w:ascii="Plus Jakarta Sans" w:hAnsi="Plus Jakarta Sans"/>
           <w:lang w:val="es-ES"/>
@@ -166,7 +166,7 @@
     <w:p>
       <w:pPr>
         <w:pStyle w:val="NormalWeb"/>
-        <w:divId w:val="1591885174"/>
+        <w:divId w:val="1164006827"/>
         <w:rPr>
           <w:rFonts w:ascii="Plus Jakarta Sans" w:hAnsi="Plus Jakarta Sans"/>
           <w:lang w:val="es-ES"/>
@@ -206,7 +206,7 @@
     <w:p>
       <w:pPr>
         <w:pStyle w:val="NormalWeb"/>
-        <w:divId w:val="1591885174"/>
+        <w:divId w:val="1164006827"/>
         <w:rPr>
           <w:rFonts w:ascii="Plus Jakarta Sans" w:hAnsi="Plus Jakarta Sans"/>
           <w:lang w:val="es-ES"/>
@@ -223,7 +223,7 @@
     <w:p>
       <w:pPr>
         <w:pStyle w:val="NormalWeb"/>
-        <w:divId w:val="1591885174"/>
+        <w:divId w:val="1164006827"/>
         <w:rPr>
           <w:rFonts w:ascii="Plus Jakarta Sans" w:hAnsi="Plus Jakarta Sans"/>
           <w:lang w:val="es-ES"/>
@@ -240,7 +240,7 @@
     <w:p>
       <w:pPr>
         <w:pStyle w:val="NormalWeb"/>
-        <w:divId w:val="1591885174"/>
+        <w:divId w:val="1164006827"/>
         <w:rPr>
           <w:rFonts w:ascii="Plus Jakarta Sans" w:hAnsi="Plus Jakarta Sans"/>
           <w:lang w:val="es-ES"/>
@@ -272,7 +272,7 @@
     <w:p>
       <w:pPr>
         <w:pStyle w:val="NormalWeb"/>
-        <w:divId w:val="1591885174"/>
+        <w:divId w:val="1164006827"/>
         <w:rPr>
           <w:rFonts w:ascii="Plus Jakarta Sans" w:hAnsi="Plus Jakarta Sans"/>
           <w:lang w:val="es-ES"/>
@@ -289,7 +289,7 @@
     <w:p>
       <w:pPr>
         <w:pStyle w:val="NormalWeb"/>
-        <w:divId w:val="1591885174"/>
+        <w:divId w:val="1164006827"/>
         <w:rPr>
           <w:rFonts w:ascii="Plus Jakarta Sans" w:hAnsi="Plus Jakarta Sans"/>
           <w:lang w:val="es-ES"/>
@@ -306,7 +306,7 @@
     <w:p>
       <w:pPr>
         <w:pStyle w:val="NormalWeb"/>
-        <w:divId w:val="1591885174"/>
+        <w:divId w:val="1164006827"/>
         <w:rPr>
           <w:rFonts w:ascii="Plus Jakarta Sans" w:hAnsi="Plus Jakarta Sans"/>
           <w:lang w:val="es-ES"/>
@@ -323,7 +323,7 @@
     <w:p>
       <w:pPr>
         <w:pStyle w:val="NormalWeb"/>
-        <w:divId w:val="1591885174"/>
+        <w:divId w:val="1164006827"/>
         <w:rPr>
           <w:rFonts w:ascii="Plus Jakarta Sans" w:hAnsi="Plus Jakarta Sans"/>
           <w:lang w:val="es-ES"/>
@@ -340,7 +340,7 @@
     <w:p>
       <w:pPr>
         <w:pStyle w:val="NormalWeb"/>
-        <w:divId w:val="1591885174"/>
+        <w:divId w:val="1164006827"/>
         <w:rPr>
           <w:rFonts w:ascii="Plus Jakarta Sans" w:hAnsi="Plus Jakarta Sans"/>
           <w:lang w:val="es-ES"/>
@@ -364,7 +364,7 @@
     <w:p>
       <w:pPr>
         <w:spacing w:before="450" w:after="450"/>
-        <w:divId w:val="1591885174"/>
+        <w:divId w:val="1164006827"/>
         <w:rPr>
           <w:rFonts w:ascii="Plus Jakarta Sans" w:eastAsia="Times New Roman" w:hAnsi="Plus Jakarta Sans"/>
           <w:lang w:val="es-ES"/>
@@ -383,7 +383,7 @@
     <w:p>
       <w:pPr>
         <w:pStyle w:val="Ttulo2"/>
-        <w:divId w:val="1591885174"/>
+        <w:divId w:val="1164006827"/>
         <w:rPr>
           <w:rFonts w:eastAsia="Times New Roman"/>
           <w:lang w:val="es-ES"/>
@@ -407,7 +407,7 @@
     <w:p>
       <w:pPr>
         <w:pStyle w:val="NormalWeb"/>
-        <w:divId w:val="1591885174"/>
+        <w:divId w:val="1164006827"/>
         <w:rPr>
           <w:rFonts w:ascii="Plus Jakarta Sans" w:hAnsi="Plus Jakarta Sans"/>
           <w:lang w:val="es-ES"/>
@@ -429,7 +429,7 @@
         </w:numPr>
         <w:spacing w:before="100" w:beforeAutospacing="1" w:after="90"/>
         <w:ind w:left="1020"/>
-        <w:divId w:val="1591885174"/>
+        <w:divId w:val="1164006827"/>
         <w:rPr>
           <w:rFonts w:ascii="Plus Jakarta Sans" w:eastAsia="Times New Roman" w:hAnsi="Plus Jakarta Sans"/>
           <w:sz w:val="21"/>
@@ -475,7 +475,7 @@
         </w:numPr>
         <w:spacing w:before="100" w:beforeAutospacing="1" w:after="90"/>
         <w:ind w:left="1020"/>
-        <w:divId w:val="1591885174"/>
+        <w:divId w:val="1164006827"/>
         <w:rPr>
           <w:rFonts w:ascii="Plus Jakarta Sans" w:eastAsia="Times New Roman" w:hAnsi="Plus Jakarta Sans"/>
           <w:sz w:val="21"/>
@@ -531,7 +531,7 @@
         </w:numPr>
         <w:spacing w:before="100" w:beforeAutospacing="1" w:after="90"/>
         <w:ind w:left="1020"/>
-        <w:divId w:val="1591885174"/>
+        <w:divId w:val="1164006827"/>
         <w:rPr>
           <w:rFonts w:ascii="Plus Jakarta Sans" w:eastAsia="Times New Roman" w:hAnsi="Plus Jakarta Sans"/>
           <w:sz w:val="21"/>
@@ -577,7 +577,7 @@
         </w:numPr>
         <w:spacing w:before="100" w:beforeAutospacing="1" w:after="90"/>
         <w:ind w:left="1020"/>
-        <w:divId w:val="1591885174"/>
+        <w:divId w:val="1164006827"/>
         <w:rPr>
           <w:rFonts w:ascii="Plus Jakarta Sans" w:eastAsia="Times New Roman" w:hAnsi="Plus Jakarta Sans"/>
           <w:sz w:val="21"/>
@@ -618,7 +618,7 @@
     <w:p>
       <w:pPr>
         <w:spacing w:before="450" w:after="450"/>
-        <w:divId w:val="1591885174"/>
+        <w:divId w:val="1164006827"/>
         <w:rPr>
           <w:rFonts w:ascii="Plus Jakarta Sans" w:eastAsia="Times New Roman" w:hAnsi="Plus Jakarta Sans"/>
           <w:lang w:val="es-ES"/>
@@ -638,7 +638,7 @@
     <w:p>
       <w:pPr>
         <w:pStyle w:val="Ttulo2"/>
-        <w:divId w:val="1591885174"/>
+        <w:divId w:val="1164006827"/>
         <w:rPr>
           <w:rFonts w:eastAsia="Times New Roman"/>
           <w:lang w:val="es-ES"/>
@@ -655,7 +655,7 @@
     <w:p>
       <w:pPr>
         <w:pStyle w:val="NormalWeb"/>
-        <w:divId w:val="1591885174"/>
+        <w:divId w:val="1164006827"/>
         <w:rPr>
           <w:rFonts w:ascii="Plus Jakarta Sans" w:hAnsi="Plus Jakarta Sans"/>
           <w:lang w:val="es-ES"/>
@@ -709,7 +709,7 @@
       </w:tblGrid>
       <w:tr>
         <w:trPr>
-          <w:divId w:val="358287268"/>
+          <w:divId w:val="1498767090"/>
           <w:tblHeader/>
         </w:trPr>
         <w:tc>
@@ -789,7 +789,7 @@
       </w:tr>
       <w:tr>
         <w:trPr>
-          <w:divId w:val="358287268"/>
+          <w:divId w:val="1498767090"/>
         </w:trPr>
         <w:tc>
           <w:tcPr>
@@ -855,7 +855,7 @@
       </w:tr>
       <w:tr>
         <w:trPr>
-          <w:divId w:val="358287268"/>
+          <w:divId w:val="1498767090"/>
         </w:trPr>
         <w:tc>
           <w:tcPr>
@@ -921,7 +921,7 @@
       </w:tr>
       <w:tr>
         <w:trPr>
-          <w:divId w:val="358287268"/>
+          <w:divId w:val="1498767090"/>
         </w:trPr>
         <w:tc>
           <w:tcPr>
@@ -987,7 +987,7 @@
       </w:tr>
       <w:tr>
         <w:trPr>
-          <w:divId w:val="358287268"/>
+          <w:divId w:val="1498767090"/>
         </w:trPr>
         <w:tc>
           <w:tcPr>
@@ -1055,7 +1055,7 @@
     <w:p>
       <w:pPr>
         <w:spacing w:before="450" w:after="450"/>
-        <w:divId w:val="1591885174"/>
+        <w:divId w:val="1164006827"/>
         <w:rPr>
           <w:rFonts w:ascii="Plus Jakarta Sans" w:eastAsia="Times New Roman" w:hAnsi="Plus Jakarta Sans"/>
           <w:lang w:val="es-ES"/>
@@ -1074,7 +1074,7 @@
     <w:p>
       <w:pPr>
         <w:pStyle w:val="Ttulo2"/>
-        <w:divId w:val="1591885174"/>
+        <w:divId w:val="1164006827"/>
         <w:rPr>
           <w:rFonts w:eastAsia="Times New Roman"/>
           <w:lang w:val="es-ES"/>
@@ -1091,7 +1091,7 @@
     <w:p>
       <w:pPr>
         <w:pStyle w:val="Ttulo3"/>
-        <w:divId w:val="1591885174"/>
+        <w:divId w:val="1164006827"/>
         <w:rPr>
           <w:rFonts w:eastAsia="Times New Roman"/>
           <w:lang w:val="es-ES"/>
@@ -1115,7 +1115,7 @@
     <w:p>
       <w:pPr>
         <w:pStyle w:val="NormalWeb"/>
-        <w:divId w:val="1591885174"/>
+        <w:divId w:val="1164006827"/>
         <w:rPr>
           <w:rFonts w:ascii="Plus Jakarta Sans" w:hAnsi="Plus Jakarta Sans"/>
           <w:lang w:val="es-ES"/>
@@ -1148,7 +1148,7 @@
       </w:tblGrid>
       <w:tr>
         <w:trPr>
-          <w:divId w:val="1017461724"/>
+          <w:divId w:val="848526114"/>
           <w:tblHeader/>
         </w:trPr>
         <w:tc>
@@ -1302,7 +1302,7 @@
       </w:tr>
       <w:tr>
         <w:trPr>
-          <w:divId w:val="1017461724"/>
+          <w:divId w:val="848526114"/>
         </w:trPr>
         <w:tc>
           <w:tcPr>
@@ -1428,7 +1428,7 @@
       </w:tr>
       <w:tr>
         <w:trPr>
-          <w:divId w:val="1017461724"/>
+          <w:divId w:val="848526114"/>
         </w:trPr>
         <w:tc>
           <w:tcPr>
@@ -1554,7 +1554,7 @@
       </w:tr>
       <w:tr>
         <w:trPr>
-          <w:divId w:val="1017461724"/>
+          <w:divId w:val="848526114"/>
         </w:trPr>
         <w:tc>
           <w:tcPr>
@@ -1680,7 +1680,7 @@
       </w:tr>
       <w:tr>
         <w:trPr>
-          <w:divId w:val="1017461724"/>
+          <w:divId w:val="848526114"/>
         </w:trPr>
         <w:tc>
           <w:tcPr>
@@ -1806,7 +1806,7 @@
       </w:tr>
       <w:tr>
         <w:trPr>
-          <w:divId w:val="1017461724"/>
+          <w:divId w:val="848526114"/>
         </w:trPr>
         <w:tc>
           <w:tcPr>
@@ -1932,7 +1932,7 @@
       </w:tr>
       <w:tr>
         <w:trPr>
-          <w:divId w:val="1017461724"/>
+          <w:divId w:val="848526114"/>
         </w:trPr>
         <w:tc>
           <w:tcPr>
@@ -2059,7 +2059,7 @@
       </w:tr>
       <w:tr>
         <w:trPr>
-          <w:divId w:val="1017461724"/>
+          <w:divId w:val="848526114"/>
         </w:trPr>
         <w:tc>
           <w:tcPr>
@@ -2194,7 +2194,7 @@
       </w:tr>
       <w:tr>
         <w:trPr>
-          <w:divId w:val="1017461724"/>
+          <w:divId w:val="848526114"/>
         </w:trPr>
         <w:tc>
           <w:tcPr>
@@ -2322,7 +2322,7 @@
     <w:p>
       <w:pPr>
         <w:pStyle w:val="Ttulo3"/>
-        <w:divId w:val="1591885174"/>
+        <w:divId w:val="1164006827"/>
         <w:rPr>
           <w:rFonts w:eastAsia="Times New Roman"/>
           <w:lang w:val="es-ES"/>
@@ -2339,7 +2339,7 @@
     <w:p>
       <w:pPr>
         <w:pStyle w:val="NormalWeb"/>
-        <w:divId w:val="1591885174"/>
+        <w:divId w:val="1164006827"/>
         <w:rPr>
           <w:rFonts w:ascii="Plus Jakarta Sans" w:hAnsi="Plus Jakarta Sans"/>
           <w:lang w:val="es-ES"/>
@@ -2361,7 +2361,7 @@
         </w:numPr>
         <w:spacing w:before="100" w:beforeAutospacing="1" w:after="90"/>
         <w:ind w:left="1020"/>
-        <w:divId w:val="1591885174"/>
+        <w:divId w:val="1164006827"/>
         <w:rPr>
           <w:rFonts w:ascii="Plus Jakarta Sans" w:eastAsia="Times New Roman" w:hAnsi="Plus Jakarta Sans"/>
           <w:sz w:val="21"/>
@@ -2463,7 +2463,7 @@
         </w:numPr>
         <w:spacing w:before="100" w:beforeAutospacing="1" w:after="90"/>
         <w:ind w:left="1020"/>
-        <w:divId w:val="1591885174"/>
+        <w:divId w:val="1164006827"/>
         <w:rPr>
           <w:rFonts w:ascii="Plus Jakarta Sans" w:eastAsia="Times New Roman" w:hAnsi="Plus Jakarta Sans"/>
           <w:sz w:val="21"/>
@@ -2565,7 +2565,7 @@
         </w:numPr>
         <w:spacing w:before="100" w:beforeAutospacing="1" w:after="90"/>
         <w:ind w:left="1020"/>
-        <w:divId w:val="1591885174"/>
+        <w:divId w:val="1164006827"/>
         <w:rPr>
           <w:rFonts w:ascii="Plus Jakarta Sans" w:eastAsia="Times New Roman" w:hAnsi="Plus Jakarta Sans"/>
           <w:sz w:val="21"/>
@@ -2671,7 +2671,7 @@
     <w:p>
       <w:pPr>
         <w:pStyle w:val="Ttulo3"/>
-        <w:divId w:val="1591885174"/>
+        <w:divId w:val="1164006827"/>
         <w:rPr>
           <w:rFonts w:eastAsia="Times New Roman"/>
           <w:lang w:val="es-ES"/>
@@ -2688,7 +2688,7 @@
     <w:p>
       <w:pPr>
         <w:jc w:val="center"/>
-        <w:divId w:val="1900744319"/>
+        <w:divId w:val="1314336452"/>
         <w:rPr>
           <w:rFonts w:ascii="Outfit" w:eastAsia="Times New Roman" w:hAnsi="Outfit"/>
           <w:b/>
@@ -2717,7 +2717,7 @@
     <w:p>
       <w:pPr>
         <w:jc w:val="center"/>
-        <w:divId w:val="606350242"/>
+        <w:divId w:val="1038429217"/>
         <w:rPr>
           <w:rFonts w:ascii="Plus Jakarta Sans" w:eastAsia="Times New Roman" w:hAnsi="Plus Jakarta Sans"/>
           <w:lang w:val="es-ES"/>
@@ -3112,7 +3112,7 @@
     <w:p>
       <w:pPr>
         <w:spacing w:before="450" w:after="450"/>
-        <w:divId w:val="1591885174"/>
+        <w:divId w:val="1164006827"/>
         <w:rPr>
           <w:rFonts w:ascii="Plus Jakarta Sans" w:eastAsia="Times New Roman" w:hAnsi="Plus Jakarta Sans"/>
           <w:lang w:val="es-ES"/>
@@ -3131,7 +3131,7 @@
     <w:p>
       <w:pPr>
         <w:pStyle w:val="Ttulo3"/>
-        <w:divId w:val="1591885174"/>
+        <w:divId w:val="1164006827"/>
         <w:rPr>
           <w:rFonts w:eastAsia="Times New Roman"/>
           <w:lang w:val="es-ES"/>
@@ -3148,7 +3148,7 @@
     <w:p>
       <w:pPr>
         <w:pStyle w:val="NormalWeb"/>
-        <w:divId w:val="1591885174"/>
+        <w:divId w:val="1164006827"/>
         <w:rPr>
           <w:rFonts w:ascii="Plus Jakarta Sans" w:hAnsi="Plus Jakarta Sans"/>
           <w:lang w:val="es-ES"/>
@@ -3188,7 +3188,7 @@
       </w:tblGrid>
       <w:tr>
         <w:trPr>
-          <w:divId w:val="76639154"/>
+          <w:divId w:val="156505981"/>
           <w:tblHeader/>
         </w:trPr>
         <w:tc>
@@ -3343,7 +3343,7 @@
       </w:tr>
       <w:tr>
         <w:trPr>
-          <w:divId w:val="76639154"/>
+          <w:divId w:val="156505981"/>
         </w:trPr>
         <w:tc>
           <w:tcPr>
@@ -3477,7 +3477,7 @@
       </w:tr>
       <w:tr>
         <w:trPr>
-          <w:divId w:val="76639154"/>
+          <w:divId w:val="156505981"/>
         </w:trPr>
         <w:tc>
           <w:tcPr>
@@ -3611,7 +3611,7 @@
       </w:tr>
       <w:tr>
         <w:trPr>
-          <w:divId w:val="76639154"/>
+          <w:divId w:val="156505981"/>
         </w:trPr>
         <w:tc>
           <w:tcPr>
@@ -3753,7 +3753,7 @@
       </w:tr>
       <w:tr>
         <w:trPr>
-          <w:divId w:val="76639154"/>
+          <w:divId w:val="156505981"/>
         </w:trPr>
         <w:tc>
           <w:tcPr>
@@ -3887,7 +3887,7 @@
       </w:tr>
       <w:tr>
         <w:trPr>
-          <w:divId w:val="76639154"/>
+          <w:divId w:val="156505981"/>
         </w:trPr>
         <w:tc>
           <w:tcPr>
@@ -4021,7 +4021,7 @@
       </w:tr>
       <w:tr>
         <w:trPr>
-          <w:divId w:val="76639154"/>
+          <w:divId w:val="156505981"/>
         </w:trPr>
         <w:tc>
           <w:tcPr>
@@ -4157,7 +4157,7 @@
     <w:p>
       <w:pPr>
         <w:pStyle w:val="Ttulo3"/>
-        <w:divId w:val="1591885174"/>
+        <w:divId w:val="1164006827"/>
         <w:rPr>
           <w:rFonts w:eastAsia="Times New Roman"/>
           <w:lang w:val="es-ES"/>
@@ -4181,7 +4181,7 @@
     <w:p>
       <w:pPr>
         <w:jc w:val="center"/>
-        <w:divId w:val="843933059"/>
+        <w:divId w:val="592207457"/>
         <w:rPr>
           <w:rFonts w:ascii="Outfit" w:eastAsia="Times New Roman" w:hAnsi="Outfit"/>
           <w:b/>
@@ -4210,7 +4210,7 @@
     <w:p>
       <w:pPr>
         <w:jc w:val="center"/>
-        <w:divId w:val="125703928"/>
+        <w:divId w:val="1481119012"/>
         <w:rPr>
           <w:rFonts w:ascii="Plus Jakarta Sans" w:eastAsia="Times New Roman" w:hAnsi="Plus Jakarta Sans"/>
           <w:lang w:val="es-ES"/>
@@ -4577,7 +4577,7 @@
     <w:p>
       <w:pPr>
         <w:spacing w:before="450" w:after="450"/>
-        <w:divId w:val="1591885174"/>
+        <w:divId w:val="1164006827"/>
         <w:rPr>
           <w:rFonts w:ascii="Plus Jakarta Sans" w:eastAsia="Times New Roman" w:hAnsi="Plus Jakarta Sans"/>
           <w:lang w:val="es-ES"/>
@@ -4596,7 +4596,7 @@
     <w:p>
       <w:pPr>
         <w:pStyle w:val="Ttulo3"/>
-        <w:divId w:val="1591885174"/>
+        <w:divId w:val="1164006827"/>
         <w:rPr>
           <w:rFonts w:eastAsia="Times New Roman"/>
           <w:lang w:val="es-ES"/>
@@ -4613,7 +4613,7 @@
     <w:p>
       <w:pPr>
         <w:pStyle w:val="NormalWeb"/>
-        <w:divId w:val="1591885174"/>
+        <w:divId w:val="1164006827"/>
         <w:rPr>
           <w:rFonts w:ascii="Plus Jakarta Sans" w:hAnsi="Plus Jakarta Sans"/>
           <w:lang w:val="es-ES"/>
@@ -4642,7 +4642,7 @@
         </w:numPr>
         <w:spacing w:before="100" w:beforeAutospacing="1" w:after="90"/>
         <w:ind w:left="1020"/>
-        <w:divId w:val="1591885174"/>
+        <w:divId w:val="1164006827"/>
         <w:rPr>
           <w:rFonts w:ascii="Plus Jakarta Sans" w:eastAsia="Times New Roman" w:hAnsi="Plus Jakarta Sans"/>
           <w:sz w:val="21"/>
@@ -4678,7 +4678,7 @@
         </w:numPr>
         <w:spacing w:before="100" w:beforeAutospacing="1" w:after="90"/>
         <w:ind w:left="1020"/>
-        <w:divId w:val="1591885174"/>
+        <w:divId w:val="1164006827"/>
         <w:rPr>
           <w:rFonts w:ascii="Plus Jakarta Sans" w:eastAsia="Times New Roman" w:hAnsi="Plus Jakarta Sans"/>
           <w:sz w:val="21"/>
@@ -4723,7 +4723,7 @@
         </w:numPr>
         <w:spacing w:before="100" w:beforeAutospacing="1" w:after="90"/>
         <w:ind w:left="1020"/>
-        <w:divId w:val="1591885174"/>
+        <w:divId w:val="1164006827"/>
         <w:rPr>
           <w:rFonts w:ascii="Plus Jakarta Sans" w:eastAsia="Times New Roman" w:hAnsi="Plus Jakarta Sans"/>
           <w:sz w:val="21"/>
@@ -4777,7 +4777,7 @@
         </w:numPr>
         <w:spacing w:before="100" w:beforeAutospacing="1" w:after="90"/>
         <w:ind w:left="1020"/>
-        <w:divId w:val="1591885174"/>
+        <w:divId w:val="1164006827"/>
         <w:rPr>
           <w:rFonts w:ascii="Plus Jakarta Sans" w:eastAsia="Times New Roman" w:hAnsi="Plus Jakarta Sans"/>
           <w:sz w:val="21"/>
@@ -4833,7 +4833,7 @@
       </w:tblGrid>
       <w:tr>
         <w:trPr>
-          <w:divId w:val="592251564"/>
+          <w:divId w:val="1316450404"/>
           <w:tblHeader/>
         </w:trPr>
         <w:tc>
@@ -4987,7 +4987,7 @@
       </w:tr>
       <w:tr>
         <w:trPr>
-          <w:divId w:val="592251564"/>
+          <w:divId w:val="1316450404"/>
         </w:trPr>
         <w:tc>
           <w:tcPr>
@@ -5113,7 +5113,7 @@
       </w:tr>
       <w:tr>
         <w:trPr>
-          <w:divId w:val="592251564"/>
+          <w:divId w:val="1316450404"/>
         </w:trPr>
         <w:tc>
           <w:tcPr>
@@ -5239,7 +5239,7 @@
       </w:tr>
       <w:tr>
         <w:trPr>
-          <w:divId w:val="592251564"/>
+          <w:divId w:val="1316450404"/>
         </w:trPr>
         <w:tc>
           <w:tcPr>
@@ -5365,7 +5365,7 @@
       </w:tr>
       <w:tr>
         <w:trPr>
-          <w:divId w:val="592251564"/>
+          <w:divId w:val="1316450404"/>
         </w:trPr>
         <w:tc>
           <w:tcPr>
@@ -5494,7 +5494,7 @@
     <w:p>
       <w:pPr>
         <w:spacing w:before="450" w:after="450"/>
-        <w:divId w:val="1591885174"/>
+        <w:divId w:val="1164006827"/>
         <w:rPr>
           <w:rFonts w:ascii="Plus Jakarta Sans" w:eastAsia="Times New Roman" w:hAnsi="Plus Jakarta Sans"/>
           <w:lang w:val="es-ES"/>
@@ -5513,7 +5513,7 @@
     <w:p>
       <w:pPr>
         <w:pStyle w:val="Ttulo3"/>
-        <w:divId w:val="1591885174"/>
+        <w:divId w:val="1164006827"/>
         <w:rPr>
           <w:rFonts w:eastAsia="Times New Roman"/>
           <w:lang w:val="es-ES"/>
@@ -5530,7 +5530,7 @@
     <w:p>
       <w:pPr>
         <w:pStyle w:val="NormalWeb"/>
-        <w:divId w:val="1591885174"/>
+        <w:divId w:val="1164006827"/>
         <w:rPr>
           <w:rFonts w:ascii="Plus Jakarta Sans" w:hAnsi="Plus Jakarta Sans"/>
           <w:lang w:val="es-ES"/>
@@ -5554,7 +5554,7 @@
     <w:p>
       <w:pPr>
         <w:pStyle w:val="Ttulo4"/>
-        <w:divId w:val="1591885174"/>
+        <w:divId w:val="1164006827"/>
         <w:rPr>
           <w:rFonts w:eastAsia="Times New Roman"/>
           <w:lang w:val="es-ES"/>
@@ -5571,7 +5571,7 @@
     <w:p>
       <w:pPr>
         <w:jc w:val="center"/>
-        <w:divId w:val="2016304213"/>
+        <w:divId w:val="1185436779"/>
         <w:rPr>
           <w:rFonts w:ascii="Outfit" w:eastAsia="Times New Roman" w:hAnsi="Outfit"/>
           <w:b/>
@@ -5600,7 +5600,7 @@
     <w:p>
       <w:pPr>
         <w:jc w:val="center"/>
-        <w:divId w:val="1217594684"/>
+        <w:divId w:val="706754900"/>
         <w:rPr>
           <w:rFonts w:ascii="Plus Jakarta Sans" w:eastAsia="Times New Roman" w:hAnsi="Plus Jakarta Sans"/>
           <w:lang w:val="es-ES"/>
@@ -5883,7 +5883,7 @@
     <w:p>
       <w:pPr>
         <w:pStyle w:val="Ttulo4"/>
-        <w:divId w:val="1591885174"/>
+        <w:divId w:val="1164006827"/>
         <w:rPr>
           <w:rFonts w:eastAsia="Times New Roman"/>
           <w:lang w:val="es-ES"/>
@@ -5900,7 +5900,7 @@
     <w:p>
       <w:pPr>
         <w:jc w:val="center"/>
-        <w:divId w:val="1460339858"/>
+        <w:divId w:val="1738284120"/>
         <w:rPr>
           <w:rFonts w:ascii="Outfit" w:eastAsia="Times New Roman" w:hAnsi="Outfit"/>
           <w:b/>
@@ -5942,7 +5942,7 @@
     <w:p>
       <w:pPr>
         <w:jc w:val="center"/>
-        <w:divId w:val="1385720125"/>
+        <w:divId w:val="1825976093"/>
         <w:rPr>
           <w:rFonts w:ascii="Plus Jakarta Sans" w:eastAsia="Times New Roman" w:hAnsi="Plus Jakarta Sans"/>
           <w:lang w:val="es-ES"/>
@@ -6260,7 +6260,7 @@
     <w:p>
       <w:pPr>
         <w:pStyle w:val="Ttulo4"/>
-        <w:divId w:val="1591885174"/>
+        <w:divId w:val="1164006827"/>
         <w:rPr>
           <w:rFonts w:eastAsia="Times New Roman"/>
           <w:lang w:val="es-ES"/>
@@ -6277,7 +6277,7 @@
     <w:p>
       <w:pPr>
         <w:jc w:val="center"/>
-        <w:divId w:val="1752309090"/>
+        <w:divId w:val="267398775"/>
         <w:rPr>
           <w:rFonts w:ascii="Outfit" w:eastAsia="Times New Roman" w:hAnsi="Outfit"/>
           <w:b/>
@@ -6306,7 +6306,7 @@
     <w:p>
       <w:pPr>
         <w:jc w:val="center"/>
-        <w:divId w:val="1386024632"/>
+        <w:divId w:val="304552336"/>
         <w:rPr>
           <w:rFonts w:ascii="Plus Jakarta Sans" w:eastAsia="Times New Roman" w:hAnsi="Plus Jakarta Sans"/>
           <w:lang w:val="es-ES"/>
@@ -6610,7 +6610,7 @@
     <w:p>
       <w:pPr>
         <w:spacing w:before="450" w:after="450"/>
-        <w:divId w:val="1591885174"/>
+        <w:divId w:val="1164006827"/>
         <w:rPr>
           <w:rFonts w:ascii="Plus Jakarta Sans" w:eastAsia="Times New Roman" w:hAnsi="Plus Jakarta Sans"/>
           <w:lang w:val="es-ES"/>
@@ -6629,7 +6629,7 @@
     <w:p>
       <w:pPr>
         <w:pStyle w:val="Ttulo3"/>
-        <w:divId w:val="1591885174"/>
+        <w:divId w:val="1164006827"/>
         <w:rPr>
           <w:rFonts w:eastAsia="Times New Roman"/>
           <w:lang w:val="es-ES"/>
@@ -6653,7 +6653,7 @@
     <w:p>
       <w:pPr>
         <w:pStyle w:val="NormalWeb"/>
-        <w:divId w:val="1591885174"/>
+        <w:divId w:val="1164006827"/>
         <w:rPr>
           <w:rFonts w:ascii="Plus Jakarta Sans" w:hAnsi="Plus Jakarta Sans"/>
           <w:lang w:val="es-ES"/>
@@ -6670,7 +6670,7 @@
     <w:p>
       <w:pPr>
         <w:pStyle w:val="Ttulo4"/>
-        <w:divId w:val="1591885174"/>
+        <w:divId w:val="1164006827"/>
         <w:rPr>
           <w:rFonts w:eastAsia="Times New Roman"/>
           <w:lang w:val="es-ES"/>
@@ -6688,7 +6688,7 @@
     <w:p>
       <w:pPr>
         <w:pStyle w:val="NormalWeb"/>
-        <w:divId w:val="1591885174"/>
+        <w:divId w:val="1164006827"/>
         <w:rPr>
           <w:rFonts w:ascii="Plus Jakarta Sans" w:hAnsi="Plus Jakarta Sans"/>
           <w:lang w:val="es-ES"/>
@@ -6726,7 +6726,7 @@
       </w:tblGrid>
       <w:tr>
         <w:trPr>
-          <w:divId w:val="352538469"/>
+          <w:divId w:val="1279335223"/>
           <w:tblHeader/>
         </w:trPr>
         <w:tc>
@@ -6806,7 +6806,7 @@
       </w:tr>
       <w:tr>
         <w:trPr>
-          <w:divId w:val="352538469"/>
+          <w:divId w:val="1279335223"/>
         </w:trPr>
         <w:tc>
           <w:tcPr>
@@ -6895,7 +6895,7 @@
     <w:p>
       <w:pPr>
         <w:pStyle w:val="Ttulo4"/>
-        <w:divId w:val="1591885174"/>
+        <w:divId w:val="1164006827"/>
         <w:rPr>
           <w:rFonts w:eastAsia="Times New Roman"/>
           <w:lang w:val="es-ES"/>
@@ -6912,7 +6912,7 @@
     <w:p>
       <w:pPr>
         <w:pStyle w:val="NormalWeb"/>
-        <w:divId w:val="1591885174"/>
+        <w:divId w:val="1164006827"/>
         <w:rPr>
           <w:rFonts w:ascii="Plus Jakarta Sans" w:hAnsi="Plus Jakarta Sans"/>
           <w:lang w:val="es-ES"/>
@@ -6943,7 +6943,7 @@
       </w:tblGrid>
       <w:tr>
         <w:trPr>
-          <w:divId w:val="1581409523"/>
+          <w:divId w:val="365910309"/>
           <w:tblHeader/>
         </w:trPr>
         <w:tc>
@@ -7034,7 +7034,7 @@
       </w:tr>
       <w:tr>
         <w:trPr>
-          <w:divId w:val="1581409523"/>
+          <w:divId w:val="365910309"/>
         </w:trPr>
         <w:tc>
           <w:tcPr>
@@ -7123,7 +7123,7 @@
     <w:p>
       <w:pPr>
         <w:pStyle w:val="Ttulo4"/>
-        <w:divId w:val="1591885174"/>
+        <w:divId w:val="1164006827"/>
         <w:rPr>
           <w:rFonts w:eastAsia="Times New Roman"/>
           <w:lang w:val="es-ES"/>
@@ -7140,7 +7140,7 @@
     <w:p>
       <w:pPr>
         <w:pStyle w:val="NormalWeb"/>
-        <w:divId w:val="1591885174"/>
+        <w:divId w:val="1164006827"/>
         <w:rPr>
           <w:rFonts w:ascii="Plus Jakarta Sans" w:hAnsi="Plus Jakarta Sans"/>
           <w:lang w:val="es-ES"/>
@@ -7171,7 +7171,7 @@
       </w:tblGrid>
       <w:tr>
         <w:trPr>
-          <w:divId w:val="2145658211"/>
+          <w:divId w:val="2113622656"/>
           <w:tblHeader/>
         </w:trPr>
         <w:tc>
@@ -7251,7 +7251,7 @@
       </w:tr>
       <w:tr>
         <w:trPr>
-          <w:divId w:val="2145658211"/>
+          <w:divId w:val="2113622656"/>
         </w:trPr>
         <w:tc>
           <w:tcPr>
@@ -7340,7 +7340,7 @@
     <w:p>
       <w:pPr>
         <w:spacing w:before="450" w:after="450"/>
-        <w:divId w:val="1591885174"/>
+        <w:divId w:val="1164006827"/>
         <w:rPr>
           <w:rFonts w:ascii="Plus Jakarta Sans" w:eastAsia="Times New Roman" w:hAnsi="Plus Jakarta Sans"/>
           <w:lang w:val="es-ES"/>
@@ -7359,7 +7359,7 @@
     <w:p>
       <w:pPr>
         <w:pStyle w:val="Ttulo2"/>
-        <w:divId w:val="1591885174"/>
+        <w:divId w:val="1164006827"/>
         <w:rPr>
           <w:rFonts w:eastAsia="Times New Roman"/>
           <w:lang w:val="es-ES"/>
@@ -7376,7 +7376,7 @@
     <w:p>
       <w:pPr>
         <w:pStyle w:val="NormalWeb"/>
-        <w:divId w:val="1591885174"/>
+        <w:divId w:val="1164006827"/>
         <w:rPr>
           <w:rFonts w:ascii="Plus Jakarta Sans" w:hAnsi="Plus Jakarta Sans"/>
           <w:lang w:val="es-ES"/>
@@ -7393,7 +7393,7 @@
     <w:p>
       <w:pPr>
         <w:pStyle w:val="Ttulo3"/>
-        <w:divId w:val="1591885174"/>
+        <w:divId w:val="1164006827"/>
         <w:rPr>
           <w:rFonts w:eastAsia="Times New Roman"/>
           <w:lang w:val="es-ES"/>
@@ -7410,7 +7410,7 @@
     <w:p>
       <w:pPr>
         <w:pStyle w:val="NormalWeb"/>
-        <w:divId w:val="1591885174"/>
+        <w:divId w:val="1164006827"/>
         <w:rPr>
           <w:rFonts w:ascii="Plus Jakarta Sans" w:hAnsi="Plus Jakarta Sans"/>
           <w:lang w:val="es-ES"/>
@@ -7443,7 +7443,7 @@
       </w:tblGrid>
       <w:tr>
         <w:trPr>
-          <w:divId w:val="1375732000"/>
+          <w:divId w:val="1501852196"/>
           <w:tblHeader/>
         </w:trPr>
         <w:tc>
@@ -7608,7 +7608,7 @@
       </w:tr>
       <w:tr>
         <w:trPr>
-          <w:divId w:val="1375732000"/>
+          <w:divId w:val="1501852196"/>
         </w:trPr>
         <w:tc>
           <w:tcPr>
@@ -7734,7 +7734,7 @@
       </w:tr>
       <w:tr>
         <w:trPr>
-          <w:divId w:val="1375732000"/>
+          <w:divId w:val="1501852196"/>
         </w:trPr>
         <w:tc>
           <w:tcPr>
@@ -7860,7 +7860,7 @@
       </w:tr>
       <w:tr>
         <w:trPr>
-          <w:divId w:val="1375732000"/>
+          <w:divId w:val="1501852196"/>
         </w:trPr>
         <w:tc>
           <w:tcPr>
@@ -7986,7 +7986,7 @@
       </w:tr>
       <w:tr>
         <w:trPr>
-          <w:divId w:val="1375732000"/>
+          <w:divId w:val="1501852196"/>
         </w:trPr>
         <w:tc>
           <w:tcPr>
@@ -8114,7 +8114,7 @@
     <w:p>
       <w:pPr>
         <w:pStyle w:val="Ttulo3"/>
-        <w:divId w:val="1591885174"/>
+        <w:divId w:val="1164006827"/>
         <w:rPr>
           <w:rFonts w:eastAsia="Times New Roman"/>
           <w:lang w:val="es-ES"/>
@@ -8132,7 +8132,7 @@
       <w:pPr>
         <w:spacing w:before="375" w:after="225"/>
         <w:jc w:val="center"/>
-        <w:divId w:val="743530076"/>
+        <w:divId w:val="80219761"/>
         <w:rPr>
           <w:rFonts w:ascii="Outfit" w:eastAsia="Times New Roman" w:hAnsi="Outfit"/>
           <w:b/>
@@ -8162,7 +8162,7 @@
       <w:pPr>
         <w:spacing w:after="375"/>
         <w:jc w:val="center"/>
-        <w:divId w:val="224294173"/>
+        <w:divId w:val="35861550"/>
         <w:rPr>
           <w:rFonts w:ascii="Plus Jakarta Sans" w:eastAsia="Times New Roman" w:hAnsi="Plus Jakarta Sans"/>
           <w:lang w:val="es-ES"/>
@@ -8550,7 +8550,7 @@
     <w:p>
       <w:pPr>
         <w:pStyle w:val="Ttulo3"/>
-        <w:divId w:val="1591885174"/>
+        <w:divId w:val="1164006827"/>
         <w:rPr>
           <w:rFonts w:eastAsia="Times New Roman"/>
           <w:lang w:val="es-ES"/>
@@ -8574,7 +8574,7 @@
     <w:p>
       <w:pPr>
         <w:pStyle w:val="NormalWeb"/>
-        <w:divId w:val="1591885174"/>
+        <w:divId w:val="1164006827"/>
         <w:rPr>
           <w:rFonts w:ascii="Plus Jakarta Sans" w:hAnsi="Plus Jakarta Sans"/>
           <w:lang w:val="es-ES"/>
@@ -8596,7 +8596,7 @@
         </w:numPr>
         <w:spacing w:before="100" w:beforeAutospacing="1" w:after="90"/>
         <w:ind w:left="1020"/>
-        <w:divId w:val="1591885174"/>
+        <w:divId w:val="1164006827"/>
         <w:rPr>
           <w:rFonts w:ascii="Plus Jakarta Sans" w:eastAsia="Times New Roman" w:hAnsi="Plus Jakarta Sans"/>
           <w:sz w:val="21"/>
@@ -8632,7 +8632,7 @@
         </w:numPr>
         <w:spacing w:before="100" w:beforeAutospacing="1" w:after="90"/>
         <w:ind w:left="1020"/>
-        <w:divId w:val="1591885174"/>
+        <w:divId w:val="1164006827"/>
         <w:rPr>
           <w:rFonts w:ascii="Plus Jakarta Sans" w:eastAsia="Times New Roman" w:hAnsi="Plus Jakarta Sans"/>
           <w:sz w:val="21"/>
@@ -8677,7 +8677,7 @@
         </w:numPr>
         <w:spacing w:before="100" w:beforeAutospacing="1" w:after="90"/>
         <w:ind w:left="1020"/>
-        <w:divId w:val="1591885174"/>
+        <w:divId w:val="1164006827"/>
         <w:rPr>
           <w:rFonts w:ascii="Plus Jakarta Sans" w:eastAsia="Times New Roman" w:hAnsi="Plus Jakarta Sans"/>
           <w:sz w:val="21"/>
@@ -8722,7 +8722,7 @@
         </w:numPr>
         <w:spacing w:before="100" w:beforeAutospacing="1" w:after="90"/>
         <w:ind w:left="1020"/>
-        <w:divId w:val="1591885174"/>
+        <w:divId w:val="1164006827"/>
         <w:rPr>
           <w:rFonts w:ascii="Plus Jakarta Sans" w:eastAsia="Times New Roman" w:hAnsi="Plus Jakarta Sans"/>
           <w:sz w:val="21"/>
@@ -8776,7 +8776,7 @@
         </w:numPr>
         <w:spacing w:before="100" w:beforeAutospacing="1" w:after="90"/>
         <w:ind w:left="1020"/>
-        <w:divId w:val="1591885174"/>
+        <w:divId w:val="1164006827"/>
         <w:rPr>
           <w:rFonts w:ascii="Plus Jakarta Sans" w:eastAsia="Times New Roman" w:hAnsi="Plus Jakarta Sans"/>
           <w:sz w:val="21"/>
@@ -8812,7 +8812,7 @@
         </w:numPr>
         <w:spacing w:before="100" w:beforeAutospacing="1" w:after="90"/>
         <w:ind w:left="1020"/>
-        <w:divId w:val="1591885174"/>
+        <w:divId w:val="1164006827"/>
         <w:rPr>
           <w:rFonts w:ascii="Plus Jakarta Sans" w:eastAsia="Times New Roman" w:hAnsi="Plus Jakarta Sans"/>
           <w:sz w:val="21"/>
@@ -8857,7 +8857,7 @@
         </w:numPr>
         <w:spacing w:before="100" w:beforeAutospacing="1" w:after="90"/>
         <w:ind w:left="1020"/>
-        <w:divId w:val="1591885174"/>
+        <w:divId w:val="1164006827"/>
         <w:rPr>
           <w:rFonts w:ascii="Plus Jakarta Sans" w:eastAsia="Times New Roman" w:hAnsi="Plus Jakarta Sans"/>
           <w:sz w:val="21"/>
@@ -8902,7 +8902,7 @@
         </w:numPr>
         <w:spacing w:before="100" w:beforeAutospacing="1" w:after="90"/>
         <w:ind w:left="1020"/>
-        <w:divId w:val="1591885174"/>
+        <w:divId w:val="1164006827"/>
         <w:rPr>
           <w:rFonts w:ascii="Plus Jakarta Sans" w:eastAsia="Times New Roman" w:hAnsi="Plus Jakarta Sans"/>
           <w:sz w:val="21"/>
@@ -8947,7 +8947,7 @@
         </w:numPr>
         <w:spacing w:before="100" w:beforeAutospacing="1" w:after="90"/>
         <w:ind w:left="1020"/>
-        <w:divId w:val="1591885174"/>
+        <w:divId w:val="1164006827"/>
         <w:rPr>
           <w:rFonts w:ascii="Plus Jakarta Sans" w:eastAsia="Times New Roman" w:hAnsi="Plus Jakarta Sans"/>
           <w:sz w:val="21"/>
@@ -8983,7 +8983,7 @@
         </w:numPr>
         <w:spacing w:before="100" w:beforeAutospacing="1" w:after="90"/>
         <w:ind w:left="1020"/>
-        <w:divId w:val="1591885174"/>
+        <w:divId w:val="1164006827"/>
         <w:rPr>
           <w:rFonts w:ascii="Plus Jakarta Sans" w:eastAsia="Times New Roman" w:hAnsi="Plus Jakarta Sans"/>
           <w:sz w:val="21"/>
@@ -9028,7 +9028,7 @@
         </w:numPr>
         <w:spacing w:before="100" w:beforeAutospacing="1" w:after="90"/>
         <w:ind w:left="1020"/>
-        <w:divId w:val="1591885174"/>
+        <w:divId w:val="1164006827"/>
         <w:rPr>
           <w:rFonts w:ascii="Plus Jakarta Sans" w:eastAsia="Times New Roman" w:hAnsi="Plus Jakarta Sans"/>
           <w:sz w:val="21"/>
@@ -9082,7 +9082,7 @@
         </w:numPr>
         <w:spacing w:before="100" w:beforeAutospacing="1" w:after="90"/>
         <w:ind w:left="1020"/>
-        <w:divId w:val="1591885174"/>
+        <w:divId w:val="1164006827"/>
         <w:rPr>
           <w:rFonts w:ascii="Plus Jakarta Sans" w:eastAsia="Times New Roman" w:hAnsi="Plus Jakarta Sans"/>
           <w:sz w:val="21"/>
@@ -9122,7 +9122,7 @@
     <w:p>
       <w:pPr>
         <w:pStyle w:val="Ttulo3"/>
-        <w:divId w:val="1591885174"/>
+        <w:divId w:val="1164006827"/>
         <w:rPr>
           <w:rFonts w:eastAsia="Times New Roman"/>
           <w:lang w:val="es-ES"/>
@@ -9140,7 +9140,7 @@
       <w:pPr>
         <w:spacing w:before="375" w:after="225"/>
         <w:jc w:val="center"/>
-        <w:divId w:val="1580408032"/>
+        <w:divId w:val="1716197505"/>
         <w:rPr>
           <w:rFonts w:ascii="Outfit" w:eastAsia="Times New Roman" w:hAnsi="Outfit"/>
           <w:b/>
@@ -9170,7 +9170,7 @@
       <w:pPr>
         <w:spacing w:after="375"/>
         <w:jc w:val="center"/>
-        <w:divId w:val="1281185145"/>
+        <w:divId w:val="504127285"/>
         <w:rPr>
           <w:rFonts w:ascii="Plus Jakarta Sans" w:eastAsia="Times New Roman" w:hAnsi="Plus Jakarta Sans"/>
           <w:lang w:val="es-ES"/>
@@ -9453,7 +9453,7 @@
     <w:p>
       <w:pPr>
         <w:spacing w:before="450" w:after="450"/>
-        <w:divId w:val="1591885174"/>
+        <w:divId w:val="1164006827"/>
         <w:rPr>
           <w:rFonts w:ascii="Plus Jakarta Sans" w:eastAsia="Times New Roman" w:hAnsi="Plus Jakarta Sans"/>
           <w:lang w:val="es-ES"/>
@@ -9472,7 +9472,7 @@
     <w:p>
       <w:pPr>
         <w:pStyle w:val="Ttulo2"/>
-        <w:divId w:val="1591885174"/>
+        <w:divId w:val="1164006827"/>
         <w:rPr>
           <w:rFonts w:eastAsia="Times New Roman"/>
           <w:lang w:val="es-ES"/>
@@ -9489,7 +9489,7 @@
     <w:p>
       <w:pPr>
         <w:pStyle w:val="NormalWeb"/>
-        <w:divId w:val="1591885174"/>
+        <w:divId w:val="1164006827"/>
         <w:rPr>
           <w:rFonts w:ascii="Plus Jakarta Sans" w:hAnsi="Plus Jakarta Sans"/>
           <w:lang w:val="es-ES"/>
@@ -9513,7 +9513,7 @@
     <w:p>
       <w:pPr>
         <w:pStyle w:val="NormalWeb"/>
-        <w:divId w:val="1591885174"/>
+        <w:divId w:val="1164006827"/>
         <w:rPr>
           <w:rFonts w:ascii="Plus Jakarta Sans" w:hAnsi="Plus Jakarta Sans"/>
           <w:lang w:val="es-ES"/>
@@ -9575,7 +9575,7 @@
     <w:p>
       <w:pPr>
         <w:pStyle w:val="NormalWeb"/>
-        <w:divId w:val="1591885174"/>
+        <w:divId w:val="1164006827"/>
         <w:rPr>
           <w:rFonts w:ascii="Plus Jakarta Sans" w:hAnsi="Plus Jakarta Sans"/>
           <w:lang w:val="es-ES"/>
@@ -9636,7 +9636,7 @@
     <w:p>
       <w:pPr>
         <w:pStyle w:val="NormalWeb"/>
-        <w:divId w:val="1591885174"/>
+        <w:divId w:val="1164006827"/>
         <w:rPr>
           <w:rFonts w:ascii="Plus Jakarta Sans" w:hAnsi="Plus Jakarta Sans"/>
           <w:lang w:val="es-ES"/>
@@ -9690,7 +9690,7 @@
     <w:p>
       <w:pPr>
         <w:pStyle w:val="NormalWeb"/>
-        <w:divId w:val="1591885174"/>
+        <w:divId w:val="1164006827"/>
         <w:rPr>
           <w:rFonts w:ascii="Plus Jakarta Sans" w:hAnsi="Plus Jakarta Sans"/>
           <w:lang w:val="es-ES"/>
@@ -9751,7 +9751,7 @@
     <w:p>
       <w:pPr>
         <w:spacing w:before="450" w:after="450"/>
-        <w:divId w:val="1591885174"/>
+        <w:divId w:val="1164006827"/>
         <w:rPr>
           <w:rFonts w:ascii="Plus Jakarta Sans" w:eastAsia="Times New Roman" w:hAnsi="Plus Jakarta Sans"/>
           <w:lang w:val="es-ES"/>
@@ -9770,7 +9770,7 @@
     <w:p>
       <w:pPr>
         <w:pStyle w:val="Ttulo2"/>
-        <w:divId w:val="1591885174"/>
+        <w:divId w:val="1164006827"/>
         <w:rPr>
           <w:rFonts w:eastAsia="Times New Roman"/>
           <w:lang w:val="es-ES"/>
@@ -9787,7 +9787,7 @@
     <w:p>
       <w:pPr>
         <w:pStyle w:val="NormalWeb"/>
-        <w:divId w:val="1591885174"/>
+        <w:divId w:val="1164006827"/>
         <w:rPr>
           <w:rFonts w:ascii="Plus Jakarta Sans" w:hAnsi="Plus Jakarta Sans"/>
           <w:lang w:val="es-ES"/>
@@ -9826,7 +9826,7 @@
     <w:p>
       <w:pPr>
         <w:pStyle w:val="Ttulo3"/>
-        <w:divId w:val="1591885174"/>
+        <w:divId w:val="1164006827"/>
         <w:rPr>
           <w:rFonts w:eastAsia="Times New Roman"/>
           <w:lang w:val="es-ES"/>
@@ -9860,7 +9860,7 @@
       </w:tblGrid>
       <w:tr>
         <w:trPr>
-          <w:divId w:val="261112923"/>
+          <w:divId w:val="1133787459"/>
           <w:tblHeader/>
         </w:trPr>
         <w:tc>
@@ -10051,7 +10051,7 @@
       </w:tr>
       <w:tr>
         <w:trPr>
-          <w:divId w:val="261112923"/>
+          <w:divId w:val="1133787459"/>
         </w:trPr>
         <w:tc>
           <w:tcPr>
@@ -10207,7 +10207,7 @@
       </w:tr>
       <w:tr>
         <w:trPr>
-          <w:divId w:val="261112923"/>
+          <w:divId w:val="1133787459"/>
         </w:trPr>
         <w:tc>
           <w:tcPr>
@@ -10363,7 +10363,7 @@
       </w:tr>
       <w:tr>
         <w:trPr>
-          <w:divId w:val="261112923"/>
+          <w:divId w:val="1133787459"/>
         </w:trPr>
         <w:tc>
           <w:tcPr>
@@ -10519,7 +10519,7 @@
       </w:tr>
       <w:tr>
         <w:trPr>
-          <w:divId w:val="261112923"/>
+          <w:divId w:val="1133787459"/>
         </w:trPr>
         <w:tc>
           <w:tcPr>
@@ -10681,7 +10681,7 @@
     <w:p>
       <w:pPr>
         <w:pStyle w:val="Ttulo3"/>
-        <w:divId w:val="1591885174"/>
+        <w:divId w:val="1164006827"/>
         <w:rPr>
           <w:rFonts w:eastAsia="Times New Roman"/>
           <w:lang w:val="es-ES"/>
@@ -10715,7 +10715,7 @@
       </w:tblGrid>
       <w:tr>
         <w:trPr>
-          <w:divId w:val="403990771"/>
+          <w:divId w:val="394740902"/>
           <w:tblHeader/>
         </w:trPr>
         <w:tc>
@@ -10906,7 +10906,7 @@
       </w:tr>
       <w:tr>
         <w:trPr>
-          <w:divId w:val="403990771"/>
+          <w:divId w:val="394740902"/>
         </w:trPr>
         <w:tc>
           <w:tcPr>
@@ -11063,7 +11063,7 @@
       </w:tr>
       <w:tr>
         <w:trPr>
-          <w:divId w:val="403990771"/>
+          <w:divId w:val="394740902"/>
         </w:trPr>
         <w:tc>
           <w:tcPr>
@@ -11222,7 +11222,7 @@
     <w:p>
       <w:pPr>
         <w:pStyle w:val="Ttulo3"/>
-        <w:divId w:val="1591885174"/>
+        <w:divId w:val="1164006827"/>
         <w:rPr>
           <w:rFonts w:eastAsia="Times New Roman"/>
           <w:lang w:val="es-ES"/>
@@ -11257,7 +11257,7 @@
       </w:tblGrid>
       <w:tr>
         <w:trPr>
-          <w:divId w:val="279919591"/>
+          <w:divId w:val="90858406"/>
           <w:tblHeader/>
         </w:trPr>
         <w:tc>
@@ -11485,7 +11485,7 @@
       </w:tr>
       <w:tr>
         <w:trPr>
-          <w:divId w:val="279919591"/>
+          <w:divId w:val="90858406"/>
         </w:trPr>
         <w:tc>
           <w:tcPr>
@@ -11681,7 +11681,7 @@
       </w:tr>
       <w:tr>
         <w:trPr>
-          <w:divId w:val="279919591"/>
+          <w:divId w:val="90858406"/>
         </w:trPr>
         <w:tc>
           <w:tcPr>
@@ -11866,7 +11866,7 @@
       </w:tr>
       <w:tr>
         <w:trPr>
-          <w:divId w:val="279919591"/>
+          <w:divId w:val="90858406"/>
         </w:trPr>
         <w:tc>
           <w:tcPr>
@@ -12064,7 +12064,7 @@
     <w:p>
       <w:pPr>
         <w:pStyle w:val="Ttulo4"/>
-        <w:divId w:val="1591885174"/>
+        <w:divId w:val="1164006827"/>
         <w:rPr>
           <w:rFonts w:eastAsia="Times New Roman"/>
           <w:lang w:val="es-ES"/>
@@ -12082,7 +12082,7 @@
       <w:pPr>
         <w:spacing w:before="375" w:after="225"/>
         <w:jc w:val="center"/>
-        <w:divId w:val="367071087"/>
+        <w:divId w:val="102725115"/>
         <w:rPr>
           <w:rFonts w:ascii="Outfit" w:eastAsia="Times New Roman" w:hAnsi="Outfit"/>
           <w:b/>
@@ -12112,7 +12112,7 @@
       <w:pPr>
         <w:spacing w:after="375"/>
         <w:jc w:val="center"/>
-        <w:divId w:val="540287391"/>
+        <w:divId w:val="948321558"/>
         <w:rPr>
           <w:rFonts w:ascii="Plus Jakarta Sans" w:eastAsia="Times New Roman" w:hAnsi="Plus Jakarta Sans"/>
           <w:lang w:val="es-ES"/>
@@ -12500,7 +12500,7 @@
     <w:p>
       <w:pPr>
         <w:pStyle w:val="Ttulo3"/>
-        <w:divId w:val="1591885174"/>
+        <w:divId w:val="1164006827"/>
         <w:rPr>
           <w:rFonts w:eastAsia="Times New Roman"/>
           <w:lang w:val="es-ES"/>
@@ -12539,7 +12539,7 @@
       </w:tblGrid>
       <w:tr>
         <w:trPr>
-          <w:divId w:val="693573355"/>
+          <w:divId w:val="607851003"/>
           <w:tblHeader/>
         </w:trPr>
         <w:tc>
@@ -12656,7 +12656,7 @@
       </w:tr>
       <w:tr>
         <w:trPr>
-          <w:divId w:val="693573355"/>
+          <w:divId w:val="607851003"/>
         </w:trPr>
         <w:tc>
           <w:tcPr>
@@ -12752,7 +12752,7 @@
       </w:tr>
       <w:tr>
         <w:trPr>
-          <w:divId w:val="693573355"/>
+          <w:divId w:val="607851003"/>
         </w:trPr>
         <w:tc>
           <w:tcPr>
@@ -12848,7 +12848,7 @@
       </w:tr>
       <w:tr>
         <w:trPr>
-          <w:divId w:val="693573355"/>
+          <w:divId w:val="607851003"/>
         </w:trPr>
         <w:tc>
           <w:tcPr>
@@ -12946,7 +12946,7 @@
     <w:p>
       <w:pPr>
         <w:pStyle w:val="NormalWeb"/>
-        <w:divId w:val="1591885174"/>
+        <w:divId w:val="1164006827"/>
         <w:rPr>
           <w:rFonts w:ascii="Plus Jakarta Sans" w:hAnsi="Plus Jakarta Sans"/>
           <w:lang w:val="es-ES"/>
@@ -12971,7 +12971,7 @@
     <w:p>
       <w:pPr>
         <w:pStyle w:val="Ttulo3"/>
-        <w:divId w:val="1591885174"/>
+        <w:divId w:val="1164006827"/>
         <w:rPr>
           <w:rFonts w:eastAsia="Times New Roman"/>
           <w:lang w:val="es-ES"/>
@@ -13006,7 +13006,7 @@
       </w:tblGrid>
       <w:tr>
         <w:trPr>
-          <w:divId w:val="1700741069"/>
+          <w:divId w:val="1087772509"/>
           <w:tblHeader/>
         </w:trPr>
         <w:tc>
@@ -13234,7 +13234,7 @@
       </w:tr>
       <w:tr>
         <w:trPr>
-          <w:divId w:val="1700741069"/>
+          <w:divId w:val="1087772509"/>
         </w:trPr>
         <w:tc>
           <w:tcPr>
@@ -13420,7 +13420,7 @@
       </w:tr>
       <w:tr>
         <w:trPr>
-          <w:divId w:val="1700741069"/>
+          <w:divId w:val="1087772509"/>
         </w:trPr>
         <w:tc>
           <w:tcPr>
@@ -13606,7 +13606,7 @@
       </w:tr>
       <w:tr>
         <w:trPr>
-          <w:divId w:val="1700741069"/>
+          <w:divId w:val="1087772509"/>
         </w:trPr>
         <w:tc>
           <w:tcPr>
@@ -13792,7 +13792,7 @@
       </w:tr>
       <w:tr>
         <w:trPr>
-          <w:divId w:val="1700741069"/>
+          <w:divId w:val="1087772509"/>
         </w:trPr>
         <w:tc>
           <w:tcPr>
@@ -13985,7 +13985,7 @@
     <w:p>
       <w:pPr>
         <w:pStyle w:val="NormalWeb"/>
-        <w:divId w:val="1591885174"/>
+        <w:divId w:val="1164006827"/>
         <w:rPr>
           <w:rFonts w:ascii="Plus Jakarta Sans" w:hAnsi="Plus Jakarta Sans"/>
           <w:lang w:val="es-ES"/>
@@ -14032,7 +14032,7 @@
     <w:p>
       <w:pPr>
         <w:pStyle w:val="Ttulo3"/>
-        <w:divId w:val="1591885174"/>
+        <w:divId w:val="1164006827"/>
         <w:rPr>
           <w:rFonts w:eastAsia="Times New Roman"/>
           <w:lang w:val="es-ES"/>
@@ -14067,7 +14067,7 @@
       </w:tblGrid>
       <w:tr>
         <w:trPr>
-          <w:divId w:val="1799251390"/>
+          <w:divId w:val="1464884823"/>
           <w:tblHeader/>
         </w:trPr>
         <w:tc>
@@ -14295,7 +14295,7 @@
       </w:tr>
       <w:tr>
         <w:trPr>
-          <w:divId w:val="1799251390"/>
+          <w:divId w:val="1464884823"/>
         </w:trPr>
         <w:tc>
           <w:tcPr>
@@ -14489,7 +14489,7 @@
       </w:tr>
       <w:tr>
         <w:trPr>
-          <w:divId w:val="1799251390"/>
+          <w:divId w:val="1464884823"/>
         </w:trPr>
         <w:tc>
           <w:tcPr>
@@ -14685,7 +14685,7 @@
     <w:p>
       <w:pPr>
         <w:pStyle w:val="Ttulo4"/>
-        <w:divId w:val="1591885174"/>
+        <w:divId w:val="1164006827"/>
         <w:rPr>
           <w:rFonts w:eastAsia="Times New Roman"/>
           <w:lang w:val="es-ES"/>
@@ -14703,7 +14703,7 @@
       <w:pPr>
         <w:spacing w:before="375" w:after="225"/>
         <w:jc w:val="center"/>
-        <w:divId w:val="1595895565"/>
+        <w:divId w:val="1254780238"/>
         <w:rPr>
           <w:rFonts w:ascii="Outfit" w:eastAsia="Times New Roman" w:hAnsi="Outfit"/>
           <w:b/>
@@ -14733,7 +14733,7 @@
       <w:pPr>
         <w:spacing w:after="375"/>
         <w:jc w:val="center"/>
-        <w:divId w:val="2079353182"/>
+        <w:divId w:val="2006081630"/>
         <w:rPr>
           <w:rFonts w:ascii="Plus Jakarta Sans" w:eastAsia="Times New Roman" w:hAnsi="Plus Jakarta Sans"/>
           <w:lang w:val="es-ES"/>
@@ -15121,7 +15121,7 @@
     <w:p>
       <w:pPr>
         <w:pStyle w:val="Ttulo3"/>
-        <w:divId w:val="1591885174"/>
+        <w:divId w:val="1164006827"/>
         <w:rPr>
           <w:rFonts w:eastAsia="Times New Roman"/>
           <w:lang w:val="es-ES"/>
@@ -15155,7 +15155,7 @@
       </w:tblGrid>
       <w:tr>
         <w:trPr>
-          <w:divId w:val="2085567290"/>
+          <w:divId w:val="1943875156"/>
           <w:tblHeader/>
         </w:trPr>
         <w:tc>
@@ -15346,7 +15346,7 @@
       </w:tr>
       <w:tr>
         <w:trPr>
-          <w:divId w:val="2085567290"/>
+          <w:divId w:val="1943875156"/>
         </w:trPr>
         <w:tc>
           <w:tcPr>
@@ -15502,7 +15502,7 @@
       </w:tr>
       <w:tr>
         <w:trPr>
-          <w:divId w:val="2085567290"/>
+          <w:divId w:val="1943875156"/>
         </w:trPr>
         <w:tc>
           <w:tcPr>
@@ -15658,7 +15658,7 @@
       </w:tr>
       <w:tr>
         <w:trPr>
-          <w:divId w:val="2085567290"/>
+          <w:divId w:val="1943875156"/>
         </w:trPr>
         <w:tc>
           <w:tcPr>
@@ -15814,7 +15814,7 @@
       </w:tr>
       <w:tr>
         <w:trPr>
-          <w:divId w:val="2085567290"/>
+          <w:divId w:val="1943875156"/>
         </w:trPr>
         <w:tc>
           <w:tcPr>
@@ -15970,7 +15970,7 @@
       </w:tr>
       <w:tr>
         <w:trPr>
-          <w:divId w:val="2085567290"/>
+          <w:divId w:val="1943875156"/>
         </w:trPr>
         <w:tc>
           <w:tcPr>
@@ -16126,7 +16126,7 @@
       </w:tr>
       <w:tr>
         <w:trPr>
-          <w:divId w:val="2085567290"/>
+          <w:divId w:val="1943875156"/>
         </w:trPr>
         <w:tc>
           <w:tcPr>
@@ -16284,7 +16284,7 @@
     <w:p>
       <w:pPr>
         <w:pStyle w:val="Ttulo3"/>
-        <w:divId w:val="1591885174"/>
+        <w:divId w:val="1164006827"/>
         <w:rPr>
           <w:rFonts w:eastAsia="Times New Roman"/>
           <w:lang w:val="es-ES"/>
@@ -16318,7 +16318,7 @@
       </w:tblGrid>
       <w:tr>
         <w:trPr>
-          <w:divId w:val="196159083"/>
+          <w:divId w:val="959872226"/>
           <w:tblHeader/>
         </w:trPr>
         <w:tc>
@@ -16509,7 +16509,7 @@
       </w:tr>
       <w:tr>
         <w:trPr>
-          <w:divId w:val="196159083"/>
+          <w:divId w:val="959872226"/>
         </w:trPr>
         <w:tc>
           <w:tcPr>
@@ -16665,7 +16665,7 @@
       </w:tr>
       <w:tr>
         <w:trPr>
-          <w:divId w:val="196159083"/>
+          <w:divId w:val="959872226"/>
         </w:trPr>
         <w:tc>
           <w:tcPr>
@@ -16821,7 +16821,7 @@
       </w:tr>
       <w:tr>
         <w:trPr>
-          <w:divId w:val="196159083"/>
+          <w:divId w:val="959872226"/>
         </w:trPr>
         <w:tc>
           <w:tcPr>
@@ -16977,7 +16977,7 @@
       </w:tr>
       <w:tr>
         <w:trPr>
-          <w:divId w:val="196159083"/>
+          <w:divId w:val="959872226"/>
         </w:trPr>
         <w:tc>
           <w:tcPr>
@@ -17133,7 +17133,7 @@
       </w:tr>
       <w:tr>
         <w:trPr>
-          <w:divId w:val="196159083"/>
+          <w:divId w:val="959872226"/>
         </w:trPr>
         <w:tc>
           <w:tcPr>
@@ -17291,7 +17291,7 @@
     <w:p>
       <w:pPr>
         <w:pStyle w:val="Ttulo3"/>
-        <w:divId w:val="1591885174"/>
+        <w:divId w:val="1164006827"/>
         <w:rPr>
           <w:rFonts w:eastAsia="Times New Roman"/>
           <w:lang w:val="es-ES"/>
@@ -17325,7 +17325,7 @@
       </w:tblGrid>
       <w:tr>
         <w:trPr>
-          <w:divId w:val="373040277"/>
+          <w:divId w:val="19166970"/>
           <w:tblHeader/>
         </w:trPr>
         <w:tc>
@@ -17516,7 +17516,7 @@
       </w:tr>
       <w:tr>
         <w:trPr>
-          <w:divId w:val="373040277"/>
+          <w:divId w:val="19166970"/>
         </w:trPr>
         <w:tc>
           <w:tcPr>
@@ -17672,7 +17672,7 @@
       </w:tr>
       <w:tr>
         <w:trPr>
-          <w:divId w:val="373040277"/>
+          <w:divId w:val="19166970"/>
         </w:trPr>
         <w:tc>
           <w:tcPr>
@@ -17830,7 +17830,7 @@
     <w:p>
       <w:pPr>
         <w:pStyle w:val="Ttulo4"/>
-        <w:divId w:val="1591885174"/>
+        <w:divId w:val="1164006827"/>
         <w:rPr>
           <w:rFonts w:eastAsia="Times New Roman"/>
           <w:lang w:val="es-ES"/>
@@ -17848,7 +17848,7 @@
       <w:pPr>
         <w:spacing w:before="375" w:after="225"/>
         <w:jc w:val="center"/>
-        <w:divId w:val="28771415"/>
+        <w:divId w:val="1897005524"/>
         <w:rPr>
           <w:rFonts w:ascii="Outfit" w:eastAsia="Times New Roman" w:hAnsi="Outfit"/>
           <w:b/>
@@ -17878,7 +17878,7 @@
       <w:pPr>
         <w:spacing w:after="375"/>
         <w:jc w:val="center"/>
-        <w:divId w:val="288170005"/>
+        <w:divId w:val="710687947"/>
         <w:rPr>
           <w:rFonts w:ascii="Plus Jakarta Sans" w:eastAsia="Times New Roman" w:hAnsi="Plus Jakarta Sans"/>
           <w:lang w:val="es-ES"/>
@@ -18266,7 +18266,7 @@
     <w:p>
       <w:pPr>
         <w:spacing w:before="450" w:after="450"/>
-        <w:divId w:val="1591885174"/>
+        <w:divId w:val="1164006827"/>
         <w:rPr>
           <w:rFonts w:ascii="Plus Jakarta Sans" w:eastAsia="Times New Roman" w:hAnsi="Plus Jakarta Sans"/>
           <w:lang w:val="es-ES"/>
@@ -18285,7 +18285,7 @@
     <w:p>
       <w:pPr>
         <w:spacing w:before="450" w:after="450"/>
-        <w:divId w:val="1591885174"/>
+        <w:divId w:val="1164006827"/>
         <w:rPr>
           <w:rFonts w:ascii="Plus Jakarta Sans" w:eastAsia="Times New Roman" w:hAnsi="Plus Jakarta Sans"/>
           <w:lang w:val="es-ES"/>
@@ -18304,7 +18304,7 @@
     <w:p>
       <w:pPr>
         <w:pStyle w:val="NormalWeb"/>
-        <w:divId w:val="1591885174"/>
+        <w:divId w:val="1164006827"/>
         <w:rPr>
           <w:rFonts w:ascii="Plus Jakarta Sans" w:hAnsi="Plus Jakarta Sans"/>
           <w:lang w:val="es-ES"/>
@@ -18353,9 +18353,9 @@
 <file path=word/numbering.xml><?xml version="1.0" encoding="utf-8"?>
 <w:numbering xmlns:wpc="http://schemas.microsoft.com/office/word/2010/wordprocessingCanvas" xmlns:cx="http://schemas.microsoft.com/office/drawing/2014/chartex" xmlns:cx1="http://schemas.microsoft.com/office/drawing/2015/9/8/chartex" xmlns:cx2="http://schemas.microsoft.com/office/drawing/2015/10/21/chartex" xmlns:cx3="http://schemas.microsoft.com/office/drawing/2016/5/9/chartex" xmlns:cx4="http://schemas.microsoft.com/office/drawing/2016/5/10/chartex" xmlns:cx5="http://schemas.microsoft.com/office/drawing/2016/5/11/chartex" xmlns:cx6="http://schemas.microsoft.com/office/drawing/2016/5/12/chartex" xmlns:cx7="http://schemas.microsoft.com/office/drawing/2016/5/13/chartex" xmlns:cx8="http://schemas.microsoft.com/office/drawing/2016/5/14/chartex" xmlns:mc="http://schemas.openxmlformats.org/markup-compatibility/2006" xmlns:aink="http://schemas.microsoft.com/office/drawing/2016/ink" xmlns:am3d="http://schemas.microsoft.com/office/drawing/2017/model3d" xmlns:o="urn:schemas-microsoft-com:office:office" xmlns:r="http://schemas.openxmlformats.org/officeDocument/2006/relationships" xmlns:m="http://schemas.openxmlformats.org/officeDocument/2006/math" xmlns:v="urn:schemas-microsoft-com:vml" xmlns:wp14="http://schemas.microsoft.com/office/word/2010/wordprocessingDrawing" xmlns:wp="http://schemas.openxmlformats.org/drawingml/2006/wordprocessingDrawing" xmlns:w10="urn:schemas-microsoft-com:office:word" xmlns:w="http://schemas.openxmlformats.org/wordprocessingml/2006/main" xmlns:w14="http://schemas.microsoft.com/office/word/2010/wordml" xmlns:w15="http://schemas.microsoft.com/office/word/2012/wordml" xmlns:w16cex="http://schemas.microsoft.com/office/word/2018/wordml/cex" xmlns:w16cid="http://schemas.microsoft.com/office/word/2016/wordml/cid" xmlns:w16="http://schemas.microsoft.com/office/word/2018/wordml" xmlns:w16sdtdh="http://schemas.microsoft.com/office/word/2020/wordml/sdtdatahash" xmlns:w16se="http://schemas.microsoft.com/office/word/2015/wordml/symex" xmlns:wpg="http://schemas.microsoft.com/office/word/2010/wordprocessingGroup" xmlns:wpi="http://schemas.microsoft.com/office/word/2010/wordprocessingInk" xmlns:wne="http://schemas.microsoft.com/office/word/2006/wordml" xmlns:wps="http://schemas.microsoft.com/office/word/2010/wordprocessingShape" mc:Ignorable="w14 w15 w16se w16cid w16 w16cex w16sdtdh wp14">
   <w:abstractNum w:abstractNumId="0" w15:restartNumberingAfterBreak="0">
-    <w:nsid w:val="150F1BF2"/>
+    <w:nsid w:val="0C444F0D"/>
     <w:multiLevelType w:val="multilevel"/>
-    <w:tmpl w:val="B85064BA"/>
+    <w:tmpl w:val="CF1609EA"/>
     <w:lvl w:ilvl="0">
       <w:start w:val="1"/>
       <w:numFmt w:val="bullet"/>
@@ -18502,9 +18502,9 @@
     </w:lvl>
   </w:abstractNum>
   <w:abstractNum w:abstractNumId="1" w15:restartNumberingAfterBreak="0">
-    <w:nsid w:val="2CE055B8"/>
+    <w:nsid w:val="378C3C66"/>
     <w:multiLevelType w:val="multilevel"/>
-    <w:tmpl w:val="854C53B4"/>
+    <w:tmpl w:val="9A80B068"/>
     <w:lvl w:ilvl="0">
       <w:start w:val="1"/>
       <w:numFmt w:val="bullet"/>
@@ -18651,9 +18651,9 @@
     </w:lvl>
   </w:abstractNum>
   <w:abstractNum w:abstractNumId="2" w15:restartNumberingAfterBreak="0">
-    <w:nsid w:val="53DC6767"/>
+    <w:nsid w:val="72B32040"/>
     <w:multiLevelType w:val="multilevel"/>
-    <w:tmpl w:val="4704F7D4"/>
+    <w:tmpl w:val="FADC8AC2"/>
     <w:lvl w:ilvl="0">
       <w:start w:val="1"/>
       <w:numFmt w:val="bullet"/>
@@ -18800,9 +18800,9 @@
     </w:lvl>
   </w:abstractNum>
   <w:abstractNum w:abstractNumId="3" w15:restartNumberingAfterBreak="0">
-    <w:nsid w:val="79515DEA"/>
+    <w:nsid w:val="7D0C0F82"/>
     <w:multiLevelType w:val="multilevel"/>
-    <w:tmpl w:val="677A2918"/>
+    <w:tmpl w:val="4CE0A0C2"/>
     <w:lvl w:ilvl="0">
       <w:start w:val="1"/>
       <w:numFmt w:val="bullet"/>
@@ -18949,16 +18949,16 @@
     </w:lvl>
   </w:abstractNum>
   <w:num w:numId="1">
-    <w:abstractNumId w:val="2"/>
+    <w:abstractNumId w:val="1"/>
   </w:num>
   <w:num w:numId="2">
     <w:abstractNumId w:val="3"/>
   </w:num>
   <w:num w:numId="3">
-    <w:abstractNumId w:val="1"/>
+    <w:abstractNumId w:val="0"/>
   </w:num>
   <w:num w:numId="4">
-    <w:abstractNumId w:val="0"/>
+    <w:abstractNumId w:val="2"/>
   </w:num>
 </w:numbering>
 </file>

</xml_diff>